<commit_message>
systemically working through again from the top
</commit_message>
<xml_diff>
--- a/Docs/Run_timing_manuscript.docx
+++ b/Docs/Run_timing_manuscript.docx
@@ -2060,163 +2060,37 @@
           <w:szCs w:val="22"/>
           <w14:ligatures w14:val="none"/>
         </w:rPr>
-        <w:t xml:space="preserve"> the Alaska Department of Fish &amp; Game</w:t>
-      </w:r>
-      <w:proofErr w:type="gramStart"/>
-      <w:r>
-        <w:rPr>
-          <w:rFonts w:ascii="Garamond" w:eastAsia="Times New Roman" w:hAnsi="Garamond" w:cs="Times New Roman"/>
-          <w:kern w:val="0"/>
-          <w:sz w:val="22"/>
-          <w:szCs w:val="22"/>
-          <w14:ligatures w14:val="none"/>
-        </w:rPr>
-        <w:t xml:space="preserve">. </w:t>
-      </w:r>
-      <w:r>
-        <w:rPr>
-          <w:rFonts w:ascii="Garamond" w:eastAsia="Times New Roman" w:hAnsi="Garamond" w:cs="Times New Roman"/>
-          <w:kern w:val="0"/>
-          <w:sz w:val="22"/>
-          <w:szCs w:val="22"/>
-          <w14:ligatures w14:val="none"/>
-        </w:rPr>
-        <w:t>.</w:t>
-      </w:r>
-      <w:proofErr w:type="gramEnd"/>
-      <w:r>
-        <w:rPr>
-          <w:rFonts w:ascii="Garamond" w:eastAsia="Times New Roman" w:hAnsi="Garamond" w:cs="Times New Roman"/>
-          <w:kern w:val="0"/>
-          <w:sz w:val="22"/>
-          <w:szCs w:val="22"/>
-          <w14:ligatures w14:val="none"/>
-        </w:rPr>
-        <w:t xml:space="preserve"> </w:t>
-      </w:r>
-      <w:r>
-        <w:rPr>
-          <w:rFonts w:ascii="Garamond" w:eastAsia="Times New Roman" w:hAnsi="Garamond" w:cs="Times New Roman"/>
-          <w:kern w:val="0"/>
-          <w:sz w:val="22"/>
-          <w:szCs w:val="22"/>
-          <w14:ligatures w14:val="none"/>
-        </w:rPr>
-        <w:t xml:space="preserve">The BTF was designed to allow in-season assessment of run strength based on catch-per-unit-effort to inform management of subsistence fisheries throughout the river (Liller report). We sampled otoliths from fish captured over the course of the entire season to assess relative stock contributions over the course of the run. </w:t>
-      </w:r>
-      <w:r>
-        <w:rPr>
-          <w:rFonts w:ascii="Garamond" w:eastAsia="Times New Roman" w:hAnsi="Garamond" w:cs="Times New Roman"/>
-          <w:kern w:val="0"/>
-          <w:sz w:val="22"/>
-          <w:szCs w:val="22"/>
-          <w14:ligatures w14:val="none"/>
-        </w:rPr>
-        <w:t xml:space="preserve">Approximately 500 otoliths were collected </w:t>
-      </w:r>
-      <w:r>
-        <w:rPr>
-          <w:rFonts w:ascii="Garamond" w:eastAsia="Times New Roman" w:hAnsi="Garamond" w:cs="Times New Roman"/>
-          <w:kern w:val="0"/>
-          <w:sz w:val="22"/>
-          <w:szCs w:val="22"/>
-          <w14:ligatures w14:val="none"/>
-        </w:rPr>
-        <w:t>each year and f</w:t>
-      </w:r>
-      <w:r>
-        <w:rPr>
-          <w:rFonts w:ascii="Garamond" w:eastAsia="Times New Roman" w:hAnsi="Garamond" w:cs="Times New Roman"/>
-          <w:kern w:val="0"/>
-          <w:sz w:val="22"/>
-          <w:szCs w:val="22"/>
-          <w14:ligatures w14:val="none"/>
-        </w:rPr>
-        <w:t xml:space="preserve">rom these, about 250 otoliths were selected for </w:t>
-      </w:r>
-      <w:r>
-        <w:rPr>
-          <w:rFonts w:ascii="Garamond" w:eastAsia="Times New Roman" w:hAnsi="Garamond" w:cs="Times New Roman"/>
-          <w:kern w:val="0"/>
-          <w:sz w:val="22"/>
-          <w:szCs w:val="22"/>
-          <w14:ligatures w14:val="none"/>
-        </w:rPr>
-        <w:t xml:space="preserve">microchemical </w:t>
-      </w:r>
-      <w:r>
-        <w:rPr>
-          <w:rFonts w:ascii="Garamond" w:eastAsia="Times New Roman" w:hAnsi="Garamond" w:cs="Times New Roman"/>
-          <w:kern w:val="0"/>
-          <w:sz w:val="22"/>
-          <w:szCs w:val="22"/>
-          <w14:ligatures w14:val="none"/>
-        </w:rPr>
-        <w:t xml:space="preserve">analysis </w:t>
-      </w:r>
-      <w:ins w:id="6" w:author="Benjamin J. Makhlouf" w:date="2025-07-26T11:26:00Z" w16du:dateUtc="2025-07-26T18:26:00Z">
-        <w:r>
-          <w:rPr>
-            <w:rFonts w:ascii="Garamond" w:eastAsia="Times New Roman" w:hAnsi="Garamond" w:cs="Times New Roman"/>
-            <w:kern w:val="0"/>
-            <w:sz w:val="22"/>
-            <w:szCs w:val="22"/>
-            <w14:ligatures w14:val="none"/>
-          </w:rPr>
-          <w:t>in proportion to the</w:t>
-        </w:r>
-      </w:ins>
-      <w:del w:id="7" w:author="Benjamin J. Makhlouf" w:date="2025-07-26T11:26:00Z" w16du:dateUtc="2025-07-26T18:26:00Z">
-        <w:r>
-          <w:rPr>
-            <w:rFonts w:ascii="Garamond" w:eastAsia="Times New Roman" w:hAnsi="Garamond" w:cs="Times New Roman"/>
-            <w:kern w:val="0"/>
-            <w:sz w:val="22"/>
-            <w:szCs w:val="22"/>
-            <w14:ligatures w14:val="none"/>
-          </w:rPr>
-          <w:delText>to ensure coverage across the full sampling period and to provide proportional representation</w:delText>
-        </w:r>
-      </w:del>
-      <w:r>
-        <w:rPr>
-          <w:rFonts w:ascii="Garamond" w:eastAsia="Times New Roman" w:hAnsi="Garamond" w:cs="Times New Roman"/>
-          <w:kern w:val="0"/>
-          <w:sz w:val="22"/>
-          <w:szCs w:val="22"/>
-          <w14:ligatures w14:val="none"/>
-        </w:rPr>
-        <w:t xml:space="preserve"> relative</w:t>
-      </w:r>
-      <w:del w:id="8" w:author="Benjamin J. Makhlouf" w:date="2025-07-26T11:26:00Z" w16du:dateUtc="2025-07-26T18:26:00Z">
-        <w:r>
-          <w:rPr>
-            <w:rFonts w:ascii="Garamond" w:eastAsia="Times New Roman" w:hAnsi="Garamond" w:cs="Times New Roman"/>
-            <w:kern w:val="0"/>
-            <w:sz w:val="22"/>
-            <w:szCs w:val="22"/>
-            <w14:ligatures w14:val="none"/>
-          </w:rPr>
-          <w:delText xml:space="preserve"> to</w:delText>
-        </w:r>
-      </w:del>
-      <w:r>
-        <w:rPr>
-          <w:rFonts w:ascii="Garamond" w:eastAsia="Times New Roman" w:hAnsi="Garamond" w:cs="Times New Roman"/>
-          <w:kern w:val="0"/>
-          <w:sz w:val="22"/>
-          <w:szCs w:val="22"/>
-          <w14:ligatures w14:val="none"/>
-        </w:rPr>
-        <w:t xml:space="preserve"> catch per unit effort (CPUE) throughout the run.</w:t>
-      </w:r>
-      <w:r>
-        <w:rPr>
-          <w:rFonts w:ascii="Garamond" w:hAnsi="Garamond"/>
-          <w:sz w:val="22"/>
-          <w:szCs w:val="22"/>
-        </w:rPr>
-        <w:t xml:space="preserve"> </w:t>
+        <w:t xml:space="preserve"> the Alaska Department of Fish &amp; Game. </w:t>
+      </w:r>
+      <w:r>
+        <w:rPr>
+          <w:rFonts w:ascii="Garamond" w:eastAsia="Times New Roman" w:hAnsi="Garamond" w:cs="Times New Roman"/>
+          <w:kern w:val="0"/>
+          <w:sz w:val="22"/>
+          <w:szCs w:val="22"/>
+          <w14:ligatures w14:val="none"/>
+        </w:rPr>
+        <w:t xml:space="preserve">The BTF was designed to allow in-season assessment of run strength based on catch-per-unit-effort to inform management of subsistence fisheries throughout the river (Liller report). </w:t>
+      </w:r>
+      <w:r>
+        <w:rPr>
+          <w:rFonts w:ascii="Garamond" w:eastAsia="Times New Roman" w:hAnsi="Garamond" w:cs="Times New Roman"/>
+          <w:kern w:val="0"/>
+          <w:sz w:val="22"/>
+          <w:szCs w:val="22"/>
+          <w14:ligatures w14:val="none"/>
+        </w:rPr>
+        <w:t xml:space="preserve">As such, fish captured in this test fishery are expected to be a representative sample of returning stocks throughout the basin. We collected approximately 500 otoliths from each year from 2017-2022, ensuring sampling efforts over the full course of the run. From these, approximately 250 otoliths were selected for microchemical analysis in proportion to the relative catch per unit effort (CPUE) </w:t>
+      </w:r>
+      <w:r>
+        <w:rPr>
+          <w:rFonts w:ascii="Garamond" w:eastAsia="Times New Roman" w:hAnsi="Garamond" w:cs="Times New Roman"/>
+          <w:kern w:val="0"/>
+          <w:sz w:val="22"/>
+          <w:szCs w:val="22"/>
+          <w14:ligatures w14:val="none"/>
+        </w:rPr>
+        <w:t xml:space="preserve">throughout the season. </w:t>
       </w:r>
     </w:p>
     <w:p>
@@ -2849,7 +2723,7 @@
         </w:rPr>
         <w:fldChar w:fldCharType="end"/>
       </w:r>
-      <w:ins w:id="9" w:author="Benjamin J. Makhlouf" w:date="2025-07-26T13:45:00Z" w16du:dateUtc="2025-07-26T20:45:00Z">
+      <w:ins w:id="6" w:author="Benjamin J. Makhlouf" w:date="2025-07-26T13:45:00Z" w16du:dateUtc="2025-07-26T20:45:00Z">
         <w:r>
           <w:rPr>
             <w:rFonts w:ascii="Garamond" w:eastAsia="Times New Roman" w:hAnsi="Garamond" w:cs="Times New Roman"/>
@@ -2905,44 +2779,21 @@
         <w:spacing w:before="100" w:beforeAutospacing="1" w:after="100" w:afterAutospacing="1" w:line="480" w:lineRule="auto"/>
         <w:ind w:firstLine="720"/>
         <w:rPr>
-          <w:rFonts w:ascii="Garamond" w:eastAsia="Times New Roman" w:hAnsi="Garamond" w:cs="Times New Roman"/>
-          <w:kern w:val="0"/>
-          <w:sz w:val="22"/>
-          <w:szCs w:val="22"/>
-          <w14:ligatures w14:val="none"/>
-          <w:rPrChange w:id="10" w:author="Benjamin J. Makhlouf" w:date="2025-07-26T13:03:00Z" w16du:dateUtc="2025-07-26T20:03:00Z">
-            <w:rPr>
-              <w:rFonts w:ascii="Garamond" w:hAnsi="Garamond" w:cs="Times New Roman"/>
-              <w:sz w:val="22"/>
-              <w:szCs w:val="22"/>
-            </w:rPr>
-          </w:rPrChange>
-        </w:rPr>
-      </w:pPr>
-      <w:ins w:id="11" w:author="Benjamin J. Makhlouf" w:date="2025-07-26T13:03:00Z" w16du:dateUtc="2025-07-26T20:03:00Z">
-        <w:r>
-          <w:rPr>
-            <w:rFonts w:ascii="Garamond" w:eastAsia="Times New Roman" w:hAnsi="Garamond" w:cs="Times New Roman"/>
-            <w:kern w:val="0"/>
-            <w:sz w:val="22"/>
-            <w:szCs w:val="22"/>
-            <w14:ligatures w14:val="none"/>
-          </w:rPr>
-          <w:t>We used an</w:t>
-        </w:r>
-      </w:ins>
-      <w:del w:id="12" w:author="Benjamin J. Makhlouf" w:date="2025-07-26T13:03:00Z" w16du:dateUtc="2025-07-26T20:03:00Z">
-        <w:r>
-          <w:rPr>
-            <w:rFonts w:ascii="Garamond" w:eastAsia="Times New Roman" w:hAnsi="Garamond" w:cs="Times New Roman"/>
-            <w:kern w:val="0"/>
-            <w:sz w:val="22"/>
-            <w:szCs w:val="22"/>
-            <w14:ligatures w14:val="none"/>
-          </w:rPr>
-          <w:delText>An</w:delText>
-        </w:r>
-      </w:del>
+          <w:rFonts w:ascii="Garamond" w:hAnsi="Garamond" w:cs="Times New Roman"/>
+          <w:sz w:val="22"/>
+          <w:szCs w:val="22"/>
+        </w:rPr>
+      </w:pPr>
+      <w:r>
+        <w:rPr>
+          <w:rFonts w:ascii="Garamond" w:eastAsia="Times New Roman" w:hAnsi="Garamond" w:cs="Times New Roman"/>
+          <w:kern w:val="0"/>
+          <w:sz w:val="22"/>
+          <w:szCs w:val="22"/>
+          <w14:ligatures w14:val="none"/>
+        </w:rPr>
+        <w:t>We used an</w:t>
+      </w:r>
       <w:r>
         <w:rPr>
           <w:rFonts w:ascii="Garamond" w:eastAsia="Times New Roman" w:hAnsi="Garamond" w:cs="Times New Roman"/>
@@ -2975,40 +2826,46 @@
         </w:rPr>
         <w:t xml:space="preserve"> of the Kuskokwim river </w:t>
       </w:r>
-      <w:ins w:id="13" w:author="Benjamin J. Makhlouf" w:date="2025-07-26T13:03:00Z" w16du:dateUtc="2025-07-26T20:03:00Z">
-        <w:r>
-          <w:rPr>
-            <w:rFonts w:ascii="Garamond" w:eastAsia="Times New Roman" w:hAnsi="Garamond" w:cs="Times New Roman"/>
-            <w:kern w:val="0"/>
-            <w:sz w:val="22"/>
-            <w:szCs w:val="22"/>
-            <w14:ligatures w14:val="none"/>
-          </w:rPr>
-          <w:t xml:space="preserve">basin </w:t>
-        </w:r>
-        <w:proofErr w:type="spellStart"/>
-        <w:r>
-          <w:rPr>
-            <w:rFonts w:ascii="Garamond" w:eastAsia="Times New Roman" w:hAnsi="Garamond" w:cs="Times New Roman"/>
-            <w:kern w:val="0"/>
-            <w:sz w:val="22"/>
-            <w:szCs w:val="22"/>
-            <w14:ligatures w14:val="none"/>
-          </w:rPr>
-          <w:t>contstucted</w:t>
-        </w:r>
-        <w:proofErr w:type="spellEnd"/>
-        <w:r>
-          <w:rPr>
-            <w:rFonts w:ascii="Garamond" w:eastAsia="Times New Roman" w:hAnsi="Garamond" w:cs="Times New Roman"/>
-            <w:kern w:val="0"/>
-            <w:sz w:val="22"/>
-            <w:szCs w:val="22"/>
-            <w14:ligatures w14:val="none"/>
-          </w:rPr>
-          <w:t xml:space="preserve"> in </w:t>
-        </w:r>
-      </w:ins>
+      <w:r>
+        <w:rPr>
+          <w:rFonts w:ascii="Garamond" w:eastAsia="Times New Roman" w:hAnsi="Garamond" w:cs="Times New Roman"/>
+          <w:kern w:val="0"/>
+          <w:sz w:val="22"/>
+          <w:szCs w:val="22"/>
+          <w14:ligatures w14:val="none"/>
+        </w:rPr>
+        <w:t xml:space="preserve">basin </w:t>
+      </w:r>
+      <w:r>
+        <w:rPr>
+          <w:rFonts w:ascii="Garamond" w:eastAsia="Times New Roman" w:hAnsi="Garamond" w:cs="Times New Roman"/>
+          <w:kern w:val="0"/>
+          <w:sz w:val="22"/>
+          <w:szCs w:val="22"/>
+          <w14:ligatures w14:val="none"/>
+        </w:rPr>
+        <w:t>constructed</w:t>
+      </w:r>
+      <w:r>
+        <w:rPr>
+          <w:rFonts w:ascii="Garamond" w:eastAsia="Times New Roman" w:hAnsi="Garamond" w:cs="Times New Roman"/>
+          <w:kern w:val="0"/>
+          <w:sz w:val="22"/>
+          <w:szCs w:val="22"/>
+          <w14:ligatures w14:val="none"/>
+        </w:rPr>
+        <w:t xml:space="preserve"> </w:t>
+      </w:r>
+      <w:r>
+        <w:rPr>
+          <w:rFonts w:ascii="Garamond" w:eastAsia="Times New Roman" w:hAnsi="Garamond" w:cs="Times New Roman"/>
+          <w:kern w:val="0"/>
+          <w:sz w:val="22"/>
+          <w:szCs w:val="22"/>
+          <w14:ligatures w14:val="none"/>
+        </w:rPr>
+        <w:t xml:space="preserve">by </w:t>
+      </w:r>
       <w:r>
         <w:rPr>
           <w:rFonts w:ascii="Garamond" w:eastAsia="Times New Roman" w:hAnsi="Garamond" w:cs="Times New Roman"/>
@@ -3060,60 +2917,16 @@
         </w:rPr>
         <w:fldChar w:fldCharType="end"/>
       </w:r>
-      <w:ins w:id="14" w:author="Benjamin J. Makhlouf" w:date="2025-07-26T13:03:00Z" w16du:dateUtc="2025-07-26T20:03:00Z">
-        <w:r>
-          <w:rPr>
-            <w:rFonts w:ascii="Garamond" w:eastAsia="Times New Roman" w:hAnsi="Garamond" w:cs="Times New Roman"/>
-            <w:kern w:val="0"/>
-            <w:sz w:val="22"/>
-            <w:szCs w:val="22"/>
-            <w14:ligatures w14:val="none"/>
-          </w:rPr>
-          <w:t xml:space="preserve">, in which </w:t>
-        </w:r>
-      </w:ins>
-      <w:del w:id="15" w:author="Benjamin J. Makhlouf" w:date="2025-07-26T13:03:00Z" w16du:dateUtc="2025-07-26T20:03:00Z">
-        <w:r>
-          <w:rPr>
-            <w:rFonts w:ascii="Garamond" w:eastAsia="Times New Roman" w:hAnsi="Garamond" w:cs="Times New Roman"/>
-            <w:kern w:val="0"/>
-            <w:sz w:val="22"/>
-            <w:szCs w:val="22"/>
-            <w14:ligatures w14:val="none"/>
-          </w:rPr>
-          <w:delText>was</w:delText>
-        </w:r>
-        <w:r>
-          <w:rPr>
-            <w:rFonts w:ascii="Garamond" w:eastAsia="Times New Roman" w:hAnsi="Garamond" w:cs="Times New Roman"/>
-            <w:kern w:val="0"/>
-            <w:sz w:val="22"/>
-            <w:szCs w:val="22"/>
-            <w14:ligatures w14:val="none"/>
-          </w:rPr>
-          <w:delText xml:space="preserve"> constructed to </w:delText>
-        </w:r>
-        <w:r>
-          <w:rPr>
-            <w:rFonts w:ascii="Garamond" w:eastAsia="Times New Roman" w:hAnsi="Garamond" w:cs="Times New Roman"/>
-            <w:kern w:val="0"/>
-            <w:sz w:val="22"/>
-            <w:szCs w:val="22"/>
-            <w14:ligatures w14:val="none"/>
-          </w:rPr>
-          <w:delText>model</w:delText>
-        </w:r>
-        <w:r>
-          <w:rPr>
-            <w:rFonts w:ascii="Garamond" w:eastAsia="Times New Roman" w:hAnsi="Garamond" w:cs="Times New Roman"/>
-            <w:kern w:val="0"/>
-            <w:sz w:val="22"/>
-            <w:szCs w:val="22"/>
-            <w14:ligatures w14:val="none"/>
-          </w:rPr>
-          <w:delText xml:space="preserve"> </w:delText>
-        </w:r>
-      </w:del>
+      <w:r>
+        <w:rPr>
+          <w:rFonts w:ascii="Garamond" w:eastAsia="Times New Roman" w:hAnsi="Garamond" w:cs="Times New Roman"/>
+          <w:kern w:val="0"/>
+          <w:sz w:val="22"/>
+          <w:szCs w:val="22"/>
+          <w14:ligatures w14:val="none"/>
+        </w:rPr>
+        <w:t xml:space="preserve">, in which </w:t>
+      </w:r>
       <w:r>
         <w:rPr>
           <w:rFonts w:ascii="Garamond" w:eastAsia="Times New Roman" w:hAnsi="Garamond" w:cs="Times New Roman"/>
@@ -3166,261 +2979,6 @@
         </w:rPr>
         <w:t xml:space="preserve"> ratios across the river basin</w:t>
       </w:r>
-      <w:ins w:id="16" w:author="Benjamin J. Makhlouf" w:date="2025-07-26T13:03:00Z" w16du:dateUtc="2025-07-26T20:03:00Z">
-        <w:r>
-          <w:rPr>
-            <w:rFonts w:ascii="Garamond" w:eastAsia="Times New Roman" w:hAnsi="Garamond" w:cs="Times New Roman"/>
-            <w:kern w:val="0"/>
-            <w:sz w:val="22"/>
-            <w:szCs w:val="22"/>
-            <w14:ligatures w14:val="none"/>
-          </w:rPr>
-          <w:t xml:space="preserve"> and associated uncertainty was modeled</w:t>
-        </w:r>
-      </w:ins>
-      <w:ins w:id="17" w:author="Benjamin J. Makhlouf" w:date="2025-07-26T13:02:00Z" w16du:dateUtc="2025-07-26T20:02:00Z">
-        <w:r>
-          <w:rPr>
-            <w:rFonts w:ascii="Garamond" w:eastAsia="Times New Roman" w:hAnsi="Garamond" w:cs="Times New Roman"/>
-            <w:kern w:val="0"/>
-            <w:sz w:val="22"/>
-            <w:szCs w:val="22"/>
-            <w14:ligatures w14:val="none"/>
-          </w:rPr>
-          <w:t xml:space="preserve"> using spatial stream network modeling (SSNM)</w:t>
-        </w:r>
-      </w:ins>
-      <w:ins w:id="18" w:author="Benjamin J. Makhlouf" w:date="2025-07-26T13:03:00Z" w16du:dateUtc="2025-07-26T20:03:00Z">
-        <w:r>
-          <w:rPr>
-            <w:rFonts w:ascii="Garamond" w:eastAsia="Times New Roman" w:hAnsi="Garamond" w:cs="Times New Roman"/>
-            <w:kern w:val="0"/>
-            <w:sz w:val="22"/>
-            <w:szCs w:val="22"/>
-            <w14:ligatures w14:val="none"/>
-          </w:rPr>
-          <w:t>.</w:t>
-        </w:r>
-      </w:ins>
-      <w:ins w:id="19" w:author="Benjamin J. Makhlouf" w:date="2025-07-26T13:04:00Z" w16du:dateUtc="2025-07-26T20:04:00Z">
-        <w:r>
-          <w:rPr>
-            <w:rFonts w:ascii="Garamond" w:eastAsia="Times New Roman" w:hAnsi="Garamond" w:cs="Times New Roman"/>
-            <w:kern w:val="0"/>
-            <w:sz w:val="22"/>
-            <w:szCs w:val="22"/>
-            <w14:ligatures w14:val="none"/>
-          </w:rPr>
-          <w:t xml:space="preserve"> </w:t>
-        </w:r>
-      </w:ins>
-      <w:del w:id="20" w:author="Benjamin J. Makhlouf" w:date="2025-07-26T13:03:00Z" w16du:dateUtc="2025-07-26T20:03:00Z">
-        <w:r>
-          <w:rPr>
-            <w:rFonts w:ascii="Garamond" w:eastAsia="Times New Roman" w:hAnsi="Garamond" w:cs="Times New Roman"/>
-            <w:kern w:val="0"/>
-            <w:sz w:val="22"/>
-            <w:szCs w:val="22"/>
-            <w14:ligatures w14:val="none"/>
-          </w:rPr>
-          <w:fldChar w:fldCharType="begin"/>
-        </w:r>
-        <w:r>
-          <w:rPr>
-            <w:rFonts w:ascii="Garamond" w:eastAsia="Times New Roman" w:hAnsi="Garamond" w:cs="Times New Roman"/>
-            <w:kern w:val="0"/>
-            <w:sz w:val="22"/>
-            <w:szCs w:val="22"/>
-            <w14:ligatures w14:val="none"/>
-          </w:rPr>
-          <w:delInstrText xml:space="preserve"> ADDIN ZOTERO_ITEM CSL_CITATION {"citationID":"98Fo8NBI","properties":{"formattedCitation":"(French et al., 2020)","plainCitation":"(French et al., 2020)","noteIndex":0},"citationItems":[{"id":1684,"uris":["http://zotero.org/users/8421274/items/M654PKRJ"],"itemData":{"id":1684,"type":"article-journal","abstract":"Riverine chemistry reflects both watershed conditions and instream processing, both of which vary across river networks, yet little is known about the scales at which watershed attributes regulate biogeochemical constituents. We used spatial stream network (SSN) models to quantify both watershed and instream effects on streamwater constituents in the Kuskokwim River (western Alaska), the largest free-flowing river in the United States. We assessed chemical constituents spanning from labile nutrients (nitrate [NO3−] and orthophosphate [PO43−]) to biologically and chemically conservative tracers (calcium [Ca2+], strontium [Sr2+], and Sr isotopes [87Sr/86Sr]). We also examined the behavior of dissolved organic carbon (DOC) relative to these constituents to understand whether bulk DOC behaved conservatively in a large boreal river network, where future changes in DOC and nutrient loading are expected under a shifting climate. We derived watershed spatial covariates comprising land cover, geology, and geomorphic characteristics at 14 different spatial extents based on stream order and relative to position in the river network to understand the effect of distant and proximal watershed attributes on streamwater constituents. For all constituents but 87Sr/86Sr, watershed attributes in low-order headwater catchments yielded the best predictive ability for streamwater constituent concentrations across the entire network. Spatial patterning for conservative tracers and bulk DOC showed strong spatial autocorrelation, whereas PO43− and NO3− exhibited spatial patchiness indicative of instream processing. Our work shows that headwater streams are disproportionately important contributors to network-wide biogeochemical constituents supporting aquatic food webs and that conservation and management of aquatic systems should include these small and often remote watershed areas.","container-title":"Journal of Geophysical Research: Biogeosciences","DOI":"10.1029/2020JG005851","ISSN":"2169-8961","issue":"12","language":"en","note":"_eprint: https://agupubs.onlinelibrary.wiley.com/doi/pdf/10.1029/2020JG005851","page":"e2020JG005851","source":"Wiley Online Library","title":"Headwater Catchments Govern Biogeochemistry in America's Largest Free-Flowing River Network","volume":"125","author":[{"family":"French","given":"David W."},{"family":"Schindler","given":"Daniel E."},{"family":"Brennan","given":"Sean R."},{"family":"Whited","given":"Diane"}],"issued":{"date-parts":[["2020"]]}}}],"schema":"https://github.com/citation-style-language/schema/raw/master/csl-citation.json"} </w:delInstrText>
-        </w:r>
-        <w:r>
-          <w:rPr>
-            <w:rFonts w:ascii="Garamond" w:eastAsia="Times New Roman" w:hAnsi="Garamond" w:cs="Times New Roman"/>
-            <w:kern w:val="0"/>
-            <w:sz w:val="22"/>
-            <w:szCs w:val="22"/>
-            <w14:ligatures w14:val="none"/>
-          </w:rPr>
-          <w:fldChar w:fldCharType="separate"/>
-        </w:r>
-        <w:r>
-          <w:rPr>
-            <w:rFonts w:ascii="Garamond" w:eastAsia="Times New Roman" w:hAnsi="Garamond" w:cs="Times New Roman"/>
-            <w:noProof/>
-            <w:kern w:val="0"/>
-            <w:sz w:val="22"/>
-            <w:szCs w:val="22"/>
-            <w14:ligatures w14:val="none"/>
-          </w:rPr>
-          <w:delText>(French et al., 2020)</w:delText>
-        </w:r>
-        <w:r>
-          <w:rPr>
-            <w:rFonts w:ascii="Garamond" w:eastAsia="Times New Roman" w:hAnsi="Garamond" w:cs="Times New Roman"/>
-            <w:kern w:val="0"/>
-            <w:sz w:val="22"/>
-            <w:szCs w:val="22"/>
-            <w14:ligatures w14:val="none"/>
-          </w:rPr>
-          <w:fldChar w:fldCharType="end"/>
-        </w:r>
-      </w:del>
-      <w:del w:id="21" w:author="Benjamin J. Makhlouf" w:date="2025-07-26T13:02:00Z" w16du:dateUtc="2025-07-26T20:02:00Z">
-        <w:r>
-          <w:rPr>
-            <w:rFonts w:ascii="Garamond" w:eastAsia="Times New Roman" w:hAnsi="Garamond" w:cs="Times New Roman"/>
-            <w:kern w:val="0"/>
-            <w:sz w:val="22"/>
-            <w:szCs w:val="22"/>
-            <w14:ligatures w14:val="none"/>
-          </w:rPr>
-          <w:delText xml:space="preserve">, following the methodology described in </w:delText>
-        </w:r>
-        <w:r>
-          <w:rPr>
-            <w:rFonts w:ascii="Garamond" w:eastAsia="Times New Roman" w:hAnsi="Garamond" w:cs="Times New Roman"/>
-            <w:kern w:val="0"/>
-            <w:sz w:val="22"/>
-            <w:szCs w:val="22"/>
-            <w14:ligatures w14:val="none"/>
-          </w:rPr>
-          <w:fldChar w:fldCharType="begin"/>
-        </w:r>
-        <w:r>
-          <w:rPr>
-            <w:rFonts w:ascii="Garamond" w:eastAsia="Times New Roman" w:hAnsi="Garamond" w:cs="Times New Roman"/>
-            <w:kern w:val="0"/>
-            <w:sz w:val="22"/>
-            <w:szCs w:val="22"/>
-            <w14:ligatures w14:val="none"/>
-          </w:rPr>
-          <w:delInstrText xml:space="preserve"> ADDIN ZOTERO_ITEM CSL_CITATION {"citationID":"ABJTaAkC","properties":{"formattedCitation":"(Brennan et al., 2016)","plainCitation":"(Brennan et al., 2016)","dontUpdate":true,"noteIndex":0},"citationItems":[{"id":2315,"uris":["http://zotero.org/users/8421274/items/Q4IUGSIX"],"itemData":{"id":2315,"type":"article-journal","abstract":"A critical challenge for the Earth sciences is to trace the transport and flux of matter within and among aquatic, terrestrial, and atmospheric systems. Robust descriptions of isotopic patterns across space and time, called “isoscapes,” form the basis of a rapidly growing and wide-ranging body of research aimed at quantifying connectivity within and among Earth's systems. However, isoscapes of rivers have been limited by conventional Euclidean approaches in geostatistics and the lack of a quantitative framework to apportion the influence of processes driven by landscape features versus in-stream phenomena. Here we demonstrate how dendritic network models substantially improve the accuracy of isoscapes of strontium isotopes and partition the influence of hydrologic transport versus local geologic features on strontium isotope ratios in a large Alaska river. This work illustrates the analytical power of dendritic network models for the field of isotope biogeochemistry, particularly for provenance studies of modern and ancient animals.","container-title":"Geophysical Research Letters","DOI":"10.1002/2016GL068904","ISSN":"1944-8007","issue":"10","language":"en","note":"_eprint: https://onlinelibrary.wiley.com/doi/pdf/10.1002/2016GL068904","page":"5043-5051","source":"Wiley Online Library","title":"Dendritic network models: Improving isoscapes and quantifying influence of landscape and in-stream processes on strontium isotopes in rivers","title-short":"Dendritic network models","volume":"43","author":[{"family":"Brennan","given":"Sean R."},{"family":"Torgersen","given":"Christian E."},{"family":"Hollenbeck","given":"Jeff P."},{"family":"Fernandez","given":"Diego P."},{"family":"Jensen","given":"Carrie K."},{"family":"Schindler","given":"Daniel E."}],"issued":{"date-parts":[["2016"]]}}}],"schema":"https://github.com/citation-style-language/schema/raw/master/csl-citation.json"} </w:delInstrText>
-        </w:r>
-        <w:r>
-          <w:rPr>
-            <w:rFonts w:ascii="Garamond" w:eastAsia="Times New Roman" w:hAnsi="Garamond" w:cs="Times New Roman"/>
-            <w:kern w:val="0"/>
-            <w:sz w:val="22"/>
-            <w:szCs w:val="22"/>
-            <w14:ligatures w14:val="none"/>
-          </w:rPr>
-          <w:fldChar w:fldCharType="separate"/>
-        </w:r>
-        <w:r>
-          <w:rPr>
-            <w:rFonts w:ascii="Garamond" w:eastAsia="Times New Roman" w:hAnsi="Garamond" w:cs="Times New Roman"/>
-            <w:noProof/>
-            <w:kern w:val="0"/>
-            <w:sz w:val="22"/>
-            <w:szCs w:val="22"/>
-            <w14:ligatures w14:val="none"/>
-          </w:rPr>
-          <w:delText>Brennan et al., (2016)</w:delText>
-        </w:r>
-        <w:r>
-          <w:rPr>
-            <w:rFonts w:ascii="Garamond" w:eastAsia="Times New Roman" w:hAnsi="Garamond" w:cs="Times New Roman"/>
-            <w:kern w:val="0"/>
-            <w:sz w:val="22"/>
-            <w:szCs w:val="22"/>
-            <w14:ligatures w14:val="none"/>
-          </w:rPr>
-          <w:fldChar w:fldCharType="end"/>
-        </w:r>
-        <w:r>
-          <w:rPr>
-            <w:rFonts w:ascii="Garamond" w:eastAsia="Times New Roman" w:hAnsi="Garamond" w:cs="Times New Roman"/>
-            <w:kern w:val="0"/>
-            <w:sz w:val="22"/>
-            <w:szCs w:val="22"/>
-            <w14:ligatures w14:val="none"/>
-          </w:rPr>
-          <w:delText xml:space="preserve"> </w:delText>
-        </w:r>
-        <w:r>
-          <w:rPr>
-            <w:rFonts w:ascii="Garamond" w:eastAsia="Times New Roman" w:hAnsi="Garamond" w:cs="Times New Roman"/>
-            <w:kern w:val="0"/>
-            <w:sz w:val="22"/>
-            <w:szCs w:val="22"/>
-            <w14:ligatures w14:val="none"/>
-          </w:rPr>
-          <w:delText xml:space="preserve">and </w:delText>
-        </w:r>
-        <w:r>
-          <w:rPr>
-            <w:rFonts w:ascii="Garamond" w:eastAsia="Times New Roman" w:hAnsi="Garamond" w:cs="Times New Roman"/>
-            <w:kern w:val="0"/>
-            <w:sz w:val="22"/>
-            <w:szCs w:val="22"/>
-            <w14:ligatures w14:val="none"/>
-          </w:rPr>
-          <w:fldChar w:fldCharType="begin"/>
-        </w:r>
-        <w:r>
-          <w:rPr>
-            <w:rFonts w:ascii="Garamond" w:eastAsia="Times New Roman" w:hAnsi="Garamond" w:cs="Times New Roman"/>
-            <w:kern w:val="0"/>
-            <w:sz w:val="22"/>
-            <w:szCs w:val="22"/>
-            <w14:ligatures w14:val="none"/>
-          </w:rPr>
-          <w:delInstrText xml:space="preserve"> ADDIN ZOTERO_ITEM CSL_CITATION {"citationID":"9A6PUmLO","properties":{"formattedCitation":"(Makhlouf et al., 2025)","plainCitation":"(Makhlouf et al., 2025)","noteIndex":0},"citationItems":[{"id":5397,"uris":["http://zotero.org/users/8421274/items/WRVF2L9N"],"itemData":{"id":5397,"type":"article-journal","abstract":"Understanding the spatial ecology of migratory species is uniquely challenging using conventional approaches. In fisheries such as for Pacific salmon, genetic stock identification (GSI) and isotope-based methods have emerged as strategies for reconstructing spatial ecology but are limited by the spatial resolution of genetic differentiation and isotopic heterogeneity. We show that integrating these complementary datasets improve the spatial resolution of provenance assignments. To do so, we reconstructed basin-wide estimates of natal origin locations for Chinook salmon in the Yukon River using samples (n = 247) from an experimental fishery designed to assess in-season run timing. A combined framework improved precision of likely provenance assignments (stream km &gt; 0.7 posterior probability) by 92% over genetic assignments and 52% over strontium isotope methods. In doing so, we illustrate watershed scale estimates of natal origin distributions with a greater resolution available from GSI or isotope data alone.","container-title":"Limnology and Oceanography Letters","DOI":"10.1002/lol2.70025","ISSN":"2378-2242","issue":"n/a","language":"en","license":"© 2025 The Author(s). Limnology and Oceanography Letters published by Wiley Periodicals LLC on behalf of Association for the Sciences of Limnology and Oceanography.","note":"_eprint: https://onlinelibrary.wiley.com/doi/pdf/10.1002/lol2.70025","source":"Wiley Online Library","title":"Combining genetic and isotope frameworks improves reconstruction of fish provenance across riverscapes","URL":"https://onlinelibrary.wiley.com/doi/abs/10.1002/lol2.70025","volume":"n/a","author":[{"family":"Makhlouf","given":"Ben"},{"family":"Cline","given":"Timothy J."},{"family":"Fernandez","given":"Diego"},{"family":"Seeb","given":"Lisa"},{"family":"Lee","given":"Elizabeth"},{"family":"Gilk-Baumer","given":"Sara"},{"family":"Whited","given":"Diane"},{"family":"Zimmerman","given":"Christian E."},{"family":"Schindler","given":"Daniel E."}],"accessed":{"date-parts":[["2025",6,4]]},"issued":{"date-parts":[["2025"]]}}}],"schema":"https://github.com/citation-style-language/schema/raw/master/csl-citation.json"} </w:delInstrText>
-        </w:r>
-        <w:r>
-          <w:rPr>
-            <w:rFonts w:ascii="Garamond" w:eastAsia="Times New Roman" w:hAnsi="Garamond" w:cs="Times New Roman"/>
-            <w:kern w:val="0"/>
-            <w:sz w:val="22"/>
-            <w:szCs w:val="22"/>
-            <w14:ligatures w14:val="none"/>
-          </w:rPr>
-          <w:fldChar w:fldCharType="separate"/>
-        </w:r>
-        <w:r>
-          <w:rPr>
-            <w:rFonts w:ascii="Garamond" w:eastAsia="Times New Roman" w:hAnsi="Garamond" w:cs="Times New Roman"/>
-            <w:noProof/>
-            <w:kern w:val="0"/>
-            <w:sz w:val="22"/>
-            <w:szCs w:val="22"/>
-            <w14:ligatures w14:val="none"/>
-          </w:rPr>
-          <w:delText>(Makhlouf et al., 2025)</w:delText>
-        </w:r>
-        <w:r>
-          <w:rPr>
-            <w:rFonts w:ascii="Garamond" w:eastAsia="Times New Roman" w:hAnsi="Garamond" w:cs="Times New Roman"/>
-            <w:kern w:val="0"/>
-            <w:sz w:val="22"/>
-            <w:szCs w:val="22"/>
-            <w14:ligatures w14:val="none"/>
-          </w:rPr>
-          <w:fldChar w:fldCharType="end"/>
-        </w:r>
-        <w:r>
-          <w:rPr>
-            <w:rFonts w:ascii="Garamond" w:eastAsia="Times New Roman" w:hAnsi="Garamond" w:cs="Times New Roman"/>
-            <w:kern w:val="0"/>
-            <w:sz w:val="22"/>
-            <w:szCs w:val="22"/>
-            <w14:ligatures w14:val="none"/>
-          </w:rPr>
-          <w:delText xml:space="preserve">. </w:delText>
-        </w:r>
-      </w:del>
-      <w:r>
-        <w:rPr>
-          <w:rFonts w:ascii="Garamond" w:eastAsia="Times New Roman" w:hAnsi="Garamond" w:cs="Times New Roman"/>
-          <w:kern w:val="0"/>
-          <w:sz w:val="22"/>
-          <w:szCs w:val="22"/>
-          <w14:ligatures w14:val="none"/>
-        </w:rPr>
-        <w:t>Briefly,</w:t>
-      </w:r>
       <w:r>
         <w:rPr>
           <w:rFonts w:ascii="Garamond" w:eastAsia="Times New Roman" w:hAnsi="Garamond" w:cs="Times New Roman"/>
@@ -3439,71 +2997,36 @@
           <w:szCs w:val="22"/>
           <w14:ligatures w14:val="none"/>
         </w:rPr>
-        <w:t xml:space="preserve"> Sr</w:t>
-      </w:r>
-      <w:r>
-        <w:rPr>
-          <w:rFonts w:ascii="Garamond" w:eastAsia="Times New Roman" w:hAnsi="Garamond" w:cs="Times New Roman"/>
-          <w:kern w:val="0"/>
-          <w:sz w:val="22"/>
-          <w:szCs w:val="22"/>
-          <w:vertAlign w:val="superscript"/>
-          <w14:ligatures w14:val="none"/>
-        </w:rPr>
-        <w:t>87</w:t>
-      </w:r>
-      <w:r>
-        <w:rPr>
-          <w:rFonts w:ascii="Garamond" w:eastAsia="Times New Roman" w:hAnsi="Garamond" w:cs="Times New Roman"/>
-          <w:kern w:val="0"/>
-          <w:sz w:val="22"/>
-          <w:szCs w:val="22"/>
-          <w14:ligatures w14:val="none"/>
-        </w:rPr>
-        <w:t>/Sr</w:t>
-      </w:r>
-      <w:r>
-        <w:rPr>
-          <w:rFonts w:ascii="Garamond" w:eastAsia="Times New Roman" w:hAnsi="Garamond" w:cs="Times New Roman"/>
-          <w:kern w:val="0"/>
-          <w:sz w:val="22"/>
-          <w:szCs w:val="22"/>
-          <w:vertAlign w:val="superscript"/>
-          <w14:ligatures w14:val="none"/>
-        </w:rPr>
-        <w:t>86</w:t>
-      </w:r>
-      <w:r>
-        <w:rPr>
-          <w:rFonts w:ascii="Garamond" w:eastAsia="Times New Roman" w:hAnsi="Garamond" w:cs="Times New Roman"/>
-          <w:kern w:val="0"/>
-          <w:sz w:val="22"/>
-          <w:szCs w:val="22"/>
-          <w14:ligatures w14:val="none"/>
-        </w:rPr>
-        <w:t xml:space="preserve"> values were derived from water samples </w:t>
-      </w:r>
-      <w:del w:id="22" w:author="Benjamin J. Makhlouf" w:date="2025-07-26T13:00:00Z" w16du:dateUtc="2025-07-26T20:00:00Z">
-        <w:r>
-          <w:rPr>
-            <w:rFonts w:ascii="Garamond" w:eastAsia="Times New Roman" w:hAnsi="Garamond" w:cs="Times New Roman"/>
-            <w:kern w:val="0"/>
-            <w:sz w:val="22"/>
-            <w:szCs w:val="22"/>
-            <w:highlight w:val="yellow"/>
-            <w14:ligatures w14:val="none"/>
-          </w:rPr>
-          <w:delText>(</w:delText>
-        </w:r>
-      </w:del>
-      <w:r>
-        <w:rPr>
-          <w:rFonts w:ascii="Garamond" w:eastAsia="Times New Roman" w:hAnsi="Garamond" w:cs="Times New Roman"/>
-          <w:kern w:val="0"/>
-          <w:sz w:val="22"/>
-          <w:szCs w:val="22"/>
-          <w14:ligatures w14:val="none"/>
-          <w:rPrChange w:id="23" w:author="Benjamin J. Makhlouf" w:date="2025-07-26T13:00:00Z" w16du:dateUtc="2025-07-26T20:00:00Z">
+        <w:t xml:space="preserve">were </w:t>
+      </w:r>
+      <w:r>
+        <w:rPr>
+          <w:rFonts w:ascii="Garamond" w:eastAsia="Times New Roman" w:hAnsi="Garamond" w:cs="Times New Roman"/>
+          <w:kern w:val="0"/>
+          <w:sz w:val="22"/>
+          <w:szCs w:val="22"/>
+          <w14:ligatures w14:val="none"/>
+        </w:rPr>
+        <w:t>modeled using spatial stream network modeling (SSNM)</w:t>
+      </w:r>
+      <w:r>
+        <w:rPr>
+          <w:rFonts w:ascii="Garamond" w:eastAsia="Times New Roman" w:hAnsi="Garamond" w:cs="Times New Roman"/>
+          <w:kern w:val="0"/>
+          <w:sz w:val="22"/>
+          <w:szCs w:val="22"/>
+          <w14:ligatures w14:val="none"/>
+        </w:rPr>
+        <w:t xml:space="preserve"> and derived from water samples collected throughout the river basin </w:t>
+      </w:r>
+      <w:r>
+        <w:rPr>
+          <w:rFonts w:ascii="Garamond" w:eastAsia="Times New Roman" w:hAnsi="Garamond" w:cs="Times New Roman"/>
+          <w:kern w:val="0"/>
+          <w:sz w:val="22"/>
+          <w:szCs w:val="22"/>
+          <w14:ligatures w14:val="none"/>
+          <w:rPrChange w:id="7" w:author="Benjamin J. Makhlouf" w:date="2025-07-26T13:00:00Z" w16du:dateUtc="2025-07-26T20:00:00Z">
             <w:rPr>
               <w:rFonts w:ascii="Garamond" w:eastAsia="Times New Roman" w:hAnsi="Garamond" w:cs="Times New Roman"/>
               <w:kern w:val="0"/>
@@ -3523,7 +3046,7 @@
           <w:sz w:val="22"/>
           <w:szCs w:val="22"/>
           <w14:ligatures w14:val="none"/>
-          <w:rPrChange w:id="24" w:author="Benjamin J. Makhlouf" w:date="2025-07-26T13:00:00Z" w16du:dateUtc="2025-07-26T20:00:00Z">
+          <w:rPrChange w:id="8" w:author="Benjamin J. Makhlouf" w:date="2025-07-26T13:00:00Z" w16du:dateUtc="2025-07-26T20:00:00Z">
             <w:rPr>
               <w:rFonts w:ascii="Garamond" w:eastAsia="Times New Roman" w:hAnsi="Garamond" w:cs="Times New Roman"/>
               <w:kern w:val="0"/>
@@ -3543,7 +3066,7 @@
           <w:sz w:val="22"/>
           <w:szCs w:val="22"/>
           <w14:ligatures w14:val="none"/>
-          <w:rPrChange w:id="25" w:author="Benjamin J. Makhlouf" w:date="2025-07-26T13:00:00Z" w16du:dateUtc="2025-07-26T20:00:00Z">
+          <w:rPrChange w:id="9" w:author="Benjamin J. Makhlouf" w:date="2025-07-26T13:00:00Z" w16du:dateUtc="2025-07-26T20:00:00Z">
             <w:rPr>
               <w:rFonts w:ascii="Garamond" w:eastAsia="Times New Roman" w:hAnsi="Garamond" w:cs="Times New Roman"/>
               <w:kern w:val="0"/>
@@ -3564,7 +3087,7 @@
           <w:sz w:val="22"/>
           <w:szCs w:val="22"/>
           <w14:ligatures w14:val="none"/>
-          <w:rPrChange w:id="26" w:author="Benjamin J. Makhlouf" w:date="2025-07-26T13:00:00Z" w16du:dateUtc="2025-07-26T20:00:00Z">
+          <w:rPrChange w:id="10" w:author="Benjamin J. Makhlouf" w:date="2025-07-26T13:00:00Z" w16du:dateUtc="2025-07-26T20:00:00Z">
             <w:rPr>
               <w:rFonts w:ascii="Garamond" w:eastAsia="Times New Roman" w:hAnsi="Garamond" w:cs="Times New Roman"/>
               <w:noProof/>
@@ -3578,30 +3101,6 @@
         </w:rPr>
         <w:t>(French et al., 2020</w:t>
       </w:r>
-      <w:ins w:id="27" w:author="Benjamin J. Makhlouf" w:date="2025-07-26T13:00:00Z" w16du:dateUtc="2025-07-26T20:00:00Z">
-        <w:r>
-          <w:rPr>
-            <w:rFonts w:ascii="Garamond" w:eastAsia="Times New Roman" w:hAnsi="Garamond" w:cs="Times New Roman"/>
-            <w:noProof/>
-            <w:kern w:val="0"/>
-            <w:sz w:val="22"/>
-            <w:szCs w:val="22"/>
-            <w14:ligatures w14:val="none"/>
-            <w:rPrChange w:id="28" w:author="Benjamin J. Makhlouf" w:date="2025-07-26T13:00:00Z" w16du:dateUtc="2025-07-26T20:00:00Z">
-              <w:rPr>
-                <w:rFonts w:ascii="Garamond" w:eastAsia="Times New Roman" w:hAnsi="Garamond" w:cs="Times New Roman"/>
-                <w:noProof/>
-                <w:kern w:val="0"/>
-                <w:sz w:val="22"/>
-                <w:szCs w:val="22"/>
-                <w:highlight w:val="yellow"/>
-                <w14:ligatures w14:val="none"/>
-              </w:rPr>
-            </w:rPrChange>
-          </w:rPr>
-          <w:t>, N = 120</w:t>
-        </w:r>
-      </w:ins>
       <w:r>
         <w:rPr>
           <w:rFonts w:ascii="Garamond" w:eastAsia="Times New Roman" w:hAnsi="Garamond" w:cs="Times New Roman"/>
@@ -3610,7 +3109,7 @@
           <w:sz w:val="22"/>
           <w:szCs w:val="22"/>
           <w14:ligatures w14:val="none"/>
-          <w:rPrChange w:id="29" w:author="Benjamin J. Makhlouf" w:date="2025-07-26T13:00:00Z" w16du:dateUtc="2025-07-26T20:00:00Z">
+          <w:rPrChange w:id="11" w:author="Benjamin J. Makhlouf" w:date="2025-07-26T13:00:00Z" w16du:dateUtc="2025-07-26T20:00:00Z">
             <w:rPr>
               <w:rFonts w:ascii="Garamond" w:eastAsia="Times New Roman" w:hAnsi="Garamond" w:cs="Times New Roman"/>
               <w:noProof/>
@@ -3622,6 +3121,28 @@
             </w:rPr>
           </w:rPrChange>
         </w:rPr>
+        <w:t>, N = 120</w:t>
+      </w:r>
+      <w:r>
+        <w:rPr>
+          <w:rFonts w:ascii="Garamond" w:eastAsia="Times New Roman" w:hAnsi="Garamond" w:cs="Times New Roman"/>
+          <w:noProof/>
+          <w:kern w:val="0"/>
+          <w:sz w:val="22"/>
+          <w:szCs w:val="22"/>
+          <w14:ligatures w14:val="none"/>
+          <w:rPrChange w:id="12" w:author="Benjamin J. Makhlouf" w:date="2025-07-26T13:00:00Z" w16du:dateUtc="2025-07-26T20:00:00Z">
+            <w:rPr>
+              <w:rFonts w:ascii="Garamond" w:eastAsia="Times New Roman" w:hAnsi="Garamond" w:cs="Times New Roman"/>
+              <w:noProof/>
+              <w:kern w:val="0"/>
+              <w:sz w:val="22"/>
+              <w:szCs w:val="22"/>
+              <w:highlight w:val="yellow"/>
+              <w14:ligatures w14:val="none"/>
+            </w:rPr>
+          </w:rPrChange>
+        </w:rPr>
         <w:t>)</w:t>
       </w:r>
       <w:r>
@@ -3631,7 +3152,7 @@
           <w:sz w:val="22"/>
           <w:szCs w:val="22"/>
           <w14:ligatures w14:val="none"/>
-          <w:rPrChange w:id="30" w:author="Benjamin J. Makhlouf" w:date="2025-07-26T13:00:00Z" w16du:dateUtc="2025-07-26T20:00:00Z">
+          <w:rPrChange w:id="13" w:author="Benjamin J. Makhlouf" w:date="2025-07-26T13:00:00Z" w16du:dateUtc="2025-07-26T20:00:00Z">
             <w:rPr>
               <w:rFonts w:ascii="Garamond" w:eastAsia="Times New Roman" w:hAnsi="Garamond" w:cs="Times New Roman"/>
               <w:kern w:val="0"/>
@@ -3644,172 +3165,149 @@
         </w:rPr>
         <w:fldChar w:fldCharType="end"/>
       </w:r>
-      <w:del w:id="31" w:author="Benjamin J. Makhlouf" w:date="2025-07-26T13:00:00Z" w16du:dateUtc="2025-07-26T20:00:00Z">
-        <w:r>
-          <w:rPr>
-            <w:rFonts w:ascii="Garamond" w:eastAsia="Times New Roman" w:hAnsi="Garamond" w:cs="Times New Roman"/>
-            <w:kern w:val="0"/>
-            <w:sz w:val="22"/>
-            <w:szCs w:val="22"/>
-            <w14:ligatures w14:val="none"/>
-            <w:rPrChange w:id="32" w:author="Benjamin J. Makhlouf" w:date="2025-07-26T13:00:00Z" w16du:dateUtc="2025-07-26T20:00:00Z">
-              <w:rPr>
-                <w:rFonts w:ascii="Garamond" w:eastAsia="Times New Roman" w:hAnsi="Garamond" w:cs="Times New Roman"/>
-                <w:kern w:val="0"/>
-                <w:sz w:val="22"/>
-                <w:szCs w:val="22"/>
-                <w:highlight w:val="yellow"/>
-                <w14:ligatures w14:val="none"/>
-              </w:rPr>
-            </w:rPrChange>
-          </w:rPr>
-          <w:delText>French et al. 202</w:delText>
-        </w:r>
-        <w:r>
-          <w:rPr>
-            <w:rFonts w:ascii="Garamond" w:eastAsia="Times New Roman" w:hAnsi="Garamond" w:cs="Times New Roman"/>
-            <w:kern w:val="0"/>
-            <w:sz w:val="22"/>
-            <w:szCs w:val="22"/>
-            <w14:ligatures w14:val="none"/>
-            <w:rPrChange w:id="33" w:author="Benjamin J. Makhlouf" w:date="2025-07-26T13:00:00Z" w16du:dateUtc="2025-07-26T20:00:00Z">
-              <w:rPr>
-                <w:rFonts w:ascii="Garamond" w:eastAsia="Times New Roman" w:hAnsi="Garamond" w:cs="Times New Roman"/>
-                <w:kern w:val="0"/>
-                <w:sz w:val="22"/>
-                <w:szCs w:val="22"/>
-                <w:highlight w:val="yellow"/>
-                <w14:ligatures w14:val="none"/>
-              </w:rPr>
-            </w:rPrChange>
-          </w:rPr>
-          <w:delText>0</w:delText>
-        </w:r>
-        <w:r>
-          <w:rPr>
-            <w:rFonts w:ascii="Garamond" w:eastAsia="Times New Roman" w:hAnsi="Garamond" w:cs="Times New Roman"/>
-            <w:kern w:val="0"/>
-            <w:sz w:val="22"/>
-            <w:szCs w:val="22"/>
-            <w14:ligatures w14:val="none"/>
-            <w:rPrChange w:id="34" w:author="Benjamin J. Makhlouf" w:date="2025-07-26T13:00:00Z" w16du:dateUtc="2025-07-26T20:00:00Z">
-              <w:rPr>
-                <w:rFonts w:ascii="Garamond" w:eastAsia="Times New Roman" w:hAnsi="Garamond" w:cs="Times New Roman"/>
-                <w:kern w:val="0"/>
-                <w:sz w:val="22"/>
-                <w:szCs w:val="22"/>
-                <w:highlight w:val="yellow"/>
-                <w14:ligatures w14:val="none"/>
-              </w:rPr>
-            </w:rPrChange>
-          </w:rPr>
-          <w:delText>;</w:delText>
-        </w:r>
-      </w:del>
-      <w:ins w:id="35" w:author="Benjamin J. Makhlouf" w:date="2025-07-26T13:00:00Z" w16du:dateUtc="2025-07-26T20:00:00Z">
-        <w:r>
-          <w:rPr>
-            <w:rFonts w:ascii="Garamond" w:eastAsia="Times New Roman" w:hAnsi="Garamond" w:cs="Times New Roman"/>
-            <w:kern w:val="0"/>
-            <w:sz w:val="22"/>
-            <w:szCs w:val="22"/>
-            <w14:ligatures w14:val="none"/>
-            <w:rPrChange w:id="36" w:author="Benjamin J. Makhlouf" w:date="2025-07-26T13:00:00Z" w16du:dateUtc="2025-07-26T20:00:00Z">
-              <w:rPr>
-                <w:rFonts w:ascii="Garamond" w:eastAsia="Times New Roman" w:hAnsi="Garamond" w:cs="Times New Roman"/>
-                <w:kern w:val="0"/>
-                <w:sz w:val="22"/>
-                <w:szCs w:val="22"/>
-                <w:highlight w:val="yellow"/>
-                <w14:ligatures w14:val="none"/>
-              </w:rPr>
-            </w:rPrChange>
-          </w:rPr>
-          <w:t xml:space="preserve"> </w:t>
-        </w:r>
-      </w:ins>
-      <w:del w:id="37" w:author="Benjamin J. Makhlouf" w:date="2025-07-26T13:00:00Z" w16du:dateUtc="2025-07-26T20:00:00Z">
-        <w:r>
-          <w:rPr>
-            <w:rFonts w:ascii="Garamond" w:eastAsia="Times New Roman" w:hAnsi="Garamond" w:cs="Times New Roman"/>
-            <w:kern w:val="0"/>
-            <w:sz w:val="22"/>
-            <w:szCs w:val="22"/>
-            <w14:ligatures w14:val="none"/>
-            <w:rPrChange w:id="38" w:author="Benjamin J. Makhlouf" w:date="2025-07-26T13:00:00Z" w16du:dateUtc="2025-07-26T20:00:00Z">
-              <w:rPr>
-                <w:rFonts w:ascii="Garamond" w:eastAsia="Times New Roman" w:hAnsi="Garamond" w:cs="Times New Roman"/>
-                <w:kern w:val="0"/>
-                <w:sz w:val="22"/>
-                <w:szCs w:val="22"/>
-                <w:highlight w:val="yellow"/>
-                <w14:ligatures w14:val="none"/>
-              </w:rPr>
-            </w:rPrChange>
-          </w:rPr>
-          <w:delText xml:space="preserve"> </w:delText>
-        </w:r>
-        <w:r>
-          <w:rPr>
-            <w:rFonts w:ascii="Garamond" w:eastAsia="Times New Roman" w:hAnsi="Garamond" w:cs="Times New Roman"/>
-            <w:kern w:val="0"/>
-            <w:sz w:val="22"/>
-            <w:szCs w:val="22"/>
-            <w14:ligatures w14:val="none"/>
-            <w:rPrChange w:id="39" w:author="Benjamin J. Makhlouf" w:date="2025-07-26T13:00:00Z" w16du:dateUtc="2025-07-26T20:00:00Z">
-              <w:rPr>
-                <w:rFonts w:ascii="Garamond" w:eastAsia="Times New Roman" w:hAnsi="Garamond" w:cs="Times New Roman"/>
-                <w:kern w:val="0"/>
-                <w:sz w:val="22"/>
-                <w:szCs w:val="22"/>
-                <w:highlight w:val="yellow"/>
-                <w14:ligatures w14:val="none"/>
-              </w:rPr>
-            </w:rPrChange>
-          </w:rPr>
-          <w:delText xml:space="preserve">N= </w:delText>
-        </w:r>
-        <w:r>
-          <w:rPr>
-            <w:rFonts w:ascii="Garamond" w:eastAsia="Times New Roman" w:hAnsi="Garamond" w:cs="Times New Roman"/>
-            <w:kern w:val="0"/>
-            <w:sz w:val="22"/>
-            <w:szCs w:val="22"/>
-            <w14:ligatures w14:val="none"/>
-            <w:rPrChange w:id="40" w:author="Benjamin J. Makhlouf" w:date="2025-07-26T13:00:00Z" w16du:dateUtc="2025-07-26T20:00:00Z">
-              <w:rPr>
-                <w:rFonts w:ascii="Garamond" w:eastAsia="Times New Roman" w:hAnsi="Garamond" w:cs="Times New Roman"/>
-                <w:kern w:val="0"/>
-                <w:sz w:val="22"/>
-                <w:szCs w:val="22"/>
-                <w:highlight w:val="yellow"/>
-                <w14:ligatures w14:val="none"/>
-              </w:rPr>
-            </w:rPrChange>
-          </w:rPr>
-          <w:delText>120</w:delText>
-        </w:r>
-        <w:r>
-          <w:rPr>
-            <w:rFonts w:ascii="Garamond" w:eastAsia="Times New Roman" w:hAnsi="Garamond" w:cs="Times New Roman"/>
-            <w:kern w:val="0"/>
-            <w:sz w:val="22"/>
-            <w:szCs w:val="22"/>
-            <w14:ligatures w14:val="none"/>
-            <w:rPrChange w:id="41" w:author="Benjamin J. Makhlouf" w:date="2025-07-26T13:00:00Z" w16du:dateUtc="2025-07-26T20:00:00Z">
-              <w:rPr>
-                <w:rFonts w:ascii="Garamond" w:eastAsia="Times New Roman" w:hAnsi="Garamond" w:cs="Times New Roman"/>
-                <w:kern w:val="0"/>
-                <w:sz w:val="22"/>
-                <w:szCs w:val="22"/>
-                <w:highlight w:val="yellow"/>
-                <w14:ligatures w14:val="none"/>
-              </w:rPr>
-            </w:rPrChange>
-          </w:rPr>
-          <w:delText>)</w:delText>
-        </w:r>
-      </w:del>
+      <w:r>
+        <w:rPr>
+          <w:rFonts w:ascii="Garamond" w:eastAsia="Times New Roman" w:hAnsi="Garamond" w:cs="Times New Roman"/>
+          <w:kern w:val="0"/>
+          <w:sz w:val="22"/>
+          <w:szCs w:val="22"/>
+          <w14:ligatures w14:val="none"/>
+        </w:rPr>
+        <w:t xml:space="preserve">. </w:t>
+      </w:r>
+      <w:r>
+        <w:rPr>
+          <w:rFonts w:ascii="Garamond" w:eastAsia="Times New Roman" w:hAnsi="Garamond" w:cs="Times New Roman"/>
+          <w:kern w:val="0"/>
+          <w:sz w:val="22"/>
+          <w:szCs w:val="22"/>
+          <w14:ligatures w14:val="none"/>
+        </w:rPr>
+        <w:t xml:space="preserve">This approach considered </w:t>
+      </w:r>
+      <w:r>
+        <w:rPr>
+          <w:rFonts w:ascii="Garamond" w:eastAsia="Times New Roman" w:hAnsi="Garamond" w:cs="Times New Roman"/>
+          <w:kern w:val="0"/>
+          <w:sz w:val="22"/>
+          <w:szCs w:val="22"/>
+          <w14:ligatures w14:val="none"/>
+        </w:rPr>
+        <w:t>several geologic and hydrological covariates as well as</w:t>
+      </w:r>
+      <w:r>
+        <w:rPr>
+          <w:rFonts w:ascii="Garamond" w:eastAsia="Times New Roman" w:hAnsi="Garamond" w:cs="Times New Roman"/>
+          <w:kern w:val="0"/>
+          <w:sz w:val="22"/>
+          <w:szCs w:val="22"/>
+          <w14:ligatures w14:val="none"/>
+        </w:rPr>
+        <w:t xml:space="preserve"> the effect of both </w:t>
+      </w:r>
+      <w:r>
+        <w:rPr>
+          <w:rFonts w:ascii="Garamond" w:eastAsia="Times New Roman" w:hAnsi="Garamond" w:cs="Times New Roman"/>
+          <w:kern w:val="0"/>
+          <w:sz w:val="22"/>
+          <w:szCs w:val="22"/>
+          <w14:ligatures w14:val="none"/>
+        </w:rPr>
+        <w:t>Euclidian distance and hydrological connectivity between sampling sites</w:t>
+      </w:r>
+      <w:r>
+        <w:rPr>
+          <w:rFonts w:ascii="Garamond" w:eastAsia="Times New Roman" w:hAnsi="Garamond" w:cs="Times New Roman"/>
+          <w:kern w:val="0"/>
+          <w:sz w:val="22"/>
+          <w:szCs w:val="22"/>
+          <w14:ligatures w14:val="none"/>
+        </w:rPr>
+        <w:t xml:space="preserve">, providing a </w:t>
+      </w:r>
+      <w:r>
+        <w:rPr>
+          <w:rFonts w:ascii="Garamond" w:hAnsi="Garamond" w:cs="Times New Roman"/>
+          <w:sz w:val="22"/>
+          <w:szCs w:val="22"/>
+        </w:rPr>
+        <w:t xml:space="preserve">spatially continuous estimate of </w:t>
+      </w:r>
+      <w:r>
+        <w:rPr>
+          <w:rFonts w:ascii="Garamond" w:eastAsia="Times New Roman" w:hAnsi="Garamond" w:cs="Times New Roman"/>
+          <w:kern w:val="0"/>
+          <w:sz w:val="22"/>
+          <w:szCs w:val="22"/>
+          <w14:ligatures w14:val="none"/>
+        </w:rPr>
+        <w:t>Sr</w:t>
+      </w:r>
+      <w:r>
+        <w:rPr>
+          <w:rFonts w:ascii="Garamond" w:eastAsia="Times New Roman" w:hAnsi="Garamond" w:cs="Times New Roman"/>
+          <w:kern w:val="0"/>
+          <w:sz w:val="22"/>
+          <w:szCs w:val="22"/>
+          <w:vertAlign w:val="superscript"/>
+          <w14:ligatures w14:val="none"/>
+        </w:rPr>
+        <w:t>87</w:t>
+      </w:r>
+      <w:r>
+        <w:rPr>
+          <w:rFonts w:ascii="Garamond" w:eastAsia="Times New Roman" w:hAnsi="Garamond" w:cs="Times New Roman"/>
+          <w:kern w:val="0"/>
+          <w:sz w:val="22"/>
+          <w:szCs w:val="22"/>
+          <w14:ligatures w14:val="none"/>
+        </w:rPr>
+        <w:t>/Sr</w:t>
+      </w:r>
+      <w:r>
+        <w:rPr>
+          <w:rFonts w:ascii="Garamond" w:eastAsia="Times New Roman" w:hAnsi="Garamond" w:cs="Times New Roman"/>
+          <w:kern w:val="0"/>
+          <w:sz w:val="22"/>
+          <w:szCs w:val="22"/>
+          <w:vertAlign w:val="superscript"/>
+          <w14:ligatures w14:val="none"/>
+        </w:rPr>
+        <w:t>86</w:t>
+      </w:r>
+      <w:r>
+        <w:rPr>
+          <w:rFonts w:ascii="Garamond" w:hAnsi="Garamond" w:cs="Times New Roman"/>
+          <w:sz w:val="22"/>
+          <w:szCs w:val="22"/>
+        </w:rPr>
+        <w:t xml:space="preserve"> values and their associated uncertainties for roughly every ~1km stretch of tributaries across the basin </w:t>
+      </w:r>
+      <w:commentRangeStart w:id="14"/>
+      <w:r>
+        <w:rPr>
+          <w:rFonts w:ascii="Garamond" w:hAnsi="Garamond" w:cs="Times New Roman"/>
+          <w:sz w:val="22"/>
+          <w:szCs w:val="22"/>
+        </w:rPr>
+        <w:t xml:space="preserve">(Figure </w:t>
+      </w:r>
+      <w:r>
+        <w:rPr>
+          <w:rFonts w:ascii="Garamond" w:hAnsi="Garamond" w:cs="Times New Roman"/>
+          <w:sz w:val="22"/>
+          <w:szCs w:val="22"/>
+        </w:rPr>
+        <w:t>1</w:t>
+      </w:r>
+      <w:r>
+        <w:rPr>
+          <w:rFonts w:ascii="Garamond" w:hAnsi="Garamond" w:cs="Times New Roman"/>
+          <w:sz w:val="22"/>
+          <w:szCs w:val="22"/>
+        </w:rPr>
+        <w:t>)</w:t>
+      </w:r>
       <w:r>
         <w:rPr>
           <w:rFonts w:ascii="Garamond" w:eastAsia="Times New Roman" w:hAnsi="Garamond" w:cs="Times New Roman"/>
@@ -3820,90 +3318,13 @@
         </w:rPr>
         <w:t xml:space="preserve"> </w:t>
       </w:r>
-      <w:r>
-        <w:rPr>
-          <w:rFonts w:ascii="Garamond" w:eastAsia="Times New Roman" w:hAnsi="Garamond" w:cs="Times New Roman"/>
-          <w:kern w:val="0"/>
-          <w:sz w:val="22"/>
-          <w:szCs w:val="22"/>
-          <w14:ligatures w14:val="none"/>
-        </w:rPr>
-        <w:t xml:space="preserve">collected throughout </w:t>
-      </w:r>
-      <w:r>
-        <w:rPr>
-          <w:rFonts w:ascii="Garamond" w:eastAsia="Times New Roman" w:hAnsi="Garamond" w:cs="Times New Roman"/>
-          <w:kern w:val="0"/>
-          <w:sz w:val="22"/>
-          <w:szCs w:val="22"/>
-          <w14:ligatures w14:val="none"/>
-        </w:rPr>
-        <w:t>the Kuskokwim River basin</w:t>
-      </w:r>
-      <w:r>
-        <w:rPr>
-          <w:rFonts w:ascii="Garamond" w:eastAsia="Times New Roman" w:hAnsi="Garamond" w:cs="Times New Roman"/>
-          <w:kern w:val="0"/>
-          <w:sz w:val="22"/>
-          <w:szCs w:val="22"/>
-          <w14:ligatures w14:val="none"/>
-        </w:rPr>
-        <w:t xml:space="preserve"> (Supp. 1) and modeled </w:t>
-      </w:r>
-      <w:del w:id="42" w:author="Benjamin J. Makhlouf" w:date="2025-07-26T13:04:00Z" w16du:dateUtc="2025-07-26T20:04:00Z">
-        <w:r>
-          <w:rPr>
-            <w:rFonts w:ascii="Garamond" w:eastAsia="Times New Roman" w:hAnsi="Garamond" w:cs="Times New Roman"/>
-            <w:kern w:val="0"/>
-            <w:sz w:val="22"/>
-            <w:szCs w:val="22"/>
-            <w14:ligatures w14:val="none"/>
-          </w:rPr>
-          <w:delText>via</w:delText>
-        </w:r>
-        <w:r>
-          <w:rPr>
-            <w:rFonts w:ascii="Garamond" w:eastAsia="Times New Roman" w:hAnsi="Garamond" w:cs="Times New Roman"/>
-            <w:kern w:val="0"/>
-            <w:sz w:val="22"/>
-            <w:szCs w:val="22"/>
-            <w14:ligatures w14:val="none"/>
-          </w:rPr>
-          <w:delText xml:space="preserve"> spatial stream network modeling</w:delText>
-        </w:r>
-        <w:r>
-          <w:rPr>
-            <w:rFonts w:ascii="Garamond" w:eastAsia="Times New Roman" w:hAnsi="Garamond" w:cs="Times New Roman"/>
-            <w:kern w:val="0"/>
-            <w:sz w:val="22"/>
-            <w:szCs w:val="22"/>
-            <w14:ligatures w14:val="none"/>
-          </w:rPr>
-          <w:delText xml:space="preserve"> </w:delText>
-        </w:r>
-      </w:del>
-      <w:r>
-        <w:rPr>
-          <w:rFonts w:ascii="Garamond" w:eastAsia="Times New Roman" w:hAnsi="Garamond" w:cs="Times New Roman"/>
-          <w:kern w:val="0"/>
-          <w:sz w:val="22"/>
-          <w:szCs w:val="22"/>
-          <w14:ligatures w14:val="none"/>
-        </w:rPr>
-        <w:t xml:space="preserve">using the STARRS package in R </w:t>
-      </w:r>
-      <w:del w:id="43" w:author="Benjamin J. Makhlouf" w:date="2025-07-26T12:59:00Z" w16du:dateUtc="2025-07-26T19:59:00Z">
-        <w:r>
-          <w:rPr>
-            <w:rFonts w:ascii="Garamond" w:eastAsia="Times New Roman" w:hAnsi="Garamond" w:cs="Times New Roman"/>
-            <w:kern w:val="0"/>
-            <w:sz w:val="22"/>
-            <w:szCs w:val="22"/>
-            <w14:ligatures w14:val="none"/>
-          </w:rPr>
-          <w:delText>(</w:delText>
-        </w:r>
-      </w:del>
+      <w:commentRangeEnd w:id="14"/>
+      <w:r>
+        <w:rPr>
+          <w:rStyle w:val="CommentReference"/>
+        </w:rPr>
+        <w:commentReference w:id="14"/>
+      </w:r>
       <w:r>
         <w:rPr>
           <w:rFonts w:ascii="Garamond" w:eastAsia="Times New Roman" w:hAnsi="Garamond" w:cs="Times New Roman"/>
@@ -3922,7 +3343,7 @@
           <w:szCs w:val="22"/>
           <w14:ligatures w14:val="none"/>
         </w:rPr>
-        <w:instrText xml:space="preserve"> ADDIN ZOTERO_ITEM CSL_CITATION {"citationID":"s6C5sUiM","properties":{"formattedCitation":"(French et al., 2020; Peterson &amp; Hoef, 2014)","plainCitation":"(French et al., 2020; Peterson &amp; Hoef, 2014)","noteIndex":0},"citationItems":[{"id":1684,"uris":["http://zotero.org/users/8421274/items/M654PKRJ"],"itemData":{"id":1684,"type":"article-journal","abstract":"Riverine chemistry reflects both watershed conditions and instream processing, both of which vary across river networks, yet little is known about the scales at which watershed attributes regulate biogeochemical constituents. We used spatial stream network (SSN) models to quantify both watershed and instream effects on streamwater constituents in the Kuskokwim River (western Alaska), the largest free-flowing river in the United States. We assessed chemical constituents spanning from labile nutrients (nitrate [NO3−] and orthophosphate [PO43−]) to biologically and chemically conservative tracers (calcium [Ca2+], strontium [Sr2+], and Sr isotopes [87Sr/86Sr]). We also examined the behavior of dissolved organic carbon (DOC) relative to these constituents to understand whether bulk DOC behaved conservatively in a large boreal river network, where future changes in DOC and nutrient loading are expected under a shifting climate. We derived watershed spatial covariates comprising land cover, geology, and geomorphic characteristics at 14 different spatial extents based on stream order and relative to position in the river network to understand the effect of distant and proximal watershed attributes on streamwater constituents. For all constituents but 87Sr/86Sr, watershed attributes in low-order headwater catchments yielded the best predictive ability for streamwater constituent concentrations across the entire network. Spatial patterning for conservative tracers and bulk DOC showed strong spatial autocorrelation, whereas PO43− and NO3− exhibited spatial patchiness indicative of instream processing. Our work shows that headwater streams are disproportionately important contributors to network-wide biogeochemical constituents supporting aquatic food webs and that conservation and management of aquatic systems should include these small and often remote watershed areas.","container-title":"Journal of Geophysical Research: Biogeosciences","DOI":"10.1029/2020JG005851","ISSN":"2169-8961","issue":"12","language":"en","note":"_eprint: https://agupubs.onlinelibrary.wiley.com/doi/pdf/10.1029/2020JG005851","page":"e2020JG005851","source":"Wiley Online Library","title":"Headwater Catchments Govern Biogeochemistry in America's Largest Free-Flowing River Network","volume":"125","author":[{"family":"French","given":"David W."},{"family":"Schindler","given":"Daniel E."},{"family":"Brennan","given":"Sean R."},{"family":"Whited","given":"Diane"}],"issued":{"date-parts":[["2020"]]}}},{"id":4119,"uris":["http://zotero.org/users/8421274/items/DJWAZARS"],"itemData":{"id":4119,"type":"article-journal","abstract":"This paper describes the STARS ArcGIS geoprocessing toolset, which is used to calculate the spatial information needed to ﬁt spatial statistical models to stream network data using the SSN package. The STARS toolset is designed for use with a landscape network (LSN), which is a topological data model produced by the FLoWS ArcGIS geoprocessing toolset. An overview of the FLoWS LSN structure and a few particularly useful tools is also provided so that users will have a clear understanding of the underlying data structure that the STARS toolset depends on. This document may be used as an introduction to new users. The methods used to calculate the spatial information and format the ﬁnal .ssn object are also explicitly described so that users may create their own .ssn object using other data models and software.","container-title":"Journal of Statistical Software","DOI":"10.18637/jss.v056.i02","ISSN":"1548-7660","issue":"2","journalAbbreviation":"J. Stat. Soft.","language":"en","source":"DOI.org (Crossref)","title":"&lt;b&gt;STARS&lt;/b&gt; : An &lt;i&gt;ArcGIS&lt;/i&gt; Toolset Used to Calculate the Spatial Information Needed to Fit Spatial Statistical Models to Stream Network Data","title-short":"&lt;b&gt;STARS&lt;/b&gt;","URL":"http://www.jstatsoft.org/v56/i02/","volume":"56","author":[{"family":"Peterson","given":"Erin E."},{"family":"Hoef","given":"Jay M. Ver"}],"accessed":{"date-parts":[["2024",1,22]]},"issued":{"date-parts":[["2014"]]}}}],"schema":"https://github.com/citation-style-language/schema/raw/master/csl-citation.json"} </w:instrText>
+        <w:instrText xml:space="preserve"> ADDIN ZOTERO_ITEM CSL_CITATION {"citationID":"a4pXqHFf","properties":{"formattedCitation":"(Ver Hoef &amp; Peterson, 2010)","plainCitation":"(Ver Hoef &amp; Peterson, 2010)","noteIndex":0},"citationItems":[{"id":4769,"uris":["http://zotero.org/users/8421274/items/XBJELDI4"],"itemData":{"id":4769,"type":"article-journal","container-title":"Journal of the American Statistical Association","DOI":"10.1198/jasa.2009.ap08248","ISSN":"0162-1459, 1537-274X","issue":"489","journalAbbreviation":"Journal of the American Statistical Association","language":"en","page":"6-18","source":"DOI.org (Crossref)","title":"A Moving Average Approach for Spatial Statistical Models of Stream Networks","volume":"105","author":[{"family":"Ver Hoef","given":"Jay M."},{"family":"Peterson","given":"Erin E."}],"issued":{"date-parts":[["2010",3,1]]}}}],"schema":"https://github.com/citation-style-language/schema/raw/master/csl-citation.json"} </w:instrText>
       </w:r>
       <w:r>
         <w:rPr>
@@ -3943,7 +3364,7 @@
           <w:szCs w:val="22"/>
           <w14:ligatures w14:val="none"/>
         </w:rPr>
-        <w:t>(French et al., 2020; Peterson &amp; Hoef, 2014)</w:t>
+        <w:t>(Ver Hoef &amp; Peterson, 2010)</w:t>
       </w:r>
       <w:r>
         <w:rPr>
@@ -3955,216 +3376,63 @@
         </w:rPr>
         <w:fldChar w:fldCharType="end"/>
       </w:r>
-      <w:ins w:id="44" w:author="Daniel Schindler" w:date="2025-07-17T13:21:00Z" w16du:dateUtc="2025-07-17T21:21:00Z">
-        <w:del w:id="45" w:author="Benjamin J. Makhlouf" w:date="2025-07-26T12:59:00Z" w16du:dateUtc="2025-07-26T19:59:00Z">
-          <w:r>
-            <w:rPr>
-              <w:rFonts w:ascii="Garamond" w:eastAsia="Times New Roman" w:hAnsi="Garamond" w:cs="Times New Roman"/>
-              <w:kern w:val="0"/>
-              <w:sz w:val="22"/>
-              <w:szCs w:val="22"/>
-              <w14:ligatures w14:val="none"/>
-            </w:rPr>
-            <w:delText>French et al. 202</w:delText>
-          </w:r>
-        </w:del>
-      </w:ins>
-      <w:ins w:id="46" w:author="Daniel Schindler" w:date="2025-07-17T13:23:00Z" w16du:dateUtc="2025-07-17T21:23:00Z">
-        <w:del w:id="47" w:author="Benjamin J. Makhlouf" w:date="2025-07-26T12:59:00Z" w16du:dateUtc="2025-07-26T19:59:00Z">
-          <w:r>
-            <w:rPr>
-              <w:rFonts w:ascii="Garamond" w:eastAsia="Times New Roman" w:hAnsi="Garamond" w:cs="Times New Roman"/>
-              <w:kern w:val="0"/>
-              <w:sz w:val="22"/>
-              <w:szCs w:val="22"/>
-              <w14:ligatures w14:val="none"/>
-            </w:rPr>
-            <w:delText>0</w:delText>
-          </w:r>
-        </w:del>
-      </w:ins>
-      <w:del w:id="48" w:author="Daniel Schindler" w:date="2025-07-17T13:21:00Z" w16du:dateUtc="2025-07-17T21:21:00Z">
-        <w:r>
-          <w:rPr>
-            <w:rFonts w:ascii="Garamond" w:eastAsia="Times New Roman" w:hAnsi="Garamond" w:cs="Times New Roman"/>
-            <w:kern w:val="0"/>
-            <w:sz w:val="22"/>
-            <w:szCs w:val="22"/>
-            <w14:ligatures w14:val="none"/>
-          </w:rPr>
-          <w:delText>add more</w:delText>
-        </w:r>
-      </w:del>
-      <w:del w:id="49" w:author="Benjamin J. Makhlouf" w:date="2025-07-26T12:59:00Z" w16du:dateUtc="2025-07-26T19:59:00Z">
-        <w:r>
-          <w:rPr>
-            <w:rFonts w:ascii="Garamond" w:eastAsia="Times New Roman" w:hAnsi="Garamond" w:cs="Times New Roman"/>
-            <w:kern w:val="0"/>
-            <w:sz w:val="22"/>
-            <w:szCs w:val="22"/>
-            <w14:ligatures w14:val="none"/>
-          </w:rPr>
-          <w:delText>)</w:delText>
-        </w:r>
-      </w:del>
-      <w:r>
-        <w:rPr>
-          <w:rFonts w:ascii="Garamond" w:eastAsia="Times New Roman" w:hAnsi="Garamond" w:cs="Times New Roman"/>
-          <w:kern w:val="0"/>
-          <w:sz w:val="22"/>
-          <w:szCs w:val="22"/>
-          <w14:ligatures w14:val="none"/>
-        </w:rPr>
-        <w:t xml:space="preserve">. This approach considered </w:t>
-      </w:r>
-      <w:r>
-        <w:rPr>
-          <w:rFonts w:ascii="Garamond" w:eastAsia="Times New Roman" w:hAnsi="Garamond" w:cs="Times New Roman"/>
-          <w:kern w:val="0"/>
-          <w:sz w:val="22"/>
-          <w:szCs w:val="22"/>
-          <w14:ligatures w14:val="none"/>
-        </w:rPr>
-        <w:t>several geologic and hydrological covariates as well as Euclidian distance and hydrological connectivity between sampling sites</w:t>
-      </w:r>
-      <w:r>
-        <w:rPr>
-          <w:rFonts w:ascii="Garamond" w:eastAsia="Times New Roman" w:hAnsi="Garamond" w:cs="Times New Roman"/>
-          <w:kern w:val="0"/>
-          <w:sz w:val="22"/>
-          <w:szCs w:val="22"/>
-          <w14:ligatures w14:val="none"/>
+      <w:r>
+        <w:rPr>
+          <w:rFonts w:ascii="Garamond" w:eastAsia="Times New Roman" w:hAnsi="Garamond" w:cs="Times New Roman"/>
+          <w:kern w:val="0"/>
+          <w:sz w:val="22"/>
+          <w:szCs w:val="22"/>
+          <w14:ligatures w14:val="none"/>
+        </w:rPr>
+        <w:t xml:space="preserve">. </w:t>
+      </w:r>
+      <w:commentRangeStart w:id="15"/>
+      <w:r>
+        <w:rPr>
+          <w:rFonts w:ascii="Garamond" w:hAnsi="Garamond" w:cs="Times New Roman"/>
+          <w:sz w:val="22"/>
+          <w:szCs w:val="22"/>
+        </w:rPr>
+        <w:t>To prevent over-assignment to tributaries with exceptionally low prediction error</w:t>
+      </w:r>
+      <w:r>
+        <w:rPr>
+          <w:rFonts w:ascii="Garamond" w:hAnsi="Garamond" w:cs="Times New Roman"/>
+          <w:sz w:val="22"/>
+          <w:szCs w:val="22"/>
         </w:rPr>
         <w:t xml:space="preserve"> </w:t>
       </w:r>
       <w:r>
         <w:rPr>
-          <w:rFonts w:ascii="Garamond" w:eastAsia="Times New Roman" w:hAnsi="Garamond" w:cs="Times New Roman"/>
-          <w:kern w:val="0"/>
-          <w:sz w:val="22"/>
-          <w:szCs w:val="22"/>
-          <w14:ligatures w14:val="none"/>
-        </w:rPr>
-        <w:fldChar w:fldCharType="begin"/>
-      </w:r>
-      <w:r>
-        <w:rPr>
-          <w:rFonts w:ascii="Garamond" w:eastAsia="Times New Roman" w:hAnsi="Garamond" w:cs="Times New Roman"/>
-          <w:kern w:val="0"/>
-          <w:sz w:val="22"/>
-          <w:szCs w:val="22"/>
-          <w14:ligatures w14:val="none"/>
-        </w:rPr>
-        <w:instrText xml:space="preserve"> ADDIN ZOTERO_ITEM CSL_CITATION {"citationID":"a4pXqHFf","properties":{"formattedCitation":"(Ver Hoef &amp; Peterson, 2010)","plainCitation":"(Ver Hoef &amp; Peterson, 2010)","noteIndex":0},"citationItems":[{"id":4769,"uris":["http://zotero.org/users/8421274/items/XBJELDI4"],"itemData":{"id":4769,"type":"article-journal","container-title":"Journal of the American Statistical Association","DOI":"10.1198/jasa.2009.ap08248","ISSN":"0162-1459, 1537-274X","issue":"489","journalAbbreviation":"Journal of the American Statistical Association","language":"en","page":"6-18","source":"DOI.org (Crossref)","title":"A Moving Average Approach for Spatial Statistical Models of Stream Networks","volume":"105","author":[{"family":"Ver Hoef","given":"Jay M."},{"family":"Peterson","given":"Erin E."}],"issued":{"date-parts":[["2010",3,1]]}}}],"schema":"https://github.com/citation-style-language/schema/raw/master/csl-citation.json"} </w:instrText>
-      </w:r>
-      <w:r>
-        <w:rPr>
-          <w:rFonts w:ascii="Garamond" w:eastAsia="Times New Roman" w:hAnsi="Garamond" w:cs="Times New Roman"/>
-          <w:kern w:val="0"/>
-          <w:sz w:val="22"/>
-          <w:szCs w:val="22"/>
-          <w14:ligatures w14:val="none"/>
-        </w:rPr>
-        <w:fldChar w:fldCharType="separate"/>
-      </w:r>
-      <w:r>
-        <w:rPr>
-          <w:rFonts w:ascii="Garamond" w:eastAsia="Times New Roman" w:hAnsi="Garamond" w:cs="Times New Roman"/>
-          <w:noProof/>
-          <w:kern w:val="0"/>
-          <w:sz w:val="22"/>
-          <w:szCs w:val="22"/>
-          <w14:ligatures w14:val="none"/>
-        </w:rPr>
-        <w:t>(Ver Hoef &amp; Peterson, 2010)</w:t>
-      </w:r>
-      <w:r>
-        <w:rPr>
-          <w:rFonts w:ascii="Garamond" w:eastAsia="Times New Roman" w:hAnsi="Garamond" w:cs="Times New Roman"/>
-          <w:kern w:val="0"/>
-          <w:sz w:val="22"/>
-          <w:szCs w:val="22"/>
-          <w14:ligatures w14:val="none"/>
-        </w:rPr>
-        <w:fldChar w:fldCharType="end"/>
-      </w:r>
-      <w:r>
-        <w:rPr>
-          <w:rFonts w:ascii="Garamond" w:eastAsia="Times New Roman" w:hAnsi="Garamond" w:cs="Times New Roman"/>
-          <w:kern w:val="0"/>
-          <w:sz w:val="22"/>
-          <w:szCs w:val="22"/>
-          <w14:ligatures w14:val="none"/>
-        </w:rPr>
-        <w:t xml:space="preserve">. </w:t>
-      </w:r>
-      <w:r>
-        <w:rPr>
           <w:rFonts w:ascii="Garamond" w:hAnsi="Garamond" w:cs="Times New Roman"/>
           <w:sz w:val="22"/>
           <w:szCs w:val="22"/>
         </w:rPr>
-        <w:t xml:space="preserve">The resulting </w:t>
-      </w:r>
-      <w:proofErr w:type="spellStart"/>
+        <w:t>minimum error values were constrained to 0.0006</w:t>
+      </w:r>
       <w:r>
         <w:rPr>
           <w:rFonts w:ascii="Garamond" w:hAnsi="Garamond" w:cs="Times New Roman"/>
           <w:sz w:val="22"/>
           <w:szCs w:val="22"/>
         </w:rPr>
-        <w:t>isoscape</w:t>
-      </w:r>
-      <w:proofErr w:type="spellEnd"/>
+        <w:t xml:space="preserve"> and above.</w:t>
+      </w:r>
       <w:r>
         <w:rPr>
           <w:rFonts w:ascii="Garamond" w:hAnsi="Garamond" w:cs="Times New Roman"/>
           <w:sz w:val="22"/>
           <w:szCs w:val="22"/>
         </w:rPr>
-        <w:t xml:space="preserve"> provides a spatially continuous estimate of </w:t>
-      </w:r>
-      <w:r>
-        <w:rPr>
-          <w:rFonts w:ascii="Garamond" w:eastAsia="Times New Roman" w:hAnsi="Garamond" w:cs="Times New Roman"/>
-          <w:kern w:val="0"/>
-          <w:sz w:val="22"/>
-          <w:szCs w:val="22"/>
-          <w14:ligatures w14:val="none"/>
-        </w:rPr>
-        <w:t>Sr</w:t>
-      </w:r>
-      <w:r>
-        <w:rPr>
-          <w:rFonts w:ascii="Garamond" w:eastAsia="Times New Roman" w:hAnsi="Garamond" w:cs="Times New Roman"/>
-          <w:kern w:val="0"/>
-          <w:sz w:val="22"/>
-          <w:szCs w:val="22"/>
-          <w:vertAlign w:val="superscript"/>
-          <w14:ligatures w14:val="none"/>
-        </w:rPr>
-        <w:t>87</w:t>
-      </w:r>
-      <w:r>
-        <w:rPr>
-          <w:rFonts w:ascii="Garamond" w:eastAsia="Times New Roman" w:hAnsi="Garamond" w:cs="Times New Roman"/>
-          <w:kern w:val="0"/>
-          <w:sz w:val="22"/>
-          <w:szCs w:val="22"/>
-          <w14:ligatures w14:val="none"/>
-        </w:rPr>
-        <w:t>/Sr</w:t>
-      </w:r>
-      <w:r>
-        <w:rPr>
-          <w:rFonts w:ascii="Garamond" w:eastAsia="Times New Roman" w:hAnsi="Garamond" w:cs="Times New Roman"/>
-          <w:kern w:val="0"/>
-          <w:sz w:val="22"/>
-          <w:szCs w:val="22"/>
-          <w:vertAlign w:val="superscript"/>
-          <w14:ligatures w14:val="none"/>
-        </w:rPr>
-        <w:t>86</w:t>
+        <w:t xml:space="preserve"> </w:t>
+      </w:r>
+      <w:commentRangeEnd w:id="15"/>
+      <w:r>
+        <w:rPr>
+          <w:rStyle w:val="CommentReference"/>
+        </w:rPr>
+        <w:commentReference w:id="15"/>
       </w:r>
       <w:r>
         <w:rPr>
@@ -4172,7 +3440,7 @@
           <w:sz w:val="22"/>
           <w:szCs w:val="22"/>
         </w:rPr>
-        <w:t xml:space="preserve"> values and their associated uncertainties for roughly every ~1km stretch of tributaries across the basin (Figure </w:t>
+        <w:t>This threshold was selected through</w:t>
       </w:r>
       <w:r>
         <w:rPr>
@@ -4180,7 +3448,7 @@
           <w:sz w:val="22"/>
           <w:szCs w:val="22"/>
         </w:rPr>
-        <w:t>1</w:t>
+        <w:t xml:space="preserve"> a</w:t>
       </w:r>
       <w:r>
         <w:rPr>
@@ -4188,7 +3456,7 @@
           <w:sz w:val="22"/>
           <w:szCs w:val="22"/>
         </w:rPr>
-        <w:t xml:space="preserve">). </w:t>
+        <w:t xml:space="preserve"> systematic evaluation to minimize assignments driven primarily by uncertainty differences rather than isotopic similarity</w:t>
       </w:r>
       <w:r>
         <w:rPr>
@@ -4196,79 +3464,15 @@
           <w:sz w:val="22"/>
           <w:szCs w:val="22"/>
         </w:rPr>
-        <w:t>To prevent over-assignment to tributaries with exceptionally low prediction error</w:t>
-      </w:r>
-      <w:ins w:id="50" w:author="Daniel Schindler" w:date="2025-07-17T13:21:00Z" w16du:dateUtc="2025-07-17T21:21:00Z">
-        <w:r>
-          <w:rPr>
-            <w:rFonts w:ascii="Garamond" w:hAnsi="Garamond" w:cs="Times New Roman"/>
-            <w:sz w:val="22"/>
-            <w:szCs w:val="22"/>
-          </w:rPr>
-          <w:t xml:space="preserve"> </w:t>
-        </w:r>
-        <w:commentRangeStart w:id="51"/>
-        <w:r>
-          <w:rPr>
-            <w:rFonts w:ascii="Garamond" w:hAnsi="Garamond" w:cs="Times New Roman"/>
-            <w:sz w:val="22"/>
-            <w:szCs w:val="22"/>
-          </w:rPr>
-          <w:t>(this was in one of Sean’s papers, can’t remember which one</w:t>
-        </w:r>
-      </w:ins>
-      <w:ins w:id="52" w:author="Daniel Schindler" w:date="2025-07-17T13:24:00Z" w16du:dateUtc="2025-07-17T21:24:00Z">
-        <w:r>
-          <w:rPr>
-            <w:rFonts w:ascii="Garamond" w:hAnsi="Garamond" w:cs="Times New Roman"/>
-            <w:sz w:val="22"/>
-            <w:szCs w:val="22"/>
-          </w:rPr>
-          <w:t>, I think Brenna</w:t>
-        </w:r>
-      </w:ins>
-      <w:ins w:id="53" w:author="Daniel Schindler" w:date="2025-07-17T13:25:00Z" w16du:dateUtc="2025-07-17T21:25:00Z">
-        <w:r>
-          <w:rPr>
-            <w:rFonts w:ascii="Garamond" w:hAnsi="Garamond" w:cs="Times New Roman"/>
-            <w:sz w:val="22"/>
-            <w:szCs w:val="22"/>
-          </w:rPr>
-          <w:t>n and Schindler 2017</w:t>
-        </w:r>
-      </w:ins>
-      <w:ins w:id="54" w:author="Daniel Schindler" w:date="2025-07-17T13:21:00Z" w16du:dateUtc="2025-07-17T21:21:00Z">
-        <w:r>
-          <w:rPr>
-            <w:rFonts w:ascii="Garamond" w:hAnsi="Garamond" w:cs="Times New Roman"/>
-            <w:sz w:val="22"/>
-            <w:szCs w:val="22"/>
-          </w:rPr>
-          <w:t>)</w:t>
-        </w:r>
-      </w:ins>
+        <w:t xml:space="preserve"> </w:t>
+      </w:r>
       <w:r>
         <w:rPr>
           <w:rFonts w:ascii="Garamond" w:hAnsi="Garamond" w:cs="Times New Roman"/>
           <w:sz w:val="22"/>
           <w:szCs w:val="22"/>
         </w:rPr>
-        <w:t xml:space="preserve">, </w:t>
-      </w:r>
-      <w:commentRangeEnd w:id="51"/>
-      <w:r>
-        <w:rPr>
-          <w:rStyle w:val="CommentReference"/>
-        </w:rPr>
-        <w:commentReference w:id="51"/>
-      </w:r>
-      <w:r>
-        <w:rPr>
-          <w:rFonts w:ascii="Garamond" w:hAnsi="Garamond" w:cs="Times New Roman"/>
-          <w:sz w:val="22"/>
-          <w:szCs w:val="22"/>
-        </w:rPr>
-        <w:t>minimum error values were constrained to 0.0006. This threshold was selected through systematic evaluation to minimize assignments driven primarily by uncertainty differences rather than isotopic similarity, while preserving broad-scale production patterns across the basin</w:t>
+        <w:t>while preserving broad-scale production patterns across the basin</w:t>
       </w:r>
     </w:p>
     <w:p>
@@ -4420,18 +3624,7 @@
           <w:szCs w:val="22"/>
           <w14:ligatures w14:val="none"/>
         </w:rPr>
-        <w:t xml:space="preserve">. This approach </w:t>
-      </w:r>
-      <w:r>
-        <w:rPr>
-          <w:rFonts w:ascii="Garamond" w:eastAsia="Times New Roman" w:hAnsi="Garamond" w:cs="Times New Roman"/>
-          <w:kern w:val="0"/>
-          <w:sz w:val="22"/>
-          <w:szCs w:val="22"/>
-          <w14:ligatures w14:val="none"/>
-        </w:rPr>
-        <w:lastRenderedPageBreak/>
-        <w:t xml:space="preserve">considers the relationship between extracted natal origin otolith </w:t>
+        <w:t xml:space="preserve">. This approach considers the relationship between extracted natal origin otolith </w:t>
       </w:r>
       <w:r>
         <w:rPr>
@@ -4511,16 +3704,14 @@
         </w:rPr>
         <w:t xml:space="preserve"> prediction error</w:t>
       </w:r>
-      <w:ins w:id="55" w:author="Daniel Schindler" w:date="2025-07-17T13:25:00Z" w16du:dateUtc="2025-07-17T21:25:00Z">
-        <w:r>
-          <w:rPr>
-            <w:rFonts w:ascii="Garamond" w:hAnsi="Garamond" w:cstheme="majorHAnsi"/>
-            <w:sz w:val="22"/>
-            <w:szCs w:val="22"/>
-          </w:rPr>
-          <w:t>s</w:t>
-        </w:r>
-      </w:ins>
+      <w:r>
+        <w:rPr>
+          <w:rFonts w:ascii="Garamond" w:hAnsi="Garamond" w:cstheme="majorHAnsi"/>
+          <w:sz w:val="22"/>
+          <w:szCs w:val="22"/>
+        </w:rPr>
+        <w:t>s</w:t>
+      </w:r>
       <w:r>
         <w:rPr>
           <w:rFonts w:ascii="Garamond" w:hAnsi="Garamond" w:cstheme="majorHAnsi"/>
@@ -4744,6 +3935,7 @@
           <w:sz w:val="22"/>
           <w:szCs w:val="22"/>
         </w:rPr>
+        <w:lastRenderedPageBreak/>
         <w:t xml:space="preserve">Posterior probability values for each tributary (j) were then calculated using Bayes theorem </w:t>
       </w:r>
       <w:r>
@@ -5307,33 +4499,15 @@
           <w:sz w:val="22"/>
           <w:szCs w:val="22"/>
         </w:rPr>
-        <w:t>tributaries with a stream order of 3 or greater</w:t>
-      </w:r>
-      <w:proofErr w:type="gramStart"/>
-      <w:r>
-        <w:rPr>
-          <w:rFonts w:ascii="Garamond" w:hAnsi="Garamond"/>
-          <w:sz w:val="22"/>
-          <w:szCs w:val="22"/>
-        </w:rPr>
-        <w:t xml:space="preserve">, </w:t>
-      </w:r>
-      <w:r>
-        <w:rPr>
-          <w:rFonts w:ascii="Garamond" w:hAnsi="Garamond"/>
-          <w:sz w:val="22"/>
-          <w:szCs w:val="22"/>
-        </w:rPr>
-        <w:t>,</w:t>
-      </w:r>
-      <w:proofErr w:type="gramEnd"/>
-      <w:r>
-        <w:rPr>
-          <w:rFonts w:ascii="Garamond" w:hAnsi="Garamond"/>
-          <w:sz w:val="22"/>
-          <w:szCs w:val="22"/>
-        </w:rPr>
-        <w:t xml:space="preserve"> reflecting Chinook </w:t>
+        <w:t xml:space="preserve">tributaries with a stream order of 3 or greater, </w:t>
+      </w:r>
+      <w:r>
+        <w:rPr>
+          <w:rFonts w:ascii="Garamond" w:hAnsi="Garamond"/>
+          <w:sz w:val="22"/>
+          <w:szCs w:val="22"/>
+        </w:rPr>
+        <w:t xml:space="preserve">reflecting Chinook </w:t>
       </w:r>
       <w:r>
         <w:rPr>
@@ -5357,53 +4531,52 @@
           <w:sz w:val="22"/>
           <w:szCs w:val="22"/>
         </w:rPr>
-        <w:t xml:space="preserve"> (</w:t>
-      </w:r>
-      <w:r>
-        <w:rPr>
-          <w:rFonts w:ascii="Garamond" w:hAnsi="Garamond"/>
-          <w:sz w:val="22"/>
-          <w:szCs w:val="22"/>
+        <w:t xml:space="preserve"> </w:t>
+      </w:r>
+      <w:r>
+        <w:rPr>
+          <w:rFonts w:ascii="Garamond" w:hAnsi="Garamond"/>
+          <w:sz w:val="22"/>
+          <w:szCs w:val="22"/>
+          <w:highlight w:val="yellow"/>
+        </w:rPr>
+        <w:t>(</w:t>
+      </w:r>
+      <w:r>
+        <w:rPr>
+          <w:rFonts w:ascii="Garamond" w:hAnsi="Garamond"/>
+          <w:sz w:val="22"/>
+          <w:szCs w:val="22"/>
+          <w:highlight w:val="yellow"/>
         </w:rPr>
         <w:t>Quinn</w:t>
       </w:r>
-      <w:del w:id="56" w:author="Benjamin J. Makhlouf" w:date="2025-07-26T11:29:00Z" w16du:dateUtc="2025-07-26T18:29:00Z">
+      <w:del w:id="16" w:author="Benjamin J. Makhlouf" w:date="2025-07-26T11:29:00Z" w16du:dateUtc="2025-07-26T18:29:00Z">
         <w:r>
           <w:rPr>
             <w:rFonts w:ascii="Garamond" w:hAnsi="Garamond"/>
             <w:sz w:val="22"/>
             <w:szCs w:val="22"/>
+            <w:highlight w:val="yellow"/>
           </w:rPr>
           <w:delText xml:space="preserve"> </w:delText>
         </w:r>
       </w:del>
-      <w:ins w:id="57" w:author="Benjamin J. Makhlouf" w:date="2025-07-26T11:29:00Z" w16du:dateUtc="2025-07-26T18:29:00Z">
-        <w:r>
-          <w:rPr>
-            <w:rFonts w:ascii="Garamond" w:hAnsi="Garamond"/>
-            <w:sz w:val="22"/>
-            <w:szCs w:val="22"/>
-          </w:rPr>
-          <w:t>, 2018</w:t>
-        </w:r>
-      </w:ins>
-      <w:ins w:id="58" w:author="Daniel Schindler" w:date="2025-07-17T13:26:00Z" w16du:dateUtc="2025-07-17T21:26:00Z">
-        <w:del w:id="59" w:author="Benjamin J. Makhlouf" w:date="2025-07-26T11:29:00Z" w16du:dateUtc="2025-07-26T18:29:00Z">
-          <w:r>
-            <w:rPr>
-              <w:rFonts w:ascii="Garamond" w:hAnsi="Garamond"/>
-              <w:sz w:val="22"/>
-              <w:szCs w:val="22"/>
-            </w:rPr>
-            <w:delText>book</w:delText>
-          </w:r>
-        </w:del>
-      </w:ins>
-      <w:r>
-        <w:rPr>
-          <w:rFonts w:ascii="Garamond" w:hAnsi="Garamond"/>
-          <w:sz w:val="22"/>
-          <w:szCs w:val="22"/>
+      <w:r>
+        <w:rPr>
+          <w:rFonts w:ascii="Garamond" w:hAnsi="Garamond"/>
+          <w:sz w:val="22"/>
+          <w:szCs w:val="22"/>
+          <w:highlight w:val="yellow"/>
+        </w:rPr>
+        <w:t>, 2018</w:t>
+      </w:r>
+      <w:r>
+        <w:rPr>
+          <w:rFonts w:ascii="Garamond" w:hAnsi="Garamond"/>
+          <w:sz w:val="22"/>
+          <w:szCs w:val="22"/>
+          <w:highlight w:val="yellow"/>
         </w:rPr>
         <w:t>)</w:t>
       </w:r>
@@ -5412,8 +4585,17 @@
           <w:rFonts w:ascii="Garamond" w:hAnsi="Garamond"/>
           <w:sz w:val="22"/>
           <w:szCs w:val="22"/>
-        </w:rPr>
-        <w:t xml:space="preserve">.  </w:t>
+          <w:highlight w:val="yellow"/>
+        </w:rPr>
+        <w:t>.</w:t>
+      </w:r>
+      <w:r>
+        <w:rPr>
+          <w:rFonts w:ascii="Garamond" w:hAnsi="Garamond"/>
+          <w:sz w:val="22"/>
+          <w:szCs w:val="22"/>
+        </w:rPr>
+        <w:t xml:space="preserve">  </w:t>
       </w:r>
       <w:r>
         <w:rPr>
@@ -5486,7 +4668,7 @@
           <w:sz w:val="22"/>
           <w:szCs w:val="22"/>
           <w14:ligatures w14:val="none"/>
-          <w:rPrChange w:id="60" w:author="Benjamin J. Makhlouf" w:date="2025-07-26T13:48:00Z" w16du:dateUtc="2025-07-26T20:48:00Z">
+          <w:rPrChange w:id="17" w:author="Benjamin J. Makhlouf" w:date="2025-07-26T13:48:00Z" w16du:dateUtc="2025-07-26T20:48:00Z">
             <w:rPr>
               <w:rFonts w:ascii="Garamond" w:eastAsia="Times New Roman" w:hAnsi="Garamond" w:cs="Times New Roman"/>
               <w:kern w:val="0"/>
@@ -5507,6 +4689,27 @@
           <w:szCs w:val="22"/>
           <w14:ligatures w14:val="none"/>
         </w:rPr>
+        <w:t xml:space="preserve"> of </w:t>
+      </w:r>
+      <w:r>
+        <w:rPr>
+          <w:rFonts w:ascii="Garamond" w:eastAsia="Times New Roman" w:hAnsi="Garamond" w:cs="Times New Roman"/>
+          <w:kern w:val="0"/>
+          <w:sz w:val="22"/>
+          <w:szCs w:val="22"/>
+          <w:highlight w:val="yellow"/>
+          <w14:ligatures w14:val="none"/>
+        </w:rPr>
+        <w:t>_____</w:t>
+      </w:r>
+      <w:r>
+        <w:rPr>
+          <w:rFonts w:ascii="Garamond" w:eastAsia="Times New Roman" w:hAnsi="Garamond" w:cs="Times New Roman"/>
+          <w:kern w:val="0"/>
+          <w:sz w:val="22"/>
+          <w:szCs w:val="22"/>
+          <w14:ligatures w14:val="none"/>
+        </w:rPr>
         <w:t>,</w:t>
       </w:r>
       <w:r>
@@ -5557,36 +4760,92 @@
           <w:szCs w:val="22"/>
           <w14:ligatures w14:val="none"/>
         </w:rPr>
-        <w:t xml:space="preserve">. Finally, data was included on observed locations of spawning </w:t>
-      </w:r>
-      <w:ins w:id="61" w:author="Daniel Schindler" w:date="2025-07-17T13:27:00Z" w16du:dateUtc="2025-07-17T21:27:00Z">
-        <w:r>
-          <w:rPr>
-            <w:rFonts w:ascii="Garamond" w:eastAsia="Times New Roman" w:hAnsi="Garamond" w:cs="Times New Roman"/>
-            <w:kern w:val="0"/>
-            <w:sz w:val="22"/>
-            <w:szCs w:val="22"/>
-            <w14:ligatures w14:val="none"/>
-          </w:rPr>
-          <w:t>C</w:t>
-        </w:r>
-      </w:ins>
-      <w:r>
-        <w:rPr>
-          <w:rFonts w:ascii="Garamond" w:eastAsia="Times New Roman" w:hAnsi="Garamond" w:cs="Times New Roman"/>
-          <w:kern w:val="0"/>
-          <w:sz w:val="22"/>
-          <w:szCs w:val="22"/>
-          <w14:ligatures w14:val="none"/>
-        </w:rPr>
-        <w:t>hinook presence derived from USGS Arctic-Yukon-Kuskokwim (AYK) Chinook Salmon Intrinsic potential mapping. This dataset synthesizes several sources of data on observed Chinook salmon spawners  to provide a binary 0 or 1 value for locations with or without observations across the dataset</w:t>
-      </w:r>
-      <w:r>
-        <w:rPr>
-          <w:rFonts w:ascii="Garamond" w:eastAsia="Times New Roman" w:hAnsi="Garamond" w:cs="Times New Roman"/>
-          <w:kern w:val="0"/>
-          <w:sz w:val="22"/>
-          <w:szCs w:val="22"/>
+        <w:t xml:space="preserve">. </w:t>
+      </w:r>
+      <w:r>
+        <w:rPr>
+          <w:rFonts w:ascii="Garamond" w:eastAsia="Times New Roman" w:hAnsi="Garamond" w:cs="Times New Roman"/>
+          <w:kern w:val="0"/>
+          <w:sz w:val="22"/>
+          <w:szCs w:val="22"/>
+          <w:highlight w:val="yellow"/>
+          <w14:ligatures w14:val="none"/>
+        </w:rPr>
+        <w:t xml:space="preserve">Finally, data was included on observed locations of spawning </w:t>
+      </w:r>
+      <w:r>
+        <w:rPr>
+          <w:rFonts w:ascii="Garamond" w:eastAsia="Times New Roman" w:hAnsi="Garamond" w:cs="Times New Roman"/>
+          <w:kern w:val="0"/>
+          <w:sz w:val="22"/>
+          <w:szCs w:val="22"/>
+          <w:highlight w:val="yellow"/>
+          <w14:ligatures w14:val="none"/>
+        </w:rPr>
+        <w:t>C</w:t>
+      </w:r>
+      <w:r>
+        <w:rPr>
+          <w:rFonts w:ascii="Garamond" w:eastAsia="Times New Roman" w:hAnsi="Garamond" w:cs="Times New Roman"/>
+          <w:kern w:val="0"/>
+          <w:sz w:val="22"/>
+          <w:szCs w:val="22"/>
+          <w:highlight w:val="yellow"/>
+          <w14:ligatures w14:val="none"/>
+        </w:rPr>
+        <w:t>hinook presence derived from USGS Arctic-Yukon-Kuskokwim (AYK) Chinook Salmon Intrinsic potential mapping</w:t>
+      </w:r>
+      <w:r>
+        <w:rPr>
+          <w:rFonts w:ascii="Garamond" w:eastAsia="Times New Roman" w:hAnsi="Garamond" w:cs="Times New Roman"/>
+          <w:kern w:val="0"/>
+          <w:sz w:val="22"/>
+          <w:szCs w:val="22"/>
+          <w:highlight w:val="yellow"/>
+          <w14:ligatures w14:val="none"/>
+        </w:rPr>
+        <w:t xml:space="preserve">, which </w:t>
+      </w:r>
+      <w:r>
+        <w:rPr>
+          <w:rFonts w:ascii="Garamond" w:eastAsia="Times New Roman" w:hAnsi="Garamond" w:cs="Times New Roman"/>
+          <w:kern w:val="0"/>
+          <w:sz w:val="22"/>
+          <w:szCs w:val="22"/>
+          <w:highlight w:val="yellow"/>
+          <w14:ligatures w14:val="none"/>
+        </w:rPr>
+        <w:t>synthesize</w:t>
+      </w:r>
+      <w:r>
+        <w:rPr>
+          <w:rFonts w:ascii="Garamond" w:eastAsia="Times New Roman" w:hAnsi="Garamond" w:cs="Times New Roman"/>
+          <w:kern w:val="0"/>
+          <w:sz w:val="22"/>
+          <w:szCs w:val="22"/>
+          <w:highlight w:val="yellow"/>
+          <w14:ligatures w14:val="none"/>
+        </w:rPr>
+        <w:t>d</w:t>
+      </w:r>
+      <w:r>
+        <w:rPr>
+          <w:rFonts w:ascii="Garamond" w:eastAsia="Times New Roman" w:hAnsi="Garamond" w:cs="Times New Roman"/>
+          <w:kern w:val="0"/>
+          <w:sz w:val="22"/>
+          <w:szCs w:val="22"/>
+          <w:highlight w:val="yellow"/>
+          <w14:ligatures w14:val="none"/>
+        </w:rPr>
+        <w:t xml:space="preserve"> several sources of data on observed Chinook salmon spawners  to provide a binary 0 or 1 value for locations with or without observations across the dataset</w:t>
+      </w:r>
+      <w:r>
+        <w:rPr>
+          <w:rFonts w:ascii="Garamond" w:eastAsia="Times New Roman" w:hAnsi="Garamond" w:cs="Times New Roman"/>
+          <w:kern w:val="0"/>
+          <w:sz w:val="22"/>
+          <w:szCs w:val="22"/>
+          <w:highlight w:val="yellow"/>
           <w14:ligatures w14:val="none"/>
         </w:rPr>
         <w:t xml:space="preserve"> </w:t>
@@ -5597,6 +4856,7 @@
           <w:kern w:val="0"/>
           <w:sz w:val="22"/>
           <w:szCs w:val="22"/>
+          <w:highlight w:val="yellow"/>
           <w14:ligatures w14:val="none"/>
         </w:rPr>
         <w:fldChar w:fldCharType="begin"/>
@@ -5607,6 +4867,7 @@
           <w:kern w:val="0"/>
           <w:sz w:val="22"/>
           <w:szCs w:val="22"/>
+          <w:highlight w:val="yellow"/>
           <w14:ligatures w14:val="none"/>
         </w:rPr>
         <w:instrText xml:space="preserve"> ADDIN ZOTERO_ITEM CSL_CITATION {"citationID":"GgqWHCm6","properties":{"formattedCitation":"(Falke &amp; Paul, 2025)","plainCitation":"(Falke &amp; Paul, 2025)","noteIndex":0},"citationItems":[{"id":5400,"uris":["http://zotero.org/users/8421274/items/GG56Y5HB"],"itemData":{"id":5400,"type":"dataset","abstract":"Chinook Salmon (Oncorhynchus tshawytscha) are an important commercial, subsistence, and recreational fishery resource in Alaska, and recent population declines have resulted in closures of some Chinook Salmon fisheries. Research into environmental factors involved in the decline of salmon stocks has exposed information gaps regarding fine-scale freshwater habitat quality known to influence Chinook Salmon productivity. We developed spatially-explicit intrinsic habitat potential models for Chinook Salmon freshwater spawning and rearing life-stages based on geomorphic stream network attributes (e.g., gradient, mean annual flow, valley bottom width). Model predictions were applied to individual stream reaches and summarized across synthetic stream networks derived from high-resolution (5-meter) digital elevation models covering the Yukon River drainage west of the US-Canada border and the entire Kuskokwim River drainage (total stream length ~667,000 km across 1.3 million km2 area). Vector spatial datasets include unique reach contributing area (uRCA) and unique reach contributing area valley bottom (uRCA VB) polygons, and confluence to confluence streamline edges derived from the NetMap synthetic streamlines product. Tabular data includes a collection of stream attributes summarized by uRCA or uRCA VB polygons, and habitat model results derived from these stream attributes. See metadata records for individual data elements for a description of input sources, software\nenvironments, data quality, processing steps, and attribute information. Approximately 87,500 and 39,500 stream km were predicted to represent moderate to high (index scores 0.6-1.0) Chinook Salmon rearing and spawning habitat suitability, respectively. Our high-resolution, spatially explicit dataset provides many options for summarizing and visualizing habitat suitability across areal units (e.g., river basins, land management boundaries) and assessing the potential for high suitability habitats outside the known distribution of Chinook Salmon at scales useful for managers and the research community.","DOI":"10.5066/P95AV4JO","license":"Creative Commons Zero v1.0 Universal","medium":"csv,xml,shp","publisher":"U.S. Geological Survey","source":"DOI.org (Datacite)","title":"Stream Attributes and Habitat Intrinsic Potential Model Results to examine Freshwater Habitat Potential for Chinook Salmon in the Yukon and Kuskokwim River Basins, Alaska","URL":"https://www.sciencebase.gov/catalog/item/64df8deed34e5f6cd553baec","author":[{"family":"Falke","given":""},{"family":"Paul","given":""}],"accessed":{"date-parts":[["2025",6,4]]},"issued":{"date-parts":[["2025"]]}}}],"schema":"https://github.com/citation-style-language/schema/raw/master/csl-citation.json"} </w:instrText>
@@ -5617,6 +4878,7 @@
           <w:kern w:val="0"/>
           <w:sz w:val="22"/>
           <w:szCs w:val="22"/>
+          <w:highlight w:val="yellow"/>
           <w14:ligatures w14:val="none"/>
         </w:rPr>
         <w:fldChar w:fldCharType="separate"/>
@@ -5628,6 +4890,7 @@
           <w:kern w:val="0"/>
           <w:sz w:val="22"/>
           <w:szCs w:val="22"/>
+          <w:highlight w:val="yellow"/>
           <w14:ligatures w14:val="none"/>
         </w:rPr>
         <w:t>(Falke &amp; Paul, 2025)</w:t>
@@ -5638,6 +4901,7 @@
           <w:kern w:val="0"/>
           <w:sz w:val="22"/>
           <w:szCs w:val="22"/>
+          <w:highlight w:val="yellow"/>
           <w14:ligatures w14:val="none"/>
         </w:rPr>
         <w:fldChar w:fldCharType="end"/>
@@ -5648,9 +4912,20 @@
           <w:kern w:val="0"/>
           <w:sz w:val="22"/>
           <w:szCs w:val="22"/>
-          <w14:ligatures w14:val="none"/>
-        </w:rPr>
-        <w:t xml:space="preserve">. </w:t>
+          <w:highlight w:val="yellow"/>
+          <w14:ligatures w14:val="none"/>
+        </w:rPr>
+        <w:t>.</w:t>
+      </w:r>
+      <w:r>
+        <w:rPr>
+          <w:rFonts w:ascii="Garamond" w:eastAsia="Times New Roman" w:hAnsi="Garamond" w:cs="Times New Roman"/>
+          <w:kern w:val="0"/>
+          <w:sz w:val="22"/>
+          <w:szCs w:val="22"/>
+          <w14:ligatures w14:val="none"/>
+        </w:rPr>
+        <w:t xml:space="preserve"> </w:t>
       </w:r>
       <w:r>
         <w:rPr>
@@ -5670,48 +4945,37 @@
           <w:szCs w:val="22"/>
           <w14:ligatures w14:val="none"/>
         </w:rPr>
-        <w:t xml:space="preserve">the </w:t>
-      </w:r>
-      <w:r>
-        <w:rPr>
-          <w:rFonts w:ascii="Garamond" w:eastAsia="Times New Roman" w:hAnsi="Garamond" w:cs="Times New Roman"/>
-          <w:kern w:val="0"/>
-          <w:sz w:val="22"/>
-          <w:szCs w:val="22"/>
-          <w14:ligatures w14:val="none"/>
-        </w:rPr>
-        <w:lastRenderedPageBreak/>
-        <w:t xml:space="preserve">two highest stream orders in the dataset (Stream order &gt;= 6). </w:t>
-      </w:r>
-      <w:r>
-        <w:rPr>
-          <w:rFonts w:ascii="Garamond" w:eastAsia="Times New Roman" w:hAnsi="Garamond" w:cs="Times New Roman"/>
-          <w:kern w:val="0"/>
-          <w:sz w:val="22"/>
-          <w:szCs w:val="22"/>
-          <w14:ligatures w14:val="none"/>
-        </w:rPr>
-        <w:t xml:space="preserve">From these tributaries, reaches identified in the </w:t>
-      </w:r>
-      <w:r>
-        <w:rPr>
-          <w:rFonts w:ascii="Garamond" w:eastAsia="Times New Roman" w:hAnsi="Garamond" w:cs="Times New Roman"/>
-          <w:kern w:val="0"/>
-          <w:sz w:val="22"/>
-          <w:szCs w:val="22"/>
-          <w14:ligatures w14:val="none"/>
-        </w:rPr>
-        <w:t>intrinsic potential</w:t>
-      </w:r>
-      <w:r>
-        <w:rPr>
-          <w:rFonts w:ascii="Garamond" w:eastAsia="Times New Roman" w:hAnsi="Garamond" w:cs="Times New Roman"/>
-          <w:kern w:val="0"/>
-          <w:sz w:val="22"/>
-          <w:szCs w:val="22"/>
-          <w14:ligatures w14:val="none"/>
-        </w:rPr>
-        <w:t xml:space="preserve"> dataset as lacking observed Chinook spawning were assigned as a value of 0. </w:t>
+        <w:t xml:space="preserve">the two highest stream orders in the dataset (Stream order &gt;= 6). </w:t>
+      </w:r>
+      <w:r>
+        <w:rPr>
+          <w:rFonts w:ascii="Garamond" w:eastAsia="Times New Roman" w:hAnsi="Garamond" w:cs="Times New Roman"/>
+          <w:kern w:val="0"/>
+          <w:sz w:val="22"/>
+          <w:szCs w:val="22"/>
+          <w14:ligatures w14:val="none"/>
+        </w:rPr>
+        <w:t xml:space="preserve">From these tributaries, reaches identified as </w:t>
+      </w:r>
+      <w:r>
+        <w:rPr>
+          <w:rFonts w:ascii="Garamond" w:eastAsia="Times New Roman" w:hAnsi="Garamond" w:cs="Times New Roman"/>
+          <w:kern w:val="0"/>
+          <w:sz w:val="22"/>
+          <w:szCs w:val="22"/>
+          <w14:ligatures w14:val="none"/>
+        </w:rPr>
+        <w:t xml:space="preserve">consistently </w:t>
+      </w:r>
+      <w:r>
+        <w:rPr>
+          <w:rFonts w:ascii="Garamond" w:eastAsia="Times New Roman" w:hAnsi="Garamond" w:cs="Times New Roman"/>
+          <w:kern w:val="0"/>
+          <w:sz w:val="22"/>
+          <w:szCs w:val="22"/>
+          <w14:ligatures w14:val="none"/>
+        </w:rPr>
+        <w:t xml:space="preserve">lacking observed Chinook spawning were assigned as a value of 0. </w:t>
       </w:r>
     </w:p>
     <w:p>
@@ -5730,7 +4994,63 @@
           <w:sz w:val="22"/>
           <w:szCs w:val="22"/>
         </w:rPr>
-        <w:t xml:space="preserve">Natal origin distributions were estimated by summing posterior probability values across individuals and locations, retaining only the top 30% of posterior values for </w:t>
+        <w:t xml:space="preserve">To estimate the spatial distribution of natal origins for a subset of the population, </w:t>
+      </w:r>
+      <w:r>
+        <w:rPr>
+          <w:rFonts w:ascii="Garamond" w:hAnsi="Garamond"/>
+          <w:sz w:val="22"/>
+          <w:szCs w:val="22"/>
+        </w:rPr>
+        <w:t xml:space="preserve">posterior probability values </w:t>
+      </w:r>
+      <w:r>
+        <w:rPr>
+          <w:rFonts w:ascii="Garamond" w:hAnsi="Garamond"/>
+          <w:sz w:val="22"/>
+          <w:szCs w:val="22"/>
+        </w:rPr>
+        <w:t xml:space="preserve">were summed </w:t>
+      </w:r>
+      <w:r>
+        <w:rPr>
+          <w:rFonts w:ascii="Garamond" w:hAnsi="Garamond"/>
+          <w:sz w:val="22"/>
+          <w:szCs w:val="22"/>
+        </w:rPr>
+        <w:t xml:space="preserve">across </w:t>
+      </w:r>
+      <w:r>
+        <w:rPr>
+          <w:rFonts w:ascii="Garamond" w:hAnsi="Garamond"/>
+          <w:sz w:val="22"/>
+          <w:szCs w:val="22"/>
+        </w:rPr>
+        <w:t xml:space="preserve">all </w:t>
+      </w:r>
+      <w:r>
+        <w:rPr>
+          <w:rFonts w:ascii="Garamond" w:hAnsi="Garamond"/>
+          <w:sz w:val="22"/>
+          <w:szCs w:val="22"/>
+        </w:rPr>
+        <w:t xml:space="preserve">individuals </w:t>
+      </w:r>
+      <w:r>
+        <w:rPr>
+          <w:rFonts w:ascii="Garamond" w:hAnsi="Garamond"/>
+          <w:sz w:val="22"/>
+          <w:szCs w:val="22"/>
+        </w:rPr>
+        <w:t>in the subset and at all reaches in the basin.</w:t>
+      </w:r>
+      <w:r>
+        <w:rPr>
+          <w:rFonts w:ascii="Garamond" w:hAnsi="Garamond"/>
+          <w:sz w:val="22"/>
+          <w:szCs w:val="22"/>
+        </w:rPr>
+        <w:t xml:space="preserve"> To focus analysis on only highly likely locations, the top 30% of posterior values were retained whereas all other values were assigned a value of 0 for </w:t>
       </w:r>
       <w:proofErr w:type="gramStart"/>
       <w:r>
@@ -5748,7 +5068,16 @@
           <w:sz w:val="22"/>
           <w:szCs w:val="22"/>
         </w:rPr>
-        <w:t xml:space="preserve"> to prevent low-probability assignments from confounding spatial patterns. Estimates were produced for predefined temporal quartiles </w:t>
+        <w:t xml:space="preserve"> before summing. Natal origin estimates were produced for </w:t>
+      </w:r>
+      <w:r>
+        <w:rPr>
+          <w:rFonts w:ascii="Garamond" w:hAnsi="Garamond"/>
+          <w:sz w:val="22"/>
+          <w:szCs w:val="22"/>
+        </w:rPr>
+        <w:lastRenderedPageBreak/>
+        <w:t xml:space="preserve">predefined temporal quartiles </w:t>
       </w:r>
       <w:r>
         <w:rPr>
@@ -5766,7 +5095,7 @@
         </w:rPr>
         <w:t>based on capture date: Q1 (run start through June 11), Q2 (June 12-21), Q3 (June 22-July 1), and Q4 (July 2 onward).</w:t>
       </w:r>
-      <w:ins w:id="62" w:author="Daniel Schindler" w:date="2025-07-17T13:30:00Z" w16du:dateUtc="2025-07-17T21:30:00Z">
+      <w:ins w:id="18" w:author="Daniel Schindler" w:date="2025-07-17T13:30:00Z" w16du:dateUtc="2025-07-17T21:30:00Z">
         <w:r>
           <w:rPr>
             <w:rFonts w:ascii="Garamond" w:hAnsi="Garamond"/>
@@ -5862,103 +5191,7 @@
           <w:sz w:val="22"/>
           <w:szCs w:val="22"/>
         </w:rPr>
-        <w:t xml:space="preserve">Due </w:t>
-      </w:r>
-      <w:r>
-        <w:rPr>
-          <w:rFonts w:ascii="Garamond" w:hAnsi="Garamond"/>
-          <w:sz w:val="22"/>
-          <w:szCs w:val="22"/>
-        </w:rPr>
-        <w:t xml:space="preserve">to differences in the total run duration among years </w:t>
-      </w:r>
-      <w:r>
-        <w:rPr>
-          <w:rFonts w:ascii="Garamond" w:hAnsi="Garamond"/>
-          <w:sz w:val="22"/>
-          <w:szCs w:val="22"/>
-        </w:rPr>
-        <w:t xml:space="preserve">the duration of the </w:t>
-      </w:r>
-      <w:r>
-        <w:rPr>
-          <w:rFonts w:ascii="Garamond" w:hAnsi="Garamond"/>
-          <w:sz w:val="22"/>
-          <w:szCs w:val="22"/>
-        </w:rPr>
-        <w:t>fourth quartile bin</w:t>
-      </w:r>
-      <w:r>
-        <w:rPr>
-          <w:rFonts w:ascii="Garamond" w:hAnsi="Garamond"/>
-          <w:sz w:val="22"/>
-          <w:szCs w:val="22"/>
-        </w:rPr>
-        <w:t xml:space="preserve"> varie</w:t>
-      </w:r>
-      <w:r>
-        <w:rPr>
-          <w:rFonts w:ascii="Garamond" w:hAnsi="Garamond"/>
-          <w:sz w:val="22"/>
-          <w:szCs w:val="22"/>
-        </w:rPr>
-        <w:t>d</w:t>
-      </w:r>
-      <w:r>
-        <w:rPr>
-          <w:rFonts w:ascii="Garamond" w:hAnsi="Garamond"/>
-          <w:sz w:val="22"/>
-          <w:szCs w:val="22"/>
-        </w:rPr>
-        <w:t xml:space="preserve"> </w:t>
-      </w:r>
-      <w:r>
-        <w:rPr>
-          <w:rFonts w:ascii="Garamond" w:hAnsi="Garamond"/>
-          <w:sz w:val="22"/>
-          <w:szCs w:val="22"/>
-        </w:rPr>
-        <w:t xml:space="preserve">slightly among years. For the most part, these deviations were minimal and </w:t>
-      </w:r>
-      <w:r>
-        <w:rPr>
-          <w:rFonts w:ascii="Garamond" w:hAnsi="Garamond"/>
-          <w:sz w:val="22"/>
-          <w:szCs w:val="22"/>
-        </w:rPr>
-        <w:t>included</w:t>
-      </w:r>
-      <w:r>
-        <w:rPr>
-          <w:rFonts w:ascii="Garamond" w:hAnsi="Garamond"/>
-          <w:sz w:val="22"/>
-          <w:szCs w:val="22"/>
-        </w:rPr>
-        <w:t xml:space="preserve"> </w:t>
-      </w:r>
-      <w:r>
-        <w:rPr>
-          <w:rFonts w:ascii="Garamond" w:hAnsi="Garamond"/>
-          <w:sz w:val="22"/>
-          <w:szCs w:val="22"/>
-        </w:rPr>
-        <w:t>a negligible</w:t>
-      </w:r>
-      <w:r>
-        <w:rPr>
-          <w:rFonts w:ascii="Garamond" w:hAnsi="Garamond"/>
-          <w:sz w:val="22"/>
-          <w:szCs w:val="22"/>
-        </w:rPr>
-        <w:t xml:space="preserve"> </w:t>
-      </w:r>
-      <w:r>
-        <w:rPr>
-          <w:rFonts w:ascii="Garamond" w:hAnsi="Garamond"/>
-          <w:sz w:val="22"/>
-          <w:szCs w:val="22"/>
-        </w:rPr>
-        <w:t xml:space="preserve">portion of the CPUE. Finally, estimates were produced for the full run in each year by including all four quartiles of data. </w:t>
+        <w:t xml:space="preserve">Estimates were also produced for the full duration of the run including all four quartiles of data for each year. </w:t>
       </w:r>
     </w:p>
     <w:p>
@@ -6011,7 +5244,7 @@
         </w:rPr>
         <w:t xml:space="preserve"> </w:t>
       </w:r>
-      <w:ins w:id="63" w:author="Daniel Schindler" w:date="2025-07-17T13:31:00Z" w16du:dateUtc="2025-07-17T21:31:00Z">
+      <w:ins w:id="19" w:author="Daniel Schindler" w:date="2025-07-17T13:31:00Z" w16du:dateUtc="2025-07-17T21:31:00Z">
         <w:r>
           <w:rPr>
             <w:rFonts w:ascii="Garamond" w:hAnsi="Garamond"/>
@@ -6162,7 +5395,87 @@
           <w:sz w:val="22"/>
           <w:szCs w:val="22"/>
         </w:rPr>
-        <w:t xml:space="preserve">). Corresponding boxplots for each quartile illustrate temporal variability in contribution patterns, ordered from upstream to downstream locations. Cumulative distribution functions </w:t>
+        <w:t>). Corresponding boxplots for each quartile illustrate temporal variability in contribution patterns, ordered from upstream to downstream locations. Cumulative distribution functions were constructed using 3-day intervals throughout each run. For each interval, tributary-level production estimates were aggregated into management units and compared against full-season totals.</w:t>
+      </w:r>
+      <w:r>
+        <w:rPr>
+          <w:rFonts w:ascii="Garamond" w:hAnsi="Garamond"/>
+          <w:sz w:val="22"/>
+          <w:szCs w:val="22"/>
+        </w:rPr>
+        <w:t xml:space="preserve"> Resulting data represent the proportion of the total contribution from each stock present at each interval. For each stock, lines were color coded by watershed position, with upstream populations in red. </w:t>
+      </w:r>
+      <w:r>
+        <w:rPr>
+          <w:rFonts w:ascii="Garamond" w:hAnsi="Garamond"/>
+          <w:sz w:val="22"/>
+          <w:szCs w:val="22"/>
+        </w:rPr>
+        <w:t xml:space="preserve">Management units were color-coded by watershed position, with upstream </w:t>
+      </w:r>
+      <w:r>
+        <w:rPr>
+          <w:rFonts w:ascii="Garamond" w:hAnsi="Garamond"/>
+          <w:sz w:val="22"/>
+          <w:szCs w:val="22"/>
+        </w:rPr>
+        <w:t>populations</w:t>
+      </w:r>
+      <w:r>
+        <w:rPr>
+          <w:rFonts w:ascii="Garamond" w:hAnsi="Garamond"/>
+          <w:sz w:val="22"/>
+          <w:szCs w:val="22"/>
+        </w:rPr>
+        <w:t xml:space="preserve"> transitioning to downstream populations in blue</w:t>
+      </w:r>
+      <w:r>
+        <w:rPr>
+          <w:rFonts w:ascii="Garamond" w:hAnsi="Garamond"/>
+          <w:sz w:val="22"/>
+          <w:szCs w:val="22"/>
+        </w:rPr>
+        <w:t xml:space="preserve">. </w:t>
+      </w:r>
+      <w:r>
+        <w:rPr>
+          <w:rFonts w:ascii="Garamond" w:hAnsi="Garamond"/>
+          <w:sz w:val="22"/>
+          <w:szCs w:val="22"/>
+        </w:rPr>
+        <w:t>To assess the effectiveness of front-end closure strategies</w:t>
+      </w:r>
+      <w:r>
+        <w:rPr>
+          <w:rFonts w:ascii="Garamond" w:hAnsi="Garamond"/>
+          <w:sz w:val="22"/>
+          <w:szCs w:val="22"/>
+        </w:rPr>
+        <w:t xml:space="preserve"> for protecting</w:t>
+      </w:r>
+      <w:r>
+        <w:rPr>
+          <w:rFonts w:ascii="Garamond" w:hAnsi="Garamond"/>
+          <w:sz w:val="22"/>
+          <w:szCs w:val="22"/>
+        </w:rPr>
+        <w:t xml:space="preserve"> upstream stock components</w:t>
+      </w:r>
+      <w:r>
+        <w:rPr>
+          <w:rFonts w:ascii="Garamond" w:hAnsi="Garamond"/>
+          <w:sz w:val="22"/>
+          <w:szCs w:val="22"/>
+        </w:rPr>
+        <w:t xml:space="preserve"> from harvest</w:t>
+      </w:r>
+      <w:r>
+        <w:rPr>
+          <w:rFonts w:ascii="Garamond" w:hAnsi="Garamond"/>
+          <w:sz w:val="22"/>
+          <w:szCs w:val="22"/>
+        </w:rPr>
+        <w:t xml:space="preserve">, we quantified the proportion of each management unit's annual production that occurs within </w:t>
       </w:r>
       <w:r>
         <w:rPr>
@@ -6171,87 +5484,7 @@
           <w:szCs w:val="22"/>
         </w:rPr>
         <w:lastRenderedPageBreak/>
-        <w:t>were constructed using 3-day intervals throughout each run. For each interval, tributary-level production estimates were aggregated into management units and compared against full-season totals.</w:t>
-      </w:r>
-      <w:r>
-        <w:rPr>
-          <w:rFonts w:ascii="Garamond" w:hAnsi="Garamond"/>
-          <w:sz w:val="22"/>
-          <w:szCs w:val="22"/>
-        </w:rPr>
-        <w:t xml:space="preserve"> Resulting data represent the proportion of the total contribution from each stock present at each interval. For each stock, lines were color coded by watershed position, with upstream populations in red. </w:t>
-      </w:r>
-      <w:r>
-        <w:rPr>
-          <w:rFonts w:ascii="Garamond" w:hAnsi="Garamond"/>
-          <w:sz w:val="22"/>
-          <w:szCs w:val="22"/>
-        </w:rPr>
-        <w:t xml:space="preserve">Management units were color-coded by watershed position, with upstream </w:t>
-      </w:r>
-      <w:r>
-        <w:rPr>
-          <w:rFonts w:ascii="Garamond" w:hAnsi="Garamond"/>
-          <w:sz w:val="22"/>
-          <w:szCs w:val="22"/>
-        </w:rPr>
-        <w:t>populations</w:t>
-      </w:r>
-      <w:r>
-        <w:rPr>
-          <w:rFonts w:ascii="Garamond" w:hAnsi="Garamond"/>
-          <w:sz w:val="22"/>
-          <w:szCs w:val="22"/>
-        </w:rPr>
-        <w:t xml:space="preserve"> transitioning to downstream populations in blue</w:t>
-      </w:r>
-      <w:r>
-        <w:rPr>
-          <w:rFonts w:ascii="Garamond" w:hAnsi="Garamond"/>
-          <w:sz w:val="22"/>
-          <w:szCs w:val="22"/>
-        </w:rPr>
-        <w:t xml:space="preserve">. </w:t>
-      </w:r>
-      <w:r>
-        <w:rPr>
-          <w:rFonts w:ascii="Garamond" w:hAnsi="Garamond"/>
-          <w:sz w:val="22"/>
-          <w:szCs w:val="22"/>
-        </w:rPr>
-        <w:t>To assess the effectiveness of front-end closure strategies</w:t>
-      </w:r>
-      <w:r>
-        <w:rPr>
-          <w:rFonts w:ascii="Garamond" w:hAnsi="Garamond"/>
-          <w:sz w:val="22"/>
-          <w:szCs w:val="22"/>
-        </w:rPr>
-        <w:t xml:space="preserve"> for protecting</w:t>
-      </w:r>
-      <w:r>
-        <w:rPr>
-          <w:rFonts w:ascii="Garamond" w:hAnsi="Garamond"/>
-          <w:sz w:val="22"/>
-          <w:szCs w:val="22"/>
-        </w:rPr>
-        <w:t xml:space="preserve"> upstream stock components</w:t>
-      </w:r>
-      <w:r>
-        <w:rPr>
-          <w:rFonts w:ascii="Garamond" w:hAnsi="Garamond"/>
-          <w:sz w:val="22"/>
-          <w:szCs w:val="22"/>
-        </w:rPr>
-        <w:t xml:space="preserve"> from harvest</w:t>
-      </w:r>
-      <w:r>
-        <w:rPr>
-          <w:rFonts w:ascii="Garamond" w:hAnsi="Garamond"/>
-          <w:sz w:val="22"/>
-          <w:szCs w:val="22"/>
-        </w:rPr>
-        <w:t>, we quantified the proportion of each management unit's annual production that occurs within the current closure window. We calculated the ratio of estimated returns during Q1 (run start through June 11) to the total annual returns for each management unit and year. This metric represents the fraction of each stock's production that would be protected by implementing a front-end closure, independent of that unit's overall contribution to basin-wide returns.</w:t>
+        <w:t>the current closure window. We calculated the ratio of estimated returns during Q1 (run start through June 11) to the total annual returns for each management unit and year. This metric represents the fraction of each stock's production that would be protected by implementing a front-end closure, independent of that unit's overall contribution to basin-wide returns.</w:t>
       </w:r>
     </w:p>
     <w:p>
@@ -6263,7 +5496,7 @@
           <w:bCs/>
           <w:sz w:val="22"/>
           <w:szCs w:val="22"/>
-          <w:rPrChange w:id="64" w:author="Benjamin J. Makhlouf" w:date="2025-07-26T11:37:00Z" w16du:dateUtc="2025-07-26T18:37:00Z">
+          <w:rPrChange w:id="20" w:author="Benjamin J. Makhlouf" w:date="2025-07-26T11:37:00Z" w16du:dateUtc="2025-07-26T18:37:00Z">
             <w:rPr>
               <w:rFonts w:ascii="Garamond" w:hAnsi="Garamond"/>
               <w:b/>
@@ -6281,7 +5514,7 @@
           <w:bCs/>
           <w:sz w:val="22"/>
           <w:szCs w:val="22"/>
-          <w:rPrChange w:id="65" w:author="Benjamin J. Makhlouf" w:date="2025-07-26T11:37:00Z" w16du:dateUtc="2025-07-26T18:37:00Z">
+          <w:rPrChange w:id="21" w:author="Benjamin J. Makhlouf" w:date="2025-07-26T11:37:00Z" w16du:dateUtc="2025-07-26T18:37:00Z">
             <w:rPr>
               <w:rFonts w:ascii="Garamond" w:hAnsi="Garamond"/>
               <w:b/>
@@ -6345,7 +5578,7 @@
           <w:rFonts w:ascii="Garamond" w:hAnsi="Garamond"/>
           <w:sz w:val="22"/>
           <w:szCs w:val="22"/>
-          <w:rPrChange w:id="66" w:author="Benjamin J. Makhlouf" w:date="2025-07-26T11:37:00Z" w16du:dateUtc="2025-07-26T18:37:00Z">
+          <w:rPrChange w:id="22" w:author="Benjamin J. Makhlouf" w:date="2025-07-26T11:37:00Z" w16du:dateUtc="2025-07-26T18:37:00Z">
             <w:rPr>
               <w:rFonts w:ascii="Garamond" w:hAnsi="Garamond"/>
               <w:sz w:val="20"/>
@@ -6369,7 +5602,7 @@
           <w:rFonts w:ascii="Garamond" w:hAnsi="Garamond"/>
           <w:sz w:val="22"/>
           <w:szCs w:val="22"/>
-          <w:rPrChange w:id="67" w:author="Benjamin J. Makhlouf" w:date="2025-07-26T11:37:00Z" w16du:dateUtc="2025-07-26T18:37:00Z">
+          <w:rPrChange w:id="23" w:author="Benjamin J. Makhlouf" w:date="2025-07-26T11:37:00Z" w16du:dateUtc="2025-07-26T18:37:00Z">
             <w:rPr>
               <w:rFonts w:ascii="Garamond" w:hAnsi="Garamond"/>
               <w:sz w:val="20"/>
@@ -6379,13 +5612,13 @@
         </w:rPr>
         <w:t xml:space="preserve">Across all years of our dataset (2017-2021), returns to the 21 stock units exhibited distinct temporal patterns in contribution and </w:t>
       </w:r>
-      <w:ins w:id="68" w:author="Daniel Schindler" w:date="2025-07-17T13:47:00Z" w16du:dateUtc="2025-07-17T21:47:00Z">
+      <w:ins w:id="24" w:author="Daniel Schindler" w:date="2025-07-17T13:47:00Z" w16du:dateUtc="2025-07-17T21:47:00Z">
         <w:r>
           <w:rPr>
             <w:rFonts w:ascii="Garamond" w:hAnsi="Garamond"/>
             <w:sz w:val="22"/>
             <w:szCs w:val="22"/>
-            <w:rPrChange w:id="69" w:author="Benjamin J. Makhlouf" w:date="2025-07-26T11:37:00Z" w16du:dateUtc="2025-07-26T18:37:00Z">
+            <w:rPrChange w:id="25" w:author="Benjamin J. Makhlouf" w:date="2025-07-26T11:37:00Z" w16du:dateUtc="2025-07-26T18:37:00Z">
               <w:rPr>
                 <w:rFonts w:ascii="Garamond" w:hAnsi="Garamond"/>
                 <w:sz w:val="20"/>
@@ -6401,6 +5634,677 @@
           <w:rFonts w:ascii="Garamond" w:hAnsi="Garamond"/>
           <w:sz w:val="22"/>
           <w:szCs w:val="22"/>
+          <w:rPrChange w:id="26" w:author="Benjamin J. Makhlouf" w:date="2025-07-26T11:37:00Z" w16du:dateUtc="2025-07-26T18:37:00Z">
+            <w:rPr>
+              <w:rFonts w:ascii="Garamond" w:hAnsi="Garamond"/>
+              <w:sz w:val="20"/>
+              <w:szCs w:val="20"/>
+            </w:rPr>
+          </w:rPrChange>
+        </w:rPr>
+        <w:t xml:space="preserve"> </w:t>
+      </w:r>
+      <w:r>
+        <w:rPr>
+          <w:rFonts w:ascii="Garamond" w:hAnsi="Garamond"/>
+          <w:sz w:val="22"/>
+          <w:szCs w:val="22"/>
+          <w:rPrChange w:id="27" w:author="Benjamin J. Makhlouf" w:date="2025-07-26T11:37:00Z" w16du:dateUtc="2025-07-26T18:37:00Z">
+            <w:rPr>
+              <w:rFonts w:ascii="Garamond" w:hAnsi="Garamond"/>
+              <w:sz w:val="20"/>
+              <w:szCs w:val="20"/>
+            </w:rPr>
+          </w:rPrChange>
+        </w:rPr>
+        <w:t xml:space="preserve">general transition </w:t>
+      </w:r>
+      <w:r>
+        <w:rPr>
+          <w:rFonts w:ascii="Garamond" w:hAnsi="Garamond"/>
+          <w:sz w:val="22"/>
+          <w:szCs w:val="22"/>
+          <w:rPrChange w:id="28" w:author="Benjamin J. Makhlouf" w:date="2025-07-26T11:37:00Z" w16du:dateUtc="2025-07-26T18:37:00Z">
+            <w:rPr>
+              <w:rFonts w:ascii="Garamond" w:hAnsi="Garamond"/>
+              <w:sz w:val="20"/>
+              <w:szCs w:val="20"/>
+            </w:rPr>
+          </w:rPrChange>
+        </w:rPr>
+        <w:t>from upstream to downstream stock</w:t>
+      </w:r>
+      <w:r>
+        <w:rPr>
+          <w:rFonts w:ascii="Garamond" w:hAnsi="Garamond"/>
+          <w:sz w:val="22"/>
+          <w:szCs w:val="22"/>
+          <w:rPrChange w:id="29" w:author="Benjamin J. Makhlouf" w:date="2025-07-26T11:37:00Z" w16du:dateUtc="2025-07-26T18:37:00Z">
+            <w:rPr>
+              <w:rFonts w:ascii="Garamond" w:hAnsi="Garamond"/>
+              <w:sz w:val="20"/>
+              <w:szCs w:val="20"/>
+            </w:rPr>
+          </w:rPrChange>
+        </w:rPr>
+        <w:t>s</w:t>
+      </w:r>
+      <w:r>
+        <w:rPr>
+          <w:rFonts w:ascii="Garamond" w:hAnsi="Garamond"/>
+          <w:sz w:val="22"/>
+          <w:szCs w:val="22"/>
+          <w:rPrChange w:id="30" w:author="Benjamin J. Makhlouf" w:date="2025-07-26T11:37:00Z" w16du:dateUtc="2025-07-26T18:37:00Z">
+            <w:rPr>
+              <w:rFonts w:ascii="Garamond" w:hAnsi="Garamond"/>
+              <w:sz w:val="20"/>
+              <w:szCs w:val="20"/>
+            </w:rPr>
+          </w:rPrChange>
+        </w:rPr>
+        <w:t xml:space="preserve"> as the season progressed. Early season returns (Q1: start of run through June 11) were dominated by stocks from the upper portions of the watershed. The largest contributors were Big River (median: ~12%, range: 8-18%), Upper Kusko</w:t>
+      </w:r>
+      <w:r>
+        <w:rPr>
+          <w:rFonts w:ascii="Garamond" w:hAnsi="Garamond"/>
+          <w:sz w:val="22"/>
+          <w:szCs w:val="22"/>
+          <w:rPrChange w:id="31" w:author="Benjamin J. Makhlouf" w:date="2025-07-26T11:37:00Z" w16du:dateUtc="2025-07-26T18:37:00Z">
+            <w:rPr>
+              <w:rFonts w:ascii="Garamond" w:hAnsi="Garamond"/>
+              <w:sz w:val="20"/>
+              <w:szCs w:val="20"/>
+            </w:rPr>
+          </w:rPrChange>
+        </w:rPr>
+        <w:t>kwim</w:t>
+      </w:r>
+      <w:r>
+        <w:rPr>
+          <w:rFonts w:ascii="Garamond" w:hAnsi="Garamond"/>
+          <w:sz w:val="22"/>
+          <w:szCs w:val="22"/>
+          <w:rPrChange w:id="32" w:author="Benjamin J. Makhlouf" w:date="2025-07-26T11:37:00Z" w16du:dateUtc="2025-07-26T18:37:00Z">
+            <w:rPr>
+              <w:rFonts w:ascii="Garamond" w:hAnsi="Garamond"/>
+              <w:sz w:val="20"/>
+              <w:szCs w:val="20"/>
+            </w:rPr>
+          </w:rPrChange>
+        </w:rPr>
+        <w:t xml:space="preserve"> Main (median: ~10%, range: 6-16%), and Swift </w:t>
+      </w:r>
+      <w:r>
+        <w:rPr>
+          <w:rFonts w:ascii="Garamond" w:hAnsi="Garamond"/>
+          <w:sz w:val="22"/>
+          <w:szCs w:val="22"/>
+          <w:rPrChange w:id="33" w:author="Benjamin J. Makhlouf" w:date="2025-07-26T11:37:00Z" w16du:dateUtc="2025-07-26T18:37:00Z">
+            <w:rPr>
+              <w:rFonts w:ascii="Garamond" w:hAnsi="Garamond"/>
+              <w:sz w:val="20"/>
+              <w:szCs w:val="20"/>
+            </w:rPr>
+          </w:rPrChange>
+        </w:rPr>
+        <w:t xml:space="preserve">River </w:t>
+      </w:r>
+      <w:r>
+        <w:rPr>
+          <w:rFonts w:ascii="Garamond" w:hAnsi="Garamond"/>
+          <w:sz w:val="22"/>
+          <w:szCs w:val="22"/>
+          <w:rPrChange w:id="34" w:author="Benjamin J. Makhlouf" w:date="2025-07-26T11:37:00Z" w16du:dateUtc="2025-07-26T18:37:00Z">
+            <w:rPr>
+              <w:rFonts w:ascii="Garamond" w:hAnsi="Garamond"/>
+              <w:sz w:val="20"/>
+              <w:szCs w:val="20"/>
+            </w:rPr>
+          </w:rPrChange>
+        </w:rPr>
+        <w:t>(median: ~8%, range: 4-14%), with moderate contributions from</w:t>
+      </w:r>
+      <w:r>
+        <w:rPr>
+          <w:rFonts w:ascii="Garamond" w:hAnsi="Garamond"/>
+          <w:sz w:val="22"/>
+          <w:szCs w:val="22"/>
+          <w:rPrChange w:id="35" w:author="Benjamin J. Makhlouf" w:date="2025-07-26T11:37:00Z" w16du:dateUtc="2025-07-26T18:37:00Z">
+            <w:rPr>
+              <w:rFonts w:ascii="Garamond" w:hAnsi="Garamond"/>
+              <w:sz w:val="20"/>
+              <w:szCs w:val="20"/>
+            </w:rPr>
+          </w:rPrChange>
+        </w:rPr>
+        <w:t xml:space="preserve"> the</w:t>
+      </w:r>
+      <w:r>
+        <w:rPr>
+          <w:rFonts w:ascii="Garamond" w:hAnsi="Garamond"/>
+          <w:sz w:val="22"/>
+          <w:szCs w:val="22"/>
+          <w:rPrChange w:id="36" w:author="Benjamin J. Makhlouf" w:date="2025-07-26T11:37:00Z" w16du:dateUtc="2025-07-26T18:37:00Z">
+            <w:rPr>
+              <w:rFonts w:ascii="Garamond" w:hAnsi="Garamond"/>
+              <w:sz w:val="20"/>
+              <w:szCs w:val="20"/>
+            </w:rPr>
+          </w:rPrChange>
+        </w:rPr>
+        <w:t xml:space="preserve"> </w:t>
+      </w:r>
+      <w:proofErr w:type="spellStart"/>
+      <w:r>
+        <w:rPr>
+          <w:rFonts w:ascii="Garamond" w:hAnsi="Garamond"/>
+          <w:sz w:val="22"/>
+          <w:szCs w:val="22"/>
+          <w:rPrChange w:id="37" w:author="Benjamin J. Makhlouf" w:date="2025-07-26T11:37:00Z" w16du:dateUtc="2025-07-26T18:37:00Z">
+            <w:rPr>
+              <w:rFonts w:ascii="Garamond" w:hAnsi="Garamond"/>
+              <w:sz w:val="20"/>
+              <w:szCs w:val="20"/>
+            </w:rPr>
+          </w:rPrChange>
+        </w:rPr>
+        <w:t>Takotna</w:t>
+      </w:r>
+      <w:proofErr w:type="spellEnd"/>
+      <w:r>
+        <w:rPr>
+          <w:rFonts w:ascii="Garamond" w:hAnsi="Garamond"/>
+          <w:sz w:val="22"/>
+          <w:szCs w:val="22"/>
+          <w:rPrChange w:id="38" w:author="Benjamin J. Makhlouf" w:date="2025-07-26T11:37:00Z" w16du:dateUtc="2025-07-26T18:37:00Z">
+            <w:rPr>
+              <w:rFonts w:ascii="Garamond" w:hAnsi="Garamond"/>
+              <w:sz w:val="20"/>
+              <w:szCs w:val="20"/>
+            </w:rPr>
+          </w:rPrChange>
+        </w:rPr>
+        <w:t xml:space="preserve"> </w:t>
+      </w:r>
+      <w:r>
+        <w:rPr>
+          <w:rFonts w:ascii="Garamond" w:hAnsi="Garamond"/>
+          <w:sz w:val="22"/>
+          <w:szCs w:val="22"/>
+          <w:rPrChange w:id="39" w:author="Benjamin J. Makhlouf" w:date="2025-07-26T11:37:00Z" w16du:dateUtc="2025-07-26T18:37:00Z">
+            <w:rPr>
+              <w:rFonts w:ascii="Garamond" w:hAnsi="Garamond"/>
+              <w:sz w:val="20"/>
+              <w:szCs w:val="20"/>
+            </w:rPr>
+          </w:rPrChange>
+        </w:rPr>
+        <w:t xml:space="preserve">River </w:t>
+      </w:r>
+      <w:r>
+        <w:rPr>
+          <w:rFonts w:ascii="Garamond" w:hAnsi="Garamond"/>
+          <w:sz w:val="22"/>
+          <w:szCs w:val="22"/>
+          <w:rPrChange w:id="40" w:author="Benjamin J. Makhlouf" w:date="2025-07-26T11:37:00Z" w16du:dateUtc="2025-07-26T18:37:00Z">
+            <w:rPr>
+              <w:rFonts w:ascii="Garamond" w:hAnsi="Garamond"/>
+              <w:sz w:val="20"/>
+              <w:szCs w:val="20"/>
+            </w:rPr>
+          </w:rPrChange>
+        </w:rPr>
+        <w:t>and Nixon Fork (~8%) and some middle-watershed stocks including Stony</w:t>
+      </w:r>
+      <w:r>
+        <w:rPr>
+          <w:rFonts w:ascii="Garamond" w:hAnsi="Garamond"/>
+          <w:sz w:val="22"/>
+          <w:szCs w:val="22"/>
+          <w:rPrChange w:id="41" w:author="Benjamin J. Makhlouf" w:date="2025-07-26T11:37:00Z" w16du:dateUtc="2025-07-26T18:37:00Z">
+            <w:rPr>
+              <w:rFonts w:ascii="Garamond" w:hAnsi="Garamond"/>
+              <w:sz w:val="20"/>
+              <w:szCs w:val="20"/>
+            </w:rPr>
+          </w:rPrChange>
+        </w:rPr>
+        <w:t xml:space="preserve"> River</w:t>
+      </w:r>
+      <w:r>
+        <w:rPr>
+          <w:rFonts w:ascii="Garamond" w:hAnsi="Garamond"/>
+          <w:sz w:val="22"/>
+          <w:szCs w:val="22"/>
+          <w:rPrChange w:id="42" w:author="Benjamin J. Makhlouf" w:date="2025-07-26T11:37:00Z" w16du:dateUtc="2025-07-26T18:37:00Z">
+            <w:rPr>
+              <w:rFonts w:ascii="Garamond" w:hAnsi="Garamond"/>
+              <w:sz w:val="20"/>
+              <w:szCs w:val="20"/>
+            </w:rPr>
+          </w:rPrChange>
+        </w:rPr>
+        <w:t xml:space="preserve"> (~6%) and </w:t>
+      </w:r>
+      <w:proofErr w:type="spellStart"/>
+      <w:r>
+        <w:rPr>
+          <w:rFonts w:ascii="Garamond" w:hAnsi="Garamond"/>
+          <w:sz w:val="22"/>
+          <w:szCs w:val="22"/>
+          <w:rPrChange w:id="43" w:author="Benjamin J. Makhlouf" w:date="2025-07-26T11:37:00Z" w16du:dateUtc="2025-07-26T18:37:00Z">
+            <w:rPr>
+              <w:rFonts w:ascii="Garamond" w:hAnsi="Garamond"/>
+              <w:sz w:val="20"/>
+              <w:szCs w:val="20"/>
+            </w:rPr>
+          </w:rPrChange>
+        </w:rPr>
+        <w:t>Holitna</w:t>
+      </w:r>
+      <w:proofErr w:type="spellEnd"/>
+      <w:r>
+        <w:rPr>
+          <w:rFonts w:ascii="Garamond" w:hAnsi="Garamond"/>
+          <w:sz w:val="22"/>
+          <w:szCs w:val="22"/>
+          <w:rPrChange w:id="44" w:author="Benjamin J. Makhlouf" w:date="2025-07-26T11:37:00Z" w16du:dateUtc="2025-07-26T18:37:00Z">
+            <w:rPr>
+              <w:rFonts w:ascii="Garamond" w:hAnsi="Garamond"/>
+              <w:sz w:val="20"/>
+              <w:szCs w:val="20"/>
+            </w:rPr>
+          </w:rPrChange>
+        </w:rPr>
+        <w:t xml:space="preserve"> </w:t>
+      </w:r>
+      <w:r>
+        <w:rPr>
+          <w:rFonts w:ascii="Garamond" w:hAnsi="Garamond"/>
+          <w:sz w:val="22"/>
+          <w:szCs w:val="22"/>
+          <w:rPrChange w:id="45" w:author="Benjamin J. Makhlouf" w:date="2025-07-26T11:37:00Z" w16du:dateUtc="2025-07-26T18:37:00Z">
+            <w:rPr>
+              <w:rFonts w:ascii="Garamond" w:hAnsi="Garamond"/>
+              <w:sz w:val="20"/>
+              <w:szCs w:val="20"/>
+            </w:rPr>
+          </w:rPrChange>
+        </w:rPr>
+        <w:t xml:space="preserve">River </w:t>
+      </w:r>
+      <w:r>
+        <w:rPr>
+          <w:rFonts w:ascii="Garamond" w:hAnsi="Garamond"/>
+          <w:sz w:val="22"/>
+          <w:szCs w:val="22"/>
+          <w:rPrChange w:id="46" w:author="Benjamin J. Makhlouf" w:date="2025-07-26T11:37:00Z" w16du:dateUtc="2025-07-26T18:37:00Z">
+            <w:rPr>
+              <w:rFonts w:ascii="Garamond" w:hAnsi="Garamond"/>
+              <w:sz w:val="20"/>
+              <w:szCs w:val="20"/>
+            </w:rPr>
+          </w:rPrChange>
+        </w:rPr>
+        <w:t xml:space="preserve">(~5%). Upper watershed stocks exhibited substantially higher inter-annual variability during Q1 as compared to the other three </w:t>
+      </w:r>
+      <w:r>
+        <w:rPr>
+          <w:rFonts w:ascii="Garamond" w:hAnsi="Garamond"/>
+          <w:sz w:val="22"/>
+          <w:szCs w:val="22"/>
+          <w:rPrChange w:id="47" w:author="Benjamin J. Makhlouf" w:date="2025-07-26T11:37:00Z" w16du:dateUtc="2025-07-26T18:37:00Z">
+            <w:rPr>
+              <w:rFonts w:ascii="Garamond" w:hAnsi="Garamond"/>
+              <w:sz w:val="20"/>
+              <w:szCs w:val="20"/>
+            </w:rPr>
+          </w:rPrChange>
+        </w:rPr>
+        <w:t xml:space="preserve">seasonal </w:t>
+      </w:r>
+      <w:r>
+        <w:rPr>
+          <w:rFonts w:ascii="Garamond" w:hAnsi="Garamond"/>
+          <w:sz w:val="22"/>
+          <w:szCs w:val="22"/>
+          <w:rPrChange w:id="48" w:author="Benjamin J. Makhlouf" w:date="2025-07-26T11:37:00Z" w16du:dateUtc="2025-07-26T18:37:00Z">
+            <w:rPr>
+              <w:rFonts w:ascii="Garamond" w:hAnsi="Garamond"/>
+              <w:sz w:val="20"/>
+              <w:szCs w:val="20"/>
+            </w:rPr>
+          </w:rPrChange>
+        </w:rPr>
+        <w:t>quartiles.</w:t>
+      </w:r>
+      <w:r>
+        <w:rPr>
+          <w:rFonts w:ascii="Garamond" w:hAnsi="Garamond"/>
+          <w:sz w:val="22"/>
+          <w:szCs w:val="22"/>
+          <w:rPrChange w:id="49" w:author="Benjamin J. Makhlouf" w:date="2025-07-26T11:37:00Z" w16du:dateUtc="2025-07-26T18:37:00Z">
+            <w:rPr>
+              <w:rFonts w:ascii="Garamond" w:hAnsi="Garamond"/>
+              <w:sz w:val="20"/>
+              <w:szCs w:val="20"/>
+            </w:rPr>
+          </w:rPrChange>
+        </w:rPr>
+        <w:t xml:space="preserve"> </w:t>
+      </w:r>
+      <w:r>
+        <w:rPr>
+          <w:rFonts w:ascii="Garamond" w:hAnsi="Garamond"/>
+          <w:sz w:val="22"/>
+          <w:szCs w:val="22"/>
+          <w:rPrChange w:id="50" w:author="Benjamin J. Makhlouf" w:date="2025-07-26T11:37:00Z" w16du:dateUtc="2025-07-26T18:37:00Z">
+            <w:rPr>
+              <w:rFonts w:ascii="Garamond" w:hAnsi="Garamond"/>
+              <w:sz w:val="20"/>
+              <w:szCs w:val="20"/>
+            </w:rPr>
+          </w:rPrChange>
+        </w:rPr>
+        <w:t xml:space="preserve">The distribution of returns became more </w:t>
+      </w:r>
+      <w:r>
+        <w:rPr>
+          <w:rFonts w:ascii="Garamond" w:hAnsi="Garamond"/>
+          <w:sz w:val="22"/>
+          <w:szCs w:val="22"/>
+          <w:rPrChange w:id="51" w:author="Benjamin J. Makhlouf" w:date="2025-07-26T11:37:00Z" w16du:dateUtc="2025-07-26T18:37:00Z">
+            <w:rPr>
+              <w:rFonts w:ascii="Garamond" w:hAnsi="Garamond"/>
+              <w:sz w:val="20"/>
+              <w:szCs w:val="20"/>
+            </w:rPr>
+          </w:rPrChange>
+        </w:rPr>
+        <w:t xml:space="preserve">widely distributed </w:t>
+      </w:r>
+      <w:r>
+        <w:rPr>
+          <w:rFonts w:ascii="Garamond" w:hAnsi="Garamond"/>
+          <w:sz w:val="22"/>
+          <w:szCs w:val="22"/>
+          <w:rPrChange w:id="52" w:author="Benjamin J. Makhlouf" w:date="2025-07-26T11:37:00Z" w16du:dateUtc="2025-07-26T18:37:00Z">
+            <w:rPr>
+              <w:rFonts w:ascii="Garamond" w:hAnsi="Garamond"/>
+              <w:sz w:val="20"/>
+              <w:szCs w:val="20"/>
+            </w:rPr>
+          </w:rPrChange>
+        </w:rPr>
+        <w:t xml:space="preserve">across the watershed during Q2 (June 12-21), with contributions more evenly distributed among management units compared to the upper-watershed dominance of Q1. Upper watershed contributions remained important but began declining: Big River decreased from 12% to 10%, Upper Kusko Main from 10% to 9%, and Swift from 8% to 7%. Simultaneously, middle-watershed stocks increased </w:t>
+      </w:r>
+      <w:r>
+        <w:rPr>
+          <w:rFonts w:ascii="Garamond" w:hAnsi="Garamond"/>
+          <w:sz w:val="22"/>
+          <w:szCs w:val="22"/>
+          <w:rPrChange w:id="53" w:author="Benjamin J. Makhlouf" w:date="2025-07-26T11:37:00Z" w16du:dateUtc="2025-07-26T18:37:00Z">
+            <w:rPr>
+              <w:rFonts w:ascii="Garamond" w:hAnsi="Garamond"/>
+              <w:sz w:val="20"/>
+              <w:szCs w:val="20"/>
+            </w:rPr>
+          </w:rPrChange>
+        </w:rPr>
+        <w:t xml:space="preserve">in </w:t>
+      </w:r>
+      <w:r>
+        <w:rPr>
+          <w:rFonts w:ascii="Garamond" w:hAnsi="Garamond"/>
+          <w:sz w:val="22"/>
+          <w:szCs w:val="22"/>
+          <w:rPrChange w:id="54" w:author="Benjamin J. Makhlouf" w:date="2025-07-26T11:37:00Z" w16du:dateUtc="2025-07-26T18:37:00Z">
+            <w:rPr>
+              <w:rFonts w:ascii="Garamond" w:hAnsi="Garamond"/>
+              <w:sz w:val="20"/>
+              <w:szCs w:val="20"/>
+            </w:rPr>
+          </w:rPrChange>
+        </w:rPr>
+        <w:t xml:space="preserve">relative importance, with </w:t>
+      </w:r>
+      <w:proofErr w:type="spellStart"/>
+      <w:r>
+        <w:rPr>
+          <w:rFonts w:ascii="Garamond" w:hAnsi="Garamond"/>
+          <w:sz w:val="22"/>
+          <w:szCs w:val="22"/>
+          <w:rPrChange w:id="55" w:author="Benjamin J. Makhlouf" w:date="2025-07-26T11:37:00Z" w16du:dateUtc="2025-07-26T18:37:00Z">
+            <w:rPr>
+              <w:rFonts w:ascii="Garamond" w:hAnsi="Garamond"/>
+              <w:sz w:val="20"/>
+              <w:szCs w:val="20"/>
+            </w:rPr>
+          </w:rPrChange>
+        </w:rPr>
+        <w:t>Holitna</w:t>
+      </w:r>
+      <w:proofErr w:type="spellEnd"/>
+      <w:r>
+        <w:rPr>
+          <w:rFonts w:ascii="Garamond" w:hAnsi="Garamond"/>
+          <w:sz w:val="22"/>
+          <w:szCs w:val="22"/>
+          <w:rPrChange w:id="56" w:author="Benjamin J. Makhlouf" w:date="2025-07-26T11:37:00Z" w16du:dateUtc="2025-07-26T18:37:00Z">
+            <w:rPr>
+              <w:rFonts w:ascii="Garamond" w:hAnsi="Garamond"/>
+              <w:sz w:val="20"/>
+              <w:szCs w:val="20"/>
+            </w:rPr>
+          </w:rPrChange>
+        </w:rPr>
+        <w:t xml:space="preserve"> rising from 5% to 7%, Middle Kusko Main from 4% to 6%, and Aniak from 3% to 5%. Stony River emerged as a consistently strong contributor (median: ~8%, range: 6-10%) with reduced variability compared to Q1 patterns (range: 4-12%). </w:t>
+      </w:r>
+      <w:r>
+        <w:rPr>
+          <w:rFonts w:ascii="Garamond" w:hAnsi="Garamond"/>
+          <w:sz w:val="22"/>
+          <w:szCs w:val="22"/>
+          <w:rPrChange w:id="57" w:author="Benjamin J. Makhlouf" w:date="2025-07-26T11:37:00Z" w16du:dateUtc="2025-07-26T18:37:00Z">
+            <w:rPr>
+              <w:rFonts w:ascii="Garamond" w:hAnsi="Garamond"/>
+              <w:sz w:val="20"/>
+              <w:szCs w:val="20"/>
+            </w:rPr>
+          </w:rPrChange>
+        </w:rPr>
+        <w:t xml:space="preserve">Q3 returns (June 22-July 1) marked a clear transition toward middle-watershed </w:t>
+      </w:r>
+      <w:r>
+        <w:rPr>
+          <w:rFonts w:ascii="Garamond" w:hAnsi="Garamond"/>
+          <w:sz w:val="22"/>
+          <w:szCs w:val="22"/>
+          <w:rPrChange w:id="58" w:author="Benjamin J. Makhlouf" w:date="2025-07-26T11:37:00Z" w16du:dateUtc="2025-07-26T18:37:00Z">
+            <w:rPr>
+              <w:rFonts w:ascii="Garamond" w:hAnsi="Garamond"/>
+              <w:sz w:val="20"/>
+              <w:szCs w:val="20"/>
+            </w:rPr>
+          </w:rPrChange>
+        </w:rPr>
+        <w:t xml:space="preserve">stocks </w:t>
+      </w:r>
+      <w:r>
+        <w:rPr>
+          <w:rFonts w:ascii="Garamond" w:hAnsi="Garamond"/>
+          <w:sz w:val="22"/>
+          <w:szCs w:val="22"/>
+          <w:rPrChange w:id="59" w:author="Benjamin J. Makhlouf" w:date="2025-07-26T11:37:00Z" w16du:dateUtc="2025-07-26T18:37:00Z">
+            <w:rPr>
+              <w:rFonts w:ascii="Garamond" w:hAnsi="Garamond"/>
+              <w:sz w:val="20"/>
+              <w:szCs w:val="20"/>
+            </w:rPr>
+          </w:rPrChange>
+        </w:rPr>
+        <w:t xml:space="preserve">and represented the most consistent period across years. Upper Kuskokwim stocks showed substantial declines - Big River dropped from 12% to 6%, Upper Kusko Main from 10% to 7%, and Swift from 8% to 4%. Conversely, middle-watershed stocks peaked in importance: Stony maintained ~8% contribution, </w:t>
+      </w:r>
+      <w:proofErr w:type="spellStart"/>
+      <w:r>
+        <w:rPr>
+          <w:rFonts w:ascii="Garamond" w:hAnsi="Garamond"/>
+          <w:sz w:val="22"/>
+          <w:szCs w:val="22"/>
+          <w:rPrChange w:id="60" w:author="Benjamin J. Makhlouf" w:date="2025-07-26T11:37:00Z" w16du:dateUtc="2025-07-26T18:37:00Z">
+            <w:rPr>
+              <w:rFonts w:ascii="Garamond" w:hAnsi="Garamond"/>
+              <w:sz w:val="20"/>
+              <w:szCs w:val="20"/>
+            </w:rPr>
+          </w:rPrChange>
+        </w:rPr>
+        <w:t>Holitna</w:t>
+      </w:r>
+      <w:proofErr w:type="spellEnd"/>
+      <w:r>
+        <w:rPr>
+          <w:rFonts w:ascii="Garamond" w:hAnsi="Garamond"/>
+          <w:sz w:val="22"/>
+          <w:szCs w:val="22"/>
+          <w:rPrChange w:id="61" w:author="Benjamin J. Makhlouf" w:date="2025-07-26T11:37:00Z" w16du:dateUtc="2025-07-26T18:37:00Z">
+            <w:rPr>
+              <w:rFonts w:ascii="Garamond" w:hAnsi="Garamond"/>
+              <w:sz w:val="20"/>
+              <w:szCs w:val="20"/>
+            </w:rPr>
+          </w:rPrChange>
+        </w:rPr>
+        <w:t xml:space="preserve"> increased to ~8%, and Middle Kusko Main reached </w:t>
+      </w:r>
+      <w:r>
+        <w:rPr>
+          <w:rFonts w:ascii="Garamond" w:hAnsi="Garamond"/>
+          <w:sz w:val="22"/>
+          <w:szCs w:val="22"/>
+          <w:rPrChange w:id="62" w:author="Benjamin J. Makhlouf" w:date="2025-07-26T11:37:00Z" w16du:dateUtc="2025-07-26T18:37:00Z">
+            <w:rPr>
+              <w:rFonts w:ascii="Garamond" w:hAnsi="Garamond"/>
+              <w:sz w:val="20"/>
+              <w:szCs w:val="20"/>
+            </w:rPr>
+          </w:rPrChange>
+        </w:rPr>
+        <w:lastRenderedPageBreak/>
+        <w:t xml:space="preserve">~7%. This quartile exhibited the </w:t>
+      </w:r>
+      <w:r>
+        <w:rPr>
+          <w:rFonts w:ascii="Garamond" w:hAnsi="Garamond"/>
+          <w:sz w:val="22"/>
+          <w:szCs w:val="22"/>
+          <w:rPrChange w:id="63" w:author="Benjamin J. Makhlouf" w:date="2025-07-26T11:37:00Z" w16du:dateUtc="2025-07-26T18:37:00Z">
+            <w:rPr>
+              <w:rFonts w:ascii="Garamond" w:hAnsi="Garamond"/>
+              <w:sz w:val="20"/>
+              <w:szCs w:val="20"/>
+            </w:rPr>
+          </w:rPrChange>
+        </w:rPr>
+        <w:t xml:space="preserve">most </w:t>
+      </w:r>
+      <w:r>
+        <w:rPr>
+          <w:rFonts w:ascii="Garamond" w:hAnsi="Garamond"/>
+          <w:sz w:val="22"/>
+          <w:szCs w:val="22"/>
+          <w:rPrChange w:id="64" w:author="Benjamin J. Makhlouf" w:date="2025-07-26T11:37:00Z" w16du:dateUtc="2025-07-26T18:37:00Z">
+            <w:rPr>
+              <w:rFonts w:ascii="Garamond" w:hAnsi="Garamond"/>
+              <w:sz w:val="20"/>
+              <w:szCs w:val="20"/>
+            </w:rPr>
+          </w:rPrChange>
+        </w:rPr>
+        <w:t>consistent</w:t>
+      </w:r>
+      <w:r>
+        <w:rPr>
+          <w:rFonts w:ascii="Garamond" w:hAnsi="Garamond"/>
+          <w:sz w:val="22"/>
+          <w:szCs w:val="22"/>
+          <w:rPrChange w:id="65" w:author="Benjamin J. Makhlouf" w:date="2025-07-26T11:37:00Z" w16du:dateUtc="2025-07-26T18:37:00Z">
+            <w:rPr>
+              <w:rFonts w:ascii="Garamond" w:hAnsi="Garamond"/>
+              <w:sz w:val="20"/>
+              <w:szCs w:val="20"/>
+            </w:rPr>
+          </w:rPrChange>
+        </w:rPr>
+        <w:t xml:space="preserve"> distribution </w:t>
+      </w:r>
+      <w:r>
+        <w:rPr>
+          <w:rFonts w:ascii="Garamond" w:hAnsi="Garamond"/>
+          <w:sz w:val="22"/>
+          <w:szCs w:val="22"/>
+          <w:rPrChange w:id="66" w:author="Benjamin J. Makhlouf" w:date="2025-07-26T11:37:00Z" w16du:dateUtc="2025-07-26T18:37:00Z">
+            <w:rPr>
+              <w:rFonts w:ascii="Garamond" w:hAnsi="Garamond"/>
+              <w:sz w:val="20"/>
+              <w:szCs w:val="20"/>
+            </w:rPr>
+          </w:rPrChange>
+        </w:rPr>
+        <w:t>(smallest interquartile ranges) for most stocks</w:t>
+      </w:r>
+      <w:r>
+        <w:rPr>
+          <w:rFonts w:ascii="Garamond" w:hAnsi="Garamond"/>
+          <w:sz w:val="22"/>
+          <w:szCs w:val="22"/>
+          <w:rPrChange w:id="67" w:author="Benjamin J. Makhlouf" w:date="2025-07-26T11:37:00Z" w16du:dateUtc="2025-07-26T18:37:00Z">
+            <w:rPr>
+              <w:rFonts w:ascii="Garamond" w:hAnsi="Garamond"/>
+              <w:sz w:val="20"/>
+              <w:szCs w:val="20"/>
+            </w:rPr>
+          </w:rPrChange>
+        </w:rPr>
+        <w:t xml:space="preserve">. </w:t>
+      </w:r>
+      <w:r>
+        <w:rPr>
+          <w:rFonts w:ascii="Garamond" w:hAnsi="Garamond"/>
+          <w:sz w:val="22"/>
+          <w:szCs w:val="22"/>
+          <w:rPrChange w:id="68" w:author="Benjamin J. Makhlouf" w:date="2025-07-26T11:37:00Z" w16du:dateUtc="2025-07-26T18:37:00Z">
+            <w:rPr>
+              <w:rFonts w:ascii="Garamond" w:hAnsi="Garamond"/>
+              <w:sz w:val="20"/>
+              <w:szCs w:val="20"/>
+            </w:rPr>
+          </w:rPrChange>
+        </w:rPr>
+        <w:t xml:space="preserve">Late-season returns (Q4: July 2 onward) demonstrated the most dramatic compositional shift, with several stocks showing </w:t>
+      </w:r>
+      <w:proofErr w:type="gramStart"/>
+      <w:r>
+        <w:rPr>
+          <w:rFonts w:ascii="Garamond" w:hAnsi="Garamond"/>
+          <w:sz w:val="22"/>
+          <w:szCs w:val="22"/>
+          <w:rPrChange w:id="69" w:author="Benjamin J. Makhlouf" w:date="2025-07-26T11:37:00Z" w16du:dateUtc="2025-07-26T18:37:00Z">
+            <w:rPr>
+              <w:rFonts w:ascii="Garamond" w:hAnsi="Garamond"/>
+              <w:sz w:val="20"/>
+              <w:szCs w:val="20"/>
+            </w:rPr>
+          </w:rPrChange>
+        </w:rPr>
+        <w:t>3-5 fold</w:t>
+      </w:r>
+      <w:proofErr w:type="gramEnd"/>
+      <w:r>
+        <w:rPr>
+          <w:rFonts w:ascii="Garamond" w:hAnsi="Garamond"/>
+          <w:sz w:val="22"/>
+          <w:szCs w:val="22"/>
           <w:rPrChange w:id="70" w:author="Benjamin J. Makhlouf" w:date="2025-07-26T11:37:00Z" w16du:dateUtc="2025-07-26T18:37:00Z">
             <w:rPr>
               <w:rFonts w:ascii="Garamond" w:hAnsi="Garamond"/>
@@ -6409,7 +6313,7 @@
             </w:rPr>
           </w:rPrChange>
         </w:rPr>
-        <w:t xml:space="preserve"> </w:t>
+        <w:t xml:space="preserve"> changes from their Q1 contributions. Upper-watershed contributions reached their seasonal minimum</w:t>
       </w:r>
       <w:r>
         <w:rPr>
@@ -6424,7 +6328,7 @@
             </w:rPr>
           </w:rPrChange>
         </w:rPr>
-        <w:t xml:space="preserve">general transition </w:t>
+        <w:t xml:space="preserve">; </w:t>
       </w:r>
       <w:r>
         <w:rPr>
@@ -6439,7 +6343,7 @@
             </w:rPr>
           </w:rPrChange>
         </w:rPr>
-        <w:t>from upstream to downstream stock</w:t>
+        <w:t>Big River declined to ~4%</w:t>
       </w:r>
       <w:r>
         <w:rPr>
@@ -6454,7 +6358,7 @@
             </w:rPr>
           </w:rPrChange>
         </w:rPr>
-        <w:t>s</w:t>
+        <w:t xml:space="preserve">, </w:t>
       </w:r>
       <w:r>
         <w:rPr>
@@ -6469,8 +6373,9 @@
             </w:rPr>
           </w:rPrChange>
         </w:rPr>
-        <w:t xml:space="preserve"> as the season progressed. Early season returns (Q1: start of run through June 11) were dominated by stocks from the upper portions of the watershed. The largest contributors were Big River (median: ~12%, range: 8-18%), Upper Kusko</w:t>
-      </w:r>
+        <w:t xml:space="preserve">Upper Kusko Main to ~6%, and Swift to ~3%. Middle-watershed stocks maintained substantial but increasingly variable contributions, with wider distributions than Q3. Most notably, lower-watershed stocks reached their peak contributions during Q4: Aniak increased from ~3% in Q1 to ~9% in Q4, Kwethluk from ~2% to ~8%, and </w:t>
+      </w:r>
+      <w:proofErr w:type="spellStart"/>
       <w:r>
         <w:rPr>
           <w:rFonts w:ascii="Garamond" w:hAnsi="Garamond"/>
@@ -6484,8 +6389,9 @@
             </w:rPr>
           </w:rPrChange>
         </w:rPr>
-        <w:t>kwim</w:t>
-      </w:r>
+        <w:t>Kisaralik</w:t>
+      </w:r>
+      <w:proofErr w:type="spellEnd"/>
       <w:r>
         <w:rPr>
           <w:rFonts w:ascii="Garamond" w:hAnsi="Garamond"/>
@@ -6499,7 +6405,7 @@
             </w:rPr>
           </w:rPrChange>
         </w:rPr>
-        <w:t xml:space="preserve"> Main (median: ~10%, range: 6-16%), and Swift </w:t>
+        <w:t xml:space="preserve"> from ~1% to ~6%. These lower-watershed stocks also exhibited the highest variability in Q4, with outliers suggesting some years had </w:t>
       </w:r>
       <w:r>
         <w:rPr>
@@ -6514,7 +6420,7 @@
             </w:rPr>
           </w:rPrChange>
         </w:rPr>
-        <w:t xml:space="preserve">River </w:t>
+        <w:t xml:space="preserve">more significant </w:t>
       </w:r>
       <w:r>
         <w:rPr>
@@ -6529,7 +6435,7 @@
             </w:rPr>
           </w:rPrChange>
         </w:rPr>
-        <w:t>(median: ~8%, range: 4-14%), with moderate contributions from</w:t>
+        <w:t>late-season contributions from these</w:t>
       </w:r>
       <w:r>
         <w:rPr>
@@ -6544,7 +6450,7 @@
             </w:rPr>
           </w:rPrChange>
         </w:rPr>
-        <w:t xml:space="preserve"> the</w:t>
+        <w:t xml:space="preserve"> stocks</w:t>
       </w:r>
       <w:r>
         <w:rPr>
@@ -6559,10 +6465,201 @@
             </w:rPr>
           </w:rPrChange>
         </w:rPr>
+        <w:t>.</w:t>
+      </w:r>
+    </w:p>
+    <w:p>
+      <w:pPr>
+        <w:pStyle w:val="whitespace-normal"/>
+        <w:spacing w:line="480" w:lineRule="auto"/>
+        <w:ind w:firstLine="720"/>
+        <w:rPr>
+          <w:rFonts w:ascii="Garamond" w:hAnsi="Garamond"/>
+          <w:sz w:val="22"/>
+          <w:szCs w:val="22"/>
+        </w:rPr>
+      </w:pPr>
+      <w:r>
+        <w:rPr>
+          <w:rFonts w:ascii="Garamond" w:hAnsi="Garamond"/>
+          <w:sz w:val="22"/>
+          <w:szCs w:val="22"/>
+        </w:rPr>
+        <w:t>We also used c</w:t>
+      </w:r>
+      <w:r>
+        <w:rPr>
+          <w:rFonts w:ascii="Garamond" w:hAnsi="Garamond"/>
+          <w:sz w:val="22"/>
+          <w:szCs w:val="22"/>
+        </w:rPr>
+        <w:t>umulative distribution plots</w:t>
+      </w:r>
+      <w:r>
+        <w:rPr>
+          <w:rFonts w:ascii="Garamond" w:hAnsi="Garamond"/>
+          <w:sz w:val="22"/>
+          <w:szCs w:val="22"/>
+        </w:rPr>
+        <w:t xml:space="preserve"> to</w:t>
+      </w:r>
+      <w:r>
+        <w:rPr>
+          <w:rFonts w:ascii="Garamond" w:hAnsi="Garamond"/>
+          <w:sz w:val="22"/>
+          <w:szCs w:val="22"/>
+        </w:rPr>
+        <w:t xml:space="preserve"> further illustrate the pattern of consistently early returning upper Kuskokwim stocks and late-returning lower Kuskokwim stocks. As compared to the relatively coarse spatial scale of quartile analysis, these data illustrate variation in run timing among stocks at a finer spatial scale that is independent of the quartile cutoff dates. This analysis reveal</w:t>
+      </w:r>
+      <w:r>
+        <w:rPr>
+          <w:rFonts w:ascii="Garamond" w:hAnsi="Garamond"/>
+          <w:sz w:val="22"/>
+          <w:szCs w:val="22"/>
+        </w:rPr>
+        <w:t>ed</w:t>
+      </w:r>
+      <w:r>
+        <w:rPr>
+          <w:rFonts w:ascii="Garamond" w:hAnsi="Garamond"/>
+          <w:sz w:val="22"/>
+          <w:szCs w:val="22"/>
+        </w:rPr>
+        <w:t xml:space="preserve"> whether the timing of stock contribution varies based on the relative timing of the run (i.e. early returning vs late returning or </w:t>
+      </w:r>
+      <w:r>
+        <w:rPr>
+          <w:rFonts w:ascii="Garamond" w:hAnsi="Garamond"/>
+          <w:sz w:val="22"/>
+          <w:szCs w:val="22"/>
+        </w:rPr>
+        <w:t xml:space="preserve">protracted </w:t>
+      </w:r>
+      <w:r>
+        <w:rPr>
+          <w:rFonts w:ascii="Garamond" w:hAnsi="Garamond"/>
+          <w:sz w:val="22"/>
+          <w:szCs w:val="22"/>
+        </w:rPr>
+        <w:t xml:space="preserve">vs </w:t>
+      </w:r>
+      <w:r>
+        <w:rPr>
+          <w:rFonts w:ascii="Garamond" w:hAnsi="Garamond"/>
+          <w:sz w:val="22"/>
+          <w:szCs w:val="22"/>
+        </w:rPr>
+        <w:t>extended</w:t>
+      </w:r>
+      <w:r>
+        <w:rPr>
+          <w:rFonts w:ascii="Garamond" w:hAnsi="Garamond"/>
+          <w:sz w:val="22"/>
+          <w:szCs w:val="22"/>
+        </w:rPr>
+        <w:t xml:space="preserve"> run</w:t>
+      </w:r>
+      <w:proofErr w:type="gramStart"/>
+      <w:r>
+        <w:rPr>
+          <w:rFonts w:ascii="Garamond" w:hAnsi="Garamond"/>
+          <w:sz w:val="22"/>
+          <w:szCs w:val="22"/>
+        </w:rPr>
+        <w:t>), and</w:t>
+      </w:r>
+      <w:proofErr w:type="gramEnd"/>
+      <w:r>
+        <w:rPr>
+          <w:rFonts w:ascii="Garamond" w:hAnsi="Garamond"/>
+          <w:sz w:val="22"/>
+          <w:szCs w:val="22"/>
+        </w:rPr>
+        <w:t xml:space="preserve"> is independent of the total contribution of the stock to the overall run.</w:t>
+      </w:r>
+      <w:r>
+        <w:rPr>
+          <w:rFonts w:ascii="Garamond" w:hAnsi="Garamond"/>
+          <w:sz w:val="22"/>
+          <w:szCs w:val="22"/>
+        </w:rPr>
         <w:t xml:space="preserve"> </w:t>
       </w:r>
+      <w:r>
+        <w:rPr>
+          <w:rFonts w:ascii="Garamond" w:hAnsi="Garamond"/>
+          <w:sz w:val="22"/>
+          <w:szCs w:val="22"/>
+        </w:rPr>
+        <w:t xml:space="preserve">Upper watershed stocks demonstrated characteristically steep early-season curves, with populations like Big River, Swift, and Upper Kusko Main reaching 50% of their annual contribution more quickly than lower stocks. In most years, these populations arrive within a predictable window during the early portion of the season, </w:t>
+      </w:r>
+      <w:r>
+        <w:rPr>
+          <w:rStyle w:val="Strong"/>
+          <w:rFonts w:ascii="Garamond" w:eastAsiaTheme="majorEastAsia" w:hAnsi="Garamond"/>
+          <w:b w:val="0"/>
+          <w:bCs w:val="0"/>
+          <w:sz w:val="22"/>
+          <w:szCs w:val="22"/>
+        </w:rPr>
+        <w:t>with most upper watershed stocks reaching the majority (&gt;50%) of their annual contribution within the first three weeks of the run</w:t>
+      </w:r>
+      <w:r>
+        <w:rPr>
+          <w:rFonts w:ascii="Garamond" w:hAnsi="Garamond"/>
+          <w:sz w:val="22"/>
+          <w:szCs w:val="22"/>
+        </w:rPr>
+        <w:t xml:space="preserve">. Lower watershed stocks exhibited markedly different cumulative patterns with gradual, extended curves reflecting protracted run timing that spans the entirety of the run. Populations such as Aniak, Kwethluk, and </w:t>
+      </w:r>
       <w:proofErr w:type="spellStart"/>
       <w:r>
+        <w:rPr>
+          <w:rFonts w:ascii="Garamond" w:hAnsi="Garamond"/>
+          <w:sz w:val="22"/>
+          <w:szCs w:val="22"/>
+        </w:rPr>
+        <w:t>Kisaralik</w:t>
+      </w:r>
+      <w:proofErr w:type="spellEnd"/>
+      <w:r>
+        <w:rPr>
+          <w:rFonts w:ascii="Garamond" w:hAnsi="Garamond"/>
+          <w:sz w:val="22"/>
+          <w:szCs w:val="22"/>
+        </w:rPr>
+        <w:t xml:space="preserve"> showed substantially lower early-season contributions, with their steepest accumulation occurring later in the season, a pattern that further supports the average higher contribution of these stocks in the fourth quartile of our dataset.  Despite varying total run size, timing, and duration, the relative timing patterns among management units remained consistent among all years of our dataset with the timing offset between upper and lower stocks persisting regardless of the run dynamics.</w:t>
+      </w:r>
+    </w:p>
+    <w:p>
+      <w:pPr>
+        <w:pStyle w:val="whitespace-normal"/>
+        <w:spacing w:line="480" w:lineRule="auto"/>
+        <w:rPr>
+          <w:rFonts w:ascii="Garamond" w:hAnsi="Garamond"/>
+          <w:b/>
+          <w:bCs/>
+          <w:sz w:val="20"/>
+          <w:szCs w:val="20"/>
+        </w:rPr>
+      </w:pPr>
+      <w:r>
+        <w:rPr>
+          <w:rFonts w:ascii="Garamond" w:hAnsi="Garamond"/>
+          <w:b/>
+          <w:bCs/>
+          <w:sz w:val="20"/>
+          <w:szCs w:val="20"/>
+        </w:rPr>
+        <w:lastRenderedPageBreak/>
+        <w:t xml:space="preserve">Front end closure protections </w:t>
+      </w:r>
+    </w:p>
+    <w:p>
+      <w:pPr>
+        <w:pStyle w:val="whitespace-normal"/>
+        <w:spacing w:line="480" w:lineRule="auto"/>
+        <w:ind w:firstLine="720"/>
         <w:rPr>
           <w:rFonts w:ascii="Garamond" w:hAnsi="Garamond"/>
           <w:sz w:val="22"/>
@@ -6575,9 +6672,7 @@
             </w:rPr>
           </w:rPrChange>
         </w:rPr>
-        <w:t>Takotna</w:t>
-      </w:r>
-      <w:proofErr w:type="spellEnd"/>
+      </w:pPr>
       <w:r>
         <w:rPr>
           <w:rFonts w:ascii="Garamond" w:hAnsi="Garamond"/>
@@ -6591,888 +6686,15 @@
             </w:rPr>
           </w:rPrChange>
         </w:rPr>
-        <w:t xml:space="preserve"> </w:t>
-      </w:r>
-      <w:r>
-        <w:rPr>
-          <w:rFonts w:ascii="Garamond" w:hAnsi="Garamond"/>
-          <w:sz w:val="22"/>
-          <w:szCs w:val="22"/>
-          <w:rPrChange w:id="83" w:author="Benjamin J. Makhlouf" w:date="2025-07-26T11:37:00Z" w16du:dateUtc="2025-07-26T18:37:00Z">
-            <w:rPr>
-              <w:rFonts w:ascii="Garamond" w:hAnsi="Garamond"/>
-              <w:sz w:val="20"/>
-              <w:szCs w:val="20"/>
-            </w:rPr>
-          </w:rPrChange>
-        </w:rPr>
-        <w:t xml:space="preserve">River </w:t>
-      </w:r>
-      <w:r>
-        <w:rPr>
-          <w:rFonts w:ascii="Garamond" w:hAnsi="Garamond"/>
-          <w:sz w:val="22"/>
-          <w:szCs w:val="22"/>
-          <w:rPrChange w:id="84" w:author="Benjamin J. Makhlouf" w:date="2025-07-26T11:37:00Z" w16du:dateUtc="2025-07-26T18:37:00Z">
-            <w:rPr>
-              <w:rFonts w:ascii="Garamond" w:hAnsi="Garamond"/>
-              <w:sz w:val="20"/>
-              <w:szCs w:val="20"/>
-            </w:rPr>
-          </w:rPrChange>
-        </w:rPr>
-        <w:t>and Nixon Fork (~8%) and some middle-watershed stocks including Stony</w:t>
-      </w:r>
-      <w:r>
-        <w:rPr>
-          <w:rFonts w:ascii="Garamond" w:hAnsi="Garamond"/>
-          <w:sz w:val="22"/>
-          <w:szCs w:val="22"/>
-          <w:rPrChange w:id="85" w:author="Benjamin J. Makhlouf" w:date="2025-07-26T11:37:00Z" w16du:dateUtc="2025-07-26T18:37:00Z">
-            <w:rPr>
-              <w:rFonts w:ascii="Garamond" w:hAnsi="Garamond"/>
-              <w:sz w:val="20"/>
-              <w:szCs w:val="20"/>
-            </w:rPr>
-          </w:rPrChange>
-        </w:rPr>
-        <w:t xml:space="preserve"> River</w:t>
-      </w:r>
-      <w:r>
-        <w:rPr>
-          <w:rFonts w:ascii="Garamond" w:hAnsi="Garamond"/>
-          <w:sz w:val="22"/>
-          <w:szCs w:val="22"/>
-          <w:rPrChange w:id="86" w:author="Benjamin J. Makhlouf" w:date="2025-07-26T11:37:00Z" w16du:dateUtc="2025-07-26T18:37:00Z">
-            <w:rPr>
-              <w:rFonts w:ascii="Garamond" w:hAnsi="Garamond"/>
-              <w:sz w:val="20"/>
-              <w:szCs w:val="20"/>
-            </w:rPr>
-          </w:rPrChange>
-        </w:rPr>
-        <w:t xml:space="preserve"> (~6%) and </w:t>
-      </w:r>
-      <w:proofErr w:type="spellStart"/>
-      <w:r>
-        <w:rPr>
-          <w:rFonts w:ascii="Garamond" w:hAnsi="Garamond"/>
-          <w:sz w:val="22"/>
-          <w:szCs w:val="22"/>
-          <w:rPrChange w:id="87" w:author="Benjamin J. Makhlouf" w:date="2025-07-26T11:37:00Z" w16du:dateUtc="2025-07-26T18:37:00Z">
-            <w:rPr>
-              <w:rFonts w:ascii="Garamond" w:hAnsi="Garamond"/>
-              <w:sz w:val="20"/>
-              <w:szCs w:val="20"/>
-            </w:rPr>
-          </w:rPrChange>
-        </w:rPr>
-        <w:t>Holitna</w:t>
-      </w:r>
-      <w:proofErr w:type="spellEnd"/>
-      <w:r>
-        <w:rPr>
-          <w:rFonts w:ascii="Garamond" w:hAnsi="Garamond"/>
-          <w:sz w:val="22"/>
-          <w:szCs w:val="22"/>
-          <w:rPrChange w:id="88" w:author="Benjamin J. Makhlouf" w:date="2025-07-26T11:37:00Z" w16du:dateUtc="2025-07-26T18:37:00Z">
-            <w:rPr>
-              <w:rFonts w:ascii="Garamond" w:hAnsi="Garamond"/>
-              <w:sz w:val="20"/>
-              <w:szCs w:val="20"/>
-            </w:rPr>
-          </w:rPrChange>
-        </w:rPr>
-        <w:t xml:space="preserve"> </w:t>
-      </w:r>
-      <w:r>
-        <w:rPr>
-          <w:rFonts w:ascii="Garamond" w:hAnsi="Garamond"/>
-          <w:sz w:val="22"/>
-          <w:szCs w:val="22"/>
-          <w:rPrChange w:id="89" w:author="Benjamin J. Makhlouf" w:date="2025-07-26T11:37:00Z" w16du:dateUtc="2025-07-26T18:37:00Z">
-            <w:rPr>
-              <w:rFonts w:ascii="Garamond" w:hAnsi="Garamond"/>
-              <w:sz w:val="20"/>
-              <w:szCs w:val="20"/>
-            </w:rPr>
-          </w:rPrChange>
-        </w:rPr>
-        <w:t xml:space="preserve">River </w:t>
-      </w:r>
-      <w:r>
-        <w:rPr>
-          <w:rFonts w:ascii="Garamond" w:hAnsi="Garamond"/>
-          <w:sz w:val="22"/>
-          <w:szCs w:val="22"/>
-          <w:rPrChange w:id="90" w:author="Benjamin J. Makhlouf" w:date="2025-07-26T11:37:00Z" w16du:dateUtc="2025-07-26T18:37:00Z">
-            <w:rPr>
-              <w:rFonts w:ascii="Garamond" w:hAnsi="Garamond"/>
-              <w:sz w:val="20"/>
-              <w:szCs w:val="20"/>
-            </w:rPr>
-          </w:rPrChange>
-        </w:rPr>
-        <w:t xml:space="preserve">(~5%). Upper watershed stocks exhibited substantially higher inter-annual variability during Q1 as compared to the other three </w:t>
-      </w:r>
-      <w:r>
-        <w:rPr>
-          <w:rFonts w:ascii="Garamond" w:hAnsi="Garamond"/>
-          <w:sz w:val="22"/>
-          <w:szCs w:val="22"/>
-          <w:rPrChange w:id="91" w:author="Benjamin J. Makhlouf" w:date="2025-07-26T11:37:00Z" w16du:dateUtc="2025-07-26T18:37:00Z">
-            <w:rPr>
-              <w:rFonts w:ascii="Garamond" w:hAnsi="Garamond"/>
-              <w:sz w:val="20"/>
-              <w:szCs w:val="20"/>
-            </w:rPr>
-          </w:rPrChange>
-        </w:rPr>
-        <w:t xml:space="preserve">seasonal </w:t>
-      </w:r>
-      <w:r>
-        <w:rPr>
-          <w:rFonts w:ascii="Garamond" w:hAnsi="Garamond"/>
-          <w:sz w:val="22"/>
-          <w:szCs w:val="22"/>
-          <w:rPrChange w:id="92" w:author="Benjamin J. Makhlouf" w:date="2025-07-26T11:37:00Z" w16du:dateUtc="2025-07-26T18:37:00Z">
-            <w:rPr>
-              <w:rFonts w:ascii="Garamond" w:hAnsi="Garamond"/>
-              <w:sz w:val="20"/>
-              <w:szCs w:val="20"/>
-            </w:rPr>
-          </w:rPrChange>
-        </w:rPr>
-        <w:t>quartiles.</w:t>
-      </w:r>
-      <w:r>
-        <w:rPr>
-          <w:rFonts w:ascii="Garamond" w:hAnsi="Garamond"/>
-          <w:sz w:val="22"/>
-          <w:szCs w:val="22"/>
-          <w:rPrChange w:id="93" w:author="Benjamin J. Makhlouf" w:date="2025-07-26T11:37:00Z" w16du:dateUtc="2025-07-26T18:37:00Z">
-            <w:rPr>
-              <w:rFonts w:ascii="Garamond" w:hAnsi="Garamond"/>
-              <w:sz w:val="20"/>
-              <w:szCs w:val="20"/>
-            </w:rPr>
-          </w:rPrChange>
-        </w:rPr>
-        <w:t xml:space="preserve"> </w:t>
-      </w:r>
-      <w:r>
-        <w:rPr>
-          <w:rFonts w:ascii="Garamond" w:hAnsi="Garamond"/>
-          <w:sz w:val="22"/>
-          <w:szCs w:val="22"/>
-          <w:rPrChange w:id="94" w:author="Benjamin J. Makhlouf" w:date="2025-07-26T11:37:00Z" w16du:dateUtc="2025-07-26T18:37:00Z">
-            <w:rPr>
-              <w:rFonts w:ascii="Garamond" w:hAnsi="Garamond"/>
-              <w:sz w:val="20"/>
-              <w:szCs w:val="20"/>
-            </w:rPr>
-          </w:rPrChange>
-        </w:rPr>
-        <w:t xml:space="preserve">The distribution of returns became more </w:t>
-      </w:r>
-      <w:r>
-        <w:rPr>
-          <w:rFonts w:ascii="Garamond" w:hAnsi="Garamond"/>
-          <w:sz w:val="22"/>
-          <w:szCs w:val="22"/>
-          <w:rPrChange w:id="95" w:author="Benjamin J. Makhlouf" w:date="2025-07-26T11:37:00Z" w16du:dateUtc="2025-07-26T18:37:00Z">
-            <w:rPr>
-              <w:rFonts w:ascii="Garamond" w:hAnsi="Garamond"/>
-              <w:sz w:val="20"/>
-              <w:szCs w:val="20"/>
-            </w:rPr>
-          </w:rPrChange>
-        </w:rPr>
-        <w:t xml:space="preserve">widely distributed </w:t>
-      </w:r>
-      <w:r>
-        <w:rPr>
-          <w:rFonts w:ascii="Garamond" w:hAnsi="Garamond"/>
-          <w:sz w:val="22"/>
-          <w:szCs w:val="22"/>
-          <w:rPrChange w:id="96" w:author="Benjamin J. Makhlouf" w:date="2025-07-26T11:37:00Z" w16du:dateUtc="2025-07-26T18:37:00Z">
-            <w:rPr>
-              <w:rFonts w:ascii="Garamond" w:hAnsi="Garamond"/>
-              <w:sz w:val="20"/>
-              <w:szCs w:val="20"/>
-            </w:rPr>
-          </w:rPrChange>
-        </w:rPr>
-        <w:t xml:space="preserve">across the watershed during Q2 (June 12-21), with contributions more evenly distributed among management units compared to the upper-watershed dominance of Q1. Upper watershed contributions remained important but began declining: Big River decreased from 12% to 10%, Upper Kusko Main from 10% to 9%, and Swift from 8% to 7%. Simultaneously, middle-watershed </w:t>
-      </w:r>
-      <w:r>
-        <w:rPr>
-          <w:rFonts w:ascii="Garamond" w:hAnsi="Garamond"/>
-          <w:sz w:val="22"/>
-          <w:szCs w:val="22"/>
-          <w:rPrChange w:id="97" w:author="Benjamin J. Makhlouf" w:date="2025-07-26T11:37:00Z" w16du:dateUtc="2025-07-26T18:37:00Z">
-            <w:rPr>
-              <w:rFonts w:ascii="Garamond" w:hAnsi="Garamond"/>
-              <w:sz w:val="20"/>
-              <w:szCs w:val="20"/>
-            </w:rPr>
-          </w:rPrChange>
-        </w:rPr>
-        <w:lastRenderedPageBreak/>
-        <w:t xml:space="preserve">stocks increased </w:t>
-      </w:r>
-      <w:r>
-        <w:rPr>
-          <w:rFonts w:ascii="Garamond" w:hAnsi="Garamond"/>
-          <w:sz w:val="22"/>
-          <w:szCs w:val="22"/>
-          <w:rPrChange w:id="98" w:author="Benjamin J. Makhlouf" w:date="2025-07-26T11:37:00Z" w16du:dateUtc="2025-07-26T18:37:00Z">
-            <w:rPr>
-              <w:rFonts w:ascii="Garamond" w:hAnsi="Garamond"/>
-              <w:sz w:val="20"/>
-              <w:szCs w:val="20"/>
-            </w:rPr>
-          </w:rPrChange>
-        </w:rPr>
-        <w:t xml:space="preserve">in </w:t>
-      </w:r>
-      <w:r>
-        <w:rPr>
-          <w:rFonts w:ascii="Garamond" w:hAnsi="Garamond"/>
-          <w:sz w:val="22"/>
-          <w:szCs w:val="22"/>
-          <w:rPrChange w:id="99" w:author="Benjamin J. Makhlouf" w:date="2025-07-26T11:37:00Z" w16du:dateUtc="2025-07-26T18:37:00Z">
-            <w:rPr>
-              <w:rFonts w:ascii="Garamond" w:hAnsi="Garamond"/>
-              <w:sz w:val="20"/>
-              <w:szCs w:val="20"/>
-            </w:rPr>
-          </w:rPrChange>
-        </w:rPr>
-        <w:t xml:space="preserve">relative importance, with </w:t>
-      </w:r>
-      <w:proofErr w:type="spellStart"/>
-      <w:r>
-        <w:rPr>
-          <w:rFonts w:ascii="Garamond" w:hAnsi="Garamond"/>
-          <w:sz w:val="22"/>
-          <w:szCs w:val="22"/>
-          <w:rPrChange w:id="100" w:author="Benjamin J. Makhlouf" w:date="2025-07-26T11:37:00Z" w16du:dateUtc="2025-07-26T18:37:00Z">
-            <w:rPr>
-              <w:rFonts w:ascii="Garamond" w:hAnsi="Garamond"/>
-              <w:sz w:val="20"/>
-              <w:szCs w:val="20"/>
-            </w:rPr>
-          </w:rPrChange>
-        </w:rPr>
-        <w:t>Holitna</w:t>
-      </w:r>
-      <w:proofErr w:type="spellEnd"/>
-      <w:r>
-        <w:rPr>
-          <w:rFonts w:ascii="Garamond" w:hAnsi="Garamond"/>
-          <w:sz w:val="22"/>
-          <w:szCs w:val="22"/>
-          <w:rPrChange w:id="101" w:author="Benjamin J. Makhlouf" w:date="2025-07-26T11:37:00Z" w16du:dateUtc="2025-07-26T18:37:00Z">
-            <w:rPr>
-              <w:rFonts w:ascii="Garamond" w:hAnsi="Garamond"/>
-              <w:sz w:val="20"/>
-              <w:szCs w:val="20"/>
-            </w:rPr>
-          </w:rPrChange>
-        </w:rPr>
-        <w:t xml:space="preserve"> rising from 5% to 7%, Middle Kusko Main from 4% to 6%, and Aniak from 3% to 5%. Stony River emerged as a consistently strong contributor (median: ~8%, range: 6-10%) with reduced variability compared to Q1 patterns (range: 4-12%). </w:t>
-      </w:r>
-      <w:r>
-        <w:rPr>
-          <w:rFonts w:ascii="Garamond" w:hAnsi="Garamond"/>
-          <w:sz w:val="22"/>
-          <w:szCs w:val="22"/>
-          <w:rPrChange w:id="102" w:author="Benjamin J. Makhlouf" w:date="2025-07-26T11:37:00Z" w16du:dateUtc="2025-07-26T18:37:00Z">
-            <w:rPr>
-              <w:rFonts w:ascii="Garamond" w:hAnsi="Garamond"/>
-              <w:sz w:val="20"/>
-              <w:szCs w:val="20"/>
-            </w:rPr>
-          </w:rPrChange>
-        </w:rPr>
-        <w:t xml:space="preserve">Q3 returns (June 22-July 1) marked a clear transition toward middle-watershed </w:t>
-      </w:r>
-      <w:r>
-        <w:rPr>
-          <w:rFonts w:ascii="Garamond" w:hAnsi="Garamond"/>
-          <w:sz w:val="22"/>
-          <w:szCs w:val="22"/>
-          <w:rPrChange w:id="103" w:author="Benjamin J. Makhlouf" w:date="2025-07-26T11:37:00Z" w16du:dateUtc="2025-07-26T18:37:00Z">
-            <w:rPr>
-              <w:rFonts w:ascii="Garamond" w:hAnsi="Garamond"/>
-              <w:sz w:val="20"/>
-              <w:szCs w:val="20"/>
-            </w:rPr>
-          </w:rPrChange>
-        </w:rPr>
-        <w:t xml:space="preserve">stocks </w:t>
-      </w:r>
-      <w:r>
-        <w:rPr>
-          <w:rFonts w:ascii="Garamond" w:hAnsi="Garamond"/>
-          <w:sz w:val="22"/>
-          <w:szCs w:val="22"/>
-          <w:rPrChange w:id="104" w:author="Benjamin J. Makhlouf" w:date="2025-07-26T11:37:00Z" w16du:dateUtc="2025-07-26T18:37:00Z">
-            <w:rPr>
-              <w:rFonts w:ascii="Garamond" w:hAnsi="Garamond"/>
-              <w:sz w:val="20"/>
-              <w:szCs w:val="20"/>
-            </w:rPr>
-          </w:rPrChange>
-        </w:rPr>
-        <w:t xml:space="preserve">and represented the most consistent period across years. Upper Kuskokwim stocks showed substantial declines - Big River dropped from 12% to 6%, Upper Kusko Main from 10% to 7%, and Swift from 8% to 4%. Conversely, middle-watershed stocks peaked in importance: Stony maintained ~8% contribution, </w:t>
-      </w:r>
-      <w:proofErr w:type="spellStart"/>
-      <w:r>
-        <w:rPr>
-          <w:rFonts w:ascii="Garamond" w:hAnsi="Garamond"/>
-          <w:sz w:val="22"/>
-          <w:szCs w:val="22"/>
-          <w:rPrChange w:id="105" w:author="Benjamin J. Makhlouf" w:date="2025-07-26T11:37:00Z" w16du:dateUtc="2025-07-26T18:37:00Z">
-            <w:rPr>
-              <w:rFonts w:ascii="Garamond" w:hAnsi="Garamond"/>
-              <w:sz w:val="20"/>
-              <w:szCs w:val="20"/>
-            </w:rPr>
-          </w:rPrChange>
-        </w:rPr>
-        <w:t>Holitna</w:t>
-      </w:r>
-      <w:proofErr w:type="spellEnd"/>
-      <w:r>
-        <w:rPr>
-          <w:rFonts w:ascii="Garamond" w:hAnsi="Garamond"/>
-          <w:sz w:val="22"/>
-          <w:szCs w:val="22"/>
-          <w:rPrChange w:id="106" w:author="Benjamin J. Makhlouf" w:date="2025-07-26T11:37:00Z" w16du:dateUtc="2025-07-26T18:37:00Z">
-            <w:rPr>
-              <w:rFonts w:ascii="Garamond" w:hAnsi="Garamond"/>
-              <w:sz w:val="20"/>
-              <w:szCs w:val="20"/>
-            </w:rPr>
-          </w:rPrChange>
-        </w:rPr>
-        <w:t xml:space="preserve"> increased to ~8%, and Middle Kusko Main reached ~7%. This quartile exhibited the </w:t>
-      </w:r>
-      <w:r>
-        <w:rPr>
-          <w:rFonts w:ascii="Garamond" w:hAnsi="Garamond"/>
-          <w:sz w:val="22"/>
-          <w:szCs w:val="22"/>
-          <w:rPrChange w:id="107" w:author="Benjamin J. Makhlouf" w:date="2025-07-26T11:37:00Z" w16du:dateUtc="2025-07-26T18:37:00Z">
-            <w:rPr>
-              <w:rFonts w:ascii="Garamond" w:hAnsi="Garamond"/>
-              <w:sz w:val="20"/>
-              <w:szCs w:val="20"/>
-            </w:rPr>
-          </w:rPrChange>
-        </w:rPr>
-        <w:t xml:space="preserve">most </w:t>
-      </w:r>
-      <w:r>
-        <w:rPr>
-          <w:rFonts w:ascii="Garamond" w:hAnsi="Garamond"/>
-          <w:sz w:val="22"/>
-          <w:szCs w:val="22"/>
-          <w:rPrChange w:id="108" w:author="Benjamin J. Makhlouf" w:date="2025-07-26T11:37:00Z" w16du:dateUtc="2025-07-26T18:37:00Z">
-            <w:rPr>
-              <w:rFonts w:ascii="Garamond" w:hAnsi="Garamond"/>
-              <w:sz w:val="20"/>
-              <w:szCs w:val="20"/>
-            </w:rPr>
-          </w:rPrChange>
-        </w:rPr>
-        <w:t>consistent</w:t>
-      </w:r>
-      <w:r>
-        <w:rPr>
-          <w:rFonts w:ascii="Garamond" w:hAnsi="Garamond"/>
-          <w:sz w:val="22"/>
-          <w:szCs w:val="22"/>
-          <w:rPrChange w:id="109" w:author="Benjamin J. Makhlouf" w:date="2025-07-26T11:37:00Z" w16du:dateUtc="2025-07-26T18:37:00Z">
-            <w:rPr>
-              <w:rFonts w:ascii="Garamond" w:hAnsi="Garamond"/>
-              <w:sz w:val="20"/>
-              <w:szCs w:val="20"/>
-            </w:rPr>
-          </w:rPrChange>
-        </w:rPr>
-        <w:t xml:space="preserve"> distribution </w:t>
-      </w:r>
-      <w:r>
-        <w:rPr>
-          <w:rFonts w:ascii="Garamond" w:hAnsi="Garamond"/>
-          <w:sz w:val="22"/>
-          <w:szCs w:val="22"/>
-          <w:rPrChange w:id="110" w:author="Benjamin J. Makhlouf" w:date="2025-07-26T11:37:00Z" w16du:dateUtc="2025-07-26T18:37:00Z">
-            <w:rPr>
-              <w:rFonts w:ascii="Garamond" w:hAnsi="Garamond"/>
-              <w:sz w:val="20"/>
-              <w:szCs w:val="20"/>
-            </w:rPr>
-          </w:rPrChange>
-        </w:rPr>
-        <w:t>(smallest interquartile ranges) for most stocks</w:t>
-      </w:r>
-      <w:r>
-        <w:rPr>
-          <w:rFonts w:ascii="Garamond" w:hAnsi="Garamond"/>
-          <w:sz w:val="22"/>
-          <w:szCs w:val="22"/>
-          <w:rPrChange w:id="111" w:author="Benjamin J. Makhlouf" w:date="2025-07-26T11:37:00Z" w16du:dateUtc="2025-07-26T18:37:00Z">
-            <w:rPr>
-              <w:rFonts w:ascii="Garamond" w:hAnsi="Garamond"/>
-              <w:sz w:val="20"/>
-              <w:szCs w:val="20"/>
-            </w:rPr>
-          </w:rPrChange>
-        </w:rPr>
-        <w:t xml:space="preserve">. </w:t>
-      </w:r>
-      <w:r>
-        <w:rPr>
-          <w:rFonts w:ascii="Garamond" w:hAnsi="Garamond"/>
-          <w:sz w:val="22"/>
-          <w:szCs w:val="22"/>
-          <w:rPrChange w:id="112" w:author="Benjamin J. Makhlouf" w:date="2025-07-26T11:37:00Z" w16du:dateUtc="2025-07-26T18:37:00Z">
-            <w:rPr>
-              <w:rFonts w:ascii="Garamond" w:hAnsi="Garamond"/>
-              <w:sz w:val="20"/>
-              <w:szCs w:val="20"/>
-            </w:rPr>
-          </w:rPrChange>
-        </w:rPr>
-        <w:t xml:space="preserve">Late-season returns (Q4: July 2 onward) demonstrated the most dramatic compositional shift, with several stocks showing </w:t>
-      </w:r>
-      <w:proofErr w:type="gramStart"/>
-      <w:r>
-        <w:rPr>
-          <w:rFonts w:ascii="Garamond" w:hAnsi="Garamond"/>
-          <w:sz w:val="22"/>
-          <w:szCs w:val="22"/>
-          <w:rPrChange w:id="113" w:author="Benjamin J. Makhlouf" w:date="2025-07-26T11:37:00Z" w16du:dateUtc="2025-07-26T18:37:00Z">
-            <w:rPr>
-              <w:rFonts w:ascii="Garamond" w:hAnsi="Garamond"/>
-              <w:sz w:val="20"/>
-              <w:szCs w:val="20"/>
-            </w:rPr>
-          </w:rPrChange>
-        </w:rPr>
-        <w:t>3-5 fold</w:t>
-      </w:r>
-      <w:proofErr w:type="gramEnd"/>
-      <w:r>
-        <w:rPr>
-          <w:rFonts w:ascii="Garamond" w:hAnsi="Garamond"/>
-          <w:sz w:val="22"/>
-          <w:szCs w:val="22"/>
-          <w:rPrChange w:id="114" w:author="Benjamin J. Makhlouf" w:date="2025-07-26T11:37:00Z" w16du:dateUtc="2025-07-26T18:37:00Z">
-            <w:rPr>
-              <w:rFonts w:ascii="Garamond" w:hAnsi="Garamond"/>
-              <w:sz w:val="20"/>
-              <w:szCs w:val="20"/>
-            </w:rPr>
-          </w:rPrChange>
-        </w:rPr>
-        <w:t xml:space="preserve"> changes from their Q1 contributions. Upper-watershed contributions reached their seasonal minimum</w:t>
-      </w:r>
-      <w:r>
-        <w:rPr>
-          <w:rFonts w:ascii="Garamond" w:hAnsi="Garamond"/>
-          <w:sz w:val="22"/>
-          <w:szCs w:val="22"/>
-          <w:rPrChange w:id="115" w:author="Benjamin J. Makhlouf" w:date="2025-07-26T11:37:00Z" w16du:dateUtc="2025-07-26T18:37:00Z">
-            <w:rPr>
-              <w:rFonts w:ascii="Garamond" w:hAnsi="Garamond"/>
-              <w:sz w:val="20"/>
-              <w:szCs w:val="20"/>
-            </w:rPr>
-          </w:rPrChange>
-        </w:rPr>
-        <w:t xml:space="preserve">; </w:t>
-      </w:r>
-      <w:r>
-        <w:rPr>
-          <w:rFonts w:ascii="Garamond" w:hAnsi="Garamond"/>
-          <w:sz w:val="22"/>
-          <w:szCs w:val="22"/>
-          <w:rPrChange w:id="116" w:author="Benjamin J. Makhlouf" w:date="2025-07-26T11:37:00Z" w16du:dateUtc="2025-07-26T18:37:00Z">
-            <w:rPr>
-              <w:rFonts w:ascii="Garamond" w:hAnsi="Garamond"/>
-              <w:sz w:val="20"/>
-              <w:szCs w:val="20"/>
-            </w:rPr>
-          </w:rPrChange>
-        </w:rPr>
-        <w:t>Big River declined to ~4%</w:t>
-      </w:r>
-      <w:r>
-        <w:rPr>
-          <w:rFonts w:ascii="Garamond" w:hAnsi="Garamond"/>
-          <w:sz w:val="22"/>
-          <w:szCs w:val="22"/>
-          <w:rPrChange w:id="117" w:author="Benjamin J. Makhlouf" w:date="2025-07-26T11:37:00Z" w16du:dateUtc="2025-07-26T18:37:00Z">
-            <w:rPr>
-              <w:rFonts w:ascii="Garamond" w:hAnsi="Garamond"/>
-              <w:sz w:val="20"/>
-              <w:szCs w:val="20"/>
-            </w:rPr>
-          </w:rPrChange>
-        </w:rPr>
-        <w:t xml:space="preserve">, </w:t>
-      </w:r>
-      <w:r>
-        <w:rPr>
-          <w:rFonts w:ascii="Garamond" w:hAnsi="Garamond"/>
-          <w:sz w:val="22"/>
-          <w:szCs w:val="22"/>
-          <w:rPrChange w:id="118" w:author="Benjamin J. Makhlouf" w:date="2025-07-26T11:37:00Z" w16du:dateUtc="2025-07-26T18:37:00Z">
-            <w:rPr>
-              <w:rFonts w:ascii="Garamond" w:hAnsi="Garamond"/>
-              <w:sz w:val="20"/>
-              <w:szCs w:val="20"/>
-            </w:rPr>
-          </w:rPrChange>
-        </w:rPr>
-        <w:t xml:space="preserve">Upper Kusko Main to ~6%, and Swift to ~3%. Middle-watershed stocks maintained substantial but increasingly variable contributions, with wider distributions than Q3. Most notably, lower-watershed stocks reached their peak contributions during Q4: Aniak increased from ~3% in Q1 to ~9% in Q4, Kwethluk from ~2% to ~8%, and </w:t>
-      </w:r>
-      <w:proofErr w:type="spellStart"/>
-      <w:r>
-        <w:rPr>
-          <w:rFonts w:ascii="Garamond" w:hAnsi="Garamond"/>
-          <w:sz w:val="22"/>
-          <w:szCs w:val="22"/>
-          <w:rPrChange w:id="119" w:author="Benjamin J. Makhlouf" w:date="2025-07-26T11:37:00Z" w16du:dateUtc="2025-07-26T18:37:00Z">
-            <w:rPr>
-              <w:rFonts w:ascii="Garamond" w:hAnsi="Garamond"/>
-              <w:sz w:val="20"/>
-              <w:szCs w:val="20"/>
-            </w:rPr>
-          </w:rPrChange>
-        </w:rPr>
-        <w:t>Kisaralik</w:t>
-      </w:r>
-      <w:proofErr w:type="spellEnd"/>
-      <w:r>
-        <w:rPr>
-          <w:rFonts w:ascii="Garamond" w:hAnsi="Garamond"/>
-          <w:sz w:val="22"/>
-          <w:szCs w:val="22"/>
-          <w:rPrChange w:id="120" w:author="Benjamin J. Makhlouf" w:date="2025-07-26T11:37:00Z" w16du:dateUtc="2025-07-26T18:37:00Z">
-            <w:rPr>
-              <w:rFonts w:ascii="Garamond" w:hAnsi="Garamond"/>
-              <w:sz w:val="20"/>
-              <w:szCs w:val="20"/>
-            </w:rPr>
-          </w:rPrChange>
-        </w:rPr>
-        <w:t xml:space="preserve"> from ~1% to ~6%. These lower-watershed stocks also exhibited the highest variability in Q4, with outliers suggesting some years had </w:t>
-      </w:r>
-      <w:r>
-        <w:rPr>
-          <w:rFonts w:ascii="Garamond" w:hAnsi="Garamond"/>
-          <w:sz w:val="22"/>
-          <w:szCs w:val="22"/>
-          <w:rPrChange w:id="121" w:author="Benjamin J. Makhlouf" w:date="2025-07-26T11:37:00Z" w16du:dateUtc="2025-07-26T18:37:00Z">
-            <w:rPr>
-              <w:rFonts w:ascii="Garamond" w:hAnsi="Garamond"/>
-              <w:sz w:val="20"/>
-              <w:szCs w:val="20"/>
-            </w:rPr>
-          </w:rPrChange>
-        </w:rPr>
-        <w:t xml:space="preserve">more significant </w:t>
-      </w:r>
-      <w:r>
-        <w:rPr>
-          <w:rFonts w:ascii="Garamond" w:hAnsi="Garamond"/>
-          <w:sz w:val="22"/>
-          <w:szCs w:val="22"/>
-          <w:rPrChange w:id="122" w:author="Benjamin J. Makhlouf" w:date="2025-07-26T11:37:00Z" w16du:dateUtc="2025-07-26T18:37:00Z">
-            <w:rPr>
-              <w:rFonts w:ascii="Garamond" w:hAnsi="Garamond"/>
-              <w:sz w:val="20"/>
-              <w:szCs w:val="20"/>
-            </w:rPr>
-          </w:rPrChange>
-        </w:rPr>
-        <w:t>late-season contributions from these</w:t>
-      </w:r>
-      <w:r>
-        <w:rPr>
-          <w:rFonts w:ascii="Garamond" w:hAnsi="Garamond"/>
-          <w:sz w:val="22"/>
-          <w:szCs w:val="22"/>
-          <w:rPrChange w:id="123" w:author="Benjamin J. Makhlouf" w:date="2025-07-26T11:37:00Z" w16du:dateUtc="2025-07-26T18:37:00Z">
-            <w:rPr>
-              <w:rFonts w:ascii="Garamond" w:hAnsi="Garamond"/>
-              <w:sz w:val="20"/>
-              <w:szCs w:val="20"/>
-            </w:rPr>
-          </w:rPrChange>
-        </w:rPr>
-        <w:t xml:space="preserve"> stocks</w:t>
-      </w:r>
-      <w:r>
-        <w:rPr>
-          <w:rFonts w:ascii="Garamond" w:hAnsi="Garamond"/>
-          <w:sz w:val="22"/>
-          <w:szCs w:val="22"/>
-          <w:rPrChange w:id="124" w:author="Benjamin J. Makhlouf" w:date="2025-07-26T11:37:00Z" w16du:dateUtc="2025-07-26T18:37:00Z">
-            <w:rPr>
-              <w:rFonts w:ascii="Garamond" w:hAnsi="Garamond"/>
-              <w:sz w:val="20"/>
-              <w:szCs w:val="20"/>
-            </w:rPr>
-          </w:rPrChange>
-        </w:rPr>
-        <w:t>.</w:t>
-      </w:r>
-    </w:p>
-    <w:p>
-      <w:pPr>
-        <w:pStyle w:val="whitespace-normal"/>
-        <w:spacing w:line="480" w:lineRule="auto"/>
-        <w:ind w:firstLine="720"/>
-        <w:rPr>
-          <w:rFonts w:ascii="Garamond" w:hAnsi="Garamond"/>
-          <w:sz w:val="22"/>
-          <w:szCs w:val="22"/>
-        </w:rPr>
-      </w:pPr>
-      <w:r>
-        <w:rPr>
-          <w:rFonts w:ascii="Garamond" w:hAnsi="Garamond"/>
-          <w:sz w:val="22"/>
-          <w:szCs w:val="22"/>
-        </w:rPr>
-        <w:t>We also used c</w:t>
-      </w:r>
-      <w:r>
-        <w:rPr>
-          <w:rFonts w:ascii="Garamond" w:hAnsi="Garamond"/>
-          <w:sz w:val="22"/>
-          <w:szCs w:val="22"/>
-        </w:rPr>
-        <w:t>umulative distribution plots</w:t>
-      </w:r>
-      <w:r>
-        <w:rPr>
-          <w:rFonts w:ascii="Garamond" w:hAnsi="Garamond"/>
-          <w:sz w:val="22"/>
-          <w:szCs w:val="22"/>
-        </w:rPr>
-        <w:t xml:space="preserve"> to</w:t>
-      </w:r>
-      <w:r>
-        <w:rPr>
-          <w:rFonts w:ascii="Garamond" w:hAnsi="Garamond"/>
-          <w:sz w:val="22"/>
-          <w:szCs w:val="22"/>
-        </w:rPr>
-        <w:t xml:space="preserve"> further illustrate the pattern of consistently early returning upper Kuskokwim stocks and late-returning lower Kuskokwim stocks. As compared to the relatively coarse spatial scale of quartile analysis, these data illustrate variation in run timing among stocks at a finer spatial scale that is independent of the quartile cutoff dates. This analysis reveal</w:t>
-      </w:r>
-      <w:r>
-        <w:rPr>
-          <w:rFonts w:ascii="Garamond" w:hAnsi="Garamond"/>
-          <w:sz w:val="22"/>
-          <w:szCs w:val="22"/>
-        </w:rPr>
-        <w:t>ed</w:t>
-      </w:r>
-      <w:r>
-        <w:rPr>
-          <w:rFonts w:ascii="Garamond" w:hAnsi="Garamond"/>
-          <w:sz w:val="22"/>
-          <w:szCs w:val="22"/>
-        </w:rPr>
-        <w:t xml:space="preserve"> whether the timing of stock contribution varies based on the relative timing of the run (i.e. early returning vs late returning or </w:t>
-      </w:r>
-      <w:r>
-        <w:rPr>
-          <w:rFonts w:ascii="Garamond" w:hAnsi="Garamond"/>
-          <w:sz w:val="22"/>
-          <w:szCs w:val="22"/>
-        </w:rPr>
-        <w:t xml:space="preserve">protracted </w:t>
-      </w:r>
-      <w:r>
-        <w:rPr>
-          <w:rFonts w:ascii="Garamond" w:hAnsi="Garamond"/>
-          <w:sz w:val="22"/>
-          <w:szCs w:val="22"/>
-        </w:rPr>
-        <w:t xml:space="preserve">vs </w:t>
-      </w:r>
-      <w:r>
-        <w:rPr>
-          <w:rFonts w:ascii="Garamond" w:hAnsi="Garamond"/>
-          <w:sz w:val="22"/>
-          <w:szCs w:val="22"/>
-        </w:rPr>
-        <w:t>extended</w:t>
-      </w:r>
-      <w:r>
-        <w:rPr>
-          <w:rFonts w:ascii="Garamond" w:hAnsi="Garamond"/>
-          <w:sz w:val="22"/>
-          <w:szCs w:val="22"/>
-        </w:rPr>
-        <w:t xml:space="preserve"> run</w:t>
-      </w:r>
-      <w:proofErr w:type="gramStart"/>
-      <w:r>
-        <w:rPr>
-          <w:rFonts w:ascii="Garamond" w:hAnsi="Garamond"/>
-          <w:sz w:val="22"/>
-          <w:szCs w:val="22"/>
-        </w:rPr>
-        <w:t>), and</w:t>
-      </w:r>
-      <w:proofErr w:type="gramEnd"/>
-      <w:r>
-        <w:rPr>
-          <w:rFonts w:ascii="Garamond" w:hAnsi="Garamond"/>
-          <w:sz w:val="22"/>
-          <w:szCs w:val="22"/>
-        </w:rPr>
-        <w:t xml:space="preserve"> is independent of the total contribution of the stock to the overall run.</w:t>
-      </w:r>
-      <w:r>
-        <w:rPr>
-          <w:rFonts w:ascii="Garamond" w:hAnsi="Garamond"/>
-          <w:sz w:val="22"/>
-          <w:szCs w:val="22"/>
-        </w:rPr>
-        <w:t xml:space="preserve"> </w:t>
-      </w:r>
-      <w:r>
-        <w:rPr>
-          <w:rFonts w:ascii="Garamond" w:hAnsi="Garamond"/>
-          <w:sz w:val="22"/>
-          <w:szCs w:val="22"/>
-        </w:rPr>
-        <w:t xml:space="preserve">Upper watershed stocks demonstrated characteristically steep early-season curves, with populations like Big River, Swift, and Upper Kusko Main reaching 50% of their annual contribution more quickly than lower stocks. In most years, these populations arrive within a predictable window during the early portion of the season, </w:t>
-      </w:r>
-      <w:r>
-        <w:rPr>
-          <w:rStyle w:val="Strong"/>
-          <w:rFonts w:ascii="Garamond" w:eastAsiaTheme="majorEastAsia" w:hAnsi="Garamond"/>
-          <w:b w:val="0"/>
-          <w:bCs w:val="0"/>
-          <w:sz w:val="22"/>
-          <w:szCs w:val="22"/>
-        </w:rPr>
-        <w:t xml:space="preserve">with most upper watershed stocks reaching the majority (&gt;50%) of their annual contribution within </w:t>
-      </w:r>
-      <w:r>
-        <w:rPr>
-          <w:rStyle w:val="Strong"/>
-          <w:rFonts w:ascii="Garamond" w:eastAsiaTheme="majorEastAsia" w:hAnsi="Garamond"/>
-          <w:b w:val="0"/>
-          <w:bCs w:val="0"/>
-          <w:sz w:val="22"/>
-          <w:szCs w:val="22"/>
-        </w:rPr>
-        <w:lastRenderedPageBreak/>
-        <w:t>the first three weeks of the run</w:t>
-      </w:r>
-      <w:r>
-        <w:rPr>
-          <w:rFonts w:ascii="Garamond" w:hAnsi="Garamond"/>
-          <w:sz w:val="22"/>
-          <w:szCs w:val="22"/>
-        </w:rPr>
-        <w:t xml:space="preserve">. Lower watershed stocks exhibited markedly different cumulative patterns with gradual, extended curves reflecting protracted run timing that spans the entirety of the run. Populations such as Aniak, Kwethluk, and </w:t>
-      </w:r>
-      <w:proofErr w:type="spellStart"/>
-      <w:r>
-        <w:rPr>
-          <w:rFonts w:ascii="Garamond" w:hAnsi="Garamond"/>
-          <w:sz w:val="22"/>
-          <w:szCs w:val="22"/>
-        </w:rPr>
-        <w:t>Kisaralik</w:t>
-      </w:r>
-      <w:proofErr w:type="spellEnd"/>
-      <w:r>
-        <w:rPr>
-          <w:rFonts w:ascii="Garamond" w:hAnsi="Garamond"/>
-          <w:sz w:val="22"/>
-          <w:szCs w:val="22"/>
-        </w:rPr>
-        <w:t xml:space="preserve"> showed substantially lower early-season contributions, with their steepest accumulation occurring later in the season, a pattern that further supports the average higher contribution of these stocks in the fourth quartile of our dataset.  Despite varying total run size, timing, and duration, the relative timing patterns among management units remained consistent among all years of our dataset with the timing offset between upper and lower stocks persisting regardless of the run dynamics.</w:t>
-      </w:r>
-    </w:p>
-    <w:p>
-      <w:pPr>
-        <w:pStyle w:val="whitespace-normal"/>
-        <w:spacing w:line="480" w:lineRule="auto"/>
-        <w:rPr>
-          <w:rFonts w:ascii="Garamond" w:hAnsi="Garamond"/>
-          <w:b/>
-          <w:bCs/>
-          <w:sz w:val="20"/>
-          <w:szCs w:val="20"/>
-        </w:rPr>
-      </w:pPr>
-      <w:r>
-        <w:rPr>
-          <w:rFonts w:ascii="Garamond" w:hAnsi="Garamond"/>
-          <w:b/>
-          <w:bCs/>
-          <w:sz w:val="20"/>
-          <w:szCs w:val="20"/>
-        </w:rPr>
-        <w:t xml:space="preserve">Front end closure protections </w:t>
-      </w:r>
-    </w:p>
-    <w:p>
-      <w:pPr>
-        <w:pStyle w:val="whitespace-normal"/>
-        <w:spacing w:line="480" w:lineRule="auto"/>
-        <w:ind w:firstLine="720"/>
-        <w:rPr>
-          <w:rFonts w:ascii="Garamond" w:hAnsi="Garamond"/>
-          <w:sz w:val="22"/>
-          <w:szCs w:val="22"/>
-          <w:rPrChange w:id="125" w:author="Benjamin J. Makhlouf" w:date="2025-07-26T11:37:00Z" w16du:dateUtc="2025-07-26T18:37:00Z">
-            <w:rPr>
-              <w:rFonts w:ascii="Garamond" w:hAnsi="Garamond"/>
-              <w:sz w:val="20"/>
-              <w:szCs w:val="20"/>
-            </w:rPr>
-          </w:rPrChange>
-        </w:rPr>
-      </w:pPr>
-      <w:r>
-        <w:rPr>
-          <w:rFonts w:ascii="Garamond" w:hAnsi="Garamond"/>
-          <w:sz w:val="22"/>
-          <w:szCs w:val="22"/>
-          <w:rPrChange w:id="126" w:author="Benjamin J. Makhlouf" w:date="2025-07-26T11:37:00Z" w16du:dateUtc="2025-07-26T18:37:00Z">
-            <w:rPr>
-              <w:rFonts w:ascii="Garamond" w:hAnsi="Garamond"/>
-              <w:sz w:val="20"/>
-              <w:szCs w:val="20"/>
-            </w:rPr>
-          </w:rPrChange>
-        </w:rPr>
         <w:t xml:space="preserve">Analysis of the protection offered to stocks across the basin based on a front-end </w:t>
       </w:r>
-      <w:ins w:id="127" w:author="Daniel Schindler" w:date="2025-07-17T14:36:00Z" w16du:dateUtc="2025-07-17T22:36:00Z">
+      <w:ins w:id="83" w:author="Daniel Schindler" w:date="2025-07-17T14:36:00Z" w16du:dateUtc="2025-07-17T22:36:00Z">
         <w:r>
           <w:rPr>
             <w:rFonts w:ascii="Garamond" w:hAnsi="Garamond"/>
             <w:sz w:val="22"/>
             <w:szCs w:val="22"/>
-            <w:rPrChange w:id="128" w:author="Benjamin J. Makhlouf" w:date="2025-07-26T11:37:00Z" w16du:dateUtc="2025-07-26T18:37:00Z">
+            <w:rPrChange w:id="84" w:author="Benjamin J. Makhlouf" w:date="2025-07-26T11:37:00Z" w16du:dateUtc="2025-07-26T18:37:00Z">
               <w:rPr>
                 <w:rFonts w:ascii="Garamond" w:hAnsi="Garamond"/>
                 <w:sz w:val="20"/>
@@ -7488,7 +6710,7 @@
           <w:rFonts w:ascii="Garamond" w:hAnsi="Garamond"/>
           <w:sz w:val="22"/>
           <w:szCs w:val="22"/>
-          <w:rPrChange w:id="129" w:author="Benjamin J. Makhlouf" w:date="2025-07-26T11:37:00Z" w16du:dateUtc="2025-07-26T18:37:00Z">
+          <w:rPrChange w:id="85" w:author="Benjamin J. Makhlouf" w:date="2025-07-26T11:37:00Z" w16du:dateUtc="2025-07-26T18:37:00Z">
             <w:rPr>
               <w:rFonts w:ascii="Garamond" w:hAnsi="Garamond"/>
               <w:sz w:val="20"/>
@@ -7504,7 +6726,7 @@
           <w:rFonts w:ascii="Garamond" w:hAnsi="Garamond"/>
           <w:sz w:val="22"/>
           <w:szCs w:val="22"/>
-          <w:rPrChange w:id="130" w:author="Benjamin J. Makhlouf" w:date="2025-07-26T11:37:00Z" w16du:dateUtc="2025-07-26T18:37:00Z">
+          <w:rPrChange w:id="86" w:author="Benjamin J. Makhlouf" w:date="2025-07-26T11:37:00Z" w16du:dateUtc="2025-07-26T18:37:00Z">
             <w:rPr>
               <w:rFonts w:ascii="Garamond" w:hAnsi="Garamond"/>
               <w:sz w:val="20"/>
@@ -7520,7 +6742,7 @@
           <w:rFonts w:ascii="Garamond" w:hAnsi="Garamond"/>
           <w:sz w:val="22"/>
           <w:szCs w:val="22"/>
-          <w:rPrChange w:id="131" w:author="Benjamin J. Makhlouf" w:date="2025-07-26T11:37:00Z" w16du:dateUtc="2025-07-26T18:37:00Z">
+          <w:rPrChange w:id="87" w:author="Benjamin J. Makhlouf" w:date="2025-07-26T11:37:00Z" w16du:dateUtc="2025-07-26T18:37:00Z">
             <w:rPr>
               <w:rFonts w:ascii="Garamond" w:hAnsi="Garamond"/>
               <w:sz w:val="20"/>
@@ -7536,7 +6758,7 @@
           <w:rFonts w:ascii="Garamond" w:hAnsi="Garamond"/>
           <w:sz w:val="22"/>
           <w:szCs w:val="22"/>
-          <w:rPrChange w:id="132" w:author="Benjamin J. Makhlouf" w:date="2025-07-26T11:37:00Z" w16du:dateUtc="2025-07-26T18:37:00Z">
+          <w:rPrChange w:id="88" w:author="Benjamin J. Makhlouf" w:date="2025-07-26T11:37:00Z" w16du:dateUtc="2025-07-26T18:37:00Z">
             <w:rPr>
               <w:rFonts w:ascii="Garamond" w:hAnsi="Garamond"/>
               <w:sz w:val="20"/>
@@ -7552,7 +6774,7 @@
           <w:rFonts w:ascii="Garamond" w:hAnsi="Garamond"/>
           <w:sz w:val="22"/>
           <w:szCs w:val="22"/>
-          <w:rPrChange w:id="133" w:author="Benjamin J. Makhlouf" w:date="2025-07-26T11:37:00Z" w16du:dateUtc="2025-07-26T18:37:00Z">
+          <w:rPrChange w:id="89" w:author="Benjamin J. Makhlouf" w:date="2025-07-26T11:37:00Z" w16du:dateUtc="2025-07-26T18:37:00Z">
             <w:rPr>
               <w:rFonts w:ascii="Garamond" w:hAnsi="Garamond"/>
               <w:sz w:val="20"/>
@@ -7568,7 +6790,7 @@
           <w:rFonts w:ascii="Garamond" w:hAnsi="Garamond"/>
           <w:sz w:val="22"/>
           <w:szCs w:val="22"/>
-          <w:rPrChange w:id="134" w:author="Benjamin J. Makhlouf" w:date="2025-07-26T11:37:00Z" w16du:dateUtc="2025-07-26T18:37:00Z">
+          <w:rPrChange w:id="90" w:author="Benjamin J. Makhlouf" w:date="2025-07-26T11:37:00Z" w16du:dateUtc="2025-07-26T18:37:00Z">
             <w:rPr>
               <w:rFonts w:ascii="Garamond" w:hAnsi="Garamond"/>
               <w:sz w:val="20"/>
@@ -7584,7 +6806,7 @@
           <w:rFonts w:ascii="Garamond" w:hAnsi="Garamond"/>
           <w:sz w:val="22"/>
           <w:szCs w:val="22"/>
-          <w:rPrChange w:id="135" w:author="Benjamin J. Makhlouf" w:date="2025-07-26T11:37:00Z" w16du:dateUtc="2025-07-26T18:37:00Z">
+          <w:rPrChange w:id="91" w:author="Benjamin J. Makhlouf" w:date="2025-07-26T11:37:00Z" w16du:dateUtc="2025-07-26T18:37:00Z">
             <w:rPr>
               <w:rFonts w:ascii="Garamond" w:hAnsi="Garamond"/>
               <w:sz w:val="20"/>
@@ -7600,7 +6822,7 @@
           <w:rFonts w:ascii="Garamond" w:hAnsi="Garamond"/>
           <w:sz w:val="22"/>
           <w:szCs w:val="22"/>
-          <w:rPrChange w:id="136" w:author="Benjamin J. Makhlouf" w:date="2025-07-26T11:37:00Z" w16du:dateUtc="2025-07-26T18:37:00Z">
+          <w:rPrChange w:id="92" w:author="Benjamin J. Makhlouf" w:date="2025-07-26T11:37:00Z" w16du:dateUtc="2025-07-26T18:37:00Z">
             <w:rPr>
               <w:rFonts w:ascii="Garamond" w:hAnsi="Garamond"/>
               <w:sz w:val="20"/>
@@ -7616,7 +6838,7 @@
           <w:rFonts w:ascii="Garamond" w:hAnsi="Garamond"/>
           <w:sz w:val="22"/>
           <w:szCs w:val="22"/>
-          <w:rPrChange w:id="137" w:author="Benjamin J. Makhlouf" w:date="2025-07-26T11:37:00Z" w16du:dateUtc="2025-07-26T18:37:00Z">
+          <w:rPrChange w:id="93" w:author="Benjamin J. Makhlouf" w:date="2025-07-26T11:37:00Z" w16du:dateUtc="2025-07-26T18:37:00Z">
             <w:rPr>
               <w:rFonts w:ascii="Garamond" w:hAnsi="Garamond"/>
               <w:sz w:val="20"/>
@@ -7632,7 +6854,7 @@
           <w:rFonts w:ascii="Garamond" w:hAnsi="Garamond"/>
           <w:sz w:val="22"/>
           <w:szCs w:val="22"/>
-          <w:rPrChange w:id="138" w:author="Benjamin J. Makhlouf" w:date="2025-07-26T11:37:00Z" w16du:dateUtc="2025-07-26T18:37:00Z">
+          <w:rPrChange w:id="94" w:author="Benjamin J. Makhlouf" w:date="2025-07-26T11:37:00Z" w16du:dateUtc="2025-07-26T18:37:00Z">
             <w:rPr>
               <w:rFonts w:ascii="Garamond" w:hAnsi="Garamond"/>
               <w:sz w:val="20"/>
@@ -7648,7 +6870,7 @@
           <w:rFonts w:ascii="Garamond" w:hAnsi="Garamond"/>
           <w:sz w:val="22"/>
           <w:szCs w:val="22"/>
-          <w:rPrChange w:id="139" w:author="Benjamin J. Makhlouf" w:date="2025-07-26T11:37:00Z" w16du:dateUtc="2025-07-26T18:37:00Z">
+          <w:rPrChange w:id="95" w:author="Benjamin J. Makhlouf" w:date="2025-07-26T11:37:00Z" w16du:dateUtc="2025-07-26T18:37:00Z">
             <w:rPr>
               <w:rFonts w:ascii="Garamond" w:hAnsi="Garamond"/>
               <w:sz w:val="20"/>
@@ -7664,7 +6886,7 @@
           <w:rFonts w:ascii="Garamond" w:hAnsi="Garamond"/>
           <w:sz w:val="22"/>
           <w:szCs w:val="22"/>
-          <w:rPrChange w:id="140" w:author="Benjamin J. Makhlouf" w:date="2025-07-26T11:37:00Z" w16du:dateUtc="2025-07-26T18:37:00Z">
+          <w:rPrChange w:id="96" w:author="Benjamin J. Makhlouf" w:date="2025-07-26T11:37:00Z" w16du:dateUtc="2025-07-26T18:37:00Z">
             <w:rPr>
               <w:rFonts w:ascii="Garamond" w:hAnsi="Garamond"/>
               <w:sz w:val="20"/>
@@ -7680,7 +6902,7 @@
           <w:rFonts w:ascii="Garamond" w:hAnsi="Garamond"/>
           <w:sz w:val="22"/>
           <w:szCs w:val="22"/>
-          <w:rPrChange w:id="141" w:author="Benjamin J. Makhlouf" w:date="2025-07-26T11:37:00Z" w16du:dateUtc="2025-07-26T18:37:00Z">
+          <w:rPrChange w:id="97" w:author="Benjamin J. Makhlouf" w:date="2025-07-26T11:37:00Z" w16du:dateUtc="2025-07-26T18:37:00Z">
             <w:rPr>
               <w:rFonts w:ascii="Garamond" w:hAnsi="Garamond"/>
               <w:sz w:val="20"/>
@@ -7696,7 +6918,7 @@
           <w:rFonts w:ascii="Garamond" w:hAnsi="Garamond"/>
           <w:sz w:val="22"/>
           <w:szCs w:val="22"/>
-          <w:rPrChange w:id="142" w:author="Benjamin J. Makhlouf" w:date="2025-07-26T11:37:00Z" w16du:dateUtc="2025-07-26T18:37:00Z">
+          <w:rPrChange w:id="98" w:author="Benjamin J. Makhlouf" w:date="2025-07-26T11:37:00Z" w16du:dateUtc="2025-07-26T18:37:00Z">
             <w:rPr>
               <w:rFonts w:ascii="Garamond" w:hAnsi="Garamond"/>
               <w:sz w:val="20"/>
@@ -7712,7 +6934,7 @@
           <w:rFonts w:ascii="Garamond" w:hAnsi="Garamond"/>
           <w:sz w:val="22"/>
           <w:szCs w:val="22"/>
-          <w:rPrChange w:id="143" w:author="Benjamin J. Makhlouf" w:date="2025-07-26T11:37:00Z" w16du:dateUtc="2025-07-26T18:37:00Z">
+          <w:rPrChange w:id="99" w:author="Benjamin J. Makhlouf" w:date="2025-07-26T11:37:00Z" w16du:dateUtc="2025-07-26T18:37:00Z">
             <w:rPr>
               <w:rFonts w:ascii="Garamond" w:hAnsi="Garamond"/>
               <w:sz w:val="20"/>
@@ -7728,7 +6950,7 @@
           <w:rFonts w:ascii="Garamond" w:hAnsi="Garamond"/>
           <w:sz w:val="22"/>
           <w:szCs w:val="22"/>
-          <w:rPrChange w:id="144" w:author="Benjamin J. Makhlouf" w:date="2025-07-26T11:37:00Z" w16du:dateUtc="2025-07-26T18:37:00Z">
+          <w:rPrChange w:id="100" w:author="Benjamin J. Makhlouf" w:date="2025-07-26T11:37:00Z" w16du:dateUtc="2025-07-26T18:37:00Z">
             <w:rPr>
               <w:rFonts w:ascii="Garamond" w:hAnsi="Garamond"/>
               <w:sz w:val="20"/>
@@ -7744,7 +6966,7 @@
           <w:rFonts w:ascii="Garamond" w:hAnsi="Garamond"/>
           <w:sz w:val="22"/>
           <w:szCs w:val="22"/>
-          <w:rPrChange w:id="145" w:author="Benjamin J. Makhlouf" w:date="2025-07-26T11:37:00Z" w16du:dateUtc="2025-07-26T18:37:00Z">
+          <w:rPrChange w:id="101" w:author="Benjamin J. Makhlouf" w:date="2025-07-26T11:37:00Z" w16du:dateUtc="2025-07-26T18:37:00Z">
             <w:rPr>
               <w:rFonts w:ascii="Garamond" w:hAnsi="Garamond"/>
               <w:sz w:val="20"/>
@@ -7760,7 +6982,7 @@
           <w:rFonts w:ascii="Garamond" w:hAnsi="Garamond"/>
           <w:sz w:val="22"/>
           <w:szCs w:val="22"/>
-          <w:rPrChange w:id="146" w:author="Benjamin J. Makhlouf" w:date="2025-07-26T11:37:00Z" w16du:dateUtc="2025-07-26T18:37:00Z">
+          <w:rPrChange w:id="102" w:author="Benjamin J. Makhlouf" w:date="2025-07-26T11:37:00Z" w16du:dateUtc="2025-07-26T18:37:00Z">
             <w:rPr>
               <w:rFonts w:ascii="Garamond" w:hAnsi="Garamond"/>
               <w:sz w:val="20"/>
@@ -7776,7 +6998,7 @@
           <w:rFonts w:ascii="Garamond" w:hAnsi="Garamond"/>
           <w:sz w:val="22"/>
           <w:szCs w:val="22"/>
-          <w:rPrChange w:id="147" w:author="Benjamin J. Makhlouf" w:date="2025-07-26T11:37:00Z" w16du:dateUtc="2025-07-26T18:37:00Z">
+          <w:rPrChange w:id="103" w:author="Benjamin J. Makhlouf" w:date="2025-07-26T11:37:00Z" w16du:dateUtc="2025-07-26T18:37:00Z">
             <w:rPr>
               <w:rFonts w:ascii="Garamond" w:hAnsi="Garamond"/>
               <w:sz w:val="20"/>
@@ -7792,7 +7014,7 @@
           <w:rFonts w:ascii="Garamond" w:hAnsi="Garamond"/>
           <w:sz w:val="22"/>
           <w:szCs w:val="22"/>
-          <w:rPrChange w:id="148" w:author="Benjamin J. Makhlouf" w:date="2025-07-26T11:37:00Z" w16du:dateUtc="2025-07-26T18:37:00Z">
+          <w:rPrChange w:id="104" w:author="Benjamin J. Makhlouf" w:date="2025-07-26T11:37:00Z" w16du:dateUtc="2025-07-26T18:37:00Z">
             <w:rPr>
               <w:rFonts w:ascii="Garamond" w:hAnsi="Garamond"/>
               <w:sz w:val="20"/>
@@ -7808,7 +7030,7 @@
           <w:rFonts w:ascii="Garamond" w:hAnsi="Garamond"/>
           <w:sz w:val="22"/>
           <w:szCs w:val="22"/>
-          <w:rPrChange w:id="149" w:author="Benjamin J. Makhlouf" w:date="2025-07-26T11:37:00Z" w16du:dateUtc="2025-07-26T18:37:00Z">
+          <w:rPrChange w:id="105" w:author="Benjamin J. Makhlouf" w:date="2025-07-26T11:37:00Z" w16du:dateUtc="2025-07-26T18:37:00Z">
             <w:rPr>
               <w:rFonts w:ascii="Garamond" w:hAnsi="Garamond"/>
               <w:sz w:val="20"/>
@@ -7816,23 +7038,7 @@
             </w:rPr>
           </w:rPrChange>
         </w:rPr>
-        <w:t xml:space="preserve"> all demonstrated </w:t>
-      </w:r>
-      <w:r>
-        <w:rPr>
-          <w:rFonts w:ascii="Garamond" w:hAnsi="Garamond"/>
-          <w:sz w:val="22"/>
-          <w:szCs w:val="22"/>
-          <w:rPrChange w:id="150" w:author="Benjamin J. Makhlouf" w:date="2025-07-26T11:37:00Z" w16du:dateUtc="2025-07-26T18:37:00Z">
-            <w:rPr>
-              <w:rFonts w:ascii="Garamond" w:hAnsi="Garamond"/>
-              <w:sz w:val="20"/>
-              <w:szCs w:val="20"/>
-            </w:rPr>
-          </w:rPrChange>
-        </w:rPr>
-        <w:lastRenderedPageBreak/>
-        <w:t>low protection rates (medians: 2.9-8.0%), with George River showing the lowest protection of all stocks (median: 3.9%, range: 1.7-8.4%), indicating that the vast majority of these stocks' contributions occur outside of the front-end closure window and are therefore subject to fishing pressure during the open fishing period.</w:t>
+        <w:t xml:space="preserve"> all demonstrated low protection rates (medians: 2.9-8.0%), with George River showing the lowest protection of all stocks (median: 3.9%, range: 1.7-8.4%), indicating that the vast majority of these stocks' contributions occur outside of the front-end closure window and are therefore subject to fishing pressure during the open fishing period.</w:t>
       </w:r>
     </w:p>
     <w:p>
@@ -7846,7 +7052,7 @@
           <w:sz w:val="22"/>
           <w:szCs w:val="22"/>
           <w:u w:val="single"/>
-          <w:rPrChange w:id="151" w:author="Benjamin J. Makhlouf" w:date="2025-07-26T11:38:00Z" w16du:dateUtc="2025-07-26T18:38:00Z">
+          <w:rPrChange w:id="106" w:author="Benjamin J. Makhlouf" w:date="2025-07-26T11:38:00Z" w16du:dateUtc="2025-07-26T18:38:00Z">
             <w:rPr>
               <w:rFonts w:ascii="Garamond" w:hAnsi="Garamond"/>
               <w:b/>
@@ -7864,7 +7070,7 @@
           <w:sz w:val="22"/>
           <w:szCs w:val="22"/>
           <w:u w:val="single"/>
-          <w:rPrChange w:id="152" w:author="Benjamin J. Makhlouf" w:date="2025-07-26T11:38:00Z" w16du:dateUtc="2025-07-26T18:38:00Z">
+          <w:rPrChange w:id="107" w:author="Benjamin J. Makhlouf" w:date="2025-07-26T11:38:00Z" w16du:dateUtc="2025-07-26T18:38:00Z">
             <w:rPr>
               <w:rFonts w:ascii="Garamond" w:hAnsi="Garamond"/>
               <w:b/>
@@ -7893,7 +7099,7 @@
           <w:bCs/>
           <w:sz w:val="22"/>
           <w:szCs w:val="22"/>
-          <w:rPrChange w:id="153" w:author="Benjamin J. Makhlouf" w:date="2025-07-26T11:38:00Z" w16du:dateUtc="2025-07-26T18:38:00Z">
+          <w:rPrChange w:id="108" w:author="Benjamin J. Makhlouf" w:date="2025-07-26T11:38:00Z" w16du:dateUtc="2025-07-26T18:38:00Z">
             <w:rPr>
               <w:rFonts w:ascii="Garamond" w:hAnsi="Garamond"/>
               <w:b/>
@@ -7908,7 +7114,7 @@
           <w:rFonts w:ascii="Garamond" w:hAnsi="Garamond"/>
           <w:sz w:val="22"/>
           <w:szCs w:val="22"/>
-          <w:rPrChange w:id="154" w:author="Benjamin J. Makhlouf" w:date="2025-07-26T11:38:00Z" w16du:dateUtc="2025-07-26T18:38:00Z">
+          <w:rPrChange w:id="109" w:author="Benjamin J. Makhlouf" w:date="2025-07-26T11:38:00Z" w16du:dateUtc="2025-07-26T18:38:00Z">
             <w:rPr>
               <w:rFonts w:ascii="Garamond" w:hAnsi="Garamond"/>
             </w:rPr>
@@ -7962,7 +7168,16 @@
           <w:sz w:val="22"/>
           <w:szCs w:val="22"/>
         </w:rPr>
-        <w:t>in the Kuskokwim River-Basin</w:t>
+        <w:t xml:space="preserve">in the </w:t>
+      </w:r>
+      <w:r>
+        <w:rPr>
+          <w:rFonts w:ascii="Garamond" w:hAnsi="Garamond"/>
+          <w:sz w:val="22"/>
+          <w:szCs w:val="22"/>
+        </w:rPr>
+        <w:lastRenderedPageBreak/>
+        <w:t>Kuskokwim River-Basin</w:t>
       </w:r>
       <w:r>
         <w:rPr>
@@ -7994,23 +7209,7 @@
           <w:sz w:val="22"/>
           <w:szCs w:val="22"/>
         </w:rPr>
-        <w:t xml:space="preserve"> </w:t>
-      </w:r>
-      <w:r>
-        <w:rPr>
-          <w:rFonts w:ascii="Garamond" w:hAnsi="Garamond"/>
-          <w:sz w:val="22"/>
-          <w:szCs w:val="22"/>
-        </w:rPr>
-        <w:t>(Clark et al., 2015, Lillard report)</w:t>
-      </w:r>
-      <w:r>
-        <w:rPr>
-          <w:rFonts w:ascii="Garamond" w:hAnsi="Garamond"/>
-          <w:sz w:val="22"/>
-          <w:szCs w:val="22"/>
-        </w:rPr>
-        <w:t xml:space="preserve">. These analyses corroborate these </w:t>
+        <w:t xml:space="preserve"> (Clark et al., 2015, Lillard report). These analyses corroborate these </w:t>
       </w:r>
       <w:r>
         <w:rPr>
@@ -8127,7 +7326,6 @@
           <w:sz w:val="22"/>
           <w:szCs w:val="22"/>
         </w:rPr>
-        <w:lastRenderedPageBreak/>
         <w:tab/>
       </w:r>
       <w:r>
@@ -8144,7 +7342,7 @@
         <w:pStyle w:val="whitespace-normal"/>
         <w:spacing w:line="480" w:lineRule="auto"/>
         <w:rPr>
-          <w:ins w:id="155" w:author="Benjamin J. Makhlouf" w:date="2025-07-26T11:41:00Z" w16du:dateUtc="2025-07-26T18:41:00Z"/>
+          <w:ins w:id="110" w:author="Benjamin J. Makhlouf" w:date="2025-07-26T11:41:00Z" w16du:dateUtc="2025-07-26T18:41:00Z"/>
           <w:rFonts w:ascii="Garamond" w:hAnsi="Garamond"/>
           <w:sz w:val="22"/>
           <w:szCs w:val="22"/>
@@ -8210,6 +7408,7 @@
         <w:spacing w:line="480" w:lineRule="auto"/>
       </w:pPr>
       <w:r>
+        <w:lastRenderedPageBreak/>
         <w:t xml:space="preserve">Big range and outliers, indicating variability among years in the protection afforded, which may be the result of differences in total run timing or big contribution years for a given stock. </w:t>
       </w:r>
     </w:p>
@@ -8468,7 +7667,7 @@
         </w:rPr>
         <w:t xml:space="preserve"> </w:t>
       </w:r>
-      <w:ins w:id="156" w:author="Daniel Schindler" w:date="2025-07-17T14:47:00Z" w16du:dateUtc="2025-07-17T22:47:00Z">
+      <w:ins w:id="111" w:author="Daniel Schindler" w:date="2025-07-17T14:47:00Z" w16du:dateUtc="2025-07-17T22:47:00Z">
         <w:r>
           <w:rPr>
             <w:rFonts w:ascii="Garamond" w:hAnsi="Garamond"/>
@@ -8480,7 +7679,7 @@
           <w:t xml:space="preserve">Should argue that upriver stocks are most vulnerable to </w:t>
         </w:r>
       </w:ins>
-      <w:ins w:id="157" w:author="Daniel Schindler" w:date="2025-07-17T14:48:00Z" w16du:dateUtc="2025-07-17T22:48:00Z">
+      <w:ins w:id="112" w:author="Daniel Schindler" w:date="2025-07-17T14:48:00Z" w16du:dateUtc="2025-07-17T22:48:00Z">
         <w:r>
           <w:rPr>
             <w:rFonts w:ascii="Garamond" w:hAnsi="Garamond"/>
@@ -8489,21 +7688,10 @@
             <w:sz w:val="22"/>
             <w:szCs w:val="22"/>
           </w:rPr>
-          <w:t xml:space="preserve">overfishing since they migrate first but also have shorter migration seasons (assuming they </w:t>
-        </w:r>
-        <w:r>
-          <w:rPr>
-            <w:rFonts w:ascii="Garamond" w:hAnsi="Garamond"/>
-            <w:b/>
-            <w:bCs/>
-            <w:sz w:val="22"/>
-            <w:szCs w:val="22"/>
-          </w:rPr>
-          <w:lastRenderedPageBreak/>
-          <w:t>do – see note above). Thus, the front end closures are a type of time management that has potential to maintain biocomplex</w:t>
+          <w:t>overfishing since they migrate first but also have shorter migration seasons (assuming they do – see note above). Thus, the front end closures are a type of time management that has potential to maintain biocomplex</w:t>
         </w:r>
       </w:ins>
-      <w:ins w:id="158" w:author="Daniel Schindler" w:date="2025-07-17T14:49:00Z" w16du:dateUtc="2025-07-17T22:49:00Z">
+      <w:ins w:id="113" w:author="Daniel Schindler" w:date="2025-07-17T14:49:00Z" w16du:dateUtc="2025-07-17T22:49:00Z">
         <w:r>
           <w:rPr>
             <w:rFonts w:ascii="Garamond" w:hAnsi="Garamond"/>
@@ -8596,8 +7784,11 @@
       </w:r>
     </w:p>
   </w:comment>
-  <w:comment w:id="51" w:author="Benjamin J. Makhlouf" w:date="2025-07-26T13:08:00Z" w:initials="b">
+  <w:comment w:id="14" w:author="Benjamin J. Makhlouf" w:date="2025-07-28T07:41:00Z" w:initials="BM">
     <w:p>
+      <w:pPr>
+        <w:pStyle w:val="CommentText"/>
+      </w:pPr>
       <w:r>
         <w:rPr>
           <w:rStyle w:val="CommentReference"/>
@@ -8605,11 +7796,23 @@
         <w:annotationRef/>
       </w:r>
       <w:r>
-        <w:rPr>
-          <w:sz w:val="20"/>
-          <w:szCs w:val="20"/>
-        </w:rPr>
-        <w:t>I cant seem to find this specific mention</w:t>
+        <w:t xml:space="preserve">Since this is published in french et al., do you think I should not include it as a figure? </w:t>
+      </w:r>
+    </w:p>
+  </w:comment>
+  <w:comment w:id="15" w:author="Benjamin J. Makhlouf" w:date="2025-07-28T07:42:00Z" w:initials="BM">
+    <w:p>
+      <w:pPr>
+        <w:pStyle w:val="CommentText"/>
+      </w:pPr>
+      <w:r>
+        <w:rPr>
+          <w:rStyle w:val="CommentReference"/>
+        </w:rPr>
+        <w:annotationRef/>
+      </w:r>
+      <w:r>
+        <w:t xml:space="preserve">This is in one of Sean’s papers but I cannot find it </w:t>
       </w:r>
     </w:p>
   </w:comment>
@@ -8622,7 +7825,8 @@
   <w15:commentEx w15:paraId="2AD4524E" w15:done="0"/>
   <w15:commentEx w15:paraId="0DA0C363" w15:paraIdParent="2AD4524E" w15:done="0"/>
   <w15:commentEx w15:paraId="75633029" w15:done="0"/>
-  <w15:commentEx w15:paraId="4E90B050" w15:done="0"/>
+  <w15:commentEx w15:paraId="317DFEBA" w15:done="0"/>
+  <w15:commentEx w15:paraId="05C4AF8C" w15:done="0"/>
 </w15:commentsEx>
 </file>
 
@@ -8632,7 +7836,8 @@
   <w16cex:commentExtensible w16cex:durableId="6C50E346" w16cex:dateUtc="2025-07-17T20:57:00Z"/>
   <w16cex:commentExtensible w16cex:durableId="31A19B43" w16cex:dateUtc="2025-07-17T21:14:00Z"/>
   <w16cex:commentExtensible w16cex:durableId="08B9BEA6" w16cex:dateUtc="2025-06-27T19:54:00Z"/>
-  <w16cex:commentExtensible w16cex:durableId="62DF3813" w16cex:dateUtc="2025-07-26T20:08:00Z"/>
+  <w16cex:commentExtensible w16cex:durableId="6C95C996" w16cex:dateUtc="2025-07-28T14:41:00Z"/>
+  <w16cex:commentExtensible w16cex:durableId="3CAE4ABD" w16cex:dateUtc="2025-07-28T14:42:00Z"/>
 </w16cex:commentsExtensible>
 </file>
 
@@ -8642,7 +7847,8 @@
   <w16cid:commentId w16cid:paraId="2AD4524E" w16cid:durableId="6C50E346"/>
   <w16cid:commentId w16cid:paraId="0DA0C363" w16cid:durableId="31A19B43"/>
   <w16cid:commentId w16cid:paraId="75633029" w16cid:durableId="08B9BEA6"/>
-  <w16cid:commentId w16cid:paraId="4E90B050" w16cid:durableId="62DF3813"/>
+  <w16cid:commentId w16cid:paraId="317DFEBA" w16cid:durableId="6C95C996"/>
+  <w16cid:commentId w16cid:paraId="05C4AF8C" w16cid:durableId="3CAE4ABD"/>
 </w16cid:commentsIds>
 </file>
 

</xml_diff>

<commit_message>
Working on the introduction
</commit_message>
<xml_diff>
--- a/Docs/Run_timing_manuscript.docx
+++ b/Docs/Run_timing_manuscript.docx
@@ -177,6 +177,450 @@
           <w:sz w:val="22"/>
           <w:szCs w:val="22"/>
         </w:rPr>
+        <w:t xml:space="preserve">A key challenge in fisheries management is the need to maximize harvest opportunities while maintaining and protecting biodiversity. This challenge is present in mixed species fisheries, where harvesting productive species often risks over-exploitation of non-target co-occurring species of concern. The same challenge also arises in single species mixed stock fisheries, where a single run </w:t>
+      </w:r>
+      <w:r>
+        <w:rPr>
+          <w:rFonts w:ascii="Garamond" w:hAnsi="Garamond"/>
+          <w:sz w:val="22"/>
+          <w:szCs w:val="22"/>
+        </w:rPr>
+        <w:t>consists</w:t>
+      </w:r>
+      <w:r>
+        <w:rPr>
+          <w:rFonts w:ascii="Garamond" w:hAnsi="Garamond"/>
+          <w:sz w:val="22"/>
+          <w:szCs w:val="22"/>
+        </w:rPr>
+        <w:t xml:space="preserve"> of several unique stock components that together contribute to biocomplexity</w:t>
+      </w:r>
+      <w:r>
+        <w:rPr>
+          <w:rFonts w:ascii="Garamond" w:hAnsi="Garamond"/>
+          <w:sz w:val="22"/>
+          <w:szCs w:val="22"/>
+        </w:rPr>
+        <w:t xml:space="preserve"> in the form of variable life history strategies and genetic makeup. This intraspecies biocomplexity serves to increase ecosystem stability by distributing risk across several weakly or negatively correlated sub-components. In addition, for </w:t>
+      </w:r>
+      <w:r>
+        <w:rPr>
+          <w:rFonts w:ascii="Garamond" w:hAnsi="Garamond"/>
+          <w:sz w:val="22"/>
+          <w:szCs w:val="22"/>
+        </w:rPr>
+        <w:t xml:space="preserve">fisheries which can harvest across several of these stock components, biocomplexity in life history may help reduce pressure on a single stock or series of stocks by distributing fishing pressure across a greater spatial and temporal scale. </w:t>
+      </w:r>
+    </w:p>
+    <w:p>
+      <w:pPr>
+        <w:spacing w:line="480" w:lineRule="auto"/>
+        <w:ind w:firstLine="720"/>
+        <w:rPr>
+          <w:rFonts w:ascii="Garamond" w:hAnsi="Garamond"/>
+          <w:sz w:val="22"/>
+          <w:szCs w:val="22"/>
+        </w:rPr>
+      </w:pPr>
+      <w:r>
+        <w:rPr>
+          <w:rFonts w:ascii="Garamond" w:hAnsi="Garamond"/>
+          <w:sz w:val="22"/>
+          <w:szCs w:val="22"/>
+        </w:rPr>
+        <w:t>In salmon ecosystems, the existence and benefits of significant intrapopulation biocomplexity have been well established. Within a given population, variability in return timing and spatial distribution of habitat use distributes the risk of perturbation across both space and time</w:t>
+      </w:r>
+      <w:r>
+        <w:rPr>
+          <w:rFonts w:ascii="Garamond" w:hAnsi="Garamond"/>
+          <w:sz w:val="22"/>
+          <w:szCs w:val="22"/>
+        </w:rPr>
+        <w:t xml:space="preserve"> </w:t>
+      </w:r>
+      <w:r>
+        <w:rPr>
+          <w:rFonts w:ascii="Garamond" w:hAnsi="Garamond"/>
+          <w:sz w:val="22"/>
+          <w:szCs w:val="22"/>
+        </w:rPr>
+        <w:t>both within and among years.</w:t>
+      </w:r>
+      <w:r>
+        <w:rPr>
+          <w:rFonts w:ascii="Garamond" w:hAnsi="Garamond"/>
+          <w:sz w:val="22"/>
+          <w:szCs w:val="22"/>
+        </w:rPr>
+        <w:t xml:space="preserve"> </w:t>
+      </w:r>
+      <w:r>
+        <w:rPr>
+          <w:rFonts w:ascii="Garamond" w:hAnsi="Garamond"/>
+          <w:sz w:val="22"/>
+          <w:szCs w:val="22"/>
+        </w:rPr>
+        <w:t>In doing so, this biocomplexity increases ecosystem resilience to short-term or local changes in habitat conditions, maximizes genetic diversity, and stabilizes aggregate resource availability.</w:t>
+      </w:r>
+      <w:r>
+        <w:rPr>
+          <w:rFonts w:ascii="Garamond" w:hAnsi="Garamond"/>
+          <w:sz w:val="22"/>
+          <w:szCs w:val="22"/>
+        </w:rPr>
+        <w:t xml:space="preserve"> </w:t>
+      </w:r>
+      <w:r>
+        <w:rPr>
+          <w:rFonts w:ascii="Garamond" w:hAnsi="Garamond"/>
+          <w:sz w:val="22"/>
+          <w:szCs w:val="22"/>
+        </w:rPr>
+        <w:t xml:space="preserve">For fisheries that harvest migrating stocks downstream, as is the case with many Pacific salmon fisheries, the reliability and duration of resource availability depends on the aggregate dynamics of upstream stocks. </w:t>
+      </w:r>
+      <w:r>
+        <w:rPr>
+          <w:rFonts w:ascii="Garamond" w:hAnsi="Garamond"/>
+          <w:sz w:val="22"/>
+          <w:szCs w:val="22"/>
+        </w:rPr>
+        <w:t>M</w:t>
+      </w:r>
+      <w:r>
+        <w:rPr>
+          <w:rFonts w:ascii="Garamond" w:hAnsi="Garamond"/>
+          <w:sz w:val="22"/>
+          <w:szCs w:val="22"/>
+        </w:rPr>
+        <w:t xml:space="preserve">anagers </w:t>
+      </w:r>
+      <w:r>
+        <w:rPr>
+          <w:rFonts w:ascii="Garamond" w:hAnsi="Garamond"/>
+          <w:sz w:val="22"/>
+          <w:szCs w:val="22"/>
+        </w:rPr>
+        <w:t xml:space="preserve">are therefore tasked with </w:t>
+      </w:r>
+      <w:r>
+        <w:rPr>
+          <w:rFonts w:ascii="Garamond" w:hAnsi="Garamond"/>
+          <w:sz w:val="22"/>
+          <w:szCs w:val="22"/>
+        </w:rPr>
+        <w:t xml:space="preserve"> design</w:t>
+      </w:r>
+      <w:r>
+        <w:rPr>
+          <w:rFonts w:ascii="Garamond" w:hAnsi="Garamond"/>
+          <w:sz w:val="22"/>
+          <w:szCs w:val="22"/>
+        </w:rPr>
+        <w:t>ing</w:t>
+      </w:r>
+      <w:r>
+        <w:rPr>
+          <w:rFonts w:ascii="Garamond" w:hAnsi="Garamond"/>
+          <w:sz w:val="22"/>
+          <w:szCs w:val="22"/>
+        </w:rPr>
+        <w:t xml:space="preserve"> harvest strategies that allow for downstream harvest while protecting the individual health of stock components</w:t>
+      </w:r>
+      <w:r>
+        <w:rPr>
+          <w:rFonts w:ascii="Garamond" w:hAnsi="Garamond"/>
+          <w:sz w:val="22"/>
+          <w:szCs w:val="22"/>
+        </w:rPr>
+        <w:t xml:space="preserve">. </w:t>
+      </w:r>
+    </w:p>
+    <w:p>
+      <w:pPr>
+        <w:spacing w:line="480" w:lineRule="auto"/>
+        <w:ind w:firstLine="720"/>
+        <w:rPr>
+          <w:rFonts w:ascii="Garamond" w:hAnsi="Garamond"/>
+          <w:sz w:val="22"/>
+          <w:szCs w:val="22"/>
+        </w:rPr>
+      </w:pPr>
+      <w:r>
+        <w:rPr>
+          <w:rFonts w:ascii="Garamond" w:hAnsi="Garamond"/>
+          <w:sz w:val="22"/>
+          <w:szCs w:val="22"/>
+        </w:rPr>
+        <w:lastRenderedPageBreak/>
+        <w:t xml:space="preserve">The harvest/biodiversity tradeoff is especially present in Western Alaska, which supports some of the largest salmon fisheries in the world, but which has seen a precipitous decline in the health of Chinook and Chum salmon populations in recent years. </w:t>
+      </w:r>
+    </w:p>
+    <w:p>
+      <w:pPr>
+        <w:spacing w:line="480" w:lineRule="auto"/>
+        <w:ind w:firstLine="720"/>
+        <w:rPr>
+          <w:rFonts w:ascii="Garamond" w:hAnsi="Garamond"/>
+          <w:sz w:val="22"/>
+          <w:szCs w:val="22"/>
+        </w:rPr>
+      </w:pPr>
+    </w:p>
+    <w:p>
+      <w:pPr>
+        <w:spacing w:line="480" w:lineRule="auto"/>
+        <w:ind w:firstLine="720"/>
+        <w:rPr>
+          <w:rFonts w:ascii="Garamond" w:hAnsi="Garamond"/>
+          <w:sz w:val="22"/>
+          <w:szCs w:val="22"/>
+        </w:rPr>
+      </w:pPr>
+      <w:r>
+        <w:rPr>
+          <w:rFonts w:ascii="Garamond" w:hAnsi="Garamond"/>
+          <w:sz w:val="22"/>
+          <w:szCs w:val="22"/>
+        </w:rPr>
+        <w:t xml:space="preserve">salmon fisheries, wherein salmon populations in large river systems are comprised of several stock components with variable health and pressure from both commercial and subsistence fisheries. In recent years returns of important species such as Chinook salmon have dropped </w:t>
+      </w:r>
+      <w:proofErr w:type="spellStart"/>
+      <w:r>
+        <w:rPr>
+          <w:rFonts w:ascii="Garamond" w:hAnsi="Garamond"/>
+          <w:sz w:val="22"/>
+          <w:szCs w:val="22"/>
+        </w:rPr>
+        <w:t>precipitiously</w:t>
+      </w:r>
+      <w:proofErr w:type="spellEnd"/>
+      <w:r>
+        <w:rPr>
+          <w:rFonts w:ascii="Garamond" w:hAnsi="Garamond"/>
+          <w:sz w:val="22"/>
+          <w:szCs w:val="22"/>
+        </w:rPr>
+        <w:t xml:space="preserve">, leading to </w:t>
+      </w:r>
+    </w:p>
+    <w:p>
+      <w:pPr>
+        <w:spacing w:line="480" w:lineRule="auto"/>
+        <w:ind w:firstLine="720"/>
+        <w:rPr>
+          <w:rFonts w:ascii="Garamond" w:hAnsi="Garamond"/>
+          <w:sz w:val="22"/>
+          <w:szCs w:val="22"/>
+        </w:rPr>
+      </w:pPr>
+    </w:p>
+    <w:p>
+      <w:pPr>
+        <w:spacing w:line="480" w:lineRule="auto"/>
+        <w:ind w:firstLine="720"/>
+        <w:rPr>
+          <w:rFonts w:ascii="Garamond" w:hAnsi="Garamond"/>
+          <w:sz w:val="22"/>
+          <w:szCs w:val="22"/>
+        </w:rPr>
+      </w:pPr>
+      <w:r>
+        <w:rPr>
+          <w:rFonts w:ascii="Garamond" w:hAnsi="Garamond"/>
+          <w:sz w:val="22"/>
+          <w:szCs w:val="22"/>
+        </w:rPr>
+        <w:t xml:space="preserve">Western Alaska salmon fisheries face a pressing harvest biodiversity tradeoff , and with little fine scale understanding of the spatial ecology </w:t>
+      </w:r>
+    </w:p>
+    <w:p>
+      <w:pPr>
+        <w:spacing w:line="480" w:lineRule="auto"/>
+        <w:ind w:firstLine="720"/>
+        <w:rPr>
+          <w:rFonts w:ascii="Garamond" w:hAnsi="Garamond"/>
+          <w:sz w:val="22"/>
+          <w:szCs w:val="22"/>
+        </w:rPr>
+      </w:pPr>
+      <w:r>
+        <w:rPr>
+          <w:rFonts w:ascii="Garamond" w:hAnsi="Garamond"/>
+          <w:sz w:val="22"/>
+          <w:szCs w:val="22"/>
+        </w:rPr>
+        <w:t xml:space="preserve">This has led to the use of front end closure strategy in the Kuskokwim </w:t>
+      </w:r>
+      <w:r>
+        <w:rPr>
+          <w:rFonts w:ascii="Garamond" w:hAnsi="Garamond"/>
+          <w:sz w:val="22"/>
+          <w:szCs w:val="22"/>
+        </w:rPr>
+        <w:t xml:space="preserve">to protect opportunity for upstream comm. And stabilize the fishery by protecting upstream stocks </w:t>
+      </w:r>
+    </w:p>
+    <w:p>
+      <w:pPr>
+        <w:spacing w:line="480" w:lineRule="auto"/>
+        <w:ind w:firstLine="720"/>
+        <w:rPr>
+          <w:rFonts w:ascii="Garamond" w:hAnsi="Garamond"/>
+          <w:sz w:val="22"/>
+          <w:szCs w:val="22"/>
+        </w:rPr>
+      </w:pPr>
+      <w:r>
+        <w:rPr>
+          <w:rFonts w:ascii="Garamond" w:hAnsi="Garamond"/>
+          <w:sz w:val="22"/>
+          <w:szCs w:val="22"/>
+        </w:rPr>
+        <w:t xml:space="preserve">Little understanding of the spatiotemporal patterns in the system </w:t>
+      </w:r>
+    </w:p>
+    <w:p>
+      <w:pPr>
+        <w:spacing w:line="480" w:lineRule="auto"/>
+        <w:ind w:firstLine="720"/>
+        <w:rPr>
+          <w:rFonts w:ascii="Garamond" w:hAnsi="Garamond"/>
+          <w:sz w:val="22"/>
+          <w:szCs w:val="22"/>
+        </w:rPr>
+      </w:pPr>
+      <w:r>
+        <w:rPr>
+          <w:rFonts w:ascii="Garamond" w:hAnsi="Garamond"/>
+          <w:sz w:val="22"/>
+          <w:szCs w:val="22"/>
+        </w:rPr>
+        <w:t xml:space="preserve">Here, we…. </w:t>
+      </w:r>
+    </w:p>
+    <w:p>
+      <w:pPr>
+        <w:spacing w:line="480" w:lineRule="auto"/>
+        <w:ind w:firstLine="720"/>
+        <w:rPr>
+          <w:rFonts w:ascii="Garamond" w:hAnsi="Garamond"/>
+          <w:sz w:val="22"/>
+          <w:szCs w:val="22"/>
+        </w:rPr>
+      </w:pPr>
+    </w:p>
+    <w:p>
+      <w:pPr>
+        <w:spacing w:line="480" w:lineRule="auto"/>
+        <w:ind w:firstLine="720"/>
+        <w:rPr>
+          <w:rFonts w:ascii="Garamond" w:hAnsi="Garamond"/>
+          <w:sz w:val="22"/>
+          <w:szCs w:val="22"/>
+        </w:rPr>
+      </w:pPr>
+      <w:r>
+        <w:rPr>
+          <w:rFonts w:ascii="Garamond" w:hAnsi="Garamond"/>
+          <w:sz w:val="22"/>
+          <w:szCs w:val="22"/>
+        </w:rPr>
+        <w:t xml:space="preserve"> </w:t>
+      </w:r>
+    </w:p>
+    <w:p>
+      <w:pPr>
+        <w:spacing w:line="480" w:lineRule="auto"/>
+        <w:ind w:firstLine="720"/>
+        <w:rPr>
+          <w:rFonts w:ascii="Garamond" w:hAnsi="Garamond"/>
+          <w:sz w:val="22"/>
+          <w:szCs w:val="22"/>
+        </w:rPr>
+      </w:pPr>
+    </w:p>
+    <w:p>
+      <w:pPr>
+        <w:spacing w:line="480" w:lineRule="auto"/>
+        <w:ind w:firstLine="720"/>
+        <w:rPr>
+          <w:rFonts w:ascii="Garamond" w:hAnsi="Garamond"/>
+          <w:sz w:val="22"/>
+          <w:szCs w:val="22"/>
+        </w:rPr>
+      </w:pPr>
+    </w:p>
+    <w:p>
+      <w:pPr>
+        <w:spacing w:line="480" w:lineRule="auto"/>
+        <w:ind w:firstLine="720"/>
+        <w:rPr>
+          <w:rFonts w:ascii="Garamond" w:hAnsi="Garamond"/>
+          <w:sz w:val="22"/>
+          <w:szCs w:val="22"/>
+        </w:rPr>
+      </w:pPr>
+    </w:p>
+    <w:p>
+      <w:pPr>
+        <w:spacing w:line="480" w:lineRule="auto"/>
+        <w:ind w:firstLine="720"/>
+        <w:rPr>
+          <w:rFonts w:ascii="Garamond" w:hAnsi="Garamond"/>
+          <w:sz w:val="22"/>
+          <w:szCs w:val="22"/>
+        </w:rPr>
+      </w:pPr>
+    </w:p>
+    <w:p>
+      <w:pPr>
+        <w:spacing w:line="480" w:lineRule="auto"/>
+        <w:ind w:firstLine="720"/>
+        <w:rPr>
+          <w:rFonts w:ascii="Garamond" w:hAnsi="Garamond"/>
+          <w:sz w:val="22"/>
+          <w:szCs w:val="22"/>
+        </w:rPr>
+      </w:pPr>
+    </w:p>
+    <w:p>
+      <w:pPr>
+        <w:spacing w:line="480" w:lineRule="auto"/>
+        <w:ind w:firstLine="720"/>
+        <w:rPr>
+          <w:rFonts w:ascii="Garamond" w:hAnsi="Garamond"/>
+          <w:sz w:val="22"/>
+          <w:szCs w:val="22"/>
+        </w:rPr>
+      </w:pPr>
+    </w:p>
+    <w:p>
+      <w:pPr>
+        <w:spacing w:line="480" w:lineRule="auto"/>
+        <w:ind w:firstLine="720"/>
+        <w:rPr>
+          <w:rFonts w:ascii="Garamond" w:hAnsi="Garamond"/>
+          <w:sz w:val="22"/>
+          <w:szCs w:val="22"/>
+        </w:rPr>
+      </w:pPr>
+    </w:p>
+    <w:p>
+      <w:pPr>
+        <w:spacing w:line="480" w:lineRule="auto"/>
+        <w:ind w:firstLine="720"/>
+        <w:rPr>
+          <w:rFonts w:ascii="Garamond" w:hAnsi="Garamond"/>
+          <w:sz w:val="22"/>
+          <w:szCs w:val="22"/>
+        </w:rPr>
+      </w:pPr>
+      <w:r>
+        <w:rPr>
+          <w:rFonts w:ascii="Garamond" w:hAnsi="Garamond"/>
+          <w:sz w:val="22"/>
+          <w:szCs w:val="22"/>
+        </w:rPr>
         <w:t>Chinook salmon populations are experiencing unprecedented declines across much of their range</w:t>
       </w:r>
       <w:r>
@@ -341,23 +785,13 @@
         </w:rPr>
         <w:t xml:space="preserve">. Salmon from this region </w:t>
       </w:r>
-      <w:proofErr w:type="gramStart"/>
-      <w:r>
-        <w:rPr>
-          <w:rFonts w:ascii="Garamond" w:hAnsi="Garamond"/>
-          <w:sz w:val="22"/>
-          <w:szCs w:val="22"/>
-        </w:rPr>
-        <w:t>have</w:t>
-      </w:r>
-      <w:proofErr w:type="gramEnd"/>
-      <w:r>
-        <w:rPr>
-          <w:rFonts w:ascii="Garamond" w:hAnsi="Garamond"/>
-          <w:sz w:val="22"/>
-          <w:szCs w:val="22"/>
-        </w:rPr>
-        <w:t xml:space="preserve"> supported</w:t>
+      <w:r>
+        <w:rPr>
+          <w:rFonts w:ascii="Garamond" w:hAnsi="Garamond"/>
+          <w:sz w:val="22"/>
+          <w:szCs w:val="22"/>
+        </w:rPr>
+        <w:t>have supported</w:t>
       </w:r>
       <w:r>
         <w:rPr>
@@ -708,16 +1142,7 @@
           <w:sz w:val="22"/>
           <w:szCs w:val="22"/>
         </w:rPr>
-        <w:t xml:space="preserve">Weak or negative covariance among these stocks helps buffer the broader population against the poor performance of any individual subunit, whose success may fluctuate in response to a </w:t>
-      </w:r>
-      <w:r>
-        <w:rPr>
-          <w:rFonts w:ascii="Garamond" w:hAnsi="Garamond"/>
-          <w:sz w:val="22"/>
-          <w:szCs w:val="22"/>
-        </w:rPr>
-        <w:lastRenderedPageBreak/>
-        <w:t>dynamic mosaic of multi-dimensional environmental conditions</w:t>
+        <w:t>Weak or negative covariance among these stocks helps buffer the broader population against the poor performance of any individual subunit, whose success may fluctuate in response to a dynamic mosaic of multi-dimensional environmental conditions</w:t>
       </w:r>
       <w:r>
         <w:rPr>
@@ -851,6 +1276,7 @@
           <w:sz w:val="22"/>
           <w:szCs w:val="22"/>
         </w:rPr>
+        <w:lastRenderedPageBreak/>
         <w:t xml:space="preserve">The reliability of salmon resources to communities is a product of the health of stock components throughout the watershed. For Pacific salmon fisheries, which harvest stocks as the migrate upstream, the duration and reliability of this resource is the result of the aggregate dynamics of upstream stocks. For example, healthy stock components with unique spatiotemporal patterns may allow for more diverse set of harvest opportunities over a longer time period  </w:t>
       </w:r>
       <w:r>
@@ -1227,16 +1653,7 @@
           <w:sz w:val="22"/>
           <w:szCs w:val="22"/>
         </w:rPr>
-        <w:t xml:space="preserve"> In practice, however, implementing such stock-specific management approaches </w:t>
-      </w:r>
-      <w:r>
-        <w:rPr>
-          <w:rFonts w:ascii="Garamond" w:hAnsi="Garamond"/>
-          <w:sz w:val="22"/>
-          <w:szCs w:val="22"/>
-        </w:rPr>
-        <w:lastRenderedPageBreak/>
-        <w:t>requires detailed data on the spatiotemporal ecology of salmon populations; information that has historically been limited at sufficiently fine spatial and temporal scales</w:t>
+        <w:t xml:space="preserve"> In practice, however, implementing such stock-specific management approaches requires detailed data on the spatiotemporal ecology of salmon populations; information that has historically been limited at sufficiently fine spatial and temporal scales</w:t>
       </w:r>
       <w:r>
         <w:rPr>
@@ -1332,7 +1749,16 @@
             <w:sz w:val="22"/>
             <w:szCs w:val="22"/>
           </w:rPr>
-          <w:t xml:space="preserve"> et al., 2018). The basin's subsistence fisheries exhibit some of Alaska's highest participation rates, and subsistence fishing for Chinook salmon in the Kuskokwim basin Is among the most highly utilized in the state (</w:t>
+          <w:t xml:space="preserve"> et al., </w:t>
+        </w:r>
+        <w:r>
+          <w:rPr>
+            <w:rFonts w:ascii="Garamond" w:hAnsi="Garamond"/>
+            <w:sz w:val="22"/>
+            <w:szCs w:val="22"/>
+          </w:rPr>
+          <w:lastRenderedPageBreak/>
+          <w:t>2018). The basin's subsistence fisheries exhibit some of Alaska's highest participation rates, and subsistence fishing for Chinook salmon in the Kuskokwim basin Is among the most highly utilized in the state (</w:t>
         </w:r>
         <w:proofErr w:type="spellStart"/>
         <w:r>
@@ -1710,7 +2136,6 @@
         </w:rPr>
         <w:t xml:space="preserve">. However, little data exist which quantifies the spatiotemporal patterns among stocks. The impact of front-end closure strategies on individual stock components is not well understood, and a more complete understanding of stock contribution to the overall run both within and among years is currently not readily available. </w:t>
       </w:r>
-      <w:proofErr w:type="gramStart"/>
       <w:r>
         <w:rPr>
           <w:rFonts w:ascii="Garamond" w:hAnsi="Garamond"/>
@@ -1725,16 +2150,7 @@
           <w:sz w:val="22"/>
           <w:szCs w:val="22"/>
         </w:rPr>
-        <w:t>hese</w:t>
-      </w:r>
-      <w:proofErr w:type="gramEnd"/>
-      <w:r>
-        <w:rPr>
-          <w:rFonts w:ascii="Garamond" w:hAnsi="Garamond"/>
-          <w:sz w:val="22"/>
-          <w:szCs w:val="22"/>
-        </w:rPr>
-        <w:t xml:space="preserve"> data may be important to assessing the impact of current management strategies and designing new strategies which maintain stock health across all components of the watershed and maintain a reliable resource for communities and industry in the region. </w:t>
+        <w:t xml:space="preserve">hese data may be important to assessing the impact of current management strategies and designing new strategies which maintain stock health across all components of the watershed and maintain a reliable resource for communities and industry in the region. </w:t>
       </w:r>
     </w:p>
     <w:p>
@@ -1753,7 +2169,6 @@
           <w:sz w:val="22"/>
           <w:szCs w:val="22"/>
         </w:rPr>
-        <w:lastRenderedPageBreak/>
         <w:t>Here, we apply otolit</w:t>
       </w:r>
       <w:r>
@@ -1890,6 +2305,7 @@
           <w:sz w:val="32"/>
           <w:szCs w:val="32"/>
         </w:rPr>
+        <w:lastRenderedPageBreak/>
         <w:t xml:space="preserve">Methods: </w:t>
       </w:r>
     </w:p>
@@ -2465,7 +2881,6 @@
           <w:szCs w:val="22"/>
           <w14:ligatures w14:val="none"/>
         </w:rPr>
-        <w:lastRenderedPageBreak/>
         <w:fldChar w:fldCharType="begin"/>
       </w:r>
       <w:r>
@@ -2792,6 +3207,7 @@
           <w:szCs w:val="22"/>
           <w14:ligatures w14:val="none"/>
         </w:rPr>
+        <w:lastRenderedPageBreak/>
         <w:t>We used an</w:t>
       </w:r>
       <w:r>
@@ -3935,7 +4351,6 @@
           <w:sz w:val="22"/>
           <w:szCs w:val="22"/>
         </w:rPr>
-        <w:lastRenderedPageBreak/>
         <w:t xml:space="preserve">Posterior probability values for each tributary (j) were then calculated using Bayes theorem </w:t>
       </w:r>
       <w:r>
@@ -4379,7 +4794,16 @@
           <w:sz w:val="22"/>
           <w:szCs w:val="22"/>
         </w:rPr>
-        <w:t>). The probability of the isotope ratio (</w:t>
+        <w:t xml:space="preserve">). The probability </w:t>
+      </w:r>
+      <w:r>
+        <w:rPr>
+          <w:rFonts w:ascii="Garamond" w:hAnsi="Garamond" w:cstheme="majorHAnsi"/>
+          <w:sz w:val="22"/>
+          <w:szCs w:val="22"/>
+        </w:rPr>
+        <w:lastRenderedPageBreak/>
+        <w:t>of the isotope ratio (</w:t>
       </w:r>
       <w:proofErr w:type="spellStart"/>
       <w:r>
@@ -5050,33 +5474,14 @@
           <w:sz w:val="22"/>
           <w:szCs w:val="22"/>
         </w:rPr>
-        <w:t xml:space="preserve"> To focus analysis on only highly likely locations, the top 30% of posterior values were retained whereas all other values were assigned a value of 0 for </w:t>
-      </w:r>
-      <w:proofErr w:type="gramStart"/>
-      <w:r>
-        <w:rPr>
-          <w:rFonts w:ascii="Garamond" w:hAnsi="Garamond"/>
-          <w:sz w:val="22"/>
-          <w:szCs w:val="22"/>
-        </w:rPr>
-        <w:t>each individual</w:t>
-      </w:r>
-      <w:proofErr w:type="gramEnd"/>
-      <w:r>
-        <w:rPr>
-          <w:rFonts w:ascii="Garamond" w:hAnsi="Garamond"/>
-          <w:sz w:val="22"/>
-          <w:szCs w:val="22"/>
-        </w:rPr>
-        <w:t xml:space="preserve"> before summing. Natal origin estimates were produced for </w:t>
-      </w:r>
-      <w:r>
-        <w:rPr>
-          <w:rFonts w:ascii="Garamond" w:hAnsi="Garamond"/>
-          <w:sz w:val="22"/>
-          <w:szCs w:val="22"/>
-        </w:rPr>
-        <w:lastRenderedPageBreak/>
+        <w:t xml:space="preserve"> To focus analysis on only highly likely locations, the top 30% of posterior values were retained whereas all other values were assigned a value of 0 for each individual before summing. Natal origin estimates were produced for </w:t>
+      </w:r>
+      <w:r>
+        <w:rPr>
+          <w:rFonts w:ascii="Garamond" w:hAnsi="Garamond"/>
+          <w:sz w:val="22"/>
+          <w:szCs w:val="22"/>
+        </w:rPr>
         <w:t xml:space="preserve">predefined temporal quartiles </w:t>
       </w:r>
       <w:r>
@@ -5191,16 +5596,7 @@
           <w:sz w:val="22"/>
           <w:szCs w:val="22"/>
         </w:rPr>
-        <w:t xml:space="preserve">Estimates were also produced for the full duration of the </w:t>
-      </w:r>
-      <w:proofErr w:type="gramStart"/>
-      <w:r>
-        <w:rPr>
-          <w:rFonts w:ascii="Garamond" w:hAnsi="Garamond"/>
-          <w:sz w:val="22"/>
-          <w:szCs w:val="22"/>
-        </w:rPr>
-        <w:t xml:space="preserve">run </w:t>
+        <w:t xml:space="preserve">Estimates were also produced for the full duration of the run </w:t>
       </w:r>
       <w:r>
         <w:rPr>
@@ -5210,7 +5606,6 @@
         </w:rPr>
         <w:t>in</w:t>
       </w:r>
-      <w:proofErr w:type="gramEnd"/>
       <w:r>
         <w:rPr>
           <w:rFonts w:ascii="Garamond" w:hAnsi="Garamond"/>
@@ -5233,7 +5628,16 @@
           <w:sz w:val="22"/>
           <w:szCs w:val="22"/>
         </w:rPr>
-        <w:t xml:space="preserve">-one management units were defined to aggregate tributary-level estimates into units relevant to current management practices (Figure 2). Management units of interest to the Alaska Department of Fish </w:t>
+        <w:t xml:space="preserve">-one management units were defined to aggregate tributary-level estimates into units relevant to current management practices (Figure 2). Management units of interest </w:t>
+      </w:r>
+      <w:r>
+        <w:rPr>
+          <w:rFonts w:ascii="Garamond" w:hAnsi="Garamond"/>
+          <w:sz w:val="22"/>
+          <w:szCs w:val="22"/>
+        </w:rPr>
+        <w:lastRenderedPageBreak/>
+        <w:t xml:space="preserve">to the Alaska Department of Fish </w:t>
       </w:r>
       <w:r>
         <w:rPr>
@@ -5291,25 +5695,7 @@
           <w:sz w:val="22"/>
           <w:szCs w:val="22"/>
         </w:rPr>
-        <w:t xml:space="preserve">with all upstream segments from the most downstream point of each tributary assigned to common management identifiers. </w:t>
-      </w:r>
-      <w:proofErr w:type="gramStart"/>
-      <w:r>
-        <w:rPr>
-          <w:rFonts w:ascii="Garamond" w:hAnsi="Garamond"/>
-          <w:sz w:val="22"/>
-          <w:szCs w:val="22"/>
-        </w:rPr>
-        <w:t>Remaining</w:t>
-      </w:r>
-      <w:proofErr w:type="gramEnd"/>
-      <w:r>
-        <w:rPr>
-          <w:rFonts w:ascii="Garamond" w:hAnsi="Garamond"/>
-          <w:sz w:val="22"/>
-          <w:szCs w:val="22"/>
-        </w:rPr>
-        <w:t xml:space="preserve"> basin areas were manually grouped into units of comparable size to ensure complete basin coverage</w:t>
+        <w:t>with all upstream segments from the most downstream point of each tributary assigned to common management identifiers. Remaining basin areas were manually grouped into units of comparable size to ensure complete basin coverage</w:t>
       </w:r>
       <w:r>
         <w:rPr>
@@ -5464,25 +5850,7 @@
           <w:sz w:val="22"/>
           <w:szCs w:val="22"/>
         </w:rPr>
-        <w:t xml:space="preserve">estimates of the returns at the tributary scale were aggregated into management units and compared against the full-season total for that stock. The resulting data represent the proportion of the total contribution of each stock present at each </w:t>
-      </w:r>
-      <w:proofErr w:type="gramStart"/>
-      <w:r>
-        <w:rPr>
-          <w:rFonts w:ascii="Garamond" w:hAnsi="Garamond"/>
-          <w:sz w:val="22"/>
-          <w:szCs w:val="22"/>
-        </w:rPr>
-        <w:t>3 day</w:t>
-      </w:r>
-      <w:proofErr w:type="gramEnd"/>
-      <w:r>
-        <w:rPr>
-          <w:rFonts w:ascii="Garamond" w:hAnsi="Garamond"/>
-          <w:sz w:val="22"/>
-          <w:szCs w:val="22"/>
-        </w:rPr>
-        <w:t xml:space="preserve"> interval in the run. </w:t>
+        <w:t xml:space="preserve">estimates of the returns at the tributary scale were aggregated into management units and compared against the full-season total for that stock. The resulting data represent the proportion of the total contribution of each stock present at each 3 day interval in the run. </w:t>
       </w:r>
       <w:r>
         <w:rPr>
@@ -5498,25 +5866,7 @@
           <w:sz w:val="22"/>
           <w:szCs w:val="22"/>
         </w:rPr>
-        <w:t xml:space="preserve">relative protection afforded to stocks by a </w:t>
-      </w:r>
-      <w:proofErr w:type="gramStart"/>
-      <w:r>
-        <w:rPr>
-          <w:rFonts w:ascii="Garamond" w:hAnsi="Garamond"/>
-          <w:sz w:val="22"/>
-          <w:szCs w:val="22"/>
-        </w:rPr>
-        <w:t>front end</w:t>
-      </w:r>
-      <w:proofErr w:type="gramEnd"/>
-      <w:r>
-        <w:rPr>
-          <w:rFonts w:ascii="Garamond" w:hAnsi="Garamond"/>
-          <w:sz w:val="22"/>
-          <w:szCs w:val="22"/>
-        </w:rPr>
-        <w:t xml:space="preserve"> closure ending on June 11</w:t>
+        <w:t>relative protection afforded to stocks by a front end closure ending on June 11</w:t>
       </w:r>
       <w:r>
         <w:rPr>
@@ -5639,7 +5989,6 @@
           <w:sz w:val="36"/>
           <w:szCs w:val="36"/>
         </w:rPr>
-        <w:lastRenderedPageBreak/>
         <w:t>Results</w:t>
       </w:r>
     </w:p>
@@ -5837,6 +6186,7 @@
           <w:sz w:val="22"/>
           <w:szCs w:val="22"/>
         </w:rPr>
+        <w:lastRenderedPageBreak/>
         <w:t xml:space="preserve">median 12.8%, range 4.6 – 16.1%), Swift River (median: 11.6%, range 5.7-14.4%), Stony River (median: 10.5%, range 9.6-12.4%), and Upper Kuskokwim Main (median: 8.9%, range 5.5-10.8%). Notably, the uppermost stocks (North, East, and South Fork Kuskokwim) consistently contributed very little (&lt; 2.5%) and the </w:t>
       </w:r>
       <w:proofErr w:type="spellStart"/>
@@ -5873,33 +6223,15 @@
           <w:sz w:val="22"/>
           <w:szCs w:val="22"/>
         </w:rPr>
-        <w:t xml:space="preserve"> stocks each contributed only modestly (median 3% and 5% respectively) despite their position near the top of the watershed. The second quartile </w:t>
-      </w:r>
-      <w:proofErr w:type="gramStart"/>
-      <w:r>
-        <w:rPr>
-          <w:rFonts w:ascii="Garamond" w:hAnsi="Garamond"/>
-          <w:sz w:val="22"/>
-          <w:szCs w:val="22"/>
-        </w:rPr>
-        <w:t xml:space="preserve">( </w:t>
-      </w:r>
-      <w:r>
-        <w:rPr>
-          <w:rFonts w:ascii="Garamond" w:hAnsi="Garamond"/>
-          <w:sz w:val="22"/>
-          <w:szCs w:val="22"/>
-        </w:rPr>
-        <w:t>June</w:t>
-      </w:r>
-      <w:proofErr w:type="gramEnd"/>
-      <w:r>
-        <w:rPr>
-          <w:rFonts w:ascii="Garamond" w:hAnsi="Garamond"/>
-          <w:sz w:val="22"/>
-          <w:szCs w:val="22"/>
-        </w:rPr>
-        <w:t xml:space="preserve"> 12</w:t>
+        <w:t xml:space="preserve"> stocks each contributed only modestly (median 3% and 5% respectively) despite their position near the top of the watershed. The second quartile ( </w:t>
+      </w:r>
+      <w:r>
+        <w:rPr>
+          <w:rFonts w:ascii="Garamond" w:hAnsi="Garamond"/>
+          <w:sz w:val="22"/>
+          <w:szCs w:val="22"/>
+        </w:rPr>
+        <w:t>June 12</w:t>
       </w:r>
       <w:r>
         <w:rPr>
@@ -6056,25 +6388,7 @@
           <w:sz w:val="22"/>
           <w:szCs w:val="22"/>
         </w:rPr>
-        <w:t>-July1st</w:t>
-      </w:r>
-      <w:proofErr w:type="gramStart"/>
-      <w:r>
-        <w:rPr>
-          <w:rFonts w:ascii="Garamond" w:hAnsi="Garamond"/>
-          <w:sz w:val="22"/>
-          <w:szCs w:val="22"/>
-        </w:rPr>
-        <w:t>) ,</w:t>
-      </w:r>
-      <w:proofErr w:type="gramEnd"/>
-      <w:r>
-        <w:rPr>
-          <w:rFonts w:ascii="Garamond" w:hAnsi="Garamond"/>
-          <w:sz w:val="22"/>
-          <w:szCs w:val="22"/>
-        </w:rPr>
-        <w:t xml:space="preserve"> but with increased contribution from the </w:t>
+        <w:t xml:space="preserve">-July1st) , but with increased contribution from the </w:t>
       </w:r>
       <w:proofErr w:type="spellStart"/>
       <w:r>
@@ -6275,33 +6589,15 @@
           <w:sz w:val="22"/>
           <w:szCs w:val="22"/>
         </w:rPr>
-        <w:t xml:space="preserve"> (median; 6.1%</w:t>
-      </w:r>
-      <w:proofErr w:type="gramStart"/>
-      <w:r>
-        <w:rPr>
-          <w:rFonts w:ascii="Garamond" w:hAnsi="Garamond"/>
-          <w:sz w:val="22"/>
-          <w:szCs w:val="22"/>
-        </w:rPr>
-        <w:t xml:space="preserve">) </w:t>
-      </w:r>
-      <w:r>
-        <w:rPr>
-          <w:rFonts w:ascii="Garamond" w:hAnsi="Garamond"/>
-          <w:sz w:val="22"/>
-          <w:szCs w:val="22"/>
-        </w:rPr>
-        <w:t>,</w:t>
-      </w:r>
-      <w:proofErr w:type="gramEnd"/>
-      <w:r>
-        <w:rPr>
-          <w:rFonts w:ascii="Garamond" w:hAnsi="Garamond"/>
-          <w:sz w:val="22"/>
-          <w:szCs w:val="22"/>
-        </w:rPr>
-        <w:t xml:space="preserve"> </w:t>
+        <w:t xml:space="preserve"> (median; 6.1%) </w:t>
+      </w:r>
+      <w:r>
+        <w:rPr>
+          <w:rFonts w:ascii="Garamond" w:hAnsi="Garamond"/>
+          <w:sz w:val="22"/>
+          <w:szCs w:val="22"/>
+        </w:rPr>
+        <w:t xml:space="preserve">, </w:t>
       </w:r>
       <w:proofErr w:type="spellStart"/>
       <w:r>
@@ -6335,33 +6631,15 @@
           <w:sz w:val="22"/>
           <w:szCs w:val="22"/>
         </w:rPr>
-        <w:t xml:space="preserve"> (median 6.7</w:t>
-      </w:r>
-      <w:proofErr w:type="gramStart"/>
-      <w:r>
-        <w:rPr>
-          <w:rFonts w:ascii="Garamond" w:hAnsi="Garamond"/>
-          <w:sz w:val="22"/>
-          <w:szCs w:val="22"/>
-        </w:rPr>
-        <w:t xml:space="preserve">%) </w:t>
-      </w:r>
-      <w:r>
-        <w:rPr>
-          <w:rFonts w:ascii="Garamond" w:hAnsi="Garamond"/>
-          <w:sz w:val="22"/>
-          <w:szCs w:val="22"/>
-        </w:rPr>
-        <w:t xml:space="preserve"> all</w:t>
-      </w:r>
-      <w:proofErr w:type="gramEnd"/>
-      <w:r>
-        <w:rPr>
-          <w:rFonts w:ascii="Garamond" w:hAnsi="Garamond"/>
-          <w:sz w:val="22"/>
-          <w:szCs w:val="22"/>
-        </w:rPr>
-        <w:t xml:space="preserve"> reached their peak contribution during this period, consistent with late returns for stocks in the lower portion of the watershed. </w:t>
+        <w:t xml:space="preserve"> (median 6.7%) </w:t>
+      </w:r>
+      <w:r>
+        <w:rPr>
+          <w:rFonts w:ascii="Garamond" w:hAnsi="Garamond"/>
+          <w:sz w:val="22"/>
+          <w:szCs w:val="22"/>
+        </w:rPr>
+        <w:t xml:space="preserve"> all reached their peak contribution during this period, consistent with late returns for stocks in the lower portion of the watershed. </w:t>
       </w:r>
     </w:p>
     <w:p>
@@ -6381,127 +6659,115 @@
           <w:sz w:val="22"/>
           <w:szCs w:val="22"/>
         </w:rPr>
+        <w:t xml:space="preserve">Cumulative distribution plots </w:t>
+      </w:r>
+      <w:r>
+        <w:rPr>
+          <w:rFonts w:ascii="Garamond" w:hAnsi="Garamond"/>
+          <w:sz w:val="22"/>
+          <w:szCs w:val="22"/>
+        </w:rPr>
+        <w:t xml:space="preserve">(Figure 4) </w:t>
+      </w:r>
+      <w:r>
+        <w:rPr>
+          <w:rFonts w:ascii="Garamond" w:hAnsi="Garamond"/>
+          <w:sz w:val="22"/>
+          <w:szCs w:val="22"/>
+        </w:rPr>
+        <w:t>corroborated the a</w:t>
+      </w:r>
+      <w:r>
+        <w:rPr>
+          <w:rFonts w:ascii="Garamond" w:hAnsi="Garamond"/>
+          <w:sz w:val="22"/>
+          <w:szCs w:val="22"/>
+        </w:rPr>
+        <w:t xml:space="preserve">bove </w:t>
+      </w:r>
+      <w:r>
+        <w:rPr>
+          <w:rFonts w:ascii="Garamond" w:hAnsi="Garamond"/>
+          <w:sz w:val="22"/>
+          <w:szCs w:val="22"/>
+        </w:rPr>
+        <w:t>patterns but</w:t>
+      </w:r>
+      <w:r>
+        <w:rPr>
+          <w:rFonts w:ascii="Garamond" w:hAnsi="Garamond"/>
+          <w:sz w:val="22"/>
+          <w:szCs w:val="22"/>
+        </w:rPr>
+        <w:t xml:space="preserve"> illustrated </w:t>
+      </w:r>
+      <w:r>
+        <w:rPr>
+          <w:rFonts w:ascii="Garamond" w:hAnsi="Garamond"/>
+          <w:sz w:val="22"/>
+          <w:szCs w:val="22"/>
+        </w:rPr>
+        <w:t xml:space="preserve">variation in run timing among stocks at a finer </w:t>
+      </w:r>
+      <w:r>
+        <w:rPr>
+          <w:rFonts w:ascii="Garamond" w:hAnsi="Garamond"/>
+          <w:sz w:val="22"/>
+          <w:szCs w:val="22"/>
+        </w:rPr>
+        <w:t xml:space="preserve">temporal scale and independent of the total contribution of each stock to the overall run. </w:t>
+      </w:r>
+      <w:r>
+        <w:rPr>
+          <w:rFonts w:ascii="Garamond" w:hAnsi="Garamond"/>
+          <w:sz w:val="22"/>
+          <w:szCs w:val="22"/>
+          <w:highlight w:val="yellow"/>
+        </w:rPr>
+        <w:t>The results display a clear pattern of earliest returning stocks (closer to red) arriving earlier in the season, with 50% of the run for stocks such as the East Fork Kuskokwim and Big River arriving within X days of the start of the run.</w:t>
+      </w:r>
+      <w:r>
+        <w:rPr>
+          <w:rFonts w:ascii="Garamond" w:hAnsi="Garamond"/>
+          <w:sz w:val="22"/>
+          <w:szCs w:val="22"/>
+        </w:rPr>
+        <w:t xml:space="preserve"> In contrast, lower Kuskokwim stocks arrive later in the season, with stocks such as the </w:t>
+      </w:r>
+      <w:proofErr w:type="spellStart"/>
+      <w:r>
+        <w:rPr>
+          <w:rFonts w:ascii="Garamond" w:hAnsi="Garamond"/>
+          <w:sz w:val="22"/>
+          <w:szCs w:val="22"/>
+        </w:rPr>
+        <w:t>Hoholitna</w:t>
+      </w:r>
+      <w:proofErr w:type="spellEnd"/>
+      <w:r>
+        <w:rPr>
+          <w:rFonts w:ascii="Garamond" w:hAnsi="Garamond"/>
+          <w:sz w:val="22"/>
+          <w:szCs w:val="22"/>
+        </w:rPr>
+        <w:t xml:space="preserve"> and Aniak river reaching 50% of their total run nearly X days from the start of the season. </w:t>
+      </w:r>
+      <w:r>
+        <w:rPr>
+          <w:rFonts w:ascii="Garamond" w:hAnsi="Garamond"/>
+          <w:sz w:val="22"/>
+          <w:szCs w:val="22"/>
+        </w:rPr>
+        <w:t xml:space="preserve">Some variability in this pattern does exist. In 2020, for example, a few of the middle Kuskokwim stocks </w:t>
+      </w:r>
+      <w:r>
+        <w:rPr>
+          <w:rFonts w:ascii="Garamond" w:hAnsi="Garamond"/>
+          <w:sz w:val="22"/>
+          <w:szCs w:val="22"/>
+        </w:rPr>
         <w:lastRenderedPageBreak/>
-        <w:t xml:space="preserve">Cumulative distribution plots </w:t>
-      </w:r>
-      <w:r>
-        <w:rPr>
-          <w:rFonts w:ascii="Garamond" w:hAnsi="Garamond"/>
-          <w:sz w:val="22"/>
-          <w:szCs w:val="22"/>
-        </w:rPr>
-        <w:t xml:space="preserve">(Figure 4) </w:t>
-      </w:r>
-      <w:r>
-        <w:rPr>
-          <w:rFonts w:ascii="Garamond" w:hAnsi="Garamond"/>
-          <w:sz w:val="22"/>
-          <w:szCs w:val="22"/>
-        </w:rPr>
-        <w:t>corroborated the a</w:t>
-      </w:r>
-      <w:r>
-        <w:rPr>
-          <w:rFonts w:ascii="Garamond" w:hAnsi="Garamond"/>
-          <w:sz w:val="22"/>
-          <w:szCs w:val="22"/>
-        </w:rPr>
-        <w:t xml:space="preserve">bove </w:t>
-      </w:r>
-      <w:r>
-        <w:rPr>
-          <w:rFonts w:ascii="Garamond" w:hAnsi="Garamond"/>
-          <w:sz w:val="22"/>
-          <w:szCs w:val="22"/>
-        </w:rPr>
-        <w:t>patterns but</w:t>
-      </w:r>
-      <w:r>
-        <w:rPr>
-          <w:rFonts w:ascii="Garamond" w:hAnsi="Garamond"/>
-          <w:sz w:val="22"/>
-          <w:szCs w:val="22"/>
-        </w:rPr>
-        <w:t xml:space="preserve"> illustrated </w:t>
-      </w:r>
-      <w:r>
-        <w:rPr>
-          <w:rFonts w:ascii="Garamond" w:hAnsi="Garamond"/>
-          <w:sz w:val="22"/>
-          <w:szCs w:val="22"/>
-        </w:rPr>
-        <w:t xml:space="preserve">variation in run timing among stocks at a finer </w:t>
-      </w:r>
-      <w:r>
-        <w:rPr>
-          <w:rFonts w:ascii="Garamond" w:hAnsi="Garamond"/>
-          <w:sz w:val="22"/>
-          <w:szCs w:val="22"/>
-        </w:rPr>
-        <w:t xml:space="preserve">temporal scale and independent of the total contribution of each stock to the overall run. </w:t>
-      </w:r>
-      <w:r>
-        <w:rPr>
-          <w:rFonts w:ascii="Garamond" w:hAnsi="Garamond"/>
-          <w:sz w:val="22"/>
-          <w:szCs w:val="22"/>
-          <w:highlight w:val="yellow"/>
-        </w:rPr>
-        <w:t xml:space="preserve">The results display a clear pattern of </w:t>
-      </w:r>
-      <w:proofErr w:type="gramStart"/>
-      <w:r>
-        <w:rPr>
-          <w:rFonts w:ascii="Garamond" w:hAnsi="Garamond"/>
-          <w:sz w:val="22"/>
-          <w:szCs w:val="22"/>
-          <w:highlight w:val="yellow"/>
-        </w:rPr>
-        <w:t>earliest</w:t>
-      </w:r>
-      <w:proofErr w:type="gramEnd"/>
-      <w:r>
-        <w:rPr>
-          <w:rFonts w:ascii="Garamond" w:hAnsi="Garamond"/>
-          <w:sz w:val="22"/>
-          <w:szCs w:val="22"/>
-          <w:highlight w:val="yellow"/>
-        </w:rPr>
-        <w:t xml:space="preserve"> returning stocks (closer to red) arriving earlier in the season, with 50% of the run for stocks such as the East Fork Kuskokwim and Big River arriving within X days of the start of the run.</w:t>
-      </w:r>
-      <w:r>
-        <w:rPr>
-          <w:rFonts w:ascii="Garamond" w:hAnsi="Garamond"/>
-          <w:sz w:val="22"/>
-          <w:szCs w:val="22"/>
-        </w:rPr>
-        <w:t xml:space="preserve"> In contrast, lower Kuskokwim stocks arrive later in the season, with stocks such as the </w:t>
-      </w:r>
-      <w:proofErr w:type="spellStart"/>
-      <w:r>
-        <w:rPr>
-          <w:rFonts w:ascii="Garamond" w:hAnsi="Garamond"/>
-          <w:sz w:val="22"/>
-          <w:szCs w:val="22"/>
-        </w:rPr>
-        <w:t>Hoholitna</w:t>
-      </w:r>
-      <w:proofErr w:type="spellEnd"/>
-      <w:r>
-        <w:rPr>
-          <w:rFonts w:ascii="Garamond" w:hAnsi="Garamond"/>
-          <w:sz w:val="22"/>
-          <w:szCs w:val="22"/>
-        </w:rPr>
-        <w:t xml:space="preserve"> and Aniak river reaching 50% of their total run nearly X days from the start of the season. </w:t>
-      </w:r>
-      <w:r>
-        <w:rPr>
-          <w:rFonts w:ascii="Garamond" w:hAnsi="Garamond"/>
-          <w:sz w:val="22"/>
-          <w:szCs w:val="22"/>
-        </w:rPr>
-        <w:t xml:space="preserve">Some variability in this pattern does exist. In 2020, for example, a few of the middle Kuskokwim stocks (yellow or orange) appear to arrive after that of the lowest Kuskokwim stocks. However, the general downstream trajectory of returning stocks remains consistent across our dataset independent of the relative </w:t>
+        <w:t xml:space="preserve">(yellow or orange) appear to arrive after that of the lowest Kuskokwim stocks. However, the general downstream trajectory of returning stocks remains consistent across our dataset independent of the relative </w:t>
       </w:r>
       <w:r>
         <w:rPr>
@@ -6632,43 +6898,7 @@
           <w:sz w:val="22"/>
           <w:szCs w:val="22"/>
         </w:rPr>
-        <w:t xml:space="preserve">A pattern of early returning upper Kuskokwim stocks clearly affords higher protection </w:t>
-      </w:r>
-      <w:proofErr w:type="gramStart"/>
-      <w:r>
-        <w:rPr>
-          <w:rFonts w:ascii="Garamond" w:hAnsi="Garamond"/>
-          <w:sz w:val="22"/>
-          <w:szCs w:val="22"/>
-        </w:rPr>
-        <w:t>to</w:t>
-      </w:r>
-      <w:proofErr w:type="gramEnd"/>
-      <w:r>
-        <w:rPr>
-          <w:rFonts w:ascii="Garamond" w:hAnsi="Garamond"/>
-          <w:sz w:val="22"/>
-          <w:szCs w:val="22"/>
-        </w:rPr>
-        <w:t xml:space="preserve"> these stocks from a </w:t>
-      </w:r>
-      <w:proofErr w:type="gramStart"/>
-      <w:r>
-        <w:rPr>
-          <w:rFonts w:ascii="Garamond" w:hAnsi="Garamond"/>
-          <w:sz w:val="22"/>
-          <w:szCs w:val="22"/>
-        </w:rPr>
-        <w:t>front end</w:t>
-      </w:r>
-      <w:proofErr w:type="gramEnd"/>
-      <w:r>
-        <w:rPr>
-          <w:rFonts w:ascii="Garamond" w:hAnsi="Garamond"/>
-          <w:sz w:val="22"/>
-          <w:szCs w:val="22"/>
-        </w:rPr>
-        <w:t xml:space="preserve"> closure ending on June 12</w:t>
+        <w:t>A pattern of early returning upper Kuskokwim stocks clearly affords higher protection to these stocks from a front end closure ending on June 12</w:t>
       </w:r>
       <w:r>
         <w:rPr>
@@ -6763,25 +6993,7 @@
           <w:sz w:val="22"/>
           <w:szCs w:val="22"/>
         </w:rPr>
-        <w:t xml:space="preserve"> River stocks, however, contain outliers of 22.1% and 18.4%, indicating that a </w:t>
-      </w:r>
-      <w:proofErr w:type="gramStart"/>
-      <w:r>
-        <w:rPr>
-          <w:rFonts w:ascii="Garamond" w:hAnsi="Garamond"/>
-          <w:sz w:val="22"/>
-          <w:szCs w:val="22"/>
-        </w:rPr>
-        <w:t>front end</w:t>
-      </w:r>
-      <w:proofErr w:type="gramEnd"/>
-      <w:r>
-        <w:rPr>
-          <w:rFonts w:ascii="Garamond" w:hAnsi="Garamond"/>
-          <w:sz w:val="22"/>
-          <w:szCs w:val="22"/>
-        </w:rPr>
-        <w:t xml:space="preserve"> closure may afford these stocks substantial protection in some years. </w:t>
+        <w:t xml:space="preserve"> River stocks, however, contain outliers of 22.1% and 18.4%, indicating that a front end closure may afford these stocks substantial protection in some years. </w:t>
       </w:r>
     </w:p>
     <w:p>
@@ -6828,7 +7040,6 @@
           <w:szCs w:val="32"/>
           <w:u w:val="single"/>
         </w:rPr>
-        <w:lastRenderedPageBreak/>
         <w:t>Discussion</w:t>
       </w:r>
     </w:p>
@@ -6996,6 +7207,7 @@
           <w:sz w:val="22"/>
           <w:szCs w:val="22"/>
         </w:rPr>
+        <w:lastRenderedPageBreak/>
         <w:t xml:space="preserve">Absent targeted management, upper Kuskokwim stocks remain among the most vulnerable to overharvest due to the timing of their returns. Importantly, because downstream dynamics reflect the aggregate behavior of upstream metapopulations, the health of these upper-basin stocks plays a disproportionate role in supporting stability and opportunity for downstream fisheries. In addition, these stocks are critical subsistence resources for upstream communities such as </w:t>
       </w:r>
       <w:proofErr w:type="spellStart"/>
@@ -7014,25 +7226,7 @@
           <w:sz w:val="22"/>
           <w:szCs w:val="22"/>
         </w:rPr>
-        <w:t xml:space="preserve"> and McGrath. If overharvest occurs before salmon </w:t>
-      </w:r>
-      <w:proofErr w:type="gramStart"/>
-      <w:r>
-        <w:rPr>
-          <w:rFonts w:ascii="Garamond" w:hAnsi="Garamond"/>
-          <w:sz w:val="22"/>
-          <w:szCs w:val="22"/>
-        </w:rPr>
-        <w:t>reach</w:t>
-      </w:r>
-      <w:proofErr w:type="gramEnd"/>
-      <w:r>
-        <w:rPr>
-          <w:rFonts w:ascii="Garamond" w:hAnsi="Garamond"/>
-          <w:sz w:val="22"/>
-          <w:szCs w:val="22"/>
-        </w:rPr>
-        <w:t xml:space="preserve"> the upper watershed, these communities may face shortfalls in resource availability.</w:t>
+        <w:t xml:space="preserve"> and McGrath. If overharvest occurs before salmon reach the upper watershed, these communities may face shortfalls in resource availability.</w:t>
       </w:r>
     </w:p>
     <w:p>
@@ -7088,7 +7282,7 @@
           <w:sz w:val="22"/>
           <w:szCs w:val="22"/>
         </w:rPr>
-        <w:t xml:space="preserve">These results advance our understanding of Chinook salmon spatial ecology in the Kuskokwim River and contribute to broader insights into salmon dynamics in large river systems. While otolith-based chemical methods used in this study have not been explicitly validated for the Kuskokwim, they have demonstrated </w:t>
+        <w:t xml:space="preserve">These results advance our understanding of Chinook salmon spatial ecology in the Kuskokwim River and contribute to broader insights into salmon dynamics in large river systems. While otolith-based chemical methods used in this study have not been explicitly validated for the Kuskokwim, they have demonstrated high assignment accuracy in other comparable systems and species (Cite cite). The spatial patterns revealed here highlight the importance of evaluating management strategies at appropriate spatial scales to identify interactions between stock-specific ecological behavior and regulatory frameworks. Strategies aiming to maintain ecosystem-scale resource availability should account for both the health of individual stocks and the broader metapopulation complex. By explicitly incorporating the spatiotemporal dynamics of </w:t>
       </w:r>
       <w:r>
         <w:rPr>
@@ -7097,7 +7291,7 @@
           <w:szCs w:val="22"/>
         </w:rPr>
         <w:lastRenderedPageBreak/>
-        <w:t>high assignment accuracy in other comparable systems and species (Cite cite). The spatial patterns revealed here highlight the importance of evaluating management strategies at appropriate spatial scales to identify interactions between stock-specific ecological behavior and regulatory frameworks. Strategies aiming to maintain ecosystem-scale resource availability should account for both the health of individual stocks and the broader metapopulation complex. By explicitly incorporating the spatiotemporal dynamics of metapopulations, managers may be better equipped to design conservation strategies that meet human resource needs while preserving the biocomplexity essential to healthy ecosystems.</w:t>
+        <w:t>metapopulations, managers may be better equipped to design conservation strategies that meet human resource needs while preserving the biocomplexity essential to healthy ecosystems.</w:t>
       </w:r>
     </w:p>
     <w:p>

</xml_diff>

<commit_message>
worked through to Results
</commit_message>
<xml_diff>
--- a/Docs/Run_timing_manuscript.docx
+++ b/Docs/Run_timing_manuscript.docx
@@ -144,8 +144,6 @@
           <w:u w:val="single"/>
         </w:rPr>
       </w:pPr>
-      <w:commentRangeStart w:id="1"/>
-      <w:commentRangeStart w:id="2"/>
       <w:r>
         <w:rPr>
           <w:rFonts w:ascii="Garamond" w:hAnsi="Garamond"/>
@@ -155,32 +153,7 @@
           <w:szCs w:val="22"/>
           <w:u w:val="single"/>
         </w:rPr>
-        <w:t>Introduction</w:t>
-      </w:r>
-      <w:commentRangeEnd w:id="1"/>
-      <w:r>
-        <w:rPr>
-          <w:rStyle w:val="CommentReference"/>
-        </w:rPr>
-        <w:commentReference w:id="1"/>
-      </w:r>
-      <w:commentRangeEnd w:id="2"/>
-      <w:r>
-        <w:rPr>
-          <w:rStyle w:val="CommentReference"/>
-        </w:rPr>
-        <w:commentReference w:id="2"/>
-      </w:r>
-      <w:r>
-        <w:rPr>
-          <w:rFonts w:ascii="Garamond" w:hAnsi="Garamond"/>
-          <w:b/>
-          <w:bCs/>
-          <w:sz w:val="22"/>
-          <w:szCs w:val="22"/>
-          <w:u w:val="single"/>
-        </w:rPr>
-        <w:t xml:space="preserve">: </w:t>
+        <w:t xml:space="preserve">Introduction: </w:t>
       </w:r>
       <w:r>
         <w:rPr>
@@ -486,15 +459,7 @@
           <w:sz w:val="22"/>
           <w:szCs w:val="22"/>
         </w:rPr>
-        <w:t xml:space="preserve">, leading to </w:t>
-      </w:r>
-      <w:r>
-        <w:rPr>
-          <w:rFonts w:ascii="Garamond" w:hAnsi="Garamond"/>
-          <w:sz w:val="22"/>
-          <w:szCs w:val="22"/>
-        </w:rPr>
-        <w:t>restricted</w:t>
+        <w:t>, leading to restricted</w:t>
       </w:r>
       <w:r>
         <w:rPr>
@@ -1094,17 +1059,27 @@
           <w:szCs w:val="22"/>
           <w14:ligatures w14:val="none"/>
         </w:rPr>
-        <w:t xml:space="preserve">Otoliths were collected </w:t>
-      </w:r>
-      <w:r>
-        <w:rPr>
-          <w:rFonts w:ascii="Garamond" w:eastAsia="Times New Roman" w:hAnsi="Garamond" w:cs="Times New Roman"/>
-          <w:kern w:val="0"/>
-          <w:sz w:val="22"/>
-          <w:szCs w:val="22"/>
-          <w14:ligatures w14:val="none"/>
-        </w:rPr>
-        <w:t xml:space="preserve">from Chinook salmon </w:t>
+        <w:t>Chinook salmon o</w:t>
+      </w:r>
+      <w:r>
+        <w:rPr>
+          <w:rFonts w:ascii="Garamond" w:eastAsia="Times New Roman" w:hAnsi="Garamond" w:cs="Times New Roman"/>
+          <w:kern w:val="0"/>
+          <w:sz w:val="22"/>
+          <w:szCs w:val="22"/>
+          <w14:ligatures w14:val="none"/>
+        </w:rPr>
+        <w:t xml:space="preserve">toliths were </w:t>
+      </w:r>
+      <w:r>
+        <w:rPr>
+          <w:rFonts w:ascii="Garamond" w:eastAsia="Times New Roman" w:hAnsi="Garamond" w:cs="Times New Roman"/>
+          <w:kern w:val="0"/>
+          <w:sz w:val="22"/>
+          <w:szCs w:val="22"/>
+          <w14:ligatures w14:val="none"/>
+        </w:rPr>
+        <w:t xml:space="preserve">collected </w:t>
       </w:r>
       <w:r>
         <w:rPr>
@@ -1134,7 +1109,7 @@
           <w:szCs w:val="22"/>
           <w14:ligatures w14:val="none"/>
         </w:rPr>
-        <w:t xml:space="preserve">sampled in </w:t>
+        <w:t xml:space="preserve">in </w:t>
       </w:r>
       <w:r>
         <w:rPr>
@@ -1216,17 +1191,126 @@
           <w:szCs w:val="22"/>
           <w14:ligatures w14:val="none"/>
         </w:rPr>
-        <w:t xml:space="preserve">The BTF was designed to allow in-season assessment of run strength based on catch-per-unit-effort to inform management of subsistence fisheries throughout the river (Liller report). </w:t>
-      </w:r>
-      <w:r>
-        <w:rPr>
-          <w:rFonts w:ascii="Garamond" w:eastAsia="Times New Roman" w:hAnsi="Garamond" w:cs="Times New Roman"/>
-          <w:kern w:val="0"/>
-          <w:sz w:val="22"/>
-          <w:szCs w:val="22"/>
-          <w14:ligatures w14:val="none"/>
-        </w:rPr>
-        <w:t xml:space="preserve">As such, fish captured in this test fishery are expected to be a representative sample of returning stocks throughout the basin. We collected approximately 500 otoliths from each year from 2017-2022, ensuring sampling efforts over the full course of the run. From these, approximately 250 otoliths were selected for microchemical analysis in proportion to the relative catch per unit effort (CPUE) </w:t>
+        <w:t>The BTF was designed to allow in-season assessment of run strength based on catch-per-unit-effort to inform management of subsistence fisheries throughout the river</w:t>
+      </w:r>
+      <w:r>
+        <w:rPr>
+          <w:rFonts w:ascii="Garamond" w:eastAsia="Times New Roman" w:hAnsi="Garamond" w:cs="Times New Roman"/>
+          <w:kern w:val="0"/>
+          <w:sz w:val="22"/>
+          <w:szCs w:val="22"/>
+          <w14:ligatures w14:val="none"/>
+        </w:rPr>
+        <w:t xml:space="preserve"> and fish caught in this fishery are expected to be a representative sample of returning stocks </w:t>
+      </w:r>
+      <w:commentRangeStart w:id="1"/>
+      <w:r>
+        <w:rPr>
+          <w:rFonts w:ascii="Garamond" w:eastAsia="Times New Roman" w:hAnsi="Garamond" w:cs="Times New Roman"/>
+          <w:kern w:val="0"/>
+          <w:sz w:val="22"/>
+          <w:szCs w:val="22"/>
+          <w14:ligatures w14:val="none"/>
+        </w:rPr>
+        <w:t>throughout the basin</w:t>
+      </w:r>
+      <w:r>
+        <w:rPr>
+          <w:rFonts w:ascii="Garamond" w:eastAsia="Times New Roman" w:hAnsi="Garamond" w:cs="Times New Roman"/>
+          <w:kern w:val="0"/>
+          <w:sz w:val="22"/>
+          <w:szCs w:val="22"/>
+          <w14:ligatures w14:val="none"/>
+        </w:rPr>
+        <w:t xml:space="preserve"> </w:t>
+      </w:r>
+      <w:commentRangeEnd w:id="1"/>
+      <w:r>
+        <w:rPr>
+          <w:rStyle w:val="CommentReference"/>
+        </w:rPr>
+        <w:commentReference w:id="1"/>
+      </w:r>
+      <w:r>
+        <w:rPr>
+          <w:rFonts w:ascii="Garamond" w:eastAsia="Times New Roman" w:hAnsi="Garamond" w:cs="Times New Roman"/>
+          <w:kern w:val="0"/>
+          <w:sz w:val="22"/>
+          <w:szCs w:val="22"/>
+          <w14:ligatures w14:val="none"/>
+        </w:rPr>
+        <w:fldChar w:fldCharType="begin"/>
+      </w:r>
+      <w:r>
+        <w:rPr>
+          <w:rFonts w:ascii="Garamond" w:eastAsia="Times New Roman" w:hAnsi="Garamond" w:cs="Times New Roman"/>
+          <w:kern w:val="0"/>
+          <w:sz w:val="22"/>
+          <w:szCs w:val="22"/>
+          <w14:ligatures w14:val="none"/>
+        </w:rPr>
+        <w:instrText xml:space="preserve"> ADDIN ZOTERO_ITEM CSL_CITATION {"citationID":"oT8qdcVg","properties":{"formattedCitation":"(Lipka &amp; Elison, 2015)","plainCitation":"(Lipka &amp; Elison, 2015)","noteIndex":0},"citationItems":[{"id":5567,"uris":["http://zotero.org/users/8421274/items/PMPCYQ6E"],"itemData":{"id":5567,"type":"report","abstract":"OBJECTIVES................................................................................................................................................................ 3 Tasks .............................................................................................................................................................................. 4\nMETHODS .................................................................................................................................................................... 4 Field Operations ............................................................................................................................................................ 4 Test Fishing Index .........................................................................................................................................................5 Age, Sex and Length Composition ................................................................................................................................6 Climatological and Stream Observations ......................................................................................................................7\nRESULTS ...................................................................................................................................................................... 7 Operations...................................................................................................................................................................... 7 Abundance Indices and Run Timing .............................................................................................................................8 Chinook Salmon .......................................................................................................................................................8 Sockeye Salmon........................................................................................................................................................8 Chum Salmon ...........................................................................................................................................................9 Coho Salmon ............................................................................................................................................................9 Climatological and Stream Observations .................................................................................................................... 10 DISCUSSION.............................................................................................................................................................. 10 Abundance Index ......................................................................................................................................................... 10 Chinook Salmon ..................................................................................................................................................... 10 Sockeye Salmon...................................................................................................................................................... 11 Chum Salmon ......................................................................................................................................................... 11 Coho Salmon .......................................................................................................................................................... 11\nCONCLUSION ........................................................................................................................................................... 11 ACKNOWLEDGEMENTS......................................................................................................................................... 12 REFERENCES CITED ............................................................................................................................................... 13 TABLES AND FIGURES ........................................................................................................................................... 15 APPENDIX A: BETHEL TEST FISHERY DRIFT SCHEDUALE ........................................................................... 37 APPENDIX B: HISTORICAL CHINOOK SALMON DATA ................................................................................... 39 APPENDIX C: HISTORICAL SOCKEYE SALMON DATA ................................................................................... 43 APPENDIX D: HISTORICAL CHUM SALMON DATA ......................................................................................... 51 APPENDIX E: HISTORICAL COHO SALMON DATA .......................................................................................... 57 APPENDIX F: HISTORICAL CLIMATOLOGICAL DATA .................................................................................... 63","collection-title":"Fishery Data Series No. 16-06 Anchorage","language":"en","publisher":"Alaska Department of Fish and Game","source":"Zotero","title":"Characterization of the 2012 and 2013 salmon runs in the Kuskokwim River based on the test fishery at Bethel.","author":[{"family":"Lipka","given":"C"},{"family":"Elison","given":"T"}],"issued":{"date-parts":[["2015"]]}}}],"schema":"https://github.com/citation-style-language/schema/raw/master/csl-citation.json"} </w:instrText>
+      </w:r>
+      <w:r>
+        <w:rPr>
+          <w:rFonts w:ascii="Garamond" w:eastAsia="Times New Roman" w:hAnsi="Garamond" w:cs="Times New Roman"/>
+          <w:kern w:val="0"/>
+          <w:sz w:val="22"/>
+          <w:szCs w:val="22"/>
+          <w14:ligatures w14:val="none"/>
+        </w:rPr>
+        <w:fldChar w:fldCharType="separate"/>
+      </w:r>
+      <w:r>
+        <w:rPr>
+          <w:rFonts w:ascii="Garamond" w:eastAsia="Times New Roman" w:hAnsi="Garamond" w:cs="Times New Roman"/>
+          <w:noProof/>
+          <w:kern w:val="0"/>
+          <w:sz w:val="22"/>
+          <w:szCs w:val="22"/>
+          <w14:ligatures w14:val="none"/>
+        </w:rPr>
+        <w:t>(Lipka &amp; Elison, 2015)</w:t>
+      </w:r>
+      <w:r>
+        <w:rPr>
+          <w:rFonts w:ascii="Garamond" w:eastAsia="Times New Roman" w:hAnsi="Garamond" w:cs="Times New Roman"/>
+          <w:kern w:val="0"/>
+          <w:sz w:val="22"/>
+          <w:szCs w:val="22"/>
+          <w14:ligatures w14:val="none"/>
+        </w:rPr>
+        <w:fldChar w:fldCharType="end"/>
+      </w:r>
+      <w:r>
+        <w:rPr>
+          <w:rFonts w:ascii="Garamond" w:eastAsia="Times New Roman" w:hAnsi="Garamond" w:cs="Times New Roman"/>
+          <w:kern w:val="0"/>
+          <w:sz w:val="22"/>
+          <w:szCs w:val="22"/>
+          <w14:ligatures w14:val="none"/>
+        </w:rPr>
+        <w:t>.</w:t>
+      </w:r>
+      <w:r>
+        <w:rPr>
+          <w:rFonts w:ascii="Garamond" w:eastAsia="Times New Roman" w:hAnsi="Garamond" w:cs="Times New Roman"/>
+          <w:kern w:val="0"/>
+          <w:sz w:val="22"/>
+          <w:szCs w:val="22"/>
+          <w14:ligatures w14:val="none"/>
+        </w:rPr>
+        <w:t xml:space="preserve"> </w:t>
+      </w:r>
+      <w:r>
+        <w:rPr>
+          <w:rFonts w:ascii="Garamond" w:eastAsia="Times New Roman" w:hAnsi="Garamond" w:cs="Times New Roman"/>
+          <w:kern w:val="0"/>
+          <w:sz w:val="22"/>
+          <w:szCs w:val="22"/>
+          <w14:ligatures w14:val="none"/>
+        </w:rPr>
+        <w:t xml:space="preserve">We collected approximately 500 otoliths from each year from 2017-2022, ensuring sampling efforts over the full course of the run. From these, approximately 250 otoliths were selected for microchemical analysis in proportion to the relative catch per unit effort (CPUE) </w:t>
       </w:r>
       <w:r>
         <w:rPr>
@@ -1611,7 +1695,283 @@
           <w:szCs w:val="22"/>
           <w14:ligatures w14:val="none"/>
         </w:rPr>
+        <w:fldChar w:fldCharType="begin"/>
+      </w:r>
+      <w:r>
+        <w:rPr>
+          <w:rFonts w:ascii="Garamond" w:eastAsia="Times New Roman" w:hAnsi="Garamond" w:cs="Times New Roman"/>
+          <w:kern w:val="0"/>
+          <w:sz w:val="22"/>
+          <w:szCs w:val="22"/>
+          <w14:ligatures w14:val="none"/>
+        </w:rPr>
+        <w:instrText xml:space="preserve"> ADDIN ZOTERO_ITEM CSL_CITATION {"citationID":"drNJXJRw","properties":{"formattedCitation":"(Brennan et al., 2015; Campana, 1999; Capo et al., 1998)","plainCitation":"(Brennan et al., 2015; Campana, 1999; Capo et al., 1998)","noteIndex":0},"citationItems":[{"id":"h4h2qxOD/ChWvHkvk","uris":["http://zotero.org/users/8421274/items/IY3FLHLM"],"itemData":{"id":"dI01jIsp/qEdWN4pU","type":"article-journal","abstract":"Strontium isotopes simultaneously delineate fine-scale natal habitats and migrations of Pacific salmon harvested during a coastal commercial fishery., Highly migratory organisms present major challenges to conservation efforts. This is especially true for exploited anadromous fish species, which exhibit long-range dispersals from natal sites, complex population structures, and extensive mixing of distinct populations during exploitation. By tracing the migratory histories of individual Chinook salmon caught in fisheries using strontium isotopes, we determined the relative production of natal habitats at fine spatial scales and different life histories. Although strontium isotopes have been widely used in provenance research, we present a new robust framework to simultaneously assess natal sources and migrations of individuals within fishery harvests through time. Our results pave the way for investigating how fine-scale habitat production and life histories of salmon respond to perturbations—providing crucial insights for conservation.","container-title":"Science Advances","DOI":"10.1126/sciadv.1400124","ISSN":"2375-2548","issue":"4","journalAbbreviation":"Sci Adv","note":"PMID: 26601173\nPMCID: PMC4640640","page":"e1400124","source":"PubMed Central","title":"Strontium isotopes delineate fine-scale natal origins and migration histories of Pacific salmon","volume":"1","author":[{"family":"Brennan","given":"Sean R."},{"family":"Zimmerman","given":"Christian E."},{"family":"Fernandez","given":"Diego P."},{"family":"Cerling","given":"Thure E."},{"family":"McPhee","given":"Megan V."},{"family":"Wooller","given":"Matthew J."}],"issued":{"date-parts":[["2015",5,15]]}}},{"id":1441,"uris":["http://zotero.org/users/8421274/items/PHNAKZ8D"],"itemData":{"id":1441,"type":"article-journal","abstract":"The fish otolith (earstone) has long been known as a timekeeper, but interest in its use as a metabolically inert environmental recorder has accelerated in recent years. In part due to technological advances, applications such as stock identification, determination of rnigralon pathways, reconstruction of temperature and salinity history, age validation, detection of anadromy, use as a natural tag and chemical mass marking have been developed, some of which are difficult or impossible to implement using alternative techniques. Microsamphg and the latest advances in beam-based probes allow many elemental assays to be coupled with daily or annual growth increments, thus providing a detailed chronologcal record of the environment. However, few workers have critically assessed the assumptions upon which the environmental reconstructions are based, or considered the possibility that elemental incorporation into the otolith may proceed differently than that into other calcified structures. This paper reviews current applications and their assumptions and suggests future directions. Particular attention is given to the premises that the elemental and isotopic composition of the otolith reflects that of the environment, and the effect of physiological filters on the resulting composition. The roles of temperature, elemental uptake into the fish and the process of otolith crystahzation are also assessed. Drawing upon recent advances in geochemistry and paleoclirnate research as points of contrast, it appears that not all applications of otolith chemistry are firmly based, although others are destined to become powerful and perhaps routine tools for the mainstream fish biologst.","container-title":"Marine Ecology Progress Series","DOI":"10.3354/meps188263","ISSN":"0171-8630, 1616-1599","journalAbbreviation":"Mar. Ecol. Prog. Ser.","language":"en","page":"263-297","source":"DOI.org (Crossref)","title":"Chemistry and composition of fish otoliths:pathways, mechanisms and applications","title-short":"Chemistry and composition of fish otoliths","volume":"188","author":[{"family":"Campana","given":"Se"}],"issued":{"date-parts":[["1999"]]}}},{"id":1457,"uris":["http://zotero.org/users/8421274/items/TDIQBP7K"],"itemData":{"id":1457,"type":"article-journal","abstract":"The strontium (Sr) isotope method can be a powerful tool in studies of chemical weathering and soil genesis, cation provenance and mobility, and the chronostratigraphic correlation of marine sediments. It is a sensitive geochemical tracer, applicable to large-scale ecosystem studies as well as to centimeter-scaled examination of cation mobility within a soil profile. The 87Sr/86Sr ratios of natural materials reflect the sources of strontium available during their formation. Isotopically distinct inputs from precipitation, dryfall, soil parent material, and surface or groundwater allow determination of the relative proportions of those materials entering or leaving an ecosystem. The isotopic compositions of labile (soil exchange complex and soil solution) strontium and Sr in vegetation reflect the sources of cations available to plants. Strontium isotopes can be used to track the biogeochemical cycling of nutrient cations such as calcium. The extent of cation contributions from in situ weathering and external additions to soil from dust and rain can also be resolved with this method. In this paper, we review the geochemistry and isotopic systematics of strontium, and discuss the use of this method as a tracer of earth surface processes.","container-title":"Geoderma","DOI":"10.1016/S0016-7061(97)00102-X","ISSN":"0016-7061","issue":"1","journalAbbreviation":"Geoderma","language":"en","page":"197-225","source":"ScienceDirect","title":"Strontium isotopes as tracers of ecosystem processes: theory and methods","title-short":"Strontium isotopes as tracers of ecosystem processes","volume":"82","author":[{"family":"Capo","given":"Rosemary C."},{"family":"Stewart","given":"Brian W."},{"family":"Chadwick","given":"Oliver A."}],"issued":{"date-parts":[["1998",2,1]]}}}],"schema":"https://github.com/citation-style-language/schema/raw/master/csl-citation.json"} </w:instrText>
+      </w:r>
+      <w:r>
+        <w:rPr>
+          <w:rFonts w:ascii="Garamond" w:eastAsia="Times New Roman" w:hAnsi="Garamond" w:cs="Times New Roman"/>
+          <w:kern w:val="0"/>
+          <w:sz w:val="22"/>
+          <w:szCs w:val="22"/>
+          <w14:ligatures w14:val="none"/>
+        </w:rPr>
+        <w:fldChar w:fldCharType="separate"/>
+      </w:r>
+      <w:r>
+        <w:rPr>
+          <w:rFonts w:ascii="Garamond" w:eastAsia="Times New Roman" w:hAnsi="Garamond" w:cs="Times New Roman"/>
+          <w:noProof/>
+          <w:kern w:val="0"/>
+          <w:sz w:val="22"/>
+          <w:szCs w:val="22"/>
+          <w14:ligatures w14:val="none"/>
+        </w:rPr>
+        <w:t>(Brennan et al., 2015; Campana, 1999; Capo et al., 1998)</w:t>
+      </w:r>
+      <w:r>
+        <w:rPr>
+          <w:rFonts w:ascii="Garamond" w:eastAsia="Times New Roman" w:hAnsi="Garamond" w:cs="Times New Roman"/>
+          <w:kern w:val="0"/>
+          <w:sz w:val="22"/>
+          <w:szCs w:val="22"/>
+          <w14:ligatures w14:val="none"/>
+        </w:rPr>
+        <w:fldChar w:fldCharType="end"/>
+      </w:r>
+      <w:r>
+        <w:rPr>
+          <w:rFonts w:ascii="Garamond" w:eastAsia="Times New Roman" w:hAnsi="Garamond" w:cs="Times New Roman"/>
+          <w:kern w:val="0"/>
+          <w:sz w:val="22"/>
+          <w:szCs w:val="22"/>
+          <w14:ligatures w14:val="none"/>
+        </w:rPr>
+        <w:t xml:space="preserve">. </w:t>
+      </w:r>
+      <w:r>
+        <w:rPr>
+          <w:rFonts w:ascii="Garamond" w:eastAsia="Times New Roman" w:hAnsi="Garamond" w:cs="Times New Roman"/>
+          <w:kern w:val="0"/>
+          <w:sz w:val="22"/>
+          <w:szCs w:val="22"/>
+          <w14:ligatures w14:val="none"/>
+        </w:rPr>
+        <w:t xml:space="preserve">From these data, the </w:t>
+      </w:r>
+      <w:r>
+        <w:rPr>
+          <w:rFonts w:ascii="Garamond" w:eastAsia="Times New Roman" w:hAnsi="Garamond" w:cs="Times New Roman"/>
+          <w:kern w:val="0"/>
+          <w:sz w:val="22"/>
+          <w:szCs w:val="22"/>
+          <w14:ligatures w14:val="none"/>
+        </w:rPr>
+        <w:t>Sr</w:t>
+      </w:r>
+      <w:r>
+        <w:rPr>
+          <w:rFonts w:ascii="Garamond" w:eastAsia="Times New Roman" w:hAnsi="Garamond" w:cs="Times New Roman"/>
+          <w:kern w:val="0"/>
+          <w:sz w:val="22"/>
+          <w:szCs w:val="22"/>
+          <w:vertAlign w:val="superscript"/>
+          <w14:ligatures w14:val="none"/>
+        </w:rPr>
+        <w:t>87</w:t>
+      </w:r>
+      <w:r>
+        <w:rPr>
+          <w:rFonts w:ascii="Garamond" w:eastAsia="Times New Roman" w:hAnsi="Garamond" w:cs="Times New Roman"/>
+          <w:kern w:val="0"/>
+          <w:sz w:val="22"/>
+          <w:szCs w:val="22"/>
+          <w14:ligatures w14:val="none"/>
+        </w:rPr>
+        <w:t>/Sr</w:t>
+      </w:r>
+      <w:r>
+        <w:rPr>
+          <w:rFonts w:ascii="Garamond" w:eastAsia="Times New Roman" w:hAnsi="Garamond" w:cs="Times New Roman"/>
+          <w:kern w:val="0"/>
+          <w:sz w:val="22"/>
+          <w:szCs w:val="22"/>
+          <w:vertAlign w:val="superscript"/>
+          <w14:ligatures w14:val="none"/>
+        </w:rPr>
+        <w:t>86</w:t>
+      </w:r>
+      <w:r>
+        <w:rPr>
+          <w:rFonts w:ascii="Garamond" w:eastAsia="Times New Roman" w:hAnsi="Garamond" w:cs="Times New Roman"/>
+          <w:kern w:val="0"/>
+          <w:sz w:val="22"/>
+          <w:szCs w:val="22"/>
+          <w14:ligatures w14:val="none"/>
+        </w:rPr>
+        <w:t xml:space="preserve"> </w:t>
+      </w:r>
+      <w:r>
+        <w:rPr>
+          <w:rFonts w:ascii="Garamond" w:eastAsia="Times New Roman" w:hAnsi="Garamond" w:cs="Times New Roman"/>
+          <w:kern w:val="0"/>
+          <w:sz w:val="22"/>
+          <w:szCs w:val="22"/>
+          <w14:ligatures w14:val="none"/>
+        </w:rPr>
+        <w:t xml:space="preserve">value associated with </w:t>
+      </w:r>
+      <w:r>
+        <w:rPr>
+          <w:rFonts w:ascii="Garamond" w:eastAsia="Times New Roman" w:hAnsi="Garamond" w:cs="Times New Roman"/>
+          <w:kern w:val="0"/>
+          <w:sz w:val="22"/>
+          <w:szCs w:val="22"/>
+          <w14:ligatures w14:val="none"/>
+        </w:rPr>
         <w:lastRenderedPageBreak/>
+        <w:t xml:space="preserve">the </w:t>
+      </w:r>
+      <w:r>
+        <w:rPr>
+          <w:rFonts w:ascii="Garamond" w:eastAsia="Times New Roman" w:hAnsi="Garamond" w:cs="Times New Roman"/>
+          <w:kern w:val="0"/>
+          <w:sz w:val="22"/>
+          <w:szCs w:val="22"/>
+          <w14:ligatures w14:val="none"/>
+        </w:rPr>
+        <w:t>natal freshwater rearing period was extracted by examining</w:t>
+      </w:r>
+      <w:r>
+        <w:rPr>
+          <w:rFonts w:ascii="Garamond" w:eastAsia="Times New Roman" w:hAnsi="Garamond" w:cs="Times New Roman"/>
+          <w:kern w:val="0"/>
+          <w:sz w:val="22"/>
+          <w:szCs w:val="22"/>
+          <w14:ligatures w14:val="none"/>
+        </w:rPr>
+        <w:t xml:space="preserve"> patterns of </w:t>
+      </w:r>
+      <w:r>
+        <w:rPr>
+          <w:rFonts w:ascii="Garamond" w:eastAsia="Times New Roman" w:hAnsi="Garamond" w:cs="Times New Roman"/>
+          <w:kern w:val="0"/>
+          <w:sz w:val="22"/>
+          <w:szCs w:val="22"/>
+          <w14:ligatures w14:val="none"/>
+        </w:rPr>
+        <w:t>change in Sr</w:t>
+      </w:r>
+      <w:r>
+        <w:rPr>
+          <w:rFonts w:ascii="Garamond" w:eastAsia="Times New Roman" w:hAnsi="Garamond" w:cs="Times New Roman"/>
+          <w:kern w:val="0"/>
+          <w:sz w:val="22"/>
+          <w:szCs w:val="22"/>
+          <w:vertAlign w:val="superscript"/>
+          <w14:ligatures w14:val="none"/>
+        </w:rPr>
+        <w:t>87</w:t>
+      </w:r>
+      <w:r>
+        <w:rPr>
+          <w:rFonts w:ascii="Garamond" w:eastAsia="Times New Roman" w:hAnsi="Garamond" w:cs="Times New Roman"/>
+          <w:kern w:val="0"/>
+          <w:sz w:val="22"/>
+          <w:szCs w:val="22"/>
+          <w14:ligatures w14:val="none"/>
+        </w:rPr>
+        <w:t>/Sr</w:t>
+      </w:r>
+      <w:r>
+        <w:rPr>
+          <w:rFonts w:ascii="Garamond" w:eastAsia="Times New Roman" w:hAnsi="Garamond" w:cs="Times New Roman"/>
+          <w:kern w:val="0"/>
+          <w:sz w:val="22"/>
+          <w:szCs w:val="22"/>
+          <w:vertAlign w:val="superscript"/>
+          <w14:ligatures w14:val="none"/>
+        </w:rPr>
+        <w:t>86</w:t>
+      </w:r>
+      <w:r>
+        <w:rPr>
+          <w:rFonts w:ascii="Garamond" w:eastAsia="Times New Roman" w:hAnsi="Garamond" w:cs="Times New Roman"/>
+          <w:kern w:val="0"/>
+          <w:sz w:val="22"/>
+          <w:szCs w:val="22"/>
+          <w14:ligatures w14:val="none"/>
+        </w:rPr>
+        <w:t xml:space="preserve"> and Sr</w:t>
+      </w:r>
+      <w:r>
+        <w:rPr>
+          <w:rFonts w:ascii="Garamond" w:eastAsia="Times New Roman" w:hAnsi="Garamond" w:cs="Times New Roman"/>
+          <w:kern w:val="0"/>
+          <w:sz w:val="22"/>
+          <w:szCs w:val="22"/>
+          <w:vertAlign w:val="superscript"/>
+          <w14:ligatures w14:val="none"/>
+        </w:rPr>
+        <w:t>88</w:t>
+      </w:r>
+      <w:r>
+        <w:rPr>
+          <w:rFonts w:ascii="Garamond" w:eastAsia="Times New Roman" w:hAnsi="Garamond" w:cs="Times New Roman"/>
+          <w:kern w:val="0"/>
+          <w:sz w:val="22"/>
+          <w:szCs w:val="22"/>
+          <w14:ligatures w14:val="none"/>
+        </w:rPr>
+        <w:t xml:space="preserve"> </w:t>
+      </w:r>
+      <w:r>
+        <w:rPr>
+          <w:rFonts w:ascii="Garamond" w:eastAsia="Times New Roman" w:hAnsi="Garamond" w:cs="Times New Roman"/>
+          <w:kern w:val="0"/>
+          <w:sz w:val="22"/>
+          <w:szCs w:val="22"/>
+          <w14:ligatures w14:val="none"/>
+        </w:rPr>
+        <w:t>between the core and freshwater region</w:t>
+      </w:r>
+      <w:r>
+        <w:rPr>
+          <w:rFonts w:ascii="Garamond" w:eastAsia="Times New Roman" w:hAnsi="Garamond" w:cs="Times New Roman"/>
+          <w:kern w:val="0"/>
+          <w:sz w:val="22"/>
+          <w:szCs w:val="22"/>
+          <w14:ligatures w14:val="none"/>
+        </w:rPr>
+        <w:t xml:space="preserve">, </w:t>
+      </w:r>
+      <w:r>
+        <w:rPr>
+          <w:rFonts w:ascii="Garamond" w:eastAsia="Times New Roman" w:hAnsi="Garamond" w:cs="Times New Roman"/>
+          <w:kern w:val="0"/>
+          <w:sz w:val="22"/>
+          <w:szCs w:val="22"/>
+          <w14:ligatures w14:val="none"/>
+        </w:rPr>
+        <w:t>morphological features of the otolith visible among the ablation path</w:t>
+      </w:r>
+      <w:r>
+        <w:rPr>
+          <w:rFonts w:ascii="Garamond" w:eastAsia="Times New Roman" w:hAnsi="Garamond" w:cs="Times New Roman"/>
+          <w:kern w:val="0"/>
+          <w:sz w:val="22"/>
+          <w:szCs w:val="22"/>
+          <w14:ligatures w14:val="none"/>
+        </w:rPr>
+        <w:t xml:space="preserve">, and known distances from the core to onset of the freshwater signal </w:t>
+      </w:r>
+      <w:r>
+        <w:rPr>
+          <w:rFonts w:ascii="Garamond" w:eastAsia="Times New Roman" w:hAnsi="Garamond" w:cs="Times New Roman"/>
+          <w:kern w:val="0"/>
+          <w:sz w:val="22"/>
+          <w:szCs w:val="22"/>
+          <w14:ligatures w14:val="none"/>
+        </w:rPr>
         <w:fldChar w:fldCharType="begin"/>
       </w:r>
       <w:r>
@@ -1622,7 +1982,7 @@
           <w:szCs w:val="22"/>
           <w14:ligatures w14:val="none"/>
         </w:rPr>
-        <w:instrText xml:space="preserve"> ADDIN ZOTERO_ITEM CSL_CITATION {"citationID":"drNJXJRw","properties":{"formattedCitation":"(Brennan et al., 2015; Campana, 1999; Capo et al., 1998)","plainCitation":"(Brennan et al., 2015; Campana, 1999; Capo et al., 1998)","noteIndex":0},"citationItems":[{"id":"h4h2qxOD/ChWvHkvk","uris":["http://zotero.org/users/8421274/items/IY3FLHLM"],"itemData":{"id":"dI01jIsp/qEdWN4pU","type":"article-journal","abstract":"Strontium isotopes simultaneously delineate fine-scale natal habitats and migrations of Pacific salmon harvested during a coastal commercial fishery., Highly migratory organisms present major challenges to conservation efforts. This is especially true for exploited anadromous fish species, which exhibit long-range dispersals from natal sites, complex population structures, and extensive mixing of distinct populations during exploitation. By tracing the migratory histories of individual Chinook salmon caught in fisheries using strontium isotopes, we determined the relative production of natal habitats at fine spatial scales and different life histories. Although strontium isotopes have been widely used in provenance research, we present a new robust framework to simultaneously assess natal sources and migrations of individuals within fishery harvests through time. Our results pave the way for investigating how fine-scale habitat production and life histories of salmon respond to perturbations—providing crucial insights for conservation.","container-title":"Science Advances","DOI":"10.1126/sciadv.1400124","ISSN":"2375-2548","issue":"4","journalAbbreviation":"Sci Adv","note":"PMID: 26601173\nPMCID: PMC4640640","page":"e1400124","source":"PubMed Central","title":"Strontium isotopes delineate fine-scale natal origins and migration histories of Pacific salmon","volume":"1","author":[{"family":"Brennan","given":"Sean R."},{"family":"Zimmerman","given":"Christian E."},{"family":"Fernandez","given":"Diego P."},{"family":"Cerling","given":"Thure E."},{"family":"McPhee","given":"Megan V."},{"family":"Wooller","given":"Matthew J."}],"issued":{"date-parts":[["2015",5,15]]}}},{"id":1441,"uris":["http://zotero.org/users/8421274/items/PHNAKZ8D"],"itemData":{"id":1441,"type":"article-journal","abstract":"The fish otolith (earstone) has long been known as a timekeeper, but interest in its use as a metabolically inert environmental recorder has accelerated in recent years. In part due to technological advances, applications such as stock identification, determination of rnigralon pathways, reconstruction of temperature and salinity history, age validation, detection of anadromy, use as a natural tag and chemical mass marking have been developed, some of which are difficult or impossible to implement using alternative techniques. Microsamphg and the latest advances in beam-based probes allow many elemental assays to be coupled with daily or annual growth increments, thus providing a detailed chronologcal record of the environment. However, few workers have critically assessed the assumptions upon which the environmental reconstructions are based, or considered the possibility that elemental incorporation into the otolith may proceed differently than that into other calcified structures. This paper reviews current applications and their assumptions and suggests future directions. Particular attention is given to the premises that the elemental and isotopic composition of the otolith reflects that of the environment, and the effect of physiological filters on the resulting composition. The roles of temperature, elemental uptake into the fish and the process of otolith crystahzation are also assessed. Drawing upon recent advances in geochemistry and paleoclirnate research as points of contrast, it appears that not all applications of otolith chemistry are firmly based, although others are destined to become powerful and perhaps routine tools for the mainstream fish biologst.","container-title":"Marine Ecology Progress Series","DOI":"10.3354/meps188263","ISSN":"0171-8630, 1616-1599","journalAbbreviation":"Mar. Ecol. Prog. Ser.","language":"en","page":"263-297","source":"DOI.org (Crossref)","title":"Chemistry and composition of fish otoliths:pathways, mechanisms and applications","title-short":"Chemistry and composition of fish otoliths","volume":"188","author":[{"family":"Campana","given":"Se"}],"issued":{"date-parts":[["1999"]]}}},{"id":1457,"uris":["http://zotero.org/users/8421274/items/TDIQBP7K"],"itemData":{"id":1457,"type":"article-journal","abstract":"The strontium (Sr) isotope method can be a powerful tool in studies of chemical weathering and soil genesis, cation provenance and mobility, and the chronostratigraphic correlation of marine sediments. It is a sensitive geochemical tracer, applicable to large-scale ecosystem studies as well as to centimeter-scaled examination of cation mobility within a soil profile. The 87Sr/86Sr ratios of natural materials reflect the sources of strontium available during their formation. Isotopically distinct inputs from precipitation, dryfall, soil parent material, and surface or groundwater allow determination of the relative proportions of those materials entering or leaving an ecosystem. The isotopic compositions of labile (soil exchange complex and soil solution) strontium and Sr in vegetation reflect the sources of cations available to plants. Strontium isotopes can be used to track the biogeochemical cycling of nutrient cations such as calcium. The extent of cation contributions from in situ weathering and external additions to soil from dust and rain can also be resolved with this method. In this paper, we review the geochemistry and isotopic systematics of strontium, and discuss the use of this method as a tracer of earth surface processes.","container-title":"Geoderma","DOI":"10.1016/S0016-7061(97)00102-X","ISSN":"0016-7061","issue":"1","journalAbbreviation":"Geoderma","language":"en","page":"197-225","source":"ScienceDirect","title":"Strontium isotopes as tracers of ecosystem processes: theory and methods","title-short":"Strontium isotopes as tracers of ecosystem processes","volume":"82","author":[{"family":"Capo","given":"Rosemary C."},{"family":"Stewart","given":"Brian W."},{"family":"Chadwick","given":"Oliver A."}],"issued":{"date-parts":[["1998",2,1]]}}}],"schema":"https://github.com/citation-style-language/schema/raw/master/csl-citation.json"} </w:instrText>
+        <w:instrText xml:space="preserve"> ADDIN ZOTERO_ITEM CSL_CITATION {"citationID":"9Eo1mxW7","properties":{"formattedCitation":"(Brennan, Schindler, et al., 2019; Chittaro et al., 2023)","plainCitation":"(Brennan, Schindler, et al., 2019; Chittaro et al., 2023)","noteIndex":0},"citationItems":[{"id":3844,"uris":["http://zotero.org/users/8421274/items/RXD5IA9D"],"itemData":{"id":3844,"type":"article-journal","abstract":"Watersheds are complex mosaics of habitats whose conditions vary across space and time as landscape features filter overriding climate forcing, yet the extent to which the reliability of ecosystem services depends on these dynamics remains unknown. We quantified how shifting habitat mosaics are expressed across a range of spatial scales within a large, free-flowing river, and how they stabilize the production of Pacific salmon that support valuable fisheries. The strontium isotope records of ear stones (otoliths) show that the relative productivity of locations across the river network, as both natal- and juvenile-rearing habitat, varies widely among years and that this variability is expressed across a broad range of spatial scales, ultimately stabilizing the interannual production of fish at the scale of the entire basin.","container-title":"Science","DOI":"10.1126/science.aav4313","issue":"6442","note":"publisher: American Association for the Advancement of Science","page":"783-786","source":"science.org (Atypon)","title":"Shifting habitat mosaics and fish production across river basins","volume":"364","author":[{"family":"Brennan","given":"Sean R."},{"family":"Schindler","given":"Daniel E."},{"family":"Cline","given":"Timothy J."},{"family":"Walsworth","given":"Timothy E."},{"family":"Buck","given":"Greg"},{"family":"Fernandez","given":"Diego P."}],"issued":{"date-parts":[["2019"]]}}},{"id":4257,"uris":["http://zotero.org/users/8421274/items/TAJ7RSQZ"],"itemData":{"id":4257,"type":"article-journal","abstract":"Effective species management often requires understanding patterns of movement and habitat use. A common approach in identifying where individuals reside relies upon chemical tracers from the environment that are incorporated into an individual's tissues. For fish, isotopes in their otoliths, specifically the portion of their otolith formed during their larval stage, have been used to identify the natal origin. Complicating this work, however, is the fact that during this life stage, there is a shift in the source of isotopes deposited onto the growing otolith from maternally to environmentally derived. The objective of this study was to identify the portion of the otolith representing this transition to environmentally derived isotopes so as to accurately investigate questions of natal origin for a threatened population of fall Chinook salmon (Oncorhynchus tshawytscha). We exposed developing larvae to four treatments that differed in terms of their water strontium isotope ratio (87Sr/86Sr) and used change-point analysis of otolith 87Sr/86Sr and strontium to calcium ratio (Sr/Ca) to identify the otolith radius corresponding to the transition to environmentally derived isotopes. Our results indicated this transition occurred, on average, at 132 μm (87Sr/86Sr; ±50 μm standard deviation) and 127 μm (Sr/Ca; ±29 μm) from the otolith core, which corresponded to the developmental time between hatching and exogenous feeding. A substantial proportion of our otoliths (i.e., 61%) did not show convergence between otolith and water 87Sr/86Sr by the end of the 113-day experiment, which was likely due to the dietary contribution of marine-based feed. Therefore, we were unable to recommend an otolith radius to target for the purposes of reconstructing natal origin apart from being beyond approximately 130 μm.","container-title":"Ecology of Freshwater Fish","DOI":"10.1111/eff.12673","ISSN":"1600-0633","issue":"1","language":"en","license":"© 2022 John Wiley &amp; Sons Ltd. This article has been contributed to by U.S. Government employees and their work is in the public domain in the USA.","note":"_eprint: https://onlinelibrary.wiley.com/doi/pdf/10.1111/eff.12673","page":"107-119","source":"Wiley Online Library","title":"The incorporation of environmentally derived 87Sr/86Sr and Sr/Ca in early otolith formation of Chinook salmon","volume":"32","author":[{"family":"Chittaro","given":"Paul"},{"family":"Hegg","given":"Jens"},{"family":"Fuhrman","given":"Abby"},{"family":"Robichaux","given":"Devin"},{"family":"Doung","given":"Rothboury"},{"family":"Beckman","given":"Brian"},{"family":"Fisher","given":"Chris"},{"family":"Vervoort","given":"Jeff"},{"family":"Kennedy","given":"Brian"}],"issued":{"date-parts":[["2023"]]}}}],"schema":"https://github.com/citation-style-language/schema/raw/master/csl-citation.json"} </w:instrText>
       </w:r>
       <w:r>
         <w:rPr>
@@ -1643,7 +2003,7 @@
           <w:szCs w:val="22"/>
           <w14:ligatures w14:val="none"/>
         </w:rPr>
-        <w:t>(Brennan et al., 2015; Campana, 1999; Capo et al., 1998)</w:t>
+        <w:t>(Brennan, Schindler, et al., 2019; Chittaro et al., 2023)</w:t>
       </w:r>
       <w:r>
         <w:rPr>
@@ -1655,221 +2015,7 @@
         </w:rPr>
         <w:fldChar w:fldCharType="end"/>
       </w:r>
-      <w:r>
-        <w:rPr>
-          <w:rFonts w:ascii="Garamond" w:eastAsia="Times New Roman" w:hAnsi="Garamond" w:cs="Times New Roman"/>
-          <w:kern w:val="0"/>
-          <w:sz w:val="22"/>
-          <w:szCs w:val="22"/>
-          <w14:ligatures w14:val="none"/>
-        </w:rPr>
-        <w:t xml:space="preserve">. </w:t>
-      </w:r>
-      <w:r>
-        <w:rPr>
-          <w:rFonts w:ascii="Garamond" w:eastAsia="Times New Roman" w:hAnsi="Garamond" w:cs="Times New Roman"/>
-          <w:kern w:val="0"/>
-          <w:sz w:val="22"/>
-          <w:szCs w:val="22"/>
-          <w14:ligatures w14:val="none"/>
-        </w:rPr>
-        <w:t xml:space="preserve">From these data, the </w:t>
-      </w:r>
-      <w:r>
-        <w:rPr>
-          <w:rFonts w:ascii="Garamond" w:eastAsia="Times New Roman" w:hAnsi="Garamond" w:cs="Times New Roman"/>
-          <w:kern w:val="0"/>
-          <w:sz w:val="22"/>
-          <w:szCs w:val="22"/>
-          <w14:ligatures w14:val="none"/>
-        </w:rPr>
-        <w:t xml:space="preserve">Sr87/86 value associated with the </w:t>
-      </w:r>
-      <w:r>
-        <w:rPr>
-          <w:rFonts w:ascii="Garamond" w:eastAsia="Times New Roman" w:hAnsi="Garamond" w:cs="Times New Roman"/>
-          <w:kern w:val="0"/>
-          <w:sz w:val="22"/>
-          <w:szCs w:val="22"/>
-          <w14:ligatures w14:val="none"/>
-        </w:rPr>
-        <w:t>natal freshwater rearing period was extracted by examining</w:t>
-      </w:r>
-      <w:r>
-        <w:rPr>
-          <w:rFonts w:ascii="Garamond" w:eastAsia="Times New Roman" w:hAnsi="Garamond" w:cs="Times New Roman"/>
-          <w:kern w:val="0"/>
-          <w:sz w:val="22"/>
-          <w:szCs w:val="22"/>
-          <w14:ligatures w14:val="none"/>
-        </w:rPr>
-        <w:t xml:space="preserve"> patterns of </w:t>
-      </w:r>
-      <w:r>
-        <w:rPr>
-          <w:rFonts w:ascii="Garamond" w:eastAsia="Times New Roman" w:hAnsi="Garamond" w:cs="Times New Roman"/>
-          <w:kern w:val="0"/>
-          <w:sz w:val="22"/>
-          <w:szCs w:val="22"/>
-          <w14:ligatures w14:val="none"/>
-        </w:rPr>
-        <w:t>change in Sr</w:t>
-      </w:r>
-      <w:r>
-        <w:rPr>
-          <w:rFonts w:ascii="Garamond" w:eastAsia="Times New Roman" w:hAnsi="Garamond" w:cs="Times New Roman"/>
-          <w:kern w:val="0"/>
-          <w:sz w:val="22"/>
-          <w:szCs w:val="22"/>
-          <w:vertAlign w:val="superscript"/>
-          <w14:ligatures w14:val="none"/>
-        </w:rPr>
-        <w:t>87</w:t>
-      </w:r>
-      <w:r>
-        <w:rPr>
-          <w:rFonts w:ascii="Garamond" w:eastAsia="Times New Roman" w:hAnsi="Garamond" w:cs="Times New Roman"/>
-          <w:kern w:val="0"/>
-          <w:sz w:val="22"/>
-          <w:szCs w:val="22"/>
-          <w14:ligatures w14:val="none"/>
-        </w:rPr>
-        <w:t>/Sr</w:t>
-      </w:r>
-      <w:r>
-        <w:rPr>
-          <w:rFonts w:ascii="Garamond" w:eastAsia="Times New Roman" w:hAnsi="Garamond" w:cs="Times New Roman"/>
-          <w:kern w:val="0"/>
-          <w:sz w:val="22"/>
-          <w:szCs w:val="22"/>
-          <w:vertAlign w:val="superscript"/>
-          <w14:ligatures w14:val="none"/>
-        </w:rPr>
-        <w:t>86</w:t>
-      </w:r>
-      <w:r>
-        <w:rPr>
-          <w:rFonts w:ascii="Garamond" w:eastAsia="Times New Roman" w:hAnsi="Garamond" w:cs="Times New Roman"/>
-          <w:kern w:val="0"/>
-          <w:sz w:val="22"/>
-          <w:szCs w:val="22"/>
-          <w14:ligatures w14:val="none"/>
-        </w:rPr>
-        <w:t xml:space="preserve"> and Sr</w:t>
-      </w:r>
-      <w:r>
-        <w:rPr>
-          <w:rFonts w:ascii="Garamond" w:eastAsia="Times New Roman" w:hAnsi="Garamond" w:cs="Times New Roman"/>
-          <w:kern w:val="0"/>
-          <w:sz w:val="22"/>
-          <w:szCs w:val="22"/>
-          <w:vertAlign w:val="superscript"/>
-          <w14:ligatures w14:val="none"/>
-        </w:rPr>
-        <w:t>88</w:t>
-      </w:r>
-      <w:r>
-        <w:rPr>
-          <w:rFonts w:ascii="Garamond" w:eastAsia="Times New Roman" w:hAnsi="Garamond" w:cs="Times New Roman"/>
-          <w:kern w:val="0"/>
-          <w:sz w:val="22"/>
-          <w:szCs w:val="22"/>
-          <w14:ligatures w14:val="none"/>
-        </w:rPr>
-        <w:t xml:space="preserve"> </w:t>
-      </w:r>
-      <w:r>
-        <w:rPr>
-          <w:rFonts w:ascii="Garamond" w:eastAsia="Times New Roman" w:hAnsi="Garamond" w:cs="Times New Roman"/>
-          <w:kern w:val="0"/>
-          <w:sz w:val="22"/>
-          <w:szCs w:val="22"/>
-          <w14:ligatures w14:val="none"/>
-        </w:rPr>
-        <w:t>between the core and freshwater region</w:t>
-      </w:r>
-      <w:r>
-        <w:rPr>
-          <w:rFonts w:ascii="Garamond" w:eastAsia="Times New Roman" w:hAnsi="Garamond" w:cs="Times New Roman"/>
-          <w:kern w:val="0"/>
-          <w:sz w:val="22"/>
-          <w:szCs w:val="22"/>
-          <w14:ligatures w14:val="none"/>
-        </w:rPr>
-        <w:t xml:space="preserve">, </w:t>
-      </w:r>
-      <w:r>
-        <w:rPr>
-          <w:rFonts w:ascii="Garamond" w:eastAsia="Times New Roman" w:hAnsi="Garamond" w:cs="Times New Roman"/>
-          <w:kern w:val="0"/>
-          <w:sz w:val="22"/>
-          <w:szCs w:val="22"/>
-          <w14:ligatures w14:val="none"/>
-        </w:rPr>
-        <w:t>morphological features of the otolith visible among the ablation path</w:t>
-      </w:r>
-      <w:r>
-        <w:rPr>
-          <w:rFonts w:ascii="Garamond" w:eastAsia="Times New Roman" w:hAnsi="Garamond" w:cs="Times New Roman"/>
-          <w:kern w:val="0"/>
-          <w:sz w:val="22"/>
-          <w:szCs w:val="22"/>
-          <w14:ligatures w14:val="none"/>
-        </w:rPr>
-        <w:t xml:space="preserve">, and known distances from the core to onset of the freshwater signal </w:t>
-      </w:r>
-      <w:r>
-        <w:rPr>
-          <w:rFonts w:ascii="Garamond" w:eastAsia="Times New Roman" w:hAnsi="Garamond" w:cs="Times New Roman"/>
-          <w:kern w:val="0"/>
-          <w:sz w:val="22"/>
-          <w:szCs w:val="22"/>
-          <w14:ligatures w14:val="none"/>
-        </w:rPr>
-        <w:fldChar w:fldCharType="begin"/>
-      </w:r>
-      <w:r>
-        <w:rPr>
-          <w:rFonts w:ascii="Garamond" w:eastAsia="Times New Roman" w:hAnsi="Garamond" w:cs="Times New Roman"/>
-          <w:kern w:val="0"/>
-          <w:sz w:val="22"/>
-          <w:szCs w:val="22"/>
-          <w14:ligatures w14:val="none"/>
-        </w:rPr>
-        <w:instrText xml:space="preserve"> ADDIN ZOTERO_ITEM CSL_CITATION {"citationID":"9Eo1mxW7","properties":{"formattedCitation":"(Brennan, Schindler, et al., 2019; Chittaro et al., 2023)","plainCitation":"(Brennan, Schindler, et al., 2019; Chittaro et al., 2023)","noteIndex":0},"citationItems":[{"id":3844,"uris":["http://zotero.org/users/8421274/items/RXD5IA9D"],"itemData":{"id":3844,"type":"article-journal","abstract":"Watersheds are complex mosaics of habitats whose conditions vary across space and time as landscape features filter overriding climate forcing, yet the extent to which the reliability of ecosystem services depends on these dynamics remains unknown. We quantified how shifting habitat mosaics are expressed across a range of spatial scales within a large, free-flowing river, and how they stabilize the production of Pacific salmon that support valuable fisheries. The strontium isotope records of ear stones (otoliths) show that the relative productivity of locations across the river network, as both natal- and juvenile-rearing habitat, varies widely among years and that this variability is expressed across a broad range of spatial scales, ultimately stabilizing the interannual production of fish at the scale of the entire basin.","container-title":"Science","DOI":"10.1126/science.aav4313","issue":"6442","note":"publisher: American Association for the Advancement of Science","page":"783-786","source":"science.org (Atypon)","title":"Shifting habitat mosaics and fish production across river basins","volume":"364","author":[{"family":"Brennan","given":"Sean R."},{"family":"Schindler","given":"Daniel E."},{"family":"Cline","given":"Timothy J."},{"family":"Walsworth","given":"Timothy E."},{"family":"Buck","given":"Greg"},{"family":"Fernandez","given":"Diego P."}],"issued":{"date-parts":[["2019"]]}}},{"id":4257,"uris":["http://zotero.org/users/8421274/items/TAJ7RSQZ"],"itemData":{"id":4257,"type":"article-journal","abstract":"Effective species management often requires understanding patterns of movement and habitat use. A common approach in identifying where individuals reside relies upon chemical tracers from the environment that are incorporated into an individual's tissues. For fish, isotopes in their otoliths, specifically the portion of their otolith formed during their larval stage, have been used to identify the natal origin. Complicating this work, however, is the fact that during this life stage, there is a shift in the source of isotopes deposited onto the growing otolith from maternally to environmentally derived. The objective of this study was to identify the portion of the otolith representing this transition to environmentally derived isotopes so as to accurately investigate questions of natal origin for a threatened population of fall Chinook salmon (Oncorhynchus tshawytscha). We exposed developing larvae to four treatments that differed in terms of their water strontium isotope ratio (87Sr/86Sr) and used change-point analysis of otolith 87Sr/86Sr and strontium to calcium ratio (Sr/Ca) to identify the otolith radius corresponding to the transition to environmentally derived isotopes. Our results indicated this transition occurred, on average, at 132 μm (87Sr/86Sr; ±50 μm standard deviation) and 127 μm (Sr/Ca; ±29 μm) from the otolith core, which corresponded to the developmental time between hatching and exogenous feeding. A substantial proportion of our otoliths (i.e., 61%) did not show convergence between otolith and water 87Sr/86Sr by the end of the 113-day experiment, which was likely due to the dietary contribution of marine-based feed. Therefore, we were unable to recommend an otolith radius to target for the purposes of reconstructing natal origin apart from being beyond approximately 130 μm.","container-title":"Ecology of Freshwater Fish","DOI":"10.1111/eff.12673","ISSN":"1600-0633","issue":"1","language":"en","license":"© 2022 John Wiley &amp; Sons Ltd. This article has been contributed to by U.S. Government employees and their work is in the public domain in the USA.","note":"_eprint: https://onlinelibrary.wiley.com/doi/pdf/10.1111/eff.12673","page":"107-119","source":"Wiley Online Library","title":"The incorporation of environmentally derived 87Sr/86Sr and Sr/Ca in early otolith formation of Chinook salmon","volume":"32","author":[{"family":"Chittaro","given":"Paul"},{"family":"Hegg","given":"Jens"},{"family":"Fuhrman","given":"Abby"},{"family":"Robichaux","given":"Devin"},{"family":"Doung","given":"Rothboury"},{"family":"Beckman","given":"Brian"},{"family":"Fisher","given":"Chris"},{"family":"Vervoort","given":"Jeff"},{"family":"Kennedy","given":"Brian"}],"issued":{"date-parts":[["2023"]]}}}],"schema":"https://github.com/citation-style-language/schema/raw/master/csl-citation.json"} </w:instrText>
-      </w:r>
-      <w:r>
-        <w:rPr>
-          <w:rFonts w:ascii="Garamond" w:eastAsia="Times New Roman" w:hAnsi="Garamond" w:cs="Times New Roman"/>
-          <w:kern w:val="0"/>
-          <w:sz w:val="22"/>
-          <w:szCs w:val="22"/>
-          <w14:ligatures w14:val="none"/>
-        </w:rPr>
-        <w:fldChar w:fldCharType="separate"/>
-      </w:r>
-      <w:r>
-        <w:rPr>
-          <w:rFonts w:ascii="Garamond" w:eastAsia="Times New Roman" w:hAnsi="Garamond" w:cs="Times New Roman"/>
-          <w:noProof/>
-          <w:kern w:val="0"/>
-          <w:sz w:val="22"/>
-          <w:szCs w:val="22"/>
-          <w14:ligatures w14:val="none"/>
-        </w:rPr>
-        <w:t>(Brennan, Schindler, et al., 2019; Chittaro et al., 2023)</w:t>
-      </w:r>
-      <w:r>
-        <w:rPr>
-          <w:rFonts w:ascii="Garamond" w:eastAsia="Times New Roman" w:hAnsi="Garamond" w:cs="Times New Roman"/>
-          <w:kern w:val="0"/>
-          <w:sz w:val="22"/>
-          <w:szCs w:val="22"/>
-          <w14:ligatures w14:val="none"/>
-        </w:rPr>
-        <w:fldChar w:fldCharType="end"/>
-      </w:r>
-      <w:ins w:id="3" w:author="Benjamin J. Makhlouf" w:date="2025-07-26T13:45:00Z" w16du:dateUtc="2025-07-26T20:45:00Z">
+      <w:ins w:id="2" w:author="Benjamin J. Makhlouf" w:date="2025-07-26T13:45:00Z" w16du:dateUtc="2025-07-26T20:45:00Z">
         <w:r>
           <w:rPr>
             <w:rFonts w:ascii="Garamond" w:eastAsia="Times New Roman" w:hAnsi="Garamond" w:cs="Times New Roman"/>
@@ -2051,7 +2197,7 @@
           <w:szCs w:val="22"/>
           <w14:ligatures w14:val="none"/>
         </w:rPr>
-        <w:t>(French et al., 2020)</w:t>
+        <w:t>French et al., 2020</w:t>
       </w:r>
       <w:r>
         <w:rPr>
@@ -2071,6 +2217,16 @@
           <w:szCs w:val="22"/>
           <w14:ligatures w14:val="none"/>
         </w:rPr>
+        <w:t xml:space="preserve"> </w:t>
+      </w:r>
+      <w:r>
+        <w:rPr>
+          <w:rFonts w:ascii="Garamond" w:eastAsia="Times New Roman" w:hAnsi="Garamond" w:cs="Times New Roman"/>
+          <w:kern w:val="0"/>
+          <w:sz w:val="22"/>
+          <w:szCs w:val="22"/>
+          <w14:ligatures w14:val="none"/>
+        </w:rPr>
         <w:t xml:space="preserve">, in which </w:t>
       </w:r>
       <w:r>
@@ -2164,6 +2320,26 @@
           <w14:ligatures w14:val="none"/>
         </w:rPr>
         <w:t xml:space="preserve"> and derived from water samples collected throughout the river basin </w:t>
+      </w:r>
+      <w:r>
+        <w:rPr>
+          <w:rFonts w:ascii="Garamond" w:eastAsia="Times New Roman" w:hAnsi="Garamond" w:cs="Times New Roman"/>
+          <w:kern w:val="0"/>
+          <w:sz w:val="22"/>
+          <w:szCs w:val="22"/>
+          <w14:ligatures w14:val="none"/>
+          <w:rPrChange w:id="3" w:author="Benjamin J. Makhlouf" w:date="2025-07-26T13:00:00Z" w16du:dateUtc="2025-07-26T20:00:00Z">
+            <w:rPr>
+              <w:rFonts w:ascii="Garamond" w:eastAsia="Times New Roman" w:hAnsi="Garamond" w:cs="Times New Roman"/>
+              <w:kern w:val="0"/>
+              <w:sz w:val="22"/>
+              <w:szCs w:val="22"/>
+              <w:highlight w:val="yellow"/>
+              <w14:ligatures w14:val="none"/>
+            </w:rPr>
+          </w:rPrChange>
+        </w:rPr>
+        <w:fldChar w:fldCharType="begin"/>
       </w:r>
       <w:r>
         <w:rPr>
@@ -2183,7 +2359,7 @@
             </w:rPr>
           </w:rPrChange>
         </w:rPr>
-        <w:fldChar w:fldCharType="begin"/>
+        <w:instrText xml:space="preserve"> ADDIN ZOTERO_ITEM CSL_CITATION {"citationID":"5Pp7WuA9","properties":{"formattedCitation":"(French et al., 2020)","plainCitation":"(French et al., 2020)","noteIndex":0},"citationItems":[{"id":1684,"uris":["http://zotero.org/users/8421274/items/M654PKRJ"],"itemData":{"id":1684,"type":"article-journal","abstract":"Riverine chemistry reflects both watershed conditions and instream processing, both of which vary across river networks, yet little is known about the scales at which watershed attributes regulate biogeochemical constituents. We used spatial stream network (SSN) models to quantify both watershed and instream effects on streamwater constituents in the Kuskokwim River (western Alaska), the largest free-flowing river in the United States. We assessed chemical constituents spanning from labile nutrients (nitrate [NO3−] and orthophosphate [PO43−]) to biologically and chemically conservative tracers (calcium [Ca2+], strontium [Sr2+], and Sr isotopes [87Sr/86Sr]). We also examined the behavior of dissolved organic carbon (DOC) relative to these constituents to understand whether bulk DOC behaved conservatively in a large boreal river network, where future changes in DOC and nutrient loading are expected under a shifting climate. We derived watershed spatial covariates comprising land cover, geology, and geomorphic characteristics at 14 different spatial extents based on stream order and relative to position in the river network to understand the effect of distant and proximal watershed attributes on streamwater constituents. For all constituents but 87Sr/86Sr, watershed attributes in low-order headwater catchments yielded the best predictive ability for streamwater constituent concentrations across the entire network. Spatial patterning for conservative tracers and bulk DOC showed strong spatial autocorrelation, whereas PO43− and NO3− exhibited spatial patchiness indicative of instream processing. Our work shows that headwater streams are disproportionately important contributors to network-wide biogeochemical constituents supporting aquatic food webs and that conservation and management of aquatic systems should include these small and often remote watershed areas.","container-title":"Journal of Geophysical Research: Biogeosciences","DOI":"10.1029/2020JG005851","ISSN":"2169-8961","issue":"12","language":"en","note":"_eprint: https://agupubs.onlinelibrary.wiley.com/doi/pdf/10.1029/2020JG005851","page":"e2020JG005851","source":"Wiley Online Library","title":"Headwater Catchments Govern Biogeochemistry in America's Largest Free-Flowing River Network","volume":"125","author":[{"family":"French","given":"David W."},{"family":"Schindler","given":"Daniel E."},{"family":"Brennan","given":"Sean R."},{"family":"Whited","given":"Diane"}],"issued":{"date-parts":[["2020"]]}}}],"schema":"https://github.com/citation-style-language/schema/raw/master/csl-citation.json"} </w:instrText>
       </w:r>
       <w:r>
         <w:rPr>
@@ -2203,11 +2379,12 @@
             </w:rPr>
           </w:rPrChange>
         </w:rPr>
-        <w:instrText xml:space="preserve"> ADDIN ZOTERO_ITEM CSL_CITATION {"citationID":"5Pp7WuA9","properties":{"formattedCitation":"(French et al., 2020)","plainCitation":"(French et al., 2020)","noteIndex":0},"citationItems":[{"id":1684,"uris":["http://zotero.org/users/8421274/items/M654PKRJ"],"itemData":{"id":1684,"type":"article-journal","abstract":"Riverine chemistry reflects both watershed conditions and instream processing, both of which vary across river networks, yet little is known about the scales at which watershed attributes regulate biogeochemical constituents. We used spatial stream network (SSN) models to quantify both watershed and instream effects on streamwater constituents in the Kuskokwim River (western Alaska), the largest free-flowing river in the United States. We assessed chemical constituents spanning from labile nutrients (nitrate [NO3−] and orthophosphate [PO43−]) to biologically and chemically conservative tracers (calcium [Ca2+], strontium [Sr2+], and Sr isotopes [87Sr/86Sr]). We also examined the behavior of dissolved organic carbon (DOC) relative to these constituents to understand whether bulk DOC behaved conservatively in a large boreal river network, where future changes in DOC and nutrient loading are expected under a shifting climate. We derived watershed spatial covariates comprising land cover, geology, and geomorphic characteristics at 14 different spatial extents based on stream order and relative to position in the river network to understand the effect of distant and proximal watershed attributes on streamwater constituents. For all constituents but 87Sr/86Sr, watershed attributes in low-order headwater catchments yielded the best predictive ability for streamwater constituent concentrations across the entire network. Spatial patterning for conservative tracers and bulk DOC showed strong spatial autocorrelation, whereas PO43− and NO3− exhibited spatial patchiness indicative of instream processing. Our work shows that headwater streams are disproportionately important contributors to network-wide biogeochemical constituents supporting aquatic food webs and that conservation and management of aquatic systems should include these small and often remote watershed areas.","container-title":"Journal of Geophysical Research: Biogeosciences","DOI":"10.1029/2020JG005851","ISSN":"2169-8961","issue":"12","language":"en","note":"_eprint: https://agupubs.onlinelibrary.wiley.com/doi/pdf/10.1029/2020JG005851","page":"e2020JG005851","source":"Wiley Online Library","title":"Headwater Catchments Govern Biogeochemistry in America's Largest Free-Flowing River Network","volume":"125","author":[{"family":"French","given":"David W."},{"family":"Schindler","given":"Daniel E."},{"family":"Brennan","given":"Sean R."},{"family":"Whited","given":"Diane"}],"issued":{"date-parts":[["2020"]]}}}],"schema":"https://github.com/citation-style-language/schema/raw/master/csl-citation.json"} </w:instrText>
-      </w:r>
-      <w:r>
-        <w:rPr>
-          <w:rFonts w:ascii="Garamond" w:eastAsia="Times New Roman" w:hAnsi="Garamond" w:cs="Times New Roman"/>
+        <w:fldChar w:fldCharType="separate"/>
+      </w:r>
+      <w:r>
+        <w:rPr>
+          <w:rFonts w:ascii="Garamond" w:eastAsia="Times New Roman" w:hAnsi="Garamond" w:cs="Times New Roman"/>
+          <w:noProof/>
           <w:kern w:val="0"/>
           <w:sz w:val="22"/>
           <w:szCs w:val="22"/>
@@ -2215,6 +2392,7 @@
           <w:rPrChange w:id="6" w:author="Benjamin J. Makhlouf" w:date="2025-07-26T13:00:00Z" w16du:dateUtc="2025-07-26T20:00:00Z">
             <w:rPr>
               <w:rFonts w:ascii="Garamond" w:eastAsia="Times New Roman" w:hAnsi="Garamond" w:cs="Times New Roman"/>
+              <w:noProof/>
               <w:kern w:val="0"/>
               <w:sz w:val="22"/>
               <w:szCs w:val="22"/>
@@ -2223,7 +2401,18 @@
             </w:rPr>
           </w:rPrChange>
         </w:rPr>
-        <w:fldChar w:fldCharType="separate"/>
+        <w:t>(</w:t>
+      </w:r>
+      <w:r>
+        <w:rPr>
+          <w:rFonts w:ascii="Garamond" w:eastAsia="Times New Roman" w:hAnsi="Garamond" w:cs="Times New Roman"/>
+          <w:noProof/>
+          <w:kern w:val="0"/>
+          <w:sz w:val="22"/>
+          <w:szCs w:val="22"/>
+          <w14:ligatures w14:val="none"/>
+        </w:rPr>
+        <w:t xml:space="preserve"> </w:t>
       </w:r>
       <w:r>
         <w:rPr>
@@ -2245,7 +2434,18 @@
             </w:rPr>
           </w:rPrChange>
         </w:rPr>
-        <w:t>(French et al., 2020</w:t>
+        <w:t>N = 120</w:t>
+      </w:r>
+      <w:r>
+        <w:rPr>
+          <w:rFonts w:ascii="Garamond" w:eastAsia="Times New Roman" w:hAnsi="Garamond" w:cs="Times New Roman"/>
+          <w:noProof/>
+          <w:kern w:val="0"/>
+          <w:sz w:val="22"/>
+          <w:szCs w:val="22"/>
+          <w14:ligatures w14:val="none"/>
+        </w:rPr>
+        <w:t xml:space="preserve">, </w:t>
       </w:r>
       <w:r>
         <w:rPr>
@@ -2267,38 +2467,16 @@
             </w:rPr>
           </w:rPrChange>
         </w:rPr>
-        <w:t>, N = 120</w:t>
-      </w:r>
-      <w:r>
-        <w:rPr>
-          <w:rFonts w:ascii="Garamond" w:eastAsia="Times New Roman" w:hAnsi="Garamond" w:cs="Times New Roman"/>
-          <w:noProof/>
+        <w:t>French et al., 2020)</w:t>
+      </w:r>
+      <w:r>
+        <w:rPr>
+          <w:rFonts w:ascii="Garamond" w:eastAsia="Times New Roman" w:hAnsi="Garamond" w:cs="Times New Roman"/>
           <w:kern w:val="0"/>
           <w:sz w:val="22"/>
           <w:szCs w:val="22"/>
           <w14:ligatures w14:val="none"/>
           <w:rPrChange w:id="9" w:author="Benjamin J. Makhlouf" w:date="2025-07-26T13:00:00Z" w16du:dateUtc="2025-07-26T20:00:00Z">
-            <w:rPr>
-              <w:rFonts w:ascii="Garamond" w:eastAsia="Times New Roman" w:hAnsi="Garamond" w:cs="Times New Roman"/>
-              <w:noProof/>
-              <w:kern w:val="0"/>
-              <w:sz w:val="22"/>
-              <w:szCs w:val="22"/>
-              <w:highlight w:val="yellow"/>
-              <w14:ligatures w14:val="none"/>
-            </w:rPr>
-          </w:rPrChange>
-        </w:rPr>
-        <w:t>)</w:t>
-      </w:r>
-      <w:r>
-        <w:rPr>
-          <w:rFonts w:ascii="Garamond" w:eastAsia="Times New Roman" w:hAnsi="Garamond" w:cs="Times New Roman"/>
-          <w:kern w:val="0"/>
-          <w:sz w:val="22"/>
-          <w:szCs w:val="22"/>
-          <w14:ligatures w14:val="none"/>
-          <w:rPrChange w:id="10" w:author="Benjamin J. Makhlouf" w:date="2025-07-26T13:00:00Z" w16du:dateUtc="2025-07-26T20:00:00Z">
             <w:rPr>
               <w:rFonts w:ascii="Garamond" w:eastAsia="Times New Roman" w:hAnsi="Garamond" w:cs="Times New Roman"/>
               <w:kern w:val="0"/>
@@ -2427,7 +2605,126 @@
           <w:sz w:val="22"/>
           <w:szCs w:val="22"/>
         </w:rPr>
-        <w:t xml:space="preserve"> values and their associated uncertainties for roughly every ~1km stretch of tributaries across the basin </w:t>
+        <w:t xml:space="preserve"> </w:t>
+      </w:r>
+      <w:r>
+        <w:rPr>
+          <w:rFonts w:ascii="Garamond" w:hAnsi="Garamond" w:cs="Times New Roman"/>
+          <w:sz w:val="22"/>
+          <w:szCs w:val="22"/>
+        </w:rPr>
+        <w:t>ratios</w:t>
+      </w:r>
+      <w:r>
+        <w:rPr>
+          <w:rFonts w:ascii="Garamond" w:hAnsi="Garamond" w:cs="Times New Roman"/>
+          <w:sz w:val="22"/>
+          <w:szCs w:val="22"/>
+        </w:rPr>
+        <w:t xml:space="preserve"> and associated uncertainties for roughly every ~1km stretch of tributaries across the basin </w:t>
+      </w:r>
+      <w:commentRangeStart w:id="10"/>
+      <w:r>
+        <w:rPr>
+          <w:rFonts w:ascii="Garamond" w:hAnsi="Garamond" w:cs="Times New Roman"/>
+          <w:sz w:val="22"/>
+          <w:szCs w:val="22"/>
+        </w:rPr>
+        <w:t xml:space="preserve">(Figure </w:t>
+      </w:r>
+      <w:r>
+        <w:rPr>
+          <w:rFonts w:ascii="Garamond" w:hAnsi="Garamond" w:cs="Times New Roman"/>
+          <w:sz w:val="22"/>
+          <w:szCs w:val="22"/>
+        </w:rPr>
+        <w:t>1</w:t>
+      </w:r>
+      <w:r>
+        <w:rPr>
+          <w:rFonts w:ascii="Garamond" w:hAnsi="Garamond" w:cs="Times New Roman"/>
+          <w:sz w:val="22"/>
+          <w:szCs w:val="22"/>
+        </w:rPr>
+        <w:t>)</w:t>
+      </w:r>
+      <w:r>
+        <w:rPr>
+          <w:rFonts w:ascii="Garamond" w:eastAsia="Times New Roman" w:hAnsi="Garamond" w:cs="Times New Roman"/>
+          <w:kern w:val="0"/>
+          <w:sz w:val="22"/>
+          <w:szCs w:val="22"/>
+          <w14:ligatures w14:val="none"/>
+        </w:rPr>
+        <w:t xml:space="preserve"> </w:t>
+      </w:r>
+      <w:commentRangeEnd w:id="10"/>
+      <w:r>
+        <w:rPr>
+          <w:rStyle w:val="CommentReference"/>
+        </w:rPr>
+        <w:commentReference w:id="10"/>
+      </w:r>
+      <w:r>
+        <w:rPr>
+          <w:rFonts w:ascii="Garamond" w:eastAsia="Times New Roman" w:hAnsi="Garamond" w:cs="Times New Roman"/>
+          <w:kern w:val="0"/>
+          <w:sz w:val="22"/>
+          <w:szCs w:val="22"/>
+          <w14:ligatures w14:val="none"/>
+        </w:rPr>
+        <w:fldChar w:fldCharType="begin"/>
+      </w:r>
+      <w:r>
+        <w:rPr>
+          <w:rFonts w:ascii="Garamond" w:eastAsia="Times New Roman" w:hAnsi="Garamond" w:cs="Times New Roman"/>
+          <w:kern w:val="0"/>
+          <w:sz w:val="22"/>
+          <w:szCs w:val="22"/>
+          <w14:ligatures w14:val="none"/>
+        </w:rPr>
+        <w:instrText xml:space="preserve"> ADDIN ZOTERO_ITEM CSL_CITATION {"citationID":"M10Aqb9z","properties":{"formattedCitation":"(Brennan et al., 2016; Ver Hoef &amp; Peterson, 2010)","plainCitation":"(Brennan et al., 2016; Ver Hoef &amp; Peterson, 2010)","noteIndex":0},"citationItems":[{"id":2315,"uris":["http://zotero.org/users/8421274/items/Q4IUGSIX"],"itemData":{"id":2315,"type":"article-journal","abstract":"A critical challenge for the Earth sciences is to trace the transport and flux of matter within and among aquatic, terrestrial, and atmospheric systems. Robust descriptions of isotopic patterns across space and time, called “isoscapes,” form the basis of a rapidly growing and wide-ranging body of research aimed at quantifying connectivity within and among Earth's systems. However, isoscapes of rivers have been limited by conventional Euclidean approaches in geostatistics and the lack of a quantitative framework to apportion the influence of processes driven by landscape features versus in-stream phenomena. Here we demonstrate how dendritic network models substantially improve the accuracy of isoscapes of strontium isotopes and partition the influence of hydrologic transport versus local geologic features on strontium isotope ratios in a large Alaska river. This work illustrates the analytical power of dendritic network models for the field of isotope biogeochemistry, particularly for provenance studies of modern and ancient animals.","container-title":"Geophysical Research Letters","DOI":"10.1002/2016GL068904","ISSN":"1944-8007","issue":"10","language":"en","note":"_eprint: https://onlinelibrary.wiley.com/doi/pdf/10.1002/2016GL068904","page":"5043-5051","source":"Wiley Online Library","title":"Dendritic network models: Improving isoscapes and quantifying influence of landscape and in-stream processes on strontium isotopes in rivers","title-short":"Dendritic network models","volume":"43","author":[{"family":"Brennan","given":"Sean R."},{"family":"Torgersen","given":"Christian E."},{"family":"Hollenbeck","given":"Jeff P."},{"family":"Fernandez","given":"Diego P."},{"family":"Jensen","given":"Carrie K."},{"family":"Schindler","given":"Daniel E."}],"issued":{"date-parts":[["2016"]]}}},{"id":4769,"uris":["http://zotero.org/users/8421274/items/XBJELDI4"],"itemData":{"id":4769,"type":"article-journal","container-title":"Journal of the American Statistical Association","DOI":"10.1198/jasa.2009.ap08248","ISSN":"0162-1459, 1537-274X","issue":"489","journalAbbreviation":"Journal of the American Statistical Association","language":"en","page":"6-18","source":"DOI.org (Crossref)","title":"A Moving Average Approach for Spatial Statistical Models of Stream Networks","volume":"105","author":[{"family":"Ver Hoef","given":"Jay M."},{"family":"Peterson","given":"Erin E."}],"issued":{"date-parts":[["2010",3,1]]}}}],"schema":"https://github.com/citation-style-language/schema/raw/master/csl-citation.json"} </w:instrText>
+      </w:r>
+      <w:r>
+        <w:rPr>
+          <w:rFonts w:ascii="Garamond" w:eastAsia="Times New Roman" w:hAnsi="Garamond" w:cs="Times New Roman"/>
+          <w:kern w:val="0"/>
+          <w:sz w:val="22"/>
+          <w:szCs w:val="22"/>
+          <w14:ligatures w14:val="none"/>
+        </w:rPr>
+        <w:fldChar w:fldCharType="separate"/>
+      </w:r>
+      <w:r>
+        <w:rPr>
+          <w:rFonts w:ascii="Garamond" w:eastAsia="Times New Roman" w:hAnsi="Garamond" w:cs="Times New Roman"/>
+          <w:noProof/>
+          <w:kern w:val="0"/>
+          <w:sz w:val="22"/>
+          <w:szCs w:val="22"/>
+          <w14:ligatures w14:val="none"/>
+        </w:rPr>
+        <w:t>(Brennan et al., 2016; Ver Hoef &amp; Peterson, 2010)</w:t>
+      </w:r>
+      <w:r>
+        <w:rPr>
+          <w:rFonts w:ascii="Garamond" w:eastAsia="Times New Roman" w:hAnsi="Garamond" w:cs="Times New Roman"/>
+          <w:kern w:val="0"/>
+          <w:sz w:val="22"/>
+          <w:szCs w:val="22"/>
+          <w14:ligatures w14:val="none"/>
+        </w:rPr>
+        <w:fldChar w:fldCharType="end"/>
+      </w:r>
+      <w:r>
+        <w:rPr>
+          <w:rFonts w:ascii="Garamond" w:eastAsia="Times New Roman" w:hAnsi="Garamond" w:cs="Times New Roman"/>
+          <w:kern w:val="0"/>
+          <w:sz w:val="22"/>
+          <w:szCs w:val="22"/>
+          <w14:ligatures w14:val="none"/>
+        </w:rPr>
+        <w:t xml:space="preserve">. </w:t>
       </w:r>
       <w:commentRangeStart w:id="11"/>
       <w:r>
@@ -2436,7 +2733,7 @@
           <w:sz w:val="22"/>
           <w:szCs w:val="22"/>
         </w:rPr>
-        <w:t xml:space="preserve">(Figure </w:t>
+        <w:t>To prevent over-assignment to tributaries with exceptionally low prediction error</w:t>
       </w:r>
       <w:r>
         <w:rPr>
@@ -2444,7 +2741,7 @@
           <w:sz w:val="22"/>
           <w:szCs w:val="22"/>
         </w:rPr>
-        <w:t>1</w:t>
+        <w:t xml:space="preserve"> </w:t>
       </w:r>
       <w:r>
         <w:rPr>
@@ -2452,15 +2749,21 @@
           <w:sz w:val="22"/>
           <w:szCs w:val="22"/>
         </w:rPr>
-        <w:t>)</w:t>
-      </w:r>
-      <w:r>
-        <w:rPr>
-          <w:rFonts w:ascii="Garamond" w:eastAsia="Times New Roman" w:hAnsi="Garamond" w:cs="Times New Roman"/>
-          <w:kern w:val="0"/>
-          <w:sz w:val="22"/>
-          <w:szCs w:val="22"/>
-          <w14:ligatures w14:val="none"/>
+        <w:t>minimum error values were constrained to 0.0006</w:t>
+      </w:r>
+      <w:r>
+        <w:rPr>
+          <w:rFonts w:ascii="Garamond" w:hAnsi="Garamond" w:cs="Times New Roman"/>
+          <w:sz w:val="22"/>
+          <w:szCs w:val="22"/>
+        </w:rPr>
+        <w:t xml:space="preserve"> and above.</w:t>
+      </w:r>
+      <w:r>
+        <w:rPr>
+          <w:rFonts w:ascii="Garamond" w:hAnsi="Garamond" w:cs="Times New Roman"/>
+          <w:sz w:val="22"/>
+          <w:szCs w:val="22"/>
         </w:rPr>
         <w:t xml:space="preserve"> </w:t>
       </w:r>
@@ -2473,73 +2776,11 @@
       </w:r>
       <w:r>
         <w:rPr>
-          <w:rFonts w:ascii="Garamond" w:eastAsia="Times New Roman" w:hAnsi="Garamond" w:cs="Times New Roman"/>
-          <w:kern w:val="0"/>
-          <w:sz w:val="22"/>
-          <w:szCs w:val="22"/>
-          <w14:ligatures w14:val="none"/>
-        </w:rPr>
-        <w:fldChar w:fldCharType="begin"/>
-      </w:r>
-      <w:r>
-        <w:rPr>
-          <w:rFonts w:ascii="Garamond" w:eastAsia="Times New Roman" w:hAnsi="Garamond" w:cs="Times New Roman"/>
-          <w:kern w:val="0"/>
-          <w:sz w:val="22"/>
-          <w:szCs w:val="22"/>
-          <w14:ligatures w14:val="none"/>
-        </w:rPr>
-        <w:instrText xml:space="preserve"> ADDIN ZOTERO_ITEM CSL_CITATION {"citationID":"a4pXqHFf","properties":{"formattedCitation":"(Ver Hoef &amp; Peterson, 2010)","plainCitation":"(Ver Hoef &amp; Peterson, 2010)","noteIndex":0},"citationItems":[{"id":4769,"uris":["http://zotero.org/users/8421274/items/XBJELDI4"],"itemData":{"id":4769,"type":"article-journal","container-title":"Journal of the American Statistical Association","DOI":"10.1198/jasa.2009.ap08248","ISSN":"0162-1459, 1537-274X","issue":"489","journalAbbreviation":"Journal of the American Statistical Association","language":"en","page":"6-18","source":"DOI.org (Crossref)","title":"A Moving Average Approach for Spatial Statistical Models of Stream Networks","volume":"105","author":[{"family":"Ver Hoef","given":"Jay M."},{"family":"Peterson","given":"Erin E."}],"issued":{"date-parts":[["2010",3,1]]}}}],"schema":"https://github.com/citation-style-language/schema/raw/master/csl-citation.json"} </w:instrText>
-      </w:r>
-      <w:r>
-        <w:rPr>
-          <w:rFonts w:ascii="Garamond" w:eastAsia="Times New Roman" w:hAnsi="Garamond" w:cs="Times New Roman"/>
-          <w:kern w:val="0"/>
-          <w:sz w:val="22"/>
-          <w:szCs w:val="22"/>
-          <w14:ligatures w14:val="none"/>
-        </w:rPr>
-        <w:fldChar w:fldCharType="separate"/>
-      </w:r>
-      <w:r>
-        <w:rPr>
-          <w:rFonts w:ascii="Garamond" w:eastAsia="Times New Roman" w:hAnsi="Garamond" w:cs="Times New Roman"/>
-          <w:noProof/>
-          <w:kern w:val="0"/>
-          <w:sz w:val="22"/>
-          <w:szCs w:val="22"/>
-          <w14:ligatures w14:val="none"/>
-        </w:rPr>
-        <w:t>(Ver Hoef &amp; Peterson, 2010)</w:t>
-      </w:r>
-      <w:r>
-        <w:rPr>
-          <w:rFonts w:ascii="Garamond" w:eastAsia="Times New Roman" w:hAnsi="Garamond" w:cs="Times New Roman"/>
-          <w:kern w:val="0"/>
-          <w:sz w:val="22"/>
-          <w:szCs w:val="22"/>
-          <w14:ligatures w14:val="none"/>
-        </w:rPr>
-        <w:fldChar w:fldCharType="end"/>
-      </w:r>
-      <w:r>
-        <w:rPr>
-          <w:rFonts w:ascii="Garamond" w:eastAsia="Times New Roman" w:hAnsi="Garamond" w:cs="Times New Roman"/>
-          <w:kern w:val="0"/>
-          <w:sz w:val="22"/>
-          <w:szCs w:val="22"/>
-          <w14:ligatures w14:val="none"/>
-        </w:rPr>
-        <w:t xml:space="preserve">. </w:t>
-      </w:r>
-      <w:commentRangeStart w:id="12"/>
-      <w:r>
-        <w:rPr>
           <w:rFonts w:ascii="Garamond" w:hAnsi="Garamond" w:cs="Times New Roman"/>
           <w:sz w:val="22"/>
           <w:szCs w:val="22"/>
         </w:rPr>
-        <w:t>To prevent over-assignment to tributaries with exceptionally low prediction error</w:t>
+        <w:t xml:space="preserve">This threshold was selected </w:t>
       </w:r>
       <w:r>
         <w:rPr>
@@ -2547,91 +2788,16 @@
           <w:sz w:val="22"/>
           <w:szCs w:val="22"/>
         </w:rPr>
-        <w:t xml:space="preserve"> </w:t>
-      </w:r>
-      <w:r>
-        <w:rPr>
-          <w:rFonts w:ascii="Garamond" w:hAnsi="Garamond" w:cs="Times New Roman"/>
-          <w:sz w:val="22"/>
-          <w:szCs w:val="22"/>
-        </w:rPr>
-        <w:t>minimum error values were constrained to 0.0006</w:t>
-      </w:r>
-      <w:r>
-        <w:rPr>
-          <w:rFonts w:ascii="Garamond" w:hAnsi="Garamond" w:cs="Times New Roman"/>
-          <w:sz w:val="22"/>
-          <w:szCs w:val="22"/>
-        </w:rPr>
-        <w:t xml:space="preserve"> and above.</w:t>
-      </w:r>
-      <w:r>
-        <w:rPr>
-          <w:rFonts w:ascii="Garamond" w:hAnsi="Garamond" w:cs="Times New Roman"/>
-          <w:sz w:val="22"/>
-          <w:szCs w:val="22"/>
-        </w:rPr>
-        <w:t xml:space="preserve"> </w:t>
-      </w:r>
-      <w:commentRangeEnd w:id="12"/>
-      <w:r>
-        <w:rPr>
-          <w:rStyle w:val="CommentReference"/>
-        </w:rPr>
-        <w:commentReference w:id="12"/>
-      </w:r>
-      <w:r>
-        <w:rPr>
-          <w:rFonts w:ascii="Garamond" w:hAnsi="Garamond" w:cs="Times New Roman"/>
-          <w:sz w:val="22"/>
-          <w:szCs w:val="22"/>
-        </w:rPr>
-        <w:t>This threshold was selected through</w:t>
-      </w:r>
-      <w:r>
-        <w:rPr>
-          <w:rFonts w:ascii="Garamond" w:hAnsi="Garamond" w:cs="Times New Roman"/>
-          <w:sz w:val="22"/>
-          <w:szCs w:val="22"/>
-        </w:rPr>
-        <w:t xml:space="preserve"> a</w:t>
-      </w:r>
-      <w:r>
-        <w:rPr>
-          <w:rFonts w:ascii="Garamond" w:hAnsi="Garamond" w:cs="Times New Roman"/>
-          <w:sz w:val="22"/>
-          <w:szCs w:val="22"/>
-        </w:rPr>
-        <w:t xml:space="preserve"> systematic evaluation to minimize assignments driven primarily by uncertainty differences rather than isotopic similarity</w:t>
-      </w:r>
-      <w:r>
-        <w:rPr>
-          <w:rFonts w:ascii="Garamond" w:hAnsi="Garamond" w:cs="Times New Roman"/>
-          <w:sz w:val="22"/>
-          <w:szCs w:val="22"/>
-        </w:rPr>
-        <w:t xml:space="preserve"> </w:t>
-      </w:r>
-      <w:r>
-        <w:rPr>
-          <w:rFonts w:ascii="Garamond" w:hAnsi="Garamond" w:cs="Times New Roman"/>
-          <w:sz w:val="22"/>
-          <w:szCs w:val="22"/>
-        </w:rPr>
-        <w:t>while preserving broad-scale production patterns across the basin</w:t>
+        <w:t xml:space="preserve">by visually examining the histogram for a cutoff which adjusted the error values for a small number of exceedingly low error tributaries while maintaining the general trend of uncertainty resulting from SSN model fit. </w:t>
       </w:r>
     </w:p>
     <w:p>
       <w:pPr>
         <w:spacing w:before="100" w:beforeAutospacing="1" w:after="100" w:afterAutospacing="1" w:line="480" w:lineRule="auto"/>
         <w:rPr>
-          <w:rFonts w:ascii="Garamond" w:eastAsia="Times New Roman" w:hAnsi="Garamond" w:cs="Times New Roman"/>
-          <w:b/>
-          <w:bCs/>
-          <w:kern w:val="0"/>
-          <w:sz w:val="22"/>
-          <w:szCs w:val="22"/>
-          <w14:ligatures w14:val="none"/>
+          <w:rFonts w:ascii="Garamond" w:hAnsi="Garamond" w:cs="Times New Roman"/>
+          <w:sz w:val="22"/>
+          <w:szCs w:val="22"/>
         </w:rPr>
       </w:pPr>
       <w:r>
@@ -3684,54 +3850,47 @@
           <w:rFonts w:ascii="Garamond" w:hAnsi="Garamond"/>
           <w:sz w:val="22"/>
           <w:szCs w:val="22"/>
-          <w:highlight w:val="yellow"/>
-        </w:rPr>
-        <w:t>(</w:t>
-      </w:r>
-      <w:r>
-        <w:rPr>
-          <w:rFonts w:ascii="Garamond" w:hAnsi="Garamond"/>
-          <w:sz w:val="22"/>
-          <w:szCs w:val="22"/>
-          <w:highlight w:val="yellow"/>
-        </w:rPr>
-        <w:t>Quinn</w:t>
-      </w:r>
-      <w:del w:id="13" w:author="Benjamin J. Makhlouf" w:date="2025-07-26T11:29:00Z" w16du:dateUtc="2025-07-26T18:29:00Z">
-        <w:r>
-          <w:rPr>
-            <w:rFonts w:ascii="Garamond" w:hAnsi="Garamond"/>
-            <w:sz w:val="22"/>
-            <w:szCs w:val="22"/>
-            <w:highlight w:val="yellow"/>
-          </w:rPr>
-          <w:delText xml:space="preserve"> </w:delText>
-        </w:r>
-      </w:del>
-      <w:r>
-        <w:rPr>
-          <w:rFonts w:ascii="Garamond" w:hAnsi="Garamond"/>
-          <w:sz w:val="22"/>
-          <w:szCs w:val="22"/>
-          <w:highlight w:val="yellow"/>
-        </w:rPr>
-        <w:t>, 2018</w:t>
-      </w:r>
-      <w:r>
-        <w:rPr>
-          <w:rFonts w:ascii="Garamond" w:hAnsi="Garamond"/>
-          <w:sz w:val="22"/>
-          <w:szCs w:val="22"/>
-          <w:highlight w:val="yellow"/>
-        </w:rPr>
-        <w:t>)</w:t>
-      </w:r>
-      <w:r>
-        <w:rPr>
-          <w:rFonts w:ascii="Garamond" w:hAnsi="Garamond"/>
-          <w:sz w:val="22"/>
-          <w:szCs w:val="22"/>
-          <w:highlight w:val="yellow"/>
+        </w:rPr>
+        <w:fldChar w:fldCharType="begin"/>
+      </w:r>
+      <w:r>
+        <w:rPr>
+          <w:rFonts w:ascii="Garamond" w:hAnsi="Garamond"/>
+          <w:sz w:val="22"/>
+          <w:szCs w:val="22"/>
+        </w:rPr>
+        <w:instrText xml:space="preserve"> ADDIN ZOTERO_ITEM CSL_CITATION {"citationID":"hf3x3enX","properties":{"formattedCitation":"(Quinn, 2018)","plainCitation":"(Quinn, 2018)","noteIndex":0},"citationItems":[{"id":5568,"uris":["http://zotero.org/users/8421274/items/TBWE7PX7"],"itemData":{"id":5568,"type":"book","publisher":"American Fisheries Society, University of Washington Press","title":"The Behavior and Ecology of Pacific Salmon and Trout","author":[{"family":"Quinn","given":"Thomas P"}],"issued":{"date-parts":[["2018",10]]}}}],"schema":"https://github.com/citation-style-language/schema/raw/master/csl-citation.json"} </w:instrText>
+      </w:r>
+      <w:r>
+        <w:rPr>
+          <w:rFonts w:ascii="Garamond" w:hAnsi="Garamond"/>
+          <w:sz w:val="22"/>
+          <w:szCs w:val="22"/>
+        </w:rPr>
+        <w:fldChar w:fldCharType="separate"/>
+      </w:r>
+      <w:r>
+        <w:rPr>
+          <w:rFonts w:ascii="Garamond" w:hAnsi="Garamond"/>
+          <w:noProof/>
+          <w:sz w:val="22"/>
+          <w:szCs w:val="22"/>
+        </w:rPr>
+        <w:t>(Quinn, 2018)</w:t>
+      </w:r>
+      <w:r>
+        <w:rPr>
+          <w:rFonts w:ascii="Garamond" w:hAnsi="Garamond"/>
+          <w:sz w:val="22"/>
+          <w:szCs w:val="22"/>
+        </w:rPr>
+        <w:fldChar w:fldCharType="end"/>
+      </w:r>
+      <w:r>
+        <w:rPr>
+          <w:rFonts w:ascii="Garamond" w:hAnsi="Garamond"/>
+          <w:sz w:val="22"/>
+          <w:szCs w:val="22"/>
         </w:rPr>
         <w:t>.</w:t>
       </w:r>
@@ -3805,68 +3964,7 @@
           <w:szCs w:val="22"/>
           <w14:ligatures w14:val="none"/>
         </w:rPr>
-        <w:t xml:space="preserve">) was used to exclude regions below </w:t>
-      </w:r>
-      <w:r>
-        <w:rPr>
-          <w:rFonts w:ascii="Garamond" w:eastAsia="Times New Roman" w:hAnsi="Garamond" w:cs="Times New Roman"/>
-          <w:kern w:val="0"/>
-          <w:sz w:val="22"/>
-          <w:szCs w:val="22"/>
-          <w14:ligatures w14:val="none"/>
-          <w:rPrChange w:id="14" w:author="Benjamin J. Makhlouf" w:date="2025-07-26T13:48:00Z" w16du:dateUtc="2025-07-26T20:48:00Z">
-            <w:rPr>
-              <w:rFonts w:ascii="Garamond" w:eastAsia="Times New Roman" w:hAnsi="Garamond" w:cs="Times New Roman"/>
-              <w:kern w:val="0"/>
-              <w:sz w:val="22"/>
-              <w:szCs w:val="22"/>
-              <w:highlight w:val="yellow"/>
-              <w14:ligatures w14:val="none"/>
-            </w:rPr>
-          </w:rPrChange>
-        </w:rPr>
-        <w:t>a threshold contributing slope value</w:t>
-      </w:r>
-      <w:r>
-        <w:rPr>
-          <w:rFonts w:ascii="Garamond" w:eastAsia="Times New Roman" w:hAnsi="Garamond" w:cs="Times New Roman"/>
-          <w:kern w:val="0"/>
-          <w:sz w:val="22"/>
-          <w:szCs w:val="22"/>
-          <w14:ligatures w14:val="none"/>
-        </w:rPr>
-        <w:t xml:space="preserve"> of </w:t>
-      </w:r>
-      <w:r>
-        <w:rPr>
-          <w:rFonts w:ascii="Garamond" w:eastAsia="Times New Roman" w:hAnsi="Garamond" w:cs="Times New Roman"/>
-          <w:kern w:val="0"/>
-          <w:sz w:val="22"/>
-          <w:szCs w:val="22"/>
-          <w:highlight w:val="yellow"/>
-          <w14:ligatures w14:val="none"/>
-        </w:rPr>
-        <w:t>_____</w:t>
-      </w:r>
-      <w:r>
-        <w:rPr>
-          <w:rFonts w:ascii="Garamond" w:eastAsia="Times New Roman" w:hAnsi="Garamond" w:cs="Times New Roman"/>
-          <w:kern w:val="0"/>
-          <w:sz w:val="22"/>
-          <w:szCs w:val="22"/>
-          <w14:ligatures w14:val="none"/>
-        </w:rPr>
-        <w:t>,</w:t>
-      </w:r>
-      <w:r>
-        <w:rPr>
-          <w:rFonts w:ascii="Garamond" w:eastAsia="Times New Roman" w:hAnsi="Garamond" w:cs="Times New Roman"/>
-          <w:kern w:val="0"/>
-          <w:sz w:val="22"/>
-          <w:szCs w:val="22"/>
-          <w14:ligatures w14:val="none"/>
-        </w:rPr>
-        <w:t xml:space="preserve"> thereby preventing assignment to exceedingly slow or flat reaches determined to be unsuitable </w:t>
+        <w:t xml:space="preserve">) was used to exclude exceedingly slow or flat reaches determined to be unsuitable </w:t>
       </w:r>
       <w:r>
         <w:rPr>
@@ -3906,6 +4004,75 @@
           <w:szCs w:val="22"/>
           <w14:ligatures w14:val="none"/>
         </w:rPr>
+        <w:t xml:space="preserve"> </w:t>
+      </w:r>
+      <w:commentRangeStart w:id="12"/>
+      <w:r>
+        <w:rPr>
+          <w:rFonts w:ascii="Garamond" w:eastAsia="Times New Roman" w:hAnsi="Garamond" w:cs="Times New Roman"/>
+          <w:kern w:val="0"/>
+          <w:sz w:val="22"/>
+          <w:szCs w:val="22"/>
+          <w14:ligatures w14:val="none"/>
+        </w:rPr>
+        <w:fldChar w:fldCharType="begin"/>
+      </w:r>
+      <w:r>
+        <w:rPr>
+          <w:rFonts w:ascii="Garamond" w:eastAsia="Times New Roman" w:hAnsi="Garamond" w:cs="Times New Roman"/>
+          <w:kern w:val="0"/>
+          <w:sz w:val="22"/>
+          <w:szCs w:val="22"/>
+          <w14:ligatures w14:val="none"/>
+        </w:rPr>
+        <w:instrText xml:space="preserve"> ADDIN ZOTERO_ITEM CSL_CITATION {"citationID":"H4pJnquA","properties":{"formattedCitation":"(Makhlouf et al., 2025)","plainCitation":"(Makhlouf et al., 2025)","noteIndex":0},"citationItems":[{"id":5397,"uris":["http://zotero.org/users/8421274/items/WRVF2L9N"],"itemData":{"id":5397,"type":"article-journal","abstract":"Understanding the spatial ecology of migratory species is uniquely challenging using conventional approaches. In fisheries such as for Pacific salmon, genetic stock identification (GSI) and isotope-based methods have emerged as strategies for reconstructing spatial ecology but are limited by the spatial resolution of genetic differentiation and isotopic heterogeneity. We show that integrating these complementary datasets improve the spatial resolution of provenance assignments. To do so, we reconstructed basin-wide estimates of natal origin locations for Chinook salmon in the Yukon River using samples (n = 247) from an experimental fishery designed to assess in-season run timing. A combined framework improved precision of likely provenance assignments (stream km &gt; 0.7 posterior probability) by 92% over genetic assignments and 52% over strontium isotope methods. In doing so, we illustrate watershed scale estimates of natal origin distributions with a greater resolution available from GSI or isotope data alone.","container-title":"Limnology and Oceanography Letters","DOI":"10.1002/lol2.70025","ISSN":"2378-2242","issue":"n/a","language":"en","license":"© 2025 The Author(s). Limnology and Oceanography Letters published by Wiley Periodicals LLC on behalf of Association for the Sciences of Limnology and Oceanography.","note":"_eprint: https://onlinelibrary.wiley.com/doi/pdf/10.1002/lol2.70025","source":"Wiley Online Library","title":"Combining genetic and isotope frameworks improves reconstruction of fish provenance across riverscapes","URL":"https://onlinelibrary.wiley.com/doi/abs/10.1002/lol2.70025","volume":"n/a","author":[{"family":"Makhlouf","given":"Ben"},{"family":"Cline","given":"Timothy J."},{"family":"Fernandez","given":"Diego"},{"family":"Seeb","given":"Lisa"},{"family":"Lee","given":"Elizabeth"},{"family":"Gilk-Baumer","given":"Sara"},{"family":"Whited","given":"Diane"},{"family":"Zimmerman","given":"Christian E."},{"family":"Schindler","given":"Daniel E."}],"accessed":{"date-parts":[["2025",6,4]]},"issued":{"date-parts":[["2025"]]}}}],"schema":"https://github.com/citation-style-language/schema/raw/master/csl-citation.json"} </w:instrText>
+      </w:r>
+      <w:r>
+        <w:rPr>
+          <w:rFonts w:ascii="Garamond" w:eastAsia="Times New Roman" w:hAnsi="Garamond" w:cs="Times New Roman"/>
+          <w:kern w:val="0"/>
+          <w:sz w:val="22"/>
+          <w:szCs w:val="22"/>
+          <w14:ligatures w14:val="none"/>
+        </w:rPr>
+        <w:fldChar w:fldCharType="separate"/>
+      </w:r>
+      <w:r>
+        <w:rPr>
+          <w:rFonts w:ascii="Garamond" w:eastAsia="Times New Roman" w:hAnsi="Garamond" w:cs="Times New Roman"/>
+          <w:noProof/>
+          <w:kern w:val="0"/>
+          <w:sz w:val="22"/>
+          <w:szCs w:val="22"/>
+          <w14:ligatures w14:val="none"/>
+        </w:rPr>
+        <w:t>(Makhlouf et al., 2025)</w:t>
+      </w:r>
+      <w:r>
+        <w:rPr>
+          <w:rFonts w:ascii="Garamond" w:eastAsia="Times New Roman" w:hAnsi="Garamond" w:cs="Times New Roman"/>
+          <w:kern w:val="0"/>
+          <w:sz w:val="22"/>
+          <w:szCs w:val="22"/>
+          <w14:ligatures w14:val="none"/>
+        </w:rPr>
+        <w:fldChar w:fldCharType="end"/>
+      </w:r>
+      <w:commentRangeEnd w:id="12"/>
+      <w:r>
+        <w:rPr>
+          <w:rStyle w:val="CommentReference"/>
+        </w:rPr>
+        <w:commentReference w:id="12"/>
+      </w:r>
+      <w:r>
+        <w:rPr>
+          <w:rFonts w:ascii="Garamond" w:eastAsia="Times New Roman" w:hAnsi="Garamond" w:cs="Times New Roman"/>
+          <w:kern w:val="0"/>
+          <w:sz w:val="22"/>
+          <w:szCs w:val="22"/>
+          <w14:ligatures w14:val="none"/>
+        </w:rPr>
         <w:t xml:space="preserve">. </w:t>
       </w:r>
       <w:r>
@@ -3914,7 +4081,6 @@
           <w:kern w:val="0"/>
           <w:sz w:val="22"/>
           <w:szCs w:val="22"/>
-          <w:highlight w:val="yellow"/>
           <w14:ligatures w14:val="none"/>
         </w:rPr>
         <w:t xml:space="preserve">Finally, data was included on observed locations of spawning </w:t>
@@ -3925,7 +4091,6 @@
           <w:kern w:val="0"/>
           <w:sz w:val="22"/>
           <w:szCs w:val="22"/>
-          <w:highlight w:val="yellow"/>
           <w14:ligatures w14:val="none"/>
         </w:rPr>
         <w:t>C</w:t>
@@ -3936,7 +4101,6 @@
           <w:kern w:val="0"/>
           <w:sz w:val="22"/>
           <w:szCs w:val="22"/>
-          <w:highlight w:val="yellow"/>
           <w14:ligatures w14:val="none"/>
         </w:rPr>
         <w:t>hinook presence derived from USGS Arctic-Yukon-Kuskokwim (AYK) Chinook Salmon Intrinsic potential mapping</w:t>
@@ -3947,7 +4111,6 @@
           <w:kern w:val="0"/>
           <w:sz w:val="22"/>
           <w:szCs w:val="22"/>
-          <w:highlight w:val="yellow"/>
           <w14:ligatures w14:val="none"/>
         </w:rPr>
         <w:t xml:space="preserve">, which </w:t>
@@ -3958,7 +4121,6 @@
           <w:kern w:val="0"/>
           <w:sz w:val="22"/>
           <w:szCs w:val="22"/>
-          <w:highlight w:val="yellow"/>
           <w14:ligatures w14:val="none"/>
         </w:rPr>
         <w:t>synthesize</w:t>
@@ -3969,7 +4131,6 @@
           <w:kern w:val="0"/>
           <w:sz w:val="22"/>
           <w:szCs w:val="22"/>
-          <w:highlight w:val="yellow"/>
           <w14:ligatures w14:val="none"/>
         </w:rPr>
         <w:t>d</w:t>
@@ -3980,29 +4141,66 @@
           <w:kern w:val="0"/>
           <w:sz w:val="22"/>
           <w:szCs w:val="22"/>
-          <w:highlight w:val="yellow"/>
-          <w14:ligatures w14:val="none"/>
-        </w:rPr>
-        <w:t xml:space="preserve"> several sources of data on observed Chinook salmon spawners  to provide a binary 0 or 1 value for locations with or without observations across the dataset</w:t>
-      </w:r>
-      <w:r>
-        <w:rPr>
-          <w:rFonts w:ascii="Garamond" w:eastAsia="Times New Roman" w:hAnsi="Garamond" w:cs="Times New Roman"/>
-          <w:kern w:val="0"/>
-          <w:sz w:val="22"/>
-          <w:szCs w:val="22"/>
-          <w:highlight w:val="yellow"/>
-          <w14:ligatures w14:val="none"/>
-        </w:rPr>
-        <w:t xml:space="preserve"> </w:t>
-      </w:r>
-      <w:r>
-        <w:rPr>
-          <w:rFonts w:ascii="Garamond" w:eastAsia="Times New Roman" w:hAnsi="Garamond" w:cs="Times New Roman"/>
-          <w:kern w:val="0"/>
-          <w:sz w:val="22"/>
-          <w:szCs w:val="22"/>
-          <w:highlight w:val="yellow"/>
+          <w14:ligatures w14:val="none"/>
+        </w:rPr>
+        <w:t xml:space="preserve"> several sources of data on observed Chinook salmon spawners to provide </w:t>
+      </w:r>
+      <w:r>
+        <w:rPr>
+          <w:rFonts w:ascii="Garamond" w:eastAsia="Times New Roman" w:hAnsi="Garamond" w:cs="Times New Roman"/>
+          <w:kern w:val="0"/>
+          <w:sz w:val="22"/>
+          <w:szCs w:val="22"/>
+          <w14:ligatures w14:val="none"/>
+        </w:rPr>
+        <w:t xml:space="preserve">data on known </w:t>
+      </w:r>
+      <w:r>
+        <w:rPr>
+          <w:rFonts w:ascii="Garamond" w:eastAsia="Times New Roman" w:hAnsi="Garamond" w:cs="Times New Roman"/>
+          <w:kern w:val="0"/>
+          <w:sz w:val="22"/>
+          <w:szCs w:val="22"/>
+          <w14:ligatures w14:val="none"/>
+        </w:rPr>
+        <w:t xml:space="preserve">locations with or without </w:t>
+      </w:r>
+      <w:r>
+        <w:rPr>
+          <w:rFonts w:ascii="Garamond" w:eastAsia="Times New Roman" w:hAnsi="Garamond" w:cs="Times New Roman"/>
+          <w:kern w:val="0"/>
+          <w:sz w:val="22"/>
+          <w:szCs w:val="22"/>
+          <w14:ligatures w14:val="none"/>
+        </w:rPr>
+        <w:t>Chinook sa</w:t>
+      </w:r>
+      <w:r>
+        <w:rPr>
+          <w:rFonts w:ascii="Garamond" w:eastAsia="Times New Roman" w:hAnsi="Garamond" w:cs="Times New Roman"/>
+          <w:kern w:val="0"/>
+          <w:sz w:val="22"/>
+          <w:szCs w:val="22"/>
+          <w14:ligatures w14:val="none"/>
+        </w:rPr>
+        <w:t>l</w:t>
+      </w:r>
+      <w:r>
+        <w:rPr>
+          <w:rFonts w:ascii="Garamond" w:eastAsia="Times New Roman" w:hAnsi="Garamond" w:cs="Times New Roman"/>
+          <w:kern w:val="0"/>
+          <w:sz w:val="22"/>
+          <w:szCs w:val="22"/>
+          <w14:ligatures w14:val="none"/>
+        </w:rPr>
+        <w:t xml:space="preserve">mon spawners </w:t>
+      </w:r>
+      <w:r>
+        <w:rPr>
+          <w:rFonts w:ascii="Garamond" w:eastAsia="Times New Roman" w:hAnsi="Garamond" w:cs="Times New Roman"/>
+          <w:kern w:val="0"/>
+          <w:sz w:val="22"/>
+          <w:szCs w:val="22"/>
           <w14:ligatures w14:val="none"/>
         </w:rPr>
         <w:fldChar w:fldCharType="begin"/>
@@ -4013,7 +4211,6 @@
           <w:kern w:val="0"/>
           <w:sz w:val="22"/>
           <w:szCs w:val="22"/>
-          <w:highlight w:val="yellow"/>
           <w14:ligatures w14:val="none"/>
         </w:rPr>
         <w:instrText xml:space="preserve"> ADDIN ZOTERO_ITEM CSL_CITATION {"citationID":"GgqWHCm6","properties":{"formattedCitation":"(Falke &amp; Paul, 2025)","plainCitation":"(Falke &amp; Paul, 2025)","noteIndex":0},"citationItems":[{"id":5400,"uris":["http://zotero.org/users/8421274/items/GG56Y5HB"],"itemData":{"id":5400,"type":"dataset","abstract":"Chinook Salmon (Oncorhynchus tshawytscha) are an important commercial, subsistence, and recreational fishery resource in Alaska, and recent population declines have resulted in closures of some Chinook Salmon fisheries. Research into environmental factors involved in the decline of salmon stocks has exposed information gaps regarding fine-scale freshwater habitat quality known to influence Chinook Salmon productivity. We developed spatially-explicit intrinsic habitat potential models for Chinook Salmon freshwater spawning and rearing life-stages based on geomorphic stream network attributes (e.g., gradient, mean annual flow, valley bottom width). Model predictions were applied to individual stream reaches and summarized across synthetic stream networks derived from high-resolution (5-meter) digital elevation models covering the Yukon River drainage west of the US-Canada border and the entire Kuskokwim River drainage (total stream length ~667,000 km across 1.3 million km2 area). Vector spatial datasets include unique reach contributing area (uRCA) and unique reach contributing area valley bottom (uRCA VB) polygons, and confluence to confluence streamline edges derived from the NetMap synthetic streamlines product. Tabular data includes a collection of stream attributes summarized by uRCA or uRCA VB polygons, and habitat model results derived from these stream attributes. See metadata records for individual data elements for a description of input sources, software\nenvironments, data quality, processing steps, and attribute information. Approximately 87,500 and 39,500 stream km were predicted to represent moderate to high (index scores 0.6-1.0) Chinook Salmon rearing and spawning habitat suitability, respectively. Our high-resolution, spatially explicit dataset provides many options for summarizing and visualizing habitat suitability across areal units (e.g., river basins, land management boundaries) and assessing the potential for high suitability habitats outside the known distribution of Chinook Salmon at scales useful for managers and the research community.","DOI":"10.5066/P95AV4JO","license":"Creative Commons Zero v1.0 Universal","medium":"csv,xml,shp","publisher":"U.S. Geological Survey","source":"DOI.org (Datacite)","title":"Stream Attributes and Habitat Intrinsic Potential Model Results to examine Freshwater Habitat Potential for Chinook Salmon in the Yukon and Kuskokwim River Basins, Alaska","URL":"https://www.sciencebase.gov/catalog/item/64df8deed34e5f6cd553baec","author":[{"family":"Falke","given":""},{"family":"Paul","given":""}],"accessed":{"date-parts":[["2025",6,4]]},"issued":{"date-parts":[["2025"]]}}}],"schema":"https://github.com/citation-style-language/schema/raw/master/csl-citation.json"} </w:instrText>
@@ -4024,7 +4221,6 @@
           <w:kern w:val="0"/>
           <w:sz w:val="22"/>
           <w:szCs w:val="22"/>
-          <w:highlight w:val="yellow"/>
           <w14:ligatures w14:val="none"/>
         </w:rPr>
         <w:fldChar w:fldCharType="separate"/>
@@ -4036,7 +4232,6 @@
           <w:kern w:val="0"/>
           <w:sz w:val="22"/>
           <w:szCs w:val="22"/>
-          <w:highlight w:val="yellow"/>
           <w14:ligatures w14:val="none"/>
         </w:rPr>
         <w:t>(Falke &amp; Paul, 2025)</w:t>
@@ -4047,7 +4242,6 @@
           <w:kern w:val="0"/>
           <w:sz w:val="22"/>
           <w:szCs w:val="22"/>
-          <w:highlight w:val="yellow"/>
           <w14:ligatures w14:val="none"/>
         </w:rPr>
         <w:fldChar w:fldCharType="end"/>
@@ -4058,7 +4252,6 @@
           <w:kern w:val="0"/>
           <w:sz w:val="22"/>
           <w:szCs w:val="22"/>
-          <w:highlight w:val="yellow"/>
           <w14:ligatures w14:val="none"/>
         </w:rPr>
         <w:t>.</w:t>
@@ -4140,7 +4333,23 @@
           <w:sz w:val="22"/>
           <w:szCs w:val="22"/>
         </w:rPr>
-        <w:t xml:space="preserve">To estimate the spatial distribution of natal origins for a subset of the population, </w:t>
+        <w:t xml:space="preserve">To estimate the spatial distribution of natal origins </w:t>
+      </w:r>
+      <w:r>
+        <w:rPr>
+          <w:rFonts w:ascii="Garamond" w:hAnsi="Garamond"/>
+          <w:sz w:val="22"/>
+          <w:szCs w:val="22"/>
+        </w:rPr>
+        <w:t>across</w:t>
+      </w:r>
+      <w:r>
+        <w:rPr>
+          <w:rFonts w:ascii="Garamond" w:hAnsi="Garamond"/>
+          <w:sz w:val="22"/>
+          <w:szCs w:val="22"/>
+        </w:rPr>
+        <w:t xml:space="preserve"> a subset of the population, </w:t>
       </w:r>
       <w:r>
         <w:rPr>
@@ -4156,6 +4365,14 @@
           <w:sz w:val="22"/>
           <w:szCs w:val="22"/>
         </w:rPr>
+        <w:t xml:space="preserve">for all individuals in the subset </w:t>
+      </w:r>
+      <w:r>
+        <w:rPr>
+          <w:rFonts w:ascii="Garamond" w:hAnsi="Garamond"/>
+          <w:sz w:val="22"/>
+          <w:szCs w:val="22"/>
+        </w:rPr>
         <w:t xml:space="preserve">were summed </w:t>
       </w:r>
       <w:r>
@@ -4164,57 +4381,200 @@
           <w:sz w:val="22"/>
           <w:szCs w:val="22"/>
         </w:rPr>
-        <w:t xml:space="preserve">across </w:t>
-      </w:r>
-      <w:r>
-        <w:rPr>
-          <w:rFonts w:ascii="Garamond" w:hAnsi="Garamond"/>
-          <w:sz w:val="22"/>
-          <w:szCs w:val="22"/>
-        </w:rPr>
-        <w:t xml:space="preserve">all </w:t>
-      </w:r>
-      <w:r>
-        <w:rPr>
-          <w:rFonts w:ascii="Garamond" w:hAnsi="Garamond"/>
-          <w:sz w:val="22"/>
-          <w:szCs w:val="22"/>
-        </w:rPr>
-        <w:t xml:space="preserve">individuals </w:t>
-      </w:r>
-      <w:r>
-        <w:rPr>
-          <w:rFonts w:ascii="Garamond" w:hAnsi="Garamond"/>
-          <w:sz w:val="22"/>
-          <w:szCs w:val="22"/>
-        </w:rPr>
-        <w:t>in the subset and at all reaches in the basin.</w:t>
-      </w:r>
-      <w:r>
-        <w:rPr>
-          <w:rFonts w:ascii="Garamond" w:hAnsi="Garamond"/>
-          <w:sz w:val="22"/>
-          <w:szCs w:val="22"/>
-        </w:rPr>
-        <w:t xml:space="preserve"> To focus analysis on only highly likely locations, the top 30% of posterior values were retained whereas all other values were assigned a value of 0 for </w:t>
-      </w:r>
-      <w:proofErr w:type="gramStart"/>
-      <w:r>
-        <w:rPr>
-          <w:rFonts w:ascii="Garamond" w:hAnsi="Garamond"/>
-          <w:sz w:val="22"/>
-          <w:szCs w:val="22"/>
-        </w:rPr>
-        <w:t>each individual</w:t>
-      </w:r>
-      <w:proofErr w:type="gramEnd"/>
-      <w:r>
-        <w:rPr>
-          <w:rFonts w:ascii="Garamond" w:hAnsi="Garamond"/>
-          <w:sz w:val="22"/>
-          <w:szCs w:val="22"/>
-        </w:rPr>
-        <w:t xml:space="preserve"> before summing. Natal origin estimates were produced for </w:t>
+        <w:t xml:space="preserve">at </w:t>
+      </w:r>
+      <w:r>
+        <w:rPr>
+          <w:rFonts w:ascii="Garamond" w:hAnsi="Garamond"/>
+          <w:sz w:val="22"/>
+          <w:szCs w:val="22"/>
+        </w:rPr>
+        <w:t>each location</w:t>
+      </w:r>
+      <w:r>
+        <w:rPr>
+          <w:rFonts w:ascii="Garamond" w:hAnsi="Garamond"/>
+          <w:sz w:val="22"/>
+          <w:szCs w:val="22"/>
+        </w:rPr>
+        <w:t>.</w:t>
+      </w:r>
+      <w:r>
+        <w:rPr>
+          <w:rFonts w:ascii="Garamond" w:hAnsi="Garamond"/>
+          <w:sz w:val="22"/>
+          <w:szCs w:val="22"/>
+        </w:rPr>
+        <w:t xml:space="preserve"> </w:t>
+      </w:r>
+      <w:r>
+        <w:rPr>
+          <w:rFonts w:ascii="Garamond" w:hAnsi="Garamond"/>
+          <w:sz w:val="22"/>
+          <w:szCs w:val="22"/>
+        </w:rPr>
+        <w:t>Before summing, o</w:t>
+      </w:r>
+      <w:r>
+        <w:rPr>
+          <w:rFonts w:ascii="Garamond" w:hAnsi="Garamond"/>
+          <w:sz w:val="22"/>
+          <w:szCs w:val="22"/>
+        </w:rPr>
+        <w:t>nly highly likely locations</w:t>
+      </w:r>
+      <w:r>
+        <w:rPr>
+          <w:rFonts w:ascii="Garamond" w:hAnsi="Garamond"/>
+          <w:sz w:val="22"/>
+          <w:szCs w:val="22"/>
+        </w:rPr>
+        <w:t xml:space="preserve"> (</w:t>
+      </w:r>
+      <w:r>
+        <w:rPr>
+          <w:rFonts w:ascii="Garamond" w:hAnsi="Garamond"/>
+          <w:sz w:val="22"/>
+          <w:szCs w:val="22"/>
+        </w:rPr>
+        <w:t xml:space="preserve">the top </w:t>
+      </w:r>
+      <w:r>
+        <w:rPr>
+          <w:rFonts w:ascii="Garamond" w:hAnsi="Garamond"/>
+          <w:sz w:val="22"/>
+          <w:szCs w:val="22"/>
+        </w:rPr>
+        <w:t>30% of posterior values</w:t>
+      </w:r>
+      <w:r>
+        <w:rPr>
+          <w:rFonts w:ascii="Garamond" w:hAnsi="Garamond"/>
+          <w:sz w:val="22"/>
+          <w:szCs w:val="22"/>
+        </w:rPr>
+        <w:t>)</w:t>
+      </w:r>
+      <w:r>
+        <w:rPr>
+          <w:rFonts w:ascii="Garamond" w:hAnsi="Garamond"/>
+          <w:sz w:val="22"/>
+          <w:szCs w:val="22"/>
+        </w:rPr>
+        <w:t xml:space="preserve"> were retained whereas all other values were assigned a value of 0</w:t>
+      </w:r>
+      <w:r>
+        <w:rPr>
+          <w:rFonts w:ascii="Garamond" w:hAnsi="Garamond"/>
+          <w:sz w:val="22"/>
+          <w:szCs w:val="22"/>
+        </w:rPr>
+        <w:t xml:space="preserve"> </w:t>
+      </w:r>
+      <w:r>
+        <w:rPr>
+          <w:rFonts w:ascii="Garamond" w:hAnsi="Garamond"/>
+          <w:sz w:val="22"/>
+          <w:szCs w:val="22"/>
+        </w:rPr>
+        <w:fldChar w:fldCharType="begin"/>
+      </w:r>
+      <w:r>
+        <w:rPr>
+          <w:rFonts w:ascii="Garamond" w:hAnsi="Garamond"/>
+          <w:sz w:val="22"/>
+          <w:szCs w:val="22"/>
+        </w:rPr>
+        <w:instrText xml:space="preserve"> ADDIN ZOTERO_ITEM CSL_CITATION {"citationID":"NBaxQoVY","properties":{"formattedCitation":"(Brennan &amp; Schindler, 2017; Vander Zanden et al., 2015)","plainCitation":"(Brennan &amp; Schindler, 2017; Vander Zanden et al., 2015)","noteIndex":0},"citationItems":[{"id":1694,"uris":["http://zotero.org/users/8421274/items/NSWL6YPN"],"itemData":{"id":1694,"type":"article-journal","abstract":"Production patterns of highly mobile species, such as anadromous fish, often exhibit high spatial and temporal heterogeneity across landscapes. Such variability is often asynchronous in time among habitats, which stabilizes production at aggregate scales of complexity. Reconstructing production patterns explicitly in space and time across multiple scales, however, remains difficult but is important for prioritizing habitat conservation. This is especially true for fishes inhabiting river basins due to long-range dispersal, high mortality at early life stages, complex population structure and elusive life history variation. We develop a new approach for mapping production patterns of Pacific salmon across a large river basin by integrating otolith microchemistry and dendritic isoscape models. The geographically continuous Bayesian assignment framework presented here yielded high accuracies (&gt;90%) and relatively high precisions (precisions &lt;4%; i.e., assignment areas of &lt;530 river km of the 13 100 km total river length) when used to determine the natal source of known-origin juvenile Chinook salmon captured throughout the study region. Integrating these methods enabled us to base estimates of provenance and habitat use of individuals on a per location basis using strontium isotopic data throughout the continuous spatial domain of a river network. Such a framework provides substantial advantages over the more common nominal approach to employing otolith microchemistry to reconstruct movement patterns of fish. In doing so, we reconstructed the spatial production patterns of adult Chinook salmon returning to a large watershed in Bristol Bay, Alaska and illustrate the power of such an approach to conservation efforts.","container-title":"Ecological Applications","DOI":"10.1002/eap.1474","ISSN":"1939-5582","issue":"2","language":"en","note":"_eprint: https://esajournals.onlinelibrary.wiley.com/doi/pdf/10.1002/eap.1474","page":"363-377","source":"Wiley Online Library","title":"Linking otolith microchemistry and dendritic isoscapes to map heterogeneous production of fish across river basins","volume":"27","author":[{"family":"Brennan","given":"Sean R."},{"family":"Schindler","given":"Daniel E."}],"issued":{"date-parts":[["2017"]]}}},{"id":5569,"uris":["http://zotero.org/users/8421274/items/MSKF925L"],"itemData":{"id":5569,"type":"article-journal","abstract":"Stable isotope analysis is a useful tool to track animal movements in both terrestrial and marine environments. These intrinsic markers are assimilated through the diet and may exhibit spatial gradients as a result of biogeochemical processes at the base of the food web. In the marine environment, maps to predict the spatial distribution of stable isotopes are limited, and thus determining geographic origin has been reliant upon integrating satellite telemetry and stable isotope data. Migratory sea turtles regularly move between foraging and reproductive areas. Whereas most nesting populations can be easily accessed and regularly monitored, little is known about the demographic trends in foraging populations. The purpose of the present study was to examine migration patterns of loggerhead nesting aggregations in the Gulf of Mexico (GoM), where sea turtles have been historically understudied. Two methods of geographic assignment using stable isotope values in known-origin samples from satellite telemetry were compared: (1) a nominal approach through discriminant analysis and (2) a novel continuous-surface approach using bivariate carbon and nitrogen isoscapes (isotopic landscapes) developed for this study. Tissue samples for stable isotope analysis were obtained from 60 satellite-tracked individuals at five nesting beaches within the GoM. Both methodological approaches for assignment resulted in high accuracy of foraging area determination, though each has advantages and disadvantages. The nominal approach is more appropriate when defined boundaries are necessary, but up to 42% of the individuals could not be considered in this approach. All individuals can be included in the continuous-surface approach, and individual results can be aggregated to identify geographic hotspots of foraging area use, though the accuracy rate was lower than nominal assignment. The methodological validation provides a foundation for future sea turtle studies in the region to inexpensively determine geographic origin for large numbers of untracked individuals. Regular monitoring of sea turtle nesting aggregations with stable isotope sampling can be used to fill critical data gaps regarding habitat use and migration patterns. Probabilistic assignment to origin with isoscapes has not been previously used in the marine environment, but the methods presented here could also be applied to other migratory marine species.","container-title":"Ecological Applications","DOI":"10.1890/14-0581.1","ISSN":"1939-5582","issue":"2","language":"en","license":"© 2015 by the Ecological Society of America","note":"_eprint: https://esajournals.onlinelibrary.wiley.com/doi/pdf/10.1890/14-0581.1","page":"320-335","source":"Wiley Online Library","title":"Determining origin in a migratory marine vertebrate: a novel method to integrate stable isotopes and satellite tracking","title-short":"Determining origin in a migratory marine vertebrate","volume":"25","author":[{"family":"Vander Zanden","given":"Hannah B."},{"family":"Tucker","given":"Anton D."},{"family":"Hart","given":"Kristen M."},{"family":"Lamont","given":"Margaret M."},{"family":"Fujisaki","given":"Ikuko"},{"family":"Addison","given":"David S."},{"family":"Mansfield","given":"Katherine L."},{"family":"Phillips","given":"Katrina F."},{"family":"Wunder","given":"Michael B."},{"family":"Bowen","given":"Gabriel J."},{"family":"Pajuelo","given":"Mariela"},{"family":"Bolten","given":"Alan B."},{"family":"Bjorndal","given":"Karen A."}],"issued":{"date-parts":[["2015"]]}}}],"schema":"https://github.com/citation-style-language/schema/raw/master/csl-citation.json"} </w:instrText>
+      </w:r>
+      <w:r>
+        <w:rPr>
+          <w:rFonts w:ascii="Garamond" w:hAnsi="Garamond"/>
+          <w:sz w:val="22"/>
+          <w:szCs w:val="22"/>
+        </w:rPr>
+        <w:fldChar w:fldCharType="separate"/>
+      </w:r>
+      <w:r>
+        <w:rPr>
+          <w:rFonts w:ascii="Garamond" w:hAnsi="Garamond"/>
+          <w:noProof/>
+          <w:sz w:val="22"/>
+          <w:szCs w:val="22"/>
+        </w:rPr>
+        <w:t>(Brennan &amp; Schindler, 2017; Vander Zanden et al., 2015)</w:t>
+      </w:r>
+      <w:r>
+        <w:rPr>
+          <w:rFonts w:ascii="Garamond" w:hAnsi="Garamond"/>
+          <w:sz w:val="22"/>
+          <w:szCs w:val="22"/>
+        </w:rPr>
+        <w:fldChar w:fldCharType="end"/>
+      </w:r>
+      <w:r>
+        <w:rPr>
+          <w:rFonts w:ascii="Garamond" w:hAnsi="Garamond"/>
+          <w:sz w:val="22"/>
+          <w:szCs w:val="22"/>
+        </w:rPr>
+        <w:t>. Subsets for which estimates of n</w:t>
+      </w:r>
+      <w:r>
+        <w:rPr>
+          <w:rFonts w:ascii="Garamond" w:hAnsi="Garamond"/>
+          <w:sz w:val="22"/>
+          <w:szCs w:val="22"/>
+        </w:rPr>
+        <w:t xml:space="preserve">atal origin were produced </w:t>
+      </w:r>
+      <w:r>
+        <w:rPr>
+          <w:rFonts w:ascii="Garamond" w:hAnsi="Garamond"/>
+          <w:sz w:val="22"/>
+          <w:szCs w:val="22"/>
+        </w:rPr>
+        <w:t xml:space="preserve">include </w:t>
+      </w:r>
+      <w:r>
+        <w:rPr>
+          <w:rFonts w:ascii="Garamond" w:hAnsi="Garamond"/>
+          <w:sz w:val="22"/>
+          <w:szCs w:val="22"/>
+        </w:rPr>
+        <w:t xml:space="preserve">predefined </w:t>
+      </w:r>
+      <w:r>
+        <w:rPr>
+          <w:rFonts w:ascii="Garamond" w:hAnsi="Garamond"/>
+          <w:sz w:val="22"/>
+          <w:szCs w:val="22"/>
+        </w:rPr>
+        <w:t xml:space="preserve">four </w:t>
+      </w:r>
+      <w:r>
+        <w:rPr>
+          <w:rFonts w:ascii="Garamond" w:hAnsi="Garamond"/>
+          <w:sz w:val="22"/>
+          <w:szCs w:val="22"/>
+        </w:rPr>
+        <w:t xml:space="preserve">temporal quartiles </w:t>
+      </w:r>
+      <w:r>
+        <w:rPr>
+          <w:rFonts w:ascii="Garamond" w:hAnsi="Garamond"/>
+          <w:sz w:val="22"/>
+          <w:szCs w:val="22"/>
+        </w:rPr>
+        <w:t xml:space="preserve">of the salmon migration season </w:t>
+      </w:r>
+      <w:r>
+        <w:rPr>
+          <w:rFonts w:ascii="Garamond" w:hAnsi="Garamond"/>
+          <w:sz w:val="22"/>
+          <w:szCs w:val="22"/>
+        </w:rPr>
+        <w:t xml:space="preserve">based on capture </w:t>
       </w:r>
       <w:r>
         <w:rPr>
@@ -4223,25 +4583,9 @@
           <w:szCs w:val="22"/>
         </w:rPr>
         <w:lastRenderedPageBreak/>
-        <w:t xml:space="preserve">predefined temporal quartiles </w:t>
-      </w:r>
-      <w:r>
-        <w:rPr>
-          <w:rFonts w:ascii="Garamond" w:hAnsi="Garamond"/>
-          <w:sz w:val="22"/>
-          <w:szCs w:val="22"/>
-        </w:rPr>
-        <w:t xml:space="preserve">of the salmon migration season </w:t>
-      </w:r>
-      <w:r>
-        <w:rPr>
-          <w:rFonts w:ascii="Garamond" w:hAnsi="Garamond"/>
-          <w:sz w:val="22"/>
-          <w:szCs w:val="22"/>
-        </w:rPr>
-        <w:t>based on capture date: Q1 (run start through June 11), Q2 (June 12-21), Q3 (June 22-July 1), and Q4 (July 2 onward).</w:t>
-      </w:r>
-      <w:ins w:id="15" w:author="Daniel Schindler" w:date="2025-07-17T13:30:00Z" w16du:dateUtc="2025-07-17T21:30:00Z">
+        <w:t>date: Q1 (run start through June 11), Q2 (June 12-21), Q3 (June 22-July 1), and Q4 (July 2 onward).</w:t>
+      </w:r>
+      <w:ins w:id="13" w:author="Daniel Schindler" w:date="2025-07-17T13:30:00Z" w16du:dateUtc="2025-07-17T21:30:00Z">
         <w:r>
           <w:rPr>
             <w:rFonts w:ascii="Garamond" w:hAnsi="Garamond"/>
@@ -4313,40 +4657,23 @@
           <w:sz w:val="22"/>
           <w:szCs w:val="22"/>
         </w:rPr>
-        <w:t xml:space="preserve">The June 11 date was chosen specifically to match the end of the ‘front end closure’ of the subsistence fishery </w:t>
-      </w:r>
-      <w:r>
-        <w:rPr>
-          <w:rFonts w:ascii="Garamond" w:hAnsi="Garamond"/>
-          <w:sz w:val="22"/>
-          <w:szCs w:val="22"/>
-        </w:rPr>
-        <w:t xml:space="preserve">corresponding to the first quartile of the run, </w:t>
-      </w:r>
-      <w:r>
-        <w:rPr>
-          <w:rFonts w:ascii="Garamond" w:hAnsi="Garamond"/>
-          <w:sz w:val="22"/>
-          <w:szCs w:val="22"/>
-        </w:rPr>
-        <w:t xml:space="preserve">which has been implemented for over a decade. </w:t>
-      </w:r>
-      <w:r>
-        <w:rPr>
-          <w:rFonts w:ascii="Garamond" w:hAnsi="Garamond"/>
-          <w:sz w:val="22"/>
-          <w:szCs w:val="22"/>
-        </w:rPr>
-        <w:t xml:space="preserve">Estimates were also produced for the full duration of the </w:t>
-      </w:r>
-      <w:proofErr w:type="gramStart"/>
-      <w:r>
-        <w:rPr>
-          <w:rFonts w:ascii="Garamond" w:hAnsi="Garamond"/>
-          <w:sz w:val="22"/>
-          <w:szCs w:val="22"/>
-        </w:rPr>
-        <w:t xml:space="preserve">run </w:t>
+        <w:t>The June 11 date was chosen specifically to match the end of the ‘front end closure’ of the subsistence fishery</w:t>
+      </w:r>
+      <w:r>
+        <w:rPr>
+          <w:rFonts w:ascii="Garamond" w:hAnsi="Garamond"/>
+          <w:sz w:val="22"/>
+          <w:szCs w:val="22"/>
+        </w:rPr>
+        <w:t xml:space="preserve">. </w:t>
+      </w:r>
+      <w:r>
+        <w:rPr>
+          <w:rFonts w:ascii="Garamond" w:hAnsi="Garamond"/>
+          <w:sz w:val="22"/>
+          <w:szCs w:val="22"/>
+        </w:rPr>
+        <w:t xml:space="preserve">Estimates were also produced for the full run </w:t>
       </w:r>
       <w:r>
         <w:rPr>
@@ -4356,7 +4683,6 @@
         </w:rPr>
         <w:t>in</w:t>
       </w:r>
-      <w:proofErr w:type="gramEnd"/>
       <w:r>
         <w:rPr>
           <w:rFonts w:ascii="Garamond" w:hAnsi="Garamond"/>
@@ -4371,32 +4697,91 @@
           <w:sz w:val="22"/>
           <w:szCs w:val="22"/>
         </w:rPr>
-        <w:t xml:space="preserve"> Twenty</w:t>
-      </w:r>
-      <w:r>
-        <w:rPr>
-          <w:rFonts w:ascii="Garamond" w:hAnsi="Garamond"/>
-          <w:sz w:val="22"/>
-          <w:szCs w:val="22"/>
-        </w:rPr>
-        <w:t xml:space="preserve">-one management units were defined to aggregate tributary-level estimates into units relevant to current management practices (Figure 2). Management units of interest to the Alaska Department of Fish </w:t>
-      </w:r>
-      <w:r>
-        <w:rPr>
-          <w:rFonts w:ascii="Garamond" w:hAnsi="Garamond"/>
-          <w:sz w:val="22"/>
-          <w:szCs w:val="22"/>
-        </w:rPr>
-        <w:t>&amp;</w:t>
-      </w:r>
-      <w:r>
-        <w:rPr>
-          <w:rFonts w:ascii="Garamond" w:hAnsi="Garamond"/>
-          <w:sz w:val="22"/>
-          <w:szCs w:val="22"/>
-        </w:rPr>
         <w:t xml:space="preserve"> </w:t>
       </w:r>
+    </w:p>
+    <w:p>
+      <w:pPr>
+        <w:spacing w:line="480" w:lineRule="auto"/>
+        <w:ind w:firstLine="720"/>
+        <w:rPr>
+          <w:rFonts w:ascii="Garamond" w:hAnsi="Garamond"/>
+          <w:sz w:val="22"/>
+          <w:szCs w:val="22"/>
+        </w:rPr>
+      </w:pPr>
+      <w:r>
+        <w:rPr>
+          <w:rFonts w:ascii="Garamond" w:hAnsi="Garamond"/>
+          <w:sz w:val="22"/>
+          <w:szCs w:val="22"/>
+        </w:rPr>
+        <w:t>Twenty</w:t>
+      </w:r>
+      <w:r>
+        <w:rPr>
+          <w:rFonts w:ascii="Garamond" w:hAnsi="Garamond"/>
+          <w:sz w:val="22"/>
+          <w:szCs w:val="22"/>
+        </w:rPr>
+        <w:t>-one management units</w:t>
+      </w:r>
+      <w:r>
+        <w:rPr>
+          <w:rFonts w:ascii="Garamond" w:hAnsi="Garamond"/>
+          <w:sz w:val="22"/>
+          <w:szCs w:val="22"/>
+        </w:rPr>
+        <w:t xml:space="preserve"> or “stocks”</w:t>
+      </w:r>
+      <w:r>
+        <w:rPr>
+          <w:rFonts w:ascii="Garamond" w:hAnsi="Garamond"/>
+          <w:sz w:val="22"/>
+          <w:szCs w:val="22"/>
+        </w:rPr>
+        <w:t xml:space="preserve"> were defined to aggregate tributary-level estimates into units relevant to current management practices (Figure 2). </w:t>
+      </w:r>
+      <w:r>
+        <w:rPr>
+          <w:rFonts w:ascii="Garamond" w:hAnsi="Garamond"/>
+          <w:sz w:val="22"/>
+          <w:szCs w:val="22"/>
+        </w:rPr>
+        <w:t xml:space="preserve">Rivers </w:t>
+      </w:r>
+      <w:r>
+        <w:rPr>
+          <w:rFonts w:ascii="Garamond" w:hAnsi="Garamond"/>
+          <w:sz w:val="22"/>
+          <w:szCs w:val="22"/>
+        </w:rPr>
+        <w:t xml:space="preserve">of </w:t>
+      </w:r>
+      <w:r>
+        <w:rPr>
+          <w:rFonts w:ascii="Garamond" w:hAnsi="Garamond"/>
+          <w:sz w:val="22"/>
+          <w:szCs w:val="22"/>
+        </w:rPr>
+        <w:t xml:space="preserve">management </w:t>
+      </w:r>
+      <w:r>
+        <w:rPr>
+          <w:rFonts w:ascii="Garamond" w:hAnsi="Garamond"/>
+          <w:sz w:val="22"/>
+          <w:szCs w:val="22"/>
+        </w:rPr>
+        <w:t xml:space="preserve">interest to the Alaska Department of Fish </w:t>
+      </w:r>
+      <w:r>
+        <w:rPr>
+          <w:rFonts w:ascii="Garamond" w:hAnsi="Garamond"/>
+          <w:sz w:val="22"/>
+          <w:szCs w:val="22"/>
+        </w:rPr>
+        <w:t xml:space="preserve">&amp; </w:t>
+      </w:r>
       <w:r>
         <w:rPr>
           <w:rFonts w:ascii="Garamond" w:hAnsi="Garamond"/>
@@ -4413,7 +4798,7 @@
         </w:rPr>
         <w:t xml:space="preserve"> </w:t>
       </w:r>
-      <w:ins w:id="16" w:author="Daniel Schindler" w:date="2025-07-17T13:31:00Z" w16du:dateUtc="2025-07-17T21:31:00Z">
+      <w:ins w:id="14" w:author="Daniel Schindler" w:date="2025-07-17T13:31:00Z" w16du:dateUtc="2025-07-17T21:31:00Z">
         <w:r>
           <w:rPr>
             <w:rFonts w:ascii="Garamond" w:hAnsi="Garamond"/>
@@ -4422,317 +4807,135 @@
           </w:rPr>
           <w:t>(Liller reference?)</w:t>
         </w:r>
-        <w:r>
-          <w:rPr>
-            <w:rFonts w:ascii="Garamond" w:hAnsi="Garamond"/>
-            <w:sz w:val="22"/>
-            <w:szCs w:val="22"/>
-          </w:rPr>
-          <w:t xml:space="preserve"> </w:t>
-        </w:r>
       </w:ins>
       <w:r>
         <w:rPr>
-          <w:rFonts w:ascii="Garamond" w:hAnsi="Garamond"/>
-          <w:sz w:val="22"/>
-          <w:szCs w:val="22"/>
-        </w:rPr>
-        <w:t xml:space="preserve">with all upstream segments from the most downstream point of each tributary assigned to common management identifiers. </w:t>
-      </w:r>
-      <w:proofErr w:type="gramStart"/>
-      <w:r>
-        <w:rPr>
-          <w:rFonts w:ascii="Garamond" w:hAnsi="Garamond"/>
-          <w:sz w:val="22"/>
-          <w:szCs w:val="22"/>
-        </w:rPr>
-        <w:t>Remaining</w:t>
-      </w:r>
-      <w:proofErr w:type="gramEnd"/>
-      <w:r>
-        <w:rPr>
-          <w:rFonts w:ascii="Garamond" w:hAnsi="Garamond"/>
-          <w:sz w:val="22"/>
-          <w:szCs w:val="22"/>
-        </w:rPr>
-        <w:t xml:space="preserve"> basin areas were manually grouped into units of comparable size to ensure complete basin coverage</w:t>
-      </w:r>
-      <w:r>
-        <w:rPr>
-          <w:rFonts w:ascii="Garamond" w:hAnsi="Garamond"/>
-          <w:sz w:val="22"/>
-          <w:szCs w:val="22"/>
-        </w:rPr>
-        <w:t xml:space="preserve"> (Figure 2).</w:t>
+          <w:rStyle w:val="CommentReference"/>
+          <w:rFonts w:ascii="Garamond" w:hAnsi="Garamond"/>
+          <w:sz w:val="22"/>
+          <w:szCs w:val="22"/>
+        </w:rPr>
+        <w:t xml:space="preserve">. From the furthest downstream connection of each of these tributaries to the mainstem all upstream segments were selected and assigned to a common identifier.  For some smaller units (i.e. the </w:t>
+      </w:r>
+      <w:proofErr w:type="spellStart"/>
+      <w:r>
+        <w:rPr>
+          <w:rStyle w:val="CommentReference"/>
+          <w:rFonts w:ascii="Garamond" w:hAnsi="Garamond"/>
+          <w:sz w:val="22"/>
+          <w:szCs w:val="22"/>
+        </w:rPr>
+        <w:t>Takotna</w:t>
+      </w:r>
+      <w:proofErr w:type="spellEnd"/>
+      <w:r>
+        <w:rPr>
+          <w:rStyle w:val="CommentReference"/>
+          <w:rFonts w:ascii="Garamond" w:hAnsi="Garamond"/>
+          <w:sz w:val="22"/>
+          <w:szCs w:val="22"/>
+        </w:rPr>
+        <w:t xml:space="preserve"> and Nixon fork), the units were combined into one to keep a relative comparable size. </w:t>
+      </w:r>
+      <w:r>
+        <w:rPr>
+          <w:rFonts w:ascii="Garamond" w:hAnsi="Garamond"/>
+          <w:sz w:val="22"/>
+          <w:szCs w:val="22"/>
+        </w:rPr>
+        <w:t xml:space="preserve">Remaining basin areas were </w:t>
+      </w:r>
+      <w:r>
+        <w:rPr>
+          <w:rFonts w:ascii="Garamond" w:hAnsi="Garamond"/>
+          <w:sz w:val="22"/>
+          <w:szCs w:val="22"/>
+        </w:rPr>
+        <w:t xml:space="preserve">then </w:t>
+      </w:r>
+      <w:r>
+        <w:rPr>
+          <w:rFonts w:ascii="Garamond" w:hAnsi="Garamond"/>
+          <w:sz w:val="22"/>
+          <w:szCs w:val="22"/>
+        </w:rPr>
+        <w:t>manually grouped into units of comparable size to ensure complete basin coverage</w:t>
+      </w:r>
+      <w:r>
+        <w:rPr>
+          <w:rFonts w:ascii="Garamond" w:hAnsi="Garamond"/>
+          <w:sz w:val="22"/>
+          <w:szCs w:val="22"/>
+        </w:rPr>
+        <w:t xml:space="preserve"> with attention paid to keeping spatially relevant regions in the same unit (i.e. Middle Kuskokwim mainstem). </w:t>
       </w:r>
     </w:p>
     <w:p>
       <w:pPr>
         <w:spacing w:line="480" w:lineRule="auto"/>
-        <w:ind w:firstLine="720"/>
-        <w:rPr>
-          <w:rFonts w:ascii="Garamond" w:hAnsi="Garamond"/>
-          <w:sz w:val="22"/>
-          <w:szCs w:val="22"/>
-        </w:rPr>
-      </w:pPr>
-      <w:r>
-        <w:rPr>
-          <w:rFonts w:ascii="Garamond" w:hAnsi="Garamond"/>
-          <w:sz w:val="22"/>
-          <w:szCs w:val="22"/>
-        </w:rPr>
-        <w:t>In each year of the study, and f</w:t>
-      </w:r>
-      <w:r>
-        <w:rPr>
-          <w:rFonts w:ascii="Garamond" w:hAnsi="Garamond"/>
-          <w:sz w:val="22"/>
-          <w:szCs w:val="22"/>
-        </w:rPr>
-        <w:t xml:space="preserve">or each </w:t>
-      </w:r>
-      <w:r>
-        <w:rPr>
-          <w:rFonts w:ascii="Garamond" w:hAnsi="Garamond"/>
-          <w:sz w:val="22"/>
-          <w:szCs w:val="22"/>
-        </w:rPr>
-        <w:t xml:space="preserve">seasonal </w:t>
-      </w:r>
-      <w:r>
-        <w:rPr>
-          <w:rFonts w:ascii="Garamond" w:hAnsi="Garamond"/>
-          <w:sz w:val="22"/>
-          <w:szCs w:val="22"/>
-        </w:rPr>
-        <w:t xml:space="preserve">quartile, return estimates were normalized to sum to one across the </w:t>
-      </w:r>
-      <w:r>
-        <w:rPr>
-          <w:rFonts w:ascii="Garamond" w:hAnsi="Garamond"/>
-          <w:sz w:val="22"/>
-          <w:szCs w:val="22"/>
-        </w:rPr>
-        <w:t>watershed to display</w:t>
-      </w:r>
-      <w:r>
-        <w:rPr>
-          <w:rFonts w:ascii="Garamond" w:hAnsi="Garamond"/>
-          <w:sz w:val="22"/>
-          <w:szCs w:val="22"/>
-        </w:rPr>
-        <w:t xml:space="preserve"> proportional contribution</w:t>
-      </w:r>
-      <w:r>
-        <w:rPr>
-          <w:rFonts w:ascii="Garamond" w:hAnsi="Garamond"/>
-          <w:sz w:val="22"/>
-          <w:szCs w:val="22"/>
-        </w:rPr>
-        <w:t xml:space="preserve"> within a given seasonal quartile. For each quartile, the mean proportional contribution value was calculated across all years for each management unit (Figure 3). </w:t>
-      </w:r>
-      <w:r>
-        <w:rPr>
-          <w:rFonts w:ascii="Garamond" w:hAnsi="Garamond"/>
-          <w:sz w:val="22"/>
-          <w:szCs w:val="22"/>
-        </w:rPr>
-        <w:t xml:space="preserve">Corresponding boxplots for each quartile illustrate </w:t>
-      </w:r>
-      <w:r>
-        <w:rPr>
-          <w:rFonts w:ascii="Garamond" w:hAnsi="Garamond"/>
-          <w:sz w:val="22"/>
-          <w:szCs w:val="22"/>
-        </w:rPr>
-        <w:t xml:space="preserve">annual </w:t>
-      </w:r>
-      <w:r>
-        <w:rPr>
-          <w:rFonts w:ascii="Garamond" w:hAnsi="Garamond"/>
-          <w:sz w:val="22"/>
-          <w:szCs w:val="22"/>
-        </w:rPr>
-        <w:t xml:space="preserve">variability in contribution patterns, ordered from </w:t>
-      </w:r>
-      <w:r>
-        <w:rPr>
-          <w:rFonts w:ascii="Garamond" w:hAnsi="Garamond"/>
-          <w:sz w:val="22"/>
-          <w:szCs w:val="22"/>
-        </w:rPr>
-        <w:t xml:space="preserve">the most </w:t>
-      </w:r>
-      <w:r>
-        <w:rPr>
-          <w:rFonts w:ascii="Garamond" w:hAnsi="Garamond"/>
-          <w:sz w:val="22"/>
-          <w:szCs w:val="22"/>
-        </w:rPr>
-        <w:t xml:space="preserve">upstream to </w:t>
-      </w:r>
-      <w:r>
-        <w:rPr>
-          <w:rFonts w:ascii="Garamond" w:hAnsi="Garamond"/>
-          <w:sz w:val="22"/>
-          <w:szCs w:val="22"/>
-        </w:rPr>
-        <w:t xml:space="preserve">the furthest </w:t>
-      </w:r>
-      <w:r>
-        <w:rPr>
-          <w:rFonts w:ascii="Garamond" w:hAnsi="Garamond"/>
-          <w:sz w:val="22"/>
-          <w:szCs w:val="22"/>
-        </w:rPr>
-        <w:t>downstream locations</w:t>
-      </w:r>
-      <w:r>
-        <w:rPr>
-          <w:rFonts w:ascii="Garamond" w:hAnsi="Garamond"/>
-          <w:sz w:val="22"/>
-          <w:szCs w:val="22"/>
-        </w:rPr>
-        <w:t xml:space="preserve"> (Figure 3). </w:t>
-      </w:r>
-      <w:r>
-        <w:rPr>
-          <w:rFonts w:ascii="Garamond" w:hAnsi="Garamond"/>
-          <w:sz w:val="22"/>
-          <w:szCs w:val="22"/>
-        </w:rPr>
-        <w:t xml:space="preserve">Cumulative distribution functions were constructed using 3-day intervals throughout each run. For each interval, </w:t>
-      </w:r>
-      <w:r>
-        <w:rPr>
-          <w:rFonts w:ascii="Garamond" w:hAnsi="Garamond"/>
-          <w:sz w:val="22"/>
-          <w:szCs w:val="22"/>
-        </w:rPr>
-        <w:t xml:space="preserve">estimates of the returns at the tributary scale were aggregated into management units and compared against the full-season total for that stock. The resulting data represent the proportion of the total contribution of each stock present at each </w:t>
-      </w:r>
-      <w:proofErr w:type="gramStart"/>
-      <w:r>
-        <w:rPr>
-          <w:rFonts w:ascii="Garamond" w:hAnsi="Garamond"/>
-          <w:sz w:val="22"/>
-          <w:szCs w:val="22"/>
-        </w:rPr>
-        <w:t>3 day</w:t>
-      </w:r>
-      <w:proofErr w:type="gramEnd"/>
-      <w:r>
-        <w:rPr>
-          <w:rFonts w:ascii="Garamond" w:hAnsi="Garamond"/>
-          <w:sz w:val="22"/>
-          <w:szCs w:val="22"/>
-        </w:rPr>
-        <w:t xml:space="preserve"> interval in the run. </w:t>
-      </w:r>
-      <w:r>
-        <w:rPr>
-          <w:rFonts w:ascii="Garamond" w:hAnsi="Garamond"/>
-          <w:sz w:val="22"/>
-          <w:szCs w:val="22"/>
-        </w:rPr>
-        <w:t xml:space="preserve">To assess the </w:t>
-      </w:r>
-      <w:r>
-        <w:rPr>
-          <w:rFonts w:ascii="Garamond" w:hAnsi="Garamond"/>
-          <w:sz w:val="22"/>
-          <w:szCs w:val="22"/>
-        </w:rPr>
-        <w:t xml:space="preserve">relative protection afforded to stocks by a </w:t>
-      </w:r>
-      <w:proofErr w:type="gramStart"/>
-      <w:r>
-        <w:rPr>
-          <w:rFonts w:ascii="Garamond" w:hAnsi="Garamond"/>
-          <w:sz w:val="22"/>
-          <w:szCs w:val="22"/>
-        </w:rPr>
-        <w:t>front end</w:t>
-      </w:r>
-      <w:proofErr w:type="gramEnd"/>
-      <w:r>
-        <w:rPr>
-          <w:rFonts w:ascii="Garamond" w:hAnsi="Garamond"/>
-          <w:sz w:val="22"/>
-          <w:szCs w:val="22"/>
-        </w:rPr>
-        <w:t xml:space="preserve"> closure ending on June 11</w:t>
-      </w:r>
-      <w:r>
-        <w:rPr>
-          <w:rFonts w:ascii="Garamond" w:hAnsi="Garamond"/>
-          <w:sz w:val="22"/>
-          <w:szCs w:val="22"/>
-          <w:vertAlign w:val="superscript"/>
-        </w:rPr>
-        <w:t>th</w:t>
-      </w:r>
-      <w:r>
-        <w:rPr>
-          <w:rFonts w:ascii="Garamond" w:hAnsi="Garamond"/>
-          <w:sz w:val="22"/>
-          <w:szCs w:val="22"/>
-        </w:rPr>
-        <w:t xml:space="preserve">, </w:t>
-      </w:r>
-      <w:r>
-        <w:rPr>
-          <w:rFonts w:ascii="Garamond" w:hAnsi="Garamond"/>
-          <w:sz w:val="22"/>
-          <w:szCs w:val="22"/>
-        </w:rPr>
-        <w:t xml:space="preserve">we quantified the proportion of each </w:t>
-      </w:r>
-      <w:r>
-        <w:rPr>
-          <w:rFonts w:ascii="Garamond" w:hAnsi="Garamond"/>
-          <w:sz w:val="22"/>
-          <w:szCs w:val="22"/>
-        </w:rPr>
-        <w:t xml:space="preserve">stock’s </w:t>
-      </w:r>
-      <w:r>
-        <w:rPr>
-          <w:rFonts w:ascii="Garamond" w:hAnsi="Garamond"/>
-          <w:sz w:val="22"/>
-          <w:szCs w:val="22"/>
-        </w:rPr>
-        <w:t xml:space="preserve">annual </w:t>
-      </w:r>
-      <w:r>
-        <w:rPr>
-          <w:rFonts w:ascii="Garamond" w:hAnsi="Garamond"/>
-          <w:sz w:val="22"/>
-          <w:szCs w:val="22"/>
-        </w:rPr>
-        <w:t>returns which</w:t>
-      </w:r>
-      <w:r>
-        <w:rPr>
-          <w:rFonts w:ascii="Garamond" w:hAnsi="Garamond"/>
-          <w:sz w:val="22"/>
-          <w:szCs w:val="22"/>
-        </w:rPr>
-        <w:t xml:space="preserve"> occur within the current closure window</w:t>
-      </w:r>
-      <w:r>
-        <w:rPr>
-          <w:rFonts w:ascii="Garamond" w:hAnsi="Garamond"/>
-          <w:sz w:val="22"/>
-          <w:szCs w:val="22"/>
-        </w:rPr>
-        <w:t xml:space="preserve"> (Q1 in our subset dataset). </w:t>
+        <w:rPr>
+          <w:rFonts w:ascii="Garamond" w:hAnsi="Garamond"/>
+          <w:b/>
+          <w:bCs/>
+          <w:sz w:val="22"/>
+          <w:szCs w:val="22"/>
+        </w:rPr>
+      </w:pPr>
+      <w:r>
+        <w:rPr>
+          <w:rFonts w:ascii="Garamond" w:hAnsi="Garamond"/>
+          <w:b/>
+          <w:bCs/>
+          <w:sz w:val="22"/>
+          <w:szCs w:val="22"/>
+        </w:rPr>
+        <w:t xml:space="preserve">Stock </w:t>
+      </w:r>
+      <w:r>
+        <w:rPr>
+          <w:rFonts w:ascii="Garamond" w:hAnsi="Garamond"/>
+          <w:b/>
+          <w:bCs/>
+          <w:sz w:val="22"/>
+          <w:szCs w:val="22"/>
+        </w:rPr>
+        <w:t>C</w:t>
+      </w:r>
+      <w:r>
+        <w:rPr>
+          <w:rFonts w:ascii="Garamond" w:hAnsi="Garamond"/>
+          <w:b/>
+          <w:bCs/>
+          <w:sz w:val="22"/>
+          <w:szCs w:val="22"/>
+        </w:rPr>
+        <w:t xml:space="preserve">ontribution </w:t>
+      </w:r>
+      <w:r>
+        <w:rPr>
+          <w:rFonts w:ascii="Garamond" w:hAnsi="Garamond"/>
+          <w:b/>
+          <w:bCs/>
+          <w:sz w:val="22"/>
+          <w:szCs w:val="22"/>
+        </w:rPr>
+        <w:t>A</w:t>
+      </w:r>
+      <w:r>
+        <w:rPr>
+          <w:rFonts w:ascii="Garamond" w:hAnsi="Garamond"/>
+          <w:b/>
+          <w:bCs/>
+          <w:sz w:val="22"/>
+          <w:szCs w:val="22"/>
+        </w:rPr>
+        <w:t xml:space="preserve">nalysis </w:t>
       </w:r>
     </w:p>
     <w:p>
       <w:pPr>
         <w:spacing w:line="480" w:lineRule="auto"/>
+        <w:ind w:firstLine="720"/>
         <w:rPr>
           <w:rFonts w:ascii="Garamond" w:hAnsi="Garamond"/>
           <w:b/>
@@ -4741,18 +4944,47 @@
           <w:szCs w:val="22"/>
         </w:rPr>
       </w:pPr>
-    </w:p>
-    <w:p>
-      <w:pPr>
-        <w:spacing w:line="480" w:lineRule="auto"/>
-        <w:rPr>
-          <w:rFonts w:ascii="Garamond" w:hAnsi="Garamond"/>
-          <w:b/>
-          <w:bCs/>
-          <w:sz w:val="22"/>
-          <w:szCs w:val="22"/>
-        </w:rPr>
-      </w:pPr>
+      <w:r>
+        <w:rPr>
+          <w:rFonts w:ascii="Garamond" w:hAnsi="Garamond"/>
+          <w:sz w:val="22"/>
+          <w:szCs w:val="22"/>
+        </w:rPr>
+        <w:t>For each year and seasonal quartile, tributary-level natal origin estimates were aggregated into management units and normalized to sum to one across the basin, representing each unit's proportional contribution to the seasonal quartile. Summary statistics were then calculated across all years for each management unit, with Figure 3a displaying mean contributions by management unit (darker colors indicating higher values) and corresponding boxplots showing median and range values for each quartile, ordered from furthest upstream (top) to downstream (bottom) by watershed position. Cumulative distribution functions were constructed to examine relative run timing independent of stock abundance by aggregating natal origin distributions by management unit for each 3-day interval and comparing against full-season totals without normalization, allowing comparison of actual return numbers over time and showing the cumulative proportion of each stock's total seasonal contribution at each time point. To evaluate the stock-specific effect of the current implemented front-end closure, we evaluated the proportion of each stock's total return occurring within the current closure window</w:t>
+      </w:r>
+      <w:r>
+        <w:rPr>
+          <w:rFonts w:ascii="Garamond" w:hAnsi="Garamond"/>
+          <w:sz w:val="22"/>
+          <w:szCs w:val="22"/>
+        </w:rPr>
+        <w:t xml:space="preserve"> (the first seasonal quartile in our dataset). The relative protection </w:t>
+      </w:r>
+      <w:r>
+        <w:rPr>
+          <w:rFonts w:ascii="Garamond" w:hAnsi="Garamond"/>
+          <w:sz w:val="22"/>
+          <w:szCs w:val="22"/>
+        </w:rPr>
+        <w:lastRenderedPageBreak/>
+        <w:t xml:space="preserve">across all years </w:t>
+      </w:r>
+      <w:r>
+        <w:rPr>
+          <w:rFonts w:ascii="Garamond" w:hAnsi="Garamond"/>
+          <w:sz w:val="22"/>
+          <w:szCs w:val="22"/>
+        </w:rPr>
+        <w:t>was used</w:t>
+      </w:r>
+      <w:r>
+        <w:rPr>
+          <w:rFonts w:ascii="Garamond" w:hAnsi="Garamond"/>
+          <w:sz w:val="22"/>
+          <w:szCs w:val="22"/>
+        </w:rPr>
+        <w:t xml:space="preserve"> produce boxplots visualizing the variability in this protection over the dataset, again ordered from furthest upstream to furthest downstream.</w:t>
+      </w:r>
     </w:p>
     <w:p>
       <w:pPr>
@@ -4785,7 +5017,6 @@
           <w:sz w:val="36"/>
           <w:szCs w:val="36"/>
         </w:rPr>
-        <w:lastRenderedPageBreak/>
         <w:t>Results</w:t>
       </w:r>
     </w:p>
@@ -5403,7 +5634,16 @@
           <w:sz w:val="22"/>
           <w:szCs w:val="22"/>
         </w:rPr>
-        <w:t xml:space="preserve"> (median; 11.6%), </w:t>
+        <w:t xml:space="preserve"> (median; </w:t>
+      </w:r>
+      <w:r>
+        <w:rPr>
+          <w:rFonts w:ascii="Garamond" w:hAnsi="Garamond"/>
+          <w:sz w:val="22"/>
+          <w:szCs w:val="22"/>
+        </w:rPr>
+        <w:lastRenderedPageBreak/>
+        <w:t xml:space="preserve">11.6%), </w:t>
       </w:r>
       <w:proofErr w:type="spellStart"/>
       <w:r>
@@ -5527,7 +5767,6 @@
           <w:sz w:val="22"/>
           <w:szCs w:val="22"/>
         </w:rPr>
-        <w:lastRenderedPageBreak/>
         <w:t xml:space="preserve">Cumulative distribution plots </w:t>
       </w:r>
       <w:r>
@@ -5593,27 +5832,7 @@
           <w:szCs w:val="22"/>
           <w:highlight w:val="yellow"/>
         </w:rPr>
-        <w:t xml:space="preserve">The results display a clear pattern of </w:t>
-      </w:r>
-      <w:proofErr w:type="gramStart"/>
-      <w:r>
-        <w:rPr>
-          <w:rFonts w:ascii="Garamond" w:hAnsi="Garamond"/>
-          <w:sz w:val="22"/>
-          <w:szCs w:val="22"/>
-          <w:highlight w:val="yellow"/>
-        </w:rPr>
-        <w:t>earliest</w:t>
-      </w:r>
-      <w:proofErr w:type="gramEnd"/>
-      <w:r>
-        <w:rPr>
-          <w:rFonts w:ascii="Garamond" w:hAnsi="Garamond"/>
-          <w:sz w:val="22"/>
-          <w:szCs w:val="22"/>
-          <w:highlight w:val="yellow"/>
-        </w:rPr>
-        <w:t xml:space="preserve"> returning stocks (closer to red) arriving earlier in the season, with 50% of the run for stocks such as the East Fork Kuskokwim and Big River arriving within X days of the start of the run.</w:t>
+        <w:t>The results display a clear pattern of earliest returning stocks (closer to red) arriving earlier in the season, with 50% of the run for stocks such as the East Fork Kuskokwim and Big River arriving within X days of the start of the run.</w:t>
       </w:r>
       <w:r>
         <w:rPr>
@@ -5778,7 +5997,7 @@
           <w:sz w:val="22"/>
           <w:szCs w:val="22"/>
         </w:rPr>
-        <w:t xml:space="preserve">A pattern of early returning upper Kuskokwim stocks clearly affords higher protection </w:t>
+        <w:t xml:space="preserve">A pattern of early returning upper Kuskokwim stocks clearly affords higher protection to these stocks from a </w:t>
       </w:r>
       <w:proofErr w:type="gramStart"/>
       <w:r>
@@ -5787,7 +6006,7 @@
           <w:sz w:val="22"/>
           <w:szCs w:val="22"/>
         </w:rPr>
-        <w:t>to</w:t>
+        <w:t>front end</w:t>
       </w:r>
       <w:proofErr w:type="gramEnd"/>
       <w:r>
@@ -5796,7 +6015,102 @@
           <w:sz w:val="22"/>
           <w:szCs w:val="22"/>
         </w:rPr>
-        <w:t xml:space="preserve"> these stocks from a </w:t>
+        <w:t xml:space="preserve"> closure ending on June 12</w:t>
+      </w:r>
+      <w:r>
+        <w:rPr>
+          <w:rFonts w:ascii="Garamond" w:hAnsi="Garamond"/>
+          <w:sz w:val="22"/>
+          <w:szCs w:val="22"/>
+          <w:vertAlign w:val="superscript"/>
+        </w:rPr>
+        <w:t>th</w:t>
+      </w:r>
+      <w:r>
+        <w:rPr>
+          <w:rFonts w:ascii="Garamond" w:hAnsi="Garamond"/>
+          <w:sz w:val="22"/>
+          <w:szCs w:val="22"/>
+        </w:rPr>
+        <w:t xml:space="preserve">.  Nearly all stocks upstream of Swift River received median protection &gt;10% of the total stock contribution across all years of our dataset, with several notable </w:t>
+      </w:r>
+      <w:proofErr w:type="spellStart"/>
+      <w:r>
+        <w:rPr>
+          <w:rFonts w:ascii="Garamond" w:hAnsi="Garamond"/>
+          <w:sz w:val="22"/>
+          <w:szCs w:val="22"/>
+        </w:rPr>
+        <w:t>outlkiers</w:t>
+      </w:r>
+      <w:proofErr w:type="spellEnd"/>
+      <w:r>
+        <w:rPr>
+          <w:rFonts w:ascii="Garamond" w:hAnsi="Garamond"/>
+          <w:sz w:val="22"/>
+          <w:szCs w:val="22"/>
+        </w:rPr>
+        <w:t xml:space="preserve"> &gt;30% protection in some years. An exception is the </w:t>
+      </w:r>
+      <w:proofErr w:type="spellStart"/>
+      <w:r>
+        <w:rPr>
+          <w:rFonts w:ascii="Garamond" w:hAnsi="Garamond"/>
+          <w:sz w:val="22"/>
+          <w:szCs w:val="22"/>
+        </w:rPr>
+        <w:t>Takotna</w:t>
+      </w:r>
+      <w:proofErr w:type="spellEnd"/>
+      <w:r>
+        <w:rPr>
+          <w:rFonts w:ascii="Garamond" w:hAnsi="Garamond"/>
+          <w:sz w:val="22"/>
+          <w:szCs w:val="22"/>
+        </w:rPr>
+        <w:t xml:space="preserve"> river and Nixon Fork stocks, which received a median protection of only 6.6%. Several stocks which contribute only minimally to the overall run are afforded significant protection. For example, although the East Fork Kuskokwim contributes minimally to the total run</w:t>
+      </w:r>
+      <w:r>
+        <w:rPr>
+          <w:rFonts w:ascii="Garamond" w:hAnsi="Garamond"/>
+          <w:sz w:val="22"/>
+          <w:szCs w:val="22"/>
+        </w:rPr>
+        <w:t xml:space="preserve"> (~2-3% annually), approximately one-quarter of its total returns are protected by a front-end closure. </w:t>
+      </w:r>
+      <w:r>
+        <w:rPr>
+          <w:rFonts w:ascii="Garamond" w:hAnsi="Garamond"/>
+          <w:sz w:val="22"/>
+          <w:szCs w:val="22"/>
+        </w:rPr>
+        <w:t xml:space="preserve">Stocks positioned lower in the watershed received less protection due to their generally late arrival, with all stocks downstream or the Swift River receiving </w:t>
+      </w:r>
+      <w:r>
+        <w:rPr>
+          <w:rFonts w:ascii="Garamond" w:hAnsi="Garamond"/>
+          <w:sz w:val="22"/>
+          <w:szCs w:val="22"/>
+        </w:rPr>
+        <w:t xml:space="preserve">median protection of less than 10%. The stony and </w:t>
+      </w:r>
+      <w:proofErr w:type="spellStart"/>
+      <w:r>
+        <w:rPr>
+          <w:rFonts w:ascii="Garamond" w:hAnsi="Garamond"/>
+          <w:sz w:val="22"/>
+          <w:szCs w:val="22"/>
+        </w:rPr>
+        <w:t>Hoholitna</w:t>
+      </w:r>
+      <w:proofErr w:type="spellEnd"/>
+      <w:r>
+        <w:rPr>
+          <w:rFonts w:ascii="Garamond" w:hAnsi="Garamond"/>
+          <w:sz w:val="22"/>
+          <w:szCs w:val="22"/>
+        </w:rPr>
+        <w:t xml:space="preserve"> River stocks, however, contain outliers of 22.1% and 18.4%, indicating that a </w:t>
       </w:r>
       <w:proofErr w:type="gramStart"/>
       <w:r>
@@ -5814,143 +6128,8 @@
           <w:sz w:val="22"/>
           <w:szCs w:val="22"/>
         </w:rPr>
-        <w:t xml:space="preserve"> closure ending on June 12</w:t>
-      </w:r>
-      <w:r>
-        <w:rPr>
-          <w:rFonts w:ascii="Garamond" w:hAnsi="Garamond"/>
-          <w:sz w:val="22"/>
-          <w:szCs w:val="22"/>
-          <w:vertAlign w:val="superscript"/>
-        </w:rPr>
-        <w:t>th</w:t>
-      </w:r>
-      <w:r>
-        <w:rPr>
-          <w:rFonts w:ascii="Garamond" w:hAnsi="Garamond"/>
-          <w:sz w:val="22"/>
-          <w:szCs w:val="22"/>
-        </w:rPr>
-        <w:t xml:space="preserve">.  Nearly all stocks upstream of Swift River received median protection &gt;10% of the total stock contribution across all years of our dataset, with several notable </w:t>
-      </w:r>
-      <w:proofErr w:type="spellStart"/>
-      <w:r>
-        <w:rPr>
-          <w:rFonts w:ascii="Garamond" w:hAnsi="Garamond"/>
-          <w:sz w:val="22"/>
-          <w:szCs w:val="22"/>
-        </w:rPr>
-        <w:t>outlkiers</w:t>
-      </w:r>
-      <w:proofErr w:type="spellEnd"/>
-      <w:r>
-        <w:rPr>
-          <w:rFonts w:ascii="Garamond" w:hAnsi="Garamond"/>
-          <w:sz w:val="22"/>
-          <w:szCs w:val="22"/>
-        </w:rPr>
-        <w:t xml:space="preserve"> &gt;30% protection in some years. An exception is the </w:t>
-      </w:r>
-      <w:proofErr w:type="spellStart"/>
-      <w:r>
-        <w:rPr>
-          <w:rFonts w:ascii="Garamond" w:hAnsi="Garamond"/>
-          <w:sz w:val="22"/>
-          <w:szCs w:val="22"/>
-        </w:rPr>
-        <w:t>Takotna</w:t>
-      </w:r>
-      <w:proofErr w:type="spellEnd"/>
-      <w:r>
-        <w:rPr>
-          <w:rFonts w:ascii="Garamond" w:hAnsi="Garamond"/>
-          <w:sz w:val="22"/>
-          <w:szCs w:val="22"/>
-        </w:rPr>
-        <w:t xml:space="preserve"> river and Nixon Fork stocks, which received a median protection of only 6.6%. Several stocks which contribute only minimally to the overall run are afforded significant protection. For example, although the East Fork Kuskokwim contributes minimally to the total run</w:t>
-      </w:r>
-      <w:r>
-        <w:rPr>
-          <w:rFonts w:ascii="Garamond" w:hAnsi="Garamond"/>
-          <w:sz w:val="22"/>
-          <w:szCs w:val="22"/>
-        </w:rPr>
-        <w:t xml:space="preserve"> (~2-3% annually), approximately one-quarter of its total returns are protected by a front-end closure. </w:t>
-      </w:r>
-      <w:r>
-        <w:rPr>
-          <w:rFonts w:ascii="Garamond" w:hAnsi="Garamond"/>
-          <w:sz w:val="22"/>
-          <w:szCs w:val="22"/>
-        </w:rPr>
-        <w:t xml:space="preserve">Stocks positioned lower in the watershed received less protection due to their generally late arrival, with all stocks downstream or the Swift River receiving </w:t>
-      </w:r>
-      <w:r>
-        <w:rPr>
-          <w:rFonts w:ascii="Garamond" w:hAnsi="Garamond"/>
-          <w:sz w:val="22"/>
-          <w:szCs w:val="22"/>
-        </w:rPr>
-        <w:t xml:space="preserve">median protection of less than 10%. The stony and </w:t>
-      </w:r>
-      <w:proofErr w:type="spellStart"/>
-      <w:r>
-        <w:rPr>
-          <w:rFonts w:ascii="Garamond" w:hAnsi="Garamond"/>
-          <w:sz w:val="22"/>
-          <w:szCs w:val="22"/>
-        </w:rPr>
-        <w:t>Hoholitna</w:t>
-      </w:r>
-      <w:proofErr w:type="spellEnd"/>
-      <w:r>
-        <w:rPr>
-          <w:rFonts w:ascii="Garamond" w:hAnsi="Garamond"/>
-          <w:sz w:val="22"/>
-          <w:szCs w:val="22"/>
-        </w:rPr>
-        <w:t xml:space="preserve"> River stocks, however, contain outliers of 22.1% and 18.4%, indicating that a </w:t>
-      </w:r>
-      <w:proofErr w:type="gramStart"/>
-      <w:r>
-        <w:rPr>
-          <w:rFonts w:ascii="Garamond" w:hAnsi="Garamond"/>
-          <w:sz w:val="22"/>
-          <w:szCs w:val="22"/>
-        </w:rPr>
-        <w:t>front end</w:t>
-      </w:r>
-      <w:proofErr w:type="gramEnd"/>
-      <w:r>
-        <w:rPr>
-          <w:rFonts w:ascii="Garamond" w:hAnsi="Garamond"/>
-          <w:sz w:val="22"/>
-          <w:szCs w:val="22"/>
-        </w:rPr>
         <w:t xml:space="preserve"> closure may afford these stocks substantial protection in some years. </w:t>
       </w:r>
-    </w:p>
-    <w:p>
-      <w:pPr>
-        <w:pStyle w:val="whitespace-normal"/>
-        <w:spacing w:line="480" w:lineRule="auto"/>
-        <w:rPr>
-          <w:rFonts w:ascii="Garamond" w:hAnsi="Garamond"/>
-          <w:sz w:val="22"/>
-          <w:szCs w:val="22"/>
-        </w:rPr>
-      </w:pPr>
-    </w:p>
-    <w:p>
-      <w:pPr>
-        <w:pStyle w:val="whitespace-normal"/>
-        <w:spacing w:line="480" w:lineRule="auto"/>
-        <w:rPr>
-          <w:rFonts w:ascii="Garamond" w:hAnsi="Garamond"/>
-          <w:sz w:val="22"/>
-          <w:szCs w:val="22"/>
-        </w:rPr>
-      </w:pPr>
     </w:p>
     <w:p>
       <w:pPr>
@@ -6013,7 +6192,7 @@
         </w:rPr>
         <w:t xml:space="preserve">over several years and </w:t>
       </w:r>
-      <w:commentRangeStart w:id="17"/>
+      <w:commentRangeStart w:id="15"/>
       <w:r>
         <w:rPr>
           <w:rFonts w:ascii="Garamond" w:hAnsi="Garamond"/>
@@ -6022,7 +6201,7 @@
         </w:rPr>
         <w:t xml:space="preserve">at a finer spatial scale </w:t>
       </w:r>
-      <w:commentRangeEnd w:id="17"/>
+      <w:commentRangeEnd w:id="15"/>
       <w:r>
         <w:rPr>
           <w:rStyle w:val="CommentReference"/>
@@ -6030,7 +6209,7 @@
           <w:kern w:val="2"/>
           <w14:ligatures w14:val="standardContextual"/>
         </w:rPr>
-        <w:commentReference w:id="17"/>
+        <w:commentReference w:id="15"/>
       </w:r>
       <w:r>
         <w:rPr>
@@ -6160,25 +6339,7 @@
           <w:sz w:val="22"/>
           <w:szCs w:val="22"/>
         </w:rPr>
-        <w:t xml:space="preserve"> and McGrath. If overharvest occurs before salmon </w:t>
-      </w:r>
-      <w:proofErr w:type="gramStart"/>
-      <w:r>
-        <w:rPr>
-          <w:rFonts w:ascii="Garamond" w:hAnsi="Garamond"/>
-          <w:sz w:val="22"/>
-          <w:szCs w:val="22"/>
-        </w:rPr>
-        <w:t>reach</w:t>
-      </w:r>
-      <w:proofErr w:type="gramEnd"/>
-      <w:r>
-        <w:rPr>
-          <w:rFonts w:ascii="Garamond" w:hAnsi="Garamond"/>
-          <w:sz w:val="22"/>
-          <w:szCs w:val="22"/>
-        </w:rPr>
-        <w:t xml:space="preserve"> the upper watershed, these communities may face shortfalls in resource availability.</w:t>
+        <w:t xml:space="preserve"> and McGrath. If overharvest occurs before salmon reach the upper watershed, these communities may face shortfalls in resource availability.</w:t>
       </w:r>
     </w:p>
     <w:p>
@@ -6396,25 +6557,7 @@
           <w:sz w:val="22"/>
           <w:szCs w:val="22"/>
         </w:rPr>
-        <w:t xml:space="preserve"> closure strategy in </w:t>
-      </w:r>
-      <w:proofErr w:type="gramStart"/>
-      <w:r>
-        <w:rPr>
-          <w:rFonts w:ascii="Garamond" w:hAnsi="Garamond"/>
-          <w:sz w:val="22"/>
-          <w:szCs w:val="22"/>
-        </w:rPr>
-        <w:t>the Kuskokwim</w:t>
-      </w:r>
-      <w:proofErr w:type="gramEnd"/>
-      <w:r>
-        <w:rPr>
-          <w:rFonts w:ascii="Garamond" w:hAnsi="Garamond"/>
-          <w:sz w:val="22"/>
-          <w:szCs w:val="22"/>
-        </w:rPr>
-        <w:t xml:space="preserve"> to protect opportunity for upstream comm. And stabilize the fishery by protecting upstream stocks </w:t>
+        <w:t xml:space="preserve"> closure strategy in the Kuskokwim to protect opportunity for upstream comm. And stabilize the fishery by protecting upstream stocks </w:t>
       </w:r>
     </w:p>
     <w:p>
@@ -6742,23 +6885,13 @@
         </w:rPr>
         <w:t xml:space="preserve">. Salmon from this region </w:t>
       </w:r>
-      <w:proofErr w:type="gramStart"/>
-      <w:r>
-        <w:rPr>
-          <w:rFonts w:ascii="Garamond" w:hAnsi="Garamond"/>
-          <w:sz w:val="22"/>
-          <w:szCs w:val="22"/>
-        </w:rPr>
-        <w:t>have</w:t>
-      </w:r>
-      <w:proofErr w:type="gramEnd"/>
-      <w:r>
-        <w:rPr>
-          <w:rFonts w:ascii="Garamond" w:hAnsi="Garamond"/>
-          <w:sz w:val="22"/>
-          <w:szCs w:val="22"/>
-        </w:rPr>
-        <w:t xml:space="preserve"> supported</w:t>
+      <w:r>
+        <w:rPr>
+          <w:rFonts w:ascii="Garamond" w:hAnsi="Garamond"/>
+          <w:sz w:val="22"/>
+          <w:szCs w:val="22"/>
+        </w:rPr>
+        <w:t>have supported</w:t>
       </w:r>
       <w:r>
         <w:rPr>
@@ -6870,7 +7003,7 @@
           <w:sz w:val="22"/>
           <w:szCs w:val="22"/>
         </w:rPr>
-        <w:instrText xml:space="preserve"> ADDIN ZOTERO_ITEM CSL_CITATION {"citationID":"pEObtCaz","properties":{"formattedCitation":"(Brown &amp; Godduhn, 2015)","plainCitation":"(Brown &amp; Godduhn, 2015)","noteIndex":0},"citationItems":[{"id":4428,"uris":["http://zotero.org/users/8421274/items/2WA8NCRM"],"itemData":{"id":4428,"type":"article-journal","language":"en","source":"Zotero","title":"Socioeconomic effects of declining salmon runs on the Yukon River","author":[{"family":"Brown","given":"Caroline L"},{"family":"Godduhn","given":"Anna"}],"issued":{"date-parts":[["2015"]]}}}],"schema":"https://github.com/citation-style-language/schema/raw/master/csl-citation.json"} </w:instrText>
+        <w:instrText xml:space="preserve"> ADDIN ZOTERO_ITEM CSL_CITATION {"citationID":"TM3ypjGJ","properties":{"formattedCitation":"(Brown &amp; Godduhn, 2015)","plainCitation":"(Brown &amp; Godduhn, 2015)","noteIndex":0},"citationItems":[{"id":4428,"uris":["http://zotero.org/users/8421274/items/2WA8NCRM"],"itemData":{"id":4428,"type":"article-journal","language":"en","source":"Zotero","title":"Socioeconomic effects of declining salmon runs on the Yukon River","author":[{"family":"Brown","given":"Caroline L"},{"family":"Godduhn","given":"Anna"}],"issued":{"date-parts":[["2015"]]}}}],"schema":"https://github.com/citation-style-language/schema/raw/master/csl-citation.json"} </w:instrText>
       </w:r>
       <w:r>
         <w:rPr>
@@ -7670,7 +7803,7 @@
         <w:spacing w:line="480" w:lineRule="auto"/>
         <w:ind w:firstLine="720"/>
         <w:rPr>
-          <w:ins w:id="18" w:author="Benjamin J. Makhlouf" w:date="2025-07-26T14:59:00Z" w16du:dateUtc="2025-07-26T21:59:00Z"/>
+          <w:ins w:id="16" w:author="Benjamin J. Makhlouf" w:date="2025-07-26T14:59:00Z" w16du:dateUtc="2025-07-26T21:59:00Z"/>
           <w:rFonts w:ascii="Garamond" w:hAnsi="Garamond"/>
           <w:sz w:val="22"/>
           <w:szCs w:val="22"/>
@@ -7904,7 +8037,7 @@
         </w:rPr>
         <w:t xml:space="preserve"> while allowing for a significant number of fish to return to stocks in the upper portions of the river basin , thereby protecting access to harvest opportunities for upstream communities and bolstering the health of upstream stocks which have a general tendency to migrate early in the season </w:t>
       </w:r>
-      <w:commentRangeStart w:id="19"/>
+      <w:commentRangeStart w:id="17"/>
       <w:r>
         <w:rPr>
           <w:rFonts w:ascii="Garamond" w:hAnsi="Garamond"/>
@@ -7992,56 +8125,20 @@
         </w:rPr>
         <w:fldChar w:fldCharType="end"/>
       </w:r>
-      <w:commentRangeEnd w:id="19"/>
+      <w:commentRangeEnd w:id="17"/>
       <w:r>
         <w:rPr>
           <w:rStyle w:val="CommentReference"/>
         </w:rPr>
-        <w:commentReference w:id="19"/>
-      </w:r>
-      <w:r>
-        <w:rPr>
-          <w:rFonts w:ascii="Garamond" w:hAnsi="Garamond"/>
-          <w:sz w:val="22"/>
-          <w:szCs w:val="22"/>
-        </w:rPr>
-        <w:t xml:space="preserve">. However, little data </w:t>
-      </w:r>
-      <w:proofErr w:type="gramStart"/>
-      <w:r>
-        <w:rPr>
-          <w:rFonts w:ascii="Garamond" w:hAnsi="Garamond"/>
-          <w:sz w:val="22"/>
-          <w:szCs w:val="22"/>
-        </w:rPr>
-        <w:t>exist</w:t>
-      </w:r>
-      <w:proofErr w:type="gramEnd"/>
-      <w:r>
-        <w:rPr>
-          <w:rFonts w:ascii="Garamond" w:hAnsi="Garamond"/>
-          <w:sz w:val="22"/>
-          <w:szCs w:val="22"/>
-        </w:rPr>
-        <w:t xml:space="preserve"> which quantifies the spatiotemporal patterns among stocks. The impact of front-end closure strategies on individual stock components is not well understood, and a more complete understanding of stock contribution to the overall run both within and among years is currently not readily available. </w:t>
-      </w:r>
-      <w:proofErr w:type="gramStart"/>
-      <w:r>
-        <w:rPr>
-          <w:rFonts w:ascii="Garamond" w:hAnsi="Garamond"/>
-          <w:sz w:val="22"/>
-          <w:szCs w:val="22"/>
-        </w:rPr>
-        <w:t>These</w:t>
-      </w:r>
-      <w:proofErr w:type="gramEnd"/>
-      <w:r>
-        <w:rPr>
-          <w:rFonts w:ascii="Garamond" w:hAnsi="Garamond"/>
-          <w:sz w:val="22"/>
-          <w:szCs w:val="22"/>
-        </w:rPr>
-        <w:t xml:space="preserve"> data may be important to assessing the impact of current management strategies and designing new strategies which maintain stock health across all components of the watershed and maintain a reliable resource for communities and industry in the region. </w:t>
+        <w:commentReference w:id="17"/>
+      </w:r>
+      <w:r>
+        <w:rPr>
+          <w:rFonts w:ascii="Garamond" w:hAnsi="Garamond"/>
+          <w:sz w:val="22"/>
+          <w:szCs w:val="22"/>
+        </w:rPr>
+        <w:t xml:space="preserve">. However, little data exist which quantifies the spatiotemporal patterns among stocks. The impact of front-end closure strategies on individual stock components is not well understood, and a more complete understanding of stock contribution to the overall run both within and among years is currently not readily available. These data may be important to assessing the impact of current management strategies and designing new strategies which maintain stock health across all components of the watershed and maintain a reliable resource for communities and industry in the region. </w:t>
       </w:r>
     </w:p>
     <w:p>
@@ -8228,8 +8325,8 @@
       </w:pPr>
     </w:p>
     <w:sectPr>
-      <w:footerReference w:type="even" r:id="rId11"/>
-      <w:footerReference w:type="default" r:id="rId12"/>
+      <w:footerReference w:type="even" r:id="rId12"/>
+      <w:footerReference w:type="default" r:id="rId13"/>
       <w:pgSz w:w="12240" w:h="15840"/>
       <w:pgMar w:top="1440" w:right="1440" w:bottom="1440" w:left="1440" w:header="720" w:footer="720" w:gutter="0"/>
       <w:lnNumType w:countBy="1" w:restart="continuous"/>
@@ -8259,11 +8356,8 @@
       </w:r>
     </w:p>
   </w:comment>
-  <w:comment w:id="1" w:author="Daniel Schindler" w:date="2025-07-17T12:57:00Z" w:initials="DS">
+  <w:comment w:id="1" w:author="bmak29" w:date="2025-07-29T18:17:00Z" w:initials="b">
     <w:p>
-      <w:pPr>
-        <w:pStyle w:val="CommentText"/>
-      </w:pPr>
       <w:r>
         <w:rPr>
           <w:rStyle w:val="CommentReference"/>
@@ -8271,15 +8365,16 @@
         <w:annotationRef/>
       </w:r>
       <w:r>
-        <w:t>Need to reorganize this to broaden scope a bit for J Appl Ecology</w:t>
+        <w:rPr>
+          <w:sz w:val="20"/>
+          <w:szCs w:val="20"/>
+        </w:rPr>
+        <w:t>Other than the Eek?</w:t>
       </w:r>
     </w:p>
   </w:comment>
-  <w:comment w:id="2" w:author="Daniel Schindler" w:date="2025-07-17T13:14:00Z" w:initials="DS">
+  <w:comment w:id="10" w:author="Benjamin J. Makhlouf" w:date="2025-07-28T07:41:00Z" w:initials="BM">
     <w:p>
-      <w:pPr>
-        <w:pStyle w:val="CommentText"/>
-      </w:pPr>
       <w:r>
         <w:rPr>
           <w:rStyle w:val="CommentReference"/>
@@ -8287,11 +8382,15 @@
         <w:annotationRef/>
       </w:r>
       <w:r>
-        <w:t>I will come back to this later.</w:t>
+        <w:rPr>
+          <w:sz w:val="20"/>
+          <w:szCs w:val="20"/>
+        </w:rPr>
+        <w:t xml:space="preserve">Since this is published in french et al., should it not be included as a figure? </w:t>
       </w:r>
     </w:p>
   </w:comment>
-  <w:comment w:id="11" w:author="Benjamin J. Makhlouf" w:date="2025-07-28T07:41:00Z" w:initials="BM">
+  <w:comment w:id="11" w:author="Benjamin J. Makhlouf" w:date="2025-07-28T07:42:00Z" w:initials="BM">
     <w:p>
       <w:pPr>
         <w:pStyle w:val="CommentText"/>
@@ -8303,15 +8402,12 @@
         <w:annotationRef/>
       </w:r>
       <w:r>
-        <w:t xml:space="preserve">Since this is published in french et al., do you think I should not include it as a figure? </w:t>
+        <w:t xml:space="preserve">This is in one of Sean’s papers but I cannot find it </w:t>
       </w:r>
     </w:p>
   </w:comment>
-  <w:comment w:id="12" w:author="Benjamin J. Makhlouf" w:date="2025-07-28T07:42:00Z" w:initials="BM">
+  <w:comment w:id="12" w:author="Benjamin J. Makhlouf" w:date="2025-07-30T08:26:00Z" w:initials="b">
     <w:p>
-      <w:pPr>
-        <w:pStyle w:val="CommentText"/>
-      </w:pPr>
       <w:r>
         <w:rPr>
           <w:rStyle w:val="CommentReference"/>
@@ -8319,11 +8415,15 @@
         <w:annotationRef/>
       </w:r>
       <w:r>
-        <w:t xml:space="preserve">This is in one of Sean’s papers but I cannot find it </w:t>
+        <w:rPr>
+          <w:sz w:val="20"/>
+          <w:szCs w:val="20"/>
+        </w:rPr>
+        <w:t>We run into the same problem as the last paper where it is very unclear how this habitat prior is made (other than shutting off the eek). I can reasonably assume it's the same as the Yukon</w:t>
       </w:r>
     </w:p>
   </w:comment>
-  <w:comment w:id="17" w:author="Benjamin J. Makhlouf" w:date="2025-07-28T13:54:00Z" w:initials="BM">
+  <w:comment w:id="15" w:author="Benjamin J. Makhlouf" w:date="2025-07-28T13:54:00Z" w:initials="BM">
     <w:p>
       <w:pPr>
         <w:pStyle w:val="CommentText"/>
@@ -8339,7 +8439,7 @@
       </w:r>
     </w:p>
   </w:comment>
-  <w:comment w:id="19" w:author="Daniel Schindler" w:date="2025-06-27T11:54:00Z" w:initials="DS">
+  <w:comment w:id="17" w:author="Daniel Schindler" w:date="2025-06-27T11:54:00Z" w:initials="DS">
     <w:p>
       <w:pPr>
         <w:pStyle w:val="CommentText"/>
@@ -8361,10 +8461,10 @@
 <file path=word/commentsExtended.xml><?xml version="1.0" encoding="utf-8"?>
 <w15:commentsEx xmlns:wpc="http://schemas.microsoft.com/office/word/2010/wordprocessingCanvas" xmlns:cx="http://schemas.microsoft.com/office/drawing/2014/chartex" xmlns:cx1="http://schemas.microsoft.com/office/drawing/2015/9/8/chartex" xmlns:cx2="http://schemas.microsoft.com/office/drawing/2015/10/21/chartex" xmlns:cx3="http://schemas.microsoft.com/office/drawing/2016/5/9/chartex" xmlns:cx4="http://schemas.microsoft.com/office/drawing/2016/5/10/chartex" xmlns:cx5="http://schemas.microsoft.com/office/drawing/2016/5/11/chartex" xmlns:cx6="http://schemas.microsoft.com/office/drawing/2016/5/12/chartex" xmlns:cx7="http://schemas.microsoft.com/office/drawing/2016/5/13/chartex" xmlns:cx8="http://schemas.microsoft.com/office/drawing/2016/5/14/chartex" xmlns:mc="http://schemas.openxmlformats.org/markup-compatibility/2006" xmlns:aink="http://schemas.microsoft.com/office/drawing/2016/ink" xmlns:am3d="http://schemas.microsoft.com/office/drawing/2017/model3d" xmlns:o="urn:schemas-microsoft-com:office:office" xmlns:oel="http://schemas.microsoft.com/office/2019/extlst" xmlns:r="http://schemas.openxmlformats.org/officeDocument/2006/relationships" xmlns:m="http://schemas.openxmlformats.org/officeDocument/2006/math" xmlns:v="urn:schemas-microsoft-com:vml" xmlns:wp14="http://schemas.microsoft.com/office/word/2010/wordprocessingDrawing" xmlns:wp="http://schemas.openxmlformats.org/drawingml/2006/wordprocessingDrawing" xmlns:w10="urn:schemas-microsoft-com:office:word" xmlns:w="http://schemas.openxmlformats.org/wordprocessingml/2006/main" xmlns:w14="http://schemas.microsoft.com/office/word/2010/wordml" xmlns:w15="http://schemas.microsoft.com/office/word/2012/wordml" xmlns:w16cex="http://schemas.microsoft.com/office/word/2018/wordml/cex" xmlns:w16cid="http://schemas.microsoft.com/office/word/2016/wordml/cid" xmlns:w16="http://schemas.microsoft.com/office/word/2018/wordml" xmlns:w16du="http://schemas.microsoft.com/office/word/2023/wordml/word16du" xmlns:w16sdtdh="http://schemas.microsoft.com/office/word/2020/wordml/sdtdatahash" xmlns:w16sdtfl="http://schemas.microsoft.com/office/word/2024/wordml/sdtformatlock" xmlns:w16se="http://schemas.microsoft.com/office/word/2015/wordml/symex" xmlns:wpg="http://schemas.microsoft.com/office/word/2010/wordprocessingGroup" xmlns:wpi="http://schemas.microsoft.com/office/word/2010/wordprocessingInk" xmlns:wne="http://schemas.microsoft.com/office/word/2006/wordml" xmlns:wps="http://schemas.microsoft.com/office/word/2010/wordprocessingShape" mc:Ignorable="w14 w15 w16se w16cid w16 w16cex w16sdtdh w16sdtfl w16du wp14">
   <w15:commentEx w15:paraId="545E12D6" w15:done="0"/>
-  <w15:commentEx w15:paraId="2AD4524E" w15:done="0"/>
-  <w15:commentEx w15:paraId="0DA0C363" w15:paraIdParent="2AD4524E" w15:done="0"/>
+  <w15:commentEx w15:paraId="7B9E6931" w15:done="0"/>
   <w15:commentEx w15:paraId="317DFEBA" w15:done="0"/>
   <w15:commentEx w15:paraId="05C4AF8C" w15:done="0"/>
+  <w15:commentEx w15:paraId="78D2F929" w15:done="0"/>
   <w15:commentEx w15:paraId="036EDFB1" w15:done="0"/>
   <w15:commentEx w15:paraId="506CDC99" w15:done="0"/>
 </w15:commentsEx>
@@ -8373,10 +8473,10 @@
 <file path=word/commentsExtensible.xml><?xml version="1.0" encoding="utf-8"?>
 <w16cex:commentsExtensible xmlns:wpc="http://schemas.microsoft.com/office/word/2010/wordprocessingCanvas" xmlns:cx="http://schemas.microsoft.com/office/drawing/2014/chartex" xmlns:cx1="http://schemas.microsoft.com/office/drawing/2015/9/8/chartex" xmlns:cx2="http://schemas.microsoft.com/office/drawing/2015/10/21/chartex" xmlns:cx3="http://schemas.microsoft.com/office/drawing/2016/5/9/chartex" xmlns:cx4="http://schemas.microsoft.com/office/drawing/2016/5/10/chartex" xmlns:cx5="http://schemas.microsoft.com/office/drawing/2016/5/11/chartex" xmlns:cx6="http://schemas.microsoft.com/office/drawing/2016/5/12/chartex" xmlns:cx7="http://schemas.microsoft.com/office/drawing/2016/5/13/chartex" xmlns:cx8="http://schemas.microsoft.com/office/drawing/2016/5/14/chartex" xmlns:cr="http://schemas.microsoft.com/office/comments/2020/reactions" xmlns:mc="http://schemas.openxmlformats.org/markup-compatibility/2006" xmlns:aink="http://schemas.microsoft.com/office/drawing/2016/ink" xmlns:am3d="http://schemas.microsoft.com/office/drawing/2017/model3d" xmlns:o="urn:schemas-microsoft-com:office:office" xmlns:oel="http://schemas.microsoft.com/office/2019/extlst" xmlns:r="http://schemas.openxmlformats.org/officeDocument/2006/relationships" xmlns:m="http://schemas.openxmlformats.org/officeDocument/2006/math" xmlns:v="urn:schemas-microsoft-com:vml" xmlns:wp14="http://schemas.microsoft.com/office/word/2010/wordprocessingDrawing" xmlns:wp="http://schemas.openxmlformats.org/drawingml/2006/wordprocessingDrawing" xmlns:w10="urn:schemas-microsoft-com:office:word" xmlns:w="http://schemas.openxmlformats.org/wordprocessingml/2006/main" xmlns:w14="http://schemas.microsoft.com/office/word/2010/wordml" xmlns:w15="http://schemas.microsoft.com/office/word/2012/wordml" xmlns:w16cex="http://schemas.microsoft.com/office/word/2018/wordml/cex" xmlns:w16cid="http://schemas.microsoft.com/office/word/2016/wordml/cid" xmlns:w16="http://schemas.microsoft.com/office/word/2018/wordml" xmlns:w16du="http://schemas.microsoft.com/office/word/2023/wordml/word16du" xmlns:w16sdtdh="http://schemas.microsoft.com/office/word/2020/wordml/sdtdatahash" xmlns:w16sdtfl="http://schemas.microsoft.com/office/word/2024/wordml/sdtformatlock" xmlns:w16se="http://schemas.microsoft.com/office/word/2015/wordml/symex" xmlns:wpg="http://schemas.microsoft.com/office/word/2010/wordprocessingGroup" xmlns:wpi="http://schemas.microsoft.com/office/word/2010/wordprocessingInk" xmlns:wne="http://schemas.microsoft.com/office/word/2006/wordml" xmlns:wps="http://schemas.microsoft.com/office/word/2010/wordprocessingShape" mc:Ignorable="w14 w15 w16se w16cid w16 w16cex w16sdtdh w16sdtfl cr w16du wp14">
   <w16cex:commentExtensible w16cex:durableId="0AF9D5BC" w16cex:dateUtc="2025-07-26T18:23:00Z"/>
-  <w16cex:commentExtensible w16cex:durableId="6C50E346" w16cex:dateUtc="2025-07-17T20:57:00Z"/>
-  <w16cex:commentExtensible w16cex:durableId="31A19B43" w16cex:dateUtc="2025-07-17T21:14:00Z"/>
+  <w16cex:commentExtensible w16cex:durableId="02BD22AA" w16cex:dateUtc="2025-07-30T01:17:00Z"/>
   <w16cex:commentExtensible w16cex:durableId="6C95C996" w16cex:dateUtc="2025-07-28T14:41:00Z"/>
   <w16cex:commentExtensible w16cex:durableId="3CAE4ABD" w16cex:dateUtc="2025-07-28T14:42:00Z"/>
+  <w16cex:commentExtensible w16cex:durableId="1D6CE52A" w16cex:dateUtc="2025-07-30T15:26:00Z"/>
   <w16cex:commentExtensible w16cex:durableId="6836BCE2" w16cex:dateUtc="2025-07-28T20:54:00Z"/>
   <w16cex:commentExtensible w16cex:durableId="08B9BEA6" w16cex:dateUtc="2025-06-27T19:54:00Z"/>
 </w16cex:commentsExtensible>
@@ -8385,10 +8485,10 @@
 <file path=word/commentsIds.xml><?xml version="1.0" encoding="utf-8"?>
 <w16cid:commentsIds xmlns:wpc="http://schemas.microsoft.com/office/word/2010/wordprocessingCanvas" xmlns:cx="http://schemas.microsoft.com/office/drawing/2014/chartex" xmlns:cx1="http://schemas.microsoft.com/office/drawing/2015/9/8/chartex" xmlns:cx2="http://schemas.microsoft.com/office/drawing/2015/10/21/chartex" xmlns:cx3="http://schemas.microsoft.com/office/drawing/2016/5/9/chartex" xmlns:cx4="http://schemas.microsoft.com/office/drawing/2016/5/10/chartex" xmlns:cx5="http://schemas.microsoft.com/office/drawing/2016/5/11/chartex" xmlns:cx6="http://schemas.microsoft.com/office/drawing/2016/5/12/chartex" xmlns:cx7="http://schemas.microsoft.com/office/drawing/2016/5/13/chartex" xmlns:cx8="http://schemas.microsoft.com/office/drawing/2016/5/14/chartex" xmlns:mc="http://schemas.openxmlformats.org/markup-compatibility/2006" xmlns:aink="http://schemas.microsoft.com/office/drawing/2016/ink" xmlns:am3d="http://schemas.microsoft.com/office/drawing/2017/model3d" xmlns:o="urn:schemas-microsoft-com:office:office" xmlns:oel="http://schemas.microsoft.com/office/2019/extlst" xmlns:r="http://schemas.openxmlformats.org/officeDocument/2006/relationships" xmlns:m="http://schemas.openxmlformats.org/officeDocument/2006/math" xmlns:v="urn:schemas-microsoft-com:vml" xmlns:wp14="http://schemas.microsoft.com/office/word/2010/wordprocessingDrawing" xmlns:wp="http://schemas.openxmlformats.org/drawingml/2006/wordprocessingDrawing" xmlns:w10="urn:schemas-microsoft-com:office:word" xmlns:w="http://schemas.openxmlformats.org/wordprocessingml/2006/main" xmlns:w14="http://schemas.microsoft.com/office/word/2010/wordml" xmlns:w15="http://schemas.microsoft.com/office/word/2012/wordml" xmlns:w16cex="http://schemas.microsoft.com/office/word/2018/wordml/cex" xmlns:w16cid="http://schemas.microsoft.com/office/word/2016/wordml/cid" xmlns:w16="http://schemas.microsoft.com/office/word/2018/wordml" xmlns:w16du="http://schemas.microsoft.com/office/word/2023/wordml/word16du" xmlns:w16sdtdh="http://schemas.microsoft.com/office/word/2020/wordml/sdtdatahash" xmlns:w16sdtfl="http://schemas.microsoft.com/office/word/2024/wordml/sdtformatlock" xmlns:w16se="http://schemas.microsoft.com/office/word/2015/wordml/symex" xmlns:wpg="http://schemas.microsoft.com/office/word/2010/wordprocessingGroup" xmlns:wpi="http://schemas.microsoft.com/office/word/2010/wordprocessingInk" xmlns:wne="http://schemas.microsoft.com/office/word/2006/wordml" xmlns:wps="http://schemas.microsoft.com/office/word/2010/wordprocessingShape" mc:Ignorable="w14 w15 w16se w16cid w16 w16cex w16sdtdh w16sdtfl w16du wp14">
   <w16cid:commentId w16cid:paraId="545E12D6" w16cid:durableId="0AF9D5BC"/>
-  <w16cid:commentId w16cid:paraId="2AD4524E" w16cid:durableId="6C50E346"/>
-  <w16cid:commentId w16cid:paraId="0DA0C363" w16cid:durableId="31A19B43"/>
+  <w16cid:commentId w16cid:paraId="7B9E6931" w16cid:durableId="02BD22AA"/>
   <w16cid:commentId w16cid:paraId="317DFEBA" w16cid:durableId="6C95C996"/>
   <w16cid:commentId w16cid:paraId="05C4AF8C" w16cid:durableId="3CAE4ABD"/>
+  <w16cid:commentId w16cid:paraId="78D2F929" w16cid:durableId="1D6CE52A"/>
   <w16cid:commentId w16cid:paraId="036EDFB1" w16cid:durableId="6836BCE2"/>
   <w16cid:commentId w16cid:paraId="506CDC99" w16cid:durableId="08B9BEA6"/>
 </w16cid:commentsIds>
@@ -9495,6 +9595,9 @@
 <file path=word/people.xml><?xml version="1.0" encoding="utf-8"?>
 <w15:people xmlns:wpc="http://schemas.microsoft.com/office/word/2010/wordprocessingCanvas" xmlns:cx="http://schemas.microsoft.com/office/drawing/2014/chartex" xmlns:cx1="http://schemas.microsoft.com/office/drawing/2015/9/8/chartex" xmlns:cx2="http://schemas.microsoft.com/office/drawing/2015/10/21/chartex" xmlns:cx3="http://schemas.microsoft.com/office/drawing/2016/5/9/chartex" xmlns:cx4="http://schemas.microsoft.com/office/drawing/2016/5/10/chartex" xmlns:cx5="http://schemas.microsoft.com/office/drawing/2016/5/11/chartex" xmlns:cx6="http://schemas.microsoft.com/office/drawing/2016/5/12/chartex" xmlns:cx7="http://schemas.microsoft.com/office/drawing/2016/5/13/chartex" xmlns:cx8="http://schemas.microsoft.com/office/drawing/2016/5/14/chartex" xmlns:mc="http://schemas.openxmlformats.org/markup-compatibility/2006" xmlns:aink="http://schemas.microsoft.com/office/drawing/2016/ink" xmlns:am3d="http://schemas.microsoft.com/office/drawing/2017/model3d" xmlns:o="urn:schemas-microsoft-com:office:office" xmlns:oel="http://schemas.microsoft.com/office/2019/extlst" xmlns:r="http://schemas.openxmlformats.org/officeDocument/2006/relationships" xmlns:m="http://schemas.openxmlformats.org/officeDocument/2006/math" xmlns:v="urn:schemas-microsoft-com:vml" xmlns:wp14="http://schemas.microsoft.com/office/word/2010/wordprocessingDrawing" xmlns:wp="http://schemas.openxmlformats.org/drawingml/2006/wordprocessingDrawing" xmlns:w10="urn:schemas-microsoft-com:office:word" xmlns:w="http://schemas.openxmlformats.org/wordprocessingml/2006/main" xmlns:w14="http://schemas.microsoft.com/office/word/2010/wordml" xmlns:w15="http://schemas.microsoft.com/office/word/2012/wordml" xmlns:w16cex="http://schemas.microsoft.com/office/word/2018/wordml/cex" xmlns:w16cid="http://schemas.microsoft.com/office/word/2016/wordml/cid" xmlns:w16="http://schemas.microsoft.com/office/word/2018/wordml" xmlns:w16du="http://schemas.microsoft.com/office/word/2023/wordml/word16du" xmlns:w16sdtdh="http://schemas.microsoft.com/office/word/2020/wordml/sdtdatahash" xmlns:w16sdtfl="http://schemas.microsoft.com/office/word/2024/wordml/sdtformatlock" xmlns:w16se="http://schemas.microsoft.com/office/word/2015/wordml/symex" xmlns:wpg="http://schemas.microsoft.com/office/word/2010/wordprocessingGroup" xmlns:wpi="http://schemas.microsoft.com/office/word/2010/wordprocessingInk" xmlns:wne="http://schemas.microsoft.com/office/word/2006/wordml" xmlns:wps="http://schemas.microsoft.com/office/word/2010/wordprocessingShape" mc:Ignorable="w14 w15 w16se w16cid w16 w16cex w16sdtdh w16sdtfl w16du wp14">
   <w15:person w15:author="Benjamin J. Makhlouf">
+    <w15:presenceInfo w15:providerId="AD" w15:userId="S::bmak29@uw.edu::e2d819b1-db99-41fc-888c-ad60b4d561ad"/>
+  </w15:person>
+  <w15:person w15:author="bmak29">
     <w15:presenceInfo w15:providerId="AD" w15:userId="S::bmak29@uw.edu::e2d819b1-db99-41fc-888c-ad60b4d561ad"/>
   </w15:person>
   <w15:person w15:author="Daniel Schindler">
@@ -10107,6 +10210,7 @@
   <w:style w:type="character" w:default="1" w:styleId="DefaultParagraphFont">
     <w:name w:val="Default Paragraph Font"/>
     <w:uiPriority w:val="1"/>
+    <w:semiHidden/>
     <w:unhideWhenUsed/>
   </w:style>
   <w:style w:type="table" w:default="1" w:styleId="TableNormal">
@@ -10936,4 +11040,16 @@
     </a:ext>
   </a:extLst>
 </a:theme>
+</file>
+
+<file path=customXml/item1.xml><?xml version="1.0" encoding="utf-8"?>
+<b:Sources xmlns:b="http://schemas.openxmlformats.org/officeDocument/2006/bibliography" xmlns="http://schemas.openxmlformats.org/officeDocument/2006/bibliography" SelectedStyle="/APASixthEditionOfficeOnline.xsl" StyleName="APA" Version="6"/>
+</file>
+
+<file path=customXml/itemProps1.xml><?xml version="1.0" encoding="utf-8"?>
+<ds:datastoreItem xmlns:ds="http://schemas.openxmlformats.org/officeDocument/2006/customXml" ds:itemID="{F0C3B3C1-115B-7142-B763-9A89294F78DA}">
+  <ds:schemaRefs>
+    <ds:schemaRef ds:uri="http://schemas.openxmlformats.org/officeDocument/2006/bibliography"/>
+  </ds:schemaRefs>
+</ds:datastoreItem>
 </file>
</xml_diff>

<commit_message>
working through the results and making new figures
</commit_message>
<xml_diff>
--- a/Docs/Run_timing_manuscript.docx
+++ b/Docs/Run_timing_manuscript.docx
@@ -4798,7 +4798,8 @@
         </w:rPr>
         <w:t xml:space="preserve"> </w:t>
       </w:r>
-      <w:ins w:id="14" w:author="Daniel Schindler" w:date="2025-07-17T13:31:00Z" w16du:dateUtc="2025-07-17T21:31:00Z">
+      <w:commentRangeStart w:id="14"/>
+      <w:ins w:id="15" w:author="Daniel Schindler" w:date="2025-07-17T13:31:00Z" w16du:dateUtc="2025-07-17T21:31:00Z">
         <w:r>
           <w:rPr>
             <w:rFonts w:ascii="Garamond" w:hAnsi="Garamond"/>
@@ -4815,7 +4816,23 @@
           <w:sz w:val="22"/>
           <w:szCs w:val="22"/>
         </w:rPr>
-        <w:t xml:space="preserve">. From the furthest downstream connection of each of these tributaries to the mainstem all upstream segments were selected and assigned to a common identifier.  For some smaller units (i.e. the </w:t>
+        <w:t xml:space="preserve">. </w:t>
+      </w:r>
+      <w:commentRangeEnd w:id="14"/>
+      <w:r>
+        <w:rPr>
+          <w:rStyle w:val="CommentReference"/>
+        </w:rPr>
+        <w:commentReference w:id="14"/>
+      </w:r>
+      <w:r>
+        <w:rPr>
+          <w:rStyle w:val="CommentReference"/>
+          <w:rFonts w:ascii="Garamond" w:hAnsi="Garamond"/>
+          <w:sz w:val="22"/>
+          <w:szCs w:val="22"/>
+        </w:rPr>
+        <w:t xml:space="preserve">From the furthest downstream connection of each of these tributaries to the mainstem all upstream segments were selected and assigned to a common identifier.  For some smaller units (i.e. the </w:t>
       </w:r>
       <w:proofErr w:type="spellStart"/>
       <w:r>
@@ -4950,15 +4967,7 @@
           <w:sz w:val="22"/>
           <w:szCs w:val="22"/>
         </w:rPr>
-        <w:t>For each year and seasonal quartile, tributary-level natal origin estimates were aggregated into management units and normalized to sum to one across the basin, representing each unit's proportional contribution to the seasonal quartile. Summary statistics were then calculated across all years for each management unit, with Figure 3a displaying mean contributions by management unit (darker colors indicating higher values) and corresponding boxplots showing median and range values for each quartile, ordered from furthest upstream (top) to downstream (bottom) by watershed position. Cumulative distribution functions were constructed to examine relative run timing independent of stock abundance by aggregating natal origin distributions by management unit for each 3-day interval and comparing against full-season totals without normalization, allowing comparison of actual return numbers over time and showing the cumulative proportion of each stock's total seasonal contribution at each time point. To evaluate the stock-specific effect of the current implemented front-end closure, we evaluated the proportion of each stock's total return occurring within the current closure window</w:t>
-      </w:r>
-      <w:r>
-        <w:rPr>
-          <w:rFonts w:ascii="Garamond" w:hAnsi="Garamond"/>
-          <w:sz w:val="22"/>
-          <w:szCs w:val="22"/>
-        </w:rPr>
-        <w:t xml:space="preserve"> (the first seasonal quartile in our dataset). The relative protection </w:t>
+        <w:t xml:space="preserve">For each year and seasonal quartile, tributary-level natal origin estimates were aggregated into management units and normalized to sum to one across the basin, representing each unit's proportional contribution to the seasonal quartile. Summary statistics were then calculated across all years for each management unit, with Figure 3a displaying mean contributions by management unit (darker colors indicating higher values) and corresponding boxplots showing median and range values for each quartile, ordered from furthest upstream (top) to downstream (bottom) by watershed position. Cumulative distribution functions were constructed to examine relative run timing independent of stock abundance by aggregating natal origin distributions by management unit for each 3-day interval and comparing against full-season totals without normalization, allowing comparison of actual return numbers over time and showing the cumulative proportion of each stock's total seasonal contribution at each time point. To evaluate the stock-specific effect of the current implemented front-end closure, we evaluated the proportion of each stock's total return occurring within the current closure window (the first seasonal quartile in our dataset). The relative protection </w:t>
       </w:r>
       <w:r>
         <w:rPr>
@@ -4967,23 +4976,7 @@
           <w:szCs w:val="22"/>
         </w:rPr>
         <w:lastRenderedPageBreak/>
-        <w:t xml:space="preserve">across all years </w:t>
-      </w:r>
-      <w:r>
-        <w:rPr>
-          <w:rFonts w:ascii="Garamond" w:hAnsi="Garamond"/>
-          <w:sz w:val="22"/>
-          <w:szCs w:val="22"/>
-        </w:rPr>
-        <w:t>was used</w:t>
-      </w:r>
-      <w:r>
-        <w:rPr>
-          <w:rFonts w:ascii="Garamond" w:hAnsi="Garamond"/>
-          <w:sz w:val="22"/>
-          <w:szCs w:val="22"/>
-        </w:rPr>
-        <w:t xml:space="preserve"> produce boxplots visualizing the variability in this protection over the dataset, again ordered from furthest upstream to furthest downstream.</w:t>
+        <w:t>across all years was used produce boxplots visualizing the variability in this protection over the dataset, again ordered from furthest upstream to furthest downstream.</w:t>
       </w:r>
     </w:p>
     <w:p>
@@ -5166,7 +5159,23 @@
           <w:sz w:val="22"/>
           <w:szCs w:val="22"/>
         </w:rPr>
-        <w:t xml:space="preserve"> as the season progressed. Early season returns (Q1: start of run through June 11) were </w:t>
+        <w:t xml:space="preserve"> as the season progressed. Early season returns (Q1: start of run through June 11</w:t>
+      </w:r>
+      <w:r>
+        <w:rPr>
+          <w:rFonts w:ascii="Garamond" w:hAnsi="Garamond"/>
+          <w:sz w:val="22"/>
+          <w:szCs w:val="22"/>
+        </w:rPr>
+        <w:t>, Figure 3a.</w:t>
+      </w:r>
+      <w:r>
+        <w:rPr>
+          <w:rFonts w:ascii="Garamond" w:hAnsi="Garamond"/>
+          <w:sz w:val="22"/>
+          <w:szCs w:val="22"/>
+        </w:rPr>
+        <w:t xml:space="preserve">) were </w:t>
       </w:r>
       <w:r>
         <w:rPr>
@@ -5214,7 +5223,23 @@
           <w:sz w:val="22"/>
           <w:szCs w:val="22"/>
         </w:rPr>
-        <w:t xml:space="preserve">median 12.8%, range 4.6 – 16.1%), Swift River (median: 11.6%, range 5.7-14.4%), Stony River (median: 10.5%, range 9.6-12.4%), and Upper Kuskokwim Main (median: 8.9%, range 5.5-10.8%). Notably, the uppermost stocks (North, East, and South Fork Kuskokwim) consistently contributed very little (&lt; 2.5%) and the </w:t>
+        <w:t>median 12.8%, range 4.6 – 16.1%), Swift River (median: 11.6%, range 5.7-14.4%), Stony River (median: 10.5%, range 9.6-12.4%), and Upper Kuskokwim Main (median: 8.9%, range 5.5-10.8%)</w:t>
+      </w:r>
+      <w:r>
+        <w:rPr>
+          <w:rFonts w:ascii="Garamond" w:hAnsi="Garamond"/>
+          <w:sz w:val="22"/>
+          <w:szCs w:val="22"/>
+        </w:rPr>
+        <w:t xml:space="preserve">. </w:t>
+      </w:r>
+      <w:r>
+        <w:rPr>
+          <w:rFonts w:ascii="Garamond" w:hAnsi="Garamond"/>
+          <w:sz w:val="22"/>
+          <w:szCs w:val="22"/>
+        </w:rPr>
+        <w:t xml:space="preserve">Notably, the uppermost stocks (North, East, and South Fork Kuskokwim) consistently contributed very little (&lt; 2.5%) and the </w:t>
       </w:r>
       <w:proofErr w:type="spellStart"/>
       <w:r>
@@ -5232,7 +5257,23 @@
           <w:sz w:val="22"/>
           <w:szCs w:val="22"/>
         </w:rPr>
-        <w:t xml:space="preserve"> and Nixon fork and </w:t>
+        <w:t xml:space="preserve"> and Nixon fork </w:t>
+      </w:r>
+      <w:r>
+        <w:rPr>
+          <w:rFonts w:ascii="Garamond" w:hAnsi="Garamond"/>
+          <w:sz w:val="22"/>
+          <w:szCs w:val="22"/>
+        </w:rPr>
+        <w:t>stock as well as the</w:t>
+      </w:r>
+      <w:r>
+        <w:rPr>
+          <w:rFonts w:ascii="Garamond" w:hAnsi="Garamond"/>
+          <w:sz w:val="22"/>
+          <w:szCs w:val="22"/>
+        </w:rPr>
+        <w:t xml:space="preserve"> </w:t>
       </w:r>
       <w:proofErr w:type="spellStart"/>
       <w:r>
@@ -5250,7 +5291,23 @@
           <w:sz w:val="22"/>
           <w:szCs w:val="22"/>
         </w:rPr>
-        <w:t xml:space="preserve"> stocks each contributed only modestly (median 3% and 5% respectively) despite their position near the top of the watershed. The second quartile </w:t>
+        <w:t xml:space="preserve"> </w:t>
+      </w:r>
+      <w:r>
+        <w:rPr>
+          <w:rFonts w:ascii="Garamond" w:hAnsi="Garamond"/>
+          <w:sz w:val="22"/>
+          <w:szCs w:val="22"/>
+        </w:rPr>
+        <w:t xml:space="preserve">river </w:t>
+      </w:r>
+      <w:r>
+        <w:rPr>
+          <w:rFonts w:ascii="Garamond" w:hAnsi="Garamond"/>
+          <w:sz w:val="22"/>
+          <w:szCs w:val="22"/>
+        </w:rPr>
+        <w:t xml:space="preserve">stock each contributed only modestly (median 3% and 5% respectively) despite their position near the top of the watershed. The second quartile </w:t>
       </w:r>
       <w:proofErr w:type="gramStart"/>
       <w:r>
@@ -5310,7 +5367,15 @@
           <w:sz w:val="22"/>
           <w:szCs w:val="22"/>
         </w:rPr>
-        <w:t xml:space="preserve">) saw a more even distribution of returns across much of the middle watershed, with Upper Kuskokwim Main, Big River, </w:t>
+        <w:t>, Figure 3b.)</w:t>
+      </w:r>
+      <w:r>
+        <w:rPr>
+          <w:rFonts w:ascii="Garamond" w:hAnsi="Garamond"/>
+          <w:sz w:val="22"/>
+          <w:szCs w:val="22"/>
+        </w:rPr>
+        <w:t xml:space="preserve"> saw a more even distribution of returns across much of the middle watershed, with Upper Kuskokwim Main, Big River, </w:t>
       </w:r>
       <w:proofErr w:type="spellStart"/>
       <w:r>
@@ -5364,7 +5429,23 @@
           <w:sz w:val="22"/>
           <w:szCs w:val="22"/>
         </w:rPr>
-        <w:t xml:space="preserve"> River, Middle Kuskokwim Main, Aniak, and </w:t>
+        <w:t xml:space="preserve"> River, Middle Kuskokwim Main, Aniak</w:t>
+      </w:r>
+      <w:r>
+        <w:rPr>
+          <w:rFonts w:ascii="Garamond" w:hAnsi="Garamond"/>
+          <w:sz w:val="22"/>
+          <w:szCs w:val="22"/>
+        </w:rPr>
+        <w:t xml:space="preserve"> River</w:t>
+      </w:r>
+      <w:r>
+        <w:rPr>
+          <w:rFonts w:ascii="Garamond" w:hAnsi="Garamond"/>
+          <w:sz w:val="22"/>
+          <w:szCs w:val="22"/>
+        </w:rPr>
+        <w:t xml:space="preserve">, and </w:t>
       </w:r>
       <w:proofErr w:type="spellStart"/>
       <w:r>
@@ -5433,25 +5514,39 @@
           <w:sz w:val="22"/>
           <w:szCs w:val="22"/>
         </w:rPr>
-        <w:t>-July1st</w:t>
-      </w:r>
-      <w:proofErr w:type="gramStart"/>
-      <w:r>
-        <w:rPr>
-          <w:rFonts w:ascii="Garamond" w:hAnsi="Garamond"/>
-          <w:sz w:val="22"/>
-          <w:szCs w:val="22"/>
-        </w:rPr>
-        <w:t>) ,</w:t>
-      </w:r>
-      <w:proofErr w:type="gramEnd"/>
-      <w:r>
-        <w:rPr>
-          <w:rFonts w:ascii="Garamond" w:hAnsi="Garamond"/>
-          <w:sz w:val="22"/>
-          <w:szCs w:val="22"/>
-        </w:rPr>
-        <w:t xml:space="preserve"> but with increased contribution from the </w:t>
+        <w:t>-</w:t>
+      </w:r>
+      <w:r>
+        <w:rPr>
+          <w:rFonts w:ascii="Garamond" w:hAnsi="Garamond"/>
+          <w:sz w:val="22"/>
+          <w:szCs w:val="22"/>
+        </w:rPr>
+        <w:t xml:space="preserve"> </w:t>
+      </w:r>
+      <w:r>
+        <w:rPr>
+          <w:rFonts w:ascii="Garamond" w:hAnsi="Garamond"/>
+          <w:sz w:val="22"/>
+          <w:szCs w:val="22"/>
+        </w:rPr>
+        <w:t>July1st</w:t>
+      </w:r>
+      <w:r>
+        <w:rPr>
+          <w:rFonts w:ascii="Garamond" w:hAnsi="Garamond"/>
+          <w:sz w:val="22"/>
+          <w:szCs w:val="22"/>
+        </w:rPr>
+        <w:t>, Figure 3c.</w:t>
+      </w:r>
+      <w:r>
+        <w:rPr>
+          <w:rFonts w:ascii="Garamond" w:hAnsi="Garamond"/>
+          <w:sz w:val="22"/>
+          <w:szCs w:val="22"/>
+        </w:rPr>
+        <w:t xml:space="preserve">), but with increased contribution from the </w:t>
       </w:r>
       <w:proofErr w:type="spellStart"/>
       <w:r>
@@ -5489,6 +5584,47 @@
         </w:rPr>
         <w:t xml:space="preserve"> River (median 9.6%, range 8.8-12.2%), and Aniak river (median 8.2%, range 5.7-10.1%). </w:t>
       </w:r>
+      <w:r>
+        <w:rPr>
+          <w:rFonts w:ascii="Garamond" w:hAnsi="Garamond"/>
+          <w:sz w:val="22"/>
+          <w:szCs w:val="22"/>
+        </w:rPr>
+        <w:t>Late season returns (July 2</w:t>
+      </w:r>
+      <w:r>
+        <w:rPr>
+          <w:rFonts w:ascii="Garamond" w:hAnsi="Garamond"/>
+          <w:sz w:val="22"/>
+          <w:szCs w:val="22"/>
+          <w:vertAlign w:val="superscript"/>
+        </w:rPr>
+        <w:t>nd</w:t>
+      </w:r>
+      <w:r>
+        <w:rPr>
+          <w:rFonts w:ascii="Garamond" w:hAnsi="Garamond"/>
+          <w:sz w:val="22"/>
+          <w:szCs w:val="22"/>
+        </w:rPr>
+        <w:t xml:space="preserve"> onward</w:t>
+      </w:r>
+      <w:r>
+        <w:rPr>
+          <w:rFonts w:ascii="Garamond" w:hAnsi="Garamond"/>
+          <w:sz w:val="22"/>
+          <w:szCs w:val="22"/>
+        </w:rPr>
+        <w:t>, Figure 3d.</w:t>
+      </w:r>
+      <w:r>
+        <w:rPr>
+          <w:rFonts w:ascii="Garamond" w:hAnsi="Garamond"/>
+          <w:sz w:val="22"/>
+          <w:szCs w:val="22"/>
+        </w:rPr>
+        <w:t>) displayed further decreasing contribution from Upper Kuskokwim stocks (</w:t>
+      </w:r>
       <w:proofErr w:type="spellStart"/>
       <w:r>
         <w:rPr>
@@ -5496,7 +5632,7 @@
           <w:sz w:val="22"/>
           <w:szCs w:val="22"/>
         </w:rPr>
-        <w:t>lLate</w:t>
+        <w:t>i.e</w:t>
       </w:r>
       <w:proofErr w:type="spellEnd"/>
       <w:r>
@@ -5505,24 +5641,7 @@
           <w:sz w:val="22"/>
           <w:szCs w:val="22"/>
         </w:rPr>
-        <w:t xml:space="preserve"> season returns (July 2</w:t>
-      </w:r>
-      <w:r>
-        <w:rPr>
-          <w:rFonts w:ascii="Garamond" w:hAnsi="Garamond"/>
-          <w:sz w:val="22"/>
-          <w:szCs w:val="22"/>
-          <w:vertAlign w:val="superscript"/>
-        </w:rPr>
-        <w:t>nd</w:t>
-      </w:r>
-      <w:r>
-        <w:rPr>
-          <w:rFonts w:ascii="Garamond" w:hAnsi="Garamond"/>
-          <w:sz w:val="22"/>
-          <w:szCs w:val="22"/>
-        </w:rPr>
-        <w:t xml:space="preserve"> onward) displayed further decreasing contribution from Upper Kuskokwim stocks (</w:t>
+        <w:t xml:space="preserve"> Upper Kuskokwim Main, Big River, </w:t>
       </w:r>
       <w:proofErr w:type="spellStart"/>
       <w:r>
@@ -5531,7 +5650,7 @@
           <w:sz w:val="22"/>
           <w:szCs w:val="22"/>
         </w:rPr>
-        <w:t>i.e</w:t>
+        <w:t>Takotna</w:t>
       </w:r>
       <w:proofErr w:type="spellEnd"/>
       <w:r>
@@ -5540,7 +5659,7 @@
           <w:sz w:val="22"/>
           <w:szCs w:val="22"/>
         </w:rPr>
-        <w:t xml:space="preserve"> Upper Kuskokwim Main, Big River, </w:t>
+        <w:t xml:space="preserve"> River and Nixon Fork, </w:t>
       </w:r>
       <w:proofErr w:type="spellStart"/>
       <w:r>
@@ -5549,7 +5668,7 @@
           <w:sz w:val="22"/>
           <w:szCs w:val="22"/>
         </w:rPr>
-        <w:t>Takotna</w:t>
+        <w:t>Tatlawiksuk</w:t>
       </w:r>
       <w:proofErr w:type="spellEnd"/>
       <w:r>
@@ -5558,7 +5677,7 @@
           <w:sz w:val="22"/>
           <w:szCs w:val="22"/>
         </w:rPr>
-        <w:t xml:space="preserve"> River and Nixon Fork, </w:t>
+        <w:t xml:space="preserve"> River, and Swift River). The </w:t>
       </w:r>
       <w:proofErr w:type="spellStart"/>
       <w:r>
@@ -5567,7 +5686,7 @@
           <w:sz w:val="22"/>
           <w:szCs w:val="22"/>
         </w:rPr>
-        <w:t>Tatlawiksuk</w:t>
+        <w:t>Hoholitna</w:t>
       </w:r>
       <w:proofErr w:type="spellEnd"/>
       <w:r>
@@ -5576,24 +5695,6 @@
           <w:sz w:val="22"/>
           <w:szCs w:val="22"/>
         </w:rPr>
-        <w:t xml:space="preserve"> River, and Swift River). The </w:t>
-      </w:r>
-      <w:proofErr w:type="spellStart"/>
-      <w:r>
-        <w:rPr>
-          <w:rFonts w:ascii="Garamond" w:hAnsi="Garamond"/>
-          <w:sz w:val="22"/>
-          <w:szCs w:val="22"/>
-        </w:rPr>
-        <w:t>Hoholitna</w:t>
-      </w:r>
-      <w:proofErr w:type="spellEnd"/>
-      <w:r>
-        <w:rPr>
-          <w:rFonts w:ascii="Garamond" w:hAnsi="Garamond"/>
-          <w:sz w:val="22"/>
-          <w:szCs w:val="22"/>
-        </w:rPr>
         <w:t xml:space="preserve"> and Middle Kuskokwim River saw slight decreases and increases in contribution, respectively, but with </w:t>
       </w:r>
       <w:r>
@@ -5610,7 +5711,16 @@
           <w:sz w:val="22"/>
           <w:szCs w:val="22"/>
         </w:rPr>
-        <w:t xml:space="preserve">increase in range indicating variability </w:t>
+        <w:t xml:space="preserve">increase in range </w:t>
+      </w:r>
+      <w:r>
+        <w:rPr>
+          <w:rFonts w:ascii="Garamond" w:hAnsi="Garamond"/>
+          <w:sz w:val="22"/>
+          <w:szCs w:val="22"/>
+        </w:rPr>
+        <w:lastRenderedPageBreak/>
+        <w:t xml:space="preserve">indicating variability </w:t>
       </w:r>
       <w:r>
         <w:rPr>
@@ -5634,16 +5744,7 @@
           <w:sz w:val="22"/>
           <w:szCs w:val="22"/>
         </w:rPr>
-        <w:t xml:space="preserve"> (median; </w:t>
-      </w:r>
-      <w:r>
-        <w:rPr>
-          <w:rFonts w:ascii="Garamond" w:hAnsi="Garamond"/>
-          <w:sz w:val="22"/>
-          <w:szCs w:val="22"/>
-        </w:rPr>
-        <w:lastRenderedPageBreak/>
-        <w:t xml:space="preserve">11.6%), </w:t>
+        <w:t xml:space="preserve"> (median; 11.6%), </w:t>
       </w:r>
       <w:proofErr w:type="spellStart"/>
       <w:r>
@@ -5830,17 +5931,64 @@
           <w:rFonts w:ascii="Garamond" w:hAnsi="Garamond"/>
           <w:sz w:val="22"/>
           <w:szCs w:val="22"/>
-          <w:highlight w:val="yellow"/>
-        </w:rPr>
-        <w:t>The results display a clear pattern of earliest returning stocks (closer to red) arriving earlier in the season, with 50% of the run for stocks such as the East Fork Kuskokwim and Big River arriving within X days of the start of the run.</w:t>
-      </w:r>
-      <w:r>
-        <w:rPr>
-          <w:rFonts w:ascii="Garamond" w:hAnsi="Garamond"/>
-          <w:sz w:val="22"/>
-          <w:szCs w:val="22"/>
-        </w:rPr>
-        <w:t xml:space="preserve"> In contrast, lower Kuskokwim stocks arrive later in the season, with stocks such as the </w:t>
+        </w:rPr>
+        <w:t xml:space="preserve">The results display a clear pattern of earliest returning stocks (closer to red) arriving earlier in the season, with 50% of the run for stocks such as the East Fork Kuskokwim and Big River arriving within </w:t>
+      </w:r>
+      <w:r>
+        <w:rPr>
+          <w:rFonts w:ascii="Garamond" w:hAnsi="Garamond"/>
+          <w:sz w:val="22"/>
+          <w:szCs w:val="22"/>
+        </w:rPr>
+        <w:t>14 and 16</w:t>
+      </w:r>
+      <w:r>
+        <w:rPr>
+          <w:rFonts w:ascii="Garamond" w:hAnsi="Garamond"/>
+          <w:sz w:val="22"/>
+          <w:szCs w:val="22"/>
+        </w:rPr>
+        <w:t xml:space="preserve"> days </w:t>
+      </w:r>
+      <w:r>
+        <w:rPr>
+          <w:rFonts w:ascii="Garamond" w:hAnsi="Garamond"/>
+          <w:sz w:val="22"/>
+          <w:szCs w:val="22"/>
+        </w:rPr>
+        <w:t xml:space="preserve">from </w:t>
+      </w:r>
+      <w:r>
+        <w:rPr>
+          <w:rFonts w:ascii="Garamond" w:hAnsi="Garamond"/>
+          <w:sz w:val="22"/>
+          <w:szCs w:val="22"/>
+        </w:rPr>
+        <w:t>the start of the run</w:t>
+      </w:r>
+      <w:r>
+        <w:rPr>
+          <w:rFonts w:ascii="Garamond" w:hAnsi="Garamond"/>
+          <w:sz w:val="22"/>
+          <w:szCs w:val="22"/>
+        </w:rPr>
+        <w:t>, on average.</w:t>
+      </w:r>
+      <w:r>
+        <w:rPr>
+          <w:rFonts w:ascii="Garamond" w:hAnsi="Garamond"/>
+          <w:sz w:val="22"/>
+          <w:szCs w:val="22"/>
+        </w:rPr>
+        <w:t xml:space="preserve"> </w:t>
+      </w:r>
+      <w:r>
+        <w:rPr>
+          <w:rFonts w:ascii="Garamond" w:hAnsi="Garamond"/>
+          <w:sz w:val="22"/>
+          <w:szCs w:val="22"/>
+        </w:rPr>
+        <w:t xml:space="preserve">In contrast, lower Kuskokwim stocks arrive later in the season, with stocks such as the </w:t>
       </w:r>
       <w:proofErr w:type="spellStart"/>
       <w:r>
@@ -5858,7 +6006,39 @@
           <w:sz w:val="22"/>
           <w:szCs w:val="22"/>
         </w:rPr>
-        <w:t xml:space="preserve"> and Aniak river reaching 50% of their total run nearly X days from the start of the season. </w:t>
+        <w:t xml:space="preserve"> and Aniak river reaching 50% of their total run nearly </w:t>
+      </w:r>
+      <w:r>
+        <w:rPr>
+          <w:rFonts w:ascii="Garamond" w:hAnsi="Garamond"/>
+          <w:sz w:val="22"/>
+          <w:szCs w:val="22"/>
+        </w:rPr>
+        <w:t xml:space="preserve">23 </w:t>
+      </w:r>
+      <w:r>
+        <w:rPr>
+          <w:rFonts w:ascii="Garamond" w:hAnsi="Garamond"/>
+          <w:sz w:val="22"/>
+          <w:szCs w:val="22"/>
+        </w:rPr>
+        <w:t>days from the start of the season</w:t>
+      </w:r>
+      <w:r>
+        <w:rPr>
+          <w:rFonts w:ascii="Garamond" w:hAnsi="Garamond"/>
+          <w:sz w:val="22"/>
+          <w:szCs w:val="22"/>
+        </w:rPr>
+        <w:t>, on average.</w:t>
+      </w:r>
+      <w:r>
+        <w:rPr>
+          <w:rFonts w:ascii="Garamond" w:hAnsi="Garamond"/>
+          <w:sz w:val="22"/>
+          <w:szCs w:val="22"/>
+        </w:rPr>
+        <w:t xml:space="preserve"> </w:t>
       </w:r>
       <w:r>
         <w:rPr>
@@ -6101,6 +6281,7 @@
           <w:sz w:val="22"/>
           <w:szCs w:val="22"/>
         </w:rPr>
+        <w:lastRenderedPageBreak/>
         <w:t>Hoholitna</w:t>
       </w:r>
       <w:proofErr w:type="spellEnd"/>
@@ -6153,7 +6334,6 @@
           <w:szCs w:val="32"/>
           <w:u w:val="single"/>
         </w:rPr>
-        <w:lastRenderedPageBreak/>
         <w:t>Discussion</w:t>
       </w:r>
     </w:p>
@@ -6192,7 +6372,7 @@
         </w:rPr>
         <w:t xml:space="preserve">over several years and </w:t>
       </w:r>
-      <w:commentRangeStart w:id="15"/>
+      <w:commentRangeStart w:id="16"/>
       <w:r>
         <w:rPr>
           <w:rFonts w:ascii="Garamond" w:hAnsi="Garamond"/>
@@ -6201,7 +6381,7 @@
         </w:rPr>
         <w:t xml:space="preserve">at a finer spatial scale </w:t>
       </w:r>
-      <w:commentRangeEnd w:id="15"/>
+      <w:commentRangeEnd w:id="16"/>
       <w:r>
         <w:rPr>
           <w:rStyle w:val="CommentReference"/>
@@ -6209,7 +6389,7 @@
           <w:kern w:val="2"/>
           <w14:ligatures w14:val="standardContextual"/>
         </w:rPr>
-        <w:commentReference w:id="15"/>
+        <w:commentReference w:id="16"/>
       </w:r>
       <w:r>
         <w:rPr>
@@ -6395,16 +6575,8 @@
           <w:sz w:val="22"/>
           <w:szCs w:val="22"/>
         </w:rPr>
-        <w:t xml:space="preserve">These results advance our understanding of Chinook salmon spatial ecology in the Kuskokwim River and contribute to broader insights into salmon dynamics in large river systems. While otolith-based chemical methods used in this study have not been explicitly validated for the Kuskokwim, they have demonstrated </w:t>
-      </w:r>
-      <w:r>
-        <w:rPr>
-          <w:rFonts w:ascii="Garamond" w:hAnsi="Garamond"/>
-          <w:sz w:val="22"/>
-          <w:szCs w:val="22"/>
-        </w:rPr>
         <w:lastRenderedPageBreak/>
-        <w:t>high assignment accuracy in other comparable systems and species (Cite cite). The spatial patterns revealed here highlight the importance of evaluating management strategies at appropriate spatial scales to identify interactions between stock-specific ecological behavior and regulatory frameworks. Strategies aiming to maintain ecosystem-scale resource availability should account for both the health of individual stocks and the broader metapopulation complex. By explicitly incorporating the spatiotemporal dynamics of metapopulations, managers may be better equipped to design conservation strategies that meet human resource needs while preserving the biocomplexity essential to healthy ecosystems.</w:t>
+        <w:t>These results advance our understanding of Chinook salmon spatial ecology in the Kuskokwim River and contribute to broader insights into salmon dynamics in large river systems. While otolith-based chemical methods used in this study have not been explicitly validated for the Kuskokwim, they have demonstrated high assignment accuracy in other comparable systems and species (Cite cite). The spatial patterns revealed here highlight the importance of evaluating management strategies at appropriate spatial scales to identify interactions between stock-specific ecological behavior and regulatory frameworks. Strategies aiming to maintain ecosystem-scale resource availability should account for both the health of individual stocks and the broader metapopulation complex. By explicitly incorporating the spatiotemporal dynamics of metapopulations, managers may be better equipped to design conservation strategies that meet human resource needs while preserving the biocomplexity essential to healthy ecosystems.</w:t>
       </w:r>
     </w:p>
     <w:p>
@@ -6539,6 +6711,7 @@
           <w:sz w:val="22"/>
           <w:szCs w:val="22"/>
         </w:rPr>
+        <w:lastRenderedPageBreak/>
         <w:t xml:space="preserve">This has led to the use of </w:t>
       </w:r>
       <w:proofErr w:type="gramStart"/>
@@ -7036,7 +7209,16 @@
           <w:sz w:val="22"/>
           <w:szCs w:val="22"/>
         </w:rPr>
-        <w:t xml:space="preserve">. As a result, resource managers face the difficult task of designing management strategies which balancing ongoing harvest opportunities with the urgent need to rebuild salmon populations and strengthen their resilience to future perturbations. </w:t>
+        <w:t xml:space="preserve">. As a result, resource managers face </w:t>
+      </w:r>
+      <w:r>
+        <w:rPr>
+          <w:rFonts w:ascii="Garamond" w:hAnsi="Garamond"/>
+          <w:sz w:val="22"/>
+          <w:szCs w:val="22"/>
+        </w:rPr>
+        <w:lastRenderedPageBreak/>
+        <w:t xml:space="preserve">the difficult task of designing management strategies which balancing ongoing harvest opportunities with the urgent need to rebuild salmon populations and strengthen their resilience to future perturbations. </w:t>
       </w:r>
     </w:p>
     <w:p>
@@ -7113,16 +7295,7 @@
           <w:sz w:val="22"/>
           <w:szCs w:val="22"/>
         </w:rPr>
-        <w:t xml:space="preserve">. In salmon populations, substantial variation in both return timing and spatial distribution of habitat </w:t>
-      </w:r>
-      <w:r>
-        <w:rPr>
-          <w:rFonts w:ascii="Garamond" w:hAnsi="Garamond"/>
-          <w:sz w:val="22"/>
-          <w:szCs w:val="22"/>
-        </w:rPr>
-        <w:lastRenderedPageBreak/>
-        <w:t>use produces significant complexity in life history strategies within and among populations</w:t>
+        <w:t>. In salmon populations, substantial variation in both return timing and spatial distribution of habitat use produces significant complexity in life history strategies within and among populations</w:t>
       </w:r>
       <w:r>
         <w:rPr>
@@ -7543,6 +7716,7 @@
           <w:sz w:val="22"/>
           <w:szCs w:val="22"/>
         </w:rPr>
+        <w:lastRenderedPageBreak/>
         <w:t xml:space="preserve">Downstream fisheries which harvest migrating stocks face a difficult challenge to design harvest methods which consider both </w:t>
       </w:r>
       <w:r>
@@ -7623,16 +7797,7 @@
           <w:sz w:val="22"/>
           <w:szCs w:val="22"/>
         </w:rPr>
-        <w:t xml:space="preserve">Fishing which disproportionally exploits weak stocks as they migrate upstream may threaten the availability of resources to upstream communities and </w:t>
-      </w:r>
-      <w:r>
-        <w:rPr>
-          <w:rFonts w:ascii="Garamond" w:hAnsi="Garamond"/>
-          <w:sz w:val="22"/>
-          <w:szCs w:val="22"/>
-        </w:rPr>
-        <w:lastRenderedPageBreak/>
-        <w:t>threaten the reliability of downstream resources in subsequent years as upstream stock health degrades. M</w:t>
+        <w:t>Fishing which disproportionally exploits weak stocks as they migrate upstream may threaten the availability of resources to upstream communities and threaten the reliability of downstream resources in subsequent years as upstream stock health degrades. M</w:t>
       </w:r>
       <w:r>
         <w:rPr>
@@ -7803,7 +7968,7 @@
         <w:spacing w:line="480" w:lineRule="auto"/>
         <w:ind w:firstLine="720"/>
         <w:rPr>
-          <w:ins w:id="16" w:author="Benjamin J. Makhlouf" w:date="2025-07-26T14:59:00Z" w16du:dateUtc="2025-07-26T21:59:00Z"/>
+          <w:ins w:id="17" w:author="Benjamin J. Makhlouf" w:date="2025-07-26T14:59:00Z" w16du:dateUtc="2025-07-26T21:59:00Z"/>
           <w:rFonts w:ascii="Garamond" w:hAnsi="Garamond"/>
           <w:sz w:val="22"/>
           <w:szCs w:val="22"/>
@@ -8037,7 +8202,7 @@
         </w:rPr>
         <w:t xml:space="preserve"> while allowing for a significant number of fish to return to stocks in the upper portions of the river basin , thereby protecting access to harvest opportunities for upstream communities and bolstering the health of upstream stocks which have a general tendency to migrate early in the season </w:t>
       </w:r>
-      <w:commentRangeStart w:id="17"/>
+      <w:commentRangeStart w:id="18"/>
       <w:r>
         <w:rPr>
           <w:rFonts w:ascii="Garamond" w:hAnsi="Garamond"/>
@@ -8125,20 +8290,29 @@
         </w:rPr>
         <w:fldChar w:fldCharType="end"/>
       </w:r>
-      <w:commentRangeEnd w:id="17"/>
+      <w:commentRangeEnd w:id="18"/>
       <w:r>
         <w:rPr>
           <w:rStyle w:val="CommentReference"/>
         </w:rPr>
-        <w:commentReference w:id="17"/>
-      </w:r>
-      <w:r>
-        <w:rPr>
-          <w:rFonts w:ascii="Garamond" w:hAnsi="Garamond"/>
-          <w:sz w:val="22"/>
-          <w:szCs w:val="22"/>
-        </w:rPr>
-        <w:t xml:space="preserve">. However, little data exist which quantifies the spatiotemporal patterns among stocks. The impact of front-end closure strategies on individual stock components is not well understood, and a more complete understanding of stock contribution to the overall run both within and among years is currently not readily available. These data may be important to assessing the impact of current management strategies and designing new strategies which maintain stock health across all components of the watershed and maintain a reliable resource for communities and industry in the region. </w:t>
+        <w:commentReference w:id="18"/>
+      </w:r>
+      <w:r>
+        <w:rPr>
+          <w:rFonts w:ascii="Garamond" w:hAnsi="Garamond"/>
+          <w:sz w:val="22"/>
+          <w:szCs w:val="22"/>
+        </w:rPr>
+        <w:t xml:space="preserve">. However, little data exist which quantifies the spatiotemporal patterns among stocks. The impact of front-end closure strategies on individual stock components is not well understood, and a more complete understanding of stock contribution to the overall run both within and among years is currently not readily available. These data may be important to assessing the impact of current management strategies and designing new strategies which maintain stock </w:t>
+      </w:r>
+      <w:r>
+        <w:rPr>
+          <w:rFonts w:ascii="Garamond" w:hAnsi="Garamond"/>
+          <w:sz w:val="22"/>
+          <w:szCs w:val="22"/>
+        </w:rPr>
+        <w:lastRenderedPageBreak/>
+        <w:t xml:space="preserve">health across all components of the watershed and maintain a reliable resource for communities and industry in the region. </w:t>
       </w:r>
     </w:p>
     <w:p>
@@ -8189,16 +8363,7 @@
           <w:sz w:val="22"/>
           <w:szCs w:val="22"/>
         </w:rPr>
-        <w:t xml:space="preserve">: (1) identify the spatiotemporal structure of </w:t>
-      </w:r>
-      <w:r>
-        <w:rPr>
-          <w:rFonts w:ascii="Garamond" w:hAnsi="Garamond"/>
-          <w:sz w:val="22"/>
-          <w:szCs w:val="22"/>
-        </w:rPr>
-        <w:lastRenderedPageBreak/>
-        <w:t>returning populations in</w:t>
+        <w:t>: (1) identify the spatiotemporal structure of returning populations in</w:t>
       </w:r>
       <w:r>
         <w:rPr>
@@ -8423,11 +8588,8 @@
       </w:r>
     </w:p>
   </w:comment>
-  <w:comment w:id="15" w:author="Benjamin J. Makhlouf" w:date="2025-07-28T13:54:00Z" w:initials="BM">
+  <w:comment w:id="14" w:author="Benjamin J. Makhlouf" w:date="2025-07-30T10:53:00Z" w:initials="b">
     <w:p>
-      <w:pPr>
-        <w:pStyle w:val="CommentText"/>
-      </w:pPr>
       <w:r>
         <w:rPr>
           <w:rStyle w:val="CommentReference"/>
@@ -8435,11 +8597,31 @@
         <w:annotationRef/>
       </w:r>
       <w:r>
-        <w:t xml:space="preserve">This might not be true for comparison to Telemetry </w:t>
+        <w:rPr>
+          <w:sz w:val="20"/>
+          <w:szCs w:val="20"/>
+        </w:rPr>
+        <w:t>The map we used to pull these rivers is on an adfg web page but I cant track it to a publication</w:t>
       </w:r>
     </w:p>
   </w:comment>
-  <w:comment w:id="17" w:author="Daniel Schindler" w:date="2025-06-27T11:54:00Z" w:initials="DS">
+  <w:comment w:id="16" w:author="Benjamin J. Makhlouf" w:date="2025-07-28T13:54:00Z" w:initials="BM">
+    <w:p>
+      <w:pPr>
+        <w:pStyle w:val="CommentText"/>
+      </w:pPr>
+      <w:r>
+        <w:rPr>
+          <w:rStyle w:val="CommentReference"/>
+        </w:rPr>
+        <w:annotationRef/>
+      </w:r>
+      <w:r>
+        <w:t xml:space="preserve">This might not be true for comparison to Telemetry </w:t>
+      </w:r>
+    </w:p>
+  </w:comment>
+  <w:comment w:id="18" w:author="Daniel Schindler" w:date="2025-06-27T11:54:00Z" w:initials="DS">
     <w:p>
       <w:pPr>
         <w:pStyle w:val="CommentText"/>
@@ -8465,6 +8647,7 @@
   <w15:commentEx w15:paraId="317DFEBA" w15:done="0"/>
   <w15:commentEx w15:paraId="05C4AF8C" w15:done="0"/>
   <w15:commentEx w15:paraId="78D2F929" w15:done="0"/>
+  <w15:commentEx w15:paraId="1EF3F5E1" w15:done="0"/>
   <w15:commentEx w15:paraId="036EDFB1" w15:done="0"/>
   <w15:commentEx w15:paraId="506CDC99" w15:done="0"/>
 </w15:commentsEx>
@@ -8477,6 +8660,7 @@
   <w16cex:commentExtensible w16cex:durableId="6C95C996" w16cex:dateUtc="2025-07-28T14:41:00Z"/>
   <w16cex:commentExtensible w16cex:durableId="3CAE4ABD" w16cex:dateUtc="2025-07-28T14:42:00Z"/>
   <w16cex:commentExtensible w16cex:durableId="1D6CE52A" w16cex:dateUtc="2025-07-30T15:26:00Z"/>
+  <w16cex:commentExtensible w16cex:durableId="4D2F7D90" w16cex:dateUtc="2025-07-30T17:53:00Z"/>
   <w16cex:commentExtensible w16cex:durableId="6836BCE2" w16cex:dateUtc="2025-07-28T20:54:00Z"/>
   <w16cex:commentExtensible w16cex:durableId="08B9BEA6" w16cex:dateUtc="2025-06-27T19:54:00Z"/>
 </w16cex:commentsExtensible>
@@ -8489,6 +8673,7 @@
   <w16cid:commentId w16cid:paraId="317DFEBA" w16cid:durableId="6C95C996"/>
   <w16cid:commentId w16cid:paraId="05C4AF8C" w16cid:durableId="3CAE4ABD"/>
   <w16cid:commentId w16cid:paraId="78D2F929" w16cid:durableId="1D6CE52A"/>
+  <w16cid:commentId w16cid:paraId="1EF3F5E1" w16cid:durableId="4D2F7D90"/>
   <w16cid:commentId w16cid:paraId="036EDFB1" w16cid:durableId="6836BCE2"/>
   <w16cid:commentId w16cid:paraId="506CDC99" w16cid:durableId="08B9BEA6"/>
 </w16cid:commentsIds>

</xml_diff>

<commit_message>
updated with all new scripts... some small errors working on
</commit_message>
<xml_diff>
--- a/Docs/Run_timing_manuscript.docx
+++ b/Docs/Run_timing_manuscript.docx
@@ -6030,7 +6030,15 @@
           <w:sz w:val="22"/>
           <w:szCs w:val="22"/>
         </w:rPr>
-        <w:t>, on average.</w:t>
+        <w:t xml:space="preserve"> on average</w:t>
+      </w:r>
+      <w:r>
+        <w:rPr>
+          <w:rFonts w:ascii="Garamond" w:hAnsi="Garamond"/>
+          <w:sz w:val="22"/>
+          <w:szCs w:val="22"/>
+        </w:rPr>
+        <w:t>.</w:t>
       </w:r>
       <w:r>
         <w:rPr>
@@ -6046,7 +6054,71 @@
           <w:sz w:val="22"/>
           <w:szCs w:val="22"/>
         </w:rPr>
-        <w:t xml:space="preserve">Some variability in this pattern does exist. In 2020, for example, a few of the middle Kuskokwim stocks (yellow or orange) appear to arrive after that of the lowest Kuskokwim stocks. However, the general downstream trajectory of returning stocks remains consistent across our dataset independent of the relative </w:t>
+        <w:t>Some variability in this pattern does exist</w:t>
+      </w:r>
+      <w:r>
+        <w:rPr>
+          <w:rFonts w:ascii="Garamond" w:hAnsi="Garamond"/>
+          <w:sz w:val="22"/>
+          <w:szCs w:val="22"/>
+        </w:rPr>
+        <w:t xml:space="preserve">, with some </w:t>
+      </w:r>
+      <w:r>
+        <w:rPr>
+          <w:rFonts w:ascii="Garamond" w:hAnsi="Garamond"/>
+          <w:sz w:val="22"/>
+          <w:szCs w:val="22"/>
+        </w:rPr>
+        <w:t>middle Kuskokwim stocks (yellow or orange) appear</w:t>
+      </w:r>
+      <w:r>
+        <w:rPr>
+          <w:rFonts w:ascii="Garamond" w:hAnsi="Garamond"/>
+          <w:sz w:val="22"/>
+          <w:szCs w:val="22"/>
+        </w:rPr>
+        <w:t>ing</w:t>
+      </w:r>
+      <w:r>
+        <w:rPr>
+          <w:rFonts w:ascii="Garamond" w:hAnsi="Garamond"/>
+          <w:sz w:val="22"/>
+          <w:szCs w:val="22"/>
+        </w:rPr>
+        <w:t xml:space="preserve"> to arrive </w:t>
+      </w:r>
+      <w:r>
+        <w:rPr>
+          <w:rFonts w:ascii="Garamond" w:hAnsi="Garamond"/>
+          <w:sz w:val="22"/>
+          <w:szCs w:val="22"/>
+        </w:rPr>
+        <w:t xml:space="preserve">with or </w:t>
+      </w:r>
+      <w:r>
+        <w:rPr>
+          <w:rFonts w:ascii="Garamond" w:hAnsi="Garamond"/>
+          <w:sz w:val="22"/>
+          <w:szCs w:val="22"/>
+        </w:rPr>
+        <w:t>after</w:t>
+      </w:r>
+      <w:r>
+        <w:rPr>
+          <w:rFonts w:ascii="Garamond" w:hAnsi="Garamond"/>
+          <w:sz w:val="22"/>
+          <w:szCs w:val="22"/>
+        </w:rPr>
+        <w:t xml:space="preserve"> those in the lower Kuskokwim in some years</w:t>
+      </w:r>
+      <w:r>
+        <w:rPr>
+          <w:rFonts w:ascii="Garamond" w:hAnsi="Garamond"/>
+          <w:sz w:val="22"/>
+          <w:szCs w:val="22"/>
+        </w:rPr>
+        <w:t xml:space="preserve">. However, the general downstream trajectory of returning stocks remains consistent across our dataset independent of the relative </w:t>
       </w:r>
       <w:r>
         <w:rPr>
@@ -6096,31 +6168,13 @@
         </w:rPr>
         <w:t xml:space="preserve">vs </w:t>
       </w:r>
-      <w:proofErr w:type="spellStart"/>
-      <w:r>
-        <w:rPr>
-          <w:rFonts w:ascii="Garamond" w:hAnsi="Garamond"/>
-          <w:sz w:val="22"/>
-          <w:szCs w:val="22"/>
-        </w:rPr>
-        <w:t>e</w:t>
-      </w:r>
-      <w:r>
-        <w:rPr>
-          <w:rFonts w:ascii="Garamond" w:hAnsi="Garamond"/>
-          <w:sz w:val="22"/>
-          <w:szCs w:val="22"/>
-        </w:rPr>
-        <w:t>extended</w:t>
-      </w:r>
-      <w:proofErr w:type="spellEnd"/>
-      <w:r>
-        <w:rPr>
-          <w:rFonts w:ascii="Garamond" w:hAnsi="Garamond"/>
-          <w:sz w:val="22"/>
-          <w:szCs w:val="22"/>
-        </w:rPr>
-        <w:t>)</w:t>
+      <w:r>
+        <w:rPr>
+          <w:rFonts w:ascii="Garamond" w:hAnsi="Garamond"/>
+          <w:sz w:val="22"/>
+          <w:szCs w:val="22"/>
+        </w:rPr>
+        <w:t>extended)</w:t>
       </w:r>
       <w:r>
         <w:rPr>

</xml_diff>

<commit_message>
started working through discussion
</commit_message>
<xml_diff>
--- a/Docs/Run_timing_manuscript.docx
+++ b/Docs/Run_timing_manuscript.docx
@@ -6396,6 +6396,134 @@
         <w:pStyle w:val="whitespace-normal"/>
         <w:spacing w:line="480" w:lineRule="auto"/>
         <w:ind w:firstLine="720"/>
+      </w:pPr>
+      <w:r>
+        <w:rPr>
+          <w:rFonts w:ascii="Garamond" w:hAnsi="Garamond"/>
+          <w:sz w:val="22"/>
+          <w:szCs w:val="22"/>
+        </w:rPr>
+        <w:t xml:space="preserve">The analysis presented here illustrates the spatiotemporal patterns of Chinook salmon in the Kuskokwim river-basin at a finer spatial scale and over a longer </w:t>
+      </w:r>
+      <w:proofErr w:type="spellStart"/>
+      <w:r>
+        <w:rPr>
+          <w:rFonts w:ascii="Garamond" w:hAnsi="Garamond"/>
+          <w:sz w:val="22"/>
+          <w:szCs w:val="22"/>
+        </w:rPr>
+        <w:t>timeperiod</w:t>
+      </w:r>
+      <w:proofErr w:type="spellEnd"/>
+      <w:r>
+        <w:rPr>
+          <w:rFonts w:ascii="Garamond" w:hAnsi="Garamond"/>
+          <w:sz w:val="22"/>
+          <w:szCs w:val="22"/>
+        </w:rPr>
+        <w:t xml:space="preserve"> than had been previously available. </w:t>
+      </w:r>
+      <w:r>
+        <w:rPr>
+          <w:rFonts w:ascii="Garamond" w:hAnsi="Garamond"/>
+          <w:sz w:val="22"/>
+          <w:szCs w:val="22"/>
+        </w:rPr>
+        <w:t>In doing so, we corroborated the relationship between run timing and watershed position</w:t>
+      </w:r>
+      <w:r>
+        <w:rPr>
+          <w:rFonts w:ascii="Garamond" w:hAnsi="Garamond"/>
+          <w:sz w:val="22"/>
+          <w:szCs w:val="22"/>
+        </w:rPr>
+        <w:t xml:space="preserve"> observed preliminarily in the </w:t>
+      </w:r>
+      <w:proofErr w:type="gramStart"/>
+      <w:r>
+        <w:rPr>
+          <w:rFonts w:ascii="Garamond" w:hAnsi="Garamond"/>
+          <w:sz w:val="22"/>
+          <w:szCs w:val="22"/>
+        </w:rPr>
+        <w:t>Kuskokwim river</w:t>
+      </w:r>
+      <w:proofErr w:type="gramEnd"/>
+      <w:r>
+        <w:rPr>
+          <w:rFonts w:ascii="Garamond" w:hAnsi="Garamond"/>
+          <w:sz w:val="22"/>
+          <w:szCs w:val="22"/>
+        </w:rPr>
+        <w:t xml:space="preserve"> basin and elsewhere</w:t>
+      </w:r>
+      <w:r>
+        <w:rPr>
+          <w:rFonts w:ascii="Garamond" w:hAnsi="Garamond"/>
+          <w:sz w:val="22"/>
+          <w:szCs w:val="22"/>
+        </w:rPr>
+        <w:t>, where the earliest stocks return to the upper portions of the watershed while later returning stocks return to lower portions of the watershed.</w:t>
+      </w:r>
+      <w:r>
+        <w:rPr>
+          <w:rFonts w:ascii="Garamond" w:hAnsi="Garamond"/>
+          <w:sz w:val="22"/>
+          <w:szCs w:val="22"/>
+        </w:rPr>
+        <w:t xml:space="preserve"> </w:t>
+      </w:r>
+      <w:r>
+        <w:t>Notably, this pattern persisted throughout our multi-year dataset despite significant differences in run timing (early vs late), duration (extended vs protracted), and overall run strength. The results suggest that these patterns are consistent in the Kuskokwim River Basin and that changes to overall run timing likely result from shifts in the phenology of the entire run rather than shifts in individual stocks.</w:t>
+      </w:r>
+    </w:p>
+    <w:p>
+      <w:pPr>
+        <w:pStyle w:val="whitespace-normal"/>
+        <w:spacing w:line="480" w:lineRule="auto"/>
+        <w:ind w:firstLine="720"/>
+      </w:pPr>
+      <w:r>
+        <w:t xml:space="preserve">The patterns observed here have </w:t>
+      </w:r>
+      <w:proofErr w:type="spellStart"/>
+      <w:r>
+        <w:t>impications</w:t>
+      </w:r>
+      <w:proofErr w:type="spellEnd"/>
+      <w:r>
+        <w:t xml:space="preserve"> for management techniques which aim to protect the biocomplexity in spatial stock structure through strategic closures of the downstream fish</w:t>
+      </w:r>
+    </w:p>
+    <w:p>
+      <w:pPr>
+        <w:pStyle w:val="whitespace-normal"/>
+        <w:spacing w:line="480" w:lineRule="auto"/>
+        <w:ind w:firstLine="720"/>
+        <w:rPr>
+          <w:rFonts w:ascii="Garamond" w:hAnsi="Garamond"/>
+          <w:sz w:val="22"/>
+          <w:szCs w:val="22"/>
+        </w:rPr>
+      </w:pPr>
+    </w:p>
+    <w:p>
+      <w:pPr>
+        <w:pStyle w:val="whitespace-normal"/>
+        <w:spacing w:line="480" w:lineRule="auto"/>
+        <w:ind w:firstLine="720"/>
+        <w:rPr>
+          <w:rFonts w:ascii="Garamond" w:hAnsi="Garamond"/>
+          <w:sz w:val="22"/>
+          <w:szCs w:val="22"/>
+        </w:rPr>
+      </w:pPr>
+    </w:p>
+    <w:p>
+      <w:pPr>
+        <w:pStyle w:val="whitespace-normal"/>
+        <w:spacing w:line="480" w:lineRule="auto"/>
+        <w:ind w:firstLine="720"/>
         <w:rPr>
           <w:rFonts w:ascii="Garamond" w:hAnsi="Garamond"/>
           <w:sz w:val="22"/>
@@ -6523,7 +6651,16 @@
           <w:sz w:val="22"/>
           <w:szCs w:val="22"/>
         </w:rPr>
-        <w:t>the findings presented here demonstrate the consistency of which this</w:t>
+        <w:t xml:space="preserve">the findings presented here demonstrate the consistency of </w:t>
+      </w:r>
+      <w:r>
+        <w:rPr>
+          <w:rFonts w:ascii="Garamond" w:hAnsi="Garamond"/>
+          <w:sz w:val="22"/>
+          <w:szCs w:val="22"/>
+        </w:rPr>
+        <w:lastRenderedPageBreak/>
+        <w:t>which this</w:t>
       </w:r>
       <w:r>
         <w:rPr>
@@ -6629,8 +6766,16 @@
           <w:sz w:val="22"/>
           <w:szCs w:val="22"/>
         </w:rPr>
+        <w:t xml:space="preserve">These results advance our understanding of Chinook salmon spatial ecology in the Kuskokwim River and contribute to broader insights into salmon dynamics in large river systems. While otolith-based chemical methods used in this study have not been explicitly validated for the Kuskokwim, they have demonstrated high assignment accuracy in other comparable systems and species (Cite cite). The spatial patterns revealed here highlight the importance of evaluating management strategies at appropriate spatial scales to identify interactions between stock-specific ecological behavior and regulatory frameworks. Strategies aiming to maintain ecosystem-scale resource availability should account for both the health of individual stocks and the broader metapopulation complex. By explicitly incorporating the spatiotemporal dynamics of </w:t>
+      </w:r>
+      <w:r>
+        <w:rPr>
+          <w:rFonts w:ascii="Garamond" w:hAnsi="Garamond"/>
+          <w:sz w:val="22"/>
+          <w:szCs w:val="22"/>
+        </w:rPr>
         <w:lastRenderedPageBreak/>
-        <w:t>These results advance our understanding of Chinook salmon spatial ecology in the Kuskokwim River and contribute to broader insights into salmon dynamics in large river systems. While otolith-based chemical methods used in this study have not been explicitly validated for the Kuskokwim, they have demonstrated high assignment accuracy in other comparable systems and species (Cite cite). The spatial patterns revealed here highlight the importance of evaluating management strategies at appropriate spatial scales to identify interactions between stock-specific ecological behavior and regulatory frameworks. Strategies aiming to maintain ecosystem-scale resource availability should account for both the health of individual stocks and the broader metapopulation complex. By explicitly incorporating the spatiotemporal dynamics of metapopulations, managers may be better equipped to design conservation strategies that meet human resource needs while preserving the biocomplexity essential to healthy ecosystems.</w:t>
+        <w:t>metapopulations, managers may be better equipped to design conservation strategies that meet human resource needs while preserving the biocomplexity essential to healthy ecosystems.</w:t>
       </w:r>
     </w:p>
     <w:p>
@@ -6765,7 +6910,6 @@
           <w:sz w:val="22"/>
           <w:szCs w:val="22"/>
         </w:rPr>
-        <w:lastRenderedPageBreak/>
         <w:t xml:space="preserve">This has led to the use of </w:t>
       </w:r>
       <w:proofErr w:type="gramStart"/>
@@ -7263,16 +7407,7 @@
           <w:sz w:val="22"/>
           <w:szCs w:val="22"/>
         </w:rPr>
-        <w:t xml:space="preserve">. As a result, resource managers face </w:t>
-      </w:r>
-      <w:r>
-        <w:rPr>
-          <w:rFonts w:ascii="Garamond" w:hAnsi="Garamond"/>
-          <w:sz w:val="22"/>
-          <w:szCs w:val="22"/>
-        </w:rPr>
-        <w:lastRenderedPageBreak/>
-        <w:t xml:space="preserve">the difficult task of designing management strategies which balancing ongoing harvest opportunities with the urgent need to rebuild salmon populations and strengthen their resilience to future perturbations. </w:t>
+        <w:t xml:space="preserve">. As a result, resource managers face the difficult task of designing management strategies which balancing ongoing harvest opportunities with the urgent need to rebuild salmon populations and strengthen their resilience to future perturbations. </w:t>
       </w:r>
     </w:p>
     <w:p>
@@ -7446,7 +7581,16 @@
           <w:sz w:val="22"/>
           <w:szCs w:val="22"/>
         </w:rPr>
-        <w:t>Weak or negative covariance among these stocks helps buffer the broader population against the poor performance of any individual subunit, whose success may fluctuate in response to a dynamic mosaic of multi-dimensional environmental conditions</w:t>
+        <w:t xml:space="preserve">Weak or negative covariance among these stocks helps buffer the broader population </w:t>
+      </w:r>
+      <w:r>
+        <w:rPr>
+          <w:rFonts w:ascii="Garamond" w:hAnsi="Garamond"/>
+          <w:sz w:val="22"/>
+          <w:szCs w:val="22"/>
+        </w:rPr>
+        <w:lastRenderedPageBreak/>
+        <w:t>against the poor performance of any individual subunit, whose success may fluctuate in response to a dynamic mosaic of multi-dimensional environmental conditions</w:t>
       </w:r>
       <w:r>
         <w:rPr>
@@ -7770,193 +7914,201 @@
           <w:sz w:val="22"/>
           <w:szCs w:val="22"/>
         </w:rPr>
+        <w:t xml:space="preserve">Downstream fisheries which harvest migrating stocks face a difficult challenge to design harvest methods which consider both </w:t>
+      </w:r>
+      <w:r>
+        <w:rPr>
+          <w:rFonts w:ascii="Garamond" w:hAnsi="Garamond"/>
+          <w:sz w:val="22"/>
+          <w:szCs w:val="22"/>
+        </w:rPr>
+        <w:t xml:space="preserve">overall </w:t>
+      </w:r>
+      <w:r>
+        <w:rPr>
+          <w:rFonts w:ascii="Garamond" w:hAnsi="Garamond"/>
+          <w:sz w:val="22"/>
+          <w:szCs w:val="22"/>
+        </w:rPr>
+        <w:t>harvest opportunity</w:t>
+      </w:r>
+      <w:r>
+        <w:rPr>
+          <w:rFonts w:ascii="Garamond" w:hAnsi="Garamond"/>
+          <w:sz w:val="22"/>
+          <w:szCs w:val="22"/>
+        </w:rPr>
+        <w:t xml:space="preserve"> as well as</w:t>
+      </w:r>
+      <w:r>
+        <w:rPr>
+          <w:rFonts w:ascii="Garamond" w:hAnsi="Garamond"/>
+          <w:sz w:val="22"/>
+          <w:szCs w:val="22"/>
+        </w:rPr>
+        <w:t xml:space="preserve"> stock specific exploitation rates. For example, strategies which </w:t>
+      </w:r>
+      <w:r>
+        <w:rPr>
+          <w:rFonts w:ascii="Garamond" w:hAnsi="Garamond"/>
+          <w:sz w:val="22"/>
+          <w:szCs w:val="22"/>
+        </w:rPr>
+        <w:t>concentrate harvest in periods of peak abundance (e.g., highest CPUE per day)</w:t>
+      </w:r>
+      <w:r>
+        <w:rPr>
+          <w:rFonts w:ascii="Garamond" w:hAnsi="Garamond"/>
+          <w:sz w:val="22"/>
+          <w:szCs w:val="22"/>
+        </w:rPr>
+        <w:t xml:space="preserve"> </w:t>
+      </w:r>
+      <w:r>
+        <w:rPr>
+          <w:rFonts w:ascii="Garamond" w:hAnsi="Garamond"/>
+          <w:sz w:val="22"/>
+          <w:szCs w:val="22"/>
+        </w:rPr>
+        <w:t>may fail to account for whether this peak consists of a mix of vulnerable, weak stocks or a single, more robust stock that can sustain higher exploitation</w:t>
+      </w:r>
+      <w:r>
+        <w:rPr>
+          <w:rFonts w:ascii="Garamond" w:hAnsi="Garamond"/>
+          <w:sz w:val="22"/>
+          <w:szCs w:val="22"/>
+        </w:rPr>
+        <w:t xml:space="preserve"> (Connors et al. 2022)</w:t>
+      </w:r>
+      <w:r>
+        <w:rPr>
+          <w:rFonts w:ascii="Garamond" w:hAnsi="Garamond"/>
+          <w:sz w:val="22"/>
+          <w:szCs w:val="22"/>
+        </w:rPr>
+        <w:t xml:space="preserve">. </w:t>
+      </w:r>
+      <w:r>
+        <w:rPr>
+          <w:rFonts w:ascii="Garamond" w:hAnsi="Garamond"/>
+          <w:sz w:val="22"/>
+          <w:szCs w:val="22"/>
+        </w:rPr>
+        <w:t>Fishing which disproportionally exploits weak stocks as they migrate upstream may threaten the availability of resources to upstream communities and threaten the reliability of downstream resources in subsequent years as upstream stock health degrades. M</w:t>
+      </w:r>
+      <w:r>
+        <w:rPr>
+          <w:rFonts w:ascii="Garamond" w:hAnsi="Garamond"/>
+          <w:sz w:val="22"/>
+          <w:szCs w:val="22"/>
+        </w:rPr>
+        <w:t>anagement strateg</w:t>
+      </w:r>
+      <w:r>
+        <w:rPr>
+          <w:rFonts w:ascii="Garamond" w:hAnsi="Garamond"/>
+          <w:sz w:val="22"/>
+          <w:szCs w:val="22"/>
+        </w:rPr>
+        <w:t>ies which maintain reliable fishery resources</w:t>
+      </w:r>
+      <w:r>
+        <w:rPr>
+          <w:rFonts w:ascii="Garamond" w:hAnsi="Garamond"/>
+          <w:sz w:val="22"/>
+          <w:szCs w:val="22"/>
+        </w:rPr>
+        <w:t xml:space="preserve"> should </w:t>
+      </w:r>
+      <w:r>
+        <w:rPr>
+          <w:rFonts w:ascii="Garamond" w:hAnsi="Garamond"/>
+          <w:sz w:val="22"/>
+          <w:szCs w:val="22"/>
+        </w:rPr>
+        <w:t xml:space="preserve">therefore </w:t>
+      </w:r>
+      <w:r>
+        <w:rPr>
+          <w:rFonts w:ascii="Garamond" w:hAnsi="Garamond"/>
+          <w:sz w:val="22"/>
+          <w:szCs w:val="22"/>
+        </w:rPr>
+        <w:t>aim to allow harvest opportunities on healthy stocks while minimizing the risk of overexploitation for co-migrating weak stocks</w:t>
+      </w:r>
+      <w:r>
+        <w:rPr>
+          <w:rFonts w:ascii="Garamond" w:hAnsi="Garamond"/>
+          <w:sz w:val="22"/>
+          <w:szCs w:val="22"/>
+        </w:rPr>
+        <w:t xml:space="preserve"> </w:t>
+      </w:r>
+      <w:r>
+        <w:rPr>
+          <w:rFonts w:ascii="Garamond" w:hAnsi="Garamond"/>
+          <w:sz w:val="22"/>
+          <w:szCs w:val="22"/>
+        </w:rPr>
+        <w:fldChar w:fldCharType="begin"/>
+      </w:r>
+      <w:r>
+        <w:rPr>
+          <w:rFonts w:ascii="Garamond" w:hAnsi="Garamond"/>
+          <w:sz w:val="22"/>
+          <w:szCs w:val="22"/>
+        </w:rPr>
+        <w:instrText xml:space="preserve"> ADDIN ZOTERO_ITEM CSL_CITATION {"citationID":"XABq2458","properties":{"formattedCitation":"(Connors et al., 2020)","plainCitation":"(Connors et al., 2020)","noteIndex":0},"citationItems":[{"id":4416,"uris":["http://zotero.org/users/8421274/items/STEMPPV7"],"itemData":{"id":4416,"type":"article-journal","abstract":"Accounting for population diversity can be critical to the sustainable management of mixed-stock fisheries because harvest rates that can be sustained by productive populations may come at the cost of overfishing less productive ones. While these harvest–diversity trade-offs are well-recognized, their consequences for harvest policy performance are not often explicitly evaluated in contemporary fisheries management. We use closed-loop simulations to evaluate the ability of alternative harvest policies to meet population diversity and fishery objectives for one of the largest subsistence Chinook salmon (Oncorhynchus tshawytscha) fisheries in the world (Kuskokwim River Basin in western Alaska). We found clear evidence of population diversity that resulted in asymmetric trade-offs among fishery and conservation objectives whereby policies that forgo relatively small amounts of harvest result in relatively large increases in equitable access to Chinook and elimination of risk of weak stock extirpation. The performance of alternative harvest policies, and the magnitude of trade-offs, were sensitive to regime shifts and uncertainty in the drivers of recruitment variation. However, we found that harvest policies that prioritized meeting minimum subsistence needs were unlikely to jeopardize long-term sustainability.","container-title":"Canadian Journal of Fisheries and Aquatic Sciences","DOI":"10.1139/cjfas-2019-0282","ISSN":"0706-652X","issue":"6","journalAbbreviation":"Can. J. Fish. Aquat. Sci.","note":"publisher: NRC Research Press","page":"1076-1089","source":"cdnsciencepub-com.offcampus.lib.washington.edu (Atypon)","title":"Incorporating harvest–population diversity trade-offs into harvest policy analyses of salmon management in large river basins","volume":"77","author":[{"family":"Connors","given":"Brendan M."},{"family":"Staton","given":"Benjamin"},{"family":"Coggins","given":"Lewis"},{"family":"Walters","given":"Carl"},{"family":"Jones","given":"Mike"},{"family":"Gwinn","given":"Daniel"},{"family":"Catalano","given":"Matt"},{"family":"Fleischman","given":"Steve"}],"issued":{"date-parts":[["2020",6]]}}}],"schema":"https://github.com/citation-style-language/schema/raw/master/csl-citation.json"} </w:instrText>
+      </w:r>
+      <w:r>
+        <w:rPr>
+          <w:rFonts w:ascii="Garamond" w:hAnsi="Garamond"/>
+          <w:sz w:val="22"/>
+          <w:szCs w:val="22"/>
+        </w:rPr>
+        <w:fldChar w:fldCharType="separate"/>
+      </w:r>
+      <w:r>
+        <w:rPr>
+          <w:rFonts w:ascii="Garamond" w:hAnsi="Garamond"/>
+          <w:noProof/>
+          <w:sz w:val="22"/>
+          <w:szCs w:val="22"/>
+        </w:rPr>
+        <w:t>(Connors et al., 2020)</w:t>
+      </w:r>
+      <w:r>
+        <w:rPr>
+          <w:rFonts w:ascii="Garamond" w:hAnsi="Garamond"/>
+          <w:sz w:val="22"/>
+          <w:szCs w:val="22"/>
+        </w:rPr>
+        <w:fldChar w:fldCharType="end"/>
+      </w:r>
+      <w:r>
+        <w:rPr>
+          <w:rFonts w:ascii="Garamond" w:hAnsi="Garamond"/>
+          <w:sz w:val="22"/>
+          <w:szCs w:val="22"/>
+        </w:rPr>
+        <w:t xml:space="preserve">. </w:t>
+      </w:r>
+      <w:r>
+        <w:rPr>
+          <w:rFonts w:ascii="Garamond" w:hAnsi="Garamond"/>
+          <w:sz w:val="22"/>
+          <w:szCs w:val="22"/>
+        </w:rPr>
+        <w:t xml:space="preserve"> In practice, however, implementing such stock-specific management approaches </w:t>
+      </w:r>
+      <w:r>
+        <w:rPr>
+          <w:rFonts w:ascii="Garamond" w:hAnsi="Garamond"/>
+          <w:sz w:val="22"/>
+          <w:szCs w:val="22"/>
+        </w:rPr>
         <w:lastRenderedPageBreak/>
-        <w:t xml:space="preserve">Downstream fisheries which harvest migrating stocks face a difficult challenge to design harvest methods which consider both </w:t>
-      </w:r>
-      <w:r>
-        <w:rPr>
-          <w:rFonts w:ascii="Garamond" w:hAnsi="Garamond"/>
-          <w:sz w:val="22"/>
-          <w:szCs w:val="22"/>
-        </w:rPr>
-        <w:t xml:space="preserve">overall </w:t>
-      </w:r>
-      <w:r>
-        <w:rPr>
-          <w:rFonts w:ascii="Garamond" w:hAnsi="Garamond"/>
-          <w:sz w:val="22"/>
-          <w:szCs w:val="22"/>
-        </w:rPr>
-        <w:t>harvest opportunity</w:t>
-      </w:r>
-      <w:r>
-        <w:rPr>
-          <w:rFonts w:ascii="Garamond" w:hAnsi="Garamond"/>
-          <w:sz w:val="22"/>
-          <w:szCs w:val="22"/>
-        </w:rPr>
-        <w:t xml:space="preserve"> as well as</w:t>
-      </w:r>
-      <w:r>
-        <w:rPr>
-          <w:rFonts w:ascii="Garamond" w:hAnsi="Garamond"/>
-          <w:sz w:val="22"/>
-          <w:szCs w:val="22"/>
-        </w:rPr>
-        <w:t xml:space="preserve"> stock specific exploitation rates. For example, strategies which </w:t>
-      </w:r>
-      <w:r>
-        <w:rPr>
-          <w:rFonts w:ascii="Garamond" w:hAnsi="Garamond"/>
-          <w:sz w:val="22"/>
-          <w:szCs w:val="22"/>
-        </w:rPr>
-        <w:t>concentrate harvest in periods of peak abundance (e.g., highest CPUE per day)</w:t>
-      </w:r>
-      <w:r>
-        <w:rPr>
-          <w:rFonts w:ascii="Garamond" w:hAnsi="Garamond"/>
-          <w:sz w:val="22"/>
-          <w:szCs w:val="22"/>
-        </w:rPr>
-        <w:t xml:space="preserve"> </w:t>
-      </w:r>
-      <w:r>
-        <w:rPr>
-          <w:rFonts w:ascii="Garamond" w:hAnsi="Garamond"/>
-          <w:sz w:val="22"/>
-          <w:szCs w:val="22"/>
-        </w:rPr>
-        <w:t>may fail to account for whether this peak consists of a mix of vulnerable, weak stocks or a single, more robust stock that can sustain higher exploitation</w:t>
-      </w:r>
-      <w:r>
-        <w:rPr>
-          <w:rFonts w:ascii="Garamond" w:hAnsi="Garamond"/>
-          <w:sz w:val="22"/>
-          <w:szCs w:val="22"/>
-        </w:rPr>
-        <w:t xml:space="preserve"> (Connors et al. 2022)</w:t>
-      </w:r>
-      <w:r>
-        <w:rPr>
-          <w:rFonts w:ascii="Garamond" w:hAnsi="Garamond"/>
-          <w:sz w:val="22"/>
-          <w:szCs w:val="22"/>
-        </w:rPr>
-        <w:t xml:space="preserve">. </w:t>
-      </w:r>
-      <w:r>
-        <w:rPr>
-          <w:rFonts w:ascii="Garamond" w:hAnsi="Garamond"/>
-          <w:sz w:val="22"/>
-          <w:szCs w:val="22"/>
-        </w:rPr>
-        <w:t>Fishing which disproportionally exploits weak stocks as they migrate upstream may threaten the availability of resources to upstream communities and threaten the reliability of downstream resources in subsequent years as upstream stock health degrades. M</w:t>
-      </w:r>
-      <w:r>
-        <w:rPr>
-          <w:rFonts w:ascii="Garamond" w:hAnsi="Garamond"/>
-          <w:sz w:val="22"/>
-          <w:szCs w:val="22"/>
-        </w:rPr>
-        <w:t>anagement strateg</w:t>
-      </w:r>
-      <w:r>
-        <w:rPr>
-          <w:rFonts w:ascii="Garamond" w:hAnsi="Garamond"/>
-          <w:sz w:val="22"/>
-          <w:szCs w:val="22"/>
-        </w:rPr>
-        <w:t>ies which maintain reliable fishery resources</w:t>
-      </w:r>
-      <w:r>
-        <w:rPr>
-          <w:rFonts w:ascii="Garamond" w:hAnsi="Garamond"/>
-          <w:sz w:val="22"/>
-          <w:szCs w:val="22"/>
-        </w:rPr>
-        <w:t xml:space="preserve"> should </w:t>
-      </w:r>
-      <w:r>
-        <w:rPr>
-          <w:rFonts w:ascii="Garamond" w:hAnsi="Garamond"/>
-          <w:sz w:val="22"/>
-          <w:szCs w:val="22"/>
-        </w:rPr>
-        <w:t xml:space="preserve">therefore </w:t>
-      </w:r>
-      <w:r>
-        <w:rPr>
-          <w:rFonts w:ascii="Garamond" w:hAnsi="Garamond"/>
-          <w:sz w:val="22"/>
-          <w:szCs w:val="22"/>
-        </w:rPr>
-        <w:t>aim to allow harvest opportunities on healthy stocks while minimizing the risk of overexploitation for co-migrating weak stocks</w:t>
-      </w:r>
-      <w:r>
-        <w:rPr>
-          <w:rFonts w:ascii="Garamond" w:hAnsi="Garamond"/>
-          <w:sz w:val="22"/>
-          <w:szCs w:val="22"/>
-        </w:rPr>
-        <w:t xml:space="preserve"> </w:t>
-      </w:r>
-      <w:r>
-        <w:rPr>
-          <w:rFonts w:ascii="Garamond" w:hAnsi="Garamond"/>
-          <w:sz w:val="22"/>
-          <w:szCs w:val="22"/>
-        </w:rPr>
-        <w:fldChar w:fldCharType="begin"/>
-      </w:r>
-      <w:r>
-        <w:rPr>
-          <w:rFonts w:ascii="Garamond" w:hAnsi="Garamond"/>
-          <w:sz w:val="22"/>
-          <w:szCs w:val="22"/>
-        </w:rPr>
-        <w:instrText xml:space="preserve"> ADDIN ZOTERO_ITEM CSL_CITATION {"citationID":"XABq2458","properties":{"formattedCitation":"(Connors et al., 2020)","plainCitation":"(Connors et al., 2020)","noteIndex":0},"citationItems":[{"id":4416,"uris":["http://zotero.org/users/8421274/items/STEMPPV7"],"itemData":{"id":4416,"type":"article-journal","abstract":"Accounting for population diversity can be critical to the sustainable management of mixed-stock fisheries because harvest rates that can be sustained by productive populations may come at the cost of overfishing less productive ones. While these harvest–diversity trade-offs are well-recognized, their consequences for harvest policy performance are not often explicitly evaluated in contemporary fisheries management. We use closed-loop simulations to evaluate the ability of alternative harvest policies to meet population diversity and fishery objectives for one of the largest subsistence Chinook salmon (Oncorhynchus tshawytscha) fisheries in the world (Kuskokwim River Basin in western Alaska). We found clear evidence of population diversity that resulted in asymmetric trade-offs among fishery and conservation objectives whereby policies that forgo relatively small amounts of harvest result in relatively large increases in equitable access to Chinook and elimination of risk of weak stock extirpation. The performance of alternative harvest policies, and the magnitude of trade-offs, were sensitive to regime shifts and uncertainty in the drivers of recruitment variation. However, we found that harvest policies that prioritized meeting minimum subsistence needs were unlikely to jeopardize long-term sustainability.","container-title":"Canadian Journal of Fisheries and Aquatic Sciences","DOI":"10.1139/cjfas-2019-0282","ISSN":"0706-652X","issue":"6","journalAbbreviation":"Can. J. Fish. Aquat. Sci.","note":"publisher: NRC Research Press","page":"1076-1089","source":"cdnsciencepub-com.offcampus.lib.washington.edu (Atypon)","title":"Incorporating harvest–population diversity trade-offs into harvest policy analyses of salmon management in large river basins","volume":"77","author":[{"family":"Connors","given":"Brendan M."},{"family":"Staton","given":"Benjamin"},{"family":"Coggins","given":"Lewis"},{"family":"Walters","given":"Carl"},{"family":"Jones","given":"Mike"},{"family":"Gwinn","given":"Daniel"},{"family":"Catalano","given":"Matt"},{"family":"Fleischman","given":"Steve"}],"issued":{"date-parts":[["2020",6]]}}}],"schema":"https://github.com/citation-style-language/schema/raw/master/csl-citation.json"} </w:instrText>
-      </w:r>
-      <w:r>
-        <w:rPr>
-          <w:rFonts w:ascii="Garamond" w:hAnsi="Garamond"/>
-          <w:sz w:val="22"/>
-          <w:szCs w:val="22"/>
-        </w:rPr>
-        <w:fldChar w:fldCharType="separate"/>
-      </w:r>
-      <w:r>
-        <w:rPr>
-          <w:rFonts w:ascii="Garamond" w:hAnsi="Garamond"/>
-          <w:noProof/>
-          <w:sz w:val="22"/>
-          <w:szCs w:val="22"/>
-        </w:rPr>
-        <w:t>(Connors et al., 2020)</w:t>
-      </w:r>
-      <w:r>
-        <w:rPr>
-          <w:rFonts w:ascii="Garamond" w:hAnsi="Garamond"/>
-          <w:sz w:val="22"/>
-          <w:szCs w:val="22"/>
-        </w:rPr>
-        <w:fldChar w:fldCharType="end"/>
-      </w:r>
-      <w:r>
-        <w:rPr>
-          <w:rFonts w:ascii="Garamond" w:hAnsi="Garamond"/>
-          <w:sz w:val="22"/>
-          <w:szCs w:val="22"/>
-        </w:rPr>
-        <w:t xml:space="preserve">. </w:t>
-      </w:r>
-      <w:r>
-        <w:rPr>
-          <w:rFonts w:ascii="Garamond" w:hAnsi="Garamond"/>
-          <w:sz w:val="22"/>
-          <w:szCs w:val="22"/>
-        </w:rPr>
-        <w:t xml:space="preserve"> In practice, however, implementing such stock-specific management approaches requires detailed data on the spatiotemporal ecology of salmon populations; information that has historically been limited at sufficiently fine spatial and temporal scales</w:t>
+        <w:t>requires detailed data on the spatiotemporal ecology of salmon populations; information that has historically been limited at sufficiently fine spatial and temporal scales</w:t>
       </w:r>
       <w:r>
         <w:rPr>
@@ -8357,16 +8509,7 @@
           <w:sz w:val="22"/>
           <w:szCs w:val="22"/>
         </w:rPr>
-        <w:t xml:space="preserve">. However, little data exist which quantifies the spatiotemporal patterns among stocks. The impact of front-end closure strategies on individual stock components is not well understood, and a more complete understanding of stock contribution to the overall run both within and among years is currently not readily available. These data may be important to assessing the impact of current management strategies and designing new strategies which maintain stock </w:t>
-      </w:r>
-      <w:r>
-        <w:rPr>
-          <w:rFonts w:ascii="Garamond" w:hAnsi="Garamond"/>
-          <w:sz w:val="22"/>
-          <w:szCs w:val="22"/>
-        </w:rPr>
-        <w:lastRenderedPageBreak/>
-        <w:t xml:space="preserve">health across all components of the watershed and maintain a reliable resource for communities and industry in the region. </w:t>
+        <w:t xml:space="preserve">. However, little data exist which quantifies the spatiotemporal patterns among stocks. The impact of front-end closure strategies on individual stock components is not well understood, and a more complete understanding of stock contribution to the overall run both within and among years is currently not readily available. These data may be important to assessing the impact of current management strategies and designing new strategies which maintain stock health across all components of the watershed and maintain a reliable resource for communities and industry in the region. </w:t>
       </w:r>
     </w:p>
     <w:p>

</xml_diff>

<commit_message>
making it up to date
</commit_message>
<xml_diff>
--- a/Docs/Run_timing_manuscript.docx
+++ b/Docs/Run_timing_manuscript.docx
@@ -144,8 +144,6 @@
           <w:u w:val="single"/>
         </w:rPr>
       </w:pPr>
-      <w:commentRangeStart w:id="1"/>
-      <w:commentRangeStart w:id="2"/>
       <w:r>
         <w:rPr>
           <w:rFonts w:ascii="Garamond" w:hAnsi="Garamond"/>
@@ -155,32 +153,7 @@
           <w:szCs w:val="22"/>
           <w:u w:val="single"/>
         </w:rPr>
-        <w:t>Introduction</w:t>
-      </w:r>
-      <w:commentRangeEnd w:id="1"/>
-      <w:r>
-        <w:rPr>
-          <w:rStyle w:val="CommentReference"/>
-        </w:rPr>
-        <w:commentReference w:id="1"/>
-      </w:r>
-      <w:commentRangeEnd w:id="2"/>
-      <w:r>
-        <w:rPr>
-          <w:rStyle w:val="CommentReference"/>
-        </w:rPr>
-        <w:commentReference w:id="2"/>
-      </w:r>
-      <w:r>
-        <w:rPr>
-          <w:rFonts w:ascii="Garamond" w:hAnsi="Garamond"/>
-          <w:b/>
-          <w:bCs/>
-          <w:sz w:val="22"/>
-          <w:szCs w:val="22"/>
-          <w:u w:val="single"/>
-        </w:rPr>
-        <w:t xml:space="preserve">: </w:t>
+        <w:t xml:space="preserve">Introduction: </w:t>
       </w:r>
       <w:r>
         <w:rPr>
@@ -486,15 +459,7 @@
           <w:sz w:val="22"/>
           <w:szCs w:val="22"/>
         </w:rPr>
-        <w:t xml:space="preserve">, leading to </w:t>
-      </w:r>
-      <w:r>
-        <w:rPr>
-          <w:rFonts w:ascii="Garamond" w:hAnsi="Garamond"/>
-          <w:sz w:val="22"/>
-          <w:szCs w:val="22"/>
-        </w:rPr>
-        <w:t>restricted</w:t>
+        <w:t>, leading to restricted</w:t>
       </w:r>
       <w:r>
         <w:rPr>
@@ -1094,17 +1059,27 @@
           <w:szCs w:val="22"/>
           <w14:ligatures w14:val="none"/>
         </w:rPr>
-        <w:t xml:space="preserve">Otoliths were collected </w:t>
-      </w:r>
-      <w:r>
-        <w:rPr>
-          <w:rFonts w:ascii="Garamond" w:eastAsia="Times New Roman" w:hAnsi="Garamond" w:cs="Times New Roman"/>
-          <w:kern w:val="0"/>
-          <w:sz w:val="22"/>
-          <w:szCs w:val="22"/>
-          <w14:ligatures w14:val="none"/>
-        </w:rPr>
-        <w:t xml:space="preserve">from Chinook salmon </w:t>
+        <w:t>Chinook salmon o</w:t>
+      </w:r>
+      <w:r>
+        <w:rPr>
+          <w:rFonts w:ascii="Garamond" w:eastAsia="Times New Roman" w:hAnsi="Garamond" w:cs="Times New Roman"/>
+          <w:kern w:val="0"/>
+          <w:sz w:val="22"/>
+          <w:szCs w:val="22"/>
+          <w14:ligatures w14:val="none"/>
+        </w:rPr>
+        <w:t xml:space="preserve">toliths were </w:t>
+      </w:r>
+      <w:r>
+        <w:rPr>
+          <w:rFonts w:ascii="Garamond" w:eastAsia="Times New Roman" w:hAnsi="Garamond" w:cs="Times New Roman"/>
+          <w:kern w:val="0"/>
+          <w:sz w:val="22"/>
+          <w:szCs w:val="22"/>
+          <w14:ligatures w14:val="none"/>
+        </w:rPr>
+        <w:t xml:space="preserve">collected </w:t>
       </w:r>
       <w:r>
         <w:rPr>
@@ -1134,7 +1109,7 @@
           <w:szCs w:val="22"/>
           <w14:ligatures w14:val="none"/>
         </w:rPr>
-        <w:t xml:space="preserve">sampled in </w:t>
+        <w:t xml:space="preserve">in </w:t>
       </w:r>
       <w:r>
         <w:rPr>
@@ -1216,17 +1191,126 @@
           <w:szCs w:val="22"/>
           <w14:ligatures w14:val="none"/>
         </w:rPr>
-        <w:t xml:space="preserve">The BTF was designed to allow in-season assessment of run strength based on catch-per-unit-effort to inform management of subsistence fisheries throughout the river (Liller report). </w:t>
-      </w:r>
-      <w:r>
-        <w:rPr>
-          <w:rFonts w:ascii="Garamond" w:eastAsia="Times New Roman" w:hAnsi="Garamond" w:cs="Times New Roman"/>
-          <w:kern w:val="0"/>
-          <w:sz w:val="22"/>
-          <w:szCs w:val="22"/>
-          <w14:ligatures w14:val="none"/>
-        </w:rPr>
-        <w:t xml:space="preserve">As such, fish captured in this test fishery are expected to be a representative sample of returning stocks throughout the basin. We collected approximately 500 otoliths from each year from 2017-2022, ensuring sampling efforts over the full course of the run. From these, approximately 250 otoliths were selected for microchemical analysis in proportion to the relative catch per unit effort (CPUE) </w:t>
+        <w:t>The BTF was designed to allow in-season assessment of run strength based on catch-per-unit-effort to inform management of subsistence fisheries throughout the river</w:t>
+      </w:r>
+      <w:r>
+        <w:rPr>
+          <w:rFonts w:ascii="Garamond" w:eastAsia="Times New Roman" w:hAnsi="Garamond" w:cs="Times New Roman"/>
+          <w:kern w:val="0"/>
+          <w:sz w:val="22"/>
+          <w:szCs w:val="22"/>
+          <w14:ligatures w14:val="none"/>
+        </w:rPr>
+        <w:t xml:space="preserve"> and fish caught in this fishery are expected to be a representative sample of returning stocks </w:t>
+      </w:r>
+      <w:commentRangeStart w:id="1"/>
+      <w:r>
+        <w:rPr>
+          <w:rFonts w:ascii="Garamond" w:eastAsia="Times New Roman" w:hAnsi="Garamond" w:cs="Times New Roman"/>
+          <w:kern w:val="0"/>
+          <w:sz w:val="22"/>
+          <w:szCs w:val="22"/>
+          <w14:ligatures w14:val="none"/>
+        </w:rPr>
+        <w:t>throughout the basin</w:t>
+      </w:r>
+      <w:r>
+        <w:rPr>
+          <w:rFonts w:ascii="Garamond" w:eastAsia="Times New Roman" w:hAnsi="Garamond" w:cs="Times New Roman"/>
+          <w:kern w:val="0"/>
+          <w:sz w:val="22"/>
+          <w:szCs w:val="22"/>
+          <w14:ligatures w14:val="none"/>
+        </w:rPr>
+        <w:t xml:space="preserve"> </w:t>
+      </w:r>
+      <w:commentRangeEnd w:id="1"/>
+      <w:r>
+        <w:rPr>
+          <w:rStyle w:val="CommentReference"/>
+        </w:rPr>
+        <w:commentReference w:id="1"/>
+      </w:r>
+      <w:r>
+        <w:rPr>
+          <w:rFonts w:ascii="Garamond" w:eastAsia="Times New Roman" w:hAnsi="Garamond" w:cs="Times New Roman"/>
+          <w:kern w:val="0"/>
+          <w:sz w:val="22"/>
+          <w:szCs w:val="22"/>
+          <w14:ligatures w14:val="none"/>
+        </w:rPr>
+        <w:fldChar w:fldCharType="begin"/>
+      </w:r>
+      <w:r>
+        <w:rPr>
+          <w:rFonts w:ascii="Garamond" w:eastAsia="Times New Roman" w:hAnsi="Garamond" w:cs="Times New Roman"/>
+          <w:kern w:val="0"/>
+          <w:sz w:val="22"/>
+          <w:szCs w:val="22"/>
+          <w14:ligatures w14:val="none"/>
+        </w:rPr>
+        <w:instrText xml:space="preserve"> ADDIN ZOTERO_ITEM CSL_CITATION {"citationID":"oT8qdcVg","properties":{"formattedCitation":"(Lipka &amp; Elison, 2015)","plainCitation":"(Lipka &amp; Elison, 2015)","noteIndex":0},"citationItems":[{"id":5567,"uris":["http://zotero.org/users/8421274/items/PMPCYQ6E"],"itemData":{"id":5567,"type":"report","abstract":"OBJECTIVES................................................................................................................................................................ 3 Tasks .............................................................................................................................................................................. 4\nMETHODS .................................................................................................................................................................... 4 Field Operations ............................................................................................................................................................ 4 Test Fishing Index .........................................................................................................................................................5 Age, Sex and Length Composition ................................................................................................................................6 Climatological and Stream Observations ......................................................................................................................7\nRESULTS ...................................................................................................................................................................... 7 Operations...................................................................................................................................................................... 7 Abundance Indices and Run Timing .............................................................................................................................8 Chinook Salmon .......................................................................................................................................................8 Sockeye Salmon........................................................................................................................................................8 Chum Salmon ...........................................................................................................................................................9 Coho Salmon ............................................................................................................................................................9 Climatological and Stream Observations .................................................................................................................... 10 DISCUSSION.............................................................................................................................................................. 10 Abundance Index ......................................................................................................................................................... 10 Chinook Salmon ..................................................................................................................................................... 10 Sockeye Salmon...................................................................................................................................................... 11 Chum Salmon ......................................................................................................................................................... 11 Coho Salmon .......................................................................................................................................................... 11\nCONCLUSION ........................................................................................................................................................... 11 ACKNOWLEDGEMENTS......................................................................................................................................... 12 REFERENCES CITED ............................................................................................................................................... 13 TABLES AND FIGURES ........................................................................................................................................... 15 APPENDIX A: BETHEL TEST FISHERY DRIFT SCHEDUALE ........................................................................... 37 APPENDIX B: HISTORICAL CHINOOK SALMON DATA ................................................................................... 39 APPENDIX C: HISTORICAL SOCKEYE SALMON DATA ................................................................................... 43 APPENDIX D: HISTORICAL CHUM SALMON DATA ......................................................................................... 51 APPENDIX E: HISTORICAL COHO SALMON DATA .......................................................................................... 57 APPENDIX F: HISTORICAL CLIMATOLOGICAL DATA .................................................................................... 63","collection-title":"Fishery Data Series No. 16-06 Anchorage","language":"en","publisher":"Alaska Department of Fish and Game","source":"Zotero","title":"Characterization of the 2012 and 2013 salmon runs in the Kuskokwim River based on the test fishery at Bethel.","author":[{"family":"Lipka","given":"C"},{"family":"Elison","given":"T"}],"issued":{"date-parts":[["2015"]]}}}],"schema":"https://github.com/citation-style-language/schema/raw/master/csl-citation.json"} </w:instrText>
+      </w:r>
+      <w:r>
+        <w:rPr>
+          <w:rFonts w:ascii="Garamond" w:eastAsia="Times New Roman" w:hAnsi="Garamond" w:cs="Times New Roman"/>
+          <w:kern w:val="0"/>
+          <w:sz w:val="22"/>
+          <w:szCs w:val="22"/>
+          <w14:ligatures w14:val="none"/>
+        </w:rPr>
+        <w:fldChar w:fldCharType="separate"/>
+      </w:r>
+      <w:r>
+        <w:rPr>
+          <w:rFonts w:ascii="Garamond" w:eastAsia="Times New Roman" w:hAnsi="Garamond" w:cs="Times New Roman"/>
+          <w:noProof/>
+          <w:kern w:val="0"/>
+          <w:sz w:val="22"/>
+          <w:szCs w:val="22"/>
+          <w14:ligatures w14:val="none"/>
+        </w:rPr>
+        <w:t>(Lipka &amp; Elison, 2015)</w:t>
+      </w:r>
+      <w:r>
+        <w:rPr>
+          <w:rFonts w:ascii="Garamond" w:eastAsia="Times New Roman" w:hAnsi="Garamond" w:cs="Times New Roman"/>
+          <w:kern w:val="0"/>
+          <w:sz w:val="22"/>
+          <w:szCs w:val="22"/>
+          <w14:ligatures w14:val="none"/>
+        </w:rPr>
+        <w:fldChar w:fldCharType="end"/>
+      </w:r>
+      <w:r>
+        <w:rPr>
+          <w:rFonts w:ascii="Garamond" w:eastAsia="Times New Roman" w:hAnsi="Garamond" w:cs="Times New Roman"/>
+          <w:kern w:val="0"/>
+          <w:sz w:val="22"/>
+          <w:szCs w:val="22"/>
+          <w14:ligatures w14:val="none"/>
+        </w:rPr>
+        <w:t>.</w:t>
+      </w:r>
+      <w:r>
+        <w:rPr>
+          <w:rFonts w:ascii="Garamond" w:eastAsia="Times New Roman" w:hAnsi="Garamond" w:cs="Times New Roman"/>
+          <w:kern w:val="0"/>
+          <w:sz w:val="22"/>
+          <w:szCs w:val="22"/>
+          <w14:ligatures w14:val="none"/>
+        </w:rPr>
+        <w:t xml:space="preserve"> </w:t>
+      </w:r>
+      <w:r>
+        <w:rPr>
+          <w:rFonts w:ascii="Garamond" w:eastAsia="Times New Roman" w:hAnsi="Garamond" w:cs="Times New Roman"/>
+          <w:kern w:val="0"/>
+          <w:sz w:val="22"/>
+          <w:szCs w:val="22"/>
+          <w14:ligatures w14:val="none"/>
+        </w:rPr>
+        <w:t xml:space="preserve">We collected approximately 500 otoliths from each year from 2017-2022, ensuring sampling efforts over the full course of the run. From these, approximately 250 otoliths were selected for microchemical analysis in proportion to the relative catch per unit effort (CPUE) </w:t>
       </w:r>
       <w:r>
         <w:rPr>
@@ -1611,7 +1695,283 @@
           <w:szCs w:val="22"/>
           <w14:ligatures w14:val="none"/>
         </w:rPr>
+        <w:fldChar w:fldCharType="begin"/>
+      </w:r>
+      <w:r>
+        <w:rPr>
+          <w:rFonts w:ascii="Garamond" w:eastAsia="Times New Roman" w:hAnsi="Garamond" w:cs="Times New Roman"/>
+          <w:kern w:val="0"/>
+          <w:sz w:val="22"/>
+          <w:szCs w:val="22"/>
+          <w14:ligatures w14:val="none"/>
+        </w:rPr>
+        <w:instrText xml:space="preserve"> ADDIN ZOTERO_ITEM CSL_CITATION {"citationID":"drNJXJRw","properties":{"formattedCitation":"(Brennan et al., 2015; Campana, 1999; Capo et al., 1998)","plainCitation":"(Brennan et al., 2015; Campana, 1999; Capo et al., 1998)","noteIndex":0},"citationItems":[{"id":"h4h2qxOD/ChWvHkvk","uris":["http://zotero.org/users/8421274/items/IY3FLHLM"],"itemData":{"id":"dI01jIsp/qEdWN4pU","type":"article-journal","abstract":"Strontium isotopes simultaneously delineate fine-scale natal habitats and migrations of Pacific salmon harvested during a coastal commercial fishery., Highly migratory organisms present major challenges to conservation efforts. This is especially true for exploited anadromous fish species, which exhibit long-range dispersals from natal sites, complex population structures, and extensive mixing of distinct populations during exploitation. By tracing the migratory histories of individual Chinook salmon caught in fisheries using strontium isotopes, we determined the relative production of natal habitats at fine spatial scales and different life histories. Although strontium isotopes have been widely used in provenance research, we present a new robust framework to simultaneously assess natal sources and migrations of individuals within fishery harvests through time. Our results pave the way for investigating how fine-scale habitat production and life histories of salmon respond to perturbations—providing crucial insights for conservation.","container-title":"Science Advances","DOI":"10.1126/sciadv.1400124","ISSN":"2375-2548","issue":"4","journalAbbreviation":"Sci Adv","note":"PMID: 26601173\nPMCID: PMC4640640","page":"e1400124","source":"PubMed Central","title":"Strontium isotopes delineate fine-scale natal origins and migration histories of Pacific salmon","volume":"1","author":[{"family":"Brennan","given":"Sean R."},{"family":"Zimmerman","given":"Christian E."},{"family":"Fernandez","given":"Diego P."},{"family":"Cerling","given":"Thure E."},{"family":"McPhee","given":"Megan V."},{"family":"Wooller","given":"Matthew J."}],"issued":{"date-parts":[["2015",5,15]]}}},{"id":1441,"uris":["http://zotero.org/users/8421274/items/PHNAKZ8D"],"itemData":{"id":1441,"type":"article-journal","abstract":"The fish otolith (earstone) has long been known as a timekeeper, but interest in its use as a metabolically inert environmental recorder has accelerated in recent years. In part due to technological advances, applications such as stock identification, determination of rnigralon pathways, reconstruction of temperature and salinity history, age validation, detection of anadromy, use as a natural tag and chemical mass marking have been developed, some of which are difficult or impossible to implement using alternative techniques. Microsamphg and the latest advances in beam-based probes allow many elemental assays to be coupled with daily or annual growth increments, thus providing a detailed chronologcal record of the environment. However, few workers have critically assessed the assumptions upon which the environmental reconstructions are based, or considered the possibility that elemental incorporation into the otolith may proceed differently than that into other calcified structures. This paper reviews current applications and their assumptions and suggests future directions. Particular attention is given to the premises that the elemental and isotopic composition of the otolith reflects that of the environment, and the effect of physiological filters on the resulting composition. The roles of temperature, elemental uptake into the fish and the process of otolith crystahzation are also assessed. Drawing upon recent advances in geochemistry and paleoclirnate research as points of contrast, it appears that not all applications of otolith chemistry are firmly based, although others are destined to become powerful and perhaps routine tools for the mainstream fish biologst.","container-title":"Marine Ecology Progress Series","DOI":"10.3354/meps188263","ISSN":"0171-8630, 1616-1599","journalAbbreviation":"Mar. Ecol. Prog. Ser.","language":"en","page":"263-297","source":"DOI.org (Crossref)","title":"Chemistry and composition of fish otoliths:pathways, mechanisms and applications","title-short":"Chemistry and composition of fish otoliths","volume":"188","author":[{"family":"Campana","given":"Se"}],"issued":{"date-parts":[["1999"]]}}},{"id":1457,"uris":["http://zotero.org/users/8421274/items/TDIQBP7K"],"itemData":{"id":1457,"type":"article-journal","abstract":"The strontium (Sr) isotope method can be a powerful tool in studies of chemical weathering and soil genesis, cation provenance and mobility, and the chronostratigraphic correlation of marine sediments. It is a sensitive geochemical tracer, applicable to large-scale ecosystem studies as well as to centimeter-scaled examination of cation mobility within a soil profile. The 87Sr/86Sr ratios of natural materials reflect the sources of strontium available during their formation. Isotopically distinct inputs from precipitation, dryfall, soil parent material, and surface or groundwater allow determination of the relative proportions of those materials entering or leaving an ecosystem. The isotopic compositions of labile (soil exchange complex and soil solution) strontium and Sr in vegetation reflect the sources of cations available to plants. Strontium isotopes can be used to track the biogeochemical cycling of nutrient cations such as calcium. The extent of cation contributions from in situ weathering and external additions to soil from dust and rain can also be resolved with this method. In this paper, we review the geochemistry and isotopic systematics of strontium, and discuss the use of this method as a tracer of earth surface processes.","container-title":"Geoderma","DOI":"10.1016/S0016-7061(97)00102-X","ISSN":"0016-7061","issue":"1","journalAbbreviation":"Geoderma","language":"en","page":"197-225","source":"ScienceDirect","title":"Strontium isotopes as tracers of ecosystem processes: theory and methods","title-short":"Strontium isotopes as tracers of ecosystem processes","volume":"82","author":[{"family":"Capo","given":"Rosemary C."},{"family":"Stewart","given":"Brian W."},{"family":"Chadwick","given":"Oliver A."}],"issued":{"date-parts":[["1998",2,1]]}}}],"schema":"https://github.com/citation-style-language/schema/raw/master/csl-citation.json"} </w:instrText>
+      </w:r>
+      <w:r>
+        <w:rPr>
+          <w:rFonts w:ascii="Garamond" w:eastAsia="Times New Roman" w:hAnsi="Garamond" w:cs="Times New Roman"/>
+          <w:kern w:val="0"/>
+          <w:sz w:val="22"/>
+          <w:szCs w:val="22"/>
+          <w14:ligatures w14:val="none"/>
+        </w:rPr>
+        <w:fldChar w:fldCharType="separate"/>
+      </w:r>
+      <w:r>
+        <w:rPr>
+          <w:rFonts w:ascii="Garamond" w:eastAsia="Times New Roman" w:hAnsi="Garamond" w:cs="Times New Roman"/>
+          <w:noProof/>
+          <w:kern w:val="0"/>
+          <w:sz w:val="22"/>
+          <w:szCs w:val="22"/>
+          <w14:ligatures w14:val="none"/>
+        </w:rPr>
+        <w:t>(Brennan et al., 2015; Campana, 1999; Capo et al., 1998)</w:t>
+      </w:r>
+      <w:r>
+        <w:rPr>
+          <w:rFonts w:ascii="Garamond" w:eastAsia="Times New Roman" w:hAnsi="Garamond" w:cs="Times New Roman"/>
+          <w:kern w:val="0"/>
+          <w:sz w:val="22"/>
+          <w:szCs w:val="22"/>
+          <w14:ligatures w14:val="none"/>
+        </w:rPr>
+        <w:fldChar w:fldCharType="end"/>
+      </w:r>
+      <w:r>
+        <w:rPr>
+          <w:rFonts w:ascii="Garamond" w:eastAsia="Times New Roman" w:hAnsi="Garamond" w:cs="Times New Roman"/>
+          <w:kern w:val="0"/>
+          <w:sz w:val="22"/>
+          <w:szCs w:val="22"/>
+          <w14:ligatures w14:val="none"/>
+        </w:rPr>
+        <w:t xml:space="preserve">. </w:t>
+      </w:r>
+      <w:r>
+        <w:rPr>
+          <w:rFonts w:ascii="Garamond" w:eastAsia="Times New Roman" w:hAnsi="Garamond" w:cs="Times New Roman"/>
+          <w:kern w:val="0"/>
+          <w:sz w:val="22"/>
+          <w:szCs w:val="22"/>
+          <w14:ligatures w14:val="none"/>
+        </w:rPr>
+        <w:t xml:space="preserve">From these data, the </w:t>
+      </w:r>
+      <w:r>
+        <w:rPr>
+          <w:rFonts w:ascii="Garamond" w:eastAsia="Times New Roman" w:hAnsi="Garamond" w:cs="Times New Roman"/>
+          <w:kern w:val="0"/>
+          <w:sz w:val="22"/>
+          <w:szCs w:val="22"/>
+          <w14:ligatures w14:val="none"/>
+        </w:rPr>
+        <w:t>Sr</w:t>
+      </w:r>
+      <w:r>
+        <w:rPr>
+          <w:rFonts w:ascii="Garamond" w:eastAsia="Times New Roman" w:hAnsi="Garamond" w:cs="Times New Roman"/>
+          <w:kern w:val="0"/>
+          <w:sz w:val="22"/>
+          <w:szCs w:val="22"/>
+          <w:vertAlign w:val="superscript"/>
+          <w14:ligatures w14:val="none"/>
+        </w:rPr>
+        <w:t>87</w:t>
+      </w:r>
+      <w:r>
+        <w:rPr>
+          <w:rFonts w:ascii="Garamond" w:eastAsia="Times New Roman" w:hAnsi="Garamond" w:cs="Times New Roman"/>
+          <w:kern w:val="0"/>
+          <w:sz w:val="22"/>
+          <w:szCs w:val="22"/>
+          <w14:ligatures w14:val="none"/>
+        </w:rPr>
+        <w:t>/Sr</w:t>
+      </w:r>
+      <w:r>
+        <w:rPr>
+          <w:rFonts w:ascii="Garamond" w:eastAsia="Times New Roman" w:hAnsi="Garamond" w:cs="Times New Roman"/>
+          <w:kern w:val="0"/>
+          <w:sz w:val="22"/>
+          <w:szCs w:val="22"/>
+          <w:vertAlign w:val="superscript"/>
+          <w14:ligatures w14:val="none"/>
+        </w:rPr>
+        <w:t>86</w:t>
+      </w:r>
+      <w:r>
+        <w:rPr>
+          <w:rFonts w:ascii="Garamond" w:eastAsia="Times New Roman" w:hAnsi="Garamond" w:cs="Times New Roman"/>
+          <w:kern w:val="0"/>
+          <w:sz w:val="22"/>
+          <w:szCs w:val="22"/>
+          <w14:ligatures w14:val="none"/>
+        </w:rPr>
+        <w:t xml:space="preserve"> </w:t>
+      </w:r>
+      <w:r>
+        <w:rPr>
+          <w:rFonts w:ascii="Garamond" w:eastAsia="Times New Roman" w:hAnsi="Garamond" w:cs="Times New Roman"/>
+          <w:kern w:val="0"/>
+          <w:sz w:val="22"/>
+          <w:szCs w:val="22"/>
+          <w14:ligatures w14:val="none"/>
+        </w:rPr>
+        <w:t xml:space="preserve">value associated with </w:t>
+      </w:r>
+      <w:r>
+        <w:rPr>
+          <w:rFonts w:ascii="Garamond" w:eastAsia="Times New Roman" w:hAnsi="Garamond" w:cs="Times New Roman"/>
+          <w:kern w:val="0"/>
+          <w:sz w:val="22"/>
+          <w:szCs w:val="22"/>
+          <w14:ligatures w14:val="none"/>
+        </w:rPr>
         <w:lastRenderedPageBreak/>
+        <w:t xml:space="preserve">the </w:t>
+      </w:r>
+      <w:r>
+        <w:rPr>
+          <w:rFonts w:ascii="Garamond" w:eastAsia="Times New Roman" w:hAnsi="Garamond" w:cs="Times New Roman"/>
+          <w:kern w:val="0"/>
+          <w:sz w:val="22"/>
+          <w:szCs w:val="22"/>
+          <w14:ligatures w14:val="none"/>
+        </w:rPr>
+        <w:t>natal freshwater rearing period was extracted by examining</w:t>
+      </w:r>
+      <w:r>
+        <w:rPr>
+          <w:rFonts w:ascii="Garamond" w:eastAsia="Times New Roman" w:hAnsi="Garamond" w:cs="Times New Roman"/>
+          <w:kern w:val="0"/>
+          <w:sz w:val="22"/>
+          <w:szCs w:val="22"/>
+          <w14:ligatures w14:val="none"/>
+        </w:rPr>
+        <w:t xml:space="preserve"> patterns of </w:t>
+      </w:r>
+      <w:r>
+        <w:rPr>
+          <w:rFonts w:ascii="Garamond" w:eastAsia="Times New Roman" w:hAnsi="Garamond" w:cs="Times New Roman"/>
+          <w:kern w:val="0"/>
+          <w:sz w:val="22"/>
+          <w:szCs w:val="22"/>
+          <w14:ligatures w14:val="none"/>
+        </w:rPr>
+        <w:t>change in Sr</w:t>
+      </w:r>
+      <w:r>
+        <w:rPr>
+          <w:rFonts w:ascii="Garamond" w:eastAsia="Times New Roman" w:hAnsi="Garamond" w:cs="Times New Roman"/>
+          <w:kern w:val="0"/>
+          <w:sz w:val="22"/>
+          <w:szCs w:val="22"/>
+          <w:vertAlign w:val="superscript"/>
+          <w14:ligatures w14:val="none"/>
+        </w:rPr>
+        <w:t>87</w:t>
+      </w:r>
+      <w:r>
+        <w:rPr>
+          <w:rFonts w:ascii="Garamond" w:eastAsia="Times New Roman" w:hAnsi="Garamond" w:cs="Times New Roman"/>
+          <w:kern w:val="0"/>
+          <w:sz w:val="22"/>
+          <w:szCs w:val="22"/>
+          <w14:ligatures w14:val="none"/>
+        </w:rPr>
+        <w:t>/Sr</w:t>
+      </w:r>
+      <w:r>
+        <w:rPr>
+          <w:rFonts w:ascii="Garamond" w:eastAsia="Times New Roman" w:hAnsi="Garamond" w:cs="Times New Roman"/>
+          <w:kern w:val="0"/>
+          <w:sz w:val="22"/>
+          <w:szCs w:val="22"/>
+          <w:vertAlign w:val="superscript"/>
+          <w14:ligatures w14:val="none"/>
+        </w:rPr>
+        <w:t>86</w:t>
+      </w:r>
+      <w:r>
+        <w:rPr>
+          <w:rFonts w:ascii="Garamond" w:eastAsia="Times New Roman" w:hAnsi="Garamond" w:cs="Times New Roman"/>
+          <w:kern w:val="0"/>
+          <w:sz w:val="22"/>
+          <w:szCs w:val="22"/>
+          <w14:ligatures w14:val="none"/>
+        </w:rPr>
+        <w:t xml:space="preserve"> and Sr</w:t>
+      </w:r>
+      <w:r>
+        <w:rPr>
+          <w:rFonts w:ascii="Garamond" w:eastAsia="Times New Roman" w:hAnsi="Garamond" w:cs="Times New Roman"/>
+          <w:kern w:val="0"/>
+          <w:sz w:val="22"/>
+          <w:szCs w:val="22"/>
+          <w:vertAlign w:val="superscript"/>
+          <w14:ligatures w14:val="none"/>
+        </w:rPr>
+        <w:t>88</w:t>
+      </w:r>
+      <w:r>
+        <w:rPr>
+          <w:rFonts w:ascii="Garamond" w:eastAsia="Times New Roman" w:hAnsi="Garamond" w:cs="Times New Roman"/>
+          <w:kern w:val="0"/>
+          <w:sz w:val="22"/>
+          <w:szCs w:val="22"/>
+          <w14:ligatures w14:val="none"/>
+        </w:rPr>
+        <w:t xml:space="preserve"> </w:t>
+      </w:r>
+      <w:r>
+        <w:rPr>
+          <w:rFonts w:ascii="Garamond" w:eastAsia="Times New Roman" w:hAnsi="Garamond" w:cs="Times New Roman"/>
+          <w:kern w:val="0"/>
+          <w:sz w:val="22"/>
+          <w:szCs w:val="22"/>
+          <w14:ligatures w14:val="none"/>
+        </w:rPr>
+        <w:t>between the core and freshwater region</w:t>
+      </w:r>
+      <w:r>
+        <w:rPr>
+          <w:rFonts w:ascii="Garamond" w:eastAsia="Times New Roman" w:hAnsi="Garamond" w:cs="Times New Roman"/>
+          <w:kern w:val="0"/>
+          <w:sz w:val="22"/>
+          <w:szCs w:val="22"/>
+          <w14:ligatures w14:val="none"/>
+        </w:rPr>
+        <w:t xml:space="preserve">, </w:t>
+      </w:r>
+      <w:r>
+        <w:rPr>
+          <w:rFonts w:ascii="Garamond" w:eastAsia="Times New Roman" w:hAnsi="Garamond" w:cs="Times New Roman"/>
+          <w:kern w:val="0"/>
+          <w:sz w:val="22"/>
+          <w:szCs w:val="22"/>
+          <w14:ligatures w14:val="none"/>
+        </w:rPr>
+        <w:t>morphological features of the otolith visible among the ablation path</w:t>
+      </w:r>
+      <w:r>
+        <w:rPr>
+          <w:rFonts w:ascii="Garamond" w:eastAsia="Times New Roman" w:hAnsi="Garamond" w:cs="Times New Roman"/>
+          <w:kern w:val="0"/>
+          <w:sz w:val="22"/>
+          <w:szCs w:val="22"/>
+          <w14:ligatures w14:val="none"/>
+        </w:rPr>
+        <w:t xml:space="preserve">, and known distances from the core to onset of the freshwater signal </w:t>
+      </w:r>
+      <w:r>
+        <w:rPr>
+          <w:rFonts w:ascii="Garamond" w:eastAsia="Times New Roman" w:hAnsi="Garamond" w:cs="Times New Roman"/>
+          <w:kern w:val="0"/>
+          <w:sz w:val="22"/>
+          <w:szCs w:val="22"/>
+          <w14:ligatures w14:val="none"/>
+        </w:rPr>
         <w:fldChar w:fldCharType="begin"/>
       </w:r>
       <w:r>
@@ -1622,7 +1982,7 @@
           <w:szCs w:val="22"/>
           <w14:ligatures w14:val="none"/>
         </w:rPr>
-        <w:instrText xml:space="preserve"> ADDIN ZOTERO_ITEM CSL_CITATION {"citationID":"drNJXJRw","properties":{"formattedCitation":"(Brennan et al., 2015; Campana, 1999; Capo et al., 1998)","plainCitation":"(Brennan et al., 2015; Campana, 1999; Capo et al., 1998)","noteIndex":0},"citationItems":[{"id":"h4h2qxOD/ChWvHkvk","uris":["http://zotero.org/users/8421274/items/IY3FLHLM"],"itemData":{"id":"dI01jIsp/qEdWN4pU","type":"article-journal","abstract":"Strontium isotopes simultaneously delineate fine-scale natal habitats and migrations of Pacific salmon harvested during a coastal commercial fishery., Highly migratory organisms present major challenges to conservation efforts. This is especially true for exploited anadromous fish species, which exhibit long-range dispersals from natal sites, complex population structures, and extensive mixing of distinct populations during exploitation. By tracing the migratory histories of individual Chinook salmon caught in fisheries using strontium isotopes, we determined the relative production of natal habitats at fine spatial scales and different life histories. Although strontium isotopes have been widely used in provenance research, we present a new robust framework to simultaneously assess natal sources and migrations of individuals within fishery harvests through time. Our results pave the way for investigating how fine-scale habitat production and life histories of salmon respond to perturbations—providing crucial insights for conservation.","container-title":"Science Advances","DOI":"10.1126/sciadv.1400124","ISSN":"2375-2548","issue":"4","journalAbbreviation":"Sci Adv","note":"PMID: 26601173\nPMCID: PMC4640640","page":"e1400124","source":"PubMed Central","title":"Strontium isotopes delineate fine-scale natal origins and migration histories of Pacific salmon","volume":"1","author":[{"family":"Brennan","given":"Sean R."},{"family":"Zimmerman","given":"Christian E."},{"family":"Fernandez","given":"Diego P."},{"family":"Cerling","given":"Thure E."},{"family":"McPhee","given":"Megan V."},{"family":"Wooller","given":"Matthew J."}],"issued":{"date-parts":[["2015",5,15]]}}},{"id":1441,"uris":["http://zotero.org/users/8421274/items/PHNAKZ8D"],"itemData":{"id":1441,"type":"article-journal","abstract":"The fish otolith (earstone) has long been known as a timekeeper, but interest in its use as a metabolically inert environmental recorder has accelerated in recent years. In part due to technological advances, applications such as stock identification, determination of rnigralon pathways, reconstruction of temperature and salinity history, age validation, detection of anadromy, use as a natural tag and chemical mass marking have been developed, some of which are difficult or impossible to implement using alternative techniques. Microsamphg and the latest advances in beam-based probes allow many elemental assays to be coupled with daily or annual growth increments, thus providing a detailed chronologcal record of the environment. However, few workers have critically assessed the assumptions upon which the environmental reconstructions are based, or considered the possibility that elemental incorporation into the otolith may proceed differently than that into other calcified structures. This paper reviews current applications and their assumptions and suggests future directions. Particular attention is given to the premises that the elemental and isotopic composition of the otolith reflects that of the environment, and the effect of physiological filters on the resulting composition. The roles of temperature, elemental uptake into the fish and the process of otolith crystahzation are also assessed. Drawing upon recent advances in geochemistry and paleoclirnate research as points of contrast, it appears that not all applications of otolith chemistry are firmly based, although others are destined to become powerful and perhaps routine tools for the mainstream fish biologst.","container-title":"Marine Ecology Progress Series","DOI":"10.3354/meps188263","ISSN":"0171-8630, 1616-1599","journalAbbreviation":"Mar. Ecol. Prog. Ser.","language":"en","page":"263-297","source":"DOI.org (Crossref)","title":"Chemistry and composition of fish otoliths:pathways, mechanisms and applications","title-short":"Chemistry and composition of fish otoliths","volume":"188","author":[{"family":"Campana","given":"Se"}],"issued":{"date-parts":[["1999"]]}}},{"id":1457,"uris":["http://zotero.org/users/8421274/items/TDIQBP7K"],"itemData":{"id":1457,"type":"article-journal","abstract":"The strontium (Sr) isotope method can be a powerful tool in studies of chemical weathering and soil genesis, cation provenance and mobility, and the chronostratigraphic correlation of marine sediments. It is a sensitive geochemical tracer, applicable to large-scale ecosystem studies as well as to centimeter-scaled examination of cation mobility within a soil profile. The 87Sr/86Sr ratios of natural materials reflect the sources of strontium available during their formation. Isotopically distinct inputs from precipitation, dryfall, soil parent material, and surface or groundwater allow determination of the relative proportions of those materials entering or leaving an ecosystem. The isotopic compositions of labile (soil exchange complex and soil solution) strontium and Sr in vegetation reflect the sources of cations available to plants. Strontium isotopes can be used to track the biogeochemical cycling of nutrient cations such as calcium. The extent of cation contributions from in situ weathering and external additions to soil from dust and rain can also be resolved with this method. In this paper, we review the geochemistry and isotopic systematics of strontium, and discuss the use of this method as a tracer of earth surface processes.","container-title":"Geoderma","DOI":"10.1016/S0016-7061(97)00102-X","ISSN":"0016-7061","issue":"1","journalAbbreviation":"Geoderma","language":"en","page":"197-225","source":"ScienceDirect","title":"Strontium isotopes as tracers of ecosystem processes: theory and methods","title-short":"Strontium isotopes as tracers of ecosystem processes","volume":"82","author":[{"family":"Capo","given":"Rosemary C."},{"family":"Stewart","given":"Brian W."},{"family":"Chadwick","given":"Oliver A."}],"issued":{"date-parts":[["1998",2,1]]}}}],"schema":"https://github.com/citation-style-language/schema/raw/master/csl-citation.json"} </w:instrText>
+        <w:instrText xml:space="preserve"> ADDIN ZOTERO_ITEM CSL_CITATION {"citationID":"9Eo1mxW7","properties":{"formattedCitation":"(Brennan, Schindler, et al., 2019; Chittaro et al., 2023)","plainCitation":"(Brennan, Schindler, et al., 2019; Chittaro et al., 2023)","noteIndex":0},"citationItems":[{"id":3844,"uris":["http://zotero.org/users/8421274/items/RXD5IA9D"],"itemData":{"id":3844,"type":"article-journal","abstract":"Watersheds are complex mosaics of habitats whose conditions vary across space and time as landscape features filter overriding climate forcing, yet the extent to which the reliability of ecosystem services depends on these dynamics remains unknown. We quantified how shifting habitat mosaics are expressed across a range of spatial scales within a large, free-flowing river, and how they stabilize the production of Pacific salmon that support valuable fisheries. The strontium isotope records of ear stones (otoliths) show that the relative productivity of locations across the river network, as both natal- and juvenile-rearing habitat, varies widely among years and that this variability is expressed across a broad range of spatial scales, ultimately stabilizing the interannual production of fish at the scale of the entire basin.","container-title":"Science","DOI":"10.1126/science.aav4313","issue":"6442","note":"publisher: American Association for the Advancement of Science","page":"783-786","source":"science.org (Atypon)","title":"Shifting habitat mosaics and fish production across river basins","volume":"364","author":[{"family":"Brennan","given":"Sean R."},{"family":"Schindler","given":"Daniel E."},{"family":"Cline","given":"Timothy J."},{"family":"Walsworth","given":"Timothy E."},{"family":"Buck","given":"Greg"},{"family":"Fernandez","given":"Diego P."}],"issued":{"date-parts":[["2019"]]}}},{"id":4257,"uris":["http://zotero.org/users/8421274/items/TAJ7RSQZ"],"itemData":{"id":4257,"type":"article-journal","abstract":"Effective species management often requires understanding patterns of movement and habitat use. A common approach in identifying where individuals reside relies upon chemical tracers from the environment that are incorporated into an individual's tissues. For fish, isotopes in their otoliths, specifically the portion of their otolith formed during their larval stage, have been used to identify the natal origin. Complicating this work, however, is the fact that during this life stage, there is a shift in the source of isotopes deposited onto the growing otolith from maternally to environmentally derived. The objective of this study was to identify the portion of the otolith representing this transition to environmentally derived isotopes so as to accurately investigate questions of natal origin for a threatened population of fall Chinook salmon (Oncorhynchus tshawytscha). We exposed developing larvae to four treatments that differed in terms of their water strontium isotope ratio (87Sr/86Sr) and used change-point analysis of otolith 87Sr/86Sr and strontium to calcium ratio (Sr/Ca) to identify the otolith radius corresponding to the transition to environmentally derived isotopes. Our results indicated this transition occurred, on average, at 132 μm (87Sr/86Sr; ±50 μm standard deviation) and 127 μm (Sr/Ca; ±29 μm) from the otolith core, which corresponded to the developmental time between hatching and exogenous feeding. A substantial proportion of our otoliths (i.e., 61%) did not show convergence between otolith and water 87Sr/86Sr by the end of the 113-day experiment, which was likely due to the dietary contribution of marine-based feed. Therefore, we were unable to recommend an otolith radius to target for the purposes of reconstructing natal origin apart from being beyond approximately 130 μm.","container-title":"Ecology of Freshwater Fish","DOI":"10.1111/eff.12673","ISSN":"1600-0633","issue":"1","language":"en","license":"© 2022 John Wiley &amp; Sons Ltd. This article has been contributed to by U.S. Government employees and their work is in the public domain in the USA.","note":"_eprint: https://onlinelibrary.wiley.com/doi/pdf/10.1111/eff.12673","page":"107-119","source":"Wiley Online Library","title":"The incorporation of environmentally derived 87Sr/86Sr and Sr/Ca in early otolith formation of Chinook salmon","volume":"32","author":[{"family":"Chittaro","given":"Paul"},{"family":"Hegg","given":"Jens"},{"family":"Fuhrman","given":"Abby"},{"family":"Robichaux","given":"Devin"},{"family":"Doung","given":"Rothboury"},{"family":"Beckman","given":"Brian"},{"family":"Fisher","given":"Chris"},{"family":"Vervoort","given":"Jeff"},{"family":"Kennedy","given":"Brian"}],"issued":{"date-parts":[["2023"]]}}}],"schema":"https://github.com/citation-style-language/schema/raw/master/csl-citation.json"} </w:instrText>
       </w:r>
       <w:r>
         <w:rPr>
@@ -1643,7 +2003,7 @@
           <w:szCs w:val="22"/>
           <w14:ligatures w14:val="none"/>
         </w:rPr>
-        <w:t>(Brennan et al., 2015; Campana, 1999; Capo et al., 1998)</w:t>
+        <w:t>(Brennan, Schindler, et al., 2019; Chittaro et al., 2023)</w:t>
       </w:r>
       <w:r>
         <w:rPr>
@@ -1655,221 +2015,7 @@
         </w:rPr>
         <w:fldChar w:fldCharType="end"/>
       </w:r>
-      <w:r>
-        <w:rPr>
-          <w:rFonts w:ascii="Garamond" w:eastAsia="Times New Roman" w:hAnsi="Garamond" w:cs="Times New Roman"/>
-          <w:kern w:val="0"/>
-          <w:sz w:val="22"/>
-          <w:szCs w:val="22"/>
-          <w14:ligatures w14:val="none"/>
-        </w:rPr>
-        <w:t xml:space="preserve">. </w:t>
-      </w:r>
-      <w:r>
-        <w:rPr>
-          <w:rFonts w:ascii="Garamond" w:eastAsia="Times New Roman" w:hAnsi="Garamond" w:cs="Times New Roman"/>
-          <w:kern w:val="0"/>
-          <w:sz w:val="22"/>
-          <w:szCs w:val="22"/>
-          <w14:ligatures w14:val="none"/>
-        </w:rPr>
-        <w:t xml:space="preserve">From these data, the </w:t>
-      </w:r>
-      <w:r>
-        <w:rPr>
-          <w:rFonts w:ascii="Garamond" w:eastAsia="Times New Roman" w:hAnsi="Garamond" w:cs="Times New Roman"/>
-          <w:kern w:val="0"/>
-          <w:sz w:val="22"/>
-          <w:szCs w:val="22"/>
-          <w14:ligatures w14:val="none"/>
-        </w:rPr>
-        <w:t xml:space="preserve">Sr87/86 value associated with the </w:t>
-      </w:r>
-      <w:r>
-        <w:rPr>
-          <w:rFonts w:ascii="Garamond" w:eastAsia="Times New Roman" w:hAnsi="Garamond" w:cs="Times New Roman"/>
-          <w:kern w:val="0"/>
-          <w:sz w:val="22"/>
-          <w:szCs w:val="22"/>
-          <w14:ligatures w14:val="none"/>
-        </w:rPr>
-        <w:t>natal freshwater rearing period was extracted by examining</w:t>
-      </w:r>
-      <w:r>
-        <w:rPr>
-          <w:rFonts w:ascii="Garamond" w:eastAsia="Times New Roman" w:hAnsi="Garamond" w:cs="Times New Roman"/>
-          <w:kern w:val="0"/>
-          <w:sz w:val="22"/>
-          <w:szCs w:val="22"/>
-          <w14:ligatures w14:val="none"/>
-        </w:rPr>
-        <w:t xml:space="preserve"> patterns of </w:t>
-      </w:r>
-      <w:r>
-        <w:rPr>
-          <w:rFonts w:ascii="Garamond" w:eastAsia="Times New Roman" w:hAnsi="Garamond" w:cs="Times New Roman"/>
-          <w:kern w:val="0"/>
-          <w:sz w:val="22"/>
-          <w:szCs w:val="22"/>
-          <w14:ligatures w14:val="none"/>
-        </w:rPr>
-        <w:t>change in Sr</w:t>
-      </w:r>
-      <w:r>
-        <w:rPr>
-          <w:rFonts w:ascii="Garamond" w:eastAsia="Times New Roman" w:hAnsi="Garamond" w:cs="Times New Roman"/>
-          <w:kern w:val="0"/>
-          <w:sz w:val="22"/>
-          <w:szCs w:val="22"/>
-          <w:vertAlign w:val="superscript"/>
-          <w14:ligatures w14:val="none"/>
-        </w:rPr>
-        <w:t>87</w:t>
-      </w:r>
-      <w:r>
-        <w:rPr>
-          <w:rFonts w:ascii="Garamond" w:eastAsia="Times New Roman" w:hAnsi="Garamond" w:cs="Times New Roman"/>
-          <w:kern w:val="0"/>
-          <w:sz w:val="22"/>
-          <w:szCs w:val="22"/>
-          <w14:ligatures w14:val="none"/>
-        </w:rPr>
-        <w:t>/Sr</w:t>
-      </w:r>
-      <w:r>
-        <w:rPr>
-          <w:rFonts w:ascii="Garamond" w:eastAsia="Times New Roman" w:hAnsi="Garamond" w:cs="Times New Roman"/>
-          <w:kern w:val="0"/>
-          <w:sz w:val="22"/>
-          <w:szCs w:val="22"/>
-          <w:vertAlign w:val="superscript"/>
-          <w14:ligatures w14:val="none"/>
-        </w:rPr>
-        <w:t>86</w:t>
-      </w:r>
-      <w:r>
-        <w:rPr>
-          <w:rFonts w:ascii="Garamond" w:eastAsia="Times New Roman" w:hAnsi="Garamond" w:cs="Times New Roman"/>
-          <w:kern w:val="0"/>
-          <w:sz w:val="22"/>
-          <w:szCs w:val="22"/>
-          <w14:ligatures w14:val="none"/>
-        </w:rPr>
-        <w:t xml:space="preserve"> and Sr</w:t>
-      </w:r>
-      <w:r>
-        <w:rPr>
-          <w:rFonts w:ascii="Garamond" w:eastAsia="Times New Roman" w:hAnsi="Garamond" w:cs="Times New Roman"/>
-          <w:kern w:val="0"/>
-          <w:sz w:val="22"/>
-          <w:szCs w:val="22"/>
-          <w:vertAlign w:val="superscript"/>
-          <w14:ligatures w14:val="none"/>
-        </w:rPr>
-        <w:t>88</w:t>
-      </w:r>
-      <w:r>
-        <w:rPr>
-          <w:rFonts w:ascii="Garamond" w:eastAsia="Times New Roman" w:hAnsi="Garamond" w:cs="Times New Roman"/>
-          <w:kern w:val="0"/>
-          <w:sz w:val="22"/>
-          <w:szCs w:val="22"/>
-          <w14:ligatures w14:val="none"/>
-        </w:rPr>
-        <w:t xml:space="preserve"> </w:t>
-      </w:r>
-      <w:r>
-        <w:rPr>
-          <w:rFonts w:ascii="Garamond" w:eastAsia="Times New Roman" w:hAnsi="Garamond" w:cs="Times New Roman"/>
-          <w:kern w:val="0"/>
-          <w:sz w:val="22"/>
-          <w:szCs w:val="22"/>
-          <w14:ligatures w14:val="none"/>
-        </w:rPr>
-        <w:t>between the core and freshwater region</w:t>
-      </w:r>
-      <w:r>
-        <w:rPr>
-          <w:rFonts w:ascii="Garamond" w:eastAsia="Times New Roman" w:hAnsi="Garamond" w:cs="Times New Roman"/>
-          <w:kern w:val="0"/>
-          <w:sz w:val="22"/>
-          <w:szCs w:val="22"/>
-          <w14:ligatures w14:val="none"/>
-        </w:rPr>
-        <w:t xml:space="preserve">, </w:t>
-      </w:r>
-      <w:r>
-        <w:rPr>
-          <w:rFonts w:ascii="Garamond" w:eastAsia="Times New Roman" w:hAnsi="Garamond" w:cs="Times New Roman"/>
-          <w:kern w:val="0"/>
-          <w:sz w:val="22"/>
-          <w:szCs w:val="22"/>
-          <w14:ligatures w14:val="none"/>
-        </w:rPr>
-        <w:t>morphological features of the otolith visible among the ablation path</w:t>
-      </w:r>
-      <w:r>
-        <w:rPr>
-          <w:rFonts w:ascii="Garamond" w:eastAsia="Times New Roman" w:hAnsi="Garamond" w:cs="Times New Roman"/>
-          <w:kern w:val="0"/>
-          <w:sz w:val="22"/>
-          <w:szCs w:val="22"/>
-          <w14:ligatures w14:val="none"/>
-        </w:rPr>
-        <w:t xml:space="preserve">, and known distances from the core to onset of the freshwater signal </w:t>
-      </w:r>
-      <w:r>
-        <w:rPr>
-          <w:rFonts w:ascii="Garamond" w:eastAsia="Times New Roman" w:hAnsi="Garamond" w:cs="Times New Roman"/>
-          <w:kern w:val="0"/>
-          <w:sz w:val="22"/>
-          <w:szCs w:val="22"/>
-          <w14:ligatures w14:val="none"/>
-        </w:rPr>
-        <w:fldChar w:fldCharType="begin"/>
-      </w:r>
-      <w:r>
-        <w:rPr>
-          <w:rFonts w:ascii="Garamond" w:eastAsia="Times New Roman" w:hAnsi="Garamond" w:cs="Times New Roman"/>
-          <w:kern w:val="0"/>
-          <w:sz w:val="22"/>
-          <w:szCs w:val="22"/>
-          <w14:ligatures w14:val="none"/>
-        </w:rPr>
-        <w:instrText xml:space="preserve"> ADDIN ZOTERO_ITEM CSL_CITATION {"citationID":"9Eo1mxW7","properties":{"formattedCitation":"(Brennan, Schindler, et al., 2019; Chittaro et al., 2023)","plainCitation":"(Brennan, Schindler, et al., 2019; Chittaro et al., 2023)","noteIndex":0},"citationItems":[{"id":3844,"uris":["http://zotero.org/users/8421274/items/RXD5IA9D"],"itemData":{"id":3844,"type":"article-journal","abstract":"Watersheds are complex mosaics of habitats whose conditions vary across space and time as landscape features filter overriding climate forcing, yet the extent to which the reliability of ecosystem services depends on these dynamics remains unknown. We quantified how shifting habitat mosaics are expressed across a range of spatial scales within a large, free-flowing river, and how they stabilize the production of Pacific salmon that support valuable fisheries. The strontium isotope records of ear stones (otoliths) show that the relative productivity of locations across the river network, as both natal- and juvenile-rearing habitat, varies widely among years and that this variability is expressed across a broad range of spatial scales, ultimately stabilizing the interannual production of fish at the scale of the entire basin.","container-title":"Science","DOI":"10.1126/science.aav4313","issue":"6442","note":"publisher: American Association for the Advancement of Science","page":"783-786","source":"science.org (Atypon)","title":"Shifting habitat mosaics and fish production across river basins","volume":"364","author":[{"family":"Brennan","given":"Sean R."},{"family":"Schindler","given":"Daniel E."},{"family":"Cline","given":"Timothy J."},{"family":"Walsworth","given":"Timothy E."},{"family":"Buck","given":"Greg"},{"family":"Fernandez","given":"Diego P."}],"issued":{"date-parts":[["2019"]]}}},{"id":4257,"uris":["http://zotero.org/users/8421274/items/TAJ7RSQZ"],"itemData":{"id":4257,"type":"article-journal","abstract":"Effective species management often requires understanding patterns of movement and habitat use. A common approach in identifying where individuals reside relies upon chemical tracers from the environment that are incorporated into an individual's tissues. For fish, isotopes in their otoliths, specifically the portion of their otolith formed during their larval stage, have been used to identify the natal origin. Complicating this work, however, is the fact that during this life stage, there is a shift in the source of isotopes deposited onto the growing otolith from maternally to environmentally derived. The objective of this study was to identify the portion of the otolith representing this transition to environmentally derived isotopes so as to accurately investigate questions of natal origin for a threatened population of fall Chinook salmon (Oncorhynchus tshawytscha). We exposed developing larvae to four treatments that differed in terms of their water strontium isotope ratio (87Sr/86Sr) and used change-point analysis of otolith 87Sr/86Sr and strontium to calcium ratio (Sr/Ca) to identify the otolith radius corresponding to the transition to environmentally derived isotopes. Our results indicated this transition occurred, on average, at 132 μm (87Sr/86Sr; ±50 μm standard deviation) and 127 μm (Sr/Ca; ±29 μm) from the otolith core, which corresponded to the developmental time between hatching and exogenous feeding. A substantial proportion of our otoliths (i.e., 61%) did not show convergence between otolith and water 87Sr/86Sr by the end of the 113-day experiment, which was likely due to the dietary contribution of marine-based feed. Therefore, we were unable to recommend an otolith radius to target for the purposes of reconstructing natal origin apart from being beyond approximately 130 μm.","container-title":"Ecology of Freshwater Fish","DOI":"10.1111/eff.12673","ISSN":"1600-0633","issue":"1","language":"en","license":"© 2022 John Wiley &amp; Sons Ltd. This article has been contributed to by U.S. Government employees and their work is in the public domain in the USA.","note":"_eprint: https://onlinelibrary.wiley.com/doi/pdf/10.1111/eff.12673","page":"107-119","source":"Wiley Online Library","title":"The incorporation of environmentally derived 87Sr/86Sr and Sr/Ca in early otolith formation of Chinook salmon","volume":"32","author":[{"family":"Chittaro","given":"Paul"},{"family":"Hegg","given":"Jens"},{"family":"Fuhrman","given":"Abby"},{"family":"Robichaux","given":"Devin"},{"family":"Doung","given":"Rothboury"},{"family":"Beckman","given":"Brian"},{"family":"Fisher","given":"Chris"},{"family":"Vervoort","given":"Jeff"},{"family":"Kennedy","given":"Brian"}],"issued":{"date-parts":[["2023"]]}}}],"schema":"https://github.com/citation-style-language/schema/raw/master/csl-citation.json"} </w:instrText>
-      </w:r>
-      <w:r>
-        <w:rPr>
-          <w:rFonts w:ascii="Garamond" w:eastAsia="Times New Roman" w:hAnsi="Garamond" w:cs="Times New Roman"/>
-          <w:kern w:val="0"/>
-          <w:sz w:val="22"/>
-          <w:szCs w:val="22"/>
-          <w14:ligatures w14:val="none"/>
-        </w:rPr>
-        <w:fldChar w:fldCharType="separate"/>
-      </w:r>
-      <w:r>
-        <w:rPr>
-          <w:rFonts w:ascii="Garamond" w:eastAsia="Times New Roman" w:hAnsi="Garamond" w:cs="Times New Roman"/>
-          <w:noProof/>
-          <w:kern w:val="0"/>
-          <w:sz w:val="22"/>
-          <w:szCs w:val="22"/>
-          <w14:ligatures w14:val="none"/>
-        </w:rPr>
-        <w:t>(Brennan, Schindler, et al., 2019; Chittaro et al., 2023)</w:t>
-      </w:r>
-      <w:r>
-        <w:rPr>
-          <w:rFonts w:ascii="Garamond" w:eastAsia="Times New Roman" w:hAnsi="Garamond" w:cs="Times New Roman"/>
-          <w:kern w:val="0"/>
-          <w:sz w:val="22"/>
-          <w:szCs w:val="22"/>
-          <w14:ligatures w14:val="none"/>
-        </w:rPr>
-        <w:fldChar w:fldCharType="end"/>
-      </w:r>
-      <w:ins w:id="3" w:author="Benjamin J. Makhlouf" w:date="2025-07-26T13:45:00Z" w16du:dateUtc="2025-07-26T20:45:00Z">
+      <w:ins w:id="2" w:author="Benjamin J. Makhlouf" w:date="2025-07-26T13:45:00Z" w16du:dateUtc="2025-07-26T20:45:00Z">
         <w:r>
           <w:rPr>
             <w:rFonts w:ascii="Garamond" w:eastAsia="Times New Roman" w:hAnsi="Garamond" w:cs="Times New Roman"/>
@@ -2051,7 +2197,7 @@
           <w:szCs w:val="22"/>
           <w14:ligatures w14:val="none"/>
         </w:rPr>
-        <w:t>(French et al., 2020)</w:t>
+        <w:t>French et al., 2020</w:t>
       </w:r>
       <w:r>
         <w:rPr>
@@ -2071,6 +2217,16 @@
           <w:szCs w:val="22"/>
           <w14:ligatures w14:val="none"/>
         </w:rPr>
+        <w:t xml:space="preserve"> </w:t>
+      </w:r>
+      <w:r>
+        <w:rPr>
+          <w:rFonts w:ascii="Garamond" w:eastAsia="Times New Roman" w:hAnsi="Garamond" w:cs="Times New Roman"/>
+          <w:kern w:val="0"/>
+          <w:sz w:val="22"/>
+          <w:szCs w:val="22"/>
+          <w14:ligatures w14:val="none"/>
+        </w:rPr>
         <w:t xml:space="preserve">, in which </w:t>
       </w:r>
       <w:r>
@@ -2164,6 +2320,26 @@
           <w14:ligatures w14:val="none"/>
         </w:rPr>
         <w:t xml:space="preserve"> and derived from water samples collected throughout the river basin </w:t>
+      </w:r>
+      <w:r>
+        <w:rPr>
+          <w:rFonts w:ascii="Garamond" w:eastAsia="Times New Roman" w:hAnsi="Garamond" w:cs="Times New Roman"/>
+          <w:kern w:val="0"/>
+          <w:sz w:val="22"/>
+          <w:szCs w:val="22"/>
+          <w14:ligatures w14:val="none"/>
+          <w:rPrChange w:id="3" w:author="Benjamin J. Makhlouf" w:date="2025-07-26T13:00:00Z" w16du:dateUtc="2025-07-26T20:00:00Z">
+            <w:rPr>
+              <w:rFonts w:ascii="Garamond" w:eastAsia="Times New Roman" w:hAnsi="Garamond" w:cs="Times New Roman"/>
+              <w:kern w:val="0"/>
+              <w:sz w:val="22"/>
+              <w:szCs w:val="22"/>
+              <w:highlight w:val="yellow"/>
+              <w14:ligatures w14:val="none"/>
+            </w:rPr>
+          </w:rPrChange>
+        </w:rPr>
+        <w:fldChar w:fldCharType="begin"/>
       </w:r>
       <w:r>
         <w:rPr>
@@ -2183,7 +2359,7 @@
             </w:rPr>
           </w:rPrChange>
         </w:rPr>
-        <w:fldChar w:fldCharType="begin"/>
+        <w:instrText xml:space="preserve"> ADDIN ZOTERO_ITEM CSL_CITATION {"citationID":"5Pp7WuA9","properties":{"formattedCitation":"(French et al., 2020)","plainCitation":"(French et al., 2020)","noteIndex":0},"citationItems":[{"id":1684,"uris":["http://zotero.org/users/8421274/items/M654PKRJ"],"itemData":{"id":1684,"type":"article-journal","abstract":"Riverine chemistry reflects both watershed conditions and instream processing, both of which vary across river networks, yet little is known about the scales at which watershed attributes regulate biogeochemical constituents. We used spatial stream network (SSN) models to quantify both watershed and instream effects on streamwater constituents in the Kuskokwim River (western Alaska), the largest free-flowing river in the United States. We assessed chemical constituents spanning from labile nutrients (nitrate [NO3−] and orthophosphate [PO43−]) to biologically and chemically conservative tracers (calcium [Ca2+], strontium [Sr2+], and Sr isotopes [87Sr/86Sr]). We also examined the behavior of dissolved organic carbon (DOC) relative to these constituents to understand whether bulk DOC behaved conservatively in a large boreal river network, where future changes in DOC and nutrient loading are expected under a shifting climate. We derived watershed spatial covariates comprising land cover, geology, and geomorphic characteristics at 14 different spatial extents based on stream order and relative to position in the river network to understand the effect of distant and proximal watershed attributes on streamwater constituents. For all constituents but 87Sr/86Sr, watershed attributes in low-order headwater catchments yielded the best predictive ability for streamwater constituent concentrations across the entire network. Spatial patterning for conservative tracers and bulk DOC showed strong spatial autocorrelation, whereas PO43− and NO3− exhibited spatial patchiness indicative of instream processing. Our work shows that headwater streams are disproportionately important contributors to network-wide biogeochemical constituents supporting aquatic food webs and that conservation and management of aquatic systems should include these small and often remote watershed areas.","container-title":"Journal of Geophysical Research: Biogeosciences","DOI":"10.1029/2020JG005851","ISSN":"2169-8961","issue":"12","language":"en","note":"_eprint: https://agupubs.onlinelibrary.wiley.com/doi/pdf/10.1029/2020JG005851","page":"e2020JG005851","source":"Wiley Online Library","title":"Headwater Catchments Govern Biogeochemistry in America's Largest Free-Flowing River Network","volume":"125","author":[{"family":"French","given":"David W."},{"family":"Schindler","given":"Daniel E."},{"family":"Brennan","given":"Sean R."},{"family":"Whited","given":"Diane"}],"issued":{"date-parts":[["2020"]]}}}],"schema":"https://github.com/citation-style-language/schema/raw/master/csl-citation.json"} </w:instrText>
       </w:r>
       <w:r>
         <w:rPr>
@@ -2203,11 +2379,12 @@
             </w:rPr>
           </w:rPrChange>
         </w:rPr>
-        <w:instrText xml:space="preserve"> ADDIN ZOTERO_ITEM CSL_CITATION {"citationID":"5Pp7WuA9","properties":{"formattedCitation":"(French et al., 2020)","plainCitation":"(French et al., 2020)","noteIndex":0},"citationItems":[{"id":1684,"uris":["http://zotero.org/users/8421274/items/M654PKRJ"],"itemData":{"id":1684,"type":"article-journal","abstract":"Riverine chemistry reflects both watershed conditions and instream processing, both of which vary across river networks, yet little is known about the scales at which watershed attributes regulate biogeochemical constituents. We used spatial stream network (SSN) models to quantify both watershed and instream effects on streamwater constituents in the Kuskokwim River (western Alaska), the largest free-flowing river in the United States. We assessed chemical constituents spanning from labile nutrients (nitrate [NO3−] and orthophosphate [PO43−]) to biologically and chemically conservative tracers (calcium [Ca2+], strontium [Sr2+], and Sr isotopes [87Sr/86Sr]). We also examined the behavior of dissolved organic carbon (DOC) relative to these constituents to understand whether bulk DOC behaved conservatively in a large boreal river network, where future changes in DOC and nutrient loading are expected under a shifting climate. We derived watershed spatial covariates comprising land cover, geology, and geomorphic characteristics at 14 different spatial extents based on stream order and relative to position in the river network to understand the effect of distant and proximal watershed attributes on streamwater constituents. For all constituents but 87Sr/86Sr, watershed attributes in low-order headwater catchments yielded the best predictive ability for streamwater constituent concentrations across the entire network. Spatial patterning for conservative tracers and bulk DOC showed strong spatial autocorrelation, whereas PO43− and NO3− exhibited spatial patchiness indicative of instream processing. Our work shows that headwater streams are disproportionately important contributors to network-wide biogeochemical constituents supporting aquatic food webs and that conservation and management of aquatic systems should include these small and often remote watershed areas.","container-title":"Journal of Geophysical Research: Biogeosciences","DOI":"10.1029/2020JG005851","ISSN":"2169-8961","issue":"12","language":"en","note":"_eprint: https://agupubs.onlinelibrary.wiley.com/doi/pdf/10.1029/2020JG005851","page":"e2020JG005851","source":"Wiley Online Library","title":"Headwater Catchments Govern Biogeochemistry in America's Largest Free-Flowing River Network","volume":"125","author":[{"family":"French","given":"David W."},{"family":"Schindler","given":"Daniel E."},{"family":"Brennan","given":"Sean R."},{"family":"Whited","given":"Diane"}],"issued":{"date-parts":[["2020"]]}}}],"schema":"https://github.com/citation-style-language/schema/raw/master/csl-citation.json"} </w:instrText>
-      </w:r>
-      <w:r>
-        <w:rPr>
-          <w:rFonts w:ascii="Garamond" w:eastAsia="Times New Roman" w:hAnsi="Garamond" w:cs="Times New Roman"/>
+        <w:fldChar w:fldCharType="separate"/>
+      </w:r>
+      <w:r>
+        <w:rPr>
+          <w:rFonts w:ascii="Garamond" w:eastAsia="Times New Roman" w:hAnsi="Garamond" w:cs="Times New Roman"/>
+          <w:noProof/>
           <w:kern w:val="0"/>
           <w:sz w:val="22"/>
           <w:szCs w:val="22"/>
@@ -2215,6 +2392,7 @@
           <w:rPrChange w:id="6" w:author="Benjamin J. Makhlouf" w:date="2025-07-26T13:00:00Z" w16du:dateUtc="2025-07-26T20:00:00Z">
             <w:rPr>
               <w:rFonts w:ascii="Garamond" w:eastAsia="Times New Roman" w:hAnsi="Garamond" w:cs="Times New Roman"/>
+              <w:noProof/>
               <w:kern w:val="0"/>
               <w:sz w:val="22"/>
               <w:szCs w:val="22"/>
@@ -2223,7 +2401,18 @@
             </w:rPr>
           </w:rPrChange>
         </w:rPr>
-        <w:fldChar w:fldCharType="separate"/>
+        <w:t>(</w:t>
+      </w:r>
+      <w:r>
+        <w:rPr>
+          <w:rFonts w:ascii="Garamond" w:eastAsia="Times New Roman" w:hAnsi="Garamond" w:cs="Times New Roman"/>
+          <w:noProof/>
+          <w:kern w:val="0"/>
+          <w:sz w:val="22"/>
+          <w:szCs w:val="22"/>
+          <w14:ligatures w14:val="none"/>
+        </w:rPr>
+        <w:t xml:space="preserve"> </w:t>
       </w:r>
       <w:r>
         <w:rPr>
@@ -2245,7 +2434,18 @@
             </w:rPr>
           </w:rPrChange>
         </w:rPr>
-        <w:t>(French et al., 2020</w:t>
+        <w:t>N = 120</w:t>
+      </w:r>
+      <w:r>
+        <w:rPr>
+          <w:rFonts w:ascii="Garamond" w:eastAsia="Times New Roman" w:hAnsi="Garamond" w:cs="Times New Roman"/>
+          <w:noProof/>
+          <w:kern w:val="0"/>
+          <w:sz w:val="22"/>
+          <w:szCs w:val="22"/>
+          <w14:ligatures w14:val="none"/>
+        </w:rPr>
+        <w:t xml:space="preserve">, </w:t>
       </w:r>
       <w:r>
         <w:rPr>
@@ -2267,38 +2467,16 @@
             </w:rPr>
           </w:rPrChange>
         </w:rPr>
-        <w:t>, N = 120</w:t>
-      </w:r>
-      <w:r>
-        <w:rPr>
-          <w:rFonts w:ascii="Garamond" w:eastAsia="Times New Roman" w:hAnsi="Garamond" w:cs="Times New Roman"/>
-          <w:noProof/>
+        <w:t>French et al., 2020)</w:t>
+      </w:r>
+      <w:r>
+        <w:rPr>
+          <w:rFonts w:ascii="Garamond" w:eastAsia="Times New Roman" w:hAnsi="Garamond" w:cs="Times New Roman"/>
           <w:kern w:val="0"/>
           <w:sz w:val="22"/>
           <w:szCs w:val="22"/>
           <w14:ligatures w14:val="none"/>
           <w:rPrChange w:id="9" w:author="Benjamin J. Makhlouf" w:date="2025-07-26T13:00:00Z" w16du:dateUtc="2025-07-26T20:00:00Z">
-            <w:rPr>
-              <w:rFonts w:ascii="Garamond" w:eastAsia="Times New Roman" w:hAnsi="Garamond" w:cs="Times New Roman"/>
-              <w:noProof/>
-              <w:kern w:val="0"/>
-              <w:sz w:val="22"/>
-              <w:szCs w:val="22"/>
-              <w:highlight w:val="yellow"/>
-              <w14:ligatures w14:val="none"/>
-            </w:rPr>
-          </w:rPrChange>
-        </w:rPr>
-        <w:t>)</w:t>
-      </w:r>
-      <w:r>
-        <w:rPr>
-          <w:rFonts w:ascii="Garamond" w:eastAsia="Times New Roman" w:hAnsi="Garamond" w:cs="Times New Roman"/>
-          <w:kern w:val="0"/>
-          <w:sz w:val="22"/>
-          <w:szCs w:val="22"/>
-          <w14:ligatures w14:val="none"/>
-          <w:rPrChange w:id="10" w:author="Benjamin J. Makhlouf" w:date="2025-07-26T13:00:00Z" w16du:dateUtc="2025-07-26T20:00:00Z">
             <w:rPr>
               <w:rFonts w:ascii="Garamond" w:eastAsia="Times New Roman" w:hAnsi="Garamond" w:cs="Times New Roman"/>
               <w:kern w:val="0"/>
@@ -2427,7 +2605,126 @@
           <w:sz w:val="22"/>
           <w:szCs w:val="22"/>
         </w:rPr>
-        <w:t xml:space="preserve"> values and their associated uncertainties for roughly every ~1km stretch of tributaries across the basin </w:t>
+        <w:t xml:space="preserve"> </w:t>
+      </w:r>
+      <w:r>
+        <w:rPr>
+          <w:rFonts w:ascii="Garamond" w:hAnsi="Garamond" w:cs="Times New Roman"/>
+          <w:sz w:val="22"/>
+          <w:szCs w:val="22"/>
+        </w:rPr>
+        <w:t>ratios</w:t>
+      </w:r>
+      <w:r>
+        <w:rPr>
+          <w:rFonts w:ascii="Garamond" w:hAnsi="Garamond" w:cs="Times New Roman"/>
+          <w:sz w:val="22"/>
+          <w:szCs w:val="22"/>
+        </w:rPr>
+        <w:t xml:space="preserve"> and associated uncertainties for roughly every ~1km stretch of tributaries across the basin </w:t>
+      </w:r>
+      <w:commentRangeStart w:id="10"/>
+      <w:r>
+        <w:rPr>
+          <w:rFonts w:ascii="Garamond" w:hAnsi="Garamond" w:cs="Times New Roman"/>
+          <w:sz w:val="22"/>
+          <w:szCs w:val="22"/>
+        </w:rPr>
+        <w:t xml:space="preserve">(Figure </w:t>
+      </w:r>
+      <w:r>
+        <w:rPr>
+          <w:rFonts w:ascii="Garamond" w:hAnsi="Garamond" w:cs="Times New Roman"/>
+          <w:sz w:val="22"/>
+          <w:szCs w:val="22"/>
+        </w:rPr>
+        <w:t>1</w:t>
+      </w:r>
+      <w:r>
+        <w:rPr>
+          <w:rFonts w:ascii="Garamond" w:hAnsi="Garamond" w:cs="Times New Roman"/>
+          <w:sz w:val="22"/>
+          <w:szCs w:val="22"/>
+        </w:rPr>
+        <w:t>)</w:t>
+      </w:r>
+      <w:r>
+        <w:rPr>
+          <w:rFonts w:ascii="Garamond" w:eastAsia="Times New Roman" w:hAnsi="Garamond" w:cs="Times New Roman"/>
+          <w:kern w:val="0"/>
+          <w:sz w:val="22"/>
+          <w:szCs w:val="22"/>
+          <w14:ligatures w14:val="none"/>
+        </w:rPr>
+        <w:t xml:space="preserve"> </w:t>
+      </w:r>
+      <w:commentRangeEnd w:id="10"/>
+      <w:r>
+        <w:rPr>
+          <w:rStyle w:val="CommentReference"/>
+        </w:rPr>
+        <w:commentReference w:id="10"/>
+      </w:r>
+      <w:r>
+        <w:rPr>
+          <w:rFonts w:ascii="Garamond" w:eastAsia="Times New Roman" w:hAnsi="Garamond" w:cs="Times New Roman"/>
+          <w:kern w:val="0"/>
+          <w:sz w:val="22"/>
+          <w:szCs w:val="22"/>
+          <w14:ligatures w14:val="none"/>
+        </w:rPr>
+        <w:fldChar w:fldCharType="begin"/>
+      </w:r>
+      <w:r>
+        <w:rPr>
+          <w:rFonts w:ascii="Garamond" w:eastAsia="Times New Roman" w:hAnsi="Garamond" w:cs="Times New Roman"/>
+          <w:kern w:val="0"/>
+          <w:sz w:val="22"/>
+          <w:szCs w:val="22"/>
+          <w14:ligatures w14:val="none"/>
+        </w:rPr>
+        <w:instrText xml:space="preserve"> ADDIN ZOTERO_ITEM CSL_CITATION {"citationID":"M10Aqb9z","properties":{"formattedCitation":"(Brennan et al., 2016; Ver Hoef &amp; Peterson, 2010)","plainCitation":"(Brennan et al., 2016; Ver Hoef &amp; Peterson, 2010)","noteIndex":0},"citationItems":[{"id":2315,"uris":["http://zotero.org/users/8421274/items/Q4IUGSIX"],"itemData":{"id":2315,"type":"article-journal","abstract":"A critical challenge for the Earth sciences is to trace the transport and flux of matter within and among aquatic, terrestrial, and atmospheric systems. Robust descriptions of isotopic patterns across space and time, called “isoscapes,” form the basis of a rapidly growing and wide-ranging body of research aimed at quantifying connectivity within and among Earth's systems. However, isoscapes of rivers have been limited by conventional Euclidean approaches in geostatistics and the lack of a quantitative framework to apportion the influence of processes driven by landscape features versus in-stream phenomena. Here we demonstrate how dendritic network models substantially improve the accuracy of isoscapes of strontium isotopes and partition the influence of hydrologic transport versus local geologic features on strontium isotope ratios in a large Alaska river. This work illustrates the analytical power of dendritic network models for the field of isotope biogeochemistry, particularly for provenance studies of modern and ancient animals.","container-title":"Geophysical Research Letters","DOI":"10.1002/2016GL068904","ISSN":"1944-8007","issue":"10","language":"en","note":"_eprint: https://onlinelibrary.wiley.com/doi/pdf/10.1002/2016GL068904","page":"5043-5051","source":"Wiley Online Library","title":"Dendritic network models: Improving isoscapes and quantifying influence of landscape and in-stream processes on strontium isotopes in rivers","title-short":"Dendritic network models","volume":"43","author":[{"family":"Brennan","given":"Sean R."},{"family":"Torgersen","given":"Christian E."},{"family":"Hollenbeck","given":"Jeff P."},{"family":"Fernandez","given":"Diego P."},{"family":"Jensen","given":"Carrie K."},{"family":"Schindler","given":"Daniel E."}],"issued":{"date-parts":[["2016"]]}}},{"id":4769,"uris":["http://zotero.org/users/8421274/items/XBJELDI4"],"itemData":{"id":4769,"type":"article-journal","container-title":"Journal of the American Statistical Association","DOI":"10.1198/jasa.2009.ap08248","ISSN":"0162-1459, 1537-274X","issue":"489","journalAbbreviation":"Journal of the American Statistical Association","language":"en","page":"6-18","source":"DOI.org (Crossref)","title":"A Moving Average Approach for Spatial Statistical Models of Stream Networks","volume":"105","author":[{"family":"Ver Hoef","given":"Jay M."},{"family":"Peterson","given":"Erin E."}],"issued":{"date-parts":[["2010",3,1]]}}}],"schema":"https://github.com/citation-style-language/schema/raw/master/csl-citation.json"} </w:instrText>
+      </w:r>
+      <w:r>
+        <w:rPr>
+          <w:rFonts w:ascii="Garamond" w:eastAsia="Times New Roman" w:hAnsi="Garamond" w:cs="Times New Roman"/>
+          <w:kern w:val="0"/>
+          <w:sz w:val="22"/>
+          <w:szCs w:val="22"/>
+          <w14:ligatures w14:val="none"/>
+        </w:rPr>
+        <w:fldChar w:fldCharType="separate"/>
+      </w:r>
+      <w:r>
+        <w:rPr>
+          <w:rFonts w:ascii="Garamond" w:eastAsia="Times New Roman" w:hAnsi="Garamond" w:cs="Times New Roman"/>
+          <w:noProof/>
+          <w:kern w:val="0"/>
+          <w:sz w:val="22"/>
+          <w:szCs w:val="22"/>
+          <w14:ligatures w14:val="none"/>
+        </w:rPr>
+        <w:t>(Brennan et al., 2016; Ver Hoef &amp; Peterson, 2010)</w:t>
+      </w:r>
+      <w:r>
+        <w:rPr>
+          <w:rFonts w:ascii="Garamond" w:eastAsia="Times New Roman" w:hAnsi="Garamond" w:cs="Times New Roman"/>
+          <w:kern w:val="0"/>
+          <w:sz w:val="22"/>
+          <w:szCs w:val="22"/>
+          <w14:ligatures w14:val="none"/>
+        </w:rPr>
+        <w:fldChar w:fldCharType="end"/>
+      </w:r>
+      <w:r>
+        <w:rPr>
+          <w:rFonts w:ascii="Garamond" w:eastAsia="Times New Roman" w:hAnsi="Garamond" w:cs="Times New Roman"/>
+          <w:kern w:val="0"/>
+          <w:sz w:val="22"/>
+          <w:szCs w:val="22"/>
+          <w14:ligatures w14:val="none"/>
+        </w:rPr>
+        <w:t xml:space="preserve">. </w:t>
       </w:r>
       <w:commentRangeStart w:id="11"/>
       <w:r>
@@ -2436,7 +2733,7 @@
           <w:sz w:val="22"/>
           <w:szCs w:val="22"/>
         </w:rPr>
-        <w:t xml:space="preserve">(Figure </w:t>
+        <w:t>To prevent over-assignment to tributaries with exceptionally low prediction error</w:t>
       </w:r>
       <w:r>
         <w:rPr>
@@ -2444,7 +2741,7 @@
           <w:sz w:val="22"/>
           <w:szCs w:val="22"/>
         </w:rPr>
-        <w:t>1</w:t>
+        <w:t xml:space="preserve"> </w:t>
       </w:r>
       <w:r>
         <w:rPr>
@@ -2452,15 +2749,21 @@
           <w:sz w:val="22"/>
           <w:szCs w:val="22"/>
         </w:rPr>
-        <w:t>)</w:t>
-      </w:r>
-      <w:r>
-        <w:rPr>
-          <w:rFonts w:ascii="Garamond" w:eastAsia="Times New Roman" w:hAnsi="Garamond" w:cs="Times New Roman"/>
-          <w:kern w:val="0"/>
-          <w:sz w:val="22"/>
-          <w:szCs w:val="22"/>
-          <w14:ligatures w14:val="none"/>
+        <w:t>minimum error values were constrained to 0.0006</w:t>
+      </w:r>
+      <w:r>
+        <w:rPr>
+          <w:rFonts w:ascii="Garamond" w:hAnsi="Garamond" w:cs="Times New Roman"/>
+          <w:sz w:val="22"/>
+          <w:szCs w:val="22"/>
+        </w:rPr>
+        <w:t xml:space="preserve"> and above.</w:t>
+      </w:r>
+      <w:r>
+        <w:rPr>
+          <w:rFonts w:ascii="Garamond" w:hAnsi="Garamond" w:cs="Times New Roman"/>
+          <w:sz w:val="22"/>
+          <w:szCs w:val="22"/>
         </w:rPr>
         <w:t xml:space="preserve"> </w:t>
       </w:r>
@@ -2473,73 +2776,11 @@
       </w:r>
       <w:r>
         <w:rPr>
-          <w:rFonts w:ascii="Garamond" w:eastAsia="Times New Roman" w:hAnsi="Garamond" w:cs="Times New Roman"/>
-          <w:kern w:val="0"/>
-          <w:sz w:val="22"/>
-          <w:szCs w:val="22"/>
-          <w14:ligatures w14:val="none"/>
-        </w:rPr>
-        <w:fldChar w:fldCharType="begin"/>
-      </w:r>
-      <w:r>
-        <w:rPr>
-          <w:rFonts w:ascii="Garamond" w:eastAsia="Times New Roman" w:hAnsi="Garamond" w:cs="Times New Roman"/>
-          <w:kern w:val="0"/>
-          <w:sz w:val="22"/>
-          <w:szCs w:val="22"/>
-          <w14:ligatures w14:val="none"/>
-        </w:rPr>
-        <w:instrText xml:space="preserve"> ADDIN ZOTERO_ITEM CSL_CITATION {"citationID":"a4pXqHFf","properties":{"formattedCitation":"(Ver Hoef &amp; Peterson, 2010)","plainCitation":"(Ver Hoef &amp; Peterson, 2010)","noteIndex":0},"citationItems":[{"id":4769,"uris":["http://zotero.org/users/8421274/items/XBJELDI4"],"itemData":{"id":4769,"type":"article-journal","container-title":"Journal of the American Statistical Association","DOI":"10.1198/jasa.2009.ap08248","ISSN":"0162-1459, 1537-274X","issue":"489","journalAbbreviation":"Journal of the American Statistical Association","language":"en","page":"6-18","source":"DOI.org (Crossref)","title":"A Moving Average Approach for Spatial Statistical Models of Stream Networks","volume":"105","author":[{"family":"Ver Hoef","given":"Jay M."},{"family":"Peterson","given":"Erin E."}],"issued":{"date-parts":[["2010",3,1]]}}}],"schema":"https://github.com/citation-style-language/schema/raw/master/csl-citation.json"} </w:instrText>
-      </w:r>
-      <w:r>
-        <w:rPr>
-          <w:rFonts w:ascii="Garamond" w:eastAsia="Times New Roman" w:hAnsi="Garamond" w:cs="Times New Roman"/>
-          <w:kern w:val="0"/>
-          <w:sz w:val="22"/>
-          <w:szCs w:val="22"/>
-          <w14:ligatures w14:val="none"/>
-        </w:rPr>
-        <w:fldChar w:fldCharType="separate"/>
-      </w:r>
-      <w:r>
-        <w:rPr>
-          <w:rFonts w:ascii="Garamond" w:eastAsia="Times New Roman" w:hAnsi="Garamond" w:cs="Times New Roman"/>
-          <w:noProof/>
-          <w:kern w:val="0"/>
-          <w:sz w:val="22"/>
-          <w:szCs w:val="22"/>
-          <w14:ligatures w14:val="none"/>
-        </w:rPr>
-        <w:t>(Ver Hoef &amp; Peterson, 2010)</w:t>
-      </w:r>
-      <w:r>
-        <w:rPr>
-          <w:rFonts w:ascii="Garamond" w:eastAsia="Times New Roman" w:hAnsi="Garamond" w:cs="Times New Roman"/>
-          <w:kern w:val="0"/>
-          <w:sz w:val="22"/>
-          <w:szCs w:val="22"/>
-          <w14:ligatures w14:val="none"/>
-        </w:rPr>
-        <w:fldChar w:fldCharType="end"/>
-      </w:r>
-      <w:r>
-        <w:rPr>
-          <w:rFonts w:ascii="Garamond" w:eastAsia="Times New Roman" w:hAnsi="Garamond" w:cs="Times New Roman"/>
-          <w:kern w:val="0"/>
-          <w:sz w:val="22"/>
-          <w:szCs w:val="22"/>
-          <w14:ligatures w14:val="none"/>
-        </w:rPr>
-        <w:t xml:space="preserve">. </w:t>
-      </w:r>
-      <w:commentRangeStart w:id="12"/>
-      <w:r>
-        <w:rPr>
           <w:rFonts w:ascii="Garamond" w:hAnsi="Garamond" w:cs="Times New Roman"/>
           <w:sz w:val="22"/>
           <w:szCs w:val="22"/>
         </w:rPr>
-        <w:t>To prevent over-assignment to tributaries with exceptionally low prediction error</w:t>
+        <w:t xml:space="preserve">This threshold was selected </w:t>
       </w:r>
       <w:r>
         <w:rPr>
@@ -2547,91 +2788,16 @@
           <w:sz w:val="22"/>
           <w:szCs w:val="22"/>
         </w:rPr>
-        <w:t xml:space="preserve"> </w:t>
-      </w:r>
-      <w:r>
-        <w:rPr>
-          <w:rFonts w:ascii="Garamond" w:hAnsi="Garamond" w:cs="Times New Roman"/>
-          <w:sz w:val="22"/>
-          <w:szCs w:val="22"/>
-        </w:rPr>
-        <w:t>minimum error values were constrained to 0.0006</w:t>
-      </w:r>
-      <w:r>
-        <w:rPr>
-          <w:rFonts w:ascii="Garamond" w:hAnsi="Garamond" w:cs="Times New Roman"/>
-          <w:sz w:val="22"/>
-          <w:szCs w:val="22"/>
-        </w:rPr>
-        <w:t xml:space="preserve"> and above.</w:t>
-      </w:r>
-      <w:r>
-        <w:rPr>
-          <w:rFonts w:ascii="Garamond" w:hAnsi="Garamond" w:cs="Times New Roman"/>
-          <w:sz w:val="22"/>
-          <w:szCs w:val="22"/>
-        </w:rPr>
-        <w:t xml:space="preserve"> </w:t>
-      </w:r>
-      <w:commentRangeEnd w:id="12"/>
-      <w:r>
-        <w:rPr>
-          <w:rStyle w:val="CommentReference"/>
-        </w:rPr>
-        <w:commentReference w:id="12"/>
-      </w:r>
-      <w:r>
-        <w:rPr>
-          <w:rFonts w:ascii="Garamond" w:hAnsi="Garamond" w:cs="Times New Roman"/>
-          <w:sz w:val="22"/>
-          <w:szCs w:val="22"/>
-        </w:rPr>
-        <w:t>This threshold was selected through</w:t>
-      </w:r>
-      <w:r>
-        <w:rPr>
-          <w:rFonts w:ascii="Garamond" w:hAnsi="Garamond" w:cs="Times New Roman"/>
-          <w:sz w:val="22"/>
-          <w:szCs w:val="22"/>
-        </w:rPr>
-        <w:t xml:space="preserve"> a</w:t>
-      </w:r>
-      <w:r>
-        <w:rPr>
-          <w:rFonts w:ascii="Garamond" w:hAnsi="Garamond" w:cs="Times New Roman"/>
-          <w:sz w:val="22"/>
-          <w:szCs w:val="22"/>
-        </w:rPr>
-        <w:t xml:space="preserve"> systematic evaluation to minimize assignments driven primarily by uncertainty differences rather than isotopic similarity</w:t>
-      </w:r>
-      <w:r>
-        <w:rPr>
-          <w:rFonts w:ascii="Garamond" w:hAnsi="Garamond" w:cs="Times New Roman"/>
-          <w:sz w:val="22"/>
-          <w:szCs w:val="22"/>
-        </w:rPr>
-        <w:t xml:space="preserve"> </w:t>
-      </w:r>
-      <w:r>
-        <w:rPr>
-          <w:rFonts w:ascii="Garamond" w:hAnsi="Garamond" w:cs="Times New Roman"/>
-          <w:sz w:val="22"/>
-          <w:szCs w:val="22"/>
-        </w:rPr>
-        <w:t>while preserving broad-scale production patterns across the basin</w:t>
+        <w:t xml:space="preserve">by visually examining the histogram for a cutoff which adjusted the error values for a small number of exceedingly low error tributaries while maintaining the general trend of uncertainty resulting from SSN model fit. </w:t>
       </w:r>
     </w:p>
     <w:p>
       <w:pPr>
         <w:spacing w:before="100" w:beforeAutospacing="1" w:after="100" w:afterAutospacing="1" w:line="480" w:lineRule="auto"/>
         <w:rPr>
-          <w:rFonts w:ascii="Garamond" w:eastAsia="Times New Roman" w:hAnsi="Garamond" w:cs="Times New Roman"/>
-          <w:b/>
-          <w:bCs/>
-          <w:kern w:val="0"/>
-          <w:sz w:val="22"/>
-          <w:szCs w:val="22"/>
-          <w14:ligatures w14:val="none"/>
+          <w:rFonts w:ascii="Garamond" w:hAnsi="Garamond" w:cs="Times New Roman"/>
+          <w:sz w:val="22"/>
+          <w:szCs w:val="22"/>
         </w:rPr>
       </w:pPr>
       <w:r>
@@ -3684,54 +3850,47 @@
           <w:rFonts w:ascii="Garamond" w:hAnsi="Garamond"/>
           <w:sz w:val="22"/>
           <w:szCs w:val="22"/>
-          <w:highlight w:val="yellow"/>
-        </w:rPr>
-        <w:t>(</w:t>
-      </w:r>
-      <w:r>
-        <w:rPr>
-          <w:rFonts w:ascii="Garamond" w:hAnsi="Garamond"/>
-          <w:sz w:val="22"/>
-          <w:szCs w:val="22"/>
-          <w:highlight w:val="yellow"/>
-        </w:rPr>
-        <w:t>Quinn</w:t>
-      </w:r>
-      <w:del w:id="13" w:author="Benjamin J. Makhlouf" w:date="2025-07-26T11:29:00Z" w16du:dateUtc="2025-07-26T18:29:00Z">
-        <w:r>
-          <w:rPr>
-            <w:rFonts w:ascii="Garamond" w:hAnsi="Garamond"/>
-            <w:sz w:val="22"/>
-            <w:szCs w:val="22"/>
-            <w:highlight w:val="yellow"/>
-          </w:rPr>
-          <w:delText xml:space="preserve"> </w:delText>
-        </w:r>
-      </w:del>
-      <w:r>
-        <w:rPr>
-          <w:rFonts w:ascii="Garamond" w:hAnsi="Garamond"/>
-          <w:sz w:val="22"/>
-          <w:szCs w:val="22"/>
-          <w:highlight w:val="yellow"/>
-        </w:rPr>
-        <w:t>, 2018</w:t>
-      </w:r>
-      <w:r>
-        <w:rPr>
-          <w:rFonts w:ascii="Garamond" w:hAnsi="Garamond"/>
-          <w:sz w:val="22"/>
-          <w:szCs w:val="22"/>
-          <w:highlight w:val="yellow"/>
-        </w:rPr>
-        <w:t>)</w:t>
-      </w:r>
-      <w:r>
-        <w:rPr>
-          <w:rFonts w:ascii="Garamond" w:hAnsi="Garamond"/>
-          <w:sz w:val="22"/>
-          <w:szCs w:val="22"/>
-          <w:highlight w:val="yellow"/>
+        </w:rPr>
+        <w:fldChar w:fldCharType="begin"/>
+      </w:r>
+      <w:r>
+        <w:rPr>
+          <w:rFonts w:ascii="Garamond" w:hAnsi="Garamond"/>
+          <w:sz w:val="22"/>
+          <w:szCs w:val="22"/>
+        </w:rPr>
+        <w:instrText xml:space="preserve"> ADDIN ZOTERO_ITEM CSL_CITATION {"citationID":"hf3x3enX","properties":{"formattedCitation":"(Quinn, 2018)","plainCitation":"(Quinn, 2018)","noteIndex":0},"citationItems":[{"id":5568,"uris":["http://zotero.org/users/8421274/items/TBWE7PX7"],"itemData":{"id":5568,"type":"book","publisher":"American Fisheries Society, University of Washington Press","title":"The Behavior and Ecology of Pacific Salmon and Trout","author":[{"family":"Quinn","given":"Thomas P"}],"issued":{"date-parts":[["2018",10]]}}}],"schema":"https://github.com/citation-style-language/schema/raw/master/csl-citation.json"} </w:instrText>
+      </w:r>
+      <w:r>
+        <w:rPr>
+          <w:rFonts w:ascii="Garamond" w:hAnsi="Garamond"/>
+          <w:sz w:val="22"/>
+          <w:szCs w:val="22"/>
+        </w:rPr>
+        <w:fldChar w:fldCharType="separate"/>
+      </w:r>
+      <w:r>
+        <w:rPr>
+          <w:rFonts w:ascii="Garamond" w:hAnsi="Garamond"/>
+          <w:noProof/>
+          <w:sz w:val="22"/>
+          <w:szCs w:val="22"/>
+        </w:rPr>
+        <w:t>(Quinn, 2018)</w:t>
+      </w:r>
+      <w:r>
+        <w:rPr>
+          <w:rFonts w:ascii="Garamond" w:hAnsi="Garamond"/>
+          <w:sz w:val="22"/>
+          <w:szCs w:val="22"/>
+        </w:rPr>
+        <w:fldChar w:fldCharType="end"/>
+      </w:r>
+      <w:r>
+        <w:rPr>
+          <w:rFonts w:ascii="Garamond" w:hAnsi="Garamond"/>
+          <w:sz w:val="22"/>
+          <w:szCs w:val="22"/>
         </w:rPr>
         <w:t>.</w:t>
       </w:r>
@@ -3805,68 +3964,7 @@
           <w:szCs w:val="22"/>
           <w14:ligatures w14:val="none"/>
         </w:rPr>
-        <w:t xml:space="preserve">) was used to exclude regions below </w:t>
-      </w:r>
-      <w:r>
-        <w:rPr>
-          <w:rFonts w:ascii="Garamond" w:eastAsia="Times New Roman" w:hAnsi="Garamond" w:cs="Times New Roman"/>
-          <w:kern w:val="0"/>
-          <w:sz w:val="22"/>
-          <w:szCs w:val="22"/>
-          <w14:ligatures w14:val="none"/>
-          <w:rPrChange w:id="14" w:author="Benjamin J. Makhlouf" w:date="2025-07-26T13:48:00Z" w16du:dateUtc="2025-07-26T20:48:00Z">
-            <w:rPr>
-              <w:rFonts w:ascii="Garamond" w:eastAsia="Times New Roman" w:hAnsi="Garamond" w:cs="Times New Roman"/>
-              <w:kern w:val="0"/>
-              <w:sz w:val="22"/>
-              <w:szCs w:val="22"/>
-              <w:highlight w:val="yellow"/>
-              <w14:ligatures w14:val="none"/>
-            </w:rPr>
-          </w:rPrChange>
-        </w:rPr>
-        <w:t>a threshold contributing slope value</w:t>
-      </w:r>
-      <w:r>
-        <w:rPr>
-          <w:rFonts w:ascii="Garamond" w:eastAsia="Times New Roman" w:hAnsi="Garamond" w:cs="Times New Roman"/>
-          <w:kern w:val="0"/>
-          <w:sz w:val="22"/>
-          <w:szCs w:val="22"/>
-          <w14:ligatures w14:val="none"/>
-        </w:rPr>
-        <w:t xml:space="preserve"> of </w:t>
-      </w:r>
-      <w:r>
-        <w:rPr>
-          <w:rFonts w:ascii="Garamond" w:eastAsia="Times New Roman" w:hAnsi="Garamond" w:cs="Times New Roman"/>
-          <w:kern w:val="0"/>
-          <w:sz w:val="22"/>
-          <w:szCs w:val="22"/>
-          <w:highlight w:val="yellow"/>
-          <w14:ligatures w14:val="none"/>
-        </w:rPr>
-        <w:t>_____</w:t>
-      </w:r>
-      <w:r>
-        <w:rPr>
-          <w:rFonts w:ascii="Garamond" w:eastAsia="Times New Roman" w:hAnsi="Garamond" w:cs="Times New Roman"/>
-          <w:kern w:val="0"/>
-          <w:sz w:val="22"/>
-          <w:szCs w:val="22"/>
-          <w14:ligatures w14:val="none"/>
-        </w:rPr>
-        <w:t>,</w:t>
-      </w:r>
-      <w:r>
-        <w:rPr>
-          <w:rFonts w:ascii="Garamond" w:eastAsia="Times New Roman" w:hAnsi="Garamond" w:cs="Times New Roman"/>
-          <w:kern w:val="0"/>
-          <w:sz w:val="22"/>
-          <w:szCs w:val="22"/>
-          <w14:ligatures w14:val="none"/>
-        </w:rPr>
-        <w:t xml:space="preserve"> thereby preventing assignment to exceedingly slow or flat reaches determined to be unsuitable </w:t>
+        <w:t xml:space="preserve">) was used to exclude exceedingly slow or flat reaches determined to be unsuitable </w:t>
       </w:r>
       <w:r>
         <w:rPr>
@@ -3906,6 +4004,75 @@
           <w:szCs w:val="22"/>
           <w14:ligatures w14:val="none"/>
         </w:rPr>
+        <w:t xml:space="preserve"> </w:t>
+      </w:r>
+      <w:commentRangeStart w:id="12"/>
+      <w:r>
+        <w:rPr>
+          <w:rFonts w:ascii="Garamond" w:eastAsia="Times New Roman" w:hAnsi="Garamond" w:cs="Times New Roman"/>
+          <w:kern w:val="0"/>
+          <w:sz w:val="22"/>
+          <w:szCs w:val="22"/>
+          <w14:ligatures w14:val="none"/>
+        </w:rPr>
+        <w:fldChar w:fldCharType="begin"/>
+      </w:r>
+      <w:r>
+        <w:rPr>
+          <w:rFonts w:ascii="Garamond" w:eastAsia="Times New Roman" w:hAnsi="Garamond" w:cs="Times New Roman"/>
+          <w:kern w:val="0"/>
+          <w:sz w:val="22"/>
+          <w:szCs w:val="22"/>
+          <w14:ligatures w14:val="none"/>
+        </w:rPr>
+        <w:instrText xml:space="preserve"> ADDIN ZOTERO_ITEM CSL_CITATION {"citationID":"H4pJnquA","properties":{"formattedCitation":"(Makhlouf et al., 2025)","plainCitation":"(Makhlouf et al., 2025)","noteIndex":0},"citationItems":[{"id":5397,"uris":["http://zotero.org/users/8421274/items/WRVF2L9N"],"itemData":{"id":5397,"type":"article-journal","abstract":"Understanding the spatial ecology of migratory species is uniquely challenging using conventional approaches. In fisheries such as for Pacific salmon, genetic stock identification (GSI) and isotope-based methods have emerged as strategies for reconstructing spatial ecology but are limited by the spatial resolution of genetic differentiation and isotopic heterogeneity. We show that integrating these complementary datasets improve the spatial resolution of provenance assignments. To do so, we reconstructed basin-wide estimates of natal origin locations for Chinook salmon in the Yukon River using samples (n = 247) from an experimental fishery designed to assess in-season run timing. A combined framework improved precision of likely provenance assignments (stream km &gt; 0.7 posterior probability) by 92% over genetic assignments and 52% over strontium isotope methods. In doing so, we illustrate watershed scale estimates of natal origin distributions with a greater resolution available from GSI or isotope data alone.","container-title":"Limnology and Oceanography Letters","DOI":"10.1002/lol2.70025","ISSN":"2378-2242","issue":"n/a","language":"en","license":"© 2025 The Author(s). Limnology and Oceanography Letters published by Wiley Periodicals LLC on behalf of Association for the Sciences of Limnology and Oceanography.","note":"_eprint: https://onlinelibrary.wiley.com/doi/pdf/10.1002/lol2.70025","source":"Wiley Online Library","title":"Combining genetic and isotope frameworks improves reconstruction of fish provenance across riverscapes","URL":"https://onlinelibrary.wiley.com/doi/abs/10.1002/lol2.70025","volume":"n/a","author":[{"family":"Makhlouf","given":"Ben"},{"family":"Cline","given":"Timothy J."},{"family":"Fernandez","given":"Diego"},{"family":"Seeb","given":"Lisa"},{"family":"Lee","given":"Elizabeth"},{"family":"Gilk-Baumer","given":"Sara"},{"family":"Whited","given":"Diane"},{"family":"Zimmerman","given":"Christian E."},{"family":"Schindler","given":"Daniel E."}],"accessed":{"date-parts":[["2025",6,4]]},"issued":{"date-parts":[["2025"]]}}}],"schema":"https://github.com/citation-style-language/schema/raw/master/csl-citation.json"} </w:instrText>
+      </w:r>
+      <w:r>
+        <w:rPr>
+          <w:rFonts w:ascii="Garamond" w:eastAsia="Times New Roman" w:hAnsi="Garamond" w:cs="Times New Roman"/>
+          <w:kern w:val="0"/>
+          <w:sz w:val="22"/>
+          <w:szCs w:val="22"/>
+          <w14:ligatures w14:val="none"/>
+        </w:rPr>
+        <w:fldChar w:fldCharType="separate"/>
+      </w:r>
+      <w:r>
+        <w:rPr>
+          <w:rFonts w:ascii="Garamond" w:eastAsia="Times New Roman" w:hAnsi="Garamond" w:cs="Times New Roman"/>
+          <w:noProof/>
+          <w:kern w:val="0"/>
+          <w:sz w:val="22"/>
+          <w:szCs w:val="22"/>
+          <w14:ligatures w14:val="none"/>
+        </w:rPr>
+        <w:t>(Makhlouf et al., 2025)</w:t>
+      </w:r>
+      <w:r>
+        <w:rPr>
+          <w:rFonts w:ascii="Garamond" w:eastAsia="Times New Roman" w:hAnsi="Garamond" w:cs="Times New Roman"/>
+          <w:kern w:val="0"/>
+          <w:sz w:val="22"/>
+          <w:szCs w:val="22"/>
+          <w14:ligatures w14:val="none"/>
+        </w:rPr>
+        <w:fldChar w:fldCharType="end"/>
+      </w:r>
+      <w:commentRangeEnd w:id="12"/>
+      <w:r>
+        <w:rPr>
+          <w:rStyle w:val="CommentReference"/>
+        </w:rPr>
+        <w:commentReference w:id="12"/>
+      </w:r>
+      <w:r>
+        <w:rPr>
+          <w:rFonts w:ascii="Garamond" w:eastAsia="Times New Roman" w:hAnsi="Garamond" w:cs="Times New Roman"/>
+          <w:kern w:val="0"/>
+          <w:sz w:val="22"/>
+          <w:szCs w:val="22"/>
+          <w14:ligatures w14:val="none"/>
+        </w:rPr>
         <w:t xml:space="preserve">. </w:t>
       </w:r>
       <w:r>
@@ -3914,7 +4081,6 @@
           <w:kern w:val="0"/>
           <w:sz w:val="22"/>
           <w:szCs w:val="22"/>
-          <w:highlight w:val="yellow"/>
           <w14:ligatures w14:val="none"/>
         </w:rPr>
         <w:t xml:space="preserve">Finally, data was included on observed locations of spawning </w:t>
@@ -3925,7 +4091,6 @@
           <w:kern w:val="0"/>
           <w:sz w:val="22"/>
           <w:szCs w:val="22"/>
-          <w:highlight w:val="yellow"/>
           <w14:ligatures w14:val="none"/>
         </w:rPr>
         <w:t>C</w:t>
@@ -3936,7 +4101,6 @@
           <w:kern w:val="0"/>
           <w:sz w:val="22"/>
           <w:szCs w:val="22"/>
-          <w:highlight w:val="yellow"/>
           <w14:ligatures w14:val="none"/>
         </w:rPr>
         <w:t>hinook presence derived from USGS Arctic-Yukon-Kuskokwim (AYK) Chinook Salmon Intrinsic potential mapping</w:t>
@@ -3947,7 +4111,6 @@
           <w:kern w:val="0"/>
           <w:sz w:val="22"/>
           <w:szCs w:val="22"/>
-          <w:highlight w:val="yellow"/>
           <w14:ligatures w14:val="none"/>
         </w:rPr>
         <w:t xml:space="preserve">, which </w:t>
@@ -3958,7 +4121,6 @@
           <w:kern w:val="0"/>
           <w:sz w:val="22"/>
           <w:szCs w:val="22"/>
-          <w:highlight w:val="yellow"/>
           <w14:ligatures w14:val="none"/>
         </w:rPr>
         <w:t>synthesize</w:t>
@@ -3969,7 +4131,6 @@
           <w:kern w:val="0"/>
           <w:sz w:val="22"/>
           <w:szCs w:val="22"/>
-          <w:highlight w:val="yellow"/>
           <w14:ligatures w14:val="none"/>
         </w:rPr>
         <w:t>d</w:t>
@@ -3980,29 +4141,66 @@
           <w:kern w:val="0"/>
           <w:sz w:val="22"/>
           <w:szCs w:val="22"/>
-          <w:highlight w:val="yellow"/>
-          <w14:ligatures w14:val="none"/>
-        </w:rPr>
-        <w:t xml:space="preserve"> several sources of data on observed Chinook salmon spawners  to provide a binary 0 or 1 value for locations with or without observations across the dataset</w:t>
-      </w:r>
-      <w:r>
-        <w:rPr>
-          <w:rFonts w:ascii="Garamond" w:eastAsia="Times New Roman" w:hAnsi="Garamond" w:cs="Times New Roman"/>
-          <w:kern w:val="0"/>
-          <w:sz w:val="22"/>
-          <w:szCs w:val="22"/>
-          <w:highlight w:val="yellow"/>
-          <w14:ligatures w14:val="none"/>
-        </w:rPr>
-        <w:t xml:space="preserve"> </w:t>
-      </w:r>
-      <w:r>
-        <w:rPr>
-          <w:rFonts w:ascii="Garamond" w:eastAsia="Times New Roman" w:hAnsi="Garamond" w:cs="Times New Roman"/>
-          <w:kern w:val="0"/>
-          <w:sz w:val="22"/>
-          <w:szCs w:val="22"/>
-          <w:highlight w:val="yellow"/>
+          <w14:ligatures w14:val="none"/>
+        </w:rPr>
+        <w:t xml:space="preserve"> several sources of data on observed Chinook salmon spawners to provide </w:t>
+      </w:r>
+      <w:r>
+        <w:rPr>
+          <w:rFonts w:ascii="Garamond" w:eastAsia="Times New Roman" w:hAnsi="Garamond" w:cs="Times New Roman"/>
+          <w:kern w:val="0"/>
+          <w:sz w:val="22"/>
+          <w:szCs w:val="22"/>
+          <w14:ligatures w14:val="none"/>
+        </w:rPr>
+        <w:t xml:space="preserve">data on known </w:t>
+      </w:r>
+      <w:r>
+        <w:rPr>
+          <w:rFonts w:ascii="Garamond" w:eastAsia="Times New Roman" w:hAnsi="Garamond" w:cs="Times New Roman"/>
+          <w:kern w:val="0"/>
+          <w:sz w:val="22"/>
+          <w:szCs w:val="22"/>
+          <w14:ligatures w14:val="none"/>
+        </w:rPr>
+        <w:t xml:space="preserve">locations with or without </w:t>
+      </w:r>
+      <w:r>
+        <w:rPr>
+          <w:rFonts w:ascii="Garamond" w:eastAsia="Times New Roman" w:hAnsi="Garamond" w:cs="Times New Roman"/>
+          <w:kern w:val="0"/>
+          <w:sz w:val="22"/>
+          <w:szCs w:val="22"/>
+          <w14:ligatures w14:val="none"/>
+        </w:rPr>
+        <w:t>Chinook sa</w:t>
+      </w:r>
+      <w:r>
+        <w:rPr>
+          <w:rFonts w:ascii="Garamond" w:eastAsia="Times New Roman" w:hAnsi="Garamond" w:cs="Times New Roman"/>
+          <w:kern w:val="0"/>
+          <w:sz w:val="22"/>
+          <w:szCs w:val="22"/>
+          <w14:ligatures w14:val="none"/>
+        </w:rPr>
+        <w:t>l</w:t>
+      </w:r>
+      <w:r>
+        <w:rPr>
+          <w:rFonts w:ascii="Garamond" w:eastAsia="Times New Roman" w:hAnsi="Garamond" w:cs="Times New Roman"/>
+          <w:kern w:val="0"/>
+          <w:sz w:val="22"/>
+          <w:szCs w:val="22"/>
+          <w14:ligatures w14:val="none"/>
+        </w:rPr>
+        <w:t xml:space="preserve">mon spawners </w:t>
+      </w:r>
+      <w:r>
+        <w:rPr>
+          <w:rFonts w:ascii="Garamond" w:eastAsia="Times New Roman" w:hAnsi="Garamond" w:cs="Times New Roman"/>
+          <w:kern w:val="0"/>
+          <w:sz w:val="22"/>
+          <w:szCs w:val="22"/>
           <w14:ligatures w14:val="none"/>
         </w:rPr>
         <w:fldChar w:fldCharType="begin"/>
@@ -4013,7 +4211,6 @@
           <w:kern w:val="0"/>
           <w:sz w:val="22"/>
           <w:szCs w:val="22"/>
-          <w:highlight w:val="yellow"/>
           <w14:ligatures w14:val="none"/>
         </w:rPr>
         <w:instrText xml:space="preserve"> ADDIN ZOTERO_ITEM CSL_CITATION {"citationID":"GgqWHCm6","properties":{"formattedCitation":"(Falke &amp; Paul, 2025)","plainCitation":"(Falke &amp; Paul, 2025)","noteIndex":0},"citationItems":[{"id":5400,"uris":["http://zotero.org/users/8421274/items/GG56Y5HB"],"itemData":{"id":5400,"type":"dataset","abstract":"Chinook Salmon (Oncorhynchus tshawytscha) are an important commercial, subsistence, and recreational fishery resource in Alaska, and recent population declines have resulted in closures of some Chinook Salmon fisheries. Research into environmental factors involved in the decline of salmon stocks has exposed information gaps regarding fine-scale freshwater habitat quality known to influence Chinook Salmon productivity. We developed spatially-explicit intrinsic habitat potential models for Chinook Salmon freshwater spawning and rearing life-stages based on geomorphic stream network attributes (e.g., gradient, mean annual flow, valley bottom width). Model predictions were applied to individual stream reaches and summarized across synthetic stream networks derived from high-resolution (5-meter) digital elevation models covering the Yukon River drainage west of the US-Canada border and the entire Kuskokwim River drainage (total stream length ~667,000 km across 1.3 million km2 area). Vector spatial datasets include unique reach contributing area (uRCA) and unique reach contributing area valley bottom (uRCA VB) polygons, and confluence to confluence streamline edges derived from the NetMap synthetic streamlines product. Tabular data includes a collection of stream attributes summarized by uRCA or uRCA VB polygons, and habitat model results derived from these stream attributes. See metadata records for individual data elements for a description of input sources, software\nenvironments, data quality, processing steps, and attribute information. Approximately 87,500 and 39,500 stream km were predicted to represent moderate to high (index scores 0.6-1.0) Chinook Salmon rearing and spawning habitat suitability, respectively. Our high-resolution, spatially explicit dataset provides many options for summarizing and visualizing habitat suitability across areal units (e.g., river basins, land management boundaries) and assessing the potential for high suitability habitats outside the known distribution of Chinook Salmon at scales useful for managers and the research community.","DOI":"10.5066/P95AV4JO","license":"Creative Commons Zero v1.0 Universal","medium":"csv,xml,shp","publisher":"U.S. Geological Survey","source":"DOI.org (Datacite)","title":"Stream Attributes and Habitat Intrinsic Potential Model Results to examine Freshwater Habitat Potential for Chinook Salmon in the Yukon and Kuskokwim River Basins, Alaska","URL":"https://www.sciencebase.gov/catalog/item/64df8deed34e5f6cd553baec","author":[{"family":"Falke","given":""},{"family":"Paul","given":""}],"accessed":{"date-parts":[["2025",6,4]]},"issued":{"date-parts":[["2025"]]}}}],"schema":"https://github.com/citation-style-language/schema/raw/master/csl-citation.json"} </w:instrText>
@@ -4024,7 +4221,6 @@
           <w:kern w:val="0"/>
           <w:sz w:val="22"/>
           <w:szCs w:val="22"/>
-          <w:highlight w:val="yellow"/>
           <w14:ligatures w14:val="none"/>
         </w:rPr>
         <w:fldChar w:fldCharType="separate"/>
@@ -4036,7 +4232,6 @@
           <w:kern w:val="0"/>
           <w:sz w:val="22"/>
           <w:szCs w:val="22"/>
-          <w:highlight w:val="yellow"/>
           <w14:ligatures w14:val="none"/>
         </w:rPr>
         <w:t>(Falke &amp; Paul, 2025)</w:t>
@@ -4047,7 +4242,6 @@
           <w:kern w:val="0"/>
           <w:sz w:val="22"/>
           <w:szCs w:val="22"/>
-          <w:highlight w:val="yellow"/>
           <w14:ligatures w14:val="none"/>
         </w:rPr>
         <w:fldChar w:fldCharType="end"/>
@@ -4058,7 +4252,6 @@
           <w:kern w:val="0"/>
           <w:sz w:val="22"/>
           <w:szCs w:val="22"/>
-          <w:highlight w:val="yellow"/>
           <w14:ligatures w14:val="none"/>
         </w:rPr>
         <w:t>.</w:t>
@@ -4140,7 +4333,23 @@
           <w:sz w:val="22"/>
           <w:szCs w:val="22"/>
         </w:rPr>
-        <w:t xml:space="preserve">To estimate the spatial distribution of natal origins for a subset of the population, </w:t>
+        <w:t xml:space="preserve">To estimate the spatial distribution of natal origins </w:t>
+      </w:r>
+      <w:r>
+        <w:rPr>
+          <w:rFonts w:ascii="Garamond" w:hAnsi="Garamond"/>
+          <w:sz w:val="22"/>
+          <w:szCs w:val="22"/>
+        </w:rPr>
+        <w:t>across</w:t>
+      </w:r>
+      <w:r>
+        <w:rPr>
+          <w:rFonts w:ascii="Garamond" w:hAnsi="Garamond"/>
+          <w:sz w:val="22"/>
+          <w:szCs w:val="22"/>
+        </w:rPr>
+        <w:t xml:space="preserve"> a subset of the population, </w:t>
       </w:r>
       <w:r>
         <w:rPr>
@@ -4156,6 +4365,14 @@
           <w:sz w:val="22"/>
           <w:szCs w:val="22"/>
         </w:rPr>
+        <w:t xml:space="preserve">for all individuals in the subset </w:t>
+      </w:r>
+      <w:r>
+        <w:rPr>
+          <w:rFonts w:ascii="Garamond" w:hAnsi="Garamond"/>
+          <w:sz w:val="22"/>
+          <w:szCs w:val="22"/>
+        </w:rPr>
         <w:t xml:space="preserve">were summed </w:t>
       </w:r>
       <w:r>
@@ -4164,57 +4381,200 @@
           <w:sz w:val="22"/>
           <w:szCs w:val="22"/>
         </w:rPr>
-        <w:t xml:space="preserve">across </w:t>
-      </w:r>
-      <w:r>
-        <w:rPr>
-          <w:rFonts w:ascii="Garamond" w:hAnsi="Garamond"/>
-          <w:sz w:val="22"/>
-          <w:szCs w:val="22"/>
-        </w:rPr>
-        <w:t xml:space="preserve">all </w:t>
-      </w:r>
-      <w:r>
-        <w:rPr>
-          <w:rFonts w:ascii="Garamond" w:hAnsi="Garamond"/>
-          <w:sz w:val="22"/>
-          <w:szCs w:val="22"/>
-        </w:rPr>
-        <w:t xml:space="preserve">individuals </w:t>
-      </w:r>
-      <w:r>
-        <w:rPr>
-          <w:rFonts w:ascii="Garamond" w:hAnsi="Garamond"/>
-          <w:sz w:val="22"/>
-          <w:szCs w:val="22"/>
-        </w:rPr>
-        <w:t>in the subset and at all reaches in the basin.</w:t>
-      </w:r>
-      <w:r>
-        <w:rPr>
-          <w:rFonts w:ascii="Garamond" w:hAnsi="Garamond"/>
-          <w:sz w:val="22"/>
-          <w:szCs w:val="22"/>
-        </w:rPr>
-        <w:t xml:space="preserve"> To focus analysis on only highly likely locations, the top 30% of posterior values were retained whereas all other values were assigned a value of 0 for </w:t>
-      </w:r>
-      <w:proofErr w:type="gramStart"/>
-      <w:r>
-        <w:rPr>
-          <w:rFonts w:ascii="Garamond" w:hAnsi="Garamond"/>
-          <w:sz w:val="22"/>
-          <w:szCs w:val="22"/>
-        </w:rPr>
-        <w:t>each individual</w:t>
-      </w:r>
-      <w:proofErr w:type="gramEnd"/>
-      <w:r>
-        <w:rPr>
-          <w:rFonts w:ascii="Garamond" w:hAnsi="Garamond"/>
-          <w:sz w:val="22"/>
-          <w:szCs w:val="22"/>
-        </w:rPr>
-        <w:t xml:space="preserve"> before summing. Natal origin estimates were produced for </w:t>
+        <w:t xml:space="preserve">at </w:t>
+      </w:r>
+      <w:r>
+        <w:rPr>
+          <w:rFonts w:ascii="Garamond" w:hAnsi="Garamond"/>
+          <w:sz w:val="22"/>
+          <w:szCs w:val="22"/>
+        </w:rPr>
+        <w:t>each location</w:t>
+      </w:r>
+      <w:r>
+        <w:rPr>
+          <w:rFonts w:ascii="Garamond" w:hAnsi="Garamond"/>
+          <w:sz w:val="22"/>
+          <w:szCs w:val="22"/>
+        </w:rPr>
+        <w:t>.</w:t>
+      </w:r>
+      <w:r>
+        <w:rPr>
+          <w:rFonts w:ascii="Garamond" w:hAnsi="Garamond"/>
+          <w:sz w:val="22"/>
+          <w:szCs w:val="22"/>
+        </w:rPr>
+        <w:t xml:space="preserve"> </w:t>
+      </w:r>
+      <w:r>
+        <w:rPr>
+          <w:rFonts w:ascii="Garamond" w:hAnsi="Garamond"/>
+          <w:sz w:val="22"/>
+          <w:szCs w:val="22"/>
+        </w:rPr>
+        <w:t>Before summing, o</w:t>
+      </w:r>
+      <w:r>
+        <w:rPr>
+          <w:rFonts w:ascii="Garamond" w:hAnsi="Garamond"/>
+          <w:sz w:val="22"/>
+          <w:szCs w:val="22"/>
+        </w:rPr>
+        <w:t>nly highly likely locations</w:t>
+      </w:r>
+      <w:r>
+        <w:rPr>
+          <w:rFonts w:ascii="Garamond" w:hAnsi="Garamond"/>
+          <w:sz w:val="22"/>
+          <w:szCs w:val="22"/>
+        </w:rPr>
+        <w:t xml:space="preserve"> (</w:t>
+      </w:r>
+      <w:r>
+        <w:rPr>
+          <w:rFonts w:ascii="Garamond" w:hAnsi="Garamond"/>
+          <w:sz w:val="22"/>
+          <w:szCs w:val="22"/>
+        </w:rPr>
+        <w:t xml:space="preserve">the top </w:t>
+      </w:r>
+      <w:r>
+        <w:rPr>
+          <w:rFonts w:ascii="Garamond" w:hAnsi="Garamond"/>
+          <w:sz w:val="22"/>
+          <w:szCs w:val="22"/>
+        </w:rPr>
+        <w:t>30% of posterior values</w:t>
+      </w:r>
+      <w:r>
+        <w:rPr>
+          <w:rFonts w:ascii="Garamond" w:hAnsi="Garamond"/>
+          <w:sz w:val="22"/>
+          <w:szCs w:val="22"/>
+        </w:rPr>
+        <w:t>)</w:t>
+      </w:r>
+      <w:r>
+        <w:rPr>
+          <w:rFonts w:ascii="Garamond" w:hAnsi="Garamond"/>
+          <w:sz w:val="22"/>
+          <w:szCs w:val="22"/>
+        </w:rPr>
+        <w:t xml:space="preserve"> were retained whereas all other values were assigned a value of 0</w:t>
+      </w:r>
+      <w:r>
+        <w:rPr>
+          <w:rFonts w:ascii="Garamond" w:hAnsi="Garamond"/>
+          <w:sz w:val="22"/>
+          <w:szCs w:val="22"/>
+        </w:rPr>
+        <w:t xml:space="preserve"> </w:t>
+      </w:r>
+      <w:r>
+        <w:rPr>
+          <w:rFonts w:ascii="Garamond" w:hAnsi="Garamond"/>
+          <w:sz w:val="22"/>
+          <w:szCs w:val="22"/>
+        </w:rPr>
+        <w:fldChar w:fldCharType="begin"/>
+      </w:r>
+      <w:r>
+        <w:rPr>
+          <w:rFonts w:ascii="Garamond" w:hAnsi="Garamond"/>
+          <w:sz w:val="22"/>
+          <w:szCs w:val="22"/>
+        </w:rPr>
+        <w:instrText xml:space="preserve"> ADDIN ZOTERO_ITEM CSL_CITATION {"citationID":"NBaxQoVY","properties":{"formattedCitation":"(Brennan &amp; Schindler, 2017; Vander Zanden et al., 2015)","plainCitation":"(Brennan &amp; Schindler, 2017; Vander Zanden et al., 2015)","noteIndex":0},"citationItems":[{"id":1694,"uris":["http://zotero.org/users/8421274/items/NSWL6YPN"],"itemData":{"id":1694,"type":"article-journal","abstract":"Production patterns of highly mobile species, such as anadromous fish, often exhibit high spatial and temporal heterogeneity across landscapes. Such variability is often asynchronous in time among habitats, which stabilizes production at aggregate scales of complexity. Reconstructing production patterns explicitly in space and time across multiple scales, however, remains difficult but is important for prioritizing habitat conservation. This is especially true for fishes inhabiting river basins due to long-range dispersal, high mortality at early life stages, complex population structure and elusive life history variation. We develop a new approach for mapping production patterns of Pacific salmon across a large river basin by integrating otolith microchemistry and dendritic isoscape models. The geographically continuous Bayesian assignment framework presented here yielded high accuracies (&gt;90%) and relatively high precisions (precisions &lt;4%; i.e., assignment areas of &lt;530 river km of the 13 100 km total river length) when used to determine the natal source of known-origin juvenile Chinook salmon captured throughout the study region. Integrating these methods enabled us to base estimates of provenance and habitat use of individuals on a per location basis using strontium isotopic data throughout the continuous spatial domain of a river network. Such a framework provides substantial advantages over the more common nominal approach to employing otolith microchemistry to reconstruct movement patterns of fish. In doing so, we reconstructed the spatial production patterns of adult Chinook salmon returning to a large watershed in Bristol Bay, Alaska and illustrate the power of such an approach to conservation efforts.","container-title":"Ecological Applications","DOI":"10.1002/eap.1474","ISSN":"1939-5582","issue":"2","language":"en","note":"_eprint: https://esajournals.onlinelibrary.wiley.com/doi/pdf/10.1002/eap.1474","page":"363-377","source":"Wiley Online Library","title":"Linking otolith microchemistry and dendritic isoscapes to map heterogeneous production of fish across river basins","volume":"27","author":[{"family":"Brennan","given":"Sean R."},{"family":"Schindler","given":"Daniel E."}],"issued":{"date-parts":[["2017"]]}}},{"id":5569,"uris":["http://zotero.org/users/8421274/items/MSKF925L"],"itemData":{"id":5569,"type":"article-journal","abstract":"Stable isotope analysis is a useful tool to track animal movements in both terrestrial and marine environments. These intrinsic markers are assimilated through the diet and may exhibit spatial gradients as a result of biogeochemical processes at the base of the food web. In the marine environment, maps to predict the spatial distribution of stable isotopes are limited, and thus determining geographic origin has been reliant upon integrating satellite telemetry and stable isotope data. Migratory sea turtles regularly move between foraging and reproductive areas. Whereas most nesting populations can be easily accessed and regularly monitored, little is known about the demographic trends in foraging populations. The purpose of the present study was to examine migration patterns of loggerhead nesting aggregations in the Gulf of Mexico (GoM), where sea turtles have been historically understudied. Two methods of geographic assignment using stable isotope values in known-origin samples from satellite telemetry were compared: (1) a nominal approach through discriminant analysis and (2) a novel continuous-surface approach using bivariate carbon and nitrogen isoscapes (isotopic landscapes) developed for this study. Tissue samples for stable isotope analysis were obtained from 60 satellite-tracked individuals at five nesting beaches within the GoM. Both methodological approaches for assignment resulted in high accuracy of foraging area determination, though each has advantages and disadvantages. The nominal approach is more appropriate when defined boundaries are necessary, but up to 42% of the individuals could not be considered in this approach. All individuals can be included in the continuous-surface approach, and individual results can be aggregated to identify geographic hotspots of foraging area use, though the accuracy rate was lower than nominal assignment. The methodological validation provides a foundation for future sea turtle studies in the region to inexpensively determine geographic origin for large numbers of untracked individuals. Regular monitoring of sea turtle nesting aggregations with stable isotope sampling can be used to fill critical data gaps regarding habitat use and migration patterns. Probabilistic assignment to origin with isoscapes has not been previously used in the marine environment, but the methods presented here could also be applied to other migratory marine species.","container-title":"Ecological Applications","DOI":"10.1890/14-0581.1","ISSN":"1939-5582","issue":"2","language":"en","license":"© 2015 by the Ecological Society of America","note":"_eprint: https://esajournals.onlinelibrary.wiley.com/doi/pdf/10.1890/14-0581.1","page":"320-335","source":"Wiley Online Library","title":"Determining origin in a migratory marine vertebrate: a novel method to integrate stable isotopes and satellite tracking","title-short":"Determining origin in a migratory marine vertebrate","volume":"25","author":[{"family":"Vander Zanden","given":"Hannah B."},{"family":"Tucker","given":"Anton D."},{"family":"Hart","given":"Kristen M."},{"family":"Lamont","given":"Margaret M."},{"family":"Fujisaki","given":"Ikuko"},{"family":"Addison","given":"David S."},{"family":"Mansfield","given":"Katherine L."},{"family":"Phillips","given":"Katrina F."},{"family":"Wunder","given":"Michael B."},{"family":"Bowen","given":"Gabriel J."},{"family":"Pajuelo","given":"Mariela"},{"family":"Bolten","given":"Alan B."},{"family":"Bjorndal","given":"Karen A."}],"issued":{"date-parts":[["2015"]]}}}],"schema":"https://github.com/citation-style-language/schema/raw/master/csl-citation.json"} </w:instrText>
+      </w:r>
+      <w:r>
+        <w:rPr>
+          <w:rFonts w:ascii="Garamond" w:hAnsi="Garamond"/>
+          <w:sz w:val="22"/>
+          <w:szCs w:val="22"/>
+        </w:rPr>
+        <w:fldChar w:fldCharType="separate"/>
+      </w:r>
+      <w:r>
+        <w:rPr>
+          <w:rFonts w:ascii="Garamond" w:hAnsi="Garamond"/>
+          <w:noProof/>
+          <w:sz w:val="22"/>
+          <w:szCs w:val="22"/>
+        </w:rPr>
+        <w:t>(Brennan &amp; Schindler, 2017; Vander Zanden et al., 2015)</w:t>
+      </w:r>
+      <w:r>
+        <w:rPr>
+          <w:rFonts w:ascii="Garamond" w:hAnsi="Garamond"/>
+          <w:sz w:val="22"/>
+          <w:szCs w:val="22"/>
+        </w:rPr>
+        <w:fldChar w:fldCharType="end"/>
+      </w:r>
+      <w:r>
+        <w:rPr>
+          <w:rFonts w:ascii="Garamond" w:hAnsi="Garamond"/>
+          <w:sz w:val="22"/>
+          <w:szCs w:val="22"/>
+        </w:rPr>
+        <w:t>. Subsets for which estimates of n</w:t>
+      </w:r>
+      <w:r>
+        <w:rPr>
+          <w:rFonts w:ascii="Garamond" w:hAnsi="Garamond"/>
+          <w:sz w:val="22"/>
+          <w:szCs w:val="22"/>
+        </w:rPr>
+        <w:t xml:space="preserve">atal origin were produced </w:t>
+      </w:r>
+      <w:r>
+        <w:rPr>
+          <w:rFonts w:ascii="Garamond" w:hAnsi="Garamond"/>
+          <w:sz w:val="22"/>
+          <w:szCs w:val="22"/>
+        </w:rPr>
+        <w:t xml:space="preserve">include </w:t>
+      </w:r>
+      <w:r>
+        <w:rPr>
+          <w:rFonts w:ascii="Garamond" w:hAnsi="Garamond"/>
+          <w:sz w:val="22"/>
+          <w:szCs w:val="22"/>
+        </w:rPr>
+        <w:t xml:space="preserve">predefined </w:t>
+      </w:r>
+      <w:r>
+        <w:rPr>
+          <w:rFonts w:ascii="Garamond" w:hAnsi="Garamond"/>
+          <w:sz w:val="22"/>
+          <w:szCs w:val="22"/>
+        </w:rPr>
+        <w:t xml:space="preserve">four </w:t>
+      </w:r>
+      <w:r>
+        <w:rPr>
+          <w:rFonts w:ascii="Garamond" w:hAnsi="Garamond"/>
+          <w:sz w:val="22"/>
+          <w:szCs w:val="22"/>
+        </w:rPr>
+        <w:t xml:space="preserve">temporal quartiles </w:t>
+      </w:r>
+      <w:r>
+        <w:rPr>
+          <w:rFonts w:ascii="Garamond" w:hAnsi="Garamond"/>
+          <w:sz w:val="22"/>
+          <w:szCs w:val="22"/>
+        </w:rPr>
+        <w:t xml:space="preserve">of the salmon migration season </w:t>
+      </w:r>
+      <w:r>
+        <w:rPr>
+          <w:rFonts w:ascii="Garamond" w:hAnsi="Garamond"/>
+          <w:sz w:val="22"/>
+          <w:szCs w:val="22"/>
+        </w:rPr>
+        <w:t xml:space="preserve">based on capture </w:t>
       </w:r>
       <w:r>
         <w:rPr>
@@ -4223,25 +4583,9 @@
           <w:szCs w:val="22"/>
         </w:rPr>
         <w:lastRenderedPageBreak/>
-        <w:t xml:space="preserve">predefined temporal quartiles </w:t>
-      </w:r>
-      <w:r>
-        <w:rPr>
-          <w:rFonts w:ascii="Garamond" w:hAnsi="Garamond"/>
-          <w:sz w:val="22"/>
-          <w:szCs w:val="22"/>
-        </w:rPr>
-        <w:t xml:space="preserve">of the salmon migration season </w:t>
-      </w:r>
-      <w:r>
-        <w:rPr>
-          <w:rFonts w:ascii="Garamond" w:hAnsi="Garamond"/>
-          <w:sz w:val="22"/>
-          <w:szCs w:val="22"/>
-        </w:rPr>
-        <w:t>based on capture date: Q1 (run start through June 11), Q2 (June 12-21), Q3 (June 22-July 1), and Q4 (July 2 onward).</w:t>
-      </w:r>
-      <w:ins w:id="15" w:author="Daniel Schindler" w:date="2025-07-17T13:30:00Z" w16du:dateUtc="2025-07-17T21:30:00Z">
+        <w:t>date: Q1 (run start through June 11), Q2 (June 12-21), Q3 (June 22-July 1), and Q4 (July 2 onward).</w:t>
+      </w:r>
+      <w:ins w:id="13" w:author="Daniel Schindler" w:date="2025-07-17T13:30:00Z" w16du:dateUtc="2025-07-17T21:30:00Z">
         <w:r>
           <w:rPr>
             <w:rFonts w:ascii="Garamond" w:hAnsi="Garamond"/>
@@ -4313,40 +4657,23 @@
           <w:sz w:val="22"/>
           <w:szCs w:val="22"/>
         </w:rPr>
-        <w:t xml:space="preserve">The June 11 date was chosen specifically to match the end of the ‘front end closure’ of the subsistence fishery </w:t>
-      </w:r>
-      <w:r>
-        <w:rPr>
-          <w:rFonts w:ascii="Garamond" w:hAnsi="Garamond"/>
-          <w:sz w:val="22"/>
-          <w:szCs w:val="22"/>
-        </w:rPr>
-        <w:t xml:space="preserve">corresponding to the first quartile of the run, </w:t>
-      </w:r>
-      <w:r>
-        <w:rPr>
-          <w:rFonts w:ascii="Garamond" w:hAnsi="Garamond"/>
-          <w:sz w:val="22"/>
-          <w:szCs w:val="22"/>
-        </w:rPr>
-        <w:t xml:space="preserve">which has been implemented for over a decade. </w:t>
-      </w:r>
-      <w:r>
-        <w:rPr>
-          <w:rFonts w:ascii="Garamond" w:hAnsi="Garamond"/>
-          <w:sz w:val="22"/>
-          <w:szCs w:val="22"/>
-        </w:rPr>
-        <w:t xml:space="preserve">Estimates were also produced for the full duration of the </w:t>
-      </w:r>
-      <w:proofErr w:type="gramStart"/>
-      <w:r>
-        <w:rPr>
-          <w:rFonts w:ascii="Garamond" w:hAnsi="Garamond"/>
-          <w:sz w:val="22"/>
-          <w:szCs w:val="22"/>
-        </w:rPr>
-        <w:t xml:space="preserve">run </w:t>
+        <w:t>The June 11 date was chosen specifically to match the end of the ‘front end closure’ of the subsistence fishery</w:t>
+      </w:r>
+      <w:r>
+        <w:rPr>
+          <w:rFonts w:ascii="Garamond" w:hAnsi="Garamond"/>
+          <w:sz w:val="22"/>
+          <w:szCs w:val="22"/>
+        </w:rPr>
+        <w:t xml:space="preserve">. </w:t>
+      </w:r>
+      <w:r>
+        <w:rPr>
+          <w:rFonts w:ascii="Garamond" w:hAnsi="Garamond"/>
+          <w:sz w:val="22"/>
+          <w:szCs w:val="22"/>
+        </w:rPr>
+        <w:t xml:space="preserve">Estimates were also produced for the full run </w:t>
       </w:r>
       <w:r>
         <w:rPr>
@@ -4356,7 +4683,6 @@
         </w:rPr>
         <w:t>in</w:t>
       </w:r>
-      <w:proofErr w:type="gramEnd"/>
       <w:r>
         <w:rPr>
           <w:rFonts w:ascii="Garamond" w:hAnsi="Garamond"/>
@@ -4371,32 +4697,91 @@
           <w:sz w:val="22"/>
           <w:szCs w:val="22"/>
         </w:rPr>
-        <w:t xml:space="preserve"> Twenty</w:t>
-      </w:r>
-      <w:r>
-        <w:rPr>
-          <w:rFonts w:ascii="Garamond" w:hAnsi="Garamond"/>
-          <w:sz w:val="22"/>
-          <w:szCs w:val="22"/>
-        </w:rPr>
-        <w:t xml:space="preserve">-one management units were defined to aggregate tributary-level estimates into units relevant to current management practices (Figure 2). Management units of interest to the Alaska Department of Fish </w:t>
-      </w:r>
-      <w:r>
-        <w:rPr>
-          <w:rFonts w:ascii="Garamond" w:hAnsi="Garamond"/>
-          <w:sz w:val="22"/>
-          <w:szCs w:val="22"/>
-        </w:rPr>
-        <w:t>&amp;</w:t>
-      </w:r>
-      <w:r>
-        <w:rPr>
-          <w:rFonts w:ascii="Garamond" w:hAnsi="Garamond"/>
-          <w:sz w:val="22"/>
-          <w:szCs w:val="22"/>
-        </w:rPr>
         <w:t xml:space="preserve"> </w:t>
       </w:r>
+    </w:p>
+    <w:p>
+      <w:pPr>
+        <w:spacing w:line="480" w:lineRule="auto"/>
+        <w:ind w:firstLine="720"/>
+        <w:rPr>
+          <w:rFonts w:ascii="Garamond" w:hAnsi="Garamond"/>
+          <w:sz w:val="22"/>
+          <w:szCs w:val="22"/>
+        </w:rPr>
+      </w:pPr>
+      <w:r>
+        <w:rPr>
+          <w:rFonts w:ascii="Garamond" w:hAnsi="Garamond"/>
+          <w:sz w:val="22"/>
+          <w:szCs w:val="22"/>
+        </w:rPr>
+        <w:t>Twenty</w:t>
+      </w:r>
+      <w:r>
+        <w:rPr>
+          <w:rFonts w:ascii="Garamond" w:hAnsi="Garamond"/>
+          <w:sz w:val="22"/>
+          <w:szCs w:val="22"/>
+        </w:rPr>
+        <w:t>-one management units</w:t>
+      </w:r>
+      <w:r>
+        <w:rPr>
+          <w:rFonts w:ascii="Garamond" w:hAnsi="Garamond"/>
+          <w:sz w:val="22"/>
+          <w:szCs w:val="22"/>
+        </w:rPr>
+        <w:t xml:space="preserve"> or “stocks”</w:t>
+      </w:r>
+      <w:r>
+        <w:rPr>
+          <w:rFonts w:ascii="Garamond" w:hAnsi="Garamond"/>
+          <w:sz w:val="22"/>
+          <w:szCs w:val="22"/>
+        </w:rPr>
+        <w:t xml:space="preserve"> were defined to aggregate tributary-level estimates into units relevant to current management practices (Figure 2). </w:t>
+      </w:r>
+      <w:r>
+        <w:rPr>
+          <w:rFonts w:ascii="Garamond" w:hAnsi="Garamond"/>
+          <w:sz w:val="22"/>
+          <w:szCs w:val="22"/>
+        </w:rPr>
+        <w:t xml:space="preserve">Rivers </w:t>
+      </w:r>
+      <w:r>
+        <w:rPr>
+          <w:rFonts w:ascii="Garamond" w:hAnsi="Garamond"/>
+          <w:sz w:val="22"/>
+          <w:szCs w:val="22"/>
+        </w:rPr>
+        <w:t xml:space="preserve">of </w:t>
+      </w:r>
+      <w:r>
+        <w:rPr>
+          <w:rFonts w:ascii="Garamond" w:hAnsi="Garamond"/>
+          <w:sz w:val="22"/>
+          <w:szCs w:val="22"/>
+        </w:rPr>
+        <w:t xml:space="preserve">management </w:t>
+      </w:r>
+      <w:r>
+        <w:rPr>
+          <w:rFonts w:ascii="Garamond" w:hAnsi="Garamond"/>
+          <w:sz w:val="22"/>
+          <w:szCs w:val="22"/>
+        </w:rPr>
+        <w:t xml:space="preserve">interest to the Alaska Department of Fish </w:t>
+      </w:r>
+      <w:r>
+        <w:rPr>
+          <w:rFonts w:ascii="Garamond" w:hAnsi="Garamond"/>
+          <w:sz w:val="22"/>
+          <w:szCs w:val="22"/>
+        </w:rPr>
+        <w:t xml:space="preserve">&amp; </w:t>
+      </w:r>
       <w:r>
         <w:rPr>
           <w:rFonts w:ascii="Garamond" w:hAnsi="Garamond"/>
@@ -4413,7 +4798,8 @@
         </w:rPr>
         <w:t xml:space="preserve"> </w:t>
       </w:r>
-      <w:ins w:id="16" w:author="Daniel Schindler" w:date="2025-07-17T13:31:00Z" w16du:dateUtc="2025-07-17T21:31:00Z">
+      <w:commentRangeStart w:id="14"/>
+      <w:ins w:id="15" w:author="Daniel Schindler" w:date="2025-07-17T13:31:00Z" w16du:dateUtc="2025-07-17T21:31:00Z">
         <w:r>
           <w:rPr>
             <w:rFonts w:ascii="Garamond" w:hAnsi="Garamond"/>
@@ -4422,317 +4808,151 @@
           </w:rPr>
           <w:t>(Liller reference?)</w:t>
         </w:r>
-        <w:r>
-          <w:rPr>
-            <w:rFonts w:ascii="Garamond" w:hAnsi="Garamond"/>
-            <w:sz w:val="22"/>
-            <w:szCs w:val="22"/>
-          </w:rPr>
-          <w:t xml:space="preserve"> </w:t>
-        </w:r>
       </w:ins>
       <w:r>
         <w:rPr>
-          <w:rFonts w:ascii="Garamond" w:hAnsi="Garamond"/>
-          <w:sz w:val="22"/>
-          <w:szCs w:val="22"/>
-        </w:rPr>
-        <w:t xml:space="preserve">with all upstream segments from the most downstream point of each tributary assigned to common management identifiers. </w:t>
-      </w:r>
-      <w:proofErr w:type="gramStart"/>
-      <w:r>
-        <w:rPr>
-          <w:rFonts w:ascii="Garamond" w:hAnsi="Garamond"/>
-          <w:sz w:val="22"/>
-          <w:szCs w:val="22"/>
-        </w:rPr>
-        <w:t>Remaining</w:t>
-      </w:r>
-      <w:proofErr w:type="gramEnd"/>
-      <w:r>
-        <w:rPr>
-          <w:rFonts w:ascii="Garamond" w:hAnsi="Garamond"/>
-          <w:sz w:val="22"/>
-          <w:szCs w:val="22"/>
-        </w:rPr>
-        <w:t xml:space="preserve"> basin areas were manually grouped into units of comparable size to ensure complete basin coverage</w:t>
-      </w:r>
-      <w:r>
-        <w:rPr>
-          <w:rFonts w:ascii="Garamond" w:hAnsi="Garamond"/>
-          <w:sz w:val="22"/>
-          <w:szCs w:val="22"/>
-        </w:rPr>
-        <w:t xml:space="preserve"> (Figure 2).</w:t>
+          <w:rStyle w:val="CommentReference"/>
+          <w:rFonts w:ascii="Garamond" w:hAnsi="Garamond"/>
+          <w:sz w:val="22"/>
+          <w:szCs w:val="22"/>
+        </w:rPr>
+        <w:t xml:space="preserve">. </w:t>
+      </w:r>
+      <w:commentRangeEnd w:id="14"/>
+      <w:r>
+        <w:rPr>
+          <w:rStyle w:val="CommentReference"/>
+        </w:rPr>
+        <w:commentReference w:id="14"/>
+      </w:r>
+      <w:r>
+        <w:rPr>
+          <w:rStyle w:val="CommentReference"/>
+          <w:rFonts w:ascii="Garamond" w:hAnsi="Garamond"/>
+          <w:sz w:val="22"/>
+          <w:szCs w:val="22"/>
+        </w:rPr>
+        <w:t xml:space="preserve">From the furthest downstream connection of each of these tributaries to the mainstem all upstream segments were selected and assigned to a common identifier.  For some smaller units (i.e. the </w:t>
+      </w:r>
+      <w:proofErr w:type="spellStart"/>
+      <w:r>
+        <w:rPr>
+          <w:rStyle w:val="CommentReference"/>
+          <w:rFonts w:ascii="Garamond" w:hAnsi="Garamond"/>
+          <w:sz w:val="22"/>
+          <w:szCs w:val="22"/>
+        </w:rPr>
+        <w:t>Takotna</w:t>
+      </w:r>
+      <w:proofErr w:type="spellEnd"/>
+      <w:r>
+        <w:rPr>
+          <w:rStyle w:val="CommentReference"/>
+          <w:rFonts w:ascii="Garamond" w:hAnsi="Garamond"/>
+          <w:sz w:val="22"/>
+          <w:szCs w:val="22"/>
+        </w:rPr>
+        <w:t xml:space="preserve"> and Nixon fork), the units were combined into one to keep a relative comparable size. </w:t>
+      </w:r>
+      <w:r>
+        <w:rPr>
+          <w:rFonts w:ascii="Garamond" w:hAnsi="Garamond"/>
+          <w:sz w:val="22"/>
+          <w:szCs w:val="22"/>
+        </w:rPr>
+        <w:t xml:space="preserve">Remaining basin areas were </w:t>
+      </w:r>
+      <w:r>
+        <w:rPr>
+          <w:rFonts w:ascii="Garamond" w:hAnsi="Garamond"/>
+          <w:sz w:val="22"/>
+          <w:szCs w:val="22"/>
+        </w:rPr>
+        <w:t xml:space="preserve">then </w:t>
+      </w:r>
+      <w:r>
+        <w:rPr>
+          <w:rFonts w:ascii="Garamond" w:hAnsi="Garamond"/>
+          <w:sz w:val="22"/>
+          <w:szCs w:val="22"/>
+        </w:rPr>
+        <w:t>manually grouped into units of comparable size to ensure complete basin coverage</w:t>
+      </w:r>
+      <w:r>
+        <w:rPr>
+          <w:rFonts w:ascii="Garamond" w:hAnsi="Garamond"/>
+          <w:sz w:val="22"/>
+          <w:szCs w:val="22"/>
+        </w:rPr>
+        <w:t xml:space="preserve"> with attention paid to keeping spatially relevant regions in the same unit (i.e. Middle Kuskokwim mainstem). </w:t>
       </w:r>
     </w:p>
     <w:p>
       <w:pPr>
         <w:spacing w:line="480" w:lineRule="auto"/>
-        <w:ind w:firstLine="720"/>
-        <w:rPr>
-          <w:rFonts w:ascii="Garamond" w:hAnsi="Garamond"/>
-          <w:sz w:val="22"/>
-          <w:szCs w:val="22"/>
-        </w:rPr>
-      </w:pPr>
-      <w:r>
-        <w:rPr>
-          <w:rFonts w:ascii="Garamond" w:hAnsi="Garamond"/>
-          <w:sz w:val="22"/>
-          <w:szCs w:val="22"/>
-        </w:rPr>
-        <w:t>In each year of the study, and f</w:t>
-      </w:r>
-      <w:r>
-        <w:rPr>
-          <w:rFonts w:ascii="Garamond" w:hAnsi="Garamond"/>
-          <w:sz w:val="22"/>
-          <w:szCs w:val="22"/>
-        </w:rPr>
-        <w:t xml:space="preserve">or each </w:t>
-      </w:r>
-      <w:r>
-        <w:rPr>
-          <w:rFonts w:ascii="Garamond" w:hAnsi="Garamond"/>
-          <w:sz w:val="22"/>
-          <w:szCs w:val="22"/>
-        </w:rPr>
-        <w:t xml:space="preserve">seasonal </w:t>
-      </w:r>
-      <w:r>
-        <w:rPr>
-          <w:rFonts w:ascii="Garamond" w:hAnsi="Garamond"/>
-          <w:sz w:val="22"/>
-          <w:szCs w:val="22"/>
-        </w:rPr>
-        <w:t xml:space="preserve">quartile, return estimates were normalized to sum to one across the </w:t>
-      </w:r>
-      <w:r>
-        <w:rPr>
-          <w:rFonts w:ascii="Garamond" w:hAnsi="Garamond"/>
-          <w:sz w:val="22"/>
-          <w:szCs w:val="22"/>
-        </w:rPr>
-        <w:t>watershed to display</w:t>
-      </w:r>
-      <w:r>
-        <w:rPr>
-          <w:rFonts w:ascii="Garamond" w:hAnsi="Garamond"/>
-          <w:sz w:val="22"/>
-          <w:szCs w:val="22"/>
-        </w:rPr>
-        <w:t xml:space="preserve"> proportional contribution</w:t>
-      </w:r>
-      <w:r>
-        <w:rPr>
-          <w:rFonts w:ascii="Garamond" w:hAnsi="Garamond"/>
-          <w:sz w:val="22"/>
-          <w:szCs w:val="22"/>
-        </w:rPr>
-        <w:t xml:space="preserve"> within a given seasonal quartile. For each quartile, the mean proportional contribution value was calculated across all years for each management unit (Figure 3). </w:t>
-      </w:r>
-      <w:r>
-        <w:rPr>
-          <w:rFonts w:ascii="Garamond" w:hAnsi="Garamond"/>
-          <w:sz w:val="22"/>
-          <w:szCs w:val="22"/>
-        </w:rPr>
-        <w:t xml:space="preserve">Corresponding boxplots for each quartile illustrate </w:t>
-      </w:r>
-      <w:r>
-        <w:rPr>
-          <w:rFonts w:ascii="Garamond" w:hAnsi="Garamond"/>
-          <w:sz w:val="22"/>
-          <w:szCs w:val="22"/>
-        </w:rPr>
-        <w:t xml:space="preserve">annual </w:t>
-      </w:r>
-      <w:r>
-        <w:rPr>
-          <w:rFonts w:ascii="Garamond" w:hAnsi="Garamond"/>
-          <w:sz w:val="22"/>
-          <w:szCs w:val="22"/>
-        </w:rPr>
-        <w:t xml:space="preserve">variability in contribution patterns, ordered from </w:t>
-      </w:r>
-      <w:r>
-        <w:rPr>
-          <w:rFonts w:ascii="Garamond" w:hAnsi="Garamond"/>
-          <w:sz w:val="22"/>
-          <w:szCs w:val="22"/>
-        </w:rPr>
-        <w:t xml:space="preserve">the most </w:t>
-      </w:r>
-      <w:r>
-        <w:rPr>
-          <w:rFonts w:ascii="Garamond" w:hAnsi="Garamond"/>
-          <w:sz w:val="22"/>
-          <w:szCs w:val="22"/>
-        </w:rPr>
-        <w:t xml:space="preserve">upstream to </w:t>
-      </w:r>
-      <w:r>
-        <w:rPr>
-          <w:rFonts w:ascii="Garamond" w:hAnsi="Garamond"/>
-          <w:sz w:val="22"/>
-          <w:szCs w:val="22"/>
-        </w:rPr>
-        <w:t xml:space="preserve">the furthest </w:t>
-      </w:r>
-      <w:r>
-        <w:rPr>
-          <w:rFonts w:ascii="Garamond" w:hAnsi="Garamond"/>
-          <w:sz w:val="22"/>
-          <w:szCs w:val="22"/>
-        </w:rPr>
-        <w:t>downstream locations</w:t>
-      </w:r>
-      <w:r>
-        <w:rPr>
-          <w:rFonts w:ascii="Garamond" w:hAnsi="Garamond"/>
-          <w:sz w:val="22"/>
-          <w:szCs w:val="22"/>
-        </w:rPr>
-        <w:t xml:space="preserve"> (Figure 3). </w:t>
-      </w:r>
-      <w:r>
-        <w:rPr>
-          <w:rFonts w:ascii="Garamond" w:hAnsi="Garamond"/>
-          <w:sz w:val="22"/>
-          <w:szCs w:val="22"/>
-        </w:rPr>
-        <w:t xml:space="preserve">Cumulative distribution functions were constructed using 3-day intervals throughout each run. For each interval, </w:t>
-      </w:r>
-      <w:r>
-        <w:rPr>
-          <w:rFonts w:ascii="Garamond" w:hAnsi="Garamond"/>
-          <w:sz w:val="22"/>
-          <w:szCs w:val="22"/>
-        </w:rPr>
-        <w:t xml:space="preserve">estimates of the returns at the tributary scale were aggregated into management units and compared against the full-season total for that stock. The resulting data represent the proportion of the total contribution of each stock present at each </w:t>
-      </w:r>
-      <w:proofErr w:type="gramStart"/>
-      <w:r>
-        <w:rPr>
-          <w:rFonts w:ascii="Garamond" w:hAnsi="Garamond"/>
-          <w:sz w:val="22"/>
-          <w:szCs w:val="22"/>
-        </w:rPr>
-        <w:t>3 day</w:t>
-      </w:r>
-      <w:proofErr w:type="gramEnd"/>
-      <w:r>
-        <w:rPr>
-          <w:rFonts w:ascii="Garamond" w:hAnsi="Garamond"/>
-          <w:sz w:val="22"/>
-          <w:szCs w:val="22"/>
-        </w:rPr>
-        <w:t xml:space="preserve"> interval in the run. </w:t>
-      </w:r>
-      <w:r>
-        <w:rPr>
-          <w:rFonts w:ascii="Garamond" w:hAnsi="Garamond"/>
-          <w:sz w:val="22"/>
-          <w:szCs w:val="22"/>
-        </w:rPr>
-        <w:t xml:space="preserve">To assess the </w:t>
-      </w:r>
-      <w:r>
-        <w:rPr>
-          <w:rFonts w:ascii="Garamond" w:hAnsi="Garamond"/>
-          <w:sz w:val="22"/>
-          <w:szCs w:val="22"/>
-        </w:rPr>
-        <w:t xml:space="preserve">relative protection afforded to stocks by a </w:t>
-      </w:r>
-      <w:proofErr w:type="gramStart"/>
-      <w:r>
-        <w:rPr>
-          <w:rFonts w:ascii="Garamond" w:hAnsi="Garamond"/>
-          <w:sz w:val="22"/>
-          <w:szCs w:val="22"/>
-        </w:rPr>
-        <w:t>front end</w:t>
-      </w:r>
-      <w:proofErr w:type="gramEnd"/>
-      <w:r>
-        <w:rPr>
-          <w:rFonts w:ascii="Garamond" w:hAnsi="Garamond"/>
-          <w:sz w:val="22"/>
-          <w:szCs w:val="22"/>
-        </w:rPr>
-        <w:t xml:space="preserve"> closure ending on June 11</w:t>
-      </w:r>
-      <w:r>
-        <w:rPr>
-          <w:rFonts w:ascii="Garamond" w:hAnsi="Garamond"/>
-          <w:sz w:val="22"/>
-          <w:szCs w:val="22"/>
-          <w:vertAlign w:val="superscript"/>
-        </w:rPr>
-        <w:t>th</w:t>
-      </w:r>
-      <w:r>
-        <w:rPr>
-          <w:rFonts w:ascii="Garamond" w:hAnsi="Garamond"/>
-          <w:sz w:val="22"/>
-          <w:szCs w:val="22"/>
-        </w:rPr>
-        <w:t xml:space="preserve">, </w:t>
-      </w:r>
-      <w:r>
-        <w:rPr>
-          <w:rFonts w:ascii="Garamond" w:hAnsi="Garamond"/>
-          <w:sz w:val="22"/>
-          <w:szCs w:val="22"/>
-        </w:rPr>
-        <w:t xml:space="preserve">we quantified the proportion of each </w:t>
-      </w:r>
-      <w:r>
-        <w:rPr>
-          <w:rFonts w:ascii="Garamond" w:hAnsi="Garamond"/>
-          <w:sz w:val="22"/>
-          <w:szCs w:val="22"/>
-        </w:rPr>
-        <w:t xml:space="preserve">stock’s </w:t>
-      </w:r>
-      <w:r>
-        <w:rPr>
-          <w:rFonts w:ascii="Garamond" w:hAnsi="Garamond"/>
-          <w:sz w:val="22"/>
-          <w:szCs w:val="22"/>
-        </w:rPr>
-        <w:t xml:space="preserve">annual </w:t>
-      </w:r>
-      <w:r>
-        <w:rPr>
-          <w:rFonts w:ascii="Garamond" w:hAnsi="Garamond"/>
-          <w:sz w:val="22"/>
-          <w:szCs w:val="22"/>
-        </w:rPr>
-        <w:t>returns which</w:t>
-      </w:r>
-      <w:r>
-        <w:rPr>
-          <w:rFonts w:ascii="Garamond" w:hAnsi="Garamond"/>
-          <w:sz w:val="22"/>
-          <w:szCs w:val="22"/>
-        </w:rPr>
-        <w:t xml:space="preserve"> occur within the current closure window</w:t>
-      </w:r>
-      <w:r>
-        <w:rPr>
-          <w:rFonts w:ascii="Garamond" w:hAnsi="Garamond"/>
-          <w:sz w:val="22"/>
-          <w:szCs w:val="22"/>
-        </w:rPr>
-        <w:t xml:space="preserve"> (Q1 in our subset dataset). </w:t>
+        <w:rPr>
+          <w:rFonts w:ascii="Garamond" w:hAnsi="Garamond"/>
+          <w:b/>
+          <w:bCs/>
+          <w:sz w:val="22"/>
+          <w:szCs w:val="22"/>
+        </w:rPr>
+      </w:pPr>
+      <w:r>
+        <w:rPr>
+          <w:rFonts w:ascii="Garamond" w:hAnsi="Garamond"/>
+          <w:b/>
+          <w:bCs/>
+          <w:sz w:val="22"/>
+          <w:szCs w:val="22"/>
+        </w:rPr>
+        <w:t xml:space="preserve">Stock </w:t>
+      </w:r>
+      <w:r>
+        <w:rPr>
+          <w:rFonts w:ascii="Garamond" w:hAnsi="Garamond"/>
+          <w:b/>
+          <w:bCs/>
+          <w:sz w:val="22"/>
+          <w:szCs w:val="22"/>
+        </w:rPr>
+        <w:t>C</w:t>
+      </w:r>
+      <w:r>
+        <w:rPr>
+          <w:rFonts w:ascii="Garamond" w:hAnsi="Garamond"/>
+          <w:b/>
+          <w:bCs/>
+          <w:sz w:val="22"/>
+          <w:szCs w:val="22"/>
+        </w:rPr>
+        <w:t xml:space="preserve">ontribution </w:t>
+      </w:r>
+      <w:r>
+        <w:rPr>
+          <w:rFonts w:ascii="Garamond" w:hAnsi="Garamond"/>
+          <w:b/>
+          <w:bCs/>
+          <w:sz w:val="22"/>
+          <w:szCs w:val="22"/>
+        </w:rPr>
+        <w:t>A</w:t>
+      </w:r>
+      <w:r>
+        <w:rPr>
+          <w:rFonts w:ascii="Garamond" w:hAnsi="Garamond"/>
+          <w:b/>
+          <w:bCs/>
+          <w:sz w:val="22"/>
+          <w:szCs w:val="22"/>
+        </w:rPr>
+        <w:t xml:space="preserve">nalysis </w:t>
       </w:r>
     </w:p>
     <w:p>
       <w:pPr>
         <w:spacing w:line="480" w:lineRule="auto"/>
+        <w:ind w:firstLine="720"/>
         <w:rPr>
           <w:rFonts w:ascii="Garamond" w:hAnsi="Garamond"/>
           <w:b/>
@@ -4741,18 +4961,23 @@
           <w:szCs w:val="22"/>
         </w:rPr>
       </w:pPr>
-    </w:p>
-    <w:p>
-      <w:pPr>
-        <w:spacing w:line="480" w:lineRule="auto"/>
-        <w:rPr>
-          <w:rFonts w:ascii="Garamond" w:hAnsi="Garamond"/>
-          <w:b/>
-          <w:bCs/>
-          <w:sz w:val="22"/>
-          <w:szCs w:val="22"/>
-        </w:rPr>
-      </w:pPr>
+      <w:r>
+        <w:rPr>
+          <w:rFonts w:ascii="Garamond" w:hAnsi="Garamond"/>
+          <w:sz w:val="22"/>
+          <w:szCs w:val="22"/>
+        </w:rPr>
+        <w:t xml:space="preserve">For each year and seasonal quartile, tributary-level natal origin estimates were aggregated into management units and normalized to sum to one across the basin, representing each unit's proportional contribution to the seasonal quartile. Summary statistics were then calculated across all years for each management unit, with Figure 3a displaying mean contributions by management unit (darker colors indicating higher values) and corresponding boxplots showing median and range values for each quartile, ordered from furthest upstream (top) to downstream (bottom) by watershed position. Cumulative distribution functions were constructed to examine relative run timing independent of stock abundance by aggregating natal origin distributions by management unit for each 3-day interval and comparing against full-season totals without normalization, allowing comparison of actual return numbers over time and showing the cumulative proportion of each stock's total seasonal contribution at each time point. To evaluate the stock-specific effect of the current implemented front-end closure, we evaluated the proportion of each stock's total return occurring within the current closure window (the first seasonal quartile in our dataset). The relative protection </w:t>
+      </w:r>
+      <w:r>
+        <w:rPr>
+          <w:rFonts w:ascii="Garamond" w:hAnsi="Garamond"/>
+          <w:sz w:val="22"/>
+          <w:szCs w:val="22"/>
+        </w:rPr>
+        <w:lastRenderedPageBreak/>
+        <w:t>across all years was used produce boxplots visualizing the variability in this protection over the dataset, again ordered from furthest upstream to furthest downstream.</w:t>
+      </w:r>
     </w:p>
     <w:p>
       <w:pPr>
@@ -4785,7 +5010,6 @@
           <w:sz w:val="36"/>
           <w:szCs w:val="36"/>
         </w:rPr>
-        <w:lastRenderedPageBreak/>
         <w:t>Results</w:t>
       </w:r>
     </w:p>
@@ -4935,7 +5159,23 @@
           <w:sz w:val="22"/>
           <w:szCs w:val="22"/>
         </w:rPr>
-        <w:t xml:space="preserve"> as the season progressed. Early season returns (Q1: start of run through June 11) were </w:t>
+        <w:t xml:space="preserve"> as the season progressed. Early season returns (Q1: start of run through June 11</w:t>
+      </w:r>
+      <w:r>
+        <w:rPr>
+          <w:rFonts w:ascii="Garamond" w:hAnsi="Garamond"/>
+          <w:sz w:val="22"/>
+          <w:szCs w:val="22"/>
+        </w:rPr>
+        <w:t>, Figure 3a.</w:t>
+      </w:r>
+      <w:r>
+        <w:rPr>
+          <w:rFonts w:ascii="Garamond" w:hAnsi="Garamond"/>
+          <w:sz w:val="22"/>
+          <w:szCs w:val="22"/>
+        </w:rPr>
+        <w:t xml:space="preserve">) were </w:t>
       </w:r>
       <w:r>
         <w:rPr>
@@ -4983,7 +5223,23 @@
           <w:sz w:val="22"/>
           <w:szCs w:val="22"/>
         </w:rPr>
-        <w:t xml:space="preserve">median 12.8%, range 4.6 – 16.1%), Swift River (median: 11.6%, range 5.7-14.4%), Stony River (median: 10.5%, range 9.6-12.4%), and Upper Kuskokwim Main (median: 8.9%, range 5.5-10.8%). Notably, the uppermost stocks (North, East, and South Fork Kuskokwim) consistently contributed very little (&lt; 2.5%) and the </w:t>
+        <w:t>median 12.8%, range 4.6 – 16.1%), Swift River (median: 11.6%, range 5.7-14.4%), Stony River (median: 10.5%, range 9.6-12.4%), and Upper Kuskokwim Main (median: 8.9%, range 5.5-10.8%)</w:t>
+      </w:r>
+      <w:r>
+        <w:rPr>
+          <w:rFonts w:ascii="Garamond" w:hAnsi="Garamond"/>
+          <w:sz w:val="22"/>
+          <w:szCs w:val="22"/>
+        </w:rPr>
+        <w:t xml:space="preserve">. </w:t>
+      </w:r>
+      <w:r>
+        <w:rPr>
+          <w:rFonts w:ascii="Garamond" w:hAnsi="Garamond"/>
+          <w:sz w:val="22"/>
+          <w:szCs w:val="22"/>
+        </w:rPr>
+        <w:t xml:space="preserve">Notably, the uppermost stocks (North, East, and South Fork Kuskokwim) consistently contributed very little (&lt; 2.5%) and the </w:t>
       </w:r>
       <w:proofErr w:type="spellStart"/>
       <w:r>
@@ -5001,7 +5257,23 @@
           <w:sz w:val="22"/>
           <w:szCs w:val="22"/>
         </w:rPr>
-        <w:t xml:space="preserve"> and Nixon fork and </w:t>
+        <w:t xml:space="preserve"> and Nixon fork </w:t>
+      </w:r>
+      <w:r>
+        <w:rPr>
+          <w:rFonts w:ascii="Garamond" w:hAnsi="Garamond"/>
+          <w:sz w:val="22"/>
+          <w:szCs w:val="22"/>
+        </w:rPr>
+        <w:t>stock as well as the</w:t>
+      </w:r>
+      <w:r>
+        <w:rPr>
+          <w:rFonts w:ascii="Garamond" w:hAnsi="Garamond"/>
+          <w:sz w:val="22"/>
+          <w:szCs w:val="22"/>
+        </w:rPr>
+        <w:t xml:space="preserve"> </w:t>
       </w:r>
       <w:proofErr w:type="spellStart"/>
       <w:r>
@@ -5019,7 +5291,23 @@
           <w:sz w:val="22"/>
           <w:szCs w:val="22"/>
         </w:rPr>
-        <w:t xml:space="preserve"> stocks each contributed only modestly (median 3% and 5% respectively) despite their position near the top of the watershed. The second quartile </w:t>
+        <w:t xml:space="preserve"> </w:t>
+      </w:r>
+      <w:r>
+        <w:rPr>
+          <w:rFonts w:ascii="Garamond" w:hAnsi="Garamond"/>
+          <w:sz w:val="22"/>
+          <w:szCs w:val="22"/>
+        </w:rPr>
+        <w:t xml:space="preserve">river </w:t>
+      </w:r>
+      <w:r>
+        <w:rPr>
+          <w:rFonts w:ascii="Garamond" w:hAnsi="Garamond"/>
+          <w:sz w:val="22"/>
+          <w:szCs w:val="22"/>
+        </w:rPr>
+        <w:t xml:space="preserve">stock each contributed only modestly (median 3% and 5% respectively) despite their position near the top of the watershed. The second quartile </w:t>
       </w:r>
       <w:proofErr w:type="gramStart"/>
       <w:r>
@@ -5079,7 +5367,15 @@
           <w:sz w:val="22"/>
           <w:szCs w:val="22"/>
         </w:rPr>
-        <w:t xml:space="preserve">) saw a more even distribution of returns across much of the middle watershed, with Upper Kuskokwim Main, Big River, </w:t>
+        <w:t>, Figure 3b.)</w:t>
+      </w:r>
+      <w:r>
+        <w:rPr>
+          <w:rFonts w:ascii="Garamond" w:hAnsi="Garamond"/>
+          <w:sz w:val="22"/>
+          <w:szCs w:val="22"/>
+        </w:rPr>
+        <w:t xml:space="preserve"> saw a more even distribution of returns across much of the middle watershed, with Upper Kuskokwim Main, Big River, </w:t>
       </w:r>
       <w:proofErr w:type="spellStart"/>
       <w:r>
@@ -5133,7 +5429,23 @@
           <w:sz w:val="22"/>
           <w:szCs w:val="22"/>
         </w:rPr>
-        <w:t xml:space="preserve"> River, Middle Kuskokwim Main, Aniak, and </w:t>
+        <w:t xml:space="preserve"> River, Middle Kuskokwim Main, Aniak</w:t>
+      </w:r>
+      <w:r>
+        <w:rPr>
+          <w:rFonts w:ascii="Garamond" w:hAnsi="Garamond"/>
+          <w:sz w:val="22"/>
+          <w:szCs w:val="22"/>
+        </w:rPr>
+        <w:t xml:space="preserve"> River</w:t>
+      </w:r>
+      <w:r>
+        <w:rPr>
+          <w:rFonts w:ascii="Garamond" w:hAnsi="Garamond"/>
+          <w:sz w:val="22"/>
+          <w:szCs w:val="22"/>
+        </w:rPr>
+        <w:t xml:space="preserve">, and </w:t>
       </w:r>
       <w:proofErr w:type="spellStart"/>
       <w:r>
@@ -5202,25 +5514,39 @@
           <w:sz w:val="22"/>
           <w:szCs w:val="22"/>
         </w:rPr>
-        <w:t>-July1st</w:t>
-      </w:r>
-      <w:proofErr w:type="gramStart"/>
-      <w:r>
-        <w:rPr>
-          <w:rFonts w:ascii="Garamond" w:hAnsi="Garamond"/>
-          <w:sz w:val="22"/>
-          <w:szCs w:val="22"/>
-        </w:rPr>
-        <w:t>) ,</w:t>
-      </w:r>
-      <w:proofErr w:type="gramEnd"/>
-      <w:r>
-        <w:rPr>
-          <w:rFonts w:ascii="Garamond" w:hAnsi="Garamond"/>
-          <w:sz w:val="22"/>
-          <w:szCs w:val="22"/>
-        </w:rPr>
-        <w:t xml:space="preserve"> but with increased contribution from the </w:t>
+        <w:t>-</w:t>
+      </w:r>
+      <w:r>
+        <w:rPr>
+          <w:rFonts w:ascii="Garamond" w:hAnsi="Garamond"/>
+          <w:sz w:val="22"/>
+          <w:szCs w:val="22"/>
+        </w:rPr>
+        <w:t xml:space="preserve"> </w:t>
+      </w:r>
+      <w:r>
+        <w:rPr>
+          <w:rFonts w:ascii="Garamond" w:hAnsi="Garamond"/>
+          <w:sz w:val="22"/>
+          <w:szCs w:val="22"/>
+        </w:rPr>
+        <w:t>July1st</w:t>
+      </w:r>
+      <w:r>
+        <w:rPr>
+          <w:rFonts w:ascii="Garamond" w:hAnsi="Garamond"/>
+          <w:sz w:val="22"/>
+          <w:szCs w:val="22"/>
+        </w:rPr>
+        <w:t>, Figure 3c.</w:t>
+      </w:r>
+      <w:r>
+        <w:rPr>
+          <w:rFonts w:ascii="Garamond" w:hAnsi="Garamond"/>
+          <w:sz w:val="22"/>
+          <w:szCs w:val="22"/>
+        </w:rPr>
+        <w:t xml:space="preserve">), but with increased contribution from the </w:t>
       </w:r>
       <w:proofErr w:type="spellStart"/>
       <w:r>
@@ -5258,6 +5584,47 @@
         </w:rPr>
         <w:t xml:space="preserve"> River (median 9.6%, range 8.8-12.2%), and Aniak river (median 8.2%, range 5.7-10.1%). </w:t>
       </w:r>
+      <w:r>
+        <w:rPr>
+          <w:rFonts w:ascii="Garamond" w:hAnsi="Garamond"/>
+          <w:sz w:val="22"/>
+          <w:szCs w:val="22"/>
+        </w:rPr>
+        <w:t>Late season returns (July 2</w:t>
+      </w:r>
+      <w:r>
+        <w:rPr>
+          <w:rFonts w:ascii="Garamond" w:hAnsi="Garamond"/>
+          <w:sz w:val="22"/>
+          <w:szCs w:val="22"/>
+          <w:vertAlign w:val="superscript"/>
+        </w:rPr>
+        <w:t>nd</w:t>
+      </w:r>
+      <w:r>
+        <w:rPr>
+          <w:rFonts w:ascii="Garamond" w:hAnsi="Garamond"/>
+          <w:sz w:val="22"/>
+          <w:szCs w:val="22"/>
+        </w:rPr>
+        <w:t xml:space="preserve"> onward</w:t>
+      </w:r>
+      <w:r>
+        <w:rPr>
+          <w:rFonts w:ascii="Garamond" w:hAnsi="Garamond"/>
+          <w:sz w:val="22"/>
+          <w:szCs w:val="22"/>
+        </w:rPr>
+        <w:t>, Figure 3d.</w:t>
+      </w:r>
+      <w:r>
+        <w:rPr>
+          <w:rFonts w:ascii="Garamond" w:hAnsi="Garamond"/>
+          <w:sz w:val="22"/>
+          <w:szCs w:val="22"/>
+        </w:rPr>
+        <w:t>) displayed further decreasing contribution from Upper Kuskokwim stocks (</w:t>
+      </w:r>
       <w:proofErr w:type="spellStart"/>
       <w:r>
         <w:rPr>
@@ -5265,7 +5632,7 @@
           <w:sz w:val="22"/>
           <w:szCs w:val="22"/>
         </w:rPr>
-        <w:t>lLate</w:t>
+        <w:t>i.e</w:t>
       </w:r>
       <w:proofErr w:type="spellEnd"/>
       <w:r>
@@ -5274,24 +5641,7 @@
           <w:sz w:val="22"/>
           <w:szCs w:val="22"/>
         </w:rPr>
-        <w:t xml:space="preserve"> season returns (July 2</w:t>
-      </w:r>
-      <w:r>
-        <w:rPr>
-          <w:rFonts w:ascii="Garamond" w:hAnsi="Garamond"/>
-          <w:sz w:val="22"/>
-          <w:szCs w:val="22"/>
-          <w:vertAlign w:val="superscript"/>
-        </w:rPr>
-        <w:t>nd</w:t>
-      </w:r>
-      <w:r>
-        <w:rPr>
-          <w:rFonts w:ascii="Garamond" w:hAnsi="Garamond"/>
-          <w:sz w:val="22"/>
-          <w:szCs w:val="22"/>
-        </w:rPr>
-        <w:t xml:space="preserve"> onward) displayed further decreasing contribution from Upper Kuskokwim stocks (</w:t>
+        <w:t xml:space="preserve"> Upper Kuskokwim Main, Big River, </w:t>
       </w:r>
       <w:proofErr w:type="spellStart"/>
       <w:r>
@@ -5300,7 +5650,7 @@
           <w:sz w:val="22"/>
           <w:szCs w:val="22"/>
         </w:rPr>
-        <w:t>i.e</w:t>
+        <w:t>Takotna</w:t>
       </w:r>
       <w:proofErr w:type="spellEnd"/>
       <w:r>
@@ -5309,7 +5659,7 @@
           <w:sz w:val="22"/>
           <w:szCs w:val="22"/>
         </w:rPr>
-        <w:t xml:space="preserve"> Upper Kuskokwim Main, Big River, </w:t>
+        <w:t xml:space="preserve"> River and Nixon Fork, </w:t>
       </w:r>
       <w:proofErr w:type="spellStart"/>
       <w:r>
@@ -5318,7 +5668,7 @@
           <w:sz w:val="22"/>
           <w:szCs w:val="22"/>
         </w:rPr>
-        <w:t>Takotna</w:t>
+        <w:t>Tatlawiksuk</w:t>
       </w:r>
       <w:proofErr w:type="spellEnd"/>
       <w:r>
@@ -5327,7 +5677,7 @@
           <w:sz w:val="22"/>
           <w:szCs w:val="22"/>
         </w:rPr>
-        <w:t xml:space="preserve"> River and Nixon Fork, </w:t>
+        <w:t xml:space="preserve"> River, and Swift River). The </w:t>
       </w:r>
       <w:proofErr w:type="spellStart"/>
       <w:r>
@@ -5336,7 +5686,7 @@
           <w:sz w:val="22"/>
           <w:szCs w:val="22"/>
         </w:rPr>
-        <w:t>Tatlawiksuk</w:t>
+        <w:t>Hoholitna</w:t>
       </w:r>
       <w:proofErr w:type="spellEnd"/>
       <w:r>
@@ -5345,24 +5695,6 @@
           <w:sz w:val="22"/>
           <w:szCs w:val="22"/>
         </w:rPr>
-        <w:t xml:space="preserve"> River, and Swift River). The </w:t>
-      </w:r>
-      <w:proofErr w:type="spellStart"/>
-      <w:r>
-        <w:rPr>
-          <w:rFonts w:ascii="Garamond" w:hAnsi="Garamond"/>
-          <w:sz w:val="22"/>
-          <w:szCs w:val="22"/>
-        </w:rPr>
-        <w:t>Hoholitna</w:t>
-      </w:r>
-      <w:proofErr w:type="spellEnd"/>
-      <w:r>
-        <w:rPr>
-          <w:rFonts w:ascii="Garamond" w:hAnsi="Garamond"/>
-          <w:sz w:val="22"/>
-          <w:szCs w:val="22"/>
-        </w:rPr>
         <w:t xml:space="preserve"> and Middle Kuskokwim River saw slight decreases and increases in contribution, respectively, but with </w:t>
       </w:r>
       <w:r>
@@ -5379,7 +5711,16 @@
           <w:sz w:val="22"/>
           <w:szCs w:val="22"/>
         </w:rPr>
-        <w:t xml:space="preserve">increase in range indicating variability </w:t>
+        <w:t xml:space="preserve">increase in range </w:t>
+      </w:r>
+      <w:r>
+        <w:rPr>
+          <w:rFonts w:ascii="Garamond" w:hAnsi="Garamond"/>
+          <w:sz w:val="22"/>
+          <w:szCs w:val="22"/>
+        </w:rPr>
+        <w:lastRenderedPageBreak/>
+        <w:t xml:space="preserve">indicating variability </w:t>
       </w:r>
       <w:r>
         <w:rPr>
@@ -5527,7 +5868,6 @@
           <w:sz w:val="22"/>
           <w:szCs w:val="22"/>
         </w:rPr>
-        <w:lastRenderedPageBreak/>
         <w:t xml:space="preserve">Cumulative distribution plots </w:t>
       </w:r>
       <w:r>
@@ -5591,37 +5931,64 @@
           <w:rFonts w:ascii="Garamond" w:hAnsi="Garamond"/>
           <w:sz w:val="22"/>
           <w:szCs w:val="22"/>
-          <w:highlight w:val="yellow"/>
-        </w:rPr>
-        <w:t xml:space="preserve">The results display a clear pattern of </w:t>
-      </w:r>
-      <w:proofErr w:type="gramStart"/>
-      <w:r>
-        <w:rPr>
-          <w:rFonts w:ascii="Garamond" w:hAnsi="Garamond"/>
-          <w:sz w:val="22"/>
-          <w:szCs w:val="22"/>
-          <w:highlight w:val="yellow"/>
-        </w:rPr>
-        <w:t>earliest</w:t>
-      </w:r>
-      <w:proofErr w:type="gramEnd"/>
-      <w:r>
-        <w:rPr>
-          <w:rFonts w:ascii="Garamond" w:hAnsi="Garamond"/>
-          <w:sz w:val="22"/>
-          <w:szCs w:val="22"/>
-          <w:highlight w:val="yellow"/>
-        </w:rPr>
-        <w:t xml:space="preserve"> returning stocks (closer to red) arriving earlier in the season, with 50% of the run for stocks such as the East Fork Kuskokwim and Big River arriving within X days of the start of the run.</w:t>
-      </w:r>
-      <w:r>
-        <w:rPr>
-          <w:rFonts w:ascii="Garamond" w:hAnsi="Garamond"/>
-          <w:sz w:val="22"/>
-          <w:szCs w:val="22"/>
-        </w:rPr>
-        <w:t xml:space="preserve"> In contrast, lower Kuskokwim stocks arrive later in the season, with stocks such as the </w:t>
+        </w:rPr>
+        <w:t xml:space="preserve">The results display a clear pattern of earliest returning stocks (closer to red) arriving earlier in the season, with 50% of the run for stocks such as the East Fork Kuskokwim and Big River arriving within </w:t>
+      </w:r>
+      <w:r>
+        <w:rPr>
+          <w:rFonts w:ascii="Garamond" w:hAnsi="Garamond"/>
+          <w:sz w:val="22"/>
+          <w:szCs w:val="22"/>
+        </w:rPr>
+        <w:t>14 and 16</w:t>
+      </w:r>
+      <w:r>
+        <w:rPr>
+          <w:rFonts w:ascii="Garamond" w:hAnsi="Garamond"/>
+          <w:sz w:val="22"/>
+          <w:szCs w:val="22"/>
+        </w:rPr>
+        <w:t xml:space="preserve"> days </w:t>
+      </w:r>
+      <w:r>
+        <w:rPr>
+          <w:rFonts w:ascii="Garamond" w:hAnsi="Garamond"/>
+          <w:sz w:val="22"/>
+          <w:szCs w:val="22"/>
+        </w:rPr>
+        <w:t xml:space="preserve">from </w:t>
+      </w:r>
+      <w:r>
+        <w:rPr>
+          <w:rFonts w:ascii="Garamond" w:hAnsi="Garamond"/>
+          <w:sz w:val="22"/>
+          <w:szCs w:val="22"/>
+        </w:rPr>
+        <w:t>the start of the run</w:t>
+      </w:r>
+      <w:r>
+        <w:rPr>
+          <w:rFonts w:ascii="Garamond" w:hAnsi="Garamond"/>
+          <w:sz w:val="22"/>
+          <w:szCs w:val="22"/>
+        </w:rPr>
+        <w:t>, on average.</w:t>
+      </w:r>
+      <w:r>
+        <w:rPr>
+          <w:rFonts w:ascii="Garamond" w:hAnsi="Garamond"/>
+          <w:sz w:val="22"/>
+          <w:szCs w:val="22"/>
+        </w:rPr>
+        <w:t xml:space="preserve"> </w:t>
+      </w:r>
+      <w:r>
+        <w:rPr>
+          <w:rFonts w:ascii="Garamond" w:hAnsi="Garamond"/>
+          <w:sz w:val="22"/>
+          <w:szCs w:val="22"/>
+        </w:rPr>
+        <w:t xml:space="preserve">In contrast, lower Kuskokwim stocks arrive later in the season, with stocks such as the </w:t>
       </w:r>
       <w:proofErr w:type="spellStart"/>
       <w:r>
@@ -5639,15 +6006,119 @@
           <w:sz w:val="22"/>
           <w:szCs w:val="22"/>
         </w:rPr>
-        <w:t xml:space="preserve"> and Aniak river reaching 50% of their total run nearly X days from the start of the season. </w:t>
-      </w:r>
-      <w:r>
-        <w:rPr>
-          <w:rFonts w:ascii="Garamond" w:hAnsi="Garamond"/>
-          <w:sz w:val="22"/>
-          <w:szCs w:val="22"/>
-        </w:rPr>
-        <w:t xml:space="preserve">Some variability in this pattern does exist. In 2020, for example, a few of the middle Kuskokwim stocks (yellow or orange) appear to arrive after that of the lowest Kuskokwim stocks. However, the general downstream trajectory of returning stocks remains consistent across our dataset independent of the relative </w:t>
+        <w:t xml:space="preserve"> and Aniak river reaching 50% of their total run nearly </w:t>
+      </w:r>
+      <w:r>
+        <w:rPr>
+          <w:rFonts w:ascii="Garamond" w:hAnsi="Garamond"/>
+          <w:sz w:val="22"/>
+          <w:szCs w:val="22"/>
+        </w:rPr>
+        <w:t xml:space="preserve">23 </w:t>
+      </w:r>
+      <w:r>
+        <w:rPr>
+          <w:rFonts w:ascii="Garamond" w:hAnsi="Garamond"/>
+          <w:sz w:val="22"/>
+          <w:szCs w:val="22"/>
+        </w:rPr>
+        <w:t>days from the start of the season</w:t>
+      </w:r>
+      <w:r>
+        <w:rPr>
+          <w:rFonts w:ascii="Garamond" w:hAnsi="Garamond"/>
+          <w:sz w:val="22"/>
+          <w:szCs w:val="22"/>
+        </w:rPr>
+        <w:t xml:space="preserve"> on average</w:t>
+      </w:r>
+      <w:r>
+        <w:rPr>
+          <w:rFonts w:ascii="Garamond" w:hAnsi="Garamond"/>
+          <w:sz w:val="22"/>
+          <w:szCs w:val="22"/>
+        </w:rPr>
+        <w:t>.</w:t>
+      </w:r>
+      <w:r>
+        <w:rPr>
+          <w:rFonts w:ascii="Garamond" w:hAnsi="Garamond"/>
+          <w:sz w:val="22"/>
+          <w:szCs w:val="22"/>
+        </w:rPr>
+        <w:t xml:space="preserve"> </w:t>
+      </w:r>
+      <w:r>
+        <w:rPr>
+          <w:rFonts w:ascii="Garamond" w:hAnsi="Garamond"/>
+          <w:sz w:val="22"/>
+          <w:szCs w:val="22"/>
+        </w:rPr>
+        <w:t>Some variability in this pattern does exist</w:t>
+      </w:r>
+      <w:r>
+        <w:rPr>
+          <w:rFonts w:ascii="Garamond" w:hAnsi="Garamond"/>
+          <w:sz w:val="22"/>
+          <w:szCs w:val="22"/>
+        </w:rPr>
+        <w:t xml:space="preserve">, with some </w:t>
+      </w:r>
+      <w:r>
+        <w:rPr>
+          <w:rFonts w:ascii="Garamond" w:hAnsi="Garamond"/>
+          <w:sz w:val="22"/>
+          <w:szCs w:val="22"/>
+        </w:rPr>
+        <w:t>middle Kuskokwim stocks (yellow or orange) appear</w:t>
+      </w:r>
+      <w:r>
+        <w:rPr>
+          <w:rFonts w:ascii="Garamond" w:hAnsi="Garamond"/>
+          <w:sz w:val="22"/>
+          <w:szCs w:val="22"/>
+        </w:rPr>
+        <w:t>ing</w:t>
+      </w:r>
+      <w:r>
+        <w:rPr>
+          <w:rFonts w:ascii="Garamond" w:hAnsi="Garamond"/>
+          <w:sz w:val="22"/>
+          <w:szCs w:val="22"/>
+        </w:rPr>
+        <w:t xml:space="preserve"> to arrive </w:t>
+      </w:r>
+      <w:r>
+        <w:rPr>
+          <w:rFonts w:ascii="Garamond" w:hAnsi="Garamond"/>
+          <w:sz w:val="22"/>
+          <w:szCs w:val="22"/>
+        </w:rPr>
+        <w:t xml:space="preserve">with or </w:t>
+      </w:r>
+      <w:r>
+        <w:rPr>
+          <w:rFonts w:ascii="Garamond" w:hAnsi="Garamond"/>
+          <w:sz w:val="22"/>
+          <w:szCs w:val="22"/>
+        </w:rPr>
+        <w:t>after</w:t>
+      </w:r>
+      <w:r>
+        <w:rPr>
+          <w:rFonts w:ascii="Garamond" w:hAnsi="Garamond"/>
+          <w:sz w:val="22"/>
+          <w:szCs w:val="22"/>
+        </w:rPr>
+        <w:t xml:space="preserve"> those in the lower Kuskokwim in some years</w:t>
+      </w:r>
+      <w:r>
+        <w:rPr>
+          <w:rFonts w:ascii="Garamond" w:hAnsi="Garamond"/>
+          <w:sz w:val="22"/>
+          <w:szCs w:val="22"/>
+        </w:rPr>
+        <w:t xml:space="preserve">. However, the general downstream trajectory of returning stocks remains consistent across our dataset independent of the relative </w:t>
       </w:r>
       <w:r>
         <w:rPr>
@@ -5697,31 +6168,13 @@
         </w:rPr>
         <w:t xml:space="preserve">vs </w:t>
       </w:r>
-      <w:proofErr w:type="spellStart"/>
-      <w:r>
-        <w:rPr>
-          <w:rFonts w:ascii="Garamond" w:hAnsi="Garamond"/>
-          <w:sz w:val="22"/>
-          <w:szCs w:val="22"/>
-        </w:rPr>
-        <w:t>e</w:t>
-      </w:r>
-      <w:r>
-        <w:rPr>
-          <w:rFonts w:ascii="Garamond" w:hAnsi="Garamond"/>
-          <w:sz w:val="22"/>
-          <w:szCs w:val="22"/>
-        </w:rPr>
-        <w:t>extended</w:t>
-      </w:r>
-      <w:proofErr w:type="spellEnd"/>
-      <w:r>
-        <w:rPr>
-          <w:rFonts w:ascii="Garamond" w:hAnsi="Garamond"/>
-          <w:sz w:val="22"/>
-          <w:szCs w:val="22"/>
-        </w:rPr>
-        <w:t>)</w:t>
+      <w:r>
+        <w:rPr>
+          <w:rFonts w:ascii="Garamond" w:hAnsi="Garamond"/>
+          <w:sz w:val="22"/>
+          <w:szCs w:val="22"/>
+        </w:rPr>
+        <w:t>extended)</w:t>
       </w:r>
       <w:r>
         <w:rPr>
@@ -5778,7 +6231,7 @@
           <w:sz w:val="22"/>
           <w:szCs w:val="22"/>
         </w:rPr>
-        <w:t xml:space="preserve">A pattern of early returning upper Kuskokwim stocks clearly affords higher protection </w:t>
+        <w:t xml:space="preserve">A pattern of early returning upper Kuskokwim stocks clearly affords higher protection to these stocks from a </w:t>
       </w:r>
       <w:proofErr w:type="gramStart"/>
       <w:r>
@@ -5787,7 +6240,7 @@
           <w:sz w:val="22"/>
           <w:szCs w:val="22"/>
         </w:rPr>
-        <w:t>to</w:t>
+        <w:t>front end</w:t>
       </w:r>
       <w:proofErr w:type="gramEnd"/>
       <w:r>
@@ -5796,7 +6249,103 @@
           <w:sz w:val="22"/>
           <w:szCs w:val="22"/>
         </w:rPr>
-        <w:t xml:space="preserve"> these stocks from a </w:t>
+        <w:t xml:space="preserve"> closure ending on June 12</w:t>
+      </w:r>
+      <w:r>
+        <w:rPr>
+          <w:rFonts w:ascii="Garamond" w:hAnsi="Garamond"/>
+          <w:sz w:val="22"/>
+          <w:szCs w:val="22"/>
+          <w:vertAlign w:val="superscript"/>
+        </w:rPr>
+        <w:t>th</w:t>
+      </w:r>
+      <w:r>
+        <w:rPr>
+          <w:rFonts w:ascii="Garamond" w:hAnsi="Garamond"/>
+          <w:sz w:val="22"/>
+          <w:szCs w:val="22"/>
+        </w:rPr>
+        <w:t xml:space="preserve">.  Nearly all stocks upstream of Swift River received median protection &gt;10% of the total stock contribution across all years of our dataset, with several notable </w:t>
+      </w:r>
+      <w:proofErr w:type="spellStart"/>
+      <w:r>
+        <w:rPr>
+          <w:rFonts w:ascii="Garamond" w:hAnsi="Garamond"/>
+          <w:sz w:val="22"/>
+          <w:szCs w:val="22"/>
+        </w:rPr>
+        <w:t>outlkiers</w:t>
+      </w:r>
+      <w:proofErr w:type="spellEnd"/>
+      <w:r>
+        <w:rPr>
+          <w:rFonts w:ascii="Garamond" w:hAnsi="Garamond"/>
+          <w:sz w:val="22"/>
+          <w:szCs w:val="22"/>
+        </w:rPr>
+        <w:t xml:space="preserve"> &gt;30% protection in some years. An exception is the </w:t>
+      </w:r>
+      <w:proofErr w:type="spellStart"/>
+      <w:r>
+        <w:rPr>
+          <w:rFonts w:ascii="Garamond" w:hAnsi="Garamond"/>
+          <w:sz w:val="22"/>
+          <w:szCs w:val="22"/>
+        </w:rPr>
+        <w:t>Takotna</w:t>
+      </w:r>
+      <w:proofErr w:type="spellEnd"/>
+      <w:r>
+        <w:rPr>
+          <w:rFonts w:ascii="Garamond" w:hAnsi="Garamond"/>
+          <w:sz w:val="22"/>
+          <w:szCs w:val="22"/>
+        </w:rPr>
+        <w:t xml:space="preserve"> river and Nixon Fork stocks, which received a median protection of only 6.6%. Several stocks which contribute only minimally to the overall run are afforded significant protection. For example, although the East Fork Kuskokwim contributes minimally to the total run</w:t>
+      </w:r>
+      <w:r>
+        <w:rPr>
+          <w:rFonts w:ascii="Garamond" w:hAnsi="Garamond"/>
+          <w:sz w:val="22"/>
+          <w:szCs w:val="22"/>
+        </w:rPr>
+        <w:t xml:space="preserve"> (~2-3% annually), approximately one-quarter of its total returns are protected by a front-end closure. </w:t>
+      </w:r>
+      <w:r>
+        <w:rPr>
+          <w:rFonts w:ascii="Garamond" w:hAnsi="Garamond"/>
+          <w:sz w:val="22"/>
+          <w:szCs w:val="22"/>
+        </w:rPr>
+        <w:t xml:space="preserve">Stocks positioned lower in the watershed received less protection due to their generally late arrival, with all stocks downstream or the Swift River receiving </w:t>
+      </w:r>
+      <w:r>
+        <w:rPr>
+          <w:rFonts w:ascii="Garamond" w:hAnsi="Garamond"/>
+          <w:sz w:val="22"/>
+          <w:szCs w:val="22"/>
+        </w:rPr>
+        <w:t xml:space="preserve">median protection of less than 10%. The stony and </w:t>
+      </w:r>
+      <w:proofErr w:type="spellStart"/>
+      <w:r>
+        <w:rPr>
+          <w:rFonts w:ascii="Garamond" w:hAnsi="Garamond"/>
+          <w:sz w:val="22"/>
+          <w:szCs w:val="22"/>
+        </w:rPr>
+        <w:lastRenderedPageBreak/>
+        <w:t>Hoholitna</w:t>
+      </w:r>
+      <w:proofErr w:type="spellEnd"/>
+      <w:r>
+        <w:rPr>
+          <w:rFonts w:ascii="Garamond" w:hAnsi="Garamond"/>
+          <w:sz w:val="22"/>
+          <w:szCs w:val="22"/>
+        </w:rPr>
+        <w:t xml:space="preserve"> River stocks, however, contain outliers of 22.1% and 18.4%, indicating that a </w:t>
       </w:r>
       <w:proofErr w:type="gramStart"/>
       <w:r>
@@ -5814,143 +6363,8 @@
           <w:sz w:val="22"/>
           <w:szCs w:val="22"/>
         </w:rPr>
-        <w:t xml:space="preserve"> closure ending on June 12</w:t>
-      </w:r>
-      <w:r>
-        <w:rPr>
-          <w:rFonts w:ascii="Garamond" w:hAnsi="Garamond"/>
-          <w:sz w:val="22"/>
-          <w:szCs w:val="22"/>
-          <w:vertAlign w:val="superscript"/>
-        </w:rPr>
-        <w:t>th</w:t>
-      </w:r>
-      <w:r>
-        <w:rPr>
-          <w:rFonts w:ascii="Garamond" w:hAnsi="Garamond"/>
-          <w:sz w:val="22"/>
-          <w:szCs w:val="22"/>
-        </w:rPr>
-        <w:t xml:space="preserve">.  Nearly all stocks upstream of Swift River received median protection &gt;10% of the total stock contribution across all years of our dataset, with several notable </w:t>
-      </w:r>
-      <w:proofErr w:type="spellStart"/>
-      <w:r>
-        <w:rPr>
-          <w:rFonts w:ascii="Garamond" w:hAnsi="Garamond"/>
-          <w:sz w:val="22"/>
-          <w:szCs w:val="22"/>
-        </w:rPr>
-        <w:t>outlkiers</w:t>
-      </w:r>
-      <w:proofErr w:type="spellEnd"/>
-      <w:r>
-        <w:rPr>
-          <w:rFonts w:ascii="Garamond" w:hAnsi="Garamond"/>
-          <w:sz w:val="22"/>
-          <w:szCs w:val="22"/>
-        </w:rPr>
-        <w:t xml:space="preserve"> &gt;30% protection in some years. An exception is the </w:t>
-      </w:r>
-      <w:proofErr w:type="spellStart"/>
-      <w:r>
-        <w:rPr>
-          <w:rFonts w:ascii="Garamond" w:hAnsi="Garamond"/>
-          <w:sz w:val="22"/>
-          <w:szCs w:val="22"/>
-        </w:rPr>
-        <w:t>Takotna</w:t>
-      </w:r>
-      <w:proofErr w:type="spellEnd"/>
-      <w:r>
-        <w:rPr>
-          <w:rFonts w:ascii="Garamond" w:hAnsi="Garamond"/>
-          <w:sz w:val="22"/>
-          <w:szCs w:val="22"/>
-        </w:rPr>
-        <w:t xml:space="preserve"> river and Nixon Fork stocks, which received a median protection of only 6.6%. Several stocks which contribute only minimally to the overall run are afforded significant protection. For example, although the East Fork Kuskokwim contributes minimally to the total run</w:t>
-      </w:r>
-      <w:r>
-        <w:rPr>
-          <w:rFonts w:ascii="Garamond" w:hAnsi="Garamond"/>
-          <w:sz w:val="22"/>
-          <w:szCs w:val="22"/>
-        </w:rPr>
-        <w:t xml:space="preserve"> (~2-3% annually), approximately one-quarter of its total returns are protected by a front-end closure. </w:t>
-      </w:r>
-      <w:r>
-        <w:rPr>
-          <w:rFonts w:ascii="Garamond" w:hAnsi="Garamond"/>
-          <w:sz w:val="22"/>
-          <w:szCs w:val="22"/>
-        </w:rPr>
-        <w:t xml:space="preserve">Stocks positioned lower in the watershed received less protection due to their generally late arrival, with all stocks downstream or the Swift River receiving </w:t>
-      </w:r>
-      <w:r>
-        <w:rPr>
-          <w:rFonts w:ascii="Garamond" w:hAnsi="Garamond"/>
-          <w:sz w:val="22"/>
-          <w:szCs w:val="22"/>
-        </w:rPr>
-        <w:t xml:space="preserve">median protection of less than 10%. The stony and </w:t>
-      </w:r>
-      <w:proofErr w:type="spellStart"/>
-      <w:r>
-        <w:rPr>
-          <w:rFonts w:ascii="Garamond" w:hAnsi="Garamond"/>
-          <w:sz w:val="22"/>
-          <w:szCs w:val="22"/>
-        </w:rPr>
-        <w:t>Hoholitna</w:t>
-      </w:r>
-      <w:proofErr w:type="spellEnd"/>
-      <w:r>
-        <w:rPr>
-          <w:rFonts w:ascii="Garamond" w:hAnsi="Garamond"/>
-          <w:sz w:val="22"/>
-          <w:szCs w:val="22"/>
-        </w:rPr>
-        <w:t xml:space="preserve"> River stocks, however, contain outliers of 22.1% and 18.4%, indicating that a </w:t>
-      </w:r>
-      <w:proofErr w:type="gramStart"/>
-      <w:r>
-        <w:rPr>
-          <w:rFonts w:ascii="Garamond" w:hAnsi="Garamond"/>
-          <w:sz w:val="22"/>
-          <w:szCs w:val="22"/>
-        </w:rPr>
-        <w:t>front end</w:t>
-      </w:r>
-      <w:proofErr w:type="gramEnd"/>
-      <w:r>
-        <w:rPr>
-          <w:rFonts w:ascii="Garamond" w:hAnsi="Garamond"/>
-          <w:sz w:val="22"/>
-          <w:szCs w:val="22"/>
-        </w:rPr>
         <w:t xml:space="preserve"> closure may afford these stocks substantial protection in some years. </w:t>
       </w:r>
-    </w:p>
-    <w:p>
-      <w:pPr>
-        <w:pStyle w:val="whitespace-normal"/>
-        <w:spacing w:line="480" w:lineRule="auto"/>
-        <w:rPr>
-          <w:rFonts w:ascii="Garamond" w:hAnsi="Garamond"/>
-          <w:sz w:val="22"/>
-          <w:szCs w:val="22"/>
-        </w:rPr>
-      </w:pPr>
-    </w:p>
-    <w:p>
-      <w:pPr>
-        <w:pStyle w:val="whitespace-normal"/>
-        <w:spacing w:line="480" w:lineRule="auto"/>
-        <w:rPr>
-          <w:rFonts w:ascii="Garamond" w:hAnsi="Garamond"/>
-          <w:sz w:val="22"/>
-          <w:szCs w:val="22"/>
-        </w:rPr>
-      </w:pPr>
     </w:p>
     <w:p>
       <w:pPr>
@@ -5974,7 +6388,6 @@
           <w:szCs w:val="32"/>
           <w:u w:val="single"/>
         </w:rPr>
-        <w:lastRenderedPageBreak/>
         <w:t>Discussion</w:t>
       </w:r>
     </w:p>
@@ -5983,6 +6396,134 @@
         <w:pStyle w:val="whitespace-normal"/>
         <w:spacing w:line="480" w:lineRule="auto"/>
         <w:ind w:firstLine="720"/>
+      </w:pPr>
+      <w:r>
+        <w:rPr>
+          <w:rFonts w:ascii="Garamond" w:hAnsi="Garamond"/>
+          <w:sz w:val="22"/>
+          <w:szCs w:val="22"/>
+        </w:rPr>
+        <w:t xml:space="preserve">The analysis presented here illustrates the spatiotemporal patterns of Chinook salmon in the Kuskokwim river-basin at a finer spatial scale and over a longer </w:t>
+      </w:r>
+      <w:proofErr w:type="spellStart"/>
+      <w:r>
+        <w:rPr>
+          <w:rFonts w:ascii="Garamond" w:hAnsi="Garamond"/>
+          <w:sz w:val="22"/>
+          <w:szCs w:val="22"/>
+        </w:rPr>
+        <w:t>timeperiod</w:t>
+      </w:r>
+      <w:proofErr w:type="spellEnd"/>
+      <w:r>
+        <w:rPr>
+          <w:rFonts w:ascii="Garamond" w:hAnsi="Garamond"/>
+          <w:sz w:val="22"/>
+          <w:szCs w:val="22"/>
+        </w:rPr>
+        <w:t xml:space="preserve"> than had been previously available. </w:t>
+      </w:r>
+      <w:r>
+        <w:rPr>
+          <w:rFonts w:ascii="Garamond" w:hAnsi="Garamond"/>
+          <w:sz w:val="22"/>
+          <w:szCs w:val="22"/>
+        </w:rPr>
+        <w:t>In doing so, we corroborated the relationship between run timing and watershed position</w:t>
+      </w:r>
+      <w:r>
+        <w:rPr>
+          <w:rFonts w:ascii="Garamond" w:hAnsi="Garamond"/>
+          <w:sz w:val="22"/>
+          <w:szCs w:val="22"/>
+        </w:rPr>
+        <w:t xml:space="preserve"> observed preliminarily in the </w:t>
+      </w:r>
+      <w:proofErr w:type="gramStart"/>
+      <w:r>
+        <w:rPr>
+          <w:rFonts w:ascii="Garamond" w:hAnsi="Garamond"/>
+          <w:sz w:val="22"/>
+          <w:szCs w:val="22"/>
+        </w:rPr>
+        <w:t>Kuskokwim river</w:t>
+      </w:r>
+      <w:proofErr w:type="gramEnd"/>
+      <w:r>
+        <w:rPr>
+          <w:rFonts w:ascii="Garamond" w:hAnsi="Garamond"/>
+          <w:sz w:val="22"/>
+          <w:szCs w:val="22"/>
+        </w:rPr>
+        <w:t xml:space="preserve"> basin and elsewhere</w:t>
+      </w:r>
+      <w:r>
+        <w:rPr>
+          <w:rFonts w:ascii="Garamond" w:hAnsi="Garamond"/>
+          <w:sz w:val="22"/>
+          <w:szCs w:val="22"/>
+        </w:rPr>
+        <w:t>, where the earliest stocks return to the upper portions of the watershed while later returning stocks return to lower portions of the watershed.</w:t>
+      </w:r>
+      <w:r>
+        <w:rPr>
+          <w:rFonts w:ascii="Garamond" w:hAnsi="Garamond"/>
+          <w:sz w:val="22"/>
+          <w:szCs w:val="22"/>
+        </w:rPr>
+        <w:t xml:space="preserve"> </w:t>
+      </w:r>
+      <w:r>
+        <w:t>Notably, this pattern persisted throughout our multi-year dataset despite significant differences in run timing (early vs late), duration (extended vs protracted), and overall run strength. The results suggest that these patterns are consistent in the Kuskokwim River Basin and that changes to overall run timing likely result from shifts in the phenology of the entire run rather than shifts in individual stocks.</w:t>
+      </w:r>
+    </w:p>
+    <w:p>
+      <w:pPr>
+        <w:pStyle w:val="whitespace-normal"/>
+        <w:spacing w:line="480" w:lineRule="auto"/>
+        <w:ind w:firstLine="720"/>
+      </w:pPr>
+      <w:r>
+        <w:t xml:space="preserve">The patterns observed here have </w:t>
+      </w:r>
+      <w:proofErr w:type="spellStart"/>
+      <w:r>
+        <w:t>impications</w:t>
+      </w:r>
+      <w:proofErr w:type="spellEnd"/>
+      <w:r>
+        <w:t xml:space="preserve"> for management techniques which aim to protect the biocomplexity in spatial stock structure through strategic closures of the downstream fish</w:t>
+      </w:r>
+    </w:p>
+    <w:p>
+      <w:pPr>
+        <w:pStyle w:val="whitespace-normal"/>
+        <w:spacing w:line="480" w:lineRule="auto"/>
+        <w:ind w:firstLine="720"/>
+        <w:rPr>
+          <w:rFonts w:ascii="Garamond" w:hAnsi="Garamond"/>
+          <w:sz w:val="22"/>
+          <w:szCs w:val="22"/>
+        </w:rPr>
+      </w:pPr>
+    </w:p>
+    <w:p>
+      <w:pPr>
+        <w:pStyle w:val="whitespace-normal"/>
+        <w:spacing w:line="480" w:lineRule="auto"/>
+        <w:ind w:firstLine="720"/>
+        <w:rPr>
+          <w:rFonts w:ascii="Garamond" w:hAnsi="Garamond"/>
+          <w:sz w:val="22"/>
+          <w:szCs w:val="22"/>
+        </w:rPr>
+      </w:pPr>
+    </w:p>
+    <w:p>
+      <w:pPr>
+        <w:pStyle w:val="whitespace-normal"/>
+        <w:spacing w:line="480" w:lineRule="auto"/>
+        <w:ind w:firstLine="720"/>
         <w:rPr>
           <w:rFonts w:ascii="Garamond" w:hAnsi="Garamond"/>
           <w:sz w:val="22"/>
@@ -6013,7 +6554,7 @@
         </w:rPr>
         <w:t xml:space="preserve">over several years and </w:t>
       </w:r>
-      <w:commentRangeStart w:id="17"/>
+      <w:commentRangeStart w:id="16"/>
       <w:r>
         <w:rPr>
           <w:rFonts w:ascii="Garamond" w:hAnsi="Garamond"/>
@@ -6022,7 +6563,7 @@
         </w:rPr>
         <w:t xml:space="preserve">at a finer spatial scale </w:t>
       </w:r>
-      <w:commentRangeEnd w:id="17"/>
+      <w:commentRangeEnd w:id="16"/>
       <w:r>
         <w:rPr>
           <w:rStyle w:val="CommentReference"/>
@@ -6030,7 +6571,7 @@
           <w:kern w:val="2"/>
           <w14:ligatures w14:val="standardContextual"/>
         </w:rPr>
-        <w:commentReference w:id="17"/>
+        <w:commentReference w:id="16"/>
       </w:r>
       <w:r>
         <w:rPr>
@@ -6110,7 +6651,16 @@
           <w:sz w:val="22"/>
           <w:szCs w:val="22"/>
         </w:rPr>
-        <w:t>the findings presented here demonstrate the consistency of which this</w:t>
+        <w:t xml:space="preserve">the findings presented here demonstrate the consistency of </w:t>
+      </w:r>
+      <w:r>
+        <w:rPr>
+          <w:rFonts w:ascii="Garamond" w:hAnsi="Garamond"/>
+          <w:sz w:val="22"/>
+          <w:szCs w:val="22"/>
+        </w:rPr>
+        <w:lastRenderedPageBreak/>
+        <w:t>which this</w:t>
       </w:r>
       <w:r>
         <w:rPr>
@@ -6160,25 +6710,7 @@
           <w:sz w:val="22"/>
           <w:szCs w:val="22"/>
         </w:rPr>
-        <w:t xml:space="preserve"> and McGrath. If overharvest occurs before salmon </w:t>
-      </w:r>
-      <w:proofErr w:type="gramStart"/>
-      <w:r>
-        <w:rPr>
-          <w:rFonts w:ascii="Garamond" w:hAnsi="Garamond"/>
-          <w:sz w:val="22"/>
-          <w:szCs w:val="22"/>
-        </w:rPr>
-        <w:t>reach</w:t>
-      </w:r>
-      <w:proofErr w:type="gramEnd"/>
-      <w:r>
-        <w:rPr>
-          <w:rFonts w:ascii="Garamond" w:hAnsi="Garamond"/>
-          <w:sz w:val="22"/>
-          <w:szCs w:val="22"/>
-        </w:rPr>
-        <w:t xml:space="preserve"> the upper watershed, these communities may face shortfalls in resource availability.</w:t>
+        <w:t xml:space="preserve"> and McGrath. If overharvest occurs before salmon reach the upper watershed, these communities may face shortfalls in resource availability.</w:t>
       </w:r>
     </w:p>
     <w:p>
@@ -6234,7 +6766,7 @@
           <w:sz w:val="22"/>
           <w:szCs w:val="22"/>
         </w:rPr>
-        <w:t xml:space="preserve">These results advance our understanding of Chinook salmon spatial ecology in the Kuskokwim River and contribute to broader insights into salmon dynamics in large river systems. While otolith-based chemical methods used in this study have not been explicitly validated for the Kuskokwim, they have demonstrated </w:t>
+        <w:t xml:space="preserve">These results advance our understanding of Chinook salmon spatial ecology in the Kuskokwim River and contribute to broader insights into salmon dynamics in large river systems. While otolith-based chemical methods used in this study have not been explicitly validated for the Kuskokwim, they have demonstrated high assignment accuracy in other comparable systems and species (Cite cite). The spatial patterns revealed here highlight the importance of evaluating management strategies at appropriate spatial scales to identify interactions between stock-specific ecological behavior and regulatory frameworks. Strategies aiming to maintain ecosystem-scale resource availability should account for both the health of individual stocks and the broader metapopulation complex. By explicitly incorporating the spatiotemporal dynamics of </w:t>
       </w:r>
       <w:r>
         <w:rPr>
@@ -6243,7 +6775,7 @@
           <w:szCs w:val="22"/>
         </w:rPr>
         <w:lastRenderedPageBreak/>
-        <w:t>high assignment accuracy in other comparable systems and species (Cite cite). The spatial patterns revealed here highlight the importance of evaluating management strategies at appropriate spatial scales to identify interactions between stock-specific ecological behavior and regulatory frameworks. Strategies aiming to maintain ecosystem-scale resource availability should account for both the health of individual stocks and the broader metapopulation complex. By explicitly incorporating the spatiotemporal dynamics of metapopulations, managers may be better equipped to design conservation strategies that meet human resource needs while preserving the biocomplexity essential to healthy ecosystems.</w:t>
+        <w:t>metapopulations, managers may be better equipped to design conservation strategies that meet human resource needs while preserving the biocomplexity essential to healthy ecosystems.</w:t>
       </w:r>
     </w:p>
     <w:p>
@@ -6396,25 +6928,7 @@
           <w:sz w:val="22"/>
           <w:szCs w:val="22"/>
         </w:rPr>
-        <w:t xml:space="preserve"> closure strategy in </w:t>
-      </w:r>
-      <w:proofErr w:type="gramStart"/>
-      <w:r>
-        <w:rPr>
-          <w:rFonts w:ascii="Garamond" w:hAnsi="Garamond"/>
-          <w:sz w:val="22"/>
-          <w:szCs w:val="22"/>
-        </w:rPr>
-        <w:t>the Kuskokwim</w:t>
-      </w:r>
-      <w:proofErr w:type="gramEnd"/>
-      <w:r>
-        <w:rPr>
-          <w:rFonts w:ascii="Garamond" w:hAnsi="Garamond"/>
-          <w:sz w:val="22"/>
-          <w:szCs w:val="22"/>
-        </w:rPr>
-        <w:t xml:space="preserve"> to protect opportunity for upstream comm. And stabilize the fishery by protecting upstream stocks </w:t>
+        <w:t xml:space="preserve"> closure strategy in the Kuskokwim to protect opportunity for upstream comm. And stabilize the fishery by protecting upstream stocks </w:t>
       </w:r>
     </w:p>
     <w:p>
@@ -6742,23 +7256,13 @@
         </w:rPr>
         <w:t xml:space="preserve">. Salmon from this region </w:t>
       </w:r>
-      <w:proofErr w:type="gramStart"/>
-      <w:r>
-        <w:rPr>
-          <w:rFonts w:ascii="Garamond" w:hAnsi="Garamond"/>
-          <w:sz w:val="22"/>
-          <w:szCs w:val="22"/>
-        </w:rPr>
-        <w:t>have</w:t>
-      </w:r>
-      <w:proofErr w:type="gramEnd"/>
-      <w:r>
-        <w:rPr>
-          <w:rFonts w:ascii="Garamond" w:hAnsi="Garamond"/>
-          <w:sz w:val="22"/>
-          <w:szCs w:val="22"/>
-        </w:rPr>
-        <w:t xml:space="preserve"> supported</w:t>
+      <w:r>
+        <w:rPr>
+          <w:rFonts w:ascii="Garamond" w:hAnsi="Garamond"/>
+          <w:sz w:val="22"/>
+          <w:szCs w:val="22"/>
+        </w:rPr>
+        <w:t>have supported</w:t>
       </w:r>
       <w:r>
         <w:rPr>
@@ -6870,7 +7374,7 @@
           <w:sz w:val="22"/>
           <w:szCs w:val="22"/>
         </w:rPr>
-        <w:instrText xml:space="preserve"> ADDIN ZOTERO_ITEM CSL_CITATION {"citationID":"pEObtCaz","properties":{"formattedCitation":"(Brown &amp; Godduhn, 2015)","plainCitation":"(Brown &amp; Godduhn, 2015)","noteIndex":0},"citationItems":[{"id":4428,"uris":["http://zotero.org/users/8421274/items/2WA8NCRM"],"itemData":{"id":4428,"type":"article-journal","language":"en","source":"Zotero","title":"Socioeconomic effects of declining salmon runs on the Yukon River","author":[{"family":"Brown","given":"Caroline L"},{"family":"Godduhn","given":"Anna"}],"issued":{"date-parts":[["2015"]]}}}],"schema":"https://github.com/citation-style-language/schema/raw/master/csl-citation.json"} </w:instrText>
+        <w:instrText xml:space="preserve"> ADDIN ZOTERO_ITEM CSL_CITATION {"citationID":"TM3ypjGJ","properties":{"formattedCitation":"(Brown &amp; Godduhn, 2015)","plainCitation":"(Brown &amp; Godduhn, 2015)","noteIndex":0},"citationItems":[{"id":4428,"uris":["http://zotero.org/users/8421274/items/2WA8NCRM"],"itemData":{"id":4428,"type":"article-journal","language":"en","source":"Zotero","title":"Socioeconomic effects of declining salmon runs on the Yukon River","author":[{"family":"Brown","given":"Caroline L"},{"family":"Godduhn","given":"Anna"}],"issued":{"date-parts":[["2015"]]}}}],"schema":"https://github.com/citation-style-language/schema/raw/master/csl-citation.json"} </w:instrText>
       </w:r>
       <w:r>
         <w:rPr>
@@ -6980,7 +7484,104 @@
           <w:sz w:val="22"/>
           <w:szCs w:val="22"/>
         </w:rPr>
-        <w:t xml:space="preserve">. In salmon populations, substantial variation in both return timing and spatial distribution of habitat </w:t>
+        <w:t>. In salmon populations, substantial variation in both return timing and spatial distribution of habitat use produces significant complexity in life history strategies within and among populations</w:t>
+      </w:r>
+      <w:r>
+        <w:rPr>
+          <w:rFonts w:ascii="Garamond" w:hAnsi="Garamond"/>
+          <w:sz w:val="22"/>
+          <w:szCs w:val="22"/>
+        </w:rPr>
+        <w:t xml:space="preserve"> (Hilborn et al. 2003)</w:t>
+      </w:r>
+      <w:r>
+        <w:rPr>
+          <w:rFonts w:ascii="Garamond" w:hAnsi="Garamond"/>
+          <w:sz w:val="22"/>
+          <w:szCs w:val="22"/>
+        </w:rPr>
+        <w:t>. Overall population performance in salmon ecosystems is</w:t>
+      </w:r>
+      <w:r>
+        <w:rPr>
+          <w:rFonts w:ascii="Garamond" w:hAnsi="Garamond"/>
+          <w:sz w:val="22"/>
+          <w:szCs w:val="22"/>
+        </w:rPr>
+        <w:t xml:space="preserve"> therefore</w:t>
+      </w:r>
+      <w:r>
+        <w:rPr>
+          <w:rFonts w:ascii="Garamond" w:hAnsi="Garamond"/>
+          <w:sz w:val="22"/>
+          <w:szCs w:val="22"/>
+        </w:rPr>
+        <w:t xml:space="preserve"> shaped by the statistical averaging of multiple distinct, semi-independent sub-units distributed across space and time</w:t>
+      </w:r>
+      <w:r>
+        <w:rPr>
+          <w:rFonts w:ascii="Garamond" w:hAnsi="Garamond"/>
+          <w:sz w:val="22"/>
+          <w:szCs w:val="22"/>
+        </w:rPr>
+        <w:t xml:space="preserve"> </w:t>
+      </w:r>
+      <w:r>
+        <w:rPr>
+          <w:rFonts w:ascii="Garamond" w:hAnsi="Garamond"/>
+          <w:sz w:val="22"/>
+          <w:szCs w:val="22"/>
+        </w:rPr>
+        <w:fldChar w:fldCharType="begin"/>
+      </w:r>
+      <w:r>
+        <w:rPr>
+          <w:rFonts w:ascii="Garamond" w:hAnsi="Garamond"/>
+          <w:sz w:val="22"/>
+          <w:szCs w:val="22"/>
+        </w:rPr>
+        <w:instrText xml:space="preserve"> ADDIN ZOTERO_ITEM CSL_CITATION {"citationID":"4R3sEUmP","properties":{"formattedCitation":"(Connors et al., 2022; Ohlberger et al., 2016)","plainCitation":"(Connors et al., 2022; Ohlberger et al., 2016)","dontUpdate":true,"noteIndex":0},"citationItems":[{"id":4144,"uris":["http://zotero.org/users/8421274/items/M4DUIZ82"],"itemData":{"id":4144,"type":"article-journal","abstract":"Variation among populations in life history and intrinsic population characteristics (i.e., population diversity) helps maintain resilience to environmental change and dampen interannual variability in ecosystem services. As a result, ecological variation, and the processes that generate it, is considered central to strategies for managing risks to ecosystems in an increasingly variable and uncertain world. However, characterizing population diversity is difficult, particularly in large and remote regions, which often prevents its formal consideration in management advice. We combined genetic stock identification of archived scale and tissue samples with state-space run-reconstruction models to estimate migration timing and annual return abundance for eight geographically and genetically distinct Chinook salmon populations within the Canadian portion of the Yukon River. We found that among-population variation in migration timing and return abundances resulted in aggregate return migrations that were 2.1 times longer and 1.4 times more stable than if they had composed a single homogeneous population. We then fit state-space spawner–recruitment models to the annual return abundances to characterize among-population diversity in intrinsic productivity and population size and their consequences for the fisheries they support. Productivity and carrying capacity varied among populations by approximately 2.4-fold (2.9 to 6.9 recruits per spawner) and three-fold (8800 to 27,000 spawners), respectively. This diversity implies an equilibrium trade-off between harvesting of the population aggregate and the conservation of individual populations whereby the harvest rate predicted to maximize aggregate harvests comes at the cost of overfishing 40% of the populations but with a relatively low risk of extirpating the weakest ones. Our findings illustrate how population diversity in one of the largest salmon-producing river basins in the world contributes to fishery stability and food security in a region where salmon have high cultural and subsistence value. More generally, our work demonstrates the utility of molecular analyses of archived biological material for characterizing diversity in biological systems and its benefits and consequences for trade-offs in decision-making.","container-title":"Ecological Applications","DOI":"10.1002/eap.2709","ISSN":"1939-5582","issue":"8","language":"en","license":"© 2022 The Ecological Society of America.","note":"_eprint: https://onlinelibrary.wiley.com/doi/pdf/10.1002/eap.2709","page":"e2709","source":"Wiley Online Library","title":"Chinook salmon diversity contributes to fishery stability and trade-offs with mixed-stock harvest","volume":"32","author":[{"family":"Connors","given":"Brendan M."},{"family":"Siegle","given":"Matthew R."},{"family":"Harding","given":"Joel"},{"family":"Rossi","given":"Steven"},{"family":"Staton","given":"Benjamin A."},{"family":"Jones","given":"Michael L."},{"family":"Bradford","given":"Michael J."},{"family":"Brown","given":"Randy"},{"family":"Bechtol","given":"Bill"},{"family":"Doherty","given":"Beau"},{"family":"Cox","given":"Sean"},{"family":"Sutherland","given":"Ben J. G."}],"issued":{"date-parts":[["2022"]]}}},{"id":5321,"uris":["http://zotero.org/users/8421274/items/PJWLDI6C"],"itemData":{"id":5321,"type":"article-journal","abstract":"A central problem in understanding how species respond to global change is in parsing the effects of local drivers of population dynamics from regional and global drivers that are shared among populations. Management and conservation efforts that typically focus on a particular population would benefit greatly from being able to separate the effects of environmental processes at local, regional, and global scales. One way of addressing this challenge is to integrate data across multiple populations and use multivariate time series approaches to estimate shared and independent components of dynamics among neighboring populations. Here, we use a data set of 15 populations of Chinook salmon (Oncorhynchus tshawytscha) covering a broad geographical range in the eastern North Pacific Ocean to show how Dynamic Factor Analysis (DFA) can be used to estimate temporal coherence in population dynamics and to detect environmental drivers across spatial scales. Our results show that productivity dynamics of Chinook salmon populations strongly covary at the regional scale, but to a lesser degree at larger spatial scales. The timing of river ice break-up in spring was identified as an important driver of regional productivity dynamics. In addition, broad-scale variability in population productivity was linked to the North Pacific Gyre Oscillation, a dominant pattern of sea surface height variability. These broad-scale patterns in productivity dynamics may be associated with recent regime shifts in the Northeast Pacific Ocean. However, our results also demonstrate that populations within regions do not always respond consistently to the same environmental drivers, thus suggesting location-specific impacts. Overall, this study illustrates the use of DFA for quantifying the spatial and temporal complexity of multiple population responses to environmental change, thereby providing insights to processes that affect populations across large geographic areas, but that might be filtered by local habitat conditions.","container-title":"Ecosphere","DOI":"10.1002/ecs2.1333","ISSN":"2150-8925","issue":"4","language":"en","license":"© 2016 Ohlberger et al.","note":"_eprint: https://esajournals.onlinelibrary.wiley.com/doi/pdf/10.1002/ecs2.1333","page":"e01333","source":"Wiley Online Library","title":"Population coherence and environmental impacts across spatial scales: a case study of Chinook salmon","title-short":"Population coherence and environmental impacts across spatial scales","volume":"7","author":[{"family":"Ohlberger","given":"Jan"},{"family":"Scheuerell","given":"Mark D."},{"family":"Schindler","given":"Daniel E."}],"issued":{"date-parts":[["2016"]]}}}],"schema":"https://github.com/citation-style-language/schema/raw/master/csl-citation.json"} </w:instrText>
+      </w:r>
+      <w:r>
+        <w:rPr>
+          <w:rFonts w:ascii="Garamond" w:hAnsi="Garamond"/>
+          <w:sz w:val="22"/>
+          <w:szCs w:val="22"/>
+        </w:rPr>
+        <w:fldChar w:fldCharType="separate"/>
+      </w:r>
+      <w:r>
+        <w:rPr>
+          <w:rFonts w:ascii="Garamond" w:hAnsi="Garamond"/>
+          <w:noProof/>
+          <w:sz w:val="22"/>
+          <w:szCs w:val="22"/>
+        </w:rPr>
+        <w:t>(Schindler et al. 2010; Connors et al., 2022)</w:t>
+      </w:r>
+      <w:r>
+        <w:rPr>
+          <w:rFonts w:ascii="Garamond" w:hAnsi="Garamond"/>
+          <w:sz w:val="22"/>
+          <w:szCs w:val="22"/>
+        </w:rPr>
+        <w:fldChar w:fldCharType="end"/>
+      </w:r>
+      <w:r>
+        <w:rPr>
+          <w:rFonts w:ascii="Garamond" w:hAnsi="Garamond"/>
+          <w:sz w:val="22"/>
+          <w:szCs w:val="22"/>
+        </w:rPr>
+        <w:t xml:space="preserve">. </w:t>
+      </w:r>
+      <w:r>
+        <w:rPr>
+          <w:rFonts w:ascii="Garamond" w:hAnsi="Garamond"/>
+          <w:sz w:val="22"/>
+          <w:szCs w:val="22"/>
+        </w:rPr>
+        <w:t xml:space="preserve">Weak or negative covariance among these stocks helps buffer the broader population </w:t>
       </w:r>
       <w:r>
         <w:rPr>
@@ -6989,104 +7590,7 @@
           <w:szCs w:val="22"/>
         </w:rPr>
         <w:lastRenderedPageBreak/>
-        <w:t>use produces significant complexity in life history strategies within and among populations</w:t>
-      </w:r>
-      <w:r>
-        <w:rPr>
-          <w:rFonts w:ascii="Garamond" w:hAnsi="Garamond"/>
-          <w:sz w:val="22"/>
-          <w:szCs w:val="22"/>
-        </w:rPr>
-        <w:t xml:space="preserve"> (Hilborn et al. 2003)</w:t>
-      </w:r>
-      <w:r>
-        <w:rPr>
-          <w:rFonts w:ascii="Garamond" w:hAnsi="Garamond"/>
-          <w:sz w:val="22"/>
-          <w:szCs w:val="22"/>
-        </w:rPr>
-        <w:t>. Overall population performance in salmon ecosystems is</w:t>
-      </w:r>
-      <w:r>
-        <w:rPr>
-          <w:rFonts w:ascii="Garamond" w:hAnsi="Garamond"/>
-          <w:sz w:val="22"/>
-          <w:szCs w:val="22"/>
-        </w:rPr>
-        <w:t xml:space="preserve"> therefore</w:t>
-      </w:r>
-      <w:r>
-        <w:rPr>
-          <w:rFonts w:ascii="Garamond" w:hAnsi="Garamond"/>
-          <w:sz w:val="22"/>
-          <w:szCs w:val="22"/>
-        </w:rPr>
-        <w:t xml:space="preserve"> shaped by the statistical averaging of multiple distinct, semi-independent sub-units distributed across space and time</w:t>
-      </w:r>
-      <w:r>
-        <w:rPr>
-          <w:rFonts w:ascii="Garamond" w:hAnsi="Garamond"/>
-          <w:sz w:val="22"/>
-          <w:szCs w:val="22"/>
-        </w:rPr>
-        <w:t xml:space="preserve"> </w:t>
-      </w:r>
-      <w:r>
-        <w:rPr>
-          <w:rFonts w:ascii="Garamond" w:hAnsi="Garamond"/>
-          <w:sz w:val="22"/>
-          <w:szCs w:val="22"/>
-        </w:rPr>
-        <w:fldChar w:fldCharType="begin"/>
-      </w:r>
-      <w:r>
-        <w:rPr>
-          <w:rFonts w:ascii="Garamond" w:hAnsi="Garamond"/>
-          <w:sz w:val="22"/>
-          <w:szCs w:val="22"/>
-        </w:rPr>
-        <w:instrText xml:space="preserve"> ADDIN ZOTERO_ITEM CSL_CITATION {"citationID":"4R3sEUmP","properties":{"formattedCitation":"(Connors et al., 2022; Ohlberger et al., 2016)","plainCitation":"(Connors et al., 2022; Ohlberger et al., 2016)","dontUpdate":true,"noteIndex":0},"citationItems":[{"id":4144,"uris":["http://zotero.org/users/8421274/items/M4DUIZ82"],"itemData":{"id":4144,"type":"article-journal","abstract":"Variation among populations in life history and intrinsic population characteristics (i.e., population diversity) helps maintain resilience to environmental change and dampen interannual variability in ecosystem services. As a result, ecological variation, and the processes that generate it, is considered central to strategies for managing risks to ecosystems in an increasingly variable and uncertain world. However, characterizing population diversity is difficult, particularly in large and remote regions, which often prevents its formal consideration in management advice. We combined genetic stock identification of archived scale and tissue samples with state-space run-reconstruction models to estimate migration timing and annual return abundance for eight geographically and genetically distinct Chinook salmon populations within the Canadian portion of the Yukon River. We found that among-population variation in migration timing and return abundances resulted in aggregate return migrations that were 2.1 times longer and 1.4 times more stable than if they had composed a single homogeneous population. We then fit state-space spawner–recruitment models to the annual return abundances to characterize among-population diversity in intrinsic productivity and population size and their consequences for the fisheries they support. Productivity and carrying capacity varied among populations by approximately 2.4-fold (2.9 to 6.9 recruits per spawner) and three-fold (8800 to 27,000 spawners), respectively. This diversity implies an equilibrium trade-off between harvesting of the population aggregate and the conservation of individual populations whereby the harvest rate predicted to maximize aggregate harvests comes at the cost of overfishing 40% of the populations but with a relatively low risk of extirpating the weakest ones. Our findings illustrate how population diversity in one of the largest salmon-producing river basins in the world contributes to fishery stability and food security in a region where salmon have high cultural and subsistence value. More generally, our work demonstrates the utility of molecular analyses of archived biological material for characterizing diversity in biological systems and its benefits and consequences for trade-offs in decision-making.","container-title":"Ecological Applications","DOI":"10.1002/eap.2709","ISSN":"1939-5582","issue":"8","language":"en","license":"© 2022 The Ecological Society of America.","note":"_eprint: https://onlinelibrary.wiley.com/doi/pdf/10.1002/eap.2709","page":"e2709","source":"Wiley Online Library","title":"Chinook salmon diversity contributes to fishery stability and trade-offs with mixed-stock harvest","volume":"32","author":[{"family":"Connors","given":"Brendan M."},{"family":"Siegle","given":"Matthew R."},{"family":"Harding","given":"Joel"},{"family":"Rossi","given":"Steven"},{"family":"Staton","given":"Benjamin A."},{"family":"Jones","given":"Michael L."},{"family":"Bradford","given":"Michael J."},{"family":"Brown","given":"Randy"},{"family":"Bechtol","given":"Bill"},{"family":"Doherty","given":"Beau"},{"family":"Cox","given":"Sean"},{"family":"Sutherland","given":"Ben J. G."}],"issued":{"date-parts":[["2022"]]}}},{"id":5321,"uris":["http://zotero.org/users/8421274/items/PJWLDI6C"],"itemData":{"id":5321,"type":"article-journal","abstract":"A central problem in understanding how species respond to global change is in parsing the effects of local drivers of population dynamics from regional and global drivers that are shared among populations. Management and conservation efforts that typically focus on a particular population would benefit greatly from being able to separate the effects of environmental processes at local, regional, and global scales. One way of addressing this challenge is to integrate data across multiple populations and use multivariate time series approaches to estimate shared and independent components of dynamics among neighboring populations. Here, we use a data set of 15 populations of Chinook salmon (Oncorhynchus tshawytscha) covering a broad geographical range in the eastern North Pacific Ocean to show how Dynamic Factor Analysis (DFA) can be used to estimate temporal coherence in population dynamics and to detect environmental drivers across spatial scales. Our results show that productivity dynamics of Chinook salmon populations strongly covary at the regional scale, but to a lesser degree at larger spatial scales. The timing of river ice break-up in spring was identified as an important driver of regional productivity dynamics. In addition, broad-scale variability in population productivity was linked to the North Pacific Gyre Oscillation, a dominant pattern of sea surface height variability. These broad-scale patterns in productivity dynamics may be associated with recent regime shifts in the Northeast Pacific Ocean. However, our results also demonstrate that populations within regions do not always respond consistently to the same environmental drivers, thus suggesting location-specific impacts. Overall, this study illustrates the use of DFA for quantifying the spatial and temporal complexity of multiple population responses to environmental change, thereby providing insights to processes that affect populations across large geographic areas, but that might be filtered by local habitat conditions.","container-title":"Ecosphere","DOI":"10.1002/ecs2.1333","ISSN":"2150-8925","issue":"4","language":"en","license":"© 2016 Ohlberger et al.","note":"_eprint: https://esajournals.onlinelibrary.wiley.com/doi/pdf/10.1002/ecs2.1333","page":"e01333","source":"Wiley Online Library","title":"Population coherence and environmental impacts across spatial scales: a case study of Chinook salmon","title-short":"Population coherence and environmental impacts across spatial scales","volume":"7","author":[{"family":"Ohlberger","given":"Jan"},{"family":"Scheuerell","given":"Mark D."},{"family":"Schindler","given":"Daniel E."}],"issued":{"date-parts":[["2016"]]}}}],"schema":"https://github.com/citation-style-language/schema/raw/master/csl-citation.json"} </w:instrText>
-      </w:r>
-      <w:r>
-        <w:rPr>
-          <w:rFonts w:ascii="Garamond" w:hAnsi="Garamond"/>
-          <w:sz w:val="22"/>
-          <w:szCs w:val="22"/>
-        </w:rPr>
-        <w:fldChar w:fldCharType="separate"/>
-      </w:r>
-      <w:r>
-        <w:rPr>
-          <w:rFonts w:ascii="Garamond" w:hAnsi="Garamond"/>
-          <w:noProof/>
-          <w:sz w:val="22"/>
-          <w:szCs w:val="22"/>
-        </w:rPr>
-        <w:t>(Schindler et al. 2010; Connors et al., 2022)</w:t>
-      </w:r>
-      <w:r>
-        <w:rPr>
-          <w:rFonts w:ascii="Garamond" w:hAnsi="Garamond"/>
-          <w:sz w:val="22"/>
-          <w:szCs w:val="22"/>
-        </w:rPr>
-        <w:fldChar w:fldCharType="end"/>
-      </w:r>
-      <w:r>
-        <w:rPr>
-          <w:rFonts w:ascii="Garamond" w:hAnsi="Garamond"/>
-          <w:sz w:val="22"/>
-          <w:szCs w:val="22"/>
-        </w:rPr>
-        <w:t xml:space="preserve">. </w:t>
-      </w:r>
-      <w:r>
-        <w:rPr>
-          <w:rFonts w:ascii="Garamond" w:hAnsi="Garamond"/>
-          <w:sz w:val="22"/>
-          <w:szCs w:val="22"/>
-        </w:rPr>
-        <w:t>Weak or negative covariance among these stocks helps buffer the broader population against the poor performance of any individual subunit, whose success may fluctuate in response to a dynamic mosaic of multi-dimensional environmental conditions</w:t>
+        <w:t>against the poor performance of any individual subunit, whose success may fluctuate in response to a dynamic mosaic of multi-dimensional environmental conditions</w:t>
       </w:r>
       <w:r>
         <w:rPr>
@@ -7490,7 +7994,112 @@
           <w:sz w:val="22"/>
           <w:szCs w:val="22"/>
         </w:rPr>
-        <w:t xml:space="preserve">Fishing which disproportionally exploits weak stocks as they migrate upstream may threaten the availability of resources to upstream communities and </w:t>
+        <w:t>Fishing which disproportionally exploits weak stocks as they migrate upstream may threaten the availability of resources to upstream communities and threaten the reliability of downstream resources in subsequent years as upstream stock health degrades. M</w:t>
+      </w:r>
+      <w:r>
+        <w:rPr>
+          <w:rFonts w:ascii="Garamond" w:hAnsi="Garamond"/>
+          <w:sz w:val="22"/>
+          <w:szCs w:val="22"/>
+        </w:rPr>
+        <w:t>anagement strateg</w:t>
+      </w:r>
+      <w:r>
+        <w:rPr>
+          <w:rFonts w:ascii="Garamond" w:hAnsi="Garamond"/>
+          <w:sz w:val="22"/>
+          <w:szCs w:val="22"/>
+        </w:rPr>
+        <w:t>ies which maintain reliable fishery resources</w:t>
+      </w:r>
+      <w:r>
+        <w:rPr>
+          <w:rFonts w:ascii="Garamond" w:hAnsi="Garamond"/>
+          <w:sz w:val="22"/>
+          <w:szCs w:val="22"/>
+        </w:rPr>
+        <w:t xml:space="preserve"> should </w:t>
+      </w:r>
+      <w:r>
+        <w:rPr>
+          <w:rFonts w:ascii="Garamond" w:hAnsi="Garamond"/>
+          <w:sz w:val="22"/>
+          <w:szCs w:val="22"/>
+        </w:rPr>
+        <w:t xml:space="preserve">therefore </w:t>
+      </w:r>
+      <w:r>
+        <w:rPr>
+          <w:rFonts w:ascii="Garamond" w:hAnsi="Garamond"/>
+          <w:sz w:val="22"/>
+          <w:szCs w:val="22"/>
+        </w:rPr>
+        <w:t>aim to allow harvest opportunities on healthy stocks while minimizing the risk of overexploitation for co-migrating weak stocks</w:t>
+      </w:r>
+      <w:r>
+        <w:rPr>
+          <w:rFonts w:ascii="Garamond" w:hAnsi="Garamond"/>
+          <w:sz w:val="22"/>
+          <w:szCs w:val="22"/>
+        </w:rPr>
+        <w:t xml:space="preserve"> </w:t>
+      </w:r>
+      <w:r>
+        <w:rPr>
+          <w:rFonts w:ascii="Garamond" w:hAnsi="Garamond"/>
+          <w:sz w:val="22"/>
+          <w:szCs w:val="22"/>
+        </w:rPr>
+        <w:fldChar w:fldCharType="begin"/>
+      </w:r>
+      <w:r>
+        <w:rPr>
+          <w:rFonts w:ascii="Garamond" w:hAnsi="Garamond"/>
+          <w:sz w:val="22"/>
+          <w:szCs w:val="22"/>
+        </w:rPr>
+        <w:instrText xml:space="preserve"> ADDIN ZOTERO_ITEM CSL_CITATION {"citationID":"XABq2458","properties":{"formattedCitation":"(Connors et al., 2020)","plainCitation":"(Connors et al., 2020)","noteIndex":0},"citationItems":[{"id":4416,"uris":["http://zotero.org/users/8421274/items/STEMPPV7"],"itemData":{"id":4416,"type":"article-journal","abstract":"Accounting for population diversity can be critical to the sustainable management of mixed-stock fisheries because harvest rates that can be sustained by productive populations may come at the cost of overfishing less productive ones. While these harvest–diversity trade-offs are well-recognized, their consequences for harvest policy performance are not often explicitly evaluated in contemporary fisheries management. We use closed-loop simulations to evaluate the ability of alternative harvest policies to meet population diversity and fishery objectives for one of the largest subsistence Chinook salmon (Oncorhynchus tshawytscha) fisheries in the world (Kuskokwim River Basin in western Alaska). We found clear evidence of population diversity that resulted in asymmetric trade-offs among fishery and conservation objectives whereby policies that forgo relatively small amounts of harvest result in relatively large increases in equitable access to Chinook and elimination of risk of weak stock extirpation. The performance of alternative harvest policies, and the magnitude of trade-offs, were sensitive to regime shifts and uncertainty in the drivers of recruitment variation. However, we found that harvest policies that prioritized meeting minimum subsistence needs were unlikely to jeopardize long-term sustainability.","container-title":"Canadian Journal of Fisheries and Aquatic Sciences","DOI":"10.1139/cjfas-2019-0282","ISSN":"0706-652X","issue":"6","journalAbbreviation":"Can. J. Fish. Aquat. Sci.","note":"publisher: NRC Research Press","page":"1076-1089","source":"cdnsciencepub-com.offcampus.lib.washington.edu (Atypon)","title":"Incorporating harvest–population diversity trade-offs into harvest policy analyses of salmon management in large river basins","volume":"77","author":[{"family":"Connors","given":"Brendan M."},{"family":"Staton","given":"Benjamin"},{"family":"Coggins","given":"Lewis"},{"family":"Walters","given":"Carl"},{"family":"Jones","given":"Mike"},{"family":"Gwinn","given":"Daniel"},{"family":"Catalano","given":"Matt"},{"family":"Fleischman","given":"Steve"}],"issued":{"date-parts":[["2020",6]]}}}],"schema":"https://github.com/citation-style-language/schema/raw/master/csl-citation.json"} </w:instrText>
+      </w:r>
+      <w:r>
+        <w:rPr>
+          <w:rFonts w:ascii="Garamond" w:hAnsi="Garamond"/>
+          <w:sz w:val="22"/>
+          <w:szCs w:val="22"/>
+        </w:rPr>
+        <w:fldChar w:fldCharType="separate"/>
+      </w:r>
+      <w:r>
+        <w:rPr>
+          <w:rFonts w:ascii="Garamond" w:hAnsi="Garamond"/>
+          <w:noProof/>
+          <w:sz w:val="22"/>
+          <w:szCs w:val="22"/>
+        </w:rPr>
+        <w:t>(Connors et al., 2020)</w:t>
+      </w:r>
+      <w:r>
+        <w:rPr>
+          <w:rFonts w:ascii="Garamond" w:hAnsi="Garamond"/>
+          <w:sz w:val="22"/>
+          <w:szCs w:val="22"/>
+        </w:rPr>
+        <w:fldChar w:fldCharType="end"/>
+      </w:r>
+      <w:r>
+        <w:rPr>
+          <w:rFonts w:ascii="Garamond" w:hAnsi="Garamond"/>
+          <w:sz w:val="22"/>
+          <w:szCs w:val="22"/>
+        </w:rPr>
+        <w:t xml:space="preserve">. </w:t>
+      </w:r>
+      <w:r>
+        <w:rPr>
+          <w:rFonts w:ascii="Garamond" w:hAnsi="Garamond"/>
+          <w:sz w:val="22"/>
+          <w:szCs w:val="22"/>
+        </w:rPr>
+        <w:t xml:space="preserve"> In practice, however, implementing such stock-specific management approaches </w:t>
       </w:r>
       <w:r>
         <w:rPr>
@@ -7499,112 +8108,7 @@
           <w:szCs w:val="22"/>
         </w:rPr>
         <w:lastRenderedPageBreak/>
-        <w:t>threaten the reliability of downstream resources in subsequent years as upstream stock health degrades. M</w:t>
-      </w:r>
-      <w:r>
-        <w:rPr>
-          <w:rFonts w:ascii="Garamond" w:hAnsi="Garamond"/>
-          <w:sz w:val="22"/>
-          <w:szCs w:val="22"/>
-        </w:rPr>
-        <w:t>anagement strateg</w:t>
-      </w:r>
-      <w:r>
-        <w:rPr>
-          <w:rFonts w:ascii="Garamond" w:hAnsi="Garamond"/>
-          <w:sz w:val="22"/>
-          <w:szCs w:val="22"/>
-        </w:rPr>
-        <w:t>ies which maintain reliable fishery resources</w:t>
-      </w:r>
-      <w:r>
-        <w:rPr>
-          <w:rFonts w:ascii="Garamond" w:hAnsi="Garamond"/>
-          <w:sz w:val="22"/>
-          <w:szCs w:val="22"/>
-        </w:rPr>
-        <w:t xml:space="preserve"> should </w:t>
-      </w:r>
-      <w:r>
-        <w:rPr>
-          <w:rFonts w:ascii="Garamond" w:hAnsi="Garamond"/>
-          <w:sz w:val="22"/>
-          <w:szCs w:val="22"/>
-        </w:rPr>
-        <w:t xml:space="preserve">therefore </w:t>
-      </w:r>
-      <w:r>
-        <w:rPr>
-          <w:rFonts w:ascii="Garamond" w:hAnsi="Garamond"/>
-          <w:sz w:val="22"/>
-          <w:szCs w:val="22"/>
-        </w:rPr>
-        <w:t>aim to allow harvest opportunities on healthy stocks while minimizing the risk of overexploitation for co-migrating weak stocks</w:t>
-      </w:r>
-      <w:r>
-        <w:rPr>
-          <w:rFonts w:ascii="Garamond" w:hAnsi="Garamond"/>
-          <w:sz w:val="22"/>
-          <w:szCs w:val="22"/>
-        </w:rPr>
-        <w:t xml:space="preserve"> </w:t>
-      </w:r>
-      <w:r>
-        <w:rPr>
-          <w:rFonts w:ascii="Garamond" w:hAnsi="Garamond"/>
-          <w:sz w:val="22"/>
-          <w:szCs w:val="22"/>
-        </w:rPr>
-        <w:fldChar w:fldCharType="begin"/>
-      </w:r>
-      <w:r>
-        <w:rPr>
-          <w:rFonts w:ascii="Garamond" w:hAnsi="Garamond"/>
-          <w:sz w:val="22"/>
-          <w:szCs w:val="22"/>
-        </w:rPr>
-        <w:instrText xml:space="preserve"> ADDIN ZOTERO_ITEM CSL_CITATION {"citationID":"XABq2458","properties":{"formattedCitation":"(Connors et al., 2020)","plainCitation":"(Connors et al., 2020)","noteIndex":0},"citationItems":[{"id":4416,"uris":["http://zotero.org/users/8421274/items/STEMPPV7"],"itemData":{"id":4416,"type":"article-journal","abstract":"Accounting for population diversity can be critical to the sustainable management of mixed-stock fisheries because harvest rates that can be sustained by productive populations may come at the cost of overfishing less productive ones. While these harvest–diversity trade-offs are well-recognized, their consequences for harvest policy performance are not often explicitly evaluated in contemporary fisheries management. We use closed-loop simulations to evaluate the ability of alternative harvest policies to meet population diversity and fishery objectives for one of the largest subsistence Chinook salmon (Oncorhynchus tshawytscha) fisheries in the world (Kuskokwim River Basin in western Alaska). We found clear evidence of population diversity that resulted in asymmetric trade-offs among fishery and conservation objectives whereby policies that forgo relatively small amounts of harvest result in relatively large increases in equitable access to Chinook and elimination of risk of weak stock extirpation. The performance of alternative harvest policies, and the magnitude of trade-offs, were sensitive to regime shifts and uncertainty in the drivers of recruitment variation. However, we found that harvest policies that prioritized meeting minimum subsistence needs were unlikely to jeopardize long-term sustainability.","container-title":"Canadian Journal of Fisheries and Aquatic Sciences","DOI":"10.1139/cjfas-2019-0282","ISSN":"0706-652X","issue":"6","journalAbbreviation":"Can. J. Fish. Aquat. Sci.","note":"publisher: NRC Research Press","page":"1076-1089","source":"cdnsciencepub-com.offcampus.lib.washington.edu (Atypon)","title":"Incorporating harvest–population diversity trade-offs into harvest policy analyses of salmon management in large river basins","volume":"77","author":[{"family":"Connors","given":"Brendan M."},{"family":"Staton","given":"Benjamin"},{"family":"Coggins","given":"Lewis"},{"family":"Walters","given":"Carl"},{"family":"Jones","given":"Mike"},{"family":"Gwinn","given":"Daniel"},{"family":"Catalano","given":"Matt"},{"family":"Fleischman","given":"Steve"}],"issued":{"date-parts":[["2020",6]]}}}],"schema":"https://github.com/citation-style-language/schema/raw/master/csl-citation.json"} </w:instrText>
-      </w:r>
-      <w:r>
-        <w:rPr>
-          <w:rFonts w:ascii="Garamond" w:hAnsi="Garamond"/>
-          <w:sz w:val="22"/>
-          <w:szCs w:val="22"/>
-        </w:rPr>
-        <w:fldChar w:fldCharType="separate"/>
-      </w:r>
-      <w:r>
-        <w:rPr>
-          <w:rFonts w:ascii="Garamond" w:hAnsi="Garamond"/>
-          <w:noProof/>
-          <w:sz w:val="22"/>
-          <w:szCs w:val="22"/>
-        </w:rPr>
-        <w:t>(Connors et al., 2020)</w:t>
-      </w:r>
-      <w:r>
-        <w:rPr>
-          <w:rFonts w:ascii="Garamond" w:hAnsi="Garamond"/>
-          <w:sz w:val="22"/>
-          <w:szCs w:val="22"/>
-        </w:rPr>
-        <w:fldChar w:fldCharType="end"/>
-      </w:r>
-      <w:r>
-        <w:rPr>
-          <w:rFonts w:ascii="Garamond" w:hAnsi="Garamond"/>
-          <w:sz w:val="22"/>
-          <w:szCs w:val="22"/>
-        </w:rPr>
-        <w:t xml:space="preserve">. </w:t>
-      </w:r>
-      <w:r>
-        <w:rPr>
-          <w:rFonts w:ascii="Garamond" w:hAnsi="Garamond"/>
-          <w:sz w:val="22"/>
-          <w:szCs w:val="22"/>
-        </w:rPr>
-        <w:t xml:space="preserve"> In practice, however, implementing such stock-specific management approaches requires detailed data on the spatiotemporal ecology of salmon populations; information that has historically been limited at sufficiently fine spatial and temporal scales</w:t>
+        <w:t>requires detailed data on the spatiotemporal ecology of salmon populations; information that has historically been limited at sufficiently fine spatial and temporal scales</w:t>
       </w:r>
       <w:r>
         <w:rPr>
@@ -7670,7 +8174,7 @@
         <w:spacing w:line="480" w:lineRule="auto"/>
         <w:ind w:firstLine="720"/>
         <w:rPr>
-          <w:ins w:id="18" w:author="Benjamin J. Makhlouf" w:date="2025-07-26T14:59:00Z" w16du:dateUtc="2025-07-26T21:59:00Z"/>
+          <w:ins w:id="17" w:author="Benjamin J. Makhlouf" w:date="2025-07-26T14:59:00Z" w16du:dateUtc="2025-07-26T21:59:00Z"/>
           <w:rFonts w:ascii="Garamond" w:hAnsi="Garamond"/>
           <w:sz w:val="22"/>
           <w:szCs w:val="22"/>
@@ -7904,7 +8408,7 @@
         </w:rPr>
         <w:t xml:space="preserve"> while allowing for a significant number of fish to return to stocks in the upper portions of the river basin , thereby protecting access to harvest opportunities for upstream communities and bolstering the health of upstream stocks which have a general tendency to migrate early in the season </w:t>
       </w:r>
-      <w:commentRangeStart w:id="19"/>
+      <w:commentRangeStart w:id="18"/>
       <w:r>
         <w:rPr>
           <w:rFonts w:ascii="Garamond" w:hAnsi="Garamond"/>
@@ -7992,56 +8496,20 @@
         </w:rPr>
         <w:fldChar w:fldCharType="end"/>
       </w:r>
-      <w:commentRangeEnd w:id="19"/>
+      <w:commentRangeEnd w:id="18"/>
       <w:r>
         <w:rPr>
           <w:rStyle w:val="CommentReference"/>
         </w:rPr>
-        <w:commentReference w:id="19"/>
-      </w:r>
-      <w:r>
-        <w:rPr>
-          <w:rFonts w:ascii="Garamond" w:hAnsi="Garamond"/>
-          <w:sz w:val="22"/>
-          <w:szCs w:val="22"/>
-        </w:rPr>
-        <w:t xml:space="preserve">. However, little data </w:t>
-      </w:r>
-      <w:proofErr w:type="gramStart"/>
-      <w:r>
-        <w:rPr>
-          <w:rFonts w:ascii="Garamond" w:hAnsi="Garamond"/>
-          <w:sz w:val="22"/>
-          <w:szCs w:val="22"/>
-        </w:rPr>
-        <w:t>exist</w:t>
-      </w:r>
-      <w:proofErr w:type="gramEnd"/>
-      <w:r>
-        <w:rPr>
-          <w:rFonts w:ascii="Garamond" w:hAnsi="Garamond"/>
-          <w:sz w:val="22"/>
-          <w:szCs w:val="22"/>
-        </w:rPr>
-        <w:t xml:space="preserve"> which quantifies the spatiotemporal patterns among stocks. The impact of front-end closure strategies on individual stock components is not well understood, and a more complete understanding of stock contribution to the overall run both within and among years is currently not readily available. </w:t>
-      </w:r>
-      <w:proofErr w:type="gramStart"/>
-      <w:r>
-        <w:rPr>
-          <w:rFonts w:ascii="Garamond" w:hAnsi="Garamond"/>
-          <w:sz w:val="22"/>
-          <w:szCs w:val="22"/>
-        </w:rPr>
-        <w:t>These</w:t>
-      </w:r>
-      <w:proofErr w:type="gramEnd"/>
-      <w:r>
-        <w:rPr>
-          <w:rFonts w:ascii="Garamond" w:hAnsi="Garamond"/>
-          <w:sz w:val="22"/>
-          <w:szCs w:val="22"/>
-        </w:rPr>
-        <w:t xml:space="preserve"> data may be important to assessing the impact of current management strategies and designing new strategies which maintain stock health across all components of the watershed and maintain a reliable resource for communities and industry in the region. </w:t>
+        <w:commentReference w:id="18"/>
+      </w:r>
+      <w:r>
+        <w:rPr>
+          <w:rFonts w:ascii="Garamond" w:hAnsi="Garamond"/>
+          <w:sz w:val="22"/>
+          <w:szCs w:val="22"/>
+        </w:rPr>
+        <w:t xml:space="preserve">. However, little data exist which quantifies the spatiotemporal patterns among stocks. The impact of front-end closure strategies on individual stock components is not well understood, and a more complete understanding of stock contribution to the overall run both within and among years is currently not readily available. These data may be important to assessing the impact of current management strategies and designing new strategies which maintain stock health across all components of the watershed and maintain a reliable resource for communities and industry in the region. </w:t>
       </w:r>
     </w:p>
     <w:p>
@@ -8092,16 +8560,7 @@
           <w:sz w:val="22"/>
           <w:szCs w:val="22"/>
         </w:rPr>
-        <w:t xml:space="preserve">: (1) identify the spatiotemporal structure of </w:t>
-      </w:r>
-      <w:r>
-        <w:rPr>
-          <w:rFonts w:ascii="Garamond" w:hAnsi="Garamond"/>
-          <w:sz w:val="22"/>
-          <w:szCs w:val="22"/>
-        </w:rPr>
-        <w:lastRenderedPageBreak/>
-        <w:t>returning populations in</w:t>
+        <w:t>: (1) identify the spatiotemporal structure of returning populations in</w:t>
       </w:r>
       <w:r>
         <w:rPr>
@@ -8228,8 +8687,8 @@
       </w:pPr>
     </w:p>
     <w:sectPr>
-      <w:footerReference w:type="even" r:id="rId11"/>
-      <w:footerReference w:type="default" r:id="rId12"/>
+      <w:footerReference w:type="even" r:id="rId12"/>
+      <w:footerReference w:type="default" r:id="rId13"/>
       <w:pgSz w:w="12240" w:h="15840"/>
       <w:pgMar w:top="1440" w:right="1440" w:bottom="1440" w:left="1440" w:header="720" w:footer="720" w:gutter="0"/>
       <w:lnNumType w:countBy="1" w:restart="continuous"/>
@@ -8259,11 +8718,8 @@
       </w:r>
     </w:p>
   </w:comment>
-  <w:comment w:id="1" w:author="Daniel Schindler" w:date="2025-07-17T12:57:00Z" w:initials="DS">
+  <w:comment w:id="1" w:author="bmak29" w:date="2025-07-29T18:17:00Z" w:initials="b">
     <w:p>
-      <w:pPr>
-        <w:pStyle w:val="CommentText"/>
-      </w:pPr>
       <w:r>
         <w:rPr>
           <w:rStyle w:val="CommentReference"/>
@@ -8271,15 +8727,16 @@
         <w:annotationRef/>
       </w:r>
       <w:r>
-        <w:t>Need to reorganize this to broaden scope a bit for J Appl Ecology</w:t>
+        <w:rPr>
+          <w:sz w:val="20"/>
+          <w:szCs w:val="20"/>
+        </w:rPr>
+        <w:t>Other than the Eek?</w:t>
       </w:r>
     </w:p>
   </w:comment>
-  <w:comment w:id="2" w:author="Daniel Schindler" w:date="2025-07-17T13:14:00Z" w:initials="DS">
+  <w:comment w:id="10" w:author="Benjamin J. Makhlouf" w:date="2025-07-28T07:41:00Z" w:initials="BM">
     <w:p>
-      <w:pPr>
-        <w:pStyle w:val="CommentText"/>
-      </w:pPr>
       <w:r>
         <w:rPr>
           <w:rStyle w:val="CommentReference"/>
@@ -8287,11 +8744,15 @@
         <w:annotationRef/>
       </w:r>
       <w:r>
-        <w:t>I will come back to this later.</w:t>
+        <w:rPr>
+          <w:sz w:val="20"/>
+          <w:szCs w:val="20"/>
+        </w:rPr>
+        <w:t xml:space="preserve">Since this is published in french et al., should it not be included as a figure? </w:t>
       </w:r>
     </w:p>
   </w:comment>
-  <w:comment w:id="11" w:author="Benjamin J. Makhlouf" w:date="2025-07-28T07:41:00Z" w:initials="BM">
+  <w:comment w:id="11" w:author="Benjamin J. Makhlouf" w:date="2025-07-28T07:42:00Z" w:initials="BM">
     <w:p>
       <w:pPr>
         <w:pStyle w:val="CommentText"/>
@@ -8303,15 +8764,12 @@
         <w:annotationRef/>
       </w:r>
       <w:r>
-        <w:t xml:space="preserve">Since this is published in french et al., do you think I should not include it as a figure? </w:t>
+        <w:t xml:space="preserve">This is in one of Sean’s papers but I cannot find it </w:t>
       </w:r>
     </w:p>
   </w:comment>
-  <w:comment w:id="12" w:author="Benjamin J. Makhlouf" w:date="2025-07-28T07:42:00Z" w:initials="BM">
+  <w:comment w:id="12" w:author="Benjamin J. Makhlouf" w:date="2025-07-30T08:26:00Z" w:initials="b">
     <w:p>
-      <w:pPr>
-        <w:pStyle w:val="CommentText"/>
-      </w:pPr>
       <w:r>
         <w:rPr>
           <w:rStyle w:val="CommentReference"/>
@@ -8319,15 +8777,16 @@
         <w:annotationRef/>
       </w:r>
       <w:r>
-        <w:t xml:space="preserve">This is in one of Sean’s papers but I cannot find it </w:t>
+        <w:rPr>
+          <w:sz w:val="20"/>
+          <w:szCs w:val="20"/>
+        </w:rPr>
+        <w:t>We run into the same problem as the last paper where it is very unclear how this habitat prior is made (other than shutting off the eek). I can reasonably assume it's the same as the Yukon</w:t>
       </w:r>
     </w:p>
   </w:comment>
-  <w:comment w:id="17" w:author="Benjamin J. Makhlouf" w:date="2025-07-28T13:54:00Z" w:initials="BM">
+  <w:comment w:id="14" w:author="Benjamin J. Makhlouf" w:date="2025-07-30T10:53:00Z" w:initials="b">
     <w:p>
-      <w:pPr>
-        <w:pStyle w:val="CommentText"/>
-      </w:pPr>
       <w:r>
         <w:rPr>
           <w:rStyle w:val="CommentReference"/>
@@ -8335,11 +8794,31 @@
         <w:annotationRef/>
       </w:r>
       <w:r>
-        <w:t xml:space="preserve">This might not be true for comparison to Telemetry </w:t>
+        <w:rPr>
+          <w:sz w:val="20"/>
+          <w:szCs w:val="20"/>
+        </w:rPr>
+        <w:t>The map we used to pull these rivers is on an adfg web page but I cant track it to a publication</w:t>
       </w:r>
     </w:p>
   </w:comment>
-  <w:comment w:id="19" w:author="Daniel Schindler" w:date="2025-06-27T11:54:00Z" w:initials="DS">
+  <w:comment w:id="16" w:author="Benjamin J. Makhlouf" w:date="2025-07-28T13:54:00Z" w:initials="BM">
+    <w:p>
+      <w:pPr>
+        <w:pStyle w:val="CommentText"/>
+      </w:pPr>
+      <w:r>
+        <w:rPr>
+          <w:rStyle w:val="CommentReference"/>
+        </w:rPr>
+        <w:annotationRef/>
+      </w:r>
+      <w:r>
+        <w:t xml:space="preserve">This might not be true for comparison to Telemetry </w:t>
+      </w:r>
+    </w:p>
+  </w:comment>
+  <w:comment w:id="18" w:author="Daniel Schindler" w:date="2025-06-27T11:54:00Z" w:initials="DS">
     <w:p>
       <w:pPr>
         <w:pStyle w:val="CommentText"/>
@@ -8361,10 +8840,11 @@
 <file path=word/commentsExtended.xml><?xml version="1.0" encoding="utf-8"?>
 <w15:commentsEx xmlns:wpc="http://schemas.microsoft.com/office/word/2010/wordprocessingCanvas" xmlns:cx="http://schemas.microsoft.com/office/drawing/2014/chartex" xmlns:cx1="http://schemas.microsoft.com/office/drawing/2015/9/8/chartex" xmlns:cx2="http://schemas.microsoft.com/office/drawing/2015/10/21/chartex" xmlns:cx3="http://schemas.microsoft.com/office/drawing/2016/5/9/chartex" xmlns:cx4="http://schemas.microsoft.com/office/drawing/2016/5/10/chartex" xmlns:cx5="http://schemas.microsoft.com/office/drawing/2016/5/11/chartex" xmlns:cx6="http://schemas.microsoft.com/office/drawing/2016/5/12/chartex" xmlns:cx7="http://schemas.microsoft.com/office/drawing/2016/5/13/chartex" xmlns:cx8="http://schemas.microsoft.com/office/drawing/2016/5/14/chartex" xmlns:mc="http://schemas.openxmlformats.org/markup-compatibility/2006" xmlns:aink="http://schemas.microsoft.com/office/drawing/2016/ink" xmlns:am3d="http://schemas.microsoft.com/office/drawing/2017/model3d" xmlns:o="urn:schemas-microsoft-com:office:office" xmlns:oel="http://schemas.microsoft.com/office/2019/extlst" xmlns:r="http://schemas.openxmlformats.org/officeDocument/2006/relationships" xmlns:m="http://schemas.openxmlformats.org/officeDocument/2006/math" xmlns:v="urn:schemas-microsoft-com:vml" xmlns:wp14="http://schemas.microsoft.com/office/word/2010/wordprocessingDrawing" xmlns:wp="http://schemas.openxmlformats.org/drawingml/2006/wordprocessingDrawing" xmlns:w10="urn:schemas-microsoft-com:office:word" xmlns:w="http://schemas.openxmlformats.org/wordprocessingml/2006/main" xmlns:w14="http://schemas.microsoft.com/office/word/2010/wordml" xmlns:w15="http://schemas.microsoft.com/office/word/2012/wordml" xmlns:w16cex="http://schemas.microsoft.com/office/word/2018/wordml/cex" xmlns:w16cid="http://schemas.microsoft.com/office/word/2016/wordml/cid" xmlns:w16="http://schemas.microsoft.com/office/word/2018/wordml" xmlns:w16du="http://schemas.microsoft.com/office/word/2023/wordml/word16du" xmlns:w16sdtdh="http://schemas.microsoft.com/office/word/2020/wordml/sdtdatahash" xmlns:w16sdtfl="http://schemas.microsoft.com/office/word/2024/wordml/sdtformatlock" xmlns:w16se="http://schemas.microsoft.com/office/word/2015/wordml/symex" xmlns:wpg="http://schemas.microsoft.com/office/word/2010/wordprocessingGroup" xmlns:wpi="http://schemas.microsoft.com/office/word/2010/wordprocessingInk" xmlns:wne="http://schemas.microsoft.com/office/word/2006/wordml" xmlns:wps="http://schemas.microsoft.com/office/word/2010/wordprocessingShape" mc:Ignorable="w14 w15 w16se w16cid w16 w16cex w16sdtdh w16sdtfl w16du wp14">
   <w15:commentEx w15:paraId="545E12D6" w15:done="0"/>
-  <w15:commentEx w15:paraId="2AD4524E" w15:done="0"/>
-  <w15:commentEx w15:paraId="0DA0C363" w15:paraIdParent="2AD4524E" w15:done="0"/>
+  <w15:commentEx w15:paraId="7B9E6931" w15:done="0"/>
   <w15:commentEx w15:paraId="317DFEBA" w15:done="0"/>
   <w15:commentEx w15:paraId="05C4AF8C" w15:done="0"/>
+  <w15:commentEx w15:paraId="78D2F929" w15:done="0"/>
+  <w15:commentEx w15:paraId="1EF3F5E1" w15:done="0"/>
   <w15:commentEx w15:paraId="036EDFB1" w15:done="0"/>
   <w15:commentEx w15:paraId="506CDC99" w15:done="0"/>
 </w15:commentsEx>
@@ -8373,10 +8853,11 @@
 <file path=word/commentsExtensible.xml><?xml version="1.0" encoding="utf-8"?>
 <w16cex:commentsExtensible xmlns:wpc="http://schemas.microsoft.com/office/word/2010/wordprocessingCanvas" xmlns:cx="http://schemas.microsoft.com/office/drawing/2014/chartex" xmlns:cx1="http://schemas.microsoft.com/office/drawing/2015/9/8/chartex" xmlns:cx2="http://schemas.microsoft.com/office/drawing/2015/10/21/chartex" xmlns:cx3="http://schemas.microsoft.com/office/drawing/2016/5/9/chartex" xmlns:cx4="http://schemas.microsoft.com/office/drawing/2016/5/10/chartex" xmlns:cx5="http://schemas.microsoft.com/office/drawing/2016/5/11/chartex" xmlns:cx6="http://schemas.microsoft.com/office/drawing/2016/5/12/chartex" xmlns:cx7="http://schemas.microsoft.com/office/drawing/2016/5/13/chartex" xmlns:cx8="http://schemas.microsoft.com/office/drawing/2016/5/14/chartex" xmlns:cr="http://schemas.microsoft.com/office/comments/2020/reactions" xmlns:mc="http://schemas.openxmlformats.org/markup-compatibility/2006" xmlns:aink="http://schemas.microsoft.com/office/drawing/2016/ink" xmlns:am3d="http://schemas.microsoft.com/office/drawing/2017/model3d" xmlns:o="urn:schemas-microsoft-com:office:office" xmlns:oel="http://schemas.microsoft.com/office/2019/extlst" xmlns:r="http://schemas.openxmlformats.org/officeDocument/2006/relationships" xmlns:m="http://schemas.openxmlformats.org/officeDocument/2006/math" xmlns:v="urn:schemas-microsoft-com:vml" xmlns:wp14="http://schemas.microsoft.com/office/word/2010/wordprocessingDrawing" xmlns:wp="http://schemas.openxmlformats.org/drawingml/2006/wordprocessingDrawing" xmlns:w10="urn:schemas-microsoft-com:office:word" xmlns:w="http://schemas.openxmlformats.org/wordprocessingml/2006/main" xmlns:w14="http://schemas.microsoft.com/office/word/2010/wordml" xmlns:w15="http://schemas.microsoft.com/office/word/2012/wordml" xmlns:w16cex="http://schemas.microsoft.com/office/word/2018/wordml/cex" xmlns:w16cid="http://schemas.microsoft.com/office/word/2016/wordml/cid" xmlns:w16="http://schemas.microsoft.com/office/word/2018/wordml" xmlns:w16du="http://schemas.microsoft.com/office/word/2023/wordml/word16du" xmlns:w16sdtdh="http://schemas.microsoft.com/office/word/2020/wordml/sdtdatahash" xmlns:w16sdtfl="http://schemas.microsoft.com/office/word/2024/wordml/sdtformatlock" xmlns:w16se="http://schemas.microsoft.com/office/word/2015/wordml/symex" xmlns:wpg="http://schemas.microsoft.com/office/word/2010/wordprocessingGroup" xmlns:wpi="http://schemas.microsoft.com/office/word/2010/wordprocessingInk" xmlns:wne="http://schemas.microsoft.com/office/word/2006/wordml" xmlns:wps="http://schemas.microsoft.com/office/word/2010/wordprocessingShape" mc:Ignorable="w14 w15 w16se w16cid w16 w16cex w16sdtdh w16sdtfl cr w16du wp14">
   <w16cex:commentExtensible w16cex:durableId="0AF9D5BC" w16cex:dateUtc="2025-07-26T18:23:00Z"/>
-  <w16cex:commentExtensible w16cex:durableId="6C50E346" w16cex:dateUtc="2025-07-17T20:57:00Z"/>
-  <w16cex:commentExtensible w16cex:durableId="31A19B43" w16cex:dateUtc="2025-07-17T21:14:00Z"/>
+  <w16cex:commentExtensible w16cex:durableId="02BD22AA" w16cex:dateUtc="2025-07-30T01:17:00Z"/>
   <w16cex:commentExtensible w16cex:durableId="6C95C996" w16cex:dateUtc="2025-07-28T14:41:00Z"/>
   <w16cex:commentExtensible w16cex:durableId="3CAE4ABD" w16cex:dateUtc="2025-07-28T14:42:00Z"/>
+  <w16cex:commentExtensible w16cex:durableId="1D6CE52A" w16cex:dateUtc="2025-07-30T15:26:00Z"/>
+  <w16cex:commentExtensible w16cex:durableId="4D2F7D90" w16cex:dateUtc="2025-07-30T17:53:00Z"/>
   <w16cex:commentExtensible w16cex:durableId="6836BCE2" w16cex:dateUtc="2025-07-28T20:54:00Z"/>
   <w16cex:commentExtensible w16cex:durableId="08B9BEA6" w16cex:dateUtc="2025-06-27T19:54:00Z"/>
 </w16cex:commentsExtensible>
@@ -8385,10 +8866,11 @@
 <file path=word/commentsIds.xml><?xml version="1.0" encoding="utf-8"?>
 <w16cid:commentsIds xmlns:wpc="http://schemas.microsoft.com/office/word/2010/wordprocessingCanvas" xmlns:cx="http://schemas.microsoft.com/office/drawing/2014/chartex" xmlns:cx1="http://schemas.microsoft.com/office/drawing/2015/9/8/chartex" xmlns:cx2="http://schemas.microsoft.com/office/drawing/2015/10/21/chartex" xmlns:cx3="http://schemas.microsoft.com/office/drawing/2016/5/9/chartex" xmlns:cx4="http://schemas.microsoft.com/office/drawing/2016/5/10/chartex" xmlns:cx5="http://schemas.microsoft.com/office/drawing/2016/5/11/chartex" xmlns:cx6="http://schemas.microsoft.com/office/drawing/2016/5/12/chartex" xmlns:cx7="http://schemas.microsoft.com/office/drawing/2016/5/13/chartex" xmlns:cx8="http://schemas.microsoft.com/office/drawing/2016/5/14/chartex" xmlns:mc="http://schemas.openxmlformats.org/markup-compatibility/2006" xmlns:aink="http://schemas.microsoft.com/office/drawing/2016/ink" xmlns:am3d="http://schemas.microsoft.com/office/drawing/2017/model3d" xmlns:o="urn:schemas-microsoft-com:office:office" xmlns:oel="http://schemas.microsoft.com/office/2019/extlst" xmlns:r="http://schemas.openxmlformats.org/officeDocument/2006/relationships" xmlns:m="http://schemas.openxmlformats.org/officeDocument/2006/math" xmlns:v="urn:schemas-microsoft-com:vml" xmlns:wp14="http://schemas.microsoft.com/office/word/2010/wordprocessingDrawing" xmlns:wp="http://schemas.openxmlformats.org/drawingml/2006/wordprocessingDrawing" xmlns:w10="urn:schemas-microsoft-com:office:word" xmlns:w="http://schemas.openxmlformats.org/wordprocessingml/2006/main" xmlns:w14="http://schemas.microsoft.com/office/word/2010/wordml" xmlns:w15="http://schemas.microsoft.com/office/word/2012/wordml" xmlns:w16cex="http://schemas.microsoft.com/office/word/2018/wordml/cex" xmlns:w16cid="http://schemas.microsoft.com/office/word/2016/wordml/cid" xmlns:w16="http://schemas.microsoft.com/office/word/2018/wordml" xmlns:w16du="http://schemas.microsoft.com/office/word/2023/wordml/word16du" xmlns:w16sdtdh="http://schemas.microsoft.com/office/word/2020/wordml/sdtdatahash" xmlns:w16sdtfl="http://schemas.microsoft.com/office/word/2024/wordml/sdtformatlock" xmlns:w16se="http://schemas.microsoft.com/office/word/2015/wordml/symex" xmlns:wpg="http://schemas.microsoft.com/office/word/2010/wordprocessingGroup" xmlns:wpi="http://schemas.microsoft.com/office/word/2010/wordprocessingInk" xmlns:wne="http://schemas.microsoft.com/office/word/2006/wordml" xmlns:wps="http://schemas.microsoft.com/office/word/2010/wordprocessingShape" mc:Ignorable="w14 w15 w16se w16cid w16 w16cex w16sdtdh w16sdtfl w16du wp14">
   <w16cid:commentId w16cid:paraId="545E12D6" w16cid:durableId="0AF9D5BC"/>
-  <w16cid:commentId w16cid:paraId="2AD4524E" w16cid:durableId="6C50E346"/>
-  <w16cid:commentId w16cid:paraId="0DA0C363" w16cid:durableId="31A19B43"/>
+  <w16cid:commentId w16cid:paraId="7B9E6931" w16cid:durableId="02BD22AA"/>
   <w16cid:commentId w16cid:paraId="317DFEBA" w16cid:durableId="6C95C996"/>
   <w16cid:commentId w16cid:paraId="05C4AF8C" w16cid:durableId="3CAE4ABD"/>
+  <w16cid:commentId w16cid:paraId="78D2F929" w16cid:durableId="1D6CE52A"/>
+  <w16cid:commentId w16cid:paraId="1EF3F5E1" w16cid:durableId="4D2F7D90"/>
   <w16cid:commentId w16cid:paraId="036EDFB1" w16cid:durableId="6836BCE2"/>
   <w16cid:commentId w16cid:paraId="506CDC99" w16cid:durableId="08B9BEA6"/>
 </w16cid:commentsIds>
@@ -9495,6 +9977,9 @@
 <file path=word/people.xml><?xml version="1.0" encoding="utf-8"?>
 <w15:people xmlns:wpc="http://schemas.microsoft.com/office/word/2010/wordprocessingCanvas" xmlns:cx="http://schemas.microsoft.com/office/drawing/2014/chartex" xmlns:cx1="http://schemas.microsoft.com/office/drawing/2015/9/8/chartex" xmlns:cx2="http://schemas.microsoft.com/office/drawing/2015/10/21/chartex" xmlns:cx3="http://schemas.microsoft.com/office/drawing/2016/5/9/chartex" xmlns:cx4="http://schemas.microsoft.com/office/drawing/2016/5/10/chartex" xmlns:cx5="http://schemas.microsoft.com/office/drawing/2016/5/11/chartex" xmlns:cx6="http://schemas.microsoft.com/office/drawing/2016/5/12/chartex" xmlns:cx7="http://schemas.microsoft.com/office/drawing/2016/5/13/chartex" xmlns:cx8="http://schemas.microsoft.com/office/drawing/2016/5/14/chartex" xmlns:mc="http://schemas.openxmlformats.org/markup-compatibility/2006" xmlns:aink="http://schemas.microsoft.com/office/drawing/2016/ink" xmlns:am3d="http://schemas.microsoft.com/office/drawing/2017/model3d" xmlns:o="urn:schemas-microsoft-com:office:office" xmlns:oel="http://schemas.microsoft.com/office/2019/extlst" xmlns:r="http://schemas.openxmlformats.org/officeDocument/2006/relationships" xmlns:m="http://schemas.openxmlformats.org/officeDocument/2006/math" xmlns:v="urn:schemas-microsoft-com:vml" xmlns:wp14="http://schemas.microsoft.com/office/word/2010/wordprocessingDrawing" xmlns:wp="http://schemas.openxmlformats.org/drawingml/2006/wordprocessingDrawing" xmlns:w10="urn:schemas-microsoft-com:office:word" xmlns:w="http://schemas.openxmlformats.org/wordprocessingml/2006/main" xmlns:w14="http://schemas.microsoft.com/office/word/2010/wordml" xmlns:w15="http://schemas.microsoft.com/office/word/2012/wordml" xmlns:w16cex="http://schemas.microsoft.com/office/word/2018/wordml/cex" xmlns:w16cid="http://schemas.microsoft.com/office/word/2016/wordml/cid" xmlns:w16="http://schemas.microsoft.com/office/word/2018/wordml" xmlns:w16du="http://schemas.microsoft.com/office/word/2023/wordml/word16du" xmlns:w16sdtdh="http://schemas.microsoft.com/office/word/2020/wordml/sdtdatahash" xmlns:w16sdtfl="http://schemas.microsoft.com/office/word/2024/wordml/sdtformatlock" xmlns:w16se="http://schemas.microsoft.com/office/word/2015/wordml/symex" xmlns:wpg="http://schemas.microsoft.com/office/word/2010/wordprocessingGroup" xmlns:wpi="http://schemas.microsoft.com/office/word/2010/wordprocessingInk" xmlns:wne="http://schemas.microsoft.com/office/word/2006/wordml" xmlns:wps="http://schemas.microsoft.com/office/word/2010/wordprocessingShape" mc:Ignorable="w14 w15 w16se w16cid w16 w16cex w16sdtdh w16sdtfl w16du wp14">
   <w15:person w15:author="Benjamin J. Makhlouf">
+    <w15:presenceInfo w15:providerId="AD" w15:userId="S::bmak29@uw.edu::e2d819b1-db99-41fc-888c-ad60b4d561ad"/>
+  </w15:person>
+  <w15:person w15:author="bmak29">
     <w15:presenceInfo w15:providerId="AD" w15:userId="S::bmak29@uw.edu::e2d819b1-db99-41fc-888c-ad60b4d561ad"/>
   </w15:person>
   <w15:person w15:author="Daniel Schindler">
@@ -10107,6 +10592,7 @@
   <w:style w:type="character" w:default="1" w:styleId="DefaultParagraphFont">
     <w:name w:val="Default Paragraph Font"/>
     <w:uiPriority w:val="1"/>
+    <w:semiHidden/>
     <w:unhideWhenUsed/>
   </w:style>
   <w:style w:type="table" w:default="1" w:styleId="TableNormal">
@@ -10936,4 +11422,16 @@
     </a:ext>
   </a:extLst>
 </a:theme>
+</file>
+
+<file path=customXml/item1.xml><?xml version="1.0" encoding="utf-8"?>
+<b:Sources xmlns:b="http://schemas.openxmlformats.org/officeDocument/2006/bibliography" xmlns="http://schemas.openxmlformats.org/officeDocument/2006/bibliography" SelectedStyle="/APASixthEditionOfficeOnline.xsl" StyleName="APA" Version="6"/>
+</file>
+
+<file path=customXml/itemProps1.xml><?xml version="1.0" encoding="utf-8"?>
+<ds:datastoreItem xmlns:ds="http://schemas.openxmlformats.org/officeDocument/2006/customXml" ds:itemID="{F0C3B3C1-115B-7142-B763-9A89294F78DA}">
+  <ds:schemaRefs>
+    <ds:schemaRef ds:uri="http://schemas.openxmlformats.org/officeDocument/2006/bibliography"/>
+  </ds:schemaRefs>
+</ds:datastoreItem>
 </file>
</xml_diff>

<commit_message>
full intro re-write, sans citations
</commit_message>
<xml_diff>
--- a/Docs/Run_timing_manuscript.docx
+++ b/Docs/Run_timing_manuscript.docx
@@ -180,127 +180,128 @@
           <w:sz w:val="22"/>
           <w:szCs w:val="22"/>
         </w:rPr>
-        <w:t xml:space="preserve">A key challenge in </w:t>
-      </w:r>
-      <w:r>
-        <w:rPr>
-          <w:rFonts w:ascii="Garamond" w:hAnsi="Garamond"/>
-          <w:sz w:val="22"/>
-          <w:szCs w:val="22"/>
-        </w:rPr>
-        <w:t xml:space="preserve">fisheries </w:t>
-      </w:r>
-      <w:r>
-        <w:rPr>
-          <w:rFonts w:ascii="Garamond" w:hAnsi="Garamond"/>
-          <w:sz w:val="22"/>
-          <w:szCs w:val="22"/>
-        </w:rPr>
-        <w:t>management is the need to maximize harvest opportunities while maintaining and protecting biodiversity. This challenge is present in mixed species fisheries, where harvesting productive species often risks over-exploitation of non-target co-occurring species of concern</w:t>
-      </w:r>
-      <w:r>
-        <w:rPr>
-          <w:rFonts w:ascii="Garamond" w:hAnsi="Garamond"/>
-          <w:sz w:val="22"/>
-          <w:szCs w:val="22"/>
-        </w:rPr>
-        <w:t xml:space="preserve"> (Cite)</w:t>
-      </w:r>
-      <w:r>
-        <w:rPr>
-          <w:rFonts w:ascii="Garamond" w:hAnsi="Garamond"/>
-          <w:sz w:val="22"/>
-          <w:szCs w:val="22"/>
-        </w:rPr>
-        <w:t xml:space="preserve">. The same challenge also arises in single species mixed stock fisheries, where a single run </w:t>
-      </w:r>
-      <w:r>
-        <w:rPr>
-          <w:rFonts w:ascii="Garamond" w:hAnsi="Garamond"/>
-          <w:sz w:val="22"/>
-          <w:szCs w:val="22"/>
-        </w:rPr>
-        <w:t>consists</w:t>
-      </w:r>
-      <w:r>
-        <w:rPr>
-          <w:rFonts w:ascii="Garamond" w:hAnsi="Garamond"/>
-          <w:sz w:val="22"/>
-          <w:szCs w:val="22"/>
-        </w:rPr>
-        <w:t xml:space="preserve"> of several unique stock components that together contribute to biocomplexity</w:t>
-      </w:r>
-      <w:r>
-        <w:rPr>
-          <w:rFonts w:ascii="Garamond" w:hAnsi="Garamond"/>
-          <w:sz w:val="22"/>
-          <w:szCs w:val="22"/>
-        </w:rPr>
-        <w:t xml:space="preserve"> in the form of variable life history strategies and genetic makeup. This intraspecies biocomplexity increase</w:t>
-      </w:r>
-      <w:r>
-        <w:rPr>
-          <w:rFonts w:ascii="Garamond" w:hAnsi="Garamond"/>
-          <w:sz w:val="22"/>
-          <w:szCs w:val="22"/>
-        </w:rPr>
-        <w:t>s</w:t>
-      </w:r>
-      <w:r>
-        <w:rPr>
-          <w:rFonts w:ascii="Garamond" w:hAnsi="Garamond"/>
-          <w:sz w:val="22"/>
-          <w:szCs w:val="22"/>
-        </w:rPr>
-        <w:t xml:space="preserve"> ecosystem stability by distributing risk across several weakly or negatively correlated sub-components. </w:t>
-      </w:r>
-      <w:r>
-        <w:rPr>
-          <w:rFonts w:ascii="Garamond" w:hAnsi="Garamond"/>
-          <w:sz w:val="22"/>
-          <w:szCs w:val="22"/>
-        </w:rPr>
-        <w:t xml:space="preserve">Additionally, </w:t>
-      </w:r>
-      <w:r>
-        <w:rPr>
-          <w:rFonts w:ascii="Garamond" w:hAnsi="Garamond"/>
-          <w:sz w:val="22"/>
-          <w:szCs w:val="22"/>
-        </w:rPr>
-        <w:t xml:space="preserve">for </w:t>
-      </w:r>
-      <w:r>
-        <w:rPr>
-          <w:rFonts w:ascii="Garamond" w:hAnsi="Garamond"/>
-          <w:sz w:val="22"/>
-          <w:szCs w:val="22"/>
-        </w:rPr>
-        <w:t xml:space="preserve">fisheries which can harvest across several of these stock components, biocomplexity in life history may help reduce pressure on a single stock by distributing fishing pressure across </w:t>
-      </w:r>
-      <w:r>
-        <w:rPr>
-          <w:rFonts w:ascii="Garamond" w:hAnsi="Garamond"/>
-          <w:sz w:val="22"/>
-          <w:szCs w:val="22"/>
-        </w:rPr>
-        <w:t>broader</w:t>
-      </w:r>
-      <w:r>
-        <w:rPr>
-          <w:rFonts w:ascii="Garamond" w:hAnsi="Garamond"/>
-          <w:sz w:val="22"/>
-          <w:szCs w:val="22"/>
-        </w:rPr>
-        <w:t xml:space="preserve"> spatial and temporal scale</w:t>
-      </w:r>
-      <w:r>
-        <w:rPr>
-          <w:rFonts w:ascii="Garamond" w:hAnsi="Garamond"/>
-          <w:sz w:val="22"/>
-          <w:szCs w:val="22"/>
-        </w:rPr>
-        <w:t>s</w:t>
+        <w:t xml:space="preserve">A </w:t>
+      </w:r>
+      <w:r>
+        <w:rPr>
+          <w:rFonts w:ascii="Garamond" w:hAnsi="Garamond"/>
+          <w:sz w:val="22"/>
+          <w:szCs w:val="22"/>
+        </w:rPr>
+        <w:t>key</w:t>
+      </w:r>
+      <w:r>
+        <w:rPr>
+          <w:rFonts w:ascii="Garamond" w:hAnsi="Garamond"/>
+          <w:sz w:val="22"/>
+          <w:szCs w:val="22"/>
+        </w:rPr>
+        <w:t xml:space="preserve"> challenge in fisheries management is balancing the dual goals of maximizing harvest opportunities and preserving biodiversity</w:t>
+      </w:r>
+      <w:r>
+        <w:rPr>
+          <w:rFonts w:ascii="Garamond" w:hAnsi="Garamond"/>
+          <w:sz w:val="22"/>
+          <w:szCs w:val="22"/>
+        </w:rPr>
+        <w:t>.</w:t>
+      </w:r>
+      <w:r>
+        <w:rPr>
+          <w:rFonts w:ascii="Garamond" w:hAnsi="Garamond"/>
+          <w:sz w:val="22"/>
+          <w:szCs w:val="22"/>
+        </w:rPr>
+        <w:t xml:space="preserve"> </w:t>
+      </w:r>
+      <w:r>
+        <w:rPr>
+          <w:rFonts w:ascii="Garamond" w:hAnsi="Garamond"/>
+          <w:sz w:val="22"/>
+          <w:szCs w:val="22"/>
+        </w:rPr>
+        <w:t>Biodiversity can be defined not only by the number of species within an ecosystem</w:t>
+      </w:r>
+      <w:r>
+        <w:rPr>
+          <w:rFonts w:ascii="Garamond" w:hAnsi="Garamond"/>
+          <w:sz w:val="22"/>
+          <w:szCs w:val="22"/>
+        </w:rPr>
+        <w:t xml:space="preserve">, </w:t>
+      </w:r>
+      <w:r>
+        <w:rPr>
+          <w:rFonts w:ascii="Garamond" w:hAnsi="Garamond"/>
+          <w:sz w:val="22"/>
+          <w:szCs w:val="22"/>
+        </w:rPr>
+        <w:t>but also by the diversity among populations</w:t>
+      </w:r>
+      <w:r>
+        <w:rPr>
+          <w:rFonts w:ascii="Garamond" w:hAnsi="Garamond"/>
+          <w:sz w:val="22"/>
+          <w:szCs w:val="22"/>
+        </w:rPr>
+        <w:t xml:space="preserve"> </w:t>
+      </w:r>
+      <w:r>
+        <w:rPr>
+          <w:rFonts w:ascii="Garamond" w:hAnsi="Garamond"/>
+          <w:sz w:val="22"/>
+          <w:szCs w:val="22"/>
+        </w:rPr>
+        <w:t>within a single species</w:t>
+      </w:r>
+      <w:r>
+        <w:rPr>
+          <w:rFonts w:ascii="Garamond" w:hAnsi="Garamond"/>
+          <w:sz w:val="22"/>
+          <w:szCs w:val="22"/>
+        </w:rPr>
+        <w:t xml:space="preserve"> </w:t>
+      </w:r>
+      <w:r>
+        <w:rPr>
+          <w:rFonts w:ascii="Garamond" w:hAnsi="Garamond"/>
+          <w:sz w:val="22"/>
+          <w:szCs w:val="22"/>
+        </w:rPr>
+        <w:fldChar w:fldCharType="begin"/>
+      </w:r>
+      <w:r>
+        <w:rPr>
+          <w:rFonts w:ascii="Garamond" w:hAnsi="Garamond"/>
+          <w:sz w:val="22"/>
+          <w:szCs w:val="22"/>
+        </w:rPr>
+        <w:instrText xml:space="preserve"> ADDIN ZOTERO_ITEM CSL_CITATION {"citationID":"O8GNuS7R","properties":{"formattedCitation":"(Bolnick et al., 2011; Luck et al., 2003; Schindler et al., 2010)","plainCitation":"(Bolnick et al., 2011; Luck et al., 2003; Schindler et al., 2010)","noteIndex":0},"citationItems":[{"id":5318,"uris":["http://zotero.org/users/8421274/items/R2ZYTKMR"],"itemData":{"id":5318,"type":"article-journal","container-title":"Trends in Ecology &amp; Evolution","DOI":"10.1016/j.tree.2011.01.009","ISSN":"0169-5347","issue":"4","journalAbbreviation":"Trends in Ecology &amp; Evolution","language":"English","note":"publisher: Elsevier\nPMID: 21367482","page":"183-192","source":"www.cell.com","title":"Why intraspecific trait variation matters in community ecology","volume":"26","author":[{"family":"Bolnick","given":"Daniel I."},{"family":"Amarasekare","given":"Priyanga"},{"family":"Araújo","given":"Márcio S."},{"family":"Bürger","given":"Reinhard"},{"family":"Levine","given":"Jonathan M."},{"family":"Novak","given":"Mark"},{"family":"Rudolf","given":"Volker H. W."},{"family":"Schreiber","given":"Sebastian J."},{"family":"Urban","given":"Mark C."},{"family":"Vasseur","given":"David A."}],"issued":{"date-parts":[["2011",4,1]]}}},{"id":5557,"uris":["http://zotero.org/users/8421274/items/VSKUKCRX"],"itemData":{"id":5557,"type":"article-journal","abstract":"The current rate of biodiversity loss threatens to disrupt greatly the functioning of ecosystems, with potentially significant consequences for humanity. The magnitude of the loss is generally measured with the use of species extinction rates, an approach that understates the severity of the problem and masks some of its most important consequences. Here, we propose a major expansion of this focus to include population diversity: considering changes in the size, number, distribution and genetic composition of populations and the implications of those changes for the functioning of ecosystems and the provision of ecosystem services. We also outline the key components of population diversity and describe a new approach to delineating a population unit that explicitly links it to the services that it provides","container-title":"Trends in Ecology &amp; Evolution","DOI":"10.1016/S0169-5347(03)00100-9","journalAbbreviation":"Trends in Ecology &amp; Evolution","page":"331-336","source":"ResearchGate","title":"Population diversity and ecosystem services","volume":"18","author":[{"family":"Luck","given":"Gary"},{"family":"Daily","given":"Gretchen"},{"family":"Ehrlich","given":"Paul"}],"issued":{"date-parts":[["2003",7,1]]}}},{"id":272,"uris":["http://zotero.org/users/8421274/items/24NDGS7V"],"itemData":{"id":272,"type":"article-journal","abstract":"One of the most pervasive themes in ecology is that biological diversity stabilizes ecosystem processes and the services they provide to society, a concept that has become a common argument for biodiversity conservation. Species-rich communities are thought to produce more temporally stable ecosystem services because of the complementary or independent dynamics among species that perform similar ecosystem functions. Such variance dampening within communities is referred to as a portfolio effect and is analogous to the effects of asset diversity on the stability of financial portfolios. In ecology, these arguments have focused on the effects of species diversity on ecosystem stability but have not considered the importance of biologically relevant diversity within individual species. Current rates of population extirpation are probably at least three orders of magnitude higher than species extinction rates, so there is a pressing need to clarify how population and life history diversity affect the performance of individual species in providing important ecosystem services. Here we use five decades of data from Oncorhynchus nerka (sockeye salmon) in Bristol Bay, Alaska, to provide the first quantification of portfolio effects that derive from population and life history diversity in an important and heavily exploited species. Variability in annual Bristol Bay salmon returns is 2.2 times lower than it would be if the system consisted of a single homogenous population rather than the several hundred discrete populations it currently consists of. Furthermore, if it were a single homogeneous population, such increased variability would lead to ten times more frequent fisheries closures. Portfolio effects are also evident in watershed food webs, where they stabilize and extend predator access to salmon resources. Our results demonstrate the critical importance of maintaining population diversity for stabilizing ecosystem services and securing the economies and livelihoods that depend on them. The reliability of ecosystem services will erode faster than indicated by species loss alone. [PUBLICATION ABSTRACT]","container-title":"Nature","DOI":"https://doi-org.prox.lib.ncsu.edu/10.1038/nature09060","ISSN":"00280836","issue":"7298","language":"English","license":"Copyright Nature Publishing Group Jun 3, 2010","note":"number-of-pages: 5\npublisher-place: London, United States\npublisher: Nature Publishing Group\nsection: LETTERS","source":"ProQuest","title":"Population diversity and the portfolio effect in an exploited species","URL":"http://www.proquest.com/docview/375318240/abstract/317AC81E34EB4163PQ/1","volume":"465","author":[{"family":"Schindler","given":"Daniel E."},{"family":"Hilborn","given":"Ray"},{"family":"Chasco","given":"Brandon"},{"family":"Boatright","given":"Christopher P."},{"family":"Quinn","given":"Thomas P."},{"family":"Rogers","given":"Lauren A."},{"family":"Webster","given":"Michael S."}],"accessed":{"date-parts":[["2022",5,12]]},"issued":{"date-parts":[["2010",6,3]]}}}],"schema":"https://github.com/citation-style-language/schema/raw/master/csl-citation.json"} </w:instrText>
+      </w:r>
+      <w:r>
+        <w:rPr>
+          <w:rFonts w:ascii="Garamond" w:hAnsi="Garamond"/>
+          <w:sz w:val="22"/>
+          <w:szCs w:val="22"/>
+        </w:rPr>
+        <w:fldChar w:fldCharType="separate"/>
+      </w:r>
+      <w:r>
+        <w:rPr>
+          <w:rFonts w:ascii="Garamond" w:hAnsi="Garamond"/>
+          <w:noProof/>
+          <w:sz w:val="22"/>
+          <w:szCs w:val="22"/>
+        </w:rPr>
+        <w:t>(Bolnick et al., 2011; Luck et al., 2003; Schindler et al., 2010)</w:t>
+      </w:r>
+      <w:r>
+        <w:rPr>
+          <w:rFonts w:ascii="Garamond" w:hAnsi="Garamond"/>
+          <w:sz w:val="22"/>
+          <w:szCs w:val="22"/>
+        </w:rPr>
+        <w:fldChar w:fldCharType="end"/>
       </w:r>
       <w:r>
         <w:rPr>
@@ -309,6 +310,276 @@
           <w:szCs w:val="22"/>
         </w:rPr>
         <w:t xml:space="preserve">. </w:t>
+      </w:r>
+      <w:r>
+        <w:rPr>
+          <w:rFonts w:ascii="Garamond" w:hAnsi="Garamond"/>
+          <w:sz w:val="22"/>
+          <w:szCs w:val="22"/>
+        </w:rPr>
+        <w:t>Maintaining biodiversity in fisheries</w:t>
+      </w:r>
+      <w:r>
+        <w:rPr>
+          <w:rFonts w:ascii="Garamond" w:hAnsi="Garamond"/>
+          <w:sz w:val="22"/>
+          <w:szCs w:val="22"/>
+        </w:rPr>
+        <w:t xml:space="preserve"> has been shown to stabilize ecosystems by distributing risk across sub-components, thereby reducing </w:t>
+      </w:r>
+      <w:r>
+        <w:rPr>
+          <w:rFonts w:ascii="Garamond" w:hAnsi="Garamond"/>
+          <w:sz w:val="22"/>
+          <w:szCs w:val="22"/>
+        </w:rPr>
+        <w:t xml:space="preserve">population level </w:t>
+      </w:r>
+      <w:r>
+        <w:rPr>
+          <w:rFonts w:ascii="Garamond" w:hAnsi="Garamond"/>
+          <w:sz w:val="22"/>
+          <w:szCs w:val="22"/>
+        </w:rPr>
+        <w:t xml:space="preserve">impacts from local or short-term </w:t>
+      </w:r>
+      <w:r>
+        <w:rPr>
+          <w:rFonts w:ascii="Garamond" w:hAnsi="Garamond"/>
+          <w:sz w:val="22"/>
+          <w:szCs w:val="22"/>
+        </w:rPr>
+        <w:t xml:space="preserve">environmental </w:t>
+      </w:r>
+      <w:r>
+        <w:rPr>
+          <w:rFonts w:ascii="Garamond" w:hAnsi="Garamond"/>
+          <w:sz w:val="22"/>
+          <w:szCs w:val="22"/>
+        </w:rPr>
+        <w:t>conditions that negatively affect individual components</w:t>
+      </w:r>
+      <w:r>
+        <w:rPr>
+          <w:rFonts w:ascii="Garamond" w:hAnsi="Garamond"/>
+          <w:sz w:val="22"/>
+          <w:szCs w:val="22"/>
+        </w:rPr>
+        <w:t xml:space="preserve"> </w:t>
+      </w:r>
+      <w:r>
+        <w:rPr>
+          <w:rFonts w:ascii="Garamond" w:hAnsi="Garamond"/>
+          <w:sz w:val="22"/>
+          <w:szCs w:val="22"/>
+        </w:rPr>
+        <w:fldChar w:fldCharType="begin"/>
+      </w:r>
+      <w:r>
+        <w:rPr>
+          <w:rFonts w:ascii="Garamond" w:hAnsi="Garamond"/>
+          <w:sz w:val="22"/>
+          <w:szCs w:val="22"/>
+        </w:rPr>
+        <w:instrText xml:space="preserve"> ADDIN ZOTERO_ITEM CSL_CITATION {"citationID":"OuntjPOB","properties":{"formattedCitation":"(Schindler et al., 2015)","plainCitation":"(Schindler et al., 2015)","noteIndex":0},"citationItems":[{"id":68,"uris":["http://zotero.org/users/8421274/items/DIRY8NHC"],"itemData":{"id":68,"type":"article-journal","container-title":"Frontiers in Ecology and the Environment","issue":"5","note":"publisher: Wiley Online Library","page":"257–263","source":"Google Scholar","title":"The portfolio concept in ecology and evolution","volume":"13","author":[{"family":"Schindler","given":"Daniel E."},{"family":"Armstrong","given":"Jonathan B."},{"family":"Reed","given":"Thomas E."}],"issued":{"date-parts":[["2015"]]}}}],"schema":"https://github.com/citation-style-language/schema/raw/master/csl-citation.json"} </w:instrText>
+      </w:r>
+      <w:r>
+        <w:rPr>
+          <w:rFonts w:ascii="Garamond" w:hAnsi="Garamond"/>
+          <w:sz w:val="22"/>
+          <w:szCs w:val="22"/>
+        </w:rPr>
+        <w:fldChar w:fldCharType="separate"/>
+      </w:r>
+      <w:r>
+        <w:rPr>
+          <w:rFonts w:ascii="Garamond" w:hAnsi="Garamond"/>
+          <w:noProof/>
+          <w:sz w:val="22"/>
+          <w:szCs w:val="22"/>
+        </w:rPr>
+        <w:t>(Schindler et al., 2015)</w:t>
+      </w:r>
+      <w:r>
+        <w:rPr>
+          <w:rFonts w:ascii="Garamond" w:hAnsi="Garamond"/>
+          <w:sz w:val="22"/>
+          <w:szCs w:val="22"/>
+        </w:rPr>
+        <w:fldChar w:fldCharType="end"/>
+      </w:r>
+      <w:r>
+        <w:rPr>
+          <w:rFonts w:ascii="Garamond" w:hAnsi="Garamond"/>
+          <w:sz w:val="22"/>
+          <w:szCs w:val="22"/>
+        </w:rPr>
+        <w:t xml:space="preserve">. </w:t>
+      </w:r>
+      <w:r>
+        <w:rPr>
+          <w:rFonts w:ascii="Garamond" w:hAnsi="Garamond"/>
+          <w:sz w:val="22"/>
+          <w:szCs w:val="22"/>
+        </w:rPr>
+        <w:t xml:space="preserve">In addition, maintaining biodiversity at the population scale can </w:t>
+      </w:r>
+      <w:r>
+        <w:rPr>
+          <w:rStyle w:val="Strong"/>
+          <w:rFonts w:ascii="Garamond" w:hAnsi="Garamond"/>
+          <w:b w:val="0"/>
+          <w:bCs w:val="0"/>
+          <w:sz w:val="22"/>
+          <w:szCs w:val="22"/>
+        </w:rPr>
+        <w:t>provide longer and more reliable</w:t>
+      </w:r>
+      <w:r>
+        <w:rPr>
+          <w:rFonts w:ascii="Garamond" w:hAnsi="Garamond"/>
+          <w:sz w:val="22"/>
+          <w:szCs w:val="22"/>
+        </w:rPr>
+        <w:t xml:space="preserve"> harvest opportunities</w:t>
+      </w:r>
+      <w:r>
+        <w:rPr>
+          <w:rFonts w:ascii="Garamond" w:hAnsi="Garamond"/>
+          <w:sz w:val="22"/>
+          <w:szCs w:val="22"/>
+        </w:rPr>
+        <w:t xml:space="preserve"> </w:t>
+      </w:r>
+      <w:r>
+        <w:rPr>
+          <w:rFonts w:ascii="Garamond" w:hAnsi="Garamond"/>
+          <w:sz w:val="22"/>
+          <w:szCs w:val="22"/>
+        </w:rPr>
+        <w:fldChar w:fldCharType="begin"/>
+      </w:r>
+      <w:r>
+        <w:rPr>
+          <w:rFonts w:ascii="Garamond" w:hAnsi="Garamond"/>
+          <w:sz w:val="22"/>
+          <w:szCs w:val="22"/>
+        </w:rPr>
+        <w:instrText xml:space="preserve"> ADDIN ZOTERO_ITEM CSL_CITATION {"citationID":"VDgUGdsR","properties":{"formattedCitation":"(Nesbitt &amp; Moore, 2016; Schindler et al., 2015)","plainCitation":"(Nesbitt &amp; Moore, 2016; Schindler et al., 2015)","noteIndex":0},"citationItems":[{"id":3361,"uris":["http://zotero.org/users/8421274/items/U6M4JZTI"],"itemData":{"id":3361,"type":"article-journal","abstract":"Indigenous people are considered to be among the most vulnerable to food insecurity and biodiversity loss. Biodiversity is cited as a key component of indigenous food security; however, quantitative examples of this linkage are limited. We examined how species and population diversity influence the food security of indigenous fisheries for Pacific salmon (Oncorhynchus species). We compared two dimensions of food security – catch stability (interannual variability) and access (season length) – across a salmon diversity gradient for 21 fisheries on the Fraser River, Canada, over 30 years, using linear regression models. We used population diversity proxies derived from a range of existing measures because population-specific data were unavailable. While both population and species diversity were generally associated with higher catch stability and temporal access, population diversity had a stronger signal. Fisheries with access to high species diversity had up to 1·4 times more stable catch than predicted by the portfolio effect and up to 1·2 times longer fishing seasons than fisheries with access to fewer species. Fisheries with access to high population diversity had up to 3·8 times more stable catch and three times longer seasons than fisheries with access to fewer populations. Catch stability of Chinook Oncorhynchus tshawytscha and sockeye Oncorhynchus nerka fisheries was best explained by the number of populations and conservation units, respectively, that migrate past a fishery en route to spawning grounds. Similar population diversity metrics were important explanatory variables for season length of sockeye, pink Oncorhynchus gorbuscha, coho Oncorhynchus kisutch and chum Oncorhynchus keta fisheries. Synthesis and applications. We show an empirical example of how multiple scales of biodiversity support food security across a large watershed and suggest that protecting fine-scale salmon diversity will help promote food security for indigenous people. The scales of environmental assessments need to match the scales of the socio-ecological processes that will be affected by development. We illustrate that upstream projects that damage salmon habitat could degrade the food security of downstream indigenous fisheries, with implications to Canadian indigenous people and to watersheds around the world where migratory fishes support local fisheries.","container-title":"Journal of Applied Ecology","DOI":"10.1111/1365-2664.12717","ISSN":"1365-2664","issue":"5","language":"en","note":"_eprint: https://onlinelibrary.wiley.com/doi/pdf/10.1111/1365-2664.12717","page":"1489-1499","source":"Wiley Online Library","title":"Species and population diversity in Pacific salmon fisheries underpin indigenous food security","volume":"53","author":[{"family":"Nesbitt","given":"Holly K."},{"family":"Moore","given":"Jonathan W."}],"issued":{"date-parts":[["2016"]]}}},{"id":68,"uris":["http://zotero.org/users/8421274/items/DIRY8NHC"],"itemData":{"id":68,"type":"article-journal","container-title":"Frontiers in Ecology and the Environment","issue":"5","note":"publisher: Wiley Online Library","page":"257–263","source":"Google Scholar","title":"The portfolio concept in ecology and evolution","volume":"13","author":[{"family":"Schindler","given":"Daniel E."},{"family":"Armstrong","given":"Jonathan B."},{"family":"Reed","given":"Thomas E."}],"issued":{"date-parts":[["2015"]]}}}],"schema":"https://github.com/citation-style-language/schema/raw/master/csl-citation.json"} </w:instrText>
+      </w:r>
+      <w:r>
+        <w:rPr>
+          <w:rFonts w:ascii="Garamond" w:hAnsi="Garamond"/>
+          <w:sz w:val="22"/>
+          <w:szCs w:val="22"/>
+        </w:rPr>
+        <w:fldChar w:fldCharType="separate"/>
+      </w:r>
+      <w:r>
+        <w:rPr>
+          <w:rFonts w:ascii="Garamond" w:hAnsi="Garamond"/>
+          <w:noProof/>
+          <w:sz w:val="22"/>
+          <w:szCs w:val="22"/>
+        </w:rPr>
+        <w:t>(Nesbitt &amp; Moore, 2016; Schindler et al., 2015)</w:t>
+      </w:r>
+      <w:r>
+        <w:rPr>
+          <w:rFonts w:ascii="Garamond" w:hAnsi="Garamond"/>
+          <w:sz w:val="22"/>
+          <w:szCs w:val="22"/>
+        </w:rPr>
+        <w:fldChar w:fldCharType="end"/>
+      </w:r>
+      <w:r>
+        <w:rPr>
+          <w:rFonts w:ascii="Garamond" w:hAnsi="Garamond"/>
+          <w:sz w:val="22"/>
+          <w:szCs w:val="22"/>
+        </w:rPr>
+        <w:t xml:space="preserve">. </w:t>
+      </w:r>
+      <w:r>
+        <w:rPr>
+          <w:rFonts w:ascii="Garamond" w:hAnsi="Garamond"/>
+          <w:sz w:val="22"/>
+          <w:szCs w:val="22"/>
+        </w:rPr>
+        <w:t>However, monitoring and accounting for this diversity remains logistically difficult, and fisheries often harvest from aggregate populations without fully understanding the effects on individual stock components.</w:t>
+      </w:r>
+      <w:r>
+        <w:rPr>
+          <w:rFonts w:ascii="Garamond" w:hAnsi="Garamond"/>
+          <w:sz w:val="22"/>
+          <w:szCs w:val="22"/>
+        </w:rPr>
+        <w:t xml:space="preserve"> As a result, mixed stock fisheries risk inadvertently overexploiting vulnerable stocks or species that co-migrate with robust stocks, </w:t>
+      </w:r>
+      <w:r>
+        <w:rPr>
+          <w:rFonts w:ascii="Garamond" w:hAnsi="Garamond"/>
+          <w:sz w:val="22"/>
+          <w:szCs w:val="22"/>
+        </w:rPr>
+        <w:t xml:space="preserve">thereby degrading system-wide biodiversity and the ecosystem benefits it provides </w:t>
+      </w:r>
+      <w:r>
+        <w:rPr>
+          <w:rFonts w:ascii="Garamond" w:hAnsi="Garamond"/>
+          <w:sz w:val="22"/>
+          <w:szCs w:val="22"/>
+        </w:rPr>
+        <w:fldChar w:fldCharType="begin"/>
+      </w:r>
+      <w:r>
+        <w:rPr>
+          <w:rFonts w:ascii="Garamond" w:hAnsi="Garamond"/>
+          <w:sz w:val="22"/>
+          <w:szCs w:val="22"/>
+        </w:rPr>
+        <w:instrText xml:space="preserve"> ADDIN ZOTERO_ITEM CSL_CITATION {"citationID":"Xy2B32bc","properties":{"formattedCitation":"(Connors et al., 2020; Moore et al., 2021)","plainCitation":"(Connors et al., 2020; Moore et al., 2021)","noteIndex":0},"citationItems":[{"id":4416,"uris":["http://zotero.org/users/8421274/items/STEMPPV7"],"itemData":{"id":4416,"type":"article-journal","abstract":"Accounting for population diversity can be critical to the sustainable management of mixed-stock fisheries because harvest rates that can be sustained by productive populations may come at the cost of overfishing less productive ones. While these harvest–diversity trade-offs are well-recognized, their consequences for harvest policy performance are not often explicitly evaluated in contemporary fisheries management. We use closed-loop simulations to evaluate the ability of alternative harvest policies to meet population diversity and fishery objectives for one of the largest subsistence Chinook salmon (Oncorhynchus tshawytscha) fisheries in the world (Kuskokwim River Basin in western Alaska). We found clear evidence of population diversity that resulted in asymmetric trade-offs among fishery and conservation objectives whereby policies that forgo relatively small amounts of harvest result in relatively large increases in equitable access to Chinook and elimination of risk of weak stock extirpation. The performance of alternative harvest policies, and the magnitude of trade-offs, were sensitive to regime shifts and uncertainty in the drivers of recruitment variation. However, we found that harvest policies that prioritized meeting minimum subsistence needs were unlikely to jeopardize long-term sustainability.","container-title":"Canadian Journal of Fisheries and Aquatic Sciences","DOI":"10.1139/cjfas-2019-0282","ISSN":"0706-652X","issue":"6","journalAbbreviation":"Can. J. Fish. Aquat. Sci.","note":"publisher: NRC Research Press","page":"1076-1089","source":"cdnsciencepub-com.offcampus.lib.washington.edu (Atypon)","title":"Incorporating harvest–population diversity trade-offs into harvest policy analyses of salmon management in large river basins","volume":"77","author":[{"family":"Connors","given":"Brendan M."},{"family":"Staton","given":"Benjamin"},{"family":"Coggins","given":"Lewis"},{"family":"Walters","given":"Carl"},{"family":"Jones","given":"Mike"},{"family":"Gwinn","given":"Daniel"},{"family":"Catalano","given":"Matt"},{"family":"Fleischman","given":"Steve"}],"issued":{"date-parts":[["2020",6]]}}},{"id":2083,"uris":["http://zotero.org/users/8421274/items/4M6WQVDS"],"itemData":{"id":2083,"type":"article-journal","abstract":"Fish biodiversity sustains the resilience and productivity of fisheries, yet this biodiversity can be threatened by overharvest and depletion in mixed-stock fisheries. Thus, the biodiversity that provides benefits may also make sustainable resource extraction more difficult, a key challenge in fisheries management. We simulated a mixed-stock fishery to explore relationships between different dimensions of biodiversity and fishery performance relative to conservation and fishery objectives. Different dimensions of biodiversity (number of stocks, evenness, asynchrony among stocks, heterogeneity in stock productivity) exacerbated trade-offs between fishery and conservation objectives. For example, fisheries targeting stock-complexes with greater asynchrony, and to a lesser extent richness, had greater stability in harvest through time but also greater risks of overfishing weak stocks and reduced yield compared to less biodiverse stock-complexes. These trade-offs were ameliorated by increasing management control—the capacity of fishery managers to harvest specific stocks. To explore these trade-offs in real-world fisheries, we contrasted the fishing and population status of individual stocks within three major mixed-stock sockeye salmon (Oncorhynchus nerka, Salmonidae) fisheries—Bristol Bay, Fraser River, and Skeena River. In general, the fisheries with lower management control had individual stocks that were more often being over- or under-fished, compared with those with higher management control, though variation among regions in biodiversity, scale of management, and magnitude of habitat alteration likely also contribute to these relationships. Collectively, our findings emphasize that there is a need to extract less or regulate better in order to conserve and benefit from biodiversity in fisheries and other natural resource management systems.","container-title":"Fish and Fisheries","DOI":"10.1111/faf.12567","ISSN":"1467-2979","issue":"5","language":"en","note":"_eprint: https://onlinelibrary.wiley.com/doi/pdf/10.1111/faf.12567","page":"1024-1040","source":"Wiley Online Library","title":"Conservation risks and portfolio effects in mixed-stock fisheries","volume":"22","author":[{"family":"Moore","given":"Jonathan W."},{"family":"Connors","given":"Brendan M."},{"family":"Hodgson","given":"Emma E."}],"issued":{"date-parts":[["2021"]]}}}],"schema":"https://github.com/citation-style-language/schema/raw/master/csl-citation.json"} </w:instrText>
+      </w:r>
+      <w:r>
+        <w:rPr>
+          <w:rFonts w:ascii="Garamond" w:hAnsi="Garamond"/>
+          <w:sz w:val="22"/>
+          <w:szCs w:val="22"/>
+        </w:rPr>
+        <w:fldChar w:fldCharType="separate"/>
+      </w:r>
+      <w:r>
+        <w:rPr>
+          <w:rFonts w:ascii="Garamond" w:hAnsi="Garamond"/>
+          <w:noProof/>
+          <w:sz w:val="22"/>
+          <w:szCs w:val="22"/>
+        </w:rPr>
+        <w:t>(Connors et al., 2020; Moore et al., 2021)</w:t>
+      </w:r>
+      <w:r>
+        <w:rPr>
+          <w:rFonts w:ascii="Garamond" w:hAnsi="Garamond"/>
+          <w:sz w:val="22"/>
+          <w:szCs w:val="22"/>
+        </w:rPr>
+        <w:fldChar w:fldCharType="end"/>
+      </w:r>
+      <w:r>
+        <w:rPr>
+          <w:rFonts w:ascii="Garamond" w:hAnsi="Garamond"/>
+          <w:sz w:val="22"/>
+          <w:szCs w:val="22"/>
+        </w:rPr>
+        <w:t>.</w:t>
+      </w:r>
+      <w:r>
+        <w:rPr>
+          <w:rFonts w:ascii="Garamond" w:hAnsi="Garamond"/>
+          <w:sz w:val="22"/>
+          <w:szCs w:val="22"/>
+        </w:rPr>
+        <w:t xml:space="preserve"> </w:t>
       </w:r>
     </w:p>
     <w:p>
@@ -327,111 +598,34 @@
           <w:sz w:val="22"/>
           <w:szCs w:val="22"/>
         </w:rPr>
-        <w:t>In salmon ecosystems, the existence and benefits of significant intrapopulation biocomplexity have been well established. Within a given population, variability in return timing and spatial distribution of habitat use distributes the risk of perturbation across both space and time</w:t>
-      </w:r>
-      <w:r>
-        <w:rPr>
-          <w:rFonts w:ascii="Garamond" w:hAnsi="Garamond"/>
-          <w:sz w:val="22"/>
-          <w:szCs w:val="22"/>
-        </w:rPr>
-        <w:t xml:space="preserve"> </w:t>
-      </w:r>
-      <w:r>
-        <w:rPr>
-          <w:rFonts w:ascii="Garamond" w:hAnsi="Garamond"/>
-          <w:sz w:val="22"/>
-          <w:szCs w:val="22"/>
-        </w:rPr>
-        <w:t>both within and among years.</w:t>
-      </w:r>
-      <w:r>
-        <w:rPr>
-          <w:rFonts w:ascii="Garamond" w:hAnsi="Garamond"/>
-          <w:sz w:val="22"/>
-          <w:szCs w:val="22"/>
-        </w:rPr>
-        <w:t xml:space="preserve"> </w:t>
-      </w:r>
-      <w:r>
-        <w:rPr>
-          <w:rFonts w:ascii="Garamond" w:hAnsi="Garamond"/>
-          <w:sz w:val="22"/>
-          <w:szCs w:val="22"/>
-        </w:rPr>
-        <w:t>In doing so, this biocomplexity increases ecosystem resilience to short-term or local changes in habitat conditions, maximizes genetic diversity, and stabilizes aggregate resource availability.</w:t>
-      </w:r>
-      <w:r>
-        <w:rPr>
-          <w:rFonts w:ascii="Garamond" w:hAnsi="Garamond"/>
-          <w:sz w:val="22"/>
-          <w:szCs w:val="22"/>
-        </w:rPr>
-        <w:t xml:space="preserve"> </w:t>
-      </w:r>
-      <w:r>
-        <w:rPr>
-          <w:rFonts w:ascii="Garamond" w:hAnsi="Garamond"/>
-          <w:sz w:val="22"/>
-          <w:szCs w:val="22"/>
-        </w:rPr>
-        <w:t xml:space="preserve">For fisheries that harvest migrating stocks downstream, as is the case with many Pacific salmon fisheries, the reliability and duration of resource availability depends on the aggregate dynamics of upstream stocks. </w:t>
-      </w:r>
-      <w:r>
-        <w:rPr>
-          <w:rFonts w:ascii="Garamond" w:hAnsi="Garamond"/>
-          <w:sz w:val="22"/>
-          <w:szCs w:val="22"/>
-        </w:rPr>
-        <w:t>M</w:t>
-      </w:r>
-      <w:r>
-        <w:rPr>
-          <w:rFonts w:ascii="Garamond" w:hAnsi="Garamond"/>
-          <w:sz w:val="22"/>
-          <w:szCs w:val="22"/>
-        </w:rPr>
-        <w:t xml:space="preserve">anagers </w:t>
-      </w:r>
-      <w:r>
-        <w:rPr>
-          <w:rFonts w:ascii="Garamond" w:hAnsi="Garamond"/>
-          <w:sz w:val="22"/>
-          <w:szCs w:val="22"/>
-        </w:rPr>
-        <w:t>must therefore</w:t>
-      </w:r>
-      <w:r>
-        <w:rPr>
-          <w:rFonts w:ascii="Garamond" w:hAnsi="Garamond"/>
-          <w:sz w:val="22"/>
-          <w:szCs w:val="22"/>
-        </w:rPr>
-        <w:t xml:space="preserve"> </w:t>
-      </w:r>
-      <w:r>
-        <w:rPr>
-          <w:rFonts w:ascii="Garamond" w:hAnsi="Garamond"/>
-          <w:sz w:val="22"/>
-          <w:szCs w:val="22"/>
-        </w:rPr>
-        <w:t>design</w:t>
-      </w:r>
-      <w:r>
-        <w:rPr>
-          <w:rFonts w:ascii="Garamond" w:hAnsi="Garamond"/>
-          <w:sz w:val="22"/>
-          <w:szCs w:val="22"/>
-        </w:rPr>
-        <w:t xml:space="preserve"> harvest strategies that allow for downstream harvest while protecting the individual health of stock components</w:t>
-      </w:r>
-      <w:r>
-        <w:rPr>
-          <w:rFonts w:ascii="Garamond" w:hAnsi="Garamond"/>
-          <w:sz w:val="22"/>
-          <w:szCs w:val="22"/>
-        </w:rPr>
-        <w:t xml:space="preserve">. </w:t>
+        <w:t xml:space="preserve">Salmon populations exhibit significant diversity in run timing and spatial distribution of habitat use. During upstream migration, returning adults comprise multiple spatial stocks with distinct abundance and run timing that co-migrate within overlapping temporal windows. </w:t>
+      </w:r>
+      <w:r>
+        <w:rPr>
+          <w:rFonts w:ascii="Garamond" w:hAnsi="Garamond"/>
+          <w:sz w:val="22"/>
+          <w:szCs w:val="22"/>
+        </w:rPr>
+        <w:t xml:space="preserve">The reliability of downstream fisheries is the result of the aggregate dynamics of these upstream stocks. </w:t>
+      </w:r>
+      <w:r>
+        <w:rPr>
+          <w:rFonts w:ascii="Garamond" w:hAnsi="Garamond"/>
+          <w:sz w:val="22"/>
+          <w:szCs w:val="22"/>
+        </w:rPr>
+        <w:t xml:space="preserve">Therefore, maintaining long-term harvest opportunities requires management strategies that preserve upstream stock diversity, </w:t>
+      </w:r>
+      <w:r>
+        <w:rPr>
+          <w:rStyle w:val="Strong"/>
+          <w:rFonts w:ascii="Garamond" w:hAnsi="Garamond"/>
+          <w:b w:val="0"/>
+          <w:bCs w:val="0"/>
+          <w:sz w:val="22"/>
+          <w:szCs w:val="22"/>
+        </w:rPr>
+        <w:t>particularly for the furthest upstream stocks that contribute disproportionately to downstream fisheries across the watershed while being especially vulnerable to over-fishing.</w:t>
       </w:r>
     </w:p>
     <w:p>
@@ -450,72 +644,120 @@
           <w:sz w:val="22"/>
           <w:szCs w:val="22"/>
         </w:rPr>
-        <w:t>Watersheds in Western Alaska s</w:t>
-      </w:r>
-      <w:r>
-        <w:rPr>
-          <w:rFonts w:ascii="Garamond" w:hAnsi="Garamond"/>
-          <w:sz w:val="22"/>
-          <w:szCs w:val="22"/>
-        </w:rPr>
-        <w:t>upport some of the largest salmon fisheries in the world</w:t>
-      </w:r>
-      <w:r>
-        <w:rPr>
-          <w:rFonts w:ascii="Garamond" w:hAnsi="Garamond"/>
-          <w:sz w:val="22"/>
-          <w:szCs w:val="22"/>
-        </w:rPr>
-        <w:t xml:space="preserve"> and contain some of the last pristine habitat for pacific salmon. However, these systems have </w:t>
-      </w:r>
-      <w:r>
-        <w:rPr>
-          <w:rFonts w:ascii="Garamond" w:hAnsi="Garamond"/>
-          <w:sz w:val="22"/>
-          <w:szCs w:val="22"/>
-        </w:rPr>
-        <w:t xml:space="preserve">seen a precipitous decline in </w:t>
-      </w:r>
-      <w:r>
-        <w:rPr>
-          <w:rFonts w:ascii="Garamond" w:hAnsi="Garamond"/>
-          <w:sz w:val="22"/>
-          <w:szCs w:val="22"/>
-        </w:rPr>
         <w:lastRenderedPageBreak/>
-        <w:t>Chinook and Chum salmon populations in recent years</w:t>
-      </w:r>
-      <w:r>
-        <w:rPr>
-          <w:rFonts w:ascii="Garamond" w:hAnsi="Garamond"/>
-          <w:sz w:val="22"/>
-          <w:szCs w:val="22"/>
-        </w:rPr>
-        <w:t>, leading to restricted</w:t>
-      </w:r>
-      <w:r>
-        <w:rPr>
-          <w:rFonts w:ascii="Garamond" w:hAnsi="Garamond"/>
-          <w:sz w:val="22"/>
-          <w:szCs w:val="22"/>
-        </w:rPr>
-        <w:t xml:space="preserve"> subsistence fishing </w:t>
-      </w:r>
-      <w:r>
-        <w:rPr>
-          <w:rFonts w:ascii="Garamond" w:hAnsi="Garamond"/>
-          <w:sz w:val="22"/>
-          <w:szCs w:val="22"/>
-        </w:rPr>
-        <w:t xml:space="preserve">for indigenous communities in the region and </w:t>
-      </w:r>
-      <w:r>
-        <w:rPr>
-          <w:rFonts w:ascii="Garamond" w:hAnsi="Garamond"/>
-          <w:sz w:val="22"/>
-          <w:szCs w:val="22"/>
-        </w:rPr>
-        <w:t>triggering a region-wide crisis of food insecurity, cultural loss, and the potential disappearance of a critical economic resource</w:t>
+        <w:t>Western Alaska</w:t>
+      </w:r>
+      <w:r>
+        <w:rPr>
+          <w:rFonts w:ascii="Garamond" w:hAnsi="Garamond"/>
+          <w:sz w:val="22"/>
+          <w:szCs w:val="22"/>
+        </w:rPr>
+        <w:t xml:space="preserve"> watersheds</w:t>
+      </w:r>
+      <w:r>
+        <w:rPr>
+          <w:rFonts w:ascii="Garamond" w:hAnsi="Garamond"/>
+          <w:sz w:val="22"/>
+          <w:szCs w:val="22"/>
+        </w:rPr>
+        <w:t xml:space="preserve"> s</w:t>
+      </w:r>
+      <w:r>
+        <w:rPr>
+          <w:rFonts w:ascii="Garamond" w:hAnsi="Garamond"/>
+          <w:sz w:val="22"/>
+          <w:szCs w:val="22"/>
+        </w:rPr>
+        <w:t xml:space="preserve">upport large salmon fisheries </w:t>
+      </w:r>
+      <w:r>
+        <w:rPr>
+          <w:rFonts w:ascii="Garamond" w:hAnsi="Garamond"/>
+          <w:sz w:val="22"/>
+          <w:szCs w:val="22"/>
+        </w:rPr>
+        <w:t xml:space="preserve">and contain some of the last pristine habitat for pacific salmon. </w:t>
+      </w:r>
+      <w:r>
+        <w:rPr>
+          <w:rFonts w:ascii="Garamond" w:hAnsi="Garamond"/>
+          <w:sz w:val="22"/>
+          <w:szCs w:val="22"/>
+        </w:rPr>
+        <w:t xml:space="preserve">In the </w:t>
+      </w:r>
+      <w:r>
+        <w:rPr>
+          <w:rFonts w:ascii="Garamond" w:hAnsi="Garamond"/>
+          <w:sz w:val="22"/>
+          <w:szCs w:val="22"/>
+        </w:rPr>
+        <w:t>Kuskokwim River</w:t>
+      </w:r>
+      <w:r>
+        <w:rPr>
+          <w:rFonts w:ascii="Garamond" w:hAnsi="Garamond"/>
+          <w:sz w:val="22"/>
+          <w:szCs w:val="22"/>
+        </w:rPr>
+        <w:t xml:space="preserve"> basin, a large</w:t>
+      </w:r>
+      <w:r>
+        <w:rPr>
+          <w:rFonts w:ascii="Garamond" w:hAnsi="Garamond"/>
+          <w:sz w:val="22"/>
+          <w:szCs w:val="22"/>
+        </w:rPr>
+        <w:t xml:space="preserve"> (127,000 km^2)</w:t>
+      </w:r>
+      <w:r>
+        <w:rPr>
+          <w:rFonts w:ascii="Garamond" w:hAnsi="Garamond"/>
+          <w:sz w:val="22"/>
+          <w:szCs w:val="22"/>
+        </w:rPr>
+        <w:t xml:space="preserve"> free flowing </w:t>
+      </w:r>
+      <w:r>
+        <w:rPr>
+          <w:rFonts w:ascii="Garamond" w:hAnsi="Garamond"/>
+          <w:sz w:val="22"/>
+          <w:szCs w:val="22"/>
+        </w:rPr>
+        <w:t>watershed</w:t>
+      </w:r>
+      <w:r>
+        <w:rPr>
+          <w:rFonts w:ascii="Garamond" w:hAnsi="Garamond"/>
+          <w:sz w:val="22"/>
+          <w:szCs w:val="22"/>
+        </w:rPr>
+        <w:t xml:space="preserve"> in Western Alaska, </w:t>
+      </w:r>
+      <w:r>
+        <w:rPr>
+          <w:rFonts w:ascii="Garamond" w:hAnsi="Garamond"/>
+          <w:sz w:val="22"/>
+          <w:szCs w:val="22"/>
+        </w:rPr>
+        <w:t>Chinook salmon populations support subsistence fishing opportunities for dozens of communities in the region</w:t>
+      </w:r>
+      <w:r>
+        <w:rPr>
+          <w:rFonts w:ascii="Garamond" w:hAnsi="Garamond"/>
+          <w:sz w:val="22"/>
+          <w:szCs w:val="22"/>
+        </w:rPr>
+        <w:t xml:space="preserve">. </w:t>
+      </w:r>
+      <w:r>
+        <w:rPr>
+          <w:rFonts w:ascii="Garamond" w:hAnsi="Garamond"/>
+          <w:sz w:val="22"/>
+          <w:szCs w:val="22"/>
+        </w:rPr>
+        <w:t>These communities are almost entirely rural and indigenous, relying on salmon for a significant portion of their protein needs</w:t>
       </w:r>
       <w:r>
         <w:rPr>
@@ -531,6 +773,146 @@
           <w:sz w:val="22"/>
           <w:szCs w:val="22"/>
         </w:rPr>
+        <w:t xml:space="preserve">(Clark et al., 2018; </w:t>
+      </w:r>
+      <w:proofErr w:type="spellStart"/>
+      <w:r>
+        <w:rPr>
+          <w:rFonts w:ascii="Garamond" w:hAnsi="Garamond"/>
+          <w:sz w:val="22"/>
+          <w:szCs w:val="22"/>
+        </w:rPr>
+        <w:t>Esquible</w:t>
+      </w:r>
+      <w:proofErr w:type="spellEnd"/>
+      <w:r>
+        <w:rPr>
+          <w:rFonts w:ascii="Garamond" w:hAnsi="Garamond"/>
+          <w:sz w:val="22"/>
+          <w:szCs w:val="22"/>
+        </w:rPr>
+        <w:t xml:space="preserve"> et al., 2024</w:t>
+      </w:r>
+      <w:r>
+        <w:rPr>
+          <w:rFonts w:ascii="Garamond" w:hAnsi="Garamond"/>
+          <w:sz w:val="22"/>
+          <w:szCs w:val="22"/>
+        </w:rPr>
+        <w:t>)</w:t>
+      </w:r>
+      <w:r>
+        <w:rPr>
+          <w:rFonts w:ascii="Garamond" w:hAnsi="Garamond"/>
+          <w:sz w:val="22"/>
+          <w:szCs w:val="22"/>
+        </w:rPr>
+        <w:t xml:space="preserve">. </w:t>
+      </w:r>
+      <w:r>
+        <w:rPr>
+          <w:rFonts w:ascii="Garamond" w:hAnsi="Garamond"/>
+          <w:sz w:val="22"/>
+          <w:szCs w:val="22"/>
+        </w:rPr>
+        <w:t>Subsistence fisheries for Chinook salmon are some of the largest in the state, and nearly every household in the watershed participates in the fishery in some way (</w:t>
+      </w:r>
+      <w:proofErr w:type="spellStart"/>
+      <w:r>
+        <w:rPr>
+          <w:rFonts w:ascii="Garamond" w:hAnsi="Garamond"/>
+          <w:sz w:val="22"/>
+          <w:szCs w:val="22"/>
+        </w:rPr>
+        <w:t>Esquible</w:t>
+      </w:r>
+      <w:proofErr w:type="spellEnd"/>
+      <w:r>
+        <w:rPr>
+          <w:rFonts w:ascii="Garamond" w:hAnsi="Garamond"/>
+          <w:sz w:val="22"/>
+          <w:szCs w:val="22"/>
+        </w:rPr>
+        <w:t xml:space="preserve"> et al., 2024). However, Chinook salmon populations in the Kuskokwim have declined precipitously in recent years, </w:t>
+      </w:r>
+      <w:r>
+        <w:rPr>
+          <w:rFonts w:ascii="Garamond" w:hAnsi="Garamond"/>
+          <w:sz w:val="22"/>
+          <w:szCs w:val="22"/>
+        </w:rPr>
+        <w:t xml:space="preserve">leading to </w:t>
+      </w:r>
+      <w:r>
+        <w:rPr>
+          <w:rFonts w:ascii="Garamond" w:hAnsi="Garamond"/>
+          <w:sz w:val="22"/>
+          <w:szCs w:val="22"/>
+        </w:rPr>
+        <w:t>subsistence fishing</w:t>
+      </w:r>
+      <w:r>
+        <w:rPr>
+          <w:rFonts w:ascii="Garamond" w:hAnsi="Garamond"/>
+          <w:sz w:val="22"/>
+          <w:szCs w:val="22"/>
+        </w:rPr>
+        <w:t xml:space="preserve"> restrictions</w:t>
+      </w:r>
+      <w:r>
+        <w:rPr>
+          <w:rFonts w:ascii="Garamond" w:hAnsi="Garamond"/>
+          <w:sz w:val="22"/>
+          <w:szCs w:val="22"/>
+        </w:rPr>
+        <w:t xml:space="preserve"> </w:t>
+      </w:r>
+      <w:r>
+        <w:rPr>
+          <w:rFonts w:ascii="Garamond" w:hAnsi="Garamond"/>
+          <w:sz w:val="22"/>
+          <w:szCs w:val="22"/>
+        </w:rPr>
+        <w:t xml:space="preserve">and </w:t>
+      </w:r>
+      <w:r>
+        <w:rPr>
+          <w:rFonts w:ascii="Garamond" w:hAnsi="Garamond"/>
+          <w:sz w:val="22"/>
+          <w:szCs w:val="22"/>
+        </w:rPr>
+        <w:t>triggering a crisis of food insecurity</w:t>
+      </w:r>
+      <w:r>
+        <w:rPr>
+          <w:rFonts w:ascii="Garamond" w:hAnsi="Garamond"/>
+          <w:sz w:val="22"/>
+          <w:szCs w:val="22"/>
+        </w:rPr>
+        <w:t xml:space="preserve"> and </w:t>
+      </w:r>
+      <w:r>
+        <w:rPr>
+          <w:rFonts w:ascii="Garamond" w:hAnsi="Garamond"/>
+          <w:sz w:val="22"/>
+          <w:szCs w:val="22"/>
+        </w:rPr>
+        <w:t>cultural loss</w:t>
+      </w:r>
+      <w:r>
+        <w:rPr>
+          <w:rFonts w:ascii="Garamond" w:hAnsi="Garamond"/>
+          <w:sz w:val="22"/>
+          <w:szCs w:val="22"/>
+        </w:rPr>
+        <w:t xml:space="preserve"> in the region </w:t>
+      </w:r>
+      <w:r>
+        <w:rPr>
+          <w:rFonts w:ascii="Garamond" w:hAnsi="Garamond"/>
+          <w:sz w:val="22"/>
+          <w:szCs w:val="22"/>
+        </w:rPr>
         <w:fldChar w:fldCharType="begin"/>
       </w:r>
       <w:r>
@@ -539,7 +921,7 @@
           <w:sz w:val="22"/>
           <w:szCs w:val="22"/>
         </w:rPr>
-        <w:instrText xml:space="preserve"> ADDIN ZOTERO_ITEM CSL_CITATION {"citationID":"pEObtCaz","properties":{"formattedCitation":"(Brown &amp; Godduhn, 2015)","plainCitation":"(Brown &amp; Godduhn, 2015)","noteIndex":0},"citationItems":[{"id":4428,"uris":["http://zotero.org/users/8421274/items/2WA8NCRM"],"itemData":{"id":4428,"type":"article-journal","language":"en","source":"Zotero","title":"Socioeconomic effects of declining salmon runs on the Yukon River","author":[{"family":"Brown","given":"Caroline L"},{"family":"Godduhn","given":"Anna"}],"issued":{"date-parts":[["2015"]]}}}],"schema":"https://github.com/citation-style-language/schema/raw/master/csl-citation.json"} </w:instrText>
+        <w:instrText xml:space="preserve"> ADDIN ZOTERO_ITEM CSL_CITATION {"citationID":"C4EZBjwd","properties":{"formattedCitation":"(Brown &amp; Godduhn, 2015; Lamborn et al., 2025; Ohlberger et al., 2018)","plainCitation":"(Brown &amp; Godduhn, 2015; Lamborn et al., 2025; Ohlberger et al., 2018)","noteIndex":0},"citationItems":[{"id":4428,"uris":["http://zotero.org/users/8421274/items/2WA8NCRM"],"itemData":{"id":4428,"type":"article-journal","language":"en","source":"Zotero","title":"Socioeconomic effects of declining salmon runs on the Yukon River","author":[{"family":"Brown","given":"Caroline L"},{"family":"Godduhn","given":"Anna"}],"issued":{"date-parts":[["2015"]]}}},{"id":5379,"uris":["http://zotero.org/users/8421274/items/6TRPLVW4"],"itemData":{"id":5379,"type":"article-journal","abstract":"Across Alaska, there have been synchronous declines in the abundance, mean age, and size of Chinook salmon (Oncorhynchus tshawytscha, Salmonidae), a species with immense social and ecological importance. The decline of Chinook salmon, and regulations addressing declines, have drastically impacted people who rely on Alaska's fisheries. Despite their importance, the drivers causing Chinook salmon declines are still not well understood. Therefore, to improve our understanding of the likely drivers of these large-scale synchronous declines, we synthesised the peer-reviewed Chinook salmon literature published between 2010 and 2024 using a weight-of-evidence approach. We identified 94 variables used to explain the trends in abundance and demographics of Chinook salmon. Each variable's association with trends in Chinook salmon was individually assessed and integrated using a standardised method. Results of this synthesis suggest the drivers for large-scale synchronous declines have occurred in the North Pacific Ocean. Specifically, we found marine predation, size selective harvest, and pink salmon (Oncorhynchus gorbuscha) abundance are the factors most strongly associated with reduced size and age. Results also suggest ocean productivity–specifically winter sea surface temperature and the North Pacific Gyre Oscillation–are the most frequently identified predictors of regional Chinook salmon abundance. In addition to addressing freshwater factors like adult heat stress and juvenile predation, we suggest research, policy, and management focus on how to better understand and address the interactions between ocean productivity, marine predation, size selective harvest, and pink salmon abundance to improve the condition of Chinook salmon, and the people and ecosystems benefiting from them.","container-title":"Fish and Fisheries","DOI":"10.1111/faf.12895","ISSN":"1467-2979","issue":"n/a","language":"en","license":"© 2025 The Author(s). Fish and Fisheries published by John Wiley &amp; Sons Ltd.","note":"_eprint: https://onlinelibrary.wiley.com/doi/pdf/10.1111/faf.12895","source":"Wiley Online Library","title":"A Synthesis of Factors Related to Trends in Abundance and Demography of Alaska Chinook Salmon (Oncorhynchus tshawytscha, Salmonidae): Implications for Research, Management, and Policy","title-short":"A Synthesis of Factors Related to Trends in Abundance and Demography of Alaska Chinook Salmon (Oncorhynchus tshawytscha, Salmonidae)","URL":"https://onlinelibrary.wiley.com/doi/abs/10.1111/faf.12895","volume":"n/a","author":[{"family":"Lamborn","given":"Chase C."},{"family":"Ohlberger","given":"Jan"},{"family":"Walsworth","given":"Timothy E."},{"family":"Westley","given":"Peter A. H."},{"family":"Cunningham","given":"Curry J."},{"family":"Wynsma","given":"Sam"},{"family":"Smith","given":"Jordan W."}],"accessed":{"date-parts":[["2025",6,4]]},"issued":{"date-parts":[["2025"]]}}},{"id":4421,"uris":["http://zotero.org/users/8421274/items/PUA9GF7A"],"itemData":{"id":4421,"type":"article-journal","abstract":"The demographic structure of populations is affected by life history strategies and how these interact with natural and anthropogenic factors such as exploitation, climate change, and biotic interactions. Previous work suggests that the mean size and age of some North American populations of Chinook salmon (Oncorhynchus tshawytscha, Salmonidae) are declining. These trends are of concern because Chinook salmon are highly valued commercially for their exceptional size and because the loss of the largest and oldest individuals may lead to reduced population productivity. Using long-term data from wild and hatchery populations, we quantified changes in the demographic structure of Chinook salmon populations over the past four decades across the Northeast Pacific Ocean, from California through western Alaska. Our results show that wild and hatchery fish are becoming smaller and younger throughout most of the Pacific coast. Proportions of older age classes have decreased over time in most regions. Simultaneously, the length-at-age of older fish has declined while the length-at-age of younger fish has typically increased. However, negative size trends of older ages were weak or non-existent at the southern end of the range. While it remains to be explored whether these trends are caused by changes in climate, fishing practices or species interactions such as predation, our qualitative review of the potential causes of demographic change suggests that selective removal of large fish has likely contributed to the apparent widespread declines in average body sizes.","container-title":"Fish and Fisheries","DOI":"10.1111/faf.12272","ISSN":"1467-2979","issue":"3","language":"en","license":"© 2018 The Authors. Fish and Fisheries published by John Wiley &amp; Sons Ltd.","note":"_eprint: https://onlinelibrary.wiley.com/doi/pdf/10.1111/faf.12272","page":"533-546","source":"Wiley Online Library","title":"Demographic changes in Chinook salmon across the Northeast Pacific Ocean","volume":"19","author":[{"family":"Ohlberger","given":"Jan"},{"family":"Ward","given":"Eric J"},{"family":"Schindler","given":"Daniel E"},{"family":"Lewis","given":"Bert"}],"issued":{"date-parts":[["2018"]]}}}],"schema":"https://github.com/citation-style-language/schema/raw/master/csl-citation.json"} </w:instrText>
       </w:r>
       <w:r>
         <w:rPr>
@@ -556,7 +938,7 @@
           <w:sz w:val="22"/>
           <w:szCs w:val="22"/>
         </w:rPr>
-        <w:t>(Brown &amp; Godduhn, 2015)</w:t>
+        <w:t>(Brown &amp; Godduhn, 2015; Lamborn et al., 2025; Ohlberger et al., 2018)</w:t>
       </w:r>
       <w:r>
         <w:rPr>
@@ -588,111 +970,43 @@
           <w:sz w:val="22"/>
           <w:szCs w:val="22"/>
         </w:rPr>
-        <w:t>As a result, resource managers</w:t>
-      </w:r>
-      <w:r>
-        <w:rPr>
-          <w:rFonts w:ascii="Garamond" w:hAnsi="Garamond"/>
-          <w:sz w:val="22"/>
-          <w:szCs w:val="22"/>
-        </w:rPr>
-        <w:t xml:space="preserve"> in Western Alaska</w:t>
-      </w:r>
-      <w:r>
-        <w:rPr>
-          <w:rFonts w:ascii="Garamond" w:hAnsi="Garamond"/>
-          <w:sz w:val="22"/>
-          <w:szCs w:val="22"/>
-        </w:rPr>
-        <w:t xml:space="preserve"> face the difficult task of designing management strategies </w:t>
-      </w:r>
-      <w:r>
-        <w:rPr>
-          <w:rFonts w:ascii="Garamond" w:hAnsi="Garamond"/>
-          <w:sz w:val="22"/>
-          <w:szCs w:val="22"/>
-        </w:rPr>
-        <w:t>that</w:t>
-      </w:r>
-      <w:r>
-        <w:rPr>
-          <w:rFonts w:ascii="Garamond" w:hAnsi="Garamond"/>
-          <w:sz w:val="22"/>
-          <w:szCs w:val="22"/>
-        </w:rPr>
-        <w:t xml:space="preserve"> balanc</w:t>
-      </w:r>
-      <w:r>
-        <w:rPr>
-          <w:rFonts w:ascii="Garamond" w:hAnsi="Garamond"/>
-          <w:sz w:val="22"/>
-          <w:szCs w:val="22"/>
-        </w:rPr>
-        <w:t>e</w:t>
-      </w:r>
-      <w:r>
-        <w:rPr>
-          <w:rFonts w:ascii="Garamond" w:hAnsi="Garamond"/>
-          <w:sz w:val="22"/>
-          <w:szCs w:val="22"/>
-        </w:rPr>
-        <w:t xml:space="preserve"> ongoing </w:t>
-      </w:r>
-      <w:r>
-        <w:rPr>
-          <w:rFonts w:ascii="Garamond" w:hAnsi="Garamond"/>
-          <w:sz w:val="22"/>
-          <w:szCs w:val="22"/>
-        </w:rPr>
-        <w:t xml:space="preserve">commercial and subsistence </w:t>
-      </w:r>
-      <w:r>
-        <w:rPr>
-          <w:rFonts w:ascii="Garamond" w:hAnsi="Garamond"/>
-          <w:sz w:val="22"/>
-          <w:szCs w:val="22"/>
-        </w:rPr>
-        <w:t xml:space="preserve">harvest opportunities </w:t>
-      </w:r>
-      <w:r>
-        <w:rPr>
-          <w:rFonts w:ascii="Garamond" w:hAnsi="Garamond"/>
-          <w:sz w:val="22"/>
-          <w:szCs w:val="22"/>
-        </w:rPr>
-        <w:t xml:space="preserve">throughout the region </w:t>
-      </w:r>
-      <w:r>
-        <w:rPr>
-          <w:rFonts w:ascii="Garamond" w:hAnsi="Garamond"/>
-          <w:sz w:val="22"/>
-          <w:szCs w:val="22"/>
-        </w:rPr>
-        <w:t xml:space="preserve">with the urgent need to rebuild salmon populations and strengthen their resilience to future perturbations. </w:t>
-      </w:r>
-      <w:r>
-        <w:rPr>
-          <w:rFonts w:ascii="Garamond" w:hAnsi="Garamond"/>
-          <w:sz w:val="22"/>
-          <w:szCs w:val="22"/>
-        </w:rPr>
-        <w:t>Designing these strategies relies on understanding the spatiotemporal dynamics of salmon returns to the system; however, there remains a relatively coarse and incomplete understanding of these dynamics given the spatial scale and remote nature of the region.</w:t>
-      </w:r>
-      <w:r>
-        <w:rPr>
-          <w:rFonts w:ascii="Garamond" w:hAnsi="Garamond"/>
-          <w:sz w:val="22"/>
-          <w:szCs w:val="22"/>
-        </w:rPr>
-        <w:t xml:space="preserve"> </w:t>
-      </w:r>
-      <w:r>
-        <w:rPr>
-          <w:rFonts w:ascii="Garamond" w:hAnsi="Garamond"/>
-          <w:sz w:val="22"/>
-          <w:szCs w:val="22"/>
-        </w:rPr>
-        <w:t>Consequently, management strategies have been designed based on this coarse understanding of stock-specific patterns, and their effects on individual stock health have not been adequately assessed.</w:t>
+        <w:t xml:space="preserve">As a result, resource managers are faced with the difficult task of designing management strategies that allow for harvest opportunities while rebuilding stocks and </w:t>
+      </w:r>
+      <w:proofErr w:type="spellStart"/>
+      <w:r>
+        <w:rPr>
+          <w:rFonts w:ascii="Garamond" w:hAnsi="Garamond"/>
+          <w:sz w:val="22"/>
+          <w:szCs w:val="22"/>
+        </w:rPr>
+        <w:t>enchancing</w:t>
+      </w:r>
+      <w:proofErr w:type="spellEnd"/>
+      <w:r>
+        <w:rPr>
+          <w:rFonts w:ascii="Garamond" w:hAnsi="Garamond"/>
+          <w:sz w:val="22"/>
+          <w:szCs w:val="22"/>
+        </w:rPr>
+        <w:t xml:space="preserve"> ecosystem </w:t>
+      </w:r>
+      <w:proofErr w:type="spellStart"/>
+      <w:r>
+        <w:rPr>
+          <w:rFonts w:ascii="Garamond" w:hAnsi="Garamond"/>
+          <w:sz w:val="22"/>
+          <w:szCs w:val="22"/>
+        </w:rPr>
+        <w:t>resilliance</w:t>
+      </w:r>
+      <w:proofErr w:type="spellEnd"/>
+      <w:r>
+        <w:rPr>
+          <w:rFonts w:ascii="Garamond" w:hAnsi="Garamond"/>
+          <w:sz w:val="22"/>
+          <w:szCs w:val="22"/>
+        </w:rPr>
+        <w:t xml:space="preserve"> to future environmental change.</w:t>
       </w:r>
     </w:p>
     <w:p>
@@ -711,110 +1025,6 @@
           <w:sz w:val="22"/>
           <w:szCs w:val="22"/>
         </w:rPr>
-        <w:t>The Kuskokwim River</w:t>
-      </w:r>
-      <w:r>
-        <w:rPr>
-          <w:rFonts w:ascii="Garamond" w:hAnsi="Garamond"/>
-          <w:sz w:val="22"/>
-          <w:szCs w:val="22"/>
-        </w:rPr>
-        <w:t xml:space="preserve">-Basin is a large, free-flowing system covering greater than 120,000 </w:t>
-      </w:r>
-      <w:r>
-        <w:rPr>
-          <w:rFonts w:ascii="Garamond" w:hAnsi="Garamond"/>
-          <w:sz w:val="22"/>
-          <w:szCs w:val="22"/>
-        </w:rPr>
-        <w:t>km²</w:t>
-      </w:r>
-      <w:r>
-        <w:rPr>
-          <w:rFonts w:ascii="Garamond" w:hAnsi="Garamond"/>
-          <w:sz w:val="22"/>
-          <w:szCs w:val="22"/>
-        </w:rPr>
-        <w:t xml:space="preserve"> in western Alaska. This system contains all five species of pacific salmon, which serve as an important subsistence resource and cultural keystone for indigenous communities in the watershed </w:t>
-      </w:r>
-      <w:r>
-        <w:rPr>
-          <w:rFonts w:ascii="Garamond" w:hAnsi="Garamond"/>
-          <w:sz w:val="22"/>
-          <w:szCs w:val="22"/>
-        </w:rPr>
-        <w:t>(Esquible et al., 2018).</w:t>
-      </w:r>
-      <w:r>
-        <w:rPr>
-          <w:rFonts w:ascii="Garamond" w:hAnsi="Garamond"/>
-          <w:sz w:val="22"/>
-          <w:szCs w:val="22"/>
-        </w:rPr>
-        <w:t xml:space="preserve"> In particular, Chinook and Chum salmon in the Kuskokwim are a critical subsistence resource for nearly every household in the basin, which are almost entirely rural and indigenous communities</w:t>
-      </w:r>
-      <w:r>
-        <w:rPr>
-          <w:rFonts w:ascii="Garamond" w:hAnsi="Garamond"/>
-          <w:sz w:val="22"/>
-          <w:szCs w:val="22"/>
-        </w:rPr>
-        <w:t xml:space="preserve"> that</w:t>
-      </w:r>
-      <w:r>
-        <w:rPr>
-          <w:rFonts w:ascii="Garamond" w:hAnsi="Garamond"/>
-          <w:sz w:val="22"/>
-          <w:szCs w:val="22"/>
-        </w:rPr>
-        <w:t xml:space="preserve"> rely on this subsistence resource for a significant portion of their protein needs </w:t>
-      </w:r>
-      <w:r>
-        <w:rPr>
-          <w:rFonts w:ascii="Garamond" w:hAnsi="Garamond"/>
-          <w:sz w:val="22"/>
-          <w:szCs w:val="22"/>
-        </w:rPr>
-        <w:t>(Clark et al., 2018; Esquible et al., 2024</w:t>
-      </w:r>
-      <w:r>
-        <w:rPr>
-          <w:rFonts w:ascii="Garamond" w:hAnsi="Garamond"/>
-          <w:sz w:val="22"/>
-          <w:szCs w:val="22"/>
-        </w:rPr>
-        <w:t xml:space="preserve">). Resource managers in the Kuskokwim river-basin have implemented a front-end block closure for Chinook salmon based on preliminary data that the earliest returning fish at the beginning of the season </w:t>
-      </w:r>
-      <w:r>
-        <w:rPr>
-          <w:rFonts w:ascii="Garamond" w:hAnsi="Garamond"/>
-          <w:sz w:val="22"/>
-          <w:szCs w:val="22"/>
-        </w:rPr>
-        <w:t xml:space="preserve">return </w:t>
-      </w:r>
-      <w:r>
-        <w:rPr>
-          <w:rFonts w:ascii="Garamond" w:hAnsi="Garamond"/>
-          <w:sz w:val="22"/>
-          <w:szCs w:val="22"/>
-        </w:rPr>
-        <w:t xml:space="preserve">to stocks at the upper reaches of the watershed. </w:t>
-      </w:r>
-      <w:r>
-        <w:rPr>
-          <w:rFonts w:ascii="Garamond" w:hAnsi="Garamond"/>
-          <w:sz w:val="22"/>
-          <w:szCs w:val="22"/>
-        </w:rPr>
-        <w:t>Given their early return timing, these stocks are particularly vulnerable to overfishing, which may compromise both upstream subsistence harvest and downstream fishery stability.</w:t>
-      </w:r>
-      <w:r>
-        <w:rPr>
-          <w:rFonts w:ascii="Garamond" w:hAnsi="Garamond"/>
-          <w:sz w:val="22"/>
-          <w:szCs w:val="22"/>
-        </w:rPr>
         <w:t xml:space="preserve"> </w:t>
       </w:r>
       <w:r>
@@ -823,7 +1033,64 @@
           <w:sz w:val="22"/>
           <w:szCs w:val="22"/>
         </w:rPr>
-        <w:t>Because the spatiotemporal patterns of stock contribution within and among years are not well understood at fine spatial scales, the effectiveness of front-end closures in protecting upper Kuskokwim stocks remains unclear. However, understanding these patterns is critical for assessing current management strategies and designing new approaches that balance regional harvest opportunities with stock-specific conservation needs.</w:t>
+        <w:t xml:space="preserve">Resource managers in the Kuskokwim river-basin have implemented a front-end closure for Chinook salmon </w:t>
+      </w:r>
+      <w:r>
+        <w:rPr>
+          <w:rFonts w:ascii="Garamond" w:hAnsi="Garamond"/>
+          <w:sz w:val="22"/>
+          <w:szCs w:val="22"/>
+        </w:rPr>
+        <w:t xml:space="preserve">that heavily restricts fishing during the beginning of the salmon migration season to protect early returning fish </w:t>
+      </w:r>
+      <w:r>
+        <w:rPr>
+          <w:rFonts w:ascii="Garamond" w:hAnsi="Garamond"/>
+          <w:sz w:val="22"/>
+          <w:szCs w:val="22"/>
+        </w:rPr>
+        <w:fldChar w:fldCharType="begin"/>
+      </w:r>
+      <w:r>
+        <w:rPr>
+          <w:rFonts w:ascii="Garamond" w:hAnsi="Garamond"/>
+          <w:sz w:val="22"/>
+          <w:szCs w:val="22"/>
+        </w:rPr>
+        <w:instrText xml:space="preserve"> ADDIN ZOTERO_ITEM CSL_CITATION {"citationID":"A32imaA8","properties":{"formattedCitation":"(Bechtol et al., 2025)","plainCitation":"(Bechtol et al., 2025)","noteIndex":0},"citationItems":[{"id":5396,"uris":["http://zotero.org/users/8421274/items/5K4UUKKW"],"itemData":{"id":5396,"type":"report","language":"en","publisher":"Kuskokwim River Inter-Tribal Fish Commission, Bethel","source":"Zotero","title":"Inseason Harvest and Effort Estimates for the 2024 Kuskokwim River Subsistence Salmon Fisheries During Block Openings","author":[{"family":"Bechtol","given":"William R"},{"family":"Vicente","given":"Terese"},{"family":"Leon","given":"Justin"},{"family":"Hoffman","given":"Avery"},{"family":"Moses","given":"Aaron"},{"family":"Hooper","given":"Delen"}],"issued":{"date-parts":[["2025"]]}}}],"schema":"https://github.com/citation-style-language/schema/raw/master/csl-citation.json"} </w:instrText>
+      </w:r>
+      <w:r>
+        <w:rPr>
+          <w:rFonts w:ascii="Garamond" w:hAnsi="Garamond"/>
+          <w:sz w:val="22"/>
+          <w:szCs w:val="22"/>
+        </w:rPr>
+        <w:fldChar w:fldCharType="separate"/>
+      </w:r>
+      <w:r>
+        <w:rPr>
+          <w:rFonts w:ascii="Garamond" w:hAnsi="Garamond"/>
+          <w:noProof/>
+          <w:sz w:val="22"/>
+          <w:szCs w:val="22"/>
+        </w:rPr>
+        <w:t>(e.g. Bechtol et al., 2025)</w:t>
+      </w:r>
+      <w:r>
+        <w:rPr>
+          <w:rFonts w:ascii="Garamond" w:hAnsi="Garamond"/>
+          <w:sz w:val="22"/>
+          <w:szCs w:val="22"/>
+        </w:rPr>
+        <w:fldChar w:fldCharType="end"/>
+      </w:r>
+      <w:r>
+        <w:rPr>
+          <w:rFonts w:ascii="Garamond" w:hAnsi="Garamond"/>
+          <w:sz w:val="22"/>
+          <w:szCs w:val="22"/>
+        </w:rPr>
+        <w:t>.</w:t>
       </w:r>
       <w:r>
         <w:rPr>
@@ -833,25 +1100,163 @@
         </w:rPr>
         <w:t xml:space="preserve"> </w:t>
       </w:r>
-    </w:p>
-    <w:p>
-      <w:pPr>
-        <w:spacing w:line="480" w:lineRule="auto"/>
-        <w:ind w:firstLine="720"/>
-        <w:rPr>
-          <w:rFonts w:ascii="Garamond" w:hAnsi="Garamond"/>
-          <w:sz w:val="22"/>
-          <w:szCs w:val="22"/>
-        </w:rPr>
-      </w:pPr>
-      <w:r>
-        <w:rPr>
-          <w:rFonts w:ascii="Garamond" w:hAnsi="Garamond"/>
-          <w:sz w:val="22"/>
-          <w:szCs w:val="22"/>
-        </w:rPr>
-        <w:lastRenderedPageBreak/>
-        <w:t>Here, we apply otolit</w:t>
+      <w:r>
+        <w:rPr>
+          <w:rFonts w:ascii="Garamond" w:hAnsi="Garamond"/>
+          <w:sz w:val="22"/>
+          <w:szCs w:val="22"/>
+        </w:rPr>
+        <w:t>This strategy aims to</w:t>
+      </w:r>
+      <w:r>
+        <w:rPr>
+          <w:rFonts w:ascii="Garamond" w:hAnsi="Garamond"/>
+          <w:sz w:val="22"/>
+          <w:szCs w:val="22"/>
+        </w:rPr>
+        <w:t xml:space="preserve"> support</w:t>
+      </w:r>
+      <w:r>
+        <w:rPr>
+          <w:rFonts w:ascii="Garamond" w:hAnsi="Garamond"/>
+          <w:sz w:val="22"/>
+          <w:szCs w:val="22"/>
+        </w:rPr>
+        <w:t xml:space="preserve"> </w:t>
+      </w:r>
+      <w:r>
+        <w:rPr>
+          <w:rFonts w:ascii="Garamond" w:hAnsi="Garamond"/>
+          <w:sz w:val="22"/>
+          <w:szCs w:val="22"/>
+        </w:rPr>
+        <w:t>basin-wide escapement goals</w:t>
+      </w:r>
+      <w:r>
+        <w:rPr>
+          <w:rFonts w:ascii="Garamond" w:hAnsi="Garamond"/>
+          <w:sz w:val="22"/>
+          <w:szCs w:val="22"/>
+        </w:rPr>
+        <w:t xml:space="preserve"> while allowing for a significant number of fish to return to stocks in the upper portions of the river basin, thereby protecting access to harvest opportunities for upstream communities and bolstering the health of upstream stocks</w:t>
+      </w:r>
+      <w:r>
+        <w:rPr>
+          <w:rFonts w:ascii="Garamond" w:hAnsi="Garamond"/>
+          <w:sz w:val="22"/>
+          <w:szCs w:val="22"/>
+        </w:rPr>
+        <w:t xml:space="preserve">. </w:t>
+      </w:r>
+      <w:r>
+        <w:rPr>
+          <w:rFonts w:ascii="Garamond" w:hAnsi="Garamond"/>
+          <w:sz w:val="22"/>
+          <w:szCs w:val="22"/>
+        </w:rPr>
+        <w:t xml:space="preserve">Early migrating fish tend to return to the furthest upstream stocks, a pattern established in other systems (Clark et al., 2015) and supported by limited telemetry data in the Kuskokwim ([citations needed]). </w:t>
+      </w:r>
+      <w:r>
+        <w:rPr>
+          <w:rFonts w:ascii="Garamond" w:hAnsi="Garamond"/>
+          <w:sz w:val="22"/>
+          <w:szCs w:val="22"/>
+        </w:rPr>
+        <w:t xml:space="preserve">However, it is unclear whether this pattern is </w:t>
+      </w:r>
+      <w:r>
+        <w:rPr>
+          <w:rStyle w:val="Strong"/>
+          <w:rFonts w:ascii="Garamond" w:hAnsi="Garamond"/>
+          <w:b w:val="0"/>
+          <w:bCs w:val="0"/>
+          <w:sz w:val="22"/>
+          <w:szCs w:val="22"/>
+        </w:rPr>
+        <w:t>consistent</w:t>
+      </w:r>
+      <w:r>
+        <w:rPr>
+          <w:rFonts w:ascii="Garamond" w:hAnsi="Garamond"/>
+          <w:sz w:val="22"/>
+          <w:szCs w:val="22"/>
+        </w:rPr>
+        <w:t xml:space="preserve"> over several years, whether there is a geographic organization to run timing, </w:t>
+      </w:r>
+      <w:r>
+        <w:rPr>
+          <w:rStyle w:val="Strong"/>
+          <w:rFonts w:ascii="Garamond" w:hAnsi="Garamond"/>
+          <w:b w:val="0"/>
+          <w:bCs w:val="0"/>
+          <w:sz w:val="22"/>
+          <w:szCs w:val="22"/>
+        </w:rPr>
+        <w:t>and whether</w:t>
+      </w:r>
+      <w:r>
+        <w:rPr>
+          <w:rFonts w:ascii="Garamond" w:hAnsi="Garamond"/>
+          <w:sz w:val="22"/>
+          <w:szCs w:val="22"/>
+        </w:rPr>
+        <w:t xml:space="preserve"> the interaction </w:t>
+      </w:r>
+      <w:r>
+        <w:rPr>
+          <w:rStyle w:val="Strong"/>
+          <w:rFonts w:ascii="Garamond" w:hAnsi="Garamond"/>
+          <w:b w:val="0"/>
+          <w:bCs w:val="0"/>
+          <w:sz w:val="22"/>
+          <w:szCs w:val="22"/>
+        </w:rPr>
+        <w:t>between</w:t>
+      </w:r>
+      <w:r>
+        <w:rPr>
+          <w:rFonts w:ascii="Garamond" w:hAnsi="Garamond"/>
+          <w:sz w:val="22"/>
+          <w:szCs w:val="22"/>
+        </w:rPr>
+        <w:t xml:space="preserve"> these patterns and the front-end closure protects upstream stocks as </w:t>
+      </w:r>
+      <w:r>
+        <w:rPr>
+          <w:rStyle w:val="Strong"/>
+          <w:rFonts w:ascii="Garamond" w:hAnsi="Garamond"/>
+          <w:b w:val="0"/>
+          <w:bCs w:val="0"/>
+          <w:sz w:val="22"/>
+          <w:szCs w:val="22"/>
+        </w:rPr>
+        <w:t>intended</w:t>
+      </w:r>
+      <w:r>
+        <w:rPr>
+          <w:rFonts w:ascii="Garamond" w:hAnsi="Garamond"/>
+          <w:b/>
+          <w:bCs/>
+          <w:sz w:val="22"/>
+          <w:szCs w:val="22"/>
+        </w:rPr>
+        <w:t>.</w:t>
+      </w:r>
+      <w:r>
+        <w:rPr>
+          <w:rFonts w:ascii="Garamond" w:hAnsi="Garamond"/>
+          <w:sz w:val="22"/>
+          <w:szCs w:val="22"/>
+        </w:rPr>
+        <w:t xml:space="preserve"> H</w:t>
+      </w:r>
+      <w:r>
+        <w:rPr>
+          <w:rFonts w:ascii="Garamond" w:hAnsi="Garamond"/>
+          <w:sz w:val="22"/>
+          <w:szCs w:val="22"/>
+        </w:rPr>
+        <w:t>ere, we apply otolit</w:t>
       </w:r>
       <w:r>
         <w:rPr>
@@ -1117,7 +1522,29 @@
           <w:szCs w:val="22"/>
           <w14:ligatures w14:val="none"/>
         </w:rPr>
-        <w:t xml:space="preserve"> the intern program of the Orutsaramiut Native Council </w:t>
+        <w:t xml:space="preserve"> the intern program of the </w:t>
+      </w:r>
+      <w:proofErr w:type="spellStart"/>
+      <w:r>
+        <w:rPr>
+          <w:rFonts w:ascii="Garamond" w:eastAsia="Times New Roman" w:hAnsi="Garamond" w:cs="Times New Roman"/>
+          <w:kern w:val="0"/>
+          <w:sz w:val="22"/>
+          <w:szCs w:val="22"/>
+          <w14:ligatures w14:val="none"/>
+        </w:rPr>
+        <w:t>Orutsaramiut</w:t>
+      </w:r>
+      <w:proofErr w:type="spellEnd"/>
+      <w:r>
+        <w:rPr>
+          <w:rFonts w:ascii="Garamond" w:eastAsia="Times New Roman" w:hAnsi="Garamond" w:cs="Times New Roman"/>
+          <w:kern w:val="0"/>
+          <w:sz w:val="22"/>
+          <w:szCs w:val="22"/>
+          <w14:ligatures w14:val="none"/>
+        </w:rPr>
+        <w:t xml:space="preserve"> Native Council </w:t>
       </w:r>
       <w:r>
         <w:rPr>
@@ -1335,7 +1762,29 @@
           <w:szCs w:val="22"/>
           <w14:ligatures w14:val="none"/>
         </w:rPr>
-        <w:t xml:space="preserve">low speed diamond blade isomet </w:t>
+        <w:t xml:space="preserve">low speed diamond blade </w:t>
+      </w:r>
+      <w:proofErr w:type="spellStart"/>
+      <w:r>
+        <w:rPr>
+          <w:rFonts w:ascii="Garamond" w:eastAsia="Times New Roman" w:hAnsi="Garamond" w:cs="Times New Roman"/>
+          <w:kern w:val="0"/>
+          <w:sz w:val="22"/>
+          <w:szCs w:val="22"/>
+          <w14:ligatures w14:val="none"/>
+        </w:rPr>
+        <w:t>isomet</w:t>
+      </w:r>
+      <w:proofErr w:type="spellEnd"/>
+      <w:r>
+        <w:rPr>
+          <w:rFonts w:ascii="Garamond" w:eastAsia="Times New Roman" w:hAnsi="Garamond" w:cs="Times New Roman"/>
+          <w:kern w:val="0"/>
+          <w:sz w:val="22"/>
+          <w:szCs w:val="22"/>
+          <w14:ligatures w14:val="none"/>
+        </w:rPr>
+        <w:t xml:space="preserve"> </w:t>
       </w:r>
       <w:r>
         <w:rPr>
@@ -1482,7 +1931,7 @@
           <w:sz w:val="22"/>
           <w:szCs w:val="22"/>
         </w:rPr>
-        <w:instrText xml:space="preserve"> ADDIN ZOTERO_ITEM CSL_CITATION {"citationID":"nvLrB1dQ","properties":{"formattedCitation":"(Brennan et al., 2015; Zimmerman &amp; Reeves, 2002)","plainCitation":"(Brennan et al., 2015; Zimmerman &amp; Reeves, 2002)","dontUpdate":true,"noteIndex":0},"citationItems":[{"id":"h4h2qxOD/ChWvHkvk","uris":["http://zotero.org/users/8421274/items/IY3FLHLM"],"itemData":{"id":915,"type":"article-journal","abstract":"Strontium isotopes simultaneously delineate fine-scale natal habitats and migrations of Pacific salmon harvested during a coastal commercial fishery., Highly migratory organisms present major challenges to conservation efforts. This is especially true for exploited anadromous fish species, which exhibit long-range dispersals from natal sites, complex population structures, and extensive mixing of distinct populations during exploitation. By tracing the migratory histories of individual Chinook salmon caught in fisheries using strontium isotopes, we determined the relative production of natal habitats at fine spatial scales and different life histories. Although strontium isotopes have been widely used in provenance research, we present a new robust framework to simultaneously assess natal sources and migrations of individuals within fishery harvests through time. Our results pave the way for investigating how fine-scale habitat production and life histories of salmon respond to perturbations—providing crucial insights for conservation.","container-title":"Science Advances","DOI":"10.1126/sciadv.1400124","ISSN":"2375-2548","issue":"4","journalAbbreviation":"Sci Adv","note":"PMID: 26601173\nPMCID: PMC4640640","page":"e1400124","source":"PubMed Central","title":"Strontium isotopes delineate fine-scale natal origins and migration histories of Pacific salmon","volume":"1","author":[{"family":"Brennan","given":"Sean R."},{"family":"Zimmerman","given":"Christian E."},{"family":"Fernandez","given":"Diego P."},{"family":"Cerling","given":"Thure E."},{"family":"McPhee","given":"Megan V."},{"family":"Wooller","given":"Matthew J."}],"issued":{"date-parts":[["2015",5,15]]}}},{"id":4132,"uris":["http://zotero.org/users/8421274/items/5YINANGC"],"itemData":{"id":4132,"type":"article-journal","abstract":"Comparisons of strontium:calcium (Sr: Ca) ratios in otolith primordia and freshwater growth regions were used to identify the progeny of steelhead Oncorhynchus mykiss (anadromous rainbow trout) and resident rainbow trout in the Deschutes River, Oregon. We cultured progeny of known adult steelhead and resident rainbow trout to confirm the relationship between Sr:Ca ratios in otolith primordia and the life history of the maternal parent. The mean (±SD) Sr:Ca ratio was significantly higher in the otolith primordia of the progeny of steelhead (0.001461 ± 0.00029; n = 100) than in those of the progeny of resident rainbow trout (0.000829 ± 0.000012; n = 100). We used comparisons of Sr:Ca ratios in the primordia and first-summer growth regions of otoliths to determine the maternal origin of unknown O. mykiss juveniles (n = 272) collected from rearing habitats within the main-stem Deschutes River and tributary rearing habitats and thus to ascertain the relative proportion of each life history morph in each rearing habitat. Resident rainbow trout fry dominated the bimonthly samples collected from main-stem rearing habitats between May and November 1995. Steelhead fry dominated samples collected from below waterfalls on two tributaries in 1996 and 1998.","container-title":"Transactions of the American Fisheries Society","DOI":"10.1577/1548-8659(2002)131&lt;0986:IOSARR&gt;2.0.CO;2","ISSN":"0002-8487","issue":"5","note":"publisher: Taylor &amp; Francis\n_eprint: https://doi.org/10.1577/1548-8659(2002)131&lt;0986:IOSARR&gt;2.0.CO;2","page":"986-993","source":"Taylor and Francis+NEJM","title":"Identification of Steelhead and Resident Rainbow Trout Progeny in the Deschutes River, Oregon, Revealed with Otolith Microchemistry","volume":"131","author":[{"family":"Zimmerman","given":"Christian E."},{"family":"Reeves","given":"Gordon H."}],"issued":{"date-parts":[["2002",9,1]]}}}],"schema":"https://github.com/citation-style-language/schema/raw/master/csl-citation.json"} </w:instrText>
+        <w:instrText xml:space="preserve"> ADDIN ZOTERO_ITEM CSL_CITATION {"citationID":"nvLrB1dQ","properties":{"formattedCitation":"(Brennan et al., 2015; Zimmerman &amp; Reeves, 2002)","plainCitation":"(Brennan et al., 2015; Zimmerman &amp; Reeves, 2002)","dontUpdate":true,"noteIndex":0},"citationItems":[{"id":"TQue60dm/OuVLOkfY","uris":["http://zotero.org/users/8421274/items/IY3FLHLM"],"itemData":{"id":915,"type":"article-journal","abstract":"Strontium isotopes simultaneously delineate fine-scale natal habitats and migrations of Pacific salmon harvested during a coastal commercial fishery., Highly migratory organisms present major challenges to conservation efforts. This is especially true for exploited anadromous fish species, which exhibit long-range dispersals from natal sites, complex population structures, and extensive mixing of distinct populations during exploitation. By tracing the migratory histories of individual Chinook salmon caught in fisheries using strontium isotopes, we determined the relative production of natal habitats at fine spatial scales and different life histories. Although strontium isotopes have been widely used in provenance research, we present a new robust framework to simultaneously assess natal sources and migrations of individuals within fishery harvests through time. Our results pave the way for investigating how fine-scale habitat production and life histories of salmon respond to perturbations—providing crucial insights for conservation.","container-title":"Science Advances","DOI":"10.1126/sciadv.1400124","ISSN":"2375-2548","issue":"4","journalAbbreviation":"Sci Adv","note":"PMID: 26601173\nPMCID: PMC4640640","page":"e1400124","source":"PubMed Central","title":"Strontium isotopes delineate fine-scale natal origins and migration histories of Pacific salmon","volume":"1","author":[{"family":"Brennan","given":"Sean R."},{"family":"Zimmerman","given":"Christian E."},{"family":"Fernandez","given":"Diego P."},{"family":"Cerling","given":"Thure E."},{"family":"McPhee","given":"Megan V."},{"family":"Wooller","given":"Matthew J."}],"issued":{"date-parts":[["2015",5,15]]}}},{"id":4132,"uris":["http://zotero.org/users/8421274/items/5YINANGC"],"itemData":{"id":4132,"type":"article-journal","abstract":"Comparisons of strontium:calcium (Sr: Ca) ratios in otolith primordia and freshwater growth regions were used to identify the progeny of steelhead Oncorhynchus mykiss (anadromous rainbow trout) and resident rainbow trout in the Deschutes River, Oregon. We cultured progeny of known adult steelhead and resident rainbow trout to confirm the relationship between Sr:Ca ratios in otolith primordia and the life history of the maternal parent. The mean (±SD) Sr:Ca ratio was significantly higher in the otolith primordia of the progeny of steelhead (0.001461 ± 0.00029; n = 100) than in those of the progeny of resident rainbow trout (0.000829 ± 0.000012; n = 100). We used comparisons of Sr:Ca ratios in the primordia and first-summer growth regions of otoliths to determine the maternal origin of unknown O. mykiss juveniles (n = 272) collected from rearing habitats within the main-stem Deschutes River and tributary rearing habitats and thus to ascertain the relative proportion of each life history morph in each rearing habitat. Resident rainbow trout fry dominated the bimonthly samples collected from main-stem rearing habitats between May and November 1995. Steelhead fry dominated samples collected from below waterfalls on two tributaries in 1996 and 1998.","container-title":"Transactions of the American Fisheries Society","DOI":"10.1577/1548-8659(2002)131&lt;0986:IOSARR&gt;2.0.CO;2","ISSN":"0002-8487","issue":"5","note":"publisher: Taylor &amp; Francis\n_eprint: https://doi.org/10.1577/1548-8659(2002)131&lt;0986:IOSARR&gt;2.0.CO;2","page":"986-993","source":"Taylor and Francis+NEJM","title":"Identification of Steelhead and Resident Rainbow Trout Progeny in the Deschutes River, Oregon, Revealed with Otolith Microchemistry","volume":"131","author":[{"family":"Zimmerman","given":"Christian E."},{"family":"Reeves","given":"Gordon H."}],"issued":{"date-parts":[["2002",9,1]]}}}],"schema":"https://github.com/citation-style-language/schema/raw/master/csl-citation.json"} </w:instrText>
       </w:r>
       <w:r>
         <w:rPr>
@@ -1639,7 +2088,7 @@
           <w:szCs w:val="22"/>
           <w14:ligatures w14:val="none"/>
         </w:rPr>
-        <w:instrText xml:space="preserve"> ADDIN ZOTERO_ITEM CSL_CITATION {"citationID":"drNJXJRw","properties":{"formattedCitation":"(Brennan et al., 2015; Campana, 1999; Capo et al., 1998)","plainCitation":"(Brennan et al., 2015; Campana, 1999; Capo et al., 1998)","noteIndex":0},"citationItems":[{"id":"h4h2qxOD/ChWvHkvk","uris":["http://zotero.org/users/8421274/items/IY3FLHLM"],"itemData":{"id":"dI01jIsp/qEdWN4pU","type":"article-journal","abstract":"Strontium isotopes simultaneously delineate fine-scale natal habitats and migrations of Pacific salmon harvested during a coastal commercial fishery., Highly migratory organisms present major challenges to conservation efforts. This is especially true for exploited anadromous fish species, which exhibit long-range dispersals from natal sites, complex population structures, and extensive mixing of distinct populations during exploitation. By tracing the migratory histories of individual Chinook salmon caught in fisheries using strontium isotopes, we determined the relative production of natal habitats at fine spatial scales and different life histories. Although strontium isotopes have been widely used in provenance research, we present a new robust framework to simultaneously assess natal sources and migrations of individuals within fishery harvests through time. Our results pave the way for investigating how fine-scale habitat production and life histories of salmon respond to perturbations—providing crucial insights for conservation.","container-title":"Science Advances","DOI":"10.1126/sciadv.1400124","ISSN":"2375-2548","issue":"4","journalAbbreviation":"Sci Adv","note":"PMID: 26601173\nPMCID: PMC4640640","page":"e1400124","source":"PubMed Central","title":"Strontium isotopes delineate fine-scale natal origins and migration histories of Pacific salmon","volume":"1","author":[{"family":"Brennan","given":"Sean R."},{"family":"Zimmerman","given":"Christian E."},{"family":"Fernandez","given":"Diego P."},{"family":"Cerling","given":"Thure E."},{"family":"McPhee","given":"Megan V."},{"family":"Wooller","given":"Matthew J."}],"issued":{"date-parts":[["2015",5,15]]}}},{"id":1441,"uris":["http://zotero.org/users/8421274/items/PHNAKZ8D"],"itemData":{"id":1441,"type":"article-journal","abstract":"The fish otolith (earstone) has long been known as a timekeeper, but interest in its use as a metabolically inert environmental recorder has accelerated in recent years. In part due to technological advances, applications such as stock identification, determination of rnigralon pathways, reconstruction of temperature and salinity history, age validation, detection of anadromy, use as a natural tag and chemical mass marking have been developed, some of which are difficult or impossible to implement using alternative techniques. Microsamphg and the latest advances in beam-based probes allow many elemental assays to be coupled with daily or annual growth increments, thus providing a detailed chronologcal record of the environment. However, few workers have critically assessed the assumptions upon which the environmental reconstructions are based, or considered the possibility that elemental incorporation into the otolith may proceed differently than that into other calcified structures. This paper reviews current applications and their assumptions and suggests future directions. Particular attention is given to the premises that the elemental and isotopic composition of the otolith reflects that of the environment, and the effect of physiological filters on the resulting composition. The roles of temperature, elemental uptake into the fish and the process of otolith crystahzation are also assessed. Drawing upon recent advances in geochemistry and paleoclirnate research as points of contrast, it appears that not all applications of otolith chemistry are firmly based, although others are destined to become powerful and perhaps routine tools for the mainstream fish biologst.","container-title":"Marine Ecology Progress Series","DOI":"10.3354/meps188263","ISSN":"0171-8630, 1616-1599","journalAbbreviation":"Mar. Ecol. Prog. Ser.","language":"en","page":"263-297","source":"DOI.org (Crossref)","title":"Chemistry and composition of fish otoliths:pathways, mechanisms and applications","title-short":"Chemistry and composition of fish otoliths","volume":"188","author":[{"family":"Campana","given":"Se"}],"issued":{"date-parts":[["1999"]]}}},{"id":1457,"uris":["http://zotero.org/users/8421274/items/TDIQBP7K"],"itemData":{"id":1457,"type":"article-journal","abstract":"The strontium (Sr) isotope method can be a powerful tool in studies of chemical weathering and soil genesis, cation provenance and mobility, and the chronostratigraphic correlation of marine sediments. It is a sensitive geochemical tracer, applicable to large-scale ecosystem studies as well as to centimeter-scaled examination of cation mobility within a soil profile. The 87Sr/86Sr ratios of natural materials reflect the sources of strontium available during their formation. Isotopically distinct inputs from precipitation, dryfall, soil parent material, and surface or groundwater allow determination of the relative proportions of those materials entering or leaving an ecosystem. The isotopic compositions of labile (soil exchange complex and soil solution) strontium and Sr in vegetation reflect the sources of cations available to plants. Strontium isotopes can be used to track the biogeochemical cycling of nutrient cations such as calcium. The extent of cation contributions from in situ weathering and external additions to soil from dust and rain can also be resolved with this method. In this paper, we review the geochemistry and isotopic systematics of strontium, and discuss the use of this method as a tracer of earth surface processes.","container-title":"Geoderma","DOI":"10.1016/S0016-7061(97)00102-X","ISSN":"0016-7061","issue":"1","journalAbbreviation":"Geoderma","language":"en","page":"197-225","source":"ScienceDirect","title":"Strontium isotopes as tracers of ecosystem processes: theory and methods","title-short":"Strontium isotopes as tracers of ecosystem processes","volume":"82","author":[{"family":"Capo","given":"Rosemary C."},{"family":"Stewart","given":"Brian W."},{"family":"Chadwick","given":"Oliver A."}],"issued":{"date-parts":[["1998",2,1]]}}}],"schema":"https://github.com/citation-style-language/schema/raw/master/csl-citation.json"} </w:instrText>
+        <w:instrText xml:space="preserve"> ADDIN ZOTERO_ITEM CSL_CITATION {"citationID":"drNJXJRw","properties":{"formattedCitation":"(Brennan et al., 2015; Campana, 1999; Capo et al., 1998)","plainCitation":"(Brennan et al., 2015; Campana, 1999; Capo et al., 1998)","noteIndex":0},"citationItems":[{"id":"TQue60dm/OuVLOkfY","uris":["http://zotero.org/users/8421274/items/IY3FLHLM"],"itemData":{"id":"dI01jIsp/qEdWN4pU","type":"article-journal","abstract":"Strontium isotopes simultaneously delineate fine-scale natal habitats and migrations of Pacific salmon harvested during a coastal commercial fishery., Highly migratory organisms present major challenges to conservation efforts. This is especially true for exploited anadromous fish species, which exhibit long-range dispersals from natal sites, complex population structures, and extensive mixing of distinct populations during exploitation. By tracing the migratory histories of individual Chinook salmon caught in fisheries using strontium isotopes, we determined the relative production of natal habitats at fine spatial scales and different life histories. Although strontium isotopes have been widely used in provenance research, we present a new robust framework to simultaneously assess natal sources and migrations of individuals within fishery harvests through time. Our results pave the way for investigating how fine-scale habitat production and life histories of salmon respond to perturbations—providing crucial insights for conservation.","container-title":"Science Advances","DOI":"10.1126/sciadv.1400124","ISSN":"2375-2548","issue":"4","journalAbbreviation":"Sci Adv","note":"PMID: 26601173\nPMCID: PMC4640640","page":"e1400124","source":"PubMed Central","title":"Strontium isotopes delineate fine-scale natal origins and migration histories of Pacific salmon","volume":"1","author":[{"family":"Brennan","given":"Sean R."},{"family":"Zimmerman","given":"Christian E."},{"family":"Fernandez","given":"Diego P."},{"family":"Cerling","given":"Thure E."},{"family":"McPhee","given":"Megan V."},{"family":"Wooller","given":"Matthew J."}],"issued":{"date-parts":[["2015",5,15]]}}},{"id":1441,"uris":["http://zotero.org/users/8421274/items/PHNAKZ8D"],"itemData":{"id":1441,"type":"article-journal","abstract":"The fish otolith (earstone) has long been known as a timekeeper, but interest in its use as a metabolically inert environmental recorder has accelerated in recent years. In part due to technological advances, applications such as stock identification, determination of rnigralon pathways, reconstruction of temperature and salinity history, age validation, detection of anadromy, use as a natural tag and chemical mass marking have been developed, some of which are difficult or impossible to implement using alternative techniques. Microsamphg and the latest advances in beam-based probes allow many elemental assays to be coupled with daily or annual growth increments, thus providing a detailed chronologcal record of the environment. However, few workers have critically assessed the assumptions upon which the environmental reconstructions are based, or considered the possibility that elemental incorporation into the otolith may proceed differently than that into other calcified structures. This paper reviews current applications and their assumptions and suggests future directions. Particular attention is given to the premises that the elemental and isotopic composition of the otolith reflects that of the environment, and the effect of physiological filters on the resulting composition. The roles of temperature, elemental uptake into the fish and the process of otolith crystahzation are also assessed. Drawing upon recent advances in geochemistry and paleoclirnate research as points of contrast, it appears that not all applications of otolith chemistry are firmly based, although others are destined to become powerful and perhaps routine tools for the mainstream fish biologst.","container-title":"Marine Ecology Progress Series","DOI":"10.3354/meps188263","ISSN":"0171-8630, 1616-1599","journalAbbreviation":"Mar. Ecol. Prog. Ser.","language":"en","page":"263-297","source":"DOI.org (Crossref)","title":"Chemistry and composition of fish otoliths:pathways, mechanisms and applications","title-short":"Chemistry and composition of fish otoliths","volume":"188","author":[{"family":"Campana","given":"Se"}],"issued":{"date-parts":[["1999"]]}}},{"id":1457,"uris":["http://zotero.org/users/8421274/items/TDIQBP7K"],"itemData":{"id":1457,"type":"article-journal","abstract":"The strontium (Sr) isotope method can be a powerful tool in studies of chemical weathering and soil genesis, cation provenance and mobility, and the chronostratigraphic correlation of marine sediments. It is a sensitive geochemical tracer, applicable to large-scale ecosystem studies as well as to centimeter-scaled examination of cation mobility within a soil profile. The 87Sr/86Sr ratios of natural materials reflect the sources of strontium available during their formation. Isotopically distinct inputs from precipitation, dryfall, soil parent material, and surface or groundwater allow determination of the relative proportions of those materials entering or leaving an ecosystem. The isotopic compositions of labile (soil exchange complex and soil solution) strontium and Sr in vegetation reflect the sources of cations available to plants. Strontium isotopes can be used to track the biogeochemical cycling of nutrient cations such as calcium. The extent of cation contributions from in situ weathering and external additions to soil from dust and rain can also be resolved with this method. In this paper, we review the geochemistry and isotopic systematics of strontium, and discuss the use of this method as a tracer of earth surface processes.","container-title":"Geoderma","DOI":"10.1016/S0016-7061(97)00102-X","ISSN":"0016-7061","issue":"1","journalAbbreviation":"Geoderma","language":"en","page":"197-225","source":"ScienceDirect","title":"Strontium isotopes as tracers of ecosystem processes: theory and methods","title-short":"Strontium isotopes as tracers of ecosystem processes","volume":"82","author":[{"family":"Capo","given":"Rosemary C."},{"family":"Stewart","given":"Brian W."},{"family":"Chadwick","given":"Oliver A."}],"issued":{"date-parts":[["1998",2,1]]}}}],"schema":"https://github.com/citation-style-language/schema/raw/master/csl-citation.json"} </w:instrText>
       </w:r>
       <w:r>
         <w:rPr>
@@ -1752,18 +2201,7 @@
           <w:szCs w:val="22"/>
           <w14:ligatures w14:val="none"/>
         </w:rPr>
-        <w:t xml:space="preserve">value associated with </w:t>
-      </w:r>
-      <w:r>
-        <w:rPr>
-          <w:rFonts w:ascii="Garamond" w:eastAsia="Times New Roman" w:hAnsi="Garamond" w:cs="Times New Roman"/>
-          <w:kern w:val="0"/>
-          <w:sz w:val="22"/>
-          <w:szCs w:val="22"/>
-          <w14:ligatures w14:val="none"/>
-        </w:rPr>
-        <w:lastRenderedPageBreak/>
-        <w:t xml:space="preserve">the </w:t>
+        <w:t xml:space="preserve">value associated with the </w:t>
       </w:r>
       <w:r>
         <w:rPr>
@@ -1973,6 +2411,7 @@
           <w14:ligatures w14:val="none"/>
         </w:rPr>
       </w:pPr>
+      <w:proofErr w:type="spellStart"/>
       <w:r>
         <w:rPr>
           <w:rFonts w:ascii="Garamond" w:eastAsia="Times New Roman" w:hAnsi="Garamond" w:cs="Times New Roman"/>
@@ -1983,7 +2422,20 @@
           <w:szCs w:val="22"/>
           <w14:ligatures w14:val="none"/>
         </w:rPr>
-        <w:t>Isoscape Development</w:t>
+        <w:t>Isoscape</w:t>
+      </w:r>
+      <w:proofErr w:type="spellEnd"/>
+      <w:r>
+        <w:rPr>
+          <w:rFonts w:ascii="Garamond" w:eastAsia="Times New Roman" w:hAnsi="Garamond" w:cs="Times New Roman"/>
+          <w:b/>
+          <w:bCs/>
+          <w:kern w:val="0"/>
+          <w:sz w:val="22"/>
+          <w:szCs w:val="22"/>
+          <w14:ligatures w14:val="none"/>
+        </w:rPr>
+        <w:t xml:space="preserve"> Development</w:t>
       </w:r>
     </w:p>
     <w:p>
@@ -2004,6 +2456,7 @@
           <w:szCs w:val="22"/>
           <w14:ligatures w14:val="none"/>
         </w:rPr>
+        <w:lastRenderedPageBreak/>
         <w:t>We used an</w:t>
       </w:r>
       <w:r>
@@ -2014,7 +2467,29 @@
           <w:szCs w:val="22"/>
           <w14:ligatures w14:val="none"/>
         </w:rPr>
-        <w:t xml:space="preserve"> isoscape of the Kuskokwim river </w:t>
+        <w:t xml:space="preserve"> </w:t>
+      </w:r>
+      <w:proofErr w:type="spellStart"/>
+      <w:r>
+        <w:rPr>
+          <w:rFonts w:ascii="Garamond" w:eastAsia="Times New Roman" w:hAnsi="Garamond" w:cs="Times New Roman"/>
+          <w:kern w:val="0"/>
+          <w:sz w:val="22"/>
+          <w:szCs w:val="22"/>
+          <w14:ligatures w14:val="none"/>
+        </w:rPr>
+        <w:t>isoscape</w:t>
+      </w:r>
+      <w:proofErr w:type="spellEnd"/>
+      <w:r>
+        <w:rPr>
+          <w:rFonts w:ascii="Garamond" w:eastAsia="Times New Roman" w:hAnsi="Garamond" w:cs="Times New Roman"/>
+          <w:kern w:val="0"/>
+          <w:sz w:val="22"/>
+          <w:szCs w:val="22"/>
+          <w14:ligatures w14:val="none"/>
+        </w:rPr>
+        <w:t xml:space="preserve"> of the Kuskokwim river </w:t>
       </w:r>
       <w:r>
         <w:rPr>
@@ -2095,7 +2570,7 @@
           <w:szCs w:val="22"/>
           <w14:ligatures w14:val="none"/>
         </w:rPr>
-        <w:t>French et al., 2020</w:t>
+        <w:t>(French et al., 2020)</w:t>
       </w:r>
       <w:r>
         <w:rPr>
@@ -2287,94 +2762,17 @@
           <w:sz w:val="22"/>
           <w:szCs w:val="22"/>
           <w14:ligatures w14:val="none"/>
+        </w:rPr>
+        <w:t>(French et al., 2020)</w:t>
+      </w:r>
+      <w:r>
+        <w:rPr>
+          <w:rFonts w:ascii="Garamond" w:eastAsia="Times New Roman" w:hAnsi="Garamond" w:cs="Times New Roman"/>
+          <w:kern w:val="0"/>
+          <w:sz w:val="22"/>
+          <w:szCs w:val="22"/>
+          <w14:ligatures w14:val="none"/>
           <w:rPrChange w:id="6" w:author="Benjamin J. Makhlouf" w:date="2025-07-26T13:00:00Z" w16du:dateUtc="2025-07-26T20:00:00Z">
-            <w:rPr>
-              <w:rFonts w:ascii="Garamond" w:eastAsia="Times New Roman" w:hAnsi="Garamond" w:cs="Times New Roman"/>
-              <w:noProof/>
-              <w:kern w:val="0"/>
-              <w:sz w:val="22"/>
-              <w:szCs w:val="22"/>
-              <w:highlight w:val="yellow"/>
-              <w14:ligatures w14:val="none"/>
-            </w:rPr>
-          </w:rPrChange>
-        </w:rPr>
-        <w:t>(</w:t>
-      </w:r>
-      <w:r>
-        <w:rPr>
-          <w:rFonts w:ascii="Garamond" w:eastAsia="Times New Roman" w:hAnsi="Garamond" w:cs="Times New Roman"/>
-          <w:noProof/>
-          <w:kern w:val="0"/>
-          <w:sz w:val="22"/>
-          <w:szCs w:val="22"/>
-          <w14:ligatures w14:val="none"/>
-        </w:rPr>
-        <w:t xml:space="preserve"> </w:t>
-      </w:r>
-      <w:r>
-        <w:rPr>
-          <w:rFonts w:ascii="Garamond" w:eastAsia="Times New Roman" w:hAnsi="Garamond" w:cs="Times New Roman"/>
-          <w:noProof/>
-          <w:kern w:val="0"/>
-          <w:sz w:val="22"/>
-          <w:szCs w:val="22"/>
-          <w14:ligatures w14:val="none"/>
-          <w:rPrChange w:id="7" w:author="Benjamin J. Makhlouf" w:date="2025-07-26T13:00:00Z" w16du:dateUtc="2025-07-26T20:00:00Z">
-            <w:rPr>
-              <w:rFonts w:ascii="Garamond" w:eastAsia="Times New Roman" w:hAnsi="Garamond" w:cs="Times New Roman"/>
-              <w:noProof/>
-              <w:kern w:val="0"/>
-              <w:sz w:val="22"/>
-              <w:szCs w:val="22"/>
-              <w:highlight w:val="yellow"/>
-              <w14:ligatures w14:val="none"/>
-            </w:rPr>
-          </w:rPrChange>
-        </w:rPr>
-        <w:t>N = 120</w:t>
-      </w:r>
-      <w:r>
-        <w:rPr>
-          <w:rFonts w:ascii="Garamond" w:eastAsia="Times New Roman" w:hAnsi="Garamond" w:cs="Times New Roman"/>
-          <w:noProof/>
-          <w:kern w:val="0"/>
-          <w:sz w:val="22"/>
-          <w:szCs w:val="22"/>
-          <w14:ligatures w14:val="none"/>
-        </w:rPr>
-        <w:t xml:space="preserve">, </w:t>
-      </w:r>
-      <w:r>
-        <w:rPr>
-          <w:rFonts w:ascii="Garamond" w:eastAsia="Times New Roman" w:hAnsi="Garamond" w:cs="Times New Roman"/>
-          <w:noProof/>
-          <w:kern w:val="0"/>
-          <w:sz w:val="22"/>
-          <w:szCs w:val="22"/>
-          <w14:ligatures w14:val="none"/>
-          <w:rPrChange w:id="8" w:author="Benjamin J. Makhlouf" w:date="2025-07-26T13:00:00Z" w16du:dateUtc="2025-07-26T20:00:00Z">
-            <w:rPr>
-              <w:rFonts w:ascii="Garamond" w:eastAsia="Times New Roman" w:hAnsi="Garamond" w:cs="Times New Roman"/>
-              <w:noProof/>
-              <w:kern w:val="0"/>
-              <w:sz w:val="22"/>
-              <w:szCs w:val="22"/>
-              <w:highlight w:val="yellow"/>
-              <w14:ligatures w14:val="none"/>
-            </w:rPr>
-          </w:rPrChange>
-        </w:rPr>
-        <w:t>French et al., 2020)</w:t>
-      </w:r>
-      <w:r>
-        <w:rPr>
-          <w:rFonts w:ascii="Garamond" w:eastAsia="Times New Roman" w:hAnsi="Garamond" w:cs="Times New Roman"/>
-          <w:kern w:val="0"/>
-          <w:sz w:val="22"/>
-          <w:szCs w:val="22"/>
-          <w14:ligatures w14:val="none"/>
-          <w:rPrChange w:id="9" w:author="Benjamin J. Makhlouf" w:date="2025-07-26T13:00:00Z" w16du:dateUtc="2025-07-26T20:00:00Z">
             <w:rPr>
               <w:rFonts w:ascii="Garamond" w:eastAsia="Times New Roman" w:hAnsi="Garamond" w:cs="Times New Roman"/>
               <w:kern w:val="0"/>
@@ -2521,7 +2919,7 @@
         </w:rPr>
         <w:t xml:space="preserve"> and associated uncertainties for roughly every ~1km stretch of tributaries across the basin </w:t>
       </w:r>
-      <w:commentRangeStart w:id="10"/>
+      <w:commentRangeStart w:id="7"/>
       <w:r>
         <w:rPr>
           <w:rFonts w:ascii="Garamond" w:hAnsi="Garamond" w:cs="Times New Roman"/>
@@ -2556,12 +2954,12 @@
         </w:rPr>
         <w:t xml:space="preserve"> </w:t>
       </w:r>
-      <w:commentRangeEnd w:id="10"/>
+      <w:commentRangeEnd w:id="7"/>
       <w:r>
         <w:rPr>
           <w:rStyle w:val="CommentReference"/>
         </w:rPr>
-        <w:commentReference w:id="10"/>
+        <w:commentReference w:id="7"/>
       </w:r>
       <w:r>
         <w:rPr>
@@ -2624,7 +3022,7 @@
         </w:rPr>
         <w:t xml:space="preserve">. </w:t>
       </w:r>
-      <w:commentRangeStart w:id="11"/>
+      <w:commentRangeStart w:id="8"/>
       <w:r>
         <w:rPr>
           <w:rFonts w:ascii="Garamond" w:hAnsi="Garamond" w:cs="Times New Roman"/>
@@ -2665,12 +3063,12 @@
         </w:rPr>
         <w:t xml:space="preserve"> </w:t>
       </w:r>
-      <w:commentRangeEnd w:id="11"/>
+      <w:commentRangeEnd w:id="8"/>
       <w:r>
         <w:rPr>
           <w:rStyle w:val="CommentReference"/>
         </w:rPr>
-        <w:commentReference w:id="11"/>
+        <w:commentReference w:id="8"/>
       </w:r>
       <w:r>
         <w:rPr>
@@ -2894,7 +3292,25 @@
           <w:sz w:val="22"/>
           <w:szCs w:val="22"/>
         </w:rPr>
-        <w:t>analytical, within-population, and isoscape prediction error</w:t>
+        <w:t xml:space="preserve">analytical, within-population, and </w:t>
+      </w:r>
+      <w:proofErr w:type="spellStart"/>
+      <w:r>
+        <w:rPr>
+          <w:rFonts w:ascii="Garamond" w:hAnsi="Garamond" w:cstheme="majorHAnsi"/>
+          <w:sz w:val="22"/>
+          <w:szCs w:val="22"/>
+        </w:rPr>
+        <w:t>isoscape</w:t>
+      </w:r>
+      <w:proofErr w:type="spellEnd"/>
+      <w:r>
+        <w:rPr>
+          <w:rFonts w:ascii="Garamond" w:hAnsi="Garamond" w:cstheme="majorHAnsi"/>
+          <w:sz w:val="22"/>
+          <w:szCs w:val="22"/>
+        </w:rPr>
+        <w:t xml:space="preserve"> prediction error</w:t>
       </w:r>
       <w:r>
         <w:rPr>
@@ -3127,7 +3543,6 @@
           <w:sz w:val="22"/>
           <w:szCs w:val="22"/>
         </w:rPr>
-        <w:lastRenderedPageBreak/>
         <w:t xml:space="preserve">Posterior probability values for each tributary (j) were then calculated using Bayes theorem </w:t>
       </w:r>
       <w:r>
@@ -3553,7 +3968,44 @@
           <w:sz w:val="22"/>
           <w:szCs w:val="22"/>
         </w:rPr>
-        <w:t xml:space="preserve">The probability of an individual assigning to tributary j is defined as the product of the probability of the isotope ratio in the otolith of an individual (o) given the isotope ratio in tributary j (r_j). The probability of the isotope ratio (rj) was assumed to be normally distributed with a mean represented by the otolith isotope ratio (o) and an error of </w:t>
+        <w:lastRenderedPageBreak/>
+        <w:t>The probability of an individual assigning to tributary j is defined as the product of the probability of the isotope ratio in the otolith of an individual (o) given the isotope ratio in tributary j (</w:t>
+      </w:r>
+      <w:proofErr w:type="spellStart"/>
+      <w:r>
+        <w:rPr>
+          <w:rFonts w:ascii="Garamond" w:hAnsi="Garamond" w:cstheme="majorHAnsi"/>
+          <w:sz w:val="22"/>
+          <w:szCs w:val="22"/>
+        </w:rPr>
+        <w:t>r_j</w:t>
+      </w:r>
+      <w:proofErr w:type="spellEnd"/>
+      <w:r>
+        <w:rPr>
+          <w:rFonts w:ascii="Garamond" w:hAnsi="Garamond" w:cstheme="majorHAnsi"/>
+          <w:sz w:val="22"/>
+          <w:szCs w:val="22"/>
+        </w:rPr>
+        <w:t>). The probability of the isotope ratio (</w:t>
+      </w:r>
+      <w:proofErr w:type="spellStart"/>
+      <w:r>
+        <w:rPr>
+          <w:rFonts w:ascii="Garamond" w:hAnsi="Garamond" w:cstheme="majorHAnsi"/>
+          <w:sz w:val="22"/>
+          <w:szCs w:val="22"/>
+        </w:rPr>
+        <w:t>rj</w:t>
+      </w:r>
+      <w:proofErr w:type="spellEnd"/>
+      <w:r>
+        <w:rPr>
+          <w:rFonts w:ascii="Garamond" w:hAnsi="Garamond" w:cstheme="majorHAnsi"/>
+          <w:sz w:val="22"/>
+          <w:szCs w:val="22"/>
+        </w:rPr>
+        <w:t xml:space="preserve">) was assumed to be normally distributed with a mean represented by the otolith isotope ratio (o) and an error of </w:t>
       </w:r>
       <m:oMath>
         <m:sSub>
@@ -3621,7 +4073,25 @@
           <w:sz w:val="22"/>
           <w:szCs w:val="22"/>
         </w:rPr>
-        <w:t>stream order prior (PStreamOrder)</w:t>
+        <w:t>stream order prior (</w:t>
+      </w:r>
+      <w:proofErr w:type="spellStart"/>
+      <w:r>
+        <w:rPr>
+          <w:rFonts w:ascii="Garamond" w:eastAsia="Times New Roman" w:hAnsi="Garamond"/>
+          <w:sz w:val="22"/>
+          <w:szCs w:val="22"/>
+        </w:rPr>
+        <w:t>PStreamOrder</w:t>
+      </w:r>
+      <w:proofErr w:type="spellEnd"/>
+      <w:r>
+        <w:rPr>
+          <w:rFonts w:ascii="Garamond" w:eastAsia="Times New Roman" w:hAnsi="Garamond"/>
+          <w:sz w:val="22"/>
+          <w:szCs w:val="22"/>
+        </w:rPr>
+        <w:t>)</w:t>
       </w:r>
       <w:r>
         <w:rPr>
@@ -3768,7 +4238,29 @@
           <w:szCs w:val="22"/>
           <w14:ligatures w14:val="none"/>
         </w:rPr>
-        <w:t xml:space="preserve">Second, a habitat suitability prior (PHabitat) was used to exclude exceedingly slow or flat reaches determined to be unsuitable </w:t>
+        <w:t>Second, a habitat suitability prior (</w:t>
+      </w:r>
+      <w:proofErr w:type="spellStart"/>
+      <w:r>
+        <w:rPr>
+          <w:rFonts w:ascii="Garamond" w:eastAsia="Times New Roman" w:hAnsi="Garamond" w:cs="Times New Roman"/>
+          <w:kern w:val="0"/>
+          <w:sz w:val="22"/>
+          <w:szCs w:val="22"/>
+          <w14:ligatures w14:val="none"/>
+        </w:rPr>
+        <w:t>PHabitat</w:t>
+      </w:r>
+      <w:proofErr w:type="spellEnd"/>
+      <w:r>
+        <w:rPr>
+          <w:rFonts w:ascii="Garamond" w:eastAsia="Times New Roman" w:hAnsi="Garamond" w:cs="Times New Roman"/>
+          <w:kern w:val="0"/>
+          <w:sz w:val="22"/>
+          <w:szCs w:val="22"/>
+          <w14:ligatures w14:val="none"/>
+        </w:rPr>
+        <w:t xml:space="preserve">) was used to exclude exceedingly slow or flat reaches determined to be unsuitable </w:t>
       </w:r>
       <w:r>
         <w:rPr>
@@ -3810,7 +4302,7 @@
         </w:rPr>
         <w:t xml:space="preserve"> </w:t>
       </w:r>
-      <w:commentRangeStart w:id="12"/>
+      <w:commentRangeStart w:id="9"/>
       <w:r>
         <w:rPr>
           <w:rFonts w:ascii="Garamond" w:eastAsia="Times New Roman" w:hAnsi="Garamond" w:cs="Times New Roman"/>
@@ -3862,12 +4354,12 @@
         </w:rPr>
         <w:fldChar w:fldCharType="end"/>
       </w:r>
-      <w:commentRangeEnd w:id="12"/>
+      <w:commentRangeEnd w:id="9"/>
       <w:r>
         <w:rPr>
           <w:rStyle w:val="CommentReference"/>
         </w:rPr>
-        <w:commentReference w:id="12"/>
+        <w:commentReference w:id="9"/>
       </w:r>
       <w:r>
         <w:rPr>
@@ -4378,18 +4870,9 @@
           <w:sz w:val="22"/>
           <w:szCs w:val="22"/>
         </w:rPr>
-        <w:t xml:space="preserve">based on capture </w:t>
-      </w:r>
-      <w:r>
-        <w:rPr>
-          <w:rFonts w:ascii="Garamond" w:hAnsi="Garamond"/>
-          <w:sz w:val="22"/>
-          <w:szCs w:val="22"/>
-        </w:rPr>
-        <w:lastRenderedPageBreak/>
-        <w:t>date: Q1 (run start through June 11), Q2 (June 12-21), Q3 (June 22-July 1), and Q4 (July 2 onward).</w:t>
-      </w:r>
-      <w:ins w:id="13" w:author="Daniel Schindler" w:date="2025-07-17T13:30:00Z" w16du:dateUtc="2025-07-17T21:30:00Z">
+        <w:t>based on capture date: Q1 (run start through June 11), Q2 (June 12-21), Q3 (June 22-July 1), and Q4 (July 2 onward).</w:t>
+      </w:r>
+      <w:ins w:id="10" w:author="Daniel Schindler" w:date="2025-07-17T13:30:00Z" w16du:dateUtc="2025-07-17T21:30:00Z">
         <w:r>
           <w:rPr>
             <w:rFonts w:ascii="Garamond" w:hAnsi="Garamond"/>
@@ -4520,6 +5003,7 @@
           <w:sz w:val="22"/>
           <w:szCs w:val="22"/>
         </w:rPr>
+        <w:lastRenderedPageBreak/>
         <w:t>Twenty</w:t>
       </w:r>
       <w:r>
@@ -4602,8 +5086,8 @@
         </w:rPr>
         <w:t xml:space="preserve"> </w:t>
       </w:r>
-      <w:commentRangeStart w:id="14"/>
-      <w:ins w:id="15" w:author="Daniel Schindler" w:date="2025-07-17T13:31:00Z" w16du:dateUtc="2025-07-17T21:31:00Z">
+      <w:commentRangeStart w:id="11"/>
+      <w:ins w:id="12" w:author="Daniel Schindler" w:date="2025-07-17T13:31:00Z" w16du:dateUtc="2025-07-17T21:31:00Z">
         <w:r>
           <w:rPr>
             <w:rFonts w:ascii="Garamond" w:hAnsi="Garamond"/>
@@ -4622,12 +5106,12 @@
         </w:rPr>
         <w:t xml:space="preserve">. </w:t>
       </w:r>
-      <w:commentRangeEnd w:id="14"/>
+      <w:commentRangeEnd w:id="11"/>
       <w:r>
         <w:rPr>
           <w:rStyle w:val="CommentReference"/>
         </w:rPr>
-        <w:commentReference w:id="14"/>
+        <w:commentReference w:id="11"/>
       </w:r>
       <w:r>
         <w:rPr>
@@ -4636,7 +5120,27 @@
           <w:sz w:val="22"/>
           <w:szCs w:val="22"/>
         </w:rPr>
-        <w:t xml:space="preserve">From the furthest downstream connection of each of these tributaries to the mainstem all upstream segments were selected and assigned to a common identifier.  For some smaller units (i.e. the Takotna and Nixon fork), the units were combined into one to keep a relative comparable size. </w:t>
+        <w:t xml:space="preserve">From the furthest downstream connection of each of these tributaries to the mainstem all upstream segments were selected and assigned to a common identifier.  For some smaller units (i.e. the </w:t>
+      </w:r>
+      <w:proofErr w:type="spellStart"/>
+      <w:r>
+        <w:rPr>
+          <w:rStyle w:val="CommentReference"/>
+          <w:rFonts w:ascii="Garamond" w:hAnsi="Garamond"/>
+          <w:sz w:val="22"/>
+          <w:szCs w:val="22"/>
+        </w:rPr>
+        <w:t>Takotna</w:t>
+      </w:r>
+      <w:proofErr w:type="spellEnd"/>
+      <w:r>
+        <w:rPr>
+          <w:rStyle w:val="CommentReference"/>
+          <w:rFonts w:ascii="Garamond" w:hAnsi="Garamond"/>
+          <w:sz w:val="22"/>
+          <w:szCs w:val="22"/>
+        </w:rPr>
+        <w:t xml:space="preserve"> and Nixon fork), the units were combined into one to keep a relative comparable size. </w:t>
       </w:r>
       <w:r>
         <w:rPr>
@@ -4751,16 +5255,7 @@
           <w:sz w:val="22"/>
           <w:szCs w:val="22"/>
         </w:rPr>
-        <w:t xml:space="preserve">For each year and seasonal quartile, tributary-level natal origin estimates were aggregated into management units and normalized to sum to one across the basin, representing each unit's proportional contribution to the seasonal quartile. Summary statistics were then calculated across all years for each management unit, with Figure 3a displaying mean contributions by management unit (darker colors indicating higher values) and corresponding boxplots showing median and range values for each quartile, ordered from furthest upstream (top) to downstream (bottom) by watershed position. Cumulative distribution functions were constructed to examine relative run timing independent of stock abundance by aggregating natal origin distributions by management unit for each 3-day interval and comparing against full-season totals without normalization, allowing comparison of actual return numbers over time and showing the cumulative proportion of each stock's total seasonal contribution at each time point. To evaluate the stock-specific effect of the current implemented front-end closure, we evaluated the proportion of each stock's total return occurring within the current closure window (the first seasonal quartile in our dataset). The relative protection </w:t>
-      </w:r>
-      <w:r>
-        <w:rPr>
-          <w:rFonts w:ascii="Garamond" w:hAnsi="Garamond"/>
-          <w:sz w:val="22"/>
-          <w:szCs w:val="22"/>
-        </w:rPr>
-        <w:lastRenderedPageBreak/>
-        <w:t>across all years was used produce boxplots visualizing the variability in this protection over the dataset, again ordered from furthest upstream to furthest downstream.</w:t>
+        <w:t>For each year and seasonal quartile, tributary-level natal origin estimates were aggregated into management units and normalized to sum to one across the basin, representing each unit's proportional contribution to the seasonal quartile. Summary statistics were then calculated across all years for each management unit, with Figure 3a displaying mean contributions by management unit (darker colors indicating higher values) and corresponding boxplots showing median and range values for each quartile, ordered from furthest upstream (top) to downstream (bottom) by watershed position. Cumulative distribution functions were constructed to examine relative run timing independent of stock abundance by aggregating natal origin distributions by management unit for each 3-day interval and comparing against full-season totals without normalization, allowing comparison of actual return numbers over time and showing the cumulative proportion of each stock's total seasonal contribution at each time point. To evaluate the stock-specific effect of the current implemented front-end closure, we evaluated the proportion of each stock's total return occurring within the current closure window (the first seasonal quartile in our dataset). The relative protection across all years was used produce boxplots visualizing the variability in this protection over the dataset, again ordered from furthest upstream to furthest downstream.</w:t>
       </w:r>
     </w:p>
     <w:p>
@@ -4816,6 +5311,7 @@
           <w:sz w:val="22"/>
           <w:szCs w:val="22"/>
         </w:rPr>
+        <w:lastRenderedPageBreak/>
         <w:t>T</w:t>
       </w:r>
       <w:r>
@@ -5023,7 +5519,25 @@
           <w:sz w:val="22"/>
           <w:szCs w:val="22"/>
         </w:rPr>
-        <w:t xml:space="preserve">Notably, the uppermost stocks (North, East, and South Fork Kuskokwim) consistently contributed very little (&lt; 2.5%) and the Takotna and Nixon fork </w:t>
+        <w:t xml:space="preserve">Notably, the uppermost stocks (North, East, and South Fork Kuskokwim) consistently contributed very little (&lt; 2.5%) and the </w:t>
+      </w:r>
+      <w:proofErr w:type="spellStart"/>
+      <w:r>
+        <w:rPr>
+          <w:rFonts w:ascii="Garamond" w:hAnsi="Garamond"/>
+          <w:sz w:val="22"/>
+          <w:szCs w:val="22"/>
+        </w:rPr>
+        <w:t>Takotna</w:t>
+      </w:r>
+      <w:proofErr w:type="spellEnd"/>
+      <w:r>
+        <w:rPr>
+          <w:rFonts w:ascii="Garamond" w:hAnsi="Garamond"/>
+          <w:sz w:val="22"/>
+          <w:szCs w:val="22"/>
+        </w:rPr>
+        <w:t xml:space="preserve"> and Nixon fork </w:t>
       </w:r>
       <w:r>
         <w:rPr>
@@ -5039,7 +5553,25 @@
           <w:sz w:val="22"/>
           <w:szCs w:val="22"/>
         </w:rPr>
-        <w:t xml:space="preserve"> Tatlawiksuk </w:t>
+        <w:t xml:space="preserve"> </w:t>
+      </w:r>
+      <w:proofErr w:type="spellStart"/>
+      <w:r>
+        <w:rPr>
+          <w:rFonts w:ascii="Garamond" w:hAnsi="Garamond"/>
+          <w:sz w:val="22"/>
+          <w:szCs w:val="22"/>
+        </w:rPr>
+        <w:t>Tatlawiksuk</w:t>
+      </w:r>
+      <w:proofErr w:type="spellEnd"/>
+      <w:r>
+        <w:rPr>
+          <w:rFonts w:ascii="Garamond" w:hAnsi="Garamond"/>
+          <w:sz w:val="22"/>
+          <w:szCs w:val="22"/>
+        </w:rPr>
+        <w:t xml:space="preserve"> </w:t>
       </w:r>
       <w:r>
         <w:rPr>
@@ -5055,15 +5587,33 @@
           <w:sz w:val="22"/>
           <w:szCs w:val="22"/>
         </w:rPr>
-        <w:t xml:space="preserve">stock each contributed only modestly (median 3% and 5% respectively) despite their position near the top of the watershed. The second quartile ( </w:t>
-      </w:r>
-      <w:r>
-        <w:rPr>
-          <w:rFonts w:ascii="Garamond" w:hAnsi="Garamond"/>
-          <w:sz w:val="22"/>
-          <w:szCs w:val="22"/>
-        </w:rPr>
-        <w:t>June 12</w:t>
+        <w:t xml:space="preserve">stock each contributed only modestly (median 3% and 5% respectively) despite their position near the top of the watershed. The second quartile </w:t>
+      </w:r>
+      <w:proofErr w:type="gramStart"/>
+      <w:r>
+        <w:rPr>
+          <w:rFonts w:ascii="Garamond" w:hAnsi="Garamond"/>
+          <w:sz w:val="22"/>
+          <w:szCs w:val="22"/>
+        </w:rPr>
+        <w:t xml:space="preserve">( </w:t>
+      </w:r>
+      <w:r>
+        <w:rPr>
+          <w:rFonts w:ascii="Garamond" w:hAnsi="Garamond"/>
+          <w:sz w:val="22"/>
+          <w:szCs w:val="22"/>
+        </w:rPr>
+        <w:t>June</w:t>
+      </w:r>
+      <w:proofErr w:type="gramEnd"/>
+      <w:r>
+        <w:rPr>
+          <w:rFonts w:ascii="Garamond" w:hAnsi="Garamond"/>
+          <w:sz w:val="22"/>
+          <w:szCs w:val="22"/>
+        </w:rPr>
+        <w:t xml:space="preserve"> 12</w:t>
       </w:r>
       <w:r>
         <w:rPr>
@@ -5105,7 +5655,61 @@
           <w:sz w:val="22"/>
           <w:szCs w:val="22"/>
         </w:rPr>
-        <w:t xml:space="preserve"> saw a more even distribution of returns across much of the middle watershed, with Upper Kuskokwim Main, Big River, Takotna River and Nixon Fork, Swift River, Holitna River, Hoholitna River, Middle Kuskokwim Main, Aniak</w:t>
+        <w:t xml:space="preserve"> saw a more even distribution of returns across much of the middle watershed, with Upper Kuskokwim Main, Big River, </w:t>
+      </w:r>
+      <w:proofErr w:type="spellStart"/>
+      <w:r>
+        <w:rPr>
+          <w:rFonts w:ascii="Garamond" w:hAnsi="Garamond"/>
+          <w:sz w:val="22"/>
+          <w:szCs w:val="22"/>
+        </w:rPr>
+        <w:t>Takotna</w:t>
+      </w:r>
+      <w:proofErr w:type="spellEnd"/>
+      <w:r>
+        <w:rPr>
+          <w:rFonts w:ascii="Garamond" w:hAnsi="Garamond"/>
+          <w:sz w:val="22"/>
+          <w:szCs w:val="22"/>
+        </w:rPr>
+        <w:t xml:space="preserve"> River and Nixon Fork, Swift River, </w:t>
+      </w:r>
+      <w:proofErr w:type="spellStart"/>
+      <w:r>
+        <w:rPr>
+          <w:rFonts w:ascii="Garamond" w:hAnsi="Garamond"/>
+          <w:sz w:val="22"/>
+          <w:szCs w:val="22"/>
+        </w:rPr>
+        <w:t>Holitna</w:t>
+      </w:r>
+      <w:proofErr w:type="spellEnd"/>
+      <w:r>
+        <w:rPr>
+          <w:rFonts w:ascii="Garamond" w:hAnsi="Garamond"/>
+          <w:sz w:val="22"/>
+          <w:szCs w:val="22"/>
+        </w:rPr>
+        <w:t xml:space="preserve"> River, </w:t>
+      </w:r>
+      <w:proofErr w:type="spellStart"/>
+      <w:r>
+        <w:rPr>
+          <w:rFonts w:ascii="Garamond" w:hAnsi="Garamond"/>
+          <w:sz w:val="22"/>
+          <w:szCs w:val="22"/>
+        </w:rPr>
+        <w:t>Hoholitna</w:t>
+      </w:r>
+      <w:proofErr w:type="spellEnd"/>
+      <w:r>
+        <w:rPr>
+          <w:rFonts w:ascii="Garamond" w:hAnsi="Garamond"/>
+          <w:sz w:val="22"/>
+          <w:szCs w:val="22"/>
+        </w:rPr>
+        <w:t xml:space="preserve"> River, Middle Kuskokwim Main, Aniak</w:t>
       </w:r>
       <w:r>
         <w:rPr>
@@ -5121,7 +5725,25 @@
           <w:sz w:val="22"/>
           <w:szCs w:val="22"/>
         </w:rPr>
-        <w:t>, and Kisarlik all contributing between 5 and 10%. Only the Stony River had an average contribution of greater than 10% (median 11.5%) with a relative constrained range (10.7 – 12.2%) indicating consistent contribution to the 2</w:t>
+        <w:t xml:space="preserve">, and </w:t>
+      </w:r>
+      <w:proofErr w:type="spellStart"/>
+      <w:r>
+        <w:rPr>
+          <w:rFonts w:ascii="Garamond" w:hAnsi="Garamond"/>
+          <w:sz w:val="22"/>
+          <w:szCs w:val="22"/>
+        </w:rPr>
+        <w:t>Kisarlik</w:t>
+      </w:r>
+      <w:proofErr w:type="spellEnd"/>
+      <w:r>
+        <w:rPr>
+          <w:rFonts w:ascii="Garamond" w:hAnsi="Garamond"/>
+          <w:sz w:val="22"/>
+          <w:szCs w:val="22"/>
+        </w:rPr>
+        <w:t xml:space="preserve"> all contributing between 5 and 10%. Only the Stony River had an average contribution of greater than 10% (median 11.5%) with a relative constrained range (10.7 – 12.2%) indicating consistent contribution to the 2</w:t>
       </w:r>
       <w:r>
         <w:rPr>
@@ -5204,7 +5826,43 @@
           <w:sz w:val="22"/>
           <w:szCs w:val="22"/>
         </w:rPr>
-        <w:t xml:space="preserve">), but with increased contribution from the Holitna River (median; 10.4%, range 9.5-13.6%), Hoholitna River (median 9.6%, range 8.8-12.2%), and Aniak river (median 8.2%, range 5.7-10.1%). </w:t>
+        <w:t xml:space="preserve">), but with increased contribution from the </w:t>
+      </w:r>
+      <w:proofErr w:type="spellStart"/>
+      <w:r>
+        <w:rPr>
+          <w:rFonts w:ascii="Garamond" w:hAnsi="Garamond"/>
+          <w:sz w:val="22"/>
+          <w:szCs w:val="22"/>
+        </w:rPr>
+        <w:t>Holitna</w:t>
+      </w:r>
+      <w:proofErr w:type="spellEnd"/>
+      <w:r>
+        <w:rPr>
+          <w:rFonts w:ascii="Garamond" w:hAnsi="Garamond"/>
+          <w:sz w:val="22"/>
+          <w:szCs w:val="22"/>
+        </w:rPr>
+        <w:t xml:space="preserve"> River (median; 10.4%, range 9.5-13.6%), </w:t>
+      </w:r>
+      <w:proofErr w:type="spellStart"/>
+      <w:r>
+        <w:rPr>
+          <w:rFonts w:ascii="Garamond" w:hAnsi="Garamond"/>
+          <w:sz w:val="22"/>
+          <w:szCs w:val="22"/>
+        </w:rPr>
+        <w:t>Hoholitna</w:t>
+      </w:r>
+      <w:proofErr w:type="spellEnd"/>
+      <w:r>
+        <w:rPr>
+          <w:rFonts w:ascii="Garamond" w:hAnsi="Garamond"/>
+          <w:sz w:val="22"/>
+          <w:szCs w:val="22"/>
+        </w:rPr>
+        <w:t xml:space="preserve"> River (median 9.6%, range 8.8-12.2%), and Aniak river (median 8.2%, range 5.7-10.1%). </w:t>
       </w:r>
       <w:r>
         <w:rPr>
@@ -5245,7 +5903,79 @@
           <w:sz w:val="22"/>
           <w:szCs w:val="22"/>
         </w:rPr>
-        <w:t xml:space="preserve">) displayed further decreasing contribution from Upper Kuskokwim stocks (i.e Upper Kuskokwim Main, Big River, Takotna River and Nixon Fork, Tatlawiksuk River, and Swift River). The Hoholitna and Middle Kuskokwim River saw slight decreases and increases in contribution, respectively, but with </w:t>
+        <w:t>) displayed further decreasing contribution from Upper Kuskokwim stocks (</w:t>
+      </w:r>
+      <w:proofErr w:type="spellStart"/>
+      <w:r>
+        <w:rPr>
+          <w:rFonts w:ascii="Garamond" w:hAnsi="Garamond"/>
+          <w:sz w:val="22"/>
+          <w:szCs w:val="22"/>
+        </w:rPr>
+        <w:t>i.e</w:t>
+      </w:r>
+      <w:proofErr w:type="spellEnd"/>
+      <w:r>
+        <w:rPr>
+          <w:rFonts w:ascii="Garamond" w:hAnsi="Garamond"/>
+          <w:sz w:val="22"/>
+          <w:szCs w:val="22"/>
+        </w:rPr>
+        <w:t xml:space="preserve"> Upper Kuskokwim Main, Big River, </w:t>
+      </w:r>
+      <w:proofErr w:type="spellStart"/>
+      <w:r>
+        <w:rPr>
+          <w:rFonts w:ascii="Garamond" w:hAnsi="Garamond"/>
+          <w:sz w:val="22"/>
+          <w:szCs w:val="22"/>
+        </w:rPr>
+        <w:t>Takotna</w:t>
+      </w:r>
+      <w:proofErr w:type="spellEnd"/>
+      <w:r>
+        <w:rPr>
+          <w:rFonts w:ascii="Garamond" w:hAnsi="Garamond"/>
+          <w:sz w:val="22"/>
+          <w:szCs w:val="22"/>
+        </w:rPr>
+        <w:t xml:space="preserve"> River and Nixon Fork, </w:t>
+      </w:r>
+      <w:proofErr w:type="spellStart"/>
+      <w:r>
+        <w:rPr>
+          <w:rFonts w:ascii="Garamond" w:hAnsi="Garamond"/>
+          <w:sz w:val="22"/>
+          <w:szCs w:val="22"/>
+        </w:rPr>
+        <w:t>Tatlawiksuk</w:t>
+      </w:r>
+      <w:proofErr w:type="spellEnd"/>
+      <w:r>
+        <w:rPr>
+          <w:rFonts w:ascii="Garamond" w:hAnsi="Garamond"/>
+          <w:sz w:val="22"/>
+          <w:szCs w:val="22"/>
+        </w:rPr>
+        <w:t xml:space="preserve"> River, and Swift River). The </w:t>
+      </w:r>
+      <w:proofErr w:type="spellStart"/>
+      <w:r>
+        <w:rPr>
+          <w:rFonts w:ascii="Garamond" w:hAnsi="Garamond"/>
+          <w:sz w:val="22"/>
+          <w:szCs w:val="22"/>
+        </w:rPr>
+        <w:t>Hoholitna</w:t>
+      </w:r>
+      <w:proofErr w:type="spellEnd"/>
+      <w:r>
+        <w:rPr>
+          <w:rFonts w:ascii="Garamond" w:hAnsi="Garamond"/>
+          <w:sz w:val="22"/>
+          <w:szCs w:val="22"/>
+        </w:rPr>
+        <w:t xml:space="preserve"> and Middle Kuskokwim River saw slight decreases and increases in contribution, respectively, but with </w:t>
       </w:r>
       <w:r>
         <w:rPr>
@@ -5261,16 +5991,7 @@
           <w:sz w:val="22"/>
           <w:szCs w:val="22"/>
         </w:rPr>
-        <w:t xml:space="preserve">increase in range </w:t>
-      </w:r>
-      <w:r>
-        <w:rPr>
-          <w:rFonts w:ascii="Garamond" w:hAnsi="Garamond"/>
-          <w:sz w:val="22"/>
-          <w:szCs w:val="22"/>
-        </w:rPr>
-        <w:lastRenderedPageBreak/>
-        <w:t xml:space="preserve">indicating variability </w:t>
+        <w:t xml:space="preserve">increase in range indicating variability </w:t>
       </w:r>
       <w:r>
         <w:rPr>
@@ -5296,6 +6017,7 @@
         </w:rPr>
         <w:t xml:space="preserve"> (median; 11.6%), </w:t>
       </w:r>
+      <w:proofErr w:type="spellStart"/>
       <w:r>
         <w:rPr>
           <w:rFonts w:ascii="Garamond" w:hAnsi="Garamond"/>
@@ -5304,22 +6026,51 @@
         </w:rPr>
         <w:t>Tuluksak</w:t>
       </w:r>
-      <w:r>
-        <w:rPr>
-          <w:rFonts w:ascii="Garamond" w:hAnsi="Garamond"/>
-          <w:sz w:val="22"/>
-          <w:szCs w:val="22"/>
-        </w:rPr>
-        <w:t xml:space="preserve"> (median; 6.1%) </w:t>
-      </w:r>
-      <w:r>
-        <w:rPr>
-          <w:rFonts w:ascii="Garamond" w:hAnsi="Garamond"/>
-          <w:sz w:val="22"/>
-          <w:szCs w:val="22"/>
-        </w:rPr>
-        <w:t>, Kisaralik</w:t>
-      </w:r>
+      <w:proofErr w:type="spellEnd"/>
+      <w:r>
+        <w:rPr>
+          <w:rFonts w:ascii="Garamond" w:hAnsi="Garamond"/>
+          <w:sz w:val="22"/>
+          <w:szCs w:val="22"/>
+        </w:rPr>
+        <w:t xml:space="preserve"> (median; 6.1%</w:t>
+      </w:r>
+      <w:proofErr w:type="gramStart"/>
+      <w:r>
+        <w:rPr>
+          <w:rFonts w:ascii="Garamond" w:hAnsi="Garamond"/>
+          <w:sz w:val="22"/>
+          <w:szCs w:val="22"/>
+        </w:rPr>
+        <w:t xml:space="preserve">) </w:t>
+      </w:r>
+      <w:r>
+        <w:rPr>
+          <w:rFonts w:ascii="Garamond" w:hAnsi="Garamond"/>
+          <w:sz w:val="22"/>
+          <w:szCs w:val="22"/>
+        </w:rPr>
+        <w:t>,</w:t>
+      </w:r>
+      <w:proofErr w:type="gramEnd"/>
+      <w:r>
+        <w:rPr>
+          <w:rFonts w:ascii="Garamond" w:hAnsi="Garamond"/>
+          <w:sz w:val="22"/>
+          <w:szCs w:val="22"/>
+        </w:rPr>
+        <w:t xml:space="preserve"> </w:t>
+      </w:r>
+      <w:proofErr w:type="spellStart"/>
+      <w:r>
+        <w:rPr>
+          <w:rFonts w:ascii="Garamond" w:hAnsi="Garamond"/>
+          <w:sz w:val="22"/>
+          <w:szCs w:val="22"/>
+        </w:rPr>
+        <w:t>Kisaralik</w:t>
+      </w:r>
+      <w:proofErr w:type="spellEnd"/>
       <w:r>
         <w:rPr>
           <w:rFonts w:ascii="Garamond" w:hAnsi="Garamond"/>
@@ -5342,15 +6093,33 @@
           <w:sz w:val="22"/>
           <w:szCs w:val="22"/>
         </w:rPr>
-        <w:t xml:space="preserve"> (median 6.7%) </w:t>
-      </w:r>
-      <w:r>
-        <w:rPr>
-          <w:rFonts w:ascii="Garamond" w:hAnsi="Garamond"/>
-          <w:sz w:val="22"/>
-          <w:szCs w:val="22"/>
-        </w:rPr>
-        <w:t xml:space="preserve"> all reached their peak contribution during this period, consistent with late returns for stocks in the lower portion of the watershed. </w:t>
+        <w:t xml:space="preserve"> (median 6.7</w:t>
+      </w:r>
+      <w:proofErr w:type="gramStart"/>
+      <w:r>
+        <w:rPr>
+          <w:rFonts w:ascii="Garamond" w:hAnsi="Garamond"/>
+          <w:sz w:val="22"/>
+          <w:szCs w:val="22"/>
+        </w:rPr>
+        <w:t xml:space="preserve">%) </w:t>
+      </w:r>
+      <w:r>
+        <w:rPr>
+          <w:rFonts w:ascii="Garamond" w:hAnsi="Garamond"/>
+          <w:sz w:val="22"/>
+          <w:szCs w:val="22"/>
+        </w:rPr>
+        <w:t xml:space="preserve"> all</w:t>
+      </w:r>
+      <w:proofErr w:type="gramEnd"/>
+      <w:r>
+        <w:rPr>
+          <w:rFonts w:ascii="Garamond" w:hAnsi="Garamond"/>
+          <w:sz w:val="22"/>
+          <w:szCs w:val="22"/>
+        </w:rPr>
+        <w:t xml:space="preserve"> reached their peak contribution during this period, consistent with late returns for stocks in the lower portion of the watershed. </w:t>
       </w:r>
     </w:p>
     <w:p>
@@ -5426,7 +6195,16 @@
           <w:sz w:val="22"/>
           <w:szCs w:val="22"/>
         </w:rPr>
-        <w:t xml:space="preserve">temporal scale and independent of the total contribution of each stock to the overall run. </w:t>
+        <w:t xml:space="preserve">temporal scale and independent of the total contribution of each stock to </w:t>
+      </w:r>
+      <w:r>
+        <w:rPr>
+          <w:rFonts w:ascii="Garamond" w:hAnsi="Garamond"/>
+          <w:sz w:val="22"/>
+          <w:szCs w:val="22"/>
+        </w:rPr>
+        <w:lastRenderedPageBreak/>
+        <w:t xml:space="preserve">the overall run. </w:t>
       </w:r>
       <w:r>
         <w:rPr>
@@ -5490,7 +6268,25 @@
           <w:sz w:val="22"/>
           <w:szCs w:val="22"/>
         </w:rPr>
-        <w:t xml:space="preserve">In contrast, lower Kuskokwim stocks arrive later in the season, with stocks such as the Hoholitna and Aniak river reaching 50% of their total run nearly </w:t>
+        <w:t xml:space="preserve">In contrast, lower Kuskokwim stocks arrive later in the season, with stocks such as the </w:t>
+      </w:r>
+      <w:proofErr w:type="spellStart"/>
+      <w:r>
+        <w:rPr>
+          <w:rFonts w:ascii="Garamond" w:hAnsi="Garamond"/>
+          <w:sz w:val="22"/>
+          <w:szCs w:val="22"/>
+        </w:rPr>
+        <w:t>Hoholitna</w:t>
+      </w:r>
+      <w:proofErr w:type="spellEnd"/>
+      <w:r>
+        <w:rPr>
+          <w:rFonts w:ascii="Garamond" w:hAnsi="Garamond"/>
+          <w:sz w:val="22"/>
+          <w:szCs w:val="22"/>
+        </w:rPr>
+        <w:t xml:space="preserve"> and Aniak river reaching 50% of their total run nearly </w:t>
       </w:r>
       <w:r>
         <w:rPr>
@@ -5715,7 +6511,25 @@
           <w:sz w:val="22"/>
           <w:szCs w:val="22"/>
         </w:rPr>
-        <w:t>A pattern of early returning upper Kuskokwim stocks clearly affords higher protection to these stocks from a front end closure ending on June 12</w:t>
+        <w:t xml:space="preserve">A pattern of early returning upper Kuskokwim stocks clearly affords higher protection to these stocks from a </w:t>
+      </w:r>
+      <w:proofErr w:type="gramStart"/>
+      <w:r>
+        <w:rPr>
+          <w:rFonts w:ascii="Garamond" w:hAnsi="Garamond"/>
+          <w:sz w:val="22"/>
+          <w:szCs w:val="22"/>
+        </w:rPr>
+        <w:t>front end</w:t>
+      </w:r>
+      <w:proofErr w:type="gramEnd"/>
+      <w:r>
+        <w:rPr>
+          <w:rFonts w:ascii="Garamond" w:hAnsi="Garamond"/>
+          <w:sz w:val="22"/>
+          <w:szCs w:val="22"/>
+        </w:rPr>
+        <w:t xml:space="preserve"> closure ending on June 12</w:t>
       </w:r>
       <w:r>
         <w:rPr>
@@ -5732,7 +6546,43 @@
           <w:sz w:val="22"/>
           <w:szCs w:val="22"/>
         </w:rPr>
-        <w:t>.  Nearly all stocks upstream of Swift River received median protection &gt;10% of the total stock contribution across all years of our dataset, with several notable outlkiers &gt;30% protection in some years. An exception is the Takotna river and Nixon Fork stocks, which received a median protection of only 6.6%. Several stocks which contribute only minimally to the overall run are afforded significant protection. For example, although the East Fork Kuskokwim contributes minimally to the total run</w:t>
+        <w:t xml:space="preserve">.  Nearly all stocks upstream of Swift River received median protection &gt;10% of the total stock contribution across all years of our dataset, with several notable </w:t>
+      </w:r>
+      <w:proofErr w:type="spellStart"/>
+      <w:r>
+        <w:rPr>
+          <w:rFonts w:ascii="Garamond" w:hAnsi="Garamond"/>
+          <w:sz w:val="22"/>
+          <w:szCs w:val="22"/>
+        </w:rPr>
+        <w:t>outlkiers</w:t>
+      </w:r>
+      <w:proofErr w:type="spellEnd"/>
+      <w:r>
+        <w:rPr>
+          <w:rFonts w:ascii="Garamond" w:hAnsi="Garamond"/>
+          <w:sz w:val="22"/>
+          <w:szCs w:val="22"/>
+        </w:rPr>
+        <w:t xml:space="preserve"> &gt;30% protection in some years. An exception is the </w:t>
+      </w:r>
+      <w:proofErr w:type="spellStart"/>
+      <w:r>
+        <w:rPr>
+          <w:rFonts w:ascii="Garamond" w:hAnsi="Garamond"/>
+          <w:sz w:val="22"/>
+          <w:szCs w:val="22"/>
+        </w:rPr>
+        <w:t>Takotna</w:t>
+      </w:r>
+      <w:proofErr w:type="spellEnd"/>
+      <w:r>
+        <w:rPr>
+          <w:rFonts w:ascii="Garamond" w:hAnsi="Garamond"/>
+          <w:sz w:val="22"/>
+          <w:szCs w:val="22"/>
+        </w:rPr>
+        <w:t xml:space="preserve"> river and Nixon Fork stocks, which received a median protection of only 6.6%. Several stocks which contribute only minimally to the overall run are afforded significant protection. For example, although the East Fork Kuskokwim contributes minimally to the total run</w:t>
       </w:r>
       <w:r>
         <w:rPr>
@@ -5758,14 +6608,41 @@
         </w:rPr>
         <w:t xml:space="preserve">median protection of less than 10%. The stony and </w:t>
       </w:r>
-      <w:r>
-        <w:rPr>
-          <w:rFonts w:ascii="Garamond" w:hAnsi="Garamond"/>
-          <w:sz w:val="22"/>
-          <w:szCs w:val="22"/>
-        </w:rPr>
-        <w:lastRenderedPageBreak/>
-        <w:t xml:space="preserve">Hoholitna River stocks, however, contain outliers of 22.1% and 18.4%, indicating that a front end closure may afford these stocks substantial protection in some years. </w:t>
+      <w:proofErr w:type="spellStart"/>
+      <w:r>
+        <w:rPr>
+          <w:rFonts w:ascii="Garamond" w:hAnsi="Garamond"/>
+          <w:sz w:val="22"/>
+          <w:szCs w:val="22"/>
+        </w:rPr>
+        <w:t>Hoholitna</w:t>
+      </w:r>
+      <w:proofErr w:type="spellEnd"/>
+      <w:r>
+        <w:rPr>
+          <w:rFonts w:ascii="Garamond" w:hAnsi="Garamond"/>
+          <w:sz w:val="22"/>
+          <w:szCs w:val="22"/>
+        </w:rPr>
+        <w:t xml:space="preserve"> River stocks, however, contain outliers of 22.1% and 18.4%, indicating that a </w:t>
+      </w:r>
+      <w:proofErr w:type="gramStart"/>
+      <w:r>
+        <w:rPr>
+          <w:rFonts w:ascii="Garamond" w:hAnsi="Garamond"/>
+          <w:sz w:val="22"/>
+          <w:szCs w:val="22"/>
+        </w:rPr>
+        <w:t>front end</w:t>
+      </w:r>
+      <w:proofErr w:type="gramEnd"/>
+      <w:r>
+        <w:rPr>
+          <w:rFonts w:ascii="Garamond" w:hAnsi="Garamond"/>
+          <w:sz w:val="22"/>
+          <w:szCs w:val="22"/>
+        </w:rPr>
+        <w:t xml:space="preserve"> closure may afford these stocks substantial protection in some years. </w:t>
       </w:r>
     </w:p>
     <w:p>
@@ -5812,6 +6689,7 @@
         </w:rPr>
         <w:t xml:space="preserve">The analysis presented here illustrates the spatiotemporal patterns of Chinook salmon in the Kuskokwim river-basin at a finer spatial scale and over a longer </w:t>
       </w:r>
+      <w:proofErr w:type="gramStart"/>
       <w:r>
         <w:rPr>
           <w:rFonts w:ascii="Garamond" w:hAnsi="Garamond"/>
@@ -5820,6 +6698,7 @@
         </w:rPr>
         <w:t>time period</w:t>
       </w:r>
+      <w:proofErr w:type="gramEnd"/>
       <w:r>
         <w:rPr>
           <w:rFonts w:ascii="Garamond" w:hAnsi="Garamond"/>
@@ -5842,6 +6721,7 @@
           <w:sz w:val="22"/>
           <w:szCs w:val="22"/>
         </w:rPr>
+        <w:lastRenderedPageBreak/>
         <w:t xml:space="preserve">available. In doing so, we corroborated </w:t>
       </w:r>
       <w:r>
@@ -5906,7 +6786,43 @@
           <w:sz w:val="22"/>
           <w:szCs w:val="22"/>
         </w:rPr>
-        <w:t>se results highlight the consistency of this pattern in the Kuskokwim river basin, and has significant implications for management strategy which aims to protect up stream stocks. In our evaluation of the current implemented front-end closure ending on June 11</w:t>
+        <w:t xml:space="preserve">se results highlight the consistency of this pattern in the </w:t>
+      </w:r>
+      <w:proofErr w:type="gramStart"/>
+      <w:r>
+        <w:rPr>
+          <w:rFonts w:ascii="Garamond" w:hAnsi="Garamond"/>
+          <w:sz w:val="22"/>
+          <w:szCs w:val="22"/>
+        </w:rPr>
+        <w:t>Kuskokwim river</w:t>
+      </w:r>
+      <w:proofErr w:type="gramEnd"/>
+      <w:r>
+        <w:rPr>
+          <w:rFonts w:ascii="Garamond" w:hAnsi="Garamond"/>
+          <w:sz w:val="22"/>
+          <w:szCs w:val="22"/>
+        </w:rPr>
+        <w:t xml:space="preserve"> </w:t>
+      </w:r>
+      <w:proofErr w:type="gramStart"/>
+      <w:r>
+        <w:rPr>
+          <w:rFonts w:ascii="Garamond" w:hAnsi="Garamond"/>
+          <w:sz w:val="22"/>
+          <w:szCs w:val="22"/>
+        </w:rPr>
+        <w:t>basin, and</w:t>
+      </w:r>
+      <w:proofErr w:type="gramEnd"/>
+      <w:r>
+        <w:rPr>
+          <w:rFonts w:ascii="Garamond" w:hAnsi="Garamond"/>
+          <w:sz w:val="22"/>
+          <w:szCs w:val="22"/>
+        </w:rPr>
+        <w:t xml:space="preserve"> has significant implications for management strategy which aims to protect up stream stocks. In our evaluation of the current implemented front-end closure ending on June 11</w:t>
       </w:r>
       <w:r>
         <w:rPr>
@@ -6039,16 +6955,7 @@
           <w:sz w:val="22"/>
           <w:szCs w:val="22"/>
         </w:rPr>
-        <w:t xml:space="preserve"> both the amount of protection as well as the number of stocks afforded that protection depend on the interaction </w:t>
-      </w:r>
-      <w:r>
-        <w:rPr>
-          <w:rFonts w:ascii="Garamond" w:hAnsi="Garamond"/>
-          <w:sz w:val="22"/>
-          <w:szCs w:val="22"/>
-        </w:rPr>
-        <w:lastRenderedPageBreak/>
-        <w:t xml:space="preserve">between the run dynamics and the timing of the closure. A more dynamic closure which is flexible based on the timing of the run may provide more consistent protection to upstream stocks. </w:t>
+        <w:t xml:space="preserve"> both the amount of protection as well as the number of stocks afforded that protection depend on the interaction between the run dynamics and the timing of the closure. A more dynamic closure which is flexible based on the timing of the run may provide more consistent protection to upstream stocks. </w:t>
       </w:r>
     </w:p>
     <w:p>
@@ -6092,7 +6999,16 @@
           <w:sz w:val="22"/>
           <w:szCs w:val="22"/>
         </w:rPr>
-        <w:t>The patterns observed in our dataset support both the preliminary understanding of the relationship between return timing and watershed position and the well-established understanding of salmon ecosystem dynamics at annual and sub-annual timescales.</w:t>
+        <w:t xml:space="preserve">The patterns observed in our dataset support both the preliminary understanding of the relationship between return timing and watershed position and the well-established understanding of salmon ecosystem dynamics at annual and sub-annual </w:t>
+      </w:r>
+      <w:r>
+        <w:rPr>
+          <w:rFonts w:ascii="Garamond" w:hAnsi="Garamond"/>
+          <w:sz w:val="22"/>
+          <w:szCs w:val="22"/>
+        </w:rPr>
+        <w:lastRenderedPageBreak/>
+        <w:t>timescales.</w:t>
       </w:r>
       <w:r>
         <w:rPr>
@@ -6164,23 +7080,7 @@
           <w:sz w:val="22"/>
           <w:szCs w:val="22"/>
         </w:rPr>
-        <w:t xml:space="preserve"> </w:t>
-      </w:r>
-      <w:r>
-        <w:rPr>
-          <w:rFonts w:ascii="Garamond" w:hAnsi="Garamond"/>
-          <w:sz w:val="22"/>
-          <w:szCs w:val="22"/>
-        </w:rPr>
-        <w:t>monitoring</w:t>
-      </w:r>
-      <w:r>
-        <w:rPr>
-          <w:rFonts w:ascii="Garamond" w:hAnsi="Garamond"/>
-          <w:sz w:val="22"/>
-          <w:szCs w:val="22"/>
-        </w:rPr>
-        <w:t xml:space="preserve"> programs </w:t>
+        <w:t xml:space="preserve"> monitoring programs </w:t>
       </w:r>
       <w:r>
         <w:rPr>
@@ -6264,7 +7164,6 @@
           <w:sz w:val="22"/>
           <w:szCs w:val="22"/>
         </w:rPr>
-        <w:lastRenderedPageBreak/>
         <w:t>Doing so is essential not only for detecting shifts in ecosystem function but also for developing adaptive strategies that sustain ecosystem services and support long-term resilience in the face of future uncertainty.</w:t>
       </w:r>
     </w:p>
@@ -6400,7 +7299,25 @@
           <w:sz w:val="22"/>
           <w:szCs w:val="22"/>
         </w:rPr>
-        <w:t xml:space="preserve">This has led to the use of front end closure strategy in the Kuskokwim to protect opportunity for upstream comm. And stabilize the fishery by protecting upstream stocks </w:t>
+        <w:t xml:space="preserve">This has led to the use of </w:t>
+      </w:r>
+      <w:proofErr w:type="gramStart"/>
+      <w:r>
+        <w:rPr>
+          <w:rFonts w:ascii="Garamond" w:hAnsi="Garamond"/>
+          <w:sz w:val="22"/>
+          <w:szCs w:val="22"/>
+        </w:rPr>
+        <w:t>front end</w:t>
+      </w:r>
+      <w:proofErr w:type="gramEnd"/>
+      <w:r>
+        <w:rPr>
+          <w:rFonts w:ascii="Garamond" w:hAnsi="Garamond"/>
+          <w:sz w:val="22"/>
+          <w:szCs w:val="22"/>
+        </w:rPr>
+        <w:t xml:space="preserve"> closure strategy in the Kuskokwim to protect opportunity for upstream comm. And stabilize the fishery by protecting upstream stocks </w:t>
       </w:r>
     </w:p>
     <w:p>
@@ -6564,6 +7481,7 @@
           <w:sz w:val="22"/>
           <w:szCs w:val="22"/>
         </w:rPr>
+        <w:lastRenderedPageBreak/>
         <w:t>Chinook salmon populations are experiencing unprecedented declines across much of their range</w:t>
       </w:r>
       <w:r>
@@ -6923,7 +7841,7 @@
           <w:sz w:val="22"/>
           <w:szCs w:val="22"/>
         </w:rPr>
-        <w:instrText xml:space="preserve"> ADDIN ZOTERO_ITEM CSL_CITATION {"citationID":"ZMEsTNxs","properties":{"formattedCitation":"(Luck et al., 2003; Schindler et al., 2015)","plainCitation":"(Luck et al., 2003; Schindler et al., 2015)","noteIndex":0},"citationItems":[{"id":5557,"uris":["http://zotero.org/users/8421274/items/VSKUKCRX"],"itemData":{"id":5557,"type":"article-journal","abstract":"The current rate of biodiversity loss threatens to disrupt greatly the functioning of ecosystems, with potentially significant consequences for humanity. The magnitude of the loss is generally measured with the use of species extinction rates, an approach that understates the severity of the problem and masks some of its most important consequences. Here, we propose a major expansion of this focus to include population diversity: considering changes in the size, number, distribution and genetic composition of populations and the implications of those changes for the functioning of ecosystems and the provision of ecosystem services. We also outline the key components of population diversity and describe a new approach to delineating a population unit that explicitly links it to the services that it provides","container-title":"Trends in Ecology &amp; Evolution","DOI":"10.1016/S0169-5347(03)00100-9","journalAbbreviation":"Trends in Ecology &amp; Evolution","page":"331-336","source":"ResearchGate","title":"Population diversity and ecosystem services","volume":"18","author":[{"family":"Luck","given":"Gary"},{"family":"Daily","given":"Gretchen"},{"family":"Ehrlich","given":"Paul"}],"issued":{"date-parts":[["2003",7,1]]}}},{"id":68,"uris":["http://zotero.org/users/8421274/items/DIRY8NHC"],"itemData":{"id":68,"type":"article-journal","container-title":"Frontiers in Ecology and the Environment","issue":"5","note":"publisher: Wiley Online Library","page":"257–263","source":"Google Scholar","title":"The portfolio concept in ecology and evolution","volume":"13","author":[{"family":"Schindler","given":"Daniel E."},{"family":"Armstrong","given":"Jonathan B."},{"family":"Reed","given":"Thomas E."}],"issued":{"date-parts":[["2015"]]}}}],"schema":"https://github.com/citation-style-language/schema/raw/master/csl-citation.json"} </w:instrText>
+        <w:instrText xml:space="preserve"> ADDIN ZOTERO_ITEM CSL_CITATION {"citationID":"ZNb1zikR","properties":{"formattedCitation":"(Luck et al., 2003; Schindler et al., 2015)","plainCitation":"(Luck et al., 2003; Schindler et al., 2015)","noteIndex":0},"citationItems":[{"id":5557,"uris":["http://zotero.org/users/8421274/items/VSKUKCRX"],"itemData":{"id":5557,"type":"article-journal","abstract":"The current rate of biodiversity loss threatens to disrupt greatly the functioning of ecosystems, with potentially significant consequences for humanity. The magnitude of the loss is generally measured with the use of species extinction rates, an approach that understates the severity of the problem and masks some of its most important consequences. Here, we propose a major expansion of this focus to include population diversity: considering changes in the size, number, distribution and genetic composition of populations and the implications of those changes for the functioning of ecosystems and the provision of ecosystem services. We also outline the key components of population diversity and describe a new approach to delineating a population unit that explicitly links it to the services that it provides","container-title":"Trends in Ecology &amp; Evolution","DOI":"10.1016/S0169-5347(03)00100-9","journalAbbreviation":"Trends in Ecology &amp; Evolution","page":"331-336","source":"ResearchGate","title":"Population diversity and ecosystem services","volume":"18","author":[{"family":"Luck","given":"Gary"},{"family":"Daily","given":"Gretchen"},{"family":"Ehrlich","given":"Paul"}],"issued":{"date-parts":[["2003",7,1]]}}},{"id":68,"uris":["http://zotero.org/users/8421274/items/DIRY8NHC"],"itemData":{"id":68,"type":"article-journal","container-title":"Frontiers in Ecology and the Environment","issue":"5","note":"publisher: Wiley Online Library","page":"257–263","source":"Google Scholar","title":"The portfolio concept in ecology and evolution","volume":"13","author":[{"family":"Schindler","given":"Daniel E."},{"family":"Armstrong","given":"Jonathan B."},{"family":"Reed","given":"Thomas E."}],"issued":{"date-parts":[["2015"]]}}}],"schema":"https://github.com/citation-style-language/schema/raw/master/csl-citation.json"} </w:instrText>
       </w:r>
       <w:r>
         <w:rPr>
@@ -6956,7 +7874,25 @@
           <w:sz w:val="22"/>
           <w:szCs w:val="22"/>
         </w:rPr>
-        <w:t>. In salmon populations, substantial variation in both return timing and spatial distribution of habitat use produces significant complexity in life history strategies within and among populations</w:t>
+        <w:t xml:space="preserve">. In salmon populations, substantial variation in both </w:t>
+      </w:r>
+      <w:proofErr w:type="gramStart"/>
+      <w:r>
+        <w:rPr>
+          <w:rFonts w:ascii="Garamond" w:hAnsi="Garamond"/>
+          <w:sz w:val="22"/>
+          <w:szCs w:val="22"/>
+        </w:rPr>
+        <w:t>return</w:t>
+      </w:r>
+      <w:proofErr w:type="gramEnd"/>
+      <w:r>
+        <w:rPr>
+          <w:rFonts w:ascii="Garamond" w:hAnsi="Garamond"/>
+          <w:sz w:val="22"/>
+          <w:szCs w:val="22"/>
+        </w:rPr>
+        <w:t xml:space="preserve"> timing and spatial distribution of habitat use produces significant complexity in life history strategies within and among populations</w:t>
       </w:r>
       <w:r>
         <w:rPr>
@@ -7053,16 +7989,7 @@
           <w:sz w:val="22"/>
           <w:szCs w:val="22"/>
         </w:rPr>
-        <w:t xml:space="preserve">Weak or negative covariance among these stocks helps buffer the broader population </w:t>
-      </w:r>
-      <w:r>
-        <w:rPr>
-          <w:rFonts w:ascii="Garamond" w:hAnsi="Garamond"/>
-          <w:sz w:val="22"/>
-          <w:szCs w:val="22"/>
-        </w:rPr>
-        <w:lastRenderedPageBreak/>
-        <w:t>against the poor performance of any individual subunit, whose success may fluctuate in response to a dynamic mosaic of multi-dimensional environmental conditions</w:t>
+        <w:t>Weak or negative covariance among these stocks helps buffer the broader population against the poor performance of any individual subunit, whose success may fluctuate in response to a dynamic mosaic of multi-dimensional environmental conditions</w:t>
       </w:r>
       <w:r>
         <w:rPr>
@@ -7196,7 +8123,16 @@
           <w:sz w:val="22"/>
           <w:szCs w:val="22"/>
         </w:rPr>
-        <w:t xml:space="preserve">The reliability of salmon resources to communities is a product of the health of stock components throughout the watershed. For Pacific salmon fisheries, which harvest stocks as the migrate upstream, the duration and reliability of this resource is the result of the aggregate dynamics of upstream stocks. For example, healthy stock components with unique spatiotemporal patterns may allow for more diverse set of harvest opportunities over a longer time period  </w:t>
+        <w:t xml:space="preserve">The reliability of salmon resources to communities is a product of the health of stock components throughout the watershed. For Pacific salmon fisheries, which harvest stocks as the migrate upstream, the </w:t>
+      </w:r>
+      <w:r>
+        <w:rPr>
+          <w:rFonts w:ascii="Garamond" w:hAnsi="Garamond"/>
+          <w:sz w:val="22"/>
+          <w:szCs w:val="22"/>
+        </w:rPr>
+        <w:lastRenderedPageBreak/>
+        <w:t xml:space="preserve">duration and reliability of this resource is the result of the aggregate dynamics of upstream stocks. For example, healthy stock components with unique spatiotemporal patterns may allow for more diverse set of harvest opportunities over a longer time period  </w:t>
       </w:r>
       <w:r>
         <w:rPr>
@@ -7212,7 +8148,7 @@
           <w:sz w:val="22"/>
           <w:szCs w:val="22"/>
         </w:rPr>
-        <w:instrText xml:space="preserve"> ADDIN ZOTERO_ITEM CSL_CITATION {"citationID":"bdM2yxbf","properties":{"formattedCitation":"(Nesbitt &amp; Moore, 2016)","plainCitation":"(Nesbitt &amp; Moore, 2016)","noteIndex":0},"citationItems":[{"id":3361,"uris":["http://zotero.org/users/8421274/items/U6M4JZTI"],"itemData":{"id":3361,"type":"article-journal","abstract":"Indigenous people are considered to be among the most vulnerable to food insecurity and biodiversity loss. Biodiversity is cited as a key component of indigenous food security; however, quantitative examples of this linkage are limited. We examined how species and population diversity influence the food security of indigenous fisheries for Pacific salmon (Oncorhynchus species). We compared two dimensions of food security – catch stability (interannual variability) and access (season length) – across a salmon diversity gradient for 21 fisheries on the Fraser River, Canada, over 30 years, using linear regression models. We used population diversity proxies derived from a range of existing measures because population-specific data were unavailable. While both population and species diversity were generally associated with higher catch stability and temporal access, population diversity had a stronger signal. Fisheries with access to high species diversity had up to 1·4 times more stable catch than predicted by the portfolio effect and up to 1·2 times longer fishing seasons than fisheries with access to fewer species. Fisheries with access to high population diversity had up to 3·8 times more stable catch and three times longer seasons than fisheries with access to fewer populations. Catch stability of Chinook Oncorhynchus tshawytscha and sockeye Oncorhynchus nerka fisheries was best explained by the number of populations and conservation units, respectively, that migrate past a fishery en route to spawning grounds. Similar population diversity metrics were important explanatory variables for season length of sockeye, pink Oncorhynchus gorbuscha, coho Oncorhynchus kisutch and chum Oncorhynchus keta fisheries. Synthesis and applications. We show an empirical example of how multiple scales of biodiversity support food security across a large watershed and suggest that protecting fine-scale salmon diversity will help promote food security for indigenous people. The scales of environmental assessments need to match the scales of the socio-ecological processes that will be affected by development. We illustrate that upstream projects that damage salmon habitat could degrade the food security of downstream indigenous fisheries, with implications to Canadian indigenous people and to watersheds around the world where migratory fishes support local fisheries.","container-title":"Journal of Applied Ecology","DOI":"10.1111/1365-2664.12717","ISSN":"1365-2664","issue":"5","language":"en","note":"_eprint: https://onlinelibrary.wiley.com/doi/pdf/10.1111/1365-2664.12717","page":"1489-1499","source":"Wiley Online Library","title":"Species and population diversity in Pacific salmon fisheries underpin indigenous food security","volume":"53","author":[{"family":"Nesbitt","given":"Holly K."},{"family":"Moore","given":"Jonathan W."}],"issued":{"date-parts":[["2016"]]}}}],"schema":"https://github.com/citation-style-language/schema/raw/master/csl-citation.json"} </w:instrText>
+        <w:instrText xml:space="preserve"> ADDIN ZOTERO_ITEM CSL_CITATION {"citationID":"KCZySFUR","properties":{"formattedCitation":"(Nesbitt &amp; Moore, 2016)","plainCitation":"(Nesbitt &amp; Moore, 2016)","noteIndex":0},"citationItems":[{"id":3361,"uris":["http://zotero.org/users/8421274/items/U6M4JZTI"],"itemData":{"id":3361,"type":"article-journal","abstract":"Indigenous people are considered to be among the most vulnerable to food insecurity and biodiversity loss. Biodiversity is cited as a key component of indigenous food security; however, quantitative examples of this linkage are limited. We examined how species and population diversity influence the food security of indigenous fisheries for Pacific salmon (Oncorhynchus species). We compared two dimensions of food security – catch stability (interannual variability) and access (season length) – across a salmon diversity gradient for 21 fisheries on the Fraser River, Canada, over 30 years, using linear regression models. We used population diversity proxies derived from a range of existing measures because population-specific data were unavailable. While both population and species diversity were generally associated with higher catch stability and temporal access, population diversity had a stronger signal. Fisheries with access to high species diversity had up to 1·4 times more stable catch than predicted by the portfolio effect and up to 1·2 times longer fishing seasons than fisheries with access to fewer species. Fisheries with access to high population diversity had up to 3·8 times more stable catch and three times longer seasons than fisheries with access to fewer populations. Catch stability of Chinook Oncorhynchus tshawytscha and sockeye Oncorhynchus nerka fisheries was best explained by the number of populations and conservation units, respectively, that migrate past a fishery en route to spawning grounds. Similar population diversity metrics were important explanatory variables for season length of sockeye, pink Oncorhynchus gorbuscha, coho Oncorhynchus kisutch and chum Oncorhynchus keta fisheries. Synthesis and applications. We show an empirical example of how multiple scales of biodiversity support food security across a large watershed and suggest that protecting fine-scale salmon diversity will help promote food security for indigenous people. The scales of environmental assessments need to match the scales of the socio-ecological processes that will be affected by development. We illustrate that upstream projects that damage salmon habitat could degrade the food security of downstream indigenous fisheries, with implications to Canadian indigenous people and to watersheds around the world where migratory fishes support local fisheries.","container-title":"Journal of Applied Ecology","DOI":"10.1111/1365-2664.12717","ISSN":"1365-2664","issue":"5","language":"en","note":"_eprint: https://onlinelibrary.wiley.com/doi/pdf/10.1111/1365-2664.12717","page":"1489-1499","source":"Wiley Online Library","title":"Species and population diversity in Pacific salmon fisheries underpin indigenous food security","volume":"53","author":[{"family":"Nesbitt","given":"Holly K."},{"family":"Moore","given":"Jonathan W."}],"issued":{"date-parts":[["2016"]]}}}],"schema":"https://github.com/citation-style-language/schema/raw/master/csl-citation.json"} </w:instrText>
       </w:r>
       <w:r>
         <w:rPr>
@@ -7571,16 +8507,7 @@
           <w:sz w:val="22"/>
           <w:szCs w:val="22"/>
         </w:rPr>
-        <w:t xml:space="preserve"> In practice, however, implementing such stock-specific management approaches </w:t>
-      </w:r>
-      <w:r>
-        <w:rPr>
-          <w:rFonts w:ascii="Garamond" w:hAnsi="Garamond"/>
-          <w:sz w:val="22"/>
-          <w:szCs w:val="22"/>
-        </w:rPr>
-        <w:lastRenderedPageBreak/>
-        <w:t>requires detailed data on the spatiotemporal ecology of salmon populations; information that has historically been limited at sufficiently fine spatial and temporal scales</w:t>
+        <w:t xml:space="preserve"> In practice, however, implementing such stock-specific management approaches requires detailed data on the spatiotemporal ecology of salmon populations; information that has historically been limited at sufficiently fine spatial and temporal scales</w:t>
       </w:r>
       <w:r>
         <w:rPr>
@@ -7646,7 +8573,7 @@
         <w:spacing w:line="480" w:lineRule="auto"/>
         <w:ind w:firstLine="720"/>
         <w:rPr>
-          <w:ins w:id="16" w:author="Benjamin J. Makhlouf" w:date="2025-07-26T14:59:00Z" w16du:dateUtc="2025-07-26T21:59:00Z"/>
+          <w:ins w:id="13" w:author="Benjamin J. Makhlouf" w:date="2025-07-26T14:59:00Z" w16du:dateUtc="2025-07-26T21:59:00Z"/>
           <w:rFonts w:ascii="Garamond" w:hAnsi="Garamond"/>
           <w:sz w:val="22"/>
           <w:szCs w:val="22"/>
@@ -7781,7 +8708,16 @@
           <w:sz w:val="22"/>
           <w:szCs w:val="22"/>
         </w:rPr>
-        <w:t xml:space="preserve">y that heavily restricts fishing during the beginning of the salmon migration season to protect early returning fish </w:t>
+        <w:t xml:space="preserve">y that heavily </w:t>
+      </w:r>
+      <w:r>
+        <w:rPr>
+          <w:rFonts w:ascii="Garamond" w:hAnsi="Garamond"/>
+          <w:sz w:val="22"/>
+          <w:szCs w:val="22"/>
+        </w:rPr>
+        <w:lastRenderedPageBreak/>
+        <w:t xml:space="preserve">restricts fishing during the beginning of the salmon migration season to protect early returning fish </w:t>
       </w:r>
       <w:r>
         <w:rPr>
@@ -7880,7 +8816,7 @@
         </w:rPr>
         <w:t xml:space="preserve"> while allowing for a significant number of fish to return to stocks in the upper portions of the river basin , thereby protecting access to harvest opportunities for upstream communities and bolstering the health of upstream stocks which have a general tendency to migrate early in the season </w:t>
       </w:r>
-      <w:commentRangeStart w:id="17"/>
+      <w:commentRangeStart w:id="14"/>
       <w:r>
         <w:rPr>
           <w:rFonts w:ascii="Garamond" w:hAnsi="Garamond"/>
@@ -7968,12 +8904,12 @@
         </w:rPr>
         <w:fldChar w:fldCharType="end"/>
       </w:r>
-      <w:commentRangeEnd w:id="17"/>
+      <w:commentRangeEnd w:id="14"/>
       <w:r>
         <w:rPr>
           <w:rStyle w:val="CommentReference"/>
         </w:rPr>
-        <w:commentReference w:id="17"/>
+        <w:commentReference w:id="14"/>
       </w:r>
       <w:r>
         <w:rPr>
@@ -8134,6 +9070,71 @@
           <w:szCs w:val="22"/>
         </w:rPr>
       </w:pPr>
+      <w:r>
+        <w:rPr>
+          <w:rFonts w:ascii="Garamond" w:hAnsi="Garamond"/>
+          <w:sz w:val="22"/>
+          <w:szCs w:val="22"/>
+        </w:rPr>
+        <w:t>mixed species fisheries, where harvesting productive species often risks over-exploitation of non-target co-occurring species of concern</w:t>
+      </w:r>
+      <w:r>
+        <w:rPr>
+          <w:rFonts w:ascii="Garamond" w:hAnsi="Garamond"/>
+          <w:sz w:val="22"/>
+          <w:szCs w:val="22"/>
+        </w:rPr>
+        <w:t xml:space="preserve"> </w:t>
+      </w:r>
+      <w:r>
+        <w:rPr>
+          <w:rFonts w:ascii="Garamond" w:hAnsi="Garamond"/>
+          <w:sz w:val="22"/>
+          <w:szCs w:val="22"/>
+        </w:rPr>
+        <w:fldChar w:fldCharType="begin"/>
+      </w:r>
+      <w:r>
+        <w:rPr>
+          <w:rFonts w:ascii="Garamond" w:hAnsi="Garamond"/>
+          <w:sz w:val="22"/>
+          <w:szCs w:val="22"/>
+        </w:rPr>
+        <w:instrText xml:space="preserve"> ADDIN ZOTERO_ITEM CSL_CITATION {"citationID":"KOBsKOeR","properties":{"formattedCitation":"(Hilborn et al., 2021; Law &amp; Plank, 2023; Tromeur &amp; Doyen, 2019)","plainCitation":"(Hilborn et al., 2021; Law &amp; Plank, 2023; Tromeur &amp; Doyen, 2019)","noteIndex":0},"citationItems":[{"id":5574,"uris":["http://zotero.org/users/8421274/items/SW25XXJK"],"itemData":{"id":5574,"type":"article-journal","abstract":"While fisheries provide food and employment for hundreds of millions of people, they also can have significant impact on biodiversity. We explore the potential of area-based fisheries management to simultaneously maintain biodiversity and high levels of sustainable food production. We used two illustrative examples of fisheries that have different gear types, areas, and species to evaluate the trade-off between biodiversity and harvest. We calculate the optimal effort by gear and area that maximizes a weighted objective function of biodiversity and harvest, ranging from 100% of the weight on harvest to 100% on biodiversity. We found for both case studies that the trade-off was highly convex, with win–win solutions allowing for high levels of both fishery harvest and conservation. This is achieved by reducing or eliminating fishing effort that negatively impacts high conservation value species while maintaining fishing effort with gears and in areas where there is low conservation impact. We suggest that, in most fisheries, such situations can be found and that effective area-based management can provide for high levels of biodiversity protection and food production.","container-title":"ICES Journal of Marine Science","DOI":"10.1093/icesjms/fsaa139","ISSN":"1054-3139","issue":"6","journalAbbreviation":"ICES Journal of Marine Science","page":"2271-2279","source":"Silverchair","title":"The trade-off between biodiversity and sustainable fish harvest with area-based management","volume":"78","author":[{"family":"Hilborn","given":"Ray"},{"family":"Akselrud","given":"Caitlin Allen"},{"family":"Peterson","given":"Henry"},{"family":"Whitehouse","given":"George A"}],"issued":{"date-parts":[["2021",9,1]]}}},{"id":5577,"uris":["http://zotero.org/users/8421274/items/LTS3DXJE"],"itemData":{"id":5577,"type":"article-journal","abstract":"Fisheries are damaging and seemingly incompatible with the conservation of marine ecosystems. Yet fish are an important source of food and support the lives of many people in coastal communities. This paper considers an idea that a moderate intensity of fishing, appropriately scaled across species, could help in maintaining biodiversity, rather than reducing it. The scaling comes from an intuition that rates of fishing mortality of species should be kept in line with production rates of the species, a notion known as balanced harvesting. This places species conservation and exploitation on an equal footing in a single equation, showing quantitatively the relative levels of fishing mortality that species of different abundance can support. Using a dynamic model of a marine ecosystem, we give numerical evidence showing for the first time that fishing, if scaled in this way, can protect rarer species, while allowing some exploitation of species with greater production. This works because fishing mortality rates, when scaled by production, are density-dependent. Such fishing, operating adaptively to follow species' production rates over time, contains a feedback that would help to protect species from overfishing in the presence of uncertainty about how marine ecosystems work.","container-title":"Fish and Fisheries","DOI":"10.1111/faf.12705","ISSN":"1467-2979","issue":"1","language":"en","license":"© 2022 John Wiley &amp; Sons Ltd.","note":"_eprint: https://onlinelibrary.wiley.com/doi/pdf/10.1111/faf.12705","page":"21-39","source":"Wiley Online Library","title":"Fishing for biodiversity by balanced harvesting","volume":"24","author":[{"family":"Law","given":"Richard"},{"family":"Plank","given":"Michael J."}],"issued":{"date-parts":[["2023"]]}}},{"id":5580,"uris":["http://zotero.org/users/8421274/items/TFTCNP4B"],"itemData":{"id":5580,"type":"article-journal","abstract":"As marine ecosystems are under pressure worldwide, many scientists and stakeholders advocate the use of ecosystem-based approaches for fishery management. In particular, management policies are expected to account for the multispecies nature of fisheries. However, numerous fisheries management plans remain based on single-species concepts, such as maximum sustainable yield (MSY) and maximum economic yield (MEY), that respectively aim at maximizing catches or profits of single species or stocks. In this study, we assess the bioeconomic sustainability of multispecies MSY and MEY in a mixed fishery, characterized by technical interactions and therefore joint production. First, we analytically show how multispecies MSY and MEY can induce overharvesting and extinction of species with low productivity and low value. Second, we identify and discuss incentives on effort costs and landing prices, as well as technical regulations, that could promote biodiversity conservation and more globally sustainability. Finally, a numerical example based on the coastal fishery in French Guiana illustrates the analytical findings.","container-title":"Environmental Modeling &amp; Assessment","DOI":"10.1007/s10666-018-9618-2","ISSN":"1573-2967","issue":"4","journalAbbreviation":"Environ Model Assess","language":"en","license":"2018 Springer International Publishing AG, part of Springer Nature","note":"Company: Springer\nDistributor: Springer\nInstitution: Springer\nLabel: Springer\nnumber: 4\npublisher: Springer International Publishing","page":"387-403","source":"link-springer-com.offcampus.lib.washington.edu","title":"Optimal Harvesting Policies Threaten Biodiversity in Mixed Fisheries","volume":"24","author":[{"family":"Tromeur","given":"Eric"},{"family":"Doyen","given":"Luc"}],"issued":{"date-parts":[["2019",8,1]]}}}],"schema":"https://github.com/citation-style-language/schema/raw/master/csl-citation.json"} </w:instrText>
+      </w:r>
+      <w:r>
+        <w:rPr>
+          <w:rFonts w:ascii="Garamond" w:hAnsi="Garamond"/>
+          <w:sz w:val="22"/>
+          <w:szCs w:val="22"/>
+        </w:rPr>
+        <w:fldChar w:fldCharType="separate"/>
+      </w:r>
+      <w:r>
+        <w:rPr>
+          <w:rFonts w:ascii="Garamond" w:hAnsi="Garamond"/>
+          <w:noProof/>
+          <w:sz w:val="22"/>
+          <w:szCs w:val="22"/>
+        </w:rPr>
+        <w:t>(Hilborn et al., 2021; Law &amp; Plank, 2023; Tromeur &amp; Doyen, 2019)</w:t>
+      </w:r>
+      <w:r>
+        <w:rPr>
+          <w:rFonts w:ascii="Garamond" w:hAnsi="Garamond"/>
+          <w:sz w:val="22"/>
+          <w:szCs w:val="22"/>
+        </w:rPr>
+        <w:fldChar w:fldCharType="end"/>
+      </w:r>
+      <w:r>
+        <w:rPr>
+          <w:rFonts w:ascii="Garamond" w:hAnsi="Garamond"/>
+          <w:sz w:val="22"/>
+          <w:szCs w:val="22"/>
+        </w:rPr>
+        <w:t>.</w:t>
+      </w:r>
     </w:p>
     <w:p>
       <w:pPr>
@@ -8207,7 +9208,7 @@
       </w:r>
     </w:p>
   </w:comment>
-  <w:comment w:id="10" w:author="Benjamin J. Makhlouf" w:date="2025-07-28T07:41:00Z" w:initials="BM">
+  <w:comment w:id="7" w:author="Benjamin J. Makhlouf" w:date="2025-07-28T07:41:00Z" w:initials="BM">
     <w:p>
       <w:r>
         <w:rPr>
@@ -8224,7 +9225,7 @@
       </w:r>
     </w:p>
   </w:comment>
-  <w:comment w:id="11" w:author="Benjamin J. Makhlouf" w:date="2025-07-28T07:42:00Z" w:initials="BM">
+  <w:comment w:id="8" w:author="Benjamin J. Makhlouf" w:date="2025-07-28T07:42:00Z" w:initials="BM">
     <w:p>
       <w:pPr>
         <w:pStyle w:val="CommentText"/>
@@ -8240,7 +9241,7 @@
       </w:r>
     </w:p>
   </w:comment>
-  <w:comment w:id="12" w:author="Benjamin J. Makhlouf" w:date="2025-07-30T08:26:00Z" w:initials="b">
+  <w:comment w:id="9" w:author="Benjamin J. Makhlouf" w:date="2025-07-30T08:26:00Z" w:initials="b">
     <w:p>
       <w:r>
         <w:rPr>
@@ -8257,7 +9258,7 @@
       </w:r>
     </w:p>
   </w:comment>
-  <w:comment w:id="14" w:author="Benjamin J. Makhlouf" w:date="2025-07-30T10:53:00Z" w:initials="b">
+  <w:comment w:id="11" w:author="Benjamin J. Makhlouf" w:date="2025-07-30T10:53:00Z" w:initials="b">
     <w:p>
       <w:r>
         <w:rPr>
@@ -8274,7 +9275,7 @@
       </w:r>
     </w:p>
   </w:comment>
-  <w:comment w:id="17" w:author="Daniel Schindler" w:date="2025-06-27T11:54:00Z" w:initials="DS">
+  <w:comment w:id="14" w:author="Daniel Schindler" w:date="2025-06-27T11:54:00Z" w:initials="DS">
     <w:p>
       <w:pPr>
         <w:pStyle w:val="CommentText"/>
@@ -10045,6 +11046,7 @@
   <w:style w:type="character" w:default="1" w:styleId="DefaultParagraphFont">
     <w:name w:val="Default Paragraph Font"/>
     <w:uiPriority w:val="1"/>
+    <w:semiHidden/>
     <w:unhideWhenUsed/>
   </w:style>
   <w:style w:type="table" w:default="1" w:styleId="TableNormal">

</xml_diff>

<commit_message>
worked through intro again, halfway through new discussion
</commit_message>
<xml_diff>
--- a/Docs/Run_timing_manuscript.docx
+++ b/Docs/Run_timing_manuscript.docx
@@ -196,15 +196,7 @@
           <w:sz w:val="22"/>
           <w:szCs w:val="22"/>
         </w:rPr>
-        <w:t xml:space="preserve"> challenge in fisheries management is balancing the dual goals of maximizing harvest opportunities and preserving biodiversity</w:t>
-      </w:r>
-      <w:r>
-        <w:rPr>
-          <w:rFonts w:ascii="Garamond" w:hAnsi="Garamond"/>
-          <w:sz w:val="22"/>
-          <w:szCs w:val="22"/>
-        </w:rPr>
-        <w:t>.</w:t>
+        <w:t xml:space="preserve"> challenge in fisheries management is balancing the dual goals of maximizing harvest opportunities and preserving biodiversity.</w:t>
       </w:r>
       <w:r>
         <w:rPr>
@@ -236,23 +228,7 @@
           <w:sz w:val="22"/>
           <w:szCs w:val="22"/>
         </w:rPr>
-        <w:t>but also by the diversity among populations</w:t>
-      </w:r>
-      <w:r>
-        <w:rPr>
-          <w:rFonts w:ascii="Garamond" w:hAnsi="Garamond"/>
-          <w:sz w:val="22"/>
-          <w:szCs w:val="22"/>
-        </w:rPr>
-        <w:t xml:space="preserve"> </w:t>
-      </w:r>
-      <w:r>
-        <w:rPr>
-          <w:rFonts w:ascii="Garamond" w:hAnsi="Garamond"/>
-          <w:sz w:val="22"/>
-          <w:szCs w:val="22"/>
-        </w:rPr>
-        <w:t>within a single species</w:t>
+        <w:t>but also by the diversity among populations within a single species</w:t>
       </w:r>
       <w:r>
         <w:rPr>
@@ -598,15 +574,7 @@
           <w:sz w:val="22"/>
           <w:szCs w:val="22"/>
         </w:rPr>
-        <w:t xml:space="preserve">Salmon populations exhibit significant diversity in run timing and spatial distribution of habitat use. During upstream migration, returning adults comprise multiple spatial stocks with distinct abundance and run timing that co-migrate within overlapping temporal windows. </w:t>
-      </w:r>
-      <w:r>
-        <w:rPr>
-          <w:rFonts w:ascii="Garamond" w:hAnsi="Garamond"/>
-          <w:sz w:val="22"/>
-          <w:szCs w:val="22"/>
-        </w:rPr>
-        <w:t xml:space="preserve">The reliability of downstream fisheries is the result of the aggregate dynamics of these upstream stocks. </w:t>
+        <w:t xml:space="preserve">Salmon populations exhibit significant diversity in run timing and spatial distribution of habitat use. During upstream migration, returning adults comprise multiple spatial stocks with distinct abundance and run timing that co-migrate within overlapping temporal windows. The reliability of downstream fisheries is the result of the aggregate dynamics of these upstream stocks. </w:t>
       </w:r>
       <w:r>
         <w:rPr>
@@ -685,23 +653,7 @@
           <w:sz w:val="22"/>
           <w:szCs w:val="22"/>
         </w:rPr>
-        <w:t xml:space="preserve">In the </w:t>
-      </w:r>
-      <w:r>
-        <w:rPr>
-          <w:rFonts w:ascii="Garamond" w:hAnsi="Garamond"/>
-          <w:sz w:val="22"/>
-          <w:szCs w:val="22"/>
-        </w:rPr>
-        <w:t>Kuskokwim River</w:t>
-      </w:r>
-      <w:r>
-        <w:rPr>
-          <w:rFonts w:ascii="Garamond" w:hAnsi="Garamond"/>
-          <w:sz w:val="22"/>
-          <w:szCs w:val="22"/>
-        </w:rPr>
-        <w:t xml:space="preserve"> basin, a large</w:t>
+        <w:t>In the Kuskokwim River basin, a large</w:t>
       </w:r>
       <w:r>
         <w:rPr>
@@ -717,31 +669,7 @@
           <w:sz w:val="22"/>
           <w:szCs w:val="22"/>
         </w:rPr>
-        <w:t xml:space="preserve"> free flowing </w:t>
-      </w:r>
-      <w:r>
-        <w:rPr>
-          <w:rFonts w:ascii="Garamond" w:hAnsi="Garamond"/>
-          <w:sz w:val="22"/>
-          <w:szCs w:val="22"/>
-        </w:rPr>
-        <w:t>watershed</w:t>
-      </w:r>
-      <w:r>
-        <w:rPr>
-          <w:rFonts w:ascii="Garamond" w:hAnsi="Garamond"/>
-          <w:sz w:val="22"/>
-          <w:szCs w:val="22"/>
-        </w:rPr>
-        <w:t xml:space="preserve"> in Western Alaska, </w:t>
-      </w:r>
-      <w:r>
-        <w:rPr>
-          <w:rFonts w:ascii="Garamond" w:hAnsi="Garamond"/>
-          <w:sz w:val="22"/>
-          <w:szCs w:val="22"/>
-        </w:rPr>
-        <w:t>Chinook salmon populations support subsistence fishing opportunities for dozens of communities in the region</w:t>
+        <w:t xml:space="preserve"> free flowing watershed in Western Alaska, Chinook salmon populations support subsistence fishing opportunities for dozens of communities in the region</w:t>
       </w:r>
       <w:r>
         <w:rPr>
@@ -799,15 +727,7 @@
           <w:sz w:val="22"/>
           <w:szCs w:val="22"/>
         </w:rPr>
-        <w:t>)</w:t>
-      </w:r>
-      <w:r>
-        <w:rPr>
-          <w:rFonts w:ascii="Garamond" w:hAnsi="Garamond"/>
-          <w:sz w:val="22"/>
-          <w:szCs w:val="22"/>
-        </w:rPr>
-        <w:t xml:space="preserve">. </w:t>
+        <w:t xml:space="preserve">). </w:t>
       </w:r>
       <w:r>
         <w:rPr>
@@ -972,16 +892,14 @@
         </w:rPr>
         <w:t xml:space="preserve">As a result, resource managers are faced with the difficult task of designing management strategies that allow for harvest opportunities while rebuilding stocks and </w:t>
       </w:r>
-      <w:proofErr w:type="spellStart"/>
-      <w:r>
-        <w:rPr>
-          <w:rFonts w:ascii="Garamond" w:hAnsi="Garamond"/>
-          <w:sz w:val="22"/>
-          <w:szCs w:val="22"/>
-        </w:rPr>
-        <w:t>enchancing</w:t>
-      </w:r>
-      <w:proofErr w:type="spellEnd"/>
+      <w:r>
+        <w:rPr>
+          <w:rFonts w:ascii="Garamond" w:hAnsi="Garamond"/>
+          <w:sz w:val="22"/>
+          <w:szCs w:val="22"/>
+        </w:rPr>
+        <w:t>enhancing</w:t>
+      </w:r>
       <w:r>
         <w:rPr>
           <w:rFonts w:ascii="Garamond" w:hAnsi="Garamond"/>
@@ -990,16 +908,14 @@
         </w:rPr>
         <w:t xml:space="preserve"> ecosystem </w:t>
       </w:r>
-      <w:proofErr w:type="spellStart"/>
-      <w:r>
-        <w:rPr>
-          <w:rFonts w:ascii="Garamond" w:hAnsi="Garamond"/>
-          <w:sz w:val="22"/>
-          <w:szCs w:val="22"/>
-        </w:rPr>
-        <w:t>resilliance</w:t>
-      </w:r>
-      <w:proofErr w:type="spellEnd"/>
+      <w:r>
+        <w:rPr>
+          <w:rFonts w:ascii="Garamond" w:hAnsi="Garamond"/>
+          <w:sz w:val="22"/>
+          <w:szCs w:val="22"/>
+        </w:rPr>
+        <w:t>resilience</w:t>
+      </w:r>
       <w:r>
         <w:rPr>
           <w:rFonts w:ascii="Garamond" w:hAnsi="Garamond"/>
@@ -1138,15 +1054,7 @@
           <w:sz w:val="22"/>
           <w:szCs w:val="22"/>
         </w:rPr>
-        <w:t xml:space="preserve"> while allowing for a significant number of fish to return to stocks in the upper portions of the river basin, thereby protecting access to harvest opportunities for upstream communities and bolstering the health of upstream stocks</w:t>
-      </w:r>
-      <w:r>
-        <w:rPr>
-          <w:rFonts w:ascii="Garamond" w:hAnsi="Garamond"/>
-          <w:sz w:val="22"/>
-          <w:szCs w:val="22"/>
-        </w:rPr>
-        <w:t xml:space="preserve">. </w:t>
+        <w:t xml:space="preserve"> while allowing for a significant number of fish to return to stocks in the upper portions of the river basin, thereby protecting access to harvest opportunities for upstream communities and bolstering the health of upstream stocks. </w:t>
       </w:r>
       <w:r>
         <w:rPr>
@@ -1354,16 +1262,6 @@
         </w:rPr>
         <w:t>on stocks across these systems.</w:t>
       </w:r>
-    </w:p>
-    <w:p>
-      <w:pPr>
-        <w:spacing w:line="480" w:lineRule="auto"/>
-        <w:rPr>
-          <w:rFonts w:ascii="Garamond" w:hAnsi="Garamond"/>
-          <w:sz w:val="22"/>
-          <w:szCs w:val="22"/>
-        </w:rPr>
-      </w:pPr>
     </w:p>
     <w:p>
       <w:pPr>
@@ -1384,6 +1282,7 @@
           <w:sz w:val="32"/>
           <w:szCs w:val="32"/>
         </w:rPr>
+        <w:lastRenderedPageBreak/>
         <w:t xml:space="preserve">Methods: </w:t>
       </w:r>
     </w:p>
@@ -2324,7 +2223,27 @@
           <w:szCs w:val="22"/>
           <w14:ligatures w14:val="none"/>
         </w:rPr>
-        <w:t>morphological features of the otolith visible among the ablation path</w:t>
+        <w:t>morphological features of the otolith visible a</w:t>
+      </w:r>
+      <w:r>
+        <w:rPr>
+          <w:rFonts w:ascii="Garamond" w:eastAsia="Times New Roman" w:hAnsi="Garamond" w:cs="Times New Roman"/>
+          <w:kern w:val="0"/>
+          <w:sz w:val="22"/>
+          <w:szCs w:val="22"/>
+          <w14:ligatures w14:val="none"/>
+        </w:rPr>
+        <w:t>long</w:t>
+      </w:r>
+      <w:r>
+        <w:rPr>
+          <w:rFonts w:ascii="Garamond" w:eastAsia="Times New Roman" w:hAnsi="Garamond" w:cs="Times New Roman"/>
+          <w:kern w:val="0"/>
+          <w:sz w:val="22"/>
+          <w:szCs w:val="22"/>
+          <w14:ligatures w14:val="none"/>
+        </w:rPr>
+        <w:t xml:space="preserve"> the ablation path</w:t>
       </w:r>
       <w:r>
         <w:rPr>
@@ -2402,17 +2321,31 @@
     </w:p>
     <w:p>
       <w:pPr>
-        <w:spacing w:before="100" w:beforeAutospacing="1" w:after="100" w:afterAutospacing="1" w:line="480" w:lineRule="auto"/>
-        <w:rPr>
-          <w:rFonts w:ascii="Garamond" w:eastAsia="Times New Roman" w:hAnsi="Garamond" w:cs="Times New Roman"/>
-          <w:kern w:val="0"/>
-          <w:sz w:val="22"/>
-          <w:szCs w:val="22"/>
-          <w14:ligatures w14:val="none"/>
-        </w:rPr>
-      </w:pPr>
-      <w:proofErr w:type="spellStart"/>
-      <w:r>
+        <w:spacing w:line="480" w:lineRule="auto"/>
+        <w:rPr>
+          <w:rFonts w:ascii="Garamond" w:eastAsia="Times New Roman" w:hAnsi="Garamond" w:cs="Times New Roman"/>
+          <w:kern w:val="0"/>
+          <w:sz w:val="22"/>
+          <w:szCs w:val="22"/>
+          <w14:ligatures w14:val="none"/>
+        </w:rPr>
+      </w:pPr>
+    </w:p>
+    <w:p>
+      <w:pPr>
+        <w:spacing w:line="480" w:lineRule="auto"/>
+        <w:rPr>
+          <w:rFonts w:ascii="Garamond" w:eastAsia="Times New Roman" w:hAnsi="Garamond" w:cs="Times New Roman"/>
+          <w:kern w:val="0"/>
+          <w:sz w:val="22"/>
+          <w:szCs w:val="22"/>
+          <w14:ligatures w14:val="none"/>
+        </w:rPr>
+      </w:pPr>
+    </w:p>
+    <w:p>
+      <w:pPr>
+        <w:spacing w:line="480" w:lineRule="auto"/>
         <w:rPr>
           <w:rFonts w:ascii="Garamond" w:eastAsia="Times New Roman" w:hAnsi="Garamond" w:cs="Times New Roman"/>
           <w:b/>
@@ -2422,9 +2355,7 @@
           <w:szCs w:val="22"/>
           <w14:ligatures w14:val="none"/>
         </w:rPr>
-        <w:t>Isoscape</w:t>
-      </w:r>
-      <w:proofErr w:type="spellEnd"/>
+      </w:pPr>
       <w:r>
         <w:rPr>
           <w:rFonts w:ascii="Garamond" w:eastAsia="Times New Roman" w:hAnsi="Garamond" w:cs="Times New Roman"/>
@@ -2435,7 +2366,8 @@
           <w:szCs w:val="22"/>
           <w14:ligatures w14:val="none"/>
         </w:rPr>
-        <w:t xml:space="preserve"> Development</w:t>
+        <w:lastRenderedPageBreak/>
+        <w:t xml:space="preserve">Natal Origin Estimation </w:t>
       </w:r>
     </w:p>
     <w:p>
@@ -2456,9 +2388,20 @@
           <w:szCs w:val="22"/>
           <w14:ligatures w14:val="none"/>
         </w:rPr>
-        <w:lastRenderedPageBreak/>
-        <w:t>We used an</w:t>
-      </w:r>
+        <w:t xml:space="preserve">A Strontium </w:t>
+      </w:r>
+      <w:proofErr w:type="spellStart"/>
+      <w:r>
+        <w:rPr>
+          <w:rFonts w:ascii="Garamond" w:eastAsia="Times New Roman" w:hAnsi="Garamond" w:cs="Times New Roman"/>
+          <w:kern w:val="0"/>
+          <w:sz w:val="22"/>
+          <w:szCs w:val="22"/>
+          <w14:ligatures w14:val="none"/>
+        </w:rPr>
+        <w:t>isoscape</w:t>
+      </w:r>
+      <w:proofErr w:type="spellEnd"/>
       <w:r>
         <w:rPr>
           <w:rFonts w:ascii="Garamond" w:eastAsia="Times New Roman" w:hAnsi="Garamond" w:cs="Times New Roman"/>
@@ -2469,27 +2412,15 @@
         </w:rPr>
         <w:t xml:space="preserve"> </w:t>
       </w:r>
-      <w:proofErr w:type="spellStart"/>
-      <w:r>
-        <w:rPr>
-          <w:rFonts w:ascii="Garamond" w:eastAsia="Times New Roman" w:hAnsi="Garamond" w:cs="Times New Roman"/>
-          <w:kern w:val="0"/>
-          <w:sz w:val="22"/>
-          <w:szCs w:val="22"/>
-          <w14:ligatures w14:val="none"/>
-        </w:rPr>
-        <w:t>isoscape</w:t>
-      </w:r>
-      <w:proofErr w:type="spellEnd"/>
-      <w:r>
-        <w:rPr>
-          <w:rFonts w:ascii="Garamond" w:eastAsia="Times New Roman" w:hAnsi="Garamond" w:cs="Times New Roman"/>
-          <w:kern w:val="0"/>
-          <w:sz w:val="22"/>
-          <w:szCs w:val="22"/>
-          <w14:ligatures w14:val="none"/>
-        </w:rPr>
-        <w:t xml:space="preserve"> of the Kuskokwim river </w:t>
+      <w:r>
+        <w:rPr>
+          <w:rFonts w:ascii="Garamond" w:eastAsia="Times New Roman" w:hAnsi="Garamond" w:cs="Times New Roman"/>
+          <w:kern w:val="0"/>
+          <w:sz w:val="22"/>
+          <w:szCs w:val="22"/>
+          <w14:ligatures w14:val="none"/>
+        </w:rPr>
+        <w:t xml:space="preserve">of the Kuskokwim river </w:t>
       </w:r>
       <w:r>
         <w:rPr>
@@ -2509,88 +2440,7 @@
           <w:szCs w:val="22"/>
           <w14:ligatures w14:val="none"/>
         </w:rPr>
-        <w:t>constructed</w:t>
-      </w:r>
-      <w:r>
-        <w:rPr>
-          <w:rFonts w:ascii="Garamond" w:eastAsia="Times New Roman" w:hAnsi="Garamond" w:cs="Times New Roman"/>
-          <w:kern w:val="0"/>
-          <w:sz w:val="22"/>
-          <w:szCs w:val="22"/>
-          <w14:ligatures w14:val="none"/>
-        </w:rPr>
-        <w:t xml:space="preserve"> </w:t>
-      </w:r>
-      <w:r>
-        <w:rPr>
-          <w:rFonts w:ascii="Garamond" w:eastAsia="Times New Roman" w:hAnsi="Garamond" w:cs="Times New Roman"/>
-          <w:kern w:val="0"/>
-          <w:sz w:val="22"/>
-          <w:szCs w:val="22"/>
-          <w14:ligatures w14:val="none"/>
-        </w:rPr>
-        <w:t xml:space="preserve">by </w:t>
-      </w:r>
-      <w:r>
-        <w:rPr>
-          <w:rFonts w:ascii="Garamond" w:eastAsia="Times New Roman" w:hAnsi="Garamond" w:cs="Times New Roman"/>
-          <w:kern w:val="0"/>
-          <w:sz w:val="22"/>
-          <w:szCs w:val="22"/>
-          <w14:ligatures w14:val="none"/>
-        </w:rPr>
-        <w:fldChar w:fldCharType="begin"/>
-      </w:r>
-      <w:r>
-        <w:rPr>
-          <w:rFonts w:ascii="Garamond" w:eastAsia="Times New Roman" w:hAnsi="Garamond" w:cs="Times New Roman"/>
-          <w:kern w:val="0"/>
-          <w:sz w:val="22"/>
-          <w:szCs w:val="22"/>
-          <w14:ligatures w14:val="none"/>
-        </w:rPr>
-        <w:instrText xml:space="preserve"> ADDIN ZOTERO_ITEM CSL_CITATION {"citationID":"W38QgOZ8","properties":{"formattedCitation":"(French et al., 2020)","plainCitation":"(French et al., 2020)","noteIndex":0},"citationItems":[{"id":1684,"uris":["http://zotero.org/users/8421274/items/M654PKRJ"],"itemData":{"id":1684,"type":"article-journal","abstract":"Riverine chemistry reflects both watershed conditions and instream processing, both of which vary across river networks, yet little is known about the scales at which watershed attributes regulate biogeochemical constituents. We used spatial stream network (SSN) models to quantify both watershed and instream effects on streamwater constituents in the Kuskokwim River (western Alaska), the largest free-flowing river in the United States. We assessed chemical constituents spanning from labile nutrients (nitrate [NO3−] and orthophosphate [PO43−]) to biologically and chemically conservative tracers (calcium [Ca2+], strontium [Sr2+], and Sr isotopes [87Sr/86Sr]). We also examined the behavior of dissolved organic carbon (DOC) relative to these constituents to understand whether bulk DOC behaved conservatively in a large boreal river network, where future changes in DOC and nutrient loading are expected under a shifting climate. We derived watershed spatial covariates comprising land cover, geology, and geomorphic characteristics at 14 different spatial extents based on stream order and relative to position in the river network to understand the effect of distant and proximal watershed attributes on streamwater constituents. For all constituents but 87Sr/86Sr, watershed attributes in low-order headwater catchments yielded the best predictive ability for streamwater constituent concentrations across the entire network. Spatial patterning for conservative tracers and bulk DOC showed strong spatial autocorrelation, whereas PO43− and NO3− exhibited spatial patchiness indicative of instream processing. Our work shows that headwater streams are disproportionately important contributors to network-wide biogeochemical constituents supporting aquatic food webs and that conservation and management of aquatic systems should include these small and often remote watershed areas.","container-title":"Journal of Geophysical Research: Biogeosciences","DOI":"10.1029/2020JG005851","ISSN":"2169-8961","issue":"12","language":"en","note":"_eprint: https://agupubs.onlinelibrary.wiley.com/doi/pdf/10.1029/2020JG005851","page":"e2020JG005851","source":"Wiley Online Library","title":"Headwater Catchments Govern Biogeochemistry in America's Largest Free-Flowing River Network","volume":"125","author":[{"family":"French","given":"David W."},{"family":"Schindler","given":"Daniel E."},{"family":"Brennan","given":"Sean R."},{"family":"Whited","given":"Diane"}],"issued":{"date-parts":[["2020"]]}}}],"schema":"https://github.com/citation-style-language/schema/raw/master/csl-citation.json"} </w:instrText>
-      </w:r>
-      <w:r>
-        <w:rPr>
-          <w:rFonts w:ascii="Garamond" w:eastAsia="Times New Roman" w:hAnsi="Garamond" w:cs="Times New Roman"/>
-          <w:kern w:val="0"/>
-          <w:sz w:val="22"/>
-          <w:szCs w:val="22"/>
-          <w14:ligatures w14:val="none"/>
-        </w:rPr>
-        <w:fldChar w:fldCharType="separate"/>
-      </w:r>
-      <w:r>
-        <w:rPr>
-          <w:rFonts w:ascii="Garamond" w:eastAsia="Times New Roman" w:hAnsi="Garamond" w:cs="Times New Roman"/>
-          <w:noProof/>
-          <w:kern w:val="0"/>
-          <w:sz w:val="22"/>
-          <w:szCs w:val="22"/>
-          <w14:ligatures w14:val="none"/>
-        </w:rPr>
-        <w:t>(French et al., 2020)</w:t>
-      </w:r>
-      <w:r>
-        <w:rPr>
-          <w:rFonts w:ascii="Garamond" w:eastAsia="Times New Roman" w:hAnsi="Garamond" w:cs="Times New Roman"/>
-          <w:kern w:val="0"/>
-          <w:sz w:val="22"/>
-          <w:szCs w:val="22"/>
-          <w14:ligatures w14:val="none"/>
-        </w:rPr>
-        <w:fldChar w:fldCharType="end"/>
-      </w:r>
-      <w:r>
-        <w:rPr>
-          <w:rFonts w:ascii="Garamond" w:eastAsia="Times New Roman" w:hAnsi="Garamond" w:cs="Times New Roman"/>
-          <w:kern w:val="0"/>
-          <w:sz w:val="22"/>
-          <w:szCs w:val="22"/>
-          <w14:ligatures w14:val="none"/>
-        </w:rPr>
-        <w:t xml:space="preserve"> </w:t>
+        <w:t>was constructed by French et al., 2020</w:t>
       </w:r>
       <w:r>
         <w:rPr>
@@ -2763,7 +2613,29 @@
           <w:szCs w:val="22"/>
           <w14:ligatures w14:val="none"/>
         </w:rPr>
-        <w:t>(French et al., 2020)</w:t>
+        <w:t>(French et al., 2020</w:t>
+      </w:r>
+      <w:r>
+        <w:rPr>
+          <w:rFonts w:ascii="Garamond" w:eastAsia="Times New Roman" w:hAnsi="Garamond" w:cs="Times New Roman"/>
+          <w:noProof/>
+          <w:kern w:val="0"/>
+          <w:sz w:val="22"/>
+          <w:szCs w:val="22"/>
+          <w14:ligatures w14:val="none"/>
+        </w:rPr>
+        <w:t>, N = 120</w:t>
+      </w:r>
+      <w:r>
+        <w:rPr>
+          <w:rFonts w:ascii="Garamond" w:eastAsia="Times New Roman" w:hAnsi="Garamond" w:cs="Times New Roman"/>
+          <w:noProof/>
+          <w:kern w:val="0"/>
+          <w:sz w:val="22"/>
+          <w:szCs w:val="22"/>
+          <w14:ligatures w14:val="none"/>
+        </w:rPr>
+        <w:t>)</w:t>
       </w:r>
       <w:r>
         <w:rPr>
@@ -2843,7 +2715,71 @@
           <w:szCs w:val="22"/>
           <w14:ligatures w14:val="none"/>
         </w:rPr>
-        <w:t xml:space="preserve">, providing a </w:t>
+        <w:t xml:space="preserve">. The resulting </w:t>
+      </w:r>
+      <w:proofErr w:type="spellStart"/>
+      <w:r>
+        <w:rPr>
+          <w:rFonts w:ascii="Garamond" w:eastAsia="Times New Roman" w:hAnsi="Garamond" w:cs="Times New Roman"/>
+          <w:kern w:val="0"/>
+          <w:sz w:val="22"/>
+          <w:szCs w:val="22"/>
+          <w14:ligatures w14:val="none"/>
+        </w:rPr>
+        <w:t>isoscape</w:t>
+      </w:r>
+      <w:proofErr w:type="spellEnd"/>
+      <w:r>
+        <w:rPr>
+          <w:rFonts w:ascii="Garamond" w:eastAsia="Times New Roman" w:hAnsi="Garamond" w:cs="Times New Roman"/>
+          <w:kern w:val="0"/>
+          <w:sz w:val="22"/>
+          <w:szCs w:val="22"/>
+          <w14:ligatures w14:val="none"/>
+        </w:rPr>
+        <w:t xml:space="preserve"> includes estimates of </w:t>
+      </w:r>
+      <w:r>
+        <w:rPr>
+          <w:rFonts w:ascii="Garamond" w:eastAsia="Times New Roman" w:hAnsi="Garamond" w:cs="Times New Roman"/>
+          <w:kern w:val="0"/>
+          <w:sz w:val="22"/>
+          <w:szCs w:val="22"/>
+          <w14:ligatures w14:val="none"/>
+        </w:rPr>
+        <w:t>Sr</w:t>
+      </w:r>
+      <w:r>
+        <w:rPr>
+          <w:rFonts w:ascii="Garamond" w:eastAsia="Times New Roman" w:hAnsi="Garamond" w:cs="Times New Roman"/>
+          <w:kern w:val="0"/>
+          <w:sz w:val="22"/>
+          <w:szCs w:val="22"/>
+          <w:vertAlign w:val="superscript"/>
+          <w14:ligatures w14:val="none"/>
+        </w:rPr>
+        <w:t>87</w:t>
+      </w:r>
+      <w:r>
+        <w:rPr>
+          <w:rFonts w:ascii="Garamond" w:eastAsia="Times New Roman" w:hAnsi="Garamond" w:cs="Times New Roman"/>
+          <w:kern w:val="0"/>
+          <w:sz w:val="22"/>
+          <w:szCs w:val="22"/>
+          <w14:ligatures w14:val="none"/>
+        </w:rPr>
+        <w:t>/Sr</w:t>
+      </w:r>
+      <w:r>
+        <w:rPr>
+          <w:rFonts w:ascii="Garamond" w:eastAsia="Times New Roman" w:hAnsi="Garamond" w:cs="Times New Roman"/>
+          <w:kern w:val="0"/>
+          <w:sz w:val="22"/>
+          <w:szCs w:val="22"/>
+          <w:vertAlign w:val="superscript"/>
+          <w14:ligatures w14:val="none"/>
+        </w:rPr>
+        <w:t>86</w:t>
       </w:r>
       <w:r>
         <w:rPr>
@@ -2851,49 +2787,7 @@
           <w:sz w:val="22"/>
           <w:szCs w:val="22"/>
         </w:rPr>
-        <w:t xml:space="preserve">spatially continuous estimate of </w:t>
-      </w:r>
-      <w:r>
-        <w:rPr>
-          <w:rFonts w:ascii="Garamond" w:eastAsia="Times New Roman" w:hAnsi="Garamond" w:cs="Times New Roman"/>
-          <w:kern w:val="0"/>
-          <w:sz w:val="22"/>
-          <w:szCs w:val="22"/>
-          <w14:ligatures w14:val="none"/>
-        </w:rPr>
-        <w:t>Sr</w:t>
-      </w:r>
-      <w:r>
-        <w:rPr>
-          <w:rFonts w:ascii="Garamond" w:eastAsia="Times New Roman" w:hAnsi="Garamond" w:cs="Times New Roman"/>
-          <w:kern w:val="0"/>
-          <w:sz w:val="22"/>
-          <w:szCs w:val="22"/>
-          <w:vertAlign w:val="superscript"/>
-          <w14:ligatures w14:val="none"/>
-        </w:rPr>
-        <w:t>87</w:t>
-      </w:r>
-      <w:r>
-        <w:rPr>
-          <w:rFonts w:ascii="Garamond" w:eastAsia="Times New Roman" w:hAnsi="Garamond" w:cs="Times New Roman"/>
-          <w:kern w:val="0"/>
-          <w:sz w:val="22"/>
-          <w:szCs w:val="22"/>
-          <w14:ligatures w14:val="none"/>
-        </w:rPr>
-        <w:t>/Sr</w:t>
-      </w:r>
-      <w:r>
-        <w:rPr>
-          <w:rFonts w:ascii="Garamond" w:eastAsia="Times New Roman" w:hAnsi="Garamond" w:cs="Times New Roman"/>
-          <w:kern w:val="0"/>
-          <w:sz w:val="22"/>
-          <w:szCs w:val="22"/>
-          <w:vertAlign w:val="superscript"/>
-          <w14:ligatures w14:val="none"/>
-        </w:rPr>
-        <w:t>86</w:t>
+        <w:t xml:space="preserve"> </w:t>
       </w:r>
       <w:r>
         <w:rPr>
@@ -2901,15 +2795,158 @@
           <w:sz w:val="22"/>
           <w:szCs w:val="22"/>
         </w:rPr>
+        <w:t>ratios</w:t>
+      </w:r>
+      <w:r>
+        <w:rPr>
+          <w:rFonts w:ascii="Garamond" w:hAnsi="Garamond" w:cs="Times New Roman"/>
+          <w:sz w:val="22"/>
+          <w:szCs w:val="22"/>
+        </w:rPr>
+        <w:t xml:space="preserve"> and associated uncertaint</w:t>
+      </w:r>
+      <w:r>
+        <w:rPr>
+          <w:rFonts w:ascii="Garamond" w:hAnsi="Garamond" w:cs="Times New Roman"/>
+          <w:sz w:val="22"/>
+          <w:szCs w:val="22"/>
+        </w:rPr>
+        <w:t>y</w:t>
+      </w:r>
+      <w:r>
+        <w:rPr>
+          <w:rFonts w:ascii="Garamond" w:hAnsi="Garamond" w:cs="Times New Roman"/>
+          <w:sz w:val="22"/>
+          <w:szCs w:val="22"/>
+        </w:rPr>
+        <w:t xml:space="preserve"> for roughly every ~1km of </w:t>
+      </w:r>
+      <w:r>
+        <w:rPr>
+          <w:rFonts w:ascii="Garamond" w:hAnsi="Garamond" w:cs="Times New Roman"/>
+          <w:sz w:val="22"/>
+          <w:szCs w:val="22"/>
+        </w:rPr>
+        <w:t>river length</w:t>
+      </w:r>
+      <w:r>
+        <w:rPr>
+          <w:rFonts w:ascii="Garamond" w:hAnsi="Garamond" w:cs="Times New Roman"/>
+          <w:sz w:val="22"/>
+          <w:szCs w:val="22"/>
+        </w:rPr>
+        <w:t xml:space="preserve"> across the basin </w:t>
+      </w:r>
+      <w:commentRangeStart w:id="7"/>
+      <w:r>
+        <w:rPr>
+          <w:rFonts w:ascii="Garamond" w:hAnsi="Garamond" w:cs="Times New Roman"/>
+          <w:sz w:val="22"/>
+          <w:szCs w:val="22"/>
+        </w:rPr>
+        <w:t xml:space="preserve">(Figure </w:t>
+      </w:r>
+      <w:r>
+        <w:rPr>
+          <w:rFonts w:ascii="Garamond" w:hAnsi="Garamond" w:cs="Times New Roman"/>
+          <w:sz w:val="22"/>
+          <w:szCs w:val="22"/>
+        </w:rPr>
+        <w:t>1</w:t>
+      </w:r>
+      <w:r>
+        <w:rPr>
+          <w:rFonts w:ascii="Garamond" w:hAnsi="Garamond" w:cs="Times New Roman"/>
+          <w:sz w:val="22"/>
+          <w:szCs w:val="22"/>
+        </w:rPr>
+        <w:t>)</w:t>
+      </w:r>
+      <w:r>
+        <w:rPr>
+          <w:rFonts w:ascii="Garamond" w:eastAsia="Times New Roman" w:hAnsi="Garamond" w:cs="Times New Roman"/>
+          <w:kern w:val="0"/>
+          <w:sz w:val="22"/>
+          <w:szCs w:val="22"/>
+          <w14:ligatures w14:val="none"/>
+        </w:rPr>
         <w:t xml:space="preserve"> </w:t>
       </w:r>
+      <w:commentRangeEnd w:id="7"/>
+      <w:r>
+        <w:rPr>
+          <w:rStyle w:val="CommentReference"/>
+        </w:rPr>
+        <w:commentReference w:id="7"/>
+      </w:r>
+      <w:r>
+        <w:rPr>
+          <w:rFonts w:ascii="Garamond" w:eastAsia="Times New Roman" w:hAnsi="Garamond" w:cs="Times New Roman"/>
+          <w:kern w:val="0"/>
+          <w:sz w:val="22"/>
+          <w:szCs w:val="22"/>
+          <w14:ligatures w14:val="none"/>
+        </w:rPr>
+        <w:fldChar w:fldCharType="begin"/>
+      </w:r>
+      <w:r>
+        <w:rPr>
+          <w:rFonts w:ascii="Garamond" w:eastAsia="Times New Roman" w:hAnsi="Garamond" w:cs="Times New Roman"/>
+          <w:kern w:val="0"/>
+          <w:sz w:val="22"/>
+          <w:szCs w:val="22"/>
+          <w14:ligatures w14:val="none"/>
+        </w:rPr>
+        <w:instrText xml:space="preserve"> ADDIN ZOTERO_ITEM CSL_CITATION {"citationID":"M10Aqb9z","properties":{"formattedCitation":"(Brennan et al., 2016; Ver Hoef &amp; Peterson, 2010)","plainCitation":"(Brennan et al., 2016; Ver Hoef &amp; Peterson, 2010)","noteIndex":0},"citationItems":[{"id":2315,"uris":["http://zotero.org/users/8421274/items/Q4IUGSIX"],"itemData":{"id":2315,"type":"article-journal","abstract":"A critical challenge for the Earth sciences is to trace the transport and flux of matter within and among aquatic, terrestrial, and atmospheric systems. Robust descriptions of isotopic patterns across space and time, called “isoscapes,” form the basis of a rapidly growing and wide-ranging body of research aimed at quantifying connectivity within and among Earth's systems. However, isoscapes of rivers have been limited by conventional Euclidean approaches in geostatistics and the lack of a quantitative framework to apportion the influence of processes driven by landscape features versus in-stream phenomena. Here we demonstrate how dendritic network models substantially improve the accuracy of isoscapes of strontium isotopes and partition the influence of hydrologic transport versus local geologic features on strontium isotope ratios in a large Alaska river. This work illustrates the analytical power of dendritic network models for the field of isotope biogeochemistry, particularly for provenance studies of modern and ancient animals.","container-title":"Geophysical Research Letters","DOI":"10.1002/2016GL068904","ISSN":"1944-8007","issue":"10","language":"en","note":"_eprint: https://onlinelibrary.wiley.com/doi/pdf/10.1002/2016GL068904","page":"5043-5051","source":"Wiley Online Library","title":"Dendritic network models: Improving isoscapes and quantifying influence of landscape and in-stream processes on strontium isotopes in rivers","title-short":"Dendritic network models","volume":"43","author":[{"family":"Brennan","given":"Sean R."},{"family":"Torgersen","given":"Christian E."},{"family":"Hollenbeck","given":"Jeff P."},{"family":"Fernandez","given":"Diego P."},{"family":"Jensen","given":"Carrie K."},{"family":"Schindler","given":"Daniel E."}],"issued":{"date-parts":[["2016"]]}}},{"id":4769,"uris":["http://zotero.org/users/8421274/items/XBJELDI4"],"itemData":{"id":4769,"type":"article-journal","container-title":"Journal of the American Statistical Association","DOI":"10.1198/jasa.2009.ap08248","ISSN":"0162-1459, 1537-274X","issue":"489","journalAbbreviation":"Journal of the American Statistical Association","language":"en","page":"6-18","source":"DOI.org (Crossref)","title":"A Moving Average Approach for Spatial Statistical Models of Stream Networks","volume":"105","author":[{"family":"Ver Hoef","given":"Jay M."},{"family":"Peterson","given":"Erin E."}],"issued":{"date-parts":[["2010",3,1]]}}}],"schema":"https://github.com/citation-style-language/schema/raw/master/csl-citation.json"} </w:instrText>
+      </w:r>
+      <w:r>
+        <w:rPr>
+          <w:rFonts w:ascii="Garamond" w:eastAsia="Times New Roman" w:hAnsi="Garamond" w:cs="Times New Roman"/>
+          <w:kern w:val="0"/>
+          <w:sz w:val="22"/>
+          <w:szCs w:val="22"/>
+          <w14:ligatures w14:val="none"/>
+        </w:rPr>
+        <w:fldChar w:fldCharType="separate"/>
+      </w:r>
+      <w:r>
+        <w:rPr>
+          <w:rFonts w:ascii="Garamond" w:eastAsia="Times New Roman" w:hAnsi="Garamond" w:cs="Times New Roman"/>
+          <w:noProof/>
+          <w:kern w:val="0"/>
+          <w:sz w:val="22"/>
+          <w:szCs w:val="22"/>
+          <w14:ligatures w14:val="none"/>
+        </w:rPr>
+        <w:t>(Brennan et al., 2016; Ver Hoef &amp; Peterson, 2010)</w:t>
+      </w:r>
+      <w:r>
+        <w:rPr>
+          <w:rFonts w:ascii="Garamond" w:eastAsia="Times New Roman" w:hAnsi="Garamond" w:cs="Times New Roman"/>
+          <w:kern w:val="0"/>
+          <w:sz w:val="22"/>
+          <w:szCs w:val="22"/>
+          <w14:ligatures w14:val="none"/>
+        </w:rPr>
+        <w:fldChar w:fldCharType="end"/>
+      </w:r>
+      <w:r>
+        <w:rPr>
+          <w:rFonts w:ascii="Garamond" w:eastAsia="Times New Roman" w:hAnsi="Garamond" w:cs="Times New Roman"/>
+          <w:kern w:val="0"/>
+          <w:sz w:val="22"/>
+          <w:szCs w:val="22"/>
+          <w14:ligatures w14:val="none"/>
+        </w:rPr>
+        <w:t xml:space="preserve">. </w:t>
+      </w:r>
       <w:r>
         <w:rPr>
           <w:rFonts w:ascii="Garamond" w:hAnsi="Garamond" w:cs="Times New Roman"/>
           <w:sz w:val="22"/>
           <w:szCs w:val="22"/>
         </w:rPr>
-        <w:t>ratios</w:t>
+        <w:t>To prevent over-assignment to tributaries with exceptionally low prediction error</w:t>
       </w:r>
       <w:r>
         <w:rPr>
@@ -2917,16 +2954,15 @@
           <w:sz w:val="22"/>
           <w:szCs w:val="22"/>
         </w:rPr>
-        <w:t xml:space="preserve"> and associated uncertainties for roughly every ~1km stretch of tributaries across the basin </w:t>
-      </w:r>
-      <w:commentRangeStart w:id="7"/>
+        <w:t xml:space="preserve"> </w:t>
+      </w:r>
       <w:r>
         <w:rPr>
           <w:rFonts w:ascii="Garamond" w:hAnsi="Garamond" w:cs="Times New Roman"/>
           <w:sz w:val="22"/>
           <w:szCs w:val="22"/>
         </w:rPr>
-        <w:t xml:space="preserve">(Figure </w:t>
+        <w:t>minimum error values were constrained to 0.0006</w:t>
       </w:r>
       <w:r>
         <w:rPr>
@@ -2934,7 +2970,7 @@
           <w:sz w:val="22"/>
           <w:szCs w:val="22"/>
         </w:rPr>
-        <w:t>1</w:t>
+        <w:t xml:space="preserve"> and above.</w:t>
       </w:r>
       <w:r>
         <w:rPr>
@@ -2942,94 +2978,15 @@
           <w:sz w:val="22"/>
           <w:szCs w:val="22"/>
         </w:rPr>
-        <w:t>)</w:t>
-      </w:r>
-      <w:r>
-        <w:rPr>
-          <w:rFonts w:ascii="Garamond" w:eastAsia="Times New Roman" w:hAnsi="Garamond" w:cs="Times New Roman"/>
-          <w:kern w:val="0"/>
-          <w:sz w:val="22"/>
-          <w:szCs w:val="22"/>
-          <w14:ligatures w14:val="none"/>
-        </w:rPr>
-        <w:t xml:space="preserve"> </w:t>
-      </w:r>
-      <w:commentRangeEnd w:id="7"/>
-      <w:r>
-        <w:rPr>
-          <w:rStyle w:val="CommentReference"/>
-        </w:rPr>
-        <w:commentReference w:id="7"/>
-      </w:r>
-      <w:r>
-        <w:rPr>
-          <w:rFonts w:ascii="Garamond" w:eastAsia="Times New Roman" w:hAnsi="Garamond" w:cs="Times New Roman"/>
-          <w:kern w:val="0"/>
-          <w:sz w:val="22"/>
-          <w:szCs w:val="22"/>
-          <w14:ligatures w14:val="none"/>
-        </w:rPr>
-        <w:fldChar w:fldCharType="begin"/>
-      </w:r>
-      <w:r>
-        <w:rPr>
-          <w:rFonts w:ascii="Garamond" w:eastAsia="Times New Roman" w:hAnsi="Garamond" w:cs="Times New Roman"/>
-          <w:kern w:val="0"/>
-          <w:sz w:val="22"/>
-          <w:szCs w:val="22"/>
-          <w14:ligatures w14:val="none"/>
-        </w:rPr>
-        <w:instrText xml:space="preserve"> ADDIN ZOTERO_ITEM CSL_CITATION {"citationID":"M10Aqb9z","properties":{"formattedCitation":"(Brennan et al., 2016; Ver Hoef &amp; Peterson, 2010)","plainCitation":"(Brennan et al., 2016; Ver Hoef &amp; Peterson, 2010)","noteIndex":0},"citationItems":[{"id":2315,"uris":["http://zotero.org/users/8421274/items/Q4IUGSIX"],"itemData":{"id":2315,"type":"article-journal","abstract":"A critical challenge for the Earth sciences is to trace the transport and flux of matter within and among aquatic, terrestrial, and atmospheric systems. Robust descriptions of isotopic patterns across space and time, called “isoscapes,” form the basis of a rapidly growing and wide-ranging body of research aimed at quantifying connectivity within and among Earth's systems. However, isoscapes of rivers have been limited by conventional Euclidean approaches in geostatistics and the lack of a quantitative framework to apportion the influence of processes driven by landscape features versus in-stream phenomena. Here we demonstrate how dendritic network models substantially improve the accuracy of isoscapes of strontium isotopes and partition the influence of hydrologic transport versus local geologic features on strontium isotope ratios in a large Alaska river. This work illustrates the analytical power of dendritic network models for the field of isotope biogeochemistry, particularly for provenance studies of modern and ancient animals.","container-title":"Geophysical Research Letters","DOI":"10.1002/2016GL068904","ISSN":"1944-8007","issue":"10","language":"en","note":"_eprint: https://onlinelibrary.wiley.com/doi/pdf/10.1002/2016GL068904","page":"5043-5051","source":"Wiley Online Library","title":"Dendritic network models: Improving isoscapes and quantifying influence of landscape and in-stream processes on strontium isotopes in rivers","title-short":"Dendritic network models","volume":"43","author":[{"family":"Brennan","given":"Sean R."},{"family":"Torgersen","given":"Christian E."},{"family":"Hollenbeck","given":"Jeff P."},{"family":"Fernandez","given":"Diego P."},{"family":"Jensen","given":"Carrie K."},{"family":"Schindler","given":"Daniel E."}],"issued":{"date-parts":[["2016"]]}}},{"id":4769,"uris":["http://zotero.org/users/8421274/items/XBJELDI4"],"itemData":{"id":4769,"type":"article-journal","container-title":"Journal of the American Statistical Association","DOI":"10.1198/jasa.2009.ap08248","ISSN":"0162-1459, 1537-274X","issue":"489","journalAbbreviation":"Journal of the American Statistical Association","language":"en","page":"6-18","source":"DOI.org (Crossref)","title":"A Moving Average Approach for Spatial Statistical Models of Stream Networks","volume":"105","author":[{"family":"Ver Hoef","given":"Jay M."},{"family":"Peterson","given":"Erin E."}],"issued":{"date-parts":[["2010",3,1]]}}}],"schema":"https://github.com/citation-style-language/schema/raw/master/csl-citation.json"} </w:instrText>
-      </w:r>
-      <w:r>
-        <w:rPr>
-          <w:rFonts w:ascii="Garamond" w:eastAsia="Times New Roman" w:hAnsi="Garamond" w:cs="Times New Roman"/>
-          <w:kern w:val="0"/>
-          <w:sz w:val="22"/>
-          <w:szCs w:val="22"/>
-          <w14:ligatures w14:val="none"/>
-        </w:rPr>
-        <w:fldChar w:fldCharType="separate"/>
-      </w:r>
-      <w:r>
-        <w:rPr>
-          <w:rFonts w:ascii="Garamond" w:eastAsia="Times New Roman" w:hAnsi="Garamond" w:cs="Times New Roman"/>
-          <w:noProof/>
-          <w:kern w:val="0"/>
-          <w:sz w:val="22"/>
-          <w:szCs w:val="22"/>
-          <w14:ligatures w14:val="none"/>
-        </w:rPr>
-        <w:t>(Brennan et al., 2016; Ver Hoef &amp; Peterson, 2010)</w:t>
-      </w:r>
-      <w:r>
-        <w:rPr>
-          <w:rFonts w:ascii="Garamond" w:eastAsia="Times New Roman" w:hAnsi="Garamond" w:cs="Times New Roman"/>
-          <w:kern w:val="0"/>
-          <w:sz w:val="22"/>
-          <w:szCs w:val="22"/>
-          <w14:ligatures w14:val="none"/>
-        </w:rPr>
-        <w:fldChar w:fldCharType="end"/>
-      </w:r>
-      <w:r>
-        <w:rPr>
-          <w:rFonts w:ascii="Garamond" w:eastAsia="Times New Roman" w:hAnsi="Garamond" w:cs="Times New Roman"/>
-          <w:kern w:val="0"/>
-          <w:sz w:val="22"/>
-          <w:szCs w:val="22"/>
-          <w14:ligatures w14:val="none"/>
-        </w:rPr>
-        <w:t xml:space="preserve">. </w:t>
-      </w:r>
-      <w:commentRangeStart w:id="8"/>
+        <w:t xml:space="preserve"> This threshold was selected </w:t>
+      </w:r>
       <w:r>
         <w:rPr>
           <w:rFonts w:ascii="Garamond" w:hAnsi="Garamond" w:cs="Times New Roman"/>
           <w:sz w:val="22"/>
           <w:szCs w:val="22"/>
         </w:rPr>
-        <w:t>To prevent over-assignment to tributaries with exceptionally low prediction error</w:t>
+        <w:t xml:space="preserve">by visually examining the histogram for a cutoff which adjusted the error values for a small number of exceedingly low error tributaries while maintaining the general </w:t>
       </w:r>
       <w:r>
         <w:rPr>
@@ -3037,100 +2994,17 @@
           <w:sz w:val="22"/>
           <w:szCs w:val="22"/>
         </w:rPr>
-        <w:t xml:space="preserve"> </w:t>
-      </w:r>
-      <w:r>
-        <w:rPr>
-          <w:rFonts w:ascii="Garamond" w:hAnsi="Garamond" w:cs="Times New Roman"/>
-          <w:sz w:val="22"/>
-          <w:szCs w:val="22"/>
-        </w:rPr>
-        <w:t>minimum error values were constrained to 0.0006</w:t>
-      </w:r>
-      <w:r>
-        <w:rPr>
-          <w:rFonts w:ascii="Garamond" w:hAnsi="Garamond" w:cs="Times New Roman"/>
-          <w:sz w:val="22"/>
-          <w:szCs w:val="22"/>
-        </w:rPr>
-        <w:t xml:space="preserve"> and above.</w:t>
-      </w:r>
-      <w:r>
-        <w:rPr>
-          <w:rFonts w:ascii="Garamond" w:hAnsi="Garamond" w:cs="Times New Roman"/>
-          <w:sz w:val="22"/>
-          <w:szCs w:val="22"/>
-        </w:rPr>
-        <w:t xml:space="preserve"> </w:t>
-      </w:r>
-      <w:commentRangeEnd w:id="8"/>
-      <w:r>
-        <w:rPr>
-          <w:rStyle w:val="CommentReference"/>
-        </w:rPr>
-        <w:commentReference w:id="8"/>
-      </w:r>
-      <w:r>
-        <w:rPr>
-          <w:rFonts w:ascii="Garamond" w:hAnsi="Garamond" w:cs="Times New Roman"/>
-          <w:sz w:val="22"/>
-          <w:szCs w:val="22"/>
-        </w:rPr>
-        <w:t xml:space="preserve">This threshold was selected </w:t>
-      </w:r>
-      <w:r>
-        <w:rPr>
-          <w:rFonts w:ascii="Garamond" w:hAnsi="Garamond" w:cs="Times New Roman"/>
-          <w:sz w:val="22"/>
-          <w:szCs w:val="22"/>
-        </w:rPr>
-        <w:t xml:space="preserve">by visually examining the histogram for a cutoff which adjusted the error values for a small number of exceedingly low error tributaries while maintaining the general trend of uncertainty resulting from SSN model fit. </w:t>
+        <w:t xml:space="preserve">distribution of error values from the original SSN model. </w:t>
       </w:r>
     </w:p>
     <w:p>
       <w:pPr>
         <w:spacing w:before="100" w:beforeAutospacing="1" w:after="100" w:afterAutospacing="1" w:line="480" w:lineRule="auto"/>
+        <w:ind w:firstLine="720"/>
         <w:rPr>
           <w:rFonts w:ascii="Garamond" w:hAnsi="Garamond" w:cs="Times New Roman"/>
           <w:sz w:val="22"/>
           <w:szCs w:val="22"/>
-        </w:rPr>
-      </w:pPr>
-      <w:r>
-        <w:rPr>
-          <w:rFonts w:ascii="Garamond" w:eastAsia="Times New Roman" w:hAnsi="Garamond" w:cs="Times New Roman"/>
-          <w:b/>
-          <w:bCs/>
-          <w:kern w:val="0"/>
-          <w:sz w:val="22"/>
-          <w:szCs w:val="22"/>
-          <w14:ligatures w14:val="none"/>
-        </w:rPr>
-        <w:t>Assignment framework and prior</w:t>
-      </w:r>
-      <w:r>
-        <w:rPr>
-          <w:rFonts w:ascii="Garamond" w:eastAsia="Times New Roman" w:hAnsi="Garamond" w:cs="Times New Roman"/>
-          <w:b/>
-          <w:bCs/>
-          <w:kern w:val="0"/>
-          <w:sz w:val="22"/>
-          <w:szCs w:val="22"/>
-          <w14:ligatures w14:val="none"/>
-        </w:rPr>
-        <w:t>s</w:t>
-      </w:r>
-    </w:p>
-    <w:p>
-      <w:pPr>
-        <w:spacing w:before="100" w:beforeAutospacing="1" w:after="100" w:afterAutospacing="1" w:line="480" w:lineRule="auto"/>
-        <w:ind w:firstLine="720"/>
-        <w:rPr>
-          <w:rFonts w:ascii="Garamond" w:eastAsia="Times New Roman" w:hAnsi="Garamond" w:cs="Times New Roman"/>
-          <w:kern w:val="0"/>
-          <w:sz w:val="22"/>
-          <w:szCs w:val="22"/>
-          <w14:ligatures w14:val="none"/>
         </w:rPr>
       </w:pPr>
       <w:r>
@@ -3955,6 +3829,17 @@
         <w:spacing w:line="480" w:lineRule="auto"/>
         <w:ind w:firstLine="720"/>
         <w:rPr>
+          <w:rFonts w:ascii="Garamond" w:hAnsi="Garamond" w:cstheme="majorHAnsi"/>
+          <w:sz w:val="22"/>
+          <w:szCs w:val="22"/>
+        </w:rPr>
+      </w:pPr>
+    </w:p>
+    <w:p>
+      <w:pPr>
+        <w:spacing w:line="480" w:lineRule="auto"/>
+        <w:ind w:firstLine="720"/>
+        <w:rPr>
           <w:rFonts w:ascii="Garamond" w:eastAsia="Times New Roman" w:hAnsi="Garamond" w:cs="Times New Roman"/>
           <w:kern w:val="0"/>
           <w:sz w:val="22"/>
@@ -4196,7 +4081,7 @@
           <w:sz w:val="22"/>
           <w:szCs w:val="22"/>
         </w:rPr>
-        <w:t xml:space="preserve">  </w:t>
+        <w:t xml:space="preserve"> </w:t>
       </w:r>
       <w:r>
         <w:rPr>
@@ -4302,7 +4187,7 @@
         </w:rPr>
         <w:t xml:space="preserve"> </w:t>
       </w:r>
-      <w:commentRangeStart w:id="9"/>
+      <w:commentRangeStart w:id="8"/>
       <w:r>
         <w:rPr>
           <w:rFonts w:ascii="Garamond" w:eastAsia="Times New Roman" w:hAnsi="Garamond" w:cs="Times New Roman"/>
@@ -4354,12 +4239,12 @@
         </w:rPr>
         <w:fldChar w:fldCharType="end"/>
       </w:r>
-      <w:commentRangeEnd w:id="9"/>
+      <w:commentRangeEnd w:id="8"/>
       <w:r>
         <w:rPr>
           <w:rStyle w:val="CommentReference"/>
         </w:rPr>
-        <w:commentReference w:id="9"/>
+        <w:commentReference w:id="8"/>
       </w:r>
       <w:r>
         <w:rPr>
@@ -4379,27 +4264,27 @@
           <w:szCs w:val="22"/>
           <w14:ligatures w14:val="none"/>
         </w:rPr>
-        <w:t xml:space="preserve">Finally, data was included on observed locations of spawning </w:t>
-      </w:r>
-      <w:r>
-        <w:rPr>
-          <w:rFonts w:ascii="Garamond" w:eastAsia="Times New Roman" w:hAnsi="Garamond" w:cs="Times New Roman"/>
-          <w:kern w:val="0"/>
-          <w:sz w:val="22"/>
-          <w:szCs w:val="22"/>
-          <w14:ligatures w14:val="none"/>
-        </w:rPr>
-        <w:t>C</w:t>
-      </w:r>
-      <w:r>
-        <w:rPr>
-          <w:rFonts w:ascii="Garamond" w:eastAsia="Times New Roman" w:hAnsi="Garamond" w:cs="Times New Roman"/>
-          <w:kern w:val="0"/>
-          <w:sz w:val="22"/>
-          <w:szCs w:val="22"/>
-          <w14:ligatures w14:val="none"/>
-        </w:rPr>
-        <w:t>hinook presence derived from USGS Arctic-Yukon-Kuskokwim (AYK) Chinook Salmon Intrinsic potential mapping</w:t>
+        <w:t xml:space="preserve">Finally, data was included on observed locations of </w:t>
+      </w:r>
+      <w:r>
+        <w:rPr>
+          <w:rFonts w:ascii="Garamond" w:eastAsia="Times New Roman" w:hAnsi="Garamond" w:cs="Times New Roman"/>
+          <w:kern w:val="0"/>
+          <w:sz w:val="22"/>
+          <w:szCs w:val="22"/>
+          <w14:ligatures w14:val="none"/>
+        </w:rPr>
+        <w:t xml:space="preserve">Chinook spawners </w:t>
+      </w:r>
+      <w:r>
+        <w:rPr>
+          <w:rFonts w:ascii="Garamond" w:eastAsia="Times New Roman" w:hAnsi="Garamond" w:cs="Times New Roman"/>
+          <w:kern w:val="0"/>
+          <w:sz w:val="22"/>
+          <w:szCs w:val="22"/>
+          <w14:ligatures w14:val="none"/>
+        </w:rPr>
+        <w:t>derived from USGS Arctic-Yukon-Kuskokwim (AYK) Chinook Salmon Intrinsic potential mapping</w:t>
       </w:r>
       <w:r>
         <w:rPr>
@@ -4439,57 +4324,17 @@
           <w:szCs w:val="22"/>
           <w14:ligatures w14:val="none"/>
         </w:rPr>
-        <w:t xml:space="preserve"> several sources of data on observed Chinook salmon spawners to provide </w:t>
-      </w:r>
-      <w:r>
-        <w:rPr>
-          <w:rFonts w:ascii="Garamond" w:eastAsia="Times New Roman" w:hAnsi="Garamond" w:cs="Times New Roman"/>
-          <w:kern w:val="0"/>
-          <w:sz w:val="22"/>
-          <w:szCs w:val="22"/>
-          <w14:ligatures w14:val="none"/>
-        </w:rPr>
-        <w:t xml:space="preserve">data on known </w:t>
-      </w:r>
-      <w:r>
-        <w:rPr>
-          <w:rFonts w:ascii="Garamond" w:eastAsia="Times New Roman" w:hAnsi="Garamond" w:cs="Times New Roman"/>
-          <w:kern w:val="0"/>
-          <w:sz w:val="22"/>
-          <w:szCs w:val="22"/>
-          <w14:ligatures w14:val="none"/>
-        </w:rPr>
-        <w:t xml:space="preserve">locations with or without </w:t>
-      </w:r>
-      <w:r>
-        <w:rPr>
-          <w:rFonts w:ascii="Garamond" w:eastAsia="Times New Roman" w:hAnsi="Garamond" w:cs="Times New Roman"/>
-          <w:kern w:val="0"/>
-          <w:sz w:val="22"/>
-          <w:szCs w:val="22"/>
-          <w14:ligatures w14:val="none"/>
-        </w:rPr>
-        <w:t>Chinook sa</w:t>
-      </w:r>
-      <w:r>
-        <w:rPr>
-          <w:rFonts w:ascii="Garamond" w:eastAsia="Times New Roman" w:hAnsi="Garamond" w:cs="Times New Roman"/>
-          <w:kern w:val="0"/>
-          <w:sz w:val="22"/>
-          <w:szCs w:val="22"/>
-          <w14:ligatures w14:val="none"/>
-        </w:rPr>
-        <w:t>l</w:t>
-      </w:r>
-      <w:r>
-        <w:rPr>
-          <w:rFonts w:ascii="Garamond" w:eastAsia="Times New Roman" w:hAnsi="Garamond" w:cs="Times New Roman"/>
-          <w:kern w:val="0"/>
-          <w:sz w:val="22"/>
-          <w:szCs w:val="22"/>
-          <w14:ligatures w14:val="none"/>
-        </w:rPr>
-        <w:t xml:space="preserve">mon spawners </w:t>
+        <w:t xml:space="preserve"> several sources of data on observed Chinook salmon spawners </w:t>
+      </w:r>
+      <w:r>
+        <w:rPr>
+          <w:rFonts w:ascii="Garamond" w:eastAsia="Times New Roman" w:hAnsi="Garamond" w:cs="Times New Roman"/>
+          <w:kern w:val="0"/>
+          <w:sz w:val="22"/>
+          <w:szCs w:val="22"/>
+          <w14:ligatures w14:val="none"/>
+        </w:rPr>
+        <w:t xml:space="preserve">into spatially referenced tributary data on the presence or absence of observations </w:t>
       </w:r>
       <w:r>
         <w:rPr>
@@ -4570,7 +4415,27 @@
           <w:szCs w:val="22"/>
           <w14:ligatures w14:val="none"/>
         </w:rPr>
-        <w:t xml:space="preserve"> To avoid biasing regions without observations but with low sampling effort, this prior was only applied to </w:t>
+        <w:t xml:space="preserve">To avoid biasing regions without observations but with low sampling effort, this prior was applied </w:t>
+      </w:r>
+      <w:r>
+        <w:rPr>
+          <w:rFonts w:ascii="Garamond" w:eastAsia="Times New Roman" w:hAnsi="Garamond" w:cs="Times New Roman"/>
+          <w:kern w:val="0"/>
+          <w:sz w:val="22"/>
+          <w:szCs w:val="22"/>
+          <w14:ligatures w14:val="none"/>
+        </w:rPr>
+        <w:t xml:space="preserve">only </w:t>
+      </w:r>
+      <w:r>
+        <w:rPr>
+          <w:rFonts w:ascii="Garamond" w:eastAsia="Times New Roman" w:hAnsi="Garamond" w:cs="Times New Roman"/>
+          <w:kern w:val="0"/>
+          <w:sz w:val="22"/>
+          <w:szCs w:val="22"/>
+          <w14:ligatures w14:val="none"/>
+        </w:rPr>
+        <w:t xml:space="preserve">to </w:t>
       </w:r>
       <w:r>
         <w:rPr>
@@ -4661,7 +4526,23 @@
           <w:sz w:val="22"/>
           <w:szCs w:val="22"/>
         </w:rPr>
-        <w:t xml:space="preserve">for all individuals in the subset </w:t>
+        <w:t>for all individuals in th</w:t>
+      </w:r>
+      <w:r>
+        <w:rPr>
+          <w:rFonts w:ascii="Garamond" w:hAnsi="Garamond"/>
+          <w:sz w:val="22"/>
+          <w:szCs w:val="22"/>
+        </w:rPr>
+        <w:t>at</w:t>
+      </w:r>
+      <w:r>
+        <w:rPr>
+          <w:rFonts w:ascii="Garamond" w:hAnsi="Garamond"/>
+          <w:sz w:val="22"/>
+          <w:szCs w:val="22"/>
+        </w:rPr>
+        <w:t xml:space="preserve"> subset </w:t>
       </w:r>
       <w:r>
         <w:rPr>
@@ -4814,47 +4695,15 @@
           <w:sz w:val="22"/>
           <w:szCs w:val="22"/>
         </w:rPr>
-        <w:t>. Subsets for which estimates of n</w:t>
-      </w:r>
-      <w:r>
-        <w:rPr>
-          <w:rFonts w:ascii="Garamond" w:hAnsi="Garamond"/>
-          <w:sz w:val="22"/>
-          <w:szCs w:val="22"/>
-        </w:rPr>
-        <w:t xml:space="preserve">atal origin were produced </w:t>
-      </w:r>
-      <w:r>
-        <w:rPr>
-          <w:rFonts w:ascii="Garamond" w:hAnsi="Garamond"/>
-          <w:sz w:val="22"/>
-          <w:szCs w:val="22"/>
-        </w:rPr>
-        <w:t xml:space="preserve">include </w:t>
-      </w:r>
-      <w:r>
-        <w:rPr>
-          <w:rFonts w:ascii="Garamond" w:hAnsi="Garamond"/>
-          <w:sz w:val="22"/>
-          <w:szCs w:val="22"/>
-        </w:rPr>
-        <w:t xml:space="preserve">predefined </w:t>
-      </w:r>
-      <w:r>
-        <w:rPr>
-          <w:rFonts w:ascii="Garamond" w:hAnsi="Garamond"/>
-          <w:sz w:val="22"/>
-          <w:szCs w:val="22"/>
-        </w:rPr>
-        <w:t xml:space="preserve">four </w:t>
-      </w:r>
-      <w:r>
-        <w:rPr>
-          <w:rFonts w:ascii="Garamond" w:hAnsi="Garamond"/>
-          <w:sz w:val="22"/>
-          <w:szCs w:val="22"/>
-        </w:rPr>
-        <w:t xml:space="preserve">temporal quartiles </w:t>
+        <w:t xml:space="preserve">. </w:t>
+      </w:r>
+      <w:r>
+        <w:rPr>
+          <w:rFonts w:ascii="Garamond" w:hAnsi="Garamond"/>
+          <w:sz w:val="22"/>
+          <w:szCs w:val="22"/>
+        </w:rPr>
+        <w:t xml:space="preserve">We produced these estimates for four predefined temporal quartiles </w:t>
       </w:r>
       <w:r>
         <w:rPr>
@@ -4872,7 +4721,7 @@
         </w:rPr>
         <w:t>based on capture date: Q1 (run start through June 11), Q2 (June 12-21), Q3 (June 22-July 1), and Q4 (July 2 onward).</w:t>
       </w:r>
-      <w:ins w:id="10" w:author="Daniel Schindler" w:date="2025-07-17T13:30:00Z" w16du:dateUtc="2025-07-17T21:30:00Z">
+      <w:ins w:id="9" w:author="Daniel Schindler" w:date="2025-07-17T13:30:00Z" w16du:dateUtc="2025-07-17T21:30:00Z">
         <w:r>
           <w:rPr>
             <w:rFonts w:ascii="Garamond" w:hAnsi="Garamond"/>
@@ -4992,6 +4841,7 @@
         <w:spacing w:line="480" w:lineRule="auto"/>
         <w:ind w:firstLine="720"/>
         <w:rPr>
+          <w:rStyle w:val="CommentReference"/>
           <w:rFonts w:ascii="Garamond" w:hAnsi="Garamond"/>
           <w:sz w:val="22"/>
           <w:szCs w:val="22"/>
@@ -5086,8 +4936,8 @@
         </w:rPr>
         <w:t xml:space="preserve"> </w:t>
       </w:r>
-      <w:commentRangeStart w:id="11"/>
-      <w:ins w:id="12" w:author="Daniel Schindler" w:date="2025-07-17T13:31:00Z" w16du:dateUtc="2025-07-17T21:31:00Z">
+      <w:commentRangeStart w:id="10"/>
+      <w:ins w:id="11" w:author="Daniel Schindler" w:date="2025-07-17T13:31:00Z" w16du:dateUtc="2025-07-17T21:31:00Z">
         <w:r>
           <w:rPr>
             <w:rFonts w:ascii="Garamond" w:hAnsi="Garamond"/>
@@ -5106,12 +4956,12 @@
         </w:rPr>
         <w:t xml:space="preserve">. </w:t>
       </w:r>
-      <w:commentRangeEnd w:id="11"/>
+      <w:commentRangeEnd w:id="10"/>
       <w:r>
         <w:rPr>
           <w:rStyle w:val="CommentReference"/>
         </w:rPr>
-        <w:commentReference w:id="11"/>
+        <w:commentReference w:id="10"/>
       </w:r>
       <w:r>
         <w:rPr>
@@ -5120,7 +4970,79 @@
           <w:sz w:val="22"/>
           <w:szCs w:val="22"/>
         </w:rPr>
-        <w:t xml:space="preserve">From the furthest downstream connection of each of these tributaries to the mainstem all upstream segments were selected and assigned to a common identifier.  For some smaller units (i.e. the </w:t>
+        <w:t>From the furthest downstream connection of each of these tributaries to the mainstem</w:t>
+      </w:r>
+      <w:r>
+        <w:rPr>
+          <w:rStyle w:val="CommentReference"/>
+          <w:rFonts w:ascii="Garamond" w:hAnsi="Garamond"/>
+          <w:sz w:val="22"/>
+          <w:szCs w:val="22"/>
+        </w:rPr>
+        <w:t xml:space="preserve"> Kuskokwim River,</w:t>
+      </w:r>
+      <w:r>
+        <w:rPr>
+          <w:rStyle w:val="CommentReference"/>
+          <w:rFonts w:ascii="Garamond" w:hAnsi="Garamond"/>
+          <w:sz w:val="22"/>
+          <w:szCs w:val="22"/>
+        </w:rPr>
+        <w:t xml:space="preserve"> all upstream segments were </w:t>
+      </w:r>
+      <w:r>
+        <w:rPr>
+          <w:rStyle w:val="CommentReference"/>
+          <w:rFonts w:ascii="Garamond" w:hAnsi="Garamond"/>
+          <w:sz w:val="22"/>
+          <w:szCs w:val="22"/>
+        </w:rPr>
+        <w:t xml:space="preserve">identified and </w:t>
+      </w:r>
+      <w:r>
+        <w:rPr>
+          <w:rStyle w:val="CommentReference"/>
+          <w:rFonts w:ascii="Garamond" w:hAnsi="Garamond"/>
+          <w:sz w:val="22"/>
+          <w:szCs w:val="22"/>
+        </w:rPr>
+        <w:t xml:space="preserve">assigned to a common </w:t>
+      </w:r>
+      <w:r>
+        <w:rPr>
+          <w:rStyle w:val="CommentReference"/>
+          <w:rFonts w:ascii="Garamond" w:hAnsi="Garamond"/>
+          <w:sz w:val="22"/>
+          <w:szCs w:val="22"/>
+        </w:rPr>
+        <w:t>stock identifier based on the name of the major tributary</w:t>
+      </w:r>
+      <w:r>
+        <w:rPr>
+          <w:rStyle w:val="CommentReference"/>
+          <w:rFonts w:ascii="Garamond" w:hAnsi="Garamond"/>
+          <w:sz w:val="22"/>
+          <w:szCs w:val="22"/>
+        </w:rPr>
+        <w:t xml:space="preserve">. For some smaller </w:t>
+      </w:r>
+      <w:r>
+        <w:rPr>
+          <w:rStyle w:val="CommentReference"/>
+          <w:rFonts w:ascii="Garamond" w:hAnsi="Garamond"/>
+          <w:sz w:val="22"/>
+          <w:szCs w:val="22"/>
+        </w:rPr>
+        <w:t xml:space="preserve">regions </w:t>
+      </w:r>
+      <w:r>
+        <w:rPr>
+          <w:rStyle w:val="CommentReference"/>
+          <w:rFonts w:ascii="Garamond" w:hAnsi="Garamond"/>
+          <w:sz w:val="22"/>
+          <w:szCs w:val="22"/>
+        </w:rPr>
+        <w:t xml:space="preserve">(i.e. the </w:t>
       </w:r>
       <w:proofErr w:type="spellStart"/>
       <w:r>
@@ -5140,39 +5062,16 @@
           <w:sz w:val="22"/>
           <w:szCs w:val="22"/>
         </w:rPr>
-        <w:t xml:space="preserve"> and Nixon fork), the units were combined into one to keep a relative comparable size. </w:t>
-      </w:r>
-      <w:r>
-        <w:rPr>
-          <w:rFonts w:ascii="Garamond" w:hAnsi="Garamond"/>
-          <w:sz w:val="22"/>
-          <w:szCs w:val="22"/>
-        </w:rPr>
-        <w:t xml:space="preserve">Remaining basin areas were </w:t>
-      </w:r>
-      <w:r>
-        <w:rPr>
-          <w:rFonts w:ascii="Garamond" w:hAnsi="Garamond"/>
-          <w:sz w:val="22"/>
-          <w:szCs w:val="22"/>
-        </w:rPr>
-        <w:t xml:space="preserve">then </w:t>
-      </w:r>
-      <w:r>
-        <w:rPr>
-          <w:rFonts w:ascii="Garamond" w:hAnsi="Garamond"/>
-          <w:sz w:val="22"/>
-          <w:szCs w:val="22"/>
-        </w:rPr>
-        <w:t>manually grouped into units of comparable size to ensure complete basin coverage</w:t>
-      </w:r>
-      <w:r>
-        <w:rPr>
-          <w:rFonts w:ascii="Garamond" w:hAnsi="Garamond"/>
-          <w:sz w:val="22"/>
-          <w:szCs w:val="22"/>
-        </w:rPr>
-        <w:t xml:space="preserve"> with attention paid to keeping spatially relevant regions in the same unit (i.e. Middle Kuskokwim mainstem). </w:t>
+        <w:t xml:space="preserve"> and Nixon fork),</w:t>
+      </w:r>
+      <w:r>
+        <w:rPr>
+          <w:rStyle w:val="CommentReference"/>
+          <w:rFonts w:ascii="Garamond" w:hAnsi="Garamond"/>
+          <w:sz w:val="22"/>
+          <w:szCs w:val="22"/>
+        </w:rPr>
+        <w:t xml:space="preserve"> multiple units were combined into one to keep a relatively comparable size between all stocks. Regions of the basin which were not included in a unit after this selection were manually grouped into units of comparable size and spatial relevance to ensure complete basin coverage. </w:t>
       </w:r>
     </w:p>
     <w:p>
@@ -5194,7 +5093,7 @@
           <w:sz w:val="22"/>
           <w:szCs w:val="22"/>
         </w:rPr>
-        <w:t xml:space="preserve">Stock </w:t>
+        <w:t xml:space="preserve">Spatiotemporal </w:t>
       </w:r>
       <w:r>
         <w:rPr>
@@ -5204,7 +5103,7 @@
           <w:sz w:val="22"/>
           <w:szCs w:val="22"/>
         </w:rPr>
-        <w:t>C</w:t>
+        <w:t xml:space="preserve">Stock </w:t>
       </w:r>
       <w:r>
         <w:rPr>
@@ -5214,7 +5113,7 @@
           <w:sz w:val="22"/>
           <w:szCs w:val="22"/>
         </w:rPr>
-        <w:t xml:space="preserve">ontribution </w:t>
+        <w:t>C</w:t>
       </w:r>
       <w:r>
         <w:rPr>
@@ -5224,7 +5123,7 @@
           <w:sz w:val="22"/>
           <w:szCs w:val="22"/>
         </w:rPr>
-        <w:t>A</w:t>
+        <w:t xml:space="preserve">ontribution </w:t>
       </w:r>
       <w:r>
         <w:rPr>
@@ -5234,6 +5133,16 @@
           <w:sz w:val="22"/>
           <w:szCs w:val="22"/>
         </w:rPr>
+        <w:t>A</w:t>
+      </w:r>
+      <w:r>
+        <w:rPr>
+          <w:rFonts w:ascii="Garamond" w:hAnsi="Garamond"/>
+          <w:b/>
+          <w:bCs/>
+          <w:sz w:val="22"/>
+          <w:szCs w:val="22"/>
+        </w:rPr>
         <w:t xml:space="preserve">nalysis </w:t>
       </w:r>
     </w:p>
@@ -5243,32 +5152,272 @@
         <w:ind w:firstLine="720"/>
         <w:rPr>
           <w:rFonts w:ascii="Garamond" w:hAnsi="Garamond"/>
-          <w:b/>
-          <w:bCs/>
-          <w:sz w:val="22"/>
-          <w:szCs w:val="22"/>
-        </w:rPr>
-      </w:pPr>
-      <w:r>
-        <w:rPr>
-          <w:rFonts w:ascii="Garamond" w:hAnsi="Garamond"/>
-          <w:sz w:val="22"/>
-          <w:szCs w:val="22"/>
-        </w:rPr>
-        <w:t>For each year and seasonal quartile, tributary-level natal origin estimates were aggregated into management units and normalized to sum to one across the basin, representing each unit's proportional contribution to the seasonal quartile. Summary statistics were then calculated across all years for each management unit, with Figure 3a displaying mean contributions by management unit (darker colors indicating higher values) and corresponding boxplots showing median and range values for each quartile, ordered from furthest upstream (top) to downstream (bottom) by watershed position. Cumulative distribution functions were constructed to examine relative run timing independent of stock abundance by aggregating natal origin distributions by management unit for each 3-day interval and comparing against full-season totals without normalization, allowing comparison of actual return numbers over time and showing the cumulative proportion of each stock's total seasonal contribution at each time point. To evaluate the stock-specific effect of the current implemented front-end closure, we evaluated the proportion of each stock's total return occurring within the current closure window (the first seasonal quartile in our dataset). The relative protection across all years was used produce boxplots visualizing the variability in this protection over the dataset, again ordered from furthest upstream to furthest downstream.</w:t>
+          <w:sz w:val="22"/>
+          <w:szCs w:val="22"/>
+        </w:rPr>
+      </w:pPr>
+      <w:r>
+        <w:rPr>
+          <w:rFonts w:ascii="Garamond" w:hAnsi="Garamond"/>
+          <w:sz w:val="22"/>
+          <w:szCs w:val="22"/>
+          <w:highlight w:val="yellow"/>
+        </w:rPr>
+        <w:t>For each year and seasonal quartile, tributary-level natal origin estimates were aggregated into management units and normalized to sum to one across the basin, representing each unit's proportional contribution to th</w:t>
+      </w:r>
+      <w:r>
+        <w:rPr>
+          <w:rFonts w:ascii="Garamond" w:hAnsi="Garamond"/>
+          <w:sz w:val="22"/>
+          <w:szCs w:val="22"/>
+          <w:highlight w:val="yellow"/>
+        </w:rPr>
+        <w:t>at</w:t>
+      </w:r>
+      <w:r>
+        <w:rPr>
+          <w:rFonts w:ascii="Garamond" w:hAnsi="Garamond"/>
+          <w:sz w:val="22"/>
+          <w:szCs w:val="22"/>
+          <w:highlight w:val="yellow"/>
+        </w:rPr>
+        <w:t xml:space="preserve"> quartile. Summary statistics were then calculated across all years</w:t>
+      </w:r>
+      <w:r>
+        <w:rPr>
+          <w:rFonts w:ascii="Garamond" w:hAnsi="Garamond"/>
+          <w:sz w:val="22"/>
+          <w:szCs w:val="22"/>
+          <w:highlight w:val="yellow"/>
+        </w:rPr>
+        <w:t xml:space="preserve">. Mean values for each management unit across all years were spatially displayed by coloring all tributaries within that unit by their value, with darker colors </w:t>
+      </w:r>
+      <w:r>
+        <w:rPr>
+          <w:rFonts w:ascii="Garamond" w:hAnsi="Garamond"/>
+          <w:sz w:val="22"/>
+          <w:szCs w:val="22"/>
+          <w:highlight w:val="yellow"/>
+        </w:rPr>
+        <w:t>indicating higher values</w:t>
+      </w:r>
+      <w:r>
+        <w:rPr>
+          <w:rFonts w:ascii="Garamond" w:hAnsi="Garamond"/>
+          <w:sz w:val="22"/>
+          <w:szCs w:val="22"/>
+          <w:highlight w:val="yellow"/>
+        </w:rPr>
+        <w:t xml:space="preserve"> (Figure 3a.) Corresponding boxplots display median, 1</w:t>
+      </w:r>
+      <w:r>
+        <w:rPr>
+          <w:rFonts w:ascii="Garamond" w:hAnsi="Garamond"/>
+          <w:sz w:val="22"/>
+          <w:szCs w:val="22"/>
+          <w:highlight w:val="yellow"/>
+          <w:vertAlign w:val="superscript"/>
+        </w:rPr>
+        <w:t>st</w:t>
+      </w:r>
+      <w:r>
+        <w:rPr>
+          <w:rFonts w:ascii="Garamond" w:hAnsi="Garamond"/>
+          <w:sz w:val="22"/>
+          <w:szCs w:val="22"/>
+          <w:highlight w:val="yellow"/>
+        </w:rPr>
+        <w:t xml:space="preserve"> and 3</w:t>
+      </w:r>
+      <w:r>
+        <w:rPr>
+          <w:rFonts w:ascii="Garamond" w:hAnsi="Garamond"/>
+          <w:sz w:val="22"/>
+          <w:szCs w:val="22"/>
+          <w:highlight w:val="yellow"/>
+          <w:vertAlign w:val="superscript"/>
+        </w:rPr>
+        <w:t>rd</w:t>
+      </w:r>
+      <w:r>
+        <w:rPr>
+          <w:rFonts w:ascii="Garamond" w:hAnsi="Garamond"/>
+          <w:sz w:val="22"/>
+          <w:szCs w:val="22"/>
+          <w:highlight w:val="yellow"/>
+        </w:rPr>
+        <w:t xml:space="preserve"> quartile, and range of the data across all years by management unit, </w:t>
+      </w:r>
+      <w:r>
+        <w:rPr>
+          <w:rFonts w:ascii="Garamond" w:hAnsi="Garamond"/>
+          <w:sz w:val="22"/>
+          <w:szCs w:val="22"/>
+          <w:highlight w:val="yellow"/>
+        </w:rPr>
+        <w:t>ordered from furthest upstream (top) to downstream (bottom) by watershed position.</w:t>
+      </w:r>
+      <w:r>
+        <w:rPr>
+          <w:rFonts w:ascii="Garamond" w:hAnsi="Garamond"/>
+          <w:sz w:val="22"/>
+          <w:szCs w:val="22"/>
+        </w:rPr>
+        <w:t xml:space="preserve"> </w:t>
       </w:r>
     </w:p>
     <w:p>
       <w:pPr>
         <w:spacing w:line="480" w:lineRule="auto"/>
-        <w:rPr>
-          <w:rFonts w:ascii="Garamond" w:hAnsi="Garamond"/>
-          <w:b/>
-          <w:bCs/>
-          <w:sz w:val="22"/>
-          <w:szCs w:val="22"/>
-        </w:rPr>
-      </w:pPr>
+        <w:ind w:firstLine="720"/>
+        <w:rPr>
+          <w:rFonts w:ascii="Garamond" w:hAnsi="Garamond"/>
+          <w:sz w:val="22"/>
+          <w:szCs w:val="22"/>
+        </w:rPr>
+      </w:pPr>
+      <w:r>
+        <w:rPr>
+          <w:rFonts w:ascii="Garamond" w:hAnsi="Garamond"/>
+          <w:sz w:val="22"/>
+          <w:szCs w:val="22"/>
+        </w:rPr>
+        <w:t>Cumulative distribution functions were constructed to examine relative run timing independent of stock abundance</w:t>
+      </w:r>
+      <w:r>
+        <w:rPr>
+          <w:rFonts w:ascii="Garamond" w:hAnsi="Garamond"/>
+          <w:sz w:val="22"/>
+          <w:szCs w:val="22"/>
+        </w:rPr>
+        <w:t xml:space="preserve"> and </w:t>
+      </w:r>
+      <w:r>
+        <w:rPr>
+          <w:rFonts w:ascii="Garamond" w:hAnsi="Garamond"/>
+          <w:sz w:val="22"/>
+          <w:szCs w:val="22"/>
+        </w:rPr>
+        <w:t xml:space="preserve">static quartile cut-off dates. For each year, the full run was split into 3-day intervals and the cumulative distribution of returners for each stock were compared to the full season totals for that stock. Resulting data illustrate the proportion (0-1) of each stock’s total cumulative contribution at each </w:t>
+      </w:r>
+      <w:proofErr w:type="gramStart"/>
+      <w:r>
+        <w:rPr>
+          <w:rFonts w:ascii="Garamond" w:hAnsi="Garamond"/>
+          <w:sz w:val="22"/>
+          <w:szCs w:val="22"/>
+        </w:rPr>
+        <w:t>3 day</w:t>
+      </w:r>
+      <w:proofErr w:type="gramEnd"/>
+      <w:r>
+        <w:rPr>
+          <w:rFonts w:ascii="Garamond" w:hAnsi="Garamond"/>
+          <w:sz w:val="22"/>
+          <w:szCs w:val="22"/>
+        </w:rPr>
+        <w:t xml:space="preserve"> interval. </w:t>
+      </w:r>
+    </w:p>
+    <w:p>
+      <w:pPr>
+        <w:spacing w:line="480" w:lineRule="auto"/>
+        <w:ind w:firstLine="720"/>
+        <w:rPr>
+          <w:rFonts w:ascii="Garamond" w:hAnsi="Garamond"/>
+          <w:sz w:val="22"/>
+          <w:szCs w:val="22"/>
+        </w:rPr>
+      </w:pPr>
+      <w:r>
+        <w:rPr>
+          <w:rFonts w:ascii="Garamond" w:hAnsi="Garamond"/>
+          <w:sz w:val="22"/>
+          <w:szCs w:val="22"/>
+        </w:rPr>
+        <w:t xml:space="preserve">To evaluate effect of the current implemented front-end closure, we </w:t>
+      </w:r>
+      <w:r>
+        <w:rPr>
+          <w:rFonts w:ascii="Garamond" w:hAnsi="Garamond"/>
+          <w:sz w:val="22"/>
+          <w:szCs w:val="22"/>
+        </w:rPr>
+        <w:t xml:space="preserve">compared the proportion of each stock’s total contribution within the front-end closure window </w:t>
+      </w:r>
+      <w:r>
+        <w:rPr>
+          <w:rFonts w:ascii="Garamond" w:hAnsi="Garamond"/>
+          <w:sz w:val="22"/>
+          <w:szCs w:val="22"/>
+        </w:rPr>
+        <w:t>(</w:t>
+      </w:r>
+      <w:r>
+        <w:rPr>
+          <w:rFonts w:ascii="Garamond" w:hAnsi="Garamond"/>
+          <w:sz w:val="22"/>
+          <w:szCs w:val="22"/>
+        </w:rPr>
+        <w:t>the first seasonal quartile</w:t>
+      </w:r>
+      <w:r>
+        <w:rPr>
+          <w:rFonts w:ascii="Garamond" w:hAnsi="Garamond"/>
+          <w:sz w:val="22"/>
+          <w:szCs w:val="22"/>
+        </w:rPr>
+        <w:t xml:space="preserve"> (Q1)</w:t>
+      </w:r>
+      <w:r>
+        <w:rPr>
+          <w:rFonts w:ascii="Garamond" w:hAnsi="Garamond"/>
+          <w:sz w:val="22"/>
+          <w:szCs w:val="22"/>
+        </w:rPr>
+        <w:t xml:space="preserve"> in our dataset). </w:t>
+      </w:r>
+      <w:r>
+        <w:rPr>
+          <w:rFonts w:ascii="Garamond" w:hAnsi="Garamond"/>
+          <w:sz w:val="22"/>
+          <w:szCs w:val="22"/>
+        </w:rPr>
+        <w:t xml:space="preserve">The resulting data illustrate the protection afforded to each stock based on the proportion of its total </w:t>
+      </w:r>
+      <w:r>
+        <w:rPr>
+          <w:rFonts w:ascii="Garamond" w:hAnsi="Garamond"/>
+          <w:sz w:val="22"/>
+          <w:szCs w:val="22"/>
+        </w:rPr>
+        <w:lastRenderedPageBreak/>
+        <w:t>run protected against harves</w:t>
+      </w:r>
+      <w:commentRangeStart w:id="12"/>
+      <w:r>
+        <w:rPr>
+          <w:rFonts w:ascii="Garamond" w:hAnsi="Garamond"/>
+          <w:sz w:val="22"/>
+          <w:szCs w:val="22"/>
+        </w:rPr>
+        <w:t>t</w:t>
+      </w:r>
+      <w:commentRangeEnd w:id="12"/>
+      <w:r>
+        <w:rPr>
+          <w:rStyle w:val="CommentReference"/>
+        </w:rPr>
+        <w:commentReference w:id="12"/>
+      </w:r>
+      <w:r>
+        <w:rPr>
+          <w:rFonts w:ascii="Garamond" w:hAnsi="Garamond"/>
+          <w:sz w:val="22"/>
+          <w:szCs w:val="22"/>
+        </w:rPr>
+        <w:t>. Variability in this protection was visualized by displaying the range and mean value across our sample set (Figure 4b).</w:t>
+      </w:r>
     </w:p>
     <w:p>
       <w:pPr>
@@ -5311,7 +5460,6 @@
           <w:sz w:val="22"/>
           <w:szCs w:val="22"/>
         </w:rPr>
-        <w:lastRenderedPageBreak/>
         <w:t>T</w:t>
       </w:r>
       <w:r>
@@ -6033,7 +6181,16 @@
           <w:sz w:val="22"/>
           <w:szCs w:val="22"/>
         </w:rPr>
-        <w:t xml:space="preserve"> (median; 6.1%</w:t>
+        <w:t xml:space="preserve"> (median; </w:t>
+      </w:r>
+      <w:r>
+        <w:rPr>
+          <w:rFonts w:ascii="Garamond" w:hAnsi="Garamond"/>
+          <w:sz w:val="22"/>
+          <w:szCs w:val="22"/>
+        </w:rPr>
+        <w:lastRenderedPageBreak/>
+        <w:t>6.1%</w:t>
       </w:r>
       <w:proofErr w:type="gramStart"/>
       <w:r>
@@ -6195,16 +6352,7 @@
           <w:sz w:val="22"/>
           <w:szCs w:val="22"/>
         </w:rPr>
-        <w:t xml:space="preserve">temporal scale and independent of the total contribution of each stock to </w:t>
-      </w:r>
-      <w:r>
-        <w:rPr>
-          <w:rFonts w:ascii="Garamond" w:hAnsi="Garamond"/>
-          <w:sz w:val="22"/>
-          <w:szCs w:val="22"/>
-        </w:rPr>
-        <w:lastRenderedPageBreak/>
-        <w:t xml:space="preserve">the overall run. </w:t>
+        <w:t xml:space="preserve">temporal scale and independent of the total contribution of each stock to the overall run. </w:t>
       </w:r>
       <w:r>
         <w:rPr>
@@ -6471,6 +6619,26 @@
           <w:szCs w:val="22"/>
         </w:rPr>
         <w:t xml:space="preserve">of the run. </w:t>
+      </w:r>
+    </w:p>
+    <w:p>
+      <w:pPr>
+        <w:pStyle w:val="whitespace-normal"/>
+        <w:spacing w:line="480" w:lineRule="auto"/>
+        <w:ind w:firstLine="720"/>
+        <w:rPr>
+          <w:rFonts w:ascii="Garamond" w:hAnsi="Garamond"/>
+          <w:sz w:val="22"/>
+          <w:szCs w:val="22"/>
+        </w:rPr>
+      </w:pPr>
+      <w:r>
+        <w:rPr>
+          <w:rFonts w:ascii="Garamond" w:hAnsi="Garamond"/>
+          <w:sz w:val="22"/>
+          <w:szCs w:val="22"/>
+        </w:rPr>
+        <w:t xml:space="preserve">*** ADD 50% run analysis *** </w:t>
       </w:r>
     </w:p>
     <w:p>
@@ -6548,6 +6716,22 @@
         </w:rPr>
         <w:t xml:space="preserve">.  Nearly all stocks upstream of Swift River received median protection &gt;10% of the total stock contribution across all years of our dataset, with several notable </w:t>
       </w:r>
+      <w:r>
+        <w:rPr>
+          <w:rFonts w:ascii="Garamond" w:hAnsi="Garamond"/>
+          <w:sz w:val="22"/>
+          <w:szCs w:val="22"/>
+        </w:rPr>
+        <w:t>outliers</w:t>
+      </w:r>
+      <w:r>
+        <w:rPr>
+          <w:rFonts w:ascii="Garamond" w:hAnsi="Garamond"/>
+          <w:sz w:val="22"/>
+          <w:szCs w:val="22"/>
+        </w:rPr>
+        <w:t xml:space="preserve"> &gt;30% protection in some years. An exception is the </w:t>
+      </w:r>
       <w:proofErr w:type="spellStart"/>
       <w:r>
         <w:rPr>
@@ -6555,7 +6739,7 @@
           <w:sz w:val="22"/>
           <w:szCs w:val="22"/>
         </w:rPr>
-        <w:t>outlkiers</w:t>
+        <w:t>Takotna</w:t>
       </w:r>
       <w:proofErr w:type="spellEnd"/>
       <w:r>
@@ -6564,7 +6748,31 @@
           <w:sz w:val="22"/>
           <w:szCs w:val="22"/>
         </w:rPr>
-        <w:t xml:space="preserve"> &gt;30% protection in some years. An exception is the </w:t>
+        <w:t xml:space="preserve"> river and Nixon Fork stocks, which received a median protection of only 6.6%. Several stocks which contribute only minimally to the overall run are afforded significant protection. For example, although the East Fork Kuskokwim contributes minimally to the total run</w:t>
+      </w:r>
+      <w:r>
+        <w:rPr>
+          <w:rFonts w:ascii="Garamond" w:hAnsi="Garamond"/>
+          <w:sz w:val="22"/>
+          <w:szCs w:val="22"/>
+        </w:rPr>
+        <w:t xml:space="preserve"> (~2-3% annually), approximately one-quarter of its total returns are protected by a front-end closure. </w:t>
+      </w:r>
+      <w:r>
+        <w:rPr>
+          <w:rFonts w:ascii="Garamond" w:hAnsi="Garamond"/>
+          <w:sz w:val="22"/>
+          <w:szCs w:val="22"/>
+        </w:rPr>
+        <w:t xml:space="preserve">Stocks positioned lower in the watershed received less protection due to their generally late arrival, with all stocks downstream or the Swift River receiving </w:t>
+      </w:r>
+      <w:r>
+        <w:rPr>
+          <w:rFonts w:ascii="Garamond" w:hAnsi="Garamond"/>
+          <w:sz w:val="22"/>
+          <w:szCs w:val="22"/>
+        </w:rPr>
+        <w:t xml:space="preserve">median protection of less than 10%. The stony and </w:t>
       </w:r>
       <w:proofErr w:type="spellStart"/>
       <w:r>
@@ -6573,48 +6781,7 @@
           <w:sz w:val="22"/>
           <w:szCs w:val="22"/>
         </w:rPr>
-        <w:t>Takotna</w:t>
-      </w:r>
-      <w:proofErr w:type="spellEnd"/>
-      <w:r>
-        <w:rPr>
-          <w:rFonts w:ascii="Garamond" w:hAnsi="Garamond"/>
-          <w:sz w:val="22"/>
-          <w:szCs w:val="22"/>
-        </w:rPr>
-        <w:t xml:space="preserve"> river and Nixon Fork stocks, which received a median protection of only 6.6%. Several stocks which contribute only minimally to the overall run are afforded significant protection. For example, although the East Fork Kuskokwim contributes minimally to the total run</w:t>
-      </w:r>
-      <w:r>
-        <w:rPr>
-          <w:rFonts w:ascii="Garamond" w:hAnsi="Garamond"/>
-          <w:sz w:val="22"/>
-          <w:szCs w:val="22"/>
-        </w:rPr>
-        <w:t xml:space="preserve"> (~2-3% annually), approximately one-quarter of its total returns are protected by a front-end closure. </w:t>
-      </w:r>
-      <w:r>
-        <w:rPr>
-          <w:rFonts w:ascii="Garamond" w:hAnsi="Garamond"/>
-          <w:sz w:val="22"/>
-          <w:szCs w:val="22"/>
-        </w:rPr>
-        <w:t xml:space="preserve">Stocks positioned lower in the watershed received less protection due to their generally late arrival, with all stocks downstream or the Swift River receiving </w:t>
-      </w:r>
-      <w:r>
-        <w:rPr>
-          <w:rFonts w:ascii="Garamond" w:hAnsi="Garamond"/>
-          <w:sz w:val="22"/>
-          <w:szCs w:val="22"/>
-        </w:rPr>
-        <w:t xml:space="preserve">median protection of less than 10%. The stony and </w:t>
-      </w:r>
-      <w:proofErr w:type="spellStart"/>
-      <w:r>
-        <w:rPr>
-          <w:rFonts w:ascii="Garamond" w:hAnsi="Garamond"/>
-          <w:sz w:val="22"/>
-          <w:szCs w:val="22"/>
-        </w:rPr>
+        <w:lastRenderedPageBreak/>
         <w:t>Hoholitna</w:t>
       </w:r>
       <w:proofErr w:type="spellEnd"/>
@@ -6687,18 +6854,32 @@
           <w:sz w:val="22"/>
           <w:szCs w:val="22"/>
         </w:rPr>
-        <w:t xml:space="preserve">The analysis presented here illustrates the spatiotemporal patterns of Chinook salmon in the Kuskokwim river-basin at a finer spatial scale and over a longer </w:t>
-      </w:r>
-      <w:proofErr w:type="gramStart"/>
-      <w:r>
-        <w:rPr>
-          <w:rFonts w:ascii="Garamond" w:hAnsi="Garamond"/>
-          <w:sz w:val="22"/>
-          <w:szCs w:val="22"/>
-        </w:rPr>
-        <w:t>time period</w:t>
-      </w:r>
-      <w:proofErr w:type="gramEnd"/>
+        <w:t xml:space="preserve">The analysis presented here illustrates spatiotemporal patterns of Chinook salmon in the Kuskokwim river-basin at a finer spatial scale and over a longer </w:t>
+      </w:r>
+      <w:r>
+        <w:rPr>
+          <w:rFonts w:ascii="Garamond" w:hAnsi="Garamond"/>
+          <w:sz w:val="22"/>
+          <w:szCs w:val="22"/>
+        </w:rPr>
+        <w:t>time</w:t>
+      </w:r>
+      <w:r>
+        <w:rPr>
+          <w:rFonts w:ascii="Garamond" w:hAnsi="Garamond"/>
+          <w:sz w:val="22"/>
+          <w:szCs w:val="22"/>
+        </w:rPr>
+        <w:t>-</w:t>
+      </w:r>
+      <w:r>
+        <w:rPr>
+          <w:rFonts w:ascii="Garamond" w:hAnsi="Garamond"/>
+          <w:sz w:val="22"/>
+          <w:szCs w:val="22"/>
+        </w:rPr>
+        <w:t>period</w:t>
+      </w:r>
       <w:r>
         <w:rPr>
           <w:rFonts w:ascii="Garamond" w:hAnsi="Garamond"/>
@@ -6721,7 +6902,6 @@
           <w:sz w:val="22"/>
           <w:szCs w:val="22"/>
         </w:rPr>
-        <w:lastRenderedPageBreak/>
         <w:t xml:space="preserve">available. In doing so, we corroborated </w:t>
       </w:r>
       <w:r>
@@ -6730,7 +6910,15 @@
           <w:sz w:val="22"/>
           <w:szCs w:val="22"/>
         </w:rPr>
-        <w:t>a preliminarily observed</w:t>
+        <w:t xml:space="preserve">the </w:t>
+      </w:r>
+      <w:r>
+        <w:rPr>
+          <w:rFonts w:ascii="Garamond" w:hAnsi="Garamond"/>
+          <w:sz w:val="22"/>
+          <w:szCs w:val="22"/>
+        </w:rPr>
+        <w:t>preliminarily observed</w:t>
       </w:r>
       <w:r>
         <w:rPr>
@@ -6754,7 +6942,23 @@
           <w:sz w:val="22"/>
           <w:szCs w:val="22"/>
         </w:rPr>
-        <w:t xml:space="preserve">his pattern </w:t>
+        <w:t xml:space="preserve">his </w:t>
+      </w:r>
+      <w:r>
+        <w:rPr>
+          <w:rFonts w:ascii="Garamond" w:hAnsi="Garamond"/>
+          <w:sz w:val="22"/>
+          <w:szCs w:val="22"/>
+        </w:rPr>
+        <w:t xml:space="preserve">general </w:t>
+      </w:r>
+      <w:r>
+        <w:rPr>
+          <w:rFonts w:ascii="Garamond" w:hAnsi="Garamond"/>
+          <w:sz w:val="22"/>
+          <w:szCs w:val="22"/>
+        </w:rPr>
+        <w:t xml:space="preserve">pattern </w:t>
       </w:r>
       <w:r>
         <w:rPr>
@@ -6778,76 +6982,23 @@
           <w:sz w:val="22"/>
           <w:szCs w:val="22"/>
         </w:rPr>
-        <w:t xml:space="preserve"> throughout our multi-year dataset despite significant differences in run timing and overall run strength. The</w:t>
-      </w:r>
-      <w:r>
-        <w:rPr>
-          <w:rFonts w:ascii="Garamond" w:hAnsi="Garamond"/>
-          <w:sz w:val="22"/>
-          <w:szCs w:val="22"/>
-        </w:rPr>
-        <w:t xml:space="preserve">se results highlight the consistency of this pattern in the </w:t>
-      </w:r>
-      <w:proofErr w:type="gramStart"/>
-      <w:r>
-        <w:rPr>
-          <w:rFonts w:ascii="Garamond" w:hAnsi="Garamond"/>
-          <w:sz w:val="22"/>
-          <w:szCs w:val="22"/>
-        </w:rPr>
-        <w:t>Kuskokwim river</w:t>
-      </w:r>
-      <w:proofErr w:type="gramEnd"/>
-      <w:r>
-        <w:rPr>
-          <w:rFonts w:ascii="Garamond" w:hAnsi="Garamond"/>
-          <w:sz w:val="22"/>
-          <w:szCs w:val="22"/>
-        </w:rPr>
-        <w:t xml:space="preserve"> </w:t>
-      </w:r>
-      <w:proofErr w:type="gramStart"/>
-      <w:r>
-        <w:rPr>
-          <w:rFonts w:ascii="Garamond" w:hAnsi="Garamond"/>
-          <w:sz w:val="22"/>
-          <w:szCs w:val="22"/>
-        </w:rPr>
-        <w:t>basin, and</w:t>
-      </w:r>
-      <w:proofErr w:type="gramEnd"/>
-      <w:r>
-        <w:rPr>
-          <w:rFonts w:ascii="Garamond" w:hAnsi="Garamond"/>
-          <w:sz w:val="22"/>
-          <w:szCs w:val="22"/>
-        </w:rPr>
-        <w:t xml:space="preserve"> has significant implications for management strategy which aims to protect up stream stocks. In our evaluation of the current implemented front-end closure ending on June 11</w:t>
-      </w:r>
-      <w:r>
-        <w:rPr>
-          <w:rFonts w:ascii="Garamond" w:hAnsi="Garamond"/>
-          <w:sz w:val="22"/>
-          <w:szCs w:val="22"/>
-          <w:vertAlign w:val="superscript"/>
-        </w:rPr>
-        <w:t>th</w:t>
-      </w:r>
-      <w:r>
-        <w:rPr>
-          <w:rFonts w:ascii="Garamond" w:hAnsi="Garamond"/>
-          <w:sz w:val="22"/>
-          <w:szCs w:val="22"/>
-        </w:rPr>
-        <w:t xml:space="preserve">, upper Kuskokwim stocks such as ____, ____, and ____ were afforded significant protection from the fishery. In doing so, this strategy appears to successfully allow upper Kuskokwim fish to return to upstream tributaries, thereby providing subsistence opportunities for upper Kuskokwim communities and </w:t>
-      </w:r>
-      <w:r>
-        <w:rPr>
-          <w:rFonts w:ascii="Garamond" w:hAnsi="Garamond"/>
-          <w:sz w:val="22"/>
-          <w:szCs w:val="22"/>
-        </w:rPr>
-        <w:t xml:space="preserve">protecting a significant portion of the overall returns from downstream harvest in subsistence or commercial fisheries. </w:t>
+        <w:t xml:space="preserve"> throughout our multi-year dataset</w:t>
+      </w:r>
+      <w:r>
+        <w:rPr>
+          <w:rFonts w:ascii="Garamond" w:hAnsi="Garamond"/>
+          <w:sz w:val="22"/>
+          <w:szCs w:val="22"/>
+        </w:rPr>
+        <w:t xml:space="preserve">, however, significant interannual variability was observed in the proportional contribution and relative timing among stocks. This result is consistent with </w:t>
+      </w:r>
+      <w:r>
+        <w:rPr>
+          <w:rFonts w:ascii="Garamond" w:hAnsi="Garamond"/>
+          <w:sz w:val="22"/>
+          <w:szCs w:val="22"/>
+        </w:rPr>
+        <w:t xml:space="preserve">documented variability in salmon ecosystems and further supports previous research highlighting shifting salmon production across river basins at annual timescales (Brennan et al., 2019). </w:t>
       </w:r>
     </w:p>
     <w:p>
@@ -6867,95 +7018,64 @@
           <w:sz w:val="22"/>
           <w:szCs w:val="22"/>
         </w:rPr>
-        <w:t>Despite</w:t>
-      </w:r>
-      <w:r>
-        <w:rPr>
-          <w:rFonts w:ascii="Garamond" w:hAnsi="Garamond"/>
-          <w:sz w:val="22"/>
-          <w:szCs w:val="22"/>
-        </w:rPr>
-        <w:t xml:space="preserve"> </w:t>
-      </w:r>
-      <w:r>
-        <w:rPr>
-          <w:rFonts w:ascii="Garamond" w:hAnsi="Garamond"/>
-          <w:sz w:val="22"/>
-          <w:szCs w:val="22"/>
-        </w:rPr>
-        <w:t>clear</w:t>
-      </w:r>
-      <w:r>
-        <w:rPr>
-          <w:rFonts w:ascii="Garamond" w:hAnsi="Garamond"/>
-          <w:sz w:val="22"/>
-          <w:szCs w:val="22"/>
-        </w:rPr>
-        <w:t>ly higher</w:t>
-      </w:r>
-      <w:r>
-        <w:rPr>
-          <w:rFonts w:ascii="Garamond" w:hAnsi="Garamond"/>
-          <w:sz w:val="22"/>
-          <w:szCs w:val="22"/>
-        </w:rPr>
-        <w:t xml:space="preserve"> average protection afforded </w:t>
-      </w:r>
-      <w:r>
-        <w:rPr>
-          <w:rFonts w:ascii="Garamond" w:hAnsi="Garamond"/>
-          <w:sz w:val="22"/>
-          <w:szCs w:val="22"/>
-        </w:rPr>
-        <w:t xml:space="preserve">to upper watershed stocks by the front-end closure, the range of protection values in our dataset is notable (Figure 5). </w:t>
-      </w:r>
-      <w:r>
-        <w:rPr>
-          <w:rFonts w:ascii="Garamond" w:hAnsi="Garamond"/>
-          <w:sz w:val="22"/>
-          <w:szCs w:val="22"/>
-        </w:rPr>
-        <w:t>Although the closure operates on a fixed date, return timing is variable among year</w:t>
-      </w:r>
-      <w:r>
-        <w:rPr>
-          <w:rFonts w:ascii="Garamond" w:hAnsi="Garamond"/>
-          <w:sz w:val="22"/>
-          <w:szCs w:val="22"/>
-        </w:rPr>
-        <w:t>s and t</w:t>
-      </w:r>
-      <w:r>
-        <w:rPr>
-          <w:rFonts w:ascii="Garamond" w:hAnsi="Garamond"/>
-          <w:sz w:val="22"/>
-          <w:szCs w:val="22"/>
-        </w:rPr>
-        <w:t>he relative proportion of the run within the front-end window is dependent on both the timing (early vs late) and the duration (extended vs protracted) of the overall return. Late return timing or extended run duration may result in less proportional contribution within the closure window as comp</w:t>
-      </w:r>
-      <w:r>
-        <w:rPr>
-          <w:rFonts w:ascii="Garamond" w:hAnsi="Garamond"/>
-          <w:sz w:val="22"/>
-          <w:szCs w:val="22"/>
-        </w:rPr>
-        <w:t>a</w:t>
-      </w:r>
-      <w:r>
-        <w:rPr>
-          <w:rFonts w:ascii="Garamond" w:hAnsi="Garamond"/>
-          <w:sz w:val="22"/>
-          <w:szCs w:val="22"/>
-        </w:rPr>
-        <w:t>red to earlier returning and more protracted run timing. As a result,</w:t>
-      </w:r>
-      <w:r>
-        <w:rPr>
-          <w:rFonts w:ascii="Garamond" w:hAnsi="Garamond"/>
-          <w:sz w:val="22"/>
-          <w:szCs w:val="22"/>
-        </w:rPr>
-        <w:t xml:space="preserve"> both the amount of protection as well as the number of stocks afforded that protection depend on the interaction between the run dynamics and the timing of the closure. A more dynamic closure which is flexible based on the timing of the run may provide more consistent protection to upstream stocks. </w:t>
+        <w:t xml:space="preserve">A </w:t>
+      </w:r>
+      <w:r>
+        <w:rPr>
+          <w:rFonts w:ascii="Garamond" w:hAnsi="Garamond"/>
+          <w:sz w:val="22"/>
+          <w:szCs w:val="22"/>
+        </w:rPr>
+        <w:t xml:space="preserve">clear trend </w:t>
+      </w:r>
+      <w:r>
+        <w:rPr>
+          <w:rFonts w:ascii="Garamond" w:hAnsi="Garamond"/>
+          <w:sz w:val="22"/>
+          <w:szCs w:val="22"/>
+        </w:rPr>
+        <w:t>in</w:t>
+      </w:r>
+      <w:r>
+        <w:rPr>
+          <w:rFonts w:ascii="Garamond" w:hAnsi="Garamond"/>
+          <w:sz w:val="22"/>
+          <w:szCs w:val="22"/>
+        </w:rPr>
+        <w:t xml:space="preserve"> early returning up</w:t>
+      </w:r>
+      <w:r>
+        <w:rPr>
+          <w:rFonts w:ascii="Garamond" w:hAnsi="Garamond"/>
+          <w:sz w:val="22"/>
+          <w:szCs w:val="22"/>
+        </w:rPr>
+        <w:t>river stocks support the stated goal of the front-end closure aiming to protect the upstream stocks from over-harvest. As a proportion of the total run, our analysis supports the efficacy of this approach, with upper Kuskokwim stocks such as ___, ____, and ____ afforded significant protection by a front-end closure ending on June 11</w:t>
+      </w:r>
+      <w:r>
+        <w:rPr>
+          <w:rFonts w:ascii="Garamond" w:hAnsi="Garamond"/>
+          <w:sz w:val="22"/>
+          <w:szCs w:val="22"/>
+          <w:vertAlign w:val="superscript"/>
+        </w:rPr>
+        <w:t>th</w:t>
+      </w:r>
+      <w:r>
+        <w:rPr>
+          <w:rFonts w:ascii="Garamond" w:hAnsi="Garamond"/>
+          <w:sz w:val="22"/>
+          <w:szCs w:val="22"/>
+        </w:rPr>
+        <w:t xml:space="preserve">.  </w:t>
+      </w:r>
+      <w:r>
+        <w:rPr>
+          <w:rFonts w:ascii="Garamond" w:hAnsi="Garamond"/>
+          <w:sz w:val="22"/>
+          <w:szCs w:val="22"/>
+        </w:rPr>
+        <w:t xml:space="preserve">Across nearly all stocks upstream </w:t>
       </w:r>
     </w:p>
     <w:p>
@@ -6975,6 +7095,178 @@
           <w:sz w:val="22"/>
           <w:szCs w:val="22"/>
         </w:rPr>
+        <w:t xml:space="preserve"> </w:t>
+      </w:r>
+    </w:p>
+    <w:p>
+      <w:pPr>
+        <w:pStyle w:val="whitespace-normal"/>
+        <w:spacing w:line="480" w:lineRule="auto"/>
+        <w:ind w:firstLine="720"/>
+        <w:rPr>
+          <w:rFonts w:ascii="Garamond" w:hAnsi="Garamond"/>
+          <w:sz w:val="22"/>
+          <w:szCs w:val="22"/>
+        </w:rPr>
+      </w:pPr>
+    </w:p>
+    <w:p>
+      <w:pPr>
+        <w:pStyle w:val="whitespace-normal"/>
+        <w:spacing w:line="480" w:lineRule="auto"/>
+        <w:ind w:firstLine="720"/>
+        <w:rPr>
+          <w:rFonts w:ascii="Garamond" w:hAnsi="Garamond"/>
+          <w:b/>
+          <w:bCs/>
+          <w:sz w:val="32"/>
+          <w:szCs w:val="32"/>
+          <w:u w:val="single"/>
+        </w:rPr>
+      </w:pPr>
+      <w:r>
+        <w:rPr>
+          <w:rFonts w:ascii="Garamond" w:hAnsi="Garamond"/>
+          <w:sz w:val="22"/>
+          <w:szCs w:val="22"/>
+        </w:rPr>
+        <w:t xml:space="preserve">upper Kuskokwim stocks such as ____, ____, and ____ were afforded significant protection from the fishery. In doing so, this strategy appears to successfully allow upper Kuskokwim fish to return to upstream tributaries, thereby providing subsistence opportunities for upper Kuskokwim communities and </w:t>
+      </w:r>
+      <w:r>
+        <w:rPr>
+          <w:rFonts w:ascii="Garamond" w:hAnsi="Garamond"/>
+          <w:sz w:val="22"/>
+          <w:szCs w:val="22"/>
+        </w:rPr>
+        <w:lastRenderedPageBreak/>
+        <w:t xml:space="preserve">protecting a significant portion of the overall returns from downstream harvest in subsistence or commercial fisheries. </w:t>
+      </w:r>
+    </w:p>
+    <w:p>
+      <w:pPr>
+        <w:pStyle w:val="whitespace-normal"/>
+        <w:spacing w:line="480" w:lineRule="auto"/>
+        <w:ind w:firstLine="720"/>
+        <w:rPr>
+          <w:rFonts w:ascii="Garamond" w:hAnsi="Garamond"/>
+          <w:sz w:val="22"/>
+          <w:szCs w:val="22"/>
+        </w:rPr>
+      </w:pPr>
+      <w:r>
+        <w:rPr>
+          <w:rFonts w:ascii="Garamond" w:hAnsi="Garamond"/>
+          <w:sz w:val="22"/>
+          <w:szCs w:val="22"/>
+        </w:rPr>
+        <w:t>Despite</w:t>
+      </w:r>
+      <w:r>
+        <w:rPr>
+          <w:rFonts w:ascii="Garamond" w:hAnsi="Garamond"/>
+          <w:sz w:val="22"/>
+          <w:szCs w:val="22"/>
+        </w:rPr>
+        <w:t xml:space="preserve"> </w:t>
+      </w:r>
+      <w:r>
+        <w:rPr>
+          <w:rFonts w:ascii="Garamond" w:hAnsi="Garamond"/>
+          <w:sz w:val="22"/>
+          <w:szCs w:val="22"/>
+        </w:rPr>
+        <w:t>clear</w:t>
+      </w:r>
+      <w:r>
+        <w:rPr>
+          <w:rFonts w:ascii="Garamond" w:hAnsi="Garamond"/>
+          <w:sz w:val="22"/>
+          <w:szCs w:val="22"/>
+        </w:rPr>
+        <w:t>ly higher</w:t>
+      </w:r>
+      <w:r>
+        <w:rPr>
+          <w:rFonts w:ascii="Garamond" w:hAnsi="Garamond"/>
+          <w:sz w:val="22"/>
+          <w:szCs w:val="22"/>
+        </w:rPr>
+        <w:t xml:space="preserve"> average protection afforded </w:t>
+      </w:r>
+      <w:r>
+        <w:rPr>
+          <w:rFonts w:ascii="Garamond" w:hAnsi="Garamond"/>
+          <w:sz w:val="22"/>
+          <w:szCs w:val="22"/>
+        </w:rPr>
+        <w:t xml:space="preserve">to upper watershed stocks by the front-end closure, the range of protection values in our dataset is notable (Figure 5). </w:t>
+      </w:r>
+      <w:r>
+        <w:rPr>
+          <w:rFonts w:ascii="Garamond" w:hAnsi="Garamond"/>
+          <w:sz w:val="22"/>
+          <w:szCs w:val="22"/>
+        </w:rPr>
+        <w:t>Although the closure operates on a fixed date, return timing is variable among year</w:t>
+      </w:r>
+      <w:r>
+        <w:rPr>
+          <w:rFonts w:ascii="Garamond" w:hAnsi="Garamond"/>
+          <w:sz w:val="22"/>
+          <w:szCs w:val="22"/>
+        </w:rPr>
+        <w:t>s and t</w:t>
+      </w:r>
+      <w:r>
+        <w:rPr>
+          <w:rFonts w:ascii="Garamond" w:hAnsi="Garamond"/>
+          <w:sz w:val="22"/>
+          <w:szCs w:val="22"/>
+        </w:rPr>
+        <w:t>he relative proportion of the run within the front-end window is dependent on both the timing (early vs late) and the duration (extended vs protracted) of the overall return. Late return timing or extended run duration may result in less proportional contribution within the closure window as comp</w:t>
+      </w:r>
+      <w:r>
+        <w:rPr>
+          <w:rFonts w:ascii="Garamond" w:hAnsi="Garamond"/>
+          <w:sz w:val="22"/>
+          <w:szCs w:val="22"/>
+        </w:rPr>
+        <w:t>a</w:t>
+      </w:r>
+      <w:r>
+        <w:rPr>
+          <w:rFonts w:ascii="Garamond" w:hAnsi="Garamond"/>
+          <w:sz w:val="22"/>
+          <w:szCs w:val="22"/>
+        </w:rPr>
+        <w:t>red to earlier returning and more protracted run timing. As a result,</w:t>
+      </w:r>
+      <w:r>
+        <w:rPr>
+          <w:rFonts w:ascii="Garamond" w:hAnsi="Garamond"/>
+          <w:sz w:val="22"/>
+          <w:szCs w:val="22"/>
+        </w:rPr>
+        <w:t xml:space="preserve"> both the amount of protection as well as the number of stocks afforded that protection depend on the interaction between the run dynamics and the timing of the closure. A more dynamic closure which is flexible based on the timing of the run may provide more consistent protection to upstream stocks. </w:t>
+      </w:r>
+    </w:p>
+    <w:p>
+      <w:pPr>
+        <w:pStyle w:val="whitespace-normal"/>
+        <w:spacing w:line="480" w:lineRule="auto"/>
+        <w:ind w:firstLine="720"/>
+        <w:rPr>
+          <w:rFonts w:ascii="Garamond" w:hAnsi="Garamond"/>
+          <w:sz w:val="22"/>
+          <w:szCs w:val="22"/>
+        </w:rPr>
+      </w:pPr>
+      <w:r>
+        <w:rPr>
+          <w:rFonts w:ascii="Garamond" w:hAnsi="Garamond"/>
+          <w:sz w:val="22"/>
+          <w:szCs w:val="22"/>
+        </w:rPr>
         <w:t>In addition to providing a more thorough understanding of the spatiotemporal patterns of returning Chinook salmon in the Kuskokwim-river basin, t</w:t>
       </w:r>
       <w:r>
@@ -6999,7 +7291,63 @@
           <w:sz w:val="22"/>
           <w:szCs w:val="22"/>
         </w:rPr>
-        <w:t xml:space="preserve">The patterns observed in our dataset support both the preliminary understanding of the relationship between return timing and watershed position and the well-established understanding of salmon ecosystem dynamics at annual and sub-annual </w:t>
+        <w:t>The patterns observed in our dataset support both the preliminary understanding of the relationship between return timing and watershed position and the well-established understanding of salmon ecosystem dynamics at annual and sub-annual timescales.</w:t>
+      </w:r>
+      <w:r>
+        <w:rPr>
+          <w:rFonts w:ascii="Garamond" w:hAnsi="Garamond"/>
+          <w:sz w:val="22"/>
+          <w:szCs w:val="22"/>
+        </w:rPr>
+        <w:t xml:space="preserve"> </w:t>
+      </w:r>
+      <w:r>
+        <w:rPr>
+          <w:rFonts w:ascii="Garamond" w:hAnsi="Garamond"/>
+          <w:sz w:val="22"/>
+          <w:szCs w:val="22"/>
+        </w:rPr>
+        <w:t>Exploring ecosystem-wide patterns at the tributary scale may provide managers with a more complete understanding of ecosystem processes, offering both comprehensive basin-wide insights and fine-scale estimates relevant to localized management decisions</w:t>
+      </w:r>
+      <w:r>
+        <w:rPr>
+          <w:rFonts w:ascii="Garamond" w:hAnsi="Garamond"/>
+          <w:sz w:val="22"/>
+          <w:szCs w:val="22"/>
+        </w:rPr>
+        <w:t xml:space="preserve">. </w:t>
+      </w:r>
+      <w:r>
+        <w:rPr>
+          <w:rFonts w:ascii="Garamond" w:hAnsi="Garamond"/>
+          <w:sz w:val="22"/>
+          <w:szCs w:val="22"/>
+        </w:rPr>
+        <w:t xml:space="preserve">While otolith-based methods used in this study have not been explicitly validated for the Kuskokwim River Basin, they have demonstrated high assignment accuracy for Pacific salmon in similar Alaska watersheds. These methods do contain some limitations for large-scale implementation in </w:t>
+      </w:r>
+      <w:r>
+        <w:rPr>
+          <w:rFonts w:ascii="Garamond" w:hAnsi="Garamond"/>
+          <w:sz w:val="22"/>
+          <w:szCs w:val="22"/>
+        </w:rPr>
+        <w:t>management;</w:t>
+      </w:r>
+      <w:r>
+        <w:rPr>
+          <w:rFonts w:ascii="Garamond" w:hAnsi="Garamond"/>
+          <w:sz w:val="22"/>
+          <w:szCs w:val="22"/>
+        </w:rPr>
+        <w:t xml:space="preserve"> most notably significant turnaround time compared to genetics-based techniques and the potential for assignment error due to limitations in isotopic heterogeneity. </w:t>
+      </w:r>
+      <w:r>
+        <w:rPr>
+          <w:rFonts w:ascii="Garamond" w:hAnsi="Garamond"/>
+          <w:sz w:val="22"/>
+          <w:szCs w:val="22"/>
+        </w:rPr>
+        <w:t xml:space="preserve">Despite these limitations, otolith microchemistry remains well-suited for exploring spatial patterns across large, </w:t>
       </w:r>
       <w:r>
         <w:rPr>
@@ -7008,63 +7356,7 @@
           <w:szCs w:val="22"/>
         </w:rPr>
         <w:lastRenderedPageBreak/>
-        <w:t>timescales.</w:t>
-      </w:r>
-      <w:r>
-        <w:rPr>
-          <w:rFonts w:ascii="Garamond" w:hAnsi="Garamond"/>
-          <w:sz w:val="22"/>
-          <w:szCs w:val="22"/>
-        </w:rPr>
-        <w:t xml:space="preserve"> </w:t>
-      </w:r>
-      <w:r>
-        <w:rPr>
-          <w:rFonts w:ascii="Garamond" w:hAnsi="Garamond"/>
-          <w:sz w:val="22"/>
-          <w:szCs w:val="22"/>
-        </w:rPr>
-        <w:t>Exploring ecosystem-wide patterns at the tributary scale may provide managers with a more complete understanding of ecosystem processes, offering both comprehensive basin-wide insights and fine-scale estimates relevant to localized management decisions</w:t>
-      </w:r>
-      <w:r>
-        <w:rPr>
-          <w:rFonts w:ascii="Garamond" w:hAnsi="Garamond"/>
-          <w:sz w:val="22"/>
-          <w:szCs w:val="22"/>
-        </w:rPr>
-        <w:t xml:space="preserve">. </w:t>
-      </w:r>
-      <w:r>
-        <w:rPr>
-          <w:rFonts w:ascii="Garamond" w:hAnsi="Garamond"/>
-          <w:sz w:val="22"/>
-          <w:szCs w:val="22"/>
-        </w:rPr>
-        <w:t xml:space="preserve">While otolith-based methods used in this study have not been explicitly validated for the Kuskokwim River Basin, they have demonstrated high assignment accuracy for Pacific salmon in similar Alaska watersheds. These methods do contain some limitations for large-scale implementation in </w:t>
-      </w:r>
-      <w:r>
-        <w:rPr>
-          <w:rFonts w:ascii="Garamond" w:hAnsi="Garamond"/>
-          <w:sz w:val="22"/>
-          <w:szCs w:val="22"/>
-        </w:rPr>
-        <w:t>management;</w:t>
-      </w:r>
-      <w:r>
-        <w:rPr>
-          <w:rFonts w:ascii="Garamond" w:hAnsi="Garamond"/>
-          <w:sz w:val="22"/>
-          <w:szCs w:val="22"/>
-        </w:rPr>
-        <w:t xml:space="preserve"> most notably significant turnaround time compared to genetics-based techniques and the potential for assignment error due to limitations in isotopic heterogeneity. </w:t>
-      </w:r>
-      <w:r>
-        <w:rPr>
-          <w:rFonts w:ascii="Garamond" w:hAnsi="Garamond"/>
-          <w:sz w:val="22"/>
-          <w:szCs w:val="22"/>
-        </w:rPr>
-        <w:t>Despite these limitations, otolith microchemistry remains well-suited for exploring spatial patterns across large, remote watersheds where e</w:t>
+        <w:t>remote watersheds where e</w:t>
       </w:r>
       <w:r>
         <w:rPr>
@@ -7481,266 +7773,274 @@
           <w:sz w:val="22"/>
           <w:szCs w:val="22"/>
         </w:rPr>
+        <w:t>Chinook salmon populations are experiencing unprecedented declines across much of their range</w:t>
+      </w:r>
+      <w:r>
+        <w:rPr>
+          <w:rFonts w:ascii="Garamond" w:hAnsi="Garamond"/>
+          <w:sz w:val="22"/>
+          <w:szCs w:val="22"/>
+        </w:rPr>
+        <w:t xml:space="preserve"> </w:t>
+      </w:r>
+      <w:r>
+        <w:rPr>
+          <w:rFonts w:ascii="Garamond" w:hAnsi="Garamond"/>
+          <w:sz w:val="22"/>
+          <w:szCs w:val="22"/>
+        </w:rPr>
+        <w:fldChar w:fldCharType="begin"/>
+      </w:r>
+      <w:r>
+        <w:rPr>
+          <w:rFonts w:ascii="Garamond" w:hAnsi="Garamond"/>
+          <w:sz w:val="22"/>
+          <w:szCs w:val="22"/>
+        </w:rPr>
+        <w:instrText xml:space="preserve"> ADDIN ZOTERO_ITEM CSL_CITATION {"citationID":"lr8eoJO9","properties":{"formattedCitation":"(Atlas et al., 2023; Ohlberger et al., 2018)","plainCitation":"(Atlas et al., 2023; Ohlberger et al., 2018)","noteIndex":0},"citationItems":[{"id":5384,"uris":["http://zotero.org/users/8421274/items/YYBUBGXV"],"itemData":{"id":5384,"type":"article-journal","abstract":"Chinook salmon (Oncorhynchus tshawytscha, Salmonidae) are foundational to social-ecological systems of the Northeast Pacific Rim and exhibit a rich diversity of life histories including in their adult migration timing, age at critical life-history transitions and marine feeding distributions. In recent decades Chinook have experienced declines across much of their native range; however, changes in productivity and abundance have rarely been evaluated in relation to life-history variation. To understand trends in Chinook salmon production, and how they are related to life history, we compiled time series data from the Fraser River to the Sacramento River on total run size (pre-fishery abundance) and escapement (post-fishery spawner abundance) and fit time series models to estimate trends across this bioregion. Our analysis revealed that most Chinook populations are declining, with negative trends in escapement (57 of 79) and total run (16 of 23) size. Trends were most acutely negative for interior spring Chinook in the Fraser, Columbia and Snake Rivers and most populations in California. Summer and fall Chinook had mixed trends, with several summer and fall upriver bright populations in the interior Columbia and Fraser exhibiting increases in abundance from the 1990s to 2019. Our research reveals widespread declines of this important species, but local complexity in trends that are mediated by population-level life history, migratory behaviours and watershed-scale restoration actions. Understanding linkages between life histories and resilience should inform rebuilding efforts for Chinook salmon and highlight the need to conserve intraspecific biodiversity.","container-title":"Fish and Fisheries","DOI":"10.1111/faf.12750","ISSN":"1467-2979","issue":"4","language":"en","license":"© 2023 The Authors. Fish and Fisheries published by John Wiley &amp; Sons Ltd.","note":"_eprint: https://onlinelibrary.wiley.com/doi/pdf/10.1111/faf.12750","page":"595-617","source":"Wiley Online Library","title":"Trends in Chinook salmon spawner abundance and total run size highlight linkages between life history, geography and decline","volume":"24","author":[{"family":"Atlas","given":"William I."},{"family":"Sloat","given":"Matthew R."},{"family":"Satterthwaite","given":"William H."},{"family":"Buehrens","given":"Thomas W."},{"family":"Parken","given":"Charles K."},{"family":"Moore","given":"Jonathan W."},{"family":"Mantua","given":"Nathan J."},{"family":"Hart","given":"Jon"},{"family":"Potapova","given":"Anna"}],"issued":{"date-parts":[["2023"]]}}},{"id":4421,"uris":["http://zotero.org/users/8421274/items/PUA9GF7A"],"itemData":{"id":4421,"type":"article-journal","abstract":"The demographic structure of populations is affected by life history strategies and how these interact with natural and anthropogenic factors such as exploitation, climate change, and biotic interactions. Previous work suggests that the mean size and age of some North American populations of Chinook salmon (Oncorhynchus tshawytscha, Salmonidae) are declining. These trends are of concern because Chinook salmon are highly valued commercially for their exceptional size and because the loss of the largest and oldest individuals may lead to reduced population productivity. Using long-term data from wild and hatchery populations, we quantified changes in the demographic structure of Chinook salmon populations over the past four decades across the Northeast Pacific Ocean, from California through western Alaska. Our results show that wild and hatchery fish are becoming smaller and younger throughout most of the Pacific coast. Proportions of older age classes have decreased over time in most regions. Simultaneously, the length-at-age of older fish has declined while the length-at-age of younger fish has typically increased. However, negative size trends of older ages were weak or non-existent at the southern end of the range. While it remains to be explored whether these trends are caused by changes in climate, fishing practices or species interactions such as predation, our qualitative review of the potential causes of demographic change suggests that selective removal of large fish has likely contributed to the apparent widespread declines in average body sizes.","container-title":"Fish and Fisheries","DOI":"10.1111/faf.12272","ISSN":"1467-2979","issue":"3","language":"en","license":"© 2018 The Authors. Fish and Fisheries published by John Wiley &amp; Sons Ltd.","note":"_eprint: https://onlinelibrary.wiley.com/doi/pdf/10.1111/faf.12272","page":"533-546","source":"Wiley Online Library","title":"Demographic changes in Chinook salmon across the Northeast Pacific Ocean","volume":"19","author":[{"family":"Ohlberger","given":"Jan"},{"family":"Ward","given":"Eric J"},{"family":"Schindler","given":"Daniel E"},{"family":"Lewis","given":"Bert"}],"issued":{"date-parts":[["2018"]]}}}],"schema":"https://github.com/citation-style-language/schema/raw/master/csl-citation.json"} </w:instrText>
+      </w:r>
+      <w:r>
+        <w:rPr>
+          <w:rFonts w:ascii="Garamond" w:hAnsi="Garamond"/>
+          <w:sz w:val="22"/>
+          <w:szCs w:val="22"/>
+        </w:rPr>
+        <w:fldChar w:fldCharType="separate"/>
+      </w:r>
+      <w:r>
+        <w:rPr>
+          <w:rFonts w:ascii="Garamond" w:hAnsi="Garamond"/>
+          <w:noProof/>
+          <w:sz w:val="22"/>
+          <w:szCs w:val="22"/>
+        </w:rPr>
+        <w:t>(Atlas et al., 2023; Ohlberger et al., 2018)</w:t>
+      </w:r>
+      <w:r>
+        <w:rPr>
+          <w:rFonts w:ascii="Garamond" w:hAnsi="Garamond"/>
+          <w:sz w:val="22"/>
+          <w:szCs w:val="22"/>
+        </w:rPr>
+        <w:fldChar w:fldCharType="end"/>
+      </w:r>
+      <w:r>
+        <w:rPr>
+          <w:rFonts w:ascii="Garamond" w:hAnsi="Garamond"/>
+          <w:sz w:val="22"/>
+          <w:szCs w:val="22"/>
+        </w:rPr>
+        <w:t xml:space="preserve">. This trend is especially severe in </w:t>
+      </w:r>
+      <w:r>
+        <w:rPr>
+          <w:rFonts w:ascii="Garamond" w:hAnsi="Garamond"/>
+          <w:sz w:val="22"/>
+          <w:szCs w:val="22"/>
+        </w:rPr>
+        <w:t>w</w:t>
+      </w:r>
+      <w:r>
+        <w:rPr>
+          <w:rFonts w:ascii="Garamond" w:hAnsi="Garamond"/>
+          <w:sz w:val="22"/>
+          <w:szCs w:val="22"/>
+        </w:rPr>
+        <w:t xml:space="preserve">estern Alaska watersheds, which contain some of the world's last pristine Chinook </w:t>
+      </w:r>
+      <w:r>
+        <w:rPr>
+          <w:rFonts w:ascii="Garamond" w:hAnsi="Garamond"/>
+          <w:sz w:val="22"/>
+          <w:szCs w:val="22"/>
+        </w:rPr>
+        <w:t xml:space="preserve">salmon </w:t>
+      </w:r>
+      <w:r>
+        <w:rPr>
+          <w:rFonts w:ascii="Garamond" w:hAnsi="Garamond"/>
+          <w:sz w:val="22"/>
+          <w:szCs w:val="22"/>
+        </w:rPr>
+        <w:t xml:space="preserve">habitat but have seen steep declines in returning Chinook and </w:t>
+      </w:r>
+      <w:r>
+        <w:rPr>
+          <w:rFonts w:ascii="Garamond" w:hAnsi="Garamond"/>
+          <w:sz w:val="22"/>
+          <w:szCs w:val="22"/>
+        </w:rPr>
+        <w:t>c</w:t>
+      </w:r>
+      <w:r>
+        <w:rPr>
+          <w:rFonts w:ascii="Garamond" w:hAnsi="Garamond"/>
+          <w:sz w:val="22"/>
+          <w:szCs w:val="22"/>
+        </w:rPr>
+        <w:t>hum salmon in recent years</w:t>
+      </w:r>
+      <w:r>
+        <w:rPr>
+          <w:rFonts w:ascii="Garamond" w:hAnsi="Garamond"/>
+          <w:sz w:val="22"/>
+          <w:szCs w:val="22"/>
+        </w:rPr>
+        <w:t xml:space="preserve"> </w:t>
+      </w:r>
+      <w:r>
+        <w:rPr>
+          <w:rFonts w:ascii="Garamond" w:hAnsi="Garamond"/>
+          <w:sz w:val="22"/>
+          <w:szCs w:val="22"/>
+        </w:rPr>
+        <w:fldChar w:fldCharType="begin"/>
+      </w:r>
+      <w:r>
+        <w:rPr>
+          <w:rFonts w:ascii="Garamond" w:hAnsi="Garamond"/>
+          <w:sz w:val="22"/>
+          <w:szCs w:val="22"/>
+        </w:rPr>
+        <w:instrText xml:space="preserve"> ADDIN ZOTERO_ITEM CSL_CITATION {"citationID":"MP9B29WU","properties":{"formattedCitation":"(Lamborn et al., 2025; Murdoch et al., 2024)","plainCitation":"(Lamborn et al., 2025; Murdoch et al., 2024)","noteIndex":0},"citationItems":[{"id":5379,"uris":["http://zotero.org/users/8421274/items/6TRPLVW4"],"itemData":{"id":5379,"type":"article-journal","abstract":"Across Alaska, there have been synchronous declines in the abundance, mean age, and size of Chinook salmon (Oncorhynchus tshawytscha, Salmonidae), a species with immense social and ecological importance. The decline of Chinook salmon, and regulations addressing declines, have drastically impacted people who rely on Alaska's fisheries. Despite their importance, the drivers causing Chinook salmon declines are still not well understood. Therefore, to improve our understanding of the likely drivers of these large-scale synchronous declines, we synthesised the peer-reviewed Chinook salmon literature published between 2010 and 2024 using a weight-of-evidence approach. We identified 94 variables used to explain the trends in abundance and demographics of Chinook salmon. Each variable's association with trends in Chinook salmon was individually assessed and integrated using a standardised method. Results of this synthesis suggest the drivers for large-scale synchronous declines have occurred in the North Pacific Ocean. Specifically, we found marine predation, size selective harvest, and pink salmon (Oncorhynchus gorbuscha) abundance are the factors most strongly associated with reduced size and age. Results also suggest ocean productivity–specifically winter sea surface temperature and the North Pacific Gyre Oscillation–are the most frequently identified predictors of regional Chinook salmon abundance. In addition to addressing freshwater factors like adult heat stress and juvenile predation, we suggest research, policy, and management focus on how to better understand and address the interactions between ocean productivity, marine predation, size selective harvest, and pink salmon abundance to improve the condition of Chinook salmon, and the people and ecosystems benefiting from them.","container-title":"Fish and Fisheries","DOI":"10.1111/faf.12895","ISSN":"1467-2979","issue":"n/a","language":"en","license":"© 2025 The Author(s). Fish and Fisheries published by John Wiley &amp; Sons Ltd.","note":"_eprint: https://onlinelibrary.wiley.com/doi/pdf/10.1111/faf.12895","source":"Wiley Online Library","title":"A Synthesis of Factors Related to Trends in Abundance and Demography of Alaska Chinook Salmon (Oncorhynchus tshawytscha, Salmonidae): Implications for Research, Management, and Policy","title-short":"A Synthesis of Factors Related to Trends in Abundance and Demography of Alaska Chinook Salmon (Oncorhynchus tshawytscha, Salmonidae)","URL":"https://onlinelibrary.wiley.com/doi/abs/10.1111/faf.12895","volume":"n/a","author":[{"family":"Lamborn","given":"Chase C."},{"family":"Ohlberger","given":"Jan"},{"family":"Walsworth","given":"Timothy E."},{"family":"Westley","given":"Peter A. H."},{"family":"Cunningham","given":"Curry J."},{"family":"Wynsma","given":"Sam"},{"family":"Smith","given":"Jordan W."}],"accessed":{"date-parts":[["2025",6,4]]},"issued":{"date-parts":[["2025"]]}}},{"id":5327,"uris":["http://zotero.org/users/8421274/items/QJJ96GUP"],"itemData":{"id":5327,"type":"article-journal","abstract":"Recent declines of Yukon River Chinook salmon (Oncorhynchus tshawytscha) populations have severely impacted people residing in the Yukon and Alaska. Evidence-based conservation strategies focused on stock recovery and adaptation are urgently needed but are limited by our understanding of what is driving declines, particularly in Canadian portions of the Yukon River basin. We examined how multiple environmental drivers may be influencing Canadian-origin Yukon River Chinook salmon productivity for eight populations over a 28-year period. We found that productivity was related to various environmental and ecosystem processes acting cumulatively over multiple life stages and across broad geographic scales. Productivity decreased in association with warmer upriver migration temperatures, wetter freshwater juvenile rearing habitats, and increasing abundances of potential marine competitors. In contrast, productivity increased in years with warmer and snowier winters and earlier spring onset. We found that different populations had similar relationships with environmental drivers, with potentially negative implications for regional fisheries stability. Our findings provide insight into how Chinook salmon are responding to rapid environmental change and can help inform salmon conservation initiatives and sustainable harvest strategies.","container-title":"CANADIAN JOURNAL OF FISHERIES AND AQUATIC SCIENCES","DOI":"10.1139/cjfas-2022-0254","ISSN":"0706-652X, 1205-7533","issue":"1","journalAbbreviation":"Can. J. Fish. Aquat. Sci.","language":"English","note":"number-of-pages: 18\npublisher-place: Ottawa\npublisher: Canadian Science Publishing\nWeb of Science ID: WOS:001129796500001","page":"97-114","source":"Clarivate Analytics Web of Science","title":"Multiple environmental drivers across life stages influence Yukon River Chinook salmon productivity","volume":"81","author":[{"family":"Murdoch","given":"A."},{"family":"Connors","given":"B. M."},{"family":"Lapointe","given":"N. W. R."},{"family":"Flemming","given":"J. Mills"},{"family":"Cooke","given":"S. J."},{"family":"Mantyka-Pringle","given":"C."}],"issued":{"date-parts":[["2024",1]]}}}],"schema":"https://github.com/citation-style-language/schema/raw/master/csl-citation.json"} </w:instrText>
+      </w:r>
+      <w:r>
+        <w:rPr>
+          <w:rFonts w:ascii="Garamond" w:hAnsi="Garamond"/>
+          <w:sz w:val="22"/>
+          <w:szCs w:val="22"/>
+        </w:rPr>
+        <w:fldChar w:fldCharType="separate"/>
+      </w:r>
+      <w:r>
+        <w:rPr>
+          <w:rFonts w:ascii="Garamond" w:hAnsi="Garamond"/>
+          <w:noProof/>
+          <w:sz w:val="22"/>
+          <w:szCs w:val="22"/>
+        </w:rPr>
+        <w:t>(Lamborn et al., 2025; Murdoch et al., 2024)</w:t>
+      </w:r>
+      <w:r>
+        <w:rPr>
+          <w:rFonts w:ascii="Garamond" w:hAnsi="Garamond"/>
+          <w:sz w:val="22"/>
+          <w:szCs w:val="22"/>
+        </w:rPr>
+        <w:fldChar w:fldCharType="end"/>
+      </w:r>
+      <w:r>
+        <w:rPr>
+          <w:rFonts w:ascii="Garamond" w:hAnsi="Garamond"/>
+          <w:sz w:val="22"/>
+          <w:szCs w:val="22"/>
+        </w:rPr>
+        <w:t xml:space="preserve">. Salmon from this region </w:t>
+      </w:r>
+      <w:r>
+        <w:rPr>
+          <w:rFonts w:ascii="Garamond" w:hAnsi="Garamond"/>
+          <w:sz w:val="22"/>
+          <w:szCs w:val="22"/>
+        </w:rPr>
+        <w:t>have supported</w:t>
+      </w:r>
+      <w:r>
+        <w:rPr>
+          <w:rFonts w:ascii="Garamond" w:hAnsi="Garamond"/>
+          <w:sz w:val="22"/>
+          <w:szCs w:val="22"/>
+        </w:rPr>
+        <w:t xml:space="preserve"> lucrative commercial fisheries and have historically </w:t>
+      </w:r>
+      <w:r>
+        <w:rPr>
+          <w:rFonts w:ascii="Garamond" w:hAnsi="Garamond"/>
+          <w:sz w:val="22"/>
+          <w:szCs w:val="22"/>
+        </w:rPr>
+        <w:t>provided the cultural and nutritional</w:t>
+      </w:r>
+      <w:r>
+        <w:rPr>
+          <w:rFonts w:ascii="Garamond" w:hAnsi="Garamond"/>
+          <w:sz w:val="22"/>
+          <w:szCs w:val="22"/>
+        </w:rPr>
+        <w:t xml:space="preserve"> </w:t>
+      </w:r>
+      <w:r>
+        <w:rPr>
+          <w:rFonts w:ascii="Garamond" w:hAnsi="Garamond"/>
+          <w:sz w:val="22"/>
+          <w:szCs w:val="22"/>
+        </w:rPr>
+        <w:t>foundation for</w:t>
+      </w:r>
+      <w:r>
+        <w:rPr>
+          <w:rFonts w:ascii="Garamond" w:hAnsi="Garamond"/>
+          <w:sz w:val="22"/>
+          <w:szCs w:val="22"/>
+        </w:rPr>
+        <w:t xml:space="preserve"> dozens of </w:t>
+      </w:r>
+      <w:r>
+        <w:rPr>
+          <w:rFonts w:ascii="Garamond" w:hAnsi="Garamond"/>
+          <w:sz w:val="22"/>
+          <w:szCs w:val="22"/>
+        </w:rPr>
+        <w:t xml:space="preserve">subsistence </w:t>
+      </w:r>
+      <w:r>
+        <w:rPr>
+          <w:rFonts w:ascii="Garamond" w:hAnsi="Garamond"/>
+          <w:sz w:val="22"/>
+          <w:szCs w:val="22"/>
+        </w:rPr>
+        <w:t xml:space="preserve">communities in the region. As runs have collapsed, however, </w:t>
+      </w:r>
+      <w:r>
+        <w:rPr>
+          <w:rFonts w:ascii="Garamond" w:hAnsi="Garamond"/>
+          <w:sz w:val="22"/>
+          <w:szCs w:val="22"/>
+        </w:rPr>
+        <w:t>harvest has been completed restricted for</w:t>
+      </w:r>
+      <w:r>
+        <w:rPr>
+          <w:rFonts w:ascii="Garamond" w:hAnsi="Garamond"/>
+          <w:sz w:val="22"/>
+          <w:szCs w:val="22"/>
+        </w:rPr>
+        <w:t xml:space="preserve"> upstream communities </w:t>
+      </w:r>
+      <w:r>
+        <w:rPr>
+          <w:rFonts w:ascii="Garamond" w:hAnsi="Garamond"/>
+          <w:sz w:val="22"/>
+          <w:szCs w:val="22"/>
+        </w:rPr>
+        <w:t xml:space="preserve">who </w:t>
+      </w:r>
+      <w:r>
+        <w:rPr>
+          <w:rFonts w:ascii="Garamond" w:hAnsi="Garamond"/>
+          <w:sz w:val="22"/>
+          <w:szCs w:val="22"/>
+        </w:rPr>
+        <w:t xml:space="preserve">have voluntarily reduced or ceased subsistence fishing altogether, triggering a region-wide crisis of food insecurity, cultural loss, and the potential </w:t>
+      </w:r>
+      <w:r>
+        <w:rPr>
+          <w:rFonts w:ascii="Garamond" w:hAnsi="Garamond"/>
+          <w:sz w:val="22"/>
+          <w:szCs w:val="22"/>
+        </w:rPr>
         <w:lastRenderedPageBreak/>
-        <w:t>Chinook salmon populations are experiencing unprecedented declines across much of their range</w:t>
-      </w:r>
-      <w:r>
-        <w:rPr>
-          <w:rFonts w:ascii="Garamond" w:hAnsi="Garamond"/>
-          <w:sz w:val="22"/>
-          <w:szCs w:val="22"/>
-        </w:rPr>
-        <w:t xml:space="preserve"> </w:t>
-      </w:r>
-      <w:r>
-        <w:rPr>
-          <w:rFonts w:ascii="Garamond" w:hAnsi="Garamond"/>
-          <w:sz w:val="22"/>
-          <w:szCs w:val="22"/>
-        </w:rPr>
-        <w:fldChar w:fldCharType="begin"/>
-      </w:r>
-      <w:r>
-        <w:rPr>
-          <w:rFonts w:ascii="Garamond" w:hAnsi="Garamond"/>
-          <w:sz w:val="22"/>
-          <w:szCs w:val="22"/>
-        </w:rPr>
-        <w:instrText xml:space="preserve"> ADDIN ZOTERO_ITEM CSL_CITATION {"citationID":"lr8eoJO9","properties":{"formattedCitation":"(Atlas et al., 2023; Ohlberger et al., 2018)","plainCitation":"(Atlas et al., 2023; Ohlberger et al., 2018)","noteIndex":0},"citationItems":[{"id":5384,"uris":["http://zotero.org/users/8421274/items/YYBUBGXV"],"itemData":{"id":5384,"type":"article-journal","abstract":"Chinook salmon (Oncorhynchus tshawytscha, Salmonidae) are foundational to social-ecological systems of the Northeast Pacific Rim and exhibit a rich diversity of life histories including in their adult migration timing, age at critical life-history transitions and marine feeding distributions. In recent decades Chinook have experienced declines across much of their native range; however, changes in productivity and abundance have rarely been evaluated in relation to life-history variation. To understand trends in Chinook salmon production, and how they are related to life history, we compiled time series data from the Fraser River to the Sacramento River on total run size (pre-fishery abundance) and escapement (post-fishery spawner abundance) and fit time series models to estimate trends across this bioregion. Our analysis revealed that most Chinook populations are declining, with negative trends in escapement (57 of 79) and total run (16 of 23) size. Trends were most acutely negative for interior spring Chinook in the Fraser, Columbia and Snake Rivers and most populations in California. Summer and fall Chinook had mixed trends, with several summer and fall upriver bright populations in the interior Columbia and Fraser exhibiting increases in abundance from the 1990s to 2019. Our research reveals widespread declines of this important species, but local complexity in trends that are mediated by population-level life history, migratory behaviours and watershed-scale restoration actions. Understanding linkages between life histories and resilience should inform rebuilding efforts for Chinook salmon and highlight the need to conserve intraspecific biodiversity.","container-title":"Fish and Fisheries","DOI":"10.1111/faf.12750","ISSN":"1467-2979","issue":"4","language":"en","license":"© 2023 The Authors. Fish and Fisheries published by John Wiley &amp; Sons Ltd.","note":"_eprint: https://onlinelibrary.wiley.com/doi/pdf/10.1111/faf.12750","page":"595-617","source":"Wiley Online Library","title":"Trends in Chinook salmon spawner abundance and total run size highlight linkages between life history, geography and decline","volume":"24","author":[{"family":"Atlas","given":"William I."},{"family":"Sloat","given":"Matthew R."},{"family":"Satterthwaite","given":"William H."},{"family":"Buehrens","given":"Thomas W."},{"family":"Parken","given":"Charles K."},{"family":"Moore","given":"Jonathan W."},{"family":"Mantua","given":"Nathan J."},{"family":"Hart","given":"Jon"},{"family":"Potapova","given":"Anna"}],"issued":{"date-parts":[["2023"]]}}},{"id":4421,"uris":["http://zotero.org/users/8421274/items/PUA9GF7A"],"itemData":{"id":4421,"type":"article-journal","abstract":"The demographic structure of populations is affected by life history strategies and how these interact with natural and anthropogenic factors such as exploitation, climate change, and biotic interactions. Previous work suggests that the mean size and age of some North American populations of Chinook salmon (Oncorhynchus tshawytscha, Salmonidae) are declining. These trends are of concern because Chinook salmon are highly valued commercially for their exceptional size and because the loss of the largest and oldest individuals may lead to reduced population productivity. Using long-term data from wild and hatchery populations, we quantified changes in the demographic structure of Chinook salmon populations over the past four decades across the Northeast Pacific Ocean, from California through western Alaska. Our results show that wild and hatchery fish are becoming smaller and younger throughout most of the Pacific coast. Proportions of older age classes have decreased over time in most regions. Simultaneously, the length-at-age of older fish has declined while the length-at-age of younger fish has typically increased. However, negative size trends of older ages were weak or non-existent at the southern end of the range. While it remains to be explored whether these trends are caused by changes in climate, fishing practices or species interactions such as predation, our qualitative review of the potential causes of demographic change suggests that selective removal of large fish has likely contributed to the apparent widespread declines in average body sizes.","container-title":"Fish and Fisheries","DOI":"10.1111/faf.12272","ISSN":"1467-2979","issue":"3","language":"en","license":"© 2018 The Authors. Fish and Fisheries published by John Wiley &amp; Sons Ltd.","note":"_eprint: https://onlinelibrary.wiley.com/doi/pdf/10.1111/faf.12272","page":"533-546","source":"Wiley Online Library","title":"Demographic changes in Chinook salmon across the Northeast Pacific Ocean","volume":"19","author":[{"family":"Ohlberger","given":"Jan"},{"family":"Ward","given":"Eric J"},{"family":"Schindler","given":"Daniel E"},{"family":"Lewis","given":"Bert"}],"issued":{"date-parts":[["2018"]]}}}],"schema":"https://github.com/citation-style-language/schema/raw/master/csl-citation.json"} </w:instrText>
-      </w:r>
-      <w:r>
-        <w:rPr>
-          <w:rFonts w:ascii="Garamond" w:hAnsi="Garamond"/>
-          <w:sz w:val="22"/>
-          <w:szCs w:val="22"/>
-        </w:rPr>
-        <w:fldChar w:fldCharType="separate"/>
-      </w:r>
-      <w:r>
-        <w:rPr>
-          <w:rFonts w:ascii="Garamond" w:hAnsi="Garamond"/>
-          <w:noProof/>
-          <w:sz w:val="22"/>
-          <w:szCs w:val="22"/>
-        </w:rPr>
-        <w:t>(Atlas et al., 2023; Ohlberger et al., 2018)</w:t>
-      </w:r>
-      <w:r>
-        <w:rPr>
-          <w:rFonts w:ascii="Garamond" w:hAnsi="Garamond"/>
-          <w:sz w:val="22"/>
-          <w:szCs w:val="22"/>
-        </w:rPr>
-        <w:fldChar w:fldCharType="end"/>
-      </w:r>
-      <w:r>
-        <w:rPr>
-          <w:rFonts w:ascii="Garamond" w:hAnsi="Garamond"/>
-          <w:sz w:val="22"/>
-          <w:szCs w:val="22"/>
-        </w:rPr>
-        <w:t xml:space="preserve">. This trend is especially severe in </w:t>
-      </w:r>
-      <w:r>
-        <w:rPr>
-          <w:rFonts w:ascii="Garamond" w:hAnsi="Garamond"/>
-          <w:sz w:val="22"/>
-          <w:szCs w:val="22"/>
-        </w:rPr>
-        <w:t>w</w:t>
-      </w:r>
-      <w:r>
-        <w:rPr>
-          <w:rFonts w:ascii="Garamond" w:hAnsi="Garamond"/>
-          <w:sz w:val="22"/>
-          <w:szCs w:val="22"/>
-        </w:rPr>
-        <w:t xml:space="preserve">estern Alaska watersheds, which contain some of the world's last pristine Chinook </w:t>
-      </w:r>
-      <w:r>
-        <w:rPr>
-          <w:rFonts w:ascii="Garamond" w:hAnsi="Garamond"/>
-          <w:sz w:val="22"/>
-          <w:szCs w:val="22"/>
-        </w:rPr>
-        <w:t xml:space="preserve">salmon </w:t>
-      </w:r>
-      <w:r>
-        <w:rPr>
-          <w:rFonts w:ascii="Garamond" w:hAnsi="Garamond"/>
-          <w:sz w:val="22"/>
-          <w:szCs w:val="22"/>
-        </w:rPr>
-        <w:t xml:space="preserve">habitat but have seen steep declines in returning Chinook and </w:t>
-      </w:r>
-      <w:r>
-        <w:rPr>
-          <w:rFonts w:ascii="Garamond" w:hAnsi="Garamond"/>
-          <w:sz w:val="22"/>
-          <w:szCs w:val="22"/>
-        </w:rPr>
-        <w:t>c</w:t>
-      </w:r>
-      <w:r>
-        <w:rPr>
-          <w:rFonts w:ascii="Garamond" w:hAnsi="Garamond"/>
-          <w:sz w:val="22"/>
-          <w:szCs w:val="22"/>
-        </w:rPr>
-        <w:t>hum salmon in recent years</w:t>
-      </w:r>
-      <w:r>
-        <w:rPr>
-          <w:rFonts w:ascii="Garamond" w:hAnsi="Garamond"/>
-          <w:sz w:val="22"/>
-          <w:szCs w:val="22"/>
-        </w:rPr>
-        <w:t xml:space="preserve"> </w:t>
-      </w:r>
-      <w:r>
-        <w:rPr>
-          <w:rFonts w:ascii="Garamond" w:hAnsi="Garamond"/>
-          <w:sz w:val="22"/>
-          <w:szCs w:val="22"/>
-        </w:rPr>
-        <w:fldChar w:fldCharType="begin"/>
-      </w:r>
-      <w:r>
-        <w:rPr>
-          <w:rFonts w:ascii="Garamond" w:hAnsi="Garamond"/>
-          <w:sz w:val="22"/>
-          <w:szCs w:val="22"/>
-        </w:rPr>
-        <w:instrText xml:space="preserve"> ADDIN ZOTERO_ITEM CSL_CITATION {"citationID":"MP9B29WU","properties":{"formattedCitation":"(Lamborn et al., 2025; Murdoch et al., 2024)","plainCitation":"(Lamborn et al., 2025; Murdoch et al., 2024)","noteIndex":0},"citationItems":[{"id":5379,"uris":["http://zotero.org/users/8421274/items/6TRPLVW4"],"itemData":{"id":5379,"type":"article-journal","abstract":"Across Alaska, there have been synchronous declines in the abundance, mean age, and size of Chinook salmon (Oncorhynchus tshawytscha, Salmonidae), a species with immense social and ecological importance. The decline of Chinook salmon, and regulations addressing declines, have drastically impacted people who rely on Alaska's fisheries. Despite their importance, the drivers causing Chinook salmon declines are still not well understood. Therefore, to improve our understanding of the likely drivers of these large-scale synchronous declines, we synthesised the peer-reviewed Chinook salmon literature published between 2010 and 2024 using a weight-of-evidence approach. We identified 94 variables used to explain the trends in abundance and demographics of Chinook salmon. Each variable's association with trends in Chinook salmon was individually assessed and integrated using a standardised method. Results of this synthesis suggest the drivers for large-scale synchronous declines have occurred in the North Pacific Ocean. Specifically, we found marine predation, size selective harvest, and pink salmon (Oncorhynchus gorbuscha) abundance are the factors most strongly associated with reduced size and age. Results also suggest ocean productivity–specifically winter sea surface temperature and the North Pacific Gyre Oscillation–are the most frequently identified predictors of regional Chinook salmon abundance. In addition to addressing freshwater factors like adult heat stress and juvenile predation, we suggest research, policy, and management focus on how to better understand and address the interactions between ocean productivity, marine predation, size selective harvest, and pink salmon abundance to improve the condition of Chinook salmon, and the people and ecosystems benefiting from them.","container-title":"Fish and Fisheries","DOI":"10.1111/faf.12895","ISSN":"1467-2979","issue":"n/a","language":"en","license":"© 2025 The Author(s). Fish and Fisheries published by John Wiley &amp; Sons Ltd.","note":"_eprint: https://onlinelibrary.wiley.com/doi/pdf/10.1111/faf.12895","source":"Wiley Online Library","title":"A Synthesis of Factors Related to Trends in Abundance and Demography of Alaska Chinook Salmon (Oncorhynchus tshawytscha, Salmonidae): Implications for Research, Management, and Policy","title-short":"A Synthesis of Factors Related to Trends in Abundance and Demography of Alaska Chinook Salmon (Oncorhynchus tshawytscha, Salmonidae)","URL":"https://onlinelibrary.wiley.com/doi/abs/10.1111/faf.12895","volume":"n/a","author":[{"family":"Lamborn","given":"Chase C."},{"family":"Ohlberger","given":"Jan"},{"family":"Walsworth","given":"Timothy E."},{"family":"Westley","given":"Peter A. H."},{"family":"Cunningham","given":"Curry J."},{"family":"Wynsma","given":"Sam"},{"family":"Smith","given":"Jordan W."}],"accessed":{"date-parts":[["2025",6,4]]},"issued":{"date-parts":[["2025"]]}}},{"id":5327,"uris":["http://zotero.org/users/8421274/items/QJJ96GUP"],"itemData":{"id":5327,"type":"article-journal","abstract":"Recent declines of Yukon River Chinook salmon (Oncorhynchus tshawytscha) populations have severely impacted people residing in the Yukon and Alaska. Evidence-based conservation strategies focused on stock recovery and adaptation are urgently needed but are limited by our understanding of what is driving declines, particularly in Canadian portions of the Yukon River basin. We examined how multiple environmental drivers may be influencing Canadian-origin Yukon River Chinook salmon productivity for eight populations over a 28-year period. We found that productivity was related to various environmental and ecosystem processes acting cumulatively over multiple life stages and across broad geographic scales. Productivity decreased in association with warmer upriver migration temperatures, wetter freshwater juvenile rearing habitats, and increasing abundances of potential marine competitors. In contrast, productivity increased in years with warmer and snowier winters and earlier spring onset. We found that different populations had similar relationships with environmental drivers, with potentially negative implications for regional fisheries stability. Our findings provide insight into how Chinook salmon are responding to rapid environmental change and can help inform salmon conservation initiatives and sustainable harvest strategies.","container-title":"CANADIAN JOURNAL OF FISHERIES AND AQUATIC SCIENCES","DOI":"10.1139/cjfas-2022-0254","ISSN":"0706-652X, 1205-7533","issue":"1","journalAbbreviation":"Can. J. Fish. Aquat. Sci.","language":"English","note":"number-of-pages: 18\npublisher-place: Ottawa\npublisher: Canadian Science Publishing\nWeb of Science ID: WOS:001129796500001","page":"97-114","source":"Clarivate Analytics Web of Science","title":"Multiple environmental drivers across life stages influence Yukon River Chinook salmon productivity","volume":"81","author":[{"family":"Murdoch","given":"A."},{"family":"Connors","given":"B. M."},{"family":"Lapointe","given":"N. W. R."},{"family":"Flemming","given":"J. Mills"},{"family":"Cooke","given":"S. J."},{"family":"Mantyka-Pringle","given":"C."}],"issued":{"date-parts":[["2024",1]]}}}],"schema":"https://github.com/citation-style-language/schema/raw/master/csl-citation.json"} </w:instrText>
-      </w:r>
-      <w:r>
-        <w:rPr>
-          <w:rFonts w:ascii="Garamond" w:hAnsi="Garamond"/>
-          <w:sz w:val="22"/>
-          <w:szCs w:val="22"/>
-        </w:rPr>
-        <w:fldChar w:fldCharType="separate"/>
-      </w:r>
-      <w:r>
-        <w:rPr>
-          <w:rFonts w:ascii="Garamond" w:hAnsi="Garamond"/>
-          <w:noProof/>
-          <w:sz w:val="22"/>
-          <w:szCs w:val="22"/>
-        </w:rPr>
-        <w:t>(Lamborn et al., 2025; Murdoch et al., 2024)</w:t>
-      </w:r>
-      <w:r>
-        <w:rPr>
-          <w:rFonts w:ascii="Garamond" w:hAnsi="Garamond"/>
-          <w:sz w:val="22"/>
-          <w:szCs w:val="22"/>
-        </w:rPr>
-        <w:fldChar w:fldCharType="end"/>
-      </w:r>
-      <w:r>
-        <w:rPr>
-          <w:rFonts w:ascii="Garamond" w:hAnsi="Garamond"/>
-          <w:sz w:val="22"/>
-          <w:szCs w:val="22"/>
-        </w:rPr>
-        <w:t xml:space="preserve">. Salmon from this region </w:t>
-      </w:r>
-      <w:r>
-        <w:rPr>
-          <w:rFonts w:ascii="Garamond" w:hAnsi="Garamond"/>
-          <w:sz w:val="22"/>
-          <w:szCs w:val="22"/>
-        </w:rPr>
-        <w:t>have supported</w:t>
-      </w:r>
-      <w:r>
-        <w:rPr>
-          <w:rFonts w:ascii="Garamond" w:hAnsi="Garamond"/>
-          <w:sz w:val="22"/>
-          <w:szCs w:val="22"/>
-        </w:rPr>
-        <w:t xml:space="preserve"> lucrative commercial fisheries and have historically </w:t>
-      </w:r>
-      <w:r>
-        <w:rPr>
-          <w:rFonts w:ascii="Garamond" w:hAnsi="Garamond"/>
-          <w:sz w:val="22"/>
-          <w:szCs w:val="22"/>
-        </w:rPr>
-        <w:t>provided the cultural and nutritional</w:t>
-      </w:r>
-      <w:r>
-        <w:rPr>
-          <w:rFonts w:ascii="Garamond" w:hAnsi="Garamond"/>
-          <w:sz w:val="22"/>
-          <w:szCs w:val="22"/>
-        </w:rPr>
-        <w:t xml:space="preserve"> </w:t>
-      </w:r>
-      <w:r>
-        <w:rPr>
-          <w:rFonts w:ascii="Garamond" w:hAnsi="Garamond"/>
-          <w:sz w:val="22"/>
-          <w:szCs w:val="22"/>
-        </w:rPr>
-        <w:t>foundation for</w:t>
-      </w:r>
-      <w:r>
-        <w:rPr>
-          <w:rFonts w:ascii="Garamond" w:hAnsi="Garamond"/>
-          <w:sz w:val="22"/>
-          <w:szCs w:val="22"/>
-        </w:rPr>
-        <w:t xml:space="preserve"> dozens of </w:t>
-      </w:r>
-      <w:r>
-        <w:rPr>
-          <w:rFonts w:ascii="Garamond" w:hAnsi="Garamond"/>
-          <w:sz w:val="22"/>
-          <w:szCs w:val="22"/>
-        </w:rPr>
-        <w:t xml:space="preserve">subsistence </w:t>
-      </w:r>
-      <w:r>
-        <w:rPr>
-          <w:rFonts w:ascii="Garamond" w:hAnsi="Garamond"/>
-          <w:sz w:val="22"/>
-          <w:szCs w:val="22"/>
-        </w:rPr>
-        <w:t xml:space="preserve">communities in the region. As runs have collapsed, however, </w:t>
-      </w:r>
-      <w:r>
-        <w:rPr>
-          <w:rFonts w:ascii="Garamond" w:hAnsi="Garamond"/>
-          <w:sz w:val="22"/>
-          <w:szCs w:val="22"/>
-        </w:rPr>
-        <w:t>harvest has been completed restricted for</w:t>
-      </w:r>
-      <w:r>
-        <w:rPr>
-          <w:rFonts w:ascii="Garamond" w:hAnsi="Garamond"/>
-          <w:sz w:val="22"/>
-          <w:szCs w:val="22"/>
-        </w:rPr>
-        <w:t xml:space="preserve"> upstream communities </w:t>
-      </w:r>
-      <w:r>
-        <w:rPr>
-          <w:rFonts w:ascii="Garamond" w:hAnsi="Garamond"/>
-          <w:sz w:val="22"/>
-          <w:szCs w:val="22"/>
-        </w:rPr>
-        <w:t xml:space="preserve">who </w:t>
-      </w:r>
-      <w:r>
-        <w:rPr>
-          <w:rFonts w:ascii="Garamond" w:hAnsi="Garamond"/>
-          <w:sz w:val="22"/>
-          <w:szCs w:val="22"/>
-        </w:rPr>
-        <w:t>have voluntarily reduced or ceased subsistence fishing altogether, triggering a region-wide crisis of food insecurity, cultural loss, and the potential disappearance of a critical economic resource</w:t>
+        <w:t>disappearance of a critical economic resource</w:t>
       </w:r>
       <w:r>
         <w:rPr>
@@ -8123,16 +8423,7 @@
           <w:sz w:val="22"/>
           <w:szCs w:val="22"/>
         </w:rPr>
-        <w:t xml:space="preserve">The reliability of salmon resources to communities is a product of the health of stock components throughout the watershed. For Pacific salmon fisheries, which harvest stocks as the migrate upstream, the </w:t>
-      </w:r>
-      <w:r>
-        <w:rPr>
-          <w:rFonts w:ascii="Garamond" w:hAnsi="Garamond"/>
-          <w:sz w:val="22"/>
-          <w:szCs w:val="22"/>
-        </w:rPr>
-        <w:lastRenderedPageBreak/>
-        <w:t xml:space="preserve">duration and reliability of this resource is the result of the aggregate dynamics of upstream stocks. For example, healthy stock components with unique spatiotemporal patterns may allow for more diverse set of harvest opportunities over a longer time period  </w:t>
+        <w:t xml:space="preserve">The reliability of salmon resources to communities is a product of the health of stock components throughout the watershed. For Pacific salmon fisheries, which harvest stocks as the migrate upstream, the duration and reliability of this resource is the result of the aggregate dynamics of upstream stocks. For example, healthy stock components with unique spatiotemporal patterns may allow for more diverse set of harvest opportunities over a longer time period  </w:t>
       </w:r>
       <w:r>
         <w:rPr>
@@ -8322,6 +8613,7 @@
           <w:sz w:val="22"/>
           <w:szCs w:val="22"/>
         </w:rPr>
+        <w:lastRenderedPageBreak/>
         <w:t xml:space="preserve">Downstream fisheries which harvest migrating stocks face a difficult challenge to design harvest methods which consider both </w:t>
       </w:r>
       <w:r>
@@ -8708,7 +9000,207 @@
           <w:sz w:val="22"/>
           <w:szCs w:val="22"/>
         </w:rPr>
-        <w:t xml:space="preserve">y that heavily </w:t>
+        <w:t xml:space="preserve">y that heavily restricts fishing during the beginning of the salmon migration season to protect early returning fish </w:t>
+      </w:r>
+      <w:r>
+        <w:rPr>
+          <w:rFonts w:ascii="Garamond" w:hAnsi="Garamond"/>
+          <w:sz w:val="22"/>
+          <w:szCs w:val="22"/>
+        </w:rPr>
+        <w:fldChar w:fldCharType="begin"/>
+      </w:r>
+      <w:r>
+        <w:rPr>
+          <w:rFonts w:ascii="Garamond" w:hAnsi="Garamond"/>
+          <w:sz w:val="22"/>
+          <w:szCs w:val="22"/>
+        </w:rPr>
+        <w:instrText xml:space="preserve"> ADDIN ZOTERO_ITEM CSL_CITATION {"citationID":"A32imaA8","properties":{"formattedCitation":"(Bechtol et al., 2025)","plainCitation":"(Bechtol et al., 2025)","dontUpdate":true,"noteIndex":0},"citationItems":[{"id":5396,"uris":["http://zotero.org/users/8421274/items/5K4UUKKW"],"itemData":{"id":5396,"type":"report","language":"en","publisher":"Kuskokwim River Inter-Tribal Fish Commission, Bethel","source":"Zotero","title":"Inseason Harvest and Effort Estimates for the 2024 Kuskokwim River Subsistence Salmon Fisheries During Block Openings","author":[{"family":"Bechtol","given":"William R"},{"family":"Vicente","given":"Terese"},{"family":"Leon","given":"Justin"},{"family":"Hoffman","given":"Avery"},{"family":"Moses","given":"Aaron"},{"family":"Hooper","given":"Delen"}],"issued":{"date-parts":[["2025"]]}}}],"schema":"https://github.com/citation-style-language/schema/raw/master/csl-citation.json"} </w:instrText>
+      </w:r>
+      <w:r>
+        <w:rPr>
+          <w:rFonts w:ascii="Garamond" w:hAnsi="Garamond"/>
+          <w:sz w:val="22"/>
+          <w:szCs w:val="22"/>
+        </w:rPr>
+        <w:fldChar w:fldCharType="separate"/>
+      </w:r>
+      <w:r>
+        <w:rPr>
+          <w:rFonts w:ascii="Garamond" w:hAnsi="Garamond"/>
+          <w:noProof/>
+          <w:sz w:val="22"/>
+          <w:szCs w:val="22"/>
+        </w:rPr>
+        <w:t>(e.g. Bechtol et al., 2025)</w:t>
+      </w:r>
+      <w:r>
+        <w:rPr>
+          <w:rFonts w:ascii="Garamond" w:hAnsi="Garamond"/>
+          <w:sz w:val="22"/>
+          <w:szCs w:val="22"/>
+        </w:rPr>
+        <w:fldChar w:fldCharType="end"/>
+      </w:r>
+      <w:r>
+        <w:rPr>
+          <w:rFonts w:ascii="Garamond" w:hAnsi="Garamond"/>
+          <w:sz w:val="22"/>
+          <w:szCs w:val="22"/>
+        </w:rPr>
+        <w:t>.</w:t>
+      </w:r>
+      <w:r>
+        <w:rPr>
+          <w:rFonts w:ascii="Garamond" w:hAnsi="Garamond"/>
+          <w:sz w:val="22"/>
+          <w:szCs w:val="22"/>
+        </w:rPr>
+        <w:t xml:space="preserve"> </w:t>
+      </w:r>
+      <w:r>
+        <w:rPr>
+          <w:rFonts w:ascii="Garamond" w:hAnsi="Garamond"/>
+          <w:sz w:val="22"/>
+          <w:szCs w:val="22"/>
+        </w:rPr>
+        <w:t>This strategy aims to</w:t>
+      </w:r>
+      <w:r>
+        <w:rPr>
+          <w:rFonts w:ascii="Garamond" w:hAnsi="Garamond"/>
+          <w:sz w:val="22"/>
+          <w:szCs w:val="22"/>
+        </w:rPr>
+        <w:t xml:space="preserve"> support</w:t>
+      </w:r>
+      <w:r>
+        <w:rPr>
+          <w:rFonts w:ascii="Garamond" w:hAnsi="Garamond"/>
+          <w:sz w:val="22"/>
+          <w:szCs w:val="22"/>
+        </w:rPr>
+        <w:t xml:space="preserve"> </w:t>
+      </w:r>
+      <w:r>
+        <w:rPr>
+          <w:rFonts w:ascii="Garamond" w:hAnsi="Garamond"/>
+          <w:sz w:val="22"/>
+          <w:szCs w:val="22"/>
+        </w:rPr>
+        <w:t>basin-wide escapement goals</w:t>
+      </w:r>
+      <w:r>
+        <w:rPr>
+          <w:rFonts w:ascii="Garamond" w:hAnsi="Garamond"/>
+          <w:sz w:val="22"/>
+          <w:szCs w:val="22"/>
+        </w:rPr>
+        <w:t xml:space="preserve"> while allowing for a significant number of fish to return to stocks in the upper portions of the river basin , thereby protecting access to harvest opportunities for upstream communities and bolstering the health of upstream stocks which have a general tendency to migrate early in the season </w:t>
+      </w:r>
+      <w:commentRangeStart w:id="14"/>
+      <w:r>
+        <w:rPr>
+          <w:rFonts w:ascii="Garamond" w:hAnsi="Garamond"/>
+          <w:sz w:val="22"/>
+          <w:szCs w:val="22"/>
+        </w:rPr>
+        <w:fldChar w:fldCharType="begin"/>
+      </w:r>
+      <w:r>
+        <w:rPr>
+          <w:rFonts w:ascii="Garamond" w:hAnsi="Garamond"/>
+          <w:sz w:val="22"/>
+          <w:szCs w:val="22"/>
+        </w:rPr>
+        <w:instrText xml:space="preserve"> ADDIN ZOTERO_ITEM CSL_CITATION {"citationID":"7EzFVXNC","properties":{"formattedCitation":"(Clark et al., 2015)","plainCitation":"(Clark et al., 2015)","noteIndex":0},"citationItems":[{"id":5370,"uris":["http://zotero.org/users/8421274/items/CSEI4Y28"],"itemData":{"id":5370,"type":"article-journal","abstract":"Variation in the timing of migration to freshwaters to spawn is one important dimension of the life history variation within individual salmon stocks. That variable has important implications for developing sustainable fisheries that simultaneously exploit multiple populations within the same geographic area. We examined the variation in migration timing of adult Chinook Salmon Oncorhynchus tshawytscha within the Togiak River system of southwest Alaska to determine whether fish that spawned in different habitats migrated into freshwater from the ocean at different times. In particular, we evaluated whether there were watershed</w:instrText>
+      </w:r>
+      <w:r>
+        <w:rPr>
+          <w:rFonts w:ascii="Cambria Math" w:hAnsi="Cambria Math" w:cs="Cambria Math"/>
+          <w:sz w:val="22"/>
+          <w:szCs w:val="22"/>
+        </w:rPr>
+        <w:instrText>‐</w:instrText>
+      </w:r>
+      <w:r>
+        <w:rPr>
+          <w:rFonts w:ascii="Garamond" w:hAnsi="Garamond"/>
+          <w:sz w:val="22"/>
+          <w:szCs w:val="22"/>
+        </w:rPr>
+        <w:instrText>wide effects of body size, sex, spawning location, and year on the timing of spawning</w:instrText>
+      </w:r>
+      <w:r>
+        <w:rPr>
+          <w:rFonts w:ascii="Cambria Math" w:hAnsi="Cambria Math" w:cs="Cambria Math"/>
+          <w:sz w:val="22"/>
+          <w:szCs w:val="22"/>
+        </w:rPr>
+        <w:instrText>‐</w:instrText>
+      </w:r>
+      <w:r>
+        <w:rPr>
+          <w:rFonts w:ascii="Garamond" w:hAnsi="Garamond"/>
+          <w:sz w:val="22"/>
+          <w:szCs w:val="22"/>
+        </w:rPr>
+        <w:instrText>run migration into the Togiak River. Migration data and spawning fate were collected using radiotelemetry and analyzed with mixed effects models to account for among</w:instrText>
+      </w:r>
+      <w:r>
+        <w:rPr>
+          <w:rFonts w:ascii="Cambria Math" w:hAnsi="Cambria Math" w:cs="Cambria Math"/>
+          <w:sz w:val="22"/>
+          <w:szCs w:val="22"/>
+        </w:rPr>
+        <w:instrText>‐</w:instrText>
+      </w:r>
+      <w:r>
+        <w:rPr>
+          <w:rFonts w:ascii="Garamond" w:hAnsi="Garamond"/>
+          <w:sz w:val="22"/>
+          <w:szCs w:val="22"/>
+        </w:rPr>
+        <w:instrText xml:space="preserve">year variation in migration timing across the 4 years of the study. We found that migration timing of Chinook Salmon in the Togiak watershed is segregated by spawning location and sex and is consistent across body sizes and years. Fish that spawned higher in the watershed had a tendency to enter freshwater earlier than fish that spawned lower in the watershed and in the main stem of the river. Our results indicate clear stock structure in the migration of spawning Chinook Salmon to the Togiak River watershed, suggesting that it is important to distribute harvest over the entire distribution of Chinook Salmon run timing to minimize the risk of overexploiting certain components of the stock complex.","container-title":"Transactions of the American Fisheries Society","DOI":"10.1080/00028487.2015.1031281","ISSN":"0002-8487","issue":"4","journalAbbreviation":"Transactions of the American Fisheries Society","page":"829-836","source":"Silverchair","title":"Migration Timing of Adult Chinook Salmon into the Togiak River, Alaska, Watershed: Is There Evidence for Stock Structure?","title-short":"Migration Timing of Adult Chinook Salmon into the Togiak River, Alaska, Watershed","volume":"144","author":[{"family":"Clark","given":"Sydney C."},{"family":"Tanner","given":"Theresa L."},{"family":"Sethi","given":"Suresh A."},{"family":"Bentley","given":"Kale T."},{"family":"Schindler","given":"Daniel E."}],"issued":{"date-parts":[["2015",7,1]]}}}],"schema":"https://github.com/citation-style-language/schema/raw/master/csl-citation.json"} </w:instrText>
+      </w:r>
+      <w:r>
+        <w:rPr>
+          <w:rFonts w:ascii="Garamond" w:hAnsi="Garamond"/>
+          <w:sz w:val="22"/>
+          <w:szCs w:val="22"/>
+        </w:rPr>
+        <w:fldChar w:fldCharType="separate"/>
+      </w:r>
+      <w:r>
+        <w:rPr>
+          <w:rFonts w:ascii="Garamond" w:hAnsi="Garamond"/>
+          <w:sz w:val="22"/>
+        </w:rPr>
+        <w:t>(Clark et al., 2015)</w:t>
+      </w:r>
+      <w:r>
+        <w:rPr>
+          <w:rFonts w:ascii="Garamond" w:hAnsi="Garamond"/>
+          <w:sz w:val="22"/>
+          <w:szCs w:val="22"/>
+        </w:rPr>
+        <w:fldChar w:fldCharType="end"/>
+      </w:r>
+      <w:commentRangeEnd w:id="14"/>
+      <w:r>
+        <w:rPr>
+          <w:rStyle w:val="CommentReference"/>
+        </w:rPr>
+        <w:commentReference w:id="14"/>
+      </w:r>
+      <w:r>
+        <w:rPr>
+          <w:rFonts w:ascii="Garamond" w:hAnsi="Garamond"/>
+          <w:sz w:val="22"/>
+          <w:szCs w:val="22"/>
+        </w:rPr>
+        <w:t xml:space="preserve">. However, little data exist which quantifies the spatiotemporal patterns among stocks. The impact of front-end closure strategies on individual stock components is not well understood, and a more complete understanding of stock contribution to the overall run both within and among years is currently not readily available. These data may be important to assessing the impact of current management strategies and designing new strategies which maintain stock </w:t>
       </w:r>
       <w:r>
         <w:rPr>
@@ -8717,207 +9209,7 @@
           <w:szCs w:val="22"/>
         </w:rPr>
         <w:lastRenderedPageBreak/>
-        <w:t xml:space="preserve">restricts fishing during the beginning of the salmon migration season to protect early returning fish </w:t>
-      </w:r>
-      <w:r>
-        <w:rPr>
-          <w:rFonts w:ascii="Garamond" w:hAnsi="Garamond"/>
-          <w:sz w:val="22"/>
-          <w:szCs w:val="22"/>
-        </w:rPr>
-        <w:fldChar w:fldCharType="begin"/>
-      </w:r>
-      <w:r>
-        <w:rPr>
-          <w:rFonts w:ascii="Garamond" w:hAnsi="Garamond"/>
-          <w:sz w:val="22"/>
-          <w:szCs w:val="22"/>
-        </w:rPr>
-        <w:instrText xml:space="preserve"> ADDIN ZOTERO_ITEM CSL_CITATION {"citationID":"A32imaA8","properties":{"formattedCitation":"(Bechtol et al., 2025)","plainCitation":"(Bechtol et al., 2025)","dontUpdate":true,"noteIndex":0},"citationItems":[{"id":5396,"uris":["http://zotero.org/users/8421274/items/5K4UUKKW"],"itemData":{"id":5396,"type":"report","language":"en","publisher":"Kuskokwim River Inter-Tribal Fish Commission, Bethel","source":"Zotero","title":"Inseason Harvest and Effort Estimates for the 2024 Kuskokwim River Subsistence Salmon Fisheries During Block Openings","author":[{"family":"Bechtol","given":"William R"},{"family":"Vicente","given":"Terese"},{"family":"Leon","given":"Justin"},{"family":"Hoffman","given":"Avery"},{"family":"Moses","given":"Aaron"},{"family":"Hooper","given":"Delen"}],"issued":{"date-parts":[["2025"]]}}}],"schema":"https://github.com/citation-style-language/schema/raw/master/csl-citation.json"} </w:instrText>
-      </w:r>
-      <w:r>
-        <w:rPr>
-          <w:rFonts w:ascii="Garamond" w:hAnsi="Garamond"/>
-          <w:sz w:val="22"/>
-          <w:szCs w:val="22"/>
-        </w:rPr>
-        <w:fldChar w:fldCharType="separate"/>
-      </w:r>
-      <w:r>
-        <w:rPr>
-          <w:rFonts w:ascii="Garamond" w:hAnsi="Garamond"/>
-          <w:noProof/>
-          <w:sz w:val="22"/>
-          <w:szCs w:val="22"/>
-        </w:rPr>
-        <w:t>(e.g. Bechtol et al., 2025)</w:t>
-      </w:r>
-      <w:r>
-        <w:rPr>
-          <w:rFonts w:ascii="Garamond" w:hAnsi="Garamond"/>
-          <w:sz w:val="22"/>
-          <w:szCs w:val="22"/>
-        </w:rPr>
-        <w:fldChar w:fldCharType="end"/>
-      </w:r>
-      <w:r>
-        <w:rPr>
-          <w:rFonts w:ascii="Garamond" w:hAnsi="Garamond"/>
-          <w:sz w:val="22"/>
-          <w:szCs w:val="22"/>
-        </w:rPr>
-        <w:t>.</w:t>
-      </w:r>
-      <w:r>
-        <w:rPr>
-          <w:rFonts w:ascii="Garamond" w:hAnsi="Garamond"/>
-          <w:sz w:val="22"/>
-          <w:szCs w:val="22"/>
-        </w:rPr>
-        <w:t xml:space="preserve"> </w:t>
-      </w:r>
-      <w:r>
-        <w:rPr>
-          <w:rFonts w:ascii="Garamond" w:hAnsi="Garamond"/>
-          <w:sz w:val="22"/>
-          <w:szCs w:val="22"/>
-        </w:rPr>
-        <w:t>This strategy aims to</w:t>
-      </w:r>
-      <w:r>
-        <w:rPr>
-          <w:rFonts w:ascii="Garamond" w:hAnsi="Garamond"/>
-          <w:sz w:val="22"/>
-          <w:szCs w:val="22"/>
-        </w:rPr>
-        <w:t xml:space="preserve"> support</w:t>
-      </w:r>
-      <w:r>
-        <w:rPr>
-          <w:rFonts w:ascii="Garamond" w:hAnsi="Garamond"/>
-          <w:sz w:val="22"/>
-          <w:szCs w:val="22"/>
-        </w:rPr>
-        <w:t xml:space="preserve"> </w:t>
-      </w:r>
-      <w:r>
-        <w:rPr>
-          <w:rFonts w:ascii="Garamond" w:hAnsi="Garamond"/>
-          <w:sz w:val="22"/>
-          <w:szCs w:val="22"/>
-        </w:rPr>
-        <w:t>basin-wide escapement goals</w:t>
-      </w:r>
-      <w:r>
-        <w:rPr>
-          <w:rFonts w:ascii="Garamond" w:hAnsi="Garamond"/>
-          <w:sz w:val="22"/>
-          <w:szCs w:val="22"/>
-        </w:rPr>
-        <w:t xml:space="preserve"> while allowing for a significant number of fish to return to stocks in the upper portions of the river basin , thereby protecting access to harvest opportunities for upstream communities and bolstering the health of upstream stocks which have a general tendency to migrate early in the season </w:t>
-      </w:r>
-      <w:commentRangeStart w:id="14"/>
-      <w:r>
-        <w:rPr>
-          <w:rFonts w:ascii="Garamond" w:hAnsi="Garamond"/>
-          <w:sz w:val="22"/>
-          <w:szCs w:val="22"/>
-        </w:rPr>
-        <w:fldChar w:fldCharType="begin"/>
-      </w:r>
-      <w:r>
-        <w:rPr>
-          <w:rFonts w:ascii="Garamond" w:hAnsi="Garamond"/>
-          <w:sz w:val="22"/>
-          <w:szCs w:val="22"/>
-        </w:rPr>
-        <w:instrText xml:space="preserve"> ADDIN ZOTERO_ITEM CSL_CITATION {"citationID":"7EzFVXNC","properties":{"formattedCitation":"(Clark et al., 2015)","plainCitation":"(Clark et al., 2015)","noteIndex":0},"citationItems":[{"id":5370,"uris":["http://zotero.org/users/8421274/items/CSEI4Y28"],"itemData":{"id":5370,"type":"article-journal","abstract":"Variation in the timing of migration to freshwaters to spawn is one important dimension of the life history variation within individual salmon stocks. That variable has important implications for developing sustainable fisheries that simultaneously exploit multiple populations within the same geographic area. We examined the variation in migration timing of adult Chinook Salmon Oncorhynchus tshawytscha within the Togiak River system of southwest Alaska to determine whether fish that spawned in different habitats migrated into freshwater from the ocean at different times. In particular, we evaluated whether there were watershed</w:instrText>
-      </w:r>
-      <w:r>
-        <w:rPr>
-          <w:rFonts w:ascii="Cambria Math" w:hAnsi="Cambria Math" w:cs="Cambria Math"/>
-          <w:sz w:val="22"/>
-          <w:szCs w:val="22"/>
-        </w:rPr>
-        <w:instrText>‐</w:instrText>
-      </w:r>
-      <w:r>
-        <w:rPr>
-          <w:rFonts w:ascii="Garamond" w:hAnsi="Garamond"/>
-          <w:sz w:val="22"/>
-          <w:szCs w:val="22"/>
-        </w:rPr>
-        <w:instrText>wide effects of body size, sex, spawning location, and year on the timing of spawning</w:instrText>
-      </w:r>
-      <w:r>
-        <w:rPr>
-          <w:rFonts w:ascii="Cambria Math" w:hAnsi="Cambria Math" w:cs="Cambria Math"/>
-          <w:sz w:val="22"/>
-          <w:szCs w:val="22"/>
-        </w:rPr>
-        <w:instrText>‐</w:instrText>
-      </w:r>
-      <w:r>
-        <w:rPr>
-          <w:rFonts w:ascii="Garamond" w:hAnsi="Garamond"/>
-          <w:sz w:val="22"/>
-          <w:szCs w:val="22"/>
-        </w:rPr>
-        <w:instrText>run migration into the Togiak River. Migration data and spawning fate were collected using radiotelemetry and analyzed with mixed effects models to account for among</w:instrText>
-      </w:r>
-      <w:r>
-        <w:rPr>
-          <w:rFonts w:ascii="Cambria Math" w:hAnsi="Cambria Math" w:cs="Cambria Math"/>
-          <w:sz w:val="22"/>
-          <w:szCs w:val="22"/>
-        </w:rPr>
-        <w:instrText>‐</w:instrText>
-      </w:r>
-      <w:r>
-        <w:rPr>
-          <w:rFonts w:ascii="Garamond" w:hAnsi="Garamond"/>
-          <w:sz w:val="22"/>
-          <w:szCs w:val="22"/>
-        </w:rPr>
-        <w:instrText xml:space="preserve">year variation in migration timing across the 4 years of the study. We found that migration timing of Chinook Salmon in the Togiak watershed is segregated by spawning location and sex and is consistent across body sizes and years. Fish that spawned higher in the watershed had a tendency to enter freshwater earlier than fish that spawned lower in the watershed and in the main stem of the river. Our results indicate clear stock structure in the migration of spawning Chinook Salmon to the Togiak River watershed, suggesting that it is important to distribute harvest over the entire distribution of Chinook Salmon run timing to minimize the risk of overexploiting certain components of the stock complex.","container-title":"Transactions of the American Fisheries Society","DOI":"10.1080/00028487.2015.1031281","ISSN":"0002-8487","issue":"4","journalAbbreviation":"Transactions of the American Fisheries Society","page":"829-836","source":"Silverchair","title":"Migration Timing of Adult Chinook Salmon into the Togiak River, Alaska, Watershed: Is There Evidence for Stock Structure?","title-short":"Migration Timing of Adult Chinook Salmon into the Togiak River, Alaska, Watershed","volume":"144","author":[{"family":"Clark","given":"Sydney C."},{"family":"Tanner","given":"Theresa L."},{"family":"Sethi","given":"Suresh A."},{"family":"Bentley","given":"Kale T."},{"family":"Schindler","given":"Daniel E."}],"issued":{"date-parts":[["2015",7,1]]}}}],"schema":"https://github.com/citation-style-language/schema/raw/master/csl-citation.json"} </w:instrText>
-      </w:r>
-      <w:r>
-        <w:rPr>
-          <w:rFonts w:ascii="Garamond" w:hAnsi="Garamond"/>
-          <w:sz w:val="22"/>
-          <w:szCs w:val="22"/>
-        </w:rPr>
-        <w:fldChar w:fldCharType="separate"/>
-      </w:r>
-      <w:r>
-        <w:rPr>
-          <w:rFonts w:ascii="Garamond" w:hAnsi="Garamond"/>
-          <w:sz w:val="22"/>
-        </w:rPr>
-        <w:t>(Clark et al., 2015)</w:t>
-      </w:r>
-      <w:r>
-        <w:rPr>
-          <w:rFonts w:ascii="Garamond" w:hAnsi="Garamond"/>
-          <w:sz w:val="22"/>
-          <w:szCs w:val="22"/>
-        </w:rPr>
-        <w:fldChar w:fldCharType="end"/>
-      </w:r>
-      <w:commentRangeEnd w:id="14"/>
-      <w:r>
-        <w:rPr>
-          <w:rStyle w:val="CommentReference"/>
-        </w:rPr>
-        <w:commentReference w:id="14"/>
-      </w:r>
-      <w:r>
-        <w:rPr>
-          <w:rFonts w:ascii="Garamond" w:hAnsi="Garamond"/>
-          <w:sz w:val="22"/>
-          <w:szCs w:val="22"/>
-        </w:rPr>
-        <w:t xml:space="preserve">. However, little data exist which quantifies the spatiotemporal patterns among stocks. The impact of front-end closure strategies on individual stock components is not well understood, and a more complete understanding of stock contribution to the overall run both within and among years is currently not readily available. These data may be important to assessing the impact of current management strategies and designing new strategies which maintain stock health across all components of the watershed and maintain a reliable resource for communities and industry in the region. </w:t>
+        <w:t xml:space="preserve">health across all components of the watershed and maintain a reliable resource for communities and industry in the region. </w:t>
       </w:r>
     </w:p>
     <w:p>
@@ -9225,11 +9517,8 @@
       </w:r>
     </w:p>
   </w:comment>
-  <w:comment w:id="8" w:author="Benjamin J. Makhlouf" w:date="2025-07-28T07:42:00Z" w:initials="BM">
+  <w:comment w:id="8" w:author="Benjamin J. Makhlouf" w:date="2025-07-30T08:26:00Z" w:initials="b">
     <w:p>
-      <w:pPr>
-        <w:pStyle w:val="CommentText"/>
-      </w:pPr>
       <w:r>
         <w:rPr>
           <w:rStyle w:val="CommentReference"/>
@@ -9237,11 +9526,15 @@
         <w:annotationRef/>
       </w:r>
       <w:r>
-        <w:t xml:space="preserve">This is in one of Sean’s papers but I cannot find it </w:t>
+        <w:rPr>
+          <w:sz w:val="20"/>
+          <w:szCs w:val="20"/>
+        </w:rPr>
+        <w:t>We run into the same problem as the last paper where it is very unclear how this habitat prior is made (other than shutting off the eek). I can reasonably assume it's the same as the Yukon</w:t>
       </w:r>
     </w:p>
   </w:comment>
-  <w:comment w:id="9" w:author="Benjamin J. Makhlouf" w:date="2025-07-30T08:26:00Z" w:initials="b">
+  <w:comment w:id="10" w:author="Benjamin J. Makhlouf" w:date="2025-07-30T10:53:00Z" w:initials="b">
     <w:p>
       <w:r>
         <w:rPr>
@@ -9254,11 +9547,11 @@
           <w:sz w:val="20"/>
           <w:szCs w:val="20"/>
         </w:rPr>
-        <w:t>We run into the same problem as the last paper where it is very unclear how this habitat prior is made (other than shutting off the eek). I can reasonably assume it's the same as the Yukon</w:t>
+        <w:t>The map we used to pull these rivers is on an adfg web page but I cant track it to a publication</w:t>
       </w:r>
     </w:p>
   </w:comment>
-  <w:comment w:id="11" w:author="Benjamin J. Makhlouf" w:date="2025-07-30T10:53:00Z" w:initials="b">
+  <w:comment w:id="12" w:author="Benjamin J. Makhlouf" w:date="2025-08-01T13:29:00Z" w:initials="b">
     <w:p>
       <w:r>
         <w:rPr>
@@ -9271,7 +9564,7 @@
           <w:sz w:val="20"/>
           <w:szCs w:val="20"/>
         </w:rPr>
-        <w:t>The map we used to pull these rivers is on an adfg web page but I cant track it to a publication</w:t>
+        <w:t xml:space="preserve">Should I mention here anything about our assumption that the amount of protection does not influence fishing effort in the open period. I.e. if lots of fish are protected the rest of the stock may be harvested even harder </w:t>
       </w:r>
     </w:p>
   </w:comment>
@@ -9299,9 +9592,9 @@
   <w15:commentEx w15:paraId="545E12D6" w15:done="0"/>
   <w15:commentEx w15:paraId="7B9E6931" w15:done="0"/>
   <w15:commentEx w15:paraId="317DFEBA" w15:done="0"/>
-  <w15:commentEx w15:paraId="05C4AF8C" w15:done="0"/>
   <w15:commentEx w15:paraId="78D2F929" w15:done="0"/>
   <w15:commentEx w15:paraId="1EF3F5E1" w15:done="0"/>
+  <w15:commentEx w15:paraId="67C57774" w15:done="0"/>
   <w15:commentEx w15:paraId="506CDC99" w15:done="0"/>
 </w15:commentsEx>
 </file>
@@ -9311,9 +9604,9 @@
   <w16cex:commentExtensible w16cex:durableId="0AF9D5BC" w16cex:dateUtc="2025-07-26T18:23:00Z"/>
   <w16cex:commentExtensible w16cex:durableId="02BD22AA" w16cex:dateUtc="2025-07-30T01:17:00Z"/>
   <w16cex:commentExtensible w16cex:durableId="6C95C996" w16cex:dateUtc="2025-07-28T14:41:00Z"/>
-  <w16cex:commentExtensible w16cex:durableId="3CAE4ABD" w16cex:dateUtc="2025-07-28T14:42:00Z"/>
   <w16cex:commentExtensible w16cex:durableId="1D6CE52A" w16cex:dateUtc="2025-07-30T15:26:00Z"/>
   <w16cex:commentExtensible w16cex:durableId="4D2F7D90" w16cex:dateUtc="2025-07-30T17:53:00Z"/>
+  <w16cex:commentExtensible w16cex:durableId="4948DF78" w16cex:dateUtc="2025-08-01T20:29:00Z"/>
   <w16cex:commentExtensible w16cex:durableId="08B9BEA6" w16cex:dateUtc="2025-06-27T19:54:00Z"/>
 </w16cex:commentsExtensible>
 </file>
@@ -9323,9 +9616,9 @@
   <w16cid:commentId w16cid:paraId="545E12D6" w16cid:durableId="0AF9D5BC"/>
   <w16cid:commentId w16cid:paraId="7B9E6931" w16cid:durableId="02BD22AA"/>
   <w16cid:commentId w16cid:paraId="317DFEBA" w16cid:durableId="6C95C996"/>
-  <w16cid:commentId w16cid:paraId="05C4AF8C" w16cid:durableId="3CAE4ABD"/>
   <w16cid:commentId w16cid:paraId="78D2F929" w16cid:durableId="1D6CE52A"/>
   <w16cid:commentId w16cid:paraId="1EF3F5E1" w16cid:durableId="4D2F7D90"/>
+  <w16cid:commentId w16cid:paraId="67C57774" w16cid:durableId="4948DF78"/>
   <w16cid:commentId w16cid:paraId="506CDC99" w16cid:durableId="08B9BEA6"/>
 </w16cid:commentsIds>
 </file>

</xml_diff>

<commit_message>
working my way back through intro, about half way
</commit_message>
<xml_diff>
--- a/Docs/Run_timing_manuscript.docx
+++ b/Docs/Run_timing_manuscript.docx
@@ -80,9 +80,38 @@
           <w:szCs w:val="20"/>
         </w:rPr>
       </w:pPr>
-      <w:commentRangeStart w:id="0"/>
-      <w:commentRangeStart w:id="1"/>
-      <w:r>
+    </w:p>
+    <w:p>
+      <w:pPr>
+        <w:suppressLineNumbers/>
+        <w:jc w:val="center"/>
+        <w:rPr>
+          <w:rFonts w:ascii="Garamond" w:hAnsi="Garamond"/>
+          <w:sz w:val="20"/>
+          <w:szCs w:val="20"/>
+        </w:rPr>
+      </w:pPr>
+      <w:r>
+        <w:rPr>
+          <w:rFonts w:ascii="Garamond" w:hAnsi="Garamond"/>
+          <w:sz w:val="20"/>
+          <w:szCs w:val="20"/>
+        </w:rPr>
+        <w:t>Ben Makhlouf, Daniel Schindler, Tim Cline, Zach Liller, Sean Larson</w:t>
+      </w:r>
+      <w:r>
+        <w:rPr>
+          <w:rFonts w:ascii="Garamond" w:hAnsi="Garamond"/>
+          <w:sz w:val="20"/>
+          <w:szCs w:val="20"/>
+        </w:rPr>
+        <w:t>, Kevin Whitworth, Spencer Reardon</w:t>
+      </w:r>
+    </w:p>
+    <w:p>
+      <w:pPr>
+        <w:suppressLineNumbers/>
+        <w:jc w:val="center"/>
         <w:rPr>
           <w:rFonts w:ascii="Garamond" w:hAnsi="Garamond"/>
           <w:b/>
@@ -90,41 +119,38 @@
           <w:sz w:val="20"/>
           <w:szCs w:val="20"/>
         </w:rPr>
-        <w:t>Ben Makhlouf, Daniel Schindler, Tim Cline, Zach Liller, Sean Larson</w:t>
-      </w:r>
-      <w:commentRangeEnd w:id="0"/>
-      <w:r>
-        <w:rPr>
-          <w:rStyle w:val="CommentReference"/>
-        </w:rPr>
-        <w:commentReference w:id="0"/>
-      </w:r>
-      <w:commentRangeEnd w:id="1"/>
-      <w:r>
-        <w:rPr>
-          <w:rStyle w:val="CommentReference"/>
-        </w:rPr>
-        <w:commentReference w:id="1"/>
-      </w:r>
+      </w:pPr>
     </w:p>
     <w:p>
       <w:pPr>
         <w:suppressLineNumbers/>
-        <w:jc w:val="center"/>
-        <w:rPr>
+        <w:rPr>
+          <w:ins w:id="0" w:author="Benjamin J. Makhlouf" w:date="2025-08-27T07:08:00Z" w16du:dateUtc="2025-08-27T14:08:00Z"/>
           <w:rFonts w:ascii="Garamond" w:hAnsi="Garamond"/>
           <w:b/>
           <w:bCs/>
-          <w:sz w:val="20"/>
-          <w:szCs w:val="20"/>
-        </w:rPr>
-      </w:pPr>
+          <w:sz w:val="22"/>
+          <w:szCs w:val="22"/>
+          <w:u w:val="single"/>
+        </w:rPr>
+      </w:pPr>
+      <w:r>
+        <w:rPr>
+          <w:rFonts w:ascii="Garamond" w:hAnsi="Garamond"/>
+          <w:b/>
+          <w:bCs/>
+          <w:sz w:val="22"/>
+          <w:szCs w:val="22"/>
+          <w:u w:val="single"/>
+        </w:rPr>
+        <w:t>Abstract:</w:t>
+      </w:r>
     </w:p>
     <w:p>
       <w:pPr>
         <w:suppressLineNumbers/>
         <w:rPr>
-          <w:ins w:id="2" w:author="Daniel Schindler" w:date="2025-08-26T17:08:00Z" w16du:dateUtc="2025-08-27T01:08:00Z"/>
+          <w:ins w:id="1" w:author="Benjamin J. Makhlouf" w:date="2025-08-27T08:43:00Z" w16du:dateUtc="2025-08-27T15:43:00Z"/>
           <w:rFonts w:ascii="Garamond" w:hAnsi="Garamond"/>
           <w:b/>
           <w:bCs/>
@@ -133,315 +159,364 @@
           <w:u w:val="single"/>
         </w:rPr>
       </w:pPr>
-      <w:ins w:id="3" w:author="Daniel Schindler" w:date="2025-08-26T17:08:00Z" w16du:dateUtc="2025-08-27T01:08:00Z">
+    </w:p>
+    <w:p>
+      <w:pPr>
+        <w:suppressLineNumbers/>
+        <w:spacing w:line="480" w:lineRule="auto"/>
+        <w:ind w:firstLine="720"/>
+        <w:rPr>
+          <w:rFonts w:ascii="Garamond" w:hAnsi="Garamond"/>
+        </w:rPr>
+      </w:pPr>
+      <w:r>
+        <w:rPr>
+          <w:rFonts w:ascii="Garamond" w:hAnsi="Garamond"/>
+        </w:rPr>
+        <w:t xml:space="preserve">Effective fisheries management requires balancing harvest opportunities with the protection of population biodiversity. Pacific salmon returning to large North American river systems exhibit significant interpopulation variability in return timing and spatial habitat use patterns, which contribute to population resilience. However, these spatiotemporal dynamics are poorly understood, limiting their integration into management strategies. Here, we reconstruct the spatiotemporal dynamics of return timing for Kuskokwim River Chinook salmon across six years using otolith isotope </w:t>
+      </w:r>
+      <w:r>
+        <w:rPr>
+          <w:rFonts w:ascii="Garamond" w:hAnsi="Garamond"/>
+        </w:rPr>
+        <w:t>signatures and</w:t>
+      </w:r>
+      <w:r>
+        <w:rPr>
+          <w:rFonts w:ascii="Garamond" w:hAnsi="Garamond"/>
+        </w:rPr>
+        <w:t xml:space="preserve"> examine the stock-specific impacts of a front-end fishery closure implemented in the basin. We demonstrate a consistent relationship between run timing and watershed position, with earlier returning populations contributing disproportionately to the uppermost portion of the watershed. This trend was consistent when examining relative population contributions within discrete temporal windows during the return migration, as well as in cumulative distribution analyses that controlled for total return abundance. While this spatial pattern was robust, we observed interannual variability in the magnitude of population contributions and overall run timing. The front-end closure strategy provided disproportionately higher protection to upper watershed stocks, thereby preserving upstream population diversity that is critical for stabilizing basin-wide fishery dynamics.</w:t>
+      </w:r>
+      <w:r>
+        <w:rPr>
+          <w:rFonts w:ascii="Garamond" w:hAnsi="Garamond"/>
+        </w:rPr>
+        <w:t xml:space="preserve"> </w:t>
+      </w:r>
+    </w:p>
+    <w:p>
+      <w:pPr>
+        <w:spacing w:line="480" w:lineRule="auto"/>
+        <w:rPr>
+          <w:ins w:id="2" w:author="Benjamin J. Makhlouf" w:date="2025-08-27T08:42:00Z" w16du:dateUtc="2025-08-27T15:42:00Z"/>
+          <w:rFonts w:ascii="Garamond" w:hAnsi="Garamond"/>
+          <w:b/>
+          <w:bCs/>
+          <w:sz w:val="22"/>
+          <w:szCs w:val="22"/>
+          <w:u w:val="single"/>
+        </w:rPr>
+      </w:pPr>
+    </w:p>
+    <w:p>
+      <w:pPr>
+        <w:spacing w:line="480" w:lineRule="auto"/>
+        <w:rPr>
+          <w:rFonts w:ascii="Garamond" w:hAnsi="Garamond"/>
+          <w:b/>
+          <w:bCs/>
+          <w:sz w:val="22"/>
+          <w:szCs w:val="22"/>
+          <w:u w:val="single"/>
+        </w:rPr>
+      </w:pPr>
+      <w:r>
+        <w:rPr>
+          <w:rFonts w:ascii="Garamond" w:hAnsi="Garamond"/>
+          <w:b/>
+          <w:bCs/>
+          <w:sz w:val="22"/>
+          <w:szCs w:val="22"/>
+          <w:u w:val="single"/>
+        </w:rPr>
+        <w:lastRenderedPageBreak/>
+        <w:t xml:space="preserve">Introduction: </w:t>
+      </w:r>
+      <w:r>
+        <w:rPr>
+          <w:rFonts w:ascii="Garamond" w:hAnsi="Garamond"/>
+          <w:sz w:val="22"/>
+          <w:szCs w:val="22"/>
+        </w:rPr>
+        <w:t xml:space="preserve"> </w:t>
+      </w:r>
+    </w:p>
+    <w:p>
+      <w:pPr>
+        <w:spacing w:line="480" w:lineRule="auto"/>
+        <w:ind w:firstLine="720"/>
+        <w:rPr>
+          <w:rFonts w:ascii="Garamond" w:hAnsi="Garamond"/>
+          <w:sz w:val="22"/>
+          <w:szCs w:val="22"/>
+        </w:rPr>
+      </w:pPr>
+      <w:r>
+        <w:rPr>
+          <w:rFonts w:ascii="Garamond" w:hAnsi="Garamond"/>
+          <w:sz w:val="22"/>
+          <w:szCs w:val="22"/>
+        </w:rPr>
+        <w:t xml:space="preserve">A </w:t>
+      </w:r>
+      <w:r>
+        <w:rPr>
+          <w:rFonts w:ascii="Garamond" w:hAnsi="Garamond"/>
+          <w:sz w:val="22"/>
+          <w:szCs w:val="22"/>
+        </w:rPr>
+        <w:t>key</w:t>
+      </w:r>
+      <w:r>
+        <w:rPr>
+          <w:rFonts w:ascii="Garamond" w:hAnsi="Garamond"/>
+          <w:sz w:val="22"/>
+          <w:szCs w:val="22"/>
+        </w:rPr>
+        <w:t xml:space="preserve"> challenge in fisheries management is balancing the dual goals of maximizing harvest opportunities </w:t>
+      </w:r>
+      <w:r>
+        <w:rPr>
+          <w:rFonts w:ascii="Garamond" w:hAnsi="Garamond"/>
+          <w:sz w:val="22"/>
+          <w:szCs w:val="22"/>
+        </w:rPr>
+        <w:t xml:space="preserve">while </w:t>
+      </w:r>
+      <w:r>
+        <w:rPr>
+          <w:rFonts w:ascii="Garamond" w:hAnsi="Garamond"/>
+          <w:sz w:val="22"/>
+          <w:szCs w:val="22"/>
+        </w:rPr>
+        <w:t>p</w:t>
+      </w:r>
+      <w:r>
+        <w:rPr>
+          <w:rFonts w:ascii="Garamond" w:hAnsi="Garamond"/>
+          <w:sz w:val="22"/>
+          <w:szCs w:val="22"/>
+        </w:rPr>
+        <w:t xml:space="preserve">reserving </w:t>
+      </w:r>
+      <w:r>
+        <w:rPr>
+          <w:rFonts w:ascii="Garamond" w:hAnsi="Garamond"/>
+          <w:sz w:val="22"/>
+          <w:szCs w:val="22"/>
+        </w:rPr>
+        <w:t>biodiversity.</w:t>
+      </w:r>
+      <w:r>
+        <w:rPr>
+          <w:rFonts w:ascii="Garamond" w:hAnsi="Garamond"/>
+          <w:sz w:val="22"/>
+          <w:szCs w:val="22"/>
+        </w:rPr>
+        <w:t xml:space="preserve"> </w:t>
+      </w:r>
+      <w:r>
+        <w:rPr>
+          <w:rFonts w:ascii="Garamond" w:hAnsi="Garamond"/>
+          <w:sz w:val="22"/>
+          <w:szCs w:val="22"/>
+        </w:rPr>
+        <w:t>In this context, b</w:t>
+      </w:r>
+      <w:r>
+        <w:rPr>
+          <w:rFonts w:ascii="Garamond" w:hAnsi="Garamond"/>
+          <w:sz w:val="22"/>
+          <w:szCs w:val="22"/>
+        </w:rPr>
+        <w:t xml:space="preserve">iodiversity can be defined </w:t>
+      </w:r>
+      <w:r>
+        <w:rPr>
+          <w:rFonts w:ascii="Garamond" w:hAnsi="Garamond"/>
+          <w:sz w:val="22"/>
+          <w:szCs w:val="22"/>
+        </w:rPr>
+        <w:t>both by</w:t>
+      </w:r>
+      <w:r>
+        <w:rPr>
+          <w:rFonts w:ascii="Garamond" w:hAnsi="Garamond"/>
+          <w:sz w:val="22"/>
+          <w:szCs w:val="22"/>
+        </w:rPr>
+        <w:t xml:space="preserve"> the number of species within an ecosystem</w:t>
+      </w:r>
+      <w:r>
+        <w:rPr>
+          <w:rFonts w:ascii="Garamond" w:hAnsi="Garamond"/>
+          <w:sz w:val="22"/>
+          <w:szCs w:val="22"/>
+        </w:rPr>
+        <w:t xml:space="preserve"> as well as</w:t>
+      </w:r>
+      <w:r>
+        <w:rPr>
+          <w:rFonts w:ascii="Garamond" w:hAnsi="Garamond"/>
+          <w:sz w:val="22"/>
+          <w:szCs w:val="22"/>
+        </w:rPr>
+        <w:t xml:space="preserve"> </w:t>
+      </w:r>
+      <w:r>
+        <w:rPr>
+          <w:rFonts w:ascii="Garamond" w:hAnsi="Garamond"/>
+          <w:sz w:val="22"/>
+          <w:szCs w:val="22"/>
+        </w:rPr>
+        <w:t xml:space="preserve">intrapopulation </w:t>
+      </w:r>
+      <w:r>
+        <w:rPr>
+          <w:rFonts w:ascii="Garamond" w:hAnsi="Garamond"/>
+          <w:sz w:val="22"/>
+          <w:szCs w:val="22"/>
+        </w:rPr>
+        <w:t xml:space="preserve">diversity among </w:t>
+      </w:r>
+      <w:r>
+        <w:rPr>
+          <w:rFonts w:ascii="Garamond" w:hAnsi="Garamond"/>
+          <w:sz w:val="22"/>
+          <w:szCs w:val="22"/>
+        </w:rPr>
+        <w:t xml:space="preserve">metapopulations of a </w:t>
+      </w:r>
+      <w:r>
+        <w:rPr>
+          <w:rFonts w:ascii="Garamond" w:hAnsi="Garamond"/>
+          <w:sz w:val="22"/>
+          <w:szCs w:val="22"/>
+        </w:rPr>
+        <w:t>single species</w:t>
+      </w:r>
+      <w:r>
+        <w:rPr>
+          <w:rFonts w:ascii="Garamond" w:hAnsi="Garamond"/>
+          <w:sz w:val="22"/>
+          <w:szCs w:val="22"/>
+        </w:rPr>
+        <w:t xml:space="preserve"> </w:t>
+      </w:r>
+      <w:r>
+        <w:rPr>
+          <w:rFonts w:ascii="Garamond" w:hAnsi="Garamond"/>
+          <w:sz w:val="22"/>
+          <w:szCs w:val="22"/>
+        </w:rPr>
+        <w:fldChar w:fldCharType="begin"/>
+      </w:r>
+      <w:r>
+        <w:rPr>
+          <w:rFonts w:ascii="Garamond" w:hAnsi="Garamond"/>
+          <w:sz w:val="22"/>
+          <w:szCs w:val="22"/>
+        </w:rPr>
+        <w:instrText xml:space="preserve"> ADDIN ZOTERO_ITEM CSL_CITATION {"citationID":"O8GNuS7R","properties":{"formattedCitation":"(Bolnick et al., 2011; Luck et al., 2003; Schindler et al., 2010)","plainCitation":"(Bolnick et al., 2011; Luck et al., 2003; Schindler et al., 2010)","noteIndex":0},"citationItems":[{"id":5318,"uris":["http://zotero.org/users/8421274/items/R2ZYTKMR"],"itemData":{"id":5318,"type":"article-journal","container-title":"Trends in Ecology &amp; Evolution","DOI":"10.1016/j.tree.2011.01.009","ISSN":"0169-5347","issue":"4","journalAbbreviation":"Trends in Ecology &amp; Evolution","language":"English","note":"publisher: Elsevier\nPMID: 21367482","page":"183-192","source":"www.cell.com","title":"Why intraspecific trait variation matters in community ecology","volume":"26","author":[{"family":"Bolnick","given":"Daniel I."},{"family":"Amarasekare","given":"Priyanga"},{"family":"Araújo","given":"Márcio S."},{"family":"Bürger","given":"Reinhard"},{"family":"Levine","given":"Jonathan M."},{"family":"Novak","given":"Mark"},{"family":"Rudolf","given":"Volker H. W."},{"family":"Schreiber","given":"Sebastian J."},{"family":"Urban","given":"Mark C."},{"family":"Vasseur","given":"David A."}],"issued":{"date-parts":[["2011",4,1]]}}},{"id":5557,"uris":["http://zotero.org/users/8421274/items/VSKUKCRX"],"itemData":{"id":5557,"type":"article-journal","abstract":"The current rate of biodiversity loss threatens to disrupt greatly the functioning of ecosystems, with potentially significant consequences for humanity. The magnitude of the loss is generally measured with the use of species extinction rates, an approach that understates the severity of the problem and masks some of its most important consequences. Here, we propose a major expansion of this focus to include population diversity: considering changes in the size, number, distribution and genetic composition of populations and the implications of those changes for the functioning of ecosystems and the provision of ecosystem services. We also outline the key components of population diversity and describe a new approach to delineating a population unit that explicitly links it to the services that it provides","container-title":"Trends in Ecology &amp; Evolution","DOI":"10.1016/S0169-5347(03)00100-9","journalAbbreviation":"Trends in Ecology &amp; Evolution","page":"331-336","source":"ResearchGate","title":"Population diversity and ecosystem services","volume":"18","author":[{"family":"Luck","given":"Gary"},{"family":"Daily","given":"Gretchen"},{"family":"Ehrlich","given":"Paul"}],"issued":{"date-parts":[["2003",7,1]]}}},{"id":272,"uris":["http://zotero.org/users/8421274/items/24NDGS7V"],"itemData":{"id":272,"type":"article-journal","abstract":"One of the most pervasive themes in ecology is that biological diversity stabilizes ecosystem processes and the services they provide to society, a concept that has become a common argument for biodiversity conservation. Species-rich communities are thought to produce more temporally stable ecosystem services because of the complementary or independent dynamics among species that perform similar ecosystem functions. Such variance dampening within communities is referred to as a portfolio effect and is analogous to the effects of asset diversity on the stability of financial portfolios. In ecology, these arguments have focused on the effects of species diversity on ecosystem stability but have not considered the importance of biologically relevant diversity within individual species. Current rates of population extirpation are probably at least three orders of magnitude higher than species extinction rates, so there is a pressing need to clarify how population and life history diversity affect the performance of individual species in providing important ecosystem services. Here we use five decades of data from Oncorhynchus nerka (sockeye salmon) in Bristol Bay, Alaska, to provide the first quantification of portfolio effects that derive from population and life history diversity in an important and heavily exploited species. Variability in annual Bristol Bay salmon returns is 2.2 times lower than it would be if the system consisted of a single homogenous population rather than the several hundred discrete populations it currently consists of. Furthermore, if it were a single homogeneous population, such increased variability would lead to ten times more frequent fisheries closures. Portfolio effects are also evident in watershed food webs, where they stabilize and extend predator access to salmon resources. Our results demonstrate the critical importance of maintaining population diversity for stabilizing ecosystem services and securing the economies and livelihoods that depend on them. The reliability of ecosystem services will erode faster than indicated by species loss alone. [PUBLICATION ABSTRACT]","container-title":"Nature","DOI":"https://doi-org.prox.lib.ncsu.edu/10.1038/nature09060","ISSN":"00280836","issue":"7298","language":"English","license":"Copyright Nature Publishing Group Jun 3, 2010","note":"number-of-pages: 5\npublisher-place: London, United States\npublisher: Nature Publishing Group\nsection: LETTERS","source":"ProQuest","title":"Population diversity and the portfolio effect in an exploited species","URL":"http://www.proquest.com/docview/375318240/abstract/317AC81E34EB4163PQ/1","volume":"465","author":[{"family":"Schindler","given":"Daniel E."},{"family":"Hilborn","given":"Ray"},{"family":"Chasco","given":"Brandon"},{"family":"Boatright","given":"Christopher P."},{"family":"Quinn","given":"Thomas P."},{"family":"Rogers","given":"Lauren A."},{"family":"Webster","given":"Michael S."}],"accessed":{"date-parts":[["2022",5,12]]},"issued":{"date-parts":[["2010",6,3]]}}}],"schema":"https://github.com/citation-style-language/schema/raw/master/csl-citation.json"} </w:instrText>
+      </w:r>
+      <w:r>
+        <w:rPr>
+          <w:rFonts w:ascii="Garamond" w:hAnsi="Garamond"/>
+          <w:sz w:val="22"/>
+          <w:szCs w:val="22"/>
+        </w:rPr>
+        <w:fldChar w:fldCharType="separate"/>
+      </w:r>
+      <w:r>
+        <w:rPr>
+          <w:rFonts w:ascii="Garamond" w:hAnsi="Garamond"/>
+          <w:noProof/>
+          <w:sz w:val="22"/>
+          <w:szCs w:val="22"/>
+        </w:rPr>
+        <w:t>(Bolnick et al., 2011; Luck et al., 2003; Schindler et al., 2010)</w:t>
+      </w:r>
+      <w:r>
+        <w:rPr>
+          <w:rFonts w:ascii="Garamond" w:hAnsi="Garamond"/>
+          <w:sz w:val="22"/>
+          <w:szCs w:val="22"/>
+        </w:rPr>
+        <w:fldChar w:fldCharType="end"/>
+      </w:r>
+      <w:r>
+        <w:rPr>
+          <w:rFonts w:ascii="Garamond" w:hAnsi="Garamond"/>
+          <w:sz w:val="22"/>
+          <w:szCs w:val="22"/>
+        </w:rPr>
+        <w:t xml:space="preserve">. </w:t>
+      </w:r>
+      <w:r>
+        <w:rPr>
+          <w:rFonts w:ascii="Garamond" w:hAnsi="Garamond"/>
+          <w:sz w:val="22"/>
+          <w:szCs w:val="22"/>
+        </w:rPr>
+        <w:t xml:space="preserve">In either case, </w:t>
+      </w:r>
+      <w:r>
+        <w:rPr>
+          <w:rFonts w:ascii="Garamond" w:hAnsi="Garamond"/>
+          <w:sz w:val="22"/>
+          <w:szCs w:val="22"/>
+        </w:rPr>
+        <w:t xml:space="preserve">population </w:t>
+      </w:r>
+      <w:r>
+        <w:rPr>
+          <w:rFonts w:ascii="Garamond" w:hAnsi="Garamond"/>
+          <w:sz w:val="22"/>
+          <w:szCs w:val="22"/>
+        </w:rPr>
+        <w:t xml:space="preserve">diversity </w:t>
+      </w:r>
+      <w:r>
+        <w:rPr>
+          <w:rFonts w:ascii="Garamond" w:hAnsi="Garamond"/>
+          <w:sz w:val="22"/>
+          <w:szCs w:val="22"/>
+        </w:rPr>
+        <w:t>stabiliz</w:t>
+      </w:r>
+      <w:r>
+        <w:rPr>
+          <w:rFonts w:ascii="Garamond" w:hAnsi="Garamond"/>
+          <w:sz w:val="22"/>
+          <w:szCs w:val="22"/>
+        </w:rPr>
+        <w:t>e</w:t>
+      </w:r>
+      <w:ins w:id="3" w:author="Daniel Schindler" w:date="2025-08-26T15:43:00Z" w16du:dateUtc="2025-08-26T23:43:00Z">
         <w:r>
           <w:rPr>
             <w:rFonts w:ascii="Garamond" w:hAnsi="Garamond"/>
-            <w:b/>
-            <w:bCs/>
             <w:sz w:val="22"/>
             <w:szCs w:val="22"/>
-            <w:u w:val="single"/>
           </w:rPr>
-          <w:t>Abstract:</w:t>
+          <w:t>s</w:t>
         </w:r>
       </w:ins>
-    </w:p>
-    <w:p>
-      <w:pPr>
-        <w:suppressLineNumbers/>
-        <w:rPr>
-          <w:rFonts w:ascii="Garamond" w:hAnsi="Garamond"/>
-          <w:b/>
-          <w:bCs/>
-          <w:sz w:val="22"/>
-          <w:szCs w:val="22"/>
-          <w:u w:val="single"/>
-        </w:rPr>
-      </w:pPr>
-    </w:p>
-    <w:p>
-      <w:pPr>
-        <w:spacing w:line="480" w:lineRule="auto"/>
-        <w:rPr>
-          <w:rFonts w:ascii="Garamond" w:hAnsi="Garamond"/>
-          <w:b/>
-          <w:bCs/>
-          <w:sz w:val="22"/>
-          <w:szCs w:val="22"/>
-          <w:u w:val="single"/>
-        </w:rPr>
-      </w:pPr>
-      <w:r>
-        <w:rPr>
-          <w:rFonts w:ascii="Garamond" w:hAnsi="Garamond"/>
-          <w:b/>
-          <w:bCs/>
-          <w:sz w:val="22"/>
-          <w:szCs w:val="22"/>
-          <w:u w:val="single"/>
-        </w:rPr>
-        <w:t xml:space="preserve">Introduction: </w:t>
-      </w:r>
-      <w:r>
-        <w:rPr>
-          <w:rFonts w:ascii="Garamond" w:hAnsi="Garamond"/>
-          <w:sz w:val="22"/>
-          <w:szCs w:val="22"/>
-        </w:rPr>
-        <w:t xml:space="preserve"> </w:t>
-      </w:r>
-    </w:p>
-    <w:p>
-      <w:pPr>
-        <w:spacing w:line="480" w:lineRule="auto"/>
-        <w:ind w:firstLine="720"/>
-        <w:rPr>
-          <w:rFonts w:ascii="Garamond" w:hAnsi="Garamond"/>
-          <w:sz w:val="22"/>
-          <w:szCs w:val="22"/>
-        </w:rPr>
-      </w:pPr>
-      <w:r>
-        <w:rPr>
-          <w:rFonts w:ascii="Garamond" w:hAnsi="Garamond"/>
-          <w:sz w:val="22"/>
-          <w:szCs w:val="22"/>
-        </w:rPr>
-        <w:t xml:space="preserve">A </w:t>
-      </w:r>
-      <w:r>
-        <w:rPr>
-          <w:rFonts w:ascii="Garamond" w:hAnsi="Garamond"/>
-          <w:sz w:val="22"/>
-          <w:szCs w:val="22"/>
-        </w:rPr>
-        <w:t>key</w:t>
-      </w:r>
-      <w:r>
-        <w:rPr>
-          <w:rFonts w:ascii="Garamond" w:hAnsi="Garamond"/>
-          <w:sz w:val="22"/>
-          <w:szCs w:val="22"/>
-        </w:rPr>
-        <w:t xml:space="preserve"> challenge in fisheries management is balancing the dual goals of maximizing harvest opportunities </w:t>
-      </w:r>
-      <w:r>
-        <w:rPr>
-          <w:rFonts w:ascii="Garamond" w:hAnsi="Garamond"/>
-          <w:sz w:val="22"/>
-          <w:szCs w:val="22"/>
-        </w:rPr>
-        <w:t xml:space="preserve">while </w:t>
-      </w:r>
-      <w:r>
-        <w:rPr>
-          <w:rFonts w:ascii="Garamond" w:hAnsi="Garamond"/>
-          <w:sz w:val="22"/>
-          <w:szCs w:val="22"/>
-        </w:rPr>
-        <w:t>p</w:t>
-      </w:r>
-      <w:r>
-        <w:rPr>
-          <w:rFonts w:ascii="Garamond" w:hAnsi="Garamond"/>
-          <w:sz w:val="22"/>
-          <w:szCs w:val="22"/>
-        </w:rPr>
-        <w:t xml:space="preserve">reserving </w:t>
-      </w:r>
-      <w:r>
-        <w:rPr>
-          <w:rFonts w:ascii="Garamond" w:hAnsi="Garamond"/>
-          <w:sz w:val="22"/>
-          <w:szCs w:val="22"/>
-        </w:rPr>
-        <w:t>biodiversity.</w:t>
-      </w:r>
-      <w:r>
-        <w:rPr>
-          <w:rFonts w:ascii="Garamond" w:hAnsi="Garamond"/>
-          <w:sz w:val="22"/>
-          <w:szCs w:val="22"/>
-        </w:rPr>
-        <w:t xml:space="preserve"> </w:t>
-      </w:r>
-      <w:r>
-        <w:rPr>
-          <w:rFonts w:ascii="Garamond" w:hAnsi="Garamond"/>
-          <w:sz w:val="22"/>
-          <w:szCs w:val="22"/>
-        </w:rPr>
-        <w:t>In this context, b</w:t>
-      </w:r>
-      <w:r>
-        <w:rPr>
-          <w:rFonts w:ascii="Garamond" w:hAnsi="Garamond"/>
-          <w:sz w:val="22"/>
-          <w:szCs w:val="22"/>
-        </w:rPr>
-        <w:t xml:space="preserve">iodiversity can be defined </w:t>
-      </w:r>
-      <w:r>
-        <w:rPr>
-          <w:rFonts w:ascii="Garamond" w:hAnsi="Garamond"/>
-          <w:sz w:val="22"/>
-          <w:szCs w:val="22"/>
-        </w:rPr>
-        <w:t>both by</w:t>
-      </w:r>
-      <w:r>
-        <w:rPr>
-          <w:rFonts w:ascii="Garamond" w:hAnsi="Garamond"/>
-          <w:sz w:val="22"/>
-          <w:szCs w:val="22"/>
-        </w:rPr>
-        <w:t xml:space="preserve"> the number of species within an ecosystem</w:t>
-      </w:r>
-      <w:r>
-        <w:rPr>
-          <w:rFonts w:ascii="Garamond" w:hAnsi="Garamond"/>
-          <w:sz w:val="22"/>
-          <w:szCs w:val="22"/>
-        </w:rPr>
-        <w:t xml:space="preserve"> as well as</w:t>
-      </w:r>
-      <w:r>
-        <w:rPr>
-          <w:rFonts w:ascii="Garamond" w:hAnsi="Garamond"/>
-          <w:sz w:val="22"/>
-          <w:szCs w:val="22"/>
-        </w:rPr>
-        <w:t xml:space="preserve"> </w:t>
-      </w:r>
-      <w:r>
-        <w:rPr>
-          <w:rFonts w:ascii="Garamond" w:hAnsi="Garamond"/>
-          <w:sz w:val="22"/>
-          <w:szCs w:val="22"/>
-        </w:rPr>
-        <w:t xml:space="preserve">intrapopulation </w:t>
-      </w:r>
-      <w:r>
-        <w:rPr>
-          <w:rFonts w:ascii="Garamond" w:hAnsi="Garamond"/>
-          <w:sz w:val="22"/>
-          <w:szCs w:val="22"/>
-        </w:rPr>
-        <w:t xml:space="preserve">diversity among </w:t>
-      </w:r>
-      <w:r>
-        <w:rPr>
-          <w:rFonts w:ascii="Garamond" w:hAnsi="Garamond"/>
-          <w:sz w:val="22"/>
-          <w:szCs w:val="22"/>
-        </w:rPr>
-        <w:t xml:space="preserve">metapopulations of a </w:t>
-      </w:r>
-      <w:r>
-        <w:rPr>
-          <w:rFonts w:ascii="Garamond" w:hAnsi="Garamond"/>
-          <w:sz w:val="22"/>
-          <w:szCs w:val="22"/>
-        </w:rPr>
-        <w:t>single species</w:t>
-      </w:r>
-      <w:r>
-        <w:rPr>
-          <w:rFonts w:ascii="Garamond" w:hAnsi="Garamond"/>
-          <w:sz w:val="22"/>
-          <w:szCs w:val="22"/>
-        </w:rPr>
-        <w:t xml:space="preserve"> </w:t>
-      </w:r>
-      <w:r>
-        <w:rPr>
-          <w:rFonts w:ascii="Garamond" w:hAnsi="Garamond"/>
-          <w:sz w:val="22"/>
-          <w:szCs w:val="22"/>
-        </w:rPr>
-        <w:fldChar w:fldCharType="begin"/>
-      </w:r>
-      <w:r>
-        <w:rPr>
-          <w:rFonts w:ascii="Garamond" w:hAnsi="Garamond"/>
-          <w:sz w:val="22"/>
-          <w:szCs w:val="22"/>
-        </w:rPr>
-        <w:instrText xml:space="preserve"> ADDIN ZOTERO_ITEM CSL_CITATION {"citationID":"O8GNuS7R","properties":{"formattedCitation":"(Bolnick et al., 2011; Luck et al., 2003; Schindler et al., 2010)","plainCitation":"(Bolnick et al., 2011; Luck et al., 2003; Schindler et al., 2010)","noteIndex":0},"citationItems":[{"id":5318,"uris":["http://zotero.org/users/8421274/items/R2ZYTKMR"],"itemData":{"id":5318,"type":"article-journal","container-title":"Trends in Ecology &amp; Evolution","DOI":"10.1016/j.tree.2011.01.009","ISSN":"0169-5347","issue":"4","journalAbbreviation":"Trends in Ecology &amp; Evolution","language":"English","note":"publisher: Elsevier\nPMID: 21367482","page":"183-192","source":"www.cell.com","title":"Why intraspecific trait variation matters in community ecology","volume":"26","author":[{"family":"Bolnick","given":"Daniel I."},{"family":"Amarasekare","given":"Priyanga"},{"family":"Araújo","given":"Márcio S."},{"family":"Bürger","given":"Reinhard"},{"family":"Levine","given":"Jonathan M."},{"family":"Novak","given":"Mark"},{"family":"Rudolf","given":"Volker H. W."},{"family":"Schreiber","given":"Sebastian J."},{"family":"Urban","given":"Mark C."},{"family":"Vasseur","given":"David A."}],"issued":{"date-parts":[["2011",4,1]]}}},{"id":5557,"uris":["http://zotero.org/users/8421274/items/VSKUKCRX"],"itemData":{"id":5557,"type":"article-journal","abstract":"The current rate of biodiversity loss threatens to disrupt greatly the functioning of ecosystems, with potentially significant consequences for humanity. The magnitude of the loss is generally measured with the use of species extinction rates, an approach that understates the severity of the problem and masks some of its most important consequences. Here, we propose a major expansion of this focus to include population diversity: considering changes in the size, number, distribution and genetic composition of populations and the implications of those changes for the functioning of ecosystems and the provision of ecosystem services. We also outline the key components of population diversity and describe a new approach to delineating a population unit that explicitly links it to the services that it provides","container-title":"Trends in Ecology &amp; Evolution","DOI":"10.1016/S0169-5347(03)00100-9","journalAbbreviation":"Trends in Ecology &amp; Evolution","page":"331-336","source":"ResearchGate","title":"Population diversity and ecosystem services","volume":"18","author":[{"family":"Luck","given":"Gary"},{"family":"Daily","given":"Gretchen"},{"family":"Ehrlich","given":"Paul"}],"issued":{"date-parts":[["2003",7,1]]}}},{"id":272,"uris":["http://zotero.org/users/8421274/items/24NDGS7V"],"itemData":{"id":272,"type":"article-journal","abstract":"One of the most pervasive themes in ecology is that biological diversity stabilizes ecosystem processes and the services they provide to society, a concept that has become a common argument for biodiversity conservation. Species-rich communities are thought to produce more temporally stable ecosystem services because of the complementary or independent dynamics among species that perform similar ecosystem functions. Such variance dampening within communities is referred to as a portfolio effect and is analogous to the effects of asset diversity on the stability of financial portfolios. In ecology, these arguments have focused on the effects of species diversity on ecosystem stability but have not considered the importance of biologically relevant diversity within individual species. Current rates of population extirpation are probably at least three orders of magnitude higher than species extinction rates, so there is a pressing need to clarify how population and life history diversity affect the performance of individual species in providing important ecosystem services. Here we use five decades of data from Oncorhynchus nerka (sockeye salmon) in Bristol Bay, Alaska, to provide the first quantification of portfolio effects that derive from population and life history diversity in an important and heavily exploited species. Variability in annual Bristol Bay salmon returns is 2.2 times lower than it would be if the system consisted of a single homogenous population rather than the several hundred discrete populations it currently consists of. Furthermore, if it were a single homogeneous population, such increased variability would lead to ten times more frequent fisheries closures. Portfolio effects are also evident in watershed food webs, where they stabilize and extend predator access to salmon resources. Our results demonstrate the critical importance of maintaining population diversity for stabilizing ecosystem services and securing the economies and livelihoods that depend on them. The reliability of ecosystem services will erode faster than indicated by species loss alone. [PUBLICATION ABSTRACT]","container-title":"Nature","DOI":"https://doi-org.prox.lib.ncsu.edu/10.1038/nature09060","ISSN":"00280836","issue":"7298","language":"English","license":"Copyright Nature Publishing Group Jun 3, 2010","note":"number-of-pages: 5\npublisher-place: London, United States\npublisher: Nature Publishing Group\nsection: LETTERS","source":"ProQuest","title":"Population diversity and the portfolio effect in an exploited species","URL":"http://www.proquest.com/docview/375318240/abstract/317AC81E34EB4163PQ/1","volume":"465","author":[{"family":"Schindler","given":"Daniel E."},{"family":"Hilborn","given":"Ray"},{"family":"Chasco","given":"Brandon"},{"family":"Boatright","given":"Christopher P."},{"family":"Quinn","given":"Thomas P."},{"family":"Rogers","given":"Lauren A."},{"family":"Webster","given":"Michael S."}],"accessed":{"date-parts":[["2022",5,12]]},"issued":{"date-parts":[["2010",6,3]]}}}],"schema":"https://github.com/citation-style-language/schema/raw/master/csl-citation.json"} </w:instrText>
-      </w:r>
-      <w:r>
-        <w:rPr>
-          <w:rFonts w:ascii="Garamond" w:hAnsi="Garamond"/>
-          <w:sz w:val="22"/>
-          <w:szCs w:val="22"/>
-        </w:rPr>
-        <w:fldChar w:fldCharType="separate"/>
-      </w:r>
-      <w:r>
-        <w:rPr>
-          <w:rFonts w:ascii="Garamond" w:hAnsi="Garamond"/>
-          <w:noProof/>
-          <w:sz w:val="22"/>
-          <w:szCs w:val="22"/>
-        </w:rPr>
-        <w:t>(Bolnick et al., 2011; Luck et al., 2003; Schindler et al., 2010)</w:t>
-      </w:r>
-      <w:r>
-        <w:rPr>
-          <w:rFonts w:ascii="Garamond" w:hAnsi="Garamond"/>
-          <w:sz w:val="22"/>
-          <w:szCs w:val="22"/>
-        </w:rPr>
-        <w:fldChar w:fldCharType="end"/>
-      </w:r>
-      <w:r>
-        <w:rPr>
-          <w:rFonts w:ascii="Garamond" w:hAnsi="Garamond"/>
-          <w:sz w:val="22"/>
-          <w:szCs w:val="22"/>
-        </w:rPr>
-        <w:t xml:space="preserve">. </w:t>
-      </w:r>
-      <w:r>
-        <w:rPr>
-          <w:rFonts w:ascii="Garamond" w:hAnsi="Garamond"/>
-          <w:sz w:val="22"/>
-          <w:szCs w:val="22"/>
-        </w:rPr>
-        <w:t xml:space="preserve">In either case, </w:t>
-      </w:r>
-      <w:r>
-        <w:rPr>
-          <w:rFonts w:ascii="Garamond" w:hAnsi="Garamond"/>
-          <w:sz w:val="22"/>
-          <w:szCs w:val="22"/>
-        </w:rPr>
-        <w:t xml:space="preserve">population </w:t>
-      </w:r>
-      <w:r>
-        <w:rPr>
-          <w:rFonts w:ascii="Garamond" w:hAnsi="Garamond"/>
-          <w:sz w:val="22"/>
-          <w:szCs w:val="22"/>
-        </w:rPr>
-        <w:t xml:space="preserve">diversity </w:t>
-      </w:r>
-      <w:r>
-        <w:rPr>
-          <w:rFonts w:ascii="Garamond" w:hAnsi="Garamond"/>
-          <w:sz w:val="22"/>
-          <w:szCs w:val="22"/>
-        </w:rPr>
-        <w:t>stabiliz</w:t>
-      </w:r>
-      <w:r>
-        <w:rPr>
-          <w:rFonts w:ascii="Garamond" w:hAnsi="Garamond"/>
-          <w:sz w:val="22"/>
-          <w:szCs w:val="22"/>
-        </w:rPr>
-        <w:t>e</w:t>
+      <w:r>
+        <w:rPr>
+          <w:rFonts w:ascii="Garamond" w:hAnsi="Garamond"/>
+          <w:sz w:val="22"/>
+          <w:szCs w:val="22"/>
+        </w:rPr>
+        <w:t xml:space="preserve"> ecosystem level processes</w:t>
+      </w:r>
+      <w:r>
+        <w:rPr>
+          <w:rFonts w:ascii="Garamond" w:hAnsi="Garamond"/>
+          <w:sz w:val="22"/>
+          <w:szCs w:val="22"/>
+        </w:rPr>
+        <w:t>, bolster</w:t>
       </w:r>
       <w:ins w:id="4" w:author="Daniel Schindler" w:date="2025-08-26T15:43:00Z" w16du:dateUtc="2025-08-26T23:43:00Z">
         <w:r>
@@ -459,15 +534,15 @@
           <w:sz w:val="22"/>
           <w:szCs w:val="22"/>
         </w:rPr>
-        <w:t xml:space="preserve"> ecosystem level processes</w:t>
-      </w:r>
-      <w:r>
-        <w:rPr>
-          <w:rFonts w:ascii="Garamond" w:hAnsi="Garamond"/>
-          <w:sz w:val="22"/>
-          <w:szCs w:val="22"/>
-        </w:rPr>
-        <w:t>, bolster</w:t>
+        <w:t xml:space="preserve"> resilience to environmental change,</w:t>
+      </w:r>
+      <w:r>
+        <w:rPr>
+          <w:rFonts w:ascii="Garamond" w:hAnsi="Garamond"/>
+          <w:sz w:val="22"/>
+          <w:szCs w:val="22"/>
+        </w:rPr>
+        <w:t xml:space="preserve"> and increase</w:t>
       </w:r>
       <w:ins w:id="5" w:author="Daniel Schindler" w:date="2025-08-26T15:43:00Z" w16du:dateUtc="2025-08-26T23:43:00Z">
         <w:r>
@@ -485,32 +560,6 @@
           <w:sz w:val="22"/>
           <w:szCs w:val="22"/>
         </w:rPr>
-        <w:t xml:space="preserve"> resilience to environmental change,</w:t>
-      </w:r>
-      <w:r>
-        <w:rPr>
-          <w:rFonts w:ascii="Garamond" w:hAnsi="Garamond"/>
-          <w:sz w:val="22"/>
-          <w:szCs w:val="22"/>
-        </w:rPr>
-        <w:t xml:space="preserve"> and increase</w:t>
-      </w:r>
-      <w:ins w:id="6" w:author="Daniel Schindler" w:date="2025-08-26T15:43:00Z" w16du:dateUtc="2025-08-26T23:43:00Z">
-        <w:r>
-          <w:rPr>
-            <w:rFonts w:ascii="Garamond" w:hAnsi="Garamond"/>
-            <w:sz w:val="22"/>
-            <w:szCs w:val="22"/>
-          </w:rPr>
-          <w:t>s</w:t>
-        </w:r>
-      </w:ins>
-      <w:r>
-        <w:rPr>
-          <w:rFonts w:ascii="Garamond" w:hAnsi="Garamond"/>
-          <w:sz w:val="22"/>
-          <w:szCs w:val="22"/>
-        </w:rPr>
         <w:t xml:space="preserve"> </w:t>
       </w:r>
       <w:r>
@@ -521,7 +570,7 @@
         </w:rPr>
         <w:t xml:space="preserve">the reliability of ecosystem services </w:t>
       </w:r>
-      <w:commentRangeStart w:id="7"/>
+      <w:commentRangeStart w:id="6"/>
       <w:r>
         <w:rPr>
           <w:rFonts w:ascii="Garamond" w:hAnsi="Garamond"/>
@@ -563,12 +612,12 @@
         </w:rPr>
         <w:fldChar w:fldCharType="end"/>
       </w:r>
-      <w:commentRangeEnd w:id="7"/>
+      <w:commentRangeEnd w:id="6"/>
       <w:r>
         <w:rPr>
           <w:rStyle w:val="CommentReference"/>
         </w:rPr>
-        <w:commentReference w:id="7"/>
+        <w:commentReference w:id="6"/>
       </w:r>
       <w:r>
         <w:rPr>
@@ -645,13 +694,13 @@
           <w:szCs w:val="22"/>
         </w:rPr>
       </w:pPr>
-      <w:commentRangeStart w:id="8"/>
-      <w:commentRangeEnd w:id="8"/>
+      <w:commentRangeStart w:id="7"/>
+      <w:commentRangeEnd w:id="7"/>
       <w:r>
         <w:rPr>
           <w:rStyle w:val="CommentReference"/>
         </w:rPr>
-        <w:commentReference w:id="8"/>
+        <w:commentReference w:id="7"/>
       </w:r>
       <w:r>
         <w:rPr>
@@ -685,7 +734,7 @@
         </w:rPr>
         <w:t xml:space="preserve"> complex</w:t>
       </w:r>
-      <w:ins w:id="9" w:author="Daniel Schindler" w:date="2025-08-26T15:48:00Z" w16du:dateUtc="2025-08-26T23:48:00Z">
+      <w:ins w:id="8" w:author="Daniel Schindler" w:date="2025-08-26T15:48:00Z" w16du:dateUtc="2025-08-26T23:48:00Z">
         <w:r>
           <w:rPr>
             <w:rFonts w:ascii="Garamond" w:hAnsi="Garamond"/>
@@ -894,56 +943,131 @@
           <w:sz w:val="22"/>
           <w:szCs w:val="22"/>
         </w:rPr>
-        <w:t xml:space="preserve">The timing, strength, and duration of downstream run dynamics are the aggregate </w:t>
-      </w:r>
-      <w:r>
-        <w:rPr>
-          <w:rFonts w:ascii="Garamond" w:hAnsi="Garamond"/>
-          <w:sz w:val="22"/>
-          <w:szCs w:val="22"/>
-        </w:rPr>
-        <w:t>of upstream stocks.</w:t>
-      </w:r>
-      <w:r>
-        <w:rPr>
-          <w:rFonts w:ascii="Garamond" w:hAnsi="Garamond"/>
-          <w:sz w:val="22"/>
-          <w:szCs w:val="22"/>
-        </w:rPr>
-        <w:t xml:space="preserve"> Maintaining life history diversity </w:t>
-      </w:r>
-      <w:r>
-        <w:rPr>
-          <w:rFonts w:ascii="Garamond" w:hAnsi="Garamond"/>
-          <w:sz w:val="22"/>
-          <w:szCs w:val="22"/>
-        </w:rPr>
-        <w:t xml:space="preserve">across the full stock complex </w:t>
-      </w:r>
-      <w:r>
-        <w:rPr>
-          <w:rFonts w:ascii="Garamond" w:hAnsi="Garamond"/>
-          <w:sz w:val="22"/>
-          <w:szCs w:val="22"/>
-        </w:rPr>
-        <w:t xml:space="preserve">protects downstream </w:t>
-      </w:r>
-      <w:r>
-        <w:rPr>
-          <w:rFonts w:ascii="Garamond" w:hAnsi="Garamond"/>
-          <w:sz w:val="22"/>
-          <w:szCs w:val="22"/>
-        </w:rPr>
-        <w:t xml:space="preserve">fisheries by distributing risk across space and time, thereby buffering overall population health from impacts to any one stock. Allowing harvest opportunity on the stock aggregate </w:t>
-      </w:r>
-      <w:r>
-        <w:rPr>
-          <w:rFonts w:ascii="Garamond" w:hAnsi="Garamond"/>
-          <w:sz w:val="22"/>
-          <w:szCs w:val="22"/>
-        </w:rPr>
-        <w:lastRenderedPageBreak/>
-        <w:t xml:space="preserve">while conserving this intrapopulation diversity is therefore key to maintaining resource reliability and ecosystem resilience to environmental change. </w:t>
+        <w:t>The timing, strength, and duration of</w:t>
+      </w:r>
+      <w:r>
+        <w:rPr>
+          <w:rFonts w:ascii="Garamond" w:hAnsi="Garamond"/>
+          <w:sz w:val="22"/>
+          <w:szCs w:val="22"/>
+        </w:rPr>
+        <w:t xml:space="preserve"> these fisheries </w:t>
+      </w:r>
+      <w:r>
+        <w:rPr>
+          <w:rFonts w:ascii="Garamond" w:hAnsi="Garamond"/>
+          <w:sz w:val="22"/>
+          <w:szCs w:val="22"/>
+        </w:rPr>
+        <w:t xml:space="preserve">are the </w:t>
+      </w:r>
+      <w:r>
+        <w:rPr>
+          <w:rFonts w:ascii="Garamond" w:hAnsi="Garamond"/>
+          <w:sz w:val="22"/>
+          <w:szCs w:val="22"/>
+        </w:rPr>
+        <w:t xml:space="preserve">result of the aggregate dynamics of upstream stock components </w:t>
+      </w:r>
+      <w:r>
+        <w:rPr>
+          <w:rFonts w:ascii="Garamond" w:hAnsi="Garamond"/>
+          <w:sz w:val="22"/>
+          <w:szCs w:val="22"/>
+          <w:highlight w:val="yellow"/>
+        </w:rPr>
+        <w:t>(Nesbitt and Moore, X).</w:t>
+      </w:r>
+      <w:r>
+        <w:rPr>
+          <w:rFonts w:ascii="Garamond" w:hAnsi="Garamond"/>
+          <w:sz w:val="22"/>
+          <w:szCs w:val="22"/>
+        </w:rPr>
+        <w:t xml:space="preserve"> </w:t>
+      </w:r>
+      <w:r>
+        <w:rPr>
+          <w:rFonts w:ascii="Garamond" w:hAnsi="Garamond"/>
+          <w:sz w:val="22"/>
+          <w:szCs w:val="22"/>
+        </w:rPr>
+        <w:t xml:space="preserve">Maintaining life history diversity across the full stock complex stabilizes downstream resources by distributing risk across several loosely or negatively correlated populations. Moreover, maximizing diversity in run timing </w:t>
+      </w:r>
+      <w:r>
+        <w:rPr>
+          <w:rFonts w:ascii="Garamond" w:hAnsi="Garamond"/>
+          <w:sz w:val="22"/>
+          <w:szCs w:val="22"/>
+        </w:rPr>
+        <w:t xml:space="preserve">may extend </w:t>
+      </w:r>
+      <w:r>
+        <w:rPr>
+          <w:rFonts w:ascii="Garamond" w:hAnsi="Garamond"/>
+          <w:sz w:val="22"/>
+          <w:szCs w:val="22"/>
+        </w:rPr>
+        <w:t>fishing opportunit</w:t>
+      </w:r>
+      <w:r>
+        <w:rPr>
+          <w:rFonts w:ascii="Garamond" w:hAnsi="Garamond"/>
+          <w:sz w:val="22"/>
+          <w:szCs w:val="22"/>
+        </w:rPr>
+        <w:t>y</w:t>
+      </w:r>
+      <w:r>
+        <w:rPr>
+          <w:rFonts w:ascii="Garamond" w:hAnsi="Garamond"/>
+          <w:sz w:val="22"/>
+          <w:szCs w:val="22"/>
+        </w:rPr>
+        <w:t xml:space="preserve"> by </w:t>
+      </w:r>
+      <w:r>
+        <w:rPr>
+          <w:rFonts w:ascii="Garamond" w:hAnsi="Garamond"/>
+          <w:sz w:val="22"/>
+          <w:szCs w:val="22"/>
+        </w:rPr>
+        <w:t xml:space="preserve">allowing </w:t>
+      </w:r>
+      <w:r>
+        <w:rPr>
+          <w:rFonts w:ascii="Garamond" w:hAnsi="Garamond"/>
+          <w:sz w:val="22"/>
+          <w:szCs w:val="22"/>
+        </w:rPr>
+        <w:t xml:space="preserve">harvest </w:t>
+      </w:r>
+      <w:r>
+        <w:rPr>
+          <w:rFonts w:ascii="Garamond" w:hAnsi="Garamond"/>
+          <w:sz w:val="22"/>
+          <w:szCs w:val="22"/>
+        </w:rPr>
+        <w:t>across several</w:t>
+      </w:r>
+      <w:r>
+        <w:rPr>
+          <w:rFonts w:ascii="Garamond" w:hAnsi="Garamond"/>
+          <w:sz w:val="22"/>
+          <w:szCs w:val="22"/>
+        </w:rPr>
+        <w:t xml:space="preserve"> stock components </w:t>
+      </w:r>
+      <w:r>
+        <w:rPr>
+          <w:rFonts w:ascii="Garamond" w:hAnsi="Garamond"/>
+          <w:sz w:val="22"/>
+          <w:szCs w:val="22"/>
+        </w:rPr>
+        <w:t>migrating at different times in the overall run.</w:t>
+      </w:r>
+      <w:r>
+        <w:t xml:space="preserve"> </w:t>
       </w:r>
     </w:p>
     <w:p>
@@ -956,7 +1080,103 @@
           <w:szCs w:val="22"/>
         </w:rPr>
       </w:pPr>
-      <w:ins w:id="10" w:author="Daniel Schindler" w:date="2025-08-26T15:58:00Z" w16du:dateUtc="2025-08-26T23:58:00Z">
+    </w:p>
+    <w:p>
+      <w:pPr>
+        <w:spacing w:line="480" w:lineRule="auto"/>
+        <w:ind w:firstLine="720"/>
+        <w:rPr>
+          <w:rFonts w:ascii="Garamond" w:hAnsi="Garamond"/>
+          <w:sz w:val="22"/>
+          <w:szCs w:val="22"/>
+        </w:rPr>
+      </w:pPr>
+    </w:p>
+    <w:p>
+      <w:pPr>
+        <w:spacing w:line="480" w:lineRule="auto"/>
+        <w:ind w:firstLine="720"/>
+        <w:rPr>
+          <w:rFonts w:ascii="Garamond" w:hAnsi="Garamond"/>
+          <w:sz w:val="22"/>
+          <w:szCs w:val="22"/>
+        </w:rPr>
+      </w:pPr>
+      <w:r>
+        <w:rPr>
+          <w:rFonts w:ascii="Garamond" w:hAnsi="Garamond"/>
+          <w:sz w:val="22"/>
+          <w:szCs w:val="22"/>
+        </w:rPr>
+        <w:lastRenderedPageBreak/>
+        <w:t xml:space="preserve">Maintaining life history diversity </w:t>
+      </w:r>
+      <w:r>
+        <w:rPr>
+          <w:rFonts w:ascii="Garamond" w:hAnsi="Garamond"/>
+          <w:sz w:val="22"/>
+          <w:szCs w:val="22"/>
+        </w:rPr>
+        <w:t xml:space="preserve">across the full stock complex protects downstream </w:t>
+      </w:r>
+      <w:r>
+        <w:rPr>
+          <w:rFonts w:ascii="Garamond" w:hAnsi="Garamond"/>
+          <w:sz w:val="22"/>
+          <w:szCs w:val="22"/>
+        </w:rPr>
+        <w:t>fisheries by distributing risk across space and time, thereby buffering overall population health from impacts to any one stock.</w:t>
+      </w:r>
+      <w:r>
+        <w:rPr>
+          <w:rFonts w:ascii="Garamond" w:hAnsi="Garamond"/>
+          <w:sz w:val="22"/>
+          <w:szCs w:val="22"/>
+        </w:rPr>
+        <w:t xml:space="preserve"> </w:t>
+      </w:r>
+    </w:p>
+    <w:p>
+      <w:pPr>
+        <w:spacing w:line="480" w:lineRule="auto"/>
+        <w:ind w:firstLine="720"/>
+        <w:rPr>
+          <w:rFonts w:ascii="Garamond" w:hAnsi="Garamond"/>
+          <w:sz w:val="22"/>
+          <w:szCs w:val="22"/>
+        </w:rPr>
+      </w:pPr>
+    </w:p>
+    <w:p>
+      <w:pPr>
+        <w:spacing w:line="480" w:lineRule="auto"/>
+        <w:ind w:firstLine="720"/>
+        <w:rPr>
+          <w:rFonts w:ascii="Garamond" w:hAnsi="Garamond"/>
+          <w:sz w:val="22"/>
+          <w:szCs w:val="22"/>
+        </w:rPr>
+      </w:pPr>
+      <w:r>
+        <w:rPr>
+          <w:rFonts w:ascii="Garamond" w:hAnsi="Garamond"/>
+          <w:sz w:val="22"/>
+          <w:szCs w:val="22"/>
+        </w:rPr>
+        <w:t xml:space="preserve">Allowing harvest opportunity on the stock aggregate while conserving this intrapopulation diversity is therefore key to maintaining resource reliability and ecosystem resilience to environmental change. </w:t>
+      </w:r>
+    </w:p>
+    <w:p>
+      <w:pPr>
+        <w:spacing w:line="480" w:lineRule="auto"/>
+        <w:ind w:firstLine="720"/>
+        <w:rPr>
+          <w:rFonts w:ascii="Garamond" w:hAnsi="Garamond"/>
+          <w:sz w:val="22"/>
+          <w:szCs w:val="22"/>
+        </w:rPr>
+      </w:pPr>
+      <w:ins w:id="9" w:author="Daniel Schindler" w:date="2025-08-26T15:58:00Z" w16du:dateUtc="2025-08-26T23:58:00Z">
         <w:r>
           <w:rPr>
             <w:rFonts w:ascii="Garamond" w:hAnsi="Garamond"/>
@@ -1313,7 +1533,7 @@
         </w:rPr>
         <w:t>the diversity of stocks throughout the basin to enhance</w:t>
       </w:r>
-      <w:del w:id="11" w:author="Daniel Schindler" w:date="2025-08-26T15:59:00Z" w16du:dateUtc="2025-08-26T23:59:00Z">
+      <w:del w:id="10" w:author="Daniel Schindler" w:date="2025-08-26T15:59:00Z" w16du:dateUtc="2025-08-26T23:59:00Z">
         <w:r>
           <w:rPr>
             <w:rFonts w:ascii="Garamond" w:hAnsi="Garamond" w:cs="Times New Roman"/>
@@ -1358,7 +1578,7 @@
           <w:szCs w:val="22"/>
         </w:rPr>
       </w:pPr>
-      <w:commentRangeStart w:id="12"/>
+      <w:commentRangeStart w:id="11"/>
       <w:r>
         <w:rPr>
           <w:rStyle w:val="Strong"/>
@@ -1370,12 +1590,12 @@
         </w:rPr>
         <w:t xml:space="preserve">One </w:t>
       </w:r>
-      <w:commentRangeEnd w:id="12"/>
+      <w:commentRangeEnd w:id="11"/>
       <w:r>
         <w:rPr>
           <w:rStyle w:val="CommentReference"/>
         </w:rPr>
-        <w:commentReference w:id="12"/>
+        <w:commentReference w:id="11"/>
       </w:r>
       <w:r>
         <w:rPr>
@@ -1388,7 +1608,7 @@
         </w:rPr>
         <w:t xml:space="preserve">approach to addressing </w:t>
       </w:r>
-      <w:ins w:id="13" w:author="Daniel Schindler" w:date="2025-08-26T16:01:00Z" w16du:dateUtc="2025-08-27T00:01:00Z">
+      <w:ins w:id="12" w:author="Daniel Schindler" w:date="2025-08-26T16:01:00Z" w16du:dateUtc="2025-08-27T00:01:00Z">
         <w:r>
           <w:rPr>
             <w:rStyle w:val="Strong"/>
@@ -1401,7 +1621,7 @@
           <w:t xml:space="preserve">the simultaneous challenge </w:t>
         </w:r>
       </w:ins>
-      <w:ins w:id="14" w:author="Daniel Schindler" w:date="2025-08-26T16:02:00Z" w16du:dateUtc="2025-08-27T00:02:00Z">
+      <w:ins w:id="13" w:author="Daniel Schindler" w:date="2025-08-26T16:02:00Z" w16du:dateUtc="2025-08-27T00:02:00Z">
         <w:r>
           <w:rPr>
             <w:rStyle w:val="Strong"/>
@@ -1414,7 +1634,7 @@
           <w:t xml:space="preserve">of allowing harvest opportunity for subsistence fisheries while protect weak stocks, particularly those returning to the headwaters, </w:t>
         </w:r>
       </w:ins>
-      <w:del w:id="15" w:author="Daniel Schindler" w:date="2025-08-26T16:02:00Z" w16du:dateUtc="2025-08-27T00:02:00Z">
+      <w:del w:id="14" w:author="Daniel Schindler" w:date="2025-08-26T16:02:00Z" w16du:dateUtc="2025-08-27T00:02:00Z">
         <w:r>
           <w:rPr>
             <w:rStyle w:val="Strong"/>
@@ -1542,7 +1762,7 @@
         </w:rPr>
         <w:t>This assumption is based on patterns established in other systems (Clark et al., 2015) and supported by limited telemetry data in the Kuskokwim (Clark and Smith, 2017)</w:t>
       </w:r>
-      <w:ins w:id="16" w:author="Daniel Schindler" w:date="2025-08-26T16:03:00Z" w16du:dateUtc="2025-08-27T00:03:00Z">
+      <w:ins w:id="15" w:author="Daniel Schindler" w:date="2025-08-26T16:03:00Z" w16du:dateUtc="2025-08-27T00:03:00Z">
         <w:r>
           <w:rPr>
             <w:rFonts w:ascii="Garamond" w:hAnsi="Garamond"/>
@@ -1552,7 +1772,7 @@
           <w:t xml:space="preserve"> and by traditional knowledge among stake</w:t>
         </w:r>
       </w:ins>
-      <w:ins w:id="17" w:author="Daniel Schindler" w:date="2025-08-26T16:04:00Z" w16du:dateUtc="2025-08-27T00:04:00Z">
+      <w:ins w:id="16" w:author="Daniel Schindler" w:date="2025-08-26T16:04:00Z" w16du:dateUtc="2025-08-27T00:04:00Z">
         <w:r>
           <w:rPr>
             <w:rFonts w:ascii="Garamond" w:hAnsi="Garamond"/>
@@ -1584,7 +1804,16 @@
           <w:sz w:val="22"/>
           <w:szCs w:val="22"/>
         </w:rPr>
-        <w:t xml:space="preserve">support basin-wide escapement goals, provide harvest opportunities to upstream communities, and protect upper river stocks which are at heightened risk of overharvest but contribute disproportionately to downstream fishery dynamics. </w:t>
+        <w:t xml:space="preserve">support basin-wide escapement goals, provide harvest opportunities to upstream communities, and protect upper river stocks </w:t>
+      </w:r>
+      <w:r>
+        <w:rPr>
+          <w:rFonts w:ascii="Garamond" w:hAnsi="Garamond"/>
+          <w:sz w:val="22"/>
+          <w:szCs w:val="22"/>
+        </w:rPr>
+        <w:lastRenderedPageBreak/>
+        <w:t xml:space="preserve">which are at heightened risk of overharvest but contribute disproportionately to downstream fishery dynamics. </w:t>
       </w:r>
       <w:r>
         <w:rPr>
@@ -1764,7 +1993,6 @@
           <w:sz w:val="22"/>
           <w:szCs w:val="22"/>
         </w:rPr>
-        <w:lastRenderedPageBreak/>
         <w:t>H</w:t>
       </w:r>
       <w:r>
@@ -1839,7 +2067,7 @@
         </w:rPr>
         <w:t xml:space="preserve"> In doing so, we</w:t>
       </w:r>
-      <w:del w:id="18" w:author="Daniel Schindler" w:date="2025-08-26T16:04:00Z" w16du:dateUtc="2025-08-27T00:04:00Z">
+      <w:del w:id="17" w:author="Daniel Schindler" w:date="2025-08-26T16:04:00Z" w16du:dateUtc="2025-08-27T00:04:00Z">
         <w:r>
           <w:rPr>
             <w:rFonts w:ascii="Garamond" w:hAnsi="Garamond"/>
@@ -2131,8 +2359,8 @@
         </w:rPr>
         <w:t xml:space="preserve">The BTF was designed to enable in-season assessment of run strength based on catch-per-unit-effort, informing management decisions for subsistence fisheries throughout the river. Fish caught in this fishery represent a representative sample of returning stocks </w:t>
       </w:r>
+      <w:commentRangeStart w:id="18"/>
       <w:commentRangeStart w:id="19"/>
-      <w:commentRangeStart w:id="20"/>
       <w:r>
         <w:rPr>
           <w:rFonts w:ascii="Garamond" w:hAnsi="Garamond"/>
@@ -2141,19 +2369,19 @@
         </w:rPr>
         <w:t xml:space="preserve">throughout the basin </w:t>
       </w:r>
+      <w:commentRangeEnd w:id="18"/>
+      <w:r>
+        <w:rPr>
+          <w:rStyle w:val="CommentReference"/>
+        </w:rPr>
+        <w:commentReference w:id="18"/>
+      </w:r>
       <w:commentRangeEnd w:id="19"/>
       <w:r>
         <w:rPr>
           <w:rStyle w:val="CommentReference"/>
         </w:rPr>
         <w:commentReference w:id="19"/>
-      </w:r>
-      <w:commentRangeEnd w:id="20"/>
-      <w:r>
-        <w:rPr>
-          <w:rStyle w:val="CommentReference"/>
-        </w:rPr>
-        <w:commentReference w:id="20"/>
       </w:r>
       <w:r>
         <w:rPr>
@@ -2386,7 +2614,19 @@
           <w:szCs w:val="22"/>
           <w14:ligatures w14:val="none"/>
         </w:rPr>
-        <w:t>(Donohoe &amp; Zimmerman, 2010; Zimmerman &amp; Reeves, 2002)</w:t>
+        <w:t xml:space="preserve">(Donohoe &amp; Zimmerman, </w:t>
+      </w:r>
+      <w:r>
+        <w:rPr>
+          <w:rFonts w:ascii="Garamond" w:eastAsia="Times New Roman" w:hAnsi="Garamond" w:cs="Times New Roman"/>
+          <w:noProof/>
+          <w:kern w:val="0"/>
+          <w:sz w:val="22"/>
+          <w:szCs w:val="22"/>
+          <w14:ligatures w14:val="none"/>
+        </w:rPr>
+        <w:lastRenderedPageBreak/>
+        <w:t>2010; Zimmerman &amp; Reeves, 2002)</w:t>
       </w:r>
       <w:r>
         <w:rPr>
@@ -2567,18 +2807,7 @@
           <w:szCs w:val="22"/>
           <w14:ligatures w14:val="none"/>
         </w:rPr>
-        <w:t xml:space="preserve">measurement of </w:t>
-      </w:r>
-      <w:r>
-        <w:rPr>
-          <w:rFonts w:ascii="Garamond" w:eastAsia="Times New Roman" w:hAnsi="Garamond" w:cs="Times New Roman"/>
-          <w:kern w:val="0"/>
-          <w:sz w:val="22"/>
-          <w:szCs w:val="22"/>
-          <w14:ligatures w14:val="none"/>
-        </w:rPr>
-        <w:lastRenderedPageBreak/>
-        <w:t>Sr</w:t>
+        <w:t>measurement of Sr</w:t>
       </w:r>
       <w:r>
         <w:rPr>
@@ -3026,7 +3255,7 @@
         </w:rPr>
         <w:t xml:space="preserve">A </w:t>
       </w:r>
-      <w:ins w:id="21" w:author="Daniel Schindler" w:date="2025-08-26T16:12:00Z" w16du:dateUtc="2025-08-27T00:12:00Z">
+      <w:ins w:id="20" w:author="Daniel Schindler" w:date="2025-08-26T16:12:00Z" w16du:dateUtc="2025-08-27T00:12:00Z">
         <w:r>
           <w:rPr>
             <w:rFonts w:ascii="Garamond" w:eastAsia="Times New Roman" w:hAnsi="Garamond" w:cs="Times New Roman"/>
@@ -3038,7 +3267,7 @@
           <w:t>s</w:t>
         </w:r>
       </w:ins>
-      <w:del w:id="22" w:author="Daniel Schindler" w:date="2025-08-26T16:12:00Z" w16du:dateUtc="2025-08-27T00:12:00Z">
+      <w:del w:id="21" w:author="Daniel Schindler" w:date="2025-08-26T16:12:00Z" w16du:dateUtc="2025-08-27T00:12:00Z">
         <w:r>
           <w:rPr>
             <w:rFonts w:ascii="Garamond" w:eastAsia="Times New Roman" w:hAnsi="Garamond" w:cs="Times New Roman"/>
@@ -3112,8 +3341,8 @@
         </w:rPr>
         <w:t xml:space="preserve"> </w:t>
       </w:r>
+      <w:commentRangeStart w:id="22"/>
       <w:commentRangeStart w:id="23"/>
-      <w:commentRangeStart w:id="24"/>
       <w:r>
         <w:rPr>
           <w:rFonts w:ascii="Garamond" w:eastAsia="Times New Roman" w:hAnsi="Garamond" w:cs="Times New Roman"/>
@@ -3134,6 +3363,13 @@
         </w:rPr>
         <w:t xml:space="preserve"> </w:t>
       </w:r>
+      <w:commentRangeEnd w:id="22"/>
+      <w:r>
+        <w:rPr>
+          <w:rStyle w:val="CommentReference"/>
+        </w:rPr>
+        <w:commentReference w:id="22"/>
+      </w:r>
       <w:commentRangeEnd w:id="23"/>
       <w:r>
         <w:rPr>
@@ -3141,13 +3377,6 @@
         </w:rPr>
         <w:commentReference w:id="23"/>
       </w:r>
-      <w:commentRangeEnd w:id="24"/>
-      <w:r>
-        <w:rPr>
-          <w:rStyle w:val="CommentReference"/>
-        </w:rPr>
-        <w:commentReference w:id="24"/>
-      </w:r>
       <w:r>
         <w:rPr>
           <w:rFonts w:ascii="Garamond" w:eastAsia="Times New Roman" w:hAnsi="Garamond" w:cs="Times New Roman"/>
@@ -3269,6 +3498,26 @@
           <w14:ligatures w14:val="none"/>
         </w:rPr>
         <w:t xml:space="preserve">derived from water samples collected throughout the river basin </w:t>
+      </w:r>
+      <w:r>
+        <w:rPr>
+          <w:rFonts w:ascii="Garamond" w:eastAsia="Times New Roman" w:hAnsi="Garamond" w:cs="Times New Roman"/>
+          <w:kern w:val="0"/>
+          <w:sz w:val="22"/>
+          <w:szCs w:val="22"/>
+          <w14:ligatures w14:val="none"/>
+          <w:rPrChange w:id="24" w:author="Benjamin J. Makhlouf" w:date="2025-07-26T13:00:00Z" w16du:dateUtc="2025-07-26T20:00:00Z">
+            <w:rPr>
+              <w:rFonts w:ascii="Garamond" w:eastAsia="Times New Roman" w:hAnsi="Garamond" w:cs="Times New Roman"/>
+              <w:kern w:val="0"/>
+              <w:sz w:val="22"/>
+              <w:szCs w:val="22"/>
+              <w:highlight w:val="yellow"/>
+              <w14:ligatures w14:val="none"/>
+            </w:rPr>
+          </w:rPrChange>
+        </w:rPr>
+        <w:fldChar w:fldCharType="begin"/>
       </w:r>
       <w:r>
         <w:rPr>
@@ -3288,7 +3537,7 @@
             </w:rPr>
           </w:rPrChange>
         </w:rPr>
-        <w:fldChar w:fldCharType="begin"/>
+        <w:instrText xml:space="preserve"> ADDIN ZOTERO_ITEM CSL_CITATION {"citationID":"5Pp7WuA9","properties":{"formattedCitation":"(French et al., 2020)","plainCitation":"(French et al., 2020)","noteIndex":0},"citationItems":[{"id":1684,"uris":["http://zotero.org/users/8421274/items/M654PKRJ"],"itemData":{"id":1684,"type":"article-journal","abstract":"Riverine chemistry reflects both watershed conditions and instream processing, both of which vary across river networks, yet little is known about the scales at which watershed attributes regulate biogeochemical constituents. We used spatial stream network (SSN) models to quantify both watershed and instream effects on streamwater constituents in the Kuskokwim River (western Alaska), the largest free-flowing river in the United States. We assessed chemical constituents spanning from labile nutrients (nitrate [NO3−] and orthophosphate [PO43−]) to biologically and chemically conservative tracers (calcium [Ca2+], strontium [Sr2+], and Sr isotopes [87Sr/86Sr]). We also examined the behavior of dissolved organic carbon (DOC) relative to these constituents to understand whether bulk DOC behaved conservatively in a large boreal river network, where future changes in DOC and nutrient loading are expected under a shifting climate. We derived watershed spatial covariates comprising land cover, geology, and geomorphic characteristics at 14 different spatial extents based on stream order and relative to position in the river network to understand the effect of distant and proximal watershed attributes on streamwater constituents. For all constituents but 87Sr/86Sr, watershed attributes in low-order headwater catchments yielded the best predictive ability for streamwater constituent concentrations across the entire network. Spatial patterning for conservative tracers and bulk DOC showed strong spatial autocorrelation, whereas PO43− and NO3− exhibited spatial patchiness indicative of instream processing. Our work shows that headwater streams are disproportionately important contributors to network-wide biogeochemical constituents supporting aquatic food webs and that conservation and management of aquatic systems should include these small and often remote watershed areas.","container-title":"Journal of Geophysical Research: Biogeosciences","DOI":"10.1029/2020JG005851","ISSN":"2169-8961","issue":"12","language":"en","note":"_eprint: https://agupubs.onlinelibrary.wiley.com/doi/pdf/10.1029/2020JG005851","page":"e2020JG005851","source":"Wiley Online Library","title":"Headwater Catchments Govern Biogeochemistry in America's Largest Free-Flowing River Network","volume":"125","author":[{"family":"French","given":"David W."},{"family":"Schindler","given":"Daniel E."},{"family":"Brennan","given":"Sean R."},{"family":"Whited","given":"Diane"}],"issued":{"date-parts":[["2020"]]}}}],"schema":"https://github.com/citation-style-language/schema/raw/master/csl-citation.json"} </w:instrText>
       </w:r>
       <w:r>
         <w:rPr>
@@ -3308,7 +3557,40 @@
             </w:rPr>
           </w:rPrChange>
         </w:rPr>
-        <w:instrText xml:space="preserve"> ADDIN ZOTERO_ITEM CSL_CITATION {"citationID":"5Pp7WuA9","properties":{"formattedCitation":"(French et al., 2020)","plainCitation":"(French et al., 2020)","noteIndex":0},"citationItems":[{"id":1684,"uris":["http://zotero.org/users/8421274/items/M654PKRJ"],"itemData":{"id":1684,"type":"article-journal","abstract":"Riverine chemistry reflects both watershed conditions and instream processing, both of which vary across river networks, yet little is known about the scales at which watershed attributes regulate biogeochemical constituents. We used spatial stream network (SSN) models to quantify both watershed and instream effects on streamwater constituents in the Kuskokwim River (western Alaska), the largest free-flowing river in the United States. We assessed chemical constituents spanning from labile nutrients (nitrate [NO3−] and orthophosphate [PO43−]) to biologically and chemically conservative tracers (calcium [Ca2+], strontium [Sr2+], and Sr isotopes [87Sr/86Sr]). We also examined the behavior of dissolved organic carbon (DOC) relative to these constituents to understand whether bulk DOC behaved conservatively in a large boreal river network, where future changes in DOC and nutrient loading are expected under a shifting climate. We derived watershed spatial covariates comprising land cover, geology, and geomorphic characteristics at 14 different spatial extents based on stream order and relative to position in the river network to understand the effect of distant and proximal watershed attributes on streamwater constituents. For all constituents but 87Sr/86Sr, watershed attributes in low-order headwater catchments yielded the best predictive ability for streamwater constituent concentrations across the entire network. Spatial patterning for conservative tracers and bulk DOC showed strong spatial autocorrelation, whereas PO43− and NO3− exhibited spatial patchiness indicative of instream processing. Our work shows that headwater streams are disproportionately important contributors to network-wide biogeochemical constituents supporting aquatic food webs and that conservation and management of aquatic systems should include these small and often remote watershed areas.","container-title":"Journal of Geophysical Research: Biogeosciences","DOI":"10.1029/2020JG005851","ISSN":"2169-8961","issue":"12","language":"en","note":"_eprint: https://agupubs.onlinelibrary.wiley.com/doi/pdf/10.1029/2020JG005851","page":"e2020JG005851","source":"Wiley Online Library","title":"Headwater Catchments Govern Biogeochemistry in America's Largest Free-Flowing River Network","volume":"125","author":[{"family":"French","given":"David W."},{"family":"Schindler","given":"Daniel E."},{"family":"Brennan","given":"Sean R."},{"family":"Whited","given":"Diane"}],"issued":{"date-parts":[["2020"]]}}}],"schema":"https://github.com/citation-style-language/schema/raw/master/csl-citation.json"} </w:instrText>
+        <w:fldChar w:fldCharType="separate"/>
+      </w:r>
+      <w:r>
+        <w:rPr>
+          <w:rFonts w:ascii="Garamond" w:eastAsia="Times New Roman" w:hAnsi="Garamond" w:cs="Times New Roman"/>
+          <w:noProof/>
+          <w:kern w:val="0"/>
+          <w:sz w:val="22"/>
+          <w:szCs w:val="22"/>
+          <w14:ligatures w14:val="none"/>
+        </w:rPr>
+        <w:t>(French et al., 2020</w:t>
+      </w:r>
+      <w:r>
+        <w:rPr>
+          <w:rFonts w:ascii="Garamond" w:eastAsia="Times New Roman" w:hAnsi="Garamond" w:cs="Times New Roman"/>
+          <w:noProof/>
+          <w:kern w:val="0"/>
+          <w:sz w:val="22"/>
+          <w:szCs w:val="22"/>
+          <w14:ligatures w14:val="none"/>
+        </w:rPr>
+        <w:t>, N = 120</w:t>
+      </w:r>
+      <w:r>
+        <w:rPr>
+          <w:rFonts w:ascii="Garamond" w:eastAsia="Times New Roman" w:hAnsi="Garamond" w:cs="Times New Roman"/>
+          <w:noProof/>
+          <w:kern w:val="0"/>
+          <w:sz w:val="22"/>
+          <w:szCs w:val="22"/>
+          <w14:ligatures w14:val="none"/>
+        </w:rPr>
+        <w:t>)</w:t>
       </w:r>
       <w:r>
         <w:rPr>
@@ -3328,6 +3610,202 @@
             </w:rPr>
           </w:rPrChange>
         </w:rPr>
+        <w:fldChar w:fldCharType="end"/>
+      </w:r>
+      <w:r>
+        <w:rPr>
+          <w:rFonts w:ascii="Garamond" w:eastAsia="Times New Roman" w:hAnsi="Garamond" w:cs="Times New Roman"/>
+          <w:kern w:val="0"/>
+          <w:sz w:val="22"/>
+          <w:szCs w:val="22"/>
+          <w14:ligatures w14:val="none"/>
+        </w:rPr>
+        <w:t xml:space="preserve">. </w:t>
+      </w:r>
+      <w:r>
+        <w:rPr>
+          <w:rFonts w:ascii="Garamond" w:eastAsia="Times New Roman" w:hAnsi="Garamond" w:cs="Times New Roman"/>
+          <w:kern w:val="0"/>
+          <w:sz w:val="22"/>
+          <w:szCs w:val="22"/>
+          <w14:ligatures w14:val="none"/>
+        </w:rPr>
+        <w:t xml:space="preserve">The resulting </w:t>
+      </w:r>
+      <w:proofErr w:type="spellStart"/>
+      <w:r>
+        <w:rPr>
+          <w:rFonts w:ascii="Garamond" w:eastAsia="Times New Roman" w:hAnsi="Garamond" w:cs="Times New Roman"/>
+          <w:kern w:val="0"/>
+          <w:sz w:val="22"/>
+          <w:szCs w:val="22"/>
+          <w14:ligatures w14:val="none"/>
+        </w:rPr>
+        <w:t>isoscape</w:t>
+      </w:r>
+      <w:proofErr w:type="spellEnd"/>
+      <w:r>
+        <w:rPr>
+          <w:rFonts w:ascii="Garamond" w:eastAsia="Times New Roman" w:hAnsi="Garamond" w:cs="Times New Roman"/>
+          <w:kern w:val="0"/>
+          <w:sz w:val="22"/>
+          <w:szCs w:val="22"/>
+          <w14:ligatures w14:val="none"/>
+        </w:rPr>
+        <w:t xml:space="preserve"> includes estimates of </w:t>
+      </w:r>
+      <w:r>
+        <w:rPr>
+          <w:rFonts w:ascii="Garamond" w:eastAsia="Times New Roman" w:hAnsi="Garamond" w:cs="Times New Roman"/>
+          <w:kern w:val="0"/>
+          <w:sz w:val="22"/>
+          <w:szCs w:val="22"/>
+          <w14:ligatures w14:val="none"/>
+        </w:rPr>
+        <w:t>Sr</w:t>
+      </w:r>
+      <w:r>
+        <w:rPr>
+          <w:rFonts w:ascii="Garamond" w:eastAsia="Times New Roman" w:hAnsi="Garamond" w:cs="Times New Roman"/>
+          <w:kern w:val="0"/>
+          <w:sz w:val="22"/>
+          <w:szCs w:val="22"/>
+          <w:vertAlign w:val="superscript"/>
+          <w14:ligatures w14:val="none"/>
+        </w:rPr>
+        <w:t>87</w:t>
+      </w:r>
+      <w:r>
+        <w:rPr>
+          <w:rFonts w:ascii="Garamond" w:eastAsia="Times New Roman" w:hAnsi="Garamond" w:cs="Times New Roman"/>
+          <w:kern w:val="0"/>
+          <w:sz w:val="22"/>
+          <w:szCs w:val="22"/>
+          <w14:ligatures w14:val="none"/>
+        </w:rPr>
+        <w:t>/Sr</w:t>
+      </w:r>
+      <w:r>
+        <w:rPr>
+          <w:rFonts w:ascii="Garamond" w:eastAsia="Times New Roman" w:hAnsi="Garamond" w:cs="Times New Roman"/>
+          <w:kern w:val="0"/>
+          <w:sz w:val="22"/>
+          <w:szCs w:val="22"/>
+          <w:vertAlign w:val="superscript"/>
+          <w14:ligatures w14:val="none"/>
+        </w:rPr>
+        <w:t>86</w:t>
+      </w:r>
+      <w:r>
+        <w:rPr>
+          <w:rFonts w:ascii="Garamond" w:hAnsi="Garamond" w:cs="Times New Roman"/>
+          <w:sz w:val="22"/>
+          <w:szCs w:val="22"/>
+        </w:rPr>
+        <w:t xml:space="preserve"> </w:t>
+      </w:r>
+      <w:r>
+        <w:rPr>
+          <w:rFonts w:ascii="Garamond" w:hAnsi="Garamond" w:cs="Times New Roman"/>
+          <w:sz w:val="22"/>
+          <w:szCs w:val="22"/>
+        </w:rPr>
+        <w:t>ratios</w:t>
+      </w:r>
+      <w:r>
+        <w:rPr>
+          <w:rFonts w:ascii="Garamond" w:hAnsi="Garamond" w:cs="Times New Roman"/>
+          <w:sz w:val="22"/>
+          <w:szCs w:val="22"/>
+        </w:rPr>
+        <w:t xml:space="preserve"> and associated uncertaint</w:t>
+      </w:r>
+      <w:r>
+        <w:rPr>
+          <w:rFonts w:ascii="Garamond" w:hAnsi="Garamond" w:cs="Times New Roman"/>
+          <w:sz w:val="22"/>
+          <w:szCs w:val="22"/>
+        </w:rPr>
+        <w:t>y</w:t>
+      </w:r>
+      <w:r>
+        <w:rPr>
+          <w:rFonts w:ascii="Garamond" w:hAnsi="Garamond" w:cs="Times New Roman"/>
+          <w:sz w:val="22"/>
+          <w:szCs w:val="22"/>
+        </w:rPr>
+        <w:t xml:space="preserve"> for roughly every ~1km of </w:t>
+      </w:r>
+      <w:r>
+        <w:rPr>
+          <w:rFonts w:ascii="Garamond" w:hAnsi="Garamond" w:cs="Times New Roman"/>
+          <w:sz w:val="22"/>
+          <w:szCs w:val="22"/>
+        </w:rPr>
+        <w:t>river length</w:t>
+      </w:r>
+      <w:r>
+        <w:rPr>
+          <w:rFonts w:ascii="Garamond" w:hAnsi="Garamond" w:cs="Times New Roman"/>
+          <w:sz w:val="22"/>
+          <w:szCs w:val="22"/>
+        </w:rPr>
+        <w:t xml:space="preserve"> across the basin (Figure </w:t>
+      </w:r>
+      <w:r>
+        <w:rPr>
+          <w:rFonts w:ascii="Garamond" w:hAnsi="Garamond" w:cs="Times New Roman"/>
+          <w:sz w:val="22"/>
+          <w:szCs w:val="22"/>
+        </w:rPr>
+        <w:t>1</w:t>
+      </w:r>
+      <w:r>
+        <w:rPr>
+          <w:rFonts w:ascii="Garamond" w:hAnsi="Garamond" w:cs="Times New Roman"/>
+          <w:sz w:val="22"/>
+          <w:szCs w:val="22"/>
+        </w:rPr>
+        <w:t>)</w:t>
+      </w:r>
+      <w:r>
+        <w:rPr>
+          <w:rFonts w:ascii="Garamond" w:eastAsia="Times New Roman" w:hAnsi="Garamond" w:cs="Times New Roman"/>
+          <w:kern w:val="0"/>
+          <w:sz w:val="22"/>
+          <w:szCs w:val="22"/>
+          <w14:ligatures w14:val="none"/>
+        </w:rPr>
+        <w:t xml:space="preserve"> </w:t>
+      </w:r>
+      <w:r>
+        <w:rPr>
+          <w:rFonts w:ascii="Garamond" w:eastAsia="Times New Roman" w:hAnsi="Garamond" w:cs="Times New Roman"/>
+          <w:kern w:val="0"/>
+          <w:sz w:val="22"/>
+          <w:szCs w:val="22"/>
+          <w14:ligatures w14:val="none"/>
+        </w:rPr>
+        <w:fldChar w:fldCharType="begin"/>
+      </w:r>
+      <w:r>
+        <w:rPr>
+          <w:rFonts w:ascii="Garamond" w:eastAsia="Times New Roman" w:hAnsi="Garamond" w:cs="Times New Roman"/>
+          <w:kern w:val="0"/>
+          <w:sz w:val="22"/>
+          <w:szCs w:val="22"/>
+          <w14:ligatures w14:val="none"/>
+        </w:rPr>
+        <w:instrText xml:space="preserve"> ADDIN ZOTERO_ITEM CSL_CITATION {"citationID":"M10Aqb9z","properties":{"formattedCitation":"(Brennan et al., 2016; Ver Hoef &amp; Peterson, 2010)","plainCitation":"(Brennan et al., 2016; Ver Hoef &amp; Peterson, 2010)","noteIndex":0},"citationItems":[{"id":2315,"uris":["http://zotero.org/users/8421274/items/Q4IUGSIX"],"itemData":{"id":2315,"type":"article-journal","abstract":"A critical challenge for the Earth sciences is to trace the transport and flux of matter within and among aquatic, terrestrial, and atmospheric systems. Robust descriptions of isotopic patterns across space and time, called “isoscapes,” form the basis of a rapidly growing and wide-ranging body of research aimed at quantifying connectivity within and among Earth's systems. However, isoscapes of rivers have been limited by conventional Euclidean approaches in geostatistics and the lack of a quantitative framework to apportion the influence of processes driven by landscape features versus in-stream phenomena. Here we demonstrate how dendritic network models substantially improve the accuracy of isoscapes of strontium isotopes and partition the influence of hydrologic transport versus local geologic features on strontium isotope ratios in a large Alaska river. This work illustrates the analytical power of dendritic network models for the field of isotope biogeochemistry, particularly for provenance studies of modern and ancient animals.","container-title":"Geophysical Research Letters","DOI":"10.1002/2016GL068904","ISSN":"1944-8007","issue":"10","language":"en","note":"_eprint: https://onlinelibrary.wiley.com/doi/pdf/10.1002/2016GL068904","page":"5043-5051","source":"Wiley Online Library","title":"Dendritic network models: Improving isoscapes and quantifying influence of landscape and in-stream processes on strontium isotopes in rivers","title-short":"Dendritic network models","volume":"43","author":[{"family":"Brennan","given":"Sean R."},{"family":"Torgersen","given":"Christian E."},{"family":"Hollenbeck","given":"Jeff P."},{"family":"Fernandez","given":"Diego P."},{"family":"Jensen","given":"Carrie K."},{"family":"Schindler","given":"Daniel E."}],"issued":{"date-parts":[["2016"]]}}},{"id":4769,"uris":["http://zotero.org/users/8421274/items/XBJELDI4"],"itemData":{"id":4769,"type":"article-journal","container-title":"Journal of the American Statistical Association","DOI":"10.1198/jasa.2009.ap08248","ISSN":"0162-1459, 1537-274X","issue":"489","journalAbbreviation":"Journal of the American Statistical Association","language":"en","page":"6-18","source":"DOI.org (Crossref)","title":"A Moving Average Approach for Spatial Statistical Models of Stream Networks","volume":"105","author":[{"family":"Ver Hoef","given":"Jay M."},{"family":"Peterson","given":"Erin E."}],"issued":{"date-parts":[["2010",3,1]]}}}],"schema":"https://github.com/citation-style-language/schema/raw/master/csl-citation.json"} </w:instrText>
+      </w:r>
+      <w:r>
+        <w:rPr>
+          <w:rFonts w:ascii="Garamond" w:eastAsia="Times New Roman" w:hAnsi="Garamond" w:cs="Times New Roman"/>
+          <w:kern w:val="0"/>
+          <w:sz w:val="22"/>
+          <w:szCs w:val="22"/>
+          <w14:ligatures w14:val="none"/>
+        </w:rPr>
         <w:fldChar w:fldCharType="separate"/>
       </w:r>
       <w:r>
@@ -3339,47 +3817,15 @@
           <w:szCs w:val="22"/>
           <w14:ligatures w14:val="none"/>
         </w:rPr>
-        <w:t>(French et al., 2020</w:t>
-      </w:r>
-      <w:r>
-        <w:rPr>
-          <w:rFonts w:ascii="Garamond" w:eastAsia="Times New Roman" w:hAnsi="Garamond" w:cs="Times New Roman"/>
-          <w:noProof/>
-          <w:kern w:val="0"/>
-          <w:sz w:val="22"/>
-          <w:szCs w:val="22"/>
-          <w14:ligatures w14:val="none"/>
-        </w:rPr>
-        <w:t>, N = 120</w:t>
-      </w:r>
-      <w:r>
-        <w:rPr>
-          <w:rFonts w:ascii="Garamond" w:eastAsia="Times New Roman" w:hAnsi="Garamond" w:cs="Times New Roman"/>
-          <w:noProof/>
-          <w:kern w:val="0"/>
-          <w:sz w:val="22"/>
-          <w:szCs w:val="22"/>
-          <w14:ligatures w14:val="none"/>
-        </w:rPr>
-        <w:t>)</w:t>
-      </w:r>
-      <w:r>
-        <w:rPr>
-          <w:rFonts w:ascii="Garamond" w:eastAsia="Times New Roman" w:hAnsi="Garamond" w:cs="Times New Roman"/>
-          <w:kern w:val="0"/>
-          <w:sz w:val="22"/>
-          <w:szCs w:val="22"/>
-          <w14:ligatures w14:val="none"/>
-          <w:rPrChange w:id="28" w:author="Benjamin J. Makhlouf" w:date="2025-07-26T13:00:00Z" w16du:dateUtc="2025-07-26T20:00:00Z">
-            <w:rPr>
-              <w:rFonts w:ascii="Garamond" w:eastAsia="Times New Roman" w:hAnsi="Garamond" w:cs="Times New Roman"/>
-              <w:kern w:val="0"/>
-              <w:sz w:val="22"/>
-              <w:szCs w:val="22"/>
-              <w:highlight w:val="yellow"/>
-              <w14:ligatures w14:val="none"/>
-            </w:rPr>
-          </w:rPrChange>
+        <w:t>(Brennan et al., 2016; Ver Hoef &amp; Peterson, 2010)</w:t>
+      </w:r>
+      <w:r>
+        <w:rPr>
+          <w:rFonts w:ascii="Garamond" w:eastAsia="Times New Roman" w:hAnsi="Garamond" w:cs="Times New Roman"/>
+          <w:kern w:val="0"/>
+          <w:sz w:val="22"/>
+          <w:szCs w:val="22"/>
+          <w14:ligatures w14:val="none"/>
         </w:rPr>
         <w:fldChar w:fldCharType="end"/>
       </w:r>
@@ -3395,85 +3841,11 @@
       </w:r>
       <w:r>
         <w:rPr>
-          <w:rFonts w:ascii="Garamond" w:eastAsia="Times New Roman" w:hAnsi="Garamond" w:cs="Times New Roman"/>
-          <w:kern w:val="0"/>
-          <w:sz w:val="22"/>
-          <w:szCs w:val="22"/>
-          <w14:ligatures w14:val="none"/>
-        </w:rPr>
-        <w:t xml:space="preserve">The resulting </w:t>
-      </w:r>
-      <w:proofErr w:type="spellStart"/>
-      <w:r>
-        <w:rPr>
-          <w:rFonts w:ascii="Garamond" w:eastAsia="Times New Roman" w:hAnsi="Garamond" w:cs="Times New Roman"/>
-          <w:kern w:val="0"/>
-          <w:sz w:val="22"/>
-          <w:szCs w:val="22"/>
-          <w14:ligatures w14:val="none"/>
-        </w:rPr>
-        <w:t>isoscape</w:t>
-      </w:r>
-      <w:proofErr w:type="spellEnd"/>
-      <w:r>
-        <w:rPr>
-          <w:rFonts w:ascii="Garamond" w:eastAsia="Times New Roman" w:hAnsi="Garamond" w:cs="Times New Roman"/>
-          <w:kern w:val="0"/>
-          <w:sz w:val="22"/>
-          <w:szCs w:val="22"/>
-          <w14:ligatures w14:val="none"/>
-        </w:rPr>
-        <w:t xml:space="preserve"> includes estimates of </w:t>
-      </w:r>
-      <w:r>
-        <w:rPr>
-          <w:rFonts w:ascii="Garamond" w:eastAsia="Times New Roman" w:hAnsi="Garamond" w:cs="Times New Roman"/>
-          <w:kern w:val="0"/>
-          <w:sz w:val="22"/>
-          <w:szCs w:val="22"/>
-          <w14:ligatures w14:val="none"/>
-        </w:rPr>
-        <w:t>Sr</w:t>
-      </w:r>
-      <w:r>
-        <w:rPr>
-          <w:rFonts w:ascii="Garamond" w:eastAsia="Times New Roman" w:hAnsi="Garamond" w:cs="Times New Roman"/>
-          <w:kern w:val="0"/>
-          <w:sz w:val="22"/>
-          <w:szCs w:val="22"/>
-          <w:vertAlign w:val="superscript"/>
-          <w14:ligatures w14:val="none"/>
-        </w:rPr>
-        <w:t>87</w:t>
-      </w:r>
-      <w:r>
-        <w:rPr>
-          <w:rFonts w:ascii="Garamond" w:eastAsia="Times New Roman" w:hAnsi="Garamond" w:cs="Times New Roman"/>
-          <w:kern w:val="0"/>
-          <w:sz w:val="22"/>
-          <w:szCs w:val="22"/>
-          <w14:ligatures w14:val="none"/>
-        </w:rPr>
-        <w:t>/Sr</w:t>
-      </w:r>
-      <w:r>
-        <w:rPr>
-          <w:rFonts w:ascii="Garamond" w:eastAsia="Times New Roman" w:hAnsi="Garamond" w:cs="Times New Roman"/>
-          <w:kern w:val="0"/>
-          <w:sz w:val="22"/>
-          <w:szCs w:val="22"/>
-          <w:vertAlign w:val="superscript"/>
-          <w14:ligatures w14:val="none"/>
-        </w:rPr>
-        <w:t>86</w:t>
-      </w:r>
-      <w:r>
-        <w:rPr>
           <w:rFonts w:ascii="Garamond" w:hAnsi="Garamond" w:cs="Times New Roman"/>
           <w:sz w:val="22"/>
           <w:szCs w:val="22"/>
         </w:rPr>
-        <w:t xml:space="preserve"> </w:t>
+        <w:t>To prevent over-assignment to tributaries with exceptionally low prediction error</w:t>
       </w:r>
       <w:r>
         <w:rPr>
@@ -3481,152 +3853,9 @@
           <w:sz w:val="22"/>
           <w:szCs w:val="22"/>
         </w:rPr>
-        <w:t>ratios</w:t>
-      </w:r>
-      <w:r>
-        <w:rPr>
-          <w:rFonts w:ascii="Garamond" w:hAnsi="Garamond" w:cs="Times New Roman"/>
-          <w:sz w:val="22"/>
-          <w:szCs w:val="22"/>
-        </w:rPr>
-        <w:t xml:space="preserve"> and associated uncertaint</w:t>
-      </w:r>
-      <w:r>
-        <w:rPr>
-          <w:rFonts w:ascii="Garamond" w:hAnsi="Garamond" w:cs="Times New Roman"/>
-          <w:sz w:val="22"/>
-          <w:szCs w:val="22"/>
-        </w:rPr>
-        <w:t>y</w:t>
-      </w:r>
-      <w:r>
-        <w:rPr>
-          <w:rFonts w:ascii="Garamond" w:hAnsi="Garamond" w:cs="Times New Roman"/>
-          <w:sz w:val="22"/>
-          <w:szCs w:val="22"/>
-        </w:rPr>
-        <w:t xml:space="preserve"> for roughly every ~1km of </w:t>
-      </w:r>
-      <w:r>
-        <w:rPr>
-          <w:rFonts w:ascii="Garamond" w:hAnsi="Garamond" w:cs="Times New Roman"/>
-          <w:sz w:val="22"/>
-          <w:szCs w:val="22"/>
-        </w:rPr>
-        <w:t>river length</w:t>
-      </w:r>
-      <w:r>
-        <w:rPr>
-          <w:rFonts w:ascii="Garamond" w:hAnsi="Garamond" w:cs="Times New Roman"/>
-          <w:sz w:val="22"/>
-          <w:szCs w:val="22"/>
-        </w:rPr>
-        <w:t xml:space="preserve"> across the basin (Figure </w:t>
-      </w:r>
-      <w:r>
-        <w:rPr>
-          <w:rFonts w:ascii="Garamond" w:hAnsi="Garamond" w:cs="Times New Roman"/>
-          <w:sz w:val="22"/>
-          <w:szCs w:val="22"/>
-        </w:rPr>
-        <w:t>1</w:t>
-      </w:r>
-      <w:r>
-        <w:rPr>
-          <w:rFonts w:ascii="Garamond" w:hAnsi="Garamond" w:cs="Times New Roman"/>
-          <w:sz w:val="22"/>
-          <w:szCs w:val="22"/>
-        </w:rPr>
-        <w:t>)</w:t>
-      </w:r>
-      <w:r>
-        <w:rPr>
-          <w:rFonts w:ascii="Garamond" w:eastAsia="Times New Roman" w:hAnsi="Garamond" w:cs="Times New Roman"/>
-          <w:kern w:val="0"/>
-          <w:sz w:val="22"/>
-          <w:szCs w:val="22"/>
-          <w14:ligatures w14:val="none"/>
-        </w:rPr>
-        <w:t xml:space="preserve"> </w:t>
-      </w:r>
-      <w:r>
-        <w:rPr>
-          <w:rFonts w:ascii="Garamond" w:eastAsia="Times New Roman" w:hAnsi="Garamond" w:cs="Times New Roman"/>
-          <w:kern w:val="0"/>
-          <w:sz w:val="22"/>
-          <w:szCs w:val="22"/>
-          <w14:ligatures w14:val="none"/>
-        </w:rPr>
-        <w:fldChar w:fldCharType="begin"/>
-      </w:r>
-      <w:r>
-        <w:rPr>
-          <w:rFonts w:ascii="Garamond" w:eastAsia="Times New Roman" w:hAnsi="Garamond" w:cs="Times New Roman"/>
-          <w:kern w:val="0"/>
-          <w:sz w:val="22"/>
-          <w:szCs w:val="22"/>
-          <w14:ligatures w14:val="none"/>
-        </w:rPr>
-        <w:instrText xml:space="preserve"> ADDIN ZOTERO_ITEM CSL_CITATION {"citationID":"M10Aqb9z","properties":{"formattedCitation":"(Brennan et al., 2016; Ver Hoef &amp; Peterson, 2010)","plainCitation":"(Brennan et al., 2016; Ver Hoef &amp; Peterson, 2010)","noteIndex":0},"citationItems":[{"id":2315,"uris":["http://zotero.org/users/8421274/items/Q4IUGSIX"],"itemData":{"id":2315,"type":"article-journal","abstract":"A critical challenge for the Earth sciences is to trace the transport and flux of matter within and among aquatic, terrestrial, and atmospheric systems. Robust descriptions of isotopic patterns across space and time, called “isoscapes,” form the basis of a rapidly growing and wide-ranging body of research aimed at quantifying connectivity within and among Earth's systems. However, isoscapes of rivers have been limited by conventional Euclidean approaches in geostatistics and the lack of a quantitative framework to apportion the influence of processes driven by landscape features versus in-stream phenomena. Here we demonstrate how dendritic network models substantially improve the accuracy of isoscapes of strontium isotopes and partition the influence of hydrologic transport versus local geologic features on strontium isotope ratios in a large Alaska river. This work illustrates the analytical power of dendritic network models for the field of isotope biogeochemistry, particularly for provenance studies of modern and ancient animals.","container-title":"Geophysical Research Letters","DOI":"10.1002/2016GL068904","ISSN":"1944-8007","issue":"10","language":"en","note":"_eprint: https://onlinelibrary.wiley.com/doi/pdf/10.1002/2016GL068904","page":"5043-5051","source":"Wiley Online Library","title":"Dendritic network models: Improving isoscapes and quantifying influence of landscape and in-stream processes on strontium isotopes in rivers","title-short":"Dendritic network models","volume":"43","author":[{"family":"Brennan","given":"Sean R."},{"family":"Torgersen","given":"Christian E."},{"family":"Hollenbeck","given":"Jeff P."},{"family":"Fernandez","given":"Diego P."},{"family":"Jensen","given":"Carrie K."},{"family":"Schindler","given":"Daniel E."}],"issued":{"date-parts":[["2016"]]}}},{"id":4769,"uris":["http://zotero.org/users/8421274/items/XBJELDI4"],"itemData":{"id":4769,"type":"article-journal","container-title":"Journal of the American Statistical Association","DOI":"10.1198/jasa.2009.ap08248","ISSN":"0162-1459, 1537-274X","issue":"489","journalAbbreviation":"Journal of the American Statistical Association","language":"en","page":"6-18","source":"DOI.org (Crossref)","title":"A Moving Average Approach for Spatial Statistical Models of Stream Networks","volume":"105","author":[{"family":"Ver Hoef","given":"Jay M."},{"family":"Peterson","given":"Erin E."}],"issued":{"date-parts":[["2010",3,1]]}}}],"schema":"https://github.com/citation-style-language/schema/raw/master/csl-citation.json"} </w:instrText>
-      </w:r>
-      <w:r>
-        <w:rPr>
-          <w:rFonts w:ascii="Garamond" w:eastAsia="Times New Roman" w:hAnsi="Garamond" w:cs="Times New Roman"/>
-          <w:kern w:val="0"/>
-          <w:sz w:val="22"/>
-          <w:szCs w:val="22"/>
-          <w14:ligatures w14:val="none"/>
-        </w:rPr>
-        <w:fldChar w:fldCharType="separate"/>
-      </w:r>
-      <w:r>
-        <w:rPr>
-          <w:rFonts w:ascii="Garamond" w:eastAsia="Times New Roman" w:hAnsi="Garamond" w:cs="Times New Roman"/>
-          <w:noProof/>
-          <w:kern w:val="0"/>
-          <w:sz w:val="22"/>
-          <w:szCs w:val="22"/>
-          <w14:ligatures w14:val="none"/>
-        </w:rPr>
-        <w:t>(Brennan et al., 2016; Ver Hoef &amp; Peterson, 2010)</w:t>
-      </w:r>
-      <w:r>
-        <w:rPr>
-          <w:rFonts w:ascii="Garamond" w:eastAsia="Times New Roman" w:hAnsi="Garamond" w:cs="Times New Roman"/>
-          <w:kern w:val="0"/>
-          <w:sz w:val="22"/>
-          <w:szCs w:val="22"/>
-          <w14:ligatures w14:val="none"/>
-        </w:rPr>
-        <w:fldChar w:fldCharType="end"/>
-      </w:r>
-      <w:r>
-        <w:rPr>
-          <w:rFonts w:ascii="Garamond" w:eastAsia="Times New Roman" w:hAnsi="Garamond" w:cs="Times New Roman"/>
-          <w:kern w:val="0"/>
-          <w:sz w:val="22"/>
-          <w:szCs w:val="22"/>
-          <w14:ligatures w14:val="none"/>
-        </w:rPr>
-        <w:t xml:space="preserve">. </w:t>
-      </w:r>
-      <w:r>
-        <w:rPr>
-          <w:rFonts w:ascii="Garamond" w:hAnsi="Garamond" w:cs="Times New Roman"/>
-          <w:sz w:val="22"/>
-          <w:szCs w:val="22"/>
-        </w:rPr>
-        <w:t>To prevent over-assignment to tributaries with exceptionally low prediction error</w:t>
-      </w:r>
-      <w:r>
-        <w:rPr>
-          <w:rFonts w:ascii="Garamond" w:hAnsi="Garamond" w:cs="Times New Roman"/>
-          <w:sz w:val="22"/>
-          <w:szCs w:val="22"/>
-        </w:rPr>
         <w:t xml:space="preserve">, </w:t>
       </w:r>
-      <w:del w:id="29" w:author="Daniel Schindler" w:date="2025-08-26T16:23:00Z" w16du:dateUtc="2025-08-27T00:23:00Z">
+      <w:del w:id="28" w:author="Daniel Schindler" w:date="2025-08-26T16:23:00Z" w16du:dateUtc="2025-08-27T00:23:00Z">
         <w:r>
           <w:rPr>
             <w:rFonts w:ascii="Garamond" w:hAnsi="Garamond" w:cs="Times New Roman"/>
@@ -4218,7 +4447,6 @@
               <w:sz w:val="18"/>
               <w:szCs w:val="18"/>
             </w:rPr>
-            <w:lastRenderedPageBreak/>
             <m:t>P</m:t>
           </m:r>
           <m:d>
@@ -4926,8 +5154,8 @@
         </w:rPr>
         <w:t xml:space="preserve"> </w:t>
       </w:r>
+      <w:commentRangeStart w:id="29"/>
       <w:commentRangeStart w:id="30"/>
-      <w:commentRangeStart w:id="31"/>
       <w:r>
         <w:rPr>
           <w:rFonts w:ascii="Garamond" w:eastAsia="Times New Roman" w:hAnsi="Garamond" w:cs="Times New Roman"/>
@@ -4979,19 +5207,19 @@
         </w:rPr>
         <w:fldChar w:fldCharType="end"/>
       </w:r>
+      <w:commentRangeEnd w:id="29"/>
+      <w:r>
+        <w:rPr>
+          <w:rStyle w:val="CommentReference"/>
+        </w:rPr>
+        <w:commentReference w:id="29"/>
+      </w:r>
       <w:commentRangeEnd w:id="30"/>
       <w:r>
         <w:rPr>
           <w:rStyle w:val="CommentReference"/>
         </w:rPr>
         <w:commentReference w:id="30"/>
-      </w:r>
-      <w:commentRangeEnd w:id="31"/>
-      <w:r>
-        <w:rPr>
-          <w:rStyle w:val="CommentReference"/>
-        </w:rPr>
-        <w:commentReference w:id="31"/>
       </w:r>
       <w:r>
         <w:rPr>
@@ -5261,6 +5489,7 @@
           <w:sz w:val="22"/>
           <w:szCs w:val="22"/>
         </w:rPr>
+        <w:lastRenderedPageBreak/>
         <w:t xml:space="preserve">To estimate the spatial distribution of natal origins </w:t>
       </w:r>
       <w:r>
@@ -5486,18 +5715,9 @@
           <w:sz w:val="22"/>
           <w:szCs w:val="22"/>
         </w:rPr>
-        <w:t xml:space="preserve">based on capture date: Q1 (run start through </w:t>
-      </w:r>
-      <w:r>
-        <w:rPr>
-          <w:rFonts w:ascii="Garamond" w:hAnsi="Garamond"/>
-          <w:sz w:val="22"/>
-          <w:szCs w:val="22"/>
-        </w:rPr>
-        <w:lastRenderedPageBreak/>
-        <w:t>June 11), Q2 (June 12-21), Q3 (June 22-July 1), and Q4 (July 2 onward).</w:t>
-      </w:r>
-      <w:ins w:id="32" w:author="Daniel Schindler" w:date="2025-07-17T13:30:00Z" w16du:dateUtc="2025-07-17T21:30:00Z">
+        <w:t>based on capture date: Q1 (run start through June 11), Q2 (June 12-21), Q3 (June 22-July 1), and Q4 (July 2 onward).</w:t>
+      </w:r>
+      <w:ins w:id="31" w:author="Daniel Schindler" w:date="2025-07-17T13:30:00Z" w16du:dateUtc="2025-07-17T21:30:00Z">
         <w:r>
           <w:rPr>
             <w:rFonts w:ascii="Garamond" w:hAnsi="Garamond"/>
@@ -5711,9 +5931,9 @@
         </w:rPr>
         <w:t xml:space="preserve"> </w:t>
       </w:r>
+      <w:commentRangeStart w:id="32"/>
       <w:commentRangeStart w:id="33"/>
-      <w:commentRangeStart w:id="34"/>
-      <w:ins w:id="35" w:author="Daniel Schindler" w:date="2025-07-17T13:31:00Z" w16du:dateUtc="2025-07-17T21:31:00Z">
+      <w:ins w:id="34" w:author="Daniel Schindler" w:date="2025-07-17T13:31:00Z" w16du:dateUtc="2025-07-17T21:31:00Z">
         <w:r>
           <w:rPr>
             <w:rFonts w:ascii="Garamond" w:hAnsi="Garamond"/>
@@ -5732,6 +5952,13 @@
         </w:rPr>
         <w:t xml:space="preserve">. </w:t>
       </w:r>
+      <w:commentRangeEnd w:id="32"/>
+      <w:r>
+        <w:rPr>
+          <w:rStyle w:val="CommentReference"/>
+        </w:rPr>
+        <w:commentReference w:id="32"/>
+      </w:r>
       <w:commentRangeEnd w:id="33"/>
       <w:r>
         <w:rPr>
@@ -5739,12 +5966,14 @@
         </w:rPr>
         <w:commentReference w:id="33"/>
       </w:r>
-      <w:commentRangeEnd w:id="34"/>
       <w:r>
         <w:rPr>
           <w:rStyle w:val="CommentReference"/>
-        </w:rPr>
-        <w:commentReference w:id="34"/>
+          <w:rFonts w:ascii="Garamond" w:hAnsi="Garamond"/>
+          <w:sz w:val="22"/>
+          <w:szCs w:val="22"/>
+        </w:rPr>
+        <w:t>From the furthest downstream connection of each of these tributaries to the mainstem</w:t>
       </w:r>
       <w:r>
         <w:rPr>
@@ -5753,7 +5982,7 @@
           <w:sz w:val="22"/>
           <w:szCs w:val="22"/>
         </w:rPr>
-        <w:t>From the furthest downstream connection of each of these tributaries to the mainstem</w:t>
+        <w:t xml:space="preserve"> Kuskokwim River,</w:t>
       </w:r>
       <w:r>
         <w:rPr>
@@ -5762,7 +5991,7 @@
           <w:sz w:val="22"/>
           <w:szCs w:val="22"/>
         </w:rPr>
-        <w:t xml:space="preserve"> Kuskokwim River,</w:t>
+        <w:t xml:space="preserve"> all upstream segments were </w:t>
       </w:r>
       <w:r>
         <w:rPr>
@@ -5771,7 +6000,7 @@
           <w:sz w:val="22"/>
           <w:szCs w:val="22"/>
         </w:rPr>
-        <w:t xml:space="preserve"> all upstream segments were </w:t>
+        <w:t xml:space="preserve">identified and </w:t>
       </w:r>
       <w:r>
         <w:rPr>
@@ -5780,7 +6009,7 @@
           <w:sz w:val="22"/>
           <w:szCs w:val="22"/>
         </w:rPr>
-        <w:t xml:space="preserve">identified and </w:t>
+        <w:t xml:space="preserve">assigned to a common </w:t>
       </w:r>
       <w:r>
         <w:rPr>
@@ -5789,7 +6018,7 @@
           <w:sz w:val="22"/>
           <w:szCs w:val="22"/>
         </w:rPr>
-        <w:t xml:space="preserve">assigned to a common </w:t>
+        <w:t>stock identifier based on the name of the major tributary</w:t>
       </w:r>
       <w:r>
         <w:rPr>
@@ -5798,7 +6027,7 @@
           <w:sz w:val="22"/>
           <w:szCs w:val="22"/>
         </w:rPr>
-        <w:t>stock identifier based on the name of the major tributary</w:t>
+        <w:t xml:space="preserve">. For some smaller </w:t>
       </w:r>
       <w:r>
         <w:rPr>
@@ -5807,7 +6036,7 @@
           <w:sz w:val="22"/>
           <w:szCs w:val="22"/>
         </w:rPr>
-        <w:t xml:space="preserve">. For some smaller </w:t>
+        <w:t xml:space="preserve">regions </w:t>
       </w:r>
       <w:r>
         <w:rPr>
@@ -5816,8 +6045,9 @@
           <w:sz w:val="22"/>
           <w:szCs w:val="22"/>
         </w:rPr>
-        <w:t xml:space="preserve">regions </w:t>
-      </w:r>
+        <w:t xml:space="preserve">(i.e. the </w:t>
+      </w:r>
+      <w:proofErr w:type="spellStart"/>
       <w:r>
         <w:rPr>
           <w:rStyle w:val="CommentReference"/>
@@ -5825,9 +6055,9 @@
           <w:sz w:val="22"/>
           <w:szCs w:val="22"/>
         </w:rPr>
-        <w:t xml:space="preserve">(i.e. the </w:t>
-      </w:r>
-      <w:proofErr w:type="spellStart"/>
+        <w:t>Takotna</w:t>
+      </w:r>
+      <w:proofErr w:type="spellEnd"/>
       <w:r>
         <w:rPr>
           <w:rStyle w:val="CommentReference"/>
@@ -5835,9 +6065,8 @@
           <w:sz w:val="22"/>
           <w:szCs w:val="22"/>
         </w:rPr>
-        <w:t>Takotna</w:t>
-      </w:r>
-      <w:proofErr w:type="spellEnd"/>
+        <w:t xml:space="preserve"> and Nixon fork),</w:t>
+      </w:r>
       <w:r>
         <w:rPr>
           <w:rStyle w:val="CommentReference"/>
@@ -5845,18 +6074,9 @@
           <w:sz w:val="22"/>
           <w:szCs w:val="22"/>
         </w:rPr>
-        <w:t xml:space="preserve"> and Nixon fork),</w:t>
-      </w:r>
-      <w:r>
-        <w:rPr>
-          <w:rStyle w:val="CommentReference"/>
-          <w:rFonts w:ascii="Garamond" w:hAnsi="Garamond"/>
-          <w:sz w:val="22"/>
-          <w:szCs w:val="22"/>
-        </w:rPr>
         <w:t xml:space="preserve"> multiple units were combined </w:t>
       </w:r>
-      <w:del w:id="36" w:author="Daniel Schindler" w:date="2025-08-26T16:33:00Z" w16du:dateUtc="2025-08-27T00:33:00Z">
+      <w:del w:id="35" w:author="Daniel Schindler" w:date="2025-08-26T16:33:00Z" w16du:dateUtc="2025-08-27T00:33:00Z">
         <w:r>
           <w:rPr>
             <w:rStyle w:val="CommentReference"/>
@@ -6015,7 +6235,7 @@
         </w:rPr>
         <w:t xml:space="preserve">For each year and seasonal quartile, tributary-level return estimates were aggregated into management units and normalized to sum to one across the basin, representing each unit's proportional contribution to that quartile. Summary statistics were then calculated across all years for each management unit. Spatial maps illustrate the mean values for each management unit, with all tributaries </w:t>
       </w:r>
-      <w:commentRangeStart w:id="37"/>
+      <w:commentRangeStart w:id="36"/>
       <w:r>
         <w:rPr>
           <w:rFonts w:ascii="Garamond" w:hAnsi="Garamond" w:cs="Times New Roman"/>
@@ -6024,12 +6244,13 @@
         </w:rPr>
         <w:t xml:space="preserve">within a unit colored according to their contribution and darker colors indicating higher values (Figure 3a). Corresponding boxplots display the median, first and third quartiles, and range of the data across all years for each management unit, ordered by </w:t>
       </w:r>
-      <w:commentRangeEnd w:id="37"/>
+      <w:commentRangeEnd w:id="36"/>
       <w:r>
         <w:rPr>
           <w:rStyle w:val="CommentReference"/>
         </w:rPr>
-        <w:commentReference w:id="37"/>
+        <w:lastRenderedPageBreak/>
+        <w:commentReference w:id="36"/>
       </w:r>
       <w:r>
         <w:rPr>
@@ -6053,16 +6274,7 @@
           <w:sz w:val="22"/>
           <w:szCs w:val="22"/>
         </w:rPr>
-        <w:t>Cumulative distribution functions were constructed to examine trends in relative run timing among stocks, independent of stock abundance and quartile cut-off dates. For each year, the full run was split into 3-day intervals and the cumulative distribution of returners for each stock was compared to the full season totals for that stock. Resulting data (Figure 4) illustrate the proportion (0-1) of each stock's total cumulative contribution at each 3-</w:t>
-      </w:r>
-      <w:r>
-        <w:rPr>
-          <w:rFonts w:ascii="Garamond" w:hAnsi="Garamond" w:cs="Times New Roman"/>
-          <w:sz w:val="22"/>
-          <w:szCs w:val="22"/>
-        </w:rPr>
-        <w:lastRenderedPageBreak/>
-        <w:t>day interval.</w:t>
+        <w:t>Cumulative distribution functions were constructed to examine trends in relative run timing among stocks, independent of stock abundance and quartile cut-off dates. For each year, the full run was split into 3-day intervals and the cumulative distribution of returners for each stock was compared to the full season totals for that stock. Resulting data (Figure 4) illustrate the proportion (0-1) of each stock's total cumulative contribution at each 3-day interval.</w:t>
       </w:r>
       <w:r>
         <w:rPr>
@@ -6133,7 +6345,7 @@
           <w:szCs w:val="36"/>
         </w:rPr>
       </w:pPr>
-      <w:ins w:id="38" w:author="Daniel Schindler" w:date="2025-08-26T16:46:00Z" w16du:dateUtc="2025-08-27T00:46:00Z">
+      <w:ins w:id="37" w:author="Daniel Schindler" w:date="2025-08-26T16:46:00Z" w16du:dateUtc="2025-08-27T00:46:00Z">
         <w:r>
           <w:rPr>
             <w:rFonts w:ascii="Garamond" w:hAnsi="Garamond"/>
@@ -6145,7 +6357,7 @@
           <w:t>Variation</w:t>
         </w:r>
       </w:ins>
-      <w:del w:id="39" w:author="Daniel Schindler" w:date="2025-08-26T16:46:00Z" w16du:dateUtc="2025-08-27T00:46:00Z">
+      <w:del w:id="38" w:author="Daniel Schindler" w:date="2025-08-26T16:46:00Z" w16du:dateUtc="2025-08-27T00:46:00Z">
         <w:r>
           <w:rPr>
             <w:rFonts w:ascii="Garamond" w:hAnsi="Garamond"/>
@@ -6310,7 +6522,7 @@
         </w:rPr>
         <w:t xml:space="preserve">) were </w:t>
       </w:r>
-      <w:del w:id="40" w:author="Daniel Schindler" w:date="2025-08-26T16:46:00Z" w16du:dateUtc="2025-08-27T00:46:00Z">
+      <w:del w:id="39" w:author="Daniel Schindler" w:date="2025-08-26T16:46:00Z" w16du:dateUtc="2025-08-27T00:46:00Z">
         <w:r>
           <w:rPr>
             <w:rFonts w:ascii="Garamond" w:hAnsi="Garamond"/>
@@ -6320,7 +6532,7 @@
           <w:delText xml:space="preserve">driven </w:delText>
         </w:r>
       </w:del>
-      <w:ins w:id="41" w:author="Daniel Schindler" w:date="2025-08-26T16:46:00Z" w16du:dateUtc="2025-08-27T00:46:00Z">
+      <w:ins w:id="40" w:author="Daniel Schindler" w:date="2025-08-26T16:46:00Z" w16du:dateUtc="2025-08-27T00:46:00Z">
         <w:r>
           <w:rPr>
             <w:rFonts w:ascii="Garamond" w:hAnsi="Garamond"/>
@@ -6573,6 +6785,7 @@
           <w:sz w:val="22"/>
           <w:szCs w:val="22"/>
         </w:rPr>
+        <w:lastRenderedPageBreak/>
         <w:t>Hoholitna</w:t>
       </w:r>
       <w:proofErr w:type="spellEnd"/>
@@ -6767,16 +6980,7 @@
           <w:sz w:val="22"/>
           <w:szCs w:val="22"/>
         </w:rPr>
-        <w:t xml:space="preserve"> River (median 9.6%, range 8.8-12.2%), and Aniak river </w:t>
-      </w:r>
-      <w:r>
-        <w:rPr>
-          <w:rFonts w:ascii="Garamond" w:hAnsi="Garamond"/>
-          <w:sz w:val="22"/>
-          <w:szCs w:val="22"/>
-        </w:rPr>
-        <w:lastRenderedPageBreak/>
-        <w:t xml:space="preserve">(median 8.2%, range 5.7-10.1%). </w:t>
+        <w:t xml:space="preserve"> River (median 9.6%, range 8.8-12.2%), and Aniak river (median 8.2%, range 5.7-10.1%). </w:t>
       </w:r>
       <w:r>
         <w:rPr>
@@ -6949,7 +7153,7 @@
         </w:rPr>
         <w:t xml:space="preserve"> (median; 6.1%)</w:t>
       </w:r>
-      <w:del w:id="42" w:author="Daniel Schindler" w:date="2025-08-26T16:48:00Z" w16du:dateUtc="2025-08-27T00:48:00Z">
+      <w:del w:id="41" w:author="Daniel Schindler" w:date="2025-08-26T16:48:00Z" w16du:dateUtc="2025-08-27T00:48:00Z">
         <w:r>
           <w:rPr>
             <w:rFonts w:ascii="Garamond" w:hAnsi="Garamond"/>
@@ -7053,7 +7257,7 @@
         </w:rPr>
         <w:t xml:space="preserve">(Figure 4) </w:t>
       </w:r>
-      <w:del w:id="43" w:author="Daniel Schindler" w:date="2025-08-26T16:49:00Z" w16du:dateUtc="2025-08-27T00:49:00Z">
+      <w:del w:id="42" w:author="Daniel Schindler" w:date="2025-08-26T16:49:00Z" w16du:dateUtc="2025-08-27T00:49:00Z">
         <w:r>
           <w:rPr>
             <w:rFonts w:ascii="Garamond" w:hAnsi="Garamond"/>
@@ -7063,7 +7267,7 @@
           <w:delText xml:space="preserve">corroborated </w:delText>
         </w:r>
       </w:del>
-      <w:ins w:id="44" w:author="Daniel Schindler" w:date="2025-08-26T16:49:00Z" w16du:dateUtc="2025-08-27T00:49:00Z">
+      <w:ins w:id="43" w:author="Daniel Schindler" w:date="2025-08-26T16:49:00Z" w16du:dateUtc="2025-08-27T00:49:00Z">
         <w:r>
           <w:rPr>
             <w:rFonts w:ascii="Garamond" w:hAnsi="Garamond"/>
@@ -7434,6 +7638,7 @@
           <w:sz w:val="22"/>
           <w:szCs w:val="22"/>
         </w:rPr>
+        <w:lastRenderedPageBreak/>
         <w:t>E</w:t>
       </w:r>
       <w:r>
@@ -7460,7 +7665,7 @@
         </w:rPr>
         <w:t xml:space="preserve"> clearly </w:t>
       </w:r>
-      <w:del w:id="45" w:author="Daniel Schindler" w:date="2025-08-26T16:50:00Z" w16du:dateUtc="2025-08-27T00:50:00Z">
+      <w:del w:id="44" w:author="Daniel Schindler" w:date="2025-08-26T16:50:00Z" w16du:dateUtc="2025-08-27T00:50:00Z">
         <w:r>
           <w:rPr>
             <w:rFonts w:ascii="Garamond" w:hAnsi="Garamond"/>
@@ -7470,7 +7675,7 @@
           <w:delText xml:space="preserve">affords </w:delText>
         </w:r>
       </w:del>
-      <w:ins w:id="46" w:author="Daniel Schindler" w:date="2025-08-26T16:50:00Z" w16du:dateUtc="2025-08-27T00:50:00Z">
+      <w:ins w:id="45" w:author="Daniel Schindler" w:date="2025-08-26T16:50:00Z" w16du:dateUtc="2025-08-27T00:50:00Z">
         <w:r>
           <w:rPr>
             <w:rFonts w:ascii="Garamond" w:hAnsi="Garamond"/>
@@ -7496,7 +7701,7 @@
         </w:rPr>
         <w:t xml:space="preserve"> by the implementation of a front-end closure</w:t>
       </w:r>
-      <w:ins w:id="47" w:author="Daniel Schindler" w:date="2025-08-26T16:50:00Z" w16du:dateUtc="2025-08-27T00:50:00Z">
+      <w:ins w:id="46" w:author="Daniel Schindler" w:date="2025-08-26T16:50:00Z" w16du:dateUtc="2025-08-27T00:50:00Z">
         <w:r>
           <w:rPr>
             <w:rFonts w:ascii="Garamond" w:hAnsi="Garamond"/>
@@ -7596,16 +7801,7 @@
           <w:sz w:val="22"/>
           <w:szCs w:val="22"/>
         </w:rPr>
-        <w:t xml:space="preserve"> river and Nixon Fork stock, which received a median protection of only 6.6%. Several stocks which contribute only minimally to the overall run are afforded significant protection. For example, although the East Fork Kuskokwim contributes </w:t>
-      </w:r>
-      <w:r>
-        <w:rPr>
-          <w:rFonts w:ascii="Garamond" w:hAnsi="Garamond"/>
-          <w:sz w:val="22"/>
-          <w:szCs w:val="22"/>
-        </w:rPr>
-        <w:lastRenderedPageBreak/>
-        <w:t>minimally to the total run</w:t>
+        <w:t xml:space="preserve"> river and Nixon Fork stock, which received a median protection of only 6.6%. Several stocks which contribute only minimally to the overall run are afforded significant protection. For example, although the East Fork Kuskokwim contributes minimally to the total run</w:t>
       </w:r>
       <w:r>
         <w:rPr>
@@ -7623,7 +7819,7 @@
         </w:rPr>
         <w:t xml:space="preserve">Stocks positioned lower in the watershed received less protection due to their </w:t>
       </w:r>
-      <w:del w:id="48" w:author="Daniel Schindler" w:date="2025-08-26T16:51:00Z" w16du:dateUtc="2025-08-27T00:51:00Z">
+      <w:del w:id="47" w:author="Daniel Schindler" w:date="2025-08-26T16:51:00Z" w16du:dateUtc="2025-08-27T00:51:00Z">
         <w:r>
           <w:rPr>
             <w:rFonts w:ascii="Garamond" w:hAnsi="Garamond"/>
@@ -7641,7 +7837,7 @@
         </w:rPr>
         <w:t>late</w:t>
       </w:r>
-      <w:ins w:id="49" w:author="Daniel Schindler" w:date="2025-08-26T16:51:00Z" w16du:dateUtc="2025-08-27T00:51:00Z">
+      <w:ins w:id="48" w:author="Daniel Schindler" w:date="2025-08-26T16:51:00Z" w16du:dateUtc="2025-08-27T00:51:00Z">
         <w:r>
           <w:rPr>
             <w:rFonts w:ascii="Garamond" w:hAnsi="Garamond"/>
@@ -7972,6 +8168,7 @@
           <w:sz w:val="22"/>
           <w:szCs w:val="22"/>
         </w:rPr>
+        <w:lastRenderedPageBreak/>
         <w:t>Importantly, this pattern is independent of overall run contribution.</w:t>
       </w:r>
       <w:r>
@@ -8047,7 +8244,6 @@
           <w:sz w:val="22"/>
           <w:szCs w:val="22"/>
         </w:rPr>
-        <w:lastRenderedPageBreak/>
         <w:t>Despite</w:t>
       </w:r>
       <w:r>
@@ -8186,7 +8382,7 @@
         </w:rPr>
         <w:t xml:space="preserve">These results suggest a potential limitation of a fixed date closure and highlights the difficulty of managing for dynamic ecosystem with fixed duration management. A more dynamic closure which is responsive to predicted or observed run dynamics may provide more consistent protection to upstream stocks. </w:t>
       </w:r>
-      <w:ins w:id="50" w:author="Daniel Schindler" w:date="2025-08-26T17:06:00Z" w16du:dateUtc="2025-08-27T01:06:00Z">
+      <w:ins w:id="49" w:author="Daniel Schindler" w:date="2025-08-26T17:06:00Z" w16du:dateUtc="2025-08-27T01:06:00Z">
         <w:r>
           <w:rPr>
             <w:rFonts w:ascii="Garamond" w:hAnsi="Garamond"/>
@@ -8196,7 +8392,7 @@
           <w:t>However, assessi</w:t>
         </w:r>
       </w:ins>
-      <w:ins w:id="51" w:author="Daniel Schindler" w:date="2025-08-26T17:07:00Z" w16du:dateUtc="2025-08-27T01:07:00Z">
+      <w:ins w:id="50" w:author="Daniel Schindler" w:date="2025-08-26T17:07:00Z" w16du:dateUtc="2025-08-27T01:07:00Z">
         <w:r>
           <w:rPr>
             <w:rFonts w:ascii="Garamond" w:hAnsi="Garamond"/>
@@ -8206,7 +8402,7 @@
           <w:t>ng</w:t>
         </w:r>
       </w:ins>
-      <w:ins w:id="52" w:author="Daniel Schindler" w:date="2025-08-26T17:06:00Z" w16du:dateUtc="2025-08-27T01:06:00Z">
+      <w:ins w:id="51" w:author="Daniel Schindler" w:date="2025-08-26T17:06:00Z" w16du:dateUtc="2025-08-27T01:06:00Z">
         <w:r>
           <w:rPr>
             <w:rFonts w:ascii="Garamond" w:hAnsi="Garamond"/>
@@ -8216,7 +8412,7 @@
           <w:t xml:space="preserve"> stock-specific run strength in-season is </w:t>
         </w:r>
       </w:ins>
-      <w:ins w:id="53" w:author="Daniel Schindler" w:date="2025-08-26T17:07:00Z" w16du:dateUtc="2025-08-27T01:07:00Z">
+      <w:ins w:id="52" w:author="Daniel Schindler" w:date="2025-08-26T17:07:00Z" w16du:dateUtc="2025-08-27T01:07:00Z">
         <w:r>
           <w:rPr>
             <w:rFonts w:ascii="Garamond" w:hAnsi="Garamond"/>
@@ -8226,7 +8422,7 @@
           <w:t xml:space="preserve">currently </w:t>
         </w:r>
       </w:ins>
-      <w:ins w:id="54" w:author="Daniel Schindler" w:date="2025-08-26T17:06:00Z" w16du:dateUtc="2025-08-27T01:06:00Z">
+      <w:ins w:id="53" w:author="Daniel Schindler" w:date="2025-08-26T17:06:00Z" w16du:dateUtc="2025-08-27T01:06:00Z">
         <w:r>
           <w:rPr>
             <w:rFonts w:ascii="Garamond" w:hAnsi="Garamond"/>
@@ -8245,7 +8441,7 @@
           <w:t>possible</w:t>
         </w:r>
       </w:ins>
-      <w:ins w:id="55" w:author="Daniel Schindler" w:date="2025-08-26T17:07:00Z" w16du:dateUtc="2025-08-27T01:07:00Z">
+      <w:ins w:id="54" w:author="Daniel Schindler" w:date="2025-08-26T17:07:00Z" w16du:dateUtc="2025-08-27T01:07:00Z">
         <w:r>
           <w:rPr>
             <w:rFonts w:ascii="Garamond" w:hAnsi="Garamond"/>
@@ -8263,7 +8459,7 @@
         <w:spacing w:line="480" w:lineRule="auto"/>
         <w:ind w:firstLine="720"/>
         <w:rPr>
-          <w:ins w:id="56" w:author="Daniel Schindler" w:date="2025-08-26T17:14:00Z" w16du:dateUtc="2025-08-27T01:14:00Z"/>
+          <w:ins w:id="55" w:author="Daniel Schindler" w:date="2025-08-26T17:14:00Z" w16du:dateUtc="2025-08-27T01:14:00Z"/>
         </w:rPr>
       </w:pPr>
       <w:r>
@@ -8402,9 +8598,18 @@
           <w:sz w:val="22"/>
           <w:szCs w:val="22"/>
         </w:rPr>
-        <w:t xml:space="preserve">Given growing global resource needs and increased uncertainty under novel climate regimes, </w:t>
-      </w:r>
-      <w:del w:id="57" w:author="Daniel Schindler" w:date="2025-08-26T17:08:00Z" w16du:dateUtc="2025-08-27T01:08:00Z">
+        <w:t xml:space="preserve">Given growing global resource needs and increased uncertainty </w:t>
+      </w:r>
+      <w:r>
+        <w:rPr>
+          <w:rFonts w:ascii="Garamond" w:hAnsi="Garamond"/>
+          <w:sz w:val="22"/>
+          <w:szCs w:val="22"/>
+        </w:rPr>
+        <w:lastRenderedPageBreak/>
+        <w:t xml:space="preserve">under novel climate regimes, </w:t>
+      </w:r>
+      <w:del w:id="56" w:author="Daniel Schindler" w:date="2025-08-26T17:08:00Z" w16du:dateUtc="2025-08-27T01:08:00Z">
         <w:r>
           <w:rPr>
             <w:rFonts w:ascii="Garamond" w:hAnsi="Garamond"/>
@@ -8414,7 +8619,7 @@
           <w:delText xml:space="preserve">understanding </w:delText>
         </w:r>
       </w:del>
-      <w:ins w:id="58" w:author="Daniel Schindler" w:date="2025-08-26T17:08:00Z" w16du:dateUtc="2025-08-27T01:08:00Z">
+      <w:ins w:id="57" w:author="Daniel Schindler" w:date="2025-08-26T17:08:00Z" w16du:dateUtc="2025-08-27T01:08:00Z">
         <w:r>
           <w:rPr>
             <w:rFonts w:ascii="Garamond" w:hAnsi="Garamond"/>
@@ -8440,7 +8645,7 @@
         </w:rPr>
         <w:t>methods to</w:t>
       </w:r>
-      <w:ins w:id="59" w:author="Daniel Schindler" w:date="2025-08-26T17:08:00Z" w16du:dateUtc="2025-08-27T01:08:00Z">
+      <w:ins w:id="58" w:author="Daniel Schindler" w:date="2025-08-26T17:08:00Z" w16du:dateUtc="2025-08-27T01:08:00Z">
         <w:r>
           <w:rPr>
             <w:rFonts w:ascii="Garamond" w:hAnsi="Garamond"/>
@@ -8450,7 +8655,7 @@
           <w:t xml:space="preserve"> conserve</w:t>
         </w:r>
       </w:ins>
-      <w:del w:id="60" w:author="Daniel Schindler" w:date="2025-08-26T17:08:00Z" w16du:dateUtc="2025-08-27T01:08:00Z">
+      <w:del w:id="59" w:author="Daniel Schindler" w:date="2025-08-26T17:08:00Z" w16du:dateUtc="2025-08-27T01:08:00Z">
         <w:r>
           <w:rPr>
             <w:rFonts w:ascii="Garamond" w:hAnsi="Garamond"/>
@@ -8483,22 +8688,22 @@
           <w:szCs w:val="22"/>
         </w:rPr>
       </w:pPr>
-      <w:ins w:id="61" w:author="Daniel Schindler" w:date="2025-08-26T17:14:00Z" w16du:dateUtc="2025-08-27T01:14:00Z">
+      <w:ins w:id="60" w:author="Daniel Schindler" w:date="2025-08-26T17:14:00Z" w16du:dateUtc="2025-08-27T01:14:00Z">
         <w:r>
           <w:t>One</w:t>
         </w:r>
       </w:ins>
-      <w:ins w:id="62" w:author="Daniel Schindler" w:date="2025-08-26T17:15:00Z" w16du:dateUtc="2025-08-27T01:15:00Z">
+      <w:ins w:id="61" w:author="Daniel Schindler" w:date="2025-08-26T17:15:00Z" w16du:dateUtc="2025-08-27T01:15:00Z">
         <w:r>
           <w:t xml:space="preserve"> thing to consider is that if there is rough number of fish that the subsistence fisheries want to harvest, front end closures </w:t>
         </w:r>
       </w:ins>
-      <w:ins w:id="63" w:author="Daniel Schindler" w:date="2025-08-26T17:16:00Z" w16du:dateUtc="2025-08-27T01:16:00Z">
+      <w:ins w:id="62" w:author="Daniel Schindler" w:date="2025-08-26T17:16:00Z" w16du:dateUtc="2025-08-27T01:16:00Z">
         <w:r>
           <w:t>could</w:t>
         </w:r>
       </w:ins>
-      <w:ins w:id="64" w:author="Daniel Schindler" w:date="2025-08-26T17:15:00Z" w16du:dateUtc="2025-08-27T01:15:00Z">
+      <w:ins w:id="63" w:author="Daniel Schindler" w:date="2025-08-26T17:15:00Z" w16du:dateUtc="2025-08-27T01:15:00Z">
         <w:r>
           <w:t xml:space="preserve"> </w:t>
         </w:r>
@@ -8508,7 +8713,7 @@
         </w:r>
       </w:ins>
       <w:proofErr w:type="gramEnd"/>
-      <w:ins w:id="65" w:author="Daniel Schindler" w:date="2025-08-26T17:16:00Z" w16du:dateUtc="2025-08-27T01:16:00Z">
+      <w:ins w:id="64" w:author="Daniel Schindler" w:date="2025-08-26T17:16:00Z" w16du:dateUtc="2025-08-27T01:16:00Z">
         <w:r>
           <w:t xml:space="preserve"> in overharvest of late running stocks.</w:t>
         </w:r>
@@ -8529,7 +8734,55 @@
 
 <file path=word/comments.xml><?xml version="1.0" encoding="utf-8"?>
 <w:comments xmlns:wpc="http://schemas.microsoft.com/office/word/2010/wordprocessingCanvas" xmlns:cx="http://schemas.microsoft.com/office/drawing/2014/chartex" xmlns:cx1="http://schemas.microsoft.com/office/drawing/2015/9/8/chartex" xmlns:cx2="http://schemas.microsoft.com/office/drawing/2015/10/21/chartex" xmlns:cx3="http://schemas.microsoft.com/office/drawing/2016/5/9/chartex" xmlns:cx4="http://schemas.microsoft.com/office/drawing/2016/5/10/chartex" xmlns:cx5="http://schemas.microsoft.com/office/drawing/2016/5/11/chartex" xmlns:cx6="http://schemas.microsoft.com/office/drawing/2016/5/12/chartex" xmlns:cx7="http://schemas.microsoft.com/office/drawing/2016/5/13/chartex" xmlns:cx8="http://schemas.microsoft.com/office/drawing/2016/5/14/chartex" xmlns:mc="http://schemas.openxmlformats.org/markup-compatibility/2006" xmlns:aink="http://schemas.microsoft.com/office/drawing/2016/ink" xmlns:am3d="http://schemas.microsoft.com/office/drawing/2017/model3d" xmlns:o="urn:schemas-microsoft-com:office:office" xmlns:oel="http://schemas.microsoft.com/office/2019/extlst" xmlns:r="http://schemas.openxmlformats.org/officeDocument/2006/relationships" xmlns:m="http://schemas.openxmlformats.org/officeDocument/2006/math" xmlns:v="urn:schemas-microsoft-com:vml" xmlns:wp14="http://schemas.microsoft.com/office/word/2010/wordprocessingDrawing" xmlns:wp="http://schemas.openxmlformats.org/drawingml/2006/wordprocessingDrawing" xmlns:w10="urn:schemas-microsoft-com:office:word" xmlns:w="http://schemas.openxmlformats.org/wordprocessingml/2006/main" xmlns:w14="http://schemas.microsoft.com/office/word/2010/wordml" xmlns:w15="http://schemas.microsoft.com/office/word/2012/wordml" xmlns:w16cex="http://schemas.microsoft.com/office/word/2018/wordml/cex" xmlns:w16cid="http://schemas.microsoft.com/office/word/2016/wordml/cid" xmlns:w16="http://schemas.microsoft.com/office/word/2018/wordml" xmlns:w16du="http://schemas.microsoft.com/office/word/2023/wordml/word16du" xmlns:w16sdtdh="http://schemas.microsoft.com/office/word/2020/wordml/sdtdatahash" xmlns:w16sdtfl="http://schemas.microsoft.com/office/word/2024/wordml/sdtformatlock" xmlns:w16se="http://schemas.microsoft.com/office/word/2015/wordml/symex" xmlns:wpg="http://schemas.microsoft.com/office/word/2010/wordprocessingGroup" xmlns:wpi="http://schemas.microsoft.com/office/word/2010/wordprocessingInk" xmlns:wne="http://schemas.microsoft.com/office/word/2006/wordml" xmlns:wps="http://schemas.microsoft.com/office/word/2010/wordprocessingShape" mc:Ignorable="w14 w15 w16se w16cid w16 w16cex w16sdtdh w16sdtfl w16du wp14">
-  <w:comment w:id="0" w:author="Benjamin J. Makhlouf" w:date="2025-07-26T11:23:00Z" w:initials="b">
+  <w:comment w:id="6" w:author="Daniel Schindler" w:date="2025-08-26T15:44:00Z" w:initials="DS">
+    <w:p>
+      <w:pPr>
+        <w:pStyle w:val="CommentText"/>
+      </w:pPr>
+      <w:r>
+        <w:rPr>
+          <w:rStyle w:val="CommentReference"/>
+        </w:rPr>
+        <w:annotationRef/>
+      </w:r>
+      <w:r>
+        <w:t>This is a better paper to cite as an example of fisheries benefitting from pop diversity</w:t>
+      </w:r>
+    </w:p>
+  </w:comment>
+  <w:comment w:id="7" w:author="Daniel Schindler" w:date="2025-08-26T15:57:00Z" w:initials="DS">
+    <w:p>
+      <w:pPr>
+        <w:pStyle w:val="CommentText"/>
+      </w:pPr>
+      <w:r>
+        <w:rPr>
+          <w:rStyle w:val="CommentReference"/>
+        </w:rPr>
+        <w:annotationRef/>
+      </w:r>
+      <w:r>
+        <w:t>I think make this paragraph more general to salmon. Then the next one can be about western Alaska and the Kusko</w:t>
+      </w:r>
+    </w:p>
+  </w:comment>
+  <w:comment w:id="11" w:author="Daniel Schindler" w:date="2025-08-26T16:00:00Z" w:initials="DS">
+    <w:p>
+      <w:pPr>
+        <w:pStyle w:val="CommentText"/>
+      </w:pPr>
+      <w:r>
+        <w:rPr>
+          <w:rStyle w:val="CommentReference"/>
+        </w:rPr>
+        <w:annotationRef/>
+      </w:r>
+      <w:r>
+        <w:t>Better to write topic sentences that are explicit enough that they stand-alone. As written, this topic sentence refers to the previous paragraph.</w:t>
+      </w:r>
+    </w:p>
+  </w:comment>
+  <w:comment w:id="18" w:author="Benjamin J. Makhlouf" w:date="2025-08-05T16:24:00Z" w:initials="b">
     <w:p>
       <w:r>
         <w:rPr>
@@ -8542,11 +8795,11 @@
           <w:sz w:val="20"/>
           <w:szCs w:val="20"/>
         </w:rPr>
-        <w:t xml:space="preserve">Thoughts on others to add? </w:t>
+        <w:t>But only above Bethel? i.e not the eek?</w:t>
       </w:r>
     </w:p>
   </w:comment>
-  <w:comment w:id="1" w:author="Daniel Schindler" w:date="2025-08-26T15:44:00Z" w:initials="DS">
+  <w:comment w:id="19" w:author="Daniel Schindler" w:date="2025-08-26T16:11:00Z" w:initials="DS">
     <w:p>
       <w:pPr>
         <w:pStyle w:val="CommentText"/>
@@ -8558,15 +8811,12 @@
         <w:annotationRef/>
       </w:r>
       <w:r>
-        <w:t>We should offer to Kevin Whitworth (KRITFC) and Spencer Reardon UWFWS) and see if they are interested in joining in.,</w:t>
+        <w:t>yes</w:t>
       </w:r>
     </w:p>
   </w:comment>
-  <w:comment w:id="7" w:author="Daniel Schindler" w:date="2025-08-26T15:44:00Z" w:initials="DS">
+  <w:comment w:id="22" w:author="Benjamin J. Makhlouf" w:date="2025-08-05T16:27:00Z" w:initials="b">
     <w:p>
-      <w:pPr>
-        <w:pStyle w:val="CommentText"/>
-      </w:pPr>
       <w:r>
         <w:rPr>
           <w:rStyle w:val="CommentReference"/>
@@ -8574,11 +8824,15 @@
         <w:annotationRef/>
       </w:r>
       <w:r>
-        <w:t>This is a better paper to cite as an example of fisheries benefitting from pop diversity</w:t>
+        <w:rPr>
+          <w:sz w:val="20"/>
+          <w:szCs w:val="20"/>
+        </w:rPr>
+        <w:t>Is it worth having this as a figure since it's in French et al</w:t>
       </w:r>
     </w:p>
   </w:comment>
-  <w:comment w:id="8" w:author="Daniel Schindler" w:date="2025-08-26T15:57:00Z" w:initials="DS">
+  <w:comment w:id="23" w:author="Daniel Schindler" w:date="2025-08-26T16:16:00Z" w:initials="DS">
     <w:p>
       <w:pPr>
         <w:pStyle w:val="CommentText"/>
@@ -8590,15 +8844,12 @@
         <w:annotationRef/>
       </w:r>
       <w:r>
-        <w:t>I think make this paragraph more general to salmon. Then the next one can be about western Alaska and the Kusko</w:t>
+        <w:t>I think it is. Its pretty squished into the French paper</w:t>
       </w:r>
     </w:p>
   </w:comment>
-  <w:comment w:id="12" w:author="Daniel Schindler" w:date="2025-08-26T16:00:00Z" w:initials="DS">
+  <w:comment w:id="29" w:author="Benjamin J. Makhlouf" w:date="2025-07-30T08:26:00Z" w:initials="b">
     <w:p>
-      <w:pPr>
-        <w:pStyle w:val="CommentText"/>
-      </w:pPr>
       <w:r>
         <w:rPr>
           <w:rStyle w:val="CommentReference"/>
@@ -8606,11 +8857,31 @@
         <w:annotationRef/>
       </w:r>
       <w:r>
-        <w:t>Better to write topic sentences that are explicit enough that they stand-alone. As written, this topic sentence refers to the previous paragraph.</w:t>
+        <w:rPr>
+          <w:sz w:val="20"/>
+          <w:szCs w:val="20"/>
+        </w:rPr>
+        <w:t>We run into the same problem as the last paper where it is very unclear how this habitat prior is made (other than shutting off the eek). I can reasonably assume it's the same as the Yukon, but I don't know. How much detail do you think we need here?</w:t>
       </w:r>
     </w:p>
   </w:comment>
-  <w:comment w:id="19" w:author="Benjamin J. Makhlouf" w:date="2025-08-05T16:24:00Z" w:initials="b">
+  <w:comment w:id="30" w:author="Daniel Schindler" w:date="2025-08-26T16:26:00Z" w:initials="DS">
+    <w:p>
+      <w:pPr>
+        <w:pStyle w:val="CommentText"/>
+      </w:pPr>
+      <w:r>
+        <w:rPr>
+          <w:rStyle w:val="CommentReference"/>
+        </w:rPr>
+        <w:annotationRef/>
+      </w:r>
+      <w:r>
+        <w:t>I think just state what the assumption is and run with it. I think it’s a reasonable assumption knowing what we do about Chinook</w:t>
+      </w:r>
+    </w:p>
+  </w:comment>
+  <w:comment w:id="32" w:author="Benjamin J. Makhlouf" w:date="2025-07-30T10:53:00Z" w:initials="b">
     <w:p>
       <w:r>
         <w:rPr>
@@ -8623,11 +8894,11 @@
           <w:sz w:val="20"/>
           <w:szCs w:val="20"/>
         </w:rPr>
-        <w:t>But only above Bethel? i.e not the eek?</w:t>
+        <w:t>The map we used to pull these rivers is on an adfg web page but I cant track it to a publication</w:t>
       </w:r>
     </w:p>
   </w:comment>
-  <w:comment w:id="20" w:author="Daniel Schindler" w:date="2025-08-26T16:11:00Z" w:initials="DS">
+  <w:comment w:id="33" w:author="Daniel Schindler" w:date="2025-08-26T16:33:00Z" w:initials="DS">
     <w:p>
       <w:pPr>
         <w:pStyle w:val="CommentText"/>
@@ -8639,110 +8910,11 @@
         <w:annotationRef/>
       </w:r>
       <w:r>
-        <w:t>yes</w:t>
+        <w:t>Zach can point us to the correct documentation</w:t>
       </w:r>
     </w:p>
   </w:comment>
-  <w:comment w:id="23" w:author="Benjamin J. Makhlouf" w:date="2025-08-05T16:27:00Z" w:initials="b">
-    <w:p>
-      <w:r>
-        <w:rPr>
-          <w:rStyle w:val="CommentReference"/>
-        </w:rPr>
-        <w:annotationRef/>
-      </w:r>
-      <w:r>
-        <w:rPr>
-          <w:sz w:val="20"/>
-          <w:szCs w:val="20"/>
-        </w:rPr>
-        <w:t>Is it worth having this as a figure since it's in French et al</w:t>
-      </w:r>
-    </w:p>
-  </w:comment>
-  <w:comment w:id="24" w:author="Daniel Schindler" w:date="2025-08-26T16:16:00Z" w:initials="DS">
-    <w:p>
-      <w:pPr>
-        <w:pStyle w:val="CommentText"/>
-      </w:pPr>
-      <w:r>
-        <w:rPr>
-          <w:rStyle w:val="CommentReference"/>
-        </w:rPr>
-        <w:annotationRef/>
-      </w:r>
-      <w:r>
-        <w:t>I think it is. Its pretty squished into the French paper</w:t>
-      </w:r>
-    </w:p>
-  </w:comment>
-  <w:comment w:id="30" w:author="Benjamin J. Makhlouf" w:date="2025-07-30T08:26:00Z" w:initials="b">
-    <w:p>
-      <w:r>
-        <w:rPr>
-          <w:rStyle w:val="CommentReference"/>
-        </w:rPr>
-        <w:annotationRef/>
-      </w:r>
-      <w:r>
-        <w:rPr>
-          <w:sz w:val="20"/>
-          <w:szCs w:val="20"/>
-        </w:rPr>
-        <w:t>We run into the same problem as the last paper where it is very unclear how this habitat prior is made (other than shutting off the eek). I can reasonably assume it's the same as the Yukon, but I don't know. How much detail do you think we need here?</w:t>
-      </w:r>
-    </w:p>
-  </w:comment>
-  <w:comment w:id="31" w:author="Daniel Schindler" w:date="2025-08-26T16:26:00Z" w:initials="DS">
-    <w:p>
-      <w:pPr>
-        <w:pStyle w:val="CommentText"/>
-      </w:pPr>
-      <w:r>
-        <w:rPr>
-          <w:rStyle w:val="CommentReference"/>
-        </w:rPr>
-        <w:annotationRef/>
-      </w:r>
-      <w:r>
-        <w:t>I think just state what the assumption is and run with it. I think it’s a reasonable assumption knowing what we do about Chinook</w:t>
-      </w:r>
-    </w:p>
-  </w:comment>
-  <w:comment w:id="33" w:author="Benjamin J. Makhlouf" w:date="2025-07-30T10:53:00Z" w:initials="b">
-    <w:p>
-      <w:r>
-        <w:rPr>
-          <w:rStyle w:val="CommentReference"/>
-        </w:rPr>
-        <w:annotationRef/>
-      </w:r>
-      <w:r>
-        <w:rPr>
-          <w:sz w:val="20"/>
-          <w:szCs w:val="20"/>
-        </w:rPr>
-        <w:t>The map we used to pull these rivers is on an adfg web page but I cant track it to a publication</w:t>
-      </w:r>
-    </w:p>
-  </w:comment>
-  <w:comment w:id="34" w:author="Daniel Schindler" w:date="2025-08-26T16:33:00Z" w:initials="DS">
-    <w:p>
-      <w:pPr>
-        <w:pStyle w:val="CommentText"/>
-      </w:pPr>
-      <w:r>
-        <w:rPr>
-          <w:rStyle w:val="CommentReference"/>
-        </w:rPr>
-        <w:annotationRef/>
-      </w:r>
-      <w:r>
-        <w:t>Zach can point us to the correct documentation</w:t>
-      </w:r>
-    </w:p>
-  </w:comment>
-  <w:comment w:id="37" w:author="Daniel Schindler" w:date="2025-08-26T16:38:00Z" w:initials="DS">
+  <w:comment w:id="36" w:author="Daniel Schindler" w:date="2025-08-26T16:38:00Z" w:initials="DS">
     <w:p>
       <w:pPr>
         <w:pStyle w:val="CommentText"/>
@@ -8763,8 +8935,6 @@
 
 <file path=word/commentsExtended.xml><?xml version="1.0" encoding="utf-8"?>
 <w15:commentsEx xmlns:wpc="http://schemas.microsoft.com/office/word/2010/wordprocessingCanvas" xmlns:cx="http://schemas.microsoft.com/office/drawing/2014/chartex" xmlns:cx1="http://schemas.microsoft.com/office/drawing/2015/9/8/chartex" xmlns:cx2="http://schemas.microsoft.com/office/drawing/2015/10/21/chartex" xmlns:cx3="http://schemas.microsoft.com/office/drawing/2016/5/9/chartex" xmlns:cx4="http://schemas.microsoft.com/office/drawing/2016/5/10/chartex" xmlns:cx5="http://schemas.microsoft.com/office/drawing/2016/5/11/chartex" xmlns:cx6="http://schemas.microsoft.com/office/drawing/2016/5/12/chartex" xmlns:cx7="http://schemas.microsoft.com/office/drawing/2016/5/13/chartex" xmlns:cx8="http://schemas.microsoft.com/office/drawing/2016/5/14/chartex" xmlns:mc="http://schemas.openxmlformats.org/markup-compatibility/2006" xmlns:aink="http://schemas.microsoft.com/office/drawing/2016/ink" xmlns:am3d="http://schemas.microsoft.com/office/drawing/2017/model3d" xmlns:o="urn:schemas-microsoft-com:office:office" xmlns:oel="http://schemas.microsoft.com/office/2019/extlst" xmlns:r="http://schemas.openxmlformats.org/officeDocument/2006/relationships" xmlns:m="http://schemas.openxmlformats.org/officeDocument/2006/math" xmlns:v="urn:schemas-microsoft-com:vml" xmlns:wp14="http://schemas.microsoft.com/office/word/2010/wordprocessingDrawing" xmlns:wp="http://schemas.openxmlformats.org/drawingml/2006/wordprocessingDrawing" xmlns:w10="urn:schemas-microsoft-com:office:word" xmlns:w="http://schemas.openxmlformats.org/wordprocessingml/2006/main" xmlns:w14="http://schemas.microsoft.com/office/word/2010/wordml" xmlns:w15="http://schemas.microsoft.com/office/word/2012/wordml" xmlns:w16cex="http://schemas.microsoft.com/office/word/2018/wordml/cex" xmlns:w16cid="http://schemas.microsoft.com/office/word/2016/wordml/cid" xmlns:w16="http://schemas.microsoft.com/office/word/2018/wordml" xmlns:w16du="http://schemas.microsoft.com/office/word/2023/wordml/word16du" xmlns:w16sdtdh="http://schemas.microsoft.com/office/word/2020/wordml/sdtdatahash" xmlns:w16sdtfl="http://schemas.microsoft.com/office/word/2024/wordml/sdtformatlock" xmlns:w16se="http://schemas.microsoft.com/office/word/2015/wordml/symex" xmlns:wpg="http://schemas.microsoft.com/office/word/2010/wordprocessingGroup" xmlns:wpi="http://schemas.microsoft.com/office/word/2010/wordprocessingInk" xmlns:wne="http://schemas.microsoft.com/office/word/2006/wordml" xmlns:wps="http://schemas.microsoft.com/office/word/2010/wordprocessingShape" mc:Ignorable="w14 w15 w16se w16cid w16 w16cex w16sdtdh w16sdtfl w16du wp14">
-  <w15:commentEx w15:paraId="545E12D6" w15:done="0"/>
-  <w15:commentEx w15:paraId="783115AD" w15:paraIdParent="545E12D6" w15:done="0"/>
   <w15:commentEx w15:paraId="399F0CFF" w15:done="1"/>
   <w15:commentEx w15:paraId="6A43EA9D" w15:done="0"/>
   <w15:commentEx w15:paraId="39BC305D" w15:done="0"/>
@@ -8782,8 +8952,6 @@
 
 <file path=word/commentsExtensible.xml><?xml version="1.0" encoding="utf-8"?>
 <w16cex:commentsExtensible xmlns:wpc="http://schemas.microsoft.com/office/word/2010/wordprocessingCanvas" xmlns:cx="http://schemas.microsoft.com/office/drawing/2014/chartex" xmlns:cx1="http://schemas.microsoft.com/office/drawing/2015/9/8/chartex" xmlns:cx2="http://schemas.microsoft.com/office/drawing/2015/10/21/chartex" xmlns:cx3="http://schemas.microsoft.com/office/drawing/2016/5/9/chartex" xmlns:cx4="http://schemas.microsoft.com/office/drawing/2016/5/10/chartex" xmlns:cx5="http://schemas.microsoft.com/office/drawing/2016/5/11/chartex" xmlns:cx6="http://schemas.microsoft.com/office/drawing/2016/5/12/chartex" xmlns:cx7="http://schemas.microsoft.com/office/drawing/2016/5/13/chartex" xmlns:cx8="http://schemas.microsoft.com/office/drawing/2016/5/14/chartex" xmlns:cr="http://schemas.microsoft.com/office/comments/2020/reactions" xmlns:mc="http://schemas.openxmlformats.org/markup-compatibility/2006" xmlns:aink="http://schemas.microsoft.com/office/drawing/2016/ink" xmlns:am3d="http://schemas.microsoft.com/office/drawing/2017/model3d" xmlns:o="urn:schemas-microsoft-com:office:office" xmlns:oel="http://schemas.microsoft.com/office/2019/extlst" xmlns:r="http://schemas.openxmlformats.org/officeDocument/2006/relationships" xmlns:m="http://schemas.openxmlformats.org/officeDocument/2006/math" xmlns:v="urn:schemas-microsoft-com:vml" xmlns:wp14="http://schemas.microsoft.com/office/word/2010/wordprocessingDrawing" xmlns:wp="http://schemas.openxmlformats.org/drawingml/2006/wordprocessingDrawing" xmlns:w10="urn:schemas-microsoft-com:office:word" xmlns:w="http://schemas.openxmlformats.org/wordprocessingml/2006/main" xmlns:w14="http://schemas.microsoft.com/office/word/2010/wordml" xmlns:w15="http://schemas.microsoft.com/office/word/2012/wordml" xmlns:w16cex="http://schemas.microsoft.com/office/word/2018/wordml/cex" xmlns:w16cid="http://schemas.microsoft.com/office/word/2016/wordml/cid" xmlns:w16="http://schemas.microsoft.com/office/word/2018/wordml" xmlns:w16du="http://schemas.microsoft.com/office/word/2023/wordml/word16du" xmlns:w16sdtdh="http://schemas.microsoft.com/office/word/2020/wordml/sdtdatahash" xmlns:w16sdtfl="http://schemas.microsoft.com/office/word/2024/wordml/sdtformatlock" xmlns:w16se="http://schemas.microsoft.com/office/word/2015/wordml/symex" xmlns:wpg="http://schemas.microsoft.com/office/word/2010/wordprocessingGroup" xmlns:wpi="http://schemas.microsoft.com/office/word/2010/wordprocessingInk" xmlns:wne="http://schemas.microsoft.com/office/word/2006/wordml" xmlns:wps="http://schemas.microsoft.com/office/word/2010/wordprocessingShape" mc:Ignorable="w14 w15 w16se w16cid w16 w16cex w16sdtdh w16sdtfl cr w16du wp14">
-  <w16cex:commentExtensible w16cex:durableId="0AF9D5BC" w16cex:dateUtc="2025-07-26T18:23:00Z"/>
-  <w16cex:commentExtensible w16cex:durableId="165E24A4" w16cex:dateUtc="2025-08-26T23:44:00Z"/>
   <w16cex:commentExtensible w16cex:durableId="4F8011AF" w16cex:dateUtc="2025-08-26T23:44:00Z"/>
   <w16cex:commentExtensible w16cex:durableId="76C28745" w16cex:dateUtc="2025-08-26T23:57:00Z"/>
   <w16cex:commentExtensible w16cex:durableId="26A86733" w16cex:dateUtc="2025-08-27T00:00:00Z"/>
@@ -8801,8 +8969,6 @@
 
 <file path=word/commentsIds.xml><?xml version="1.0" encoding="utf-8"?>
 <w16cid:commentsIds xmlns:wpc="http://schemas.microsoft.com/office/word/2010/wordprocessingCanvas" xmlns:cx="http://schemas.microsoft.com/office/drawing/2014/chartex" xmlns:cx1="http://schemas.microsoft.com/office/drawing/2015/9/8/chartex" xmlns:cx2="http://schemas.microsoft.com/office/drawing/2015/10/21/chartex" xmlns:cx3="http://schemas.microsoft.com/office/drawing/2016/5/9/chartex" xmlns:cx4="http://schemas.microsoft.com/office/drawing/2016/5/10/chartex" xmlns:cx5="http://schemas.microsoft.com/office/drawing/2016/5/11/chartex" xmlns:cx6="http://schemas.microsoft.com/office/drawing/2016/5/12/chartex" xmlns:cx7="http://schemas.microsoft.com/office/drawing/2016/5/13/chartex" xmlns:cx8="http://schemas.microsoft.com/office/drawing/2016/5/14/chartex" xmlns:mc="http://schemas.openxmlformats.org/markup-compatibility/2006" xmlns:aink="http://schemas.microsoft.com/office/drawing/2016/ink" xmlns:am3d="http://schemas.microsoft.com/office/drawing/2017/model3d" xmlns:o="urn:schemas-microsoft-com:office:office" xmlns:oel="http://schemas.microsoft.com/office/2019/extlst" xmlns:r="http://schemas.openxmlformats.org/officeDocument/2006/relationships" xmlns:m="http://schemas.openxmlformats.org/officeDocument/2006/math" xmlns:v="urn:schemas-microsoft-com:vml" xmlns:wp14="http://schemas.microsoft.com/office/word/2010/wordprocessingDrawing" xmlns:wp="http://schemas.openxmlformats.org/drawingml/2006/wordprocessingDrawing" xmlns:w10="urn:schemas-microsoft-com:office:word" xmlns:w="http://schemas.openxmlformats.org/wordprocessingml/2006/main" xmlns:w14="http://schemas.microsoft.com/office/word/2010/wordml" xmlns:w15="http://schemas.microsoft.com/office/word/2012/wordml" xmlns:w16cex="http://schemas.microsoft.com/office/word/2018/wordml/cex" xmlns:w16cid="http://schemas.microsoft.com/office/word/2016/wordml/cid" xmlns:w16="http://schemas.microsoft.com/office/word/2018/wordml" xmlns:w16du="http://schemas.microsoft.com/office/word/2023/wordml/word16du" xmlns:w16sdtdh="http://schemas.microsoft.com/office/word/2020/wordml/sdtdatahash" xmlns:w16sdtfl="http://schemas.microsoft.com/office/word/2024/wordml/sdtformatlock" xmlns:w16se="http://schemas.microsoft.com/office/word/2015/wordml/symex" xmlns:wpg="http://schemas.microsoft.com/office/word/2010/wordprocessingGroup" xmlns:wpi="http://schemas.microsoft.com/office/word/2010/wordprocessingInk" xmlns:wne="http://schemas.microsoft.com/office/word/2006/wordml" xmlns:wps="http://schemas.microsoft.com/office/word/2010/wordprocessingShape" mc:Ignorable="w14 w15 w16se w16cid w16 w16cex w16sdtdh w16sdtfl w16du wp14">
-  <w16cid:commentId w16cid:paraId="545E12D6" w16cid:durableId="0AF9D5BC"/>
-  <w16cid:commentId w16cid:paraId="783115AD" w16cid:durableId="165E24A4"/>
   <w16cid:commentId w16cid:paraId="399F0CFF" w16cid:durableId="4F8011AF"/>
   <w16cid:commentId w16cid:paraId="6A43EA9D" w16cid:durableId="76C28745"/>
   <w16cid:commentId w16cid:paraId="39BC305D" w16cid:durableId="26A86733"/>

</xml_diff>

<commit_message>
updated docs to be the correct updated Run_timing_manuscript
</commit_message>
<xml_diff>
--- a/Docs/Run_timing_manuscript.docx
+++ b/Docs/Run_timing_manuscript.docx
@@ -74,6 +74,33 @@
         <w:jc w:val="center"/>
         <w:rPr>
           <w:rFonts w:ascii="Garamond" w:hAnsi="Garamond"/>
+          <w:sz w:val="20"/>
+          <w:szCs w:val="20"/>
+        </w:rPr>
+      </w:pPr>
+      <w:r>
+        <w:rPr>
+          <w:rFonts w:ascii="Garamond" w:hAnsi="Garamond"/>
+          <w:sz w:val="20"/>
+          <w:szCs w:val="20"/>
+        </w:rPr>
+        <w:t>Ben Makhlouf, Daniel Schindler, Tim Cline, Zach Liller, Sean Larson</w:t>
+      </w:r>
+      <w:r>
+        <w:rPr>
+          <w:rFonts w:ascii="Garamond" w:hAnsi="Garamond"/>
+          <w:sz w:val="20"/>
+          <w:szCs w:val="20"/>
+        </w:rPr>
+        <w:t>, Kevin Whitworth, Spencer Reardon</w:t>
+      </w:r>
+    </w:p>
+    <w:p>
+      <w:pPr>
+        <w:suppressLineNumbers/>
+        <w:jc w:val="center"/>
+        <w:rPr>
+          <w:rFonts w:ascii="Garamond" w:hAnsi="Garamond"/>
           <w:b/>
           <w:bCs/>
           <w:sz w:val="20"/>
@@ -84,46 +111,6 @@
     <w:p>
       <w:pPr>
         <w:suppressLineNumbers/>
-        <w:jc w:val="center"/>
-        <w:rPr>
-          <w:rFonts w:ascii="Garamond" w:hAnsi="Garamond"/>
-          <w:sz w:val="20"/>
-          <w:szCs w:val="20"/>
-        </w:rPr>
-      </w:pPr>
-      <w:r>
-        <w:rPr>
-          <w:rFonts w:ascii="Garamond" w:hAnsi="Garamond"/>
-          <w:sz w:val="20"/>
-          <w:szCs w:val="20"/>
-        </w:rPr>
-        <w:t>Ben Makhlouf, Daniel Schindler, Tim Cline, Zach Liller, Sean Larson</w:t>
-      </w:r>
-      <w:r>
-        <w:rPr>
-          <w:rFonts w:ascii="Garamond" w:hAnsi="Garamond"/>
-          <w:sz w:val="20"/>
-          <w:szCs w:val="20"/>
-        </w:rPr>
-        <w:t>, Kevin Whitworth, Spencer Reardon</w:t>
-      </w:r>
-    </w:p>
-    <w:p>
-      <w:pPr>
-        <w:suppressLineNumbers/>
-        <w:jc w:val="center"/>
-        <w:rPr>
-          <w:rFonts w:ascii="Garamond" w:hAnsi="Garamond"/>
-          <w:b/>
-          <w:bCs/>
-          <w:sz w:val="20"/>
-          <w:szCs w:val="20"/>
-        </w:rPr>
-      </w:pPr>
-    </w:p>
-    <w:p>
-      <w:pPr>
-        <w:suppressLineNumbers/>
         <w:rPr>
           <w:ins w:id="0" w:author="Benjamin J. Makhlouf" w:date="2025-08-27T07:08:00Z" w16du:dateUtc="2025-08-27T14:08:00Z"/>
           <w:rFonts w:ascii="Garamond" w:hAnsi="Garamond"/>
@@ -167,29 +154,39 @@
         <w:ind w:firstLine="720"/>
         <w:rPr>
           <w:rFonts w:ascii="Garamond" w:hAnsi="Garamond"/>
-        </w:rPr>
-      </w:pPr>
-      <w:r>
-        <w:rPr>
-          <w:rFonts w:ascii="Garamond" w:hAnsi="Garamond"/>
+          <w:sz w:val="22"/>
+          <w:szCs w:val="22"/>
+        </w:rPr>
+      </w:pPr>
+      <w:r>
+        <w:rPr>
+          <w:rFonts w:ascii="Garamond" w:hAnsi="Garamond"/>
+          <w:sz w:val="22"/>
+          <w:szCs w:val="22"/>
         </w:rPr>
         <w:t xml:space="preserve">Effective fisheries management requires balancing harvest opportunities with the protection of population biodiversity. Pacific salmon returning to large North American river systems exhibit significant interpopulation variability in return timing and spatial habitat use patterns, which contribute to population resilience. However, these spatiotemporal dynamics are poorly understood, limiting their integration into management strategies. Here, we reconstruct the spatiotemporal dynamics of return timing for Kuskokwim River Chinook salmon across six years using otolith isotope </w:t>
       </w:r>
       <w:r>
         <w:rPr>
           <w:rFonts w:ascii="Garamond" w:hAnsi="Garamond"/>
+          <w:sz w:val="22"/>
+          <w:szCs w:val="22"/>
         </w:rPr>
         <w:t>signatures and</w:t>
       </w:r>
       <w:r>
         <w:rPr>
           <w:rFonts w:ascii="Garamond" w:hAnsi="Garamond"/>
+          <w:sz w:val="22"/>
+          <w:szCs w:val="22"/>
         </w:rPr>
         <w:t xml:space="preserve"> examine the stock-specific impacts of a front-end fishery closure implemented in the basin. We demonstrate a consistent relationship between run timing and watershed position, with earlier returning populations contributing disproportionately to the uppermost portion of the watershed. This trend was consistent when examining relative population contributions within discrete temporal windows during the return migration, as well as in cumulative distribution analyses that controlled for total return abundance. While this spatial pattern was robust, we observed interannual variability in the magnitude of population contributions and overall run timing. The front-end closure strategy provided disproportionately higher protection to upper watershed stocks, thereby preserving upstream population diversity that is critical for stabilizing basin-wide fishery dynamics.</w:t>
       </w:r>
       <w:r>
         <w:rPr>
           <w:rFonts w:ascii="Garamond" w:hAnsi="Garamond"/>
+          <w:sz w:val="22"/>
+          <w:szCs w:val="22"/>
         </w:rPr>
         <w:t xml:space="preserve"> </w:t>
       </w:r>
@@ -229,7 +226,6 @@
           <w:szCs w:val="22"/>
           <w:u w:val="single"/>
         </w:rPr>
-        <w:lastRenderedPageBreak/>
         <w:t xml:space="preserve">Introduction: </w:t>
       </w:r>
       <w:r>
@@ -409,6 +405,7 @@
           <w:sz w:val="22"/>
           <w:szCs w:val="22"/>
         </w:rPr>
+        <w:lastRenderedPageBreak/>
         <w:fldChar w:fldCharType="begin"/>
       </w:r>
       <w:r>
@@ -992,82 +989,15 @@
           <w:sz w:val="22"/>
           <w:szCs w:val="22"/>
         </w:rPr>
-        <w:t xml:space="preserve">Maintaining life history diversity across the full stock complex stabilizes downstream resources by distributing risk across several loosely or negatively correlated populations. Moreover, maximizing diversity in run timing </w:t>
-      </w:r>
-      <w:r>
-        <w:rPr>
-          <w:rFonts w:ascii="Garamond" w:hAnsi="Garamond"/>
-          <w:sz w:val="22"/>
-          <w:szCs w:val="22"/>
-        </w:rPr>
-        <w:t xml:space="preserve">may extend </w:t>
-      </w:r>
-      <w:r>
-        <w:rPr>
-          <w:rFonts w:ascii="Garamond" w:hAnsi="Garamond"/>
-          <w:sz w:val="22"/>
-          <w:szCs w:val="22"/>
-        </w:rPr>
-        <w:t>fishing opportunit</w:t>
-      </w:r>
-      <w:r>
-        <w:rPr>
-          <w:rFonts w:ascii="Garamond" w:hAnsi="Garamond"/>
-          <w:sz w:val="22"/>
-          <w:szCs w:val="22"/>
-        </w:rPr>
-        <w:t>y</w:t>
-      </w:r>
-      <w:r>
-        <w:rPr>
-          <w:rFonts w:ascii="Garamond" w:hAnsi="Garamond"/>
-          <w:sz w:val="22"/>
-          <w:szCs w:val="22"/>
-        </w:rPr>
-        <w:t xml:space="preserve"> by </w:t>
-      </w:r>
-      <w:r>
-        <w:rPr>
-          <w:rFonts w:ascii="Garamond" w:hAnsi="Garamond"/>
-          <w:sz w:val="22"/>
-          <w:szCs w:val="22"/>
-        </w:rPr>
-        <w:t xml:space="preserve">allowing </w:t>
-      </w:r>
-      <w:r>
-        <w:rPr>
-          <w:rFonts w:ascii="Garamond" w:hAnsi="Garamond"/>
-          <w:sz w:val="22"/>
-          <w:szCs w:val="22"/>
-        </w:rPr>
-        <w:t xml:space="preserve">harvest </w:t>
-      </w:r>
-      <w:r>
-        <w:rPr>
-          <w:rFonts w:ascii="Garamond" w:hAnsi="Garamond"/>
-          <w:sz w:val="22"/>
-          <w:szCs w:val="22"/>
-        </w:rPr>
-        <w:t>across several</w:t>
-      </w:r>
-      <w:r>
-        <w:rPr>
-          <w:rFonts w:ascii="Garamond" w:hAnsi="Garamond"/>
-          <w:sz w:val="22"/>
-          <w:szCs w:val="22"/>
-        </w:rPr>
-        <w:t xml:space="preserve"> stock components </w:t>
-      </w:r>
-      <w:r>
-        <w:rPr>
-          <w:rFonts w:ascii="Garamond" w:hAnsi="Garamond"/>
-          <w:sz w:val="22"/>
-          <w:szCs w:val="22"/>
-        </w:rPr>
-        <w:t>migrating at different times in the overall run.</w:t>
-      </w:r>
-      <w:r>
-        <w:t xml:space="preserve"> </w:t>
+        <w:t xml:space="preserve">Maintaining life history diversity across the full stock complex stabilizes downstream resources by distributing risk across several loosely or negatively correlated populations. </w:t>
+      </w:r>
+      <w:r>
+        <w:rPr>
+          <w:rFonts w:ascii="Garamond" w:hAnsi="Garamond"/>
+          <w:sz w:val="22"/>
+          <w:szCs w:val="22"/>
+        </w:rPr>
+        <w:t>Moreover, maximizing diversity in run timing may extend fishing opportunities by allowing harvest of multiple stock components migrating at different times.</w:t>
       </w:r>
     </w:p>
     <w:p>
@@ -1080,112 +1010,14 @@
           <w:szCs w:val="22"/>
         </w:rPr>
       </w:pPr>
-    </w:p>
-    <w:p>
-      <w:pPr>
-        <w:spacing w:line="480" w:lineRule="auto"/>
-        <w:ind w:firstLine="720"/>
-        <w:rPr>
-          <w:rFonts w:ascii="Garamond" w:hAnsi="Garamond"/>
-          <w:sz w:val="22"/>
-          <w:szCs w:val="22"/>
-        </w:rPr>
-      </w:pPr>
-    </w:p>
-    <w:p>
-      <w:pPr>
-        <w:spacing w:line="480" w:lineRule="auto"/>
-        <w:ind w:firstLine="720"/>
-        <w:rPr>
-          <w:rFonts w:ascii="Garamond" w:hAnsi="Garamond"/>
-          <w:sz w:val="22"/>
-          <w:szCs w:val="22"/>
-        </w:rPr>
-      </w:pPr>
-      <w:r>
-        <w:rPr>
-          <w:rFonts w:ascii="Garamond" w:hAnsi="Garamond"/>
-          <w:sz w:val="22"/>
-          <w:szCs w:val="22"/>
-        </w:rPr>
-        <w:lastRenderedPageBreak/>
-        <w:t xml:space="preserve">Maintaining life history diversity </w:t>
-      </w:r>
-      <w:r>
-        <w:rPr>
-          <w:rFonts w:ascii="Garamond" w:hAnsi="Garamond"/>
-          <w:sz w:val="22"/>
-          <w:szCs w:val="22"/>
-        </w:rPr>
-        <w:t xml:space="preserve">across the full stock complex protects downstream </w:t>
-      </w:r>
-      <w:r>
-        <w:rPr>
-          <w:rFonts w:ascii="Garamond" w:hAnsi="Garamond"/>
-          <w:sz w:val="22"/>
-          <w:szCs w:val="22"/>
-        </w:rPr>
-        <w:t>fisheries by distributing risk across space and time, thereby buffering overall population health from impacts to any one stock.</w:t>
-      </w:r>
-      <w:r>
-        <w:rPr>
-          <w:rFonts w:ascii="Garamond" w:hAnsi="Garamond"/>
-          <w:sz w:val="22"/>
-          <w:szCs w:val="22"/>
-        </w:rPr>
-        <w:t xml:space="preserve"> </w:t>
-      </w:r>
-    </w:p>
-    <w:p>
-      <w:pPr>
-        <w:spacing w:line="480" w:lineRule="auto"/>
-        <w:ind w:firstLine="720"/>
-        <w:rPr>
-          <w:rFonts w:ascii="Garamond" w:hAnsi="Garamond"/>
-          <w:sz w:val="22"/>
-          <w:szCs w:val="22"/>
-        </w:rPr>
-      </w:pPr>
-    </w:p>
-    <w:p>
-      <w:pPr>
-        <w:spacing w:line="480" w:lineRule="auto"/>
-        <w:ind w:firstLine="720"/>
-        <w:rPr>
-          <w:rFonts w:ascii="Garamond" w:hAnsi="Garamond"/>
-          <w:sz w:val="22"/>
-          <w:szCs w:val="22"/>
-        </w:rPr>
-      </w:pPr>
-      <w:r>
-        <w:rPr>
-          <w:rFonts w:ascii="Garamond" w:hAnsi="Garamond"/>
-          <w:sz w:val="22"/>
-          <w:szCs w:val="22"/>
-        </w:rPr>
-        <w:t xml:space="preserve">Allowing harvest opportunity on the stock aggregate while conserving this intrapopulation diversity is therefore key to maintaining resource reliability and ecosystem resilience to environmental change. </w:t>
-      </w:r>
-    </w:p>
-    <w:p>
-      <w:pPr>
-        <w:spacing w:line="480" w:lineRule="auto"/>
-        <w:ind w:firstLine="720"/>
-        <w:rPr>
-          <w:rFonts w:ascii="Garamond" w:hAnsi="Garamond"/>
-          <w:sz w:val="22"/>
-          <w:szCs w:val="22"/>
-        </w:rPr>
-      </w:pPr>
-      <w:ins w:id="9" w:author="Daniel Schindler" w:date="2025-08-26T15:58:00Z" w16du:dateUtc="2025-08-26T23:58:00Z">
-        <w:r>
-          <w:rPr>
-            <w:rFonts w:ascii="Garamond" w:hAnsi="Garamond"/>
-            <w:sz w:val="22"/>
-            <w:szCs w:val="22"/>
-          </w:rPr>
-          <w:t xml:space="preserve">Topic sentence about western Alaska. </w:t>
-        </w:r>
-      </w:ins>
+      <w:r>
+        <w:rPr>
+          <w:rFonts w:ascii="Garamond" w:hAnsi="Garamond"/>
+          <w:sz w:val="22"/>
+          <w:szCs w:val="22"/>
+        </w:rPr>
+        <w:t xml:space="preserve">Western Alaska watersheds contain some of the last remaining pristine salmon habitat and have historically supported large returns of Pacific salmon. </w:t>
+      </w:r>
       <w:r>
         <w:rPr>
           <w:rFonts w:ascii="Garamond" w:hAnsi="Garamond"/>
@@ -1515,6 +1347,7 @@
           <w:sz w:val="22"/>
           <w:szCs w:val="22"/>
         </w:rPr>
+        <w:lastRenderedPageBreak/>
         <w:t xml:space="preserve">designing management strategies that </w:t>
       </w:r>
       <w:r>
@@ -1533,16 +1366,6 @@
         </w:rPr>
         <w:t>the diversity of stocks throughout the basin to enhance</w:t>
       </w:r>
-      <w:del w:id="10" w:author="Daniel Schindler" w:date="2025-08-26T15:59:00Z" w16du:dateUtc="2025-08-26T23:59:00Z">
-        <w:r>
-          <w:rPr>
-            <w:rFonts w:ascii="Garamond" w:hAnsi="Garamond" w:cs="Times New Roman"/>
-            <w:sz w:val="22"/>
-            <w:szCs w:val="22"/>
-          </w:rPr>
-          <w:delText xml:space="preserve"> and enhancing</w:delText>
-        </w:r>
-      </w:del>
       <w:r>
         <w:rPr>
           <w:rFonts w:ascii="Garamond" w:hAnsi="Garamond" w:cs="Times New Roman"/>
@@ -1578,7 +1401,7 @@
           <w:szCs w:val="22"/>
         </w:rPr>
       </w:pPr>
-      <w:commentRangeStart w:id="11"/>
+      <w:commentRangeStart w:id="9"/>
       <w:r>
         <w:rPr>
           <w:rStyle w:val="Strong"/>
@@ -1590,12 +1413,12 @@
         </w:rPr>
         <w:t xml:space="preserve">One </w:t>
       </w:r>
-      <w:commentRangeEnd w:id="11"/>
+      <w:commentRangeEnd w:id="9"/>
       <w:r>
         <w:rPr>
           <w:rStyle w:val="CommentReference"/>
         </w:rPr>
-        <w:commentReference w:id="11"/>
+        <w:commentReference w:id="9"/>
       </w:r>
       <w:r>
         <w:rPr>
@@ -1608,45 +1431,6 @@
         </w:rPr>
         <w:t xml:space="preserve">approach to addressing </w:t>
       </w:r>
-      <w:ins w:id="12" w:author="Daniel Schindler" w:date="2025-08-26T16:01:00Z" w16du:dateUtc="2025-08-27T00:01:00Z">
-        <w:r>
-          <w:rPr>
-            <w:rStyle w:val="Strong"/>
-            <w:rFonts w:ascii="Garamond" w:hAnsi="Garamond"/>
-            <w:b w:val="0"/>
-            <w:bCs w:val="0"/>
-            <w:sz w:val="22"/>
-            <w:szCs w:val="22"/>
-          </w:rPr>
-          <w:t xml:space="preserve">the simultaneous challenge </w:t>
-        </w:r>
-      </w:ins>
-      <w:ins w:id="13" w:author="Daniel Schindler" w:date="2025-08-26T16:02:00Z" w16du:dateUtc="2025-08-27T00:02:00Z">
-        <w:r>
-          <w:rPr>
-            <w:rStyle w:val="Strong"/>
-            <w:rFonts w:ascii="Garamond" w:hAnsi="Garamond"/>
-            <w:b w:val="0"/>
-            <w:bCs w:val="0"/>
-            <w:sz w:val="22"/>
-            <w:szCs w:val="22"/>
-          </w:rPr>
-          <w:t xml:space="preserve">of allowing harvest opportunity for subsistence fisheries while protect weak stocks, particularly those returning to the headwaters, </w:t>
-        </w:r>
-      </w:ins>
-      <w:del w:id="14" w:author="Daniel Schindler" w:date="2025-08-26T16:02:00Z" w16du:dateUtc="2025-08-27T00:02:00Z">
-        <w:r>
-          <w:rPr>
-            <w:rStyle w:val="Strong"/>
-            <w:rFonts w:ascii="Garamond" w:hAnsi="Garamond"/>
-            <w:b w:val="0"/>
-            <w:bCs w:val="0"/>
-            <w:sz w:val="22"/>
-            <w:szCs w:val="22"/>
-          </w:rPr>
-          <w:delText>this challenge</w:delText>
-        </w:r>
-      </w:del>
       <w:r>
         <w:rPr>
           <w:rStyle w:val="Strong"/>
@@ -1656,244 +1440,7 @@
           <w:sz w:val="22"/>
           <w:szCs w:val="22"/>
         </w:rPr>
-        <w:t xml:space="preserve"> has been</w:t>
-      </w:r>
-      <w:r>
-        <w:rPr>
-          <w:rFonts w:ascii="Garamond" w:hAnsi="Garamond"/>
-          <w:sz w:val="22"/>
-          <w:szCs w:val="22"/>
-        </w:rPr>
-        <w:t xml:space="preserve"> the implementation of a front-end closure for Chinook salmon that heavily restricts fishing</w:t>
-      </w:r>
-      <w:r>
-        <w:rPr>
-          <w:rFonts w:ascii="Garamond" w:hAnsi="Garamond"/>
-          <w:sz w:val="22"/>
-          <w:szCs w:val="22"/>
-        </w:rPr>
-        <w:t xml:space="preserve"> during the beginning of the salmon migration season.</w:t>
-      </w:r>
-      <w:r>
-        <w:rPr>
-          <w:rFonts w:ascii="Garamond" w:hAnsi="Garamond"/>
-          <w:sz w:val="22"/>
-          <w:szCs w:val="22"/>
-        </w:rPr>
-        <w:t xml:space="preserve"> </w:t>
-      </w:r>
-      <w:r>
-        <w:rPr>
-          <w:rFonts w:ascii="Garamond" w:hAnsi="Garamond"/>
-          <w:sz w:val="22"/>
-          <w:szCs w:val="22"/>
-        </w:rPr>
-        <w:t>This strategy is</w:t>
-      </w:r>
-      <w:r>
-        <w:rPr>
-          <w:rFonts w:ascii="Garamond" w:hAnsi="Garamond"/>
-          <w:sz w:val="22"/>
-          <w:szCs w:val="22"/>
-        </w:rPr>
-        <w:t xml:space="preserve"> designed to protect early river fish</w:t>
-      </w:r>
-      <w:r>
-        <w:rPr>
-          <w:rFonts w:ascii="Garamond" w:hAnsi="Garamond"/>
-          <w:sz w:val="22"/>
-          <w:szCs w:val="22"/>
-        </w:rPr>
-        <w:t xml:space="preserve"> </w:t>
-      </w:r>
-      <w:r>
-        <w:rPr>
-          <w:rFonts w:ascii="Garamond" w:hAnsi="Garamond"/>
-          <w:sz w:val="22"/>
-          <w:szCs w:val="22"/>
-        </w:rPr>
-        <w:t xml:space="preserve">which are </w:t>
-      </w:r>
-      <w:r>
-        <w:rPr>
-          <w:rFonts w:ascii="Garamond" w:hAnsi="Garamond"/>
-          <w:sz w:val="22"/>
-          <w:szCs w:val="22"/>
-        </w:rPr>
-        <w:t>assum</w:t>
-      </w:r>
-      <w:r>
-        <w:rPr>
-          <w:rFonts w:ascii="Garamond" w:hAnsi="Garamond"/>
-          <w:sz w:val="22"/>
-          <w:szCs w:val="22"/>
-        </w:rPr>
-        <w:t xml:space="preserve">ed to </w:t>
-      </w:r>
-      <w:r>
-        <w:rPr>
-          <w:rFonts w:ascii="Garamond" w:hAnsi="Garamond"/>
-          <w:sz w:val="22"/>
-          <w:szCs w:val="22"/>
-        </w:rPr>
-        <w:t>return to the furthest upstream stocks</w:t>
-      </w:r>
-      <w:r>
-        <w:rPr>
-          <w:rFonts w:ascii="Garamond" w:hAnsi="Garamond"/>
-          <w:sz w:val="22"/>
-          <w:szCs w:val="22"/>
-        </w:rPr>
-        <w:t xml:space="preserve"> and are, therefore, subjected to harvest over more of the river than lower watershed stocks</w:t>
-      </w:r>
-      <w:r>
-        <w:rPr>
-          <w:rFonts w:ascii="Garamond" w:hAnsi="Garamond"/>
-          <w:sz w:val="22"/>
-          <w:szCs w:val="22"/>
-        </w:rPr>
-        <w:t xml:space="preserve">. </w:t>
-      </w:r>
-      <w:r>
-        <w:rPr>
-          <w:rFonts w:ascii="Garamond" w:hAnsi="Garamond"/>
-          <w:sz w:val="22"/>
-          <w:szCs w:val="22"/>
-        </w:rPr>
-        <w:t>This assumption is based on patterns established in other systems (Clark et al., 2015) and supported by limited telemetry data in the Kuskokwim (Clark and Smith, 2017)</w:t>
-      </w:r>
-      <w:ins w:id="15" w:author="Daniel Schindler" w:date="2025-08-26T16:03:00Z" w16du:dateUtc="2025-08-27T00:03:00Z">
-        <w:r>
-          <w:rPr>
-            <w:rFonts w:ascii="Garamond" w:hAnsi="Garamond"/>
-            <w:sz w:val="22"/>
-            <w:szCs w:val="22"/>
-          </w:rPr>
-          <w:t xml:space="preserve"> and by traditional knowledge among stake</w:t>
-        </w:r>
-      </w:ins>
-      <w:ins w:id="16" w:author="Daniel Schindler" w:date="2025-08-26T16:04:00Z" w16du:dateUtc="2025-08-27T00:04:00Z">
-        <w:r>
-          <w:rPr>
-            <w:rFonts w:ascii="Garamond" w:hAnsi="Garamond"/>
-            <w:sz w:val="22"/>
-            <w:szCs w:val="22"/>
-          </w:rPr>
-          <w:t>holders</w:t>
-        </w:r>
-      </w:ins>
-      <w:r>
-        <w:rPr>
-          <w:rFonts w:ascii="Garamond" w:hAnsi="Garamond"/>
-          <w:sz w:val="22"/>
-          <w:szCs w:val="22"/>
-        </w:rPr>
-        <w:t xml:space="preserve">. </w:t>
-      </w:r>
-      <w:r>
-        <w:rPr>
-          <w:rFonts w:ascii="Garamond" w:hAnsi="Garamond"/>
-          <w:sz w:val="22"/>
-          <w:szCs w:val="22"/>
-        </w:rPr>
-        <w:t xml:space="preserve">By protecting upriver stocks, managers aim to </w:t>
-      </w:r>
-      <w:r>
-        <w:rPr>
-          <w:rFonts w:ascii="Garamond" w:hAnsi="Garamond"/>
-          <w:sz w:val="22"/>
-          <w:szCs w:val="22"/>
-        </w:rPr>
-        <w:t xml:space="preserve">support basin-wide escapement goals, provide harvest opportunities to upstream communities, and protect upper river stocks </w:t>
-      </w:r>
-      <w:r>
-        <w:rPr>
-          <w:rFonts w:ascii="Garamond" w:hAnsi="Garamond"/>
-          <w:sz w:val="22"/>
-          <w:szCs w:val="22"/>
-        </w:rPr>
-        <w:lastRenderedPageBreak/>
-        <w:t xml:space="preserve">which are at heightened risk of overharvest but contribute disproportionately to downstream fishery dynamics. </w:t>
-      </w:r>
-      <w:r>
-        <w:rPr>
-          <w:rFonts w:ascii="Garamond" w:hAnsi="Garamond"/>
-          <w:sz w:val="22"/>
-          <w:szCs w:val="22"/>
-        </w:rPr>
-        <w:t>However,</w:t>
-      </w:r>
-      <w:r>
-        <w:rPr>
-          <w:rFonts w:ascii="Garamond" w:hAnsi="Garamond"/>
-          <w:sz w:val="22"/>
-          <w:szCs w:val="22"/>
-        </w:rPr>
-        <w:t xml:space="preserve"> </w:t>
-      </w:r>
-      <w:r>
-        <w:rPr>
-          <w:rFonts w:ascii="Garamond" w:hAnsi="Garamond"/>
-          <w:sz w:val="22"/>
-          <w:szCs w:val="22"/>
-        </w:rPr>
-        <w:t>the spatial ecology of Chinook salmon in the Kuskokwim River basin remains poorly understood. It</w:t>
-      </w:r>
-      <w:r>
-        <w:rPr>
-          <w:rFonts w:ascii="Garamond" w:hAnsi="Garamond"/>
-          <w:sz w:val="22"/>
-          <w:szCs w:val="22"/>
-        </w:rPr>
-        <w:t xml:space="preserve"> </w:t>
-      </w:r>
-      <w:r>
-        <w:rPr>
-          <w:rFonts w:ascii="Garamond" w:hAnsi="Garamond"/>
-          <w:sz w:val="22"/>
-          <w:szCs w:val="22"/>
-        </w:rPr>
-        <w:t xml:space="preserve">remains </w:t>
-      </w:r>
-      <w:r>
-        <w:rPr>
-          <w:rFonts w:ascii="Garamond" w:hAnsi="Garamond"/>
-          <w:sz w:val="22"/>
-          <w:szCs w:val="22"/>
-        </w:rPr>
-        <w:t>unclear whether th</w:t>
-      </w:r>
-      <w:r>
-        <w:rPr>
-          <w:rFonts w:ascii="Garamond" w:hAnsi="Garamond"/>
-          <w:sz w:val="22"/>
-          <w:szCs w:val="22"/>
-        </w:rPr>
-        <w:t>e</w:t>
-      </w:r>
-      <w:r>
-        <w:rPr>
-          <w:rFonts w:ascii="Garamond" w:hAnsi="Garamond"/>
-          <w:sz w:val="22"/>
-          <w:szCs w:val="22"/>
-        </w:rPr>
-        <w:t xml:space="preserve"> pattern</w:t>
-      </w:r>
-      <w:r>
-        <w:rPr>
-          <w:rFonts w:ascii="Garamond" w:hAnsi="Garamond"/>
-          <w:sz w:val="22"/>
-          <w:szCs w:val="22"/>
-        </w:rPr>
-        <w:t>s observed in telemetry studies are</w:t>
-      </w:r>
-      <w:r>
-        <w:rPr>
-          <w:rFonts w:ascii="Garamond" w:hAnsi="Garamond"/>
-          <w:sz w:val="22"/>
-          <w:szCs w:val="22"/>
-        </w:rPr>
-        <w:t xml:space="preserve"> </w:t>
+        <w:t xml:space="preserve">the simultaneous challenge of allowing harvest opportunity for subsistence fisheries while protect weak stocks, particularly those returning to the headwaters, </w:t>
       </w:r>
       <w:r>
         <w:rPr>
@@ -1904,15 +1451,255 @@
           <w:sz w:val="22"/>
           <w:szCs w:val="22"/>
         </w:rPr>
-        <w:t>consistent</w:t>
-      </w:r>
-      <w:r>
-        <w:rPr>
-          <w:rFonts w:ascii="Garamond" w:hAnsi="Garamond"/>
-          <w:sz w:val="22"/>
-          <w:szCs w:val="22"/>
-        </w:rPr>
-        <w:t xml:space="preserve"> over several years, whether there is a geographic organization to run timing, </w:t>
+        <w:t>has been</w:t>
+      </w:r>
+      <w:r>
+        <w:rPr>
+          <w:rFonts w:ascii="Garamond" w:hAnsi="Garamond"/>
+          <w:sz w:val="22"/>
+          <w:szCs w:val="22"/>
+        </w:rPr>
+        <w:t xml:space="preserve"> the implementation of a front-end closure for Chinook salmon that heavily restricts fishing</w:t>
+      </w:r>
+      <w:r>
+        <w:rPr>
+          <w:rFonts w:ascii="Garamond" w:hAnsi="Garamond"/>
+          <w:sz w:val="22"/>
+          <w:szCs w:val="22"/>
+        </w:rPr>
+        <w:t xml:space="preserve"> during the beginning of the salmon migration season.</w:t>
+      </w:r>
+      <w:r>
+        <w:rPr>
+          <w:rFonts w:ascii="Garamond" w:hAnsi="Garamond"/>
+          <w:sz w:val="22"/>
+          <w:szCs w:val="22"/>
+        </w:rPr>
+        <w:t xml:space="preserve"> </w:t>
+      </w:r>
+      <w:r>
+        <w:rPr>
+          <w:rFonts w:ascii="Garamond" w:hAnsi="Garamond"/>
+          <w:sz w:val="22"/>
+          <w:szCs w:val="22"/>
+        </w:rPr>
+        <w:t>This strategy is</w:t>
+      </w:r>
+      <w:r>
+        <w:rPr>
+          <w:rFonts w:ascii="Garamond" w:hAnsi="Garamond"/>
+          <w:sz w:val="22"/>
+          <w:szCs w:val="22"/>
+        </w:rPr>
+        <w:t xml:space="preserve"> designed to protect early river fish</w:t>
+      </w:r>
+      <w:r>
+        <w:rPr>
+          <w:rFonts w:ascii="Garamond" w:hAnsi="Garamond"/>
+          <w:sz w:val="22"/>
+          <w:szCs w:val="22"/>
+        </w:rPr>
+        <w:t xml:space="preserve"> </w:t>
+      </w:r>
+      <w:r>
+        <w:rPr>
+          <w:rFonts w:ascii="Garamond" w:hAnsi="Garamond"/>
+          <w:sz w:val="22"/>
+          <w:szCs w:val="22"/>
+        </w:rPr>
+        <w:t xml:space="preserve">which are </w:t>
+      </w:r>
+      <w:r>
+        <w:rPr>
+          <w:rFonts w:ascii="Garamond" w:hAnsi="Garamond"/>
+          <w:sz w:val="22"/>
+          <w:szCs w:val="22"/>
+        </w:rPr>
+        <w:t>assum</w:t>
+      </w:r>
+      <w:r>
+        <w:rPr>
+          <w:rFonts w:ascii="Garamond" w:hAnsi="Garamond"/>
+          <w:sz w:val="22"/>
+          <w:szCs w:val="22"/>
+        </w:rPr>
+        <w:t xml:space="preserve">ed to </w:t>
+      </w:r>
+      <w:r>
+        <w:rPr>
+          <w:rFonts w:ascii="Garamond" w:hAnsi="Garamond"/>
+          <w:sz w:val="22"/>
+          <w:szCs w:val="22"/>
+        </w:rPr>
+        <w:t>return to the furthest upstream stocks</w:t>
+      </w:r>
+      <w:r>
+        <w:rPr>
+          <w:rFonts w:ascii="Garamond" w:hAnsi="Garamond"/>
+          <w:sz w:val="22"/>
+          <w:szCs w:val="22"/>
+        </w:rPr>
+        <w:t xml:space="preserve"> and are, therefore, subjected to harvest over more of the river than lower watershed stocks</w:t>
+      </w:r>
+      <w:r>
+        <w:rPr>
+          <w:rFonts w:ascii="Garamond" w:hAnsi="Garamond"/>
+          <w:sz w:val="22"/>
+          <w:szCs w:val="22"/>
+        </w:rPr>
+        <w:t xml:space="preserve">. </w:t>
+      </w:r>
+      <w:r>
+        <w:rPr>
+          <w:rFonts w:ascii="Garamond" w:hAnsi="Garamond"/>
+          <w:sz w:val="22"/>
+          <w:szCs w:val="22"/>
+        </w:rPr>
+        <w:t>This assumption is based on patterns established in other systems (Clark et al., 2015</w:t>
+      </w:r>
+      <w:r>
+        <w:rPr>
+          <w:rFonts w:ascii="Garamond" w:hAnsi="Garamond"/>
+          <w:sz w:val="22"/>
+          <w:szCs w:val="22"/>
+        </w:rPr>
+        <w:t>) supported</w:t>
+      </w:r>
+      <w:r>
+        <w:rPr>
+          <w:rFonts w:ascii="Garamond" w:hAnsi="Garamond"/>
+          <w:sz w:val="22"/>
+          <w:szCs w:val="22"/>
+        </w:rPr>
+        <w:t xml:space="preserve"> by limited telemetry data in the Kuskokwim (Clark and Smith, 2017)</w:t>
+      </w:r>
+      <w:r>
+        <w:rPr>
+          <w:rFonts w:ascii="Garamond" w:hAnsi="Garamond"/>
+          <w:sz w:val="22"/>
+          <w:szCs w:val="22"/>
+        </w:rPr>
+        <w:t xml:space="preserve"> and </w:t>
+      </w:r>
+      <w:r>
+        <w:rPr>
+          <w:rFonts w:ascii="Garamond" w:hAnsi="Garamond"/>
+          <w:sz w:val="22"/>
+          <w:szCs w:val="22"/>
+        </w:rPr>
+        <w:t xml:space="preserve">further corroborated </w:t>
+      </w:r>
+      <w:r>
+        <w:rPr>
+          <w:rFonts w:ascii="Garamond" w:hAnsi="Garamond"/>
+          <w:sz w:val="22"/>
+          <w:szCs w:val="22"/>
+        </w:rPr>
+        <w:t>by traditional knowledge among stakeholders</w:t>
+      </w:r>
+      <w:r>
+        <w:rPr>
+          <w:rFonts w:ascii="Garamond" w:hAnsi="Garamond"/>
+          <w:sz w:val="22"/>
+          <w:szCs w:val="22"/>
+        </w:rPr>
+        <w:t xml:space="preserve">. </w:t>
+      </w:r>
+      <w:r>
+        <w:rPr>
+          <w:rFonts w:ascii="Garamond" w:hAnsi="Garamond"/>
+          <w:sz w:val="22"/>
+          <w:szCs w:val="22"/>
+        </w:rPr>
+        <w:t xml:space="preserve">By protecting upriver stocks, managers aim to </w:t>
+      </w:r>
+      <w:r>
+        <w:rPr>
+          <w:rFonts w:ascii="Garamond" w:hAnsi="Garamond"/>
+          <w:sz w:val="22"/>
+          <w:szCs w:val="22"/>
+        </w:rPr>
+        <w:t xml:space="preserve">support basin-wide escapement goals, provide harvest opportunities to upstream communities, and protect upper river stocks which are at heightened risk of overharvest but contribute disproportionately to downstream fishery dynamics. </w:t>
+      </w:r>
+      <w:r>
+        <w:rPr>
+          <w:rFonts w:ascii="Garamond" w:hAnsi="Garamond"/>
+          <w:sz w:val="22"/>
+          <w:szCs w:val="22"/>
+        </w:rPr>
+        <w:t>However,</w:t>
+      </w:r>
+      <w:r>
+        <w:rPr>
+          <w:rFonts w:ascii="Garamond" w:hAnsi="Garamond"/>
+          <w:sz w:val="22"/>
+          <w:szCs w:val="22"/>
+        </w:rPr>
+        <w:t xml:space="preserve"> </w:t>
+      </w:r>
+      <w:r>
+        <w:rPr>
+          <w:rFonts w:ascii="Garamond" w:hAnsi="Garamond"/>
+          <w:sz w:val="22"/>
+          <w:szCs w:val="22"/>
+        </w:rPr>
+        <w:t>the spatial ecology of Chinook salmon in the Kuskokwim River basin remains poorly understood. It</w:t>
+      </w:r>
+      <w:r>
+        <w:rPr>
+          <w:rFonts w:ascii="Garamond" w:hAnsi="Garamond"/>
+          <w:sz w:val="22"/>
+          <w:szCs w:val="22"/>
+        </w:rPr>
+        <w:t xml:space="preserve"> </w:t>
+      </w:r>
+      <w:r>
+        <w:rPr>
+          <w:rFonts w:ascii="Garamond" w:hAnsi="Garamond"/>
+          <w:sz w:val="22"/>
+          <w:szCs w:val="22"/>
+        </w:rPr>
+        <w:t xml:space="preserve">remains </w:t>
+      </w:r>
+      <w:r>
+        <w:rPr>
+          <w:rFonts w:ascii="Garamond" w:hAnsi="Garamond"/>
+          <w:sz w:val="22"/>
+          <w:szCs w:val="22"/>
+        </w:rPr>
+        <w:t>unclear whether th</w:t>
+      </w:r>
+      <w:r>
+        <w:rPr>
+          <w:rFonts w:ascii="Garamond" w:hAnsi="Garamond"/>
+          <w:sz w:val="22"/>
+          <w:szCs w:val="22"/>
+        </w:rPr>
+        <w:t>e</w:t>
+      </w:r>
+      <w:r>
+        <w:rPr>
+          <w:rFonts w:ascii="Garamond" w:hAnsi="Garamond"/>
+          <w:sz w:val="22"/>
+          <w:szCs w:val="22"/>
+        </w:rPr>
+        <w:t xml:space="preserve"> pattern</w:t>
+      </w:r>
+      <w:r>
+        <w:rPr>
+          <w:rFonts w:ascii="Garamond" w:hAnsi="Garamond"/>
+          <w:sz w:val="22"/>
+          <w:szCs w:val="22"/>
+        </w:rPr>
+        <w:t>s observed in telemetry studies are</w:t>
+      </w:r>
+      <w:r>
+        <w:rPr>
+          <w:rFonts w:ascii="Garamond" w:hAnsi="Garamond"/>
+          <w:sz w:val="22"/>
+          <w:szCs w:val="22"/>
+        </w:rPr>
+        <w:t xml:space="preserve"> </w:t>
       </w:r>
       <w:r>
         <w:rPr>
@@ -1923,15 +1710,15 @@
           <w:sz w:val="22"/>
           <w:szCs w:val="22"/>
         </w:rPr>
-        <w:t>and whether</w:t>
-      </w:r>
-      <w:r>
-        <w:rPr>
-          <w:rFonts w:ascii="Garamond" w:hAnsi="Garamond"/>
-          <w:sz w:val="22"/>
-          <w:szCs w:val="22"/>
-        </w:rPr>
-        <w:t xml:space="preserve"> the interaction </w:t>
+        <w:t>consistent</w:t>
+      </w:r>
+      <w:r>
+        <w:rPr>
+          <w:rFonts w:ascii="Garamond" w:hAnsi="Garamond"/>
+          <w:sz w:val="22"/>
+          <w:szCs w:val="22"/>
+        </w:rPr>
+        <w:t xml:space="preserve"> over several years, whether there is a geographic organization to run timing, </w:t>
       </w:r>
       <w:r>
         <w:rPr>
@@ -1942,15 +1729,15 @@
           <w:sz w:val="22"/>
           <w:szCs w:val="22"/>
         </w:rPr>
-        <w:t>between</w:t>
-      </w:r>
-      <w:r>
-        <w:rPr>
-          <w:rFonts w:ascii="Garamond" w:hAnsi="Garamond"/>
-          <w:sz w:val="22"/>
-          <w:szCs w:val="22"/>
-        </w:rPr>
-        <w:t xml:space="preserve"> these patterns and the front-end closure protects upstream stocks as </w:t>
+        <w:t>and whether</w:t>
+      </w:r>
+      <w:r>
+        <w:rPr>
+          <w:rFonts w:ascii="Garamond" w:hAnsi="Garamond"/>
+          <w:sz w:val="22"/>
+          <w:szCs w:val="22"/>
+        </w:rPr>
+        <w:t xml:space="preserve"> the interaction </w:t>
       </w:r>
       <w:r>
         <w:rPr>
@@ -1961,6 +1748,25 @@
           <w:sz w:val="22"/>
           <w:szCs w:val="22"/>
         </w:rPr>
+        <w:t>between</w:t>
+      </w:r>
+      <w:r>
+        <w:rPr>
+          <w:rFonts w:ascii="Garamond" w:hAnsi="Garamond"/>
+          <w:sz w:val="22"/>
+          <w:szCs w:val="22"/>
+        </w:rPr>
+        <w:t xml:space="preserve"> these patterns and the front-end closure protects upstream stocks as </w:t>
+      </w:r>
+      <w:r>
+        <w:rPr>
+          <w:rStyle w:val="Strong"/>
+          <w:rFonts w:ascii="Garamond" w:hAnsi="Garamond"/>
+          <w:b w:val="0"/>
+          <w:bCs w:val="0"/>
+          <w:sz w:val="22"/>
+          <w:szCs w:val="22"/>
+        </w:rPr>
         <w:t>intended</w:t>
       </w:r>
       <w:r>
@@ -2067,16 +1873,6 @@
         </w:rPr>
         <w:t xml:space="preserve"> In doing so, we</w:t>
       </w:r>
-      <w:del w:id="17" w:author="Daniel Schindler" w:date="2025-08-26T16:04:00Z" w16du:dateUtc="2025-08-27T00:04:00Z">
-        <w:r>
-          <w:rPr>
-            <w:rFonts w:ascii="Garamond" w:hAnsi="Garamond"/>
-            <w:sz w:val="22"/>
-            <w:szCs w:val="22"/>
-          </w:rPr>
-          <w:delText xml:space="preserve"> will</w:delText>
-        </w:r>
-      </w:del>
       <w:r>
         <w:rPr>
           <w:rFonts w:ascii="Garamond" w:hAnsi="Garamond"/>
@@ -2193,6 +1989,7 @@
           <w:szCs w:val="22"/>
           <w:u w:val="single"/>
         </w:rPr>
+        <w:lastRenderedPageBreak/>
         <w:t xml:space="preserve">Otolith </w:t>
       </w:r>
       <w:r>
@@ -2357,31 +2154,39 @@
           <w:sz w:val="22"/>
           <w:szCs w:val="22"/>
         </w:rPr>
-        <w:t xml:space="preserve">The BTF was designed to enable in-season assessment of run strength based on catch-per-unit-effort, informing management decisions for subsistence fisheries throughout the river. Fish caught in this fishery represent a representative sample of returning stocks </w:t>
-      </w:r>
-      <w:commentRangeStart w:id="18"/>
-      <w:commentRangeStart w:id="19"/>
-      <w:r>
-        <w:rPr>
-          <w:rFonts w:ascii="Garamond" w:hAnsi="Garamond"/>
-          <w:sz w:val="22"/>
-          <w:szCs w:val="22"/>
-        </w:rPr>
-        <w:t xml:space="preserve">throughout the basin </w:t>
-      </w:r>
-      <w:commentRangeEnd w:id="18"/>
-      <w:r>
-        <w:rPr>
-          <w:rStyle w:val="CommentReference"/>
-        </w:rPr>
-        <w:commentReference w:id="18"/>
-      </w:r>
-      <w:commentRangeEnd w:id="19"/>
-      <w:r>
-        <w:rPr>
-          <w:rStyle w:val="CommentReference"/>
-        </w:rPr>
-        <w:commentReference w:id="19"/>
+        <w:t xml:space="preserve">The BTF was designed to enable in-season assessment of run strength based on catch-per-unit-effort, informing management decisions for subsistence fisheries throughout the river. Fish caught in this fishery </w:t>
+      </w:r>
+      <w:r>
+        <w:rPr>
+          <w:rFonts w:ascii="Garamond" w:hAnsi="Garamond"/>
+          <w:sz w:val="22"/>
+          <w:szCs w:val="22"/>
+        </w:rPr>
+        <w:t xml:space="preserve">are </w:t>
+      </w:r>
+      <w:r>
+        <w:rPr>
+          <w:rFonts w:ascii="Garamond" w:hAnsi="Garamond"/>
+          <w:sz w:val="22"/>
+          <w:szCs w:val="22"/>
+        </w:rPr>
+        <w:t xml:space="preserve">a representative sample of returning stocks </w:t>
+      </w:r>
+      <w:r>
+        <w:rPr>
+          <w:rFonts w:ascii="Garamond" w:hAnsi="Garamond"/>
+          <w:sz w:val="22"/>
+          <w:szCs w:val="22"/>
+        </w:rPr>
+        <w:t>throughout the basin above the test fishery location near Bethel, Alaska</w:t>
+      </w:r>
+      <w:r>
+        <w:rPr>
+          <w:rFonts w:ascii="Garamond" w:hAnsi="Garamond"/>
+          <w:sz w:val="22"/>
+          <w:szCs w:val="22"/>
+        </w:rPr>
+        <w:t xml:space="preserve"> </w:t>
       </w:r>
       <w:r>
         <w:rPr>
@@ -2614,19 +2419,7 @@
           <w:szCs w:val="22"/>
           <w14:ligatures w14:val="none"/>
         </w:rPr>
-        <w:t xml:space="preserve">(Donohoe &amp; Zimmerman, </w:t>
-      </w:r>
-      <w:r>
-        <w:rPr>
-          <w:rFonts w:ascii="Garamond" w:eastAsia="Times New Roman" w:hAnsi="Garamond" w:cs="Times New Roman"/>
-          <w:noProof/>
-          <w:kern w:val="0"/>
-          <w:sz w:val="22"/>
-          <w:szCs w:val="22"/>
-          <w14:ligatures w14:val="none"/>
-        </w:rPr>
-        <w:lastRenderedPageBreak/>
-        <w:t>2010; Zimmerman &amp; Reeves, 2002)</w:t>
+        <w:t>(Donohoe &amp; Zimmerman, 2010; Zimmerman &amp; Reeves, 2002)</w:t>
       </w:r>
       <w:r>
         <w:rPr>
@@ -3253,9 +3046,10 @@
           <w:szCs w:val="22"/>
           <w14:ligatures w14:val="none"/>
         </w:rPr>
+        <w:lastRenderedPageBreak/>
         <w:t xml:space="preserve">A </w:t>
       </w:r>
-      <w:ins w:id="20" w:author="Daniel Schindler" w:date="2025-08-26T16:12:00Z" w16du:dateUtc="2025-08-27T00:12:00Z">
+      <w:ins w:id="10" w:author="Daniel Schindler" w:date="2025-08-26T16:12:00Z" w16du:dateUtc="2025-08-27T00:12:00Z">
         <w:r>
           <w:rPr>
             <w:rFonts w:ascii="Garamond" w:eastAsia="Times New Roman" w:hAnsi="Garamond" w:cs="Times New Roman"/>
@@ -3267,18 +3061,6 @@
           <w:t>s</w:t>
         </w:r>
       </w:ins>
-      <w:del w:id="21" w:author="Daniel Schindler" w:date="2025-08-26T16:12:00Z" w16du:dateUtc="2025-08-27T00:12:00Z">
-        <w:r>
-          <w:rPr>
-            <w:rFonts w:ascii="Garamond" w:eastAsia="Times New Roman" w:hAnsi="Garamond" w:cs="Times New Roman"/>
-            <w:kern w:val="0"/>
-            <w:sz w:val="22"/>
-            <w:szCs w:val="22"/>
-            <w14:ligatures w14:val="none"/>
-          </w:rPr>
-          <w:delText>S</w:delText>
-        </w:r>
-      </w:del>
       <w:r>
         <w:rPr>
           <w:rFonts w:ascii="Garamond" w:eastAsia="Times New Roman" w:hAnsi="Garamond" w:cs="Times New Roman"/>
@@ -3341,8 +3123,8 @@
         </w:rPr>
         <w:t xml:space="preserve"> </w:t>
       </w:r>
-      <w:commentRangeStart w:id="22"/>
-      <w:commentRangeStart w:id="23"/>
+      <w:commentRangeStart w:id="11"/>
+      <w:commentRangeStart w:id="12"/>
       <w:r>
         <w:rPr>
           <w:rFonts w:ascii="Garamond" w:eastAsia="Times New Roman" w:hAnsi="Garamond" w:cs="Times New Roman"/>
@@ -3363,19 +3145,19 @@
         </w:rPr>
         <w:t xml:space="preserve"> </w:t>
       </w:r>
-      <w:commentRangeEnd w:id="22"/>
+      <w:commentRangeEnd w:id="11"/>
       <w:r>
         <w:rPr>
           <w:rStyle w:val="CommentReference"/>
         </w:rPr>
-        <w:commentReference w:id="22"/>
-      </w:r>
-      <w:commentRangeEnd w:id="23"/>
+        <w:commentReference w:id="11"/>
+      </w:r>
+      <w:commentRangeEnd w:id="12"/>
       <w:r>
         <w:rPr>
           <w:rStyle w:val="CommentReference"/>
         </w:rPr>
-        <w:commentReference w:id="23"/>
+        <w:commentReference w:id="12"/>
       </w:r>
       <w:r>
         <w:rPr>
@@ -3506,16 +3288,6 @@
           <w:sz w:val="22"/>
           <w:szCs w:val="22"/>
           <w14:ligatures w14:val="none"/>
-          <w:rPrChange w:id="24" w:author="Benjamin J. Makhlouf" w:date="2025-07-26T13:00:00Z" w16du:dateUtc="2025-07-26T20:00:00Z">
-            <w:rPr>
-              <w:rFonts w:ascii="Garamond" w:eastAsia="Times New Roman" w:hAnsi="Garamond" w:cs="Times New Roman"/>
-              <w:kern w:val="0"/>
-              <w:sz w:val="22"/>
-              <w:szCs w:val="22"/>
-              <w:highlight w:val="yellow"/>
-              <w14:ligatures w14:val="none"/>
-            </w:rPr>
-          </w:rPrChange>
         </w:rPr>
         <w:fldChar w:fldCharType="begin"/>
       </w:r>
@@ -3526,16 +3298,6 @@
           <w:sz w:val="22"/>
           <w:szCs w:val="22"/>
           <w14:ligatures w14:val="none"/>
-          <w:rPrChange w:id="25" w:author="Benjamin J. Makhlouf" w:date="2025-07-26T13:00:00Z" w16du:dateUtc="2025-07-26T20:00:00Z">
-            <w:rPr>
-              <w:rFonts w:ascii="Garamond" w:eastAsia="Times New Roman" w:hAnsi="Garamond" w:cs="Times New Roman"/>
-              <w:kern w:val="0"/>
-              <w:sz w:val="22"/>
-              <w:szCs w:val="22"/>
-              <w:highlight w:val="yellow"/>
-              <w14:ligatures w14:val="none"/>
-            </w:rPr>
-          </w:rPrChange>
         </w:rPr>
         <w:instrText xml:space="preserve"> ADDIN ZOTERO_ITEM CSL_CITATION {"citationID":"5Pp7WuA9","properties":{"formattedCitation":"(French et al., 2020)","plainCitation":"(French et al., 2020)","noteIndex":0},"citationItems":[{"id":1684,"uris":["http://zotero.org/users/8421274/items/M654PKRJ"],"itemData":{"id":1684,"type":"article-journal","abstract":"Riverine chemistry reflects both watershed conditions and instream processing, both of which vary across river networks, yet little is known about the scales at which watershed attributes regulate biogeochemical constituents. We used spatial stream network (SSN) models to quantify both watershed and instream effects on streamwater constituents in the Kuskokwim River (western Alaska), the largest free-flowing river in the United States. We assessed chemical constituents spanning from labile nutrients (nitrate [NO3−] and orthophosphate [PO43−]) to biologically and chemically conservative tracers (calcium [Ca2+], strontium [Sr2+], and Sr isotopes [87Sr/86Sr]). We also examined the behavior of dissolved organic carbon (DOC) relative to these constituents to understand whether bulk DOC behaved conservatively in a large boreal river network, where future changes in DOC and nutrient loading are expected under a shifting climate. We derived watershed spatial covariates comprising land cover, geology, and geomorphic characteristics at 14 different spatial extents based on stream order and relative to position in the river network to understand the effect of distant and proximal watershed attributes on streamwater constituents. For all constituents but 87Sr/86Sr, watershed attributes in low-order headwater catchments yielded the best predictive ability for streamwater constituent concentrations across the entire network. Spatial patterning for conservative tracers and bulk DOC showed strong spatial autocorrelation, whereas PO43− and NO3− exhibited spatial patchiness indicative of instream processing. Our work shows that headwater streams are disproportionately important contributors to network-wide biogeochemical constituents supporting aquatic food webs and that conservation and management of aquatic systems should include these small and often remote watershed areas.","container-title":"Journal of Geophysical Research: Biogeosciences","DOI":"10.1029/2020JG005851","ISSN":"2169-8961","issue":"12","language":"en","note":"_eprint: https://agupubs.onlinelibrary.wiley.com/doi/pdf/10.1029/2020JG005851","page":"e2020JG005851","source":"Wiley Online Library","title":"Headwater Catchments Govern Biogeochemistry in America's Largest Free-Flowing River Network","volume":"125","author":[{"family":"French","given":"David W."},{"family":"Schindler","given":"Daniel E."},{"family":"Brennan","given":"Sean R."},{"family":"Whited","given":"Diane"}],"issued":{"date-parts":[["2020"]]}}}],"schema":"https://github.com/citation-style-language/schema/raw/master/csl-citation.json"} </w:instrText>
       </w:r>
@@ -3546,16 +3308,6 @@
           <w:sz w:val="22"/>
           <w:szCs w:val="22"/>
           <w14:ligatures w14:val="none"/>
-          <w:rPrChange w:id="26" w:author="Benjamin J. Makhlouf" w:date="2025-07-26T13:00:00Z" w16du:dateUtc="2025-07-26T20:00:00Z">
-            <w:rPr>
-              <w:rFonts w:ascii="Garamond" w:eastAsia="Times New Roman" w:hAnsi="Garamond" w:cs="Times New Roman"/>
-              <w:kern w:val="0"/>
-              <w:sz w:val="22"/>
-              <w:szCs w:val="22"/>
-              <w:highlight w:val="yellow"/>
-              <w14:ligatures w14:val="none"/>
-            </w:rPr>
-          </w:rPrChange>
         </w:rPr>
         <w:fldChar w:fldCharType="separate"/>
       </w:r>
@@ -3599,16 +3351,6 @@
           <w:sz w:val="22"/>
           <w:szCs w:val="22"/>
           <w14:ligatures w14:val="none"/>
-          <w:rPrChange w:id="27" w:author="Benjamin J. Makhlouf" w:date="2025-07-26T13:00:00Z" w16du:dateUtc="2025-07-26T20:00:00Z">
-            <w:rPr>
-              <w:rFonts w:ascii="Garamond" w:eastAsia="Times New Roman" w:hAnsi="Garamond" w:cs="Times New Roman"/>
-              <w:kern w:val="0"/>
-              <w:sz w:val="22"/>
-              <w:szCs w:val="22"/>
-              <w:highlight w:val="yellow"/>
-              <w14:ligatures w14:val="none"/>
-            </w:rPr>
-          </w:rPrChange>
         </w:rPr>
         <w:fldChar w:fldCharType="end"/>
       </w:r>
@@ -3853,25 +3595,7 @@
           <w:sz w:val="22"/>
           <w:szCs w:val="22"/>
         </w:rPr>
-        <w:t xml:space="preserve">, </w:t>
-      </w:r>
-      <w:del w:id="28" w:author="Daniel Schindler" w:date="2025-08-26T16:23:00Z" w16du:dateUtc="2025-08-27T00:23:00Z">
-        <w:r>
-          <w:rPr>
-            <w:rFonts w:ascii="Garamond" w:hAnsi="Garamond" w:cs="Times New Roman"/>
-            <w:sz w:val="22"/>
-            <w:szCs w:val="22"/>
-          </w:rPr>
-          <w:delText xml:space="preserve">minimum </w:delText>
-        </w:r>
-      </w:del>
-      <w:r>
-        <w:rPr>
-          <w:rFonts w:ascii="Garamond" w:hAnsi="Garamond" w:cs="Times New Roman"/>
-          <w:sz w:val="22"/>
-          <w:szCs w:val="22"/>
-        </w:rPr>
-        <w:t xml:space="preserve">uncertainty </w:t>
+        <w:t xml:space="preserve">, uncertainty </w:t>
       </w:r>
       <w:r>
         <w:rPr>
@@ -4826,7 +4550,16 @@
           <w:sz w:val="22"/>
           <w:szCs w:val="22"/>
         </w:rPr>
-        <w:t>). The probability of the isotope ratio (</w:t>
+        <w:t xml:space="preserve">). The probability </w:t>
+      </w:r>
+      <w:r>
+        <w:rPr>
+          <w:rFonts w:ascii="Garamond" w:hAnsi="Garamond" w:cstheme="majorHAnsi"/>
+          <w:sz w:val="22"/>
+          <w:szCs w:val="22"/>
+        </w:rPr>
+        <w:lastRenderedPageBreak/>
+        <w:t>of the isotope ratio (</w:t>
       </w:r>
       <w:proofErr w:type="spellStart"/>
       <w:r>
@@ -5154,8 +4887,8 @@
         </w:rPr>
         <w:t xml:space="preserve"> </w:t>
       </w:r>
-      <w:commentRangeStart w:id="29"/>
-      <w:commentRangeStart w:id="30"/>
+      <w:commentRangeStart w:id="13"/>
+      <w:commentRangeStart w:id="14"/>
       <w:r>
         <w:rPr>
           <w:rFonts w:ascii="Garamond" w:eastAsia="Times New Roman" w:hAnsi="Garamond" w:cs="Times New Roman"/>
@@ -5207,19 +4940,19 @@
         </w:rPr>
         <w:fldChar w:fldCharType="end"/>
       </w:r>
-      <w:commentRangeEnd w:id="29"/>
+      <w:commentRangeEnd w:id="13"/>
       <w:r>
         <w:rPr>
           <w:rStyle w:val="CommentReference"/>
         </w:rPr>
-        <w:commentReference w:id="29"/>
-      </w:r>
-      <w:commentRangeEnd w:id="30"/>
+        <w:commentReference w:id="13"/>
+      </w:r>
+      <w:commentRangeEnd w:id="14"/>
       <w:r>
         <w:rPr>
           <w:rStyle w:val="CommentReference"/>
         </w:rPr>
-        <w:commentReference w:id="30"/>
+        <w:commentReference w:id="14"/>
       </w:r>
       <w:r>
         <w:rPr>
@@ -5489,7 +5222,6 @@
           <w:sz w:val="22"/>
           <w:szCs w:val="22"/>
         </w:rPr>
-        <w:lastRenderedPageBreak/>
         <w:t xml:space="preserve">To estimate the spatial distribution of natal origins </w:t>
       </w:r>
       <w:r>
@@ -5717,7 +5449,7 @@
         </w:rPr>
         <w:t>based on capture date: Q1 (run start through June 11), Q2 (June 12-21), Q3 (June 22-July 1), and Q4 (July 2 onward).</w:t>
       </w:r>
-      <w:ins w:id="31" w:author="Daniel Schindler" w:date="2025-07-17T13:30:00Z" w16du:dateUtc="2025-07-17T21:30:00Z">
+      <w:ins w:id="15" w:author="Daniel Schindler" w:date="2025-07-17T13:30:00Z" w16du:dateUtc="2025-07-17T21:30:00Z">
         <w:r>
           <w:rPr>
             <w:rFonts w:ascii="Garamond" w:hAnsi="Garamond"/>
@@ -5849,6 +5581,7 @@
           <w:sz w:val="22"/>
           <w:szCs w:val="22"/>
         </w:rPr>
+        <w:lastRenderedPageBreak/>
         <w:t>Twenty</w:t>
       </w:r>
       <w:r>
@@ -5931,9 +5664,9 @@
         </w:rPr>
         <w:t xml:space="preserve"> </w:t>
       </w:r>
-      <w:commentRangeStart w:id="32"/>
-      <w:commentRangeStart w:id="33"/>
-      <w:ins w:id="34" w:author="Daniel Schindler" w:date="2025-07-17T13:31:00Z" w16du:dateUtc="2025-07-17T21:31:00Z">
+      <w:commentRangeStart w:id="16"/>
+      <w:commentRangeStart w:id="17"/>
+      <w:ins w:id="18" w:author="Daniel Schindler" w:date="2025-07-17T13:31:00Z" w16du:dateUtc="2025-07-17T21:31:00Z">
         <w:r>
           <w:rPr>
             <w:rFonts w:ascii="Garamond" w:hAnsi="Garamond"/>
@@ -5952,19 +5685,19 @@
         </w:rPr>
         <w:t xml:space="preserve">. </w:t>
       </w:r>
-      <w:commentRangeEnd w:id="32"/>
+      <w:commentRangeEnd w:id="16"/>
       <w:r>
         <w:rPr>
           <w:rStyle w:val="CommentReference"/>
         </w:rPr>
-        <w:commentReference w:id="32"/>
-      </w:r>
-      <w:commentRangeEnd w:id="33"/>
+        <w:commentReference w:id="16"/>
+      </w:r>
+      <w:commentRangeEnd w:id="17"/>
       <w:r>
         <w:rPr>
           <w:rStyle w:val="CommentReference"/>
         </w:rPr>
-        <w:commentReference w:id="33"/>
+        <w:commentReference w:id="17"/>
       </w:r>
       <w:r>
         <w:rPr>
@@ -6074,27 +5807,7 @@
           <w:sz w:val="22"/>
           <w:szCs w:val="22"/>
         </w:rPr>
-        <w:t xml:space="preserve"> multiple units were combined </w:t>
-      </w:r>
-      <w:del w:id="35" w:author="Daniel Schindler" w:date="2025-08-26T16:33:00Z" w16du:dateUtc="2025-08-27T00:33:00Z">
-        <w:r>
-          <w:rPr>
-            <w:rStyle w:val="CommentReference"/>
-            <w:rFonts w:ascii="Garamond" w:hAnsi="Garamond"/>
-            <w:sz w:val="22"/>
-            <w:szCs w:val="22"/>
-          </w:rPr>
-          <w:delText xml:space="preserve">into one </w:delText>
-        </w:r>
-      </w:del>
-      <w:r>
-        <w:rPr>
-          <w:rStyle w:val="CommentReference"/>
-          <w:rFonts w:ascii="Garamond" w:hAnsi="Garamond"/>
-          <w:sz w:val="22"/>
-          <w:szCs w:val="22"/>
-        </w:rPr>
-        <w:t xml:space="preserve">to keep a relatively comparable size between all stocks. Regions of the basin which were not </w:t>
+        <w:t xml:space="preserve"> multiple units were combined to keep a relatively comparable size between all stocks. Regions of the basin which were not </w:t>
       </w:r>
       <w:r>
         <w:rPr>
@@ -6233,24 +5946,15 @@
           <w:sz w:val="22"/>
           <w:szCs w:val="22"/>
         </w:rPr>
-        <w:t xml:space="preserve">For each year and seasonal quartile, tributary-level return estimates were aggregated into management units and normalized to sum to one across the basin, representing each unit's proportional contribution to that quartile. Summary statistics were then calculated across all years for each management unit. Spatial maps illustrate the mean values for each management unit, with all tributaries </w:t>
-      </w:r>
-      <w:commentRangeStart w:id="36"/>
+        <w:t>For each year and seasonal quartile, tributary-level return estimates were aggregated into management units and normalized to sum to one across the basin, representing each unit's proportional contribution to that quartile. Summary statistics were then calculated across all years for each management unit</w:t>
+      </w:r>
       <w:r>
         <w:rPr>
           <w:rFonts w:ascii="Garamond" w:hAnsi="Garamond" w:cs="Times New Roman"/>
           <w:sz w:val="22"/>
           <w:szCs w:val="22"/>
         </w:rPr>
-        <w:t xml:space="preserve">within a unit colored according to their contribution and darker colors indicating higher values (Figure 3a). Corresponding boxplots display the median, first and third quartiles, and range of the data across all years for each management unit, ordered by </w:t>
-      </w:r>
-      <w:commentRangeEnd w:id="36"/>
-      <w:r>
-        <w:rPr>
-          <w:rStyle w:val="CommentReference"/>
-        </w:rPr>
-        <w:lastRenderedPageBreak/>
-        <w:commentReference w:id="36"/>
+        <w:t xml:space="preserve"> and maps </w:t>
       </w:r>
       <w:r>
         <w:rPr>
@@ -6258,7 +5962,7 @@
           <w:sz w:val="22"/>
           <w:szCs w:val="22"/>
         </w:rPr>
-        <w:t>watershed position from furthest upstream (top) to most downstream (bottom)</w:t>
+        <w:t>(Figure 3a)</w:t>
       </w:r>
       <w:r>
         <w:rPr>
@@ -6331,6 +6035,7 @@
           <w:sz w:val="36"/>
           <w:szCs w:val="36"/>
         </w:rPr>
+        <w:lastRenderedPageBreak/>
         <w:t>Results</w:t>
       </w:r>
     </w:p>
@@ -6345,40 +6050,6 @@
           <w:szCs w:val="36"/>
         </w:rPr>
       </w:pPr>
-      <w:ins w:id="37" w:author="Daniel Schindler" w:date="2025-08-26T16:46:00Z" w16du:dateUtc="2025-08-27T00:46:00Z">
-        <w:r>
-          <w:rPr>
-            <w:rFonts w:ascii="Garamond" w:hAnsi="Garamond"/>
-            <w:b/>
-            <w:bCs/>
-            <w:sz w:val="22"/>
-            <w:szCs w:val="22"/>
-          </w:rPr>
-          <w:t>Variation</w:t>
-        </w:r>
-      </w:ins>
-      <w:del w:id="38" w:author="Daniel Schindler" w:date="2025-08-26T16:46:00Z" w16du:dateUtc="2025-08-27T00:46:00Z">
-        <w:r>
-          <w:rPr>
-            <w:rFonts w:ascii="Garamond" w:hAnsi="Garamond"/>
-            <w:b/>
-            <w:bCs/>
-            <w:sz w:val="22"/>
-            <w:szCs w:val="22"/>
-          </w:rPr>
-          <w:delText>T</w:delText>
-        </w:r>
-        <w:r>
-          <w:rPr>
-            <w:rFonts w:ascii="Garamond" w:hAnsi="Garamond"/>
-            <w:b/>
-            <w:bCs/>
-            <w:sz w:val="22"/>
-            <w:szCs w:val="22"/>
-          </w:rPr>
-          <w:delText>rends</w:delText>
-        </w:r>
-      </w:del>
       <w:r>
         <w:rPr>
           <w:rFonts w:ascii="Garamond" w:hAnsi="Garamond"/>
@@ -6387,7 +6058,7 @@
           <w:sz w:val="22"/>
           <w:szCs w:val="22"/>
         </w:rPr>
-        <w:t xml:space="preserve"> in stock </w:t>
+        <w:t>Variation</w:t>
       </w:r>
       <w:r>
         <w:rPr>
@@ -6397,7 +6068,7 @@
           <w:sz w:val="22"/>
           <w:szCs w:val="22"/>
         </w:rPr>
-        <w:t>return timing</w:t>
+        <w:t xml:space="preserve"> in stock </w:t>
       </w:r>
       <w:r>
         <w:rPr>
@@ -6407,7 +6078,7 @@
           <w:sz w:val="22"/>
           <w:szCs w:val="22"/>
         </w:rPr>
-        <w:t xml:space="preserve"> </w:t>
+        <w:t>return timing</w:t>
       </w:r>
       <w:r>
         <w:rPr>
@@ -6417,7 +6088,7 @@
           <w:sz w:val="22"/>
           <w:szCs w:val="22"/>
         </w:rPr>
-        <w:t xml:space="preserve">within </w:t>
+        <w:t xml:space="preserve"> </w:t>
       </w:r>
       <w:r>
         <w:rPr>
@@ -6427,6 +6098,16 @@
           <w:sz w:val="22"/>
           <w:szCs w:val="22"/>
         </w:rPr>
+        <w:t xml:space="preserve">within </w:t>
+      </w:r>
+      <w:r>
+        <w:rPr>
+          <w:rFonts w:ascii="Garamond" w:hAnsi="Garamond"/>
+          <w:b/>
+          <w:bCs/>
+          <w:sz w:val="22"/>
+          <w:szCs w:val="22"/>
+        </w:rPr>
         <w:t>season</w:t>
       </w:r>
     </w:p>
@@ -6522,26 +6203,14 @@
         </w:rPr>
         <w:t xml:space="preserve">) were </w:t>
       </w:r>
-      <w:del w:id="39" w:author="Daniel Schindler" w:date="2025-08-26T16:46:00Z" w16du:dateUtc="2025-08-27T00:46:00Z">
-        <w:r>
-          <w:rPr>
-            <w:rFonts w:ascii="Garamond" w:hAnsi="Garamond"/>
-            <w:sz w:val="22"/>
-            <w:szCs w:val="22"/>
-          </w:rPr>
-          <w:delText xml:space="preserve">driven </w:delText>
-        </w:r>
-      </w:del>
-      <w:ins w:id="40" w:author="Daniel Schindler" w:date="2025-08-26T16:46:00Z" w16du:dateUtc="2025-08-27T00:46:00Z">
-        <w:r>
-          <w:rPr>
-            <w:rFonts w:ascii="Garamond" w:hAnsi="Garamond"/>
-            <w:sz w:val="22"/>
-            <w:szCs w:val="22"/>
-          </w:rPr>
-          <w:t xml:space="preserve">represented </w:t>
-        </w:r>
-      </w:ins>
+      <w:r>
+        <w:rPr>
+          <w:rFonts w:ascii="Garamond" w:hAnsi="Garamond"/>
+          <w:sz w:val="22"/>
+          <w:szCs w:val="22"/>
+        </w:rPr>
+        <w:t xml:space="preserve">represented </w:t>
+      </w:r>
       <w:r>
         <w:rPr>
           <w:rFonts w:ascii="Garamond" w:hAnsi="Garamond"/>
@@ -6785,7 +6454,6 @@
           <w:sz w:val="22"/>
           <w:szCs w:val="22"/>
         </w:rPr>
-        <w:lastRenderedPageBreak/>
         <w:t>Hoholitna</w:t>
       </w:r>
       <w:proofErr w:type="spellEnd"/>
@@ -7153,16 +6821,6 @@
         </w:rPr>
         <w:t xml:space="preserve"> (median; 6.1%)</w:t>
       </w:r>
-      <w:del w:id="41" w:author="Daniel Schindler" w:date="2025-08-26T16:48:00Z" w16du:dateUtc="2025-08-27T00:48:00Z">
-        <w:r>
-          <w:rPr>
-            <w:rFonts w:ascii="Garamond" w:hAnsi="Garamond"/>
-            <w:sz w:val="22"/>
-            <w:szCs w:val="22"/>
-          </w:rPr>
-          <w:delText xml:space="preserve"> </w:delText>
-        </w:r>
-      </w:del>
       <w:r>
         <w:rPr>
           <w:rFonts w:ascii="Garamond" w:hAnsi="Garamond"/>
@@ -7247,6 +6905,7 @@
           <w:sz w:val="22"/>
           <w:szCs w:val="22"/>
         </w:rPr>
+        <w:lastRenderedPageBreak/>
         <w:t xml:space="preserve">Cumulative distribution plots </w:t>
       </w:r>
       <w:r>
@@ -7257,7 +6916,7 @@
         </w:rPr>
         <w:t xml:space="preserve">(Figure 4) </w:t>
       </w:r>
-      <w:del w:id="42" w:author="Daniel Schindler" w:date="2025-08-26T16:49:00Z" w16du:dateUtc="2025-08-27T00:49:00Z">
+      <w:del w:id="19" w:author="Daniel Schindler" w:date="2025-08-26T16:49:00Z" w16du:dateUtc="2025-08-27T00:49:00Z">
         <w:r>
           <w:rPr>
             <w:rFonts w:ascii="Garamond" w:hAnsi="Garamond"/>
@@ -7267,24 +6926,22 @@
           <w:delText xml:space="preserve">corroborated </w:delText>
         </w:r>
       </w:del>
-      <w:ins w:id="43" w:author="Daniel Schindler" w:date="2025-08-26T16:49:00Z" w16du:dateUtc="2025-08-27T00:49:00Z">
-        <w:r>
-          <w:rPr>
-            <w:rFonts w:ascii="Garamond" w:hAnsi="Garamond"/>
-            <w:sz w:val="22"/>
-            <w:szCs w:val="22"/>
-          </w:rPr>
-          <w:t>further emphasized</w:t>
-        </w:r>
-        <w:r>
-          <w:rPr>
-            <w:rFonts w:ascii="Garamond" w:hAnsi="Garamond"/>
-            <w:sz w:val="22"/>
-            <w:szCs w:val="22"/>
-          </w:rPr>
-          <w:t xml:space="preserve"> </w:t>
-        </w:r>
-      </w:ins>
+      <w:r>
+        <w:rPr>
+          <w:rFonts w:ascii="Garamond" w:hAnsi="Garamond"/>
+          <w:sz w:val="22"/>
+          <w:szCs w:val="22"/>
+        </w:rPr>
+        <w:t>further emphasized</w:t>
+      </w:r>
+      <w:r>
+        <w:rPr>
+          <w:rFonts w:ascii="Garamond" w:hAnsi="Garamond"/>
+          <w:sz w:val="22"/>
+          <w:szCs w:val="22"/>
+        </w:rPr>
+        <w:t xml:space="preserve"> </w:t>
+      </w:r>
       <w:r>
         <w:rPr>
           <w:rFonts w:ascii="Garamond" w:hAnsi="Garamond"/>
@@ -7638,7 +7295,6 @@
           <w:sz w:val="22"/>
           <w:szCs w:val="22"/>
         </w:rPr>
-        <w:lastRenderedPageBreak/>
         <w:t>E</w:t>
       </w:r>
       <w:r>
@@ -7665,17 +7321,7 @@
         </w:rPr>
         <w:t xml:space="preserve"> clearly </w:t>
       </w:r>
-      <w:del w:id="44" w:author="Daniel Schindler" w:date="2025-08-26T16:50:00Z" w16du:dateUtc="2025-08-27T00:50:00Z">
-        <w:r>
-          <w:rPr>
-            <w:rFonts w:ascii="Garamond" w:hAnsi="Garamond"/>
-            <w:sz w:val="22"/>
-            <w:szCs w:val="22"/>
-          </w:rPr>
-          <w:delText xml:space="preserve">affords </w:delText>
-        </w:r>
-      </w:del>
-      <w:ins w:id="45" w:author="Daniel Schindler" w:date="2025-08-26T16:50:00Z" w16du:dateUtc="2025-08-27T00:50:00Z">
+      <w:ins w:id="20" w:author="Daniel Schindler" w:date="2025-08-26T16:50:00Z" w16du:dateUtc="2025-08-27T00:50:00Z">
         <w:r>
           <w:rPr>
             <w:rFonts w:ascii="Garamond" w:hAnsi="Garamond"/>
@@ -7701,16 +7347,14 @@
         </w:rPr>
         <w:t xml:space="preserve"> by the implementation of a front-end closure</w:t>
       </w:r>
-      <w:ins w:id="46" w:author="Daniel Schindler" w:date="2025-08-26T16:50:00Z" w16du:dateUtc="2025-08-27T00:50:00Z">
-        <w:r>
-          <w:rPr>
-            <w:rFonts w:ascii="Garamond" w:hAnsi="Garamond"/>
-            <w:sz w:val="22"/>
-            <w:szCs w:val="22"/>
-          </w:rPr>
-          <w:t xml:space="preserve"> management strategy</w:t>
-        </w:r>
-      </w:ins>
+      <w:r>
+        <w:rPr>
+          <w:rFonts w:ascii="Garamond" w:hAnsi="Garamond"/>
+          <w:sz w:val="22"/>
+          <w:szCs w:val="22"/>
+        </w:rPr>
+        <w:t xml:space="preserve"> management strategy</w:t>
+      </w:r>
       <w:r>
         <w:rPr>
           <w:rFonts w:ascii="Garamond" w:hAnsi="Garamond"/>
@@ -7819,7 +7463,7 @@
         </w:rPr>
         <w:t xml:space="preserve">Stocks positioned lower in the watershed received less protection due to their </w:t>
       </w:r>
-      <w:del w:id="47" w:author="Daniel Schindler" w:date="2025-08-26T16:51:00Z" w16du:dateUtc="2025-08-27T00:51:00Z">
+      <w:del w:id="21" w:author="Daniel Schindler" w:date="2025-08-26T16:51:00Z" w16du:dateUtc="2025-08-27T00:51:00Z">
         <w:r>
           <w:rPr>
             <w:rFonts w:ascii="Garamond" w:hAnsi="Garamond"/>
@@ -7837,7 +7481,7 @@
         </w:rPr>
         <w:t>late</w:t>
       </w:r>
-      <w:ins w:id="48" w:author="Daniel Schindler" w:date="2025-08-26T16:51:00Z" w16du:dateUtc="2025-08-27T00:51:00Z">
+      <w:ins w:id="22" w:author="Daniel Schindler" w:date="2025-08-26T16:51:00Z" w16du:dateUtc="2025-08-27T00:51:00Z">
         <w:r>
           <w:rPr>
             <w:rFonts w:ascii="Garamond" w:hAnsi="Garamond"/>
@@ -7940,6 +7584,7 @@
           <w:sz w:val="22"/>
           <w:szCs w:val="22"/>
         </w:rPr>
+        <w:lastRenderedPageBreak/>
         <w:t xml:space="preserve">The analysis presented here illustrates spatiotemporal patterns of Chinook salmon in the Kuskokwim river-basin at a finer spatial scale and over a longer time-period than had previously been available. In doing so, these data corroborate a </w:t>
       </w:r>
       <w:r>
@@ -8168,7 +7813,6 @@
           <w:sz w:val="22"/>
           <w:szCs w:val="22"/>
         </w:rPr>
-        <w:lastRenderedPageBreak/>
         <w:t>Importantly, this pattern is independent of overall run contribution.</w:t>
       </w:r>
       <w:r>
@@ -8380,78 +8024,25 @@
           <w:sz w:val="22"/>
           <w:szCs w:val="22"/>
         </w:rPr>
-        <w:t xml:space="preserve">These results suggest a potential limitation of a fixed date closure and highlights the difficulty of managing for dynamic ecosystem with fixed duration management. A more dynamic closure which is responsive to predicted or observed run dynamics may provide more consistent protection to upstream stocks. </w:t>
-      </w:r>
-      <w:ins w:id="49" w:author="Daniel Schindler" w:date="2025-08-26T17:06:00Z" w16du:dateUtc="2025-08-27T01:06:00Z">
-        <w:r>
-          <w:rPr>
-            <w:rFonts w:ascii="Garamond" w:hAnsi="Garamond"/>
-            <w:sz w:val="22"/>
-            <w:szCs w:val="22"/>
-          </w:rPr>
-          <w:t>However, assessi</w:t>
-        </w:r>
-      </w:ins>
-      <w:ins w:id="50" w:author="Daniel Schindler" w:date="2025-08-26T17:07:00Z" w16du:dateUtc="2025-08-27T01:07:00Z">
-        <w:r>
-          <w:rPr>
-            <w:rFonts w:ascii="Garamond" w:hAnsi="Garamond"/>
-            <w:sz w:val="22"/>
-            <w:szCs w:val="22"/>
-          </w:rPr>
-          <w:t>ng</w:t>
-        </w:r>
-      </w:ins>
-      <w:ins w:id="51" w:author="Daniel Schindler" w:date="2025-08-26T17:06:00Z" w16du:dateUtc="2025-08-27T01:06:00Z">
-        <w:r>
-          <w:rPr>
-            <w:rFonts w:ascii="Garamond" w:hAnsi="Garamond"/>
-            <w:sz w:val="22"/>
-            <w:szCs w:val="22"/>
-          </w:rPr>
-          <w:t xml:space="preserve"> stock-specific run strength in-season is </w:t>
-        </w:r>
-      </w:ins>
-      <w:ins w:id="52" w:author="Daniel Schindler" w:date="2025-08-26T17:07:00Z" w16du:dateUtc="2025-08-27T01:07:00Z">
-        <w:r>
-          <w:rPr>
-            <w:rFonts w:ascii="Garamond" w:hAnsi="Garamond"/>
-            <w:sz w:val="22"/>
-            <w:szCs w:val="22"/>
-          </w:rPr>
-          <w:t xml:space="preserve">currently </w:t>
-        </w:r>
-      </w:ins>
-      <w:ins w:id="53" w:author="Daniel Schindler" w:date="2025-08-26T17:06:00Z" w16du:dateUtc="2025-08-27T01:06:00Z">
-        <w:r>
-          <w:rPr>
-            <w:rFonts w:ascii="Garamond" w:hAnsi="Garamond"/>
-            <w:sz w:val="22"/>
-            <w:szCs w:val="22"/>
-          </w:rPr>
-          <w:t xml:space="preserve">not </w:t>
-        </w:r>
-        <w:proofErr w:type="gramStart"/>
-        <w:r>
-          <w:rPr>
-            <w:rFonts w:ascii="Garamond" w:hAnsi="Garamond"/>
-            <w:sz w:val="22"/>
-            <w:szCs w:val="22"/>
-          </w:rPr>
-          <w:t>possible</w:t>
-        </w:r>
-      </w:ins>
-      <w:ins w:id="54" w:author="Daniel Schindler" w:date="2025-08-26T17:07:00Z" w16du:dateUtc="2025-08-27T01:07:00Z">
-        <w:r>
-          <w:rPr>
-            <w:rFonts w:ascii="Garamond" w:hAnsi="Garamond"/>
-            <w:sz w:val="22"/>
-            <w:szCs w:val="22"/>
-          </w:rPr>
-          <w:t>..</w:t>
-        </w:r>
-      </w:ins>
-      <w:proofErr w:type="gramEnd"/>
+        <w:t xml:space="preserve">These results suggest a potential limitation of a fixed date closure </w:t>
+      </w:r>
+      <w:r>
+        <w:rPr>
+          <w:rFonts w:ascii="Garamond" w:hAnsi="Garamond"/>
+          <w:sz w:val="22"/>
+          <w:szCs w:val="22"/>
+        </w:rPr>
+        <w:lastRenderedPageBreak/>
+        <w:t xml:space="preserve">and highlights the difficulty of managing for dynamic ecosystem with fixed duration management. A more dynamic closure which is responsive to predicted or observed run dynamics may provide more consistent protection to upstream stocks. </w:t>
+      </w:r>
+      <w:r>
+        <w:rPr>
+          <w:rFonts w:ascii="Garamond" w:hAnsi="Garamond"/>
+          <w:sz w:val="22"/>
+          <w:szCs w:val="22"/>
+        </w:rPr>
+        <w:t>However, assessing stock-specific run strength in-season is currently not possible.</w:t>
+      </w:r>
     </w:p>
     <w:p>
       <w:pPr>
@@ -8459,7 +8050,7 @@
         <w:spacing w:line="480" w:lineRule="auto"/>
         <w:ind w:firstLine="720"/>
         <w:rPr>
-          <w:ins w:id="55" w:author="Daniel Schindler" w:date="2025-08-26T17:14:00Z" w16du:dateUtc="2025-08-27T01:14:00Z"/>
+          <w:ins w:id="23" w:author="Daniel Schindler" w:date="2025-08-26T17:14:00Z" w16du:dateUtc="2025-08-27T01:14:00Z"/>
         </w:rPr>
       </w:pPr>
       <w:r>
@@ -8598,45 +8189,24 @@
           <w:sz w:val="22"/>
           <w:szCs w:val="22"/>
         </w:rPr>
-        <w:t xml:space="preserve">Given growing global resource needs and increased uncertainty </w:t>
-      </w:r>
-      <w:r>
-        <w:rPr>
-          <w:rFonts w:ascii="Garamond" w:hAnsi="Garamond"/>
-          <w:sz w:val="22"/>
-          <w:szCs w:val="22"/>
-        </w:rPr>
-        <w:lastRenderedPageBreak/>
-        <w:t xml:space="preserve">under novel climate regimes, </w:t>
-      </w:r>
-      <w:del w:id="56" w:author="Daniel Schindler" w:date="2025-08-26T17:08:00Z" w16du:dateUtc="2025-08-27T01:08:00Z">
-        <w:r>
-          <w:rPr>
-            <w:rFonts w:ascii="Garamond" w:hAnsi="Garamond"/>
-            <w:sz w:val="22"/>
-            <w:szCs w:val="22"/>
-          </w:rPr>
-          <w:delText xml:space="preserve">understanding </w:delText>
-        </w:r>
-      </w:del>
-      <w:ins w:id="57" w:author="Daniel Schindler" w:date="2025-08-26T17:08:00Z" w16du:dateUtc="2025-08-27T01:08:00Z">
-        <w:r>
-          <w:rPr>
-            <w:rFonts w:ascii="Garamond" w:hAnsi="Garamond"/>
-            <w:sz w:val="22"/>
-            <w:szCs w:val="22"/>
-          </w:rPr>
-          <w:t>developing</w:t>
-        </w:r>
-        <w:r>
-          <w:rPr>
-            <w:rFonts w:ascii="Garamond" w:hAnsi="Garamond"/>
-            <w:sz w:val="22"/>
-            <w:szCs w:val="22"/>
-          </w:rPr>
-          <w:t xml:space="preserve"> </w:t>
-        </w:r>
-      </w:ins>
+        <w:t xml:space="preserve">Given growing global resource needs and increased uncertainty under novel climate regimes, </w:t>
+      </w:r>
+      <w:r>
+        <w:rPr>
+          <w:rFonts w:ascii="Garamond" w:hAnsi="Garamond"/>
+          <w:sz w:val="22"/>
+          <w:szCs w:val="22"/>
+        </w:rPr>
+        <w:t>developing</w:t>
+      </w:r>
+      <w:r>
+        <w:rPr>
+          <w:rFonts w:ascii="Garamond" w:hAnsi="Garamond"/>
+          <w:sz w:val="22"/>
+          <w:szCs w:val="22"/>
+        </w:rPr>
+        <w:t xml:space="preserve"> </w:t>
+      </w:r>
       <w:r>
         <w:rPr>
           <w:rFonts w:ascii="Garamond" w:hAnsi="Garamond"/>
@@ -8645,17 +8215,15 @@
         </w:rPr>
         <w:t>methods to</w:t>
       </w:r>
-      <w:ins w:id="58" w:author="Daniel Schindler" w:date="2025-08-26T17:08:00Z" w16du:dateUtc="2025-08-27T01:08:00Z">
-        <w:r>
-          <w:rPr>
-            <w:rFonts w:ascii="Garamond" w:hAnsi="Garamond"/>
-            <w:sz w:val="22"/>
-            <w:szCs w:val="22"/>
-          </w:rPr>
-          <w:t xml:space="preserve"> conserve</w:t>
-        </w:r>
-      </w:ins>
-      <w:del w:id="59" w:author="Daniel Schindler" w:date="2025-08-26T17:08:00Z" w16du:dateUtc="2025-08-27T01:08:00Z">
+      <w:r>
+        <w:rPr>
+          <w:rFonts w:ascii="Garamond" w:hAnsi="Garamond"/>
+          <w:sz w:val="22"/>
+          <w:szCs w:val="22"/>
+        </w:rPr>
+        <w:t xml:space="preserve"> conserve</w:t>
+      </w:r>
+      <w:del w:id="24" w:author="Daniel Schindler" w:date="2025-08-26T17:08:00Z" w16du:dateUtc="2025-08-27T01:08:00Z">
         <w:r>
           <w:rPr>
             <w:rFonts w:ascii="Garamond" w:hAnsi="Garamond"/>
@@ -8688,22 +8256,22 @@
           <w:szCs w:val="22"/>
         </w:rPr>
       </w:pPr>
-      <w:ins w:id="60" w:author="Daniel Schindler" w:date="2025-08-26T17:14:00Z" w16du:dateUtc="2025-08-27T01:14:00Z">
+      <w:ins w:id="25" w:author="Daniel Schindler" w:date="2025-08-26T17:14:00Z" w16du:dateUtc="2025-08-27T01:14:00Z">
         <w:r>
           <w:t>One</w:t>
         </w:r>
       </w:ins>
-      <w:ins w:id="61" w:author="Daniel Schindler" w:date="2025-08-26T17:15:00Z" w16du:dateUtc="2025-08-27T01:15:00Z">
+      <w:ins w:id="26" w:author="Daniel Schindler" w:date="2025-08-26T17:15:00Z" w16du:dateUtc="2025-08-27T01:15:00Z">
         <w:r>
           <w:t xml:space="preserve"> thing to consider is that if there is rough number of fish that the subsistence fisheries want to harvest, front end closures </w:t>
         </w:r>
       </w:ins>
-      <w:ins w:id="62" w:author="Daniel Schindler" w:date="2025-08-26T17:16:00Z" w16du:dateUtc="2025-08-27T01:16:00Z">
+      <w:ins w:id="27" w:author="Daniel Schindler" w:date="2025-08-26T17:16:00Z" w16du:dateUtc="2025-08-27T01:16:00Z">
         <w:r>
           <w:t>could</w:t>
         </w:r>
       </w:ins>
-      <w:ins w:id="63" w:author="Daniel Schindler" w:date="2025-08-26T17:15:00Z" w16du:dateUtc="2025-08-27T01:15:00Z">
+      <w:ins w:id="28" w:author="Daniel Schindler" w:date="2025-08-26T17:15:00Z" w16du:dateUtc="2025-08-27T01:15:00Z">
         <w:r>
           <w:t xml:space="preserve"> </w:t>
         </w:r>
@@ -8713,7 +8281,7 @@
         </w:r>
       </w:ins>
       <w:proofErr w:type="gramEnd"/>
-      <w:ins w:id="64" w:author="Daniel Schindler" w:date="2025-08-26T17:16:00Z" w16du:dateUtc="2025-08-27T01:16:00Z">
+      <w:ins w:id="29" w:author="Daniel Schindler" w:date="2025-08-26T17:16:00Z" w16du:dateUtc="2025-08-27T01:16:00Z">
         <w:r>
           <w:t xml:space="preserve"> in overharvest of late running stocks.</w:t>
         </w:r>
@@ -8766,7 +8334,7 @@
       </w:r>
     </w:p>
   </w:comment>
-  <w:comment w:id="11" w:author="Daniel Schindler" w:date="2025-08-26T16:00:00Z" w:initials="DS">
+  <w:comment w:id="9" w:author="Daniel Schindler" w:date="2025-08-26T16:00:00Z" w:initials="DS">
     <w:p>
       <w:pPr>
         <w:pStyle w:val="CommentText"/>
@@ -8782,7 +8350,7 @@
       </w:r>
     </w:p>
   </w:comment>
-  <w:comment w:id="18" w:author="Benjamin J. Makhlouf" w:date="2025-08-05T16:24:00Z" w:initials="b">
+  <w:comment w:id="11" w:author="Benjamin J. Makhlouf" w:date="2025-08-05T16:27:00Z" w:initials="b">
     <w:p>
       <w:r>
         <w:rPr>
@@ -8795,11 +8363,11 @@
           <w:sz w:val="20"/>
           <w:szCs w:val="20"/>
         </w:rPr>
-        <w:t>But only above Bethel? i.e not the eek?</w:t>
+        <w:t>Is it worth having this as a figure since it's in French et al</w:t>
       </w:r>
     </w:p>
   </w:comment>
-  <w:comment w:id="19" w:author="Daniel Schindler" w:date="2025-08-26T16:11:00Z" w:initials="DS">
+  <w:comment w:id="12" w:author="Daniel Schindler" w:date="2025-08-26T16:16:00Z" w:initials="DS">
     <w:p>
       <w:pPr>
         <w:pStyle w:val="CommentText"/>
@@ -8811,11 +8379,11 @@
         <w:annotationRef/>
       </w:r>
       <w:r>
-        <w:t>yes</w:t>
+        <w:t>I think it is. Its pretty squished into the French paper</w:t>
       </w:r>
     </w:p>
   </w:comment>
-  <w:comment w:id="22" w:author="Benjamin J. Makhlouf" w:date="2025-08-05T16:27:00Z" w:initials="b">
+  <w:comment w:id="13" w:author="Benjamin J. Makhlouf" w:date="2025-07-30T08:26:00Z" w:initials="b">
     <w:p>
       <w:r>
         <w:rPr>
@@ -8828,11 +8396,11 @@
           <w:sz w:val="20"/>
           <w:szCs w:val="20"/>
         </w:rPr>
-        <w:t>Is it worth having this as a figure since it's in French et al</w:t>
+        <w:t>We run into the same problem as the last paper where it is very unclear how this habitat prior is made (other than shutting off the eek). I can reasonably assume it's the same as the Yukon, but I don't know. How much detail do you think we need here?</w:t>
       </w:r>
     </w:p>
   </w:comment>
-  <w:comment w:id="23" w:author="Daniel Schindler" w:date="2025-08-26T16:16:00Z" w:initials="DS">
+  <w:comment w:id="14" w:author="Daniel Schindler" w:date="2025-08-26T16:26:00Z" w:initials="DS">
     <w:p>
       <w:pPr>
         <w:pStyle w:val="CommentText"/>
@@ -8844,11 +8412,11 @@
         <w:annotationRef/>
       </w:r>
       <w:r>
-        <w:t>I think it is. Its pretty squished into the French paper</w:t>
+        <w:t>I think just state what the assumption is and run with it. I think it’s a reasonable assumption knowing what we do about Chinook</w:t>
       </w:r>
     </w:p>
   </w:comment>
-  <w:comment w:id="29" w:author="Benjamin J. Makhlouf" w:date="2025-07-30T08:26:00Z" w:initials="b">
+  <w:comment w:id="16" w:author="Benjamin J. Makhlouf" w:date="2025-07-30T10:53:00Z" w:initials="b">
     <w:p>
       <w:r>
         <w:rPr>
@@ -8861,11 +8429,11 @@
           <w:sz w:val="20"/>
           <w:szCs w:val="20"/>
         </w:rPr>
-        <w:t>We run into the same problem as the last paper where it is very unclear how this habitat prior is made (other than shutting off the eek). I can reasonably assume it's the same as the Yukon, but I don't know. How much detail do you think we need here?</w:t>
+        <w:t>The map we used to pull these rivers is on an adfg web page but I cant track it to a publication</w:t>
       </w:r>
     </w:p>
   </w:comment>
-  <w:comment w:id="30" w:author="Daniel Schindler" w:date="2025-08-26T16:26:00Z" w:initials="DS">
+  <w:comment w:id="17" w:author="Daniel Schindler" w:date="2025-08-26T16:33:00Z" w:initials="DS">
     <w:p>
       <w:pPr>
         <w:pStyle w:val="CommentText"/>
@@ -8877,56 +8445,7 @@
         <w:annotationRef/>
       </w:r>
       <w:r>
-        <w:t>I think just state what the assumption is and run with it. I think it’s a reasonable assumption knowing what we do about Chinook</w:t>
-      </w:r>
-    </w:p>
-  </w:comment>
-  <w:comment w:id="32" w:author="Benjamin J. Makhlouf" w:date="2025-07-30T10:53:00Z" w:initials="b">
-    <w:p>
-      <w:r>
-        <w:rPr>
-          <w:rStyle w:val="CommentReference"/>
-        </w:rPr>
-        <w:annotationRef/>
-      </w:r>
-      <w:r>
-        <w:rPr>
-          <w:sz w:val="20"/>
-          <w:szCs w:val="20"/>
-        </w:rPr>
-        <w:t>The map we used to pull these rivers is on an adfg web page but I cant track it to a publication</w:t>
-      </w:r>
-    </w:p>
-  </w:comment>
-  <w:comment w:id="33" w:author="Daniel Schindler" w:date="2025-08-26T16:33:00Z" w:initials="DS">
-    <w:p>
-      <w:pPr>
-        <w:pStyle w:val="CommentText"/>
-      </w:pPr>
-      <w:r>
-        <w:rPr>
-          <w:rStyle w:val="CommentReference"/>
-        </w:rPr>
-        <w:annotationRef/>
-      </w:r>
-      <w:r>
         <w:t>Zach can point us to the correct documentation</w:t>
-      </w:r>
-    </w:p>
-  </w:comment>
-  <w:comment w:id="36" w:author="Daniel Schindler" w:date="2025-08-26T16:38:00Z" w:initials="DS">
-    <w:p>
-      <w:pPr>
-        <w:pStyle w:val="CommentText"/>
-      </w:pPr>
-      <w:r>
-        <w:rPr>
-          <w:rStyle w:val="CommentReference"/>
-        </w:rPr>
-        <w:annotationRef/>
-      </w:r>
-      <w:r>
-        <w:t xml:space="preserve">Much of this should go in the figure captions. </w:t>
       </w:r>
     </w:p>
   </w:comment>
@@ -8937,16 +8456,13 @@
 <w15:commentsEx xmlns:wpc="http://schemas.microsoft.com/office/word/2010/wordprocessingCanvas" xmlns:cx="http://schemas.microsoft.com/office/drawing/2014/chartex" xmlns:cx1="http://schemas.microsoft.com/office/drawing/2015/9/8/chartex" xmlns:cx2="http://schemas.microsoft.com/office/drawing/2015/10/21/chartex" xmlns:cx3="http://schemas.microsoft.com/office/drawing/2016/5/9/chartex" xmlns:cx4="http://schemas.microsoft.com/office/drawing/2016/5/10/chartex" xmlns:cx5="http://schemas.microsoft.com/office/drawing/2016/5/11/chartex" xmlns:cx6="http://schemas.microsoft.com/office/drawing/2016/5/12/chartex" xmlns:cx7="http://schemas.microsoft.com/office/drawing/2016/5/13/chartex" xmlns:cx8="http://schemas.microsoft.com/office/drawing/2016/5/14/chartex" xmlns:mc="http://schemas.openxmlformats.org/markup-compatibility/2006" xmlns:aink="http://schemas.microsoft.com/office/drawing/2016/ink" xmlns:am3d="http://schemas.microsoft.com/office/drawing/2017/model3d" xmlns:o="urn:schemas-microsoft-com:office:office" xmlns:oel="http://schemas.microsoft.com/office/2019/extlst" xmlns:r="http://schemas.openxmlformats.org/officeDocument/2006/relationships" xmlns:m="http://schemas.openxmlformats.org/officeDocument/2006/math" xmlns:v="urn:schemas-microsoft-com:vml" xmlns:wp14="http://schemas.microsoft.com/office/word/2010/wordprocessingDrawing" xmlns:wp="http://schemas.openxmlformats.org/drawingml/2006/wordprocessingDrawing" xmlns:w10="urn:schemas-microsoft-com:office:word" xmlns:w="http://schemas.openxmlformats.org/wordprocessingml/2006/main" xmlns:w14="http://schemas.microsoft.com/office/word/2010/wordml" xmlns:w15="http://schemas.microsoft.com/office/word/2012/wordml" xmlns:w16cex="http://schemas.microsoft.com/office/word/2018/wordml/cex" xmlns:w16cid="http://schemas.microsoft.com/office/word/2016/wordml/cid" xmlns:w16="http://schemas.microsoft.com/office/word/2018/wordml" xmlns:w16du="http://schemas.microsoft.com/office/word/2023/wordml/word16du" xmlns:w16sdtdh="http://schemas.microsoft.com/office/word/2020/wordml/sdtdatahash" xmlns:w16sdtfl="http://schemas.microsoft.com/office/word/2024/wordml/sdtformatlock" xmlns:w16se="http://schemas.microsoft.com/office/word/2015/wordml/symex" xmlns:wpg="http://schemas.microsoft.com/office/word/2010/wordprocessingGroup" xmlns:wpi="http://schemas.microsoft.com/office/word/2010/wordprocessingInk" xmlns:wne="http://schemas.microsoft.com/office/word/2006/wordml" xmlns:wps="http://schemas.microsoft.com/office/word/2010/wordprocessingShape" mc:Ignorable="w14 w15 w16se w16cid w16 w16cex w16sdtdh w16sdtfl w16du wp14">
   <w15:commentEx w15:paraId="399F0CFF" w15:done="1"/>
   <w15:commentEx w15:paraId="6A43EA9D" w15:done="0"/>
-  <w15:commentEx w15:paraId="39BC305D" w15:done="0"/>
-  <w15:commentEx w15:paraId="6A17B1A6" w15:done="0"/>
-  <w15:commentEx w15:paraId="4F3C2EB9" w15:paraIdParent="6A17B1A6" w15:done="0"/>
+  <w15:commentEx w15:paraId="39BC305D" w15:done="1"/>
   <w15:commentEx w15:paraId="4FA71363" w15:done="0"/>
   <w15:commentEx w15:paraId="34C74063" w15:paraIdParent="4FA71363" w15:done="0"/>
-  <w15:commentEx w15:paraId="78D2F929" w15:done="0"/>
-  <w15:commentEx w15:paraId="26178001" w15:paraIdParent="78D2F929" w15:done="0"/>
+  <w15:commentEx w15:paraId="78D2F929" w15:done="1"/>
+  <w15:commentEx w15:paraId="26178001" w15:paraIdParent="78D2F929" w15:done="1"/>
   <w15:commentEx w15:paraId="1EF3F5E1" w15:done="0"/>
   <w15:commentEx w15:paraId="1265733C" w15:paraIdParent="1EF3F5E1" w15:done="0"/>
-  <w15:commentEx w15:paraId="3E626EAE" w15:done="0"/>
 </w15:commentsEx>
 </file>
 
@@ -8955,15 +8471,12 @@
   <w16cex:commentExtensible w16cex:durableId="4F8011AF" w16cex:dateUtc="2025-08-26T23:44:00Z"/>
   <w16cex:commentExtensible w16cex:durableId="76C28745" w16cex:dateUtc="2025-08-26T23:57:00Z"/>
   <w16cex:commentExtensible w16cex:durableId="26A86733" w16cex:dateUtc="2025-08-27T00:00:00Z"/>
-  <w16cex:commentExtensible w16cex:durableId="4E947D26" w16cex:dateUtc="2025-08-05T23:24:00Z"/>
-  <w16cex:commentExtensible w16cex:durableId="255B0A56" w16cex:dateUtc="2025-08-27T00:11:00Z"/>
   <w16cex:commentExtensible w16cex:durableId="5F2857FB" w16cex:dateUtc="2025-08-05T23:27:00Z"/>
   <w16cex:commentExtensible w16cex:durableId="523CC5C2" w16cex:dateUtc="2025-08-27T00:16:00Z"/>
   <w16cex:commentExtensible w16cex:durableId="1D6CE52A" w16cex:dateUtc="2025-07-30T15:26:00Z"/>
   <w16cex:commentExtensible w16cex:durableId="6BCCD95A" w16cex:dateUtc="2025-08-27T00:26:00Z"/>
   <w16cex:commentExtensible w16cex:durableId="4D2F7D90" w16cex:dateUtc="2025-07-30T17:53:00Z"/>
   <w16cex:commentExtensible w16cex:durableId="71DD3A22" w16cex:dateUtc="2025-08-27T00:33:00Z"/>
-  <w16cex:commentExtensible w16cex:durableId="31AD9C6F" w16cex:dateUtc="2025-08-27T00:38:00Z"/>
 </w16cex:commentsExtensible>
 </file>
 
@@ -8972,15 +8485,12 @@
   <w16cid:commentId w16cid:paraId="399F0CFF" w16cid:durableId="4F8011AF"/>
   <w16cid:commentId w16cid:paraId="6A43EA9D" w16cid:durableId="76C28745"/>
   <w16cid:commentId w16cid:paraId="39BC305D" w16cid:durableId="26A86733"/>
-  <w16cid:commentId w16cid:paraId="6A17B1A6" w16cid:durableId="4E947D26"/>
-  <w16cid:commentId w16cid:paraId="4F3C2EB9" w16cid:durableId="255B0A56"/>
   <w16cid:commentId w16cid:paraId="4FA71363" w16cid:durableId="5F2857FB"/>
   <w16cid:commentId w16cid:paraId="34C74063" w16cid:durableId="523CC5C2"/>
   <w16cid:commentId w16cid:paraId="78D2F929" w16cid:durableId="1D6CE52A"/>
   <w16cid:commentId w16cid:paraId="26178001" w16cid:durableId="6BCCD95A"/>
   <w16cid:commentId w16cid:paraId="1EF3F5E1" w16cid:durableId="4D2F7D90"/>
   <w16cid:commentId w16cid:paraId="1265733C" w16cid:durableId="71DD3A22"/>
-  <w16cid:commentId w16cid:paraId="3E626EAE" w16cid:durableId="31AD9C6F"/>
 </w16cid:commentsIds>
 </file>
 

</xml_diff>

<commit_message>
another go through of the intro, need to clean up the refs
</commit_message>
<xml_diff>
--- a/Docs/Run_timing_manuscript.docx
+++ b/Docs/Run_timing_manuscript.docx
@@ -180,7 +180,39 @@
           <w:sz w:val="22"/>
           <w:szCs w:val="22"/>
         </w:rPr>
-        <w:t xml:space="preserve"> examine the stock-specific impacts of a front-end fishery closure implemented in the basin. We demonstrate a consistent relationship between run timing and watershed position, with earlier returning populations contributing disproportionately to the uppermost portion of the watershed. This trend was consistent when examining relative population contributions within discrete temporal windows during the return migration, as well as in cumulative distribution analyses that controlled for total return abundance. While this spatial pattern was robust, we observed interannual variability in the magnitude of population contributions and overall run timing. The front-end closure strategy provided disproportionately higher protection to upper watershed stocks, thereby preserving upstream population diversity that is critical for stabilizing basin-wide fishery dynamics.</w:t>
+        <w:t xml:space="preserve"> examine the stock-specific impacts of a front-end fishery closure implemented in the basin. We demonstrate a consistent relationship between run timing and watershed position, with earlier returning populations contributing disproportionately to the uppermost portion of the watershed. This trend was consistent when examining relative population contributions within discrete temporal windows during the return migration, as well as in cumulative distribution analyses that controlled for total return abundance. While this spatial pattern was robust, we </w:t>
+      </w:r>
+      <w:r>
+        <w:rPr>
+          <w:rFonts w:ascii="Garamond" w:hAnsi="Garamond"/>
+          <w:sz w:val="22"/>
+          <w:szCs w:val="22"/>
+        </w:rPr>
+        <w:t xml:space="preserve">did </w:t>
+      </w:r>
+      <w:r>
+        <w:rPr>
+          <w:rFonts w:ascii="Garamond" w:hAnsi="Garamond"/>
+          <w:sz w:val="22"/>
+          <w:szCs w:val="22"/>
+        </w:rPr>
+        <w:t xml:space="preserve">observed </w:t>
+      </w:r>
+      <w:r>
+        <w:rPr>
+          <w:rFonts w:ascii="Garamond" w:hAnsi="Garamond"/>
+          <w:sz w:val="22"/>
+          <w:szCs w:val="22"/>
+        </w:rPr>
+        <w:t xml:space="preserve">some level of </w:t>
+      </w:r>
+      <w:r>
+        <w:rPr>
+          <w:rFonts w:ascii="Garamond" w:hAnsi="Garamond"/>
+          <w:sz w:val="22"/>
+          <w:szCs w:val="22"/>
+        </w:rPr>
+        <w:t>interannual variability in the magnitude of population contributions and overall run timing. The front-end closure strategy provided disproportionately higher protection to upper watershed stocks, thereby preserving upstream population diversity that is critical for stabilizing basin-wide fishery dynamics.</w:t>
       </w:r>
       <w:r>
         <w:rPr>
@@ -243,184 +275,242 @@
         <w:ind w:firstLine="720"/>
         <w:rPr>
           <w:rFonts w:ascii="Garamond" w:hAnsi="Garamond"/>
-          <w:sz w:val="22"/>
-          <w:szCs w:val="22"/>
-        </w:rPr>
-      </w:pPr>
-      <w:r>
-        <w:rPr>
-          <w:rFonts w:ascii="Garamond" w:hAnsi="Garamond"/>
-          <w:sz w:val="22"/>
-          <w:szCs w:val="22"/>
-        </w:rPr>
+        </w:rPr>
+      </w:pPr>
+      <w:r>
+        <w:rPr>
+          <w:rFonts w:ascii="Garamond" w:hAnsi="Garamond"/>
+        </w:rPr>
+        <w:lastRenderedPageBreak/>
         <w:t xml:space="preserve">A </w:t>
       </w:r>
       <w:r>
         <w:rPr>
           <w:rFonts w:ascii="Garamond" w:hAnsi="Garamond"/>
-          <w:sz w:val="22"/>
-          <w:szCs w:val="22"/>
         </w:rPr>
         <w:t>key</w:t>
       </w:r>
       <w:r>
         <w:rPr>
           <w:rFonts w:ascii="Garamond" w:hAnsi="Garamond"/>
-          <w:sz w:val="22"/>
-          <w:szCs w:val="22"/>
         </w:rPr>
         <w:t xml:space="preserve"> challenge in fisheries management is balancing the dual goals of maximizing harvest opportunities </w:t>
       </w:r>
       <w:r>
         <w:rPr>
           <w:rFonts w:ascii="Garamond" w:hAnsi="Garamond"/>
-          <w:sz w:val="22"/>
-          <w:szCs w:val="22"/>
-        </w:rPr>
-        <w:t xml:space="preserve">while </w:t>
-      </w:r>
-      <w:r>
-        <w:rPr>
-          <w:rFonts w:ascii="Garamond" w:hAnsi="Garamond"/>
-          <w:sz w:val="22"/>
-          <w:szCs w:val="22"/>
-        </w:rPr>
-        <w:t>p</w:t>
-      </w:r>
-      <w:r>
-        <w:rPr>
-          <w:rFonts w:ascii="Garamond" w:hAnsi="Garamond"/>
-          <w:sz w:val="22"/>
-          <w:szCs w:val="22"/>
-        </w:rPr>
-        <w:t xml:space="preserve">reserving </w:t>
-      </w:r>
-      <w:r>
-        <w:rPr>
-          <w:rFonts w:ascii="Garamond" w:hAnsi="Garamond"/>
-          <w:sz w:val="22"/>
-          <w:szCs w:val="22"/>
-        </w:rPr>
-        <w:t>biodiversity.</w:t>
-      </w:r>
-      <w:r>
-        <w:rPr>
-          <w:rFonts w:ascii="Garamond" w:hAnsi="Garamond"/>
-          <w:sz w:val="22"/>
-          <w:szCs w:val="22"/>
+        </w:rPr>
+        <w:t xml:space="preserve">while preserving </w:t>
+      </w:r>
+      <w:r>
+        <w:rPr>
+          <w:rFonts w:ascii="Garamond" w:hAnsi="Garamond"/>
+        </w:rPr>
+        <w:t xml:space="preserve">biodiversity. </w:t>
+      </w:r>
+      <w:r>
+        <w:rPr>
+          <w:rFonts w:ascii="Garamond" w:hAnsi="Garamond"/>
+        </w:rPr>
+        <w:t>In this context, b</w:t>
+      </w:r>
+      <w:r>
+        <w:rPr>
+          <w:rFonts w:ascii="Garamond" w:hAnsi="Garamond"/>
+        </w:rPr>
+        <w:t xml:space="preserve">iodiversity can be defined </w:t>
+      </w:r>
+      <w:r>
+        <w:rPr>
+          <w:rFonts w:ascii="Garamond" w:hAnsi="Garamond"/>
+        </w:rPr>
+        <w:t>both by</w:t>
+      </w:r>
+      <w:r>
+        <w:rPr>
+          <w:rFonts w:ascii="Garamond" w:hAnsi="Garamond"/>
+        </w:rPr>
+        <w:t xml:space="preserve"> the number of species within an ecosystem</w:t>
+      </w:r>
+      <w:r>
+        <w:rPr>
+          <w:rFonts w:ascii="Garamond" w:hAnsi="Garamond"/>
+        </w:rPr>
+        <w:t xml:space="preserve"> as well as</w:t>
+      </w:r>
+      <w:r>
+        <w:rPr>
+          <w:rFonts w:ascii="Garamond" w:hAnsi="Garamond"/>
         </w:rPr>
         <w:t xml:space="preserve"> </w:t>
       </w:r>
       <w:r>
         <w:rPr>
           <w:rFonts w:ascii="Garamond" w:hAnsi="Garamond"/>
-          <w:sz w:val="22"/>
-          <w:szCs w:val="22"/>
-        </w:rPr>
-        <w:t>In this context, b</w:t>
-      </w:r>
-      <w:r>
-        <w:rPr>
-          <w:rFonts w:ascii="Garamond" w:hAnsi="Garamond"/>
-          <w:sz w:val="22"/>
-          <w:szCs w:val="22"/>
-        </w:rPr>
-        <w:t xml:space="preserve">iodiversity can be defined </w:t>
-      </w:r>
-      <w:r>
-        <w:rPr>
-          <w:rFonts w:ascii="Garamond" w:hAnsi="Garamond"/>
-          <w:sz w:val="22"/>
-          <w:szCs w:val="22"/>
-        </w:rPr>
-        <w:t>both by</w:t>
-      </w:r>
-      <w:r>
-        <w:rPr>
-          <w:rFonts w:ascii="Garamond" w:hAnsi="Garamond"/>
-          <w:sz w:val="22"/>
-          <w:szCs w:val="22"/>
-        </w:rPr>
-        <w:t xml:space="preserve"> the number of species within an ecosystem</w:t>
-      </w:r>
-      <w:r>
-        <w:rPr>
-          <w:rFonts w:ascii="Garamond" w:hAnsi="Garamond"/>
-          <w:sz w:val="22"/>
-          <w:szCs w:val="22"/>
-        </w:rPr>
-        <w:t xml:space="preserve"> as well as</w:t>
-      </w:r>
-      <w:r>
-        <w:rPr>
-          <w:rFonts w:ascii="Garamond" w:hAnsi="Garamond"/>
-          <w:sz w:val="22"/>
-          <w:szCs w:val="22"/>
+        </w:rPr>
+        <w:t xml:space="preserve">intrapopulation </w:t>
+      </w:r>
+      <w:r>
+        <w:rPr>
+          <w:rFonts w:ascii="Garamond" w:hAnsi="Garamond"/>
+        </w:rPr>
+        <w:t xml:space="preserve">diversity among </w:t>
+      </w:r>
+      <w:r>
+        <w:rPr>
+          <w:rFonts w:ascii="Garamond" w:hAnsi="Garamond"/>
+        </w:rPr>
+        <w:t xml:space="preserve">metapopulations of a </w:t>
+      </w:r>
+      <w:r>
+        <w:rPr>
+          <w:rFonts w:ascii="Garamond" w:hAnsi="Garamond"/>
+        </w:rPr>
+        <w:t>single species</w:t>
+      </w:r>
+      <w:r>
+        <w:rPr>
+          <w:rFonts w:ascii="Garamond" w:hAnsi="Garamond"/>
         </w:rPr>
         <w:t xml:space="preserve"> </w:t>
       </w:r>
       <w:r>
         <w:rPr>
           <w:rFonts w:ascii="Garamond" w:hAnsi="Garamond"/>
-          <w:sz w:val="22"/>
-          <w:szCs w:val="22"/>
-        </w:rPr>
-        <w:t xml:space="preserve">intrapopulation </w:t>
-      </w:r>
-      <w:r>
-        <w:rPr>
-          <w:rFonts w:ascii="Garamond" w:hAnsi="Garamond"/>
-          <w:sz w:val="22"/>
-          <w:szCs w:val="22"/>
-        </w:rPr>
-        <w:t xml:space="preserve">diversity among </w:t>
-      </w:r>
-      <w:r>
-        <w:rPr>
-          <w:rFonts w:ascii="Garamond" w:hAnsi="Garamond"/>
-          <w:sz w:val="22"/>
-          <w:szCs w:val="22"/>
-        </w:rPr>
-        <w:t xml:space="preserve">metapopulations of a </w:t>
-      </w:r>
-      <w:r>
-        <w:rPr>
-          <w:rFonts w:ascii="Garamond" w:hAnsi="Garamond"/>
-          <w:sz w:val="22"/>
-          <w:szCs w:val="22"/>
-        </w:rPr>
-        <w:t>single species</w:t>
-      </w:r>
-      <w:r>
-        <w:rPr>
-          <w:rFonts w:ascii="Garamond" w:hAnsi="Garamond"/>
-          <w:sz w:val="22"/>
-          <w:szCs w:val="22"/>
+        </w:rPr>
+        <w:fldChar w:fldCharType="begin"/>
+      </w:r>
+      <w:r>
+        <w:rPr>
+          <w:rFonts w:ascii="Garamond" w:hAnsi="Garamond"/>
+        </w:rPr>
+        <w:instrText xml:space="preserve"> ADDIN ZOTERO_ITEM CSL_CITATION {"citationID":"O8GNuS7R","properties":{"formattedCitation":"(Bolnick et al., 2011; Luck et al., 2003; Schindler et al., 2010)","plainCitation":"(Bolnick et al., 2011; Luck et al., 2003; Schindler et al., 2010)","noteIndex":0},"citationItems":[{"id":5318,"uris":["http://zotero.org/users/8421274/items/R2ZYTKMR"],"itemData":{"id":5318,"type":"article-journal","container-title":"Trends in Ecology &amp; Evolution","DOI":"10.1016/j.tree.2011.01.009","ISSN":"0169-5347","issue":"4","journalAbbreviation":"Trends in Ecology &amp; Evolution","language":"English","note":"publisher: Elsevier\nPMID: 21367482","page":"183-192","source":"www.cell.com","title":"Why intraspecific trait variation matters in community ecology","volume":"26","author":[{"family":"Bolnick","given":"Daniel I."},{"family":"Amarasekare","given":"Priyanga"},{"family":"Araújo","given":"Márcio S."},{"family":"Bürger","given":"Reinhard"},{"family":"Levine","given":"Jonathan M."},{"family":"Novak","given":"Mark"},{"family":"Rudolf","given":"Volker H. W."},{"family":"Schreiber","given":"Sebastian J."},{"family":"Urban","given":"Mark C."},{"family":"Vasseur","given":"David A."}],"issued":{"date-parts":[["2011",4,1]]}}},{"id":5557,"uris":["http://zotero.org/users/8421274/items/VSKUKCRX"],"itemData":{"id":5557,"type":"article-journal","abstract":"The current rate of biodiversity loss threatens to disrupt greatly the functioning of ecosystems, with potentially significant consequences for humanity. The magnitude of the loss is generally measured with the use of species extinction rates, an approach that understates the severity of the problem and masks some of its most important consequences. Here, we propose a major expansion of this focus to include population diversity: considering changes in the size, number, distribution and genetic composition of populations and the implications of those changes for the functioning of ecosystems and the provision of ecosystem services. We also outline the key components of population diversity and describe a new approach to delineating a population unit that explicitly links it to the services that it provides","container-title":"Trends in Ecology &amp; Evolution","DOI":"10.1016/S0169-5347(03)00100-9","journalAbbreviation":"Trends in Ecology &amp; Evolution","page":"331-336","source":"ResearchGate","title":"Population diversity and ecosystem services","volume":"18","author":[{"family":"Luck","given":"Gary"},{"family":"Daily","given":"Gretchen"},{"family":"Ehrlich","given":"Paul"}],"issued":{"date-parts":[["2003",7,1]]}}},{"id":272,"uris":["http://zotero.org/users/8421274/items/24NDGS7V"],"itemData":{"id":272,"type":"article-journal","abstract":"One of the most pervasive themes in ecology is that biological diversity stabilizes ecosystem processes and the services they provide to society, a concept that has become a common argument for biodiversity conservation. Species-rich communities are thought to produce more temporally stable ecosystem services because of the complementary or independent dynamics among species that perform similar ecosystem functions. Such variance dampening within communities is referred to as a portfolio effect and is analogous to the effects of asset diversity on the stability of financial portfolios. In ecology, these arguments have focused on the effects of species diversity on ecosystem stability but have not considered the importance of biologically relevant diversity within individual species. Current rates of population extirpation are probably at least three orders of magnitude higher than species extinction rates, so there is a pressing need to clarify how population and life history diversity affect the performance of individual species in providing important ecosystem services. Here we use five decades of data from Oncorhynchus nerka (sockeye salmon) in Bristol Bay, Alaska, to provide the first quantification of portfolio effects that derive from population and life history diversity in an important and heavily exploited species. Variability in annual Bristol Bay salmon returns is 2.2 times lower than it would be if the system consisted of a single homogenous population rather than the several hundred discrete populations it currently consists of. Furthermore, if it were a single homogeneous population, such increased variability would lead to ten times more frequent fisheries closures. Portfolio effects are also evident in watershed food webs, where they stabilize and extend predator access to salmon resources. Our results demonstrate the critical importance of maintaining population diversity for stabilizing ecosystem services and securing the economies and livelihoods that depend on them. The reliability of ecosystem services will erode faster than indicated by species loss alone. [PUBLICATION ABSTRACT]","container-title":"Nature","DOI":"https://doi-org.prox.lib.ncsu.edu/10.1038/nature09060","ISSN":"00280836","issue":"7298","language":"English","license":"Copyright Nature Publishing Group Jun 3, 2010","note":"number-of-pages: 5\npublisher-place: London, United States\npublisher: Nature Publishing Group\nsection: LETTERS","source":"ProQuest","title":"Population diversity and the portfolio effect in an exploited species","URL":"http://www.proquest.com/docview/375318240/abstract/317AC81E34EB4163PQ/1","volume":"465","author":[{"family":"Schindler","given":"Daniel E."},{"family":"Hilborn","given":"Ray"},{"family":"Chasco","given":"Brandon"},{"family":"Boatright","given":"Christopher P."},{"family":"Quinn","given":"Thomas P."},{"family":"Rogers","given":"Lauren A."},{"family":"Webster","given":"Michael S."}],"accessed":{"date-parts":[["2022",5,12]]},"issued":{"date-parts":[["2010",6,3]]}}}],"schema":"https://github.com/citation-style-language/schema/raw/master/csl-citation.json"} </w:instrText>
+      </w:r>
+      <w:r>
+        <w:rPr>
+          <w:rFonts w:ascii="Garamond" w:hAnsi="Garamond"/>
+        </w:rPr>
+        <w:fldChar w:fldCharType="separate"/>
+      </w:r>
+      <w:r>
+        <w:rPr>
+          <w:rFonts w:ascii="Garamond" w:hAnsi="Garamond"/>
+          <w:noProof/>
+        </w:rPr>
+        <w:t>(Bolnick et al., 2011; Luck et al., 2003; Schindler et al., 2010)</w:t>
+      </w:r>
+      <w:r>
+        <w:rPr>
+          <w:rFonts w:ascii="Garamond" w:hAnsi="Garamond"/>
+        </w:rPr>
+        <w:fldChar w:fldCharType="end"/>
+      </w:r>
+      <w:r>
+        <w:rPr>
+          <w:rFonts w:ascii="Garamond" w:hAnsi="Garamond"/>
+        </w:rPr>
+        <w:t xml:space="preserve">. </w:t>
+      </w:r>
+      <w:r>
+        <w:rPr>
+          <w:rFonts w:ascii="Garamond" w:hAnsi="Garamond"/>
+        </w:rPr>
+        <w:t xml:space="preserve">In either case, </w:t>
+      </w:r>
+      <w:r>
+        <w:rPr>
+          <w:rFonts w:ascii="Garamond" w:hAnsi="Garamond"/>
+        </w:rPr>
+        <w:t xml:space="preserve">population </w:t>
+      </w:r>
+      <w:r>
+        <w:rPr>
+          <w:rFonts w:ascii="Garamond" w:hAnsi="Garamond"/>
+        </w:rPr>
+        <w:t xml:space="preserve">diversity </w:t>
+      </w:r>
+      <w:r>
+        <w:rPr>
+          <w:rFonts w:ascii="Garamond" w:hAnsi="Garamond"/>
+        </w:rPr>
+        <w:t>stabiliz</w:t>
+      </w:r>
+      <w:r>
+        <w:rPr>
+          <w:rFonts w:ascii="Garamond" w:hAnsi="Garamond"/>
+        </w:rPr>
+        <w:t>e</w:t>
+      </w:r>
+      <w:r>
+        <w:rPr>
+          <w:rFonts w:ascii="Garamond" w:hAnsi="Garamond"/>
+        </w:rPr>
+        <w:t>s</w:t>
+      </w:r>
+      <w:r>
+        <w:rPr>
+          <w:rFonts w:ascii="Garamond" w:hAnsi="Garamond"/>
+        </w:rPr>
+        <w:t xml:space="preserve"> ecosystem level processes</w:t>
+      </w:r>
+      <w:r>
+        <w:rPr>
+          <w:rFonts w:ascii="Garamond" w:hAnsi="Garamond"/>
+        </w:rPr>
+        <w:t>, bolster</w:t>
+      </w:r>
+      <w:r>
+        <w:rPr>
+          <w:rFonts w:ascii="Garamond" w:hAnsi="Garamond"/>
+        </w:rPr>
+        <w:t>s</w:t>
+      </w:r>
+      <w:r>
+        <w:rPr>
+          <w:rFonts w:ascii="Garamond" w:hAnsi="Garamond"/>
+        </w:rPr>
+        <w:t xml:space="preserve"> resilience to environmental change,</w:t>
+      </w:r>
+      <w:r>
+        <w:rPr>
+          <w:rFonts w:ascii="Garamond" w:hAnsi="Garamond"/>
+        </w:rPr>
+        <w:t xml:space="preserve"> and increase</w:t>
+      </w:r>
+      <w:r>
+        <w:rPr>
+          <w:rFonts w:ascii="Garamond" w:hAnsi="Garamond"/>
+        </w:rPr>
+        <w:t>s</w:t>
+      </w:r>
+      <w:r>
+        <w:rPr>
+          <w:rFonts w:ascii="Garamond" w:hAnsi="Garamond"/>
         </w:rPr>
         <w:t xml:space="preserve"> </w:t>
       </w:r>
       <w:r>
         <w:rPr>
           <w:rFonts w:ascii="Garamond" w:hAnsi="Garamond"/>
-          <w:sz w:val="22"/>
-          <w:szCs w:val="22"/>
-        </w:rPr>
-        <w:lastRenderedPageBreak/>
+        </w:rPr>
+        <w:t xml:space="preserve">the reliability of ecosystem services </w:t>
+      </w:r>
+      <w:commentRangeStart w:id="3"/>
+      <w:r>
+        <w:rPr>
+          <w:rFonts w:ascii="Garamond" w:hAnsi="Garamond"/>
+        </w:rPr>
         <w:fldChar w:fldCharType="begin"/>
       </w:r>
       <w:r>
         <w:rPr>
           <w:rFonts w:ascii="Garamond" w:hAnsi="Garamond"/>
-          <w:sz w:val="22"/>
-          <w:szCs w:val="22"/>
-        </w:rPr>
-        <w:instrText xml:space="preserve"> ADDIN ZOTERO_ITEM CSL_CITATION {"citationID":"O8GNuS7R","properties":{"formattedCitation":"(Bolnick et al., 2011; Luck et al., 2003; Schindler et al., 2010)","plainCitation":"(Bolnick et al., 2011; Luck et al., 2003; Schindler et al., 2010)","noteIndex":0},"citationItems":[{"id":5318,"uris":["http://zotero.org/users/8421274/items/R2ZYTKMR"],"itemData":{"id":5318,"type":"article-journal","container-title":"Trends in Ecology &amp; Evolution","DOI":"10.1016/j.tree.2011.01.009","ISSN":"0169-5347","issue":"4","journalAbbreviation":"Trends in Ecology &amp; Evolution","language":"English","note":"publisher: Elsevier\nPMID: 21367482","page":"183-192","source":"www.cell.com","title":"Why intraspecific trait variation matters in community ecology","volume":"26","author":[{"family":"Bolnick","given":"Daniel I."},{"family":"Amarasekare","given":"Priyanga"},{"family":"Araújo","given":"Márcio S."},{"family":"Bürger","given":"Reinhard"},{"family":"Levine","given":"Jonathan M."},{"family":"Novak","given":"Mark"},{"family":"Rudolf","given":"Volker H. W."},{"family":"Schreiber","given":"Sebastian J."},{"family":"Urban","given":"Mark C."},{"family":"Vasseur","given":"David A."}],"issued":{"date-parts":[["2011",4,1]]}}},{"id":5557,"uris":["http://zotero.org/users/8421274/items/VSKUKCRX"],"itemData":{"id":5557,"type":"article-journal","abstract":"The current rate of biodiversity loss threatens to disrupt greatly the functioning of ecosystems, with potentially significant consequences for humanity. The magnitude of the loss is generally measured with the use of species extinction rates, an approach that understates the severity of the problem and masks some of its most important consequences. Here, we propose a major expansion of this focus to include population diversity: considering changes in the size, number, distribution and genetic composition of populations and the implications of those changes for the functioning of ecosystems and the provision of ecosystem services. We also outline the key components of population diversity and describe a new approach to delineating a population unit that explicitly links it to the services that it provides","container-title":"Trends in Ecology &amp; Evolution","DOI":"10.1016/S0169-5347(03)00100-9","journalAbbreviation":"Trends in Ecology &amp; Evolution","page":"331-336","source":"ResearchGate","title":"Population diversity and ecosystem services","volume":"18","author":[{"family":"Luck","given":"Gary"},{"family":"Daily","given":"Gretchen"},{"family":"Ehrlich","given":"Paul"}],"issued":{"date-parts":[["2003",7,1]]}}},{"id":272,"uris":["http://zotero.org/users/8421274/items/24NDGS7V"],"itemData":{"id":272,"type":"article-journal","abstract":"One of the most pervasive themes in ecology is that biological diversity stabilizes ecosystem processes and the services they provide to society, a concept that has become a common argument for biodiversity conservation. Species-rich communities are thought to produce more temporally stable ecosystem services because of the complementary or independent dynamics among species that perform similar ecosystem functions. Such variance dampening within communities is referred to as a portfolio effect and is analogous to the effects of asset diversity on the stability of financial portfolios. In ecology, these arguments have focused on the effects of species diversity on ecosystem stability but have not considered the importance of biologically relevant diversity within individual species. Current rates of population extirpation are probably at least three orders of magnitude higher than species extinction rates, so there is a pressing need to clarify how population and life history diversity affect the performance of individual species in providing important ecosystem services. Here we use five decades of data from Oncorhynchus nerka (sockeye salmon) in Bristol Bay, Alaska, to provide the first quantification of portfolio effects that derive from population and life history diversity in an important and heavily exploited species. Variability in annual Bristol Bay salmon returns is 2.2 times lower than it would be if the system consisted of a single homogenous population rather than the several hundred discrete populations it currently consists of. Furthermore, if it were a single homogeneous population, such increased variability would lead to ten times more frequent fisheries closures. Portfolio effects are also evident in watershed food webs, where they stabilize and extend predator access to salmon resources. Our results demonstrate the critical importance of maintaining population diversity for stabilizing ecosystem services and securing the economies and livelihoods that depend on them. The reliability of ecosystem services will erode faster than indicated by species loss alone. [PUBLICATION ABSTRACT]","container-title":"Nature","DOI":"https://doi-org.prox.lib.ncsu.edu/10.1038/nature09060","ISSN":"00280836","issue":"7298","language":"English","license":"Copyright Nature Publishing Group Jun 3, 2010","note":"number-of-pages: 5\npublisher-place: London, United States\npublisher: Nature Publishing Group\nsection: LETTERS","source":"ProQuest","title":"Population diversity and the portfolio effect in an exploited species","URL":"http://www.proquest.com/docview/375318240/abstract/317AC81E34EB4163PQ/1","volume":"465","author":[{"family":"Schindler","given":"Daniel E."},{"family":"Hilborn","given":"Ray"},{"family":"Chasco","given":"Brandon"},{"family":"Boatright","given":"Christopher P."},{"family":"Quinn","given":"Thomas P."},{"family":"Rogers","given":"Lauren A."},{"family":"Webster","given":"Michael S."}],"accessed":{"date-parts":[["2022",5,12]]},"issued":{"date-parts":[["2010",6,3]]}}}],"schema":"https://github.com/citation-style-language/schema/raw/master/csl-citation.json"} </w:instrText>
-      </w:r>
-      <w:r>
-        <w:rPr>
-          <w:rFonts w:ascii="Garamond" w:hAnsi="Garamond"/>
-          <w:sz w:val="22"/>
-          <w:szCs w:val="22"/>
+        </w:rPr>
+        <w:instrText xml:space="preserve"> ADDIN ZOTERO_ITEM CSL_CITATION {"citationID":"VDgUGdsR","properties":{"formattedCitation":"(Nesbitt &amp; Moore, 2016; Schindler et al., 2015)","plainCitation":"(Nesbitt &amp; Moore, 2016; Schindler et al., 2015)","noteIndex":0},"citationItems":[{"id":3361,"uris":["http://zotero.org/users/8421274/items/U6M4JZTI"],"itemData":{"id":3361,"type":"article-journal","abstract":"Indigenous people are considered to be among the most vulnerable to food insecurity and biodiversity loss. Biodiversity is cited as a key component of indigenous food security; however, quantitative examples of this linkage are limited. We examined how species and population diversity influence the food security of indigenous fisheries for Pacific salmon (Oncorhynchus species). We compared two dimensions of food security – catch stability (interannual variability) and access (season length) – across a salmon diversity gradient for 21 fisheries on the Fraser River, Canada, over 30 years, using linear regression models. We used population diversity proxies derived from a range of existing measures because population-specific data were unavailable. While both population and species diversity were generally associated with higher catch stability and temporal access, population diversity had a stronger signal. Fisheries with access to high species diversity had up to 1·4 times more stable catch than predicted by the portfolio effect and up to 1·2 times longer fishing seasons than fisheries with access to fewer species. Fisheries with access to high population diversity had up to 3·8 times more stable catch and three times longer seasons than fisheries with access to fewer populations. Catch stability of Chinook Oncorhynchus tshawytscha and sockeye Oncorhynchus nerka fisheries was best explained by the number of populations and conservation units, respectively, that migrate past a fishery en route to spawning grounds. Similar population diversity metrics were important explanatory variables for season length of sockeye, pink Oncorhynchus gorbuscha, coho Oncorhynchus kisutch and chum Oncorhynchus keta fisheries. Synthesis and applications. We show an empirical example of how multiple scales of biodiversity support food security across a large watershed and suggest that protecting fine-scale salmon diversity will help promote food security for indigenous people. The scales of environmental assessments need to match the scales of the socio-ecological processes that will be affected by development. We illustrate that upstream projects that damage salmon habitat could degrade the food security of downstream indigenous fisheries, with implications to Canadian indigenous people and to watersheds around the world where migratory fishes support local fisheries.","container-title":"Journal of Applied Ecology","DOI":"10.1111/1365-2664.12717","ISSN":"1365-2664","issue":"5","language":"en","note":"_eprint: https://onlinelibrary.wiley.com/doi/pdf/10.1111/1365-2664.12717","page":"1489-1499","source":"Wiley Online Library","title":"Species and population diversity in Pacific salmon fisheries underpin indigenous food security","volume":"53","author":[{"family":"Nesbitt","given":"Holly K."},{"family":"Moore","given":"Jonathan W."}],"issued":{"date-parts":[["2016"]]}}},{"id":68,"uris":["http://zotero.org/users/8421274/items/DIRY8NHC"],"itemData":{"id":68,"type":"article-journal","container-title":"Frontiers in Ecology and the Environment","issue":"5","note":"publisher: Wiley Online Library","page":"257–263","source":"Google Scholar","title":"The portfolio concept in ecology and evolution","volume":"13","author":[{"family":"Schindler","given":"Daniel E."},{"family":"Armstrong","given":"Jonathan B."},{"family":"Reed","given":"Thomas E."}],"issued":{"date-parts":[["2015"]]}}}],"schema":"https://github.com/citation-style-language/schema/raw/master/csl-citation.json"} </w:instrText>
+      </w:r>
+      <w:r>
+        <w:rPr>
+          <w:rFonts w:ascii="Garamond" w:hAnsi="Garamond"/>
         </w:rPr>
         <w:fldChar w:fldCharType="separate"/>
       </w:r>
@@ -428,315 +518,121 @@
         <w:rPr>
           <w:rFonts w:ascii="Garamond" w:hAnsi="Garamond"/>
           <w:noProof/>
-          <w:sz w:val="22"/>
-          <w:szCs w:val="22"/>
-        </w:rPr>
-        <w:t>(Bolnick et al., 2011; Luck et al., 2003; Schindler et al., 2010)</w:t>
-      </w:r>
-      <w:r>
-        <w:rPr>
-          <w:rFonts w:ascii="Garamond" w:hAnsi="Garamond"/>
-          <w:sz w:val="22"/>
-          <w:szCs w:val="22"/>
+        </w:rPr>
+        <w:t>(Schindler et al., 2015)</w:t>
+      </w:r>
+      <w:r>
+        <w:rPr>
+          <w:rFonts w:ascii="Garamond" w:hAnsi="Garamond"/>
         </w:rPr>
         <w:fldChar w:fldCharType="end"/>
       </w:r>
-      <w:r>
-        <w:rPr>
-          <w:rFonts w:ascii="Garamond" w:hAnsi="Garamond"/>
-          <w:sz w:val="22"/>
-          <w:szCs w:val="22"/>
+      <w:commentRangeEnd w:id="3"/>
+      <w:r>
+        <w:rPr>
+          <w:rStyle w:val="CommentReference"/>
+          <w:rFonts w:ascii="Garamond" w:hAnsi="Garamond"/>
+          <w:sz w:val="24"/>
+          <w:szCs w:val="24"/>
+        </w:rPr>
+        <w:commentReference w:id="3"/>
+      </w:r>
+      <w:r>
+        <w:rPr>
+          <w:rFonts w:ascii="Garamond" w:hAnsi="Garamond"/>
         </w:rPr>
         <w:t xml:space="preserve">. </w:t>
       </w:r>
       <w:r>
         <w:rPr>
           <w:rFonts w:ascii="Garamond" w:hAnsi="Garamond"/>
-          <w:sz w:val="22"/>
-          <w:szCs w:val="22"/>
-        </w:rPr>
-        <w:t xml:space="preserve">In either case, </w:t>
-      </w:r>
-      <w:r>
-        <w:rPr>
-          <w:rFonts w:ascii="Garamond" w:hAnsi="Garamond"/>
-          <w:sz w:val="22"/>
-          <w:szCs w:val="22"/>
-        </w:rPr>
-        <w:t xml:space="preserve">population </w:t>
-      </w:r>
-      <w:r>
-        <w:rPr>
-          <w:rFonts w:ascii="Garamond" w:hAnsi="Garamond"/>
-          <w:sz w:val="22"/>
-          <w:szCs w:val="22"/>
-        </w:rPr>
-        <w:t xml:space="preserve">diversity </w:t>
-      </w:r>
-      <w:r>
-        <w:rPr>
-          <w:rFonts w:ascii="Garamond" w:hAnsi="Garamond"/>
-          <w:sz w:val="22"/>
-          <w:szCs w:val="22"/>
-        </w:rPr>
-        <w:t>stabiliz</w:t>
-      </w:r>
-      <w:r>
-        <w:rPr>
-          <w:rFonts w:ascii="Garamond" w:hAnsi="Garamond"/>
-          <w:sz w:val="22"/>
-          <w:szCs w:val="22"/>
-        </w:rPr>
-        <w:t>e</w:t>
-      </w:r>
-      <w:ins w:id="3" w:author="Daniel Schindler" w:date="2025-08-26T15:43:00Z" w16du:dateUtc="2025-08-26T23:43:00Z">
+        </w:rPr>
+        <w:t>Designing management strategies that explicitly protect biodiversity</w:t>
+      </w:r>
+      <w:r>
+        <w:rPr>
+          <w:rFonts w:ascii="Garamond" w:hAnsi="Garamond"/>
+        </w:rPr>
+        <w:t>, however,</w:t>
+      </w:r>
+      <w:r>
+        <w:rPr>
+          <w:rFonts w:ascii="Garamond" w:hAnsi="Garamond"/>
+        </w:rPr>
+        <w:t xml:space="preserve"> require a thorough understanding of the ecological mechanisms that drive it. In many </w:t>
+      </w:r>
+      <w:r>
+        <w:rPr>
+          <w:rFonts w:ascii="Garamond" w:hAnsi="Garamond"/>
+        </w:rPr>
+        <w:t xml:space="preserve">cases, such as in </w:t>
+      </w:r>
+      <w:r>
+        <w:rPr>
+          <w:rFonts w:ascii="Garamond" w:hAnsi="Garamond"/>
+        </w:rPr>
+        <w:t>large and remote ecosystems,</w:t>
+      </w:r>
+      <w:r>
+        <w:rPr>
+          <w:rFonts w:ascii="Garamond" w:hAnsi="Garamond"/>
+        </w:rPr>
+        <w:t xml:space="preserve"> understanding these patterns at sufficient spatial or temporal scales remains a challenge</w:t>
+      </w:r>
+      <w:r>
+        <w:rPr>
+          <w:rFonts w:ascii="Garamond" w:hAnsi="Garamond"/>
+        </w:rPr>
+        <w:t>.</w:t>
+      </w:r>
+    </w:p>
+    <w:p>
+      <w:pPr>
+        <w:spacing w:line="480" w:lineRule="auto"/>
+        <w:ind w:firstLine="720"/>
+        <w:rPr>
+          <w:rFonts w:ascii="Garamond" w:hAnsi="Garamond"/>
+        </w:rPr>
+      </w:pPr>
+      <w:commentRangeStart w:id="4"/>
+      <w:commentRangeEnd w:id="4"/>
+      <w:r>
+        <w:rPr>
+          <w:rStyle w:val="CommentReference"/>
+          <w:rFonts w:ascii="Garamond" w:hAnsi="Garamond"/>
+          <w:sz w:val="24"/>
+          <w:szCs w:val="24"/>
+        </w:rPr>
+        <w:commentReference w:id="4"/>
+      </w:r>
+      <w:r>
+        <w:rPr>
+          <w:rFonts w:ascii="Garamond" w:hAnsi="Garamond"/>
+        </w:rPr>
+        <w:t>Pacific salmon returning to North American watersheds</w:t>
+      </w:r>
+      <w:r>
+        <w:rPr>
+          <w:rFonts w:ascii="Garamond" w:hAnsi="Garamond"/>
+        </w:rPr>
+        <w:t xml:space="preserve"> exhibit significant diversity in run timing and spatial distribution across large</w:t>
+      </w:r>
+      <w:r>
+        <w:rPr>
+          <w:rFonts w:ascii="Garamond" w:hAnsi="Garamond"/>
+        </w:rPr>
+        <w:t xml:space="preserve"> and</w:t>
+      </w:r>
+      <w:r>
+        <w:rPr>
+          <w:rFonts w:ascii="Garamond" w:hAnsi="Garamond"/>
+        </w:rPr>
+        <w:t xml:space="preserve"> complex</w:t>
+      </w:r>
+      <w:ins w:id="5" w:author="Daniel Schindler" w:date="2025-08-26T15:48:00Z" w16du:dateUtc="2025-08-26T23:48:00Z">
         <w:r>
           <w:rPr>
             <w:rFonts w:ascii="Garamond" w:hAnsi="Garamond"/>
-            <w:sz w:val="22"/>
-            <w:szCs w:val="22"/>
-          </w:rPr>
-          <w:t>s</w:t>
-        </w:r>
-      </w:ins>
-      <w:r>
-        <w:rPr>
-          <w:rFonts w:ascii="Garamond" w:hAnsi="Garamond"/>
-          <w:sz w:val="22"/>
-          <w:szCs w:val="22"/>
-        </w:rPr>
-        <w:t xml:space="preserve"> ecosystem level processes</w:t>
-      </w:r>
-      <w:r>
-        <w:rPr>
-          <w:rFonts w:ascii="Garamond" w:hAnsi="Garamond"/>
-          <w:sz w:val="22"/>
-          <w:szCs w:val="22"/>
-        </w:rPr>
-        <w:t>, bolster</w:t>
-      </w:r>
-      <w:ins w:id="4" w:author="Daniel Schindler" w:date="2025-08-26T15:43:00Z" w16du:dateUtc="2025-08-26T23:43:00Z">
-        <w:r>
-          <w:rPr>
-            <w:rFonts w:ascii="Garamond" w:hAnsi="Garamond"/>
-            <w:sz w:val="22"/>
-            <w:szCs w:val="22"/>
-          </w:rPr>
-          <w:t>s</w:t>
-        </w:r>
-      </w:ins>
-      <w:r>
-        <w:rPr>
-          <w:rFonts w:ascii="Garamond" w:hAnsi="Garamond"/>
-          <w:sz w:val="22"/>
-          <w:szCs w:val="22"/>
-        </w:rPr>
-        <w:t xml:space="preserve"> resilience to environmental change,</w:t>
-      </w:r>
-      <w:r>
-        <w:rPr>
-          <w:rFonts w:ascii="Garamond" w:hAnsi="Garamond"/>
-          <w:sz w:val="22"/>
-          <w:szCs w:val="22"/>
-        </w:rPr>
-        <w:t xml:space="preserve"> and increase</w:t>
-      </w:r>
-      <w:ins w:id="5" w:author="Daniel Schindler" w:date="2025-08-26T15:43:00Z" w16du:dateUtc="2025-08-26T23:43:00Z">
-        <w:r>
-          <w:rPr>
-            <w:rFonts w:ascii="Garamond" w:hAnsi="Garamond"/>
-            <w:sz w:val="22"/>
-            <w:szCs w:val="22"/>
-          </w:rPr>
-          <w:t>s</w:t>
-        </w:r>
-      </w:ins>
-      <w:r>
-        <w:rPr>
-          <w:rFonts w:ascii="Garamond" w:hAnsi="Garamond"/>
-          <w:sz w:val="22"/>
-          <w:szCs w:val="22"/>
-        </w:rPr>
-        <w:t xml:space="preserve"> </w:t>
-      </w:r>
-      <w:r>
-        <w:rPr>
-          <w:rFonts w:ascii="Garamond" w:hAnsi="Garamond"/>
-          <w:sz w:val="22"/>
-          <w:szCs w:val="22"/>
-        </w:rPr>
-        <w:t xml:space="preserve">the reliability of ecosystem services </w:t>
-      </w:r>
-      <w:commentRangeStart w:id="6"/>
-      <w:r>
-        <w:rPr>
-          <w:rFonts w:ascii="Garamond" w:hAnsi="Garamond"/>
-          <w:sz w:val="22"/>
-          <w:szCs w:val="22"/>
-        </w:rPr>
-        <w:fldChar w:fldCharType="begin"/>
-      </w:r>
-      <w:r>
-        <w:rPr>
-          <w:rFonts w:ascii="Garamond" w:hAnsi="Garamond"/>
-          <w:sz w:val="22"/>
-          <w:szCs w:val="22"/>
-        </w:rPr>
-        <w:instrText xml:space="preserve"> ADDIN ZOTERO_ITEM CSL_CITATION {"citationID":"VDgUGdsR","properties":{"formattedCitation":"(Nesbitt &amp; Moore, 2016; Schindler et al., 2015)","plainCitation":"(Nesbitt &amp; Moore, 2016; Schindler et al., 2015)","noteIndex":0},"citationItems":[{"id":3361,"uris":["http://zotero.org/users/8421274/items/U6M4JZTI"],"itemData":{"id":3361,"type":"article-journal","abstract":"Indigenous people are considered to be among the most vulnerable to food insecurity and biodiversity loss. Biodiversity is cited as a key component of indigenous food security; however, quantitative examples of this linkage are limited. We examined how species and population diversity influence the food security of indigenous fisheries for Pacific salmon (Oncorhynchus species). We compared two dimensions of food security – catch stability (interannual variability) and access (season length) – across a salmon diversity gradient for 21 fisheries on the Fraser River, Canada, over 30 years, using linear regression models. We used population diversity proxies derived from a range of existing measures because population-specific data were unavailable. While both population and species diversity were generally associated with higher catch stability and temporal access, population diversity had a stronger signal. Fisheries with access to high species diversity had up to 1·4 times more stable catch than predicted by the portfolio effect and up to 1·2 times longer fishing seasons than fisheries with access to fewer species. Fisheries with access to high population diversity had up to 3·8 times more stable catch and three times longer seasons than fisheries with access to fewer populations. Catch stability of Chinook Oncorhynchus tshawytscha and sockeye Oncorhynchus nerka fisheries was best explained by the number of populations and conservation units, respectively, that migrate past a fishery en route to spawning grounds. Similar population diversity metrics were important explanatory variables for season length of sockeye, pink Oncorhynchus gorbuscha, coho Oncorhynchus kisutch and chum Oncorhynchus keta fisheries. Synthesis and applications. We show an empirical example of how multiple scales of biodiversity support food security across a large watershed and suggest that protecting fine-scale salmon diversity will help promote food security for indigenous people. The scales of environmental assessments need to match the scales of the socio-ecological processes that will be affected by development. We illustrate that upstream projects that damage salmon habitat could degrade the food security of downstream indigenous fisheries, with implications to Canadian indigenous people and to watersheds around the world where migratory fishes support local fisheries.","container-title":"Journal of Applied Ecology","DOI":"10.1111/1365-2664.12717","ISSN":"1365-2664","issue":"5","language":"en","note":"_eprint: https://onlinelibrary.wiley.com/doi/pdf/10.1111/1365-2664.12717","page":"1489-1499","source":"Wiley Online Library","title":"Species and population diversity in Pacific salmon fisheries underpin indigenous food security","volume":"53","author":[{"family":"Nesbitt","given":"Holly K."},{"family":"Moore","given":"Jonathan W."}],"issued":{"date-parts":[["2016"]]}}},{"id":68,"uris":["http://zotero.org/users/8421274/items/DIRY8NHC"],"itemData":{"id":68,"type":"article-journal","container-title":"Frontiers in Ecology and the Environment","issue":"5","note":"publisher: Wiley Online Library","page":"257–263","source":"Google Scholar","title":"The portfolio concept in ecology and evolution","volume":"13","author":[{"family":"Schindler","given":"Daniel E."},{"family":"Armstrong","given":"Jonathan B."},{"family":"Reed","given":"Thomas E."}],"issued":{"date-parts":[["2015"]]}}}],"schema":"https://github.com/citation-style-language/schema/raw/master/csl-citation.json"} </w:instrText>
-      </w:r>
-      <w:r>
-        <w:rPr>
-          <w:rFonts w:ascii="Garamond" w:hAnsi="Garamond"/>
-          <w:sz w:val="22"/>
-          <w:szCs w:val="22"/>
-        </w:rPr>
-        <w:fldChar w:fldCharType="separate"/>
-      </w:r>
-      <w:r>
-        <w:rPr>
-          <w:rFonts w:ascii="Garamond" w:hAnsi="Garamond"/>
-          <w:noProof/>
-          <w:sz w:val="22"/>
-          <w:szCs w:val="22"/>
-        </w:rPr>
-        <w:t>(Schindler et al., 2015)</w:t>
-      </w:r>
-      <w:r>
-        <w:rPr>
-          <w:rFonts w:ascii="Garamond" w:hAnsi="Garamond"/>
-          <w:sz w:val="22"/>
-          <w:szCs w:val="22"/>
-        </w:rPr>
-        <w:fldChar w:fldCharType="end"/>
-      </w:r>
-      <w:commentRangeEnd w:id="6"/>
-      <w:r>
-        <w:rPr>
-          <w:rStyle w:val="CommentReference"/>
-        </w:rPr>
-        <w:commentReference w:id="6"/>
-      </w:r>
-      <w:r>
-        <w:rPr>
-          <w:rFonts w:ascii="Garamond" w:hAnsi="Garamond"/>
-          <w:sz w:val="22"/>
-          <w:szCs w:val="22"/>
-        </w:rPr>
-        <w:t xml:space="preserve">. </w:t>
-      </w:r>
-      <w:r>
-        <w:rPr>
-          <w:rFonts w:ascii="Garamond" w:hAnsi="Garamond"/>
-          <w:sz w:val="22"/>
-          <w:szCs w:val="22"/>
-        </w:rPr>
-        <w:t>Designing management strategies that explicitly protect biodiversity</w:t>
-      </w:r>
-      <w:r>
-        <w:rPr>
-          <w:rFonts w:ascii="Garamond" w:hAnsi="Garamond"/>
-          <w:sz w:val="22"/>
-          <w:szCs w:val="22"/>
-        </w:rPr>
-        <w:t>, however,</w:t>
-      </w:r>
-      <w:r>
-        <w:rPr>
-          <w:rFonts w:ascii="Garamond" w:hAnsi="Garamond"/>
-          <w:sz w:val="22"/>
-          <w:szCs w:val="22"/>
-        </w:rPr>
-        <w:t xml:space="preserve"> require a thorough understanding of the ecological mechanisms that drive it. In many </w:t>
-      </w:r>
-      <w:r>
-        <w:rPr>
-          <w:rFonts w:ascii="Garamond" w:hAnsi="Garamond"/>
-          <w:sz w:val="22"/>
-          <w:szCs w:val="22"/>
-        </w:rPr>
-        <w:t xml:space="preserve">cases, such as in </w:t>
-      </w:r>
-      <w:r>
-        <w:rPr>
-          <w:rFonts w:ascii="Garamond" w:hAnsi="Garamond"/>
-          <w:sz w:val="22"/>
-          <w:szCs w:val="22"/>
-        </w:rPr>
-        <w:t>large and remote ecosystems,</w:t>
-      </w:r>
-      <w:r>
-        <w:rPr>
-          <w:rFonts w:ascii="Garamond" w:hAnsi="Garamond"/>
-          <w:sz w:val="22"/>
-          <w:szCs w:val="22"/>
-        </w:rPr>
-        <w:t xml:space="preserve"> understanding these patterns at sufficient spatial or temporal scales remains a challenge</w:t>
-      </w:r>
-      <w:r>
-        <w:rPr>
-          <w:rFonts w:ascii="Garamond" w:hAnsi="Garamond"/>
-          <w:sz w:val="22"/>
-          <w:szCs w:val="22"/>
-        </w:rPr>
-        <w:t xml:space="preserve">. </w:t>
-      </w:r>
-    </w:p>
-    <w:p>
-      <w:pPr>
-        <w:spacing w:line="480" w:lineRule="auto"/>
-        <w:ind w:firstLine="720"/>
-        <w:rPr>
-          <w:rFonts w:ascii="Garamond" w:hAnsi="Garamond"/>
-          <w:sz w:val="22"/>
-          <w:szCs w:val="22"/>
-        </w:rPr>
-      </w:pPr>
-      <w:commentRangeStart w:id="7"/>
-      <w:commentRangeEnd w:id="7"/>
-      <w:r>
-        <w:rPr>
-          <w:rStyle w:val="CommentReference"/>
-        </w:rPr>
-        <w:commentReference w:id="7"/>
-      </w:r>
-      <w:r>
-        <w:rPr>
-          <w:rFonts w:ascii="Garamond" w:hAnsi="Garamond"/>
-          <w:sz w:val="22"/>
-          <w:szCs w:val="22"/>
-        </w:rPr>
-        <w:t>Pacific salmon returning to North American watersheds</w:t>
-      </w:r>
-      <w:r>
-        <w:rPr>
-          <w:rFonts w:ascii="Garamond" w:hAnsi="Garamond"/>
-          <w:sz w:val="22"/>
-          <w:szCs w:val="22"/>
-        </w:rPr>
-        <w:t xml:space="preserve"> exhibit significant diversity in run timing and spatial distribution across large</w:t>
-      </w:r>
-      <w:r>
-        <w:rPr>
-          <w:rFonts w:ascii="Garamond" w:hAnsi="Garamond"/>
-          <w:sz w:val="22"/>
-          <w:szCs w:val="22"/>
-        </w:rPr>
-        <w:t xml:space="preserve"> and</w:t>
-      </w:r>
-      <w:r>
-        <w:rPr>
-          <w:rFonts w:ascii="Garamond" w:hAnsi="Garamond"/>
-          <w:sz w:val="22"/>
-          <w:szCs w:val="22"/>
-        </w:rPr>
-        <w:t xml:space="preserve"> complex</w:t>
-      </w:r>
-      <w:ins w:id="8" w:author="Daniel Schindler" w:date="2025-08-26T15:48:00Z" w16du:dateUtc="2025-08-26T23:48:00Z">
-        <w:r>
-          <w:rPr>
-            <w:rFonts w:ascii="Garamond" w:hAnsi="Garamond"/>
-            <w:sz w:val="22"/>
-            <w:szCs w:val="22"/>
           </w:rPr>
           <w:t xml:space="preserve"> </w:t>
         </w:r>
@@ -744,258 +640,210 @@
       <w:r>
         <w:rPr>
           <w:rFonts w:ascii="Garamond" w:hAnsi="Garamond"/>
-          <w:sz w:val="22"/>
-          <w:szCs w:val="22"/>
         </w:rPr>
         <w:t>river systems</w:t>
       </w:r>
       <w:r>
         <w:rPr>
           <w:rFonts w:ascii="Garamond" w:hAnsi="Garamond"/>
-          <w:sz w:val="22"/>
-          <w:szCs w:val="22"/>
-        </w:rPr>
-        <w:t xml:space="preserve"> (Schindler et al. 2010, Nesbitt and Moore.</w:t>
-      </w:r>
-      <w:r>
-        <w:rPr>
-          <w:rFonts w:ascii="Garamond" w:hAnsi="Garamond"/>
-          <w:sz w:val="22"/>
-          <w:szCs w:val="22"/>
+        </w:rPr>
+        <w:t xml:space="preserve"> </w:t>
+      </w:r>
+      <w:r>
+        <w:rPr>
+          <w:rFonts w:ascii="Garamond" w:hAnsi="Garamond"/>
+          <w:highlight w:val="yellow"/>
+        </w:rPr>
+        <w:t>(Schindler et al. 2010, Nesbitt and Moore.</w:t>
+      </w:r>
+      <w:r>
+        <w:rPr>
+          <w:rFonts w:ascii="Garamond" w:hAnsi="Garamond"/>
+          <w:highlight w:val="yellow"/>
         </w:rPr>
         <w:t>, Griffiths et al.</w:t>
       </w:r>
       <w:r>
         <w:rPr>
           <w:rFonts w:ascii="Garamond" w:hAnsi="Garamond"/>
-          <w:sz w:val="22"/>
-          <w:szCs w:val="22"/>
+          <w:highlight w:val="yellow"/>
         </w:rPr>
         <w:t>.)</w:t>
       </w:r>
       <w:r>
         <w:rPr>
           <w:rFonts w:ascii="Garamond" w:hAnsi="Garamond"/>
-          <w:sz w:val="22"/>
-          <w:szCs w:val="22"/>
+          <w:highlight w:val="yellow"/>
+        </w:rPr>
+        <w:t>.</w:t>
+      </w:r>
+      <w:r>
+        <w:rPr>
+          <w:rFonts w:ascii="Garamond" w:hAnsi="Garamond"/>
+        </w:rPr>
+        <w:t xml:space="preserve"> </w:t>
+      </w:r>
+      <w:r>
+        <w:rPr>
+          <w:rFonts w:ascii="Garamond" w:hAnsi="Garamond"/>
+        </w:rPr>
+        <w:t xml:space="preserve">Populations of adult fish migrating upstream are comprised of multiple </w:t>
+      </w:r>
+      <w:r>
+        <w:rPr>
+          <w:rFonts w:ascii="Garamond" w:hAnsi="Garamond"/>
+        </w:rPr>
+        <w:t>distinct</w:t>
+      </w:r>
+      <w:r>
+        <w:rPr>
+          <w:rFonts w:ascii="Garamond" w:hAnsi="Garamond"/>
+        </w:rPr>
+        <w:t xml:space="preserve"> spatial stocks </w:t>
+      </w:r>
+      <w:r>
+        <w:rPr>
+          <w:rFonts w:ascii="Garamond" w:hAnsi="Garamond"/>
+        </w:rPr>
+        <w:t xml:space="preserve">which vary in their relative </w:t>
+      </w:r>
+      <w:r>
+        <w:rPr>
+          <w:rFonts w:ascii="Garamond" w:hAnsi="Garamond"/>
+        </w:rPr>
+        <w:t>strength,</w:t>
+      </w:r>
+      <w:r>
+        <w:rPr>
+          <w:rFonts w:ascii="Garamond" w:hAnsi="Garamond"/>
+        </w:rPr>
+        <w:t xml:space="preserve"> </w:t>
+      </w:r>
+      <w:r>
+        <w:rPr>
+          <w:rFonts w:ascii="Garamond" w:hAnsi="Garamond"/>
+        </w:rPr>
+        <w:t xml:space="preserve">but which </w:t>
+      </w:r>
+      <w:r>
+        <w:rPr>
+          <w:rFonts w:ascii="Garamond" w:hAnsi="Garamond"/>
+        </w:rPr>
+        <w:t xml:space="preserve">co-migrate within overlapping temporal windows. </w:t>
+      </w:r>
+      <w:r>
+        <w:rPr>
+          <w:rFonts w:ascii="Garamond" w:hAnsi="Garamond"/>
+        </w:rPr>
+        <w:t xml:space="preserve">As a result, downstream fisheries </w:t>
+      </w:r>
+      <w:r>
+        <w:rPr>
+          <w:rFonts w:ascii="Garamond" w:hAnsi="Garamond"/>
+        </w:rPr>
+        <w:t>that</w:t>
+      </w:r>
+      <w:r>
+        <w:rPr>
+          <w:rFonts w:ascii="Garamond" w:hAnsi="Garamond"/>
+        </w:rPr>
+        <w:t xml:space="preserve"> harvest migrating fish risk overexploitation of vulnerable stocks which co-migrate with more robust </w:t>
+      </w:r>
+      <w:r>
+        <w:rPr>
+          <w:rFonts w:ascii="Garamond" w:hAnsi="Garamond"/>
+        </w:rPr>
+        <w:t>ones</w:t>
+      </w:r>
+      <w:r>
+        <w:rPr>
+          <w:rFonts w:ascii="Garamond" w:hAnsi="Garamond"/>
+        </w:rPr>
+        <w:t xml:space="preserve"> </w:t>
+      </w:r>
+      <w:r>
+        <w:rPr>
+          <w:rFonts w:ascii="Garamond" w:hAnsi="Garamond"/>
+        </w:rPr>
+        <w:fldChar w:fldCharType="begin"/>
+      </w:r>
+      <w:r>
+        <w:rPr>
+          <w:rFonts w:ascii="Garamond" w:hAnsi="Garamond"/>
+        </w:rPr>
+        <w:instrText xml:space="preserve"> ADDIN ZOTERO_ITEM CSL_CITATION {"citationID":"Xy2B32bc","properties":{"formattedCitation":"(Connors et al., 2020; Moore et al., 2021)","plainCitation":"(Connors et al., 2020; Moore et al., 2021)","noteIndex":0},"citationItems":[{"id":4416,"uris":["http://zotero.org/users/8421274/items/STEMPPV7"],"itemData":{"id":4416,"type":"article-journal","abstract":"Accounting for population diversity can be critical to the sustainable management of mixed-stock fisheries because harvest rates that can be sustained by productive populations may come at the cost of overfishing less productive ones. While these harvest–diversity trade-offs are well-recognized, their consequences for harvest policy performance are not often explicitly evaluated in contemporary fisheries management. We use closed-loop simulations to evaluate the ability of alternative harvest policies to meet population diversity and fishery objectives for one of the largest subsistence Chinook salmon (Oncorhynchus tshawytscha) fisheries in the world (Kuskokwim River Basin in western Alaska). We found clear evidence of population diversity that resulted in asymmetric trade-offs among fishery and conservation objectives whereby policies that forgo relatively small amounts of harvest result in relatively large increases in equitable access to Chinook and elimination of risk of weak stock extirpation. The performance of alternative harvest policies, and the magnitude of trade-offs, were sensitive to regime shifts and uncertainty in the drivers of recruitment variation. However, we found that harvest policies that prioritized meeting minimum subsistence needs were unlikely to jeopardize long-term sustainability.","container-title":"Canadian Journal of Fisheries and Aquatic Sciences","DOI":"10.1139/cjfas-2019-0282","ISSN":"0706-652X","issue":"6","journalAbbreviation":"Can. J. Fish. Aquat. Sci.","note":"publisher: NRC Research Press","page":"1076-1089","source":"cdnsciencepub-com.offcampus.lib.washington.edu (Atypon)","title":"Incorporating harvest–population diversity trade-offs into harvest policy analyses of salmon management in large river basins","volume":"77","author":[{"family":"Connors","given":"Brendan M."},{"family":"Staton","given":"Benjamin"},{"family":"Coggins","given":"Lewis"},{"family":"Walters","given":"Carl"},{"family":"Jones","given":"Mike"},{"family":"Gwinn","given":"Daniel"},{"family":"Catalano","given":"Matt"},{"family":"Fleischman","given":"Steve"}],"issued":{"date-parts":[["2020",6]]}}},{"id":2083,"uris":["http://zotero.org/users/8421274/items/4M6WQVDS"],"itemData":{"id":2083,"type":"article-journal","abstract":"Fish biodiversity sustains the resilience and productivity of fisheries, yet this biodiversity can be threatened by overharvest and depletion in mixed-stock fisheries. Thus, the biodiversity that provides benefits may also make sustainable resource extraction more difficult, a key challenge in fisheries management. We simulated a mixed-stock fishery to explore relationships between different dimensions of biodiversity and fishery performance relative to conservation and fishery objectives. Different dimensions of biodiversity (number of stocks, evenness, asynchrony among stocks, heterogeneity in stock productivity) exacerbated trade-offs between fishery and conservation objectives. For example, fisheries targeting stock-complexes with greater asynchrony, and to a lesser extent richness, had greater stability in harvest through time but also greater risks of overfishing weak stocks and reduced yield compared to less biodiverse stock-complexes. These trade-offs were ameliorated by increasing management control—the capacity of fishery managers to harvest specific stocks. To explore these trade-offs in real-world fisheries, we contrasted the fishing and population status of individual stocks within three major mixed-stock sockeye salmon (Oncorhynchus nerka, Salmonidae) fisheries—Bristol Bay, Fraser River, and Skeena River. In general, the fisheries with lower management control had individual stocks that were more often being over- or under-fished, compared with those with higher management control, though variation among regions in biodiversity, scale of management, and magnitude of habitat alteration likely also contribute to these relationships. Collectively, our findings emphasize that there is a need to extract less or regulate better in order to conserve and benefit from biodiversity in fisheries and other natural resource management systems.","container-title":"Fish and Fisheries","DOI":"10.1111/faf.12567","ISSN":"1467-2979","issue":"5","language":"en","note":"_eprint: https://onlinelibrary.wiley.com/doi/pdf/10.1111/faf.12567","page":"1024-1040","source":"Wiley Online Library","title":"Conservation risks and portfolio effects in mixed-stock fisheries","volume":"22","author":[{"family":"Moore","given":"Jonathan W."},{"family":"Connors","given":"Brendan M."},{"family":"Hodgson","given":"Emma E."}],"issued":{"date-parts":[["2021"]]}}}],"schema":"https://github.com/citation-style-language/schema/raw/master/csl-citation.json"} </w:instrText>
+      </w:r>
+      <w:r>
+        <w:rPr>
+          <w:rFonts w:ascii="Garamond" w:hAnsi="Garamond"/>
+        </w:rPr>
+        <w:fldChar w:fldCharType="separate"/>
+      </w:r>
+      <w:r>
+        <w:rPr>
+          <w:rFonts w:ascii="Garamond" w:hAnsi="Garamond"/>
+          <w:noProof/>
+        </w:rPr>
+        <w:t>(Connors et al., 2020; Moore et al., 2021)</w:t>
+      </w:r>
+      <w:r>
+        <w:rPr>
+          <w:rFonts w:ascii="Garamond" w:hAnsi="Garamond"/>
+        </w:rPr>
+        <w:fldChar w:fldCharType="end"/>
+      </w:r>
+      <w:r>
+        <w:rPr>
+          <w:rFonts w:ascii="Garamond" w:hAnsi="Garamond"/>
         </w:rPr>
         <w:t xml:space="preserve">. </w:t>
       </w:r>
       <w:r>
         <w:rPr>
           <w:rFonts w:ascii="Garamond" w:hAnsi="Garamond"/>
-          <w:sz w:val="22"/>
-          <w:szCs w:val="22"/>
-        </w:rPr>
-        <w:t xml:space="preserve">Populations of adult fish migrating upstream are comprised of multiple </w:t>
-      </w:r>
-      <w:r>
-        <w:rPr>
-          <w:rFonts w:ascii="Garamond" w:hAnsi="Garamond"/>
-          <w:sz w:val="22"/>
-          <w:szCs w:val="22"/>
-        </w:rPr>
-        <w:t>distinct</w:t>
-      </w:r>
-      <w:r>
-        <w:rPr>
-          <w:rFonts w:ascii="Garamond" w:hAnsi="Garamond"/>
-          <w:sz w:val="22"/>
-          <w:szCs w:val="22"/>
-        </w:rPr>
-        <w:t xml:space="preserve"> spatial stocks </w:t>
-      </w:r>
-      <w:r>
-        <w:rPr>
-          <w:rFonts w:ascii="Garamond" w:hAnsi="Garamond"/>
-          <w:sz w:val="22"/>
-          <w:szCs w:val="22"/>
-        </w:rPr>
-        <w:t xml:space="preserve">which vary in their relative </w:t>
-      </w:r>
-      <w:r>
-        <w:rPr>
-          <w:rFonts w:ascii="Garamond" w:hAnsi="Garamond"/>
-          <w:sz w:val="22"/>
-          <w:szCs w:val="22"/>
-        </w:rPr>
-        <w:t>strength,</w:t>
-      </w:r>
-      <w:r>
-        <w:rPr>
-          <w:rFonts w:ascii="Garamond" w:hAnsi="Garamond"/>
-          <w:sz w:val="22"/>
-          <w:szCs w:val="22"/>
+        </w:rPr>
+        <w:t>The timing, strength, and duration of</w:t>
+      </w:r>
+      <w:r>
+        <w:rPr>
+          <w:rFonts w:ascii="Garamond" w:hAnsi="Garamond"/>
+        </w:rPr>
+        <w:t xml:space="preserve"> these fisheries </w:t>
+      </w:r>
+      <w:r>
+        <w:rPr>
+          <w:rFonts w:ascii="Garamond" w:hAnsi="Garamond"/>
+        </w:rPr>
+        <w:t xml:space="preserve">are the </w:t>
+      </w:r>
+      <w:r>
+        <w:rPr>
+          <w:rFonts w:ascii="Garamond" w:hAnsi="Garamond"/>
+        </w:rPr>
+        <w:t xml:space="preserve">result of the aggregate dynamics of upstream stock components </w:t>
+      </w:r>
+      <w:r>
+        <w:rPr>
+          <w:rFonts w:ascii="Garamond" w:hAnsi="Garamond"/>
+          <w:highlight w:val="yellow"/>
+        </w:rPr>
+        <w:t>(Nesbitt and Moore, X).</w:t>
+      </w:r>
+      <w:r>
+        <w:rPr>
+          <w:rFonts w:ascii="Garamond" w:hAnsi="Garamond"/>
         </w:rPr>
         <w:t xml:space="preserve"> </w:t>
       </w:r>
       <w:r>
         <w:rPr>
           <w:rFonts w:ascii="Garamond" w:hAnsi="Garamond"/>
-          <w:sz w:val="22"/>
-          <w:szCs w:val="22"/>
-        </w:rPr>
-        <w:t xml:space="preserve">but which </w:t>
-      </w:r>
-      <w:r>
-        <w:rPr>
-          <w:rFonts w:ascii="Garamond" w:hAnsi="Garamond"/>
-          <w:sz w:val="22"/>
-          <w:szCs w:val="22"/>
-        </w:rPr>
-        <w:t xml:space="preserve">co-migrate within overlapping temporal windows. </w:t>
-      </w:r>
-      <w:r>
-        <w:rPr>
-          <w:rFonts w:ascii="Garamond" w:hAnsi="Garamond"/>
-          <w:sz w:val="22"/>
-          <w:szCs w:val="22"/>
-        </w:rPr>
-        <w:t xml:space="preserve">As a result, downstream fisheries </w:t>
-      </w:r>
-      <w:r>
-        <w:rPr>
-          <w:rFonts w:ascii="Garamond" w:hAnsi="Garamond"/>
-          <w:sz w:val="22"/>
-          <w:szCs w:val="22"/>
-        </w:rPr>
-        <w:t>that</w:t>
-      </w:r>
-      <w:r>
-        <w:rPr>
-          <w:rFonts w:ascii="Garamond" w:hAnsi="Garamond"/>
-          <w:sz w:val="22"/>
-          <w:szCs w:val="22"/>
-        </w:rPr>
-        <w:t xml:space="preserve"> harvest migrating fish risk overexploitation of vulnerable stocks which co-migrate with more robust </w:t>
-      </w:r>
-      <w:r>
-        <w:rPr>
-          <w:rFonts w:ascii="Garamond" w:hAnsi="Garamond"/>
-          <w:sz w:val="22"/>
-          <w:szCs w:val="22"/>
-        </w:rPr>
-        <w:t>ones</w:t>
-      </w:r>
-      <w:r>
-        <w:rPr>
-          <w:rFonts w:ascii="Garamond" w:hAnsi="Garamond"/>
-          <w:sz w:val="22"/>
-          <w:szCs w:val="22"/>
-        </w:rPr>
-        <w:t xml:space="preserve"> </w:t>
-      </w:r>
-      <w:r>
-        <w:rPr>
-          <w:rFonts w:ascii="Garamond" w:hAnsi="Garamond"/>
-          <w:sz w:val="22"/>
-          <w:szCs w:val="22"/>
-        </w:rPr>
-        <w:fldChar w:fldCharType="begin"/>
-      </w:r>
-      <w:r>
-        <w:rPr>
-          <w:rFonts w:ascii="Garamond" w:hAnsi="Garamond"/>
-          <w:sz w:val="22"/>
-          <w:szCs w:val="22"/>
-        </w:rPr>
-        <w:instrText xml:space="preserve"> ADDIN ZOTERO_ITEM CSL_CITATION {"citationID":"Xy2B32bc","properties":{"formattedCitation":"(Connors et al., 2020; Moore et al., 2021)","plainCitation":"(Connors et al., 2020; Moore et al., 2021)","noteIndex":0},"citationItems":[{"id":4416,"uris":["http://zotero.org/users/8421274/items/STEMPPV7"],"itemData":{"id":4416,"type":"article-journal","abstract":"Accounting for population diversity can be critical to the sustainable management of mixed-stock fisheries because harvest rates that can be sustained by productive populations may come at the cost of overfishing less productive ones. While these harvest–diversity trade-offs are well-recognized, their consequences for harvest policy performance are not often explicitly evaluated in contemporary fisheries management. We use closed-loop simulations to evaluate the ability of alternative harvest policies to meet population diversity and fishery objectives for one of the largest subsistence Chinook salmon (Oncorhynchus tshawytscha) fisheries in the world (Kuskokwim River Basin in western Alaska). We found clear evidence of population diversity that resulted in asymmetric trade-offs among fishery and conservation objectives whereby policies that forgo relatively small amounts of harvest result in relatively large increases in equitable access to Chinook and elimination of risk of weak stock extirpation. The performance of alternative harvest policies, and the magnitude of trade-offs, were sensitive to regime shifts and uncertainty in the drivers of recruitment variation. However, we found that harvest policies that prioritized meeting minimum subsistence needs were unlikely to jeopardize long-term sustainability.","container-title":"Canadian Journal of Fisheries and Aquatic Sciences","DOI":"10.1139/cjfas-2019-0282","ISSN":"0706-652X","issue":"6","journalAbbreviation":"Can. J. Fish. Aquat. Sci.","note":"publisher: NRC Research Press","page":"1076-1089","source":"cdnsciencepub-com.offcampus.lib.washington.edu (Atypon)","title":"Incorporating harvest–population diversity trade-offs into harvest policy analyses of salmon management in large river basins","volume":"77","author":[{"family":"Connors","given":"Brendan M."},{"family":"Staton","given":"Benjamin"},{"family":"Coggins","given":"Lewis"},{"family":"Walters","given":"Carl"},{"family":"Jones","given":"Mike"},{"family":"Gwinn","given":"Daniel"},{"family":"Catalano","given":"Matt"},{"family":"Fleischman","given":"Steve"}],"issued":{"date-parts":[["2020",6]]}}},{"id":2083,"uris":["http://zotero.org/users/8421274/items/4M6WQVDS"],"itemData":{"id":2083,"type":"article-journal","abstract":"Fish biodiversity sustains the resilience and productivity of fisheries, yet this biodiversity can be threatened by overharvest and depletion in mixed-stock fisheries. Thus, the biodiversity that provides benefits may also make sustainable resource extraction more difficult, a key challenge in fisheries management. We simulated a mixed-stock fishery to explore relationships between different dimensions of biodiversity and fishery performance relative to conservation and fishery objectives. Different dimensions of biodiversity (number of stocks, evenness, asynchrony among stocks, heterogeneity in stock productivity) exacerbated trade-offs between fishery and conservation objectives. For example, fisheries targeting stock-complexes with greater asynchrony, and to a lesser extent richness, had greater stability in harvest through time but also greater risks of overfishing weak stocks and reduced yield compared to less biodiverse stock-complexes. These trade-offs were ameliorated by increasing management control—the capacity of fishery managers to harvest specific stocks. To explore these trade-offs in real-world fisheries, we contrasted the fishing and population status of individual stocks within three major mixed-stock sockeye salmon (Oncorhynchus nerka, Salmonidae) fisheries—Bristol Bay, Fraser River, and Skeena River. In general, the fisheries with lower management control had individual stocks that were more often being over- or under-fished, compared with those with higher management control, though variation among regions in biodiversity, scale of management, and magnitude of habitat alteration likely also contribute to these relationships. Collectively, our findings emphasize that there is a need to extract less or regulate better in order to conserve and benefit from biodiversity in fisheries and other natural resource management systems.","container-title":"Fish and Fisheries","DOI":"10.1111/faf.12567","ISSN":"1467-2979","issue":"5","language":"en","note":"_eprint: https://onlinelibrary.wiley.com/doi/pdf/10.1111/faf.12567","page":"1024-1040","source":"Wiley Online Library","title":"Conservation risks and portfolio effects in mixed-stock fisheries","volume":"22","author":[{"family":"Moore","given":"Jonathan W."},{"family":"Connors","given":"Brendan M."},{"family":"Hodgson","given":"Emma E."}],"issued":{"date-parts":[["2021"]]}}}],"schema":"https://github.com/citation-style-language/schema/raw/master/csl-citation.json"} </w:instrText>
-      </w:r>
-      <w:r>
-        <w:rPr>
-          <w:rFonts w:ascii="Garamond" w:hAnsi="Garamond"/>
-          <w:sz w:val="22"/>
-          <w:szCs w:val="22"/>
-        </w:rPr>
-        <w:fldChar w:fldCharType="separate"/>
-      </w:r>
-      <w:r>
-        <w:rPr>
-          <w:rFonts w:ascii="Garamond" w:hAnsi="Garamond"/>
-          <w:noProof/>
-          <w:sz w:val="22"/>
-          <w:szCs w:val="22"/>
-        </w:rPr>
-        <w:t>(Connors et al., 2020; Moore et al., 2021)</w:t>
-      </w:r>
-      <w:r>
-        <w:rPr>
-          <w:rFonts w:ascii="Garamond" w:hAnsi="Garamond"/>
-          <w:sz w:val="22"/>
-          <w:szCs w:val="22"/>
-        </w:rPr>
-        <w:fldChar w:fldCharType="end"/>
-      </w:r>
-      <w:r>
-        <w:rPr>
-          <w:rFonts w:ascii="Garamond" w:hAnsi="Garamond"/>
-          <w:sz w:val="22"/>
-          <w:szCs w:val="22"/>
-        </w:rPr>
-        <w:t xml:space="preserve">. </w:t>
-      </w:r>
-      <w:r>
-        <w:rPr>
-          <w:rFonts w:ascii="Garamond" w:hAnsi="Garamond"/>
-          <w:sz w:val="22"/>
-          <w:szCs w:val="22"/>
-        </w:rPr>
-        <w:t>The timing, strength, and duration of</w:t>
-      </w:r>
-      <w:r>
-        <w:rPr>
-          <w:rFonts w:ascii="Garamond" w:hAnsi="Garamond"/>
-          <w:sz w:val="22"/>
-          <w:szCs w:val="22"/>
-        </w:rPr>
-        <w:t xml:space="preserve"> these fisheries </w:t>
-      </w:r>
-      <w:r>
-        <w:rPr>
-          <w:rFonts w:ascii="Garamond" w:hAnsi="Garamond"/>
-          <w:sz w:val="22"/>
-          <w:szCs w:val="22"/>
-        </w:rPr>
-        <w:t xml:space="preserve">are the </w:t>
-      </w:r>
-      <w:r>
-        <w:rPr>
-          <w:rFonts w:ascii="Garamond" w:hAnsi="Garamond"/>
-          <w:sz w:val="22"/>
-          <w:szCs w:val="22"/>
-        </w:rPr>
-        <w:t xml:space="preserve">result of the aggregate dynamics of upstream stock components </w:t>
-      </w:r>
-      <w:r>
-        <w:rPr>
-          <w:rFonts w:ascii="Garamond" w:hAnsi="Garamond"/>
-          <w:sz w:val="22"/>
-          <w:szCs w:val="22"/>
-          <w:highlight w:val="yellow"/>
-        </w:rPr>
-        <w:t>(Nesbitt and Moore, X).</w:t>
-      </w:r>
-      <w:r>
-        <w:rPr>
-          <w:rFonts w:ascii="Garamond" w:hAnsi="Garamond"/>
-          <w:sz w:val="22"/>
-          <w:szCs w:val="22"/>
-        </w:rPr>
-        <w:t xml:space="preserve"> </w:t>
-      </w:r>
-      <w:r>
-        <w:rPr>
-          <w:rFonts w:ascii="Garamond" w:hAnsi="Garamond"/>
-          <w:sz w:val="22"/>
-          <w:szCs w:val="22"/>
         </w:rPr>
         <w:t xml:space="preserve">Maintaining life history diversity across the full stock complex stabilizes downstream resources by distributing risk across several loosely or negatively correlated populations. </w:t>
       </w:r>
       <w:r>
         <w:rPr>
           <w:rFonts w:ascii="Garamond" w:hAnsi="Garamond"/>
-          <w:sz w:val="22"/>
-          <w:szCs w:val="22"/>
         </w:rPr>
         <w:t>Moreover, maximizing diversity in run timing may extend fishing opportunities by allowing harvest of multiple stock components migrating at different times.</w:t>
       </w:r>
@@ -1006,39 +854,29 @@
         <w:ind w:firstLine="720"/>
         <w:rPr>
           <w:rFonts w:ascii="Garamond" w:hAnsi="Garamond"/>
-          <w:sz w:val="22"/>
-          <w:szCs w:val="22"/>
-        </w:rPr>
-      </w:pPr>
-      <w:r>
-        <w:rPr>
-          <w:rFonts w:ascii="Garamond" w:hAnsi="Garamond"/>
-          <w:sz w:val="22"/>
-          <w:szCs w:val="22"/>
+        </w:rPr>
+      </w:pPr>
+      <w:r>
+        <w:rPr>
+          <w:rFonts w:ascii="Garamond" w:hAnsi="Garamond"/>
         </w:rPr>
         <w:t xml:space="preserve">Western Alaska watersheds contain some of the last remaining pristine salmon habitat and have historically supported large returns of Pacific salmon. </w:t>
       </w:r>
       <w:r>
         <w:rPr>
           <w:rFonts w:ascii="Garamond" w:hAnsi="Garamond"/>
-          <w:sz w:val="22"/>
-          <w:szCs w:val="22"/>
         </w:rPr>
         <w:t>In the Kuskokwim River basin, a large</w:t>
       </w:r>
       <w:r>
         <w:rPr>
           <w:rFonts w:ascii="Garamond" w:hAnsi="Garamond"/>
-          <w:sz w:val="22"/>
-          <w:szCs w:val="22"/>
         </w:rPr>
         <w:t xml:space="preserve"> (127,000 km</w:t>
       </w:r>
       <w:r>
         <w:rPr>
           <w:rFonts w:ascii="Garamond" w:hAnsi="Garamond"/>
-          <w:sz w:val="22"/>
-          <w:szCs w:val="22"/>
           <w:vertAlign w:val="superscript"/>
         </w:rPr>
         <w:t>2</w:t>
@@ -1046,24 +884,18 @@
       <w:r>
         <w:rPr>
           <w:rFonts w:ascii="Garamond" w:hAnsi="Garamond"/>
-          <w:sz w:val="22"/>
-          <w:szCs w:val="22"/>
         </w:rPr>
         <w:t>)</w:t>
       </w:r>
       <w:r>
         <w:rPr>
           <w:rFonts w:ascii="Garamond" w:hAnsi="Garamond"/>
-          <w:sz w:val="22"/>
-          <w:szCs w:val="22"/>
         </w:rPr>
         <w:t xml:space="preserve"> free flowing watershed in Western Alaska, Chinook salmon</w:t>
       </w:r>
       <w:r>
         <w:rPr>
           <w:rFonts w:ascii="Garamond" w:hAnsi="Garamond"/>
-          <w:sz w:val="22"/>
-          <w:szCs w:val="22"/>
         </w:rPr>
         <w:t xml:space="preserve"> (</w:t>
       </w:r>
@@ -1073,8 +905,6 @@
           <w:i/>
           <w:iCs/>
           <w:color w:val="000000" w:themeColor="text1"/>
-          <w:sz w:val="22"/>
-          <w:szCs w:val="22"/>
         </w:rPr>
         <w:t>Oncorhynchus tshawytscha</w:t>
       </w:r>
@@ -1082,8 +912,6 @@
         <w:rPr>
           <w:rFonts w:ascii="Garamond" w:hAnsi="Garamond"/>
           <w:color w:val="000000" w:themeColor="text1"/>
-          <w:sz w:val="22"/>
-          <w:szCs w:val="22"/>
         </w:rPr>
         <w:t>)</w:t>
       </w:r>
@@ -1091,49 +919,81 @@
         <w:rPr>
           <w:rFonts w:ascii="Garamond" w:hAnsi="Garamond"/>
           <w:color w:val="000000" w:themeColor="text1"/>
-          <w:sz w:val="22"/>
-          <w:szCs w:val="22"/>
         </w:rPr>
         <w:t xml:space="preserve"> </w:t>
       </w:r>
       <w:r>
         <w:rPr>
           <w:rFonts w:ascii="Garamond" w:hAnsi="Garamond"/>
-          <w:sz w:val="22"/>
-          <w:szCs w:val="22"/>
-        </w:rPr>
+        </w:rPr>
+        <w:lastRenderedPageBreak/>
         <w:t xml:space="preserve">populations </w:t>
       </w:r>
       <w:r>
         <w:rPr>
           <w:rFonts w:ascii="Garamond" w:hAnsi="Garamond"/>
-          <w:sz w:val="22"/>
-          <w:szCs w:val="22"/>
-        </w:rPr>
-        <w:t>support subsistence fishing opportunities for dozens of communities, almost all of which are rural and indigenous</w:t>
-      </w:r>
-      <w:r>
-        <w:rPr>
-          <w:rFonts w:ascii="Garamond" w:hAnsi="Garamond"/>
-          <w:sz w:val="22"/>
-          <w:szCs w:val="22"/>
+        </w:rPr>
+        <w:t xml:space="preserve">support subsistence fishing opportunities for dozens of communities, almost all of which are rural and indigenous </w:t>
+      </w:r>
+      <w:r>
+        <w:rPr>
+          <w:rFonts w:ascii="Garamond" w:hAnsi="Garamond"/>
+          <w:highlight w:val="yellow"/>
+        </w:rPr>
+        <w:t xml:space="preserve">(Clark et al., 2018; </w:t>
+      </w:r>
+      <w:proofErr w:type="spellStart"/>
+      <w:r>
+        <w:rPr>
+          <w:rFonts w:ascii="Garamond" w:hAnsi="Garamond"/>
+          <w:highlight w:val="yellow"/>
+        </w:rPr>
+        <w:t>Esquible</w:t>
+      </w:r>
+      <w:proofErr w:type="spellEnd"/>
+      <w:r>
+        <w:rPr>
+          <w:rFonts w:ascii="Garamond" w:hAnsi="Garamond"/>
+          <w:highlight w:val="yellow"/>
+        </w:rPr>
+        <w:t xml:space="preserve"> et al., 2024).</w:t>
+      </w:r>
+      <w:r>
+        <w:rPr>
+          <w:rFonts w:ascii="Garamond" w:hAnsi="Garamond"/>
         </w:rPr>
         <w:t xml:space="preserve"> </w:t>
       </w:r>
       <w:r>
         <w:rPr>
           <w:rFonts w:ascii="Garamond" w:hAnsi="Garamond"/>
-          <w:sz w:val="22"/>
-          <w:szCs w:val="22"/>
-        </w:rPr>
-        <w:t xml:space="preserve">(Clark et al., 2018; </w:t>
+        </w:rPr>
+        <w:t xml:space="preserve">Subsistence fisheries </w:t>
+      </w:r>
+      <w:r>
+        <w:rPr>
+          <w:rFonts w:ascii="Garamond" w:hAnsi="Garamond"/>
+        </w:rPr>
+        <w:t>are the primary form of harvest in the watershed</w:t>
+      </w:r>
+      <w:r>
+        <w:rPr>
+          <w:rFonts w:ascii="Garamond" w:hAnsi="Garamond"/>
+        </w:rPr>
+        <w:t xml:space="preserve">, and nearly every household participates in the fishery in some way </w:t>
+      </w:r>
+      <w:r>
+        <w:rPr>
+          <w:rFonts w:ascii="Garamond" w:hAnsi="Garamond"/>
+          <w:highlight w:val="yellow"/>
+        </w:rPr>
+        <w:t>(</w:t>
       </w:r>
       <w:proofErr w:type="spellStart"/>
       <w:r>
         <w:rPr>
           <w:rFonts w:ascii="Garamond" w:hAnsi="Garamond"/>
-          <w:sz w:val="22"/>
-          <w:szCs w:val="22"/>
+          <w:highlight w:val="yellow"/>
         </w:rPr>
         <w:t>Esquible</w:t>
       </w:r>
@@ -1141,252 +1001,140 @@
       <w:r>
         <w:rPr>
           <w:rFonts w:ascii="Garamond" w:hAnsi="Garamond"/>
-          <w:sz w:val="22"/>
-          <w:szCs w:val="22"/>
-        </w:rPr>
-        <w:t xml:space="preserve"> et al., 2024</w:t>
-      </w:r>
-      <w:r>
-        <w:rPr>
-          <w:rFonts w:ascii="Garamond" w:hAnsi="Garamond"/>
-          <w:sz w:val="22"/>
-          <w:szCs w:val="22"/>
-        </w:rPr>
-        <w:t xml:space="preserve">). </w:t>
-      </w:r>
-      <w:r>
-        <w:rPr>
-          <w:rFonts w:ascii="Garamond" w:hAnsi="Garamond"/>
-          <w:sz w:val="22"/>
-          <w:szCs w:val="22"/>
-        </w:rPr>
-        <w:t xml:space="preserve">Subsistence fisheries </w:t>
-      </w:r>
-      <w:r>
-        <w:rPr>
-          <w:rFonts w:ascii="Garamond" w:hAnsi="Garamond"/>
-          <w:sz w:val="22"/>
-          <w:szCs w:val="22"/>
-        </w:rPr>
-        <w:t>are the primary form of harvest in the watershed</w:t>
-      </w:r>
-      <w:r>
-        <w:rPr>
-          <w:rFonts w:ascii="Garamond" w:hAnsi="Garamond"/>
-          <w:sz w:val="22"/>
-          <w:szCs w:val="22"/>
-        </w:rPr>
-        <w:t>, and nearly every household participates in the fishery in some way (</w:t>
-      </w:r>
-      <w:proofErr w:type="spellStart"/>
-      <w:r>
-        <w:rPr>
-          <w:rFonts w:ascii="Garamond" w:hAnsi="Garamond"/>
-          <w:sz w:val="22"/>
-          <w:szCs w:val="22"/>
-        </w:rPr>
-        <w:t>Esquible</w:t>
-      </w:r>
-      <w:proofErr w:type="spellEnd"/>
-      <w:r>
-        <w:rPr>
-          <w:rFonts w:ascii="Garamond" w:hAnsi="Garamond"/>
-          <w:sz w:val="22"/>
-          <w:szCs w:val="22"/>
-        </w:rPr>
-        <w:t xml:space="preserve"> et al., 2024). However, Chinook salmon populations in the Kuskokwim have declined precipitously in recent years, </w:t>
-      </w:r>
-      <w:r>
-        <w:rPr>
-          <w:rFonts w:ascii="Garamond" w:hAnsi="Garamond"/>
-          <w:sz w:val="22"/>
-          <w:szCs w:val="22"/>
-        </w:rPr>
-        <w:t xml:space="preserve">leading to </w:t>
-      </w:r>
-      <w:r>
-        <w:rPr>
-          <w:rFonts w:ascii="Garamond" w:hAnsi="Garamond"/>
-          <w:sz w:val="22"/>
-          <w:szCs w:val="22"/>
-        </w:rPr>
-        <w:t>subsistence fishing</w:t>
-      </w:r>
-      <w:r>
-        <w:rPr>
-          <w:rFonts w:ascii="Garamond" w:hAnsi="Garamond"/>
-          <w:sz w:val="22"/>
-          <w:szCs w:val="22"/>
+          <w:highlight w:val="yellow"/>
+        </w:rPr>
+        <w:t xml:space="preserve"> et al., 2024).</w:t>
+      </w:r>
+      <w:r>
+        <w:rPr>
+          <w:rFonts w:ascii="Garamond" w:hAnsi="Garamond"/>
+        </w:rPr>
+        <w:t xml:space="preserve"> However, Chinook salmon populations in the Kuskokwim have declined precipitously in recent years, </w:t>
+      </w:r>
+      <w:r>
+        <w:rPr>
+          <w:rFonts w:ascii="Garamond" w:hAnsi="Garamond"/>
+        </w:rPr>
+        <w:t>leading to subsistence fishing</w:t>
+      </w:r>
+      <w:r>
+        <w:rPr>
+          <w:rFonts w:ascii="Garamond" w:hAnsi="Garamond"/>
         </w:rPr>
         <w:t xml:space="preserve"> restrictions</w:t>
       </w:r>
       <w:r>
         <w:rPr>
           <w:rFonts w:ascii="Garamond" w:hAnsi="Garamond"/>
-          <w:sz w:val="22"/>
-          <w:szCs w:val="22"/>
+        </w:rPr>
+        <w:t xml:space="preserve"> and triggering a crisis of food insecurity</w:t>
+      </w:r>
+      <w:r>
+        <w:rPr>
+          <w:rFonts w:ascii="Garamond" w:hAnsi="Garamond"/>
+        </w:rPr>
+        <w:t xml:space="preserve"> and </w:t>
+      </w:r>
+      <w:r>
+        <w:rPr>
+          <w:rFonts w:ascii="Garamond" w:hAnsi="Garamond"/>
+        </w:rPr>
+        <w:t>cultural loss</w:t>
+      </w:r>
+      <w:r>
+        <w:rPr>
+          <w:rFonts w:ascii="Garamond" w:hAnsi="Garamond"/>
         </w:rPr>
         <w:t xml:space="preserve"> </w:t>
       </w:r>
       <w:r>
         <w:rPr>
           <w:rFonts w:ascii="Garamond" w:hAnsi="Garamond"/>
-          <w:sz w:val="22"/>
-          <w:szCs w:val="22"/>
-        </w:rPr>
-        <w:t xml:space="preserve">and </w:t>
-      </w:r>
-      <w:r>
-        <w:rPr>
-          <w:rFonts w:ascii="Garamond" w:hAnsi="Garamond"/>
-          <w:sz w:val="22"/>
-          <w:szCs w:val="22"/>
-        </w:rPr>
-        <w:t>triggering a crisis of food insecurity</w:t>
-      </w:r>
-      <w:r>
-        <w:rPr>
-          <w:rFonts w:ascii="Garamond" w:hAnsi="Garamond"/>
-          <w:sz w:val="22"/>
-          <w:szCs w:val="22"/>
-        </w:rPr>
-        <w:t xml:space="preserve"> and </w:t>
-      </w:r>
-      <w:r>
-        <w:rPr>
-          <w:rFonts w:ascii="Garamond" w:hAnsi="Garamond"/>
-          <w:sz w:val="22"/>
-          <w:szCs w:val="22"/>
-        </w:rPr>
-        <w:t>cultural loss</w:t>
-      </w:r>
-      <w:r>
-        <w:rPr>
-          <w:rFonts w:ascii="Garamond" w:hAnsi="Garamond"/>
-          <w:sz w:val="22"/>
-          <w:szCs w:val="22"/>
+        </w:rPr>
+        <w:fldChar w:fldCharType="begin"/>
+      </w:r>
+      <w:r>
+        <w:rPr>
+          <w:rFonts w:ascii="Garamond" w:hAnsi="Garamond"/>
+        </w:rPr>
+        <w:instrText xml:space="preserve"> ADDIN ZOTERO_ITEM CSL_CITATION {"citationID":"C4EZBjwd","properties":{"formattedCitation":"(Brown &amp; Godduhn, 2015; Lamborn et al., 2025; Ohlberger et al., 2018)","plainCitation":"(Brown &amp; Godduhn, 2015; Lamborn et al., 2025; Ohlberger et al., 2018)","noteIndex":0},"citationItems":[{"id":4428,"uris":["http://zotero.org/users/8421274/items/2WA8NCRM"],"itemData":{"id":4428,"type":"article-journal","language":"en","source":"Zotero","title":"Socioeconomic effects of declining salmon runs on the Yukon River","author":[{"family":"Brown","given":"Caroline L"},{"family":"Godduhn","given":"Anna"}],"issued":{"date-parts":[["2015"]]}}},{"id":5379,"uris":["http://zotero.org/users/8421274/items/6TRPLVW4"],"itemData":{"id":5379,"type":"article-journal","abstract":"Across Alaska, there have been synchronous declines in the abundance, mean age, and size of Chinook salmon (Oncorhynchus tshawytscha, Salmonidae), a species with immense social and ecological importance. The decline of Chinook salmon, and regulations addressing declines, have drastically impacted people who rely on Alaska's fisheries. Despite their importance, the drivers causing Chinook salmon declines are still not well understood. Therefore, to improve our understanding of the likely drivers of these large-scale synchronous declines, we synthesised the peer-reviewed Chinook salmon literature published between 2010 and 2024 using a weight-of-evidence approach. We identified 94 variables used to explain the trends in abundance and demographics of Chinook salmon. Each variable's association with trends in Chinook salmon was individually assessed and integrated using a standardised method. Results of this synthesis suggest the drivers for large-scale synchronous declines have occurred in the North Pacific Ocean. Specifically, we found marine predation, size selective harvest, and pink salmon (Oncorhynchus gorbuscha) abundance are the factors most strongly associated with reduced size and age. Results also suggest ocean productivity–specifically winter sea surface temperature and the North Pacific Gyre Oscillation–are the most frequently identified predictors of regional Chinook salmon abundance. In addition to addressing freshwater factors like adult heat stress and juvenile predation, we suggest research, policy, and management focus on how to better understand and address the interactions between ocean productivity, marine predation, size selective harvest, and pink salmon abundance to improve the condition of Chinook salmon, and the people and ecosystems benefiting from them.","container-title":"Fish and Fisheries","DOI":"10.1111/faf.12895","ISSN":"1467-2979","issue":"n/a","language":"en","license":"© 2025 The Author(s). Fish and Fisheries published by John Wiley &amp; Sons Ltd.","note":"_eprint: https://onlinelibrary.wiley.com/doi/pdf/10.1111/faf.12895","source":"Wiley Online Library","title":"A Synthesis of Factors Related to Trends in Abundance and Demography of Alaska Chinook Salmon (Oncorhynchus tshawytscha, Salmonidae): Implications for Research, Management, and Policy","title-short":"A Synthesis of Factors Related to Trends in Abundance and Demography of Alaska Chinook Salmon (Oncorhynchus tshawytscha, Salmonidae)","URL":"https://onlinelibrary.wiley.com/doi/abs/10.1111/faf.12895","volume":"n/a","author":[{"family":"Lamborn","given":"Chase C."},{"family":"Ohlberger","given":"Jan"},{"family":"Walsworth","given":"Timothy E."},{"family":"Westley","given":"Peter A. H."},{"family":"Cunningham","given":"Curry J."},{"family":"Wynsma","given":"Sam"},{"family":"Smith","given":"Jordan W."}],"accessed":{"date-parts":[["2025",6,4]]},"issued":{"date-parts":[["2025"]]}}},{"id":4421,"uris":["http://zotero.org/users/8421274/items/PUA9GF7A"],"itemData":{"id":4421,"type":"article-journal","abstract":"The demographic structure of populations is affected by life history strategies and how these interact with natural and anthropogenic factors such as exploitation, climate change, and biotic interactions. Previous work suggests that the mean size and age of some North American populations of Chinook salmon (Oncorhynchus tshawytscha, Salmonidae) are declining. These trends are of concern because Chinook salmon are highly valued commercially for their exceptional size and because the loss of the largest and oldest individuals may lead to reduced population productivity. Using long-term data from wild and hatchery populations, we quantified changes in the demographic structure of Chinook salmon populations over the past four decades across the Northeast Pacific Ocean, from California through western Alaska. Our results show that wild and hatchery fish are becoming smaller and younger throughout most of the Pacific coast. Proportions of older age classes have decreased over time in most regions. Simultaneously, the length-at-age of older fish has declined while the length-at-age of younger fish has typically increased. However, negative size trends of older ages were weak or non-existent at the southern end of the range. While it remains to be explored whether these trends are caused by changes in climate, fishing practices or species interactions such as predation, our qualitative review of the potential causes of demographic change suggests that selective removal of large fish has likely contributed to the apparent widespread declines in average body sizes.","container-title":"Fish and Fisheries","DOI":"10.1111/faf.12272","ISSN":"1467-2979","issue":"3","language":"en","license":"© 2018 The Authors. Fish and Fisheries published by John Wiley &amp; Sons Ltd.","note":"_eprint: https://onlinelibrary.wiley.com/doi/pdf/10.1111/faf.12272","page":"533-546","source":"Wiley Online Library","title":"Demographic changes in Chinook salmon across the Northeast Pacific Ocean","volume":"19","author":[{"family":"Ohlberger","given":"Jan"},{"family":"Ward","given":"Eric J"},{"family":"Schindler","given":"Daniel E"},{"family":"Lewis","given":"Bert"}],"issued":{"date-parts":[["2018"]]}}}],"schema":"https://github.com/citation-style-language/schema/raw/master/csl-citation.json"} </w:instrText>
+      </w:r>
+      <w:r>
+        <w:rPr>
+          <w:rFonts w:ascii="Garamond" w:hAnsi="Garamond"/>
+        </w:rPr>
+        <w:fldChar w:fldCharType="separate"/>
+      </w:r>
+      <w:r>
+        <w:rPr>
+          <w:rFonts w:ascii="Garamond" w:hAnsi="Garamond"/>
+          <w:noProof/>
+        </w:rPr>
+        <w:t>(Brown &amp; Godduhn, 2015; Lamborn et al., 2025; Ohlberger et al., 2018)</w:t>
+      </w:r>
+      <w:r>
+        <w:rPr>
+          <w:rFonts w:ascii="Garamond" w:hAnsi="Garamond"/>
+        </w:rPr>
+        <w:fldChar w:fldCharType="end"/>
+      </w:r>
+      <w:r>
+        <w:rPr>
+          <w:rFonts w:ascii="Garamond" w:hAnsi="Garamond"/>
+        </w:rPr>
+        <w:t>.</w:t>
+      </w:r>
+      <w:r>
+        <w:rPr>
+          <w:rFonts w:ascii="Garamond" w:hAnsi="Garamond"/>
         </w:rPr>
         <w:t xml:space="preserve"> </w:t>
       </w:r>
       <w:r>
         <w:rPr>
           <w:rFonts w:ascii="Garamond" w:hAnsi="Garamond"/>
-          <w:sz w:val="22"/>
-          <w:szCs w:val="22"/>
-        </w:rPr>
-        <w:fldChar w:fldCharType="begin"/>
-      </w:r>
-      <w:r>
-        <w:rPr>
-          <w:rFonts w:ascii="Garamond" w:hAnsi="Garamond"/>
-          <w:sz w:val="22"/>
-          <w:szCs w:val="22"/>
-        </w:rPr>
-        <w:instrText xml:space="preserve"> ADDIN ZOTERO_ITEM CSL_CITATION {"citationID":"C4EZBjwd","properties":{"formattedCitation":"(Brown &amp; Godduhn, 2015; Lamborn et al., 2025; Ohlberger et al., 2018)","plainCitation":"(Brown &amp; Godduhn, 2015; Lamborn et al., 2025; Ohlberger et al., 2018)","noteIndex":0},"citationItems":[{"id":4428,"uris":["http://zotero.org/users/8421274/items/2WA8NCRM"],"itemData":{"id":4428,"type":"article-journal","language":"en","source":"Zotero","title":"Socioeconomic effects of declining salmon runs on the Yukon River","author":[{"family":"Brown","given":"Caroline L"},{"family":"Godduhn","given":"Anna"}],"issued":{"date-parts":[["2015"]]}}},{"id":5379,"uris":["http://zotero.org/users/8421274/items/6TRPLVW4"],"itemData":{"id":5379,"type":"article-journal","abstract":"Across Alaska, there have been synchronous declines in the abundance, mean age, and size of Chinook salmon (Oncorhynchus tshawytscha, Salmonidae), a species with immense social and ecological importance. The decline of Chinook salmon, and regulations addressing declines, have drastically impacted people who rely on Alaska's fisheries. Despite their importance, the drivers causing Chinook salmon declines are still not well understood. Therefore, to improve our understanding of the likely drivers of these large-scale synchronous declines, we synthesised the peer-reviewed Chinook salmon literature published between 2010 and 2024 using a weight-of-evidence approach. We identified 94 variables used to explain the trends in abundance and demographics of Chinook salmon. Each variable's association with trends in Chinook salmon was individually assessed and integrated using a standardised method. Results of this synthesis suggest the drivers for large-scale synchronous declines have occurred in the North Pacific Ocean. Specifically, we found marine predation, size selective harvest, and pink salmon (Oncorhynchus gorbuscha) abundance are the factors most strongly associated with reduced size and age. Results also suggest ocean productivity–specifically winter sea surface temperature and the North Pacific Gyre Oscillation–are the most frequently identified predictors of regional Chinook salmon abundance. In addition to addressing freshwater factors like adult heat stress and juvenile predation, we suggest research, policy, and management focus on how to better understand and address the interactions between ocean productivity, marine predation, size selective harvest, and pink salmon abundance to improve the condition of Chinook salmon, and the people and ecosystems benefiting from them.","container-title":"Fish and Fisheries","DOI":"10.1111/faf.12895","ISSN":"1467-2979","issue":"n/a","language":"en","license":"© 2025 The Author(s). Fish and Fisheries published by John Wiley &amp; Sons Ltd.","note":"_eprint: https://onlinelibrary.wiley.com/doi/pdf/10.1111/faf.12895","source":"Wiley Online Library","title":"A Synthesis of Factors Related to Trends in Abundance and Demography of Alaska Chinook Salmon (Oncorhynchus tshawytscha, Salmonidae): Implications for Research, Management, and Policy","title-short":"A Synthesis of Factors Related to Trends in Abundance and Demography of Alaska Chinook Salmon (Oncorhynchus tshawytscha, Salmonidae)","URL":"https://onlinelibrary.wiley.com/doi/abs/10.1111/faf.12895","volume":"n/a","author":[{"family":"Lamborn","given":"Chase C."},{"family":"Ohlberger","given":"Jan"},{"family":"Walsworth","given":"Timothy E."},{"family":"Westley","given":"Peter A. H."},{"family":"Cunningham","given":"Curry J."},{"family":"Wynsma","given":"Sam"},{"family":"Smith","given":"Jordan W."}],"accessed":{"date-parts":[["2025",6,4]]},"issued":{"date-parts":[["2025"]]}}},{"id":4421,"uris":["http://zotero.org/users/8421274/items/PUA9GF7A"],"itemData":{"id":4421,"type":"article-journal","abstract":"The demographic structure of populations is affected by life history strategies and how these interact with natural and anthropogenic factors such as exploitation, climate change, and biotic interactions. Previous work suggests that the mean size and age of some North American populations of Chinook salmon (Oncorhynchus tshawytscha, Salmonidae) are declining. These trends are of concern because Chinook salmon are highly valued commercially for their exceptional size and because the loss of the largest and oldest individuals may lead to reduced population productivity. Using long-term data from wild and hatchery populations, we quantified changes in the demographic structure of Chinook salmon populations over the past four decades across the Northeast Pacific Ocean, from California through western Alaska. Our results show that wild and hatchery fish are becoming smaller and younger throughout most of the Pacific coast. Proportions of older age classes have decreased over time in most regions. Simultaneously, the length-at-age of older fish has declined while the length-at-age of younger fish has typically increased. However, negative size trends of older ages were weak or non-existent at the southern end of the range. While it remains to be explored whether these trends are caused by changes in climate, fishing practices or species interactions such as predation, our qualitative review of the potential causes of demographic change suggests that selective removal of large fish has likely contributed to the apparent widespread declines in average body sizes.","container-title":"Fish and Fisheries","DOI":"10.1111/faf.12272","ISSN":"1467-2979","issue":"3","language":"en","license":"© 2018 The Authors. Fish and Fisheries published by John Wiley &amp; Sons Ltd.","note":"_eprint: https://onlinelibrary.wiley.com/doi/pdf/10.1111/faf.12272","page":"533-546","source":"Wiley Online Library","title":"Demographic changes in Chinook salmon across the Northeast Pacific Ocean","volume":"19","author":[{"family":"Ohlberger","given":"Jan"},{"family":"Ward","given":"Eric J"},{"family":"Schindler","given":"Daniel E"},{"family":"Lewis","given":"Bert"}],"issued":{"date-parts":[["2018"]]}}}],"schema":"https://github.com/citation-style-language/schema/raw/master/csl-citation.json"} </w:instrText>
-      </w:r>
-      <w:r>
-        <w:rPr>
-          <w:rFonts w:ascii="Garamond" w:hAnsi="Garamond"/>
-          <w:sz w:val="22"/>
-          <w:szCs w:val="22"/>
-        </w:rPr>
-        <w:fldChar w:fldCharType="separate"/>
-      </w:r>
-      <w:r>
-        <w:rPr>
-          <w:rFonts w:ascii="Garamond" w:hAnsi="Garamond"/>
-          <w:noProof/>
-          <w:sz w:val="22"/>
-          <w:szCs w:val="22"/>
-        </w:rPr>
-        <w:t>(Brown &amp; Godduhn, 2015; Lamborn et al., 2025; Ohlberger et al., 2018)</w:t>
-      </w:r>
-      <w:r>
-        <w:rPr>
-          <w:rFonts w:ascii="Garamond" w:hAnsi="Garamond"/>
-          <w:sz w:val="22"/>
-          <w:szCs w:val="22"/>
-        </w:rPr>
-        <w:fldChar w:fldCharType="end"/>
-      </w:r>
-      <w:r>
-        <w:rPr>
-          <w:rFonts w:ascii="Garamond" w:hAnsi="Garamond"/>
-          <w:sz w:val="22"/>
-          <w:szCs w:val="22"/>
+        </w:rPr>
+        <w:t xml:space="preserve">As a result, resource managers are </w:t>
+      </w:r>
+      <w:r>
+        <w:rPr>
+          <w:rFonts w:ascii="Garamond" w:hAnsi="Garamond"/>
+        </w:rPr>
+        <w:t xml:space="preserve">tasked with </w:t>
+      </w:r>
+      <w:r>
+        <w:rPr>
+          <w:rFonts w:ascii="Garamond" w:hAnsi="Garamond"/>
+        </w:rPr>
+        <w:t xml:space="preserve">designing management strategies that </w:t>
+      </w:r>
+      <w:r>
+        <w:rPr>
+          <w:rFonts w:ascii="Garamond" w:hAnsi="Garamond" w:cs="Times New Roman"/>
+        </w:rPr>
+        <w:t xml:space="preserve">allow for harvest opportunities while simultaneously rebuilding </w:t>
+      </w:r>
+      <w:r>
+        <w:rPr>
+          <w:rFonts w:ascii="Garamond" w:hAnsi="Garamond" w:cs="Times New Roman"/>
+        </w:rPr>
+        <w:t>the diversity of stocks throughout the basin to enhance</w:t>
+      </w:r>
+      <w:r>
+        <w:rPr>
+          <w:rFonts w:ascii="Garamond" w:hAnsi="Garamond" w:cs="Times New Roman"/>
+        </w:rPr>
+        <w:t xml:space="preserve"> ecosystem resilience</w:t>
+      </w:r>
+      <w:r>
+        <w:rPr>
+          <w:rFonts w:ascii="Garamond" w:hAnsi="Garamond"/>
         </w:rPr>
         <w:t>.</w:t>
       </w:r>
       <w:r>
         <w:rPr>
           <w:rFonts w:ascii="Garamond" w:hAnsi="Garamond"/>
-          <w:sz w:val="22"/>
-          <w:szCs w:val="22"/>
-        </w:rPr>
-        <w:t xml:space="preserve"> </w:t>
-      </w:r>
-      <w:r>
-        <w:rPr>
-          <w:rFonts w:ascii="Garamond" w:hAnsi="Garamond"/>
-          <w:sz w:val="22"/>
-          <w:szCs w:val="22"/>
-        </w:rPr>
-        <w:t xml:space="preserve">As a result, resource managers are </w:t>
-      </w:r>
-      <w:r>
-        <w:rPr>
-          <w:rFonts w:ascii="Garamond" w:hAnsi="Garamond"/>
-          <w:sz w:val="22"/>
-          <w:szCs w:val="22"/>
-        </w:rPr>
-        <w:t xml:space="preserve">tasked with </w:t>
-      </w:r>
-      <w:r>
-        <w:rPr>
-          <w:rFonts w:ascii="Garamond" w:hAnsi="Garamond"/>
-          <w:sz w:val="22"/>
-          <w:szCs w:val="22"/>
-        </w:rPr>
-        <w:lastRenderedPageBreak/>
-        <w:t xml:space="preserve">designing management strategies that </w:t>
-      </w:r>
-      <w:r>
-        <w:rPr>
-          <w:rFonts w:ascii="Garamond" w:hAnsi="Garamond" w:cs="Times New Roman"/>
-          <w:sz w:val="22"/>
-          <w:szCs w:val="22"/>
-        </w:rPr>
-        <w:t xml:space="preserve">allow for harvest opportunities while simultaneously rebuilding </w:t>
-      </w:r>
-      <w:r>
-        <w:rPr>
-          <w:rFonts w:ascii="Garamond" w:hAnsi="Garamond" w:cs="Times New Roman"/>
-          <w:sz w:val="22"/>
-          <w:szCs w:val="22"/>
-        </w:rPr>
-        <w:t>the diversity of stocks throughout the basin to enhance</w:t>
-      </w:r>
-      <w:r>
-        <w:rPr>
-          <w:rFonts w:ascii="Garamond" w:hAnsi="Garamond" w:cs="Times New Roman"/>
-          <w:sz w:val="22"/>
-          <w:szCs w:val="22"/>
-        </w:rPr>
-        <w:t xml:space="preserve"> ecosystem resilience</w:t>
-      </w:r>
-      <w:r>
-        <w:rPr>
-          <w:rFonts w:ascii="Garamond" w:hAnsi="Garamond"/>
-          <w:sz w:val="22"/>
-          <w:szCs w:val="22"/>
-        </w:rPr>
-        <w:t>.</w:t>
-      </w:r>
-      <w:r>
-        <w:rPr>
-          <w:rFonts w:ascii="Garamond" w:hAnsi="Garamond"/>
-          <w:sz w:val="22"/>
-          <w:szCs w:val="22"/>
         </w:rPr>
         <w:t xml:space="preserve"> </w:t>
       </w:r>
@@ -1397,28 +1145,16 @@
         <w:ind w:firstLine="720"/>
         <w:rPr>
           <w:rFonts w:ascii="Garamond" w:hAnsi="Garamond"/>
-          <w:sz w:val="22"/>
-          <w:szCs w:val="22"/>
-        </w:rPr>
-      </w:pPr>
-      <w:commentRangeStart w:id="9"/>
+        </w:rPr>
+      </w:pPr>
       <w:r>
         <w:rPr>
           <w:rStyle w:val="Strong"/>
           <w:rFonts w:ascii="Garamond" w:hAnsi="Garamond"/>
           <w:b w:val="0"/>
           <w:bCs w:val="0"/>
-          <w:sz w:val="22"/>
-          <w:szCs w:val="22"/>
-        </w:rPr>
-        <w:t xml:space="preserve">One </w:t>
-      </w:r>
-      <w:commentRangeEnd w:id="9"/>
-      <w:r>
-        <w:rPr>
-          <w:rStyle w:val="CommentReference"/>
-        </w:rPr>
-        <w:commentReference w:id="9"/>
+        </w:rPr>
+        <w:t>A management approach implemented in the Kuskokwim River-basin has been a front-end closure which prohibits fishing during a fixed temporal window from June 1</w:t>
       </w:r>
       <w:r>
         <w:rPr>
@@ -1426,10 +1162,9 @@
           <w:rFonts w:ascii="Garamond" w:hAnsi="Garamond"/>
           <w:b w:val="0"/>
           <w:bCs w:val="0"/>
-          <w:sz w:val="22"/>
-          <w:szCs w:val="22"/>
-        </w:rPr>
-        <w:t xml:space="preserve">approach to addressing </w:t>
+          <w:vertAlign w:val="superscript"/>
+        </w:rPr>
+        <w:t>st</w:t>
       </w:r>
       <w:r>
         <w:rPr>
@@ -1437,10 +1172,8 @@
           <w:rFonts w:ascii="Garamond" w:hAnsi="Garamond"/>
           <w:b w:val="0"/>
           <w:bCs w:val="0"/>
-          <w:sz w:val="22"/>
-          <w:szCs w:val="22"/>
-        </w:rPr>
-        <w:t xml:space="preserve">the simultaneous challenge of allowing harvest opportunity for subsistence fisheries while protect weak stocks, particularly those returning to the headwaters, </w:t>
+        </w:rPr>
+        <w:t xml:space="preserve"> to June 11</w:t>
       </w:r>
       <w:r>
         <w:rPr>
@@ -1448,258 +1181,9 @@
           <w:rFonts w:ascii="Garamond" w:hAnsi="Garamond"/>
           <w:b w:val="0"/>
           <w:bCs w:val="0"/>
-          <w:sz w:val="22"/>
-          <w:szCs w:val="22"/>
-        </w:rPr>
-        <w:t>has been</w:t>
-      </w:r>
-      <w:r>
-        <w:rPr>
-          <w:rFonts w:ascii="Garamond" w:hAnsi="Garamond"/>
-          <w:sz w:val="22"/>
-          <w:szCs w:val="22"/>
-        </w:rPr>
-        <w:t xml:space="preserve"> the implementation of a front-end closure for Chinook salmon that heavily restricts fishing</w:t>
-      </w:r>
-      <w:r>
-        <w:rPr>
-          <w:rFonts w:ascii="Garamond" w:hAnsi="Garamond"/>
-          <w:sz w:val="22"/>
-          <w:szCs w:val="22"/>
-        </w:rPr>
-        <w:t xml:space="preserve"> during the beginning of the salmon migration season.</w:t>
-      </w:r>
-      <w:r>
-        <w:rPr>
-          <w:rFonts w:ascii="Garamond" w:hAnsi="Garamond"/>
-          <w:sz w:val="22"/>
-          <w:szCs w:val="22"/>
-        </w:rPr>
-        <w:t xml:space="preserve"> </w:t>
-      </w:r>
-      <w:r>
-        <w:rPr>
-          <w:rFonts w:ascii="Garamond" w:hAnsi="Garamond"/>
-          <w:sz w:val="22"/>
-          <w:szCs w:val="22"/>
-        </w:rPr>
-        <w:t>This strategy is</w:t>
-      </w:r>
-      <w:r>
-        <w:rPr>
-          <w:rFonts w:ascii="Garamond" w:hAnsi="Garamond"/>
-          <w:sz w:val="22"/>
-          <w:szCs w:val="22"/>
-        </w:rPr>
-        <w:t xml:space="preserve"> designed to protect early river fish</w:t>
-      </w:r>
-      <w:r>
-        <w:rPr>
-          <w:rFonts w:ascii="Garamond" w:hAnsi="Garamond"/>
-          <w:sz w:val="22"/>
-          <w:szCs w:val="22"/>
-        </w:rPr>
-        <w:t xml:space="preserve"> </w:t>
-      </w:r>
-      <w:r>
-        <w:rPr>
-          <w:rFonts w:ascii="Garamond" w:hAnsi="Garamond"/>
-          <w:sz w:val="22"/>
-          <w:szCs w:val="22"/>
-        </w:rPr>
-        <w:t xml:space="preserve">which are </w:t>
-      </w:r>
-      <w:r>
-        <w:rPr>
-          <w:rFonts w:ascii="Garamond" w:hAnsi="Garamond"/>
-          <w:sz w:val="22"/>
-          <w:szCs w:val="22"/>
-        </w:rPr>
-        <w:t>assum</w:t>
-      </w:r>
-      <w:r>
-        <w:rPr>
-          <w:rFonts w:ascii="Garamond" w:hAnsi="Garamond"/>
-          <w:sz w:val="22"/>
-          <w:szCs w:val="22"/>
-        </w:rPr>
-        <w:t xml:space="preserve">ed to </w:t>
-      </w:r>
-      <w:r>
-        <w:rPr>
-          <w:rFonts w:ascii="Garamond" w:hAnsi="Garamond"/>
-          <w:sz w:val="22"/>
-          <w:szCs w:val="22"/>
-        </w:rPr>
-        <w:t>return to the furthest upstream stocks</w:t>
-      </w:r>
-      <w:r>
-        <w:rPr>
-          <w:rFonts w:ascii="Garamond" w:hAnsi="Garamond"/>
-          <w:sz w:val="22"/>
-          <w:szCs w:val="22"/>
-        </w:rPr>
-        <w:t xml:space="preserve"> and are, therefore, subjected to harvest over more of the river than lower watershed stocks</w:t>
-      </w:r>
-      <w:r>
-        <w:rPr>
-          <w:rFonts w:ascii="Garamond" w:hAnsi="Garamond"/>
-          <w:sz w:val="22"/>
-          <w:szCs w:val="22"/>
-        </w:rPr>
-        <w:t xml:space="preserve">. </w:t>
-      </w:r>
-      <w:r>
-        <w:rPr>
-          <w:rFonts w:ascii="Garamond" w:hAnsi="Garamond"/>
-          <w:sz w:val="22"/>
-          <w:szCs w:val="22"/>
-        </w:rPr>
-        <w:t>This assumption is based on patterns established in other systems (Clark et al., 2015</w:t>
-      </w:r>
-      <w:r>
-        <w:rPr>
-          <w:rFonts w:ascii="Garamond" w:hAnsi="Garamond"/>
-          <w:sz w:val="22"/>
-          <w:szCs w:val="22"/>
-        </w:rPr>
-        <w:t>) supported</w:t>
-      </w:r>
-      <w:r>
-        <w:rPr>
-          <w:rFonts w:ascii="Garamond" w:hAnsi="Garamond"/>
-          <w:sz w:val="22"/>
-          <w:szCs w:val="22"/>
-        </w:rPr>
-        <w:t xml:space="preserve"> by limited telemetry data in the Kuskokwim (Clark and Smith, 2017)</w:t>
-      </w:r>
-      <w:r>
-        <w:rPr>
-          <w:rFonts w:ascii="Garamond" w:hAnsi="Garamond"/>
-          <w:sz w:val="22"/>
-          <w:szCs w:val="22"/>
-        </w:rPr>
-        <w:t xml:space="preserve"> and </w:t>
-      </w:r>
-      <w:r>
-        <w:rPr>
-          <w:rFonts w:ascii="Garamond" w:hAnsi="Garamond"/>
-          <w:sz w:val="22"/>
-          <w:szCs w:val="22"/>
-        </w:rPr>
-        <w:t xml:space="preserve">further corroborated </w:t>
-      </w:r>
-      <w:r>
-        <w:rPr>
-          <w:rFonts w:ascii="Garamond" w:hAnsi="Garamond"/>
-          <w:sz w:val="22"/>
-          <w:szCs w:val="22"/>
-        </w:rPr>
-        <w:t>by traditional knowledge among stakeholders</w:t>
-      </w:r>
-      <w:r>
-        <w:rPr>
-          <w:rFonts w:ascii="Garamond" w:hAnsi="Garamond"/>
-          <w:sz w:val="22"/>
-          <w:szCs w:val="22"/>
-        </w:rPr>
-        <w:t xml:space="preserve">. </w:t>
-      </w:r>
-      <w:r>
-        <w:rPr>
-          <w:rFonts w:ascii="Garamond" w:hAnsi="Garamond"/>
-          <w:sz w:val="22"/>
-          <w:szCs w:val="22"/>
-        </w:rPr>
-        <w:t xml:space="preserve">By protecting upriver stocks, managers aim to </w:t>
-      </w:r>
-      <w:r>
-        <w:rPr>
-          <w:rFonts w:ascii="Garamond" w:hAnsi="Garamond"/>
-          <w:sz w:val="22"/>
-          <w:szCs w:val="22"/>
-        </w:rPr>
-        <w:t xml:space="preserve">support basin-wide escapement goals, provide harvest opportunities to upstream communities, and protect upper river stocks which are at heightened risk of overharvest but contribute disproportionately to downstream fishery dynamics. </w:t>
-      </w:r>
-      <w:r>
-        <w:rPr>
-          <w:rFonts w:ascii="Garamond" w:hAnsi="Garamond"/>
-          <w:sz w:val="22"/>
-          <w:szCs w:val="22"/>
-        </w:rPr>
-        <w:t>However,</w:t>
-      </w:r>
-      <w:r>
-        <w:rPr>
-          <w:rFonts w:ascii="Garamond" w:hAnsi="Garamond"/>
-          <w:sz w:val="22"/>
-          <w:szCs w:val="22"/>
-        </w:rPr>
-        <w:t xml:space="preserve"> </w:t>
-      </w:r>
-      <w:r>
-        <w:rPr>
-          <w:rFonts w:ascii="Garamond" w:hAnsi="Garamond"/>
-          <w:sz w:val="22"/>
-          <w:szCs w:val="22"/>
-        </w:rPr>
-        <w:t>the spatial ecology of Chinook salmon in the Kuskokwim River basin remains poorly understood. It</w:t>
-      </w:r>
-      <w:r>
-        <w:rPr>
-          <w:rFonts w:ascii="Garamond" w:hAnsi="Garamond"/>
-          <w:sz w:val="22"/>
-          <w:szCs w:val="22"/>
-        </w:rPr>
-        <w:t xml:space="preserve"> </w:t>
-      </w:r>
-      <w:r>
-        <w:rPr>
-          <w:rFonts w:ascii="Garamond" w:hAnsi="Garamond"/>
-          <w:sz w:val="22"/>
-          <w:szCs w:val="22"/>
-        </w:rPr>
-        <w:t xml:space="preserve">remains </w:t>
-      </w:r>
-      <w:r>
-        <w:rPr>
-          <w:rFonts w:ascii="Garamond" w:hAnsi="Garamond"/>
-          <w:sz w:val="22"/>
-          <w:szCs w:val="22"/>
-        </w:rPr>
-        <w:t>unclear whether th</w:t>
-      </w:r>
-      <w:r>
-        <w:rPr>
-          <w:rFonts w:ascii="Garamond" w:hAnsi="Garamond"/>
-          <w:sz w:val="22"/>
-          <w:szCs w:val="22"/>
-        </w:rPr>
-        <w:t>e</w:t>
-      </w:r>
-      <w:r>
-        <w:rPr>
-          <w:rFonts w:ascii="Garamond" w:hAnsi="Garamond"/>
-          <w:sz w:val="22"/>
-          <w:szCs w:val="22"/>
-        </w:rPr>
-        <w:t xml:space="preserve"> pattern</w:t>
-      </w:r>
-      <w:r>
-        <w:rPr>
-          <w:rFonts w:ascii="Garamond" w:hAnsi="Garamond"/>
-          <w:sz w:val="22"/>
-          <w:szCs w:val="22"/>
-        </w:rPr>
-        <w:t>s observed in telemetry studies are</w:t>
-      </w:r>
-      <w:r>
-        <w:rPr>
-          <w:rFonts w:ascii="Garamond" w:hAnsi="Garamond"/>
-          <w:sz w:val="22"/>
-          <w:szCs w:val="22"/>
-        </w:rPr>
-        <w:t xml:space="preserve"> </w:t>
+          <w:vertAlign w:val="superscript"/>
+        </w:rPr>
+        <w:t>th</w:t>
       </w:r>
       <w:r>
         <w:rPr>
@@ -1707,18 +1191,167 @@
           <w:rFonts w:ascii="Garamond" w:hAnsi="Garamond"/>
           <w:b w:val="0"/>
           <w:bCs w:val="0"/>
-          <w:sz w:val="22"/>
-          <w:szCs w:val="22"/>
-        </w:rPr>
-        <w:t>consistent</w:t>
-      </w:r>
-      <w:r>
-        <w:rPr>
-          <w:rFonts w:ascii="Garamond" w:hAnsi="Garamond"/>
-          <w:sz w:val="22"/>
-          <w:szCs w:val="22"/>
-        </w:rPr>
-        <w:t xml:space="preserve"> over several years, whether there is a geographic organization to run timing, </w:t>
+        </w:rPr>
+        <w:t xml:space="preserve">. </w:t>
+      </w:r>
+      <w:r>
+        <w:rPr>
+          <w:rFonts w:ascii="Garamond" w:hAnsi="Garamond"/>
+        </w:rPr>
+        <w:t xml:space="preserve">This strategy is designed to protect early river fish </w:t>
+      </w:r>
+      <w:r>
+        <w:rPr>
+          <w:rFonts w:ascii="Garamond" w:hAnsi="Garamond"/>
+        </w:rPr>
+        <w:t xml:space="preserve">which are </w:t>
+      </w:r>
+      <w:r>
+        <w:rPr>
+          <w:rFonts w:ascii="Garamond" w:hAnsi="Garamond"/>
+        </w:rPr>
+        <w:t>assum</w:t>
+      </w:r>
+      <w:r>
+        <w:rPr>
+          <w:rFonts w:ascii="Garamond" w:hAnsi="Garamond"/>
+        </w:rPr>
+        <w:t xml:space="preserve">ed to </w:t>
+      </w:r>
+      <w:r>
+        <w:rPr>
+          <w:rFonts w:ascii="Garamond" w:hAnsi="Garamond"/>
+        </w:rPr>
+        <w:t>return to the furthest upstream stocks</w:t>
+      </w:r>
+      <w:r>
+        <w:rPr>
+          <w:rFonts w:ascii="Garamond" w:hAnsi="Garamond"/>
+        </w:rPr>
+        <w:t xml:space="preserve"> and are, therefore, subjected to harvest over more of the river than lower watershed stocks</w:t>
+      </w:r>
+      <w:r>
+        <w:rPr>
+          <w:rFonts w:ascii="Garamond" w:hAnsi="Garamond"/>
+        </w:rPr>
+        <w:t xml:space="preserve">. </w:t>
+      </w:r>
+      <w:r>
+        <w:rPr>
+          <w:rFonts w:ascii="Garamond" w:hAnsi="Garamond"/>
+        </w:rPr>
+        <w:t xml:space="preserve">This assumption is based on patterns established in other systems </w:t>
+      </w:r>
+      <w:r>
+        <w:rPr>
+          <w:rFonts w:ascii="Garamond" w:hAnsi="Garamond"/>
+          <w:highlight w:val="yellow"/>
+        </w:rPr>
+        <w:t>(Clark et al., 2015</w:t>
+      </w:r>
+      <w:r>
+        <w:rPr>
+          <w:rFonts w:ascii="Garamond" w:hAnsi="Garamond"/>
+          <w:highlight w:val="yellow"/>
+        </w:rPr>
+        <w:t>)</w:t>
+      </w:r>
+      <w:r>
+        <w:rPr>
+          <w:rFonts w:ascii="Garamond" w:hAnsi="Garamond"/>
+        </w:rPr>
+        <w:t xml:space="preserve"> supported</w:t>
+      </w:r>
+      <w:r>
+        <w:rPr>
+          <w:rFonts w:ascii="Garamond" w:hAnsi="Garamond"/>
+        </w:rPr>
+        <w:t xml:space="preserve"> by limited telemetry data in the Kuskokwim </w:t>
+      </w:r>
+      <w:r>
+        <w:rPr>
+          <w:rFonts w:ascii="Garamond" w:hAnsi="Garamond"/>
+          <w:highlight w:val="yellow"/>
+        </w:rPr>
+        <w:t>(Clark and Smith, 2017)</w:t>
+      </w:r>
+      <w:r>
+        <w:rPr>
+          <w:rFonts w:ascii="Garamond" w:hAnsi="Garamond"/>
+        </w:rPr>
+        <w:t xml:space="preserve"> and </w:t>
+      </w:r>
+      <w:r>
+        <w:rPr>
+          <w:rFonts w:ascii="Garamond" w:hAnsi="Garamond"/>
+        </w:rPr>
+        <w:t xml:space="preserve">further corroborated </w:t>
+      </w:r>
+      <w:r>
+        <w:rPr>
+          <w:rFonts w:ascii="Garamond" w:hAnsi="Garamond"/>
+        </w:rPr>
+        <w:t>by traditional knowledge among stakeholders</w:t>
+      </w:r>
+      <w:r>
+        <w:rPr>
+          <w:rFonts w:ascii="Garamond" w:hAnsi="Garamond"/>
+        </w:rPr>
+        <w:t xml:space="preserve">. </w:t>
+      </w:r>
+      <w:r>
+        <w:rPr>
+          <w:rFonts w:ascii="Garamond" w:hAnsi="Garamond"/>
+        </w:rPr>
+        <w:t xml:space="preserve">By protecting upriver stocks, managers aim to </w:t>
+      </w:r>
+      <w:r>
+        <w:rPr>
+          <w:rFonts w:ascii="Garamond" w:hAnsi="Garamond"/>
+        </w:rPr>
+        <w:t xml:space="preserve">support basin-wide escapement goals, provide harvest opportunities to upstream communities, and protect upper river stocks which are at heightened risk of overharvest but contribute disproportionately to downstream fishery dynamics. </w:t>
+      </w:r>
+      <w:r>
+        <w:rPr>
+          <w:rFonts w:ascii="Garamond" w:hAnsi="Garamond"/>
+        </w:rPr>
+        <w:t>However,</w:t>
+      </w:r>
+      <w:r>
+        <w:rPr>
+          <w:rFonts w:ascii="Garamond" w:hAnsi="Garamond"/>
+        </w:rPr>
+        <w:t xml:space="preserve"> </w:t>
+      </w:r>
+      <w:r>
+        <w:rPr>
+          <w:rFonts w:ascii="Garamond" w:hAnsi="Garamond"/>
+        </w:rPr>
+        <w:t xml:space="preserve">the spatial ecology of Chinook salmon in the Kuskokwim River basin remains poorly understood. </w:t>
+      </w:r>
+      <w:r>
+        <w:rPr>
+          <w:rFonts w:ascii="Garamond" w:hAnsi="Garamond"/>
+        </w:rPr>
+        <w:t xml:space="preserve">In addition, it is not well understood whether </w:t>
+      </w:r>
+      <w:r>
+        <w:rPr>
+          <w:rFonts w:ascii="Garamond" w:hAnsi="Garamond"/>
+        </w:rPr>
+        <w:t>pattern</w:t>
+      </w:r>
+      <w:r>
+        <w:rPr>
+          <w:rFonts w:ascii="Garamond" w:hAnsi="Garamond"/>
+        </w:rPr>
+        <w:t>s observed in telemetry studies are</w:t>
+      </w:r>
+      <w:r>
+        <w:rPr>
+          <w:rFonts w:ascii="Garamond" w:hAnsi="Garamond"/>
+        </w:rPr>
+        <w:t xml:space="preserve"> </w:t>
       </w:r>
       <w:r>
         <w:rPr>
@@ -1726,18 +1359,14 @@
           <w:rFonts w:ascii="Garamond" w:hAnsi="Garamond"/>
           <w:b w:val="0"/>
           <w:bCs w:val="0"/>
-          <w:sz w:val="22"/>
-          <w:szCs w:val="22"/>
-        </w:rPr>
-        <w:t>and whether</w:t>
-      </w:r>
-      <w:r>
-        <w:rPr>
-          <w:rFonts w:ascii="Garamond" w:hAnsi="Garamond"/>
-          <w:sz w:val="22"/>
-          <w:szCs w:val="22"/>
-        </w:rPr>
-        <w:t xml:space="preserve"> the interaction </w:t>
+        </w:rPr>
+        <w:t>consistent</w:t>
+      </w:r>
+      <w:r>
+        <w:rPr>
+          <w:rFonts w:ascii="Garamond" w:hAnsi="Garamond"/>
+        </w:rPr>
+        <w:t xml:space="preserve"> over several years, whether there is a geographic organization to run timing, </w:t>
       </w:r>
       <w:r>
         <w:rPr>
@@ -1745,18 +1374,14 @@
           <w:rFonts w:ascii="Garamond" w:hAnsi="Garamond"/>
           <w:b w:val="0"/>
           <w:bCs w:val="0"/>
-          <w:sz w:val="22"/>
-          <w:szCs w:val="22"/>
-        </w:rPr>
-        <w:t>between</w:t>
-      </w:r>
-      <w:r>
-        <w:rPr>
-          <w:rFonts w:ascii="Garamond" w:hAnsi="Garamond"/>
-          <w:sz w:val="22"/>
-          <w:szCs w:val="22"/>
-        </w:rPr>
-        <w:t xml:space="preserve"> these patterns and the front-end closure protects upstream stocks as </w:t>
+        </w:rPr>
+        <w:t>and whether</w:t>
+      </w:r>
+      <w:r>
+        <w:rPr>
+          <w:rFonts w:ascii="Garamond" w:hAnsi="Garamond"/>
+        </w:rPr>
+        <w:t xml:space="preserve"> the interaction </w:t>
       </w:r>
       <w:r>
         <w:rPr>
@@ -1764,8 +1389,21 @@
           <w:rFonts w:ascii="Garamond" w:hAnsi="Garamond"/>
           <w:b w:val="0"/>
           <w:bCs w:val="0"/>
-          <w:sz w:val="22"/>
-          <w:szCs w:val="22"/>
+        </w:rPr>
+        <w:t>between</w:t>
+      </w:r>
+      <w:r>
+        <w:rPr>
+          <w:rFonts w:ascii="Garamond" w:hAnsi="Garamond"/>
+        </w:rPr>
+        <w:t xml:space="preserve"> these patterns and the front-end closure protects upstream stocks as </w:t>
+      </w:r>
+      <w:r>
+        <w:rPr>
+          <w:rStyle w:val="Strong"/>
+          <w:rFonts w:ascii="Garamond" w:hAnsi="Garamond"/>
+          <w:b w:val="0"/>
+          <w:bCs w:val="0"/>
         </w:rPr>
         <w:t>intended</w:t>
       </w:r>
@@ -1774,16 +1412,12 @@
           <w:rFonts w:ascii="Garamond" w:hAnsi="Garamond"/>
           <w:b/>
           <w:bCs/>
-          <w:sz w:val="22"/>
-          <w:szCs w:val="22"/>
         </w:rPr>
         <w:t>.</w:t>
       </w:r>
       <w:r>
         <w:rPr>
           <w:rFonts w:ascii="Garamond" w:hAnsi="Garamond"/>
-          <w:sz w:val="22"/>
-          <w:szCs w:val="22"/>
         </w:rPr>
         <w:t xml:space="preserve"> </w:t>
       </w:r>
@@ -1792,158 +1426,18 @@
       <w:pPr>
         <w:spacing w:line="480" w:lineRule="auto"/>
         <w:ind w:firstLine="720"/>
-      </w:pPr>
-      <w:r>
-        <w:rPr>
-          <w:rFonts w:ascii="Garamond" w:hAnsi="Garamond"/>
-          <w:sz w:val="22"/>
-          <w:szCs w:val="22"/>
-        </w:rPr>
-        <w:t>H</w:t>
-      </w:r>
-      <w:r>
-        <w:rPr>
-          <w:rFonts w:ascii="Garamond" w:hAnsi="Garamond"/>
-          <w:sz w:val="22"/>
-          <w:szCs w:val="22"/>
-        </w:rPr>
-        <w:t>ere, we apply otolit</w:t>
-      </w:r>
-      <w:r>
-        <w:rPr>
-          <w:rFonts w:ascii="Garamond" w:hAnsi="Garamond"/>
-          <w:sz w:val="22"/>
-          <w:szCs w:val="22"/>
-        </w:rPr>
-        <w:t>h microchemistry from fish caught</w:t>
-      </w:r>
-      <w:r>
-        <w:rPr>
-          <w:rFonts w:ascii="Garamond" w:hAnsi="Garamond"/>
-          <w:sz w:val="22"/>
-          <w:szCs w:val="22"/>
-        </w:rPr>
-        <w:t xml:space="preserve"> in test fisheries over the course of the seasonal migration period </w:t>
-      </w:r>
-      <w:r>
-        <w:rPr>
-          <w:rFonts w:ascii="Garamond" w:hAnsi="Garamond"/>
-          <w:sz w:val="22"/>
-          <w:szCs w:val="22"/>
-        </w:rPr>
-        <w:t>over 6 years in the Kuskokwim River-basin</w:t>
-      </w:r>
-      <w:r>
-        <w:rPr>
-          <w:rFonts w:ascii="Garamond" w:hAnsi="Garamond"/>
-          <w:sz w:val="22"/>
-          <w:szCs w:val="22"/>
-        </w:rPr>
-        <w:t xml:space="preserve"> to reconstruct spatiotemporal patterns of Chinook salmon </w:t>
-      </w:r>
-      <w:r>
-        <w:rPr>
-          <w:rFonts w:ascii="Garamond" w:hAnsi="Garamond"/>
-          <w:sz w:val="22"/>
-          <w:szCs w:val="22"/>
-        </w:rPr>
-        <w:t xml:space="preserve">returns </w:t>
-      </w:r>
-      <w:r>
-        <w:rPr>
-          <w:rFonts w:ascii="Garamond" w:hAnsi="Garamond"/>
-          <w:sz w:val="22"/>
-          <w:szCs w:val="22"/>
-        </w:rPr>
-        <w:t>at the sub basin scale.</w:t>
-      </w:r>
-      <w:r>
-        <w:rPr>
-          <w:rFonts w:ascii="Garamond" w:hAnsi="Garamond"/>
-          <w:sz w:val="22"/>
-          <w:szCs w:val="22"/>
-        </w:rPr>
-        <w:t xml:space="preserve"> Limited genetic structure in this stock complex prevents application of genetics approaches for quantifying migration timing of different stocks throughout the watershed.</w:t>
-      </w:r>
-      <w:r>
-        <w:rPr>
-          <w:rFonts w:ascii="Garamond" w:hAnsi="Garamond"/>
-          <w:sz w:val="22"/>
-          <w:szCs w:val="22"/>
-        </w:rPr>
-        <w:t xml:space="preserve"> In doing so, we</w:t>
-      </w:r>
-      <w:r>
-        <w:rPr>
-          <w:rFonts w:ascii="Garamond" w:hAnsi="Garamond"/>
-          <w:sz w:val="22"/>
-          <w:szCs w:val="22"/>
-        </w:rPr>
-        <w:t>: (1) identify the spatiotemporal structure of returning populations in</w:t>
-      </w:r>
-      <w:r>
-        <w:rPr>
-          <w:rFonts w:ascii="Garamond" w:hAnsi="Garamond"/>
-          <w:sz w:val="22"/>
-          <w:szCs w:val="22"/>
-        </w:rPr>
-        <w:t xml:space="preserve"> the Kuskokwim river-basin, and </w:t>
-      </w:r>
-      <w:r>
-        <w:rPr>
-          <w:rFonts w:ascii="Garamond" w:hAnsi="Garamond"/>
-          <w:sz w:val="22"/>
-          <w:szCs w:val="22"/>
-        </w:rPr>
-        <w:t>(2)</w:t>
-      </w:r>
-      <w:r>
-        <w:rPr>
-          <w:rFonts w:ascii="Garamond" w:hAnsi="Garamond"/>
-          <w:sz w:val="22"/>
-          <w:szCs w:val="22"/>
-        </w:rPr>
-        <w:t xml:space="preserve"> </w:t>
-      </w:r>
-      <w:r>
-        <w:rPr>
-          <w:rFonts w:ascii="Garamond" w:hAnsi="Garamond"/>
-          <w:sz w:val="22"/>
-          <w:szCs w:val="22"/>
-        </w:rPr>
-        <w:t xml:space="preserve">evaluate the potential impacts of </w:t>
-      </w:r>
-      <w:r>
-        <w:rPr>
-          <w:rFonts w:ascii="Garamond" w:hAnsi="Garamond"/>
-          <w:sz w:val="22"/>
-          <w:szCs w:val="22"/>
-        </w:rPr>
-        <w:t xml:space="preserve">the </w:t>
-      </w:r>
-      <w:r>
-        <w:rPr>
-          <w:rFonts w:ascii="Garamond" w:hAnsi="Garamond"/>
-          <w:sz w:val="22"/>
-          <w:szCs w:val="22"/>
-        </w:rPr>
-        <w:t>front-end closure</w:t>
-      </w:r>
-      <w:r>
-        <w:rPr>
-          <w:rFonts w:ascii="Garamond" w:hAnsi="Garamond"/>
-          <w:sz w:val="22"/>
-          <w:szCs w:val="22"/>
-        </w:rPr>
-        <w:t xml:space="preserve"> approach for conserving population diversity within salmon stock complexes returning to large and remote watersheds</w:t>
-      </w:r>
-      <w:r>
-        <w:rPr>
-          <w:rFonts w:ascii="Garamond" w:hAnsi="Garamond"/>
-          <w:sz w:val="22"/>
-          <w:szCs w:val="22"/>
-        </w:rPr>
-        <w:t>.</w:t>
+        <w:rPr>
+          <w:rFonts w:ascii="Garamond" w:hAnsi="Garamond"/>
+          <w:b/>
+          <w:bCs/>
+        </w:rPr>
+      </w:pPr>
+      <w:r>
+        <w:rPr>
+          <w:rFonts w:ascii="Garamond" w:hAnsi="Garamond"/>
+        </w:rPr>
+        <w:lastRenderedPageBreak/>
+        <w:t>Here, we use otolith chemistry from fish caught during test fisheries throughout the seasonal migration period over six years in the Kuskokwim River basin to reconstruct spatiotemporal patterns of Chinook salmon returns. The limited genetic structure of this stock complex precludes using genetic approaches to quantify migration timing of different stocks throughout the watershed. Otolith-based methods for estimating provenance therefore offer a novel approach to: (1) identify the spatiotemporal structure of returning populations in the Kuskokwim River basin, and (2) evaluate potential impacts of front-end closures on conserving population diversity within salmon stock complexes returning to large, remote watersheds.</w:t>
       </w:r>
     </w:p>
     <w:p>
@@ -1989,7 +1483,6 @@
           <w:szCs w:val="22"/>
           <w:u w:val="single"/>
         </w:rPr>
-        <w:lastRenderedPageBreak/>
         <w:t xml:space="preserve">Otolith </w:t>
       </w:r>
       <w:r>
@@ -2459,6 +1952,7 @@
           <w:szCs w:val="22"/>
           <w14:ligatures w14:val="none"/>
         </w:rPr>
+        <w:lastRenderedPageBreak/>
         <w:t xml:space="preserve">(identified by the dark annuli check indicative of marine entry) </w:t>
       </w:r>
       <w:r>
@@ -3046,10 +2540,9 @@
           <w:szCs w:val="22"/>
           <w14:ligatures w14:val="none"/>
         </w:rPr>
-        <w:lastRenderedPageBreak/>
         <w:t xml:space="preserve">A </w:t>
       </w:r>
-      <w:ins w:id="10" w:author="Daniel Schindler" w:date="2025-08-26T16:12:00Z" w16du:dateUtc="2025-08-27T00:12:00Z">
+      <w:ins w:id="6" w:author="Daniel Schindler" w:date="2025-08-26T16:12:00Z" w16du:dateUtc="2025-08-27T00:12:00Z">
         <w:r>
           <w:rPr>
             <w:rFonts w:ascii="Garamond" w:eastAsia="Times New Roman" w:hAnsi="Garamond" w:cs="Times New Roman"/>
@@ -3123,8 +2616,8 @@
         </w:rPr>
         <w:t xml:space="preserve"> </w:t>
       </w:r>
-      <w:commentRangeStart w:id="11"/>
-      <w:commentRangeStart w:id="12"/>
+      <w:commentRangeStart w:id="7"/>
+      <w:commentRangeStart w:id="8"/>
       <w:r>
         <w:rPr>
           <w:rFonts w:ascii="Garamond" w:eastAsia="Times New Roman" w:hAnsi="Garamond" w:cs="Times New Roman"/>
@@ -3145,19 +2638,19 @@
         </w:rPr>
         <w:t xml:space="preserve"> </w:t>
       </w:r>
-      <w:commentRangeEnd w:id="11"/>
+      <w:commentRangeEnd w:id="7"/>
       <w:r>
         <w:rPr>
           <w:rStyle w:val="CommentReference"/>
         </w:rPr>
-        <w:commentReference w:id="11"/>
-      </w:r>
-      <w:commentRangeEnd w:id="12"/>
+        <w:commentReference w:id="7"/>
+      </w:r>
+      <w:commentRangeEnd w:id="8"/>
       <w:r>
         <w:rPr>
           <w:rStyle w:val="CommentReference"/>
         </w:rPr>
-        <w:commentReference w:id="12"/>
+        <w:commentReference w:id="8"/>
       </w:r>
       <w:r>
         <w:rPr>
@@ -4098,6 +3591,7 @@
           <w:sz w:val="22"/>
           <w:szCs w:val="22"/>
         </w:rPr>
+        <w:lastRenderedPageBreak/>
         <w:t xml:space="preserve">Posterior probability values for each tributary (j) were then calculated using Bayes theorem </w:t>
       </w:r>
       <w:r>
@@ -4550,16 +4044,7 @@
           <w:sz w:val="22"/>
           <w:szCs w:val="22"/>
         </w:rPr>
-        <w:t xml:space="preserve">). The probability </w:t>
-      </w:r>
-      <w:r>
-        <w:rPr>
-          <w:rFonts w:ascii="Garamond" w:hAnsi="Garamond" w:cstheme="majorHAnsi"/>
-          <w:sz w:val="22"/>
-          <w:szCs w:val="22"/>
-        </w:rPr>
-        <w:lastRenderedPageBreak/>
-        <w:t>of the isotope ratio (</w:t>
+        <w:t>). The probability of the isotope ratio (</w:t>
       </w:r>
       <w:proofErr w:type="spellStart"/>
       <w:r>
@@ -4887,8 +4372,8 @@
         </w:rPr>
         <w:t xml:space="preserve"> </w:t>
       </w:r>
-      <w:commentRangeStart w:id="13"/>
-      <w:commentRangeStart w:id="14"/>
+      <w:commentRangeStart w:id="9"/>
+      <w:commentRangeStart w:id="10"/>
       <w:r>
         <w:rPr>
           <w:rFonts w:ascii="Garamond" w:eastAsia="Times New Roman" w:hAnsi="Garamond" w:cs="Times New Roman"/>
@@ -4940,19 +4425,19 @@
         </w:rPr>
         <w:fldChar w:fldCharType="end"/>
       </w:r>
-      <w:commentRangeEnd w:id="13"/>
+      <w:commentRangeEnd w:id="9"/>
       <w:r>
         <w:rPr>
           <w:rStyle w:val="CommentReference"/>
         </w:rPr>
-        <w:commentReference w:id="13"/>
-      </w:r>
-      <w:commentRangeEnd w:id="14"/>
+        <w:commentReference w:id="9"/>
+      </w:r>
+      <w:commentRangeEnd w:id="10"/>
       <w:r>
         <w:rPr>
           <w:rStyle w:val="CommentReference"/>
         </w:rPr>
-        <w:commentReference w:id="14"/>
+        <w:commentReference w:id="10"/>
       </w:r>
       <w:r>
         <w:rPr>
@@ -5326,7 +4811,16 @@
           <w:sz w:val="22"/>
           <w:szCs w:val="22"/>
         </w:rPr>
-        <w:t>nly highly likely locations</w:t>
+        <w:t xml:space="preserve">nly </w:t>
+      </w:r>
+      <w:r>
+        <w:rPr>
+          <w:rFonts w:ascii="Garamond" w:hAnsi="Garamond"/>
+          <w:sz w:val="22"/>
+          <w:szCs w:val="22"/>
+        </w:rPr>
+        <w:lastRenderedPageBreak/>
+        <w:t>highly likely locations</w:t>
       </w:r>
       <w:r>
         <w:rPr>
@@ -5449,7 +4943,7 @@
         </w:rPr>
         <w:t>based on capture date: Q1 (run start through June 11), Q2 (June 12-21), Q3 (June 22-July 1), and Q4 (July 2 onward).</w:t>
       </w:r>
-      <w:ins w:id="15" w:author="Daniel Schindler" w:date="2025-07-17T13:30:00Z" w16du:dateUtc="2025-07-17T21:30:00Z">
+      <w:ins w:id="11" w:author="Daniel Schindler" w:date="2025-07-17T13:30:00Z" w16du:dateUtc="2025-07-17T21:30:00Z">
         <w:r>
           <w:rPr>
             <w:rFonts w:ascii="Garamond" w:hAnsi="Garamond"/>
@@ -5581,7 +5075,6 @@
           <w:sz w:val="22"/>
           <w:szCs w:val="22"/>
         </w:rPr>
-        <w:lastRenderedPageBreak/>
         <w:t>Twenty</w:t>
       </w:r>
       <w:r>
@@ -5664,9 +5157,9 @@
         </w:rPr>
         <w:t xml:space="preserve"> </w:t>
       </w:r>
-      <w:commentRangeStart w:id="16"/>
-      <w:commentRangeStart w:id="17"/>
-      <w:ins w:id="18" w:author="Daniel Schindler" w:date="2025-07-17T13:31:00Z" w16du:dateUtc="2025-07-17T21:31:00Z">
+      <w:commentRangeStart w:id="12"/>
+      <w:commentRangeStart w:id="13"/>
+      <w:ins w:id="14" w:author="Daniel Schindler" w:date="2025-07-17T13:31:00Z" w16du:dateUtc="2025-07-17T21:31:00Z">
         <w:r>
           <w:rPr>
             <w:rFonts w:ascii="Garamond" w:hAnsi="Garamond"/>
@@ -5685,19 +5178,19 @@
         </w:rPr>
         <w:t xml:space="preserve">. </w:t>
       </w:r>
-      <w:commentRangeEnd w:id="16"/>
+      <w:commentRangeEnd w:id="12"/>
       <w:r>
         <w:rPr>
           <w:rStyle w:val="CommentReference"/>
         </w:rPr>
-        <w:commentReference w:id="16"/>
-      </w:r>
-      <w:commentRangeEnd w:id="17"/>
+        <w:commentReference w:id="12"/>
+      </w:r>
+      <w:commentRangeEnd w:id="13"/>
       <w:r>
         <w:rPr>
           <w:rStyle w:val="CommentReference"/>
         </w:rPr>
-        <w:commentReference w:id="17"/>
+        <w:commentReference w:id="13"/>
       </w:r>
       <w:r>
         <w:rPr>
@@ -5986,7 +5479,16 @@
           <w:sz w:val="22"/>
           <w:szCs w:val="22"/>
         </w:rPr>
-        <w:t xml:space="preserve"> The number of days from the beginning of the run to 50% of the overall stock return were calculated from these data for each year by identifying the interval which each stock reached &gt;50%</w:t>
+        <w:t xml:space="preserve"> The number of days from the beginning of the run to 50% of </w:t>
+      </w:r>
+      <w:r>
+        <w:rPr>
+          <w:rFonts w:ascii="Garamond" w:hAnsi="Garamond" w:cs="Times New Roman"/>
+          <w:sz w:val="22"/>
+          <w:szCs w:val="22"/>
+        </w:rPr>
+        <w:lastRenderedPageBreak/>
+        <w:t>the overall stock return were calculated from these data for each year by identifying the interval which each stock reached &gt;50%</w:t>
       </w:r>
       <w:r>
         <w:rPr>
@@ -6035,7 +5537,6 @@
           <w:sz w:val="36"/>
           <w:szCs w:val="36"/>
         </w:rPr>
-        <w:lastRenderedPageBreak/>
         <w:t>Results</w:t>
       </w:r>
     </w:p>
@@ -6341,33 +5842,15 @@
           <w:sz w:val="22"/>
           <w:szCs w:val="22"/>
         </w:rPr>
-        <w:t xml:space="preserve">stock each contributed only modestly (median 3% and 5% respectively) despite their position near the top of the watershed. The second quartile </w:t>
-      </w:r>
-      <w:proofErr w:type="gramStart"/>
-      <w:r>
-        <w:rPr>
-          <w:rFonts w:ascii="Garamond" w:hAnsi="Garamond"/>
-          <w:sz w:val="22"/>
-          <w:szCs w:val="22"/>
-        </w:rPr>
-        <w:t xml:space="preserve">( </w:t>
-      </w:r>
-      <w:r>
-        <w:rPr>
-          <w:rFonts w:ascii="Garamond" w:hAnsi="Garamond"/>
-          <w:sz w:val="22"/>
-          <w:szCs w:val="22"/>
-        </w:rPr>
-        <w:t>June</w:t>
-      </w:r>
-      <w:proofErr w:type="gramEnd"/>
-      <w:r>
-        <w:rPr>
-          <w:rFonts w:ascii="Garamond" w:hAnsi="Garamond"/>
-          <w:sz w:val="22"/>
-          <w:szCs w:val="22"/>
-        </w:rPr>
-        <w:t xml:space="preserve"> 12</w:t>
+        <w:t xml:space="preserve">stock each contributed only modestly (median 3% and 5% respectively) despite their position near the top of the watershed. The second quartile ( </w:t>
+      </w:r>
+      <w:r>
+        <w:rPr>
+          <w:rFonts w:ascii="Garamond" w:hAnsi="Garamond"/>
+          <w:sz w:val="22"/>
+          <w:szCs w:val="22"/>
+        </w:rPr>
+        <w:t>June 12</w:t>
       </w:r>
       <w:r>
         <w:rPr>
@@ -6648,7 +6131,16 @@
           <w:sz w:val="22"/>
           <w:szCs w:val="22"/>
         </w:rPr>
-        <w:t xml:space="preserve"> River (median 9.6%, range 8.8-12.2%), and Aniak river (median 8.2%, range 5.7-10.1%). </w:t>
+        <w:t xml:space="preserve"> River (median 9.6%, range 8.8-12.2%), and Aniak river </w:t>
+      </w:r>
+      <w:r>
+        <w:rPr>
+          <w:rFonts w:ascii="Garamond" w:hAnsi="Garamond"/>
+          <w:sz w:val="22"/>
+          <w:szCs w:val="22"/>
+        </w:rPr>
+        <w:lastRenderedPageBreak/>
+        <w:t xml:space="preserve">(median 8.2%, range 5.7-10.1%). </w:t>
       </w:r>
       <w:r>
         <w:rPr>
@@ -6905,7 +6397,6 @@
           <w:sz w:val="22"/>
           <w:szCs w:val="22"/>
         </w:rPr>
-        <w:lastRenderedPageBreak/>
         <w:t xml:space="preserve">Cumulative distribution plots </w:t>
       </w:r>
       <w:r>
@@ -6916,7 +6407,7 @@
         </w:rPr>
         <w:t xml:space="preserve">(Figure 4) </w:t>
       </w:r>
-      <w:del w:id="19" w:author="Daniel Schindler" w:date="2025-08-26T16:49:00Z" w16du:dateUtc="2025-08-27T00:49:00Z">
+      <w:del w:id="15" w:author="Daniel Schindler" w:date="2025-08-26T16:49:00Z" w16du:dateUtc="2025-08-27T00:49:00Z">
         <w:r>
           <w:rPr>
             <w:rFonts w:ascii="Garamond" w:hAnsi="Garamond"/>
@@ -7321,7 +6812,7 @@
         </w:rPr>
         <w:t xml:space="preserve"> clearly </w:t>
       </w:r>
-      <w:ins w:id="20" w:author="Daniel Schindler" w:date="2025-08-26T16:50:00Z" w16du:dateUtc="2025-08-27T00:50:00Z">
+      <w:ins w:id="16" w:author="Daniel Schindler" w:date="2025-08-26T16:50:00Z" w16du:dateUtc="2025-08-27T00:50:00Z">
         <w:r>
           <w:rPr>
             <w:rFonts w:ascii="Garamond" w:hAnsi="Garamond"/>
@@ -7385,33 +6876,15 @@
           <w:sz w:val="22"/>
           <w:szCs w:val="22"/>
         </w:rPr>
-        <w:t xml:space="preserve"> </w:t>
-      </w:r>
-      <w:proofErr w:type="gramStart"/>
-      <w:r>
-        <w:rPr>
-          <w:rFonts w:ascii="Garamond" w:hAnsi="Garamond"/>
-          <w:sz w:val="22"/>
-          <w:szCs w:val="22"/>
-        </w:rPr>
-        <w:t>(</w:t>
-      </w:r>
-      <w:r>
-        <w:rPr>
-          <w:rFonts w:ascii="Garamond" w:hAnsi="Garamond"/>
-          <w:sz w:val="22"/>
-          <w:szCs w:val="22"/>
-        </w:rPr>
-        <w:t xml:space="preserve"> &gt;</w:t>
-      </w:r>
-      <w:proofErr w:type="gramEnd"/>
-      <w:r>
-        <w:rPr>
-          <w:rFonts w:ascii="Garamond" w:hAnsi="Garamond"/>
-          <w:sz w:val="22"/>
-          <w:szCs w:val="22"/>
-        </w:rPr>
-        <w:t>30% protection</w:t>
+        <w:t xml:space="preserve"> (</w:t>
+      </w:r>
+      <w:r>
+        <w:rPr>
+          <w:rFonts w:ascii="Garamond" w:hAnsi="Garamond"/>
+          <w:sz w:val="22"/>
+          <w:szCs w:val="22"/>
+        </w:rPr>
+        <w:t xml:space="preserve"> &gt;30% protection</w:t>
       </w:r>
       <w:r>
         <w:rPr>
@@ -7445,7 +6918,16 @@
           <w:sz w:val="22"/>
           <w:szCs w:val="22"/>
         </w:rPr>
-        <w:t xml:space="preserve"> river and Nixon Fork stock, which received a median protection of only 6.6%. Several stocks which contribute only minimally to the overall run are afforded significant protection. For example, although the East Fork Kuskokwim contributes minimally to the total run</w:t>
+        <w:t xml:space="preserve"> river and Nixon Fork stock, which received a median protection of only 6.6%. Several stocks which contribute only minimally to the overall run are afforded significant protection. For example, although the East Fork Kuskokwim contributes </w:t>
+      </w:r>
+      <w:r>
+        <w:rPr>
+          <w:rFonts w:ascii="Garamond" w:hAnsi="Garamond"/>
+          <w:sz w:val="22"/>
+          <w:szCs w:val="22"/>
+        </w:rPr>
+        <w:lastRenderedPageBreak/>
+        <w:t>minimally to the total run</w:t>
       </w:r>
       <w:r>
         <w:rPr>
@@ -7463,7 +6945,7 @@
         </w:rPr>
         <w:t xml:space="preserve">Stocks positioned lower in the watershed received less protection due to their </w:t>
       </w:r>
-      <w:del w:id="21" w:author="Daniel Schindler" w:date="2025-08-26T16:51:00Z" w16du:dateUtc="2025-08-27T00:51:00Z">
+      <w:del w:id="17" w:author="Daniel Schindler" w:date="2025-08-26T16:51:00Z" w16du:dateUtc="2025-08-27T00:51:00Z">
         <w:r>
           <w:rPr>
             <w:rFonts w:ascii="Garamond" w:hAnsi="Garamond"/>
@@ -7481,7 +6963,7 @@
         </w:rPr>
         <w:t>late</w:t>
       </w:r>
-      <w:ins w:id="22" w:author="Daniel Schindler" w:date="2025-08-26T16:51:00Z" w16du:dateUtc="2025-08-27T00:51:00Z">
+      <w:ins w:id="18" w:author="Daniel Schindler" w:date="2025-08-26T16:51:00Z" w16du:dateUtc="2025-08-27T00:51:00Z">
         <w:r>
           <w:rPr>
             <w:rFonts w:ascii="Garamond" w:hAnsi="Garamond"/>
@@ -7584,7 +7066,6 @@
           <w:sz w:val="22"/>
           <w:szCs w:val="22"/>
         </w:rPr>
-        <w:lastRenderedPageBreak/>
         <w:t xml:space="preserve">The analysis presented here illustrates spatiotemporal patterns of Chinook salmon in the Kuskokwim river-basin at a finer spatial scale and over a longer time-period than had previously been available. In doing so, these data corroborate a </w:t>
       </w:r>
       <w:r>
@@ -7888,6 +7369,7 @@
           <w:sz w:val="22"/>
           <w:szCs w:val="22"/>
         </w:rPr>
+        <w:lastRenderedPageBreak/>
         <w:t>Despite</w:t>
       </w:r>
       <w:r>
@@ -8024,16 +7506,7 @@
           <w:sz w:val="22"/>
           <w:szCs w:val="22"/>
         </w:rPr>
-        <w:t xml:space="preserve">These results suggest a potential limitation of a fixed date closure </w:t>
-      </w:r>
-      <w:r>
-        <w:rPr>
-          <w:rFonts w:ascii="Garamond" w:hAnsi="Garamond"/>
-          <w:sz w:val="22"/>
-          <w:szCs w:val="22"/>
-        </w:rPr>
-        <w:lastRenderedPageBreak/>
-        <w:t xml:space="preserve">and highlights the difficulty of managing for dynamic ecosystem with fixed duration management. A more dynamic closure which is responsive to predicted or observed run dynamics may provide more consistent protection to upstream stocks. </w:t>
+        <w:t xml:space="preserve">These results suggest a potential limitation of a fixed date closure and highlights the difficulty of managing for dynamic ecosystem with fixed duration management. A more dynamic closure which is responsive to predicted or observed run dynamics may provide more consistent protection to upstream stocks. </w:t>
       </w:r>
       <w:r>
         <w:rPr>
@@ -8050,7 +7523,7 @@
         <w:spacing w:line="480" w:lineRule="auto"/>
         <w:ind w:firstLine="720"/>
         <w:rPr>
-          <w:ins w:id="23" w:author="Daniel Schindler" w:date="2025-08-26T17:14:00Z" w16du:dateUtc="2025-08-27T01:14:00Z"/>
+          <w:ins w:id="19" w:author="Daniel Schindler" w:date="2025-08-26T17:14:00Z" w16du:dateUtc="2025-08-27T01:14:00Z"/>
         </w:rPr>
       </w:pPr>
       <w:r>
@@ -8223,7 +7696,7 @@
         </w:rPr>
         <w:t xml:space="preserve"> conserve</w:t>
       </w:r>
-      <w:del w:id="24" w:author="Daniel Schindler" w:date="2025-08-26T17:08:00Z" w16du:dateUtc="2025-08-27T01:08:00Z">
+      <w:del w:id="20" w:author="Daniel Schindler" w:date="2025-08-26T17:08:00Z" w16du:dateUtc="2025-08-27T01:08:00Z">
         <w:r>
           <w:rPr>
             <w:rFonts w:ascii="Garamond" w:hAnsi="Garamond"/>
@@ -8256,32 +7729,27 @@
           <w:szCs w:val="22"/>
         </w:rPr>
       </w:pPr>
-      <w:ins w:id="25" w:author="Daniel Schindler" w:date="2025-08-26T17:14:00Z" w16du:dateUtc="2025-08-27T01:14:00Z">
+      <w:ins w:id="21" w:author="Daniel Schindler" w:date="2025-08-26T17:14:00Z" w16du:dateUtc="2025-08-27T01:14:00Z">
         <w:r>
           <w:t>One</w:t>
         </w:r>
       </w:ins>
-      <w:ins w:id="26" w:author="Daniel Schindler" w:date="2025-08-26T17:15:00Z" w16du:dateUtc="2025-08-27T01:15:00Z">
+      <w:ins w:id="22" w:author="Daniel Schindler" w:date="2025-08-26T17:15:00Z" w16du:dateUtc="2025-08-27T01:15:00Z">
         <w:r>
           <w:t xml:space="preserve"> thing to consider is that if there is rough number of fish that the subsistence fisheries want to harvest, front end closures </w:t>
         </w:r>
       </w:ins>
-      <w:ins w:id="27" w:author="Daniel Schindler" w:date="2025-08-26T17:16:00Z" w16du:dateUtc="2025-08-27T01:16:00Z">
+      <w:ins w:id="23" w:author="Daniel Schindler" w:date="2025-08-26T17:16:00Z" w16du:dateUtc="2025-08-27T01:16:00Z">
         <w:r>
           <w:t>could</w:t>
         </w:r>
       </w:ins>
-      <w:ins w:id="28" w:author="Daniel Schindler" w:date="2025-08-26T17:15:00Z" w16du:dateUtc="2025-08-27T01:15:00Z">
+      <w:ins w:id="24" w:author="Daniel Schindler" w:date="2025-08-26T17:15:00Z" w16du:dateUtc="2025-08-27T01:15:00Z">
         <w:r>
-          <w:t xml:space="preserve"> </w:t>
-        </w:r>
-        <w:proofErr w:type="gramStart"/>
-        <w:r>
-          <w:t>actually result</w:t>
+          <w:t xml:space="preserve"> actually result</w:t>
         </w:r>
       </w:ins>
-      <w:proofErr w:type="gramEnd"/>
-      <w:ins w:id="29" w:author="Daniel Schindler" w:date="2025-08-26T17:16:00Z" w16du:dateUtc="2025-08-27T01:16:00Z">
+      <w:ins w:id="25" w:author="Daniel Schindler" w:date="2025-08-26T17:16:00Z" w16du:dateUtc="2025-08-27T01:16:00Z">
         <w:r>
           <w:t xml:space="preserve"> in overharvest of late running stocks.</w:t>
         </w:r>
@@ -8302,7 +7770,7 @@
 
 <file path=word/comments.xml><?xml version="1.0" encoding="utf-8"?>
 <w:comments xmlns:wpc="http://schemas.microsoft.com/office/word/2010/wordprocessingCanvas" xmlns:cx="http://schemas.microsoft.com/office/drawing/2014/chartex" xmlns:cx1="http://schemas.microsoft.com/office/drawing/2015/9/8/chartex" xmlns:cx2="http://schemas.microsoft.com/office/drawing/2015/10/21/chartex" xmlns:cx3="http://schemas.microsoft.com/office/drawing/2016/5/9/chartex" xmlns:cx4="http://schemas.microsoft.com/office/drawing/2016/5/10/chartex" xmlns:cx5="http://schemas.microsoft.com/office/drawing/2016/5/11/chartex" xmlns:cx6="http://schemas.microsoft.com/office/drawing/2016/5/12/chartex" xmlns:cx7="http://schemas.microsoft.com/office/drawing/2016/5/13/chartex" xmlns:cx8="http://schemas.microsoft.com/office/drawing/2016/5/14/chartex" xmlns:mc="http://schemas.openxmlformats.org/markup-compatibility/2006" xmlns:aink="http://schemas.microsoft.com/office/drawing/2016/ink" xmlns:am3d="http://schemas.microsoft.com/office/drawing/2017/model3d" xmlns:o="urn:schemas-microsoft-com:office:office" xmlns:oel="http://schemas.microsoft.com/office/2019/extlst" xmlns:r="http://schemas.openxmlformats.org/officeDocument/2006/relationships" xmlns:m="http://schemas.openxmlformats.org/officeDocument/2006/math" xmlns:v="urn:schemas-microsoft-com:vml" xmlns:wp14="http://schemas.microsoft.com/office/word/2010/wordprocessingDrawing" xmlns:wp="http://schemas.openxmlformats.org/drawingml/2006/wordprocessingDrawing" xmlns:w10="urn:schemas-microsoft-com:office:word" xmlns:w="http://schemas.openxmlformats.org/wordprocessingml/2006/main" xmlns:w14="http://schemas.microsoft.com/office/word/2010/wordml" xmlns:w15="http://schemas.microsoft.com/office/word/2012/wordml" xmlns:w16cex="http://schemas.microsoft.com/office/word/2018/wordml/cex" xmlns:w16cid="http://schemas.microsoft.com/office/word/2016/wordml/cid" xmlns:w16="http://schemas.microsoft.com/office/word/2018/wordml" xmlns:w16du="http://schemas.microsoft.com/office/word/2023/wordml/word16du" xmlns:w16sdtdh="http://schemas.microsoft.com/office/word/2020/wordml/sdtdatahash" xmlns:w16sdtfl="http://schemas.microsoft.com/office/word/2024/wordml/sdtformatlock" xmlns:w16se="http://schemas.microsoft.com/office/word/2015/wordml/symex" xmlns:wpg="http://schemas.microsoft.com/office/word/2010/wordprocessingGroup" xmlns:wpi="http://schemas.microsoft.com/office/word/2010/wordprocessingInk" xmlns:wne="http://schemas.microsoft.com/office/word/2006/wordml" xmlns:wps="http://schemas.microsoft.com/office/word/2010/wordprocessingShape" mc:Ignorable="w14 w15 w16se w16cid w16 w16cex w16sdtdh w16sdtfl w16du wp14">
-  <w:comment w:id="6" w:author="Daniel Schindler" w:date="2025-08-26T15:44:00Z" w:initials="DS">
+  <w:comment w:id="3" w:author="Daniel Schindler" w:date="2025-08-26T15:44:00Z" w:initials="DS">
     <w:p>
       <w:pPr>
         <w:pStyle w:val="CommentText"/>
@@ -8318,7 +7786,7 @@
       </w:r>
     </w:p>
   </w:comment>
-  <w:comment w:id="7" w:author="Daniel Schindler" w:date="2025-08-26T15:57:00Z" w:initials="DS">
+  <w:comment w:id="4" w:author="Daniel Schindler" w:date="2025-08-26T15:57:00Z" w:initials="DS">
     <w:p>
       <w:pPr>
         <w:pStyle w:val="CommentText"/>
@@ -8334,11 +7802,8 @@
       </w:r>
     </w:p>
   </w:comment>
-  <w:comment w:id="9" w:author="Daniel Schindler" w:date="2025-08-26T16:00:00Z" w:initials="DS">
+  <w:comment w:id="7" w:author="Benjamin J. Makhlouf" w:date="2025-08-05T16:27:00Z" w:initials="b">
     <w:p>
-      <w:pPr>
-        <w:pStyle w:val="CommentText"/>
-      </w:pPr>
       <w:r>
         <w:rPr>
           <w:rStyle w:val="CommentReference"/>
@@ -8346,11 +7811,31 @@
         <w:annotationRef/>
       </w:r>
       <w:r>
-        <w:t>Better to write topic sentences that are explicit enough that they stand-alone. As written, this topic sentence refers to the previous paragraph.</w:t>
+        <w:rPr>
+          <w:sz w:val="20"/>
+          <w:szCs w:val="20"/>
+        </w:rPr>
+        <w:t>Is it worth having this as a figure since it's in French et al</w:t>
       </w:r>
     </w:p>
   </w:comment>
-  <w:comment w:id="11" w:author="Benjamin J. Makhlouf" w:date="2025-08-05T16:27:00Z" w:initials="b">
+  <w:comment w:id="8" w:author="Daniel Schindler" w:date="2025-08-26T16:16:00Z" w:initials="DS">
+    <w:p>
+      <w:pPr>
+        <w:pStyle w:val="CommentText"/>
+      </w:pPr>
+      <w:r>
+        <w:rPr>
+          <w:rStyle w:val="CommentReference"/>
+        </w:rPr>
+        <w:annotationRef/>
+      </w:r>
+      <w:r>
+        <w:t>I think it is. Its pretty squished into the French paper</w:t>
+      </w:r>
+    </w:p>
+  </w:comment>
+  <w:comment w:id="9" w:author="Benjamin J. Makhlouf" w:date="2025-07-30T08:26:00Z" w:initials="b">
     <w:p>
       <w:r>
         <w:rPr>
@@ -8363,11 +7848,11 @@
           <w:sz w:val="20"/>
           <w:szCs w:val="20"/>
         </w:rPr>
-        <w:t>Is it worth having this as a figure since it's in French et al</w:t>
+        <w:t>We run into the same problem as the last paper where it is very unclear how this habitat prior is made (other than shutting off the eek). I can reasonably assume it's the same as the Yukon, but I don't know. How much detail do you think we need here?</w:t>
       </w:r>
     </w:p>
   </w:comment>
-  <w:comment w:id="12" w:author="Daniel Schindler" w:date="2025-08-26T16:16:00Z" w:initials="DS">
+  <w:comment w:id="10" w:author="Daniel Schindler" w:date="2025-08-26T16:26:00Z" w:initials="DS">
     <w:p>
       <w:pPr>
         <w:pStyle w:val="CommentText"/>
@@ -8379,11 +7864,11 @@
         <w:annotationRef/>
       </w:r>
       <w:r>
-        <w:t>I think it is. Its pretty squished into the French paper</w:t>
+        <w:t>I think just state what the assumption is and run with it. I think it’s a reasonable assumption knowing what we do about Chinook</w:t>
       </w:r>
     </w:p>
   </w:comment>
-  <w:comment w:id="13" w:author="Benjamin J. Makhlouf" w:date="2025-07-30T08:26:00Z" w:initials="b">
+  <w:comment w:id="12" w:author="Benjamin J. Makhlouf" w:date="2025-07-30T10:53:00Z" w:initials="b">
     <w:p>
       <w:r>
         <w:rPr>
@@ -8396,44 +7881,11 @@
           <w:sz w:val="20"/>
           <w:szCs w:val="20"/>
         </w:rPr>
-        <w:t>We run into the same problem as the last paper where it is very unclear how this habitat prior is made (other than shutting off the eek). I can reasonably assume it's the same as the Yukon, but I don't know. How much detail do you think we need here?</w:t>
+        <w:t>The map we used to pull these rivers is on an adfg web page but I cant track it to a publication</w:t>
       </w:r>
     </w:p>
   </w:comment>
-  <w:comment w:id="14" w:author="Daniel Schindler" w:date="2025-08-26T16:26:00Z" w:initials="DS">
-    <w:p>
-      <w:pPr>
-        <w:pStyle w:val="CommentText"/>
-      </w:pPr>
-      <w:r>
-        <w:rPr>
-          <w:rStyle w:val="CommentReference"/>
-        </w:rPr>
-        <w:annotationRef/>
-      </w:r>
-      <w:r>
-        <w:t>I think just state what the assumption is and run with it. I think it’s a reasonable assumption knowing what we do about Chinook</w:t>
-      </w:r>
-    </w:p>
-  </w:comment>
-  <w:comment w:id="16" w:author="Benjamin J. Makhlouf" w:date="2025-07-30T10:53:00Z" w:initials="b">
-    <w:p>
-      <w:r>
-        <w:rPr>
-          <w:rStyle w:val="CommentReference"/>
-        </w:rPr>
-        <w:annotationRef/>
-      </w:r>
-      <w:r>
-        <w:rPr>
-          <w:sz w:val="20"/>
-          <w:szCs w:val="20"/>
-        </w:rPr>
-        <w:t>The map we used to pull these rivers is on an adfg web page but I cant track it to a publication</w:t>
-      </w:r>
-    </w:p>
-  </w:comment>
-  <w:comment w:id="17" w:author="Daniel Schindler" w:date="2025-08-26T16:33:00Z" w:initials="DS">
+  <w:comment w:id="13" w:author="Daniel Schindler" w:date="2025-08-26T16:33:00Z" w:initials="DS">
     <w:p>
       <w:pPr>
         <w:pStyle w:val="CommentText"/>
@@ -8456,7 +7908,6 @@
 <w15:commentsEx xmlns:wpc="http://schemas.microsoft.com/office/word/2010/wordprocessingCanvas" xmlns:cx="http://schemas.microsoft.com/office/drawing/2014/chartex" xmlns:cx1="http://schemas.microsoft.com/office/drawing/2015/9/8/chartex" xmlns:cx2="http://schemas.microsoft.com/office/drawing/2015/10/21/chartex" xmlns:cx3="http://schemas.microsoft.com/office/drawing/2016/5/9/chartex" xmlns:cx4="http://schemas.microsoft.com/office/drawing/2016/5/10/chartex" xmlns:cx5="http://schemas.microsoft.com/office/drawing/2016/5/11/chartex" xmlns:cx6="http://schemas.microsoft.com/office/drawing/2016/5/12/chartex" xmlns:cx7="http://schemas.microsoft.com/office/drawing/2016/5/13/chartex" xmlns:cx8="http://schemas.microsoft.com/office/drawing/2016/5/14/chartex" xmlns:mc="http://schemas.openxmlformats.org/markup-compatibility/2006" xmlns:aink="http://schemas.microsoft.com/office/drawing/2016/ink" xmlns:am3d="http://schemas.microsoft.com/office/drawing/2017/model3d" xmlns:o="urn:schemas-microsoft-com:office:office" xmlns:oel="http://schemas.microsoft.com/office/2019/extlst" xmlns:r="http://schemas.openxmlformats.org/officeDocument/2006/relationships" xmlns:m="http://schemas.openxmlformats.org/officeDocument/2006/math" xmlns:v="urn:schemas-microsoft-com:vml" xmlns:wp14="http://schemas.microsoft.com/office/word/2010/wordprocessingDrawing" xmlns:wp="http://schemas.openxmlformats.org/drawingml/2006/wordprocessingDrawing" xmlns:w10="urn:schemas-microsoft-com:office:word" xmlns:w="http://schemas.openxmlformats.org/wordprocessingml/2006/main" xmlns:w14="http://schemas.microsoft.com/office/word/2010/wordml" xmlns:w15="http://schemas.microsoft.com/office/word/2012/wordml" xmlns:w16cex="http://schemas.microsoft.com/office/word/2018/wordml/cex" xmlns:w16cid="http://schemas.microsoft.com/office/word/2016/wordml/cid" xmlns:w16="http://schemas.microsoft.com/office/word/2018/wordml" xmlns:w16du="http://schemas.microsoft.com/office/word/2023/wordml/word16du" xmlns:w16sdtdh="http://schemas.microsoft.com/office/word/2020/wordml/sdtdatahash" xmlns:w16sdtfl="http://schemas.microsoft.com/office/word/2024/wordml/sdtformatlock" xmlns:w16se="http://schemas.microsoft.com/office/word/2015/wordml/symex" xmlns:wpg="http://schemas.microsoft.com/office/word/2010/wordprocessingGroup" xmlns:wpi="http://schemas.microsoft.com/office/word/2010/wordprocessingInk" xmlns:wne="http://schemas.microsoft.com/office/word/2006/wordml" xmlns:wps="http://schemas.microsoft.com/office/word/2010/wordprocessingShape" mc:Ignorable="w14 w15 w16se w16cid w16 w16cex w16sdtdh w16sdtfl w16du wp14">
   <w15:commentEx w15:paraId="399F0CFF" w15:done="1"/>
   <w15:commentEx w15:paraId="6A43EA9D" w15:done="0"/>
-  <w15:commentEx w15:paraId="39BC305D" w15:done="1"/>
   <w15:commentEx w15:paraId="4FA71363" w15:done="0"/>
   <w15:commentEx w15:paraId="34C74063" w15:paraIdParent="4FA71363" w15:done="0"/>
   <w15:commentEx w15:paraId="78D2F929" w15:done="1"/>
@@ -8470,7 +7921,6 @@
 <w16cex:commentsExtensible xmlns:wpc="http://schemas.microsoft.com/office/word/2010/wordprocessingCanvas" xmlns:cx="http://schemas.microsoft.com/office/drawing/2014/chartex" xmlns:cx1="http://schemas.microsoft.com/office/drawing/2015/9/8/chartex" xmlns:cx2="http://schemas.microsoft.com/office/drawing/2015/10/21/chartex" xmlns:cx3="http://schemas.microsoft.com/office/drawing/2016/5/9/chartex" xmlns:cx4="http://schemas.microsoft.com/office/drawing/2016/5/10/chartex" xmlns:cx5="http://schemas.microsoft.com/office/drawing/2016/5/11/chartex" xmlns:cx6="http://schemas.microsoft.com/office/drawing/2016/5/12/chartex" xmlns:cx7="http://schemas.microsoft.com/office/drawing/2016/5/13/chartex" xmlns:cx8="http://schemas.microsoft.com/office/drawing/2016/5/14/chartex" xmlns:cr="http://schemas.microsoft.com/office/comments/2020/reactions" xmlns:mc="http://schemas.openxmlformats.org/markup-compatibility/2006" xmlns:aink="http://schemas.microsoft.com/office/drawing/2016/ink" xmlns:am3d="http://schemas.microsoft.com/office/drawing/2017/model3d" xmlns:o="urn:schemas-microsoft-com:office:office" xmlns:oel="http://schemas.microsoft.com/office/2019/extlst" xmlns:r="http://schemas.openxmlformats.org/officeDocument/2006/relationships" xmlns:m="http://schemas.openxmlformats.org/officeDocument/2006/math" xmlns:v="urn:schemas-microsoft-com:vml" xmlns:wp14="http://schemas.microsoft.com/office/word/2010/wordprocessingDrawing" xmlns:wp="http://schemas.openxmlformats.org/drawingml/2006/wordprocessingDrawing" xmlns:w10="urn:schemas-microsoft-com:office:word" xmlns:w="http://schemas.openxmlformats.org/wordprocessingml/2006/main" xmlns:w14="http://schemas.microsoft.com/office/word/2010/wordml" xmlns:w15="http://schemas.microsoft.com/office/word/2012/wordml" xmlns:w16cex="http://schemas.microsoft.com/office/word/2018/wordml/cex" xmlns:w16cid="http://schemas.microsoft.com/office/word/2016/wordml/cid" xmlns:w16="http://schemas.microsoft.com/office/word/2018/wordml" xmlns:w16du="http://schemas.microsoft.com/office/word/2023/wordml/word16du" xmlns:w16sdtdh="http://schemas.microsoft.com/office/word/2020/wordml/sdtdatahash" xmlns:w16sdtfl="http://schemas.microsoft.com/office/word/2024/wordml/sdtformatlock" xmlns:w16se="http://schemas.microsoft.com/office/word/2015/wordml/symex" xmlns:wpg="http://schemas.microsoft.com/office/word/2010/wordprocessingGroup" xmlns:wpi="http://schemas.microsoft.com/office/word/2010/wordprocessingInk" xmlns:wne="http://schemas.microsoft.com/office/word/2006/wordml" xmlns:wps="http://schemas.microsoft.com/office/word/2010/wordprocessingShape" mc:Ignorable="w14 w15 w16se w16cid w16 w16cex w16sdtdh w16sdtfl cr w16du wp14">
   <w16cex:commentExtensible w16cex:durableId="4F8011AF" w16cex:dateUtc="2025-08-26T23:44:00Z"/>
   <w16cex:commentExtensible w16cex:durableId="76C28745" w16cex:dateUtc="2025-08-26T23:57:00Z"/>
-  <w16cex:commentExtensible w16cex:durableId="26A86733" w16cex:dateUtc="2025-08-27T00:00:00Z"/>
   <w16cex:commentExtensible w16cex:durableId="5F2857FB" w16cex:dateUtc="2025-08-05T23:27:00Z"/>
   <w16cex:commentExtensible w16cex:durableId="523CC5C2" w16cex:dateUtc="2025-08-27T00:16:00Z"/>
   <w16cex:commentExtensible w16cex:durableId="1D6CE52A" w16cex:dateUtc="2025-07-30T15:26:00Z"/>
@@ -8484,7 +7934,6 @@
 <w16cid:commentsIds xmlns:wpc="http://schemas.microsoft.com/office/word/2010/wordprocessingCanvas" xmlns:cx="http://schemas.microsoft.com/office/drawing/2014/chartex" xmlns:cx1="http://schemas.microsoft.com/office/drawing/2015/9/8/chartex" xmlns:cx2="http://schemas.microsoft.com/office/drawing/2015/10/21/chartex" xmlns:cx3="http://schemas.microsoft.com/office/drawing/2016/5/9/chartex" xmlns:cx4="http://schemas.microsoft.com/office/drawing/2016/5/10/chartex" xmlns:cx5="http://schemas.microsoft.com/office/drawing/2016/5/11/chartex" xmlns:cx6="http://schemas.microsoft.com/office/drawing/2016/5/12/chartex" xmlns:cx7="http://schemas.microsoft.com/office/drawing/2016/5/13/chartex" xmlns:cx8="http://schemas.microsoft.com/office/drawing/2016/5/14/chartex" xmlns:mc="http://schemas.openxmlformats.org/markup-compatibility/2006" xmlns:aink="http://schemas.microsoft.com/office/drawing/2016/ink" xmlns:am3d="http://schemas.microsoft.com/office/drawing/2017/model3d" xmlns:o="urn:schemas-microsoft-com:office:office" xmlns:oel="http://schemas.microsoft.com/office/2019/extlst" xmlns:r="http://schemas.openxmlformats.org/officeDocument/2006/relationships" xmlns:m="http://schemas.openxmlformats.org/officeDocument/2006/math" xmlns:v="urn:schemas-microsoft-com:vml" xmlns:wp14="http://schemas.microsoft.com/office/word/2010/wordprocessingDrawing" xmlns:wp="http://schemas.openxmlformats.org/drawingml/2006/wordprocessingDrawing" xmlns:w10="urn:schemas-microsoft-com:office:word" xmlns:w="http://schemas.openxmlformats.org/wordprocessingml/2006/main" xmlns:w14="http://schemas.microsoft.com/office/word/2010/wordml" xmlns:w15="http://schemas.microsoft.com/office/word/2012/wordml" xmlns:w16cex="http://schemas.microsoft.com/office/word/2018/wordml/cex" xmlns:w16cid="http://schemas.microsoft.com/office/word/2016/wordml/cid" xmlns:w16="http://schemas.microsoft.com/office/word/2018/wordml" xmlns:w16du="http://schemas.microsoft.com/office/word/2023/wordml/word16du" xmlns:w16sdtdh="http://schemas.microsoft.com/office/word/2020/wordml/sdtdatahash" xmlns:w16sdtfl="http://schemas.microsoft.com/office/word/2024/wordml/sdtformatlock" xmlns:w16se="http://schemas.microsoft.com/office/word/2015/wordml/symex" xmlns:wpg="http://schemas.microsoft.com/office/word/2010/wordprocessingGroup" xmlns:wpi="http://schemas.microsoft.com/office/word/2010/wordprocessingInk" xmlns:wne="http://schemas.microsoft.com/office/word/2006/wordml" xmlns:wps="http://schemas.microsoft.com/office/word/2010/wordprocessingShape" mc:Ignorable="w14 w15 w16se w16cid w16 w16cex w16sdtdh w16sdtfl w16du wp14">
   <w16cid:commentId w16cid:paraId="399F0CFF" w16cid:durableId="4F8011AF"/>
   <w16cid:commentId w16cid:paraId="6A43EA9D" w16cid:durableId="76C28745"/>
-  <w16cid:commentId w16cid:paraId="39BC305D" w16cid:durableId="26A86733"/>
   <w16cid:commentId w16cid:paraId="4FA71363" w16cid:durableId="5F2857FB"/>
   <w16cid:commentId w16cid:paraId="34C74063" w16cid:durableId="523CC5C2"/>
   <w16cid:commentId w16cid:paraId="78D2F929" w16cid:durableId="1D6CE52A"/>

</xml_diff>

<commit_message>
small updated to ms
</commit_message>
<xml_diff>
--- a/Docs/Run_timing_manuscript.docx
+++ b/Docs/Run_timing_manuscript.docx
@@ -241,6 +241,30 @@
     </w:p>
     <w:p>
       <w:pPr>
+        <w:suppressLineNumbers/>
+        <w:spacing w:line="480" w:lineRule="auto"/>
+        <w:ind w:firstLine="720"/>
+        <w:rPr>
+          <w:rFonts w:ascii="Garamond" w:hAnsi="Garamond"/>
+          <w:sz w:val="22"/>
+          <w:szCs w:val="22"/>
+        </w:rPr>
+      </w:pPr>
+    </w:p>
+    <w:p>
+      <w:pPr>
+        <w:suppressLineNumbers/>
+        <w:spacing w:line="480" w:lineRule="auto"/>
+        <w:ind w:firstLine="720"/>
+        <w:rPr>
+          <w:rFonts w:ascii="Garamond" w:hAnsi="Garamond"/>
+          <w:sz w:val="22"/>
+          <w:szCs w:val="22"/>
+        </w:rPr>
+      </w:pPr>
+    </w:p>
+    <w:p>
+      <w:pPr>
         <w:spacing w:line="480" w:lineRule="auto"/>
         <w:rPr>
           <w:rFonts w:ascii="Garamond" w:hAnsi="Garamond"/>
@@ -260,6 +284,7 @@
           <w:szCs w:val="22"/>
           <w:u w:val="single"/>
         </w:rPr>
+        <w:lastRenderedPageBreak/>
         <w:t xml:space="preserve">Introduction: </w:t>
       </w:r>
       <w:r>
@@ -283,7 +308,6 @@
         <w:rPr>
           <w:rFonts w:ascii="Garamond" w:hAnsi="Garamond"/>
         </w:rPr>
-        <w:lastRenderedPageBreak/>
         <w:t xml:space="preserve">A </w:t>
       </w:r>
       <w:r>
@@ -507,7 +531,7 @@
         <w:rPr>
           <w:rFonts w:ascii="Garamond" w:hAnsi="Garamond"/>
         </w:rPr>
-        <w:instrText xml:space="preserve"> ADDIN ZOTERO_ITEM CSL_CITATION {"citationID":"VDgUGdsR","properties":{"formattedCitation":"(Nesbitt &amp; Moore, 2016; Schindler et al., 2015)","plainCitation":"(Nesbitt &amp; Moore, 2016; Schindler et al., 2015)","noteIndex":0},"citationItems":[{"id":3361,"uris":["http://zotero.org/users/8421274/items/U6M4JZTI"],"itemData":{"id":3361,"type":"article-journal","abstract":"Indigenous people are considered to be among the most vulnerable to food insecurity and biodiversity loss. Biodiversity is cited as a key component of indigenous food security; however, quantitative examples of this linkage are limited. We examined how species and population diversity influence the food security of indigenous fisheries for Pacific salmon (Oncorhynchus species). We compared two dimensions of food security – catch stability (interannual variability) and access (season length) – across a salmon diversity gradient for 21 fisheries on the Fraser River, Canada, over 30 years, using linear regression models. We used population diversity proxies derived from a range of existing measures because population-specific data were unavailable. While both population and species diversity were generally associated with higher catch stability and temporal access, population diversity had a stronger signal. Fisheries with access to high species diversity had up to 1·4 times more stable catch than predicted by the portfolio effect and up to 1·2 times longer fishing seasons than fisheries with access to fewer species. Fisheries with access to high population diversity had up to 3·8 times more stable catch and three times longer seasons than fisheries with access to fewer populations. Catch stability of Chinook Oncorhynchus tshawytscha and sockeye Oncorhynchus nerka fisheries was best explained by the number of populations and conservation units, respectively, that migrate past a fishery en route to spawning grounds. Similar population diversity metrics were important explanatory variables for season length of sockeye, pink Oncorhynchus gorbuscha, coho Oncorhynchus kisutch and chum Oncorhynchus keta fisheries. Synthesis and applications. We show an empirical example of how multiple scales of biodiversity support food security across a large watershed and suggest that protecting fine-scale salmon diversity will help promote food security for indigenous people. The scales of environmental assessments need to match the scales of the socio-ecological processes that will be affected by development. We illustrate that upstream projects that damage salmon habitat could degrade the food security of downstream indigenous fisheries, with implications to Canadian indigenous people and to watersheds around the world where migratory fishes support local fisheries.","container-title":"Journal of Applied Ecology","DOI":"10.1111/1365-2664.12717","ISSN":"1365-2664","issue":"5","language":"en","note":"_eprint: https://onlinelibrary.wiley.com/doi/pdf/10.1111/1365-2664.12717","page":"1489-1499","source":"Wiley Online Library","title":"Species and population diversity in Pacific salmon fisheries underpin indigenous food security","volume":"53","author":[{"family":"Nesbitt","given":"Holly K."},{"family":"Moore","given":"Jonathan W."}],"issued":{"date-parts":[["2016"]]}}},{"id":68,"uris":["http://zotero.org/users/8421274/items/DIRY8NHC"],"itemData":{"id":68,"type":"article-journal","container-title":"Frontiers in Ecology and the Environment","issue":"5","note":"publisher: Wiley Online Library","page":"257–263","source":"Google Scholar","title":"The portfolio concept in ecology and evolution","volume":"13","author":[{"family":"Schindler","given":"Daniel E."},{"family":"Armstrong","given":"Jonathan B."},{"family":"Reed","given":"Thomas E."}],"issued":{"date-parts":[["2015"]]}}}],"schema":"https://github.com/citation-style-language/schema/raw/master/csl-citation.json"} </w:instrText>
+        <w:instrText xml:space="preserve"> ADDIN ZOTERO_ITEM CSL_CITATION {"citationID":"VDgUGdsR","properties":{"formattedCitation":"(Nesbitt &amp; Moore, 2016; Schindler et al., 2015)","plainCitation":"(Nesbitt &amp; Moore, 2016; Schindler et al., 2015)","dontUpdate":true,"noteIndex":0},"citationItems":[{"id":3361,"uris":["http://zotero.org/users/8421274/items/U6M4JZTI"],"itemData":{"id":3361,"type":"article-journal","abstract":"Indigenous people are considered to be among the most vulnerable to food insecurity and biodiversity loss. Biodiversity is cited as a key component of indigenous food security; however, quantitative examples of this linkage are limited. We examined how species and population diversity influence the food security of indigenous fisheries for Pacific salmon (Oncorhynchus species). We compared two dimensions of food security – catch stability (interannual variability) and access (season length) – across a salmon diversity gradient for 21 fisheries on the Fraser River, Canada, over 30 years, using linear regression models. We used population diversity proxies derived from a range of existing measures because population-specific data were unavailable. While both population and species diversity were generally associated with higher catch stability and temporal access, population diversity had a stronger signal. Fisheries with access to high species diversity had up to 1·4 times more stable catch than predicted by the portfolio effect and up to 1·2 times longer fishing seasons than fisheries with access to fewer species. Fisheries with access to high population diversity had up to 3·8 times more stable catch and three times longer seasons than fisheries with access to fewer populations. Catch stability of Chinook Oncorhynchus tshawytscha and sockeye Oncorhynchus nerka fisheries was best explained by the number of populations and conservation units, respectively, that migrate past a fishery en route to spawning grounds. Similar population diversity metrics were important explanatory variables for season length of sockeye, pink Oncorhynchus gorbuscha, coho Oncorhynchus kisutch and chum Oncorhynchus keta fisheries. Synthesis and applications. We show an empirical example of how multiple scales of biodiversity support food security across a large watershed and suggest that protecting fine-scale salmon diversity will help promote food security for indigenous people. The scales of environmental assessments need to match the scales of the socio-ecological processes that will be affected by development. We illustrate that upstream projects that damage salmon habitat could degrade the food security of downstream indigenous fisheries, with implications to Canadian indigenous people and to watersheds around the world where migratory fishes support local fisheries.","container-title":"Journal of Applied Ecology","DOI":"10.1111/1365-2664.12717","ISSN":"1365-2664","issue":"5","language":"en","note":"_eprint: https://onlinelibrary.wiley.com/doi/pdf/10.1111/1365-2664.12717","page":"1489-1499","source":"Wiley Online Library","title":"Species and population diversity in Pacific salmon fisheries underpin indigenous food security","volume":"53","author":[{"family":"Nesbitt","given":"Holly K."},{"family":"Moore","given":"Jonathan W."}],"issued":{"date-parts":[["2016"]]}}},{"id":68,"uris":["http://zotero.org/users/8421274/items/DIRY8NHC"],"itemData":{"id":68,"type":"article-journal","container-title":"Frontiers in Ecology and the Environment","issue":"5","note":"publisher: Wiley Online Library","page":"257–263","source":"Google Scholar","title":"The portfolio concept in ecology and evolution","volume":"13","author":[{"family":"Schindler","given":"Daniel E."},{"family":"Armstrong","given":"Jonathan B."},{"family":"Reed","given":"Thomas E."}],"issued":{"date-parts":[["2015"]]}}}],"schema":"https://github.com/citation-style-language/schema/raw/master/csl-citation.json"} </w:instrText>
       </w:r>
       <w:r>
         <w:rPr>
@@ -630,30 +654,69 @@
       <w:r>
         <w:rPr>
           <w:rFonts w:ascii="Garamond" w:hAnsi="Garamond"/>
-          <w:highlight w:val="yellow"/>
-        </w:rPr>
-        <w:t>(Schindler et al. 2010, Nesbitt and Moore.</w:t>
-      </w:r>
-      <w:r>
-        <w:rPr>
-          <w:rFonts w:ascii="Garamond" w:hAnsi="Garamond"/>
-          <w:highlight w:val="yellow"/>
-        </w:rPr>
-        <w:t>, Griffiths et al.</w:t>
-      </w:r>
-      <w:r>
-        <w:rPr>
-          <w:rFonts w:ascii="Garamond" w:hAnsi="Garamond"/>
-          <w:highlight w:val="yellow"/>
-        </w:rPr>
-        <w:t>.)</w:t>
-      </w:r>
-      <w:r>
-        <w:rPr>
-          <w:rFonts w:ascii="Garamond" w:hAnsi="Garamond"/>
-          <w:highlight w:val="yellow"/>
-        </w:rPr>
-        <w:t>.</w:t>
+        </w:rPr>
+        <w:fldChar w:fldCharType="begin"/>
+      </w:r>
+      <w:r>
+        <w:rPr>
+          <w:rFonts w:ascii="Garamond" w:hAnsi="Garamond"/>
+        </w:rPr>
+        <w:instrText xml:space="preserve"> ADDIN ZOTERO_ITEM CSL_CITATION {"citationID":"74xWzV2z","properties":{"formattedCitation":"(Griffiths et al., 2014; Nesbitt &amp; Moore, 2016; Schindler et al., 2010)","plainCitation":"(Griffiths et al., 2014; Nesbitt &amp; Moore, 2016; Schindler et al., 2010)","noteIndex":0},"citationItems":[{"id":4217,"uris":["http://zotero.org/users/8421274/items/8XTQF7BZ"],"itemData":{"id":4217,"type":"article-journal","abstract":"&lt;list list-type=\"1\" id=\"jpe12341-list-0001\"&gt; Quantifying the variability in the delivery of ecosystem services across the landscape can be used to set appropriate management targets, evaluate resilience and target conservation efforts. Ecosystem functions and services may exhibit portfolio-type dynamics, whereby diversity within lower levels promotes stability at more aggregated levels. Portfolio theory provides a framework to characterize the relative performance among ecosystems and the processes that drive differences in performance. We assessed Pacific salmon Oncorhynchus spp. portfolio performance across their native latitudinal range focusing on the reliability of salmon returns as a metric with which to assess the function of salmon ecosystems and their services to humans. We used the Sharpe ratio (e.g. the size of the total salmon return to the portfolio relative to its variability (risk)) to evaluate the performance of Chinook and sockeye salmon portfolios across the west coast of North America. We evaluated the effects on portfolio performance from the variance of and covariance among salmon returns within each portfolio, and the association between portfolio performance and watershed attributes. We found a positive latitudinal trend in the risk-adjusted performance of Chinook and sockeye salmon portfolios that also correlated negatively with anthropogenic impact on watersheds (e.g. dams and land-use change). High-latitude Chinook salmon portfolios were on average 25 times more reliable, and their portfolio risk was mainly due to low variance in the individual assets. Sockeye salmon portfolios were also more reliable at higher latitudes, but sources of risk varied among the highest performing portfolios.Synthesis and applications. Portfolio theory provides a straightforward method for characterizing the resilience of salmon ecosystems and their services. Natural variability in portfolio performance among undeveloped watersheds provides a benchmark for restoration efforts. Locally and regionally, assessing the sources of portfolio risk can guide actions to maintain existing resilience (protect habitat and disturbance regimes that maintain response diversity; employ harvest strategies sensitive to different portfolio components) or improve restoration activities. Improving our understanding of portfolio reliability may allow for management of natural resources that is robust to ongoing environmental change. Portfolio theory provides a straightforward method for characterizing the resilience of salmon ecosystems and their services. Natural variability in portfolio performance among undeveloped watersheds provides a benchmark for restoration efforts. Locally and regionally, assessing the sources of portfolio risk can guide actions to maintain existing resilience (protect habitat and disturbance regimes that maintain response diversity; employ harvest strategies sensitive to different portfolio components) or improve restoration activities. Improving our understanding of portfolio reliability may allow for management of natural resources that is robust to ongoing environmental change.","container-title":"JOURNAL OF APPLIED ECOLOGY","DOI":"10.1111/1365-2664.12341","ISSN":"0021-8901, 1365-2664","issue":"6","journalAbbreviation":"J. Appl. Ecol.","language":"English","note":"number-of-pages: 10\npublisher-place: Hoboken\npublisher: Wiley-Blackwell\nWeb of Science ID: WOS:000345706100010","page":"1554-1563","source":"Clarivate Analytics Web of Science","title":"Performance of salmon fishery portfolios across western North America","volume":"51","author":[{"family":"Griffiths","given":"Jennifer R."},{"family":"Schindler","given":"Daniel E."},{"family":"Armstrong","given":"Jonathan B."},{"family":"Scheuerell","given":"Mark D."},{"family":"Whited","given":"Diane C."},{"family":"Clark","given":"Robert A."},{"family":"Hilborn","given":"Ray"},{"family":"Holt","given":"Carrie A."},{"family":"Lindley","given":"Steven T."},{"family":"Stanford","given":"Jack A."},{"family":"Volk","given":"Eric C."}],"issued":{"date-parts":[["2014",12]]}}},{"id":3361,"uris":["http://zotero.org/users/8421274/items/U6M4JZTI"],"itemData":{"id":3361,"type":"article-journal","abstract":"Indigenous people are considered to be among the most vulnerable to food insecurity and biodiversity loss. Biodiversity is cited as a key component of indigenous food security; however, quantitative examples of this linkage are limited. We examined how species and population diversity influence the food security of indigenous fisheries for Pacific salmon (Oncorhynchus species). We compared two dimensions of food security – catch stability (interannual variability) and access (season length) – across a salmon diversity gradient for 21 fisheries on the Fraser River, Canada, over 30 years, using linear regression models. We used population diversity proxies derived from a range of existing measures because population-specific data were unavailable. While both population and species diversity were generally associated with higher catch stability and temporal access, population diversity had a stronger signal. Fisheries with access to high species diversity had up to 1·4 times more stable catch than predicted by the portfolio effect and up to 1·2 times longer fishing seasons than fisheries with access to fewer species. Fisheries with access to high population diversity had up to 3·8 times more stable catch and three times longer seasons than fisheries with access to fewer populations. Catch stability of Chinook Oncorhynchus tshawytscha and sockeye Oncorhynchus nerka fisheries was best explained by the number of populations and conservation units, respectively, that migrate past a fishery en route to spawning grounds. Similar population diversity metrics were important explanatory variables for season length of sockeye, pink Oncorhynchus gorbuscha, coho Oncorhynchus kisutch and chum Oncorhynchus keta fisheries. Synthesis and applications. We show an empirical example of how multiple scales of biodiversity support food security across a large watershed and suggest that protecting fine-scale salmon diversity will help promote food security for indigenous people. The scales of environmental assessments need to match the scales of the socio-ecological processes that will be affected by development. We illustrate that upstream projects that damage salmon habitat could degrade the food security of downstream indigenous fisheries, with implications to Canadian indigenous people and to watersheds around the world where migratory fishes support local fisheries.","container-title":"Journal of Applied Ecology","DOI":"10.1111/1365-2664.12717","ISSN":"1365-2664","issue":"5","language":"en","note":"_eprint: https://onlinelibrary.wiley.com/doi/pdf/10.1111/1365-2664.12717","page":"1489-1499","source":"Wiley Online Library","title":"Species and population diversity in Pacific salmon fisheries underpin indigenous food security","volume":"53","author":[{"family":"Nesbitt","given":"Holly K."},{"family":"Moore","given":"Jonathan W."}],"issued":{"date-parts":[["2016"]]}}},{"id":272,"uris":["http://zotero.org/users/8421274/items/24NDGS7V"],"itemData":{"id":272,"type":"article-journal","abstract":"One of the most pervasive themes in ecology is that biological diversity stabilizes ecosystem processes and the services they provide to society, a concept that has become a common argument for biodiversity conservation. Species-rich communities are thought to produce more temporally stable ecosystem services because of the complementary or independent dynamics among species that perform similar ecosystem functions. Such variance dampening within communities is referred to as a portfolio effect and is analogous to the effects of asset diversity on the stability of financial portfolios. In ecology, these arguments have focused on the effects of species diversity on ecosystem stability but have not considered the importance of biologically relevant diversity within individual species. Current rates of population extirpation are probably at least three orders of magnitude higher than species extinction rates, so there is a pressing need to clarify how population and life history diversity affect the performance of individual species in providing important ecosystem services. Here we use five decades of data from Oncorhynchus nerka (sockeye salmon) in Bristol Bay, Alaska, to provide the first quantification of portfolio effects that derive from population and life history diversity in an important and heavily exploited species. Variability in annual Bristol Bay salmon returns is 2.2 times lower than it would be if the system consisted of a single homogenous population rather than the several hundred discrete populations it currently consists of. Furthermore, if it were a single homogeneous population, such increased variability would lead to ten times more frequent fisheries closures. Portfolio effects are also evident in watershed food webs, where they stabilize and extend predator access to salmon resources. Our results demonstrate the critical importance of maintaining population diversity for stabilizing ecosystem services and securing the economies and livelihoods that depend on them. The reliability of ecosystem services will erode faster than indicated by species loss alone. [PUBLICATION ABSTRACT]","container-title":"Nature","DOI":"https://doi-org.prox.lib.ncsu.edu/10.1038/nature09060","ISSN":"00280836","issue":"7298","language":"English","license":"Copyright Nature Publishing Group Jun 3, 2010","note":"number-of-pages: 5\npublisher-place: London, United States\npublisher: Nature Publishing Group\nsection: LETTERS","source":"ProQuest","title":"Population diversity and the portfolio effect in an exploited species","URL":"http://www.proquest.com/docview/375318240/abstract/317AC81E34EB4163PQ/1","volume":"465","author":[{"family":"Schindler","given":"Daniel E."},{"family":"Hilborn","given":"Ray"},{"family":"Chasco","given":"Brandon"},{"family":"Boatright","given":"Christopher P."},{"family":"Quinn","given":"Thomas P."},{"family":"Rogers","given":"Lauren A."},{"family":"Webster","given":"Michael S."}],"accessed":{"date-parts":[["2022",5,12]]},"issued":{"date-parts":[["2010",6,3]]}}}],"schema":"https://github.com/citation-style-language/schema/raw/master/csl-citation.json"} </w:instrText>
+      </w:r>
+      <w:r>
+        <w:rPr>
+          <w:rFonts w:ascii="Garamond" w:hAnsi="Garamond"/>
+        </w:rPr>
+        <w:fldChar w:fldCharType="separate"/>
+      </w:r>
+      <w:r>
+        <w:rPr>
+          <w:rFonts w:ascii="Garamond" w:hAnsi="Garamond"/>
+          <w:noProof/>
+        </w:rPr>
+        <w:t>(Griffiths et al., 2014; Nesbitt &amp; Moore, 2016; Schindler et al., 2010)</w:t>
+      </w:r>
+      <w:r>
+        <w:rPr>
+          <w:rFonts w:ascii="Garamond" w:hAnsi="Garamond"/>
+        </w:rPr>
+        <w:fldChar w:fldCharType="end"/>
+      </w:r>
+      <w:r>
+        <w:rPr>
+          <w:rFonts w:ascii="Garamond" w:hAnsi="Garamond"/>
+        </w:rPr>
+        <w:t xml:space="preserve">. </w:t>
+      </w:r>
+      <w:r>
+        <w:rPr>
+          <w:rFonts w:ascii="Garamond" w:hAnsi="Garamond"/>
+        </w:rPr>
+        <w:t xml:space="preserve">Populations of adult fish migrating upstream are comprised of multiple </w:t>
+      </w:r>
+      <w:r>
+        <w:rPr>
+          <w:rFonts w:ascii="Garamond" w:hAnsi="Garamond"/>
+        </w:rPr>
+        <w:t>distinct</w:t>
+      </w:r>
+      <w:r>
+        <w:rPr>
+          <w:rFonts w:ascii="Garamond" w:hAnsi="Garamond"/>
+        </w:rPr>
+        <w:t xml:space="preserve"> spatial stocks </w:t>
+      </w:r>
+      <w:r>
+        <w:rPr>
+          <w:rFonts w:ascii="Garamond" w:hAnsi="Garamond"/>
+        </w:rPr>
+        <w:t xml:space="preserve">which vary in their relative </w:t>
+      </w:r>
+      <w:r>
+        <w:rPr>
+          <w:rFonts w:ascii="Garamond" w:hAnsi="Garamond"/>
+        </w:rPr>
+        <w:t>strength,</w:t>
       </w:r>
       <w:r>
         <w:rPr>
@@ -665,31 +728,37 @@
         <w:rPr>
           <w:rFonts w:ascii="Garamond" w:hAnsi="Garamond"/>
         </w:rPr>
-        <w:t xml:space="preserve">Populations of adult fish migrating upstream are comprised of multiple </w:t>
-      </w:r>
-      <w:r>
-        <w:rPr>
-          <w:rFonts w:ascii="Garamond" w:hAnsi="Garamond"/>
-        </w:rPr>
-        <w:t>distinct</w:t>
-      </w:r>
-      <w:r>
-        <w:rPr>
-          <w:rFonts w:ascii="Garamond" w:hAnsi="Garamond"/>
-        </w:rPr>
-        <w:t xml:space="preserve"> spatial stocks </w:t>
-      </w:r>
-      <w:r>
-        <w:rPr>
-          <w:rFonts w:ascii="Garamond" w:hAnsi="Garamond"/>
-        </w:rPr>
-        <w:t xml:space="preserve">which vary in their relative </w:t>
-      </w:r>
-      <w:r>
-        <w:rPr>
-          <w:rFonts w:ascii="Garamond" w:hAnsi="Garamond"/>
-        </w:rPr>
-        <w:t>strength,</w:t>
+        <w:t xml:space="preserve">but which </w:t>
+      </w:r>
+      <w:r>
+        <w:rPr>
+          <w:rFonts w:ascii="Garamond" w:hAnsi="Garamond"/>
+        </w:rPr>
+        <w:t xml:space="preserve">co-migrate within overlapping temporal windows. </w:t>
+      </w:r>
+      <w:r>
+        <w:rPr>
+          <w:rFonts w:ascii="Garamond" w:hAnsi="Garamond"/>
+        </w:rPr>
+        <w:t xml:space="preserve">As a result, downstream fisheries </w:t>
+      </w:r>
+      <w:r>
+        <w:rPr>
+          <w:rFonts w:ascii="Garamond" w:hAnsi="Garamond"/>
+        </w:rPr>
+        <w:t>that</w:t>
+      </w:r>
+      <w:r>
+        <w:rPr>
+          <w:rFonts w:ascii="Garamond" w:hAnsi="Garamond"/>
+        </w:rPr>
+        <w:t xml:space="preserve"> harvest migrating fish risk overexploitation of vulnerable stocks which co-migrate with more robust </w:t>
+      </w:r>
+      <w:r>
+        <w:rPr>
+          <w:rFonts w:ascii="Garamond" w:hAnsi="Garamond"/>
+        </w:rPr>
+        <w:t>ones</w:t>
       </w:r>
       <w:r>
         <w:rPr>
@@ -701,48 +770,6 @@
         <w:rPr>
           <w:rFonts w:ascii="Garamond" w:hAnsi="Garamond"/>
         </w:rPr>
-        <w:t xml:space="preserve">but which </w:t>
-      </w:r>
-      <w:r>
-        <w:rPr>
-          <w:rFonts w:ascii="Garamond" w:hAnsi="Garamond"/>
-        </w:rPr>
-        <w:t xml:space="preserve">co-migrate within overlapping temporal windows. </w:t>
-      </w:r>
-      <w:r>
-        <w:rPr>
-          <w:rFonts w:ascii="Garamond" w:hAnsi="Garamond"/>
-        </w:rPr>
-        <w:t xml:space="preserve">As a result, downstream fisheries </w:t>
-      </w:r>
-      <w:r>
-        <w:rPr>
-          <w:rFonts w:ascii="Garamond" w:hAnsi="Garamond"/>
-        </w:rPr>
-        <w:t>that</w:t>
-      </w:r>
-      <w:r>
-        <w:rPr>
-          <w:rFonts w:ascii="Garamond" w:hAnsi="Garamond"/>
-        </w:rPr>
-        <w:t xml:space="preserve"> harvest migrating fish risk overexploitation of vulnerable stocks which co-migrate with more robust </w:t>
-      </w:r>
-      <w:r>
-        <w:rPr>
-          <w:rFonts w:ascii="Garamond" w:hAnsi="Garamond"/>
-        </w:rPr>
-        <w:t>ones</w:t>
-      </w:r>
-      <w:r>
-        <w:rPr>
-          <w:rFonts w:ascii="Garamond" w:hAnsi="Garamond"/>
-        </w:rPr>
-        <w:t xml:space="preserve"> </w:t>
-      </w:r>
-      <w:r>
-        <w:rPr>
-          <w:rFonts w:ascii="Garamond" w:hAnsi="Garamond"/>
-        </w:rPr>
         <w:fldChar w:fldCharType="begin"/>
       </w:r>
       <w:r>
@@ -798,20 +825,44 @@
         <w:rPr>
           <w:rFonts w:ascii="Garamond" w:hAnsi="Garamond"/>
         </w:rPr>
-        <w:t xml:space="preserve">result of the aggregate dynamics of upstream stock components </w:t>
-      </w:r>
-      <w:r>
-        <w:rPr>
-          <w:rFonts w:ascii="Garamond" w:hAnsi="Garamond"/>
-          <w:highlight w:val="yellow"/>
-        </w:rPr>
-        <w:t>(Nesbitt and Moore, X).</w:t>
-      </w:r>
-      <w:r>
-        <w:rPr>
-          <w:rFonts w:ascii="Garamond" w:hAnsi="Garamond"/>
-        </w:rPr>
-        <w:t xml:space="preserve"> </w:t>
+        <w:t>result of the aggregate dynamics of upstream stock components</w:t>
+      </w:r>
+      <w:r>
+        <w:rPr>
+          <w:rFonts w:ascii="Garamond" w:hAnsi="Garamond"/>
+        </w:rPr>
+        <w:fldChar w:fldCharType="begin"/>
+      </w:r>
+      <w:r>
+        <w:rPr>
+          <w:rFonts w:ascii="Garamond" w:hAnsi="Garamond"/>
+        </w:rPr>
+        <w:instrText xml:space="preserve"> ADDIN ZOTERO_ITEM CSL_CITATION {"citationID":"cRw1bfjv","properties":{"formattedCitation":"(Nesbitt &amp; Moore, 2016)","plainCitation":"(Nesbitt &amp; Moore, 2016)","noteIndex":0},"citationItems":[{"id":3361,"uris":["http://zotero.org/users/8421274/items/U6M4JZTI"],"itemData":{"id":3361,"type":"article-journal","abstract":"Indigenous people are considered to be among the most vulnerable to food insecurity and biodiversity loss. Biodiversity is cited as a key component of indigenous food security; however, quantitative examples of this linkage are limited. We examined how species and population diversity influence the food security of indigenous fisheries for Pacific salmon (Oncorhynchus species). We compared two dimensions of food security – catch stability (interannual variability) and access (season length) – across a salmon diversity gradient for 21 fisheries on the Fraser River, Canada, over 30 years, using linear regression models. We used population diversity proxies derived from a range of existing measures because population-specific data were unavailable. While both population and species diversity were generally associated with higher catch stability and temporal access, population diversity had a stronger signal. Fisheries with access to high species diversity had up to 1·4 times more stable catch than predicted by the portfolio effect and up to 1·2 times longer fishing seasons than fisheries with access to fewer species. Fisheries with access to high population diversity had up to 3·8 times more stable catch and three times longer seasons than fisheries with access to fewer populations. Catch stability of Chinook Oncorhynchus tshawytscha and sockeye Oncorhynchus nerka fisheries was best explained by the number of populations and conservation units, respectively, that migrate past a fishery en route to spawning grounds. Similar population diversity metrics were important explanatory variables for season length of sockeye, pink Oncorhynchus gorbuscha, coho Oncorhynchus kisutch and chum Oncorhynchus keta fisheries. Synthesis and applications. We show an empirical example of how multiple scales of biodiversity support food security across a large watershed and suggest that protecting fine-scale salmon diversity will help promote food security for indigenous people. The scales of environmental assessments need to match the scales of the socio-ecological processes that will be affected by development. We illustrate that upstream projects that damage salmon habitat could degrade the food security of downstream indigenous fisheries, with implications to Canadian indigenous people and to watersheds around the world where migratory fishes support local fisheries.","container-title":"Journal of Applied Ecology","DOI":"10.1111/1365-2664.12717","ISSN":"1365-2664","issue":"5","language":"en","note":"_eprint: https://onlinelibrary.wiley.com/doi/pdf/10.1111/1365-2664.12717","page":"1489-1499","source":"Wiley Online Library","title":"Species and population diversity in Pacific salmon fisheries underpin indigenous food security","volume":"53","author":[{"family":"Nesbitt","given":"Holly K."},{"family":"Moore","given":"Jonathan W."}],"issued":{"date-parts":[["2016"]]}}}],"schema":"https://github.com/citation-style-language/schema/raw/master/csl-citation.json"} </w:instrText>
+      </w:r>
+      <w:r>
+        <w:rPr>
+          <w:rFonts w:ascii="Garamond" w:hAnsi="Garamond"/>
+        </w:rPr>
+        <w:fldChar w:fldCharType="separate"/>
+      </w:r>
+      <w:r>
+        <w:rPr>
+          <w:rFonts w:ascii="Garamond" w:hAnsi="Garamond"/>
+          <w:noProof/>
+        </w:rPr>
+        <w:t>(Nesbitt &amp; Moore, 2016)</w:t>
+      </w:r>
+      <w:r>
+        <w:rPr>
+          <w:rFonts w:ascii="Garamond" w:hAnsi="Garamond"/>
+        </w:rPr>
+        <w:fldChar w:fldCharType="end"/>
+      </w:r>
+      <w:r>
+        <w:rPr>
+          <w:rFonts w:ascii="Garamond" w:hAnsi="Garamond"/>
+        </w:rPr>
+        <w:t xml:space="preserve">. </w:t>
       </w:r>
       <w:r>
         <w:rPr>
@@ -838,6 +889,7 @@
         <w:rPr>
           <w:rFonts w:ascii="Garamond" w:hAnsi="Garamond"/>
         </w:rPr>
+        <w:lastRenderedPageBreak/>
         <w:t xml:space="preserve">Western Alaska watersheds contain some of the last remaining pristine salmon habitat and have historically supported large returns of Pacific salmon. </w:t>
       </w:r>
       <w:r>
@@ -904,7 +956,6 @@
         <w:rPr>
           <w:rFonts w:ascii="Garamond" w:hAnsi="Garamond"/>
         </w:rPr>
-        <w:lastRenderedPageBreak/>
         <w:t xml:space="preserve">populations </w:t>
       </w:r>
       <w:r>
@@ -916,7 +967,6 @@
       <w:r>
         <w:rPr>
           <w:rFonts w:ascii="Garamond" w:hAnsi="Garamond"/>
-          <w:highlight w:val="yellow"/>
         </w:rPr>
         <w:t xml:space="preserve">(Clark et al., 2018; </w:t>
       </w:r>
@@ -924,7 +974,6 @@
       <w:r>
         <w:rPr>
           <w:rFonts w:ascii="Garamond" w:hAnsi="Garamond"/>
-          <w:highlight w:val="yellow"/>
         </w:rPr>
         <w:t>Esquible</w:t>
       </w:r>
@@ -932,7 +981,6 @@
       <w:r>
         <w:rPr>
           <w:rFonts w:ascii="Garamond" w:hAnsi="Garamond"/>
-          <w:highlight w:val="yellow"/>
         </w:rPr>
         <w:t xml:space="preserve"> et al., 2024).</w:t>
       </w:r>
@@ -963,7 +1011,6 @@
       <w:r>
         <w:rPr>
           <w:rFonts w:ascii="Garamond" w:hAnsi="Garamond"/>
-          <w:highlight w:val="yellow"/>
         </w:rPr>
         <w:t>(</w:t>
       </w:r>
@@ -971,7 +1018,6 @@
       <w:r>
         <w:rPr>
           <w:rFonts w:ascii="Garamond" w:hAnsi="Garamond"/>
-          <w:highlight w:val="yellow"/>
         </w:rPr>
         <w:t>Esquible</w:t>
       </w:r>
@@ -979,7 +1025,6 @@
       <w:r>
         <w:rPr>
           <w:rFonts w:ascii="Garamond" w:hAnsi="Garamond"/>
-          <w:highlight w:val="yellow"/>
         </w:rPr>
         <w:t xml:space="preserve"> et al., 2024).</w:t>
       </w:r>
@@ -1223,35 +1268,114 @@
       <w:r>
         <w:rPr>
           <w:rFonts w:ascii="Garamond" w:hAnsi="Garamond"/>
+        </w:rPr>
+        <w:fldChar w:fldCharType="begin"/>
+      </w:r>
+      <w:r>
+        <w:rPr>
+          <w:rFonts w:ascii="Garamond" w:hAnsi="Garamond"/>
+        </w:rPr>
+        <w:instrText xml:space="preserve"> ADDIN ZOTERO_ITEM CSL_CITATION {"citationID":"DfGnnmMb","properties":{"formattedCitation":"(Clark et al., 2015)","plainCitation":"(Clark et al., 2015)","noteIndex":0},"citationItems":[{"id":5370,"uris":["http://zotero.org/users/8421274/items/CSEI4Y28"],"itemData":{"id":5370,"type":"article-journal","abstract":"Variation in the timing of migration to freshwaters to spawn is one important dimension of the life history variation within individual salmon stocks. That variable has important implications for developing sustainable fisheries that simultaneously exploit multiple populations within the same geographic area. We examined the variation in migration timing of adult Chinook Salmon Oncorhynchus tshawytscha within the Togiak River system of southwest Alaska to determine whether fish that spawned in different habitats migrated into freshwater from the ocean at different times. In particular, we evaluated whether there were watershed</w:instrText>
+      </w:r>
+      <w:r>
+        <w:rPr>
+          <w:rFonts w:ascii="Cambria Math" w:hAnsi="Cambria Math" w:cs="Cambria Math"/>
+        </w:rPr>
+        <w:instrText>‐</w:instrText>
+      </w:r>
+      <w:r>
+        <w:rPr>
+          <w:rFonts w:ascii="Garamond" w:hAnsi="Garamond"/>
+        </w:rPr>
+        <w:instrText>wide effects of body size, sex, spawning location, and year on the timing of spawning</w:instrText>
+      </w:r>
+      <w:r>
+        <w:rPr>
+          <w:rFonts w:ascii="Cambria Math" w:hAnsi="Cambria Math" w:cs="Cambria Math"/>
+        </w:rPr>
+        <w:instrText>‐</w:instrText>
+      </w:r>
+      <w:r>
+        <w:rPr>
+          <w:rFonts w:ascii="Garamond" w:hAnsi="Garamond"/>
+        </w:rPr>
+        <w:instrText>run migration into the Togiak River. Migration data and spawning fate were collected using radiotelemetry and analyzed with mixed effects models to account for among</w:instrText>
+      </w:r>
+      <w:r>
+        <w:rPr>
+          <w:rFonts w:ascii="Cambria Math" w:hAnsi="Cambria Math" w:cs="Cambria Math"/>
+        </w:rPr>
+        <w:instrText>‐</w:instrText>
+      </w:r>
+      <w:r>
+        <w:rPr>
+          <w:rFonts w:ascii="Garamond" w:hAnsi="Garamond"/>
+        </w:rPr>
+        <w:instrText xml:space="preserve">year variation in migration timing across the 4 years of the study. We found that migration timing of Chinook Salmon in the Togiak watershed is segregated by spawning location and sex and is consistent across body sizes and years. Fish that spawned higher in the watershed had a tendency to enter freshwater earlier than fish that spawned lower in the watershed and in the main stem of the river. Our results indicate clear stock structure in the migration of spawning Chinook Salmon to the Togiak River watershed, suggesting that it is important to distribute harvest over the entire distribution of Chinook Salmon run timing to minimize the risk of overexploiting certain components of the stock complex.","container-title":"Transactions of the American Fisheries Society","DOI":"10.1080/00028487.2015.1031281","ISSN":"0002-8487","issue":"4","journalAbbreviation":"Transactions of the American Fisheries Society","page":"829-836","source":"Silverchair","title":"Migration Timing of Adult Chinook Salmon into the Togiak River, Alaska, Watershed: Is There Evidence for Stock Structure?","title-short":"Migration Timing of Adult Chinook Salmon into the Togiak River, Alaska, Watershed","volume":"144","author":[{"family":"Clark","given":"Sydney C."},{"family":"Tanner","given":"Theresa L."},{"family":"Sethi","given":"Suresh A."},{"family":"Bentley","given":"Kale T."},{"family":"Schindler","given":"Daniel E."}],"issued":{"date-parts":[["2015",7,1]]}}}],"schema":"https://github.com/citation-style-language/schema/raw/master/csl-citation.json"} </w:instrText>
+      </w:r>
+      <w:r>
+        <w:rPr>
+          <w:rFonts w:ascii="Garamond" w:hAnsi="Garamond"/>
+        </w:rPr>
+        <w:fldChar w:fldCharType="separate"/>
+      </w:r>
+      <w:r>
+        <w:rPr>
+          <w:rFonts w:ascii="Garamond" w:hAnsi="Garamond"/>
+          <w:noProof/>
+        </w:rPr>
+        <w:t>(Clark et al., 2015)</w:t>
+      </w:r>
+      <w:r>
+        <w:rPr>
+          <w:rFonts w:ascii="Garamond" w:hAnsi="Garamond"/>
+        </w:rPr>
+        <w:fldChar w:fldCharType="end"/>
+      </w:r>
+      <w:r>
+        <w:rPr>
+          <w:rFonts w:ascii="Garamond" w:hAnsi="Garamond"/>
+        </w:rPr>
+        <w:t xml:space="preserve">, </w:t>
+      </w:r>
+      <w:r>
+        <w:rPr>
+          <w:rFonts w:ascii="Garamond" w:hAnsi="Garamond"/>
+        </w:rPr>
+        <w:t xml:space="preserve"> supported</w:t>
+      </w:r>
+      <w:r>
+        <w:rPr>
+          <w:rFonts w:ascii="Garamond" w:hAnsi="Garamond"/>
+        </w:rPr>
+        <w:t xml:space="preserve"> by limited telemetry data in the Kuskokwim </w:t>
+      </w:r>
+      <w:r>
+        <w:rPr>
+          <w:rFonts w:ascii="Garamond" w:hAnsi="Garamond"/>
           <w:highlight w:val="yellow"/>
         </w:rPr>
-        <w:t>(Clark et al., 2015</w:t>
+        <w:t>(</w:t>
       </w:r>
       <w:r>
         <w:rPr>
           <w:rFonts w:ascii="Garamond" w:hAnsi="Garamond"/>
           <w:highlight w:val="yellow"/>
         </w:rPr>
+        <w:t>Cite</w:t>
+      </w:r>
+      <w:r>
+        <w:rPr>
+          <w:rFonts w:ascii="Garamond" w:hAnsi="Garamond"/>
+          <w:highlight w:val="yellow"/>
+        </w:rPr>
         <w:t>)</w:t>
       </w:r>
       <w:r>
         <w:rPr>
           <w:rFonts w:ascii="Garamond" w:hAnsi="Garamond"/>
         </w:rPr>
-        <w:t xml:space="preserve"> supported</w:t>
-      </w:r>
-      <w:r>
-        <w:rPr>
-          <w:rFonts w:ascii="Garamond" w:hAnsi="Garamond"/>
-        </w:rPr>
-        <w:t xml:space="preserve"> by limited telemetry data in the Kuskokwim </w:t>
-      </w:r>
-      <w:r>
-        <w:rPr>
-          <w:rFonts w:ascii="Garamond" w:hAnsi="Garamond"/>
-          <w:highlight w:val="yellow"/>
-        </w:rPr>
-        <w:t>(Clark and Smith, 2017)</w:t>
+        <w:t>,</w:t>
       </w:r>
       <w:r>
         <w:rPr>
@@ -1353,6 +1477,7 @@
           <w:b w:val="0"/>
           <w:bCs w:val="0"/>
         </w:rPr>
+        <w:lastRenderedPageBreak/>
         <w:t>and whether</w:t>
       </w:r>
       <w:r>
@@ -1414,7 +1539,6 @@
         <w:rPr>
           <w:rFonts w:ascii="Garamond" w:hAnsi="Garamond"/>
         </w:rPr>
-        <w:lastRenderedPageBreak/>
         <w:t>Here, we use otolith chemistry from fish caught during test fisheries throughout the seasonal migration period over six years in the Kuskokwim River basin to reconstruct spatiotemporal patterns of Chinook salmon returns. The limited genetic structure of this stock complex precludes using genetic approaches to quantify migration timing of different stocks throughout the watershed. Otolith-based methods for estimating provenance therefore offer a novel approach to: (1) identify the spatiotemporal structure of returning populations in the Kuskokwim River basin, and (2) evaluate potential impacts of front-end closures on conserving population diversity within salmon stock complexes returning to large, remote watersheds.</w:t>
       </w:r>
     </w:p>
@@ -1708,6 +1832,7 @@
         <w:rPr>
           <w:rFonts w:ascii="Garamond" w:hAnsi="Garamond"/>
         </w:rPr>
+        <w:lastRenderedPageBreak/>
         <w:t xml:space="preserve">Otoliths </w:t>
       </w:r>
       <w:r>
@@ -1821,16 +1946,7 @@
           <w:kern w:val="0"/>
           <w14:ligatures w14:val="none"/>
         </w:rPr>
-        <w:t xml:space="preserve">. Prepared samples were analyzed at the </w:t>
-      </w:r>
-      <w:r>
-        <w:rPr>
-          <w:rFonts w:ascii="Garamond" w:eastAsia="Times New Roman" w:hAnsi="Garamond" w:cs="Times New Roman"/>
-          <w:kern w:val="0"/>
-          <w14:ligatures w14:val="none"/>
-        </w:rPr>
-        <w:lastRenderedPageBreak/>
-        <w:t xml:space="preserve">University of Utah Strontium Isotope Laboratory using laser ablation inductively coupled plasma mass spectrometry (LA-ICP-MS). Laser ablation was conducted along a transect from the otolith core to just beyond the onset of marine growth </w:t>
+        <w:t xml:space="preserve">. Prepared samples were analyzed at the University of Utah Strontium Isotope Laboratory using laser ablation inductively coupled plasma mass spectrometry (LA-ICP-MS). Laser ablation was conducted along a transect from the otolith core to just beyond the onset of marine growth </w:t>
       </w:r>
       <w:r>
         <w:rPr>
@@ -1880,7 +1996,7 @@
         <w:rPr>
           <w:rFonts w:ascii="Garamond" w:hAnsi="Garamond" w:cstheme="majorHAnsi"/>
         </w:rPr>
-        <w:instrText xml:space="preserve"> ADDIN ZOTERO_ITEM CSL_CITATION {"citationID":"nvLrB1dQ","properties":{"formattedCitation":"(Brennan et al., 2015; Zimmerman &amp; Reeves, 2002)","plainCitation":"(Brennan et al., 2015; Zimmerman &amp; Reeves, 2002)","dontUpdate":true,"noteIndex":0},"citationItems":[{"id":"TQue60dm/OuVLOkfY","uris":["http://zotero.org/users/8421274/items/IY3FLHLM"],"itemData":{"id":915,"type":"article-journal","abstract":"Strontium isotopes simultaneously delineate fine-scale natal habitats and migrations of Pacific salmon harvested during a coastal commercial fishery., Highly migratory organisms present major challenges to conservation efforts. This is especially true for exploited anadromous fish species, which exhibit long-range dispersals from natal sites, complex population structures, and extensive mixing of distinct populations during exploitation. By tracing the migratory histories of individual Chinook salmon caught in fisheries using strontium isotopes, we determined the relative production of natal habitats at fine spatial scales and different life histories. Although strontium isotopes have been widely used in provenance research, we present a new robust framework to simultaneously assess natal sources and migrations of individuals within fishery harvests through time. Our results pave the way for investigating how fine-scale habitat production and life histories of salmon respond to perturbations—providing crucial insights for conservation.","container-title":"Science Advances","DOI":"10.1126/sciadv.1400124","ISSN":"2375-2548","issue":"4","journalAbbreviation":"Sci Adv","note":"PMID: 26601173\nPMCID: PMC4640640","page":"e1400124","source":"PubMed Central","title":"Strontium isotopes delineate fine-scale natal origins and migration histories of Pacific salmon","volume":"1","author":[{"family":"Brennan","given":"Sean R."},{"family":"Zimmerman","given":"Christian E."},{"family":"Fernandez","given":"Diego P."},{"family":"Cerling","given":"Thure E."},{"family":"McPhee","given":"Megan V."},{"family":"Wooller","given":"Matthew J."}],"issued":{"date-parts":[["2015",5,15]]}}},{"id":4132,"uris":["http://zotero.org/users/8421274/items/5YINANGC"],"itemData":{"id":4132,"type":"article-journal","abstract":"Comparisons of strontium:calcium (Sr: Ca) ratios in otolith primordia and freshwater growth regions were used to identify the progeny of steelhead Oncorhynchus mykiss (anadromous rainbow trout) and resident rainbow trout in the Deschutes River, Oregon. We cultured progeny of known adult steelhead and resident rainbow trout to confirm the relationship between Sr:Ca ratios in otolith primordia and the life history of the maternal parent. The mean (±SD) Sr:Ca ratio was significantly higher in the otolith primordia of the progeny of steelhead (0.001461 ± 0.00029; n = 100) than in those of the progeny of resident rainbow trout (0.000829 ± 0.000012; n = 100). We used comparisons of Sr:Ca ratios in the primordia and first-summer growth regions of otoliths to determine the maternal origin of unknown O. mykiss juveniles (n = 272) collected from rearing habitats within the main-stem Deschutes River and tributary rearing habitats and thus to ascertain the relative proportion of each life history morph in each rearing habitat. Resident rainbow trout fry dominated the bimonthly samples collected from main-stem rearing habitats between May and November 1995. Steelhead fry dominated samples collected from below waterfalls on two tributaries in 1996 and 1998.","container-title":"Transactions of the American Fisheries Society","DOI":"10.1577/1548-8659(2002)131&lt;0986:IOSARR&gt;2.0.CO;2","ISSN":"0002-8487","issue":"5","note":"publisher: Taylor &amp; Francis\n_eprint: https://doi.org/10.1577/1548-8659(2002)131&lt;0986:IOSARR&gt;2.0.CO;2","page":"986-993","source":"Taylor and Francis+NEJM","title":"Identification of Steelhead and Resident Rainbow Trout Progeny in the Deschutes River, Oregon, Revealed with Otolith Microchemistry","volume":"131","author":[{"family":"Zimmerman","given":"Christian E."},{"family":"Reeves","given":"Gordon H."}],"issued":{"date-parts":[["2002",9,1]]}}}],"schema":"https://github.com/citation-style-language/schema/raw/master/csl-citation.json"} </w:instrText>
+        <w:instrText xml:space="preserve"> ADDIN ZOTERO_ITEM CSL_CITATION {"citationID":"nvLrB1dQ","properties":{"formattedCitation":"(Brennan et al., 2015; Zimmerman &amp; Reeves, 2002)","plainCitation":"(Brennan et al., 2015; Zimmerman &amp; Reeves, 2002)","dontUpdate":true,"noteIndex":0},"citationItems":[{"id":"qdfHghSJ/KSW9LWYv","uris":["http://zotero.org/users/8421274/items/IY3FLHLM"],"itemData":{"id":915,"type":"article-journal","abstract":"Strontium isotopes simultaneously delineate fine-scale natal habitats and migrations of Pacific salmon harvested during a coastal commercial fishery., Highly migratory organisms present major challenges to conservation efforts. This is especially true for exploited anadromous fish species, which exhibit long-range dispersals from natal sites, complex population structures, and extensive mixing of distinct populations during exploitation. By tracing the migratory histories of individual Chinook salmon caught in fisheries using strontium isotopes, we determined the relative production of natal habitats at fine spatial scales and different life histories. Although strontium isotopes have been widely used in provenance research, we present a new robust framework to simultaneously assess natal sources and migrations of individuals within fishery harvests through time. Our results pave the way for investigating how fine-scale habitat production and life histories of salmon respond to perturbations—providing crucial insights for conservation.","container-title":"Science Advances","DOI":"10.1126/sciadv.1400124","ISSN":"2375-2548","issue":"4","journalAbbreviation":"Sci Adv","note":"PMID: 26601173\nPMCID: PMC4640640","page":"e1400124","source":"PubMed Central","title":"Strontium isotopes delineate fine-scale natal origins and migration histories of Pacific salmon","volume":"1","author":[{"family":"Brennan","given":"Sean R."},{"family":"Zimmerman","given":"Christian E."},{"family":"Fernandez","given":"Diego P."},{"family":"Cerling","given":"Thure E."},{"family":"McPhee","given":"Megan V."},{"family":"Wooller","given":"Matthew J."}],"issued":{"date-parts":[["2015",5,15]]}}},{"id":4132,"uris":["http://zotero.org/users/8421274/items/5YINANGC"],"itemData":{"id":4132,"type":"article-journal","abstract":"Comparisons of strontium:calcium (Sr: Ca) ratios in otolith primordia and freshwater growth regions were used to identify the progeny of steelhead Oncorhynchus mykiss (anadromous rainbow trout) and resident rainbow trout in the Deschutes River, Oregon. We cultured progeny of known adult steelhead and resident rainbow trout to confirm the relationship between Sr:Ca ratios in otolith primordia and the life history of the maternal parent. The mean (±SD) Sr:Ca ratio was significantly higher in the otolith primordia of the progeny of steelhead (0.001461 ± 0.00029; n = 100) than in those of the progeny of resident rainbow trout (0.000829 ± 0.000012; n = 100). We used comparisons of Sr:Ca ratios in the primordia and first-summer growth regions of otoliths to determine the maternal origin of unknown O. mykiss juveniles (n = 272) collected from rearing habitats within the main-stem Deschutes River and tributary rearing habitats and thus to ascertain the relative proportion of each life history morph in each rearing habitat. Resident rainbow trout fry dominated the bimonthly samples collected from main-stem rearing habitats between May and November 1995. Steelhead fry dominated samples collected from below waterfalls on two tributaries in 1996 and 1998.","container-title":"Transactions of the American Fisheries Society","DOI":"10.1577/1548-8659(2002)131&lt;0986:IOSARR&gt;2.0.CO;2","ISSN":"0002-8487","issue":"5","note":"publisher: Taylor &amp; Francis\n_eprint: https://doi.org/10.1577/1548-8659(2002)131&lt;0986:IOSARR&gt;2.0.CO;2","page":"986-993","source":"Taylor and Francis+NEJM","title":"Identification of Steelhead and Resident Rainbow Trout Progeny in the Deschutes River, Oregon, Revealed with Otolith Microchemistry","volume":"131","author":[{"family":"Zimmerman","given":"Christian E."},{"family":"Reeves","given":"Gordon H."}],"issued":{"date-parts":[["2002",9,1]]}}}],"schema":"https://github.com/citation-style-language/schema/raw/master/csl-citation.json"} </w:instrText>
       </w:r>
       <w:r>
         <w:rPr>
@@ -1991,7 +2107,7 @@
           <w:kern w:val="0"/>
           <w14:ligatures w14:val="none"/>
         </w:rPr>
-        <w:instrText xml:space="preserve"> ADDIN ZOTERO_ITEM CSL_CITATION {"citationID":"drNJXJRw","properties":{"formattedCitation":"(Brennan et al., 2015; Campana, 1999; Capo et al., 1998)","plainCitation":"(Brennan et al., 2015; Campana, 1999; Capo et al., 1998)","noteIndex":0},"citationItems":[{"id":"TQue60dm/OuVLOkfY","uris":["http://zotero.org/users/8421274/items/IY3FLHLM"],"itemData":{"id":"dI01jIsp/qEdWN4pU","type":"article-journal","abstract":"Strontium isotopes simultaneously delineate fine-scale natal habitats and migrations of Pacific salmon harvested during a coastal commercial fishery., Highly migratory organisms present major challenges to conservation efforts. This is especially true for exploited anadromous fish species, which exhibit long-range dispersals from natal sites, complex population structures, and extensive mixing of distinct populations during exploitation. By tracing the migratory histories of individual Chinook salmon caught in fisheries using strontium isotopes, we determined the relative production of natal habitats at fine spatial scales and different life histories. Although strontium isotopes have been widely used in provenance research, we present a new robust framework to simultaneously assess natal sources and migrations of individuals within fishery harvests through time. Our results pave the way for investigating how fine-scale habitat production and life histories of salmon respond to perturbations—providing crucial insights for conservation.","container-title":"Science Advances","DOI":"10.1126/sciadv.1400124","ISSN":"2375-2548","issue":"4","journalAbbreviation":"Sci Adv","note":"PMID: 26601173\nPMCID: PMC4640640","page":"e1400124","source":"PubMed Central","title":"Strontium isotopes delineate fine-scale natal origins and migration histories of Pacific salmon","volume":"1","author":[{"family":"Brennan","given":"Sean R."},{"family":"Zimmerman","given":"Christian E."},{"family":"Fernandez","given":"Diego P."},{"family":"Cerling","given":"Thure E."},{"family":"McPhee","given":"Megan V."},{"family":"Wooller","given":"Matthew J."}],"issued":{"date-parts":[["2015",5,15]]}}},{"id":1441,"uris":["http://zotero.org/users/8421274/items/PHNAKZ8D"],"itemData":{"id":1441,"type":"article-journal","abstract":"The fish otolith (earstone) has long been known as a timekeeper, but interest in its use as a metabolically inert environmental recorder has accelerated in recent years. In part due to technological advances, applications such as stock identification, determination of rnigralon pathways, reconstruction of temperature and salinity history, age validation, detection of anadromy, use as a natural tag and chemical mass marking have been developed, some of which are difficult or impossible to implement using alternative techniques. Microsamphg and the latest advances in beam-based probes allow many elemental assays to be coupled with daily or annual growth increments, thus providing a detailed chronologcal record of the environment. However, few workers have critically assessed the assumptions upon which the environmental reconstructions are based, or considered the possibility that elemental incorporation into the otolith may proceed differently than that into other calcified structures. This paper reviews current applications and their assumptions and suggests future directions. Particular attention is given to the premises that the elemental and isotopic composition of the otolith reflects that of the environment, and the effect of physiological filters on the resulting composition. The roles of temperature, elemental uptake into the fish and the process of otolith crystahzation are also assessed. Drawing upon recent advances in geochemistry and paleoclirnate research as points of contrast, it appears that not all applications of otolith chemistry are firmly based, although others are destined to become powerful and perhaps routine tools for the mainstream fish biologst.","container-title":"Marine Ecology Progress Series","DOI":"10.3354/meps188263","ISSN":"0171-8630, 1616-1599","journalAbbreviation":"Mar. Ecol. Prog. Ser.","language":"en","page":"263-297","source":"DOI.org (Crossref)","title":"Chemistry and composition of fish otoliths:pathways, mechanisms and applications","title-short":"Chemistry and composition of fish otoliths","volume":"188","author":[{"family":"Campana","given":"Se"}],"issued":{"date-parts":[["1999"]]}}},{"id":1457,"uris":["http://zotero.org/users/8421274/items/TDIQBP7K"],"itemData":{"id":1457,"type":"article-journal","abstract":"The strontium (Sr) isotope method can be a powerful tool in studies of chemical weathering and soil genesis, cation provenance and mobility, and the chronostratigraphic correlation of marine sediments. It is a sensitive geochemical tracer, applicable to large-scale ecosystem studies as well as to centimeter-scaled examination of cation mobility within a soil profile. The 87Sr/86Sr ratios of natural materials reflect the sources of strontium available during their formation. Isotopically distinct inputs from precipitation, dryfall, soil parent material, and surface or groundwater allow determination of the relative proportions of those materials entering or leaving an ecosystem. The isotopic compositions of labile (soil exchange complex and soil solution) strontium and Sr in vegetation reflect the sources of cations available to plants. Strontium isotopes can be used to track the biogeochemical cycling of nutrient cations such as calcium. The extent of cation contributions from in situ weathering and external additions to soil from dust and rain can also be resolved with this method. In this paper, we review the geochemistry and isotopic systematics of strontium, and discuss the use of this method as a tracer of earth surface processes.","container-title":"Geoderma","DOI":"10.1016/S0016-7061(97)00102-X","ISSN":"0016-7061","issue":"1","journalAbbreviation":"Geoderma","language":"en","page":"197-225","source":"ScienceDirect","title":"Strontium isotopes as tracers of ecosystem processes: theory and methods","title-short":"Strontium isotopes as tracers of ecosystem processes","volume":"82","author":[{"family":"Capo","given":"Rosemary C."},{"family":"Stewart","given":"Brian W."},{"family":"Chadwick","given":"Oliver A."}],"issued":{"date-parts":[["1998",2,1]]}}}],"schema":"https://github.com/citation-style-language/schema/raw/master/csl-citation.json"} </w:instrText>
+        <w:instrText xml:space="preserve"> ADDIN ZOTERO_ITEM CSL_CITATION {"citationID":"drNJXJRw","properties":{"formattedCitation":"(Brennan et al., 2015; Campana, 1999; Capo et al., 1998)","plainCitation":"(Brennan et al., 2015; Campana, 1999; Capo et al., 1998)","noteIndex":0},"citationItems":[{"id":"qdfHghSJ/KSW9LWYv","uris":["http://zotero.org/users/8421274/items/IY3FLHLM"],"itemData":{"id":"dI01jIsp/qEdWN4pU","type":"article-journal","abstract":"Strontium isotopes simultaneously delineate fine-scale natal habitats and migrations of Pacific salmon harvested during a coastal commercial fishery., Highly migratory organisms present major challenges to conservation efforts. This is especially true for exploited anadromous fish species, which exhibit long-range dispersals from natal sites, complex population structures, and extensive mixing of distinct populations during exploitation. By tracing the migratory histories of individual Chinook salmon caught in fisheries using strontium isotopes, we determined the relative production of natal habitats at fine spatial scales and different life histories. Although strontium isotopes have been widely used in provenance research, we present a new robust framework to simultaneously assess natal sources and migrations of individuals within fishery harvests through time. Our results pave the way for investigating how fine-scale habitat production and life histories of salmon respond to perturbations—providing crucial insights for conservation.","container-title":"Science Advances","DOI":"10.1126/sciadv.1400124","ISSN":"2375-2548","issue":"4","journalAbbreviation":"Sci Adv","note":"PMID: 26601173\nPMCID: PMC4640640","page":"e1400124","source":"PubMed Central","title":"Strontium isotopes delineate fine-scale natal origins and migration histories of Pacific salmon","volume":"1","author":[{"family":"Brennan","given":"Sean R."},{"family":"Zimmerman","given":"Christian E."},{"family":"Fernandez","given":"Diego P."},{"family":"Cerling","given":"Thure E."},{"family":"McPhee","given":"Megan V."},{"family":"Wooller","given":"Matthew J."}],"issued":{"date-parts":[["2015",5,15]]}}},{"id":1441,"uris":["http://zotero.org/users/8421274/items/PHNAKZ8D"],"itemData":{"id":1441,"type":"article-journal","abstract":"The fish otolith (earstone) has long been known as a timekeeper, but interest in its use as a metabolically inert environmental recorder has accelerated in recent years. In part due to technological advances, applications such as stock identification, determination of rnigralon pathways, reconstruction of temperature and salinity history, age validation, detection of anadromy, use as a natural tag and chemical mass marking have been developed, some of which are difficult or impossible to implement using alternative techniques. Microsamphg and the latest advances in beam-based probes allow many elemental assays to be coupled with daily or annual growth increments, thus providing a detailed chronologcal record of the environment. However, few workers have critically assessed the assumptions upon which the environmental reconstructions are based, or considered the possibility that elemental incorporation into the otolith may proceed differently than that into other calcified structures. This paper reviews current applications and their assumptions and suggests future directions. Particular attention is given to the premises that the elemental and isotopic composition of the otolith reflects that of the environment, and the effect of physiological filters on the resulting composition. The roles of temperature, elemental uptake into the fish and the process of otolith crystahzation are also assessed. Drawing upon recent advances in geochemistry and paleoclirnate research as points of contrast, it appears that not all applications of otolith chemistry are firmly based, although others are destined to become powerful and perhaps routine tools for the mainstream fish biologst.","container-title":"Marine Ecology Progress Series","DOI":"10.3354/meps188263","ISSN":"0171-8630, 1616-1599","journalAbbreviation":"Mar. Ecol. Prog. Ser.","language":"en","page":"263-297","source":"DOI.org (Crossref)","title":"Chemistry and composition of fish otoliths:pathways, mechanisms and applications","title-short":"Chemistry and composition of fish otoliths","volume":"188","author":[{"family":"Campana","given":"Se"}],"issued":{"date-parts":[["1999"]]}}},{"id":1457,"uris":["http://zotero.org/users/8421274/items/TDIQBP7K"],"itemData":{"id":1457,"type":"article-journal","abstract":"The strontium (Sr) isotope method can be a powerful tool in studies of chemical weathering and soil genesis, cation provenance and mobility, and the chronostratigraphic correlation of marine sediments. It is a sensitive geochemical tracer, applicable to large-scale ecosystem studies as well as to centimeter-scaled examination of cation mobility within a soil profile. The 87Sr/86Sr ratios of natural materials reflect the sources of strontium available during their formation. Isotopically distinct inputs from precipitation, dryfall, soil parent material, and surface or groundwater allow determination of the relative proportions of those materials entering or leaving an ecosystem. The isotopic compositions of labile (soil exchange complex and soil solution) strontium and Sr in vegetation reflect the sources of cations available to plants. Strontium isotopes can be used to track the biogeochemical cycling of nutrient cations such as calcium. The extent of cation contributions from in situ weathering and external additions to soil from dust and rain can also be resolved with this method. In this paper, we review the geochemistry and isotopic systematics of strontium, and discuss the use of this method as a tracer of earth surface processes.","container-title":"Geoderma","DOI":"10.1016/S0016-7061(97)00102-X","ISSN":"0016-7061","issue":"1","journalAbbreviation":"Geoderma","language":"en","page":"197-225","source":"ScienceDirect","title":"Strontium isotopes as tracers of ecosystem processes: theory and methods","title-short":"Strontium isotopes as tracers of ecosystem processes","volume":"82","author":[{"family":"Capo","given":"Rosemary C."},{"family":"Stewart","given":"Brian W."},{"family":"Chadwick","given":"Oliver A."}],"issued":{"date-parts":[["1998",2,1]]}}}],"schema":"https://github.com/citation-style-language/schema/raw/master/csl-citation.json"} </w:instrText>
       </w:r>
       <w:r>
         <w:rPr>
@@ -2445,7 +2561,7 @@
           <w:kern w:val="0"/>
           <w14:ligatures w14:val="none"/>
         </w:rPr>
-        <w:instrText xml:space="preserve"> ADDIN ZOTERO_ITEM CSL_CITATION {"citationID":"5Pp7WuA9","properties":{"formattedCitation":"(French et al., 2020)","plainCitation":"(French et al., 2020)","noteIndex":0},"citationItems":[{"id":1684,"uris":["http://zotero.org/users/8421274/items/M654PKRJ"],"itemData":{"id":1684,"type":"article-journal","abstract":"Riverine chemistry reflects both watershed conditions and instream processing, both of which vary across river networks, yet little is known about the scales at which watershed attributes regulate biogeochemical constituents. We used spatial stream network (SSN) models to quantify both watershed and instream effects on streamwater constituents in the Kuskokwim River (western Alaska), the largest free-flowing river in the United States. We assessed chemical constituents spanning from labile nutrients (nitrate [NO3−] and orthophosphate [PO43−]) to biologically and chemically conservative tracers (calcium [Ca2+], strontium [Sr2+], and Sr isotopes [87Sr/86Sr]). We also examined the behavior of dissolved organic carbon (DOC) relative to these constituents to understand whether bulk DOC behaved conservatively in a large boreal river network, where future changes in DOC and nutrient loading are expected under a shifting climate. We derived watershed spatial covariates comprising land cover, geology, and geomorphic characteristics at 14 different spatial extents based on stream order and relative to position in the river network to understand the effect of distant and proximal watershed attributes on streamwater constituents. For all constituents but 87Sr/86Sr, watershed attributes in low-order headwater catchments yielded the best predictive ability for streamwater constituent concentrations across the entire network. Spatial patterning for conservative tracers and bulk DOC showed strong spatial autocorrelation, whereas PO43− and NO3− exhibited spatial patchiness indicative of instream processing. Our work shows that headwater streams are disproportionately important contributors to network-wide biogeochemical constituents supporting aquatic food webs and that conservation and management of aquatic systems should include these small and often remote watershed areas.","container-title":"Journal of Geophysical Research: Biogeosciences","DOI":"10.1029/2020JG005851","ISSN":"2169-8961","issue":"12","language":"en","note":"_eprint: https://agupubs.onlinelibrary.wiley.com/doi/pdf/10.1029/2020JG005851","page":"e2020JG005851","source":"Wiley Online Library","title":"Headwater Catchments Govern Biogeochemistry in America's Largest Free-Flowing River Network","volume":"125","author":[{"family":"French","given":"David W."},{"family":"Schindler","given":"Daniel E."},{"family":"Brennan","given":"Sean R."},{"family":"Whited","given":"Diane"}],"issued":{"date-parts":[["2020"]]}}}],"schema":"https://github.com/citation-style-language/schema/raw/master/csl-citation.json"} </w:instrText>
+        <w:instrText xml:space="preserve"> ADDIN ZOTERO_ITEM CSL_CITATION {"citationID":"5Pp7WuA9","properties":{"formattedCitation":"(French et al., 2020)","plainCitation":"(French et al., 2020)","dontUpdate":true,"noteIndex":0},"citationItems":[{"id":1684,"uris":["http://zotero.org/users/8421274/items/M654PKRJ"],"itemData":{"id":1684,"type":"article-journal","abstract":"Riverine chemistry reflects both watershed conditions and instream processing, both of which vary across river networks, yet little is known about the scales at which watershed attributes regulate biogeochemical constituents. We used spatial stream network (SSN) models to quantify both watershed and instream effects on streamwater constituents in the Kuskokwim River (western Alaska), the largest free-flowing river in the United States. We assessed chemical constituents spanning from labile nutrients (nitrate [NO3−] and orthophosphate [PO43−]) to biologically and chemically conservative tracers (calcium [Ca2+], strontium [Sr2+], and Sr isotopes [87Sr/86Sr]). We also examined the behavior of dissolved organic carbon (DOC) relative to these constituents to understand whether bulk DOC behaved conservatively in a large boreal river network, where future changes in DOC and nutrient loading are expected under a shifting climate. We derived watershed spatial covariates comprising land cover, geology, and geomorphic characteristics at 14 different spatial extents based on stream order and relative to position in the river network to understand the effect of distant and proximal watershed attributes on streamwater constituents. For all constituents but 87Sr/86Sr, watershed attributes in low-order headwater catchments yielded the best predictive ability for streamwater constituent concentrations across the entire network. Spatial patterning for conservative tracers and bulk DOC showed strong spatial autocorrelation, whereas PO43− and NO3− exhibited spatial patchiness indicative of instream processing. Our work shows that headwater streams are disproportionately important contributors to network-wide biogeochemical constituents supporting aquatic food webs and that conservation and management of aquatic systems should include these small and often remote watershed areas.","container-title":"Journal of Geophysical Research: Biogeosciences","DOI":"10.1029/2020JG005851","ISSN":"2169-8961","issue":"12","language":"en","note":"_eprint: https://agupubs.onlinelibrary.wiley.com/doi/pdf/10.1029/2020JG005851","page":"e2020JG005851","source":"Wiley Online Library","title":"Headwater Catchments Govern Biogeochemistry in America's Largest Free-Flowing River Network","volume":"125","author":[{"family":"French","given":"David W."},{"family":"Schindler","given":"Daniel E."},{"family":"Brennan","given":"Sean R."},{"family":"Whited","given":"Diane"}],"issued":{"date-parts":[["2020"]]}}}],"schema":"https://github.com/citation-style-language/schema/raw/master/csl-citation.json"} </w:instrText>
       </w:r>
       <w:r>
         <w:rPr>
@@ -2691,7 +2807,14 @@
         <w:rPr>
           <w:rFonts w:ascii="Garamond" w:hAnsi="Garamond" w:cs="Times New Roman"/>
         </w:rPr>
-        <w:t xml:space="preserve">by visually examining the histogram for a cutoff which adjusted the values for a small number of exceedingly low </w:t>
+        <w:t xml:space="preserve">by visually examining the histogram for a cutoff which adjusted the values for a small </w:t>
+      </w:r>
+      <w:r>
+        <w:rPr>
+          <w:rFonts w:ascii="Garamond" w:hAnsi="Garamond" w:cs="Times New Roman"/>
+        </w:rPr>
+        <w:lastRenderedPageBreak/>
+        <w:t xml:space="preserve">number of exceedingly low </w:t>
       </w:r>
       <w:r>
         <w:rPr>
@@ -2744,7 +2867,6 @@
           <w:kern w:val="0"/>
           <w14:ligatures w14:val="none"/>
         </w:rPr>
-        <w:lastRenderedPageBreak/>
         <w:t>P</w:t>
       </w:r>
       <w:r>
@@ -3714,7 +3836,14 @@
         <w:rPr>
           <w:rFonts w:ascii="Garamond" w:hAnsi="Garamond"/>
         </w:rPr>
-        <w:t xml:space="preserve"> or greater were included in assignments (assigned a prior value of 1), while smaller tributaries were excluded (assigned a value of 0). </w:t>
+        <w:t xml:space="preserve"> or greater </w:t>
+      </w:r>
+      <w:r>
+        <w:rPr>
+          <w:rFonts w:ascii="Garamond" w:hAnsi="Garamond"/>
+        </w:rPr>
+        <w:lastRenderedPageBreak/>
+        <w:t xml:space="preserve">were included in assignments (assigned a prior value of 1), while smaller tributaries were excluded (assigned a value of 0). </w:t>
       </w:r>
       <w:r>
         <w:rPr>
@@ -3805,17 +3934,7 @@
           <w:kern w:val="0"/>
           <w14:ligatures w14:val="none"/>
         </w:rPr>
-        <w:t xml:space="preserve">(Makhlouf et al., </w:t>
-      </w:r>
-      <w:r>
-        <w:rPr>
-          <w:rFonts w:ascii="Garamond" w:eastAsia="Times New Roman" w:hAnsi="Garamond" w:cs="Times New Roman"/>
-          <w:noProof/>
-          <w:kern w:val="0"/>
-          <w14:ligatures w14:val="none"/>
-        </w:rPr>
-        <w:lastRenderedPageBreak/>
-        <w:t>2025)</w:t>
+        <w:t>(Makhlouf et al., 2025)</w:t>
       </w:r>
       <w:r>
         <w:rPr>
@@ -4400,7 +4519,7 @@
           <w:sz w:val="24"/>
           <w:szCs w:val="24"/>
         </w:rPr>
-        <w:t>. From the furthest downstream connection of each of these tributaries to the mainstem</w:t>
+        <w:t xml:space="preserve">. From the </w:t>
       </w:r>
       <w:r>
         <w:rPr>
@@ -4409,7 +4528,8 @@
           <w:sz w:val="24"/>
           <w:szCs w:val="24"/>
         </w:rPr>
-        <w:t xml:space="preserve"> Kuskokwim River,</w:t>
+        <w:lastRenderedPageBreak/>
+        <w:t>furthest downstream connection of each of these tributaries to the mainstem</w:t>
       </w:r>
       <w:r>
         <w:rPr>
@@ -4418,7 +4538,7 @@
           <w:sz w:val="24"/>
           <w:szCs w:val="24"/>
         </w:rPr>
-        <w:t xml:space="preserve"> all upstream segments were </w:t>
+        <w:t xml:space="preserve"> Kuskokwim River,</w:t>
       </w:r>
       <w:r>
         <w:rPr>
@@ -4427,7 +4547,7 @@
           <w:sz w:val="24"/>
           <w:szCs w:val="24"/>
         </w:rPr>
-        <w:t xml:space="preserve">identified and </w:t>
+        <w:t xml:space="preserve"> all upstream segments were </w:t>
       </w:r>
       <w:r>
         <w:rPr>
@@ -4436,7 +4556,7 @@
           <w:sz w:val="24"/>
           <w:szCs w:val="24"/>
         </w:rPr>
-        <w:t>assigned to a common</w:t>
+        <w:t xml:space="preserve">identified and </w:t>
       </w:r>
       <w:r>
         <w:rPr>
@@ -4445,7 +4565,7 @@
           <w:sz w:val="24"/>
           <w:szCs w:val="24"/>
         </w:rPr>
-        <w:t xml:space="preserve"> identifier based on the name of the major tributary</w:t>
+        <w:t>assigned to a common</w:t>
       </w:r>
       <w:r>
         <w:rPr>
@@ -4454,7 +4574,7 @@
           <w:sz w:val="24"/>
           <w:szCs w:val="24"/>
         </w:rPr>
-        <w:t xml:space="preserve">. For some smaller </w:t>
+        <w:t xml:space="preserve"> identifier based on the name of the major tributary</w:t>
       </w:r>
       <w:r>
         <w:rPr>
@@ -4463,7 +4583,7 @@
           <w:sz w:val="24"/>
           <w:szCs w:val="24"/>
         </w:rPr>
-        <w:t xml:space="preserve">regions </w:t>
+        <w:t xml:space="preserve">. For some smaller </w:t>
       </w:r>
       <w:r>
         <w:rPr>
@@ -4472,9 +4592,8 @@
           <w:sz w:val="24"/>
           <w:szCs w:val="24"/>
         </w:rPr>
-        <w:t xml:space="preserve">(i.e. the </w:t>
-      </w:r>
-      <w:proofErr w:type="spellStart"/>
+        <w:t xml:space="preserve">regions </w:t>
+      </w:r>
       <w:r>
         <w:rPr>
           <w:rStyle w:val="CommentReference"/>
@@ -4482,9 +4601,9 @@
           <w:sz w:val="24"/>
           <w:szCs w:val="24"/>
         </w:rPr>
-        <w:t>Takotna</w:t>
-      </w:r>
-      <w:proofErr w:type="spellEnd"/>
+        <w:t xml:space="preserve">(i.e. the </w:t>
+      </w:r>
+      <w:proofErr w:type="spellStart"/>
       <w:r>
         <w:rPr>
           <w:rStyle w:val="CommentReference"/>
@@ -4492,8 +4611,9 @@
           <w:sz w:val="24"/>
           <w:szCs w:val="24"/>
         </w:rPr>
-        <w:t xml:space="preserve"> and Nixon fork),</w:t>
-      </w:r>
+        <w:t>Takotna</w:t>
+      </w:r>
+      <w:proofErr w:type="spellEnd"/>
       <w:r>
         <w:rPr>
           <w:rStyle w:val="CommentReference"/>
@@ -4501,7 +4621,7 @@
           <w:sz w:val="24"/>
           <w:szCs w:val="24"/>
         </w:rPr>
-        <w:t xml:space="preserve"> multiple units were </w:t>
+        <w:t xml:space="preserve"> and Nixon fork),</w:t>
       </w:r>
       <w:r>
         <w:rPr>
@@ -4510,8 +4630,7 @@
           <w:sz w:val="24"/>
           <w:szCs w:val="24"/>
         </w:rPr>
-        <w:lastRenderedPageBreak/>
-        <w:t xml:space="preserve">combined to keep a relatively comparable size between all stocks. Regions of the basin which were not </w:t>
+        <w:t xml:space="preserve"> multiple units were combined to keep a relatively comparable size between all stocks. Regions of the basin which were not </w:t>
       </w:r>
       <w:r>
         <w:rPr>
@@ -4762,6 +4881,7 @@
           <w:sz w:val="32"/>
           <w:szCs w:val="32"/>
         </w:rPr>
+        <w:lastRenderedPageBreak/>
         <w:t>Results</w:t>
       </w:r>
     </w:p>
@@ -4853,514 +4973,520 @@
           <w:sz w:val="22"/>
           <w:szCs w:val="22"/>
         </w:rPr>
+        <w:tab/>
+      </w:r>
+      <w:r>
+        <w:rPr>
+          <w:rFonts w:ascii="Garamond" w:hAnsi="Garamond"/>
+        </w:rPr>
+        <w:t xml:space="preserve">Across all years of our dataset (2017-2021), returns to the 21 stock units exhibited </w:t>
+      </w:r>
+      <w:r>
+        <w:rPr>
+          <w:rFonts w:ascii="Garamond" w:hAnsi="Garamond"/>
+        </w:rPr>
+        <w:t>a</w:t>
+      </w:r>
+      <w:r>
+        <w:rPr>
+          <w:rFonts w:ascii="Garamond" w:hAnsi="Garamond"/>
+        </w:rPr>
+        <w:t xml:space="preserve"> </w:t>
+      </w:r>
+      <w:r>
+        <w:rPr>
+          <w:rFonts w:ascii="Garamond" w:hAnsi="Garamond"/>
+        </w:rPr>
+        <w:t xml:space="preserve">general transition </w:t>
+      </w:r>
+      <w:r>
+        <w:rPr>
+          <w:rFonts w:ascii="Garamond" w:hAnsi="Garamond"/>
+        </w:rPr>
+        <w:t>from upstream to downstream stock</w:t>
+      </w:r>
+      <w:r>
+        <w:rPr>
+          <w:rFonts w:ascii="Garamond" w:hAnsi="Garamond"/>
+        </w:rPr>
+        <w:t>s</w:t>
+      </w:r>
+      <w:r>
+        <w:rPr>
+          <w:rFonts w:ascii="Garamond" w:hAnsi="Garamond"/>
+        </w:rPr>
+        <w:t xml:space="preserve"> as the season progressed. Early season returns (Q1: start of run through June 11</w:t>
+      </w:r>
+      <w:r>
+        <w:rPr>
+          <w:rFonts w:ascii="Garamond" w:hAnsi="Garamond"/>
+        </w:rPr>
+        <w:t>, Figure 3a.</w:t>
+      </w:r>
+      <w:r>
+        <w:rPr>
+          <w:rFonts w:ascii="Garamond" w:hAnsi="Garamond"/>
+        </w:rPr>
+        <w:t xml:space="preserve">) were </w:t>
+      </w:r>
+      <w:r>
+        <w:rPr>
+          <w:rFonts w:ascii="Garamond" w:hAnsi="Garamond"/>
+        </w:rPr>
+        <w:t xml:space="preserve">represented </w:t>
+      </w:r>
+      <w:r>
+        <w:rPr>
+          <w:rFonts w:ascii="Garamond" w:hAnsi="Garamond"/>
+        </w:rPr>
+        <w:t xml:space="preserve">primarily </w:t>
+      </w:r>
+      <w:r>
+        <w:rPr>
+          <w:rFonts w:ascii="Garamond" w:hAnsi="Garamond"/>
+        </w:rPr>
+        <w:t>by stocks from the upper portions of the watershed</w:t>
+      </w:r>
+      <w:r>
+        <w:rPr>
+          <w:rFonts w:ascii="Garamond" w:hAnsi="Garamond"/>
+        </w:rPr>
+        <w:t xml:space="preserve"> including</w:t>
+      </w:r>
+      <w:r>
+        <w:rPr>
+          <w:rFonts w:ascii="Garamond" w:hAnsi="Garamond"/>
+        </w:rPr>
+        <w:t xml:space="preserve"> </w:t>
+      </w:r>
+      <w:r>
+        <w:rPr>
+          <w:rFonts w:ascii="Garamond" w:hAnsi="Garamond"/>
+        </w:rPr>
+        <w:t xml:space="preserve">Big River ( </w:t>
+      </w:r>
+      <w:r>
+        <w:rPr>
+          <w:rFonts w:ascii="Garamond" w:hAnsi="Garamond"/>
+        </w:rPr>
+        <w:t>median 12.8%, range 4.6 – 16.1%), Swift River (median: 11.6%, range 5.7-14.4%), Stony River (median: 10.5%, range 9.6-12.4%), and Upper Kuskokwim Main (median: 8.9%, range 5.5-10.8%)</w:t>
+      </w:r>
+      <w:r>
+        <w:rPr>
+          <w:rFonts w:ascii="Garamond" w:hAnsi="Garamond"/>
+        </w:rPr>
+        <w:t xml:space="preserve">. </w:t>
+      </w:r>
+      <w:r>
+        <w:rPr>
+          <w:rFonts w:ascii="Garamond" w:hAnsi="Garamond"/>
+        </w:rPr>
+        <w:t xml:space="preserve">Notably, the uppermost stocks (North, East, and South Fork Kuskokwim) consistently contributed very little (&lt; 2.5%) and the </w:t>
+      </w:r>
+      <w:proofErr w:type="spellStart"/>
+      <w:r>
+        <w:rPr>
+          <w:rFonts w:ascii="Garamond" w:hAnsi="Garamond"/>
+        </w:rPr>
+        <w:t>Takotna</w:t>
+      </w:r>
+      <w:proofErr w:type="spellEnd"/>
+      <w:r>
+        <w:rPr>
+          <w:rFonts w:ascii="Garamond" w:hAnsi="Garamond"/>
+        </w:rPr>
+        <w:t xml:space="preserve"> and Nixon fork </w:t>
+      </w:r>
+      <w:r>
+        <w:rPr>
+          <w:rFonts w:ascii="Garamond" w:hAnsi="Garamond"/>
+        </w:rPr>
+        <w:t>stock as well as the</w:t>
+      </w:r>
+      <w:r>
+        <w:rPr>
+          <w:rFonts w:ascii="Garamond" w:hAnsi="Garamond"/>
+        </w:rPr>
+        <w:t xml:space="preserve"> </w:t>
+      </w:r>
+      <w:proofErr w:type="spellStart"/>
+      <w:r>
+        <w:rPr>
+          <w:rFonts w:ascii="Garamond" w:hAnsi="Garamond"/>
+        </w:rPr>
+        <w:t>Tatlawiksuk</w:t>
+      </w:r>
+      <w:proofErr w:type="spellEnd"/>
+      <w:r>
+        <w:rPr>
+          <w:rFonts w:ascii="Garamond" w:hAnsi="Garamond"/>
+        </w:rPr>
+        <w:t xml:space="preserve"> </w:t>
+      </w:r>
+      <w:r>
+        <w:rPr>
+          <w:rFonts w:ascii="Garamond" w:hAnsi="Garamond"/>
+        </w:rPr>
+        <w:t xml:space="preserve">river </w:t>
+      </w:r>
+      <w:r>
+        <w:rPr>
+          <w:rFonts w:ascii="Garamond" w:hAnsi="Garamond"/>
+        </w:rPr>
+        <w:t xml:space="preserve">stock each contributed only modestly (median 3% and 5% respectively) despite their position near the top of the watershed. The second quartile </w:t>
+      </w:r>
+      <w:proofErr w:type="gramStart"/>
+      <w:r>
+        <w:rPr>
+          <w:rFonts w:ascii="Garamond" w:hAnsi="Garamond"/>
+        </w:rPr>
+        <w:t xml:space="preserve">( </w:t>
+      </w:r>
+      <w:r>
+        <w:rPr>
+          <w:rFonts w:ascii="Garamond" w:hAnsi="Garamond"/>
+        </w:rPr>
+        <w:t>June</w:t>
+      </w:r>
+      <w:proofErr w:type="gramEnd"/>
+      <w:r>
+        <w:rPr>
+          <w:rFonts w:ascii="Garamond" w:hAnsi="Garamond"/>
+        </w:rPr>
+        <w:t xml:space="preserve"> 12</w:t>
+      </w:r>
+      <w:r>
+        <w:rPr>
+          <w:rFonts w:ascii="Garamond" w:hAnsi="Garamond"/>
+          <w:vertAlign w:val="superscript"/>
+        </w:rPr>
+        <w:t>th</w:t>
+      </w:r>
+      <w:r>
+        <w:rPr>
+          <w:rFonts w:ascii="Garamond" w:hAnsi="Garamond"/>
+        </w:rPr>
+        <w:t xml:space="preserve"> – 21</w:t>
+      </w:r>
+      <w:r>
+        <w:rPr>
+          <w:rFonts w:ascii="Garamond" w:hAnsi="Garamond"/>
+          <w:vertAlign w:val="superscript"/>
+        </w:rPr>
+        <w:t>st</w:t>
+      </w:r>
+      <w:r>
+        <w:rPr>
+          <w:rFonts w:ascii="Garamond" w:hAnsi="Garamond"/>
+        </w:rPr>
+        <w:t>, Figure 3b.)</w:t>
+      </w:r>
+      <w:r>
+        <w:rPr>
+          <w:rFonts w:ascii="Garamond" w:hAnsi="Garamond"/>
+        </w:rPr>
+        <w:t xml:space="preserve"> saw a more even distribution of returns across much of the middle watershed, with Upper Kuskokwim Main, Big River, </w:t>
+      </w:r>
+      <w:proofErr w:type="spellStart"/>
+      <w:r>
+        <w:rPr>
+          <w:rFonts w:ascii="Garamond" w:hAnsi="Garamond"/>
+        </w:rPr>
+        <w:t>Takotna</w:t>
+      </w:r>
+      <w:proofErr w:type="spellEnd"/>
+      <w:r>
+        <w:rPr>
+          <w:rFonts w:ascii="Garamond" w:hAnsi="Garamond"/>
+        </w:rPr>
+        <w:t xml:space="preserve"> River and Nixon Fork, Swift River, </w:t>
+      </w:r>
+      <w:proofErr w:type="spellStart"/>
+      <w:r>
+        <w:rPr>
+          <w:rFonts w:ascii="Garamond" w:hAnsi="Garamond"/>
+        </w:rPr>
+        <w:t>Holitna</w:t>
+      </w:r>
+      <w:proofErr w:type="spellEnd"/>
+      <w:r>
+        <w:rPr>
+          <w:rFonts w:ascii="Garamond" w:hAnsi="Garamond"/>
+        </w:rPr>
+        <w:t xml:space="preserve"> River, </w:t>
+      </w:r>
+      <w:proofErr w:type="spellStart"/>
+      <w:r>
+        <w:rPr>
+          <w:rFonts w:ascii="Garamond" w:hAnsi="Garamond"/>
+        </w:rPr>
+        <w:t>Hoholitna</w:t>
+      </w:r>
+      <w:proofErr w:type="spellEnd"/>
+      <w:r>
+        <w:rPr>
+          <w:rFonts w:ascii="Garamond" w:hAnsi="Garamond"/>
+        </w:rPr>
+        <w:t xml:space="preserve"> River, Middle Kuskokwim Main, Aniak</w:t>
+      </w:r>
+      <w:r>
+        <w:rPr>
+          <w:rFonts w:ascii="Garamond" w:hAnsi="Garamond"/>
+        </w:rPr>
+        <w:t xml:space="preserve"> River</w:t>
+      </w:r>
+      <w:r>
+        <w:rPr>
+          <w:rFonts w:ascii="Garamond" w:hAnsi="Garamond"/>
+        </w:rPr>
+        <w:t xml:space="preserve">, and </w:t>
+      </w:r>
+      <w:proofErr w:type="spellStart"/>
+      <w:r>
+        <w:rPr>
+          <w:rFonts w:ascii="Garamond" w:hAnsi="Garamond"/>
+        </w:rPr>
+        <w:t>Kisar</w:t>
+      </w:r>
+      <w:r>
+        <w:rPr>
+          <w:rFonts w:ascii="Garamond" w:hAnsi="Garamond"/>
+        </w:rPr>
+        <w:t>a</w:t>
+      </w:r>
+      <w:r>
+        <w:rPr>
+          <w:rFonts w:ascii="Garamond" w:hAnsi="Garamond"/>
+        </w:rPr>
+        <w:t>lik</w:t>
+      </w:r>
+      <w:proofErr w:type="spellEnd"/>
+      <w:r>
+        <w:rPr>
+          <w:rFonts w:ascii="Garamond" w:hAnsi="Garamond"/>
+        </w:rPr>
+        <w:t xml:space="preserve"> all contributing between 5 and 10%. Only the Stony River had an average contribution of greater than 10% (median 11.5%) with a relative constrained range (10.7 – 12.2%) indicating consistent contribution to the 2</w:t>
+      </w:r>
+      <w:r>
+        <w:rPr>
+          <w:rFonts w:ascii="Garamond" w:hAnsi="Garamond"/>
+          <w:vertAlign w:val="superscript"/>
+        </w:rPr>
+        <w:t>nd</w:t>
+      </w:r>
+      <w:r>
+        <w:rPr>
+          <w:rFonts w:ascii="Garamond" w:hAnsi="Garamond"/>
+        </w:rPr>
+        <w:t xml:space="preserve"> quartile. This pattern largely holds in the 3</w:t>
+      </w:r>
+      <w:r>
+        <w:rPr>
+          <w:rFonts w:ascii="Garamond" w:hAnsi="Garamond"/>
+          <w:vertAlign w:val="superscript"/>
+        </w:rPr>
+        <w:t>rd</w:t>
+      </w:r>
+      <w:r>
+        <w:rPr>
+          <w:rFonts w:ascii="Garamond" w:hAnsi="Garamond"/>
+        </w:rPr>
+        <w:t xml:space="preserve"> quartile (June 22</w:t>
+      </w:r>
+      <w:r>
+        <w:rPr>
+          <w:rFonts w:ascii="Garamond" w:hAnsi="Garamond"/>
+          <w:vertAlign w:val="superscript"/>
+        </w:rPr>
+        <w:t>nd</w:t>
+      </w:r>
+      <w:r>
+        <w:rPr>
+          <w:rFonts w:ascii="Garamond" w:hAnsi="Garamond"/>
+        </w:rPr>
+        <w:t>-</w:t>
+      </w:r>
+      <w:r>
+        <w:rPr>
+          <w:rFonts w:ascii="Garamond" w:hAnsi="Garamond"/>
+        </w:rPr>
+        <w:t xml:space="preserve"> </w:t>
+      </w:r>
+      <w:r>
+        <w:rPr>
+          <w:rFonts w:ascii="Garamond" w:hAnsi="Garamond"/>
+        </w:rPr>
+        <w:t>July</w:t>
+      </w:r>
+      <w:r>
+        <w:rPr>
+          <w:rFonts w:ascii="Garamond" w:hAnsi="Garamond"/>
+        </w:rPr>
+        <w:t xml:space="preserve"> </w:t>
+      </w:r>
+      <w:r>
+        <w:rPr>
+          <w:rFonts w:ascii="Garamond" w:hAnsi="Garamond"/>
+        </w:rPr>
+        <w:t>1st</w:t>
+      </w:r>
+      <w:r>
+        <w:rPr>
+          <w:rFonts w:ascii="Garamond" w:hAnsi="Garamond"/>
+        </w:rPr>
+        <w:t>, Figure 3c.</w:t>
+      </w:r>
+      <w:r>
+        <w:rPr>
+          <w:rFonts w:ascii="Garamond" w:hAnsi="Garamond"/>
+        </w:rPr>
+        <w:t xml:space="preserve">), but with increased contribution from the </w:t>
+      </w:r>
+      <w:proofErr w:type="spellStart"/>
+      <w:r>
+        <w:rPr>
+          <w:rFonts w:ascii="Garamond" w:hAnsi="Garamond"/>
+        </w:rPr>
+        <w:t>Holitna</w:t>
+      </w:r>
+      <w:proofErr w:type="spellEnd"/>
+      <w:r>
+        <w:rPr>
+          <w:rFonts w:ascii="Garamond" w:hAnsi="Garamond"/>
+        </w:rPr>
+        <w:t xml:space="preserve"> River (median; 10.4%, range 9.5-13.6%), </w:t>
+      </w:r>
+      <w:proofErr w:type="spellStart"/>
+      <w:r>
+        <w:rPr>
+          <w:rFonts w:ascii="Garamond" w:hAnsi="Garamond"/>
+        </w:rPr>
+        <w:t>Hoholitna</w:t>
+      </w:r>
+      <w:proofErr w:type="spellEnd"/>
+      <w:r>
+        <w:rPr>
+          <w:rFonts w:ascii="Garamond" w:hAnsi="Garamond"/>
+        </w:rPr>
+        <w:t xml:space="preserve"> River (median 9.6%, range 8.8-12.2%), and Aniak river (median 8.2%, range 5.7-10.1%). </w:t>
+      </w:r>
+      <w:r>
+        <w:rPr>
+          <w:rFonts w:ascii="Garamond" w:hAnsi="Garamond"/>
+        </w:rPr>
+        <w:t>Late season returns (July 2</w:t>
+      </w:r>
+      <w:r>
+        <w:rPr>
+          <w:rFonts w:ascii="Garamond" w:hAnsi="Garamond"/>
+          <w:vertAlign w:val="superscript"/>
+        </w:rPr>
+        <w:t>nd</w:t>
+      </w:r>
+      <w:r>
+        <w:rPr>
+          <w:rFonts w:ascii="Garamond" w:hAnsi="Garamond"/>
+        </w:rPr>
+        <w:t xml:space="preserve"> onward</w:t>
+      </w:r>
+      <w:r>
+        <w:rPr>
+          <w:rFonts w:ascii="Garamond" w:hAnsi="Garamond"/>
+        </w:rPr>
+        <w:t>, Figure 3d.</w:t>
+      </w:r>
+      <w:r>
+        <w:rPr>
+          <w:rFonts w:ascii="Garamond" w:hAnsi="Garamond"/>
+        </w:rPr>
+        <w:t>) displayed further decreasing contribution from Upper Kuskokwim stocks (</w:t>
+      </w:r>
+      <w:proofErr w:type="spellStart"/>
+      <w:r>
+        <w:rPr>
+          <w:rFonts w:ascii="Garamond" w:hAnsi="Garamond"/>
+        </w:rPr>
+        <w:t>i.e</w:t>
+      </w:r>
+      <w:proofErr w:type="spellEnd"/>
+      <w:r>
+        <w:rPr>
+          <w:rFonts w:ascii="Garamond" w:hAnsi="Garamond"/>
+        </w:rPr>
+        <w:t xml:space="preserve"> Upper Kuskokwim Main, Big River, </w:t>
+      </w:r>
+      <w:proofErr w:type="spellStart"/>
+      <w:r>
+        <w:rPr>
+          <w:rFonts w:ascii="Garamond" w:hAnsi="Garamond"/>
+        </w:rPr>
+        <w:t>Takotna</w:t>
+      </w:r>
+      <w:proofErr w:type="spellEnd"/>
+      <w:r>
+        <w:rPr>
+          <w:rFonts w:ascii="Garamond" w:hAnsi="Garamond"/>
+        </w:rPr>
+        <w:t xml:space="preserve"> River and Nixon Fork, </w:t>
+      </w:r>
+      <w:proofErr w:type="spellStart"/>
+      <w:r>
+        <w:rPr>
+          <w:rFonts w:ascii="Garamond" w:hAnsi="Garamond"/>
+        </w:rPr>
+        <w:t>Tatlawiksuk</w:t>
+      </w:r>
+      <w:proofErr w:type="spellEnd"/>
+      <w:r>
+        <w:rPr>
+          <w:rFonts w:ascii="Garamond" w:hAnsi="Garamond"/>
+        </w:rPr>
+        <w:t xml:space="preserve"> River, and Swift River). The </w:t>
+      </w:r>
+      <w:proofErr w:type="spellStart"/>
+      <w:r>
+        <w:rPr>
+          <w:rFonts w:ascii="Garamond" w:hAnsi="Garamond"/>
+        </w:rPr>
+        <w:t>Hoholitna</w:t>
+      </w:r>
+      <w:proofErr w:type="spellEnd"/>
+      <w:r>
+        <w:rPr>
+          <w:rFonts w:ascii="Garamond" w:hAnsi="Garamond"/>
+        </w:rPr>
+        <w:t xml:space="preserve"> and Middle Kuskokwim River saw slight decreases and increases in contribution, respectively, but with </w:t>
+      </w:r>
+      <w:r>
+        <w:rPr>
+          <w:rFonts w:ascii="Garamond" w:hAnsi="Garamond"/>
+        </w:rPr>
+        <w:t xml:space="preserve">an associated </w:t>
+      </w:r>
+      <w:r>
+        <w:rPr>
+          <w:rFonts w:ascii="Garamond" w:hAnsi="Garamond"/>
+        </w:rPr>
+        <w:t xml:space="preserve">increase in range indicating variability </w:t>
+      </w:r>
+      <w:r>
+        <w:rPr>
+          <w:rFonts w:ascii="Garamond" w:hAnsi="Garamond"/>
+        </w:rPr>
+        <w:t xml:space="preserve">across </w:t>
+      </w:r>
+      <w:r>
+        <w:rPr>
+          <w:rFonts w:ascii="Garamond" w:hAnsi="Garamond"/>
+        </w:rPr>
+        <w:t xml:space="preserve">the </w:t>
+      </w:r>
+      <w:r>
+        <w:rPr>
+          <w:rFonts w:ascii="Garamond" w:hAnsi="Garamond"/>
+        </w:rPr>
         <w:lastRenderedPageBreak/>
-        <w:tab/>
-      </w:r>
-      <w:r>
-        <w:rPr>
-          <w:rFonts w:ascii="Garamond" w:hAnsi="Garamond"/>
-        </w:rPr>
-        <w:t xml:space="preserve">Across all years of our dataset (2017-2021), returns to the 21 stock units exhibited </w:t>
-      </w:r>
-      <w:r>
-        <w:rPr>
-          <w:rFonts w:ascii="Garamond" w:hAnsi="Garamond"/>
-        </w:rPr>
-        <w:t>a</w:t>
-      </w:r>
-      <w:r>
-        <w:rPr>
-          <w:rFonts w:ascii="Garamond" w:hAnsi="Garamond"/>
-        </w:rPr>
-        <w:t xml:space="preserve"> </w:t>
-      </w:r>
-      <w:r>
-        <w:rPr>
-          <w:rFonts w:ascii="Garamond" w:hAnsi="Garamond"/>
-        </w:rPr>
-        <w:t xml:space="preserve">general transition </w:t>
-      </w:r>
-      <w:r>
-        <w:rPr>
-          <w:rFonts w:ascii="Garamond" w:hAnsi="Garamond"/>
-        </w:rPr>
-        <w:t>from upstream to downstream stock</w:t>
-      </w:r>
-      <w:r>
-        <w:rPr>
-          <w:rFonts w:ascii="Garamond" w:hAnsi="Garamond"/>
-        </w:rPr>
-        <w:t>s</w:t>
-      </w:r>
-      <w:r>
-        <w:rPr>
-          <w:rFonts w:ascii="Garamond" w:hAnsi="Garamond"/>
-        </w:rPr>
-        <w:t xml:space="preserve"> as the season progressed. Early season returns (Q1: start of run through June 11</w:t>
-      </w:r>
-      <w:r>
-        <w:rPr>
-          <w:rFonts w:ascii="Garamond" w:hAnsi="Garamond"/>
-        </w:rPr>
-        <w:t>, Figure 3a.</w:t>
-      </w:r>
-      <w:r>
-        <w:rPr>
-          <w:rFonts w:ascii="Garamond" w:hAnsi="Garamond"/>
-        </w:rPr>
-        <w:t xml:space="preserve">) were </w:t>
-      </w:r>
-      <w:r>
-        <w:rPr>
-          <w:rFonts w:ascii="Garamond" w:hAnsi="Garamond"/>
-        </w:rPr>
-        <w:t xml:space="preserve">represented </w:t>
-      </w:r>
-      <w:r>
-        <w:rPr>
-          <w:rFonts w:ascii="Garamond" w:hAnsi="Garamond"/>
-        </w:rPr>
-        <w:t xml:space="preserve">primarily </w:t>
-      </w:r>
-      <w:r>
-        <w:rPr>
-          <w:rFonts w:ascii="Garamond" w:hAnsi="Garamond"/>
-        </w:rPr>
-        <w:t>by stocks from the upper portions of the watershed</w:t>
-      </w:r>
-      <w:r>
-        <w:rPr>
-          <w:rFonts w:ascii="Garamond" w:hAnsi="Garamond"/>
-        </w:rPr>
-        <w:t xml:space="preserve"> including</w:t>
-      </w:r>
-      <w:r>
-        <w:rPr>
-          <w:rFonts w:ascii="Garamond" w:hAnsi="Garamond"/>
-        </w:rPr>
-        <w:t xml:space="preserve"> </w:t>
-      </w:r>
-      <w:r>
-        <w:rPr>
-          <w:rFonts w:ascii="Garamond" w:hAnsi="Garamond"/>
-        </w:rPr>
-        <w:t xml:space="preserve">Big River ( </w:t>
-      </w:r>
-      <w:r>
-        <w:rPr>
-          <w:rFonts w:ascii="Garamond" w:hAnsi="Garamond"/>
-        </w:rPr>
-        <w:t>median 12.8%, range 4.6 – 16.1%), Swift River (median: 11.6%, range 5.7-14.4%), Stony River (median: 10.5%, range 9.6-12.4%), and Upper Kuskokwim Main (median: 8.9%, range 5.5-10.8%)</w:t>
-      </w:r>
-      <w:r>
-        <w:rPr>
-          <w:rFonts w:ascii="Garamond" w:hAnsi="Garamond"/>
-        </w:rPr>
-        <w:t xml:space="preserve">. </w:t>
-      </w:r>
-      <w:r>
-        <w:rPr>
-          <w:rFonts w:ascii="Garamond" w:hAnsi="Garamond"/>
-        </w:rPr>
-        <w:t xml:space="preserve">Notably, the uppermost stocks (North, East, and South Fork Kuskokwim) consistently contributed very little (&lt; 2.5%) and the </w:t>
-      </w:r>
-      <w:proofErr w:type="spellStart"/>
-      <w:r>
-        <w:rPr>
-          <w:rFonts w:ascii="Garamond" w:hAnsi="Garamond"/>
-        </w:rPr>
-        <w:t>Takotna</w:t>
-      </w:r>
-      <w:proofErr w:type="spellEnd"/>
-      <w:r>
-        <w:rPr>
-          <w:rFonts w:ascii="Garamond" w:hAnsi="Garamond"/>
-        </w:rPr>
-        <w:t xml:space="preserve"> and Nixon fork </w:t>
-      </w:r>
-      <w:r>
-        <w:rPr>
-          <w:rFonts w:ascii="Garamond" w:hAnsi="Garamond"/>
-        </w:rPr>
-        <w:t>stock as well as the</w:t>
-      </w:r>
-      <w:r>
-        <w:rPr>
-          <w:rFonts w:ascii="Garamond" w:hAnsi="Garamond"/>
-        </w:rPr>
-        <w:t xml:space="preserve"> </w:t>
-      </w:r>
-      <w:proofErr w:type="spellStart"/>
-      <w:r>
-        <w:rPr>
-          <w:rFonts w:ascii="Garamond" w:hAnsi="Garamond"/>
-        </w:rPr>
-        <w:t>Tatlawiksuk</w:t>
-      </w:r>
-      <w:proofErr w:type="spellEnd"/>
-      <w:r>
-        <w:rPr>
-          <w:rFonts w:ascii="Garamond" w:hAnsi="Garamond"/>
-        </w:rPr>
-        <w:t xml:space="preserve"> </w:t>
-      </w:r>
-      <w:r>
-        <w:rPr>
-          <w:rFonts w:ascii="Garamond" w:hAnsi="Garamond"/>
-        </w:rPr>
-        <w:t xml:space="preserve">river </w:t>
-      </w:r>
-      <w:r>
-        <w:rPr>
-          <w:rFonts w:ascii="Garamond" w:hAnsi="Garamond"/>
-        </w:rPr>
-        <w:t xml:space="preserve">stock each contributed only modestly (median 3% and 5% respectively) despite their position near the top of the watershed. The second quartile </w:t>
-      </w:r>
-      <w:proofErr w:type="gramStart"/>
-      <w:r>
-        <w:rPr>
-          <w:rFonts w:ascii="Garamond" w:hAnsi="Garamond"/>
-        </w:rPr>
-        <w:t xml:space="preserve">( </w:t>
-      </w:r>
-      <w:r>
-        <w:rPr>
-          <w:rFonts w:ascii="Garamond" w:hAnsi="Garamond"/>
-        </w:rPr>
-        <w:t>June</w:t>
-      </w:r>
-      <w:proofErr w:type="gramEnd"/>
-      <w:r>
-        <w:rPr>
-          <w:rFonts w:ascii="Garamond" w:hAnsi="Garamond"/>
-        </w:rPr>
-        <w:t xml:space="preserve"> 12</w:t>
-      </w:r>
-      <w:r>
-        <w:rPr>
-          <w:rFonts w:ascii="Garamond" w:hAnsi="Garamond"/>
-          <w:vertAlign w:val="superscript"/>
-        </w:rPr>
-        <w:t>th</w:t>
-      </w:r>
-      <w:r>
-        <w:rPr>
-          <w:rFonts w:ascii="Garamond" w:hAnsi="Garamond"/>
-        </w:rPr>
-        <w:t xml:space="preserve"> – 21</w:t>
-      </w:r>
-      <w:r>
-        <w:rPr>
-          <w:rFonts w:ascii="Garamond" w:hAnsi="Garamond"/>
-          <w:vertAlign w:val="superscript"/>
-        </w:rPr>
-        <w:t>st</w:t>
-      </w:r>
-      <w:r>
-        <w:rPr>
-          <w:rFonts w:ascii="Garamond" w:hAnsi="Garamond"/>
-        </w:rPr>
-        <w:t>, Figure 3b.)</w:t>
-      </w:r>
-      <w:r>
-        <w:rPr>
-          <w:rFonts w:ascii="Garamond" w:hAnsi="Garamond"/>
-        </w:rPr>
-        <w:t xml:space="preserve"> saw a more even distribution of returns across much of the middle watershed, with Upper Kuskokwim Main, Big River, </w:t>
-      </w:r>
-      <w:proofErr w:type="spellStart"/>
-      <w:r>
-        <w:rPr>
-          <w:rFonts w:ascii="Garamond" w:hAnsi="Garamond"/>
-        </w:rPr>
-        <w:t>Takotna</w:t>
-      </w:r>
-      <w:proofErr w:type="spellEnd"/>
-      <w:r>
-        <w:rPr>
-          <w:rFonts w:ascii="Garamond" w:hAnsi="Garamond"/>
-        </w:rPr>
-        <w:t xml:space="preserve"> River and Nixon Fork, Swift River, </w:t>
-      </w:r>
-      <w:proofErr w:type="spellStart"/>
-      <w:r>
-        <w:rPr>
-          <w:rFonts w:ascii="Garamond" w:hAnsi="Garamond"/>
-        </w:rPr>
-        <w:t>Holitna</w:t>
-      </w:r>
-      <w:proofErr w:type="spellEnd"/>
-      <w:r>
-        <w:rPr>
-          <w:rFonts w:ascii="Garamond" w:hAnsi="Garamond"/>
-        </w:rPr>
-        <w:t xml:space="preserve"> River, </w:t>
-      </w:r>
-      <w:proofErr w:type="spellStart"/>
-      <w:r>
-        <w:rPr>
-          <w:rFonts w:ascii="Garamond" w:hAnsi="Garamond"/>
-        </w:rPr>
-        <w:t>Hoholitna</w:t>
-      </w:r>
-      <w:proofErr w:type="spellEnd"/>
-      <w:r>
-        <w:rPr>
-          <w:rFonts w:ascii="Garamond" w:hAnsi="Garamond"/>
-        </w:rPr>
-        <w:t xml:space="preserve"> River, Middle Kuskokwim Main, Aniak</w:t>
-      </w:r>
-      <w:r>
-        <w:rPr>
-          <w:rFonts w:ascii="Garamond" w:hAnsi="Garamond"/>
-        </w:rPr>
-        <w:t xml:space="preserve"> River</w:t>
-      </w:r>
-      <w:r>
-        <w:rPr>
-          <w:rFonts w:ascii="Garamond" w:hAnsi="Garamond"/>
-        </w:rPr>
-        <w:t xml:space="preserve">, and </w:t>
-      </w:r>
-      <w:proofErr w:type="spellStart"/>
-      <w:r>
-        <w:rPr>
-          <w:rFonts w:ascii="Garamond" w:hAnsi="Garamond"/>
-        </w:rPr>
-        <w:t>Kisar</w:t>
-      </w:r>
-      <w:r>
-        <w:rPr>
-          <w:rFonts w:ascii="Garamond" w:hAnsi="Garamond"/>
-        </w:rPr>
-        <w:t>a</w:t>
-      </w:r>
-      <w:r>
-        <w:rPr>
-          <w:rFonts w:ascii="Garamond" w:hAnsi="Garamond"/>
-        </w:rPr>
-        <w:t>lik</w:t>
-      </w:r>
-      <w:proofErr w:type="spellEnd"/>
-      <w:r>
-        <w:rPr>
-          <w:rFonts w:ascii="Garamond" w:hAnsi="Garamond"/>
-        </w:rPr>
-        <w:t xml:space="preserve"> all contributing between 5 and 10%. Only the Stony River had an average contribution of greater than 10% (median 11.5%) with a relative constrained range (10.7 – 12.2%) indicating consistent contribution to the 2</w:t>
-      </w:r>
-      <w:r>
-        <w:rPr>
-          <w:rFonts w:ascii="Garamond" w:hAnsi="Garamond"/>
-          <w:vertAlign w:val="superscript"/>
-        </w:rPr>
-        <w:t>nd</w:t>
-      </w:r>
-      <w:r>
-        <w:rPr>
-          <w:rFonts w:ascii="Garamond" w:hAnsi="Garamond"/>
-        </w:rPr>
-        <w:t xml:space="preserve"> quartile. This pattern largely holds in the 3</w:t>
-      </w:r>
-      <w:r>
-        <w:rPr>
-          <w:rFonts w:ascii="Garamond" w:hAnsi="Garamond"/>
-          <w:vertAlign w:val="superscript"/>
-        </w:rPr>
-        <w:t>rd</w:t>
-      </w:r>
-      <w:r>
-        <w:rPr>
-          <w:rFonts w:ascii="Garamond" w:hAnsi="Garamond"/>
-        </w:rPr>
-        <w:t xml:space="preserve"> quartile (June 22</w:t>
-      </w:r>
-      <w:r>
-        <w:rPr>
-          <w:rFonts w:ascii="Garamond" w:hAnsi="Garamond"/>
-          <w:vertAlign w:val="superscript"/>
-        </w:rPr>
-        <w:t>nd</w:t>
-      </w:r>
-      <w:r>
-        <w:rPr>
-          <w:rFonts w:ascii="Garamond" w:hAnsi="Garamond"/>
-        </w:rPr>
-        <w:t>-</w:t>
-      </w:r>
-      <w:r>
-        <w:rPr>
-          <w:rFonts w:ascii="Garamond" w:hAnsi="Garamond"/>
-        </w:rPr>
-        <w:t xml:space="preserve"> </w:t>
-      </w:r>
-      <w:r>
-        <w:rPr>
-          <w:rFonts w:ascii="Garamond" w:hAnsi="Garamond"/>
-        </w:rPr>
-        <w:t>July</w:t>
-      </w:r>
-      <w:r>
-        <w:rPr>
-          <w:rFonts w:ascii="Garamond" w:hAnsi="Garamond"/>
-        </w:rPr>
-        <w:t xml:space="preserve"> </w:t>
-      </w:r>
-      <w:r>
-        <w:rPr>
-          <w:rFonts w:ascii="Garamond" w:hAnsi="Garamond"/>
-        </w:rPr>
-        <w:t>1st</w:t>
-      </w:r>
-      <w:r>
-        <w:rPr>
-          <w:rFonts w:ascii="Garamond" w:hAnsi="Garamond"/>
-        </w:rPr>
-        <w:t>, Figure 3c.</w:t>
-      </w:r>
-      <w:r>
-        <w:rPr>
-          <w:rFonts w:ascii="Garamond" w:hAnsi="Garamond"/>
-        </w:rPr>
-        <w:t xml:space="preserve">), but with increased contribution from the </w:t>
-      </w:r>
-      <w:proofErr w:type="spellStart"/>
-      <w:r>
-        <w:rPr>
-          <w:rFonts w:ascii="Garamond" w:hAnsi="Garamond"/>
-        </w:rPr>
-        <w:t>Holitna</w:t>
-      </w:r>
-      <w:proofErr w:type="spellEnd"/>
-      <w:r>
-        <w:rPr>
-          <w:rFonts w:ascii="Garamond" w:hAnsi="Garamond"/>
-        </w:rPr>
-        <w:t xml:space="preserve"> River (median; 10.4%, range 9.5-13.6%), </w:t>
-      </w:r>
-      <w:proofErr w:type="spellStart"/>
-      <w:r>
-        <w:rPr>
-          <w:rFonts w:ascii="Garamond" w:hAnsi="Garamond"/>
-        </w:rPr>
-        <w:t>Hoholitna</w:t>
-      </w:r>
-      <w:proofErr w:type="spellEnd"/>
-      <w:r>
-        <w:rPr>
-          <w:rFonts w:ascii="Garamond" w:hAnsi="Garamond"/>
-        </w:rPr>
-        <w:t xml:space="preserve"> River (median 9.6%, range 8.8-12.2%), and Aniak river (median 8.2%, range 5.7-10.1%). </w:t>
-      </w:r>
-      <w:r>
-        <w:rPr>
-          <w:rFonts w:ascii="Garamond" w:hAnsi="Garamond"/>
-        </w:rPr>
-        <w:t>Late season returns (July 2</w:t>
-      </w:r>
-      <w:r>
-        <w:rPr>
-          <w:rFonts w:ascii="Garamond" w:hAnsi="Garamond"/>
-          <w:vertAlign w:val="superscript"/>
-        </w:rPr>
-        <w:t>nd</w:t>
-      </w:r>
-      <w:r>
-        <w:rPr>
-          <w:rFonts w:ascii="Garamond" w:hAnsi="Garamond"/>
-        </w:rPr>
-        <w:t xml:space="preserve"> onward</w:t>
-      </w:r>
-      <w:r>
-        <w:rPr>
-          <w:rFonts w:ascii="Garamond" w:hAnsi="Garamond"/>
-        </w:rPr>
-        <w:t>, Figure 3d.</w:t>
-      </w:r>
-      <w:r>
-        <w:rPr>
-          <w:rFonts w:ascii="Garamond" w:hAnsi="Garamond"/>
-        </w:rPr>
-        <w:t>) displayed further decreasing contribution from Upper Kuskokwim stocks (</w:t>
-      </w:r>
-      <w:proofErr w:type="spellStart"/>
-      <w:r>
-        <w:rPr>
-          <w:rFonts w:ascii="Garamond" w:hAnsi="Garamond"/>
-        </w:rPr>
-        <w:t>i.e</w:t>
-      </w:r>
-      <w:proofErr w:type="spellEnd"/>
-      <w:r>
-        <w:rPr>
-          <w:rFonts w:ascii="Garamond" w:hAnsi="Garamond"/>
-        </w:rPr>
-        <w:t xml:space="preserve"> Upper Kuskokwim Main, Big River, </w:t>
-      </w:r>
-      <w:proofErr w:type="spellStart"/>
-      <w:r>
-        <w:rPr>
-          <w:rFonts w:ascii="Garamond" w:hAnsi="Garamond"/>
-        </w:rPr>
-        <w:t>Takotna</w:t>
-      </w:r>
-      <w:proofErr w:type="spellEnd"/>
-      <w:r>
-        <w:rPr>
-          <w:rFonts w:ascii="Garamond" w:hAnsi="Garamond"/>
-        </w:rPr>
-        <w:t xml:space="preserve"> River and Nixon Fork, </w:t>
-      </w:r>
-      <w:proofErr w:type="spellStart"/>
-      <w:r>
-        <w:rPr>
-          <w:rFonts w:ascii="Garamond" w:hAnsi="Garamond"/>
-        </w:rPr>
-        <w:t>Tatlawiksuk</w:t>
-      </w:r>
-      <w:proofErr w:type="spellEnd"/>
-      <w:r>
-        <w:rPr>
-          <w:rFonts w:ascii="Garamond" w:hAnsi="Garamond"/>
-        </w:rPr>
-        <w:t xml:space="preserve"> River, and Swift River). The </w:t>
-      </w:r>
-      <w:proofErr w:type="spellStart"/>
-      <w:r>
-        <w:rPr>
-          <w:rFonts w:ascii="Garamond" w:hAnsi="Garamond"/>
-        </w:rPr>
-        <w:t>Hoholitna</w:t>
-      </w:r>
-      <w:proofErr w:type="spellEnd"/>
-      <w:r>
-        <w:rPr>
-          <w:rFonts w:ascii="Garamond" w:hAnsi="Garamond"/>
-        </w:rPr>
-        <w:t xml:space="preserve"> and Middle Kuskokwim River saw slight decreases and increases in contribution, respectively, but with </w:t>
-      </w:r>
-      <w:r>
-        <w:rPr>
-          <w:rFonts w:ascii="Garamond" w:hAnsi="Garamond"/>
-        </w:rPr>
-        <w:t xml:space="preserve">an associated </w:t>
-      </w:r>
-      <w:r>
-        <w:rPr>
-          <w:rFonts w:ascii="Garamond" w:hAnsi="Garamond"/>
-        </w:rPr>
-        <w:t xml:space="preserve">increase in range indicating variability </w:t>
-      </w:r>
-      <w:r>
-        <w:rPr>
-          <w:rFonts w:ascii="Garamond" w:hAnsi="Garamond"/>
-        </w:rPr>
-        <w:t xml:space="preserve">across </w:t>
-      </w:r>
-      <w:r>
-        <w:rPr>
-          <w:rFonts w:ascii="Garamond" w:hAnsi="Garamond"/>
-        </w:rPr>
-        <w:t>the dataset. Contribution from the Aniak</w:t>
+        <w:t>dataset. Contribution from the Aniak</w:t>
       </w:r>
       <w:r>
         <w:rPr>
@@ -5446,7 +5572,6 @@
         <w:rPr>
           <w:rFonts w:ascii="Garamond" w:hAnsi="Garamond"/>
         </w:rPr>
-        <w:lastRenderedPageBreak/>
         <w:t xml:space="preserve">Cumulative distribution plots </w:t>
       </w:r>
       <w:r>
@@ -5816,7 +5941,14 @@
         <w:rPr>
           <w:rFonts w:ascii="Garamond" w:hAnsi="Garamond"/>
         </w:rPr>
-        <w:t xml:space="preserve"> river and Nixon Fork stock, which received a median protection of only 6.6%. Several stocks which contribute only minimally to the overall run are afforded significant protection. For example, although the East Fork Kuskokwim contributes minimally to the total run</w:t>
+        <w:t xml:space="preserve"> river and Nixon Fork stock, which received a median protection of only 6.6%. Several stocks which contribute only minimally to the overall run are afforded significant protection. For example, </w:t>
+      </w:r>
+      <w:r>
+        <w:rPr>
+          <w:rFonts w:ascii="Garamond" w:hAnsi="Garamond"/>
+        </w:rPr>
+        <w:lastRenderedPageBreak/>
+        <w:t>although the East Fork Kuskokwim contributes minimally to the total run</w:t>
       </w:r>
       <w:r>
         <w:rPr>
@@ -5860,14 +5992,7 @@
         <w:rPr>
           <w:rFonts w:ascii="Garamond" w:hAnsi="Garamond"/>
         </w:rPr>
-        <w:t xml:space="preserve"> River </w:t>
-      </w:r>
-      <w:r>
-        <w:rPr>
-          <w:rFonts w:ascii="Garamond" w:hAnsi="Garamond"/>
-        </w:rPr>
-        <w:lastRenderedPageBreak/>
-        <w:t>stocks, however, contain outliers of 22.1% and 18.4%, indicating that a front</w:t>
+        <w:t xml:space="preserve"> River stocks, however, contain outliers of 22.1% and 18.4%, indicating that a front</w:t>
       </w:r>
       <w:r>
         <w:rPr>
@@ -5962,14 +6087,7 @@
         <w:rPr>
           <w:rFonts w:ascii="Garamond" w:hAnsi="Garamond"/>
         </w:rPr>
-        <w:t xml:space="preserve">. </w:t>
-      </w:r>
-      <w:proofErr w:type="gramStart"/>
-      <w:r>
-        <w:rPr>
-          <w:rFonts w:ascii="Garamond" w:hAnsi="Garamond"/>
-        </w:rPr>
-        <w:t>Th</w:t>
+        <w:t>. Th</w:t>
       </w:r>
       <w:r>
         <w:rPr>
@@ -5993,14 +6111,7 @@
         <w:rPr>
           <w:rFonts w:ascii="Garamond" w:hAnsi="Garamond"/>
         </w:rPr>
-        <w:t xml:space="preserve"> result</w:t>
-      </w:r>
-      <w:proofErr w:type="gramEnd"/>
-      <w:r>
-        <w:rPr>
-          <w:rFonts w:ascii="Garamond" w:hAnsi="Garamond"/>
-        </w:rPr>
-        <w:t xml:space="preserve"> </w:t>
+        <w:t xml:space="preserve"> result </w:t>
       </w:r>
       <w:r>
         <w:rPr>
@@ -6077,9 +6188,39 @@
       <w:r>
         <w:rPr>
           <w:rFonts w:ascii="Garamond" w:hAnsi="Garamond"/>
-          <w:highlight w:val="yellow"/>
-        </w:rPr>
-        <w:t>(Brennan et al., 2019).</w:t>
+        </w:rPr>
+        <w:fldChar w:fldCharType="begin"/>
+      </w:r>
+      <w:r>
+        <w:rPr>
+          <w:rFonts w:ascii="Garamond" w:hAnsi="Garamond"/>
+        </w:rPr>
+        <w:instrText xml:space="preserve"> ADDIN ZOTERO_ITEM CSL_CITATION {"citationID":"IspQSUXO","properties":{"formattedCitation":"(Brennan, Schindler, et al., 2019)","plainCitation":"(Brennan, Schindler, et al., 2019)","noteIndex":0},"citationItems":[{"id":3844,"uris":["http://zotero.org/users/8421274/items/RXD5IA9D"],"itemData":{"id":3844,"type":"article-journal","abstract":"Watersheds are complex mosaics of habitats whose conditions vary across space and time as landscape features filter overriding climate forcing, yet the extent to which the reliability of ecosystem services depends on these dynamics remains unknown. We quantified how shifting habitat mosaics are expressed across a range of spatial scales within a large, free-flowing river, and how they stabilize the production of Pacific salmon that support valuable fisheries. The strontium isotope records of ear stones (otoliths) show that the relative productivity of locations across the river network, as both natal- and juvenile-rearing habitat, varies widely among years and that this variability is expressed across a broad range of spatial scales, ultimately stabilizing the interannual production of fish at the scale of the entire basin.","container-title":"Science","DOI":"10.1126/science.aav4313","issue":"6442","note":"publisher: American Association for the Advancement of Science","page":"783-786","source":"science.org (Atypon)","title":"Shifting habitat mosaics and fish production across river basins","volume":"364","author":[{"family":"Brennan","given":"Sean R."},{"family":"Schindler","given":"Daniel E."},{"family":"Cline","given":"Timothy J."},{"family":"Walsworth","given":"Timothy E."},{"family":"Buck","given":"Greg"},{"family":"Fernandez","given":"Diego P."}],"issued":{"date-parts":[["2019"]]}}}],"schema":"https://github.com/citation-style-language/schema/raw/master/csl-citation.json"} </w:instrText>
+      </w:r>
+      <w:r>
+        <w:rPr>
+          <w:rFonts w:ascii="Garamond" w:hAnsi="Garamond"/>
+        </w:rPr>
+        <w:fldChar w:fldCharType="separate"/>
+      </w:r>
+      <w:r>
+        <w:rPr>
+          <w:rFonts w:ascii="Garamond" w:hAnsi="Garamond"/>
+          <w:noProof/>
+        </w:rPr>
+        <w:t>(Brennan, Schindler, et al., 2019)</w:t>
+      </w:r>
+      <w:r>
+        <w:rPr>
+          <w:rFonts w:ascii="Garamond" w:hAnsi="Garamond"/>
+        </w:rPr>
+        <w:fldChar w:fldCharType="end"/>
+      </w:r>
+      <w:r>
+        <w:rPr>
+          <w:rFonts w:ascii="Garamond" w:hAnsi="Garamond"/>
+        </w:rPr>
+        <w:t xml:space="preserve">. </w:t>
       </w:r>
     </w:p>
     <w:p>
@@ -6134,7 +6275,14 @@
         <w:rPr>
           <w:rFonts w:ascii="Garamond" w:hAnsi="Garamond"/>
         </w:rPr>
-        <w:t xml:space="preserve"> and providing opportunity for subsistence fishers at the uppermost portions of the watershed harvest opportunities. Upper Kuskokwim stocks not only comprised a substantial proportion of early season </w:t>
+        <w:t xml:space="preserve"> and providing opportunity for subsistence fishers at the uppermost portions of the watershed harvest opportunities. Upper Kuskokwim stocks not only </w:t>
+      </w:r>
+      <w:r>
+        <w:rPr>
+          <w:rFonts w:ascii="Garamond" w:hAnsi="Garamond"/>
+        </w:rPr>
+        <w:lastRenderedPageBreak/>
+        <w:t xml:space="preserve">comprised a substantial proportion of early season </w:t>
       </w:r>
       <w:r>
         <w:rPr>
@@ -6208,17 +6356,7 @@
           <w:b w:val="0"/>
           <w:bCs w:val="0"/>
         </w:rPr>
-        <w:t xml:space="preserve">Given the potential for changes to the relative </w:t>
-      </w:r>
-      <w:r>
-        <w:rPr>
-          <w:rStyle w:val="Strong"/>
-          <w:rFonts w:ascii="Garamond" w:eastAsiaTheme="majorEastAsia" w:hAnsi="Garamond"/>
-          <w:b w:val="0"/>
-          <w:bCs w:val="0"/>
-        </w:rPr>
-        <w:lastRenderedPageBreak/>
-        <w:t xml:space="preserve">production of stocks under shifting environmental conditions, these results suggest that the front-end closure strategy maintains biodiversity across the full stock complex in the upper Kuskokwim, regardless of the overall contribution. </w:t>
+        <w:t xml:space="preserve">Given the potential for changes to the relative production of stocks under shifting environmental conditions, these results suggest that the front-end closure strategy maintains biodiversity across the full stock complex in the upper Kuskokwim, regardless of the overall contribution. </w:t>
       </w:r>
     </w:p>
     <w:p>
@@ -6418,14 +6556,14 @@
         <w:rPr>
           <w:rFonts w:ascii="Garamond" w:hAnsi="Garamond"/>
         </w:rPr>
-        <w:t xml:space="preserve">Protecting upper Kuskokwim stocks through front-end closures appears to be a valid strategy for maintaining biodiversity across the river basin while ensuring basin-wide escapement goals and harvest opportunities. However, this method may be limited in its ability to provide targeted protection for individual stocks, given both the overall run dynamics and interannual variability in production and timing among stocks. Moreover, the efficacy of front-end closures for maintaining basin-wide stock diversity depends on interactions between the closure timing and the spatiotemporal dynamics of the run, as well as fishery dynamics after the closure ends. For example, </w:t>
+        <w:t xml:space="preserve">Protecting upper Kuskokwim stocks through front-end closures appears to be a valid strategy for maintaining biodiversity across the river basin while ensuring basin-wide escapement goals and harvest opportunities. However, this method may be limited in its ability to provide </w:t>
       </w:r>
       <w:r>
         <w:rPr>
           <w:rFonts w:ascii="Garamond" w:hAnsi="Garamond"/>
         </w:rPr>
         <w:lastRenderedPageBreak/>
-        <w:t>protecting a large proportion of upstream stocks may negatively impact weak downstream stocks that could face increased fishing pressure, particularly during years with contracted runs or exceptionally strong early-season returns. Consequently, the efficacy of management strategies such as front-end closures must be assessed alongside the full suite of ecosystem and fishery dynamics to fully understand their effects on maintaining basin-wide biodiversity.</w:t>
+        <w:t>targeted protection for individual stocks, given both the overall run dynamics and interannual variability in production and timing among stocks. Moreover, the efficacy of front-end closures for maintaining basin-wide stock diversity depends on interactions between the closure timing and the spatiotemporal dynamics of the run, as well as fishery dynamics after the closure ends. For example, protecting a large proportion of upstream stocks may negatively impact weak downstream stocks that could face increased fishing pressure, particularly during years with contracted runs or exceptionally strong early-season returns. Consequently, the efficacy of management strategies such as front-end closures must be assessed alongside the full suite of ecosystem and fishery dynamics to fully understand their effects on maintaining basin-wide biodiversity.</w:t>
       </w:r>
     </w:p>
     <w:p>
@@ -6449,22 +6587,45 @@
       <w:r>
         <w:rPr>
           <w:rFonts w:ascii="Garamond" w:hAnsi="Garamond"/>
-          <w:highlight w:val="yellow"/>
-        </w:rPr>
-        <w:t>(Cite)</w:t>
-      </w:r>
-      <w:r>
-        <w:rPr>
-          <w:rFonts w:ascii="Garamond" w:hAnsi="Garamond"/>
-          <w:highlight w:val="yellow"/>
-        </w:rPr>
-        <w:t>.</w:t>
-      </w:r>
-      <w:r>
-        <w:rPr>
-          <w:rFonts w:ascii="Garamond" w:hAnsi="Garamond"/>
-        </w:rPr>
-        <w:t xml:space="preserve"> Although these methods contain some limitations for direct management (i.e. turnaround time</w:t>
+        </w:rPr>
+        <w:fldChar w:fldCharType="begin"/>
+      </w:r>
+      <w:r>
+        <w:rPr>
+          <w:rFonts w:ascii="Garamond" w:hAnsi="Garamond"/>
+        </w:rPr>
+        <w:instrText xml:space="preserve"> ADDIN ZOTERO_ITEM CSL_CITATION {"citationID":"tvE9voRc","properties":{"formattedCitation":"(Brennan et al., 2015)","plainCitation":"(Brennan et al., 2015)","noteIndex":0},"citationItems":[{"id":"qdfHghSJ/KSW9LWYv","uris":["http://zotero.org/users/8421274/items/IY3FLHLM"],"itemData":{"id":"qdfHghSJ/KSW9LWYv","type":"article-journal","abstract":"Strontium isotopes simultaneously delineate fine-scale natal habitats and migrations of Pacific salmon harvested during a coastal commercial fishery., Highly migratory organisms present major challenges to conservation efforts. This is especially true for exploited anadromous fish species, which exhibit long-range dispersals from natal sites, complex population structures, and extensive mixing of distinct populations during exploitation. By tracing the migratory histories of individual Chinook salmon caught in fisheries using strontium isotopes, we determined the relative production of natal habitats at fine spatial scales and different life histories. Although strontium isotopes have been widely used in provenance research, we present a new robust framework to simultaneously assess natal sources and migrations of individuals within fishery harvests through time. Our results pave the way for investigating how fine-scale habitat production and life histories of salmon respond to perturbations—providing crucial insights for conservation.","container-title":"Science Advances","DOI":"10.1126/sciadv.1400124","ISSN":"2375-2548","issue":"4","journalAbbreviation":"Sci Adv","note":"PMID: 26601173\nPMCID: PMC4640640","page":"e1400124","source":"PubMed Central","title":"Strontium isotopes delineate fine-scale natal origins and migration histories of Pacific salmon","volume":"1","author":[{"family":"Brennan","given":"Sean R."},{"family":"Zimmerman","given":"Christian E."},{"family":"Fernandez","given":"Diego P."},{"family":"Cerling","given":"Thure E."},{"family":"McPhee","given":"Megan V."},{"family":"Wooller","given":"Matthew J."}],"issued":{"date-parts":[["2015",5,15]]}}}],"schema":"https://github.com/citation-style-language/schema/raw/master/csl-citation.json"} </w:instrText>
+      </w:r>
+      <w:r>
+        <w:rPr>
+          <w:rFonts w:ascii="Garamond" w:hAnsi="Garamond"/>
+        </w:rPr>
+        <w:fldChar w:fldCharType="separate"/>
+      </w:r>
+      <w:r>
+        <w:rPr>
+          <w:rFonts w:ascii="Garamond" w:hAnsi="Garamond"/>
+          <w:noProof/>
+        </w:rPr>
+        <w:t>(Brennan et al., 2015)</w:t>
+      </w:r>
+      <w:r>
+        <w:rPr>
+          <w:rFonts w:ascii="Garamond" w:hAnsi="Garamond"/>
+        </w:rPr>
+        <w:fldChar w:fldCharType="end"/>
+      </w:r>
+      <w:r>
+        <w:rPr>
+          <w:rFonts w:ascii="Garamond" w:hAnsi="Garamond"/>
+        </w:rPr>
+        <w:t xml:space="preserve">. </w:t>
+      </w:r>
+      <w:r>
+        <w:rPr>
+          <w:rFonts w:ascii="Garamond" w:hAnsi="Garamond"/>
+        </w:rPr>
+        <w:t>Although these methods contain some limitations for direct management (i.e. turnaround time</w:t>
       </w:r>
       <w:r>
         <w:rPr>

</xml_diff>